<commit_message>
Agrego al documento tecnico de diseno los componentes comunes y los formularios de autenticacion y registro
</commit_message>
<xml_diff>
--- a/docs/diseno/INVENTRA_Documento_Tecnico_Diseno.docx
+++ b/docs/diseno/INVENTRA_Documento_Tecnico_Diseno.docx
@@ -845,6 +845,424 @@
       <w:r>
         <w:fldChar w:fldCharType="begin" w:dirty="true"/>
         <w:instrText xml:space="preserve">PAGEREF bm13</w:instrText>
+        <w:fldChar w:fldCharType="end"/>
+      </w:r>
+    </w:p>
+    <w:p>
+      <w:pPr>
+        <w:tabs>
+          <w:tab w:val="right" w:pos="9200" w:leader="dot"/>
+        </w:tabs>
+        <w:spacing w:after="40" w:line="252"/>
+      </w:pPr>
+      <w:hyperlink w:history="1" w:anchor="bm14">
+        <w:r>
+          <w:rPr>
+            <w:rFonts w:ascii="Arial" w:cs="Arial" w:eastAsia="Arial" w:hAnsi="Arial"/>
+            <w:b/>
+            <w:bCs/>
+            <w:color w:val="1F3864"/>
+            <w:sz w:val="21"/>
+            <w:szCs w:val="21"/>
+          </w:rPr>
+          <w:t xml:space="preserve">6. Componentes comunes de la interfaz</w:t>
+        </w:r>
+      </w:hyperlink>
+      <w:r>
+        <w:rPr>
+          <w:rFonts w:ascii="Arial" w:cs="Arial" w:eastAsia="Arial" w:hAnsi="Arial"/>
+          <w:sz w:val="20"/>
+          <w:szCs w:val="20"/>
+        </w:rPr>
+        <w:t xml:space="preserve">	</w:t>
+      </w:r>
+      <w:r>
+        <w:fldChar w:fldCharType="begin" w:dirty="true"/>
+        <w:instrText xml:space="preserve">PAGEREF bm14</w:instrText>
+        <w:fldChar w:fldCharType="end"/>
+      </w:r>
+    </w:p>
+    <w:p>
+      <w:pPr>
+        <w:tabs>
+          <w:tab w:val="right" w:pos="9200" w:leader="dot"/>
+        </w:tabs>
+        <w:spacing w:after="40" w:line="252"/>
+        <w:ind w:left="360"/>
+      </w:pPr>
+      <w:hyperlink w:history="1" w:anchor="bm15">
+        <w:r>
+          <w:rPr>
+            <w:rFonts w:ascii="Arial" w:cs="Arial" w:eastAsia="Arial" w:hAnsi="Arial"/>
+            <w:b w:val="false"/>
+            <w:bCs w:val="false"/>
+            <w:color w:val="1F3864"/>
+            <w:sz w:val="20"/>
+            <w:szCs w:val="20"/>
+          </w:rPr>
+          <w:t xml:space="preserve">6.1 Estados de los componentes interactivos</w:t>
+        </w:r>
+      </w:hyperlink>
+      <w:r>
+        <w:rPr>
+          <w:rFonts w:ascii="Arial" w:cs="Arial" w:eastAsia="Arial" w:hAnsi="Arial"/>
+          <w:sz w:val="20"/>
+          <w:szCs w:val="20"/>
+        </w:rPr>
+        <w:t xml:space="preserve">	</w:t>
+      </w:r>
+      <w:r>
+        <w:fldChar w:fldCharType="begin" w:dirty="true"/>
+        <w:instrText xml:space="preserve">PAGEREF bm15</w:instrText>
+        <w:fldChar w:fldCharType="end"/>
+      </w:r>
+    </w:p>
+    <w:p>
+      <w:pPr>
+        <w:tabs>
+          <w:tab w:val="right" w:pos="9200" w:leader="dot"/>
+        </w:tabs>
+        <w:spacing w:after="40" w:line="252"/>
+        <w:ind w:left="360"/>
+      </w:pPr>
+      <w:hyperlink w:history="1" w:anchor="bm16">
+        <w:r>
+          <w:rPr>
+            <w:rFonts w:ascii="Arial" w:cs="Arial" w:eastAsia="Arial" w:hAnsi="Arial"/>
+            <w:b w:val="false"/>
+            <w:bCs w:val="false"/>
+            <w:color w:val="1F3864"/>
+            <w:sz w:val="20"/>
+            <w:szCs w:val="20"/>
+          </w:rPr>
+          <w:t xml:space="preserve">6.2 Botones</w:t>
+        </w:r>
+      </w:hyperlink>
+      <w:r>
+        <w:rPr>
+          <w:rFonts w:ascii="Arial" w:cs="Arial" w:eastAsia="Arial" w:hAnsi="Arial"/>
+          <w:sz w:val="20"/>
+          <w:szCs w:val="20"/>
+        </w:rPr>
+        <w:t xml:space="preserve">	</w:t>
+      </w:r>
+      <w:r>
+        <w:fldChar w:fldCharType="begin" w:dirty="true"/>
+        <w:instrText xml:space="preserve">PAGEREF bm16</w:instrText>
+        <w:fldChar w:fldCharType="end"/>
+      </w:r>
+    </w:p>
+    <w:p>
+      <w:pPr>
+        <w:tabs>
+          <w:tab w:val="right" w:pos="9200" w:leader="dot"/>
+        </w:tabs>
+        <w:spacing w:after="40" w:line="252"/>
+        <w:ind w:left="360"/>
+      </w:pPr>
+      <w:hyperlink w:history="1" w:anchor="bm17">
+        <w:r>
+          <w:rPr>
+            <w:rFonts w:ascii="Arial" w:cs="Arial" w:eastAsia="Arial" w:hAnsi="Arial"/>
+            <w:b w:val="false"/>
+            <w:bCs w:val="false"/>
+            <w:color w:val="1F3864"/>
+            <w:sz w:val="20"/>
+            <w:szCs w:val="20"/>
+          </w:rPr>
+          <w:t xml:space="preserve">6.3 Campos de formulario</w:t>
+        </w:r>
+      </w:hyperlink>
+      <w:r>
+        <w:rPr>
+          <w:rFonts w:ascii="Arial" w:cs="Arial" w:eastAsia="Arial" w:hAnsi="Arial"/>
+          <w:sz w:val="20"/>
+          <w:szCs w:val="20"/>
+        </w:rPr>
+        <w:t xml:space="preserve">	</w:t>
+      </w:r>
+      <w:r>
+        <w:fldChar w:fldCharType="begin" w:dirty="true"/>
+        <w:instrText xml:space="preserve">PAGEREF bm17</w:instrText>
+        <w:fldChar w:fldCharType="end"/>
+      </w:r>
+    </w:p>
+    <w:p>
+      <w:pPr>
+        <w:tabs>
+          <w:tab w:val="right" w:pos="9200" w:leader="dot"/>
+        </w:tabs>
+        <w:spacing w:after="40" w:line="252"/>
+        <w:ind w:left="360"/>
+      </w:pPr>
+      <w:hyperlink w:history="1" w:anchor="bm18">
+        <w:r>
+          <w:rPr>
+            <w:rFonts w:ascii="Arial" w:cs="Arial" w:eastAsia="Arial" w:hAnsi="Arial"/>
+            <w:b w:val="false"/>
+            <w:bCs w:val="false"/>
+            <w:color w:val="1F3864"/>
+            <w:sz w:val="20"/>
+            <w:szCs w:val="20"/>
+          </w:rPr>
+          <w:t xml:space="preserve">6.4 Mensajes, alertas y etiquetas de estado</w:t>
+        </w:r>
+      </w:hyperlink>
+      <w:r>
+        <w:rPr>
+          <w:rFonts w:ascii="Arial" w:cs="Arial" w:eastAsia="Arial" w:hAnsi="Arial"/>
+          <w:sz w:val="20"/>
+          <w:szCs w:val="20"/>
+        </w:rPr>
+        <w:t xml:space="preserve">	</w:t>
+      </w:r>
+      <w:r>
+        <w:fldChar w:fldCharType="begin" w:dirty="true"/>
+        <w:instrText xml:space="preserve">PAGEREF bm18</w:instrText>
+        <w:fldChar w:fldCharType="end"/>
+      </w:r>
+    </w:p>
+    <w:p>
+      <w:pPr>
+        <w:tabs>
+          <w:tab w:val="right" w:pos="9200" w:leader="dot"/>
+        </w:tabs>
+        <w:spacing w:after="40" w:line="252"/>
+        <w:ind w:left="360"/>
+      </w:pPr>
+      <w:hyperlink w:history="1" w:anchor="bm19">
+        <w:r>
+          <w:rPr>
+            <w:rFonts w:ascii="Arial" w:cs="Arial" w:eastAsia="Arial" w:hAnsi="Arial"/>
+            <w:b w:val="false"/>
+            <w:bCs w:val="false"/>
+            <w:color w:val="1F3864"/>
+            <w:sz w:val="20"/>
+            <w:szCs w:val="20"/>
+          </w:rPr>
+          <w:t xml:space="preserve">6.5 Navegación, tarjetas y tablas</w:t>
+        </w:r>
+      </w:hyperlink>
+      <w:r>
+        <w:rPr>
+          <w:rFonts w:ascii="Arial" w:cs="Arial" w:eastAsia="Arial" w:hAnsi="Arial"/>
+          <w:sz w:val="20"/>
+          <w:szCs w:val="20"/>
+        </w:rPr>
+        <w:t xml:space="preserve">	</w:t>
+      </w:r>
+      <w:r>
+        <w:fldChar w:fldCharType="begin" w:dirty="true"/>
+        <w:instrText xml:space="preserve">PAGEREF bm19</w:instrText>
+        <w:fldChar w:fldCharType="end"/>
+      </w:r>
+    </w:p>
+    <w:p>
+      <w:pPr>
+        <w:tabs>
+          <w:tab w:val="right" w:pos="9200" w:leader="dot"/>
+        </w:tabs>
+        <w:spacing w:after="40" w:line="252"/>
+        <w:ind w:left="360"/>
+      </w:pPr>
+      <w:hyperlink w:history="1" w:anchor="bm20">
+        <w:r>
+          <w:rPr>
+            <w:rFonts w:ascii="Arial" w:cs="Arial" w:eastAsia="Arial" w:hAnsi="Arial"/>
+            <w:b w:val="false"/>
+            <w:bCs w:val="false"/>
+            <w:color w:val="1F3864"/>
+            <w:sz w:val="20"/>
+            <w:szCs w:val="20"/>
+          </w:rPr>
+          <w:t xml:space="preserve">6.6 Ventanas de confirmación</w:t>
+        </w:r>
+      </w:hyperlink>
+      <w:r>
+        <w:rPr>
+          <w:rFonts w:ascii="Arial" w:cs="Arial" w:eastAsia="Arial" w:hAnsi="Arial"/>
+          <w:sz w:val="20"/>
+          <w:szCs w:val="20"/>
+        </w:rPr>
+        <w:t xml:space="preserve">	</w:t>
+      </w:r>
+      <w:r>
+        <w:fldChar w:fldCharType="begin" w:dirty="true"/>
+        <w:instrText xml:space="preserve">PAGEREF bm20</w:instrText>
+        <w:fldChar w:fldCharType="end"/>
+      </w:r>
+    </w:p>
+    <w:p>
+      <w:pPr>
+        <w:tabs>
+          <w:tab w:val="right" w:pos="9200" w:leader="dot"/>
+        </w:tabs>
+        <w:spacing w:after="40" w:line="252"/>
+      </w:pPr>
+      <w:hyperlink w:history="1" w:anchor="bm21">
+        <w:r>
+          <w:rPr>
+            <w:rFonts w:ascii="Arial" w:cs="Arial" w:eastAsia="Arial" w:hAnsi="Arial"/>
+            <w:b/>
+            <w:bCs/>
+            <w:color w:val="1F3864"/>
+            <w:sz w:val="21"/>
+            <w:szCs w:val="21"/>
+          </w:rPr>
+          <w:t xml:space="preserve">7. Formularios de autenticación y registro</w:t>
+        </w:r>
+      </w:hyperlink>
+      <w:r>
+        <w:rPr>
+          <w:rFonts w:ascii="Arial" w:cs="Arial" w:eastAsia="Arial" w:hAnsi="Arial"/>
+          <w:sz w:val="20"/>
+          <w:szCs w:val="20"/>
+        </w:rPr>
+        <w:t xml:space="preserve">	</w:t>
+      </w:r>
+      <w:r>
+        <w:fldChar w:fldCharType="begin" w:dirty="true"/>
+        <w:instrText xml:space="preserve">PAGEREF bm21</w:instrText>
+        <w:fldChar w:fldCharType="end"/>
+      </w:r>
+    </w:p>
+    <w:p>
+      <w:pPr>
+        <w:tabs>
+          <w:tab w:val="right" w:pos="9200" w:leader="dot"/>
+        </w:tabs>
+        <w:spacing w:after="40" w:line="252"/>
+        <w:ind w:left="360"/>
+      </w:pPr>
+      <w:hyperlink w:history="1" w:anchor="bm22">
+        <w:r>
+          <w:rPr>
+            <w:rFonts w:ascii="Arial" w:cs="Arial" w:eastAsia="Arial" w:hAnsi="Arial"/>
+            <w:b w:val="false"/>
+            <w:bCs w:val="false"/>
+            <w:color w:val="1F3864"/>
+            <w:sz w:val="20"/>
+            <w:szCs w:val="20"/>
+          </w:rPr>
+          <w:t xml:space="preserve">7.1 Inicio de sesión</w:t>
+        </w:r>
+      </w:hyperlink>
+      <w:r>
+        <w:rPr>
+          <w:rFonts w:ascii="Arial" w:cs="Arial" w:eastAsia="Arial" w:hAnsi="Arial"/>
+          <w:sz w:val="20"/>
+          <w:szCs w:val="20"/>
+        </w:rPr>
+        <w:t xml:space="preserve">	</w:t>
+      </w:r>
+      <w:r>
+        <w:fldChar w:fldCharType="begin" w:dirty="true"/>
+        <w:instrText xml:space="preserve">PAGEREF bm22</w:instrText>
+        <w:fldChar w:fldCharType="end"/>
+      </w:r>
+    </w:p>
+    <w:p>
+      <w:pPr>
+        <w:tabs>
+          <w:tab w:val="right" w:pos="9200" w:leader="dot"/>
+        </w:tabs>
+        <w:spacing w:after="40" w:line="252"/>
+        <w:ind w:left="360"/>
+      </w:pPr>
+      <w:hyperlink w:history="1" w:anchor="bm23">
+        <w:r>
+          <w:rPr>
+            <w:rFonts w:ascii="Arial" w:cs="Arial" w:eastAsia="Arial" w:hAnsi="Arial"/>
+            <w:b w:val="false"/>
+            <w:bCs w:val="false"/>
+            <w:color w:val="1F3864"/>
+            <w:sz w:val="20"/>
+            <w:szCs w:val="20"/>
+          </w:rPr>
+          <w:t xml:space="preserve">7.2 Registro de la licorería</w:t>
+        </w:r>
+      </w:hyperlink>
+      <w:r>
+        <w:rPr>
+          <w:rFonts w:ascii="Arial" w:cs="Arial" w:eastAsia="Arial" w:hAnsi="Arial"/>
+          <w:sz w:val="20"/>
+          <w:szCs w:val="20"/>
+        </w:rPr>
+        <w:t xml:space="preserve">	</w:t>
+      </w:r>
+      <w:r>
+        <w:fldChar w:fldCharType="begin" w:dirty="true"/>
+        <w:instrText xml:space="preserve">PAGEREF bm23</w:instrText>
+        <w:fldChar w:fldCharType="end"/>
+      </w:r>
+    </w:p>
+    <w:p>
+      <w:pPr>
+        <w:tabs>
+          <w:tab w:val="right" w:pos="9200" w:leader="dot"/>
+        </w:tabs>
+        <w:spacing w:after="40" w:line="252"/>
+        <w:ind w:left="360"/>
+      </w:pPr>
+      <w:hyperlink w:history="1" w:anchor="bm24">
+        <w:r>
+          <w:rPr>
+            <w:rFonts w:ascii="Arial" w:cs="Arial" w:eastAsia="Arial" w:hAnsi="Arial"/>
+            <w:b w:val="false"/>
+            <w:bCs w:val="false"/>
+            <w:color w:val="1F3864"/>
+            <w:sz w:val="20"/>
+            <w:szCs w:val="20"/>
+          </w:rPr>
+          <w:t xml:space="preserve">7.3 Recuperación de contraseña</w:t>
+        </w:r>
+      </w:hyperlink>
+      <w:r>
+        <w:rPr>
+          <w:rFonts w:ascii="Arial" w:cs="Arial" w:eastAsia="Arial" w:hAnsi="Arial"/>
+          <w:sz w:val="20"/>
+          <w:szCs w:val="20"/>
+        </w:rPr>
+        <w:t xml:space="preserve">	</w:t>
+      </w:r>
+      <w:r>
+        <w:fldChar w:fldCharType="begin" w:dirty="true"/>
+        <w:instrText xml:space="preserve">PAGEREF bm24</w:instrText>
+        <w:fldChar w:fldCharType="end"/>
+      </w:r>
+    </w:p>
+    <w:p>
+      <w:pPr>
+        <w:tabs>
+          <w:tab w:val="right" w:pos="9200" w:leader="dot"/>
+        </w:tabs>
+        <w:spacing w:after="40" w:line="252"/>
+        <w:ind w:left="360"/>
+      </w:pPr>
+      <w:hyperlink w:history="1" w:anchor="bm25">
+        <w:r>
+          <w:rPr>
+            <w:rFonts w:ascii="Arial" w:cs="Arial" w:eastAsia="Arial" w:hAnsi="Arial"/>
+            <w:b w:val="false"/>
+            <w:bCs w:val="false"/>
+            <w:color w:val="1F3864"/>
+            <w:sz w:val="20"/>
+            <w:szCs w:val="20"/>
+          </w:rPr>
+          <w:t xml:space="preserve">7.4 Validaciones y mensajes</w:t>
+        </w:r>
+      </w:hyperlink>
+      <w:r>
+        <w:rPr>
+          <w:rFonts w:ascii="Arial" w:cs="Arial" w:eastAsia="Arial" w:hAnsi="Arial"/>
+          <w:sz w:val="20"/>
+          <w:szCs w:val="20"/>
+        </w:rPr>
+        <w:t xml:space="preserve">	</w:t>
+      </w:r>
+      <w:r>
+        <w:fldChar w:fldCharType="begin" w:dirty="true"/>
+        <w:instrText xml:space="preserve">PAGEREF bm25</w:instrText>
         <w:fldChar w:fldCharType="end"/>
       </w:r>
     </w:p>
@@ -3691,6 +4109,3407 @@
                 <w:szCs w:val="19"/>
               </w:rPr>
               <w:t xml:space="preserve">Rejilla completa; navegación lateral fija.</w:t>
+            </w:r>
+          </w:p>
+        </w:tc>
+      </w:tr>
+    </w:tbl>
+    <w:p>
+      <w:pPr>
+        <w:pStyle w:val="Heading1"/>
+        <w:pageBreakBefore/>
+        <w:spacing w:after="110" w:before="220"/>
+      </w:pPr>
+      <w:bookmarkStart w:name="bm14" w:id="14"/>
+      <w:r>
+        <w:rPr>
+          <w:rFonts w:ascii="Arial" w:cs="Arial" w:eastAsia="Arial" w:hAnsi="Arial"/>
+          <w:b/>
+          <w:bCs/>
+          <w:color w:val="1F3864"/>
+          <w:sz w:val="27"/>
+          <w:szCs w:val="27"/>
+        </w:rPr>
+        <w:t xml:space="preserve">6. Componentes comunes de la interfaz</w:t>
+      </w:r>
+      <w:bookmarkEnd w:id="14"/>
+    </w:p>
+    <w:p>
+      <w:pPr>
+        <w:spacing w:after="110" w:line="262"/>
+        <w:jc w:val="both"/>
+      </w:pPr>
+      <w:r>
+        <w:rPr>
+          <w:rFonts w:ascii="Arial" w:cs="Arial" w:eastAsia="Arial" w:hAnsi="Arial"/>
+          <w:sz w:val="22"/>
+          <w:szCs w:val="22"/>
+        </w:rPr>
+        <w:t xml:space="preserve">La interfaz se construye a partir de un conjunto reducido de componentes reutilizables. Cada componente tiene una función definida, una apariencia única en toda la aplicación y un comportamiento previsible frente a la acción del usuario. Esta sección describe los componentes base, sus variantes y los estados en que puede encontrarse cada uno.</w:t>
+      </w:r>
+    </w:p>
+    <w:p>
+      <w:pPr>
+        <w:pStyle w:val="Heading2"/>
+        <w:spacing w:after="80" w:before="150"/>
+      </w:pPr>
+      <w:bookmarkStart w:name="bm15" w:id="15"/>
+      <w:r>
+        <w:rPr>
+          <w:rFonts w:ascii="Arial" w:cs="Arial" w:eastAsia="Arial" w:hAnsi="Arial"/>
+          <w:b/>
+          <w:bCs/>
+          <w:color w:val="2E5496"/>
+          <w:sz w:val="23"/>
+          <w:szCs w:val="23"/>
+        </w:rPr>
+        <w:t xml:space="preserve">6.1 Estados de los componentes interactivos</w:t>
+      </w:r>
+      <w:bookmarkEnd w:id="15"/>
+    </w:p>
+    <w:p>
+      <w:pPr>
+        <w:spacing w:after="110" w:line="262"/>
+        <w:jc w:val="both"/>
+      </w:pPr>
+      <w:r>
+        <w:rPr>
+          <w:rFonts w:ascii="Arial" w:cs="Arial" w:eastAsia="Arial" w:hAnsi="Arial"/>
+          <w:sz w:val="22"/>
+          <w:szCs w:val="22"/>
+        </w:rPr>
+        <w:t xml:space="preserve">Todo elemento con el que el usuario puede interactuar cambia de apariencia según su situación. Los estados son los mismos para botones, campos, enlaces y elementos de navegación, de modo que el comportamiento resulte reconocible en cualquier pantalla:</w:t>
+      </w:r>
+    </w:p>
+    <w:tbl>
+      <w:tblPr>
+        <w:tblW w:type="dxa" w:w="9360"/>
+        <w:tblBorders>
+          <w:top w:val="single" w:color="9CA3AF" w:sz="6"/>
+          <w:left w:val="single" w:color="9CA3AF" w:sz="6"/>
+          <w:bottom w:val="single" w:color="9CA3AF" w:sz="6"/>
+          <w:right w:val="single" w:color="9CA3AF" w:sz="6"/>
+          <w:insideH w:val="single" w:color="9CA3AF" w:sz="6"/>
+          <w:insideV w:val="single" w:color="9CA3AF" w:sz="6"/>
+        </w:tblBorders>
+        <w:tblLayout w:type="fixed"/>
+      </w:tblPr>
+      <w:tblGrid>
+        <w:gridCol w:w="1700"/>
+        <w:gridCol w:w="4000"/>
+        <w:gridCol w:w="3660"/>
+      </w:tblGrid>
+      <w:tr>
+        <w:trPr>
+          <w:tblHeader/>
+        </w:trPr>
+        <w:tc>
+          <w:tcPr>
+            <w:tcW w:type="dxa" w:w="1700"/>
+            <w:shd w:fill="1F3864" w:val="clear"/>
+            <w:tcMar>
+              <w:top w:type="dxa" w:w="40"/>
+              <w:left w:type="dxa" w:w="70"/>
+              <w:bottom w:type="dxa" w:w="40"/>
+              <w:right w:type="dxa" w:w="70"/>
+            </w:tcMar>
+          </w:tcPr>
+          <w:p>
+            <w:pPr>
+              <w:spacing w:after="0" w:line="236"/>
+            </w:pPr>
+            <w:r>
+              <w:rPr>
+                <w:rFonts w:ascii="Arial" w:cs="Arial" w:eastAsia="Arial" w:hAnsi="Arial"/>
+                <w:b/>
+                <w:bCs/>
+                <w:color w:val="FFFFFF"/>
+                <w:sz w:val="19"/>
+                <w:szCs w:val="19"/>
+              </w:rPr>
+              <w:t xml:space="preserve">Estado</w:t>
+            </w:r>
+          </w:p>
+        </w:tc>
+        <w:tc>
+          <w:tcPr>
+            <w:tcW w:type="dxa" w:w="4000"/>
+            <w:shd w:fill="1F3864" w:val="clear"/>
+            <w:tcMar>
+              <w:top w:type="dxa" w:w="40"/>
+              <w:left w:type="dxa" w:w="70"/>
+              <w:bottom w:type="dxa" w:w="40"/>
+              <w:right w:type="dxa" w:w="70"/>
+            </w:tcMar>
+          </w:tcPr>
+          <w:p>
+            <w:pPr>
+              <w:spacing w:after="0" w:line="236"/>
+            </w:pPr>
+            <w:r>
+              <w:rPr>
+                <w:rFonts w:ascii="Arial" w:cs="Arial" w:eastAsia="Arial" w:hAnsi="Arial"/>
+                <w:b/>
+                <w:bCs/>
+                <w:color w:val="FFFFFF"/>
+                <w:sz w:val="19"/>
+                <w:szCs w:val="19"/>
+              </w:rPr>
+              <w:t xml:space="preserve">Cuándo se presenta</w:t>
+            </w:r>
+          </w:p>
+        </w:tc>
+        <w:tc>
+          <w:tcPr>
+            <w:tcW w:type="dxa" w:w="3660"/>
+            <w:shd w:fill="1F3864" w:val="clear"/>
+            <w:tcMar>
+              <w:top w:type="dxa" w:w="40"/>
+              <w:left w:type="dxa" w:w="70"/>
+              <w:bottom w:type="dxa" w:w="40"/>
+              <w:right w:type="dxa" w:w="70"/>
+            </w:tcMar>
+          </w:tcPr>
+          <w:p>
+            <w:pPr>
+              <w:spacing w:after="0" w:line="236"/>
+            </w:pPr>
+            <w:r>
+              <w:rPr>
+                <w:rFonts w:ascii="Arial" w:cs="Arial" w:eastAsia="Arial" w:hAnsi="Arial"/>
+                <w:b/>
+                <w:bCs/>
+                <w:color w:val="FFFFFF"/>
+                <w:sz w:val="19"/>
+                <w:szCs w:val="19"/>
+              </w:rPr>
+              <w:t xml:space="preserve">Señal visual</w:t>
+            </w:r>
+          </w:p>
+        </w:tc>
+      </w:tr>
+      <w:tr>
+        <w:trPr>
+          <w:tblHeader w:val="false"/>
+        </w:trPr>
+        <w:tc>
+          <w:tcPr>
+            <w:tcW w:type="dxa" w:w="1700"/>
+            <w:shd w:fill="FFFFFF" w:val="clear"/>
+            <w:tcMar>
+              <w:top w:type="dxa" w:w="40"/>
+              <w:left w:type="dxa" w:w="70"/>
+              <w:bottom w:type="dxa" w:w="40"/>
+              <w:right w:type="dxa" w:w="70"/>
+            </w:tcMar>
+          </w:tcPr>
+          <w:p>
+            <w:pPr>
+              <w:spacing w:after="0" w:line="236"/>
+            </w:pPr>
+            <w:r>
+              <w:rPr>
+                <w:rFonts w:ascii="Arial" w:cs="Arial" w:eastAsia="Arial" w:hAnsi="Arial"/>
+                <w:sz w:val="19"/>
+                <w:szCs w:val="19"/>
+              </w:rPr>
+              <w:t xml:space="preserve">Normal</w:t>
+            </w:r>
+          </w:p>
+        </w:tc>
+        <w:tc>
+          <w:tcPr>
+            <w:tcW w:type="dxa" w:w="4000"/>
+            <w:shd w:fill="FFFFFF" w:val="clear"/>
+            <w:tcMar>
+              <w:top w:type="dxa" w:w="40"/>
+              <w:left w:type="dxa" w:w="70"/>
+              <w:bottom w:type="dxa" w:w="40"/>
+              <w:right w:type="dxa" w:w="70"/>
+            </w:tcMar>
+          </w:tcPr>
+          <w:p>
+            <w:pPr>
+              <w:spacing w:after="0" w:line="236"/>
+            </w:pPr>
+            <w:r>
+              <w:rPr>
+                <w:rFonts w:ascii="Arial" w:cs="Arial" w:eastAsia="Arial" w:hAnsi="Arial"/>
+                <w:sz w:val="19"/>
+                <w:szCs w:val="19"/>
+              </w:rPr>
+              <w:t xml:space="preserve">El elemento está disponible y en reposo.</w:t>
+            </w:r>
+          </w:p>
+        </w:tc>
+        <w:tc>
+          <w:tcPr>
+            <w:tcW w:type="dxa" w:w="3660"/>
+            <w:shd w:fill="FFFFFF" w:val="clear"/>
+            <w:tcMar>
+              <w:top w:type="dxa" w:w="40"/>
+              <w:left w:type="dxa" w:w="70"/>
+              <w:bottom w:type="dxa" w:w="40"/>
+              <w:right w:type="dxa" w:w="70"/>
+            </w:tcMar>
+          </w:tcPr>
+          <w:p>
+            <w:pPr>
+              <w:spacing w:after="0" w:line="236"/>
+            </w:pPr>
+            <w:r>
+              <w:rPr>
+                <w:rFonts w:ascii="Arial" w:cs="Arial" w:eastAsia="Arial" w:hAnsi="Arial"/>
+                <w:sz w:val="19"/>
+                <w:szCs w:val="19"/>
+              </w:rPr>
+              <w:t xml:space="preserve">Color y borde definidos para su variante.</w:t>
+            </w:r>
+          </w:p>
+        </w:tc>
+      </w:tr>
+      <w:tr>
+        <w:trPr>
+          <w:tblHeader w:val="false"/>
+        </w:trPr>
+        <w:tc>
+          <w:tcPr>
+            <w:tcW w:type="dxa" w:w="1700"/>
+            <w:shd w:fill="F2F2F2" w:val="clear"/>
+            <w:tcMar>
+              <w:top w:type="dxa" w:w="40"/>
+              <w:left w:type="dxa" w:w="70"/>
+              <w:bottom w:type="dxa" w:w="40"/>
+              <w:right w:type="dxa" w:w="70"/>
+            </w:tcMar>
+          </w:tcPr>
+          <w:p>
+            <w:pPr>
+              <w:spacing w:after="0" w:line="236"/>
+            </w:pPr>
+            <w:r>
+              <w:rPr>
+                <w:rFonts w:ascii="Arial" w:cs="Arial" w:eastAsia="Arial" w:hAnsi="Arial"/>
+                <w:sz w:val="19"/>
+                <w:szCs w:val="19"/>
+              </w:rPr>
+              <w:t xml:space="preserve">Puntero encima</w:t>
+            </w:r>
+          </w:p>
+        </w:tc>
+        <w:tc>
+          <w:tcPr>
+            <w:tcW w:type="dxa" w:w="4000"/>
+            <w:shd w:fill="F2F2F2" w:val="clear"/>
+            <w:tcMar>
+              <w:top w:type="dxa" w:w="40"/>
+              <w:left w:type="dxa" w:w="70"/>
+              <w:bottom w:type="dxa" w:w="40"/>
+              <w:right w:type="dxa" w:w="70"/>
+            </w:tcMar>
+          </w:tcPr>
+          <w:p>
+            <w:pPr>
+              <w:spacing w:after="0" w:line="236"/>
+            </w:pPr>
+            <w:r>
+              <w:rPr>
+                <w:rFonts w:ascii="Arial" w:cs="Arial" w:eastAsia="Arial" w:hAnsi="Arial"/>
+                <w:sz w:val="19"/>
+                <w:szCs w:val="19"/>
+              </w:rPr>
+              <w:t xml:space="preserve">El cursor se sitúa sobre el elemento.</w:t>
+            </w:r>
+          </w:p>
+        </w:tc>
+        <w:tc>
+          <w:tcPr>
+            <w:tcW w:type="dxa" w:w="3660"/>
+            <w:shd w:fill="F2F2F2" w:val="clear"/>
+            <w:tcMar>
+              <w:top w:type="dxa" w:w="40"/>
+              <w:left w:type="dxa" w:w="70"/>
+              <w:bottom w:type="dxa" w:w="40"/>
+              <w:right w:type="dxa" w:w="70"/>
+            </w:tcMar>
+          </w:tcPr>
+          <w:p>
+            <w:pPr>
+              <w:spacing w:after="0" w:line="236"/>
+            </w:pPr>
+            <w:r>
+              <w:rPr>
+                <w:rFonts w:ascii="Arial" w:cs="Arial" w:eastAsia="Arial" w:hAnsi="Arial"/>
+                <w:sz w:val="19"/>
+                <w:szCs w:val="19"/>
+              </w:rPr>
+              <w:t xml:space="preserve">El color de fondo se oscurece ligeramente.</w:t>
+            </w:r>
+          </w:p>
+        </w:tc>
+      </w:tr>
+      <w:tr>
+        <w:trPr>
+          <w:tblHeader w:val="false"/>
+        </w:trPr>
+        <w:tc>
+          <w:tcPr>
+            <w:tcW w:type="dxa" w:w="1700"/>
+            <w:shd w:fill="FFFFFF" w:val="clear"/>
+            <w:tcMar>
+              <w:top w:type="dxa" w:w="40"/>
+              <w:left w:type="dxa" w:w="70"/>
+              <w:bottom w:type="dxa" w:w="40"/>
+              <w:right w:type="dxa" w:w="70"/>
+            </w:tcMar>
+          </w:tcPr>
+          <w:p>
+            <w:pPr>
+              <w:spacing w:after="0" w:line="236"/>
+            </w:pPr>
+            <w:r>
+              <w:rPr>
+                <w:rFonts w:ascii="Arial" w:cs="Arial" w:eastAsia="Arial" w:hAnsi="Arial"/>
+                <w:sz w:val="19"/>
+                <w:szCs w:val="19"/>
+              </w:rPr>
+              <w:t xml:space="preserve">Foco</w:t>
+            </w:r>
+          </w:p>
+        </w:tc>
+        <w:tc>
+          <w:tcPr>
+            <w:tcW w:type="dxa" w:w="4000"/>
+            <w:shd w:fill="FFFFFF" w:val="clear"/>
+            <w:tcMar>
+              <w:top w:type="dxa" w:w="40"/>
+              <w:left w:type="dxa" w:w="70"/>
+              <w:bottom w:type="dxa" w:w="40"/>
+              <w:right w:type="dxa" w:w="70"/>
+            </w:tcMar>
+          </w:tcPr>
+          <w:p>
+            <w:pPr>
+              <w:spacing w:after="0" w:line="236"/>
+            </w:pPr>
+            <w:r>
+              <w:rPr>
+                <w:rFonts w:ascii="Arial" w:cs="Arial" w:eastAsia="Arial" w:hAnsi="Arial"/>
+                <w:sz w:val="19"/>
+                <w:szCs w:val="19"/>
+              </w:rPr>
+              <w:t xml:space="preserve">El elemento se selecciona con el teclado o al escribir en él.</w:t>
+            </w:r>
+          </w:p>
+        </w:tc>
+        <w:tc>
+          <w:tcPr>
+            <w:tcW w:type="dxa" w:w="3660"/>
+            <w:shd w:fill="FFFFFF" w:val="clear"/>
+            <w:tcMar>
+              <w:top w:type="dxa" w:w="40"/>
+              <w:left w:type="dxa" w:w="70"/>
+              <w:bottom w:type="dxa" w:w="40"/>
+              <w:right w:type="dxa" w:w="70"/>
+            </w:tcMar>
+          </w:tcPr>
+          <w:p>
+            <w:pPr>
+              <w:spacing w:after="0" w:line="236"/>
+            </w:pPr>
+            <w:r>
+              <w:rPr>
+                <w:rFonts w:ascii="Arial" w:cs="Arial" w:eastAsia="Arial" w:hAnsi="Arial"/>
+                <w:sz w:val="19"/>
+                <w:szCs w:val="19"/>
+              </w:rPr>
+              <w:t xml:space="preserve">Anillo de foco en azul secundario alrededor del elemento.</w:t>
+            </w:r>
+          </w:p>
+        </w:tc>
+      </w:tr>
+      <w:tr>
+        <w:trPr>
+          <w:tblHeader w:val="false"/>
+        </w:trPr>
+        <w:tc>
+          <w:tcPr>
+            <w:tcW w:type="dxa" w:w="1700"/>
+            <w:shd w:fill="F2F2F2" w:val="clear"/>
+            <w:tcMar>
+              <w:top w:type="dxa" w:w="40"/>
+              <w:left w:type="dxa" w:w="70"/>
+              <w:bottom w:type="dxa" w:w="40"/>
+              <w:right w:type="dxa" w:w="70"/>
+            </w:tcMar>
+          </w:tcPr>
+          <w:p>
+            <w:pPr>
+              <w:spacing w:after="0" w:line="236"/>
+            </w:pPr>
+            <w:r>
+              <w:rPr>
+                <w:rFonts w:ascii="Arial" w:cs="Arial" w:eastAsia="Arial" w:hAnsi="Arial"/>
+                <w:sz w:val="19"/>
+                <w:szCs w:val="19"/>
+              </w:rPr>
+              <w:t xml:space="preserve">Presionado</w:t>
+            </w:r>
+          </w:p>
+        </w:tc>
+        <w:tc>
+          <w:tcPr>
+            <w:tcW w:type="dxa" w:w="4000"/>
+            <w:shd w:fill="F2F2F2" w:val="clear"/>
+            <w:tcMar>
+              <w:top w:type="dxa" w:w="40"/>
+              <w:left w:type="dxa" w:w="70"/>
+              <w:bottom w:type="dxa" w:w="40"/>
+              <w:right w:type="dxa" w:w="70"/>
+            </w:tcMar>
+          </w:tcPr>
+          <w:p>
+            <w:pPr>
+              <w:spacing w:after="0" w:line="236"/>
+            </w:pPr>
+            <w:r>
+              <w:rPr>
+                <w:rFonts w:ascii="Arial" w:cs="Arial" w:eastAsia="Arial" w:hAnsi="Arial"/>
+                <w:sz w:val="19"/>
+                <w:szCs w:val="19"/>
+              </w:rPr>
+              <w:t xml:space="preserve">El usuario mantiene pulsado el elemento.</w:t>
+            </w:r>
+          </w:p>
+        </w:tc>
+        <w:tc>
+          <w:tcPr>
+            <w:tcW w:type="dxa" w:w="3660"/>
+            <w:shd w:fill="F2F2F2" w:val="clear"/>
+            <w:tcMar>
+              <w:top w:type="dxa" w:w="40"/>
+              <w:left w:type="dxa" w:w="70"/>
+              <w:bottom w:type="dxa" w:w="40"/>
+              <w:right w:type="dxa" w:w="70"/>
+            </w:tcMar>
+          </w:tcPr>
+          <w:p>
+            <w:pPr>
+              <w:spacing w:after="0" w:line="236"/>
+            </w:pPr>
+            <w:r>
+              <w:rPr>
+                <w:rFonts w:ascii="Arial" w:cs="Arial" w:eastAsia="Arial" w:hAnsi="Arial"/>
+                <w:sz w:val="19"/>
+                <w:szCs w:val="19"/>
+              </w:rPr>
+              <w:t xml:space="preserve">Tono más oscuro y leve reducción de la sombra.</w:t>
+            </w:r>
+          </w:p>
+        </w:tc>
+      </w:tr>
+      <w:tr>
+        <w:trPr>
+          <w:tblHeader w:val="false"/>
+        </w:trPr>
+        <w:tc>
+          <w:tcPr>
+            <w:tcW w:type="dxa" w:w="1700"/>
+            <w:shd w:fill="FFFFFF" w:val="clear"/>
+            <w:tcMar>
+              <w:top w:type="dxa" w:w="40"/>
+              <w:left w:type="dxa" w:w="70"/>
+              <w:bottom w:type="dxa" w:w="40"/>
+              <w:right w:type="dxa" w:w="70"/>
+            </w:tcMar>
+          </w:tcPr>
+          <w:p>
+            <w:pPr>
+              <w:spacing w:after="0" w:line="236"/>
+            </w:pPr>
+            <w:r>
+              <w:rPr>
+                <w:rFonts w:ascii="Arial" w:cs="Arial" w:eastAsia="Arial" w:hAnsi="Arial"/>
+                <w:sz w:val="19"/>
+                <w:szCs w:val="19"/>
+              </w:rPr>
+              <w:t xml:space="preserve">Deshabilitado</w:t>
+            </w:r>
+          </w:p>
+        </w:tc>
+        <w:tc>
+          <w:tcPr>
+            <w:tcW w:type="dxa" w:w="4000"/>
+            <w:shd w:fill="FFFFFF" w:val="clear"/>
+            <w:tcMar>
+              <w:top w:type="dxa" w:w="40"/>
+              <w:left w:type="dxa" w:w="70"/>
+              <w:bottom w:type="dxa" w:w="40"/>
+              <w:right w:type="dxa" w:w="70"/>
+            </w:tcMar>
+          </w:tcPr>
+          <w:p>
+            <w:pPr>
+              <w:spacing w:after="0" w:line="236"/>
+            </w:pPr>
+            <w:r>
+              <w:rPr>
+                <w:rFonts w:ascii="Arial" w:cs="Arial" w:eastAsia="Arial" w:hAnsi="Arial"/>
+                <w:sz w:val="19"/>
+                <w:szCs w:val="19"/>
+              </w:rPr>
+              <w:t xml:space="preserve">La acción no está permitida en ese momento.</w:t>
+            </w:r>
+          </w:p>
+        </w:tc>
+        <w:tc>
+          <w:tcPr>
+            <w:tcW w:type="dxa" w:w="3660"/>
+            <w:shd w:fill="FFFFFF" w:val="clear"/>
+            <w:tcMar>
+              <w:top w:type="dxa" w:w="40"/>
+              <w:left w:type="dxa" w:w="70"/>
+              <w:bottom w:type="dxa" w:w="40"/>
+              <w:right w:type="dxa" w:w="70"/>
+            </w:tcMar>
+          </w:tcPr>
+          <w:p>
+            <w:pPr>
+              <w:spacing w:after="0" w:line="236"/>
+            </w:pPr>
+            <w:r>
+              <w:rPr>
+                <w:rFonts w:ascii="Arial" w:cs="Arial" w:eastAsia="Arial" w:hAnsi="Arial"/>
+                <w:sz w:val="19"/>
+                <w:szCs w:val="19"/>
+              </w:rPr>
+              <w:t xml:space="preserve">Colores atenuados y cursor no disponible.</w:t>
+            </w:r>
+          </w:p>
+        </w:tc>
+      </w:tr>
+      <w:tr>
+        <w:trPr>
+          <w:tblHeader w:val="false"/>
+        </w:trPr>
+        <w:tc>
+          <w:tcPr>
+            <w:tcW w:type="dxa" w:w="1700"/>
+            <w:shd w:fill="F2F2F2" w:val="clear"/>
+            <w:tcMar>
+              <w:top w:type="dxa" w:w="40"/>
+              <w:left w:type="dxa" w:w="70"/>
+              <w:bottom w:type="dxa" w:w="40"/>
+              <w:right w:type="dxa" w:w="70"/>
+            </w:tcMar>
+          </w:tcPr>
+          <w:p>
+            <w:pPr>
+              <w:spacing w:after="0" w:line="236"/>
+            </w:pPr>
+            <w:r>
+              <w:rPr>
+                <w:rFonts w:ascii="Arial" w:cs="Arial" w:eastAsia="Arial" w:hAnsi="Arial"/>
+                <w:sz w:val="19"/>
+                <w:szCs w:val="19"/>
+              </w:rPr>
+              <w:t xml:space="preserve">En proceso</w:t>
+            </w:r>
+          </w:p>
+        </w:tc>
+        <w:tc>
+          <w:tcPr>
+            <w:tcW w:type="dxa" w:w="4000"/>
+            <w:shd w:fill="F2F2F2" w:val="clear"/>
+            <w:tcMar>
+              <w:top w:type="dxa" w:w="40"/>
+              <w:left w:type="dxa" w:w="70"/>
+              <w:bottom w:type="dxa" w:w="40"/>
+              <w:right w:type="dxa" w:w="70"/>
+            </w:tcMar>
+          </w:tcPr>
+          <w:p>
+            <w:pPr>
+              <w:spacing w:after="0" w:line="236"/>
+            </w:pPr>
+            <w:r>
+              <w:rPr>
+                <w:rFonts w:ascii="Arial" w:cs="Arial" w:eastAsia="Arial" w:hAnsi="Arial"/>
+                <w:sz w:val="19"/>
+                <w:szCs w:val="19"/>
+              </w:rPr>
+              <w:t xml:space="preserve">La acción se está ejecutando.</w:t>
+            </w:r>
+          </w:p>
+        </w:tc>
+        <w:tc>
+          <w:tcPr>
+            <w:tcW w:type="dxa" w:w="3660"/>
+            <w:shd w:fill="F2F2F2" w:val="clear"/>
+            <w:tcMar>
+              <w:top w:type="dxa" w:w="40"/>
+              <w:left w:type="dxa" w:w="70"/>
+              <w:bottom w:type="dxa" w:w="40"/>
+              <w:right w:type="dxa" w:w="70"/>
+            </w:tcMar>
+          </w:tcPr>
+          <w:p>
+            <w:pPr>
+              <w:spacing w:after="0" w:line="236"/>
+            </w:pPr>
+            <w:r>
+              <w:rPr>
+                <w:rFonts w:ascii="Arial" w:cs="Arial" w:eastAsia="Arial" w:hAnsi="Arial"/>
+                <w:sz w:val="19"/>
+                <w:szCs w:val="19"/>
+              </w:rPr>
+              <w:t xml:space="preserve">Indicador de carga y bloqueo temporal del botón.</w:t>
+            </w:r>
+          </w:p>
+        </w:tc>
+      </w:tr>
+      <w:tr>
+        <w:trPr>
+          <w:tblHeader w:val="false"/>
+        </w:trPr>
+        <w:tc>
+          <w:tcPr>
+            <w:tcW w:type="dxa" w:w="1700"/>
+            <w:shd w:fill="FFFFFF" w:val="clear"/>
+            <w:tcMar>
+              <w:top w:type="dxa" w:w="40"/>
+              <w:left w:type="dxa" w:w="70"/>
+              <w:bottom w:type="dxa" w:w="40"/>
+              <w:right w:type="dxa" w:w="70"/>
+            </w:tcMar>
+          </w:tcPr>
+          <w:p>
+            <w:pPr>
+              <w:spacing w:after="0" w:line="236"/>
+            </w:pPr>
+            <w:r>
+              <w:rPr>
+                <w:rFonts w:ascii="Arial" w:cs="Arial" w:eastAsia="Arial" w:hAnsi="Arial"/>
+                <w:sz w:val="19"/>
+                <w:szCs w:val="19"/>
+              </w:rPr>
+              <w:t xml:space="preserve">Error</w:t>
+            </w:r>
+          </w:p>
+        </w:tc>
+        <w:tc>
+          <w:tcPr>
+            <w:tcW w:type="dxa" w:w="4000"/>
+            <w:shd w:fill="FFFFFF" w:val="clear"/>
+            <w:tcMar>
+              <w:top w:type="dxa" w:w="40"/>
+              <w:left w:type="dxa" w:w="70"/>
+              <w:bottom w:type="dxa" w:w="40"/>
+              <w:right w:type="dxa" w:w="70"/>
+            </w:tcMar>
+          </w:tcPr>
+          <w:p>
+            <w:pPr>
+              <w:spacing w:after="0" w:line="236"/>
+            </w:pPr>
+            <w:r>
+              <w:rPr>
+                <w:rFonts w:ascii="Arial" w:cs="Arial" w:eastAsia="Arial" w:hAnsi="Arial"/>
+                <w:sz w:val="19"/>
+                <w:szCs w:val="19"/>
+              </w:rPr>
+              <w:t xml:space="preserve">El dato ingresado no cumple una validación.</w:t>
+            </w:r>
+          </w:p>
+        </w:tc>
+        <w:tc>
+          <w:tcPr>
+            <w:tcW w:type="dxa" w:w="3660"/>
+            <w:shd w:fill="FFFFFF" w:val="clear"/>
+            <w:tcMar>
+              <w:top w:type="dxa" w:w="40"/>
+              <w:left w:type="dxa" w:w="70"/>
+              <w:bottom w:type="dxa" w:w="40"/>
+              <w:right w:type="dxa" w:w="70"/>
+            </w:tcMar>
+          </w:tcPr>
+          <w:p>
+            <w:pPr>
+              <w:spacing w:after="0" w:line="236"/>
+            </w:pPr>
+            <w:r>
+              <w:rPr>
+                <w:rFonts w:ascii="Arial" w:cs="Arial" w:eastAsia="Arial" w:hAnsi="Arial"/>
+                <w:sz w:val="19"/>
+                <w:szCs w:val="19"/>
+              </w:rPr>
+              <w:t xml:space="preserve">Borde en color de peligro y mensaje explicativo.</w:t>
+            </w:r>
+          </w:p>
+        </w:tc>
+      </w:tr>
+    </w:tbl>
+    <w:p>
+      <w:pPr>
+        <w:pStyle w:val="Heading2"/>
+        <w:spacing w:after="80" w:before="150"/>
+      </w:pPr>
+      <w:bookmarkStart w:name="bm16" w:id="16"/>
+      <w:r>
+        <w:rPr>
+          <w:rFonts w:ascii="Arial" w:cs="Arial" w:eastAsia="Arial" w:hAnsi="Arial"/>
+          <w:b/>
+          <w:bCs/>
+          <w:color w:val="2E5496"/>
+          <w:sz w:val="23"/>
+          <w:szCs w:val="23"/>
+        </w:rPr>
+        <w:t xml:space="preserve">6.2 Botones</w:t>
+      </w:r>
+      <w:bookmarkEnd w:id="16"/>
+    </w:p>
+    <w:p>
+      <w:pPr>
+        <w:spacing w:after="110" w:line="262"/>
+        <w:jc w:val="both"/>
+      </w:pPr>
+      <w:r>
+        <w:rPr>
+          <w:rFonts w:ascii="Arial" w:cs="Arial" w:eastAsia="Arial" w:hAnsi="Arial"/>
+          <w:sz w:val="22"/>
+          <w:szCs w:val="22"/>
+        </w:rPr>
+        <w:t xml:space="preserve">Los botones concentran las acciones de cada pantalla. Se definen cuatro variantes, diferenciadas por su importancia dentro del flujo:</w:t>
+      </w:r>
+    </w:p>
+    <w:tbl>
+      <w:tblPr>
+        <w:tblW w:type="dxa" w:w="9360"/>
+        <w:tblBorders>
+          <w:top w:val="single" w:color="9CA3AF" w:sz="6"/>
+          <w:left w:val="single" w:color="9CA3AF" w:sz="6"/>
+          <w:bottom w:val="single" w:color="9CA3AF" w:sz="6"/>
+          <w:right w:val="single" w:color="9CA3AF" w:sz="6"/>
+          <w:insideH w:val="single" w:color="9CA3AF" w:sz="6"/>
+          <w:insideV w:val="single" w:color="9CA3AF" w:sz="6"/>
+        </w:tblBorders>
+        <w:tblLayout w:type="fixed"/>
+      </w:tblPr>
+      <w:tblGrid>
+        <w:gridCol w:w="1700"/>
+        <w:gridCol w:w="4600"/>
+        <w:gridCol w:w="3060"/>
+      </w:tblGrid>
+      <w:tr>
+        <w:trPr>
+          <w:tblHeader/>
+        </w:trPr>
+        <w:tc>
+          <w:tcPr>
+            <w:tcW w:type="dxa" w:w="1700"/>
+            <w:shd w:fill="1F3864" w:val="clear"/>
+            <w:tcMar>
+              <w:top w:type="dxa" w:w="40"/>
+              <w:left w:type="dxa" w:w="70"/>
+              <w:bottom w:type="dxa" w:w="40"/>
+              <w:right w:type="dxa" w:w="70"/>
+            </w:tcMar>
+          </w:tcPr>
+          <w:p>
+            <w:pPr>
+              <w:spacing w:after="0" w:line="236"/>
+            </w:pPr>
+            <w:r>
+              <w:rPr>
+                <w:rFonts w:ascii="Arial" w:cs="Arial" w:eastAsia="Arial" w:hAnsi="Arial"/>
+                <w:b/>
+                <w:bCs/>
+                <w:color w:val="FFFFFF"/>
+                <w:sz w:val="19"/>
+                <w:szCs w:val="19"/>
+              </w:rPr>
+              <w:t xml:space="preserve">Variante</w:t>
+            </w:r>
+          </w:p>
+        </w:tc>
+        <w:tc>
+          <w:tcPr>
+            <w:tcW w:type="dxa" w:w="4600"/>
+            <w:shd w:fill="1F3864" w:val="clear"/>
+            <w:tcMar>
+              <w:top w:type="dxa" w:w="40"/>
+              <w:left w:type="dxa" w:w="70"/>
+              <w:bottom w:type="dxa" w:w="40"/>
+              <w:right w:type="dxa" w:w="70"/>
+            </w:tcMar>
+          </w:tcPr>
+          <w:p>
+            <w:pPr>
+              <w:spacing w:after="0" w:line="236"/>
+            </w:pPr>
+            <w:r>
+              <w:rPr>
+                <w:rFonts w:ascii="Arial" w:cs="Arial" w:eastAsia="Arial" w:hAnsi="Arial"/>
+                <w:b/>
+                <w:bCs/>
+                <w:color w:val="FFFFFF"/>
+                <w:sz w:val="19"/>
+                <w:szCs w:val="19"/>
+              </w:rPr>
+              <w:t xml:space="preserve">Uso</w:t>
+            </w:r>
+          </w:p>
+        </w:tc>
+        <w:tc>
+          <w:tcPr>
+            <w:tcW w:type="dxa" w:w="3060"/>
+            <w:shd w:fill="1F3864" w:val="clear"/>
+            <w:tcMar>
+              <w:top w:type="dxa" w:w="40"/>
+              <w:left w:type="dxa" w:w="70"/>
+              <w:bottom w:type="dxa" w:w="40"/>
+              <w:right w:type="dxa" w:w="70"/>
+            </w:tcMar>
+          </w:tcPr>
+          <w:p>
+            <w:pPr>
+              <w:spacing w:after="0" w:line="236"/>
+            </w:pPr>
+            <w:r>
+              <w:rPr>
+                <w:rFonts w:ascii="Arial" w:cs="Arial" w:eastAsia="Arial" w:hAnsi="Arial"/>
+                <w:b/>
+                <w:bCs/>
+                <w:color w:val="FFFFFF"/>
+                <w:sz w:val="19"/>
+                <w:szCs w:val="19"/>
+              </w:rPr>
+              <w:t xml:space="preserve">Color</w:t>
+            </w:r>
+          </w:p>
+        </w:tc>
+      </w:tr>
+      <w:tr>
+        <w:trPr>
+          <w:tblHeader w:val="false"/>
+        </w:trPr>
+        <w:tc>
+          <w:tcPr>
+            <w:tcW w:type="dxa" w:w="1700"/>
+            <w:shd w:fill="FFFFFF" w:val="clear"/>
+            <w:tcMar>
+              <w:top w:type="dxa" w:w="40"/>
+              <w:left w:type="dxa" w:w="70"/>
+              <w:bottom w:type="dxa" w:w="40"/>
+              <w:right w:type="dxa" w:w="70"/>
+            </w:tcMar>
+          </w:tcPr>
+          <w:p>
+            <w:pPr>
+              <w:spacing w:after="0" w:line="236"/>
+            </w:pPr>
+            <w:r>
+              <w:rPr>
+                <w:rFonts w:ascii="Arial" w:cs="Arial" w:eastAsia="Arial" w:hAnsi="Arial"/>
+                <w:sz w:val="19"/>
+                <w:szCs w:val="19"/>
+              </w:rPr>
+              <w:t xml:space="preserve">Primario</w:t>
+            </w:r>
+          </w:p>
+        </w:tc>
+        <w:tc>
+          <w:tcPr>
+            <w:tcW w:type="dxa" w:w="4600"/>
+            <w:shd w:fill="FFFFFF" w:val="clear"/>
+            <w:tcMar>
+              <w:top w:type="dxa" w:w="40"/>
+              <w:left w:type="dxa" w:w="70"/>
+              <w:bottom w:type="dxa" w:w="40"/>
+              <w:right w:type="dxa" w:w="70"/>
+            </w:tcMar>
+          </w:tcPr>
+          <w:p>
+            <w:pPr>
+              <w:spacing w:after="0" w:line="236"/>
+            </w:pPr>
+            <w:r>
+              <w:rPr>
+                <w:rFonts w:ascii="Arial" w:cs="Arial" w:eastAsia="Arial" w:hAnsi="Arial"/>
+                <w:sz w:val="19"/>
+                <w:szCs w:val="19"/>
+              </w:rPr>
+              <w:t xml:space="preserve">Acción principal de la pantalla: registrar venta, guardar, confirmar.</w:t>
+            </w:r>
+          </w:p>
+        </w:tc>
+        <w:tc>
+          <w:tcPr>
+            <w:tcW w:type="dxa" w:w="3060"/>
+            <w:shd w:fill="FFFFFF" w:val="clear"/>
+            <w:tcMar>
+              <w:top w:type="dxa" w:w="40"/>
+              <w:left w:type="dxa" w:w="70"/>
+              <w:bottom w:type="dxa" w:w="40"/>
+              <w:right w:type="dxa" w:w="70"/>
+            </w:tcMar>
+          </w:tcPr>
+          <w:p>
+            <w:pPr>
+              <w:spacing w:after="0" w:line="236"/>
+            </w:pPr>
+            <w:r>
+              <w:rPr>
+                <w:rFonts w:ascii="Arial" w:cs="Arial" w:eastAsia="Arial" w:hAnsi="Arial"/>
+                <w:sz w:val="19"/>
+                <w:szCs w:val="19"/>
+              </w:rPr>
+              <w:t xml:space="preserve">CTA verde con texto blanco.</w:t>
+            </w:r>
+          </w:p>
+        </w:tc>
+      </w:tr>
+      <w:tr>
+        <w:trPr>
+          <w:tblHeader w:val="false"/>
+        </w:trPr>
+        <w:tc>
+          <w:tcPr>
+            <w:tcW w:type="dxa" w:w="1700"/>
+            <w:shd w:fill="F2F2F2" w:val="clear"/>
+            <w:tcMar>
+              <w:top w:type="dxa" w:w="40"/>
+              <w:left w:type="dxa" w:w="70"/>
+              <w:bottom w:type="dxa" w:w="40"/>
+              <w:right w:type="dxa" w:w="70"/>
+            </w:tcMar>
+          </w:tcPr>
+          <w:p>
+            <w:pPr>
+              <w:spacing w:after="0" w:line="236"/>
+            </w:pPr>
+            <w:r>
+              <w:rPr>
+                <w:rFonts w:ascii="Arial" w:cs="Arial" w:eastAsia="Arial" w:hAnsi="Arial"/>
+                <w:sz w:val="19"/>
+                <w:szCs w:val="19"/>
+              </w:rPr>
+              <w:t xml:space="preserve">Secundario</w:t>
+            </w:r>
+          </w:p>
+        </w:tc>
+        <w:tc>
+          <w:tcPr>
+            <w:tcW w:type="dxa" w:w="4600"/>
+            <w:shd w:fill="F2F2F2" w:val="clear"/>
+            <w:tcMar>
+              <w:top w:type="dxa" w:w="40"/>
+              <w:left w:type="dxa" w:w="70"/>
+              <w:bottom w:type="dxa" w:w="40"/>
+              <w:right w:type="dxa" w:w="70"/>
+            </w:tcMar>
+          </w:tcPr>
+          <w:p>
+            <w:pPr>
+              <w:spacing w:after="0" w:line="236"/>
+            </w:pPr>
+            <w:r>
+              <w:rPr>
+                <w:rFonts w:ascii="Arial" w:cs="Arial" w:eastAsia="Arial" w:hAnsi="Arial"/>
+                <w:sz w:val="19"/>
+                <w:szCs w:val="19"/>
+              </w:rPr>
+              <w:t xml:space="preserve">Acciones de apoyo: cancelar, volver, exportar.</w:t>
+            </w:r>
+          </w:p>
+        </w:tc>
+        <w:tc>
+          <w:tcPr>
+            <w:tcW w:type="dxa" w:w="3060"/>
+            <w:shd w:fill="F2F2F2" w:val="clear"/>
+            <w:tcMar>
+              <w:top w:type="dxa" w:w="40"/>
+              <w:left w:type="dxa" w:w="70"/>
+              <w:bottom w:type="dxa" w:w="40"/>
+              <w:right w:type="dxa" w:w="70"/>
+            </w:tcMar>
+          </w:tcPr>
+          <w:p>
+            <w:pPr>
+              <w:spacing w:after="0" w:line="236"/>
+            </w:pPr>
+            <w:r>
+              <w:rPr>
+                <w:rFonts w:ascii="Arial" w:cs="Arial" w:eastAsia="Arial" w:hAnsi="Arial"/>
+                <w:sz w:val="19"/>
+                <w:szCs w:val="19"/>
+              </w:rPr>
+              <w:t xml:space="preserve">Fondo claro con borde y texto en azul secundario.</w:t>
+            </w:r>
+          </w:p>
+        </w:tc>
+      </w:tr>
+      <w:tr>
+        <w:trPr>
+          <w:tblHeader w:val="false"/>
+        </w:trPr>
+        <w:tc>
+          <w:tcPr>
+            <w:tcW w:type="dxa" w:w="1700"/>
+            <w:shd w:fill="FFFFFF" w:val="clear"/>
+            <w:tcMar>
+              <w:top w:type="dxa" w:w="40"/>
+              <w:left w:type="dxa" w:w="70"/>
+              <w:bottom w:type="dxa" w:w="40"/>
+              <w:right w:type="dxa" w:w="70"/>
+            </w:tcMar>
+          </w:tcPr>
+          <w:p>
+            <w:pPr>
+              <w:spacing w:after="0" w:line="236"/>
+            </w:pPr>
+            <w:r>
+              <w:rPr>
+                <w:rFonts w:ascii="Arial" w:cs="Arial" w:eastAsia="Arial" w:hAnsi="Arial"/>
+                <w:sz w:val="19"/>
+                <w:szCs w:val="19"/>
+              </w:rPr>
+              <w:t xml:space="preserve">De texto</w:t>
+            </w:r>
+          </w:p>
+        </w:tc>
+        <w:tc>
+          <w:tcPr>
+            <w:tcW w:type="dxa" w:w="4600"/>
+            <w:shd w:fill="FFFFFF" w:val="clear"/>
+            <w:tcMar>
+              <w:top w:type="dxa" w:w="40"/>
+              <w:left w:type="dxa" w:w="70"/>
+              <w:bottom w:type="dxa" w:w="40"/>
+              <w:right w:type="dxa" w:w="70"/>
+            </w:tcMar>
+          </w:tcPr>
+          <w:p>
+            <w:pPr>
+              <w:spacing w:after="0" w:line="236"/>
+            </w:pPr>
+            <w:r>
+              <w:rPr>
+                <w:rFonts w:ascii="Arial" w:cs="Arial" w:eastAsia="Arial" w:hAnsi="Arial"/>
+                <w:sz w:val="19"/>
+                <w:szCs w:val="19"/>
+              </w:rPr>
+              <w:t xml:space="preserve">Acciones de baja jerarquía y enlaces dentro de un bloque.</w:t>
+            </w:r>
+          </w:p>
+        </w:tc>
+        <w:tc>
+          <w:tcPr>
+            <w:tcW w:type="dxa" w:w="3060"/>
+            <w:shd w:fill="FFFFFF" w:val="clear"/>
+            <w:tcMar>
+              <w:top w:type="dxa" w:w="40"/>
+              <w:left w:type="dxa" w:w="70"/>
+              <w:bottom w:type="dxa" w:w="40"/>
+              <w:right w:type="dxa" w:w="70"/>
+            </w:tcMar>
+          </w:tcPr>
+          <w:p>
+            <w:pPr>
+              <w:spacing w:after="0" w:line="236"/>
+            </w:pPr>
+            <w:r>
+              <w:rPr>
+                <w:rFonts w:ascii="Arial" w:cs="Arial" w:eastAsia="Arial" w:hAnsi="Arial"/>
+                <w:sz w:val="19"/>
+                <w:szCs w:val="19"/>
+              </w:rPr>
+              <w:t xml:space="preserve">Sin fondo ni borde, texto en azul secundario.</w:t>
+            </w:r>
+          </w:p>
+        </w:tc>
+      </w:tr>
+      <w:tr>
+        <w:trPr>
+          <w:tblHeader w:val="false"/>
+        </w:trPr>
+        <w:tc>
+          <w:tcPr>
+            <w:tcW w:type="dxa" w:w="1700"/>
+            <w:shd w:fill="F2F2F2" w:val="clear"/>
+            <w:tcMar>
+              <w:top w:type="dxa" w:w="40"/>
+              <w:left w:type="dxa" w:w="70"/>
+              <w:bottom w:type="dxa" w:w="40"/>
+              <w:right w:type="dxa" w:w="70"/>
+            </w:tcMar>
+          </w:tcPr>
+          <w:p>
+            <w:pPr>
+              <w:spacing w:after="0" w:line="236"/>
+            </w:pPr>
+            <w:r>
+              <w:rPr>
+                <w:rFonts w:ascii="Arial" w:cs="Arial" w:eastAsia="Arial" w:hAnsi="Arial"/>
+                <w:sz w:val="19"/>
+                <w:szCs w:val="19"/>
+              </w:rPr>
+              <w:t xml:space="preserve">De peligro</w:t>
+            </w:r>
+          </w:p>
+        </w:tc>
+        <w:tc>
+          <w:tcPr>
+            <w:tcW w:type="dxa" w:w="4600"/>
+            <w:shd w:fill="F2F2F2" w:val="clear"/>
+            <w:tcMar>
+              <w:top w:type="dxa" w:w="40"/>
+              <w:left w:type="dxa" w:w="70"/>
+              <w:bottom w:type="dxa" w:w="40"/>
+              <w:right w:type="dxa" w:w="70"/>
+            </w:tcMar>
+          </w:tcPr>
+          <w:p>
+            <w:pPr>
+              <w:spacing w:after="0" w:line="236"/>
+            </w:pPr>
+            <w:r>
+              <w:rPr>
+                <w:rFonts w:ascii="Arial" w:cs="Arial" w:eastAsia="Arial" w:hAnsi="Arial"/>
+                <w:sz w:val="19"/>
+                <w:szCs w:val="19"/>
+              </w:rPr>
+              <w:t xml:space="preserve">Acciones destructivas o irreversibles: anular, eliminar.</w:t>
+            </w:r>
+          </w:p>
+        </w:tc>
+        <w:tc>
+          <w:tcPr>
+            <w:tcW w:type="dxa" w:w="3060"/>
+            <w:shd w:fill="F2F2F2" w:val="clear"/>
+            <w:tcMar>
+              <w:top w:type="dxa" w:w="40"/>
+              <w:left w:type="dxa" w:w="70"/>
+              <w:bottom w:type="dxa" w:w="40"/>
+              <w:right w:type="dxa" w:w="70"/>
+            </w:tcMar>
+          </w:tcPr>
+          <w:p>
+            <w:pPr>
+              <w:spacing w:after="0" w:line="236"/>
+            </w:pPr>
+            <w:r>
+              <w:rPr>
+                <w:rFonts w:ascii="Arial" w:cs="Arial" w:eastAsia="Arial" w:hAnsi="Arial"/>
+                <w:sz w:val="19"/>
+                <w:szCs w:val="19"/>
+              </w:rPr>
+              <w:t xml:space="preserve">Rojo de peligro con texto blanco.</w:t>
+            </w:r>
+          </w:p>
+        </w:tc>
+      </w:tr>
+    </w:tbl>
+    <w:p>
+      <w:pPr>
+        <w:spacing w:after="20" w:before="60"/>
+        <w:jc w:val="center"/>
+      </w:pPr>
+      <w:r>
+        <w:drawing>
+          <wp:inline distT="0" distB="0" distL="0" distR="0">
+            <wp:extent cx="5905500" cy="2419350"/>
+            <wp:effectExtent t="0" r="0" b="0" l="0"/>
+            <wp:docPr id="1" name="" descr="" title=""/>
+            <wp:cNvGraphicFramePr>
+              <a:graphicFrameLocks xmlns:a="http://schemas.openxmlformats.org/drawingml/2006/main" noChangeAspect="1"/>
+            </wp:cNvGraphicFramePr>
+            <a:graphic xmlns:a="http://schemas.openxmlformats.org/drawingml/2006/main">
+              <a:graphicData uri="http://schemas.openxmlformats.org/drawingml/2006/picture">
+                <pic:pic xmlns:pic="http://schemas.openxmlformats.org/drawingml/2006/picture">
+                  <pic:nvPicPr>
+                    <pic:cNvPr id="0" name="" descr=""/>
+                    <pic:cNvPicPr>
+                      <a:picLocks noChangeAspect="1" noChangeArrowheads="1"/>
+                    </pic:cNvPicPr>
+                  </pic:nvPicPr>
+                  <pic:blipFill>
+                    <a:blip r:embed="rId10" cstate="none"/>
+                    <a:srcRect/>
+                    <a:stretch>
+                      <a:fillRect/>
+                    </a:stretch>
+                  </pic:blipFill>
+                  <pic:spPr bwMode="auto">
+                    <a:xfrm>
+                      <a:off x="0" y="0"/>
+                      <a:ext cx="5905500" cy="2419350"/>
+                    </a:xfrm>
+                    <a:prstGeom prst="rect">
+                      <a:avLst/>
+                    </a:prstGeom>
+                  </pic:spPr>
+                </pic:pic>
+              </a:graphicData>
+            </a:graphic>
+          </wp:inline>
+        </w:drawing>
+      </w:r>
+    </w:p>
+    <w:p>
+      <w:pPr>
+        <w:spacing w:after="150" w:before="6"/>
+        <w:jc w:val="center"/>
+      </w:pPr>
+      <w:r>
+        <w:rPr>
+          <w:rFonts w:ascii="Arial" w:cs="Arial" w:eastAsia="Arial" w:hAnsi="Arial"/>
+          <w:i/>
+          <w:iCs/>
+          <w:color w:val="5B6678"/>
+          <w:sz w:val="18"/>
+          <w:szCs w:val="18"/>
+        </w:rPr>
+        <w:t xml:space="preserve">Figura 3. Variantes de botón y sus estados. Fuente: del autor.</w:t>
+      </w:r>
+    </w:p>
+    <w:p>
+      <w:pPr>
+        <w:spacing w:after="110" w:line="262"/>
+        <w:jc w:val="both"/>
+      </w:pPr>
+      <w:r>
+        <w:rPr>
+          <w:rFonts w:ascii="Arial" w:cs="Arial" w:eastAsia="Arial" w:hAnsi="Arial"/>
+          <w:sz w:val="22"/>
+          <w:szCs w:val="22"/>
+        </w:rPr>
+        <w:t xml:space="preserve">Reglas de uso:</w:t>
+      </w:r>
+    </w:p>
+    <w:p>
+      <w:pPr>
+        <w:pStyle w:val="ListParagraph"/>
+        <w:numPr>
+          <w:ilvl w:val="0"/>
+          <w:numId w:val="1"/>
+        </w:numPr>
+        <w:spacing w:after="60" w:line="258"/>
+      </w:pPr>
+      <w:r>
+        <w:rPr>
+          <w:rFonts w:ascii="Arial" w:cs="Arial" w:eastAsia="Arial" w:hAnsi="Arial"/>
+          <w:sz w:val="22"/>
+          <w:szCs w:val="22"/>
+        </w:rPr>
+        <w:t xml:space="preserve">Cada pantalla tiene una sola acción principal, expresada con un botón primario.</w:t>
+      </w:r>
+    </w:p>
+    <w:p>
+      <w:pPr>
+        <w:pStyle w:val="ListParagraph"/>
+        <w:numPr>
+          <w:ilvl w:val="0"/>
+          <w:numId w:val="1"/>
+        </w:numPr>
+        <w:spacing w:after="60" w:line="258"/>
+      </w:pPr>
+      <w:r>
+        <w:rPr>
+          <w:rFonts w:ascii="Arial" w:cs="Arial" w:eastAsia="Arial" w:hAnsi="Arial"/>
+          <w:sz w:val="22"/>
+          <w:szCs w:val="22"/>
+        </w:rPr>
+        <w:t xml:space="preserve">La etiqueta del botón nombra la acción que ejecuta (Guardar producto, Cobrar, Anular venta) y no expresiones genéricas.</w:t>
+      </w:r>
+    </w:p>
+    <w:p>
+      <w:pPr>
+        <w:pStyle w:val="ListParagraph"/>
+        <w:numPr>
+          <w:ilvl w:val="0"/>
+          <w:numId w:val="1"/>
+        </w:numPr>
+        <w:spacing w:after="60" w:line="258"/>
+      </w:pPr>
+      <w:r>
+        <w:rPr>
+          <w:rFonts w:ascii="Arial" w:cs="Arial" w:eastAsia="Arial" w:hAnsi="Arial"/>
+          <w:sz w:val="22"/>
+          <w:szCs w:val="22"/>
+        </w:rPr>
+        <w:t xml:space="preserve">En formularios y en la versión móvil el botón principal ocupa el ancho disponible.</w:t>
+      </w:r>
+    </w:p>
+    <w:p>
+      <w:pPr>
+        <w:pStyle w:val="ListParagraph"/>
+        <w:numPr>
+          <w:ilvl w:val="0"/>
+          <w:numId w:val="1"/>
+        </w:numPr>
+        <w:spacing w:after="60" w:line="258"/>
+      </w:pPr>
+      <w:r>
+        <w:rPr>
+          <w:rFonts w:ascii="Arial" w:cs="Arial" w:eastAsia="Arial" w:hAnsi="Arial"/>
+          <w:sz w:val="22"/>
+          <w:szCs w:val="22"/>
+        </w:rPr>
+        <w:t xml:space="preserve">Las acciones destructivas usan la variante de peligro y siempre solicitan confirmación.</w:t>
+      </w:r>
+    </w:p>
+    <w:p>
+      <w:pPr>
+        <w:pStyle w:val="Heading2"/>
+        <w:spacing w:after="80" w:before="150"/>
+      </w:pPr>
+      <w:bookmarkStart w:name="bm17" w:id="17"/>
+      <w:r>
+        <w:rPr>
+          <w:rFonts w:ascii="Arial" w:cs="Arial" w:eastAsia="Arial" w:hAnsi="Arial"/>
+          <w:b/>
+          <w:bCs/>
+          <w:color w:val="2E5496"/>
+          <w:sz w:val="23"/>
+          <w:szCs w:val="23"/>
+        </w:rPr>
+        <w:t xml:space="preserve">6.3 Campos de formulario</w:t>
+      </w:r>
+      <w:bookmarkEnd w:id="17"/>
+    </w:p>
+    <w:p>
+      <w:pPr>
+        <w:spacing w:after="110" w:line="262"/>
+        <w:jc w:val="both"/>
+      </w:pPr>
+      <w:r>
+        <w:rPr>
+          <w:rFonts w:ascii="Arial" w:cs="Arial" w:eastAsia="Arial" w:hAnsi="Arial"/>
+          <w:sz w:val="22"/>
+          <w:szCs w:val="22"/>
+        </w:rPr>
+        <w:t xml:space="preserve">Los campos comparten una misma estructura: etiqueta visible sobre el control, área de captura de altura uniforme y, debajo, el texto de ayuda o el mensaje de validación. La etiqueta no se reemplaza por el texto de ejemplo interno, que desaparece al escribir.</w:t>
+      </w:r>
+    </w:p>
+    <w:p>
+      <w:pPr>
+        <w:spacing w:after="20" w:before="60"/>
+        <w:jc w:val="center"/>
+      </w:pPr>
+      <w:r>
+        <w:drawing>
+          <wp:inline distT="0" distB="0" distL="0" distR="0">
+            <wp:extent cx="5905500" cy="2257425"/>
+            <wp:effectExtent t="0" r="0" b="0" l="0"/>
+            <wp:docPr id="1" name="" descr="" title=""/>
+            <wp:cNvGraphicFramePr>
+              <a:graphicFrameLocks xmlns:a="http://schemas.openxmlformats.org/drawingml/2006/main" noChangeAspect="1"/>
+            </wp:cNvGraphicFramePr>
+            <a:graphic xmlns:a="http://schemas.openxmlformats.org/drawingml/2006/main">
+              <a:graphicData uri="http://schemas.openxmlformats.org/drawingml/2006/picture">
+                <pic:pic xmlns:pic="http://schemas.openxmlformats.org/drawingml/2006/picture">
+                  <pic:nvPicPr>
+                    <pic:cNvPr id="0" name="" descr=""/>
+                    <pic:cNvPicPr>
+                      <a:picLocks noChangeAspect="1" noChangeArrowheads="1"/>
+                    </pic:cNvPicPr>
+                  </pic:nvPicPr>
+                  <pic:blipFill>
+                    <a:blip r:embed="rId11" cstate="none"/>
+                    <a:srcRect/>
+                    <a:stretch>
+                      <a:fillRect/>
+                    </a:stretch>
+                  </pic:blipFill>
+                  <pic:spPr bwMode="auto">
+                    <a:xfrm>
+                      <a:off x="0" y="0"/>
+                      <a:ext cx="5905500" cy="2257425"/>
+                    </a:xfrm>
+                    <a:prstGeom prst="rect">
+                      <a:avLst/>
+                    </a:prstGeom>
+                  </pic:spPr>
+                </pic:pic>
+              </a:graphicData>
+            </a:graphic>
+          </wp:inline>
+        </w:drawing>
+      </w:r>
+    </w:p>
+    <w:p>
+      <w:pPr>
+        <w:spacing w:after="150" w:before="6"/>
+        <w:jc w:val="center"/>
+      </w:pPr>
+      <w:r>
+        <w:rPr>
+          <w:rFonts w:ascii="Arial" w:cs="Arial" w:eastAsia="Arial" w:hAnsi="Arial"/>
+          <w:i/>
+          <w:iCs/>
+          <w:color w:val="5B6678"/>
+          <w:sz w:val="18"/>
+          <w:szCs w:val="18"/>
+        </w:rPr>
+        <w:t xml:space="preserve">Figura 4. Estados del campo de texto. Fuente: del autor.</w:t>
+      </w:r>
+    </w:p>
+    <w:p>
+      <w:pPr>
+        <w:pStyle w:val="ListParagraph"/>
+        <w:numPr>
+          <w:ilvl w:val="0"/>
+          <w:numId w:val="1"/>
+        </w:numPr>
+        <w:spacing w:after="60" w:line="258"/>
+      </w:pPr>
+      <w:r>
+        <w:rPr>
+          <w:rFonts w:ascii="Arial" w:cs="Arial" w:eastAsia="Arial" w:hAnsi="Arial"/>
+          <w:b/>
+          <w:bCs/>
+          <w:sz w:val="22"/>
+          <w:szCs w:val="22"/>
+        </w:rPr>
+        <w:t xml:space="preserve">Normal. </w:t>
+      </w:r>
+      <w:r>
+        <w:rPr>
+          <w:rFonts w:ascii="Arial" w:cs="Arial" w:eastAsia="Arial" w:hAnsi="Arial"/>
+          <w:sz w:val="22"/>
+          <w:szCs w:val="22"/>
+        </w:rPr>
+        <w:t xml:space="preserve">Borde neutro y texto de ejemplo en gris; el texto de ayuda describe el formato esperado.</w:t>
+      </w:r>
+    </w:p>
+    <w:p>
+      <w:pPr>
+        <w:pStyle w:val="ListParagraph"/>
+        <w:numPr>
+          <w:ilvl w:val="0"/>
+          <w:numId w:val="1"/>
+        </w:numPr>
+        <w:spacing w:after="60" w:line="258"/>
+      </w:pPr>
+      <w:r>
+        <w:rPr>
+          <w:rFonts w:ascii="Arial" w:cs="Arial" w:eastAsia="Arial" w:hAnsi="Arial"/>
+          <w:b/>
+          <w:bCs/>
+          <w:sz w:val="22"/>
+          <w:szCs w:val="22"/>
+        </w:rPr>
+        <w:t xml:space="preserve">Enfocado. </w:t>
+      </w:r>
+      <w:r>
+        <w:rPr>
+          <w:rFonts w:ascii="Arial" w:cs="Arial" w:eastAsia="Arial" w:hAnsi="Arial"/>
+          <w:sz w:val="22"/>
+          <w:szCs w:val="22"/>
+        </w:rPr>
+        <w:t xml:space="preserve">Borde en azul secundario y anillo de foco, visible también al navegar con el teclado.</w:t>
+      </w:r>
+    </w:p>
+    <w:p>
+      <w:pPr>
+        <w:pStyle w:val="ListParagraph"/>
+        <w:numPr>
+          <w:ilvl w:val="0"/>
+          <w:numId w:val="1"/>
+        </w:numPr>
+        <w:spacing w:after="60" w:line="258"/>
+      </w:pPr>
+      <w:r>
+        <w:rPr>
+          <w:rFonts w:ascii="Arial" w:cs="Arial" w:eastAsia="Arial" w:hAnsi="Arial"/>
+          <w:b/>
+          <w:bCs/>
+          <w:sz w:val="22"/>
+          <w:szCs w:val="22"/>
+        </w:rPr>
+        <w:t xml:space="preserve">Con error. </w:t>
+      </w:r>
+      <w:r>
+        <w:rPr>
+          <w:rFonts w:ascii="Arial" w:cs="Arial" w:eastAsia="Arial" w:hAnsi="Arial"/>
+          <w:sz w:val="22"/>
+          <w:szCs w:val="22"/>
+        </w:rPr>
+        <w:t xml:space="preserve">Borde en color de peligro y mensaje que indica la causa y la forma de corregirla.</w:t>
+      </w:r>
+    </w:p>
+    <w:p>
+      <w:pPr>
+        <w:pStyle w:val="ListParagraph"/>
+        <w:numPr>
+          <w:ilvl w:val="0"/>
+          <w:numId w:val="1"/>
+        </w:numPr>
+        <w:spacing w:after="60" w:line="258"/>
+      </w:pPr>
+      <w:r>
+        <w:rPr>
+          <w:rFonts w:ascii="Arial" w:cs="Arial" w:eastAsia="Arial" w:hAnsi="Arial"/>
+          <w:b/>
+          <w:bCs/>
+          <w:sz w:val="22"/>
+          <w:szCs w:val="22"/>
+        </w:rPr>
+        <w:t xml:space="preserve">Deshabilitado. </w:t>
+      </w:r>
+      <w:r>
+        <w:rPr>
+          <w:rFonts w:ascii="Arial" w:cs="Arial" w:eastAsia="Arial" w:hAnsi="Arial"/>
+          <w:sz w:val="22"/>
+          <w:szCs w:val="22"/>
+        </w:rPr>
+        <w:t xml:space="preserve">Fondo atenuado y contenido no editable; se emplea cuando el dato depende de otra selección.</w:t>
+      </w:r>
+    </w:p>
+    <w:p>
+      <w:pPr>
+        <w:spacing w:after="110" w:line="262"/>
+        <w:jc w:val="both"/>
+      </w:pPr>
+      <w:r>
+        <w:rPr>
+          <w:rFonts w:ascii="Arial" w:cs="Arial" w:eastAsia="Arial" w:hAnsi="Arial"/>
+          <w:sz w:val="22"/>
+          <w:szCs w:val="22"/>
+        </w:rPr>
+        <w:t xml:space="preserve">Además del campo de texto, se emplean listas desplegables, campos numéricos, selectores de fecha, casillas de verificación y el buscador con filtros. Todos conservan la misma altura, el mismo radio de esquina y los mismos estados.</w:t>
+      </w:r>
+    </w:p>
+    <w:p>
+      <w:pPr>
+        <w:pStyle w:val="Heading2"/>
+        <w:spacing w:after="80" w:before="150"/>
+      </w:pPr>
+      <w:bookmarkStart w:name="bm18" w:id="18"/>
+      <w:r>
+        <w:rPr>
+          <w:rFonts w:ascii="Arial" w:cs="Arial" w:eastAsia="Arial" w:hAnsi="Arial"/>
+          <w:b/>
+          <w:bCs/>
+          <w:color w:val="2E5496"/>
+          <w:sz w:val="23"/>
+          <w:szCs w:val="23"/>
+        </w:rPr>
+        <w:t xml:space="preserve">6.4 Mensajes, alertas y etiquetas de estado</w:t>
+      </w:r>
+      <w:bookmarkEnd w:id="18"/>
+    </w:p>
+    <w:p>
+      <w:pPr>
+        <w:spacing w:after="110" w:line="262"/>
+        <w:jc w:val="both"/>
+      </w:pPr>
+      <w:r>
+        <w:rPr>
+          <w:rFonts w:ascii="Arial" w:cs="Arial" w:eastAsia="Arial" w:hAnsi="Arial"/>
+          <w:sz w:val="22"/>
+          <w:szCs w:val="22"/>
+        </w:rPr>
+        <w:t xml:space="preserve">La retroalimentación al usuario se entrega mediante mensajes de bloque, ubicados dentro del contenido, y avisos emergentes de corta duración para las confirmaciones. El color y el icono identifican el tipo de mensaje:</w:t>
+      </w:r>
+    </w:p>
+    <w:tbl>
+      <w:tblPr>
+        <w:tblW w:type="dxa" w:w="9360"/>
+        <w:tblBorders>
+          <w:top w:val="single" w:color="9CA3AF" w:sz="6"/>
+          <w:left w:val="single" w:color="9CA3AF" w:sz="6"/>
+          <w:bottom w:val="single" w:color="9CA3AF" w:sz="6"/>
+          <w:right w:val="single" w:color="9CA3AF" w:sz="6"/>
+          <w:insideH w:val="single" w:color="9CA3AF" w:sz="6"/>
+          <w:insideV w:val="single" w:color="9CA3AF" w:sz="6"/>
+        </w:tblBorders>
+        <w:tblLayout w:type="fixed"/>
+      </w:tblPr>
+      <w:tblGrid>
+        <w:gridCol w:w="1700"/>
+        <w:gridCol w:w="2300"/>
+        <w:gridCol w:w="5360"/>
+      </w:tblGrid>
+      <w:tr>
+        <w:trPr>
+          <w:tblHeader/>
+        </w:trPr>
+        <w:tc>
+          <w:tcPr>
+            <w:tcW w:type="dxa" w:w="1700"/>
+            <w:shd w:fill="1F3864" w:val="clear"/>
+            <w:tcMar>
+              <w:top w:type="dxa" w:w="40"/>
+              <w:left w:type="dxa" w:w="70"/>
+              <w:bottom w:type="dxa" w:w="40"/>
+              <w:right w:type="dxa" w:w="70"/>
+            </w:tcMar>
+          </w:tcPr>
+          <w:p>
+            <w:pPr>
+              <w:spacing w:after="0" w:line="236"/>
+            </w:pPr>
+            <w:r>
+              <w:rPr>
+                <w:rFonts w:ascii="Arial" w:cs="Arial" w:eastAsia="Arial" w:hAnsi="Arial"/>
+                <w:b/>
+                <w:bCs/>
+                <w:color w:val="FFFFFF"/>
+                <w:sz w:val="19"/>
+                <w:szCs w:val="19"/>
+              </w:rPr>
+              <w:t xml:space="preserve">Tipo</w:t>
+            </w:r>
+          </w:p>
+        </w:tc>
+        <w:tc>
+          <w:tcPr>
+            <w:tcW w:type="dxa" w:w="2300"/>
+            <w:shd w:fill="1F3864" w:val="clear"/>
+            <w:tcMar>
+              <w:top w:type="dxa" w:w="40"/>
+              <w:left w:type="dxa" w:w="70"/>
+              <w:bottom w:type="dxa" w:w="40"/>
+              <w:right w:type="dxa" w:w="70"/>
+            </w:tcMar>
+          </w:tcPr>
+          <w:p>
+            <w:pPr>
+              <w:spacing w:after="0" w:line="236"/>
+            </w:pPr>
+            <w:r>
+              <w:rPr>
+                <w:rFonts w:ascii="Arial" w:cs="Arial" w:eastAsia="Arial" w:hAnsi="Arial"/>
+                <w:b/>
+                <w:bCs/>
+                <w:color w:val="FFFFFF"/>
+                <w:sz w:val="19"/>
+                <w:szCs w:val="19"/>
+              </w:rPr>
+              <w:t xml:space="preserve">Color</w:t>
+            </w:r>
+          </w:p>
+        </w:tc>
+        <w:tc>
+          <w:tcPr>
+            <w:tcW w:type="dxa" w:w="5360"/>
+            <w:shd w:fill="1F3864" w:val="clear"/>
+            <w:tcMar>
+              <w:top w:type="dxa" w:w="40"/>
+              <w:left w:type="dxa" w:w="70"/>
+              <w:bottom w:type="dxa" w:w="40"/>
+              <w:right w:type="dxa" w:w="70"/>
+            </w:tcMar>
+          </w:tcPr>
+          <w:p>
+            <w:pPr>
+              <w:spacing w:after="0" w:line="236"/>
+            </w:pPr>
+            <w:r>
+              <w:rPr>
+                <w:rFonts w:ascii="Arial" w:cs="Arial" w:eastAsia="Arial" w:hAnsi="Arial"/>
+                <w:b/>
+                <w:bCs/>
+                <w:color w:val="FFFFFF"/>
+                <w:sz w:val="19"/>
+                <w:szCs w:val="19"/>
+              </w:rPr>
+              <w:t xml:space="preserve">Uso</w:t>
+            </w:r>
+          </w:p>
+        </w:tc>
+      </w:tr>
+      <w:tr>
+        <w:trPr>
+          <w:tblHeader w:val="false"/>
+        </w:trPr>
+        <w:tc>
+          <w:tcPr>
+            <w:tcW w:type="dxa" w:w="1700"/>
+            <w:shd w:fill="FFFFFF" w:val="clear"/>
+            <w:tcMar>
+              <w:top w:type="dxa" w:w="40"/>
+              <w:left w:type="dxa" w:w="70"/>
+              <w:bottom w:type="dxa" w:w="40"/>
+              <w:right w:type="dxa" w:w="70"/>
+            </w:tcMar>
+          </w:tcPr>
+          <w:p>
+            <w:pPr>
+              <w:spacing w:after="0" w:line="236"/>
+            </w:pPr>
+            <w:r>
+              <w:rPr>
+                <w:rFonts w:ascii="Arial" w:cs="Arial" w:eastAsia="Arial" w:hAnsi="Arial"/>
+                <w:sz w:val="19"/>
+                <w:szCs w:val="19"/>
+              </w:rPr>
+              <w:t xml:space="preserve">Éxito</w:t>
+            </w:r>
+          </w:p>
+        </w:tc>
+        <w:tc>
+          <w:tcPr>
+            <w:tcW w:type="dxa" w:w="2300"/>
+            <w:shd w:fill="FFFFFF" w:val="clear"/>
+            <w:tcMar>
+              <w:top w:type="dxa" w:w="40"/>
+              <w:left w:type="dxa" w:w="70"/>
+              <w:bottom w:type="dxa" w:w="40"/>
+              <w:right w:type="dxa" w:w="70"/>
+            </w:tcMar>
+          </w:tcPr>
+          <w:p>
+            <w:pPr>
+              <w:spacing w:after="0" w:line="236"/>
+            </w:pPr>
+            <w:r>
+              <w:rPr>
+                <w:rFonts w:ascii="Arial" w:cs="Arial" w:eastAsia="Arial" w:hAnsi="Arial"/>
+                <w:sz w:val="19"/>
+                <w:szCs w:val="19"/>
+              </w:rPr>
+              <w:t xml:space="preserve">CTA verde</w:t>
+            </w:r>
+          </w:p>
+        </w:tc>
+        <w:tc>
+          <w:tcPr>
+            <w:tcW w:type="dxa" w:w="5360"/>
+            <w:shd w:fill="FFFFFF" w:val="clear"/>
+            <w:tcMar>
+              <w:top w:type="dxa" w:w="40"/>
+              <w:left w:type="dxa" w:w="70"/>
+              <w:bottom w:type="dxa" w:w="40"/>
+              <w:right w:type="dxa" w:w="70"/>
+            </w:tcMar>
+          </w:tcPr>
+          <w:p>
+            <w:pPr>
+              <w:spacing w:after="0" w:line="236"/>
+            </w:pPr>
+            <w:r>
+              <w:rPr>
+                <w:rFonts w:ascii="Arial" w:cs="Arial" w:eastAsia="Arial" w:hAnsi="Arial"/>
+                <w:sz w:val="19"/>
+                <w:szCs w:val="19"/>
+              </w:rPr>
+              <w:t xml:space="preserve">Confirma que la operación se completó.</w:t>
+            </w:r>
+          </w:p>
+        </w:tc>
+      </w:tr>
+      <w:tr>
+        <w:trPr>
+          <w:tblHeader w:val="false"/>
+        </w:trPr>
+        <w:tc>
+          <w:tcPr>
+            <w:tcW w:type="dxa" w:w="1700"/>
+            <w:shd w:fill="F2F2F2" w:val="clear"/>
+            <w:tcMar>
+              <w:top w:type="dxa" w:w="40"/>
+              <w:left w:type="dxa" w:w="70"/>
+              <w:bottom w:type="dxa" w:w="40"/>
+              <w:right w:type="dxa" w:w="70"/>
+            </w:tcMar>
+          </w:tcPr>
+          <w:p>
+            <w:pPr>
+              <w:spacing w:after="0" w:line="236"/>
+            </w:pPr>
+            <w:r>
+              <w:rPr>
+                <w:rFonts w:ascii="Arial" w:cs="Arial" w:eastAsia="Arial" w:hAnsi="Arial"/>
+                <w:sz w:val="19"/>
+                <w:szCs w:val="19"/>
+              </w:rPr>
+              <w:t xml:space="preserve">Advertencia</w:t>
+            </w:r>
+          </w:p>
+        </w:tc>
+        <w:tc>
+          <w:tcPr>
+            <w:tcW w:type="dxa" w:w="2300"/>
+            <w:shd w:fill="F2F2F2" w:val="clear"/>
+            <w:tcMar>
+              <w:top w:type="dxa" w:w="40"/>
+              <w:left w:type="dxa" w:w="70"/>
+              <w:bottom w:type="dxa" w:w="40"/>
+              <w:right w:type="dxa" w:w="70"/>
+            </w:tcMar>
+          </w:tcPr>
+          <w:p>
+            <w:pPr>
+              <w:spacing w:after="0" w:line="236"/>
+            </w:pPr>
+            <w:r>
+              <w:rPr>
+                <w:rFonts w:ascii="Arial" w:cs="Arial" w:eastAsia="Arial" w:hAnsi="Arial"/>
+                <w:sz w:val="19"/>
+                <w:szCs w:val="19"/>
+              </w:rPr>
+              <w:t xml:space="preserve">Naranja de advertencia</w:t>
+            </w:r>
+          </w:p>
+        </w:tc>
+        <w:tc>
+          <w:tcPr>
+            <w:tcW w:type="dxa" w:w="5360"/>
+            <w:shd w:fill="F2F2F2" w:val="clear"/>
+            <w:tcMar>
+              <w:top w:type="dxa" w:w="40"/>
+              <w:left w:type="dxa" w:w="70"/>
+              <w:bottom w:type="dxa" w:w="40"/>
+              <w:right w:type="dxa" w:w="70"/>
+            </w:tcMar>
+          </w:tcPr>
+          <w:p>
+            <w:pPr>
+              <w:spacing w:after="0" w:line="236"/>
+            </w:pPr>
+            <w:r>
+              <w:rPr>
+                <w:rFonts w:ascii="Arial" w:cs="Arial" w:eastAsia="Arial" w:hAnsi="Arial"/>
+                <w:sz w:val="19"/>
+                <w:szCs w:val="19"/>
+              </w:rPr>
+              <w:t xml:space="preserve">Avisos de stock bajo y situaciones que requieren atención.</w:t>
+            </w:r>
+          </w:p>
+        </w:tc>
+      </w:tr>
+      <w:tr>
+        <w:trPr>
+          <w:tblHeader w:val="false"/>
+        </w:trPr>
+        <w:tc>
+          <w:tcPr>
+            <w:tcW w:type="dxa" w:w="1700"/>
+            <w:shd w:fill="FFFFFF" w:val="clear"/>
+            <w:tcMar>
+              <w:top w:type="dxa" w:w="40"/>
+              <w:left w:type="dxa" w:w="70"/>
+              <w:bottom w:type="dxa" w:w="40"/>
+              <w:right w:type="dxa" w:w="70"/>
+            </w:tcMar>
+          </w:tcPr>
+          <w:p>
+            <w:pPr>
+              <w:spacing w:after="0" w:line="236"/>
+            </w:pPr>
+            <w:r>
+              <w:rPr>
+                <w:rFonts w:ascii="Arial" w:cs="Arial" w:eastAsia="Arial" w:hAnsi="Arial"/>
+                <w:sz w:val="19"/>
+                <w:szCs w:val="19"/>
+              </w:rPr>
+              <w:t xml:space="preserve">Error</w:t>
+            </w:r>
+          </w:p>
+        </w:tc>
+        <w:tc>
+          <w:tcPr>
+            <w:tcW w:type="dxa" w:w="2300"/>
+            <w:shd w:fill="FFFFFF" w:val="clear"/>
+            <w:tcMar>
+              <w:top w:type="dxa" w:w="40"/>
+              <w:left w:type="dxa" w:w="70"/>
+              <w:bottom w:type="dxa" w:w="40"/>
+              <w:right w:type="dxa" w:w="70"/>
+            </w:tcMar>
+          </w:tcPr>
+          <w:p>
+            <w:pPr>
+              <w:spacing w:after="0" w:line="236"/>
+            </w:pPr>
+            <w:r>
+              <w:rPr>
+                <w:rFonts w:ascii="Arial" w:cs="Arial" w:eastAsia="Arial" w:hAnsi="Arial"/>
+                <w:sz w:val="19"/>
+                <w:szCs w:val="19"/>
+              </w:rPr>
+              <w:t xml:space="preserve">Rojo de peligro</w:t>
+            </w:r>
+          </w:p>
+        </w:tc>
+        <w:tc>
+          <w:tcPr>
+            <w:tcW w:type="dxa" w:w="5360"/>
+            <w:shd w:fill="FFFFFF" w:val="clear"/>
+            <w:tcMar>
+              <w:top w:type="dxa" w:w="40"/>
+              <w:left w:type="dxa" w:w="70"/>
+              <w:bottom w:type="dxa" w:w="40"/>
+              <w:right w:type="dxa" w:w="70"/>
+            </w:tcMar>
+          </w:tcPr>
+          <w:p>
+            <w:pPr>
+              <w:spacing w:after="0" w:line="236"/>
+            </w:pPr>
+            <w:r>
+              <w:rPr>
+                <w:rFonts w:ascii="Arial" w:cs="Arial" w:eastAsia="Arial" w:hAnsi="Arial"/>
+                <w:sz w:val="19"/>
+                <w:szCs w:val="19"/>
+              </w:rPr>
+              <w:t xml:space="preserve">La operación no pudo completarse e indica cómo continuar.</w:t>
+            </w:r>
+          </w:p>
+        </w:tc>
+      </w:tr>
+      <w:tr>
+        <w:trPr>
+          <w:tblHeader w:val="false"/>
+        </w:trPr>
+        <w:tc>
+          <w:tcPr>
+            <w:tcW w:type="dxa" w:w="1700"/>
+            <w:shd w:fill="F2F2F2" w:val="clear"/>
+            <w:tcMar>
+              <w:top w:type="dxa" w:w="40"/>
+              <w:left w:type="dxa" w:w="70"/>
+              <w:bottom w:type="dxa" w:w="40"/>
+              <w:right w:type="dxa" w:w="70"/>
+            </w:tcMar>
+          </w:tcPr>
+          <w:p>
+            <w:pPr>
+              <w:spacing w:after="0" w:line="236"/>
+            </w:pPr>
+            <w:r>
+              <w:rPr>
+                <w:rFonts w:ascii="Arial" w:cs="Arial" w:eastAsia="Arial" w:hAnsi="Arial"/>
+                <w:sz w:val="19"/>
+                <w:szCs w:val="19"/>
+              </w:rPr>
+              <w:t xml:space="preserve">Información</w:t>
+            </w:r>
+          </w:p>
+        </w:tc>
+        <w:tc>
+          <w:tcPr>
+            <w:tcW w:type="dxa" w:w="2300"/>
+            <w:shd w:fill="F2F2F2" w:val="clear"/>
+            <w:tcMar>
+              <w:top w:type="dxa" w:w="40"/>
+              <w:left w:type="dxa" w:w="70"/>
+              <w:bottom w:type="dxa" w:w="40"/>
+              <w:right w:type="dxa" w:w="70"/>
+            </w:tcMar>
+          </w:tcPr>
+          <w:p>
+            <w:pPr>
+              <w:spacing w:after="0" w:line="236"/>
+            </w:pPr>
+            <w:r>
+              <w:rPr>
+                <w:rFonts w:ascii="Arial" w:cs="Arial" w:eastAsia="Arial" w:hAnsi="Arial"/>
+                <w:sz w:val="19"/>
+                <w:szCs w:val="19"/>
+              </w:rPr>
+              <w:t xml:space="preserve">Azul secundario</w:t>
+            </w:r>
+          </w:p>
+        </w:tc>
+        <w:tc>
+          <w:tcPr>
+            <w:tcW w:type="dxa" w:w="5360"/>
+            <w:shd w:fill="F2F2F2" w:val="clear"/>
+            <w:tcMar>
+              <w:top w:type="dxa" w:w="40"/>
+              <w:left w:type="dxa" w:w="70"/>
+              <w:bottom w:type="dxa" w:w="40"/>
+              <w:right w:type="dxa" w:w="70"/>
+            </w:tcMar>
+          </w:tcPr>
+          <w:p>
+            <w:pPr>
+              <w:spacing w:after="0" w:line="236"/>
+            </w:pPr>
+            <w:r>
+              <w:rPr>
+                <w:rFonts w:ascii="Arial" w:cs="Arial" w:eastAsia="Arial" w:hAnsi="Arial"/>
+                <w:sz w:val="19"/>
+                <w:szCs w:val="19"/>
+              </w:rPr>
+              <w:t xml:space="preserve">Datos de contexto, como el envío de una factura en ambiente de pruebas.</w:t>
+            </w:r>
+          </w:p>
+        </w:tc>
+      </w:tr>
+    </w:tbl>
+    <w:p>
+      <w:pPr>
+        <w:spacing w:after="110" w:line="262"/>
+        <w:jc w:val="both"/>
+      </w:pPr>
+      <w:r>
+        <w:rPr>
+          <w:rFonts w:ascii="Arial" w:cs="Arial" w:eastAsia="Arial" w:hAnsi="Arial"/>
+          <w:sz w:val="22"/>
+          <w:szCs w:val="22"/>
+        </w:rPr>
+        <w:t xml:space="preserve">Las etiquetas de estado identifican la situación de un registro dentro de las listas y los detalles. Se emplean los estados definidos en el modelo de datos: activo e inactivo para productos y usuarios, stock bajo y agotado para existencias, registrada y anulada para ventas, y activa o suspendida para la suscripción de la licorería.</w:t>
+      </w:r>
+    </w:p>
+    <w:p>
+      <w:pPr>
+        <w:spacing w:after="20" w:before="60"/>
+        <w:jc w:val="center"/>
+      </w:pPr>
+      <w:r>
+        <w:drawing>
+          <wp:inline distT="0" distB="0" distL="0" distR="0">
+            <wp:extent cx="5334000" cy="3381375"/>
+            <wp:effectExtent t="0" r="0" b="0" l="0"/>
+            <wp:docPr id="1" name="" descr="" title=""/>
+            <wp:cNvGraphicFramePr>
+              <a:graphicFrameLocks xmlns:a="http://schemas.openxmlformats.org/drawingml/2006/main" noChangeAspect="1"/>
+            </wp:cNvGraphicFramePr>
+            <a:graphic xmlns:a="http://schemas.openxmlformats.org/drawingml/2006/main">
+              <a:graphicData uri="http://schemas.openxmlformats.org/drawingml/2006/picture">
+                <pic:pic xmlns:pic="http://schemas.openxmlformats.org/drawingml/2006/picture">
+                  <pic:nvPicPr>
+                    <pic:cNvPr id="0" name="" descr=""/>
+                    <pic:cNvPicPr>
+                      <a:picLocks noChangeAspect="1" noChangeArrowheads="1"/>
+                    </pic:cNvPicPr>
+                  </pic:nvPicPr>
+                  <pic:blipFill>
+                    <a:blip r:embed="rId12" cstate="none"/>
+                    <a:srcRect/>
+                    <a:stretch>
+                      <a:fillRect/>
+                    </a:stretch>
+                  </pic:blipFill>
+                  <pic:spPr bwMode="auto">
+                    <a:xfrm>
+                      <a:off x="0" y="0"/>
+                      <a:ext cx="5334000" cy="3381375"/>
+                    </a:xfrm>
+                    <a:prstGeom prst="rect">
+                      <a:avLst/>
+                    </a:prstGeom>
+                  </pic:spPr>
+                </pic:pic>
+              </a:graphicData>
+            </a:graphic>
+          </wp:inline>
+        </w:drawing>
+      </w:r>
+    </w:p>
+    <w:p>
+      <w:pPr>
+        <w:spacing w:after="150" w:before="6"/>
+        <w:jc w:val="center"/>
+      </w:pPr>
+      <w:r>
+        <w:rPr>
+          <w:rFonts w:ascii="Arial" w:cs="Arial" w:eastAsia="Arial" w:hAnsi="Arial"/>
+          <w:i/>
+          <w:iCs/>
+          <w:color w:val="5B6678"/>
+          <w:sz w:val="18"/>
+          <w:szCs w:val="18"/>
+        </w:rPr>
+        <w:t xml:space="preserve">Figura 5. Mensajes del sistema y etiquetas de estado. Fuente: del autor.</w:t>
+      </w:r>
+    </w:p>
+    <w:p>
+      <w:pPr>
+        <w:pStyle w:val="Heading2"/>
+        <w:spacing w:after="80" w:before="150"/>
+      </w:pPr>
+      <w:bookmarkStart w:name="bm19" w:id="19"/>
+      <w:r>
+        <w:rPr>
+          <w:rFonts w:ascii="Arial" w:cs="Arial" w:eastAsia="Arial" w:hAnsi="Arial"/>
+          <w:b/>
+          <w:bCs/>
+          <w:color w:val="2E5496"/>
+          <w:sz w:val="23"/>
+          <w:szCs w:val="23"/>
+        </w:rPr>
+        <w:t xml:space="preserve">6.5 Navegación, tarjetas y tablas</w:t>
+      </w:r>
+      <w:bookmarkEnd w:id="19"/>
+    </w:p>
+    <w:p>
+      <w:pPr>
+        <w:spacing w:after="110" w:line="262"/>
+        <w:jc w:val="both"/>
+      </w:pPr>
+      <w:r>
+        <w:rPr>
+          <w:rFonts w:ascii="Arial" w:cs="Arial" w:eastAsia="Arial" w:hAnsi="Arial"/>
+          <w:sz w:val="22"/>
+          <w:szCs w:val="22"/>
+        </w:rPr>
+        <w:t xml:space="preserve">La estructura de la aplicación se apoya en tres componentes de disposición:</w:t>
+      </w:r>
+    </w:p>
+    <w:p>
+      <w:pPr>
+        <w:pStyle w:val="ListParagraph"/>
+        <w:numPr>
+          <w:ilvl w:val="0"/>
+          <w:numId w:val="1"/>
+        </w:numPr>
+        <w:spacing w:after="60" w:line="258"/>
+      </w:pPr>
+      <w:r>
+        <w:rPr>
+          <w:rFonts w:ascii="Arial" w:cs="Arial" w:eastAsia="Arial" w:hAnsi="Arial"/>
+          <w:b/>
+          <w:bCs/>
+          <w:sz w:val="22"/>
+          <w:szCs w:val="22"/>
+        </w:rPr>
+        <w:t xml:space="preserve">Navegación. </w:t>
+      </w:r>
+      <w:r>
+        <w:rPr>
+          <w:rFonts w:ascii="Arial" w:cs="Arial" w:eastAsia="Arial" w:hAnsi="Arial"/>
+          <w:sz w:val="22"/>
+          <w:szCs w:val="22"/>
+        </w:rPr>
+        <w:t xml:space="preserve">En escritorio, una barra lateral fija en azul primario con los módulos habilitados según el rol y el plan; en la parte superior, el título de la pantalla, las acciones de contexto y el acceso al perfil. En móvil, la navegación se traslada a la parte inferior.</w:t>
+      </w:r>
+    </w:p>
+    <w:p>
+      <w:pPr>
+        <w:pStyle w:val="ListParagraph"/>
+        <w:numPr>
+          <w:ilvl w:val="0"/>
+          <w:numId w:val="1"/>
+        </w:numPr>
+        <w:spacing w:after="60" w:line="258"/>
+      </w:pPr>
+      <w:r>
+        <w:rPr>
+          <w:rFonts w:ascii="Arial" w:cs="Arial" w:eastAsia="Arial" w:hAnsi="Arial"/>
+          <w:b/>
+          <w:bCs/>
+          <w:sz w:val="22"/>
+          <w:szCs w:val="22"/>
+        </w:rPr>
+        <w:t xml:space="preserve">Tarjetas de indicador. </w:t>
+      </w:r>
+      <w:r>
+        <w:rPr>
+          <w:rFonts w:ascii="Arial" w:cs="Arial" w:eastAsia="Arial" w:hAnsi="Arial"/>
+          <w:sz w:val="22"/>
+          <w:szCs w:val="22"/>
+        </w:rPr>
+        <w:t xml:space="preserve">Presentan una cifra principal con su descripción y la variación frente al periodo anterior. Se usan en el panel principal y en reportes.</w:t>
+      </w:r>
+    </w:p>
+    <w:p>
+      <w:pPr>
+        <w:pStyle w:val="ListParagraph"/>
+        <w:numPr>
+          <w:ilvl w:val="0"/>
+          <w:numId w:val="1"/>
+        </w:numPr>
+        <w:spacing w:after="60" w:line="258"/>
+      </w:pPr>
+      <w:r>
+        <w:rPr>
+          <w:rFonts w:ascii="Arial" w:cs="Arial" w:eastAsia="Arial" w:hAnsi="Arial"/>
+          <w:b/>
+          <w:bCs/>
+          <w:sz w:val="22"/>
+          <w:szCs w:val="22"/>
+        </w:rPr>
+        <w:t xml:space="preserve">Tablas. </w:t>
+      </w:r>
+      <w:r>
+        <w:rPr>
+          <w:rFonts w:ascii="Arial" w:cs="Arial" w:eastAsia="Arial" w:hAnsi="Arial"/>
+          <w:sz w:val="22"/>
+          <w:szCs w:val="22"/>
+        </w:rPr>
+        <w:t xml:space="preserve">Muestran los listados de productos, ventas y movimientos. Incluyen encabezado fijo, buscador, filtros rápidos, etiquetas de estado en la última columna y paginación cuando el volumen lo requiere.</w:t>
+      </w:r>
+    </w:p>
+    <w:p>
+      <w:pPr>
+        <w:spacing w:after="20" w:before="60"/>
+        <w:jc w:val="center"/>
+      </w:pPr>
+      <w:r>
+        <w:drawing>
+          <wp:inline distT="0" distB="0" distL="0" distR="0">
+            <wp:extent cx="6096000" cy="1676400"/>
+            <wp:effectExtent t="0" r="0" b="0" l="0"/>
+            <wp:docPr id="1" name="" descr="" title=""/>
+            <wp:cNvGraphicFramePr>
+              <a:graphicFrameLocks xmlns:a="http://schemas.openxmlformats.org/drawingml/2006/main" noChangeAspect="1"/>
+            </wp:cNvGraphicFramePr>
+            <a:graphic xmlns:a="http://schemas.openxmlformats.org/drawingml/2006/main">
+              <a:graphicData uri="http://schemas.openxmlformats.org/drawingml/2006/picture">
+                <pic:pic xmlns:pic="http://schemas.openxmlformats.org/drawingml/2006/picture">
+                  <pic:nvPicPr>
+                    <pic:cNvPr id="0" name="" descr=""/>
+                    <pic:cNvPicPr>
+                      <a:picLocks noChangeAspect="1" noChangeArrowheads="1"/>
+                    </pic:cNvPicPr>
+                  </pic:nvPicPr>
+                  <pic:blipFill>
+                    <a:blip r:embed="rId13" cstate="none"/>
+                    <a:srcRect/>
+                    <a:stretch>
+                      <a:fillRect/>
+                    </a:stretch>
+                  </pic:blipFill>
+                  <pic:spPr bwMode="auto">
+                    <a:xfrm>
+                      <a:off x="0" y="0"/>
+                      <a:ext cx="6096000" cy="1676400"/>
+                    </a:xfrm>
+                    <a:prstGeom prst="rect">
+                      <a:avLst/>
+                    </a:prstGeom>
+                  </pic:spPr>
+                </pic:pic>
+              </a:graphicData>
+            </a:graphic>
+          </wp:inline>
+        </w:drawing>
+      </w:r>
+    </w:p>
+    <w:p>
+      <w:pPr>
+        <w:spacing w:after="150" w:before="6"/>
+        <w:jc w:val="center"/>
+      </w:pPr>
+      <w:r>
+        <w:rPr>
+          <w:rFonts w:ascii="Arial" w:cs="Arial" w:eastAsia="Arial" w:hAnsi="Arial"/>
+          <w:i/>
+          <w:iCs/>
+          <w:color w:val="5B6678"/>
+          <w:sz w:val="18"/>
+          <w:szCs w:val="18"/>
+        </w:rPr>
+        <w:t xml:space="preserve">Figura 6. Barra de navegación, tarjeta de indicador y tabla de listado. Fuente: del autor.</w:t>
+      </w:r>
+    </w:p>
+    <w:p>
+      <w:pPr>
+        <w:pStyle w:val="Heading2"/>
+        <w:spacing w:after="80" w:before="150"/>
+      </w:pPr>
+      <w:bookmarkStart w:name="bm20" w:id="20"/>
+      <w:r>
+        <w:rPr>
+          <w:rFonts w:ascii="Arial" w:cs="Arial" w:eastAsia="Arial" w:hAnsi="Arial"/>
+          <w:b/>
+          <w:bCs/>
+          <w:color w:val="2E5496"/>
+          <w:sz w:val="23"/>
+          <w:szCs w:val="23"/>
+        </w:rPr>
+        <w:t xml:space="preserve">6.6 Ventanas de confirmación</w:t>
+      </w:r>
+      <w:bookmarkEnd w:id="20"/>
+    </w:p>
+    <w:p>
+      <w:pPr>
+        <w:spacing w:after="110" w:line="262"/>
+        <w:jc w:val="both"/>
+      </w:pPr>
+      <w:r>
+        <w:rPr>
+          <w:rFonts w:ascii="Arial" w:cs="Arial" w:eastAsia="Arial" w:hAnsi="Arial"/>
+          <w:sz w:val="22"/>
+          <w:szCs w:val="22"/>
+        </w:rPr>
+        <w:t xml:space="preserve">Las acciones sensibles se confirman en una ventana modal antes de ejecutarse. La ventana enuncia la acción en el título, explica su consecuencia en una frase y ofrece dos botones: uno secundario para cancelar y uno de peligro para continuar. El fondo de la pantalla se atenúa y la ventana se cierra con la tecla de escape o con la acción de cancelar.</w:t>
+      </w:r>
+    </w:p>
+    <w:p>
+      <w:pPr>
+        <w:spacing w:after="20" w:before="60"/>
+        <w:jc w:val="center"/>
+      </w:pPr>
+      <w:r>
+        <w:drawing>
+          <wp:inline distT="0" distB="0" distL="0" distR="0">
+            <wp:extent cx="4762500" cy="2447925"/>
+            <wp:effectExtent t="0" r="0" b="0" l="0"/>
+            <wp:docPr id="1" name="" descr="" title=""/>
+            <wp:cNvGraphicFramePr>
+              <a:graphicFrameLocks xmlns:a="http://schemas.openxmlformats.org/drawingml/2006/main" noChangeAspect="1"/>
+            </wp:cNvGraphicFramePr>
+            <a:graphic xmlns:a="http://schemas.openxmlformats.org/drawingml/2006/main">
+              <a:graphicData uri="http://schemas.openxmlformats.org/drawingml/2006/picture">
+                <pic:pic xmlns:pic="http://schemas.openxmlformats.org/drawingml/2006/picture">
+                  <pic:nvPicPr>
+                    <pic:cNvPr id="0" name="" descr=""/>
+                    <pic:cNvPicPr>
+                      <a:picLocks noChangeAspect="1" noChangeArrowheads="1"/>
+                    </pic:cNvPicPr>
+                  </pic:nvPicPr>
+                  <pic:blipFill>
+                    <a:blip r:embed="rId14" cstate="none"/>
+                    <a:srcRect/>
+                    <a:stretch>
+                      <a:fillRect/>
+                    </a:stretch>
+                  </pic:blipFill>
+                  <pic:spPr bwMode="auto">
+                    <a:xfrm>
+                      <a:off x="0" y="0"/>
+                      <a:ext cx="4762500" cy="2447925"/>
+                    </a:xfrm>
+                    <a:prstGeom prst="rect">
+                      <a:avLst/>
+                    </a:prstGeom>
+                  </pic:spPr>
+                </pic:pic>
+              </a:graphicData>
+            </a:graphic>
+          </wp:inline>
+        </w:drawing>
+      </w:r>
+    </w:p>
+    <w:p>
+      <w:pPr>
+        <w:spacing w:after="150" w:before="6"/>
+        <w:jc w:val="center"/>
+      </w:pPr>
+      <w:r>
+        <w:rPr>
+          <w:rFonts w:ascii="Arial" w:cs="Arial" w:eastAsia="Arial" w:hAnsi="Arial"/>
+          <w:i/>
+          <w:iCs/>
+          <w:color w:val="5B6678"/>
+          <w:sz w:val="18"/>
+          <w:szCs w:val="18"/>
+        </w:rPr>
+        <w:t xml:space="preserve">Figura 7. Ventana de confirmación de una acción sensible. Fuente: del autor.</w:t>
+      </w:r>
+    </w:p>
+    <w:p>
+      <w:pPr>
+        <w:spacing w:after="110" w:line="262"/>
+        <w:jc w:val="both"/>
+      </w:pPr>
+      <w:r>
+        <w:rPr>
+          <w:rFonts w:ascii="Arial" w:cs="Arial" w:eastAsia="Arial" w:hAnsi="Arial"/>
+          <w:sz w:val="22"/>
+          <w:szCs w:val="22"/>
+        </w:rPr>
+        <w:t xml:space="preserve">Requieren confirmación, entre otras, la anulación de una venta, la inactivación de un producto o un usuario, el traslado de mercancía entre sedes y la restauración de una copia de seguridad.</w:t>
+      </w:r>
+    </w:p>
+    <w:p>
+      <w:pPr>
+        <w:pStyle w:val="Heading1"/>
+        <w:pageBreakBefore/>
+        <w:spacing w:after="110" w:before="220"/>
+      </w:pPr>
+      <w:bookmarkStart w:name="bm21" w:id="21"/>
+      <w:r>
+        <w:rPr>
+          <w:rFonts w:ascii="Arial" w:cs="Arial" w:eastAsia="Arial" w:hAnsi="Arial"/>
+          <w:b/>
+          <w:bCs/>
+          <w:color w:val="1F3864"/>
+          <w:sz w:val="27"/>
+          <w:szCs w:val="27"/>
+        </w:rPr>
+        <w:t xml:space="preserve">7. Formularios de autenticación y registro</w:t>
+      </w:r>
+      <w:bookmarkEnd w:id="21"/>
+    </w:p>
+    <w:p>
+      <w:pPr>
+        <w:spacing w:after="110" w:line="262"/>
+        <w:jc w:val="both"/>
+      </w:pPr>
+      <w:r>
+        <w:rPr>
+          <w:rFonts w:ascii="Arial" w:cs="Arial" w:eastAsia="Arial" w:hAnsi="Arial"/>
+          <w:sz w:val="22"/>
+          <w:szCs w:val="22"/>
+        </w:rPr>
+        <w:t xml:space="preserve">El acceso a INVENTRA se realiza mediante una cuenta de usuario asociada a una licorería. Los formularios de autenticación y registro comparten una misma disposición: un panel de marca a la izquierda, con la propuesta de valor del producto, y el formulario a la derecha, con los campos estrictamente necesarios para completar la acción.</w:t>
+      </w:r>
+    </w:p>
+    <w:p>
+      <w:pPr>
+        <w:pStyle w:val="Heading2"/>
+        <w:spacing w:after="80" w:before="150"/>
+      </w:pPr>
+      <w:bookmarkStart w:name="bm22" w:id="22"/>
+      <w:r>
+        <w:rPr>
+          <w:rFonts w:ascii="Arial" w:cs="Arial" w:eastAsia="Arial" w:hAnsi="Arial"/>
+          <w:b/>
+          <w:bCs/>
+          <w:color w:val="2E5496"/>
+          <w:sz w:val="23"/>
+          <w:szCs w:val="23"/>
+        </w:rPr>
+        <w:t xml:space="preserve">7.1 Inicio de sesión</w:t>
+      </w:r>
+      <w:bookmarkEnd w:id="22"/>
+    </w:p>
+    <w:p>
+      <w:pPr>
+        <w:spacing w:after="110" w:line="262"/>
+        <w:jc w:val="both"/>
+      </w:pPr>
+      <w:r>
+        <w:rPr>
+          <w:rFonts w:ascii="Arial" w:cs="Arial" w:eastAsia="Arial" w:hAnsi="Arial"/>
+          <w:sz w:val="22"/>
+          <w:szCs w:val="22"/>
+        </w:rPr>
+        <w:t xml:space="preserve">El formulario solicita el correo electrónico y la contraseña. Incluye la opción de mantener la sesión iniciada, el enlace de recuperación de contraseña y el acceso al registro para quienes aún no tienen cuenta.</w:t>
+      </w:r>
+    </w:p>
+    <w:p>
+      <w:pPr>
+        <w:spacing w:after="20" w:before="60"/>
+        <w:jc w:val="center"/>
+      </w:pPr>
+      <w:r>
+        <w:drawing>
+          <wp:inline distT="0" distB="0" distL="0" distR="0">
+            <wp:extent cx="6096000" cy="3048000"/>
+            <wp:effectExtent t="0" r="0" b="0" l="0"/>
+            <wp:docPr id="1" name="" descr="" title=""/>
+            <wp:cNvGraphicFramePr>
+              <a:graphicFrameLocks xmlns:a="http://schemas.openxmlformats.org/drawingml/2006/main" noChangeAspect="1"/>
+            </wp:cNvGraphicFramePr>
+            <a:graphic xmlns:a="http://schemas.openxmlformats.org/drawingml/2006/main">
+              <a:graphicData uri="http://schemas.openxmlformats.org/drawingml/2006/picture">
+                <pic:pic xmlns:pic="http://schemas.openxmlformats.org/drawingml/2006/picture">
+                  <pic:nvPicPr>
+                    <pic:cNvPr id="0" name="" descr=""/>
+                    <pic:cNvPicPr>
+                      <a:picLocks noChangeAspect="1" noChangeArrowheads="1"/>
+                    </pic:cNvPicPr>
+                  </pic:nvPicPr>
+                  <pic:blipFill>
+                    <a:blip r:embed="rId15" cstate="none"/>
+                    <a:srcRect/>
+                    <a:stretch>
+                      <a:fillRect/>
+                    </a:stretch>
+                  </pic:blipFill>
+                  <pic:spPr bwMode="auto">
+                    <a:xfrm>
+                      <a:off x="0" y="0"/>
+                      <a:ext cx="6096000" cy="3048000"/>
+                    </a:xfrm>
+                    <a:prstGeom prst="rect">
+                      <a:avLst/>
+                    </a:prstGeom>
+                  </pic:spPr>
+                </pic:pic>
+              </a:graphicData>
+            </a:graphic>
+          </wp:inline>
+        </w:drawing>
+      </w:r>
+    </w:p>
+    <w:p>
+      <w:pPr>
+        <w:spacing w:after="150" w:before="6"/>
+        <w:jc w:val="center"/>
+      </w:pPr>
+      <w:r>
+        <w:rPr>
+          <w:rFonts w:ascii="Arial" w:cs="Arial" w:eastAsia="Arial" w:hAnsi="Arial"/>
+          <w:i/>
+          <w:iCs/>
+          <w:color w:val="5B6678"/>
+          <w:sz w:val="18"/>
+          <w:szCs w:val="18"/>
+        </w:rPr>
+        <w:t xml:space="preserve">Figura 8. Pantalla de inicio de sesión. Fuente: del autor.</w:t>
+      </w:r>
+    </w:p>
+    <w:p>
+      <w:pPr>
+        <w:pStyle w:val="ListParagraph"/>
+        <w:numPr>
+          <w:ilvl w:val="0"/>
+          <w:numId w:val="1"/>
+        </w:numPr>
+        <w:spacing w:after="60" w:line="258"/>
+      </w:pPr>
+      <w:r>
+        <w:rPr>
+          <w:rFonts w:ascii="Arial" w:cs="Arial" w:eastAsia="Arial" w:hAnsi="Arial"/>
+          <w:sz w:val="22"/>
+          <w:szCs w:val="22"/>
+        </w:rPr>
+        <w:t xml:space="preserve">El botón principal permanece deshabilitado mientras falte alguno de los dos campos.</w:t>
+      </w:r>
+    </w:p>
+    <w:p>
+      <w:pPr>
+        <w:pStyle w:val="ListParagraph"/>
+        <w:numPr>
+          <w:ilvl w:val="0"/>
+          <w:numId w:val="1"/>
+        </w:numPr>
+        <w:spacing w:after="60" w:line="258"/>
+      </w:pPr>
+      <w:r>
+        <w:rPr>
+          <w:rFonts w:ascii="Arial" w:cs="Arial" w:eastAsia="Arial" w:hAnsi="Arial"/>
+          <w:sz w:val="22"/>
+          <w:szCs w:val="22"/>
+        </w:rPr>
+        <w:t xml:space="preserve">Si las credenciales no coinciden, el mensaje es el mismo para el correo y para la contraseña, de modo que no se revele cuáles cuentas existen.</w:t>
+      </w:r>
+    </w:p>
+    <w:p>
+      <w:pPr>
+        <w:pStyle w:val="ListParagraph"/>
+        <w:numPr>
+          <w:ilvl w:val="0"/>
+          <w:numId w:val="1"/>
+        </w:numPr>
+        <w:spacing w:after="60" w:line="258"/>
+      </w:pPr>
+      <w:r>
+        <w:rPr>
+          <w:rFonts w:ascii="Arial" w:cs="Arial" w:eastAsia="Arial" w:hAnsi="Arial"/>
+          <w:sz w:val="22"/>
+          <w:szCs w:val="22"/>
+        </w:rPr>
+        <w:t xml:space="preserve">Tras varios intentos fallidos consecutivos la cuenta se bloquea de forma temporal y el formulario informa la situación.</w:t>
+      </w:r>
+    </w:p>
+    <w:p>
+      <w:pPr>
+        <w:pStyle w:val="ListParagraph"/>
+        <w:numPr>
+          <w:ilvl w:val="0"/>
+          <w:numId w:val="1"/>
+        </w:numPr>
+        <w:spacing w:after="60" w:line="258"/>
+      </w:pPr>
+      <w:r>
+        <w:rPr>
+          <w:rFonts w:ascii="Arial" w:cs="Arial" w:eastAsia="Arial" w:hAnsi="Arial"/>
+          <w:sz w:val="22"/>
+          <w:szCs w:val="22"/>
+        </w:rPr>
+        <w:t xml:space="preserve">Si la cuenta está inactiva o la suscripción se encuentra suspendida, el acceso se deniega con un mensaje que indica el motivo.</w:t>
+      </w:r>
+    </w:p>
+    <w:p>
+      <w:pPr>
+        <w:pStyle w:val="Heading2"/>
+        <w:spacing w:after="80" w:before="150"/>
+      </w:pPr>
+      <w:bookmarkStart w:name="bm23" w:id="23"/>
+      <w:r>
+        <w:rPr>
+          <w:rFonts w:ascii="Arial" w:cs="Arial" w:eastAsia="Arial" w:hAnsi="Arial"/>
+          <w:b/>
+          <w:bCs/>
+          <w:color w:val="2E5496"/>
+          <w:sz w:val="23"/>
+          <w:szCs w:val="23"/>
+        </w:rPr>
+        <w:t xml:space="preserve">7.2 Registro de la licorería</w:t>
+      </w:r>
+      <w:bookmarkEnd w:id="23"/>
+    </w:p>
+    <w:p>
+      <w:pPr>
+        <w:spacing w:after="110" w:line="262"/>
+        <w:jc w:val="both"/>
+      </w:pPr>
+      <w:r>
+        <w:rPr>
+          <w:rFonts w:ascii="Arial" w:cs="Arial" w:eastAsia="Arial" w:hAnsi="Arial"/>
+          <w:sz w:val="22"/>
+          <w:szCs w:val="22"/>
+        </w:rPr>
+        <w:t xml:space="preserve">El registro crea al mismo tiempo la licorería y su primer usuario, con rol de administrador. Se piden únicamente cuatro datos: el nombre del negocio, el nombre y apellido del responsable, el correo electrónico y la contraseña.</w:t>
+      </w:r>
+    </w:p>
+    <w:p>
+      <w:pPr>
+        <w:spacing w:after="20" w:before="60"/>
+        <w:jc w:val="center"/>
+      </w:pPr>
+      <w:r>
+        <w:drawing>
+          <wp:inline distT="0" distB="0" distL="0" distR="0">
+            <wp:extent cx="6096000" cy="3848100"/>
+            <wp:effectExtent t="0" r="0" b="0" l="0"/>
+            <wp:docPr id="1" name="" descr="" title=""/>
+            <wp:cNvGraphicFramePr>
+              <a:graphicFrameLocks xmlns:a="http://schemas.openxmlformats.org/drawingml/2006/main" noChangeAspect="1"/>
+            </wp:cNvGraphicFramePr>
+            <a:graphic xmlns:a="http://schemas.openxmlformats.org/drawingml/2006/main">
+              <a:graphicData uri="http://schemas.openxmlformats.org/drawingml/2006/picture">
+                <pic:pic xmlns:pic="http://schemas.openxmlformats.org/drawingml/2006/picture">
+                  <pic:nvPicPr>
+                    <pic:cNvPr id="0" name="" descr=""/>
+                    <pic:cNvPicPr>
+                      <a:picLocks noChangeAspect="1" noChangeArrowheads="1"/>
+                    </pic:cNvPicPr>
+                  </pic:nvPicPr>
+                  <pic:blipFill>
+                    <a:blip r:embed="rId16" cstate="none"/>
+                    <a:srcRect/>
+                    <a:stretch>
+                      <a:fillRect/>
+                    </a:stretch>
+                  </pic:blipFill>
+                  <pic:spPr bwMode="auto">
+                    <a:xfrm>
+                      <a:off x="0" y="0"/>
+                      <a:ext cx="6096000" cy="3848100"/>
+                    </a:xfrm>
+                    <a:prstGeom prst="rect">
+                      <a:avLst/>
+                    </a:prstGeom>
+                  </pic:spPr>
+                </pic:pic>
+              </a:graphicData>
+            </a:graphic>
+          </wp:inline>
+        </w:drawing>
+      </w:r>
+    </w:p>
+    <w:p>
+      <w:pPr>
+        <w:spacing w:after="150" w:before="6"/>
+        <w:jc w:val="center"/>
+      </w:pPr>
+      <w:r>
+        <w:rPr>
+          <w:rFonts w:ascii="Arial" w:cs="Arial" w:eastAsia="Arial" w:hAnsi="Arial"/>
+          <w:i/>
+          <w:iCs/>
+          <w:color w:val="5B6678"/>
+          <w:sz w:val="18"/>
+          <w:szCs w:val="18"/>
+        </w:rPr>
+        <w:t xml:space="preserve">Figura 9. Pantalla de registro de la licorería. Fuente: del autor.</w:t>
+      </w:r>
+    </w:p>
+    <w:p>
+      <w:pPr>
+        <w:pStyle w:val="ListParagraph"/>
+        <w:numPr>
+          <w:ilvl w:val="0"/>
+          <w:numId w:val="1"/>
+        </w:numPr>
+        <w:spacing w:after="60" w:line="258"/>
+      </w:pPr>
+      <w:r>
+        <w:rPr>
+          <w:rFonts w:ascii="Arial" w:cs="Arial" w:eastAsia="Arial" w:hAnsi="Arial"/>
+          <w:sz w:val="22"/>
+          <w:szCs w:val="22"/>
+        </w:rPr>
+        <w:t xml:space="preserve">El correo electrónico identifica al usuario y no puede estar registrado previamente.</w:t>
+      </w:r>
+    </w:p>
+    <w:p>
+      <w:pPr>
+        <w:pStyle w:val="ListParagraph"/>
+        <w:numPr>
+          <w:ilvl w:val="0"/>
+          <w:numId w:val="1"/>
+        </w:numPr>
+        <w:spacing w:after="60" w:line="258"/>
+      </w:pPr>
+      <w:r>
+        <w:rPr>
+          <w:rFonts w:ascii="Arial" w:cs="Arial" w:eastAsia="Arial" w:hAnsi="Arial"/>
+          <w:sz w:val="22"/>
+          <w:szCs w:val="22"/>
+        </w:rPr>
+        <w:t xml:space="preserve">La contraseña exige una longitud mínima de ocho caracteres; el campo permite mostrar u ocultar el contenido escrito.</w:t>
+      </w:r>
+    </w:p>
+    <w:p>
+      <w:pPr>
+        <w:pStyle w:val="ListParagraph"/>
+        <w:numPr>
+          <w:ilvl w:val="0"/>
+          <w:numId w:val="1"/>
+        </w:numPr>
+        <w:spacing w:after="60" w:line="258"/>
+      </w:pPr>
+      <w:r>
+        <w:rPr>
+          <w:rFonts w:ascii="Arial" w:cs="Arial" w:eastAsia="Arial" w:hAnsi="Arial"/>
+          <w:sz w:val="22"/>
+          <w:szCs w:val="22"/>
+        </w:rPr>
+        <w:t xml:space="preserve">Al completar el registro, la licorería queda asociada al plan Básico y el usuario ingresa directamente al panel principal.</w:t>
+      </w:r>
+    </w:p>
+    <w:p>
+      <w:pPr>
+        <w:pStyle w:val="Heading2"/>
+        <w:spacing w:after="80" w:before="150"/>
+      </w:pPr>
+      <w:bookmarkStart w:name="bm24" w:id="24"/>
+      <w:r>
+        <w:rPr>
+          <w:rFonts w:ascii="Arial" w:cs="Arial" w:eastAsia="Arial" w:hAnsi="Arial"/>
+          <w:b/>
+          <w:bCs/>
+          <w:color w:val="2E5496"/>
+          <w:sz w:val="23"/>
+          <w:szCs w:val="23"/>
+        </w:rPr>
+        <w:t xml:space="preserve">7.3 Recuperación de contraseña</w:t>
+      </w:r>
+      <w:bookmarkEnd w:id="24"/>
+    </w:p>
+    <w:p>
+      <w:pPr>
+        <w:spacing w:after="110" w:line="262"/>
+        <w:jc w:val="both"/>
+      </w:pPr>
+      <w:r>
+        <w:rPr>
+          <w:rFonts w:ascii="Arial" w:cs="Arial" w:eastAsia="Arial" w:hAnsi="Arial"/>
+          <w:sz w:val="22"/>
+          <w:szCs w:val="22"/>
+        </w:rPr>
+        <w:t xml:space="preserve">Desde el inicio de sesión se accede a la recuperación de contraseña. El usuario ingresa su correo electrónico y recibe un enlace de vigencia limitada para definir una contraseña nueva. El mensaje en pantalla es el mismo exista o no la cuenta, y la contraseña anterior deja de ser válida una vez completado el cambio.</w:t>
+      </w:r>
+    </w:p>
+    <w:p>
+      <w:pPr>
+        <w:pStyle w:val="Heading2"/>
+        <w:spacing w:after="80" w:before="150"/>
+      </w:pPr>
+      <w:bookmarkStart w:name="bm25" w:id="25"/>
+      <w:r>
+        <w:rPr>
+          <w:rFonts w:ascii="Arial" w:cs="Arial" w:eastAsia="Arial" w:hAnsi="Arial"/>
+          <w:b/>
+          <w:bCs/>
+          <w:color w:val="2E5496"/>
+          <w:sz w:val="23"/>
+          <w:szCs w:val="23"/>
+        </w:rPr>
+        <w:t xml:space="preserve">7.4 Validaciones y mensajes</w:t>
+      </w:r>
+      <w:bookmarkEnd w:id="25"/>
+    </w:p>
+    <w:p>
+      <w:pPr>
+        <w:spacing w:after="110" w:line="262"/>
+        <w:jc w:val="both"/>
+      </w:pPr>
+      <w:r>
+        <w:rPr>
+          <w:rFonts w:ascii="Arial" w:cs="Arial" w:eastAsia="Arial" w:hAnsi="Arial"/>
+          <w:sz w:val="22"/>
+          <w:szCs w:val="22"/>
+        </w:rPr>
+        <w:t xml:space="preserve">Las validaciones se ejecutan al salir de cada campo y nuevamente al enviar el formulario. El mensaje se ubica bajo el campo correspondiente, en color de peligro, y el foco se traslada al primer campo con error.</w:t>
+      </w:r>
+    </w:p>
+    <w:tbl>
+      <w:tblPr>
+        <w:tblW w:type="dxa" w:w="9360"/>
+        <w:tblBorders>
+          <w:top w:val="single" w:color="9CA3AF" w:sz="6"/>
+          <w:left w:val="single" w:color="9CA3AF" w:sz="6"/>
+          <w:bottom w:val="single" w:color="9CA3AF" w:sz="6"/>
+          <w:right w:val="single" w:color="9CA3AF" w:sz="6"/>
+          <w:insideH w:val="single" w:color="9CA3AF" w:sz="6"/>
+          <w:insideV w:val="single" w:color="9CA3AF" w:sz="6"/>
+        </w:tblBorders>
+        <w:tblLayout w:type="fixed"/>
+      </w:tblPr>
+      <w:tblGrid>
+        <w:gridCol w:w="2100"/>
+        <w:gridCol w:w="3100"/>
+        <w:gridCol w:w="4160"/>
+      </w:tblGrid>
+      <w:tr>
+        <w:trPr>
+          <w:tblHeader/>
+        </w:trPr>
+        <w:tc>
+          <w:tcPr>
+            <w:tcW w:type="dxa" w:w="2100"/>
+            <w:shd w:fill="1F3864" w:val="clear"/>
+            <w:tcMar>
+              <w:top w:type="dxa" w:w="40"/>
+              <w:left w:type="dxa" w:w="70"/>
+              <w:bottom w:type="dxa" w:w="40"/>
+              <w:right w:type="dxa" w:w="70"/>
+            </w:tcMar>
+          </w:tcPr>
+          <w:p>
+            <w:pPr>
+              <w:spacing w:after="0" w:line="236"/>
+            </w:pPr>
+            <w:r>
+              <w:rPr>
+                <w:rFonts w:ascii="Arial" w:cs="Arial" w:eastAsia="Arial" w:hAnsi="Arial"/>
+                <w:b/>
+                <w:bCs/>
+                <w:color w:val="FFFFFF"/>
+                <w:sz w:val="19"/>
+                <w:szCs w:val="19"/>
+              </w:rPr>
+              <w:t xml:space="preserve">Campo</w:t>
+            </w:r>
+          </w:p>
+        </w:tc>
+        <w:tc>
+          <w:tcPr>
+            <w:tcW w:type="dxa" w:w="3100"/>
+            <w:shd w:fill="1F3864" w:val="clear"/>
+            <w:tcMar>
+              <w:top w:type="dxa" w:w="40"/>
+              <w:left w:type="dxa" w:w="70"/>
+              <w:bottom w:type="dxa" w:w="40"/>
+              <w:right w:type="dxa" w:w="70"/>
+            </w:tcMar>
+          </w:tcPr>
+          <w:p>
+            <w:pPr>
+              <w:spacing w:after="0" w:line="236"/>
+            </w:pPr>
+            <w:r>
+              <w:rPr>
+                <w:rFonts w:ascii="Arial" w:cs="Arial" w:eastAsia="Arial" w:hAnsi="Arial"/>
+                <w:b/>
+                <w:bCs/>
+                <w:color w:val="FFFFFF"/>
+                <w:sz w:val="19"/>
+                <w:szCs w:val="19"/>
+              </w:rPr>
+              <w:t xml:space="preserve">Regla</w:t>
+            </w:r>
+          </w:p>
+        </w:tc>
+        <w:tc>
+          <w:tcPr>
+            <w:tcW w:type="dxa" w:w="4160"/>
+            <w:shd w:fill="1F3864" w:val="clear"/>
+            <w:tcMar>
+              <w:top w:type="dxa" w:w="40"/>
+              <w:left w:type="dxa" w:w="70"/>
+              <w:bottom w:type="dxa" w:w="40"/>
+              <w:right w:type="dxa" w:w="70"/>
+            </w:tcMar>
+          </w:tcPr>
+          <w:p>
+            <w:pPr>
+              <w:spacing w:after="0" w:line="236"/>
+            </w:pPr>
+            <w:r>
+              <w:rPr>
+                <w:rFonts w:ascii="Arial" w:cs="Arial" w:eastAsia="Arial" w:hAnsi="Arial"/>
+                <w:b/>
+                <w:bCs/>
+                <w:color w:val="FFFFFF"/>
+                <w:sz w:val="19"/>
+                <w:szCs w:val="19"/>
+              </w:rPr>
+              <w:t xml:space="preserve">Mensaje</w:t>
+            </w:r>
+          </w:p>
+        </w:tc>
+      </w:tr>
+      <w:tr>
+        <w:trPr>
+          <w:tblHeader w:val="false"/>
+        </w:trPr>
+        <w:tc>
+          <w:tcPr>
+            <w:tcW w:type="dxa" w:w="2100"/>
+            <w:shd w:fill="FFFFFF" w:val="clear"/>
+            <w:tcMar>
+              <w:top w:type="dxa" w:w="40"/>
+              <w:left w:type="dxa" w:w="70"/>
+              <w:bottom w:type="dxa" w:w="40"/>
+              <w:right w:type="dxa" w:w="70"/>
+            </w:tcMar>
+          </w:tcPr>
+          <w:p>
+            <w:pPr>
+              <w:spacing w:after="0" w:line="236"/>
+            </w:pPr>
+            <w:r>
+              <w:rPr>
+                <w:rFonts w:ascii="Arial" w:cs="Arial" w:eastAsia="Arial" w:hAnsi="Arial"/>
+                <w:sz w:val="19"/>
+                <w:szCs w:val="19"/>
+              </w:rPr>
+              <w:t xml:space="preserve">Correo electrónico</w:t>
+            </w:r>
+          </w:p>
+        </w:tc>
+        <w:tc>
+          <w:tcPr>
+            <w:tcW w:type="dxa" w:w="3100"/>
+            <w:shd w:fill="FFFFFF" w:val="clear"/>
+            <w:tcMar>
+              <w:top w:type="dxa" w:w="40"/>
+              <w:left w:type="dxa" w:w="70"/>
+              <w:bottom w:type="dxa" w:w="40"/>
+              <w:right w:type="dxa" w:w="70"/>
+            </w:tcMar>
+          </w:tcPr>
+          <w:p>
+            <w:pPr>
+              <w:spacing w:after="0" w:line="236"/>
+            </w:pPr>
+            <w:r>
+              <w:rPr>
+                <w:rFonts w:ascii="Arial" w:cs="Arial" w:eastAsia="Arial" w:hAnsi="Arial"/>
+                <w:sz w:val="19"/>
+                <w:szCs w:val="19"/>
+              </w:rPr>
+              <w:t xml:space="preserve">Obligatorio y con formato válido.</w:t>
+            </w:r>
+          </w:p>
+        </w:tc>
+        <w:tc>
+          <w:tcPr>
+            <w:tcW w:type="dxa" w:w="4160"/>
+            <w:shd w:fill="FFFFFF" w:val="clear"/>
+            <w:tcMar>
+              <w:top w:type="dxa" w:w="40"/>
+              <w:left w:type="dxa" w:w="70"/>
+              <w:bottom w:type="dxa" w:w="40"/>
+              <w:right w:type="dxa" w:w="70"/>
+            </w:tcMar>
+          </w:tcPr>
+          <w:p>
+            <w:pPr>
+              <w:spacing w:after="0" w:line="236"/>
+            </w:pPr>
+            <w:r>
+              <w:rPr>
+                <w:rFonts w:ascii="Arial" w:cs="Arial" w:eastAsia="Arial" w:hAnsi="Arial"/>
+                <w:sz w:val="19"/>
+                <w:szCs w:val="19"/>
+              </w:rPr>
+              <w:t xml:space="preserve">Ingresa un correo electrónico válido.</w:t>
+            </w:r>
+          </w:p>
+        </w:tc>
+      </w:tr>
+      <w:tr>
+        <w:trPr>
+          <w:tblHeader w:val="false"/>
+        </w:trPr>
+        <w:tc>
+          <w:tcPr>
+            <w:tcW w:type="dxa" w:w="2100"/>
+            <w:shd w:fill="F2F2F2" w:val="clear"/>
+            <w:tcMar>
+              <w:top w:type="dxa" w:w="40"/>
+              <w:left w:type="dxa" w:w="70"/>
+              <w:bottom w:type="dxa" w:w="40"/>
+              <w:right w:type="dxa" w:w="70"/>
+            </w:tcMar>
+          </w:tcPr>
+          <w:p>
+            <w:pPr>
+              <w:spacing w:after="0" w:line="236"/>
+            </w:pPr>
+            <w:r>
+              <w:rPr>
+                <w:rFonts w:ascii="Arial" w:cs="Arial" w:eastAsia="Arial" w:hAnsi="Arial"/>
+                <w:sz w:val="19"/>
+                <w:szCs w:val="19"/>
+              </w:rPr>
+              <w:t xml:space="preserve">Contraseña</w:t>
+            </w:r>
+          </w:p>
+        </w:tc>
+        <w:tc>
+          <w:tcPr>
+            <w:tcW w:type="dxa" w:w="3100"/>
+            <w:shd w:fill="F2F2F2" w:val="clear"/>
+            <w:tcMar>
+              <w:top w:type="dxa" w:w="40"/>
+              <w:left w:type="dxa" w:w="70"/>
+              <w:bottom w:type="dxa" w:w="40"/>
+              <w:right w:type="dxa" w:w="70"/>
+            </w:tcMar>
+          </w:tcPr>
+          <w:p>
+            <w:pPr>
+              <w:spacing w:after="0" w:line="236"/>
+            </w:pPr>
+            <w:r>
+              <w:rPr>
+                <w:rFonts w:ascii="Arial" w:cs="Arial" w:eastAsia="Arial" w:hAnsi="Arial"/>
+                <w:sz w:val="19"/>
+                <w:szCs w:val="19"/>
+              </w:rPr>
+              <w:t xml:space="preserve">Obligatoria.</w:t>
+            </w:r>
+          </w:p>
+        </w:tc>
+        <w:tc>
+          <w:tcPr>
+            <w:tcW w:type="dxa" w:w="4160"/>
+            <w:shd w:fill="F2F2F2" w:val="clear"/>
+            <w:tcMar>
+              <w:top w:type="dxa" w:w="40"/>
+              <w:left w:type="dxa" w:w="70"/>
+              <w:bottom w:type="dxa" w:w="40"/>
+              <w:right w:type="dxa" w:w="70"/>
+            </w:tcMar>
+          </w:tcPr>
+          <w:p>
+            <w:pPr>
+              <w:spacing w:after="0" w:line="236"/>
+            </w:pPr>
+            <w:r>
+              <w:rPr>
+                <w:rFonts w:ascii="Arial" w:cs="Arial" w:eastAsia="Arial" w:hAnsi="Arial"/>
+                <w:sz w:val="19"/>
+                <w:szCs w:val="19"/>
+              </w:rPr>
+              <w:t xml:space="preserve">La contraseña es obligatoria.</w:t>
+            </w:r>
+          </w:p>
+        </w:tc>
+      </w:tr>
+      <w:tr>
+        <w:trPr>
+          <w:tblHeader w:val="false"/>
+        </w:trPr>
+        <w:tc>
+          <w:tcPr>
+            <w:tcW w:type="dxa" w:w="2100"/>
+            <w:shd w:fill="FFFFFF" w:val="clear"/>
+            <w:tcMar>
+              <w:top w:type="dxa" w:w="40"/>
+              <w:left w:type="dxa" w:w="70"/>
+              <w:bottom w:type="dxa" w:w="40"/>
+              <w:right w:type="dxa" w:w="70"/>
+            </w:tcMar>
+          </w:tcPr>
+          <w:p>
+            <w:pPr>
+              <w:spacing w:after="0" w:line="236"/>
+            </w:pPr>
+            <w:r>
+              <w:rPr>
+                <w:rFonts w:ascii="Arial" w:cs="Arial" w:eastAsia="Arial" w:hAnsi="Arial"/>
+                <w:sz w:val="19"/>
+                <w:szCs w:val="19"/>
+              </w:rPr>
+              <w:t xml:space="preserve">Contraseña (registro)</w:t>
+            </w:r>
+          </w:p>
+        </w:tc>
+        <w:tc>
+          <w:tcPr>
+            <w:tcW w:type="dxa" w:w="3100"/>
+            <w:shd w:fill="FFFFFF" w:val="clear"/>
+            <w:tcMar>
+              <w:top w:type="dxa" w:w="40"/>
+              <w:left w:type="dxa" w:w="70"/>
+              <w:bottom w:type="dxa" w:w="40"/>
+              <w:right w:type="dxa" w:w="70"/>
+            </w:tcMar>
+          </w:tcPr>
+          <w:p>
+            <w:pPr>
+              <w:spacing w:after="0" w:line="236"/>
+            </w:pPr>
+            <w:r>
+              <w:rPr>
+                <w:rFonts w:ascii="Arial" w:cs="Arial" w:eastAsia="Arial" w:hAnsi="Arial"/>
+                <w:sz w:val="19"/>
+                <w:szCs w:val="19"/>
+              </w:rPr>
+              <w:t xml:space="preserve">Mínimo ocho caracteres.</w:t>
+            </w:r>
+          </w:p>
+        </w:tc>
+        <w:tc>
+          <w:tcPr>
+            <w:tcW w:type="dxa" w:w="4160"/>
+            <w:shd w:fill="FFFFFF" w:val="clear"/>
+            <w:tcMar>
+              <w:top w:type="dxa" w:w="40"/>
+              <w:left w:type="dxa" w:w="70"/>
+              <w:bottom w:type="dxa" w:w="40"/>
+              <w:right w:type="dxa" w:w="70"/>
+            </w:tcMar>
+          </w:tcPr>
+          <w:p>
+            <w:pPr>
+              <w:spacing w:after="0" w:line="236"/>
+            </w:pPr>
+            <w:r>
+              <w:rPr>
+                <w:rFonts w:ascii="Arial" w:cs="Arial" w:eastAsia="Arial" w:hAnsi="Arial"/>
+                <w:sz w:val="19"/>
+                <w:szCs w:val="19"/>
+              </w:rPr>
+              <w:t xml:space="preserve">La contraseña debe tener mínimo 8 caracteres.</w:t>
+            </w:r>
+          </w:p>
+        </w:tc>
+      </w:tr>
+      <w:tr>
+        <w:trPr>
+          <w:tblHeader w:val="false"/>
+        </w:trPr>
+        <w:tc>
+          <w:tcPr>
+            <w:tcW w:type="dxa" w:w="2100"/>
+            <w:shd w:fill="F2F2F2" w:val="clear"/>
+            <w:tcMar>
+              <w:top w:type="dxa" w:w="40"/>
+              <w:left w:type="dxa" w:w="70"/>
+              <w:bottom w:type="dxa" w:w="40"/>
+              <w:right w:type="dxa" w:w="70"/>
+            </w:tcMar>
+          </w:tcPr>
+          <w:p>
+            <w:pPr>
+              <w:spacing w:after="0" w:line="236"/>
+            </w:pPr>
+            <w:r>
+              <w:rPr>
+                <w:rFonts w:ascii="Arial" w:cs="Arial" w:eastAsia="Arial" w:hAnsi="Arial"/>
+                <w:sz w:val="19"/>
+                <w:szCs w:val="19"/>
+              </w:rPr>
+              <w:t xml:space="preserve">Nombre del negocio</w:t>
+            </w:r>
+          </w:p>
+        </w:tc>
+        <w:tc>
+          <w:tcPr>
+            <w:tcW w:type="dxa" w:w="3100"/>
+            <w:shd w:fill="F2F2F2" w:val="clear"/>
+            <w:tcMar>
+              <w:top w:type="dxa" w:w="40"/>
+              <w:left w:type="dxa" w:w="70"/>
+              <w:bottom w:type="dxa" w:w="40"/>
+              <w:right w:type="dxa" w:w="70"/>
+            </w:tcMar>
+          </w:tcPr>
+          <w:p>
+            <w:pPr>
+              <w:spacing w:after="0" w:line="236"/>
+            </w:pPr>
+            <w:r>
+              <w:rPr>
+                <w:rFonts w:ascii="Arial" w:cs="Arial" w:eastAsia="Arial" w:hAnsi="Arial"/>
+                <w:sz w:val="19"/>
+                <w:szCs w:val="19"/>
+              </w:rPr>
+              <w:t xml:space="preserve">Obligatorio.</w:t>
+            </w:r>
+          </w:p>
+        </w:tc>
+        <w:tc>
+          <w:tcPr>
+            <w:tcW w:type="dxa" w:w="4160"/>
+            <w:shd w:fill="F2F2F2" w:val="clear"/>
+            <w:tcMar>
+              <w:top w:type="dxa" w:w="40"/>
+              <w:left w:type="dxa" w:w="70"/>
+              <w:bottom w:type="dxa" w:w="40"/>
+              <w:right w:type="dxa" w:w="70"/>
+            </w:tcMar>
+          </w:tcPr>
+          <w:p>
+            <w:pPr>
+              <w:spacing w:after="0" w:line="236"/>
+            </w:pPr>
+            <w:r>
+              <w:rPr>
+                <w:rFonts w:ascii="Arial" w:cs="Arial" w:eastAsia="Arial" w:hAnsi="Arial"/>
+                <w:sz w:val="19"/>
+                <w:szCs w:val="19"/>
+              </w:rPr>
+              <w:t xml:space="preserve">Ingresa el nombre de tu negocio.</w:t>
+            </w:r>
+          </w:p>
+        </w:tc>
+      </w:tr>
+      <w:tr>
+        <w:trPr>
+          <w:tblHeader w:val="false"/>
+        </w:trPr>
+        <w:tc>
+          <w:tcPr>
+            <w:tcW w:type="dxa" w:w="2100"/>
+            <w:shd w:fill="FFFFFF" w:val="clear"/>
+            <w:tcMar>
+              <w:top w:type="dxa" w:w="40"/>
+              <w:left w:type="dxa" w:w="70"/>
+              <w:bottom w:type="dxa" w:w="40"/>
+              <w:right w:type="dxa" w:w="70"/>
+            </w:tcMar>
+          </w:tcPr>
+          <w:p>
+            <w:pPr>
+              <w:spacing w:after="0" w:line="236"/>
+            </w:pPr>
+            <w:r>
+              <w:rPr>
+                <w:rFonts w:ascii="Arial" w:cs="Arial" w:eastAsia="Arial" w:hAnsi="Arial"/>
+                <w:sz w:val="19"/>
+                <w:szCs w:val="19"/>
+              </w:rPr>
+              <w:t xml:space="preserve">Nombre y apellido</w:t>
+            </w:r>
+          </w:p>
+        </w:tc>
+        <w:tc>
+          <w:tcPr>
+            <w:tcW w:type="dxa" w:w="3100"/>
+            <w:shd w:fill="FFFFFF" w:val="clear"/>
+            <w:tcMar>
+              <w:top w:type="dxa" w:w="40"/>
+              <w:left w:type="dxa" w:w="70"/>
+              <w:bottom w:type="dxa" w:w="40"/>
+              <w:right w:type="dxa" w:w="70"/>
+            </w:tcMar>
+          </w:tcPr>
+          <w:p>
+            <w:pPr>
+              <w:spacing w:after="0" w:line="236"/>
+            </w:pPr>
+            <w:r>
+              <w:rPr>
+                <w:rFonts w:ascii="Arial" w:cs="Arial" w:eastAsia="Arial" w:hAnsi="Arial"/>
+                <w:sz w:val="19"/>
+                <w:szCs w:val="19"/>
+              </w:rPr>
+              <w:t xml:space="preserve">Obligatorio.</w:t>
+            </w:r>
+          </w:p>
+        </w:tc>
+        <w:tc>
+          <w:tcPr>
+            <w:tcW w:type="dxa" w:w="4160"/>
+            <w:shd w:fill="FFFFFF" w:val="clear"/>
+            <w:tcMar>
+              <w:top w:type="dxa" w:w="40"/>
+              <w:left w:type="dxa" w:w="70"/>
+              <w:bottom w:type="dxa" w:w="40"/>
+              <w:right w:type="dxa" w:w="70"/>
+            </w:tcMar>
+          </w:tcPr>
+          <w:p>
+            <w:pPr>
+              <w:spacing w:after="0" w:line="236"/>
+            </w:pPr>
+            <w:r>
+              <w:rPr>
+                <w:rFonts w:ascii="Arial" w:cs="Arial" w:eastAsia="Arial" w:hAnsi="Arial"/>
+                <w:sz w:val="19"/>
+                <w:szCs w:val="19"/>
+              </w:rPr>
+              <w:t xml:space="preserve">Ingresa tu nombre y apellido.</w:t>
+            </w:r>
+          </w:p>
+        </w:tc>
+      </w:tr>
+      <w:tr>
+        <w:trPr>
+          <w:tblHeader w:val="false"/>
+        </w:trPr>
+        <w:tc>
+          <w:tcPr>
+            <w:tcW w:type="dxa" w:w="2100"/>
+            <w:shd w:fill="F2F2F2" w:val="clear"/>
+            <w:tcMar>
+              <w:top w:type="dxa" w:w="40"/>
+              <w:left w:type="dxa" w:w="70"/>
+              <w:bottom w:type="dxa" w:w="40"/>
+              <w:right w:type="dxa" w:w="70"/>
+            </w:tcMar>
+          </w:tcPr>
+          <w:p>
+            <w:pPr>
+              <w:spacing w:after="0" w:line="236"/>
+            </w:pPr>
+            <w:r>
+              <w:rPr>
+                <w:rFonts w:ascii="Arial" w:cs="Arial" w:eastAsia="Arial" w:hAnsi="Arial"/>
+                <w:sz w:val="19"/>
+                <w:szCs w:val="19"/>
+              </w:rPr>
+              <w:t xml:space="preserve">Credenciales</w:t>
+            </w:r>
+          </w:p>
+        </w:tc>
+        <w:tc>
+          <w:tcPr>
+            <w:tcW w:type="dxa" w:w="3100"/>
+            <w:shd w:fill="F2F2F2" w:val="clear"/>
+            <w:tcMar>
+              <w:top w:type="dxa" w:w="40"/>
+              <w:left w:type="dxa" w:w="70"/>
+              <w:bottom w:type="dxa" w:w="40"/>
+              <w:right w:type="dxa" w:w="70"/>
+            </w:tcMar>
+          </w:tcPr>
+          <w:p>
+            <w:pPr>
+              <w:spacing w:after="0" w:line="236"/>
+            </w:pPr>
+            <w:r>
+              <w:rPr>
+                <w:rFonts w:ascii="Arial" w:cs="Arial" w:eastAsia="Arial" w:hAnsi="Arial"/>
+                <w:sz w:val="19"/>
+                <w:szCs w:val="19"/>
+              </w:rPr>
+              <w:t xml:space="preserve">Deben corresponder a una cuenta activa.</w:t>
+            </w:r>
+          </w:p>
+        </w:tc>
+        <w:tc>
+          <w:tcPr>
+            <w:tcW w:type="dxa" w:w="4160"/>
+            <w:shd w:fill="F2F2F2" w:val="clear"/>
+            <w:tcMar>
+              <w:top w:type="dxa" w:w="40"/>
+              <w:left w:type="dxa" w:w="70"/>
+              <w:bottom w:type="dxa" w:w="40"/>
+              <w:right w:type="dxa" w:w="70"/>
+            </w:tcMar>
+          </w:tcPr>
+          <w:p>
+            <w:pPr>
+              <w:spacing w:after="0" w:line="236"/>
+            </w:pPr>
+            <w:r>
+              <w:rPr>
+                <w:rFonts w:ascii="Arial" w:cs="Arial" w:eastAsia="Arial" w:hAnsi="Arial"/>
+                <w:sz w:val="19"/>
+                <w:szCs w:val="19"/>
+              </w:rPr>
+              <w:t xml:space="preserve">El correo o la contraseña no son correctos.</w:t>
             </w:r>
           </w:p>
         </w:tc>

</xml_diff>

<commit_message>
Completo el documento técnico de diseño con las pantallas, los mensajes y el comportamiento responsivo, y corrijo el modo oscuro del prototipo
</commit_message>
<xml_diff>
--- a/docs/diseno/INVENTRA_Documento_Tecnico_Diseno.docx
+++ b/docs/diseno/INVENTRA_Documento_Tecnico_Diseno.docx
@@ -300,7 +300,7 @@
                 <w:sz w:val="19"/>
                 <w:szCs w:val="19"/>
               </w:rPr>
-              <w:t xml:space="preserve">09/09/2026</w:t>
+              <w:t xml:space="preserve">11/09/2026</w:t>
             </w:r>
           </w:p>
         </w:tc>
@@ -1263,6 +1263,595 @@
       <w:r>
         <w:fldChar w:fldCharType="begin" w:dirty="true"/>
         <w:instrText xml:space="preserve">PAGEREF bm25</w:instrText>
+        <w:fldChar w:fldCharType="end"/>
+      </w:r>
+    </w:p>
+    <w:p>
+      <w:pPr>
+        <w:tabs>
+          <w:tab w:val="right" w:pos="9200" w:leader="dot"/>
+        </w:tabs>
+        <w:spacing w:after="40" w:line="252"/>
+      </w:pPr>
+      <w:hyperlink w:history="1" w:anchor="bm26">
+        <w:r>
+          <w:rPr>
+            <w:rFonts w:ascii="Arial" w:cs="Arial" w:eastAsia="Arial" w:hAnsi="Arial"/>
+            <w:b/>
+            <w:bCs/>
+            <w:color w:val="1F3864"/>
+            <w:sz w:val="21"/>
+            <w:szCs w:val="21"/>
+          </w:rPr>
+          <w:t xml:space="preserve">8. Pantallas principales</w:t>
+        </w:r>
+      </w:hyperlink>
+      <w:r>
+        <w:rPr>
+          <w:rFonts w:ascii="Arial" w:cs="Arial" w:eastAsia="Arial" w:hAnsi="Arial"/>
+          <w:sz w:val="20"/>
+          <w:szCs w:val="20"/>
+        </w:rPr>
+        <w:t xml:space="preserve">	</w:t>
+      </w:r>
+      <w:r>
+        <w:fldChar w:fldCharType="begin" w:dirty="true"/>
+        <w:instrText xml:space="preserve">PAGEREF bm26</w:instrText>
+        <w:fldChar w:fldCharType="end"/>
+      </w:r>
+    </w:p>
+    <w:p>
+      <w:pPr>
+        <w:tabs>
+          <w:tab w:val="right" w:pos="9200" w:leader="dot"/>
+        </w:tabs>
+        <w:spacing w:after="40" w:line="252"/>
+        <w:ind w:left="360"/>
+      </w:pPr>
+      <w:hyperlink w:history="1" w:anchor="bm27">
+        <w:r>
+          <w:rPr>
+            <w:rFonts w:ascii="Arial" w:cs="Arial" w:eastAsia="Arial" w:hAnsi="Arial"/>
+            <w:b w:val="false"/>
+            <w:bCs w:val="false"/>
+            <w:color w:val="1F3864"/>
+            <w:sz w:val="20"/>
+            <w:szCs w:val="20"/>
+          </w:rPr>
+          <w:t xml:space="preserve">8.1 Página de presentación</w:t>
+        </w:r>
+      </w:hyperlink>
+      <w:r>
+        <w:rPr>
+          <w:rFonts w:ascii="Arial" w:cs="Arial" w:eastAsia="Arial" w:hAnsi="Arial"/>
+          <w:sz w:val="20"/>
+          <w:szCs w:val="20"/>
+        </w:rPr>
+        <w:t xml:space="preserve">	</w:t>
+      </w:r>
+      <w:r>
+        <w:fldChar w:fldCharType="begin" w:dirty="true"/>
+        <w:instrText xml:space="preserve">PAGEREF bm27</w:instrText>
+        <w:fldChar w:fldCharType="end"/>
+      </w:r>
+    </w:p>
+    <w:p>
+      <w:pPr>
+        <w:tabs>
+          <w:tab w:val="right" w:pos="9200" w:leader="dot"/>
+        </w:tabs>
+        <w:spacing w:after="40" w:line="252"/>
+        <w:ind w:left="360"/>
+      </w:pPr>
+      <w:hyperlink w:history="1" w:anchor="bm28">
+        <w:r>
+          <w:rPr>
+            <w:rFonts w:ascii="Arial" w:cs="Arial" w:eastAsia="Arial" w:hAnsi="Arial"/>
+            <w:b w:val="false"/>
+            <w:bCs w:val="false"/>
+            <w:color w:val="1F3864"/>
+            <w:sz w:val="20"/>
+            <w:szCs w:val="20"/>
+          </w:rPr>
+          <w:t xml:space="preserve">8.2 Panel principal</w:t>
+        </w:r>
+      </w:hyperlink>
+      <w:r>
+        <w:rPr>
+          <w:rFonts w:ascii="Arial" w:cs="Arial" w:eastAsia="Arial" w:hAnsi="Arial"/>
+          <w:sz w:val="20"/>
+          <w:szCs w:val="20"/>
+        </w:rPr>
+        <w:t xml:space="preserve">	</w:t>
+      </w:r>
+      <w:r>
+        <w:fldChar w:fldCharType="begin" w:dirty="true"/>
+        <w:instrText xml:space="preserve">PAGEREF bm28</w:instrText>
+        <w:fldChar w:fldCharType="end"/>
+      </w:r>
+    </w:p>
+    <w:p>
+      <w:pPr>
+        <w:tabs>
+          <w:tab w:val="right" w:pos="9200" w:leader="dot"/>
+        </w:tabs>
+        <w:spacing w:after="40" w:line="252"/>
+        <w:ind w:left="360"/>
+      </w:pPr>
+      <w:hyperlink w:history="1" w:anchor="bm29">
+        <w:r>
+          <w:rPr>
+            <w:rFonts w:ascii="Arial" w:cs="Arial" w:eastAsia="Arial" w:hAnsi="Arial"/>
+            <w:b w:val="false"/>
+            <w:bCs w:val="false"/>
+            <w:color w:val="1F3864"/>
+            <w:sz w:val="20"/>
+            <w:szCs w:val="20"/>
+          </w:rPr>
+          <w:t xml:space="preserve">8.3 Inventario: lista de productos</w:t>
+        </w:r>
+      </w:hyperlink>
+      <w:r>
+        <w:rPr>
+          <w:rFonts w:ascii="Arial" w:cs="Arial" w:eastAsia="Arial" w:hAnsi="Arial"/>
+          <w:sz w:val="20"/>
+          <w:szCs w:val="20"/>
+        </w:rPr>
+        <w:t xml:space="preserve">	</w:t>
+      </w:r>
+      <w:r>
+        <w:fldChar w:fldCharType="begin" w:dirty="true"/>
+        <w:instrText xml:space="preserve">PAGEREF bm29</w:instrText>
+        <w:fldChar w:fldCharType="end"/>
+      </w:r>
+    </w:p>
+    <w:p>
+      <w:pPr>
+        <w:tabs>
+          <w:tab w:val="right" w:pos="9200" w:leader="dot"/>
+        </w:tabs>
+        <w:spacing w:after="40" w:line="252"/>
+        <w:ind w:left="360"/>
+      </w:pPr>
+      <w:hyperlink w:history="1" w:anchor="bm30">
+        <w:r>
+          <w:rPr>
+            <w:rFonts w:ascii="Arial" w:cs="Arial" w:eastAsia="Arial" w:hAnsi="Arial"/>
+            <w:b w:val="false"/>
+            <w:bCs w:val="false"/>
+            <w:color w:val="1F3864"/>
+            <w:sz w:val="20"/>
+            <w:szCs w:val="20"/>
+          </w:rPr>
+          <w:t xml:space="preserve">8.4 Inventario: registro y edición de producto</w:t>
+        </w:r>
+      </w:hyperlink>
+      <w:r>
+        <w:rPr>
+          <w:rFonts w:ascii="Arial" w:cs="Arial" w:eastAsia="Arial" w:hAnsi="Arial"/>
+          <w:sz w:val="20"/>
+          <w:szCs w:val="20"/>
+        </w:rPr>
+        <w:t xml:space="preserve">	</w:t>
+      </w:r>
+      <w:r>
+        <w:fldChar w:fldCharType="begin" w:dirty="true"/>
+        <w:instrText xml:space="preserve">PAGEREF bm30</w:instrText>
+        <w:fldChar w:fldCharType="end"/>
+      </w:r>
+    </w:p>
+    <w:p>
+      <w:pPr>
+        <w:tabs>
+          <w:tab w:val="right" w:pos="9200" w:leader="dot"/>
+        </w:tabs>
+        <w:spacing w:after="40" w:line="252"/>
+        <w:ind w:left="360"/>
+      </w:pPr>
+      <w:hyperlink w:history="1" w:anchor="bm31">
+        <w:r>
+          <w:rPr>
+            <w:rFonts w:ascii="Arial" w:cs="Arial" w:eastAsia="Arial" w:hAnsi="Arial"/>
+            <w:b w:val="false"/>
+            <w:bCs w:val="false"/>
+            <w:color w:val="1F3864"/>
+            <w:sz w:val="20"/>
+            <w:szCs w:val="20"/>
+          </w:rPr>
+          <w:t xml:space="preserve">8.5 Punto de venta</w:t>
+        </w:r>
+      </w:hyperlink>
+      <w:r>
+        <w:rPr>
+          <w:rFonts w:ascii="Arial" w:cs="Arial" w:eastAsia="Arial" w:hAnsi="Arial"/>
+          <w:sz w:val="20"/>
+          <w:szCs w:val="20"/>
+        </w:rPr>
+        <w:t xml:space="preserve">	</w:t>
+      </w:r>
+      <w:r>
+        <w:fldChar w:fldCharType="begin" w:dirty="true"/>
+        <w:instrText xml:space="preserve">PAGEREF bm31</w:instrText>
+        <w:fldChar w:fldCharType="end"/>
+      </w:r>
+    </w:p>
+    <w:p>
+      <w:pPr>
+        <w:tabs>
+          <w:tab w:val="right" w:pos="9200" w:leader="dot"/>
+        </w:tabs>
+        <w:spacing w:after="40" w:line="252"/>
+        <w:ind w:left="360"/>
+      </w:pPr>
+      <w:hyperlink w:history="1" w:anchor="bm32">
+        <w:r>
+          <w:rPr>
+            <w:rFonts w:ascii="Arial" w:cs="Arial" w:eastAsia="Arial" w:hAnsi="Arial"/>
+            <w:b w:val="false"/>
+            <w:bCs w:val="false"/>
+            <w:color w:val="1F3864"/>
+            <w:sz w:val="20"/>
+            <w:szCs w:val="20"/>
+          </w:rPr>
+          <w:t xml:space="preserve">8.6 Reportes</w:t>
+        </w:r>
+      </w:hyperlink>
+      <w:r>
+        <w:rPr>
+          <w:rFonts w:ascii="Arial" w:cs="Arial" w:eastAsia="Arial" w:hAnsi="Arial"/>
+          <w:sz w:val="20"/>
+          <w:szCs w:val="20"/>
+        </w:rPr>
+        <w:t xml:space="preserve">	</w:t>
+      </w:r>
+      <w:r>
+        <w:fldChar w:fldCharType="begin" w:dirty="true"/>
+        <w:instrText xml:space="preserve">PAGEREF bm32</w:instrText>
+        <w:fldChar w:fldCharType="end"/>
+      </w:r>
+    </w:p>
+    <w:p>
+      <w:pPr>
+        <w:tabs>
+          <w:tab w:val="right" w:pos="9200" w:leader="dot"/>
+        </w:tabs>
+        <w:spacing w:after="40" w:line="252"/>
+      </w:pPr>
+      <w:hyperlink w:history="1" w:anchor="bm33">
+        <w:r>
+          <w:rPr>
+            <w:rFonts w:ascii="Arial" w:cs="Arial" w:eastAsia="Arial" w:hAnsi="Arial"/>
+            <w:b/>
+            <w:bCs/>
+            <w:color w:val="1F3864"/>
+            <w:sz w:val="21"/>
+            <w:szCs w:val="21"/>
+          </w:rPr>
+          <w:t xml:space="preserve">9. Mensajes y estados de pantalla</w:t>
+        </w:r>
+      </w:hyperlink>
+      <w:r>
+        <w:rPr>
+          <w:rFonts w:ascii="Arial" w:cs="Arial" w:eastAsia="Arial" w:hAnsi="Arial"/>
+          <w:sz w:val="20"/>
+          <w:szCs w:val="20"/>
+        </w:rPr>
+        <w:t xml:space="preserve">	</w:t>
+      </w:r>
+      <w:r>
+        <w:fldChar w:fldCharType="begin" w:dirty="true"/>
+        <w:instrText xml:space="preserve">PAGEREF bm33</w:instrText>
+        <w:fldChar w:fldCharType="end"/>
+      </w:r>
+    </w:p>
+    <w:p>
+      <w:pPr>
+        <w:tabs>
+          <w:tab w:val="right" w:pos="9200" w:leader="dot"/>
+        </w:tabs>
+        <w:spacing w:after="40" w:line="252"/>
+        <w:ind w:left="360"/>
+      </w:pPr>
+      <w:hyperlink w:history="1" w:anchor="bm34">
+        <w:r>
+          <w:rPr>
+            <w:rFonts w:ascii="Arial" w:cs="Arial" w:eastAsia="Arial" w:hAnsi="Arial"/>
+            <w:b w:val="false"/>
+            <w:bCs w:val="false"/>
+            <w:color w:val="1F3864"/>
+            <w:sz w:val="20"/>
+            <w:szCs w:val="20"/>
+          </w:rPr>
+          <w:t xml:space="preserve">9.1 Estados de una pantalla</w:t>
+        </w:r>
+      </w:hyperlink>
+      <w:r>
+        <w:rPr>
+          <w:rFonts w:ascii="Arial" w:cs="Arial" w:eastAsia="Arial" w:hAnsi="Arial"/>
+          <w:sz w:val="20"/>
+          <w:szCs w:val="20"/>
+        </w:rPr>
+        <w:t xml:space="preserve">	</w:t>
+      </w:r>
+      <w:r>
+        <w:fldChar w:fldCharType="begin" w:dirty="true"/>
+        <w:instrText xml:space="preserve">PAGEREF bm34</w:instrText>
+        <w:fldChar w:fldCharType="end"/>
+      </w:r>
+    </w:p>
+    <w:p>
+      <w:pPr>
+        <w:tabs>
+          <w:tab w:val="right" w:pos="9200" w:leader="dot"/>
+        </w:tabs>
+        <w:spacing w:after="40" w:line="252"/>
+        <w:ind w:left="360"/>
+      </w:pPr>
+      <w:hyperlink w:history="1" w:anchor="bm35">
+        <w:r>
+          <w:rPr>
+            <w:rFonts w:ascii="Arial" w:cs="Arial" w:eastAsia="Arial" w:hAnsi="Arial"/>
+            <w:b w:val="false"/>
+            <w:bCs w:val="false"/>
+            <w:color w:val="1F3864"/>
+            <w:sz w:val="20"/>
+            <w:szCs w:val="20"/>
+          </w:rPr>
+          <w:t xml:space="preserve">9.2 Redacción de los mensajes</w:t>
+        </w:r>
+      </w:hyperlink>
+      <w:r>
+        <w:rPr>
+          <w:rFonts w:ascii="Arial" w:cs="Arial" w:eastAsia="Arial" w:hAnsi="Arial"/>
+          <w:sz w:val="20"/>
+          <w:szCs w:val="20"/>
+        </w:rPr>
+        <w:t xml:space="preserve">	</w:t>
+      </w:r>
+      <w:r>
+        <w:fldChar w:fldCharType="begin" w:dirty="true"/>
+        <w:instrText xml:space="preserve">PAGEREF bm35</w:instrText>
+        <w:fldChar w:fldCharType="end"/>
+      </w:r>
+    </w:p>
+    <w:p>
+      <w:pPr>
+        <w:tabs>
+          <w:tab w:val="right" w:pos="9200" w:leader="dot"/>
+        </w:tabs>
+        <w:spacing w:after="40" w:line="252"/>
+      </w:pPr>
+      <w:hyperlink w:history="1" w:anchor="bm36">
+        <w:r>
+          <w:rPr>
+            <w:rFonts w:ascii="Arial" w:cs="Arial" w:eastAsia="Arial" w:hAnsi="Arial"/>
+            <w:b/>
+            <w:bCs/>
+            <w:color w:val="1F3864"/>
+            <w:sz w:val="21"/>
+            <w:szCs w:val="21"/>
+          </w:rPr>
+          <w:t xml:space="preserve">10. Comportamiento responsivo y modo oscuro</w:t>
+        </w:r>
+      </w:hyperlink>
+      <w:r>
+        <w:rPr>
+          <w:rFonts w:ascii="Arial" w:cs="Arial" w:eastAsia="Arial" w:hAnsi="Arial"/>
+          <w:sz w:val="20"/>
+          <w:szCs w:val="20"/>
+        </w:rPr>
+        <w:t xml:space="preserve">	</w:t>
+      </w:r>
+      <w:r>
+        <w:fldChar w:fldCharType="begin" w:dirty="true"/>
+        <w:instrText xml:space="preserve">PAGEREF bm36</w:instrText>
+        <w:fldChar w:fldCharType="end"/>
+      </w:r>
+    </w:p>
+    <w:p>
+      <w:pPr>
+        <w:tabs>
+          <w:tab w:val="right" w:pos="9200" w:leader="dot"/>
+        </w:tabs>
+        <w:spacing w:after="40" w:line="252"/>
+        <w:ind w:left="360"/>
+      </w:pPr>
+      <w:hyperlink w:history="1" w:anchor="bm37">
+        <w:r>
+          <w:rPr>
+            <w:rFonts w:ascii="Arial" w:cs="Arial" w:eastAsia="Arial" w:hAnsi="Arial"/>
+            <w:b w:val="false"/>
+            <w:bCs w:val="false"/>
+            <w:color w:val="1F3864"/>
+            <w:sz w:val="20"/>
+            <w:szCs w:val="20"/>
+          </w:rPr>
+          <w:t xml:space="preserve">10.1 Versión móvil</w:t>
+        </w:r>
+      </w:hyperlink>
+      <w:r>
+        <w:rPr>
+          <w:rFonts w:ascii="Arial" w:cs="Arial" w:eastAsia="Arial" w:hAnsi="Arial"/>
+          <w:sz w:val="20"/>
+          <w:szCs w:val="20"/>
+        </w:rPr>
+        <w:t xml:space="preserve">	</w:t>
+      </w:r>
+      <w:r>
+        <w:fldChar w:fldCharType="begin" w:dirty="true"/>
+        <w:instrText xml:space="preserve">PAGEREF bm37</w:instrText>
+        <w:fldChar w:fldCharType="end"/>
+      </w:r>
+    </w:p>
+    <w:p>
+      <w:pPr>
+        <w:tabs>
+          <w:tab w:val="right" w:pos="9200" w:leader="dot"/>
+        </w:tabs>
+        <w:spacing w:after="40" w:line="252"/>
+        <w:ind w:left="360"/>
+      </w:pPr>
+      <w:hyperlink w:history="1" w:anchor="bm38">
+        <w:r>
+          <w:rPr>
+            <w:rFonts w:ascii="Arial" w:cs="Arial" w:eastAsia="Arial" w:hAnsi="Arial"/>
+            <w:b w:val="false"/>
+            <w:bCs w:val="false"/>
+            <w:color w:val="1F3864"/>
+            <w:sz w:val="20"/>
+            <w:szCs w:val="20"/>
+          </w:rPr>
+          <w:t xml:space="preserve">10.2 Tablet y escritorio</w:t>
+        </w:r>
+      </w:hyperlink>
+      <w:r>
+        <w:rPr>
+          <w:rFonts w:ascii="Arial" w:cs="Arial" w:eastAsia="Arial" w:hAnsi="Arial"/>
+          <w:sz w:val="20"/>
+          <w:szCs w:val="20"/>
+        </w:rPr>
+        <w:t xml:space="preserve">	</w:t>
+      </w:r>
+      <w:r>
+        <w:fldChar w:fldCharType="begin" w:dirty="true"/>
+        <w:instrText xml:space="preserve">PAGEREF bm38</w:instrText>
+        <w:fldChar w:fldCharType="end"/>
+      </w:r>
+    </w:p>
+    <w:p>
+      <w:pPr>
+        <w:tabs>
+          <w:tab w:val="right" w:pos="9200" w:leader="dot"/>
+        </w:tabs>
+        <w:spacing w:after="40" w:line="252"/>
+        <w:ind w:left="360"/>
+      </w:pPr>
+      <w:hyperlink w:history="1" w:anchor="bm39">
+        <w:r>
+          <w:rPr>
+            <w:rFonts w:ascii="Arial" w:cs="Arial" w:eastAsia="Arial" w:hAnsi="Arial"/>
+            <w:b w:val="false"/>
+            <w:bCs w:val="false"/>
+            <w:color w:val="1F3864"/>
+            <w:sz w:val="20"/>
+            <w:szCs w:val="20"/>
+          </w:rPr>
+          <w:t xml:space="preserve">10.3 Modo oscuro</w:t>
+        </w:r>
+      </w:hyperlink>
+      <w:r>
+        <w:rPr>
+          <w:rFonts w:ascii="Arial" w:cs="Arial" w:eastAsia="Arial" w:hAnsi="Arial"/>
+          <w:sz w:val="20"/>
+          <w:szCs w:val="20"/>
+        </w:rPr>
+        <w:t xml:space="preserve">	</w:t>
+      </w:r>
+      <w:r>
+        <w:fldChar w:fldCharType="begin" w:dirty="true"/>
+        <w:instrText xml:space="preserve">PAGEREF bm39</w:instrText>
+        <w:fldChar w:fldCharType="end"/>
+      </w:r>
+    </w:p>
+    <w:p>
+      <w:pPr>
+        <w:tabs>
+          <w:tab w:val="right" w:pos="9200" w:leader="dot"/>
+        </w:tabs>
+        <w:spacing w:after="40" w:line="252"/>
+      </w:pPr>
+      <w:hyperlink w:history="1" w:anchor="bm40">
+        <w:r>
+          <w:rPr>
+            <w:rFonts w:ascii="Arial" w:cs="Arial" w:eastAsia="Arial" w:hAnsi="Arial"/>
+            <w:b/>
+            <w:bCs/>
+            <w:color w:val="1F3864"/>
+            <w:sz w:val="21"/>
+            <w:szCs w:val="21"/>
+          </w:rPr>
+          <w:t xml:space="preserve">11. Conclusión</w:t>
+        </w:r>
+      </w:hyperlink>
+      <w:r>
+        <w:rPr>
+          <w:rFonts w:ascii="Arial" w:cs="Arial" w:eastAsia="Arial" w:hAnsi="Arial"/>
+          <w:sz w:val="20"/>
+          <w:szCs w:val="20"/>
+        </w:rPr>
+        <w:t xml:space="preserve">	</w:t>
+      </w:r>
+      <w:r>
+        <w:fldChar w:fldCharType="begin" w:dirty="true"/>
+        <w:instrText xml:space="preserve">PAGEREF bm40</w:instrText>
+        <w:fldChar w:fldCharType="end"/>
+      </w:r>
+    </w:p>
+    <w:p>
+      <w:pPr>
+        <w:tabs>
+          <w:tab w:val="right" w:pos="9200" w:leader="dot"/>
+        </w:tabs>
+        <w:spacing w:after="40" w:line="252"/>
+      </w:pPr>
+      <w:hyperlink w:history="1" w:anchor="bm41">
+        <w:r>
+          <w:rPr>
+            <w:rFonts w:ascii="Arial" w:cs="Arial" w:eastAsia="Arial" w:hAnsi="Arial"/>
+            <w:b/>
+            <w:bCs/>
+            <w:color w:val="1F3864"/>
+            <w:sz w:val="21"/>
+            <w:szCs w:val="21"/>
+          </w:rPr>
+          <w:t xml:space="preserve">12. Glosario</w:t>
+        </w:r>
+      </w:hyperlink>
+      <w:r>
+        <w:rPr>
+          <w:rFonts w:ascii="Arial" w:cs="Arial" w:eastAsia="Arial" w:hAnsi="Arial"/>
+          <w:sz w:val="20"/>
+          <w:szCs w:val="20"/>
+        </w:rPr>
+        <w:t xml:space="preserve">	</w:t>
+      </w:r>
+      <w:r>
+        <w:fldChar w:fldCharType="begin" w:dirty="true"/>
+        <w:instrText xml:space="preserve">PAGEREF bm41</w:instrText>
+        <w:fldChar w:fldCharType="end"/>
+      </w:r>
+    </w:p>
+    <w:p>
+      <w:pPr>
+        <w:tabs>
+          <w:tab w:val="right" w:pos="9200" w:leader="dot"/>
+        </w:tabs>
+        <w:spacing w:after="40" w:line="252"/>
+      </w:pPr>
+      <w:hyperlink w:history="1" w:anchor="bm42">
+        <w:r>
+          <w:rPr>
+            <w:rFonts w:ascii="Arial" w:cs="Arial" w:eastAsia="Arial" w:hAnsi="Arial"/>
+            <w:b/>
+            <w:bCs/>
+            <w:color w:val="1F3864"/>
+            <w:sz w:val="21"/>
+            <w:szCs w:val="21"/>
+          </w:rPr>
+          <w:t xml:space="preserve">13. Referencias</w:t>
+        </w:r>
+      </w:hyperlink>
+      <w:r>
+        <w:rPr>
+          <w:rFonts w:ascii="Arial" w:cs="Arial" w:eastAsia="Arial" w:hAnsi="Arial"/>
+          <w:sz w:val="20"/>
+          <w:szCs w:val="20"/>
+        </w:rPr>
+        <w:t xml:space="preserve">	</w:t>
+      </w:r>
+      <w:r>
+        <w:fldChar w:fldCharType="begin" w:dirty="true"/>
+        <w:instrText xml:space="preserve">PAGEREF bm42</w:instrText>
         <w:fldChar w:fldCharType="end"/>
       </w:r>
     </w:p>
@@ -7515,6 +8104,2878 @@
         </w:tc>
       </w:tr>
     </w:tbl>
+    <w:p>
+      <w:pPr>
+        <w:pStyle w:val="Heading1"/>
+        <w:pageBreakBefore/>
+        <w:spacing w:after="110" w:before="220"/>
+      </w:pPr>
+      <w:bookmarkStart w:name="bm26" w:id="26"/>
+      <w:r>
+        <w:rPr>
+          <w:rFonts w:ascii="Arial" w:cs="Arial" w:eastAsia="Arial" w:hAnsi="Arial"/>
+          <w:b/>
+          <w:bCs/>
+          <w:color w:val="1F3864"/>
+          <w:sz w:val="27"/>
+          <w:szCs w:val="27"/>
+        </w:rPr>
+        <w:t xml:space="preserve">8. Pantallas principales</w:t>
+      </w:r>
+      <w:bookmarkEnd w:id="26"/>
+    </w:p>
+    <w:p>
+      <w:pPr>
+        <w:spacing w:after="110" w:line="262"/>
+        <w:jc w:val="both"/>
+      </w:pPr>
+      <w:r>
+        <w:rPr>
+          <w:rFonts w:ascii="Arial" w:cs="Arial" w:eastAsia="Arial" w:hAnsi="Arial"/>
+          <w:sz w:val="22"/>
+          <w:szCs w:val="22"/>
+        </w:rPr>
+        <w:t xml:space="preserve">Las pantallas que se presentan a continuación corresponden a los requisitos funcionales de prioridad alta y a las vistas previstas en la especificación de requisitos. Todas se muestran en modo claro y en resolución de escritorio; su comportamiento en pantallas menores se describe en la sección 10. Las imágenes provienen del prototipo de INVENTRA y los datos que aparecen en ellas son de ejemplo.</w:t>
+      </w:r>
+    </w:p>
+    <w:p>
+      <w:pPr>
+        <w:pStyle w:val="Heading2"/>
+        <w:spacing w:after="80" w:before="150"/>
+      </w:pPr>
+      <w:bookmarkStart w:name="bm27" w:id="27"/>
+      <w:r>
+        <w:rPr>
+          <w:rFonts w:ascii="Arial" w:cs="Arial" w:eastAsia="Arial" w:hAnsi="Arial"/>
+          <w:b/>
+          <w:bCs/>
+          <w:color w:val="2E5496"/>
+          <w:sz w:val="23"/>
+          <w:szCs w:val="23"/>
+        </w:rPr>
+        <w:t xml:space="preserve">8.1 Página de presentación</w:t>
+      </w:r>
+      <w:bookmarkEnd w:id="27"/>
+    </w:p>
+    <w:p>
+      <w:pPr>
+        <w:spacing w:after="110" w:line="262"/>
+        <w:jc w:val="both"/>
+      </w:pPr>
+      <w:r>
+        <w:rPr>
+          <w:rFonts w:ascii="Arial" w:cs="Arial" w:eastAsia="Arial" w:hAnsi="Arial"/>
+          <w:sz w:val="22"/>
+          <w:szCs w:val="22"/>
+        </w:rPr>
+        <w:t xml:space="preserve">Es la pantalla pública del producto y la puerta de entrada al registro. Se compone de una barra superior con la marca, los enlaces de navegación y la acción de prueba gratuita; un bloque principal con la promesa del producto y dos acciones —una principal para iniciar la prueba y una secundaria para ver la demostración—; y una franja con los tres beneficios centrales: inventario en tiempo real con control por lote, punto de venta rápido y reportes de ventas y utilidad.</w:t>
+      </w:r>
+    </w:p>
+    <w:p>
+      <w:pPr>
+        <w:spacing w:after="20" w:before="60"/>
+        <w:jc w:val="center"/>
+      </w:pPr>
+      <w:r>
+        <w:drawing>
+          <wp:inline distT="0" distB="0" distL="0" distR="0">
+            <wp:extent cx="6096000" cy="3000375"/>
+            <wp:effectExtent t="0" r="0" b="0" l="0"/>
+            <wp:docPr id="1" name="" descr="" title=""/>
+            <wp:cNvGraphicFramePr>
+              <a:graphicFrameLocks xmlns:a="http://schemas.openxmlformats.org/drawingml/2006/main" noChangeAspect="1"/>
+            </wp:cNvGraphicFramePr>
+            <a:graphic xmlns:a="http://schemas.openxmlformats.org/drawingml/2006/main">
+              <a:graphicData uri="http://schemas.openxmlformats.org/drawingml/2006/picture">
+                <pic:pic xmlns:pic="http://schemas.openxmlformats.org/drawingml/2006/picture">
+                  <pic:nvPicPr>
+                    <pic:cNvPr id="0" name="" descr=""/>
+                    <pic:cNvPicPr>
+                      <a:picLocks noChangeAspect="1" noChangeArrowheads="1"/>
+                    </pic:cNvPicPr>
+                  </pic:nvPicPr>
+                  <pic:blipFill>
+                    <a:blip r:embed="rId17" cstate="none"/>
+                    <a:srcRect/>
+                    <a:stretch>
+                      <a:fillRect/>
+                    </a:stretch>
+                  </pic:blipFill>
+                  <pic:spPr bwMode="auto">
+                    <a:xfrm>
+                      <a:off x="0" y="0"/>
+                      <a:ext cx="6096000" cy="3000375"/>
+                    </a:xfrm>
+                    <a:prstGeom prst="rect">
+                      <a:avLst/>
+                    </a:prstGeom>
+                  </pic:spPr>
+                </pic:pic>
+              </a:graphicData>
+            </a:graphic>
+          </wp:inline>
+        </w:drawing>
+      </w:r>
+    </w:p>
+    <w:p>
+      <w:pPr>
+        <w:spacing w:after="150" w:before="6"/>
+        <w:jc w:val="center"/>
+      </w:pPr>
+      <w:r>
+        <w:rPr>
+          <w:rFonts w:ascii="Arial" w:cs="Arial" w:eastAsia="Arial" w:hAnsi="Arial"/>
+          <w:i/>
+          <w:iCs/>
+          <w:color w:val="5B6678"/>
+          <w:sz w:val="18"/>
+          <w:szCs w:val="18"/>
+        </w:rPr>
+        <w:t xml:space="preserve">Figura 10. Página de presentación. Fuente: del autor.</w:t>
+      </w:r>
+    </w:p>
+    <w:p>
+      <w:pPr>
+        <w:pStyle w:val="Heading2"/>
+        <w:spacing w:after="80" w:before="150"/>
+      </w:pPr>
+      <w:bookmarkStart w:name="bm28" w:id="28"/>
+      <w:r>
+        <w:rPr>
+          <w:rFonts w:ascii="Arial" w:cs="Arial" w:eastAsia="Arial" w:hAnsi="Arial"/>
+          <w:b/>
+          <w:bCs/>
+          <w:color w:val="2E5496"/>
+          <w:sz w:val="23"/>
+          <w:szCs w:val="23"/>
+        </w:rPr>
+        <w:t xml:space="preserve">8.2 Panel principal</w:t>
+      </w:r>
+      <w:bookmarkEnd w:id="28"/>
+    </w:p>
+    <w:p>
+      <w:pPr>
+        <w:spacing w:after="110" w:line="262"/>
+        <w:jc w:val="both"/>
+      </w:pPr>
+      <w:r>
+        <w:rPr>
+          <w:rFonts w:ascii="Arial" w:cs="Arial" w:eastAsia="Arial" w:hAnsi="Arial"/>
+          <w:sz w:val="22"/>
+          <w:szCs w:val="22"/>
+        </w:rPr>
+        <w:t xml:space="preserve">Es la primera pantalla tras iniciar sesión y resume el estado del negocio. La navegación lateral da acceso a los módulos habilitados según el rol y el plan contratado; la barra superior muestra el título de la pantalla, la sede activa y el acceso al perfil.</w:t>
+      </w:r>
+    </w:p>
+    <w:p>
+      <w:pPr>
+        <w:pStyle w:val="ListParagraph"/>
+        <w:numPr>
+          <w:ilvl w:val="0"/>
+          <w:numId w:val="1"/>
+        </w:numPr>
+        <w:spacing w:after="60" w:line="258"/>
+      </w:pPr>
+      <w:r>
+        <w:rPr>
+          <w:rFonts w:ascii="Arial" w:cs="Arial" w:eastAsia="Arial" w:hAnsi="Arial"/>
+          <w:sz w:val="22"/>
+          <w:szCs w:val="22"/>
+        </w:rPr>
+        <w:t xml:space="preserve">Cuatro tarjetas de indicador: ventas del día, productos activos en el catálogo, productos con stock bajo y utilidad del mes, cada una con su variación frente al periodo anterior.</w:t>
+      </w:r>
+    </w:p>
+    <w:p>
+      <w:pPr>
+        <w:pStyle w:val="ListParagraph"/>
+        <w:numPr>
+          <w:ilvl w:val="0"/>
+          <w:numId w:val="1"/>
+        </w:numPr>
+        <w:spacing w:after="60" w:line="258"/>
+      </w:pPr>
+      <w:r>
+        <w:rPr>
+          <w:rFonts w:ascii="Arial" w:cs="Arial" w:eastAsia="Arial" w:hAnsi="Arial"/>
+          <w:sz w:val="22"/>
+          <w:szCs w:val="22"/>
+        </w:rPr>
+        <w:t xml:space="preserve">Panel de alertas de stock bajo, con la existencia restante de cada producto y el acceso al listado completo.</w:t>
+      </w:r>
+    </w:p>
+    <w:p>
+      <w:pPr>
+        <w:pStyle w:val="ListParagraph"/>
+        <w:numPr>
+          <w:ilvl w:val="0"/>
+          <w:numId w:val="1"/>
+        </w:numPr>
+        <w:spacing w:after="60" w:line="258"/>
+      </w:pPr>
+      <w:r>
+        <w:rPr>
+          <w:rFonts w:ascii="Arial" w:cs="Arial" w:eastAsia="Arial" w:hAnsi="Arial"/>
+          <w:sz w:val="22"/>
+          <w:szCs w:val="22"/>
+        </w:rPr>
+        <w:t xml:space="preserve">Gráfico de ventas de la semana, para identificar los días de mayor movimiento.</w:t>
+      </w:r>
+    </w:p>
+    <w:p>
+      <w:pPr>
+        <w:spacing w:after="20" w:before="60"/>
+        <w:jc w:val="center"/>
+      </w:pPr>
+      <w:r>
+        <w:drawing>
+          <wp:inline distT="0" distB="0" distL="0" distR="0">
+            <wp:extent cx="6096000" cy="2857500"/>
+            <wp:effectExtent t="0" r="0" b="0" l="0"/>
+            <wp:docPr id="1" name="" descr="" title=""/>
+            <wp:cNvGraphicFramePr>
+              <a:graphicFrameLocks xmlns:a="http://schemas.openxmlformats.org/drawingml/2006/main" noChangeAspect="1"/>
+            </wp:cNvGraphicFramePr>
+            <a:graphic xmlns:a="http://schemas.openxmlformats.org/drawingml/2006/main">
+              <a:graphicData uri="http://schemas.openxmlformats.org/drawingml/2006/picture">
+                <pic:pic xmlns:pic="http://schemas.openxmlformats.org/drawingml/2006/picture">
+                  <pic:nvPicPr>
+                    <pic:cNvPr id="0" name="" descr=""/>
+                    <pic:cNvPicPr>
+                      <a:picLocks noChangeAspect="1" noChangeArrowheads="1"/>
+                    </pic:cNvPicPr>
+                  </pic:nvPicPr>
+                  <pic:blipFill>
+                    <a:blip r:embed="rId18" cstate="none"/>
+                    <a:srcRect/>
+                    <a:stretch>
+                      <a:fillRect/>
+                    </a:stretch>
+                  </pic:blipFill>
+                  <pic:spPr bwMode="auto">
+                    <a:xfrm>
+                      <a:off x="0" y="0"/>
+                      <a:ext cx="6096000" cy="2857500"/>
+                    </a:xfrm>
+                    <a:prstGeom prst="rect">
+                      <a:avLst/>
+                    </a:prstGeom>
+                  </pic:spPr>
+                </pic:pic>
+              </a:graphicData>
+            </a:graphic>
+          </wp:inline>
+        </w:drawing>
+      </w:r>
+    </w:p>
+    <w:p>
+      <w:pPr>
+        <w:spacing w:after="150" w:before="6"/>
+        <w:jc w:val="center"/>
+      </w:pPr>
+      <w:r>
+        <w:rPr>
+          <w:rFonts w:ascii="Arial" w:cs="Arial" w:eastAsia="Arial" w:hAnsi="Arial"/>
+          <w:i/>
+          <w:iCs/>
+          <w:color w:val="5B6678"/>
+          <w:sz w:val="18"/>
+          <w:szCs w:val="18"/>
+        </w:rPr>
+        <w:t xml:space="preserve">Figura 11. Panel principal. Fuente: del autor.</w:t>
+      </w:r>
+    </w:p>
+    <w:p>
+      <w:pPr>
+        <w:pStyle w:val="Heading2"/>
+        <w:spacing w:after="80" w:before="150"/>
+      </w:pPr>
+      <w:bookmarkStart w:name="bm29" w:id="29"/>
+      <w:r>
+        <w:rPr>
+          <w:rFonts w:ascii="Arial" w:cs="Arial" w:eastAsia="Arial" w:hAnsi="Arial"/>
+          <w:b/>
+          <w:bCs/>
+          <w:color w:val="2E5496"/>
+          <w:sz w:val="23"/>
+          <w:szCs w:val="23"/>
+        </w:rPr>
+        <w:t xml:space="preserve">8.3 Inventario: lista de productos</w:t>
+      </w:r>
+      <w:bookmarkEnd w:id="29"/>
+    </w:p>
+    <w:p>
+      <w:pPr>
+        <w:spacing w:after="110" w:line="262"/>
+        <w:jc w:val="both"/>
+      </w:pPr>
+      <w:r>
+        <w:rPr>
+          <w:rFonts w:ascii="Arial" w:cs="Arial" w:eastAsia="Arial" w:hAnsi="Arial"/>
+          <w:sz w:val="22"/>
+          <w:szCs w:val="22"/>
+        </w:rPr>
+        <w:t xml:space="preserve">Concentra la consulta del catálogo. Sobre la tabla se ubican el buscador por nombre o código y los filtros rápidos por situación de existencias. La tabla presenta el producto, su categoría, el precio de venta, las existencias, la etiqueta de estado y la acción de edición. La acción principal de la pantalla, situada en la barra superior, es el registro de un producto nuevo.</w:t>
+      </w:r>
+    </w:p>
+    <w:p>
+      <w:pPr>
+        <w:spacing w:after="20" w:before="60"/>
+        <w:jc w:val="center"/>
+      </w:pPr>
+      <w:r>
+        <w:drawing>
+          <wp:inline distT="0" distB="0" distL="0" distR="0">
+            <wp:extent cx="6096000" cy="2857500"/>
+            <wp:effectExtent t="0" r="0" b="0" l="0"/>
+            <wp:docPr id="1" name="" descr="" title=""/>
+            <wp:cNvGraphicFramePr>
+              <a:graphicFrameLocks xmlns:a="http://schemas.openxmlformats.org/drawingml/2006/main" noChangeAspect="1"/>
+            </wp:cNvGraphicFramePr>
+            <a:graphic xmlns:a="http://schemas.openxmlformats.org/drawingml/2006/main">
+              <a:graphicData uri="http://schemas.openxmlformats.org/drawingml/2006/picture">
+                <pic:pic xmlns:pic="http://schemas.openxmlformats.org/drawingml/2006/picture">
+                  <pic:nvPicPr>
+                    <pic:cNvPr id="0" name="" descr=""/>
+                    <pic:cNvPicPr>
+                      <a:picLocks noChangeAspect="1" noChangeArrowheads="1"/>
+                    </pic:cNvPicPr>
+                  </pic:nvPicPr>
+                  <pic:blipFill>
+                    <a:blip r:embed="rId19" cstate="none"/>
+                    <a:srcRect/>
+                    <a:stretch>
+                      <a:fillRect/>
+                    </a:stretch>
+                  </pic:blipFill>
+                  <pic:spPr bwMode="auto">
+                    <a:xfrm>
+                      <a:off x="0" y="0"/>
+                      <a:ext cx="6096000" cy="2857500"/>
+                    </a:xfrm>
+                    <a:prstGeom prst="rect">
+                      <a:avLst/>
+                    </a:prstGeom>
+                  </pic:spPr>
+                </pic:pic>
+              </a:graphicData>
+            </a:graphic>
+          </wp:inline>
+        </w:drawing>
+      </w:r>
+    </w:p>
+    <w:p>
+      <w:pPr>
+        <w:spacing w:after="150" w:before="6"/>
+        <w:jc w:val="center"/>
+      </w:pPr>
+      <w:r>
+        <w:rPr>
+          <w:rFonts w:ascii="Arial" w:cs="Arial" w:eastAsia="Arial" w:hAnsi="Arial"/>
+          <w:i/>
+          <w:iCs/>
+          <w:color w:val="5B6678"/>
+          <w:sz w:val="18"/>
+          <w:szCs w:val="18"/>
+        </w:rPr>
+        <w:t xml:space="preserve">Figura 12. Inventario: lista de productos. Fuente: del autor.</w:t>
+      </w:r>
+    </w:p>
+    <w:p>
+      <w:pPr>
+        <w:pStyle w:val="Heading2"/>
+        <w:spacing w:after="80" w:before="150"/>
+      </w:pPr>
+      <w:bookmarkStart w:name="bm30" w:id="30"/>
+      <w:r>
+        <w:rPr>
+          <w:rFonts w:ascii="Arial" w:cs="Arial" w:eastAsia="Arial" w:hAnsi="Arial"/>
+          <w:b/>
+          <w:bCs/>
+          <w:color w:val="2E5496"/>
+          <w:sz w:val="23"/>
+          <w:szCs w:val="23"/>
+        </w:rPr>
+        <w:t xml:space="preserve">8.4 Inventario: registro y edición de producto</w:t>
+      </w:r>
+      <w:bookmarkEnd w:id="30"/>
+    </w:p>
+    <w:p>
+      <w:pPr>
+        <w:spacing w:after="110" w:line="262"/>
+        <w:jc w:val="both"/>
+      </w:pPr>
+      <w:r>
+        <w:rPr>
+          <w:rFonts w:ascii="Arial" w:cs="Arial" w:eastAsia="Arial" w:hAnsi="Arial"/>
+          <w:sz w:val="22"/>
+          <w:szCs w:val="22"/>
+        </w:rPr>
+        <w:t xml:space="preserve">El mismo formulario se emplea para crear y para editar. Agrupa los datos de identificación del producto (nombre, categoría, presentación y código de barras) y los datos comerciales y de existencias (precio de compra, precio de venta, stock inicial y stock mínimo de alerta). El precio de venta se registra de forma independiente del costo: el sistema puede sugerirlo a partir del margen, pero nunca lo modifica de manera automática.</w:t>
+      </w:r>
+    </w:p>
+    <w:p>
+      <w:pPr>
+        <w:spacing w:after="20" w:before="60"/>
+        <w:jc w:val="center"/>
+      </w:pPr>
+      <w:r>
+        <w:drawing>
+          <wp:inline distT="0" distB="0" distL="0" distR="0">
+            <wp:extent cx="4953000" cy="4572000"/>
+            <wp:effectExtent t="0" r="0" b="0" l="0"/>
+            <wp:docPr id="1" name="" descr="" title=""/>
+            <wp:cNvGraphicFramePr>
+              <a:graphicFrameLocks xmlns:a="http://schemas.openxmlformats.org/drawingml/2006/main" noChangeAspect="1"/>
+            </wp:cNvGraphicFramePr>
+            <a:graphic xmlns:a="http://schemas.openxmlformats.org/drawingml/2006/main">
+              <a:graphicData uri="http://schemas.openxmlformats.org/drawingml/2006/picture">
+                <pic:pic xmlns:pic="http://schemas.openxmlformats.org/drawingml/2006/picture">
+                  <pic:nvPicPr>
+                    <pic:cNvPr id="0" name="" descr=""/>
+                    <pic:cNvPicPr>
+                      <a:picLocks noChangeAspect="1" noChangeArrowheads="1"/>
+                    </pic:cNvPicPr>
+                  </pic:nvPicPr>
+                  <pic:blipFill>
+                    <a:blip r:embed="rId20" cstate="none"/>
+                    <a:srcRect/>
+                    <a:stretch>
+                      <a:fillRect/>
+                    </a:stretch>
+                  </pic:blipFill>
+                  <pic:spPr bwMode="auto">
+                    <a:xfrm>
+                      <a:off x="0" y="0"/>
+                      <a:ext cx="4953000" cy="4572000"/>
+                    </a:xfrm>
+                    <a:prstGeom prst="rect">
+                      <a:avLst/>
+                    </a:prstGeom>
+                  </pic:spPr>
+                </pic:pic>
+              </a:graphicData>
+            </a:graphic>
+          </wp:inline>
+        </w:drawing>
+      </w:r>
+    </w:p>
+    <w:p>
+      <w:pPr>
+        <w:spacing w:after="150" w:before="6"/>
+        <w:jc w:val="center"/>
+      </w:pPr>
+      <w:r>
+        <w:rPr>
+          <w:rFonts w:ascii="Arial" w:cs="Arial" w:eastAsia="Arial" w:hAnsi="Arial"/>
+          <w:i/>
+          <w:iCs/>
+          <w:color w:val="5B6678"/>
+          <w:sz w:val="18"/>
+          <w:szCs w:val="18"/>
+        </w:rPr>
+        <w:t xml:space="preserve">Figura 13. Formulario de registro y edición de producto. Fuente: del autor.</w:t>
+      </w:r>
+    </w:p>
+    <w:p>
+      <w:pPr>
+        <w:pStyle w:val="Heading2"/>
+        <w:spacing w:after="80" w:before="150"/>
+      </w:pPr>
+      <w:bookmarkStart w:name="bm31" w:id="31"/>
+      <w:r>
+        <w:rPr>
+          <w:rFonts w:ascii="Arial" w:cs="Arial" w:eastAsia="Arial" w:hAnsi="Arial"/>
+          <w:b/>
+          <w:bCs/>
+          <w:color w:val="2E5496"/>
+          <w:sz w:val="23"/>
+          <w:szCs w:val="23"/>
+        </w:rPr>
+        <w:t xml:space="preserve">8.5 Punto de venta</w:t>
+      </w:r>
+      <w:bookmarkEnd w:id="31"/>
+    </w:p>
+    <w:p>
+      <w:pPr>
+        <w:spacing w:after="110" w:line="262"/>
+        <w:jc w:val="both"/>
+      </w:pPr>
+      <w:r>
+        <w:rPr>
+          <w:rFonts w:ascii="Arial" w:cs="Arial" w:eastAsia="Arial" w:hAnsi="Arial"/>
+          <w:sz w:val="22"/>
+          <w:szCs w:val="22"/>
+        </w:rPr>
+        <w:t xml:space="preserve">Es la pantalla de uso más frecuente y la que exige mayor rapidez. Se divide en dos zonas: a la izquierda, el buscador con lectura de código de barras, los filtros por categoría y la cuadrícula de productos con precio y existencia disponible; a la derecha, la venta en curso con sus líneas, el subtotal, el descuento, el total, los medios de pago y la acción de cobro, que muestra el valor a cobrar en la propia etiqueta del botón.</w:t>
+      </w:r>
+    </w:p>
+    <w:p>
+      <w:pPr>
+        <w:spacing w:after="110" w:line="262"/>
+        <w:jc w:val="both"/>
+      </w:pPr>
+      <w:r>
+        <w:rPr>
+          <w:rFonts w:ascii="Arial" w:cs="Arial" w:eastAsia="Arial" w:hAnsi="Arial"/>
+          <w:sz w:val="22"/>
+          <w:szCs w:val="22"/>
+        </w:rPr>
+        <w:t xml:space="preserve">Al confirmar el cobro, el sistema descuenta las existencias consumiendo los lotes más antiguos, registra el costo real despachado y genera el comprobante de la venta.</w:t>
+      </w:r>
+    </w:p>
+    <w:p>
+      <w:pPr>
+        <w:spacing w:after="20" w:before="60"/>
+        <w:jc w:val="center"/>
+      </w:pPr>
+      <w:r>
+        <w:drawing>
+          <wp:inline distT="0" distB="0" distL="0" distR="0">
+            <wp:extent cx="6096000" cy="2876550"/>
+            <wp:effectExtent t="0" r="0" b="0" l="0"/>
+            <wp:docPr id="1" name="" descr="" title=""/>
+            <wp:cNvGraphicFramePr>
+              <a:graphicFrameLocks xmlns:a="http://schemas.openxmlformats.org/drawingml/2006/main" noChangeAspect="1"/>
+            </wp:cNvGraphicFramePr>
+            <a:graphic xmlns:a="http://schemas.openxmlformats.org/drawingml/2006/main">
+              <a:graphicData uri="http://schemas.openxmlformats.org/drawingml/2006/picture">
+                <pic:pic xmlns:pic="http://schemas.openxmlformats.org/drawingml/2006/picture">
+                  <pic:nvPicPr>
+                    <pic:cNvPr id="0" name="" descr=""/>
+                    <pic:cNvPicPr>
+                      <a:picLocks noChangeAspect="1" noChangeArrowheads="1"/>
+                    </pic:cNvPicPr>
+                  </pic:nvPicPr>
+                  <pic:blipFill>
+                    <a:blip r:embed="rId21" cstate="none"/>
+                    <a:srcRect/>
+                    <a:stretch>
+                      <a:fillRect/>
+                    </a:stretch>
+                  </pic:blipFill>
+                  <pic:spPr bwMode="auto">
+                    <a:xfrm>
+                      <a:off x="0" y="0"/>
+                      <a:ext cx="6096000" cy="2876550"/>
+                    </a:xfrm>
+                    <a:prstGeom prst="rect">
+                      <a:avLst/>
+                    </a:prstGeom>
+                  </pic:spPr>
+                </pic:pic>
+              </a:graphicData>
+            </a:graphic>
+          </wp:inline>
+        </w:drawing>
+      </w:r>
+    </w:p>
+    <w:p>
+      <w:pPr>
+        <w:spacing w:after="150" w:before="6"/>
+        <w:jc w:val="center"/>
+      </w:pPr>
+      <w:r>
+        <w:rPr>
+          <w:rFonts w:ascii="Arial" w:cs="Arial" w:eastAsia="Arial" w:hAnsi="Arial"/>
+          <w:i/>
+          <w:iCs/>
+          <w:color w:val="5B6678"/>
+          <w:sz w:val="18"/>
+          <w:szCs w:val="18"/>
+        </w:rPr>
+        <w:t xml:space="preserve">Figura 14. Punto de venta. Fuente: del autor.</w:t>
+      </w:r>
+    </w:p>
+    <w:p>
+      <w:pPr>
+        <w:pStyle w:val="Heading2"/>
+        <w:spacing w:after="80" w:before="150"/>
+      </w:pPr>
+      <w:bookmarkStart w:name="bm32" w:id="32"/>
+      <w:r>
+        <w:rPr>
+          <w:rFonts w:ascii="Arial" w:cs="Arial" w:eastAsia="Arial" w:hAnsi="Arial"/>
+          <w:b/>
+          <w:bCs/>
+          <w:color w:val="2E5496"/>
+          <w:sz w:val="23"/>
+          <w:szCs w:val="23"/>
+        </w:rPr>
+        <w:t xml:space="preserve">8.6 Reportes</w:t>
+      </w:r>
+      <w:bookmarkEnd w:id="32"/>
+    </w:p>
+    <w:p>
+      <w:pPr>
+        <w:spacing w:after="110" w:line="262"/>
+        <w:jc w:val="both"/>
+      </w:pPr>
+      <w:r>
+        <w:rPr>
+          <w:rFonts w:ascii="Arial" w:cs="Arial" w:eastAsia="Arial" w:hAnsi="Arial"/>
+          <w:sz w:val="22"/>
+          <w:szCs w:val="22"/>
+        </w:rPr>
+        <w:t xml:space="preserve">Presenta los resultados del periodo seleccionado, que se indica en la barra superior junto a la acción de exportación. En la parte alta se ubican los indicadores del mes —ventas, utilidad y ticket promedio— y debajo, el comportamiento de las ventas por día y el listado de productos más vendidos con las unidades despachadas. La utilidad se calcula con el costo histórico de los lotes consumidos, no con el costo actual del producto.</w:t>
+      </w:r>
+    </w:p>
+    <w:p>
+      <w:pPr>
+        <w:spacing w:after="20" w:before="60"/>
+        <w:jc w:val="center"/>
+      </w:pPr>
+      <w:r>
+        <w:drawing>
+          <wp:inline distT="0" distB="0" distL="0" distR="0">
+            <wp:extent cx="6096000" cy="2857500"/>
+            <wp:effectExtent t="0" r="0" b="0" l="0"/>
+            <wp:docPr id="1" name="" descr="" title=""/>
+            <wp:cNvGraphicFramePr>
+              <a:graphicFrameLocks xmlns:a="http://schemas.openxmlformats.org/drawingml/2006/main" noChangeAspect="1"/>
+            </wp:cNvGraphicFramePr>
+            <a:graphic xmlns:a="http://schemas.openxmlformats.org/drawingml/2006/main">
+              <a:graphicData uri="http://schemas.openxmlformats.org/drawingml/2006/picture">
+                <pic:pic xmlns:pic="http://schemas.openxmlformats.org/drawingml/2006/picture">
+                  <pic:nvPicPr>
+                    <pic:cNvPr id="0" name="" descr=""/>
+                    <pic:cNvPicPr>
+                      <a:picLocks noChangeAspect="1" noChangeArrowheads="1"/>
+                    </pic:cNvPicPr>
+                  </pic:nvPicPr>
+                  <pic:blipFill>
+                    <a:blip r:embed="rId22" cstate="none"/>
+                    <a:srcRect/>
+                    <a:stretch>
+                      <a:fillRect/>
+                    </a:stretch>
+                  </pic:blipFill>
+                  <pic:spPr bwMode="auto">
+                    <a:xfrm>
+                      <a:off x="0" y="0"/>
+                      <a:ext cx="6096000" cy="2857500"/>
+                    </a:xfrm>
+                    <a:prstGeom prst="rect">
+                      <a:avLst/>
+                    </a:prstGeom>
+                  </pic:spPr>
+                </pic:pic>
+              </a:graphicData>
+            </a:graphic>
+          </wp:inline>
+        </w:drawing>
+      </w:r>
+    </w:p>
+    <w:p>
+      <w:pPr>
+        <w:spacing w:after="150" w:before="6"/>
+        <w:jc w:val="center"/>
+      </w:pPr>
+      <w:r>
+        <w:rPr>
+          <w:rFonts w:ascii="Arial" w:cs="Arial" w:eastAsia="Arial" w:hAnsi="Arial"/>
+          <w:i/>
+          <w:iCs/>
+          <w:color w:val="5B6678"/>
+          <w:sz w:val="18"/>
+          <w:szCs w:val="18"/>
+        </w:rPr>
+        <w:t xml:space="preserve">Figura 15. Reportes. Fuente: del autor.</w:t>
+      </w:r>
+    </w:p>
+    <w:p>
+      <w:pPr>
+        <w:pStyle w:val="Heading1"/>
+        <w:pageBreakBefore/>
+        <w:spacing w:after="110" w:before="220"/>
+      </w:pPr>
+      <w:bookmarkStart w:name="bm33" w:id="33"/>
+      <w:r>
+        <w:rPr>
+          <w:rFonts w:ascii="Arial" w:cs="Arial" w:eastAsia="Arial" w:hAnsi="Arial"/>
+          <w:b/>
+          <w:bCs/>
+          <w:color w:val="1F3864"/>
+          <w:sz w:val="27"/>
+          <w:szCs w:val="27"/>
+        </w:rPr>
+        <w:t xml:space="preserve">9. Mensajes y estados de pantalla</w:t>
+      </w:r>
+      <w:bookmarkEnd w:id="33"/>
+    </w:p>
+    <w:p>
+      <w:pPr>
+        <w:spacing w:after="110" w:line="262"/>
+        <w:jc w:val="both"/>
+      </w:pPr>
+      <w:r>
+        <w:rPr>
+          <w:rFonts w:ascii="Arial" w:cs="Arial" w:eastAsia="Arial" w:hAnsi="Arial"/>
+          <w:sz w:val="22"/>
+          <w:szCs w:val="22"/>
+        </w:rPr>
+        <w:t xml:space="preserve">Además de los componentes descritos en la sección 6, la interfaz define cómo se comporta una pantalla cuando no hay información que mostrar, cuando los datos aún se están cargando o cuando una operación falla. El objetivo es que el usuario siempre sepa qué ocurre y qué puede hacer a continuación.</w:t>
+      </w:r>
+    </w:p>
+    <w:p>
+      <w:pPr>
+        <w:spacing w:after="20" w:before="60"/>
+        <w:jc w:val="center"/>
+      </w:pPr>
+      <w:r>
+        <w:drawing>
+          <wp:inline distT="0" distB="0" distL="0" distR="0">
+            <wp:extent cx="6096000" cy="2305050"/>
+            <wp:effectExtent t="0" r="0" b="0" l="0"/>
+            <wp:docPr id="1" name="" descr="" title=""/>
+            <wp:cNvGraphicFramePr>
+              <a:graphicFrameLocks xmlns:a="http://schemas.openxmlformats.org/drawingml/2006/main" noChangeAspect="1"/>
+            </wp:cNvGraphicFramePr>
+            <a:graphic xmlns:a="http://schemas.openxmlformats.org/drawingml/2006/main">
+              <a:graphicData uri="http://schemas.openxmlformats.org/drawingml/2006/picture">
+                <pic:pic xmlns:pic="http://schemas.openxmlformats.org/drawingml/2006/picture">
+                  <pic:nvPicPr>
+                    <pic:cNvPr id="0" name="" descr=""/>
+                    <pic:cNvPicPr>
+                      <a:picLocks noChangeAspect="1" noChangeArrowheads="1"/>
+                    </pic:cNvPicPr>
+                  </pic:nvPicPr>
+                  <pic:blipFill>
+                    <a:blip r:embed="rId23" cstate="none"/>
+                    <a:srcRect/>
+                    <a:stretch>
+                      <a:fillRect/>
+                    </a:stretch>
+                  </pic:blipFill>
+                  <pic:spPr bwMode="auto">
+                    <a:xfrm>
+                      <a:off x="0" y="0"/>
+                      <a:ext cx="6096000" cy="2305050"/>
+                    </a:xfrm>
+                    <a:prstGeom prst="rect">
+                      <a:avLst/>
+                    </a:prstGeom>
+                  </pic:spPr>
+                </pic:pic>
+              </a:graphicData>
+            </a:graphic>
+          </wp:inline>
+        </w:drawing>
+      </w:r>
+    </w:p>
+    <w:p>
+      <w:pPr>
+        <w:spacing w:after="150" w:before="6"/>
+        <w:jc w:val="center"/>
+      </w:pPr>
+      <w:r>
+        <w:rPr>
+          <w:rFonts w:ascii="Arial" w:cs="Arial" w:eastAsia="Arial" w:hAnsi="Arial"/>
+          <w:i/>
+          <w:iCs/>
+          <w:color w:val="5B6678"/>
+          <w:sz w:val="18"/>
+          <w:szCs w:val="18"/>
+        </w:rPr>
+        <w:t xml:space="preserve">Figura 16. Mensajes del sistema y estado vacío. Fuente: del autor.</w:t>
+      </w:r>
+    </w:p>
+    <w:p>
+      <w:pPr>
+        <w:pStyle w:val="Heading2"/>
+        <w:spacing w:after="80" w:before="150"/>
+      </w:pPr>
+      <w:bookmarkStart w:name="bm34" w:id="34"/>
+      <w:r>
+        <w:rPr>
+          <w:rFonts w:ascii="Arial" w:cs="Arial" w:eastAsia="Arial" w:hAnsi="Arial"/>
+          <w:b/>
+          <w:bCs/>
+          <w:color w:val="2E5496"/>
+          <w:sz w:val="23"/>
+          <w:szCs w:val="23"/>
+        </w:rPr>
+        <w:t xml:space="preserve">9.1 Estados de una pantalla</w:t>
+      </w:r>
+      <w:bookmarkEnd w:id="34"/>
+    </w:p>
+    <w:tbl>
+      <w:tblPr>
+        <w:tblW w:type="dxa" w:w="9360"/>
+        <w:tblBorders>
+          <w:top w:val="single" w:color="9CA3AF" w:sz="6"/>
+          <w:left w:val="single" w:color="9CA3AF" w:sz="6"/>
+          <w:bottom w:val="single" w:color="9CA3AF" w:sz="6"/>
+          <w:right w:val="single" w:color="9CA3AF" w:sz="6"/>
+          <w:insideH w:val="single" w:color="9CA3AF" w:sz="6"/>
+          <w:insideV w:val="single" w:color="9CA3AF" w:sz="6"/>
+        </w:tblBorders>
+        <w:tblLayout w:type="fixed"/>
+      </w:tblPr>
+      <w:tblGrid>
+        <w:gridCol w:w="1700"/>
+        <w:gridCol w:w="3200"/>
+        <w:gridCol w:w="4460"/>
+      </w:tblGrid>
+      <w:tr>
+        <w:trPr>
+          <w:tblHeader/>
+        </w:trPr>
+        <w:tc>
+          <w:tcPr>
+            <w:tcW w:type="dxa" w:w="1700"/>
+            <w:shd w:fill="1F3864" w:val="clear"/>
+            <w:tcMar>
+              <w:top w:type="dxa" w:w="40"/>
+              <w:left w:type="dxa" w:w="70"/>
+              <w:bottom w:type="dxa" w:w="40"/>
+              <w:right w:type="dxa" w:w="70"/>
+            </w:tcMar>
+          </w:tcPr>
+          <w:p>
+            <w:pPr>
+              <w:spacing w:after="0" w:line="236"/>
+            </w:pPr>
+            <w:r>
+              <w:rPr>
+                <w:rFonts w:ascii="Arial" w:cs="Arial" w:eastAsia="Arial" w:hAnsi="Arial"/>
+                <w:b/>
+                <w:bCs/>
+                <w:color w:val="FFFFFF"/>
+                <w:sz w:val="19"/>
+                <w:szCs w:val="19"/>
+              </w:rPr>
+              <w:t xml:space="preserve">Estado</w:t>
+            </w:r>
+          </w:p>
+        </w:tc>
+        <w:tc>
+          <w:tcPr>
+            <w:tcW w:type="dxa" w:w="3200"/>
+            <w:shd w:fill="1F3864" w:val="clear"/>
+            <w:tcMar>
+              <w:top w:type="dxa" w:w="40"/>
+              <w:left w:type="dxa" w:w="70"/>
+              <w:bottom w:type="dxa" w:w="40"/>
+              <w:right w:type="dxa" w:w="70"/>
+            </w:tcMar>
+          </w:tcPr>
+          <w:p>
+            <w:pPr>
+              <w:spacing w:after="0" w:line="236"/>
+            </w:pPr>
+            <w:r>
+              <w:rPr>
+                <w:rFonts w:ascii="Arial" w:cs="Arial" w:eastAsia="Arial" w:hAnsi="Arial"/>
+                <w:b/>
+                <w:bCs/>
+                <w:color w:val="FFFFFF"/>
+                <w:sz w:val="19"/>
+                <w:szCs w:val="19"/>
+              </w:rPr>
+              <w:t xml:space="preserve">Cuándo se presenta</w:t>
+            </w:r>
+          </w:p>
+        </w:tc>
+        <w:tc>
+          <w:tcPr>
+            <w:tcW w:type="dxa" w:w="4460"/>
+            <w:shd w:fill="1F3864" w:val="clear"/>
+            <w:tcMar>
+              <w:top w:type="dxa" w:w="40"/>
+              <w:left w:type="dxa" w:w="70"/>
+              <w:bottom w:type="dxa" w:w="40"/>
+              <w:right w:type="dxa" w:w="70"/>
+            </w:tcMar>
+          </w:tcPr>
+          <w:p>
+            <w:pPr>
+              <w:spacing w:after="0" w:line="236"/>
+            </w:pPr>
+            <w:r>
+              <w:rPr>
+                <w:rFonts w:ascii="Arial" w:cs="Arial" w:eastAsia="Arial" w:hAnsi="Arial"/>
+                <w:b/>
+                <w:bCs/>
+                <w:color w:val="FFFFFF"/>
+                <w:sz w:val="19"/>
+                <w:szCs w:val="19"/>
+              </w:rPr>
+              <w:t xml:space="preserve">Qué muestra la pantalla</w:t>
+            </w:r>
+          </w:p>
+        </w:tc>
+      </w:tr>
+      <w:tr>
+        <w:trPr>
+          <w:tblHeader w:val="false"/>
+        </w:trPr>
+        <w:tc>
+          <w:tcPr>
+            <w:tcW w:type="dxa" w:w="1700"/>
+            <w:shd w:fill="FFFFFF" w:val="clear"/>
+            <w:tcMar>
+              <w:top w:type="dxa" w:w="40"/>
+              <w:left w:type="dxa" w:w="70"/>
+              <w:bottom w:type="dxa" w:w="40"/>
+              <w:right w:type="dxa" w:w="70"/>
+            </w:tcMar>
+          </w:tcPr>
+          <w:p>
+            <w:pPr>
+              <w:spacing w:after="0" w:line="236"/>
+            </w:pPr>
+            <w:r>
+              <w:rPr>
+                <w:rFonts w:ascii="Arial" w:cs="Arial" w:eastAsia="Arial" w:hAnsi="Arial"/>
+                <w:sz w:val="19"/>
+                <w:szCs w:val="19"/>
+              </w:rPr>
+              <w:t xml:space="preserve">Con datos</w:t>
+            </w:r>
+          </w:p>
+        </w:tc>
+        <w:tc>
+          <w:tcPr>
+            <w:tcW w:type="dxa" w:w="3200"/>
+            <w:shd w:fill="FFFFFF" w:val="clear"/>
+            <w:tcMar>
+              <w:top w:type="dxa" w:w="40"/>
+              <w:left w:type="dxa" w:w="70"/>
+              <w:bottom w:type="dxa" w:w="40"/>
+              <w:right w:type="dxa" w:w="70"/>
+            </w:tcMar>
+          </w:tcPr>
+          <w:p>
+            <w:pPr>
+              <w:spacing w:after="0" w:line="236"/>
+            </w:pPr>
+            <w:r>
+              <w:rPr>
+                <w:rFonts w:ascii="Arial" w:cs="Arial" w:eastAsia="Arial" w:hAnsi="Arial"/>
+                <w:sz w:val="19"/>
+                <w:szCs w:val="19"/>
+              </w:rPr>
+              <w:t xml:space="preserve">Funcionamiento normal.</w:t>
+            </w:r>
+          </w:p>
+        </w:tc>
+        <w:tc>
+          <w:tcPr>
+            <w:tcW w:type="dxa" w:w="4460"/>
+            <w:shd w:fill="FFFFFF" w:val="clear"/>
+            <w:tcMar>
+              <w:top w:type="dxa" w:w="40"/>
+              <w:left w:type="dxa" w:w="70"/>
+              <w:bottom w:type="dxa" w:w="40"/>
+              <w:right w:type="dxa" w:w="70"/>
+            </w:tcMar>
+          </w:tcPr>
+          <w:p>
+            <w:pPr>
+              <w:spacing w:after="0" w:line="236"/>
+            </w:pPr>
+            <w:r>
+              <w:rPr>
+                <w:rFonts w:ascii="Arial" w:cs="Arial" w:eastAsia="Arial" w:hAnsi="Arial"/>
+                <w:sz w:val="19"/>
+                <w:szCs w:val="19"/>
+              </w:rPr>
+              <w:t xml:space="preserve">El contenido propio de la pantalla.</w:t>
+            </w:r>
+          </w:p>
+        </w:tc>
+      </w:tr>
+      <w:tr>
+        <w:trPr>
+          <w:tblHeader w:val="false"/>
+        </w:trPr>
+        <w:tc>
+          <w:tcPr>
+            <w:tcW w:type="dxa" w:w="1700"/>
+            <w:shd w:fill="F2F2F2" w:val="clear"/>
+            <w:tcMar>
+              <w:top w:type="dxa" w:w="40"/>
+              <w:left w:type="dxa" w:w="70"/>
+              <w:bottom w:type="dxa" w:w="40"/>
+              <w:right w:type="dxa" w:w="70"/>
+            </w:tcMar>
+          </w:tcPr>
+          <w:p>
+            <w:pPr>
+              <w:spacing w:after="0" w:line="236"/>
+            </w:pPr>
+            <w:r>
+              <w:rPr>
+                <w:rFonts w:ascii="Arial" w:cs="Arial" w:eastAsia="Arial" w:hAnsi="Arial"/>
+                <w:sz w:val="19"/>
+                <w:szCs w:val="19"/>
+              </w:rPr>
+              <w:t xml:space="preserve">Cargando</w:t>
+            </w:r>
+          </w:p>
+        </w:tc>
+        <w:tc>
+          <w:tcPr>
+            <w:tcW w:type="dxa" w:w="3200"/>
+            <w:shd w:fill="F2F2F2" w:val="clear"/>
+            <w:tcMar>
+              <w:top w:type="dxa" w:w="40"/>
+              <w:left w:type="dxa" w:w="70"/>
+              <w:bottom w:type="dxa" w:w="40"/>
+              <w:right w:type="dxa" w:w="70"/>
+            </w:tcMar>
+          </w:tcPr>
+          <w:p>
+            <w:pPr>
+              <w:spacing w:after="0" w:line="236"/>
+            </w:pPr>
+            <w:r>
+              <w:rPr>
+                <w:rFonts w:ascii="Arial" w:cs="Arial" w:eastAsia="Arial" w:hAnsi="Arial"/>
+                <w:sz w:val="19"/>
+                <w:szCs w:val="19"/>
+              </w:rPr>
+              <w:t xml:space="preserve">Mientras se consulta la información.</w:t>
+            </w:r>
+          </w:p>
+        </w:tc>
+        <w:tc>
+          <w:tcPr>
+            <w:tcW w:type="dxa" w:w="4460"/>
+            <w:shd w:fill="F2F2F2" w:val="clear"/>
+            <w:tcMar>
+              <w:top w:type="dxa" w:w="40"/>
+              <w:left w:type="dxa" w:w="70"/>
+              <w:bottom w:type="dxa" w:w="40"/>
+              <w:right w:type="dxa" w:w="70"/>
+            </w:tcMar>
+          </w:tcPr>
+          <w:p>
+            <w:pPr>
+              <w:spacing w:after="0" w:line="236"/>
+            </w:pPr>
+            <w:r>
+              <w:rPr>
+                <w:rFonts w:ascii="Arial" w:cs="Arial" w:eastAsia="Arial" w:hAnsi="Arial"/>
+                <w:sz w:val="19"/>
+                <w:szCs w:val="19"/>
+              </w:rPr>
+              <w:t xml:space="preserve">Marcadores de carga en el lugar del contenido, conservando la estructura.</w:t>
+            </w:r>
+          </w:p>
+        </w:tc>
+      </w:tr>
+      <w:tr>
+        <w:trPr>
+          <w:tblHeader w:val="false"/>
+        </w:trPr>
+        <w:tc>
+          <w:tcPr>
+            <w:tcW w:type="dxa" w:w="1700"/>
+            <w:shd w:fill="FFFFFF" w:val="clear"/>
+            <w:tcMar>
+              <w:top w:type="dxa" w:w="40"/>
+              <w:left w:type="dxa" w:w="70"/>
+              <w:bottom w:type="dxa" w:w="40"/>
+              <w:right w:type="dxa" w:w="70"/>
+            </w:tcMar>
+          </w:tcPr>
+          <w:p>
+            <w:pPr>
+              <w:spacing w:after="0" w:line="236"/>
+            </w:pPr>
+            <w:r>
+              <w:rPr>
+                <w:rFonts w:ascii="Arial" w:cs="Arial" w:eastAsia="Arial" w:hAnsi="Arial"/>
+                <w:sz w:val="19"/>
+                <w:szCs w:val="19"/>
+              </w:rPr>
+              <w:t xml:space="preserve">Vacío inicial</w:t>
+            </w:r>
+          </w:p>
+        </w:tc>
+        <w:tc>
+          <w:tcPr>
+            <w:tcW w:type="dxa" w:w="3200"/>
+            <w:shd w:fill="FFFFFF" w:val="clear"/>
+            <w:tcMar>
+              <w:top w:type="dxa" w:w="40"/>
+              <w:left w:type="dxa" w:w="70"/>
+              <w:bottom w:type="dxa" w:w="40"/>
+              <w:right w:type="dxa" w:w="70"/>
+            </w:tcMar>
+          </w:tcPr>
+          <w:p>
+            <w:pPr>
+              <w:spacing w:after="0" w:line="236"/>
+            </w:pPr>
+            <w:r>
+              <w:rPr>
+                <w:rFonts w:ascii="Arial" w:cs="Arial" w:eastAsia="Arial" w:hAnsi="Arial"/>
+                <w:sz w:val="19"/>
+                <w:szCs w:val="19"/>
+              </w:rPr>
+              <w:t xml:space="preserve">El usuario aún no ha registrado datos.</w:t>
+            </w:r>
+          </w:p>
+        </w:tc>
+        <w:tc>
+          <w:tcPr>
+            <w:tcW w:type="dxa" w:w="4460"/>
+            <w:shd w:fill="FFFFFF" w:val="clear"/>
+            <w:tcMar>
+              <w:top w:type="dxa" w:w="40"/>
+              <w:left w:type="dxa" w:w="70"/>
+              <w:bottom w:type="dxa" w:w="40"/>
+              <w:right w:type="dxa" w:w="70"/>
+            </w:tcMar>
+          </w:tcPr>
+          <w:p>
+            <w:pPr>
+              <w:spacing w:after="0" w:line="236"/>
+            </w:pPr>
+            <w:r>
+              <w:rPr>
+                <w:rFonts w:ascii="Arial" w:cs="Arial" w:eastAsia="Arial" w:hAnsi="Arial"/>
+                <w:sz w:val="19"/>
+                <w:szCs w:val="19"/>
+              </w:rPr>
+              <w:t xml:space="preserve">Mensaje breve, explicación de un renglón y la acción para crear el primer registro.</w:t>
+            </w:r>
+          </w:p>
+        </w:tc>
+      </w:tr>
+      <w:tr>
+        <w:trPr>
+          <w:tblHeader w:val="false"/>
+        </w:trPr>
+        <w:tc>
+          <w:tcPr>
+            <w:tcW w:type="dxa" w:w="1700"/>
+            <w:shd w:fill="F2F2F2" w:val="clear"/>
+            <w:tcMar>
+              <w:top w:type="dxa" w:w="40"/>
+              <w:left w:type="dxa" w:w="70"/>
+              <w:bottom w:type="dxa" w:w="40"/>
+              <w:right w:type="dxa" w:w="70"/>
+            </w:tcMar>
+          </w:tcPr>
+          <w:p>
+            <w:pPr>
+              <w:spacing w:after="0" w:line="236"/>
+            </w:pPr>
+            <w:r>
+              <w:rPr>
+                <w:rFonts w:ascii="Arial" w:cs="Arial" w:eastAsia="Arial" w:hAnsi="Arial"/>
+                <w:sz w:val="19"/>
+                <w:szCs w:val="19"/>
+              </w:rPr>
+              <w:t xml:space="preserve">Sin resultados</w:t>
+            </w:r>
+          </w:p>
+        </w:tc>
+        <w:tc>
+          <w:tcPr>
+            <w:tcW w:type="dxa" w:w="3200"/>
+            <w:shd w:fill="F2F2F2" w:val="clear"/>
+            <w:tcMar>
+              <w:top w:type="dxa" w:w="40"/>
+              <w:left w:type="dxa" w:w="70"/>
+              <w:bottom w:type="dxa" w:w="40"/>
+              <w:right w:type="dxa" w:w="70"/>
+            </w:tcMar>
+          </w:tcPr>
+          <w:p>
+            <w:pPr>
+              <w:spacing w:after="0" w:line="236"/>
+            </w:pPr>
+            <w:r>
+              <w:rPr>
+                <w:rFonts w:ascii="Arial" w:cs="Arial" w:eastAsia="Arial" w:hAnsi="Arial"/>
+                <w:sz w:val="19"/>
+                <w:szCs w:val="19"/>
+              </w:rPr>
+              <w:t xml:space="preserve">La búsqueda o el filtro no arroja coincidencias.</w:t>
+            </w:r>
+          </w:p>
+        </w:tc>
+        <w:tc>
+          <w:tcPr>
+            <w:tcW w:type="dxa" w:w="4460"/>
+            <w:shd w:fill="F2F2F2" w:val="clear"/>
+            <w:tcMar>
+              <w:top w:type="dxa" w:w="40"/>
+              <w:left w:type="dxa" w:w="70"/>
+              <w:bottom w:type="dxa" w:w="40"/>
+              <w:right w:type="dxa" w:w="70"/>
+            </w:tcMar>
+          </w:tcPr>
+          <w:p>
+            <w:pPr>
+              <w:spacing w:after="0" w:line="236"/>
+            </w:pPr>
+            <w:r>
+              <w:rPr>
+                <w:rFonts w:ascii="Arial" w:cs="Arial" w:eastAsia="Arial" w:hAnsi="Arial"/>
+                <w:sz w:val="19"/>
+                <w:szCs w:val="19"/>
+              </w:rPr>
+              <w:t xml:space="preserve">Aviso de que no se encontraron resultados y sugerencia de modificar la búsqueda.</w:t>
+            </w:r>
+          </w:p>
+        </w:tc>
+      </w:tr>
+      <w:tr>
+        <w:trPr>
+          <w:tblHeader w:val="false"/>
+        </w:trPr>
+        <w:tc>
+          <w:tcPr>
+            <w:tcW w:type="dxa" w:w="1700"/>
+            <w:shd w:fill="FFFFFF" w:val="clear"/>
+            <w:tcMar>
+              <w:top w:type="dxa" w:w="40"/>
+              <w:left w:type="dxa" w:w="70"/>
+              <w:bottom w:type="dxa" w:w="40"/>
+              <w:right w:type="dxa" w:w="70"/>
+            </w:tcMar>
+          </w:tcPr>
+          <w:p>
+            <w:pPr>
+              <w:spacing w:after="0" w:line="236"/>
+            </w:pPr>
+            <w:r>
+              <w:rPr>
+                <w:rFonts w:ascii="Arial" w:cs="Arial" w:eastAsia="Arial" w:hAnsi="Arial"/>
+                <w:sz w:val="19"/>
+                <w:szCs w:val="19"/>
+              </w:rPr>
+              <w:t xml:space="preserve">Error</w:t>
+            </w:r>
+          </w:p>
+        </w:tc>
+        <w:tc>
+          <w:tcPr>
+            <w:tcW w:type="dxa" w:w="3200"/>
+            <w:shd w:fill="FFFFFF" w:val="clear"/>
+            <w:tcMar>
+              <w:top w:type="dxa" w:w="40"/>
+              <w:left w:type="dxa" w:w="70"/>
+              <w:bottom w:type="dxa" w:w="40"/>
+              <w:right w:type="dxa" w:w="70"/>
+            </w:tcMar>
+          </w:tcPr>
+          <w:p>
+            <w:pPr>
+              <w:spacing w:after="0" w:line="236"/>
+            </w:pPr>
+            <w:r>
+              <w:rPr>
+                <w:rFonts w:ascii="Arial" w:cs="Arial" w:eastAsia="Arial" w:hAnsi="Arial"/>
+                <w:sz w:val="19"/>
+                <w:szCs w:val="19"/>
+              </w:rPr>
+              <w:t xml:space="preserve">Falla la operación o la conexión.</w:t>
+            </w:r>
+          </w:p>
+        </w:tc>
+        <w:tc>
+          <w:tcPr>
+            <w:tcW w:type="dxa" w:w="4460"/>
+            <w:shd w:fill="FFFFFF" w:val="clear"/>
+            <w:tcMar>
+              <w:top w:type="dxa" w:w="40"/>
+              <w:left w:type="dxa" w:w="70"/>
+              <w:bottom w:type="dxa" w:w="40"/>
+              <w:right w:type="dxa" w:w="70"/>
+            </w:tcMar>
+          </w:tcPr>
+          <w:p>
+            <w:pPr>
+              <w:spacing w:after="0" w:line="236"/>
+            </w:pPr>
+            <w:r>
+              <w:rPr>
+                <w:rFonts w:ascii="Arial" w:cs="Arial" w:eastAsia="Arial" w:hAnsi="Arial"/>
+                <w:sz w:val="19"/>
+                <w:szCs w:val="19"/>
+              </w:rPr>
+              <w:t xml:space="preserve">Mensaje en color de peligro con la causa y la opción de reintentar.</w:t>
+            </w:r>
+          </w:p>
+        </w:tc>
+      </w:tr>
+      <w:tr>
+        <w:trPr>
+          <w:tblHeader w:val="false"/>
+        </w:trPr>
+        <w:tc>
+          <w:tcPr>
+            <w:tcW w:type="dxa" w:w="1700"/>
+            <w:shd w:fill="F2F2F2" w:val="clear"/>
+            <w:tcMar>
+              <w:top w:type="dxa" w:w="40"/>
+              <w:left w:type="dxa" w:w="70"/>
+              <w:bottom w:type="dxa" w:w="40"/>
+              <w:right w:type="dxa" w:w="70"/>
+            </w:tcMar>
+          </w:tcPr>
+          <w:p>
+            <w:pPr>
+              <w:spacing w:after="0" w:line="236"/>
+            </w:pPr>
+            <w:r>
+              <w:rPr>
+                <w:rFonts w:ascii="Arial" w:cs="Arial" w:eastAsia="Arial" w:hAnsi="Arial"/>
+                <w:sz w:val="19"/>
+                <w:szCs w:val="19"/>
+              </w:rPr>
+              <w:t xml:space="preserve">Sin permiso</w:t>
+            </w:r>
+          </w:p>
+        </w:tc>
+        <w:tc>
+          <w:tcPr>
+            <w:tcW w:type="dxa" w:w="3200"/>
+            <w:shd w:fill="F2F2F2" w:val="clear"/>
+            <w:tcMar>
+              <w:top w:type="dxa" w:w="40"/>
+              <w:left w:type="dxa" w:w="70"/>
+              <w:bottom w:type="dxa" w:w="40"/>
+              <w:right w:type="dxa" w:w="70"/>
+            </w:tcMar>
+          </w:tcPr>
+          <w:p>
+            <w:pPr>
+              <w:spacing w:after="0" w:line="236"/>
+            </w:pPr>
+            <w:r>
+              <w:rPr>
+                <w:rFonts w:ascii="Arial" w:cs="Arial" w:eastAsia="Arial" w:hAnsi="Arial"/>
+                <w:sz w:val="19"/>
+                <w:szCs w:val="19"/>
+              </w:rPr>
+              <w:t xml:space="preserve">El rol o el plan no habilitan la función.</w:t>
+            </w:r>
+          </w:p>
+        </w:tc>
+        <w:tc>
+          <w:tcPr>
+            <w:tcW w:type="dxa" w:w="4460"/>
+            <w:shd w:fill="F2F2F2" w:val="clear"/>
+            <w:tcMar>
+              <w:top w:type="dxa" w:w="40"/>
+              <w:left w:type="dxa" w:w="70"/>
+              <w:bottom w:type="dxa" w:w="40"/>
+              <w:right w:type="dxa" w:w="70"/>
+            </w:tcMar>
+          </w:tcPr>
+          <w:p>
+            <w:pPr>
+              <w:spacing w:after="0" w:line="236"/>
+            </w:pPr>
+            <w:r>
+              <w:rPr>
+                <w:rFonts w:ascii="Arial" w:cs="Arial" w:eastAsia="Arial" w:hAnsi="Arial"/>
+                <w:sz w:val="19"/>
+                <w:szCs w:val="19"/>
+              </w:rPr>
+              <w:t xml:space="preserve">Explicación del motivo y, cuando corresponde, la vía para cambiar de plan.</w:t>
+            </w:r>
+          </w:p>
+        </w:tc>
+      </w:tr>
+    </w:tbl>
+    <w:p>
+      <w:pPr>
+        <w:pStyle w:val="Heading2"/>
+        <w:spacing w:after="80" w:before="150"/>
+      </w:pPr>
+      <w:bookmarkStart w:name="bm35" w:id="35"/>
+      <w:r>
+        <w:rPr>
+          <w:rFonts w:ascii="Arial" w:cs="Arial" w:eastAsia="Arial" w:hAnsi="Arial"/>
+          <w:b/>
+          <w:bCs/>
+          <w:color w:val="2E5496"/>
+          <w:sz w:val="23"/>
+          <w:szCs w:val="23"/>
+        </w:rPr>
+        <w:t xml:space="preserve">9.2 Redacción de los mensajes</w:t>
+      </w:r>
+      <w:bookmarkEnd w:id="35"/>
+    </w:p>
+    <w:p>
+      <w:pPr>
+        <w:spacing w:after="110" w:line="262"/>
+        <w:jc w:val="both"/>
+      </w:pPr>
+      <w:r>
+        <w:rPr>
+          <w:rFonts w:ascii="Arial" w:cs="Arial" w:eastAsia="Arial" w:hAnsi="Arial"/>
+          <w:sz w:val="22"/>
+          <w:szCs w:val="22"/>
+        </w:rPr>
+        <w:t xml:space="preserve">Los textos siguen las mismas reglas en toda la aplicación:</w:t>
+      </w:r>
+    </w:p>
+    <w:p>
+      <w:pPr>
+        <w:pStyle w:val="ListParagraph"/>
+        <w:numPr>
+          <w:ilvl w:val="0"/>
+          <w:numId w:val="1"/>
+        </w:numPr>
+        <w:spacing w:after="60" w:line="258"/>
+      </w:pPr>
+      <w:r>
+        <w:rPr>
+          <w:rFonts w:ascii="Arial" w:cs="Arial" w:eastAsia="Arial" w:hAnsi="Arial"/>
+          <w:sz w:val="22"/>
+          <w:szCs w:val="22"/>
+        </w:rPr>
+        <w:t xml:space="preserve">Lenguaje sencillo y directo, sin términos técnicos ni códigos de error visibles para el usuario.</w:t>
+      </w:r>
+    </w:p>
+    <w:p>
+      <w:pPr>
+        <w:pStyle w:val="ListParagraph"/>
+        <w:numPr>
+          <w:ilvl w:val="0"/>
+          <w:numId w:val="1"/>
+        </w:numPr>
+        <w:spacing w:after="60" w:line="258"/>
+      </w:pPr>
+      <w:r>
+        <w:rPr>
+          <w:rFonts w:ascii="Arial" w:cs="Arial" w:eastAsia="Arial" w:hAnsi="Arial"/>
+          <w:sz w:val="22"/>
+          <w:szCs w:val="22"/>
+        </w:rPr>
+        <w:t xml:space="preserve">El mensaje describe qué ocurrió y qué hacer a continuación, en una sola frase cuando es posible.</w:t>
+      </w:r>
+    </w:p>
+    <w:p>
+      <w:pPr>
+        <w:pStyle w:val="ListParagraph"/>
+        <w:numPr>
+          <w:ilvl w:val="0"/>
+          <w:numId w:val="1"/>
+        </w:numPr>
+        <w:spacing w:after="60" w:line="258"/>
+      </w:pPr>
+      <w:r>
+        <w:rPr>
+          <w:rFonts w:ascii="Arial" w:cs="Arial" w:eastAsia="Arial" w:hAnsi="Arial"/>
+          <w:sz w:val="22"/>
+          <w:szCs w:val="22"/>
+        </w:rPr>
+        <w:t xml:space="preserve">Los mensajes de validación se ubican junto al campo que los origina; los de operación, en la parte superior del contenido o como aviso emergente.</w:t>
+      </w:r>
+    </w:p>
+    <w:p>
+      <w:pPr>
+        <w:pStyle w:val="ListParagraph"/>
+        <w:numPr>
+          <w:ilvl w:val="0"/>
+          <w:numId w:val="1"/>
+        </w:numPr>
+        <w:spacing w:after="60" w:line="258"/>
+      </w:pPr>
+      <w:r>
+        <w:rPr>
+          <w:rFonts w:ascii="Arial" w:cs="Arial" w:eastAsia="Arial" w:hAnsi="Arial"/>
+          <w:sz w:val="22"/>
+          <w:szCs w:val="22"/>
+        </w:rPr>
+        <w:t xml:space="preserve">Las confirmaciones de una acción rápida desaparecen solas; los errores permanecen hasta que el usuario los atiende.</w:t>
+      </w:r>
+    </w:p>
+    <w:p>
+      <w:pPr>
+        <w:pStyle w:val="ListParagraph"/>
+        <w:numPr>
+          <w:ilvl w:val="0"/>
+          <w:numId w:val="1"/>
+        </w:numPr>
+        <w:spacing w:after="60" w:line="258"/>
+      </w:pPr>
+      <w:r>
+        <w:rPr>
+          <w:rFonts w:ascii="Arial" w:cs="Arial" w:eastAsia="Arial" w:hAnsi="Arial"/>
+          <w:sz w:val="22"/>
+          <w:szCs w:val="22"/>
+        </w:rPr>
+        <w:t xml:space="preserve">No se responsabiliza al usuario del error ni se emplean expresiones de alarma.</w:t>
+      </w:r>
+    </w:p>
+    <w:p>
+      <w:pPr>
+        <w:pStyle w:val="Heading1"/>
+        <w:pageBreakBefore/>
+        <w:spacing w:after="110" w:before="220"/>
+      </w:pPr>
+      <w:bookmarkStart w:name="bm36" w:id="36"/>
+      <w:r>
+        <w:rPr>
+          <w:rFonts w:ascii="Arial" w:cs="Arial" w:eastAsia="Arial" w:hAnsi="Arial"/>
+          <w:b/>
+          <w:bCs/>
+          <w:color w:val="1F3864"/>
+          <w:sz w:val="27"/>
+          <w:szCs w:val="27"/>
+        </w:rPr>
+        <w:t xml:space="preserve">10. Comportamiento responsivo y modo oscuro</w:t>
+      </w:r>
+      <w:bookmarkEnd w:id="36"/>
+    </w:p>
+    <w:p>
+      <w:pPr>
+        <w:spacing w:after="110" w:line="262"/>
+        <w:jc w:val="both"/>
+      </w:pPr>
+      <w:r>
+        <w:rPr>
+          <w:rFonts w:ascii="Arial" w:cs="Arial" w:eastAsia="Arial" w:hAnsi="Arial"/>
+          <w:sz w:val="22"/>
+          <w:szCs w:val="22"/>
+        </w:rPr>
+        <w:t xml:space="preserve">La interfaz se adapta a los tamaños definidos en la sección 5.3. La adaptación no consiste en reducir la pantalla de escritorio, sino en reorganizar el contenido para conservar la facilidad de uso en cada dispositivo.</w:t>
+      </w:r>
+    </w:p>
+    <w:p>
+      <w:pPr>
+        <w:pStyle w:val="Heading2"/>
+        <w:spacing w:after="80" w:before="150"/>
+      </w:pPr>
+      <w:bookmarkStart w:name="bm37" w:id="37"/>
+      <w:r>
+        <w:rPr>
+          <w:rFonts w:ascii="Arial" w:cs="Arial" w:eastAsia="Arial" w:hAnsi="Arial"/>
+          <w:b/>
+          <w:bCs/>
+          <w:color w:val="2E5496"/>
+          <w:sz w:val="23"/>
+          <w:szCs w:val="23"/>
+        </w:rPr>
+        <w:t xml:space="preserve">10.1 Versión móvil</w:t>
+      </w:r>
+      <w:bookmarkEnd w:id="37"/>
+    </w:p>
+    <w:p>
+      <w:pPr>
+        <w:spacing w:after="110" w:line="262"/>
+        <w:jc w:val="both"/>
+      </w:pPr>
+      <w:r>
+        <w:rPr>
+          <w:rFonts w:ascii="Arial" w:cs="Arial" w:eastAsia="Arial" w:hAnsi="Arial"/>
+          <w:sz w:val="22"/>
+          <w:szCs w:val="22"/>
+        </w:rPr>
+        <w:t xml:space="preserve">En el teléfono el contenido se presenta en una sola columna y la navegación lateral se traslada a una barra inferior con los accesos de uso frecuente. Los controles aumentan su área de toque y las tablas se convierten en listas, de modo que cada registro ocupe un renglón legible.</w:t>
+      </w:r>
+    </w:p>
+    <w:p>
+      <w:pPr>
+        <w:pStyle w:val="ListParagraph"/>
+        <w:numPr>
+          <w:ilvl w:val="0"/>
+          <w:numId w:val="1"/>
+        </w:numPr>
+        <w:spacing w:after="60" w:line="258"/>
+      </w:pPr>
+      <w:r>
+        <w:rPr>
+          <w:rFonts w:ascii="Arial" w:cs="Arial" w:eastAsia="Arial" w:hAnsi="Arial"/>
+          <w:sz w:val="22"/>
+          <w:szCs w:val="22"/>
+        </w:rPr>
+        <w:t xml:space="preserve">Inicio de sesión: formulario centrado, con los campos y el botón a todo el ancho.</w:t>
+      </w:r>
+    </w:p>
+    <w:p>
+      <w:pPr>
+        <w:pStyle w:val="ListParagraph"/>
+        <w:numPr>
+          <w:ilvl w:val="0"/>
+          <w:numId w:val="1"/>
+        </w:numPr>
+        <w:spacing w:after="60" w:line="258"/>
+      </w:pPr>
+      <w:r>
+        <w:rPr>
+          <w:rFonts w:ascii="Arial" w:cs="Arial" w:eastAsia="Arial" w:hAnsi="Arial"/>
+          <w:sz w:val="22"/>
+          <w:szCs w:val="22"/>
+        </w:rPr>
+        <w:t xml:space="preserve">Panel: los indicadores se agrupan de a dos por fila y las alertas de stock quedan inmediatamente debajo.</w:t>
+      </w:r>
+    </w:p>
+    <w:p>
+      <w:pPr>
+        <w:pStyle w:val="ListParagraph"/>
+        <w:numPr>
+          <w:ilvl w:val="0"/>
+          <w:numId w:val="1"/>
+        </w:numPr>
+        <w:spacing w:after="60" w:line="258"/>
+      </w:pPr>
+      <w:r>
+        <w:rPr>
+          <w:rFonts w:ascii="Arial" w:cs="Arial" w:eastAsia="Arial" w:hAnsi="Arial"/>
+          <w:sz w:val="22"/>
+          <w:szCs w:val="22"/>
+        </w:rPr>
+        <w:t xml:space="preserve">Punto de venta: buscador, lista de la venta en curso, total y medios de pago en una sola columna, con la acción de cobro fija en la parte inferior.</w:t>
+      </w:r>
+    </w:p>
+    <w:p>
+      <w:pPr>
+        <w:spacing w:after="20" w:before="60"/>
+        <w:jc w:val="center"/>
+      </w:pPr>
+      <w:r>
+        <w:drawing>
+          <wp:inline distT="0" distB="0" distL="0" distR="0">
+            <wp:extent cx="6096000" cy="2714625"/>
+            <wp:effectExtent t="0" r="0" b="0" l="0"/>
+            <wp:docPr id="1" name="" descr="" title=""/>
+            <wp:cNvGraphicFramePr>
+              <a:graphicFrameLocks xmlns:a="http://schemas.openxmlformats.org/drawingml/2006/main" noChangeAspect="1"/>
+            </wp:cNvGraphicFramePr>
+            <a:graphic xmlns:a="http://schemas.openxmlformats.org/drawingml/2006/main">
+              <a:graphicData uri="http://schemas.openxmlformats.org/drawingml/2006/picture">
+                <pic:pic xmlns:pic="http://schemas.openxmlformats.org/drawingml/2006/picture">
+                  <pic:nvPicPr>
+                    <pic:cNvPr id="0" name="" descr=""/>
+                    <pic:cNvPicPr>
+                      <a:picLocks noChangeAspect="1" noChangeArrowheads="1"/>
+                    </pic:cNvPicPr>
+                  </pic:nvPicPr>
+                  <pic:blipFill>
+                    <a:blip r:embed="rId24" cstate="none"/>
+                    <a:srcRect/>
+                    <a:stretch>
+                      <a:fillRect/>
+                    </a:stretch>
+                  </pic:blipFill>
+                  <pic:spPr bwMode="auto">
+                    <a:xfrm>
+                      <a:off x="0" y="0"/>
+                      <a:ext cx="6096000" cy="2714625"/>
+                    </a:xfrm>
+                    <a:prstGeom prst="rect">
+                      <a:avLst/>
+                    </a:prstGeom>
+                  </pic:spPr>
+                </pic:pic>
+              </a:graphicData>
+            </a:graphic>
+          </wp:inline>
+        </w:drawing>
+      </w:r>
+    </w:p>
+    <w:p>
+      <w:pPr>
+        <w:spacing w:after="150" w:before="6"/>
+        <w:jc w:val="center"/>
+      </w:pPr>
+      <w:r>
+        <w:rPr>
+          <w:rFonts w:ascii="Arial" w:cs="Arial" w:eastAsia="Arial" w:hAnsi="Arial"/>
+          <w:i/>
+          <w:iCs/>
+          <w:color w:val="5B6678"/>
+          <w:sz w:val="18"/>
+          <w:szCs w:val="18"/>
+        </w:rPr>
+        <w:t xml:space="preserve">Figura 17. Versión móvil: inicio de sesión, panel y punto de venta. Fuente: del autor.</w:t>
+      </w:r>
+    </w:p>
+    <w:p>
+      <w:pPr>
+        <w:pStyle w:val="Heading2"/>
+        <w:spacing w:after="80" w:before="150"/>
+      </w:pPr>
+      <w:bookmarkStart w:name="bm38" w:id="38"/>
+      <w:r>
+        <w:rPr>
+          <w:rFonts w:ascii="Arial" w:cs="Arial" w:eastAsia="Arial" w:hAnsi="Arial"/>
+          <w:b/>
+          <w:bCs/>
+          <w:color w:val="2E5496"/>
+          <w:sz w:val="23"/>
+          <w:szCs w:val="23"/>
+        </w:rPr>
+        <w:t xml:space="preserve">10.2 Tablet y escritorio</w:t>
+      </w:r>
+      <w:bookmarkEnd w:id="38"/>
+    </w:p>
+    <w:p>
+      <w:pPr>
+        <w:spacing w:after="110" w:line="262"/>
+        <w:jc w:val="both"/>
+      </w:pPr>
+      <w:r>
+        <w:rPr>
+          <w:rFonts w:ascii="Arial" w:cs="Arial" w:eastAsia="Arial" w:hAnsi="Arial"/>
+          <w:sz w:val="22"/>
+          <w:szCs w:val="22"/>
+        </w:rPr>
+        <w:t xml:space="preserve">En tablet el contenido se organiza en dos columnas y la navegación lateral puede contraerse para dejar más espacio al contenido. En escritorio se emplea la rejilla completa, con la navegación lateral fija y los paneles de apoyo a la derecha del contenido principal, como ocurre en el punto de venta.</w:t>
+      </w:r>
+    </w:p>
+    <w:p>
+      <w:pPr>
+        <w:pStyle w:val="Heading2"/>
+        <w:spacing w:after="80" w:before="150"/>
+      </w:pPr>
+      <w:bookmarkStart w:name="bm39" w:id="39"/>
+      <w:r>
+        <w:rPr>
+          <w:rFonts w:ascii="Arial" w:cs="Arial" w:eastAsia="Arial" w:hAnsi="Arial"/>
+          <w:b/>
+          <w:bCs/>
+          <w:color w:val="2E5496"/>
+          <w:sz w:val="23"/>
+          <w:szCs w:val="23"/>
+        </w:rPr>
+        <w:t xml:space="preserve">10.3 Modo oscuro</w:t>
+      </w:r>
+      <w:bookmarkEnd w:id="39"/>
+    </w:p>
+    <w:p>
+      <w:pPr>
+        <w:spacing w:after="110" w:line="262"/>
+        <w:jc w:val="both"/>
+      </w:pPr>
+      <w:r>
+        <w:rPr>
+          <w:rFonts w:ascii="Arial" w:cs="Arial" w:eastAsia="Arial" w:hAnsi="Arial"/>
+          <w:sz w:val="22"/>
+          <w:szCs w:val="22"/>
+        </w:rPr>
+        <w:t xml:space="preserve">El modo oscuro utiliza la variante de paleta definida en la sección 4.2 y conserva la misma estructura, la misma jerarquía y los mismos componentes del modo claro. Cambian únicamente los colores de fondo, superficie, borde y texto, y se ajustan los tonos de las etiquetas de estado para mantener el contraste. La elección del modo es del usuario y se conserva entre sesiones.</w:t>
+      </w:r>
+    </w:p>
+    <w:p>
+      <w:pPr>
+        <w:spacing w:after="20" w:before="60"/>
+        <w:jc w:val="center"/>
+      </w:pPr>
+      <w:r>
+        <w:drawing>
+          <wp:inline distT="0" distB="0" distL="0" distR="0">
+            <wp:extent cx="6096000" cy="3057525"/>
+            <wp:effectExtent t="0" r="0" b="0" l="0"/>
+            <wp:docPr id="1" name="" descr="" title=""/>
+            <wp:cNvGraphicFramePr>
+              <a:graphicFrameLocks xmlns:a="http://schemas.openxmlformats.org/drawingml/2006/main" noChangeAspect="1"/>
+            </wp:cNvGraphicFramePr>
+            <a:graphic xmlns:a="http://schemas.openxmlformats.org/drawingml/2006/main">
+              <a:graphicData uri="http://schemas.openxmlformats.org/drawingml/2006/picture">
+                <pic:pic xmlns:pic="http://schemas.openxmlformats.org/drawingml/2006/picture">
+                  <pic:nvPicPr>
+                    <pic:cNvPr id="0" name="" descr=""/>
+                    <pic:cNvPicPr>
+                      <a:picLocks noChangeAspect="1" noChangeArrowheads="1"/>
+                    </pic:cNvPicPr>
+                  </pic:nvPicPr>
+                  <pic:blipFill>
+                    <a:blip r:embed="rId25" cstate="none"/>
+                    <a:srcRect/>
+                    <a:stretch>
+                      <a:fillRect/>
+                    </a:stretch>
+                  </pic:blipFill>
+                  <pic:spPr bwMode="auto">
+                    <a:xfrm>
+                      <a:off x="0" y="0"/>
+                      <a:ext cx="6096000" cy="3057525"/>
+                    </a:xfrm>
+                    <a:prstGeom prst="rect">
+                      <a:avLst/>
+                    </a:prstGeom>
+                  </pic:spPr>
+                </pic:pic>
+              </a:graphicData>
+            </a:graphic>
+          </wp:inline>
+        </w:drawing>
+      </w:r>
+    </w:p>
+    <w:p>
+      <w:pPr>
+        <w:spacing w:after="150" w:before="6"/>
+        <w:jc w:val="center"/>
+      </w:pPr>
+      <w:r>
+        <w:rPr>
+          <w:rFonts w:ascii="Arial" w:cs="Arial" w:eastAsia="Arial" w:hAnsi="Arial"/>
+          <w:i/>
+          <w:iCs/>
+          <w:color w:val="5B6678"/>
+          <w:sz w:val="18"/>
+          <w:szCs w:val="18"/>
+        </w:rPr>
+        <w:t xml:space="preserve">Figura 18. Panel principal en modo oscuro. Fuente: del autor.</w:t>
+      </w:r>
+    </w:p>
+    <w:p>
+      <w:pPr>
+        <w:pStyle w:val="Heading1"/>
+        <w:pageBreakBefore/>
+        <w:spacing w:after="110" w:before="220"/>
+      </w:pPr>
+      <w:bookmarkStart w:name="bm40" w:id="40"/>
+      <w:r>
+        <w:rPr>
+          <w:rFonts w:ascii="Arial" w:cs="Arial" w:eastAsia="Arial" w:hAnsi="Arial"/>
+          <w:b/>
+          <w:bCs/>
+          <w:color w:val="1F3864"/>
+          <w:sz w:val="27"/>
+          <w:szCs w:val="27"/>
+        </w:rPr>
+        <w:t xml:space="preserve">11. Conclusión</w:t>
+      </w:r>
+      <w:bookmarkEnd w:id="40"/>
+    </w:p>
+    <w:p>
+      <w:pPr>
+        <w:spacing w:after="110" w:line="262"/>
+        <w:jc w:val="both"/>
+      </w:pPr>
+      <w:r>
+        <w:rPr>
+          <w:rFonts w:ascii="Arial" w:cs="Arial" w:eastAsia="Arial" w:hAnsi="Arial"/>
+          <w:sz w:val="22"/>
+          <w:szCs w:val="22"/>
+        </w:rPr>
+        <w:t xml:space="preserve">Este documento reúne los lineamientos visuales y de interacción de INVENTRA: la identidad visual con sus dos paletas, la tipografía y la iconografía; la rejilla, el espaciado y los puntos de quiebre; los componentes comunes con sus estados; los formularios de acceso y registro; las pantallas principales de la aplicación; el tratamiento de los mensajes y de los estados de pantalla; y el comportamiento en distintos dispositivos.</w:t>
+      </w:r>
+    </w:p>
+    <w:p>
+      <w:pPr>
+        <w:spacing w:after="110" w:line="262"/>
+        <w:jc w:val="both"/>
+      </w:pPr>
+      <w:r>
+        <w:rPr>
+          <w:rFonts w:ascii="Arial" w:cs="Arial" w:eastAsia="Arial" w:hAnsi="Arial"/>
+          <w:sz w:val="22"/>
+          <w:szCs w:val="22"/>
+        </w:rPr>
+        <w:t xml:space="preserve">Con ello, la etapa de construcción cuenta con un referente único para implementar la interfaz: cada pantalla nueva puede armarse a partir de los componentes ya definidos, sin decisiones visuales aisladas. Los criterios aquí establecidos son coherentes con la especificación de requisitos, con el modelo de datos y con el análisis y diseño en UML del proyecto, y se complementan con el manual de marca, que desarrolla el uso del logotipo y de los elementos gráficos de identidad.</w:t>
+      </w:r>
+    </w:p>
+    <w:p>
+      <w:pPr>
+        <w:pStyle w:val="Heading1"/>
+        <w:pageBreakBefore/>
+        <w:spacing w:after="110" w:before="220"/>
+      </w:pPr>
+      <w:bookmarkStart w:name="bm41" w:id="41"/>
+      <w:r>
+        <w:rPr>
+          <w:rFonts w:ascii="Arial" w:cs="Arial" w:eastAsia="Arial" w:hAnsi="Arial"/>
+          <w:b/>
+          <w:bCs/>
+          <w:color w:val="1F3864"/>
+          <w:sz w:val="27"/>
+          <w:szCs w:val="27"/>
+        </w:rPr>
+        <w:t xml:space="preserve">12. Glosario</w:t>
+      </w:r>
+      <w:bookmarkEnd w:id="41"/>
+    </w:p>
+    <w:tbl>
+      <w:tblPr>
+        <w:tblW w:type="dxa" w:w="9360"/>
+        <w:tblBorders>
+          <w:top w:val="single" w:color="9CA3AF" w:sz="6"/>
+          <w:left w:val="single" w:color="9CA3AF" w:sz="6"/>
+          <w:bottom w:val="single" w:color="9CA3AF" w:sz="6"/>
+          <w:right w:val="single" w:color="9CA3AF" w:sz="6"/>
+          <w:insideH w:val="single" w:color="9CA3AF" w:sz="6"/>
+          <w:insideV w:val="single" w:color="9CA3AF" w:sz="6"/>
+        </w:tblBorders>
+        <w:tblLayout w:type="fixed"/>
+      </w:tblPr>
+      <w:tblGrid>
+        <w:gridCol w:w="2100"/>
+        <w:gridCol w:w="7260"/>
+      </w:tblGrid>
+      <w:tr>
+        <w:trPr>
+          <w:tblHeader/>
+        </w:trPr>
+        <w:tc>
+          <w:tcPr>
+            <w:tcW w:type="dxa" w:w="2100"/>
+            <w:shd w:fill="1F3864" w:val="clear"/>
+            <w:tcMar>
+              <w:top w:type="dxa" w:w="40"/>
+              <w:left w:type="dxa" w:w="70"/>
+              <w:bottom w:type="dxa" w:w="40"/>
+              <w:right w:type="dxa" w:w="70"/>
+            </w:tcMar>
+          </w:tcPr>
+          <w:p>
+            <w:pPr>
+              <w:spacing w:after="0" w:line="236"/>
+            </w:pPr>
+            <w:r>
+              <w:rPr>
+                <w:rFonts w:ascii="Arial" w:cs="Arial" w:eastAsia="Arial" w:hAnsi="Arial"/>
+                <w:b/>
+                <w:bCs/>
+                <w:color w:val="FFFFFF"/>
+                <w:sz w:val="19"/>
+                <w:szCs w:val="19"/>
+              </w:rPr>
+              <w:t xml:space="preserve">Término</w:t>
+            </w:r>
+          </w:p>
+        </w:tc>
+        <w:tc>
+          <w:tcPr>
+            <w:tcW w:type="dxa" w:w="7260"/>
+            <w:shd w:fill="1F3864" w:val="clear"/>
+            <w:tcMar>
+              <w:top w:type="dxa" w:w="40"/>
+              <w:left w:type="dxa" w:w="70"/>
+              <w:bottom w:type="dxa" w:w="40"/>
+              <w:right w:type="dxa" w:w="70"/>
+            </w:tcMar>
+          </w:tcPr>
+          <w:p>
+            <w:pPr>
+              <w:spacing w:after="0" w:line="236"/>
+            </w:pPr>
+            <w:r>
+              <w:rPr>
+                <w:rFonts w:ascii="Arial" w:cs="Arial" w:eastAsia="Arial" w:hAnsi="Arial"/>
+                <w:b/>
+                <w:bCs/>
+                <w:color w:val="FFFFFF"/>
+                <w:sz w:val="19"/>
+                <w:szCs w:val="19"/>
+              </w:rPr>
+              <w:t xml:space="preserve">Definición</w:t>
+            </w:r>
+          </w:p>
+        </w:tc>
+      </w:tr>
+      <w:tr>
+        <w:trPr>
+          <w:tblHeader w:val="false"/>
+        </w:trPr>
+        <w:tc>
+          <w:tcPr>
+            <w:tcW w:type="dxa" w:w="2100"/>
+            <w:shd w:fill="FFFFFF" w:val="clear"/>
+            <w:tcMar>
+              <w:top w:type="dxa" w:w="40"/>
+              <w:left w:type="dxa" w:w="70"/>
+              <w:bottom w:type="dxa" w:w="40"/>
+              <w:right w:type="dxa" w:w="70"/>
+            </w:tcMar>
+          </w:tcPr>
+          <w:p>
+            <w:pPr>
+              <w:spacing w:after="0" w:line="236"/>
+            </w:pPr>
+            <w:r>
+              <w:rPr>
+                <w:rFonts w:ascii="Arial" w:cs="Arial" w:eastAsia="Arial" w:hAnsi="Arial"/>
+                <w:sz w:val="19"/>
+                <w:szCs w:val="19"/>
+              </w:rPr>
+              <w:t xml:space="preserve">Accesibilidad</w:t>
+            </w:r>
+          </w:p>
+        </w:tc>
+        <w:tc>
+          <w:tcPr>
+            <w:tcW w:type="dxa" w:w="7260"/>
+            <w:shd w:fill="FFFFFF" w:val="clear"/>
+            <w:tcMar>
+              <w:top w:type="dxa" w:w="40"/>
+              <w:left w:type="dxa" w:w="70"/>
+              <w:bottom w:type="dxa" w:w="40"/>
+              <w:right w:type="dxa" w:w="70"/>
+            </w:tcMar>
+          </w:tcPr>
+          <w:p>
+            <w:pPr>
+              <w:spacing w:after="0" w:line="236"/>
+            </w:pPr>
+            <w:r>
+              <w:rPr>
+                <w:rFonts w:ascii="Arial" w:cs="Arial" w:eastAsia="Arial" w:hAnsi="Arial"/>
+                <w:sz w:val="19"/>
+                <w:szCs w:val="19"/>
+              </w:rPr>
+              <w:t xml:space="preserve">Conjunto de prácticas que permiten que la interfaz pueda ser usada por personas con distintas capacidades y condiciones de uso.</w:t>
+            </w:r>
+          </w:p>
+        </w:tc>
+      </w:tr>
+      <w:tr>
+        <w:trPr>
+          <w:tblHeader w:val="false"/>
+        </w:trPr>
+        <w:tc>
+          <w:tcPr>
+            <w:tcW w:type="dxa" w:w="2100"/>
+            <w:shd w:fill="F2F2F2" w:val="clear"/>
+            <w:tcMar>
+              <w:top w:type="dxa" w:w="40"/>
+              <w:left w:type="dxa" w:w="70"/>
+              <w:bottom w:type="dxa" w:w="40"/>
+              <w:right w:type="dxa" w:w="70"/>
+            </w:tcMar>
+          </w:tcPr>
+          <w:p>
+            <w:pPr>
+              <w:spacing w:after="0" w:line="236"/>
+            </w:pPr>
+            <w:r>
+              <w:rPr>
+                <w:rFonts w:ascii="Arial" w:cs="Arial" w:eastAsia="Arial" w:hAnsi="Arial"/>
+                <w:sz w:val="19"/>
+                <w:szCs w:val="19"/>
+              </w:rPr>
+              <w:t xml:space="preserve">Componente</w:t>
+            </w:r>
+          </w:p>
+        </w:tc>
+        <w:tc>
+          <w:tcPr>
+            <w:tcW w:type="dxa" w:w="7260"/>
+            <w:shd w:fill="F2F2F2" w:val="clear"/>
+            <w:tcMar>
+              <w:top w:type="dxa" w:w="40"/>
+              <w:left w:type="dxa" w:w="70"/>
+              <w:bottom w:type="dxa" w:w="40"/>
+              <w:right w:type="dxa" w:w="70"/>
+            </w:tcMar>
+          </w:tcPr>
+          <w:p>
+            <w:pPr>
+              <w:spacing w:after="0" w:line="236"/>
+            </w:pPr>
+            <w:r>
+              <w:rPr>
+                <w:rFonts w:ascii="Arial" w:cs="Arial" w:eastAsia="Arial" w:hAnsi="Arial"/>
+                <w:sz w:val="19"/>
+                <w:szCs w:val="19"/>
+              </w:rPr>
+              <w:t xml:space="preserve">Elemento reutilizable de la interfaz, con una función y una apariencia definidas, que se repite en distintas pantallas.</w:t>
+            </w:r>
+          </w:p>
+        </w:tc>
+      </w:tr>
+      <w:tr>
+        <w:trPr>
+          <w:tblHeader w:val="false"/>
+        </w:trPr>
+        <w:tc>
+          <w:tcPr>
+            <w:tcW w:type="dxa" w:w="2100"/>
+            <w:shd w:fill="FFFFFF" w:val="clear"/>
+            <w:tcMar>
+              <w:top w:type="dxa" w:w="40"/>
+              <w:left w:type="dxa" w:w="70"/>
+              <w:bottom w:type="dxa" w:w="40"/>
+              <w:right w:type="dxa" w:w="70"/>
+            </w:tcMar>
+          </w:tcPr>
+          <w:p>
+            <w:pPr>
+              <w:spacing w:after="0" w:line="236"/>
+            </w:pPr>
+            <w:r>
+              <w:rPr>
+                <w:rFonts w:ascii="Arial" w:cs="Arial" w:eastAsia="Arial" w:hAnsi="Arial"/>
+                <w:sz w:val="19"/>
+                <w:szCs w:val="19"/>
+              </w:rPr>
+              <w:t xml:space="preserve">CTA</w:t>
+            </w:r>
+          </w:p>
+        </w:tc>
+        <w:tc>
+          <w:tcPr>
+            <w:tcW w:type="dxa" w:w="7260"/>
+            <w:shd w:fill="FFFFFF" w:val="clear"/>
+            <w:tcMar>
+              <w:top w:type="dxa" w:w="40"/>
+              <w:left w:type="dxa" w:w="70"/>
+              <w:bottom w:type="dxa" w:w="40"/>
+              <w:right w:type="dxa" w:w="70"/>
+            </w:tcMar>
+          </w:tcPr>
+          <w:p>
+            <w:pPr>
+              <w:spacing w:after="0" w:line="236"/>
+            </w:pPr>
+            <w:r>
+              <w:rPr>
+                <w:rFonts w:ascii="Arial" w:cs="Arial" w:eastAsia="Arial" w:hAnsi="Arial"/>
+                <w:sz w:val="19"/>
+                <w:szCs w:val="19"/>
+              </w:rPr>
+              <w:t xml:space="preserve">Color y botón reservados para la acción principal de una pantalla, del inglés «call to action» o llamado a la acción.</w:t>
+            </w:r>
+          </w:p>
+        </w:tc>
+      </w:tr>
+      <w:tr>
+        <w:trPr>
+          <w:tblHeader w:val="false"/>
+        </w:trPr>
+        <w:tc>
+          <w:tcPr>
+            <w:tcW w:type="dxa" w:w="2100"/>
+            <w:shd w:fill="F2F2F2" w:val="clear"/>
+            <w:tcMar>
+              <w:top w:type="dxa" w:w="40"/>
+              <w:left w:type="dxa" w:w="70"/>
+              <w:bottom w:type="dxa" w:w="40"/>
+              <w:right w:type="dxa" w:w="70"/>
+            </w:tcMar>
+          </w:tcPr>
+          <w:p>
+            <w:pPr>
+              <w:spacing w:after="0" w:line="236"/>
+            </w:pPr>
+            <w:r>
+              <w:rPr>
+                <w:rFonts w:ascii="Arial" w:cs="Arial" w:eastAsia="Arial" w:hAnsi="Arial"/>
+                <w:sz w:val="19"/>
+                <w:szCs w:val="19"/>
+              </w:rPr>
+              <w:t xml:space="preserve">Estado</w:t>
+            </w:r>
+          </w:p>
+        </w:tc>
+        <w:tc>
+          <w:tcPr>
+            <w:tcW w:type="dxa" w:w="7260"/>
+            <w:shd w:fill="F2F2F2" w:val="clear"/>
+            <w:tcMar>
+              <w:top w:type="dxa" w:w="40"/>
+              <w:left w:type="dxa" w:w="70"/>
+              <w:bottom w:type="dxa" w:w="40"/>
+              <w:right w:type="dxa" w:w="70"/>
+            </w:tcMar>
+          </w:tcPr>
+          <w:p>
+            <w:pPr>
+              <w:spacing w:after="0" w:line="236"/>
+            </w:pPr>
+            <w:r>
+              <w:rPr>
+                <w:rFonts w:ascii="Arial" w:cs="Arial" w:eastAsia="Arial" w:hAnsi="Arial"/>
+                <w:sz w:val="19"/>
+                <w:szCs w:val="19"/>
+              </w:rPr>
+              <w:t xml:space="preserve">Situación en que se encuentra un componente o una pantalla y que determina su apariencia y su comportamiento.</w:t>
+            </w:r>
+          </w:p>
+        </w:tc>
+      </w:tr>
+      <w:tr>
+        <w:trPr>
+          <w:tblHeader w:val="false"/>
+        </w:trPr>
+        <w:tc>
+          <w:tcPr>
+            <w:tcW w:type="dxa" w:w="2100"/>
+            <w:shd w:fill="FFFFFF" w:val="clear"/>
+            <w:tcMar>
+              <w:top w:type="dxa" w:w="40"/>
+              <w:left w:type="dxa" w:w="70"/>
+              <w:bottom w:type="dxa" w:w="40"/>
+              <w:right w:type="dxa" w:w="70"/>
+            </w:tcMar>
+          </w:tcPr>
+          <w:p>
+            <w:pPr>
+              <w:spacing w:after="0" w:line="236"/>
+            </w:pPr>
+            <w:r>
+              <w:rPr>
+                <w:rFonts w:ascii="Arial" w:cs="Arial" w:eastAsia="Arial" w:hAnsi="Arial"/>
+                <w:sz w:val="19"/>
+                <w:szCs w:val="19"/>
+              </w:rPr>
+              <w:t xml:space="preserve">Etiqueta de estado</w:t>
+            </w:r>
+          </w:p>
+        </w:tc>
+        <w:tc>
+          <w:tcPr>
+            <w:tcW w:type="dxa" w:w="7260"/>
+            <w:shd w:fill="FFFFFF" w:val="clear"/>
+            <w:tcMar>
+              <w:top w:type="dxa" w:w="40"/>
+              <w:left w:type="dxa" w:w="70"/>
+              <w:bottom w:type="dxa" w:w="40"/>
+              <w:right w:type="dxa" w:w="70"/>
+            </w:tcMar>
+          </w:tcPr>
+          <w:p>
+            <w:pPr>
+              <w:spacing w:after="0" w:line="236"/>
+            </w:pPr>
+            <w:r>
+              <w:rPr>
+                <w:rFonts w:ascii="Arial" w:cs="Arial" w:eastAsia="Arial" w:hAnsi="Arial"/>
+                <w:sz w:val="19"/>
+                <w:szCs w:val="19"/>
+              </w:rPr>
+              <w:t xml:space="preserve">Marca breve y de color que identifica la situación de un registro, como activo, stock bajo o anulada.</w:t>
+            </w:r>
+          </w:p>
+        </w:tc>
+      </w:tr>
+      <w:tr>
+        <w:trPr>
+          <w:tblHeader w:val="false"/>
+        </w:trPr>
+        <w:tc>
+          <w:tcPr>
+            <w:tcW w:type="dxa" w:w="2100"/>
+            <w:shd w:fill="F2F2F2" w:val="clear"/>
+            <w:tcMar>
+              <w:top w:type="dxa" w:w="40"/>
+              <w:left w:type="dxa" w:w="70"/>
+              <w:bottom w:type="dxa" w:w="40"/>
+              <w:right w:type="dxa" w:w="70"/>
+            </w:tcMar>
+          </w:tcPr>
+          <w:p>
+            <w:pPr>
+              <w:spacing w:after="0" w:line="236"/>
+            </w:pPr>
+            <w:r>
+              <w:rPr>
+                <w:rFonts w:ascii="Arial" w:cs="Arial" w:eastAsia="Arial" w:hAnsi="Arial"/>
+                <w:sz w:val="19"/>
+                <w:szCs w:val="19"/>
+              </w:rPr>
+              <w:t xml:space="preserve">Modo oscuro</w:t>
+            </w:r>
+          </w:p>
+        </w:tc>
+        <w:tc>
+          <w:tcPr>
+            <w:tcW w:type="dxa" w:w="7260"/>
+            <w:shd w:fill="F2F2F2" w:val="clear"/>
+            <w:tcMar>
+              <w:top w:type="dxa" w:w="40"/>
+              <w:left w:type="dxa" w:w="70"/>
+              <w:bottom w:type="dxa" w:w="40"/>
+              <w:right w:type="dxa" w:w="70"/>
+            </w:tcMar>
+          </w:tcPr>
+          <w:p>
+            <w:pPr>
+              <w:spacing w:after="0" w:line="236"/>
+            </w:pPr>
+            <w:r>
+              <w:rPr>
+                <w:rFonts w:ascii="Arial" w:cs="Arial" w:eastAsia="Arial" w:hAnsi="Arial"/>
+                <w:sz w:val="19"/>
+                <w:szCs w:val="19"/>
+              </w:rPr>
+              <w:t xml:space="preserve">Variante de la interfaz con fondos oscuros y texto claro, pensada para ambientes de poca luz.</w:t>
+            </w:r>
+          </w:p>
+        </w:tc>
+      </w:tr>
+      <w:tr>
+        <w:trPr>
+          <w:tblHeader w:val="false"/>
+        </w:trPr>
+        <w:tc>
+          <w:tcPr>
+            <w:tcW w:type="dxa" w:w="2100"/>
+            <w:shd w:fill="FFFFFF" w:val="clear"/>
+            <w:tcMar>
+              <w:top w:type="dxa" w:w="40"/>
+              <w:left w:type="dxa" w:w="70"/>
+              <w:bottom w:type="dxa" w:w="40"/>
+              <w:right w:type="dxa" w:w="70"/>
+            </w:tcMar>
+          </w:tcPr>
+          <w:p>
+            <w:pPr>
+              <w:spacing w:after="0" w:line="236"/>
+            </w:pPr>
+            <w:r>
+              <w:rPr>
+                <w:rFonts w:ascii="Arial" w:cs="Arial" w:eastAsia="Arial" w:hAnsi="Arial"/>
+                <w:sz w:val="19"/>
+                <w:szCs w:val="19"/>
+              </w:rPr>
+              <w:t xml:space="preserve">Punto de quiebre</w:t>
+            </w:r>
+          </w:p>
+        </w:tc>
+        <w:tc>
+          <w:tcPr>
+            <w:tcW w:type="dxa" w:w="7260"/>
+            <w:shd w:fill="FFFFFF" w:val="clear"/>
+            <w:tcMar>
+              <w:top w:type="dxa" w:w="40"/>
+              <w:left w:type="dxa" w:w="70"/>
+              <w:bottom w:type="dxa" w:w="40"/>
+              <w:right w:type="dxa" w:w="70"/>
+            </w:tcMar>
+          </w:tcPr>
+          <w:p>
+            <w:pPr>
+              <w:spacing w:after="0" w:line="236"/>
+            </w:pPr>
+            <w:r>
+              <w:rPr>
+                <w:rFonts w:ascii="Arial" w:cs="Arial" w:eastAsia="Arial" w:hAnsi="Arial"/>
+                <w:sz w:val="19"/>
+                <w:szCs w:val="19"/>
+              </w:rPr>
+              <w:t xml:space="preserve">Ancho de pantalla a partir del cual la disposición del contenido cambia.</w:t>
+            </w:r>
+          </w:p>
+        </w:tc>
+      </w:tr>
+      <w:tr>
+        <w:trPr>
+          <w:tblHeader w:val="false"/>
+        </w:trPr>
+        <w:tc>
+          <w:tcPr>
+            <w:tcW w:type="dxa" w:w="2100"/>
+            <w:shd w:fill="F2F2F2" w:val="clear"/>
+            <w:tcMar>
+              <w:top w:type="dxa" w:w="40"/>
+              <w:left w:type="dxa" w:w="70"/>
+              <w:bottom w:type="dxa" w:w="40"/>
+              <w:right w:type="dxa" w:w="70"/>
+            </w:tcMar>
+          </w:tcPr>
+          <w:p>
+            <w:pPr>
+              <w:spacing w:after="0" w:line="236"/>
+            </w:pPr>
+            <w:r>
+              <w:rPr>
+                <w:rFonts w:ascii="Arial" w:cs="Arial" w:eastAsia="Arial" w:hAnsi="Arial"/>
+                <w:sz w:val="19"/>
+                <w:szCs w:val="19"/>
+              </w:rPr>
+              <w:t xml:space="preserve">Rejilla</w:t>
+            </w:r>
+          </w:p>
+        </w:tc>
+        <w:tc>
+          <w:tcPr>
+            <w:tcW w:type="dxa" w:w="7260"/>
+            <w:shd w:fill="F2F2F2" w:val="clear"/>
+            <w:tcMar>
+              <w:top w:type="dxa" w:w="40"/>
+              <w:left w:type="dxa" w:w="70"/>
+              <w:bottom w:type="dxa" w:w="40"/>
+              <w:right w:type="dxa" w:w="70"/>
+            </w:tcMar>
+          </w:tcPr>
+          <w:p>
+            <w:pPr>
+              <w:spacing w:after="0" w:line="236"/>
+            </w:pPr>
+            <w:r>
+              <w:rPr>
+                <w:rFonts w:ascii="Arial" w:cs="Arial" w:eastAsia="Arial" w:hAnsi="Arial"/>
+                <w:sz w:val="19"/>
+                <w:szCs w:val="19"/>
+              </w:rPr>
+              <w:t xml:space="preserve">Sistema de columnas y márgenes que ordena la ubicación de los elementos en la pantalla.</w:t>
+            </w:r>
+          </w:p>
+        </w:tc>
+      </w:tr>
+      <w:tr>
+        <w:trPr>
+          <w:tblHeader w:val="false"/>
+        </w:trPr>
+        <w:tc>
+          <w:tcPr>
+            <w:tcW w:type="dxa" w:w="2100"/>
+            <w:shd w:fill="FFFFFF" w:val="clear"/>
+            <w:tcMar>
+              <w:top w:type="dxa" w:w="40"/>
+              <w:left w:type="dxa" w:w="70"/>
+              <w:bottom w:type="dxa" w:w="40"/>
+              <w:right w:type="dxa" w:w="70"/>
+            </w:tcMar>
+          </w:tcPr>
+          <w:p>
+            <w:pPr>
+              <w:spacing w:after="0" w:line="236"/>
+            </w:pPr>
+            <w:r>
+              <w:rPr>
+                <w:rFonts w:ascii="Arial" w:cs="Arial" w:eastAsia="Arial" w:hAnsi="Arial"/>
+                <w:sz w:val="19"/>
+                <w:szCs w:val="19"/>
+              </w:rPr>
+              <w:t xml:space="preserve">Responsivo</w:t>
+            </w:r>
+          </w:p>
+        </w:tc>
+        <w:tc>
+          <w:tcPr>
+            <w:tcW w:type="dxa" w:w="7260"/>
+            <w:shd w:fill="FFFFFF" w:val="clear"/>
+            <w:tcMar>
+              <w:top w:type="dxa" w:w="40"/>
+              <w:left w:type="dxa" w:w="70"/>
+              <w:bottom w:type="dxa" w:w="40"/>
+              <w:right w:type="dxa" w:w="70"/>
+            </w:tcMar>
+          </w:tcPr>
+          <w:p>
+            <w:pPr>
+              <w:spacing w:after="0" w:line="236"/>
+            </w:pPr>
+            <w:r>
+              <w:rPr>
+                <w:rFonts w:ascii="Arial" w:cs="Arial" w:eastAsia="Arial" w:hAnsi="Arial"/>
+                <w:sz w:val="19"/>
+                <w:szCs w:val="19"/>
+              </w:rPr>
+              <w:t xml:space="preserve">Capacidad de la interfaz de adaptar su disposición al tamaño de la pantalla en que se muestra.</w:t>
+            </w:r>
+          </w:p>
+        </w:tc>
+      </w:tr>
+      <w:tr>
+        <w:trPr>
+          <w:tblHeader w:val="false"/>
+        </w:trPr>
+        <w:tc>
+          <w:tcPr>
+            <w:tcW w:type="dxa" w:w="2100"/>
+            <w:shd w:fill="F2F2F2" w:val="clear"/>
+            <w:tcMar>
+              <w:top w:type="dxa" w:w="40"/>
+              <w:left w:type="dxa" w:w="70"/>
+              <w:bottom w:type="dxa" w:w="40"/>
+              <w:right w:type="dxa" w:w="70"/>
+            </w:tcMar>
+          </w:tcPr>
+          <w:p>
+            <w:pPr>
+              <w:spacing w:after="0" w:line="236"/>
+            </w:pPr>
+            <w:r>
+              <w:rPr>
+                <w:rFonts w:ascii="Arial" w:cs="Arial" w:eastAsia="Arial" w:hAnsi="Arial"/>
+                <w:sz w:val="19"/>
+                <w:szCs w:val="19"/>
+              </w:rPr>
+              <w:t xml:space="preserve">Sistema de diseño</w:t>
+            </w:r>
+          </w:p>
+        </w:tc>
+        <w:tc>
+          <w:tcPr>
+            <w:tcW w:type="dxa" w:w="7260"/>
+            <w:shd w:fill="F2F2F2" w:val="clear"/>
+            <w:tcMar>
+              <w:top w:type="dxa" w:w="40"/>
+              <w:left w:type="dxa" w:w="70"/>
+              <w:bottom w:type="dxa" w:w="40"/>
+              <w:right w:type="dxa" w:w="70"/>
+            </w:tcMar>
+          </w:tcPr>
+          <w:p>
+            <w:pPr>
+              <w:spacing w:after="0" w:line="236"/>
+            </w:pPr>
+            <w:r>
+              <w:rPr>
+                <w:rFonts w:ascii="Arial" w:cs="Arial" w:eastAsia="Arial" w:hAnsi="Arial"/>
+                <w:sz w:val="19"/>
+                <w:szCs w:val="19"/>
+              </w:rPr>
+              <w:t xml:space="preserve">Conjunto de reglas, estilos y componentes que garantiza la coherencia visual y de comportamiento del producto.</w:t>
+            </w:r>
+          </w:p>
+        </w:tc>
+      </w:tr>
+      <w:tr>
+        <w:trPr>
+          <w:tblHeader w:val="false"/>
+        </w:trPr>
+        <w:tc>
+          <w:tcPr>
+            <w:tcW w:type="dxa" w:w="2100"/>
+            <w:shd w:fill="FFFFFF" w:val="clear"/>
+            <w:tcMar>
+              <w:top w:type="dxa" w:w="40"/>
+              <w:left w:type="dxa" w:w="70"/>
+              <w:bottom w:type="dxa" w:w="40"/>
+              <w:right w:type="dxa" w:w="70"/>
+            </w:tcMar>
+          </w:tcPr>
+          <w:p>
+            <w:pPr>
+              <w:spacing w:after="0" w:line="236"/>
+            </w:pPr>
+            <w:r>
+              <w:rPr>
+                <w:rFonts w:ascii="Arial" w:cs="Arial" w:eastAsia="Arial" w:hAnsi="Arial"/>
+                <w:sz w:val="19"/>
+                <w:szCs w:val="19"/>
+              </w:rPr>
+              <w:t xml:space="preserve">Texto de ayuda</w:t>
+            </w:r>
+          </w:p>
+        </w:tc>
+        <w:tc>
+          <w:tcPr>
+            <w:tcW w:type="dxa" w:w="7260"/>
+            <w:shd w:fill="FFFFFF" w:val="clear"/>
+            <w:tcMar>
+              <w:top w:type="dxa" w:w="40"/>
+              <w:left w:type="dxa" w:w="70"/>
+              <w:bottom w:type="dxa" w:w="40"/>
+              <w:right w:type="dxa" w:w="70"/>
+            </w:tcMar>
+          </w:tcPr>
+          <w:p>
+            <w:pPr>
+              <w:spacing w:after="0" w:line="236"/>
+            </w:pPr>
+            <w:r>
+              <w:rPr>
+                <w:rFonts w:ascii="Arial" w:cs="Arial" w:eastAsia="Arial" w:hAnsi="Arial"/>
+                <w:sz w:val="19"/>
+                <w:szCs w:val="19"/>
+              </w:rPr>
+              <w:t xml:space="preserve">Indicación breve bajo un campo que explica el dato esperado o su formato.</w:t>
+            </w:r>
+          </w:p>
+        </w:tc>
+      </w:tr>
+      <w:tr>
+        <w:trPr>
+          <w:tblHeader w:val="false"/>
+        </w:trPr>
+        <w:tc>
+          <w:tcPr>
+            <w:tcW w:type="dxa" w:w="2100"/>
+            <w:shd w:fill="F2F2F2" w:val="clear"/>
+            <w:tcMar>
+              <w:top w:type="dxa" w:w="40"/>
+              <w:left w:type="dxa" w:w="70"/>
+              <w:bottom w:type="dxa" w:w="40"/>
+              <w:right w:type="dxa" w:w="70"/>
+            </w:tcMar>
+          </w:tcPr>
+          <w:p>
+            <w:pPr>
+              <w:spacing w:after="0" w:line="236"/>
+            </w:pPr>
+            <w:r>
+              <w:rPr>
+                <w:rFonts w:ascii="Arial" w:cs="Arial" w:eastAsia="Arial" w:hAnsi="Arial"/>
+                <w:sz w:val="19"/>
+                <w:szCs w:val="19"/>
+              </w:rPr>
+              <w:t xml:space="preserve">Ventana modal</w:t>
+            </w:r>
+          </w:p>
+        </w:tc>
+        <w:tc>
+          <w:tcPr>
+            <w:tcW w:type="dxa" w:w="7260"/>
+            <w:shd w:fill="F2F2F2" w:val="clear"/>
+            <w:tcMar>
+              <w:top w:type="dxa" w:w="40"/>
+              <w:left w:type="dxa" w:w="70"/>
+              <w:bottom w:type="dxa" w:w="40"/>
+              <w:right w:type="dxa" w:w="70"/>
+            </w:tcMar>
+          </w:tcPr>
+          <w:p>
+            <w:pPr>
+              <w:spacing w:after="0" w:line="236"/>
+            </w:pPr>
+            <w:r>
+              <w:rPr>
+                <w:rFonts w:ascii="Arial" w:cs="Arial" w:eastAsia="Arial" w:hAnsi="Arial"/>
+                <w:sz w:val="19"/>
+                <w:szCs w:val="19"/>
+              </w:rPr>
+              <w:t xml:space="preserve">Ventana que se superpone al contenido y exige una respuesta antes de continuar.</w:t>
+            </w:r>
+          </w:p>
+        </w:tc>
+      </w:tr>
+      <w:tr>
+        <w:trPr>
+          <w:tblHeader w:val="false"/>
+        </w:trPr>
+        <w:tc>
+          <w:tcPr>
+            <w:tcW w:type="dxa" w:w="2100"/>
+            <w:shd w:fill="FFFFFF" w:val="clear"/>
+            <w:tcMar>
+              <w:top w:type="dxa" w:w="40"/>
+              <w:left w:type="dxa" w:w="70"/>
+              <w:bottom w:type="dxa" w:w="40"/>
+              <w:right w:type="dxa" w:w="70"/>
+            </w:tcMar>
+          </w:tcPr>
+          <w:p>
+            <w:pPr>
+              <w:spacing w:after="0" w:line="236"/>
+            </w:pPr>
+            <w:r>
+              <w:rPr>
+                <w:rFonts w:ascii="Arial" w:cs="Arial" w:eastAsia="Arial" w:hAnsi="Arial"/>
+                <w:sz w:val="19"/>
+                <w:szCs w:val="19"/>
+              </w:rPr>
+              <w:t xml:space="preserve">WCAG</w:t>
+            </w:r>
+          </w:p>
+        </w:tc>
+        <w:tc>
+          <w:tcPr>
+            <w:tcW w:type="dxa" w:w="7260"/>
+            <w:shd w:fill="FFFFFF" w:val="clear"/>
+            <w:tcMar>
+              <w:top w:type="dxa" w:w="40"/>
+              <w:left w:type="dxa" w:w="70"/>
+              <w:bottom w:type="dxa" w:w="40"/>
+              <w:right w:type="dxa" w:w="70"/>
+            </w:tcMar>
+          </w:tcPr>
+          <w:p>
+            <w:pPr>
+              <w:spacing w:after="0" w:line="236"/>
+            </w:pPr>
+            <w:r>
+              <w:rPr>
+                <w:rFonts w:ascii="Arial" w:cs="Arial" w:eastAsia="Arial" w:hAnsi="Arial"/>
+                <w:sz w:val="19"/>
+                <w:szCs w:val="19"/>
+              </w:rPr>
+              <w:t xml:space="preserve">Pautas internacionales de accesibilidad para contenido web, publicadas por el W3C.</w:t>
+            </w:r>
+          </w:p>
+        </w:tc>
+      </w:tr>
+    </w:tbl>
+    <w:p>
+      <w:pPr>
+        <w:pStyle w:val="Heading1"/>
+        <w:pageBreakBefore/>
+        <w:spacing w:after="110" w:before="220"/>
+      </w:pPr>
+      <w:bookmarkStart w:name="bm42" w:id="42"/>
+      <w:r>
+        <w:rPr>
+          <w:rFonts w:ascii="Arial" w:cs="Arial" w:eastAsia="Arial" w:hAnsi="Arial"/>
+          <w:b/>
+          <w:bCs/>
+          <w:color w:val="1F3864"/>
+          <w:sz w:val="27"/>
+          <w:szCs w:val="27"/>
+        </w:rPr>
+        <w:t xml:space="preserve">13. Referencias</w:t>
+      </w:r>
+      <w:bookmarkEnd w:id="42"/>
+    </w:p>
+    <w:p>
+      <w:pPr>
+        <w:spacing w:after="110" w:line="262"/>
+        <w:jc w:val="both"/>
+      </w:pPr>
+      <w:r>
+        <w:rPr>
+          <w:rFonts w:ascii="Arial" w:cs="Arial" w:eastAsia="Arial" w:hAnsi="Arial"/>
+          <w:sz w:val="22"/>
+          <w:szCs w:val="22"/>
+        </w:rPr>
+        <w:t xml:space="preserve">Documentos del proyecto:</w:t>
+      </w:r>
+    </w:p>
+    <w:p>
+      <w:pPr>
+        <w:pStyle w:val="ListParagraph"/>
+        <w:numPr>
+          <w:ilvl w:val="0"/>
+          <w:numId w:val="1"/>
+        </w:numPr>
+        <w:spacing w:after="60" w:line="258"/>
+      </w:pPr>
+      <w:r>
+        <w:rPr>
+          <w:rFonts w:ascii="Arial" w:cs="Arial" w:eastAsia="Arial" w:hAnsi="Arial"/>
+          <w:sz w:val="22"/>
+          <w:szCs w:val="22"/>
+        </w:rPr>
+        <w:t xml:space="preserve">Especificación de requisitos de software INVENTRA (IEEE 830), revisión 1.</w:t>
+      </w:r>
+    </w:p>
+    <w:p>
+      <w:pPr>
+        <w:pStyle w:val="ListParagraph"/>
+        <w:numPr>
+          <w:ilvl w:val="0"/>
+          <w:numId w:val="1"/>
+        </w:numPr>
+        <w:spacing w:after="60" w:line="258"/>
+      </w:pPr>
+      <w:r>
+        <w:rPr>
+          <w:rFonts w:ascii="Arial" w:cs="Arial" w:eastAsia="Arial" w:hAnsi="Arial"/>
+          <w:sz w:val="22"/>
+          <w:szCs w:val="22"/>
+        </w:rPr>
+        <w:t xml:space="preserve">Modelo entidad-relación, modelo relacional y diccionario de datos de INVENTRA, revisión 1.</w:t>
+      </w:r>
+    </w:p>
+    <w:p>
+      <w:pPr>
+        <w:pStyle w:val="ListParagraph"/>
+        <w:numPr>
+          <w:ilvl w:val="0"/>
+          <w:numId w:val="1"/>
+        </w:numPr>
+        <w:spacing w:after="60" w:line="258"/>
+      </w:pPr>
+      <w:r>
+        <w:rPr>
+          <w:rFonts w:ascii="Arial" w:cs="Arial" w:eastAsia="Arial" w:hAnsi="Arial"/>
+          <w:sz w:val="22"/>
+          <w:szCs w:val="22"/>
+        </w:rPr>
+        <w:t xml:space="preserve">Documento de análisis y diseño en UML de INVENTRA, revisión 1.</w:t>
+      </w:r>
+    </w:p>
+    <w:p>
+      <w:pPr>
+        <w:pStyle w:val="ListParagraph"/>
+        <w:numPr>
+          <w:ilvl w:val="0"/>
+          <w:numId w:val="1"/>
+        </w:numPr>
+        <w:spacing w:after="60" w:line="258"/>
+      </w:pPr>
+      <w:r>
+        <w:rPr>
+          <w:rFonts w:ascii="Arial" w:cs="Arial" w:eastAsia="Arial" w:hAnsi="Arial"/>
+          <w:sz w:val="22"/>
+          <w:szCs w:val="22"/>
+        </w:rPr>
+        <w:t xml:space="preserve">Prototipo de interfaz de INVENTRA (web y móvil, modo claro y modo oscuro).</w:t>
+      </w:r>
+    </w:p>
+    <w:p>
+      <w:pPr>
+        <w:spacing w:after="110" w:line="262"/>
+        <w:jc w:val="both"/>
+      </w:pPr>
+      <w:r>
+        <w:rPr>
+          <w:rFonts w:ascii="Arial" w:cs="Arial" w:eastAsia="Arial" w:hAnsi="Arial"/>
+          <w:sz w:val="22"/>
+          <w:szCs w:val="22"/>
+        </w:rPr>
+        <w:t xml:space="preserve">Fuentes externas:</w:t>
+      </w:r>
+    </w:p>
+    <w:p>
+      <w:pPr>
+        <w:pStyle w:val="ListParagraph"/>
+        <w:numPr>
+          <w:ilvl w:val="0"/>
+          <w:numId w:val="1"/>
+        </w:numPr>
+        <w:spacing w:after="60" w:line="258"/>
+      </w:pPr>
+      <w:r>
+        <w:rPr>
+          <w:rFonts w:ascii="Arial" w:cs="Arial" w:eastAsia="Arial" w:hAnsi="Arial"/>
+          <w:sz w:val="22"/>
+          <w:szCs w:val="22"/>
+        </w:rPr>
+        <w:t xml:space="preserve">World Wide Web Consortium. Web Content Accessibility Guidelines (WCAG) 2.1. W3C, 2018.</w:t>
+      </w:r>
+    </w:p>
+    <w:p>
+      <w:pPr>
+        <w:pStyle w:val="ListParagraph"/>
+        <w:numPr>
+          <w:ilvl w:val="0"/>
+          <w:numId w:val="1"/>
+        </w:numPr>
+        <w:spacing w:after="60" w:line="258"/>
+      </w:pPr>
+      <w:r>
+        <w:rPr>
+          <w:rFonts w:ascii="Arial" w:cs="Arial" w:eastAsia="Arial" w:hAnsi="Arial"/>
+          <w:sz w:val="22"/>
+          <w:szCs w:val="22"/>
+        </w:rPr>
+        <w:t xml:space="preserve">Nielsen, J. Diez heurísticas generales para el diseño de interfaces de usuario. Nielsen Norman Group, 1994.</w:t>
+      </w:r>
+    </w:p>
+    <w:p>
+      <w:pPr>
+        <w:pStyle w:val="ListParagraph"/>
+        <w:numPr>
+          <w:ilvl w:val="0"/>
+          <w:numId w:val="1"/>
+        </w:numPr>
+        <w:spacing w:after="60" w:line="258"/>
+      </w:pPr>
+      <w:r>
+        <w:rPr>
+          <w:rFonts w:ascii="Arial" w:cs="Arial" w:eastAsia="Arial" w:hAnsi="Arial"/>
+          <w:sz w:val="22"/>
+          <w:szCs w:val="22"/>
+        </w:rPr>
+        <w:t xml:space="preserve">Krug, S. No me hagas pensar: una aproximación a la usabilidad en la web. 3.ª edición. Pearson, 2015.</w:t>
+      </w:r>
+    </w:p>
+    <w:p>
+      <w:pPr>
+        <w:pStyle w:val="ListParagraph"/>
+        <w:numPr>
+          <w:ilvl w:val="0"/>
+          <w:numId w:val="1"/>
+        </w:numPr>
+        <w:spacing w:after="60" w:line="258"/>
+      </w:pPr>
+      <w:r>
+        <w:rPr>
+          <w:rFonts w:ascii="Arial" w:cs="Arial" w:eastAsia="Arial" w:hAnsi="Arial"/>
+          <w:sz w:val="22"/>
+          <w:szCs w:val="22"/>
+        </w:rPr>
+        <w:t xml:space="preserve">Familia tipográfica Inter, de distribución libre bajo licencia SIL Open Font License.</w:t>
+      </w:r>
+    </w:p>
     <w:sectPr>
       <w:footerReference w:type="default" r:id="rId7"/>
       <w:pgSz w:w="12240" w:h="15840" w:orient="portrait"/>

</xml_diff>

<commit_message>
Agrego al manual de marca la identidad visual y ajusto el color de las acciones para cumplir el contraste
</commit_message>
<xml_diff>
--- a/docs/diseno/INVENTRA_Documento_Tecnico_Diseno.docx
+++ b/docs/diseno/INVENTRA_Documento_Tecnico_Diseno.docx
@@ -297,6 +297,8 @@
             <w:r>
               <w:rPr>
                 <w:rFonts w:ascii="Arial" w:cs="Arial" w:eastAsia="Arial" w:hAnsi="Arial"/>
+                <w:b w:val="false"/>
+                <w:bCs w:val="false"/>
                 <w:sz w:val="19"/>
                 <w:szCs w:val="19"/>
               </w:rPr>
@@ -322,6 +324,8 @@
             <w:r>
               <w:rPr>
                 <w:rFonts w:ascii="Arial" w:cs="Arial" w:eastAsia="Arial" w:hAnsi="Arial"/>
+                <w:b w:val="false"/>
+                <w:bCs w:val="false"/>
                 <w:sz w:val="19"/>
                 <w:szCs w:val="19"/>
               </w:rPr>
@@ -347,6 +351,8 @@
             <w:r>
               <w:rPr>
                 <w:rFonts w:ascii="Arial" w:cs="Arial" w:eastAsia="Arial" w:hAnsi="Arial"/>
+                <w:b w:val="false"/>
+                <w:bCs w:val="false"/>
                 <w:sz w:val="19"/>
                 <w:szCs w:val="19"/>
               </w:rPr>
@@ -372,6 +378,8 @@
             <w:r>
               <w:rPr>
                 <w:rFonts w:ascii="Arial" w:cs="Arial" w:eastAsia="Arial" w:hAnsi="Arial"/>
+                <w:b w:val="false"/>
+                <w:bCs w:val="false"/>
                 <w:sz w:val="19"/>
                 <w:szCs w:val="19"/>
               </w:rPr>
@@ -1179,7 +1187,7 @@
             <w:sz w:val="20"/>
             <w:szCs w:val="20"/>
           </w:rPr>
-          <w:t xml:space="preserve">7.2 Registro de la licorería</w:t>
+          <w:t xml:space="preserve">7.2 Registro de la licorera</w:t>
         </w:r>
       </w:hyperlink>
       <w:r>
@@ -1967,7 +1975,7 @@
           <w:sz w:val="22"/>
           <w:szCs w:val="22"/>
         </w:rPr>
-        <w:t xml:space="preserve">Los usuarios de INVENTRA son propietarios y vendedores de licorerías, con distinto nivel de manejo de herramientas tecnológicas. El diseño prioriza la sencillez y la rapidez de uso, especialmente en el punto de venta. Se adoptan los siguientes principios:</w:t>
+        <w:t xml:space="preserve">Los usuarios de INVENTRA son propietarios y vendedores de licoreras, con distinto nivel de manejo de herramientas tecnológicas. El diseño prioriza la sencillez y la rapidez de uso, especialmente en el punto de venta. Se adoptan los siguientes principios:</w:t>
       </w:r>
     </w:p>
     <w:p>
@@ -2197,7 +2205,7 @@
           <w:sz w:val="22"/>
           <w:szCs w:val="22"/>
         </w:rPr>
-        <w:t xml:space="preserve">Se mantiene un contraste suficiente entre el texto y su fondo para que la lectura sea cómoda.</w:t>
+        <w:t xml:space="preserve">Toda combinación de texto y fondo alcanza como mínimo una relación de 4,5 a 1. Las superficies de acción que llevan texto blanco emplean las variantes oscuras de la paleta, verificadas una a una.</w:t>
       </w:r>
     </w:p>
     <w:p>
@@ -2371,7 +2379,7 @@
           <w:sz w:val="22"/>
           <w:szCs w:val="22"/>
         </w:rPr>
-        <w:t xml:space="preserve">La identidad visual de INVENTRA se basa en una paleta sobria y profesional, con un color de acción (CTA) que resalta las acciones principales. La paleta cuenta con una variante clara y una oscura, que comparten los mismos roles.</w:t>
+        <w:t xml:space="preserve">La identidad visual de INVENTRA se basa en una paleta sobria y profesional, con un verde que resalta las acciones principales. La paleta cuenta con una variante clara y una oscura, que comparten los mismos roles. El verde y el rojo tienen además una variante oscurecida, que se emplea cuando la superficie lleva texto blanco, para conservar el contraste exigido.</w:t>
       </w:r>
     </w:p>
     <w:p>
@@ -2401,7 +2409,7 @@
       <w:r>
         <w:drawing>
           <wp:inline distT="0" distB="0" distL="0" distR="0">
-            <wp:extent cx="5905500" cy="1609725"/>
+            <wp:extent cx="5905500" cy="2324100"/>
             <wp:effectExtent t="0" r="0" b="0" l="0"/>
             <wp:docPr id="1" name="" descr="" title=""/>
             <wp:cNvGraphicFramePr>
@@ -2426,7 +2434,7 @@
                   <pic:spPr bwMode="auto">
                     <a:xfrm>
                       <a:off x="0" y="0"/>
-                      <a:ext cx="5905500" cy="1609725"/>
+                      <a:ext cx="5905500" cy="2324100"/>
                     </a:xfrm>
                     <a:prstGeom prst="rect">
                       <a:avLst/>
@@ -2671,6 +2679,8 @@
             <w:r>
               <w:rPr>
                 <w:rFonts w:ascii="Arial" w:cs="Arial" w:eastAsia="Arial" w:hAnsi="Arial"/>
+                <w:b w:val="false"/>
+                <w:bCs w:val="false"/>
                 <w:sz w:val="19"/>
                 <w:szCs w:val="19"/>
               </w:rPr>
@@ -2696,6 +2706,8 @@
             <w:r>
               <w:rPr>
                 <w:rFonts w:ascii="Arial" w:cs="Arial" w:eastAsia="Arial" w:hAnsi="Arial"/>
+                <w:b w:val="false"/>
+                <w:bCs w:val="false"/>
                 <w:sz w:val="19"/>
                 <w:szCs w:val="19"/>
               </w:rPr>
@@ -2726,6 +2738,8 @@
             <w:r>
               <w:rPr>
                 <w:rFonts w:ascii="Arial" w:cs="Arial" w:eastAsia="Arial" w:hAnsi="Arial"/>
+                <w:b w:val="false"/>
+                <w:bCs w:val="false"/>
                 <w:sz w:val="19"/>
                 <w:szCs w:val="19"/>
               </w:rPr>
@@ -2751,6 +2765,8 @@
             <w:r>
               <w:rPr>
                 <w:rFonts w:ascii="Arial" w:cs="Arial" w:eastAsia="Arial" w:hAnsi="Arial"/>
+                <w:b w:val="false"/>
+                <w:bCs w:val="false"/>
                 <w:sz w:val="19"/>
                 <w:szCs w:val="19"/>
               </w:rPr>
@@ -2781,10 +2797,12 @@
             <w:r>
               <w:rPr>
                 <w:rFonts w:ascii="Arial" w:cs="Arial" w:eastAsia="Arial" w:hAnsi="Arial"/>
-                <w:sz w:val="19"/>
-                <w:szCs w:val="19"/>
-              </w:rPr>
-              <w:t xml:space="preserve">CTA (verde)</w:t>
+                <w:b w:val="false"/>
+                <w:bCs w:val="false"/>
+                <w:sz w:val="19"/>
+                <w:szCs w:val="19"/>
+              </w:rPr>
+              <w:t xml:space="preserve">Verde de marca</w:t>
             </w:r>
           </w:p>
         </w:tc>
@@ -2806,10 +2824,12 @@
             <w:r>
               <w:rPr>
                 <w:rFonts w:ascii="Arial" w:cs="Arial" w:eastAsia="Arial" w:hAnsi="Arial"/>
-                <w:sz w:val="19"/>
-                <w:szCs w:val="19"/>
-              </w:rPr>
-              <w:t xml:space="preserve">Únicamente la acción principal de cada pantalla (guardar, registrar venta, confirmar).</w:t>
+                <w:b w:val="false"/>
+                <w:bCs w:val="false"/>
+                <w:sz w:val="19"/>
+                <w:szCs w:val="19"/>
+              </w:rPr>
+              <w:t xml:space="preserve">Símbolo de la marca, acentos gráficos e indicadores; con texto oscuro encima.</w:t>
             </w:r>
           </w:p>
         </w:tc>
@@ -2836,10 +2856,12 @@
             <w:r>
               <w:rPr>
                 <w:rFonts w:ascii="Arial" w:cs="Arial" w:eastAsia="Arial" w:hAnsi="Arial"/>
-                <w:sz w:val="19"/>
-                <w:szCs w:val="19"/>
-              </w:rPr>
-              <w:t xml:space="preserve">Fondo y superficie</w:t>
+                <w:b w:val="false"/>
+                <w:bCs w:val="false"/>
+                <w:sz w:val="19"/>
+                <w:szCs w:val="19"/>
+              </w:rPr>
+              <w:t xml:space="preserve">Verde de acción</w:t>
             </w:r>
           </w:p>
         </w:tc>
@@ -2861,10 +2883,12 @@
             <w:r>
               <w:rPr>
                 <w:rFonts w:ascii="Arial" w:cs="Arial" w:eastAsia="Arial" w:hAnsi="Arial"/>
-                <w:sz w:val="19"/>
-                <w:szCs w:val="19"/>
-              </w:rPr>
-              <w:t xml:space="preserve">Fondo general y superficies de tarjetas y paneles.</w:t>
+                <w:b w:val="false"/>
+                <w:bCs w:val="false"/>
+                <w:sz w:val="19"/>
+                <w:szCs w:val="19"/>
+              </w:rPr>
+              <w:t xml:space="preserve">Superficies de la acción principal que llevan texto blanco (guardar, registrar venta, confirmar).</w:t>
             </w:r>
           </w:p>
         </w:tc>
@@ -2891,10 +2915,12 @@
             <w:r>
               <w:rPr>
                 <w:rFonts w:ascii="Arial" w:cs="Arial" w:eastAsia="Arial" w:hAnsi="Arial"/>
-                <w:sz w:val="19"/>
-                <w:szCs w:val="19"/>
-              </w:rPr>
-              <w:t xml:space="preserve">Borde</w:t>
+                <w:b w:val="false"/>
+                <w:bCs w:val="false"/>
+                <w:sz w:val="19"/>
+                <w:szCs w:val="19"/>
+              </w:rPr>
+              <w:t xml:space="preserve">Fondo y superficie</w:t>
             </w:r>
           </w:p>
         </w:tc>
@@ -2916,10 +2942,12 @@
             <w:r>
               <w:rPr>
                 <w:rFonts w:ascii="Arial" w:cs="Arial" w:eastAsia="Arial" w:hAnsi="Arial"/>
-                <w:sz w:val="19"/>
-                <w:szCs w:val="19"/>
-              </w:rPr>
-              <w:t xml:space="preserve">Separadores y contornos de campos y tarjetas.</w:t>
+                <w:b w:val="false"/>
+                <w:bCs w:val="false"/>
+                <w:sz w:val="19"/>
+                <w:szCs w:val="19"/>
+              </w:rPr>
+              <w:t xml:space="preserve">Fondo general y superficies de tarjetas y paneles.</w:t>
             </w:r>
           </w:p>
         </w:tc>
@@ -2946,10 +2974,12 @@
             <w:r>
               <w:rPr>
                 <w:rFonts w:ascii="Arial" w:cs="Arial" w:eastAsia="Arial" w:hAnsi="Arial"/>
-                <w:sz w:val="19"/>
-                <w:szCs w:val="19"/>
-              </w:rPr>
-              <w:t xml:space="preserve">Texto y texto secundario</w:t>
+                <w:b w:val="false"/>
+                <w:bCs w:val="false"/>
+                <w:sz w:val="19"/>
+                <w:szCs w:val="19"/>
+              </w:rPr>
+              <w:t xml:space="preserve">Borde</w:t>
             </w:r>
           </w:p>
         </w:tc>
@@ -2971,10 +3001,12 @@
             <w:r>
               <w:rPr>
                 <w:rFonts w:ascii="Arial" w:cs="Arial" w:eastAsia="Arial" w:hAnsi="Arial"/>
-                <w:sz w:val="19"/>
-                <w:szCs w:val="19"/>
-              </w:rPr>
-              <w:t xml:space="preserve">Texto principal y texto de apoyo o descripciones.</w:t>
+                <w:b w:val="false"/>
+                <w:bCs w:val="false"/>
+                <w:sz w:val="19"/>
+                <w:szCs w:val="19"/>
+              </w:rPr>
+              <w:t xml:space="preserve">Separadores y contornos de campos y tarjetas.</w:t>
             </w:r>
           </w:p>
         </w:tc>
@@ -3001,10 +3033,12 @@
             <w:r>
               <w:rPr>
                 <w:rFonts w:ascii="Arial" w:cs="Arial" w:eastAsia="Arial" w:hAnsi="Arial"/>
-                <w:sz w:val="19"/>
-                <w:szCs w:val="19"/>
-              </w:rPr>
-              <w:t xml:space="preserve">Advertencia</w:t>
+                <w:b w:val="false"/>
+                <w:bCs w:val="false"/>
+                <w:sz w:val="19"/>
+                <w:szCs w:val="19"/>
+              </w:rPr>
+              <w:t xml:space="preserve">Texto y texto secundario</w:t>
             </w:r>
           </w:p>
         </w:tc>
@@ -3026,10 +3060,12 @@
             <w:r>
               <w:rPr>
                 <w:rFonts w:ascii="Arial" w:cs="Arial" w:eastAsia="Arial" w:hAnsi="Arial"/>
-                <w:sz w:val="19"/>
-                <w:szCs w:val="19"/>
-              </w:rPr>
-              <w:t xml:space="preserve">Alertas de stock bajo y avisos preventivos.</w:t>
+                <w:b w:val="false"/>
+                <w:bCs w:val="false"/>
+                <w:sz w:val="19"/>
+                <w:szCs w:val="19"/>
+              </w:rPr>
+              <w:t xml:space="preserve">Texto principal y texto de apoyo o descripciones.</w:t>
             </w:r>
           </w:p>
         </w:tc>
@@ -3056,10 +3092,12 @@
             <w:r>
               <w:rPr>
                 <w:rFonts w:ascii="Arial" w:cs="Arial" w:eastAsia="Arial" w:hAnsi="Arial"/>
-                <w:sz w:val="19"/>
-                <w:szCs w:val="19"/>
-              </w:rPr>
-              <w:t xml:space="preserve">Peligro</w:t>
+                <w:b w:val="false"/>
+                <w:bCs w:val="false"/>
+                <w:sz w:val="19"/>
+                <w:szCs w:val="19"/>
+              </w:rPr>
+              <w:t xml:space="preserve">Advertencia</w:t>
             </w:r>
           </w:p>
         </w:tc>
@@ -3081,10 +3119,130 @@
             <w:r>
               <w:rPr>
                 <w:rFonts w:ascii="Arial" w:cs="Arial" w:eastAsia="Arial" w:hAnsi="Arial"/>
-                <w:sz w:val="19"/>
-                <w:szCs w:val="19"/>
-              </w:rPr>
-              <w:t xml:space="preserve">Acciones destructivas o de riesgo (anular, eliminar).</w:t>
+                <w:b w:val="false"/>
+                <w:bCs w:val="false"/>
+                <w:sz w:val="19"/>
+                <w:szCs w:val="19"/>
+              </w:rPr>
+              <w:t xml:space="preserve">Alertas de stock bajo y avisos preventivos; siempre con texto oscuro.</w:t>
+            </w:r>
+          </w:p>
+        </w:tc>
+      </w:tr>
+      <w:tr>
+        <w:trPr>
+          <w:tblHeader w:val="false"/>
+        </w:trPr>
+        <w:tc>
+          <w:tcPr>
+            <w:tcW w:type="dxa" w:w="2600"/>
+            <w:shd w:fill="FFFFFF" w:val="clear"/>
+            <w:tcMar>
+              <w:top w:type="dxa" w:w="40"/>
+              <w:left w:type="dxa" w:w="70"/>
+              <w:bottom w:type="dxa" w:w="40"/>
+              <w:right w:type="dxa" w:w="70"/>
+            </w:tcMar>
+          </w:tcPr>
+          <w:p>
+            <w:pPr>
+              <w:spacing w:after="0" w:line="236"/>
+            </w:pPr>
+            <w:r>
+              <w:rPr>
+                <w:rFonts w:ascii="Arial" w:cs="Arial" w:eastAsia="Arial" w:hAnsi="Arial"/>
+                <w:b w:val="false"/>
+                <w:bCs w:val="false"/>
+                <w:sz w:val="19"/>
+                <w:szCs w:val="19"/>
+              </w:rPr>
+              <w:t xml:space="preserve">Peligro</w:t>
+            </w:r>
+          </w:p>
+        </w:tc>
+        <w:tc>
+          <w:tcPr>
+            <w:tcW w:type="dxa" w:w="6760"/>
+            <w:shd w:fill="FFFFFF" w:val="clear"/>
+            <w:tcMar>
+              <w:top w:type="dxa" w:w="40"/>
+              <w:left w:type="dxa" w:w="70"/>
+              <w:bottom w:type="dxa" w:w="40"/>
+              <w:right w:type="dxa" w:w="70"/>
+            </w:tcMar>
+          </w:tcPr>
+          <w:p>
+            <w:pPr>
+              <w:spacing w:after="0" w:line="236"/>
+            </w:pPr>
+            <w:r>
+              <w:rPr>
+                <w:rFonts w:ascii="Arial" w:cs="Arial" w:eastAsia="Arial" w:hAnsi="Arial"/>
+                <w:b w:val="false"/>
+                <w:bCs w:val="false"/>
+                <w:sz w:val="19"/>
+                <w:szCs w:val="19"/>
+              </w:rPr>
+              <w:t xml:space="preserve">Bordes, iconos y mensajes de error.</w:t>
+            </w:r>
+          </w:p>
+        </w:tc>
+      </w:tr>
+      <w:tr>
+        <w:trPr>
+          <w:tblHeader w:val="false"/>
+        </w:trPr>
+        <w:tc>
+          <w:tcPr>
+            <w:tcW w:type="dxa" w:w="2600"/>
+            <w:shd w:fill="F2F2F2" w:val="clear"/>
+            <w:tcMar>
+              <w:top w:type="dxa" w:w="40"/>
+              <w:left w:type="dxa" w:w="70"/>
+              <w:bottom w:type="dxa" w:w="40"/>
+              <w:right w:type="dxa" w:w="70"/>
+            </w:tcMar>
+          </w:tcPr>
+          <w:p>
+            <w:pPr>
+              <w:spacing w:after="0" w:line="236"/>
+            </w:pPr>
+            <w:r>
+              <w:rPr>
+                <w:rFonts w:ascii="Arial" w:cs="Arial" w:eastAsia="Arial" w:hAnsi="Arial"/>
+                <w:b w:val="false"/>
+                <w:bCs w:val="false"/>
+                <w:sz w:val="19"/>
+                <w:szCs w:val="19"/>
+              </w:rPr>
+              <w:t xml:space="preserve">Peligro de acción</w:t>
+            </w:r>
+          </w:p>
+        </w:tc>
+        <w:tc>
+          <w:tcPr>
+            <w:tcW w:type="dxa" w:w="6760"/>
+            <w:shd w:fill="F2F2F2" w:val="clear"/>
+            <w:tcMar>
+              <w:top w:type="dxa" w:w="40"/>
+              <w:left w:type="dxa" w:w="70"/>
+              <w:bottom w:type="dxa" w:w="40"/>
+              <w:right w:type="dxa" w:w="70"/>
+            </w:tcMar>
+          </w:tcPr>
+          <w:p>
+            <w:pPr>
+              <w:spacing w:after="0" w:line="236"/>
+            </w:pPr>
+            <w:r>
+              <w:rPr>
+                <w:rFonts w:ascii="Arial" w:cs="Arial" w:eastAsia="Arial" w:hAnsi="Arial"/>
+                <w:b w:val="false"/>
+                <w:bCs w:val="false"/>
+                <w:sz w:val="19"/>
+                <w:szCs w:val="19"/>
+              </w:rPr>
+              <w:t xml:space="preserve">Superficies de acciones destructivas con texto blanco (anular, eliminar).</w:t>
             </w:r>
           </w:p>
         </w:tc>
@@ -3281,6 +3439,8 @@
             <w:r>
               <w:rPr>
                 <w:rFonts w:ascii="Arial" w:cs="Arial" w:eastAsia="Arial" w:hAnsi="Arial"/>
+                <w:b w:val="false"/>
+                <w:bCs w:val="false"/>
                 <w:sz w:val="19"/>
                 <w:szCs w:val="19"/>
               </w:rPr>
@@ -3306,6 +3466,8 @@
             <w:r>
               <w:rPr>
                 <w:rFonts w:ascii="Arial" w:cs="Arial" w:eastAsia="Arial" w:hAnsi="Arial"/>
+                <w:b w:val="false"/>
+                <w:bCs w:val="false"/>
                 <w:sz w:val="19"/>
                 <w:szCs w:val="19"/>
               </w:rPr>
@@ -3331,6 +3493,8 @@
             <w:r>
               <w:rPr>
                 <w:rFonts w:ascii="Arial" w:cs="Arial" w:eastAsia="Arial" w:hAnsi="Arial"/>
+                <w:b w:val="false"/>
+                <w:bCs w:val="false"/>
                 <w:sz w:val="19"/>
                 <w:szCs w:val="19"/>
               </w:rPr>
@@ -3356,6 +3520,8 @@
             <w:r>
               <w:rPr>
                 <w:rFonts w:ascii="Arial" w:cs="Arial" w:eastAsia="Arial" w:hAnsi="Arial"/>
+                <w:b w:val="false"/>
+                <w:bCs w:val="false"/>
                 <w:sz w:val="19"/>
                 <w:szCs w:val="19"/>
               </w:rPr>
@@ -3386,6 +3552,8 @@
             <w:r>
               <w:rPr>
                 <w:rFonts w:ascii="Arial" w:cs="Arial" w:eastAsia="Arial" w:hAnsi="Arial"/>
+                <w:b w:val="false"/>
+                <w:bCs w:val="false"/>
                 <w:sz w:val="19"/>
                 <w:szCs w:val="19"/>
               </w:rPr>
@@ -3411,6 +3579,8 @@
             <w:r>
               <w:rPr>
                 <w:rFonts w:ascii="Arial" w:cs="Arial" w:eastAsia="Arial" w:hAnsi="Arial"/>
+                <w:b w:val="false"/>
+                <w:bCs w:val="false"/>
                 <w:sz w:val="19"/>
                 <w:szCs w:val="19"/>
               </w:rPr>
@@ -3436,6 +3606,8 @@
             <w:r>
               <w:rPr>
                 <w:rFonts w:ascii="Arial" w:cs="Arial" w:eastAsia="Arial" w:hAnsi="Arial"/>
+                <w:b w:val="false"/>
+                <w:bCs w:val="false"/>
                 <w:sz w:val="19"/>
                 <w:szCs w:val="19"/>
               </w:rPr>
@@ -3461,6 +3633,8 @@
             <w:r>
               <w:rPr>
                 <w:rFonts w:ascii="Arial" w:cs="Arial" w:eastAsia="Arial" w:hAnsi="Arial"/>
+                <w:b w:val="false"/>
+                <w:bCs w:val="false"/>
                 <w:sz w:val="19"/>
                 <w:szCs w:val="19"/>
               </w:rPr>
@@ -3491,6 +3665,8 @@
             <w:r>
               <w:rPr>
                 <w:rFonts w:ascii="Arial" w:cs="Arial" w:eastAsia="Arial" w:hAnsi="Arial"/>
+                <w:b w:val="false"/>
+                <w:bCs w:val="false"/>
                 <w:sz w:val="19"/>
                 <w:szCs w:val="19"/>
               </w:rPr>
@@ -3516,6 +3692,8 @@
             <w:r>
               <w:rPr>
                 <w:rFonts w:ascii="Arial" w:cs="Arial" w:eastAsia="Arial" w:hAnsi="Arial"/>
+                <w:b w:val="false"/>
+                <w:bCs w:val="false"/>
                 <w:sz w:val="19"/>
                 <w:szCs w:val="19"/>
               </w:rPr>
@@ -3541,6 +3719,8 @@
             <w:r>
               <w:rPr>
                 <w:rFonts w:ascii="Arial" w:cs="Arial" w:eastAsia="Arial" w:hAnsi="Arial"/>
+                <w:b w:val="false"/>
+                <w:bCs w:val="false"/>
                 <w:sz w:val="19"/>
                 <w:szCs w:val="19"/>
               </w:rPr>
@@ -3566,6 +3746,8 @@
             <w:r>
               <w:rPr>
                 <w:rFonts w:ascii="Arial" w:cs="Arial" w:eastAsia="Arial" w:hAnsi="Arial"/>
+                <w:b w:val="false"/>
+                <w:bCs w:val="false"/>
                 <w:sz w:val="19"/>
                 <w:szCs w:val="19"/>
               </w:rPr>
@@ -3596,6 +3778,8 @@
             <w:r>
               <w:rPr>
                 <w:rFonts w:ascii="Arial" w:cs="Arial" w:eastAsia="Arial" w:hAnsi="Arial"/>
+                <w:b w:val="false"/>
+                <w:bCs w:val="false"/>
                 <w:sz w:val="19"/>
                 <w:szCs w:val="19"/>
               </w:rPr>
@@ -3621,6 +3805,8 @@
             <w:r>
               <w:rPr>
                 <w:rFonts w:ascii="Arial" w:cs="Arial" w:eastAsia="Arial" w:hAnsi="Arial"/>
+                <w:b w:val="false"/>
+                <w:bCs w:val="false"/>
                 <w:sz w:val="19"/>
                 <w:szCs w:val="19"/>
               </w:rPr>
@@ -3646,6 +3832,8 @@
             <w:r>
               <w:rPr>
                 <w:rFonts w:ascii="Arial" w:cs="Arial" w:eastAsia="Arial" w:hAnsi="Arial"/>
+                <w:b w:val="false"/>
+                <w:bCs w:val="false"/>
                 <w:sz w:val="19"/>
                 <w:szCs w:val="19"/>
               </w:rPr>
@@ -3671,6 +3859,8 @@
             <w:r>
               <w:rPr>
                 <w:rFonts w:ascii="Arial" w:cs="Arial" w:eastAsia="Arial" w:hAnsi="Arial"/>
+                <w:b w:val="false"/>
+                <w:bCs w:val="false"/>
                 <w:sz w:val="19"/>
                 <w:szCs w:val="19"/>
               </w:rPr>
@@ -3701,6 +3891,8 @@
             <w:r>
               <w:rPr>
                 <w:rFonts w:ascii="Arial" w:cs="Arial" w:eastAsia="Arial" w:hAnsi="Arial"/>
+                <w:b w:val="false"/>
+                <w:bCs w:val="false"/>
                 <w:sz w:val="19"/>
                 <w:szCs w:val="19"/>
               </w:rPr>
@@ -3726,6 +3918,8 @@
             <w:r>
               <w:rPr>
                 <w:rFonts w:ascii="Arial" w:cs="Arial" w:eastAsia="Arial" w:hAnsi="Arial"/>
+                <w:b w:val="false"/>
+                <w:bCs w:val="false"/>
                 <w:sz w:val="19"/>
                 <w:szCs w:val="19"/>
               </w:rPr>
@@ -3751,6 +3945,8 @@
             <w:r>
               <w:rPr>
                 <w:rFonts w:ascii="Arial" w:cs="Arial" w:eastAsia="Arial" w:hAnsi="Arial"/>
+                <w:b w:val="false"/>
+                <w:bCs w:val="false"/>
                 <w:sz w:val="19"/>
                 <w:szCs w:val="19"/>
               </w:rPr>
@@ -3776,6 +3972,8 @@
             <w:r>
               <w:rPr>
                 <w:rFonts w:ascii="Arial" w:cs="Arial" w:eastAsia="Arial" w:hAnsi="Arial"/>
+                <w:b w:val="false"/>
+                <w:bCs w:val="false"/>
                 <w:sz w:val="19"/>
                 <w:szCs w:val="19"/>
               </w:rPr>
@@ -3806,6 +4004,8 @@
             <w:r>
               <w:rPr>
                 <w:rFonts w:ascii="Arial" w:cs="Arial" w:eastAsia="Arial" w:hAnsi="Arial"/>
+                <w:b w:val="false"/>
+                <w:bCs w:val="false"/>
                 <w:sz w:val="19"/>
                 <w:szCs w:val="19"/>
               </w:rPr>
@@ -3831,6 +4031,8 @@
             <w:r>
               <w:rPr>
                 <w:rFonts w:ascii="Arial" w:cs="Arial" w:eastAsia="Arial" w:hAnsi="Arial"/>
+                <w:b w:val="false"/>
+                <w:bCs w:val="false"/>
                 <w:sz w:val="19"/>
                 <w:szCs w:val="19"/>
               </w:rPr>
@@ -3856,6 +4058,8 @@
             <w:r>
               <w:rPr>
                 <w:rFonts w:ascii="Arial" w:cs="Arial" w:eastAsia="Arial" w:hAnsi="Arial"/>
+                <w:b w:val="false"/>
+                <w:bCs w:val="false"/>
                 <w:sz w:val="19"/>
                 <w:szCs w:val="19"/>
               </w:rPr>
@@ -3881,6 +4085,8 @@
             <w:r>
               <w:rPr>
                 <w:rFonts w:ascii="Arial" w:cs="Arial" w:eastAsia="Arial" w:hAnsi="Arial"/>
+                <w:b w:val="false"/>
+                <w:bCs w:val="false"/>
                 <w:sz w:val="19"/>
                 <w:szCs w:val="19"/>
               </w:rPr>
@@ -4090,6 +4296,8 @@
             <w:r>
               <w:rPr>
                 <w:rFonts w:ascii="Arial" w:cs="Arial" w:eastAsia="Arial" w:hAnsi="Arial"/>
+                <w:b w:val="false"/>
+                <w:bCs w:val="false"/>
                 <w:sz w:val="19"/>
                 <w:szCs w:val="19"/>
               </w:rPr>
@@ -4115,6 +4323,8 @@
             <w:r>
               <w:rPr>
                 <w:rFonts w:ascii="Arial" w:cs="Arial" w:eastAsia="Arial" w:hAnsi="Arial"/>
+                <w:b w:val="false"/>
+                <w:bCs w:val="false"/>
                 <w:sz w:val="19"/>
                 <w:szCs w:val="19"/>
               </w:rPr>
@@ -4145,6 +4355,8 @@
             <w:r>
               <w:rPr>
                 <w:rFonts w:ascii="Arial" w:cs="Arial" w:eastAsia="Arial" w:hAnsi="Arial"/>
+                <w:b w:val="false"/>
+                <w:bCs w:val="false"/>
                 <w:sz w:val="19"/>
                 <w:szCs w:val="19"/>
               </w:rPr>
@@ -4170,6 +4382,8 @@
             <w:r>
               <w:rPr>
                 <w:rFonts w:ascii="Arial" w:cs="Arial" w:eastAsia="Arial" w:hAnsi="Arial"/>
+                <w:b w:val="false"/>
+                <w:bCs w:val="false"/>
                 <w:sz w:val="19"/>
                 <w:szCs w:val="19"/>
               </w:rPr>
@@ -4200,6 +4414,8 @@
             <w:r>
               <w:rPr>
                 <w:rFonts w:ascii="Arial" w:cs="Arial" w:eastAsia="Arial" w:hAnsi="Arial"/>
+                <w:b w:val="false"/>
+                <w:bCs w:val="false"/>
                 <w:sz w:val="19"/>
                 <w:szCs w:val="19"/>
               </w:rPr>
@@ -4225,6 +4441,8 @@
             <w:r>
               <w:rPr>
                 <w:rFonts w:ascii="Arial" w:cs="Arial" w:eastAsia="Arial" w:hAnsi="Arial"/>
+                <w:b w:val="false"/>
+                <w:bCs w:val="false"/>
                 <w:sz w:val="19"/>
                 <w:szCs w:val="19"/>
               </w:rPr>
@@ -4255,6 +4473,8 @@
             <w:r>
               <w:rPr>
                 <w:rFonts w:ascii="Arial" w:cs="Arial" w:eastAsia="Arial" w:hAnsi="Arial"/>
+                <w:b w:val="false"/>
+                <w:bCs w:val="false"/>
                 <w:sz w:val="19"/>
                 <w:szCs w:val="19"/>
               </w:rPr>
@@ -4280,6 +4500,8 @@
             <w:r>
               <w:rPr>
                 <w:rFonts w:ascii="Arial" w:cs="Arial" w:eastAsia="Arial" w:hAnsi="Arial"/>
+                <w:b w:val="false"/>
+                <w:bCs w:val="false"/>
                 <w:sz w:val="19"/>
                 <w:szCs w:val="19"/>
               </w:rPr>
@@ -4484,6 +4706,8 @@
             <w:r>
               <w:rPr>
                 <w:rFonts w:ascii="Arial" w:cs="Arial" w:eastAsia="Arial" w:hAnsi="Arial"/>
+                <w:b w:val="false"/>
+                <w:bCs w:val="false"/>
                 <w:sz w:val="19"/>
                 <w:szCs w:val="19"/>
               </w:rPr>
@@ -4509,6 +4733,8 @@
             <w:r>
               <w:rPr>
                 <w:rFonts w:ascii="Arial" w:cs="Arial" w:eastAsia="Arial" w:hAnsi="Arial"/>
+                <w:b w:val="false"/>
+                <w:bCs w:val="false"/>
                 <w:sz w:val="19"/>
                 <w:szCs w:val="19"/>
               </w:rPr>
@@ -4534,6 +4760,8 @@
             <w:r>
               <w:rPr>
                 <w:rFonts w:ascii="Arial" w:cs="Arial" w:eastAsia="Arial" w:hAnsi="Arial"/>
+                <w:b w:val="false"/>
+                <w:bCs w:val="false"/>
                 <w:sz w:val="19"/>
                 <w:szCs w:val="19"/>
               </w:rPr>
@@ -4564,6 +4792,8 @@
             <w:r>
               <w:rPr>
                 <w:rFonts w:ascii="Arial" w:cs="Arial" w:eastAsia="Arial" w:hAnsi="Arial"/>
+                <w:b w:val="false"/>
+                <w:bCs w:val="false"/>
                 <w:sz w:val="19"/>
                 <w:szCs w:val="19"/>
               </w:rPr>
@@ -4589,6 +4819,8 @@
             <w:r>
               <w:rPr>
                 <w:rFonts w:ascii="Arial" w:cs="Arial" w:eastAsia="Arial" w:hAnsi="Arial"/>
+                <w:b w:val="false"/>
+                <w:bCs w:val="false"/>
                 <w:sz w:val="19"/>
                 <w:szCs w:val="19"/>
               </w:rPr>
@@ -4614,6 +4846,8 @@
             <w:r>
               <w:rPr>
                 <w:rFonts w:ascii="Arial" w:cs="Arial" w:eastAsia="Arial" w:hAnsi="Arial"/>
+                <w:b w:val="false"/>
+                <w:bCs w:val="false"/>
                 <w:sz w:val="19"/>
                 <w:szCs w:val="19"/>
               </w:rPr>
@@ -4644,6 +4878,8 @@
             <w:r>
               <w:rPr>
                 <w:rFonts w:ascii="Arial" w:cs="Arial" w:eastAsia="Arial" w:hAnsi="Arial"/>
+                <w:b w:val="false"/>
+                <w:bCs w:val="false"/>
                 <w:sz w:val="19"/>
                 <w:szCs w:val="19"/>
               </w:rPr>
@@ -4669,6 +4905,8 @@
             <w:r>
               <w:rPr>
                 <w:rFonts w:ascii="Arial" w:cs="Arial" w:eastAsia="Arial" w:hAnsi="Arial"/>
+                <w:b w:val="false"/>
+                <w:bCs w:val="false"/>
                 <w:sz w:val="19"/>
                 <w:szCs w:val="19"/>
               </w:rPr>
@@ -4694,6 +4932,8 @@
             <w:r>
               <w:rPr>
                 <w:rFonts w:ascii="Arial" w:cs="Arial" w:eastAsia="Arial" w:hAnsi="Arial"/>
+                <w:b w:val="false"/>
+                <w:bCs w:val="false"/>
                 <w:sz w:val="19"/>
                 <w:szCs w:val="19"/>
               </w:rPr>
@@ -4899,6 +5139,8 @@
             <w:r>
               <w:rPr>
                 <w:rFonts w:ascii="Arial" w:cs="Arial" w:eastAsia="Arial" w:hAnsi="Arial"/>
+                <w:b w:val="false"/>
+                <w:bCs w:val="false"/>
                 <w:sz w:val="19"/>
                 <w:szCs w:val="19"/>
               </w:rPr>
@@ -4924,6 +5166,8 @@
             <w:r>
               <w:rPr>
                 <w:rFonts w:ascii="Arial" w:cs="Arial" w:eastAsia="Arial" w:hAnsi="Arial"/>
+                <w:b w:val="false"/>
+                <w:bCs w:val="false"/>
                 <w:sz w:val="19"/>
                 <w:szCs w:val="19"/>
               </w:rPr>
@@ -4949,6 +5193,8 @@
             <w:r>
               <w:rPr>
                 <w:rFonts w:ascii="Arial" w:cs="Arial" w:eastAsia="Arial" w:hAnsi="Arial"/>
+                <w:b w:val="false"/>
+                <w:bCs w:val="false"/>
                 <w:sz w:val="19"/>
                 <w:szCs w:val="19"/>
               </w:rPr>
@@ -4979,6 +5225,8 @@
             <w:r>
               <w:rPr>
                 <w:rFonts w:ascii="Arial" w:cs="Arial" w:eastAsia="Arial" w:hAnsi="Arial"/>
+                <w:b w:val="false"/>
+                <w:bCs w:val="false"/>
                 <w:sz w:val="19"/>
                 <w:szCs w:val="19"/>
               </w:rPr>
@@ -5004,6 +5252,8 @@
             <w:r>
               <w:rPr>
                 <w:rFonts w:ascii="Arial" w:cs="Arial" w:eastAsia="Arial" w:hAnsi="Arial"/>
+                <w:b w:val="false"/>
+                <w:bCs w:val="false"/>
                 <w:sz w:val="19"/>
                 <w:szCs w:val="19"/>
               </w:rPr>
@@ -5029,6 +5279,8 @@
             <w:r>
               <w:rPr>
                 <w:rFonts w:ascii="Arial" w:cs="Arial" w:eastAsia="Arial" w:hAnsi="Arial"/>
+                <w:b w:val="false"/>
+                <w:bCs w:val="false"/>
                 <w:sz w:val="19"/>
                 <w:szCs w:val="19"/>
               </w:rPr>
@@ -5059,6 +5311,8 @@
             <w:r>
               <w:rPr>
                 <w:rFonts w:ascii="Arial" w:cs="Arial" w:eastAsia="Arial" w:hAnsi="Arial"/>
+                <w:b w:val="false"/>
+                <w:bCs w:val="false"/>
                 <w:sz w:val="19"/>
                 <w:szCs w:val="19"/>
               </w:rPr>
@@ -5084,6 +5338,8 @@
             <w:r>
               <w:rPr>
                 <w:rFonts w:ascii="Arial" w:cs="Arial" w:eastAsia="Arial" w:hAnsi="Arial"/>
+                <w:b w:val="false"/>
+                <w:bCs w:val="false"/>
                 <w:sz w:val="19"/>
                 <w:szCs w:val="19"/>
               </w:rPr>
@@ -5109,6 +5365,8 @@
             <w:r>
               <w:rPr>
                 <w:rFonts w:ascii="Arial" w:cs="Arial" w:eastAsia="Arial" w:hAnsi="Arial"/>
+                <w:b w:val="false"/>
+                <w:bCs w:val="false"/>
                 <w:sz w:val="19"/>
                 <w:szCs w:val="19"/>
               </w:rPr>
@@ -5139,6 +5397,8 @@
             <w:r>
               <w:rPr>
                 <w:rFonts w:ascii="Arial" w:cs="Arial" w:eastAsia="Arial" w:hAnsi="Arial"/>
+                <w:b w:val="false"/>
+                <w:bCs w:val="false"/>
                 <w:sz w:val="19"/>
                 <w:szCs w:val="19"/>
               </w:rPr>
@@ -5164,6 +5424,8 @@
             <w:r>
               <w:rPr>
                 <w:rFonts w:ascii="Arial" w:cs="Arial" w:eastAsia="Arial" w:hAnsi="Arial"/>
+                <w:b w:val="false"/>
+                <w:bCs w:val="false"/>
                 <w:sz w:val="19"/>
                 <w:szCs w:val="19"/>
               </w:rPr>
@@ -5189,6 +5451,8 @@
             <w:r>
               <w:rPr>
                 <w:rFonts w:ascii="Arial" w:cs="Arial" w:eastAsia="Arial" w:hAnsi="Arial"/>
+                <w:b w:val="false"/>
+                <w:bCs w:val="false"/>
                 <w:sz w:val="19"/>
                 <w:szCs w:val="19"/>
               </w:rPr>
@@ -5219,6 +5483,8 @@
             <w:r>
               <w:rPr>
                 <w:rFonts w:ascii="Arial" w:cs="Arial" w:eastAsia="Arial" w:hAnsi="Arial"/>
+                <w:b w:val="false"/>
+                <w:bCs w:val="false"/>
                 <w:sz w:val="19"/>
                 <w:szCs w:val="19"/>
               </w:rPr>
@@ -5244,6 +5510,8 @@
             <w:r>
               <w:rPr>
                 <w:rFonts w:ascii="Arial" w:cs="Arial" w:eastAsia="Arial" w:hAnsi="Arial"/>
+                <w:b w:val="false"/>
+                <w:bCs w:val="false"/>
                 <w:sz w:val="19"/>
                 <w:szCs w:val="19"/>
               </w:rPr>
@@ -5269,6 +5537,8 @@
             <w:r>
               <w:rPr>
                 <w:rFonts w:ascii="Arial" w:cs="Arial" w:eastAsia="Arial" w:hAnsi="Arial"/>
+                <w:b w:val="false"/>
+                <w:bCs w:val="false"/>
                 <w:sz w:val="19"/>
                 <w:szCs w:val="19"/>
               </w:rPr>
@@ -5299,6 +5569,8 @@
             <w:r>
               <w:rPr>
                 <w:rFonts w:ascii="Arial" w:cs="Arial" w:eastAsia="Arial" w:hAnsi="Arial"/>
+                <w:b w:val="false"/>
+                <w:bCs w:val="false"/>
                 <w:sz w:val="19"/>
                 <w:szCs w:val="19"/>
               </w:rPr>
@@ -5324,6 +5596,8 @@
             <w:r>
               <w:rPr>
                 <w:rFonts w:ascii="Arial" w:cs="Arial" w:eastAsia="Arial" w:hAnsi="Arial"/>
+                <w:b w:val="false"/>
+                <w:bCs w:val="false"/>
                 <w:sz w:val="19"/>
                 <w:szCs w:val="19"/>
               </w:rPr>
@@ -5349,6 +5623,8 @@
             <w:r>
               <w:rPr>
                 <w:rFonts w:ascii="Arial" w:cs="Arial" w:eastAsia="Arial" w:hAnsi="Arial"/>
+                <w:b w:val="false"/>
+                <w:bCs w:val="false"/>
                 <w:sz w:val="19"/>
                 <w:szCs w:val="19"/>
               </w:rPr>
@@ -5379,6 +5655,8 @@
             <w:r>
               <w:rPr>
                 <w:rFonts w:ascii="Arial" w:cs="Arial" w:eastAsia="Arial" w:hAnsi="Arial"/>
+                <w:b w:val="false"/>
+                <w:bCs w:val="false"/>
                 <w:sz w:val="19"/>
                 <w:szCs w:val="19"/>
               </w:rPr>
@@ -5404,6 +5682,8 @@
             <w:r>
               <w:rPr>
                 <w:rFonts w:ascii="Arial" w:cs="Arial" w:eastAsia="Arial" w:hAnsi="Arial"/>
+                <w:b w:val="false"/>
+                <w:bCs w:val="false"/>
                 <w:sz w:val="19"/>
                 <w:szCs w:val="19"/>
               </w:rPr>
@@ -5429,6 +5709,8 @@
             <w:r>
               <w:rPr>
                 <w:rFonts w:ascii="Arial" w:cs="Arial" w:eastAsia="Arial" w:hAnsi="Arial"/>
+                <w:b w:val="false"/>
+                <w:bCs w:val="false"/>
                 <w:sz w:val="19"/>
                 <w:szCs w:val="19"/>
               </w:rPr>
@@ -5600,6 +5882,8 @@
             <w:r>
               <w:rPr>
                 <w:rFonts w:ascii="Arial" w:cs="Arial" w:eastAsia="Arial" w:hAnsi="Arial"/>
+                <w:b w:val="false"/>
+                <w:bCs w:val="false"/>
                 <w:sz w:val="19"/>
                 <w:szCs w:val="19"/>
               </w:rPr>
@@ -5625,6 +5909,8 @@
             <w:r>
               <w:rPr>
                 <w:rFonts w:ascii="Arial" w:cs="Arial" w:eastAsia="Arial" w:hAnsi="Arial"/>
+                <w:b w:val="false"/>
+                <w:bCs w:val="false"/>
                 <w:sz w:val="19"/>
                 <w:szCs w:val="19"/>
               </w:rPr>
@@ -5650,10 +5936,12 @@
             <w:r>
               <w:rPr>
                 <w:rFonts w:ascii="Arial" w:cs="Arial" w:eastAsia="Arial" w:hAnsi="Arial"/>
-                <w:sz w:val="19"/>
-                <w:szCs w:val="19"/>
-              </w:rPr>
-              <w:t xml:space="preserve">CTA verde con texto blanco.</w:t>
+                <w:b w:val="false"/>
+                <w:bCs w:val="false"/>
+                <w:sz w:val="19"/>
+                <w:szCs w:val="19"/>
+              </w:rPr>
+              <w:t xml:space="preserve">Verde de acción con texto blanco.</w:t>
             </w:r>
           </w:p>
         </w:tc>
@@ -5680,6 +5968,8 @@
             <w:r>
               <w:rPr>
                 <w:rFonts w:ascii="Arial" w:cs="Arial" w:eastAsia="Arial" w:hAnsi="Arial"/>
+                <w:b w:val="false"/>
+                <w:bCs w:val="false"/>
                 <w:sz w:val="19"/>
                 <w:szCs w:val="19"/>
               </w:rPr>
@@ -5705,6 +5995,8 @@
             <w:r>
               <w:rPr>
                 <w:rFonts w:ascii="Arial" w:cs="Arial" w:eastAsia="Arial" w:hAnsi="Arial"/>
+                <w:b w:val="false"/>
+                <w:bCs w:val="false"/>
                 <w:sz w:val="19"/>
                 <w:szCs w:val="19"/>
               </w:rPr>
@@ -5730,6 +6022,8 @@
             <w:r>
               <w:rPr>
                 <w:rFonts w:ascii="Arial" w:cs="Arial" w:eastAsia="Arial" w:hAnsi="Arial"/>
+                <w:b w:val="false"/>
+                <w:bCs w:val="false"/>
                 <w:sz w:val="19"/>
                 <w:szCs w:val="19"/>
               </w:rPr>
@@ -5760,6 +6054,8 @@
             <w:r>
               <w:rPr>
                 <w:rFonts w:ascii="Arial" w:cs="Arial" w:eastAsia="Arial" w:hAnsi="Arial"/>
+                <w:b w:val="false"/>
+                <w:bCs w:val="false"/>
                 <w:sz w:val="19"/>
                 <w:szCs w:val="19"/>
               </w:rPr>
@@ -5785,6 +6081,8 @@
             <w:r>
               <w:rPr>
                 <w:rFonts w:ascii="Arial" w:cs="Arial" w:eastAsia="Arial" w:hAnsi="Arial"/>
+                <w:b w:val="false"/>
+                <w:bCs w:val="false"/>
                 <w:sz w:val="19"/>
                 <w:szCs w:val="19"/>
               </w:rPr>
@@ -5810,6 +6108,8 @@
             <w:r>
               <w:rPr>
                 <w:rFonts w:ascii="Arial" w:cs="Arial" w:eastAsia="Arial" w:hAnsi="Arial"/>
+                <w:b w:val="false"/>
+                <w:bCs w:val="false"/>
                 <w:sz w:val="19"/>
                 <w:szCs w:val="19"/>
               </w:rPr>
@@ -5840,6 +6140,8 @@
             <w:r>
               <w:rPr>
                 <w:rFonts w:ascii="Arial" w:cs="Arial" w:eastAsia="Arial" w:hAnsi="Arial"/>
+                <w:b w:val="false"/>
+                <w:bCs w:val="false"/>
                 <w:sz w:val="19"/>
                 <w:szCs w:val="19"/>
               </w:rPr>
@@ -5865,6 +6167,8 @@
             <w:r>
               <w:rPr>
                 <w:rFonts w:ascii="Arial" w:cs="Arial" w:eastAsia="Arial" w:hAnsi="Arial"/>
+                <w:b w:val="false"/>
+                <w:bCs w:val="false"/>
                 <w:sz w:val="19"/>
                 <w:szCs w:val="19"/>
               </w:rPr>
@@ -5890,15 +6194,31 @@
             <w:r>
               <w:rPr>
                 <w:rFonts w:ascii="Arial" w:cs="Arial" w:eastAsia="Arial" w:hAnsi="Arial"/>
-                <w:sz w:val="19"/>
-                <w:szCs w:val="19"/>
-              </w:rPr>
-              <w:t xml:space="preserve">Rojo de peligro con texto blanco.</w:t>
+                <w:b w:val="false"/>
+                <w:bCs w:val="false"/>
+                <w:sz w:val="19"/>
+                <w:szCs w:val="19"/>
+              </w:rPr>
+              <w:t xml:space="preserve">Peligro de acción con texto blanco.</w:t>
             </w:r>
           </w:p>
         </w:tc>
       </w:tr>
     </w:tbl>
+    <w:p>
+      <w:pPr>
+        <w:spacing w:after="110" w:line="262"/>
+        <w:jc w:val="both"/>
+      </w:pPr>
+      <w:r>
+        <w:rPr>
+          <w:rFonts w:ascii="Arial" w:cs="Arial" w:eastAsia="Arial" w:hAnsi="Arial"/>
+          <w:sz w:val="22"/>
+          <w:szCs w:val="22"/>
+        </w:rPr>
+        <w:t xml:space="preserve">El botón primario emplea el verde de acción y no el verde de marca: sobre este último, el texto blanco no alcanza el contraste mínimo. El verde de marca se reserva para el símbolo, los acentos gráficos y las etiquetas con texto oscuro. En modo oscuro, el verde de acento se acompaña siempre de texto oscuro.</w:t>
+      </w:r>
+    </w:p>
     <w:p>
       <w:pPr>
         <w:spacing w:after="20" w:before="60"/>
@@ -6432,6 +6752,8 @@
             <w:r>
               <w:rPr>
                 <w:rFonts w:ascii="Arial" w:cs="Arial" w:eastAsia="Arial" w:hAnsi="Arial"/>
+                <w:b w:val="false"/>
+                <w:bCs w:val="false"/>
                 <w:sz w:val="19"/>
                 <w:szCs w:val="19"/>
               </w:rPr>
@@ -6457,6 +6779,8 @@
             <w:r>
               <w:rPr>
                 <w:rFonts w:ascii="Arial" w:cs="Arial" w:eastAsia="Arial" w:hAnsi="Arial"/>
+                <w:b w:val="false"/>
+                <w:bCs w:val="false"/>
                 <w:sz w:val="19"/>
                 <w:szCs w:val="19"/>
               </w:rPr>
@@ -6482,6 +6806,8 @@
             <w:r>
               <w:rPr>
                 <w:rFonts w:ascii="Arial" w:cs="Arial" w:eastAsia="Arial" w:hAnsi="Arial"/>
+                <w:b w:val="false"/>
+                <w:bCs w:val="false"/>
                 <w:sz w:val="19"/>
                 <w:szCs w:val="19"/>
               </w:rPr>
@@ -6512,6 +6838,8 @@
             <w:r>
               <w:rPr>
                 <w:rFonts w:ascii="Arial" w:cs="Arial" w:eastAsia="Arial" w:hAnsi="Arial"/>
+                <w:b w:val="false"/>
+                <w:bCs w:val="false"/>
                 <w:sz w:val="19"/>
                 <w:szCs w:val="19"/>
               </w:rPr>
@@ -6537,6 +6865,8 @@
             <w:r>
               <w:rPr>
                 <w:rFonts w:ascii="Arial" w:cs="Arial" w:eastAsia="Arial" w:hAnsi="Arial"/>
+                <w:b w:val="false"/>
+                <w:bCs w:val="false"/>
                 <w:sz w:val="19"/>
                 <w:szCs w:val="19"/>
               </w:rPr>
@@ -6562,6 +6892,8 @@
             <w:r>
               <w:rPr>
                 <w:rFonts w:ascii="Arial" w:cs="Arial" w:eastAsia="Arial" w:hAnsi="Arial"/>
+                <w:b w:val="false"/>
+                <w:bCs w:val="false"/>
                 <w:sz w:val="19"/>
                 <w:szCs w:val="19"/>
               </w:rPr>
@@ -6592,6 +6924,8 @@
             <w:r>
               <w:rPr>
                 <w:rFonts w:ascii="Arial" w:cs="Arial" w:eastAsia="Arial" w:hAnsi="Arial"/>
+                <w:b w:val="false"/>
+                <w:bCs w:val="false"/>
                 <w:sz w:val="19"/>
                 <w:szCs w:val="19"/>
               </w:rPr>
@@ -6617,6 +6951,8 @@
             <w:r>
               <w:rPr>
                 <w:rFonts w:ascii="Arial" w:cs="Arial" w:eastAsia="Arial" w:hAnsi="Arial"/>
+                <w:b w:val="false"/>
+                <w:bCs w:val="false"/>
                 <w:sz w:val="19"/>
                 <w:szCs w:val="19"/>
               </w:rPr>
@@ -6642,6 +6978,8 @@
             <w:r>
               <w:rPr>
                 <w:rFonts w:ascii="Arial" w:cs="Arial" w:eastAsia="Arial" w:hAnsi="Arial"/>
+                <w:b w:val="false"/>
+                <w:bCs w:val="false"/>
                 <w:sz w:val="19"/>
                 <w:szCs w:val="19"/>
               </w:rPr>
@@ -6672,6 +7010,8 @@
             <w:r>
               <w:rPr>
                 <w:rFonts w:ascii="Arial" w:cs="Arial" w:eastAsia="Arial" w:hAnsi="Arial"/>
+                <w:b w:val="false"/>
+                <w:bCs w:val="false"/>
                 <w:sz w:val="19"/>
                 <w:szCs w:val="19"/>
               </w:rPr>
@@ -6697,6 +7037,8 @@
             <w:r>
               <w:rPr>
                 <w:rFonts w:ascii="Arial" w:cs="Arial" w:eastAsia="Arial" w:hAnsi="Arial"/>
+                <w:b w:val="false"/>
+                <w:bCs w:val="false"/>
                 <w:sz w:val="19"/>
                 <w:szCs w:val="19"/>
               </w:rPr>
@@ -6722,6 +7064,8 @@
             <w:r>
               <w:rPr>
                 <w:rFonts w:ascii="Arial" w:cs="Arial" w:eastAsia="Arial" w:hAnsi="Arial"/>
+                <w:b w:val="false"/>
+                <w:bCs w:val="false"/>
                 <w:sz w:val="19"/>
                 <w:szCs w:val="19"/>
               </w:rPr>
@@ -6742,7 +7086,7 @@
           <w:sz w:val="22"/>
           <w:szCs w:val="22"/>
         </w:rPr>
-        <w:t xml:space="preserve">Las etiquetas de estado identifican la situación de un registro dentro de las listas y los detalles. Se emplean los estados definidos en el modelo de datos: activo e inactivo para productos y usuarios, stock bajo y agotado para existencias, registrada y anulada para ventas, y activa o suspendida para la suscripción de la licorería.</w:t>
+        <w:t xml:space="preserve">Las etiquetas de estado identifican la situación de un registro dentro de las listas y los detalles. Se emplean los estados definidos en el modelo de datos: activo e inactivo para productos y usuarios, stock bajo y agotado para existencias, registrada y anulada para ventas, y activa o suspendida para la suscripción de la licorera.</w:t>
       </w:r>
     </w:p>
     <w:p>
@@ -7129,7 +7473,7 @@
           <w:sz w:val="22"/>
           <w:szCs w:val="22"/>
         </w:rPr>
-        <w:t xml:space="preserve">El acceso a INVENTRA se realiza mediante una cuenta de usuario asociada a una licorería. Los formularios de autenticación y registro comparten una misma disposición: un panel de marca a la izquierda, con la propuesta de valor del producto, y el formulario a la derecha, con los campos estrictamente necesarios para completar la acción.</w:t>
+        <w:t xml:space="preserve">El acceso a INVENTRA se realiza mediante una cuenta de usuario asociada a una licorera. Los formularios de autenticación y registro comparten una misma disposición: un panel de marca a la izquierda, con la propuesta de valor del producto, y el formulario a la derecha, con los campos estrictamente necesarios para completar la acción.</w:t>
       </w:r>
     </w:p>
     <w:p>
@@ -7315,7 +7659,7 @@
           <w:sz w:val="23"/>
           <w:szCs w:val="23"/>
         </w:rPr>
-        <w:t xml:space="preserve">7.2 Registro de la licorería</w:t>
+        <w:t xml:space="preserve">7.2 Registro de la licorera</w:t>
       </w:r>
       <w:bookmarkEnd w:id="23"/>
     </w:p>
@@ -7330,7 +7674,7 @@
           <w:sz w:val="22"/>
           <w:szCs w:val="22"/>
         </w:rPr>
-        <w:t xml:space="preserve">El registro crea al mismo tiempo la licorería y su primer usuario, con rol de administrador. Se piden únicamente cuatro datos: el nombre del negocio, el nombre y apellido del responsable, el correo electrónico y la contraseña.</w:t>
+        <w:t xml:space="preserve">El registro crea al mismo tiempo la licorera y su primer usuario, con rol de administrador. Se piden únicamente cuatro datos: el nombre del negocio, el nombre y apellido del responsable, el correo electrónico y la contraseña.</w:t>
       </w:r>
     </w:p>
     <w:p>
@@ -7393,7 +7737,7 @@
           <w:sz w:val="18"/>
           <w:szCs w:val="18"/>
         </w:rPr>
-        <w:t xml:space="preserve">Figura 9. Pantalla de registro de la licorería. Fuente: del autor.</w:t>
+        <w:t xml:space="preserve">Figura 9. Pantalla de registro de la licorera. Fuente: del autor.</w:t>
       </w:r>
     </w:p>
     <w:p>
@@ -7447,7 +7791,7 @@
           <w:sz w:val="22"/>
           <w:szCs w:val="22"/>
         </w:rPr>
-        <w:t xml:space="preserve">Al completar el registro, la licorería queda asociada al plan Básico y el usuario ingresa directamente al panel principal.</w:t>
+        <w:t xml:space="preserve">Al completar el registro, la licorera queda asociada al plan Básico y el usuario ingresa directamente al panel principal.</w:t>
       </w:r>
     </w:p>
     <w:p>
@@ -7645,6 +7989,8 @@
             <w:r>
               <w:rPr>
                 <w:rFonts w:ascii="Arial" w:cs="Arial" w:eastAsia="Arial" w:hAnsi="Arial"/>
+                <w:b w:val="false"/>
+                <w:bCs w:val="false"/>
                 <w:sz w:val="19"/>
                 <w:szCs w:val="19"/>
               </w:rPr>
@@ -7670,6 +8016,8 @@
             <w:r>
               <w:rPr>
                 <w:rFonts w:ascii="Arial" w:cs="Arial" w:eastAsia="Arial" w:hAnsi="Arial"/>
+                <w:b w:val="false"/>
+                <w:bCs w:val="false"/>
                 <w:sz w:val="19"/>
                 <w:szCs w:val="19"/>
               </w:rPr>
@@ -7695,6 +8043,8 @@
             <w:r>
               <w:rPr>
                 <w:rFonts w:ascii="Arial" w:cs="Arial" w:eastAsia="Arial" w:hAnsi="Arial"/>
+                <w:b w:val="false"/>
+                <w:bCs w:val="false"/>
                 <w:sz w:val="19"/>
                 <w:szCs w:val="19"/>
               </w:rPr>
@@ -7725,6 +8075,8 @@
             <w:r>
               <w:rPr>
                 <w:rFonts w:ascii="Arial" w:cs="Arial" w:eastAsia="Arial" w:hAnsi="Arial"/>
+                <w:b w:val="false"/>
+                <w:bCs w:val="false"/>
                 <w:sz w:val="19"/>
                 <w:szCs w:val="19"/>
               </w:rPr>
@@ -7750,6 +8102,8 @@
             <w:r>
               <w:rPr>
                 <w:rFonts w:ascii="Arial" w:cs="Arial" w:eastAsia="Arial" w:hAnsi="Arial"/>
+                <w:b w:val="false"/>
+                <w:bCs w:val="false"/>
                 <w:sz w:val="19"/>
                 <w:szCs w:val="19"/>
               </w:rPr>
@@ -7775,6 +8129,8 @@
             <w:r>
               <w:rPr>
                 <w:rFonts w:ascii="Arial" w:cs="Arial" w:eastAsia="Arial" w:hAnsi="Arial"/>
+                <w:b w:val="false"/>
+                <w:bCs w:val="false"/>
                 <w:sz w:val="19"/>
                 <w:szCs w:val="19"/>
               </w:rPr>
@@ -7805,6 +8161,8 @@
             <w:r>
               <w:rPr>
                 <w:rFonts w:ascii="Arial" w:cs="Arial" w:eastAsia="Arial" w:hAnsi="Arial"/>
+                <w:b w:val="false"/>
+                <w:bCs w:val="false"/>
                 <w:sz w:val="19"/>
                 <w:szCs w:val="19"/>
               </w:rPr>
@@ -7830,6 +8188,8 @@
             <w:r>
               <w:rPr>
                 <w:rFonts w:ascii="Arial" w:cs="Arial" w:eastAsia="Arial" w:hAnsi="Arial"/>
+                <w:b w:val="false"/>
+                <w:bCs w:val="false"/>
                 <w:sz w:val="19"/>
                 <w:szCs w:val="19"/>
               </w:rPr>
@@ -7855,6 +8215,8 @@
             <w:r>
               <w:rPr>
                 <w:rFonts w:ascii="Arial" w:cs="Arial" w:eastAsia="Arial" w:hAnsi="Arial"/>
+                <w:b w:val="false"/>
+                <w:bCs w:val="false"/>
                 <w:sz w:val="19"/>
                 <w:szCs w:val="19"/>
               </w:rPr>
@@ -7885,6 +8247,8 @@
             <w:r>
               <w:rPr>
                 <w:rFonts w:ascii="Arial" w:cs="Arial" w:eastAsia="Arial" w:hAnsi="Arial"/>
+                <w:b w:val="false"/>
+                <w:bCs w:val="false"/>
                 <w:sz w:val="19"/>
                 <w:szCs w:val="19"/>
               </w:rPr>
@@ -7910,6 +8274,8 @@
             <w:r>
               <w:rPr>
                 <w:rFonts w:ascii="Arial" w:cs="Arial" w:eastAsia="Arial" w:hAnsi="Arial"/>
+                <w:b w:val="false"/>
+                <w:bCs w:val="false"/>
                 <w:sz w:val="19"/>
                 <w:szCs w:val="19"/>
               </w:rPr>
@@ -7935,6 +8301,8 @@
             <w:r>
               <w:rPr>
                 <w:rFonts w:ascii="Arial" w:cs="Arial" w:eastAsia="Arial" w:hAnsi="Arial"/>
+                <w:b w:val="false"/>
+                <w:bCs w:val="false"/>
                 <w:sz w:val="19"/>
                 <w:szCs w:val="19"/>
               </w:rPr>
@@ -7965,6 +8333,8 @@
             <w:r>
               <w:rPr>
                 <w:rFonts w:ascii="Arial" w:cs="Arial" w:eastAsia="Arial" w:hAnsi="Arial"/>
+                <w:b w:val="false"/>
+                <w:bCs w:val="false"/>
                 <w:sz w:val="19"/>
                 <w:szCs w:val="19"/>
               </w:rPr>
@@ -7990,6 +8360,8 @@
             <w:r>
               <w:rPr>
                 <w:rFonts w:ascii="Arial" w:cs="Arial" w:eastAsia="Arial" w:hAnsi="Arial"/>
+                <w:b w:val="false"/>
+                <w:bCs w:val="false"/>
                 <w:sz w:val="19"/>
                 <w:szCs w:val="19"/>
               </w:rPr>
@@ -8015,6 +8387,8 @@
             <w:r>
               <w:rPr>
                 <w:rFonts w:ascii="Arial" w:cs="Arial" w:eastAsia="Arial" w:hAnsi="Arial"/>
+                <w:b w:val="false"/>
+                <w:bCs w:val="false"/>
                 <w:sz w:val="19"/>
                 <w:szCs w:val="19"/>
               </w:rPr>
@@ -8045,6 +8419,8 @@
             <w:r>
               <w:rPr>
                 <w:rFonts w:ascii="Arial" w:cs="Arial" w:eastAsia="Arial" w:hAnsi="Arial"/>
+                <w:b w:val="false"/>
+                <w:bCs w:val="false"/>
                 <w:sz w:val="19"/>
                 <w:szCs w:val="19"/>
               </w:rPr>
@@ -8070,6 +8446,8 @@
             <w:r>
               <w:rPr>
                 <w:rFonts w:ascii="Arial" w:cs="Arial" w:eastAsia="Arial" w:hAnsi="Arial"/>
+                <w:b w:val="false"/>
+                <w:bCs w:val="false"/>
                 <w:sz w:val="19"/>
                 <w:szCs w:val="19"/>
               </w:rPr>
@@ -8095,6 +8473,8 @@
             <w:r>
               <w:rPr>
                 <w:rFonts w:ascii="Arial" w:cs="Arial" w:eastAsia="Arial" w:hAnsi="Arial"/>
+                <w:b w:val="false"/>
+                <w:bCs w:val="false"/>
                 <w:sz w:val="19"/>
                 <w:szCs w:val="19"/>
               </w:rPr>
@@ -9027,6 +9407,8 @@
             <w:r>
               <w:rPr>
                 <w:rFonts w:ascii="Arial" w:cs="Arial" w:eastAsia="Arial" w:hAnsi="Arial"/>
+                <w:b w:val="false"/>
+                <w:bCs w:val="false"/>
                 <w:sz w:val="19"/>
                 <w:szCs w:val="19"/>
               </w:rPr>
@@ -9052,6 +9434,8 @@
             <w:r>
               <w:rPr>
                 <w:rFonts w:ascii="Arial" w:cs="Arial" w:eastAsia="Arial" w:hAnsi="Arial"/>
+                <w:b w:val="false"/>
+                <w:bCs w:val="false"/>
                 <w:sz w:val="19"/>
                 <w:szCs w:val="19"/>
               </w:rPr>
@@ -9077,6 +9461,8 @@
             <w:r>
               <w:rPr>
                 <w:rFonts w:ascii="Arial" w:cs="Arial" w:eastAsia="Arial" w:hAnsi="Arial"/>
+                <w:b w:val="false"/>
+                <w:bCs w:val="false"/>
                 <w:sz w:val="19"/>
                 <w:szCs w:val="19"/>
               </w:rPr>
@@ -9107,6 +9493,8 @@
             <w:r>
               <w:rPr>
                 <w:rFonts w:ascii="Arial" w:cs="Arial" w:eastAsia="Arial" w:hAnsi="Arial"/>
+                <w:b w:val="false"/>
+                <w:bCs w:val="false"/>
                 <w:sz w:val="19"/>
                 <w:szCs w:val="19"/>
               </w:rPr>
@@ -9132,6 +9520,8 @@
             <w:r>
               <w:rPr>
                 <w:rFonts w:ascii="Arial" w:cs="Arial" w:eastAsia="Arial" w:hAnsi="Arial"/>
+                <w:b w:val="false"/>
+                <w:bCs w:val="false"/>
                 <w:sz w:val="19"/>
                 <w:szCs w:val="19"/>
               </w:rPr>
@@ -9157,6 +9547,8 @@
             <w:r>
               <w:rPr>
                 <w:rFonts w:ascii="Arial" w:cs="Arial" w:eastAsia="Arial" w:hAnsi="Arial"/>
+                <w:b w:val="false"/>
+                <w:bCs w:val="false"/>
                 <w:sz w:val="19"/>
                 <w:szCs w:val="19"/>
               </w:rPr>
@@ -9187,6 +9579,8 @@
             <w:r>
               <w:rPr>
                 <w:rFonts w:ascii="Arial" w:cs="Arial" w:eastAsia="Arial" w:hAnsi="Arial"/>
+                <w:b w:val="false"/>
+                <w:bCs w:val="false"/>
                 <w:sz w:val="19"/>
                 <w:szCs w:val="19"/>
               </w:rPr>
@@ -9212,6 +9606,8 @@
             <w:r>
               <w:rPr>
                 <w:rFonts w:ascii="Arial" w:cs="Arial" w:eastAsia="Arial" w:hAnsi="Arial"/>
+                <w:b w:val="false"/>
+                <w:bCs w:val="false"/>
                 <w:sz w:val="19"/>
                 <w:szCs w:val="19"/>
               </w:rPr>
@@ -9237,6 +9633,8 @@
             <w:r>
               <w:rPr>
                 <w:rFonts w:ascii="Arial" w:cs="Arial" w:eastAsia="Arial" w:hAnsi="Arial"/>
+                <w:b w:val="false"/>
+                <w:bCs w:val="false"/>
                 <w:sz w:val="19"/>
                 <w:szCs w:val="19"/>
               </w:rPr>
@@ -9267,6 +9665,8 @@
             <w:r>
               <w:rPr>
                 <w:rFonts w:ascii="Arial" w:cs="Arial" w:eastAsia="Arial" w:hAnsi="Arial"/>
+                <w:b w:val="false"/>
+                <w:bCs w:val="false"/>
                 <w:sz w:val="19"/>
                 <w:szCs w:val="19"/>
               </w:rPr>
@@ -9292,6 +9692,8 @@
             <w:r>
               <w:rPr>
                 <w:rFonts w:ascii="Arial" w:cs="Arial" w:eastAsia="Arial" w:hAnsi="Arial"/>
+                <w:b w:val="false"/>
+                <w:bCs w:val="false"/>
                 <w:sz w:val="19"/>
                 <w:szCs w:val="19"/>
               </w:rPr>
@@ -9317,6 +9719,8 @@
             <w:r>
               <w:rPr>
                 <w:rFonts w:ascii="Arial" w:cs="Arial" w:eastAsia="Arial" w:hAnsi="Arial"/>
+                <w:b w:val="false"/>
+                <w:bCs w:val="false"/>
                 <w:sz w:val="19"/>
                 <w:szCs w:val="19"/>
               </w:rPr>
@@ -9347,6 +9751,8 @@
             <w:r>
               <w:rPr>
                 <w:rFonts w:ascii="Arial" w:cs="Arial" w:eastAsia="Arial" w:hAnsi="Arial"/>
+                <w:b w:val="false"/>
+                <w:bCs w:val="false"/>
                 <w:sz w:val="19"/>
                 <w:szCs w:val="19"/>
               </w:rPr>
@@ -9372,6 +9778,8 @@
             <w:r>
               <w:rPr>
                 <w:rFonts w:ascii="Arial" w:cs="Arial" w:eastAsia="Arial" w:hAnsi="Arial"/>
+                <w:b w:val="false"/>
+                <w:bCs w:val="false"/>
                 <w:sz w:val="19"/>
                 <w:szCs w:val="19"/>
               </w:rPr>
@@ -9397,6 +9805,8 @@
             <w:r>
               <w:rPr>
                 <w:rFonts w:ascii="Arial" w:cs="Arial" w:eastAsia="Arial" w:hAnsi="Arial"/>
+                <w:b w:val="false"/>
+                <w:bCs w:val="false"/>
                 <w:sz w:val="19"/>
                 <w:szCs w:val="19"/>
               </w:rPr>
@@ -9427,6 +9837,8 @@
             <w:r>
               <w:rPr>
                 <w:rFonts w:ascii="Arial" w:cs="Arial" w:eastAsia="Arial" w:hAnsi="Arial"/>
+                <w:b w:val="false"/>
+                <w:bCs w:val="false"/>
                 <w:sz w:val="19"/>
                 <w:szCs w:val="19"/>
               </w:rPr>
@@ -9452,6 +9864,8 @@
             <w:r>
               <w:rPr>
                 <w:rFonts w:ascii="Arial" w:cs="Arial" w:eastAsia="Arial" w:hAnsi="Arial"/>
+                <w:b w:val="false"/>
+                <w:bCs w:val="false"/>
                 <w:sz w:val="19"/>
                 <w:szCs w:val="19"/>
               </w:rPr>
@@ -9477,6 +9891,8 @@
             <w:r>
               <w:rPr>
                 <w:rFonts w:ascii="Arial" w:cs="Arial" w:eastAsia="Arial" w:hAnsi="Arial"/>
+                <w:b w:val="false"/>
+                <w:bCs w:val="false"/>
                 <w:sz w:val="19"/>
                 <w:szCs w:val="19"/>
               </w:rPr>
@@ -10090,6 +10506,8 @@
             <w:r>
               <w:rPr>
                 <w:rFonts w:ascii="Arial" w:cs="Arial" w:eastAsia="Arial" w:hAnsi="Arial"/>
+                <w:b w:val="false"/>
+                <w:bCs w:val="false"/>
                 <w:sz w:val="19"/>
                 <w:szCs w:val="19"/>
               </w:rPr>
@@ -10115,6 +10533,8 @@
             <w:r>
               <w:rPr>
                 <w:rFonts w:ascii="Arial" w:cs="Arial" w:eastAsia="Arial" w:hAnsi="Arial"/>
+                <w:b w:val="false"/>
+                <w:bCs w:val="false"/>
                 <w:sz w:val="19"/>
                 <w:szCs w:val="19"/>
               </w:rPr>
@@ -10145,6 +10565,8 @@
             <w:r>
               <w:rPr>
                 <w:rFonts w:ascii="Arial" w:cs="Arial" w:eastAsia="Arial" w:hAnsi="Arial"/>
+                <w:b w:val="false"/>
+                <w:bCs w:val="false"/>
                 <w:sz w:val="19"/>
                 <w:szCs w:val="19"/>
               </w:rPr>
@@ -10170,6 +10592,8 @@
             <w:r>
               <w:rPr>
                 <w:rFonts w:ascii="Arial" w:cs="Arial" w:eastAsia="Arial" w:hAnsi="Arial"/>
+                <w:b w:val="false"/>
+                <w:bCs w:val="false"/>
                 <w:sz w:val="19"/>
                 <w:szCs w:val="19"/>
               </w:rPr>
@@ -10200,6 +10624,8 @@
             <w:r>
               <w:rPr>
                 <w:rFonts w:ascii="Arial" w:cs="Arial" w:eastAsia="Arial" w:hAnsi="Arial"/>
+                <w:b w:val="false"/>
+                <w:bCs w:val="false"/>
                 <w:sz w:val="19"/>
                 <w:szCs w:val="19"/>
               </w:rPr>
@@ -10225,6 +10651,8 @@
             <w:r>
               <w:rPr>
                 <w:rFonts w:ascii="Arial" w:cs="Arial" w:eastAsia="Arial" w:hAnsi="Arial"/>
+                <w:b w:val="false"/>
+                <w:bCs w:val="false"/>
                 <w:sz w:val="19"/>
                 <w:szCs w:val="19"/>
               </w:rPr>
@@ -10255,6 +10683,8 @@
             <w:r>
               <w:rPr>
                 <w:rFonts w:ascii="Arial" w:cs="Arial" w:eastAsia="Arial" w:hAnsi="Arial"/>
+                <w:b w:val="false"/>
+                <w:bCs w:val="false"/>
                 <w:sz w:val="19"/>
                 <w:szCs w:val="19"/>
               </w:rPr>
@@ -10280,6 +10710,8 @@
             <w:r>
               <w:rPr>
                 <w:rFonts w:ascii="Arial" w:cs="Arial" w:eastAsia="Arial" w:hAnsi="Arial"/>
+                <w:b w:val="false"/>
+                <w:bCs w:val="false"/>
                 <w:sz w:val="19"/>
                 <w:szCs w:val="19"/>
               </w:rPr>
@@ -10310,6 +10742,8 @@
             <w:r>
               <w:rPr>
                 <w:rFonts w:ascii="Arial" w:cs="Arial" w:eastAsia="Arial" w:hAnsi="Arial"/>
+                <w:b w:val="false"/>
+                <w:bCs w:val="false"/>
                 <w:sz w:val="19"/>
                 <w:szCs w:val="19"/>
               </w:rPr>
@@ -10335,6 +10769,8 @@
             <w:r>
               <w:rPr>
                 <w:rFonts w:ascii="Arial" w:cs="Arial" w:eastAsia="Arial" w:hAnsi="Arial"/>
+                <w:b w:val="false"/>
+                <w:bCs w:val="false"/>
                 <w:sz w:val="19"/>
                 <w:szCs w:val="19"/>
               </w:rPr>
@@ -10365,6 +10801,8 @@
             <w:r>
               <w:rPr>
                 <w:rFonts w:ascii="Arial" w:cs="Arial" w:eastAsia="Arial" w:hAnsi="Arial"/>
+                <w:b w:val="false"/>
+                <w:bCs w:val="false"/>
                 <w:sz w:val="19"/>
                 <w:szCs w:val="19"/>
               </w:rPr>
@@ -10390,6 +10828,8 @@
             <w:r>
               <w:rPr>
                 <w:rFonts w:ascii="Arial" w:cs="Arial" w:eastAsia="Arial" w:hAnsi="Arial"/>
+                <w:b w:val="false"/>
+                <w:bCs w:val="false"/>
                 <w:sz w:val="19"/>
                 <w:szCs w:val="19"/>
               </w:rPr>
@@ -10420,6 +10860,8 @@
             <w:r>
               <w:rPr>
                 <w:rFonts w:ascii="Arial" w:cs="Arial" w:eastAsia="Arial" w:hAnsi="Arial"/>
+                <w:b w:val="false"/>
+                <w:bCs w:val="false"/>
                 <w:sz w:val="19"/>
                 <w:szCs w:val="19"/>
               </w:rPr>
@@ -10445,6 +10887,8 @@
             <w:r>
               <w:rPr>
                 <w:rFonts w:ascii="Arial" w:cs="Arial" w:eastAsia="Arial" w:hAnsi="Arial"/>
+                <w:b w:val="false"/>
+                <w:bCs w:val="false"/>
                 <w:sz w:val="19"/>
                 <w:szCs w:val="19"/>
               </w:rPr>
@@ -10475,6 +10919,8 @@
             <w:r>
               <w:rPr>
                 <w:rFonts w:ascii="Arial" w:cs="Arial" w:eastAsia="Arial" w:hAnsi="Arial"/>
+                <w:b w:val="false"/>
+                <w:bCs w:val="false"/>
                 <w:sz w:val="19"/>
                 <w:szCs w:val="19"/>
               </w:rPr>
@@ -10500,6 +10946,8 @@
             <w:r>
               <w:rPr>
                 <w:rFonts w:ascii="Arial" w:cs="Arial" w:eastAsia="Arial" w:hAnsi="Arial"/>
+                <w:b w:val="false"/>
+                <w:bCs w:val="false"/>
                 <w:sz w:val="19"/>
                 <w:szCs w:val="19"/>
               </w:rPr>
@@ -10530,6 +10978,8 @@
             <w:r>
               <w:rPr>
                 <w:rFonts w:ascii="Arial" w:cs="Arial" w:eastAsia="Arial" w:hAnsi="Arial"/>
+                <w:b w:val="false"/>
+                <w:bCs w:val="false"/>
                 <w:sz w:val="19"/>
                 <w:szCs w:val="19"/>
               </w:rPr>
@@ -10555,6 +11005,8 @@
             <w:r>
               <w:rPr>
                 <w:rFonts w:ascii="Arial" w:cs="Arial" w:eastAsia="Arial" w:hAnsi="Arial"/>
+                <w:b w:val="false"/>
+                <w:bCs w:val="false"/>
                 <w:sz w:val="19"/>
                 <w:szCs w:val="19"/>
               </w:rPr>
@@ -10585,6 +11037,8 @@
             <w:r>
               <w:rPr>
                 <w:rFonts w:ascii="Arial" w:cs="Arial" w:eastAsia="Arial" w:hAnsi="Arial"/>
+                <w:b w:val="false"/>
+                <w:bCs w:val="false"/>
                 <w:sz w:val="19"/>
                 <w:szCs w:val="19"/>
               </w:rPr>
@@ -10610,6 +11064,8 @@
             <w:r>
               <w:rPr>
                 <w:rFonts w:ascii="Arial" w:cs="Arial" w:eastAsia="Arial" w:hAnsi="Arial"/>
+                <w:b w:val="false"/>
+                <w:bCs w:val="false"/>
                 <w:sz w:val="19"/>
                 <w:szCs w:val="19"/>
               </w:rPr>
@@ -10640,6 +11096,8 @@
             <w:r>
               <w:rPr>
                 <w:rFonts w:ascii="Arial" w:cs="Arial" w:eastAsia="Arial" w:hAnsi="Arial"/>
+                <w:b w:val="false"/>
+                <w:bCs w:val="false"/>
                 <w:sz w:val="19"/>
                 <w:szCs w:val="19"/>
               </w:rPr>
@@ -10665,6 +11123,8 @@
             <w:r>
               <w:rPr>
                 <w:rFonts w:ascii="Arial" w:cs="Arial" w:eastAsia="Arial" w:hAnsi="Arial"/>
+                <w:b w:val="false"/>
+                <w:bCs w:val="false"/>
                 <w:sz w:val="19"/>
                 <w:szCs w:val="19"/>
               </w:rPr>
@@ -10695,6 +11155,8 @@
             <w:r>
               <w:rPr>
                 <w:rFonts w:ascii="Arial" w:cs="Arial" w:eastAsia="Arial" w:hAnsi="Arial"/>
+                <w:b w:val="false"/>
+                <w:bCs w:val="false"/>
                 <w:sz w:val="19"/>
                 <w:szCs w:val="19"/>
               </w:rPr>
@@ -10720,6 +11182,8 @@
             <w:r>
               <w:rPr>
                 <w:rFonts w:ascii="Arial" w:cs="Arial" w:eastAsia="Arial" w:hAnsi="Arial"/>
+                <w:b w:val="false"/>
+                <w:bCs w:val="false"/>
                 <w:sz w:val="19"/>
                 <w:szCs w:val="19"/>
               </w:rPr>
@@ -10750,6 +11214,8 @@
             <w:r>
               <w:rPr>
                 <w:rFonts w:ascii="Arial" w:cs="Arial" w:eastAsia="Arial" w:hAnsi="Arial"/>
+                <w:b w:val="false"/>
+                <w:bCs w:val="false"/>
                 <w:sz w:val="19"/>
                 <w:szCs w:val="19"/>
               </w:rPr>
@@ -10775,6 +11241,8 @@
             <w:r>
               <w:rPr>
                 <w:rFonts w:ascii="Arial" w:cs="Arial" w:eastAsia="Arial" w:hAnsi="Arial"/>
+                <w:b w:val="false"/>
+                <w:bCs w:val="false"/>
                 <w:sz w:val="19"/>
                 <w:szCs w:val="19"/>
               </w:rPr>

</xml_diff>

<commit_message>
Construyo la pantalla de suscripcion del negocio con su vista previa del cambio de plan
</commit_message>
<xml_diff>
--- a/docs/diseno/INVENTRA_Documento_Tecnico_Diseno.docx
+++ b/docs/diseno/INVENTRA_Documento_Tecnico_Diseno.docx
@@ -154,6 +154,12 @@
         <w:gridCol w:w="3260"/>
       </w:tblGrid>
       <w:tr>
+        <w:tblPrEx>
+          <w:tblCellMar>
+            <w:top w:w="0" w:type="dxa"/>
+            <w:bottom w:w="0" w:type="dxa"/>
+          </w:tblCellMar>
+        </w:tblPrEx>
         <w:trPr>
           <w:tblHeader/>
         </w:trPr>
@@ -267,6 +273,12 @@
         </w:tc>
       </w:tr>
       <w:tr>
+        <w:tblPrEx>
+          <w:tblCellMar>
+            <w:top w:w="0" w:type="dxa"/>
+            <w:bottom w:w="0" w:type="dxa"/>
+          </w:tblCellMar>
+        </w:tblPrEx>
         <w:tc>
           <w:tcPr>
             <w:tcW w:w="1500" w:type="dxa"/>
@@ -1804,8 +1816,52 @@
           <w:tab w:val="right" w:leader="dot" w:pos="9200"/>
         </w:tabs>
         <w:spacing w:after="40" w:line="252" w:lineRule="auto"/>
+        <w:ind w:left="360"/>
       </w:pPr>
       <w:hyperlink w:anchor="bm33" w:history="1">
+        <w:r>
+          <w:rPr>
+            <w:color w:val="1F3864"/>
+            <w:sz w:val="20"/>
+            <w:szCs w:val="20"/>
+          </w:rPr>
+          <w:t>8.7 Mi suscripción</w:t>
+        </w:r>
+      </w:hyperlink>
+      <w:r>
+        <w:rPr>
+          <w:sz w:val="20"/>
+          <w:szCs w:val="20"/>
+        </w:rPr>
+        <w:tab/>
+      </w:r>
+      <w:r>
+        <w:fldChar w:fldCharType="begin"/>
+      </w:r>
+      <w:r>
+        <w:instrText>PAGEREF bm33</w:instrText>
+      </w:r>
+      <w:r>
+        <w:fldChar w:fldCharType="separate"/>
+      </w:r>
+      <w:r>
+        <w:rPr>
+          <w:noProof/>
+        </w:rPr>
+        <w:t>1</w:t>
+      </w:r>
+      <w:r>
+        <w:fldChar w:fldCharType="end"/>
+      </w:r>
+    </w:p>
+    <w:p>
+      <w:pPr>
+        <w:tabs>
+          <w:tab w:val="right" w:leader="dot" w:pos="9200"/>
+        </w:tabs>
+        <w:spacing w:after="40" w:line="252" w:lineRule="auto"/>
+      </w:pPr>
+      <w:hyperlink w:anchor="bm34" w:history="1">
         <w:r>
           <w:rPr>
             <w:b/>
@@ -1828,7 +1884,7 @@
         <w:fldChar w:fldCharType="begin"/>
       </w:r>
       <w:r>
-        <w:instrText>PAGEREF bm33</w:instrText>
+        <w:instrText>PAGEREF bm34</w:instrText>
       </w:r>
       <w:r>
         <w:fldChar w:fldCharType="separate"/>
@@ -1851,7 +1907,7 @@
         <w:spacing w:after="40" w:line="252" w:lineRule="auto"/>
         <w:ind w:left="360"/>
       </w:pPr>
-      <w:hyperlink w:anchor="bm34" w:history="1">
+      <w:hyperlink w:anchor="bm35" w:history="1">
         <w:r>
           <w:rPr>
             <w:color w:val="1F3864"/>
@@ -1872,7 +1928,7 @@
         <w:fldChar w:fldCharType="begin"/>
       </w:r>
       <w:r>
-        <w:instrText>PAGEREF bm34</w:instrText>
+        <w:instrText>PAGEREF bm35</w:instrText>
       </w:r>
       <w:r>
         <w:fldChar w:fldCharType="separate"/>
@@ -1895,7 +1951,7 @@
         <w:spacing w:after="40" w:line="252" w:lineRule="auto"/>
         <w:ind w:left="360"/>
       </w:pPr>
-      <w:hyperlink w:anchor="bm35" w:history="1">
+      <w:hyperlink w:anchor="bm36" w:history="1">
         <w:r>
           <w:rPr>
             <w:color w:val="1F3864"/>
@@ -1916,7 +1972,7 @@
         <w:fldChar w:fldCharType="begin"/>
       </w:r>
       <w:r>
-        <w:instrText>PAGEREF bm35</w:instrText>
+        <w:instrText>PAGEREF bm36</w:instrText>
       </w:r>
       <w:r>
         <w:fldChar w:fldCharType="separate"/>
@@ -1938,7 +1994,7 @@
         </w:tabs>
         <w:spacing w:after="40" w:line="252" w:lineRule="auto"/>
       </w:pPr>
-      <w:hyperlink w:anchor="bm36" w:history="1">
+      <w:hyperlink w:anchor="bm37" w:history="1">
         <w:r>
           <w:rPr>
             <w:b/>
@@ -1961,7 +2017,7 @@
         <w:fldChar w:fldCharType="begin"/>
       </w:r>
       <w:r>
-        <w:instrText>PAGEREF bm36</w:instrText>
+        <w:instrText>PAGEREF bm37</w:instrText>
       </w:r>
       <w:r>
         <w:fldChar w:fldCharType="separate"/>
@@ -1984,7 +2040,7 @@
         <w:spacing w:after="40" w:line="252" w:lineRule="auto"/>
         <w:ind w:left="360"/>
       </w:pPr>
-      <w:hyperlink w:anchor="bm37" w:history="1">
+      <w:hyperlink w:anchor="bm38" w:history="1">
         <w:r>
           <w:rPr>
             <w:color w:val="1F3864"/>
@@ -2005,7 +2061,7 @@
         <w:fldChar w:fldCharType="begin"/>
       </w:r>
       <w:r>
-        <w:instrText>PAGEREF bm37</w:instrText>
+        <w:instrText>PAGEREF bm38</w:instrText>
       </w:r>
       <w:r>
         <w:fldChar w:fldCharType="separate"/>
@@ -2028,7 +2084,7 @@
         <w:spacing w:after="40" w:line="252" w:lineRule="auto"/>
         <w:ind w:left="360"/>
       </w:pPr>
-      <w:hyperlink w:anchor="bm38" w:history="1">
+      <w:hyperlink w:anchor="bm39" w:history="1">
         <w:r>
           <w:rPr>
             <w:color w:val="1F3864"/>
@@ -2049,7 +2105,7 @@
         <w:fldChar w:fldCharType="begin"/>
       </w:r>
       <w:r>
-        <w:instrText>PAGEREF bm38</w:instrText>
+        <w:instrText>PAGEREF bm39</w:instrText>
       </w:r>
       <w:r>
         <w:fldChar w:fldCharType="separate"/>
@@ -2072,7 +2128,7 @@
         <w:spacing w:after="40" w:line="252" w:lineRule="auto"/>
         <w:ind w:left="360"/>
       </w:pPr>
-      <w:hyperlink w:anchor="bm39" w:history="1">
+      <w:hyperlink w:anchor="bm40" w:history="1">
         <w:r>
           <w:rPr>
             <w:color w:val="1F3864"/>
@@ -2093,7 +2149,7 @@
         <w:fldChar w:fldCharType="begin"/>
       </w:r>
       <w:r>
-        <w:instrText>PAGEREF bm39</w:instrText>
+        <w:instrText>PAGEREF bm40</w:instrText>
       </w:r>
       <w:r>
         <w:fldChar w:fldCharType="separate"/>
@@ -2115,7 +2171,7 @@
         </w:tabs>
         <w:spacing w:after="40" w:line="252" w:lineRule="auto"/>
       </w:pPr>
-      <w:hyperlink w:anchor="bm40" w:history="1">
+      <w:hyperlink w:anchor="bm41" w:history="1">
         <w:r>
           <w:rPr>
             <w:b/>
@@ -2138,7 +2194,7 @@
         <w:fldChar w:fldCharType="begin"/>
       </w:r>
       <w:r>
-        <w:instrText>PAGEREF bm40</w:instrText>
+        <w:instrText>PAGEREF bm41</w:instrText>
       </w:r>
       <w:r>
         <w:fldChar w:fldCharType="separate"/>
@@ -2160,7 +2216,7 @@
         </w:tabs>
         <w:spacing w:after="40" w:line="252" w:lineRule="auto"/>
       </w:pPr>
-      <w:hyperlink w:anchor="bm41" w:history="1">
+      <w:hyperlink w:anchor="bm42" w:history="1">
         <w:r>
           <w:rPr>
             <w:b/>
@@ -2183,7 +2239,7 @@
         <w:fldChar w:fldCharType="begin"/>
       </w:r>
       <w:r>
-        <w:instrText>PAGEREF bm41</w:instrText>
+        <w:instrText>PAGEREF bm42</w:instrText>
       </w:r>
       <w:r>
         <w:fldChar w:fldCharType="separate"/>
@@ -2205,7 +2261,7 @@
         </w:tabs>
         <w:spacing w:after="40" w:line="252" w:lineRule="auto"/>
       </w:pPr>
-      <w:hyperlink w:anchor="bm42" w:history="1">
+      <w:hyperlink w:anchor="bm43" w:history="1">
         <w:r>
           <w:rPr>
             <w:b/>
@@ -2228,7 +2284,7 @@
         <w:fldChar w:fldCharType="begin"/>
       </w:r>
       <w:r>
-        <w:instrText>PAGEREF bm42</w:instrText>
+        <w:instrText>PAGEREF bm43</w:instrText>
       </w:r>
       <w:r>
         <w:fldChar w:fldCharType="separate"/>
@@ -2268,10 +2324,7 @@
         <w:jc w:val="both"/>
       </w:pPr>
       <w:r>
-        <w:t>Este documento define el sistema de diseño de la interfaz de INVENTRA para las plataformas web y móvil. Reúne la identidad visual, los componentes reutilizables, las pautas de accesibilidad y de experiencia de usuario, y las pantallas principales de la aplicación. Su propósito es servir de guía para la etapa de construcción y garantizar una interfaz coherente en todo el producto</w:t>
-      </w:r>
-      <w:r>
-        <w:t>.</w:t>
+        <w:t>Este documento define el sistema de diseño de la interfaz de INVENTRA para las plataformas web y móvil. Reúne la identidad visual, los componentes reutilizables, las pautas de accesibilidad y de experiencia de usuario, y las pantallas principales de la aplicación. Su propósito es servir de guía para la etapa de construcción y garantizar una interfaz coherente en todo el producto.</w:t>
       </w:r>
     </w:p>
     <w:p>
@@ -2287,10 +2340,7 @@
         <w:t xml:space="preserve">Objetivo. </w:t>
       </w:r>
       <w:r>
-        <w:t>Establecer los lineamientos visuales y de interacción que orientan el desarrollo de la interfaz, de modo que las pantallas mantengan una apariencia y un comportamiento uniformes</w:t>
-      </w:r>
-      <w:r>
-        <w:t>.</w:t>
+        <w:t>Establecer los lineamientos visuales y de interacción que orientan el desarrollo de la interfaz, de modo que las pantallas mantengan una apariencia y un comportamiento uniformes.</w:t>
       </w:r>
     </w:p>
     <w:p>
@@ -2458,10 +2508,7 @@
         <w:t xml:space="preserve">Retroalimentación. </w:t>
       </w:r>
       <w:r>
-        <w:t>El sistema informa siempre el resultado de cada acción (éxito, error o proceso en curso)</w:t>
-      </w:r>
-      <w:r>
-        <w:t>.</w:t>
+        <w:t>El sistema informa siempre el resultado de cada acción (éxito, error o proceso en curso).</w:t>
       </w:r>
     </w:p>
     <w:p>
@@ -2670,7 +2717,7 @@
           <w:noProof/>
         </w:rPr>
         <w:drawing>
-          <wp:inline distT="0" distB="0" distL="0" distR="0" wp14:anchorId="1D70D834" wp14:editId="0D230FD8">
+          <wp:inline distT="0" distB="0" distL="0" distR="0" wp14:anchorId="2EDAA709" wp14:editId="1546C456">
             <wp:extent cx="5905500" cy="2324100"/>
             <wp:effectExtent l="0" t="0" r="0" b="0"/>
             <wp:docPr id="1" name="Imagen 1"/>
@@ -2753,10 +2800,10 @@
           <w:noProof/>
         </w:rPr>
         <w:drawing>
-          <wp:inline distT="0" distB="0" distL="0" distR="0" wp14:anchorId="152399DA" wp14:editId="11D20582">
+          <wp:inline distT="0" distB="0" distL="0" distR="0" wp14:anchorId="56E6D655" wp14:editId="70B95278">
             <wp:extent cx="5334000" cy="2371725"/>
             <wp:effectExtent l="0" t="0" r="0" b="0"/>
-            <wp:docPr id="1288640685" name="Imagen 1288640685"/>
+            <wp:docPr id="1161191268" name="Imagen 1161191268"/>
             <wp:cNvGraphicFramePr>
               <a:graphicFrameLocks xmlns:a="http://schemas.openxmlformats.org/drawingml/2006/main" noChangeAspect="1"/>
             </wp:cNvGraphicFramePr>
@@ -2860,6 +2907,12 @@
         <w:gridCol w:w="4510"/>
       </w:tblGrid>
       <w:tr>
+        <w:tblPrEx>
+          <w:tblCellMar>
+            <w:top w:w="0" w:type="dxa"/>
+            <w:bottom w:w="0" w:type="dxa"/>
+          </w:tblCellMar>
+        </w:tblPrEx>
         <w:trPr>
           <w:tblHeader/>
         </w:trPr>
@@ -2973,6 +3026,12 @@
         </w:tc>
       </w:tr>
       <w:tr>
+        <w:tblPrEx>
+          <w:tblCellMar>
+            <w:top w:w="0" w:type="dxa"/>
+            <w:bottom w:w="0" w:type="dxa"/>
+          </w:tblCellMar>
+        </w:tblPrEx>
         <w:tc>
           <w:tcPr>
             <w:tcW w:w="1850" w:type="dxa"/>
@@ -3071,6 +3130,12 @@
         </w:tc>
       </w:tr>
       <w:tr>
+        <w:tblPrEx>
+          <w:tblCellMar>
+            <w:top w:w="0" w:type="dxa"/>
+            <w:bottom w:w="0" w:type="dxa"/>
+          </w:tblCellMar>
+        </w:tblPrEx>
         <w:tc>
           <w:tcPr>
             <w:tcW w:w="1850" w:type="dxa"/>
@@ -3170,6 +3235,12 @@
         </w:tc>
       </w:tr>
       <w:tr>
+        <w:tblPrEx>
+          <w:tblCellMar>
+            <w:top w:w="0" w:type="dxa"/>
+            <w:bottom w:w="0" w:type="dxa"/>
+          </w:tblCellMar>
+        </w:tblPrEx>
         <w:tc>
           <w:tcPr>
             <w:tcW w:w="1850" w:type="dxa"/>
@@ -3268,6 +3339,12 @@
         </w:tc>
       </w:tr>
       <w:tr>
+        <w:tblPrEx>
+          <w:tblCellMar>
+            <w:top w:w="0" w:type="dxa"/>
+            <w:bottom w:w="0" w:type="dxa"/>
+          </w:tblCellMar>
+        </w:tblPrEx>
         <w:tc>
           <w:tcPr>
             <w:tcW w:w="1850" w:type="dxa"/>
@@ -3366,6 +3443,12 @@
         </w:tc>
       </w:tr>
       <w:tr>
+        <w:tblPrEx>
+          <w:tblCellMar>
+            <w:top w:w="0" w:type="dxa"/>
+            <w:bottom w:w="0" w:type="dxa"/>
+          </w:tblCellMar>
+        </w:tblPrEx>
         <w:tc>
           <w:tcPr>
             <w:tcW w:w="1850" w:type="dxa"/>
@@ -3464,6 +3547,12 @@
         </w:tc>
       </w:tr>
       <w:tr>
+        <w:tblPrEx>
+          <w:tblCellMar>
+            <w:top w:w="0" w:type="dxa"/>
+            <w:bottom w:w="0" w:type="dxa"/>
+          </w:tblCellMar>
+        </w:tblPrEx>
         <w:tc>
           <w:tcPr>
             <w:tcW w:w="1850" w:type="dxa"/>
@@ -3562,6 +3651,12 @@
         </w:tc>
       </w:tr>
       <w:tr>
+        <w:tblPrEx>
+          <w:tblCellMar>
+            <w:top w:w="0" w:type="dxa"/>
+            <w:bottom w:w="0" w:type="dxa"/>
+          </w:tblCellMar>
+        </w:tblPrEx>
         <w:tc>
           <w:tcPr>
             <w:tcW w:w="1850" w:type="dxa"/>
@@ -3660,6 +3755,12 @@
         </w:tc>
       </w:tr>
       <w:tr>
+        <w:tblPrEx>
+          <w:tblCellMar>
+            <w:top w:w="0" w:type="dxa"/>
+            <w:bottom w:w="0" w:type="dxa"/>
+          </w:tblCellMar>
+        </w:tblPrEx>
         <w:tc>
           <w:tcPr>
             <w:tcW w:w="1850" w:type="dxa"/>
@@ -3758,6 +3859,12 @@
         </w:tc>
       </w:tr>
       <w:tr>
+        <w:tblPrEx>
+          <w:tblCellMar>
+            <w:top w:w="0" w:type="dxa"/>
+            <w:bottom w:w="0" w:type="dxa"/>
+          </w:tblCellMar>
+        </w:tblPrEx>
         <w:tc>
           <w:tcPr>
             <w:tcW w:w="1850" w:type="dxa"/>
@@ -3856,6 +3963,12 @@
         </w:tc>
       </w:tr>
       <w:tr>
+        <w:tblPrEx>
+          <w:tblCellMar>
+            <w:top w:w="0" w:type="dxa"/>
+            <w:bottom w:w="0" w:type="dxa"/>
+          </w:tblCellMar>
+        </w:tblPrEx>
         <w:tc>
           <w:tcPr>
             <w:tcW w:w="1850" w:type="dxa"/>
@@ -3954,6 +4067,12 @@
         </w:tc>
       </w:tr>
       <w:tr>
+        <w:tblPrEx>
+          <w:tblCellMar>
+            <w:top w:w="0" w:type="dxa"/>
+            <w:bottom w:w="0" w:type="dxa"/>
+          </w:tblCellMar>
+        </w:tblPrEx>
         <w:tc>
           <w:tcPr>
             <w:tcW w:w="1850" w:type="dxa"/>
@@ -4052,6 +4171,12 @@
         </w:tc>
       </w:tr>
       <w:tr>
+        <w:tblPrEx>
+          <w:tblCellMar>
+            <w:top w:w="0" w:type="dxa"/>
+            <w:bottom w:w="0" w:type="dxa"/>
+          </w:tblCellMar>
+        </w:tblPrEx>
         <w:tc>
           <w:tcPr>
             <w:tcW w:w="1850" w:type="dxa"/>
@@ -4150,6 +4275,12 @@
         </w:tc>
       </w:tr>
       <w:tr>
+        <w:tblPrEx>
+          <w:tblCellMar>
+            <w:top w:w="0" w:type="dxa"/>
+            <w:bottom w:w="0" w:type="dxa"/>
+          </w:tblCellMar>
+        </w:tblPrEx>
         <w:tc>
           <w:tcPr>
             <w:tcW w:w="1850" w:type="dxa"/>
@@ -4248,6 +4379,12 @@
         </w:tc>
       </w:tr>
       <w:tr>
+        <w:tblPrEx>
+          <w:tblCellMar>
+            <w:top w:w="0" w:type="dxa"/>
+            <w:bottom w:w="0" w:type="dxa"/>
+          </w:tblCellMar>
+        </w:tblPrEx>
         <w:tc>
           <w:tcPr>
             <w:tcW w:w="1850" w:type="dxa"/>
@@ -4346,6 +4483,12 @@
         </w:tc>
       </w:tr>
       <w:tr>
+        <w:tblPrEx>
+          <w:tblCellMar>
+            <w:top w:w="0" w:type="dxa"/>
+            <w:bottom w:w="0" w:type="dxa"/>
+          </w:tblCellMar>
+        </w:tblPrEx>
         <w:tc>
           <w:tcPr>
             <w:tcW w:w="1850" w:type="dxa"/>
@@ -4444,6 +4587,12 @@
         </w:tc>
       </w:tr>
       <w:tr>
+        <w:tblPrEx>
+          <w:tblCellMar>
+            <w:top w:w="0" w:type="dxa"/>
+            <w:bottom w:w="0" w:type="dxa"/>
+          </w:tblCellMar>
+        </w:tblPrEx>
         <w:tc>
           <w:tcPr>
             <w:tcW w:w="1850" w:type="dxa"/>
@@ -4542,6 +4691,12 @@
         </w:tc>
       </w:tr>
       <w:tr>
+        <w:tblPrEx>
+          <w:tblCellMar>
+            <w:top w:w="0" w:type="dxa"/>
+            <w:bottom w:w="0" w:type="dxa"/>
+          </w:tblCellMar>
+        </w:tblPrEx>
         <w:tc>
           <w:tcPr>
             <w:tcW w:w="1850" w:type="dxa"/>
@@ -4692,6 +4847,12 @@
         <w:gridCol w:w="3760"/>
       </w:tblGrid>
       <w:tr>
+        <w:tblPrEx>
+          <w:tblCellMar>
+            <w:top w:w="0" w:type="dxa"/>
+            <w:bottom w:w="0" w:type="dxa"/>
+          </w:tblCellMar>
+        </w:tblPrEx>
         <w:trPr>
           <w:tblHeader/>
         </w:trPr>
@@ -4805,6 +4966,12 @@
         </w:tc>
       </w:tr>
       <w:tr>
+        <w:tblPrEx>
+          <w:tblCellMar>
+            <w:top w:w="0" w:type="dxa"/>
+            <w:bottom w:w="0" w:type="dxa"/>
+          </w:tblCellMar>
+        </w:tblPrEx>
         <w:tc>
           <w:tcPr>
             <w:tcW w:w="2400" w:type="dxa"/>
@@ -4903,6 +5070,12 @@
         </w:tc>
       </w:tr>
       <w:tr>
+        <w:tblPrEx>
+          <w:tblCellMar>
+            <w:top w:w="0" w:type="dxa"/>
+            <w:bottom w:w="0" w:type="dxa"/>
+          </w:tblCellMar>
+        </w:tblPrEx>
         <w:tc>
           <w:tcPr>
             <w:tcW w:w="2400" w:type="dxa"/>
@@ -5001,6 +5174,12 @@
         </w:tc>
       </w:tr>
       <w:tr>
+        <w:tblPrEx>
+          <w:tblCellMar>
+            <w:top w:w="0" w:type="dxa"/>
+            <w:bottom w:w="0" w:type="dxa"/>
+          </w:tblCellMar>
+        </w:tblPrEx>
         <w:tc>
           <w:tcPr>
             <w:tcW w:w="2400" w:type="dxa"/>
@@ -5099,6 +5278,12 @@
         </w:tc>
       </w:tr>
       <w:tr>
+        <w:tblPrEx>
+          <w:tblCellMar>
+            <w:top w:w="0" w:type="dxa"/>
+            <w:bottom w:w="0" w:type="dxa"/>
+          </w:tblCellMar>
+        </w:tblPrEx>
         <w:tc>
           <w:tcPr>
             <w:tcW w:w="2400" w:type="dxa"/>
@@ -5197,6 +5382,12 @@
         </w:tc>
       </w:tr>
       <w:tr>
+        <w:tblPrEx>
+          <w:tblCellMar>
+            <w:top w:w="0" w:type="dxa"/>
+            <w:bottom w:w="0" w:type="dxa"/>
+          </w:tblCellMar>
+        </w:tblPrEx>
         <w:tc>
           <w:tcPr>
             <w:tcW w:w="2400" w:type="dxa"/>
@@ -5295,6 +5486,12 @@
         </w:tc>
       </w:tr>
       <w:tr>
+        <w:tblPrEx>
+          <w:tblCellMar>
+            <w:top w:w="0" w:type="dxa"/>
+            <w:bottom w:w="0" w:type="dxa"/>
+          </w:tblCellMar>
+        </w:tblPrEx>
         <w:tc>
           <w:tcPr>
             <w:tcW w:w="2400" w:type="dxa"/>
@@ -5499,6 +5696,12 @@
         <w:gridCol w:w="7160"/>
       </w:tblGrid>
       <w:tr>
+        <w:tblPrEx>
+          <w:tblCellMar>
+            <w:top w:w="0" w:type="dxa"/>
+            <w:bottom w:w="0" w:type="dxa"/>
+          </w:tblCellMar>
+        </w:tblPrEx>
         <w:trPr>
           <w:tblHeader/>
         </w:trPr>
@@ -5558,6 +5761,12 @@
         </w:tc>
       </w:tr>
       <w:tr>
+        <w:tblPrEx>
+          <w:tblCellMar>
+            <w:top w:w="0" w:type="dxa"/>
+            <w:bottom w:w="0" w:type="dxa"/>
+          </w:tblCellMar>
+        </w:tblPrEx>
         <w:tc>
           <w:tcPr>
             <w:tcW w:w="2200" w:type="dxa"/>
@@ -5608,6 +5817,12 @@
         </w:tc>
       </w:tr>
       <w:tr>
+        <w:tblPrEx>
+          <w:tblCellMar>
+            <w:top w:w="0" w:type="dxa"/>
+            <w:bottom w:w="0" w:type="dxa"/>
+          </w:tblCellMar>
+        </w:tblPrEx>
         <w:tc>
           <w:tcPr>
             <w:tcW w:w="2200" w:type="dxa"/>
@@ -5658,6 +5873,12 @@
         </w:tc>
       </w:tr>
       <w:tr>
+        <w:tblPrEx>
+          <w:tblCellMar>
+            <w:top w:w="0" w:type="dxa"/>
+            <w:bottom w:w="0" w:type="dxa"/>
+          </w:tblCellMar>
+        </w:tblPrEx>
         <w:tc>
           <w:tcPr>
             <w:tcW w:w="2200" w:type="dxa"/>
@@ -5708,6 +5929,12 @@
         </w:tc>
       </w:tr>
       <w:tr>
+        <w:tblPrEx>
+          <w:tblCellMar>
+            <w:top w:w="0" w:type="dxa"/>
+            <w:bottom w:w="0" w:type="dxa"/>
+          </w:tblCellMar>
+        </w:tblPrEx>
         <w:tc>
           <w:tcPr>
             <w:tcW w:w="2200" w:type="dxa"/>
@@ -5836,6 +6063,12 @@
         <w:gridCol w:w="4960"/>
       </w:tblGrid>
       <w:tr>
+        <w:tblPrEx>
+          <w:tblCellMar>
+            <w:top w:w="0" w:type="dxa"/>
+            <w:bottom w:w="0" w:type="dxa"/>
+          </w:tblCellMar>
+        </w:tblPrEx>
         <w:trPr>
           <w:tblHeader/>
         </w:trPr>
@@ -5922,6 +6155,12 @@
         </w:tc>
       </w:tr>
       <w:tr>
+        <w:tblPrEx>
+          <w:tblCellMar>
+            <w:top w:w="0" w:type="dxa"/>
+            <w:bottom w:w="0" w:type="dxa"/>
+          </w:tblCellMar>
+        </w:tblPrEx>
         <w:tc>
           <w:tcPr>
             <w:tcW w:w="2200" w:type="dxa"/>
@@ -5996,6 +6235,12 @@
         </w:tc>
       </w:tr>
       <w:tr>
+        <w:tblPrEx>
+          <w:tblCellMar>
+            <w:top w:w="0" w:type="dxa"/>
+            <w:bottom w:w="0" w:type="dxa"/>
+          </w:tblCellMar>
+        </w:tblPrEx>
         <w:tc>
           <w:tcPr>
             <w:tcW w:w="2200" w:type="dxa"/>
@@ -6070,6 +6315,12 @@
         </w:tc>
       </w:tr>
       <w:tr>
+        <w:tblPrEx>
+          <w:tblCellMar>
+            <w:top w:w="0" w:type="dxa"/>
+            <w:bottom w:w="0" w:type="dxa"/>
+          </w:tblCellMar>
+        </w:tblPrEx>
         <w:tc>
           <w:tcPr>
             <w:tcW w:w="2200" w:type="dxa"/>
@@ -6224,6 +6475,12 @@
         <w:gridCol w:w="3660"/>
       </w:tblGrid>
       <w:tr>
+        <w:tblPrEx>
+          <w:tblCellMar>
+            <w:top w:w="0" w:type="dxa"/>
+            <w:bottom w:w="0" w:type="dxa"/>
+          </w:tblCellMar>
+        </w:tblPrEx>
         <w:trPr>
           <w:tblHeader/>
         </w:trPr>
@@ -6310,6 +6567,12 @@
         </w:tc>
       </w:tr>
       <w:tr>
+        <w:tblPrEx>
+          <w:tblCellMar>
+            <w:top w:w="0" w:type="dxa"/>
+            <w:bottom w:w="0" w:type="dxa"/>
+          </w:tblCellMar>
+        </w:tblPrEx>
         <w:tc>
           <w:tcPr>
             <w:tcW w:w="1700" w:type="dxa"/>
@@ -6384,6 +6647,12 @@
         </w:tc>
       </w:tr>
       <w:tr>
+        <w:tblPrEx>
+          <w:tblCellMar>
+            <w:top w:w="0" w:type="dxa"/>
+            <w:bottom w:w="0" w:type="dxa"/>
+          </w:tblCellMar>
+        </w:tblPrEx>
         <w:tc>
           <w:tcPr>
             <w:tcW w:w="1700" w:type="dxa"/>
@@ -6458,6 +6727,12 @@
         </w:tc>
       </w:tr>
       <w:tr>
+        <w:tblPrEx>
+          <w:tblCellMar>
+            <w:top w:w="0" w:type="dxa"/>
+            <w:bottom w:w="0" w:type="dxa"/>
+          </w:tblCellMar>
+        </w:tblPrEx>
         <w:tc>
           <w:tcPr>
             <w:tcW w:w="1700" w:type="dxa"/>
@@ -6532,6 +6807,12 @@
         </w:tc>
       </w:tr>
       <w:tr>
+        <w:tblPrEx>
+          <w:tblCellMar>
+            <w:top w:w="0" w:type="dxa"/>
+            <w:bottom w:w="0" w:type="dxa"/>
+          </w:tblCellMar>
+        </w:tblPrEx>
         <w:tc>
           <w:tcPr>
             <w:tcW w:w="1700" w:type="dxa"/>
@@ -6606,6 +6887,12 @@
         </w:tc>
       </w:tr>
       <w:tr>
+        <w:tblPrEx>
+          <w:tblCellMar>
+            <w:top w:w="0" w:type="dxa"/>
+            <w:bottom w:w="0" w:type="dxa"/>
+          </w:tblCellMar>
+        </w:tblPrEx>
         <w:tc>
           <w:tcPr>
             <w:tcW w:w="1700" w:type="dxa"/>
@@ -6680,6 +6967,12 @@
         </w:tc>
       </w:tr>
       <w:tr>
+        <w:tblPrEx>
+          <w:tblCellMar>
+            <w:top w:w="0" w:type="dxa"/>
+            <w:bottom w:w="0" w:type="dxa"/>
+          </w:tblCellMar>
+        </w:tblPrEx>
         <w:tc>
           <w:tcPr>
             <w:tcW w:w="1700" w:type="dxa"/>
@@ -6754,6 +7047,12 @@
         </w:tc>
       </w:tr>
       <w:tr>
+        <w:tblPrEx>
+          <w:tblCellMar>
+            <w:top w:w="0" w:type="dxa"/>
+            <w:bottom w:w="0" w:type="dxa"/>
+          </w:tblCellMar>
+        </w:tblPrEx>
         <w:tc>
           <w:tcPr>
             <w:tcW w:w="1700" w:type="dxa"/>
@@ -6879,6 +7178,12 @@
         <w:gridCol w:w="3060"/>
       </w:tblGrid>
       <w:tr>
+        <w:tblPrEx>
+          <w:tblCellMar>
+            <w:top w:w="0" w:type="dxa"/>
+            <w:bottom w:w="0" w:type="dxa"/>
+          </w:tblCellMar>
+        </w:tblPrEx>
         <w:trPr>
           <w:tblHeader/>
         </w:trPr>
@@ -6965,6 +7270,12 @@
         </w:tc>
       </w:tr>
       <w:tr>
+        <w:tblPrEx>
+          <w:tblCellMar>
+            <w:top w:w="0" w:type="dxa"/>
+            <w:bottom w:w="0" w:type="dxa"/>
+          </w:tblCellMar>
+        </w:tblPrEx>
         <w:tc>
           <w:tcPr>
             <w:tcW w:w="1700" w:type="dxa"/>
@@ -7039,6 +7350,12 @@
         </w:tc>
       </w:tr>
       <w:tr>
+        <w:tblPrEx>
+          <w:tblCellMar>
+            <w:top w:w="0" w:type="dxa"/>
+            <w:bottom w:w="0" w:type="dxa"/>
+          </w:tblCellMar>
+        </w:tblPrEx>
         <w:tc>
           <w:tcPr>
             <w:tcW w:w="1700" w:type="dxa"/>
@@ -7113,6 +7430,12 @@
         </w:tc>
       </w:tr>
       <w:tr>
+        <w:tblPrEx>
+          <w:tblCellMar>
+            <w:top w:w="0" w:type="dxa"/>
+            <w:bottom w:w="0" w:type="dxa"/>
+          </w:tblCellMar>
+        </w:tblPrEx>
         <w:tc>
           <w:tcPr>
             <w:tcW w:w="1700" w:type="dxa"/>
@@ -7187,6 +7510,12 @@
         </w:tc>
       </w:tr>
       <w:tr>
+        <w:tblPrEx>
+          <w:tblCellMar>
+            <w:top w:w="0" w:type="dxa"/>
+            <w:bottom w:w="0" w:type="dxa"/>
+          </w:tblCellMar>
+        </w:tblPrEx>
         <w:tc>
           <w:tcPr>
             <w:tcW w:w="1700" w:type="dxa"/>
@@ -7281,10 +7610,10 @@
         </w:rPr>
         <w:lastRenderedPageBreak/>
         <w:drawing>
-          <wp:inline distT="0" distB="0" distL="0" distR="0" wp14:anchorId="412A0060" wp14:editId="035D4CE7">
+          <wp:inline distT="0" distB="0" distL="0" distR="0" wp14:anchorId="109DAC66" wp14:editId="0BEB80A0">
             <wp:extent cx="5905500" cy="2419350"/>
             <wp:effectExtent l="0" t="0" r="0" b="0"/>
-            <wp:docPr id="1077300805" name="Imagen 1077300805"/>
+            <wp:docPr id="1497086497" name="Imagen 1497086497"/>
             <wp:cNvGraphicFramePr>
               <a:graphicFrameLocks xmlns:a="http://schemas.openxmlformats.org/drawingml/2006/main" noChangeAspect="1"/>
             </wp:cNvGraphicFramePr>
@@ -7434,10 +7763,10 @@
           <w:noProof/>
         </w:rPr>
         <w:drawing>
-          <wp:inline distT="0" distB="0" distL="0" distR="0" wp14:anchorId="2D5BEE38" wp14:editId="3ACEABF1">
+          <wp:inline distT="0" distB="0" distL="0" distR="0" wp14:anchorId="64B23D1C" wp14:editId="24DF43D9">
             <wp:extent cx="5905500" cy="2257425"/>
             <wp:effectExtent l="0" t="0" r="0" b="0"/>
-            <wp:docPr id="51364893" name="Imagen 51364893"/>
+            <wp:docPr id="349414791" name="Imagen 349414791"/>
             <wp:cNvGraphicFramePr>
               <a:graphicFrameLocks xmlns:a="http://schemas.openxmlformats.org/drawingml/2006/main" noChangeAspect="1"/>
             </wp:cNvGraphicFramePr>
@@ -7630,6 +7959,12 @@
         <w:gridCol w:w="5360"/>
       </w:tblGrid>
       <w:tr>
+        <w:tblPrEx>
+          <w:tblCellMar>
+            <w:top w:w="0" w:type="dxa"/>
+            <w:bottom w:w="0" w:type="dxa"/>
+          </w:tblCellMar>
+        </w:tblPrEx>
         <w:trPr>
           <w:tblHeader/>
         </w:trPr>
@@ -7716,6 +8051,12 @@
         </w:tc>
       </w:tr>
       <w:tr>
+        <w:tblPrEx>
+          <w:tblCellMar>
+            <w:top w:w="0" w:type="dxa"/>
+            <w:bottom w:w="0" w:type="dxa"/>
+          </w:tblCellMar>
+        </w:tblPrEx>
         <w:tc>
           <w:tcPr>
             <w:tcW w:w="1700" w:type="dxa"/>
@@ -7790,6 +8131,12 @@
         </w:tc>
       </w:tr>
       <w:tr>
+        <w:tblPrEx>
+          <w:tblCellMar>
+            <w:top w:w="0" w:type="dxa"/>
+            <w:bottom w:w="0" w:type="dxa"/>
+          </w:tblCellMar>
+        </w:tblPrEx>
         <w:tc>
           <w:tcPr>
             <w:tcW w:w="1700" w:type="dxa"/>
@@ -7864,6 +8211,12 @@
         </w:tc>
       </w:tr>
       <w:tr>
+        <w:tblPrEx>
+          <w:tblCellMar>
+            <w:top w:w="0" w:type="dxa"/>
+            <w:bottom w:w="0" w:type="dxa"/>
+          </w:tblCellMar>
+        </w:tblPrEx>
         <w:tc>
           <w:tcPr>
             <w:tcW w:w="1700" w:type="dxa"/>
@@ -7938,6 +8291,12 @@
         </w:tc>
       </w:tr>
       <w:tr>
+        <w:tblPrEx>
+          <w:tblCellMar>
+            <w:top w:w="0" w:type="dxa"/>
+            <w:bottom w:w="0" w:type="dxa"/>
+          </w:tblCellMar>
+        </w:tblPrEx>
         <w:tc>
           <w:tcPr>
             <w:tcW w:w="1700" w:type="dxa"/>
@@ -8031,10 +8390,10 @@
           <w:noProof/>
         </w:rPr>
         <w:drawing>
-          <wp:inline distT="0" distB="0" distL="0" distR="0" wp14:anchorId="25A70EF9" wp14:editId="14F638CE">
+          <wp:inline distT="0" distB="0" distL="0" distR="0" wp14:anchorId="243AAC28" wp14:editId="79EB4994">
             <wp:extent cx="5334000" cy="3381375"/>
             <wp:effectExtent l="0" t="0" r="0" b="0"/>
-            <wp:docPr id="459827017" name="Imagen 459827017"/>
+            <wp:docPr id="1910381599" name="Imagen 1910381599"/>
             <wp:cNvGraphicFramePr>
               <a:graphicFrameLocks xmlns:a="http://schemas.openxmlformats.org/drawingml/2006/main" noChangeAspect="1"/>
             </wp:cNvGraphicFramePr>
@@ -8127,7 +8486,10 @@
           <w:b/>
           <w:bCs/>
         </w:rPr>
-        <w:t>Navegación. En escritorio, una barra lateral fija en azul primario con los módulos habilitados según el rol y el plan; en la parte superior, el título de la pantalla, las acciones de contexto y el acceso al perfil. En móvil, la barra lateral se traslada a la parte superior y se desplaza en horizontal, conservando el acceso a todos los módulos.</w:t>
+        <w:t xml:space="preserve">Navegación. </w:t>
+      </w:r>
+      <w:r>
+        <w:t>En escritorio, una barra lateral fija en azul primario con los módulos habilitados según el rol y el plan; en la parte superior, el título de la pantalla, las acciones de contexto y el acceso al perfil. En móvil, la barra lateral se traslada a la parte superior y se desplaza en horizontal, conservando el acceso a todos los módulos.</w:t>
       </w:r>
     </w:p>
     <w:p>
@@ -8181,10 +8543,10 @@
           <w:noProof/>
         </w:rPr>
         <w:drawing>
-          <wp:inline distT="0" distB="0" distL="0" distR="0" wp14:anchorId="44EE0237" wp14:editId="79D7C77A">
+          <wp:inline distT="0" distB="0" distL="0" distR="0" wp14:anchorId="5272A4CE" wp14:editId="13295E5C">
             <wp:extent cx="6096000" cy="1676400"/>
             <wp:effectExtent l="0" t="0" r="0" b="0"/>
-            <wp:docPr id="45284721" name="Imagen 45284721"/>
+            <wp:docPr id="657125968" name="Imagen 657125968"/>
             <wp:cNvGraphicFramePr>
               <a:graphicFrameLocks xmlns:a="http://schemas.openxmlformats.org/drawingml/2006/main" noChangeAspect="1"/>
             </wp:cNvGraphicFramePr>
@@ -8273,10 +8635,10 @@
           <w:noProof/>
         </w:rPr>
         <w:drawing>
-          <wp:inline distT="0" distB="0" distL="0" distR="0" wp14:anchorId="660C88CE" wp14:editId="09E93FD9">
+          <wp:inline distT="0" distB="0" distL="0" distR="0" wp14:anchorId="3515BC00" wp14:editId="1DDA17E8">
             <wp:extent cx="4762500" cy="2447925"/>
             <wp:effectExtent l="0" t="0" r="0" b="0"/>
-            <wp:docPr id="2133637732" name="Imagen 2133637732"/>
+            <wp:docPr id="33631168" name="Imagen 33631168"/>
             <wp:cNvGraphicFramePr>
               <a:graphicFrameLocks xmlns:a="http://schemas.openxmlformats.org/drawingml/2006/main" noChangeAspect="1"/>
             </wp:cNvGraphicFramePr>
@@ -8403,10 +8765,10 @@
           <w:noProof/>
         </w:rPr>
         <w:drawing>
-          <wp:inline distT="0" distB="0" distL="0" distR="0" wp14:anchorId="544328B8" wp14:editId="2F7E0039">
+          <wp:inline distT="0" distB="0" distL="0" distR="0" wp14:anchorId="52D3D2D5" wp14:editId="234C0E05">
             <wp:extent cx="6096000" cy="3048000"/>
             <wp:effectExtent l="0" t="0" r="0" b="0"/>
-            <wp:docPr id="2107437364" name="Imagen 2107437364"/>
+            <wp:docPr id="1156282116" name="Imagen 1156282116"/>
             <wp:cNvGraphicFramePr>
               <a:graphicFrameLocks xmlns:a="http://schemas.openxmlformats.org/drawingml/2006/main" noChangeAspect="1"/>
             </wp:cNvGraphicFramePr>
@@ -8548,10 +8910,10 @@
         </w:rPr>
         <w:lastRenderedPageBreak/>
         <w:drawing>
-          <wp:inline distT="0" distB="0" distL="0" distR="0" wp14:anchorId="0FDB5B55" wp14:editId="6D4B9070">
+          <wp:inline distT="0" distB="0" distL="0" distR="0" wp14:anchorId="37C2AB16" wp14:editId="422A3998">
             <wp:extent cx="6096000" cy="3848100"/>
             <wp:effectExtent l="0" t="0" r="0" b="0"/>
-            <wp:docPr id="251189718" name="Imagen 251189718"/>
+            <wp:docPr id="650565111" name="Imagen 650565111"/>
             <wp:cNvGraphicFramePr>
               <a:graphicFrameLocks xmlns:a="http://schemas.openxmlformats.org/drawingml/2006/main" noChangeAspect="1"/>
             </wp:cNvGraphicFramePr>
@@ -8720,6 +9082,12 @@
         <w:gridCol w:w="4160"/>
       </w:tblGrid>
       <w:tr>
+        <w:tblPrEx>
+          <w:tblCellMar>
+            <w:top w:w="0" w:type="dxa"/>
+            <w:bottom w:w="0" w:type="dxa"/>
+          </w:tblCellMar>
+        </w:tblPrEx>
         <w:trPr>
           <w:tblHeader/>
         </w:trPr>
@@ -8806,6 +9174,12 @@
         </w:tc>
       </w:tr>
       <w:tr>
+        <w:tblPrEx>
+          <w:tblCellMar>
+            <w:top w:w="0" w:type="dxa"/>
+            <w:bottom w:w="0" w:type="dxa"/>
+          </w:tblCellMar>
+        </w:tblPrEx>
         <w:tc>
           <w:tcPr>
             <w:tcW w:w="2100" w:type="dxa"/>
@@ -8880,6 +9254,12 @@
         </w:tc>
       </w:tr>
       <w:tr>
+        <w:tblPrEx>
+          <w:tblCellMar>
+            <w:top w:w="0" w:type="dxa"/>
+            <w:bottom w:w="0" w:type="dxa"/>
+          </w:tblCellMar>
+        </w:tblPrEx>
         <w:tc>
           <w:tcPr>
             <w:tcW w:w="2100" w:type="dxa"/>
@@ -8954,6 +9334,12 @@
         </w:tc>
       </w:tr>
       <w:tr>
+        <w:tblPrEx>
+          <w:tblCellMar>
+            <w:top w:w="0" w:type="dxa"/>
+            <w:bottom w:w="0" w:type="dxa"/>
+          </w:tblCellMar>
+        </w:tblPrEx>
         <w:tc>
           <w:tcPr>
             <w:tcW w:w="2100" w:type="dxa"/>
@@ -9028,6 +9414,12 @@
         </w:tc>
       </w:tr>
       <w:tr>
+        <w:tblPrEx>
+          <w:tblCellMar>
+            <w:top w:w="0" w:type="dxa"/>
+            <w:bottom w:w="0" w:type="dxa"/>
+          </w:tblCellMar>
+        </w:tblPrEx>
         <w:tc>
           <w:tcPr>
             <w:tcW w:w="2100" w:type="dxa"/>
@@ -9102,6 +9494,12 @@
         </w:tc>
       </w:tr>
       <w:tr>
+        <w:tblPrEx>
+          <w:tblCellMar>
+            <w:top w:w="0" w:type="dxa"/>
+            <w:bottom w:w="0" w:type="dxa"/>
+          </w:tblCellMar>
+        </w:tblPrEx>
         <w:tc>
           <w:tcPr>
             <w:tcW w:w="2100" w:type="dxa"/>
@@ -9176,6 +9574,12 @@
         </w:tc>
       </w:tr>
       <w:tr>
+        <w:tblPrEx>
+          <w:tblCellMar>
+            <w:top w:w="0" w:type="dxa"/>
+            <w:bottom w:w="0" w:type="dxa"/>
+          </w:tblCellMar>
+        </w:tblPrEx>
         <w:tc>
           <w:tcPr>
             <w:tcW w:w="2100" w:type="dxa"/>
@@ -9317,10 +9721,10 @@
           <w:noProof/>
         </w:rPr>
         <w:drawing>
-          <wp:inline distT="0" distB="0" distL="0" distR="0" wp14:anchorId="06F0FA3F" wp14:editId="65BD098B">
+          <wp:inline distT="0" distB="0" distL="0" distR="0" wp14:anchorId="68F04473" wp14:editId="647ECD83">
             <wp:extent cx="6096000" cy="3000375"/>
             <wp:effectExtent l="0" t="0" r="0" b="0"/>
-            <wp:docPr id="32235196" name="Imagen 32235196"/>
+            <wp:docPr id="2052150752" name="Imagen 2052150752"/>
             <wp:cNvGraphicFramePr>
               <a:graphicFrameLocks xmlns:a="http://schemas.openxmlformats.org/drawingml/2006/main" noChangeAspect="1"/>
             </wp:cNvGraphicFramePr>
@@ -9449,10 +9853,10 @@
         </w:rPr>
         <w:lastRenderedPageBreak/>
         <w:drawing>
-          <wp:inline distT="0" distB="0" distL="0" distR="0" wp14:anchorId="2023FE5A" wp14:editId="1FE188E8">
+          <wp:inline distT="0" distB="0" distL="0" distR="0" wp14:anchorId="6F9EFD58" wp14:editId="416A023E">
             <wp:extent cx="6096000" cy="2857500"/>
             <wp:effectExtent l="0" t="0" r="0" b="0"/>
-            <wp:docPr id="974837261" name="Imagen 974837261"/>
+            <wp:docPr id="950796651" name="Imagen 950796651"/>
             <wp:cNvGraphicFramePr>
               <a:graphicFrameLocks xmlns:a="http://schemas.openxmlformats.org/drawingml/2006/main" noChangeAspect="1"/>
             </wp:cNvGraphicFramePr>
@@ -9541,10 +9945,10 @@
           <w:noProof/>
         </w:rPr>
         <w:drawing>
-          <wp:inline distT="0" distB="0" distL="0" distR="0" wp14:anchorId="2A4DE754" wp14:editId="09B03A17">
+          <wp:inline distT="0" distB="0" distL="0" distR="0" wp14:anchorId="1AE4E64F" wp14:editId="5A6419BF">
             <wp:extent cx="6096000" cy="2857500"/>
             <wp:effectExtent l="0" t="0" r="0" b="0"/>
-            <wp:docPr id="350381120" name="Imagen 350381120"/>
+            <wp:docPr id="1189987927" name="Imagen 1189987927"/>
             <wp:cNvGraphicFramePr>
               <a:graphicFrameLocks xmlns:a="http://schemas.openxmlformats.org/drawingml/2006/main" noChangeAspect="1"/>
             </wp:cNvGraphicFramePr>
@@ -9634,10 +10038,10 @@
         </w:rPr>
         <w:lastRenderedPageBreak/>
         <w:drawing>
-          <wp:inline distT="0" distB="0" distL="0" distR="0" wp14:anchorId="48B13D27" wp14:editId="5283CEDE">
+          <wp:inline distT="0" distB="0" distL="0" distR="0" wp14:anchorId="4D3CA54E" wp14:editId="2A9E70E9">
             <wp:extent cx="4953000" cy="4572000"/>
             <wp:effectExtent l="0" t="0" r="0" b="0"/>
-            <wp:docPr id="534984209" name="Imagen 534984209"/>
+            <wp:docPr id="1581986011" name="Imagen 1581986011"/>
             <wp:cNvGraphicFramePr>
               <a:graphicFrameLocks xmlns:a="http://schemas.openxmlformats.org/drawingml/2006/main" noChangeAspect="1"/>
             </wp:cNvGraphicFramePr>
@@ -9736,10 +10140,10 @@
         </w:rPr>
         <w:lastRenderedPageBreak/>
         <w:drawing>
-          <wp:inline distT="0" distB="0" distL="0" distR="0" wp14:anchorId="25A4025A" wp14:editId="1FFAF929">
+          <wp:inline distT="0" distB="0" distL="0" distR="0" wp14:anchorId="1B5E70BD" wp14:editId="1117D130">
             <wp:extent cx="6096000" cy="2562225"/>
             <wp:effectExtent l="0" t="0" r="0" b="0"/>
-            <wp:docPr id="414068858" name="Imagen 414068858"/>
+            <wp:docPr id="1112097117" name="Imagen 1112097117"/>
             <wp:cNvGraphicFramePr>
               <a:graphicFrameLocks xmlns:a="http://schemas.openxmlformats.org/drawingml/2006/main" noChangeAspect="1"/>
             </wp:cNvGraphicFramePr>
@@ -9828,10 +10232,10 @@
           <w:noProof/>
         </w:rPr>
         <w:drawing>
-          <wp:inline distT="0" distB="0" distL="0" distR="0" wp14:anchorId="7A3551CA" wp14:editId="6A8F9F8D">
+          <wp:inline distT="0" distB="0" distL="0" distR="0" wp14:anchorId="59C0DFB3" wp14:editId="5752B7E2">
             <wp:extent cx="6096000" cy="2857500"/>
             <wp:effectExtent l="0" t="0" r="0" b="0"/>
-            <wp:docPr id="13455019" name="Imagen 13455019"/>
+            <wp:docPr id="1234444453" name="Imagen 1234444453"/>
             <wp:cNvGraphicFramePr>
               <a:graphicFrameLocks xmlns:a="http://schemas.openxmlformats.org/drawingml/2006/main" noChangeAspect="1"/>
             </wp:cNvGraphicFramePr>
@@ -9885,21 +10289,19 @@
     </w:p>
     <w:p>
       <w:pPr>
-        <w:pStyle w:val="Ttulo1"/>
-        <w:pageBreakBefore/>
-        <w:spacing w:before="220" w:after="110"/>
+        <w:pStyle w:val="Ttulo2"/>
+        <w:spacing w:before="150" w:after="80"/>
       </w:pPr>
       <w:bookmarkStart w:id="32" w:name="bm33"/>
       <w:r>
         <w:rPr>
           <w:b/>
           <w:bCs/>
-          <w:color w:val="1F3864"/>
-          <w:sz w:val="27"/>
-          <w:szCs w:val="27"/>
-        </w:rPr>
-        <w:lastRenderedPageBreak/>
-        <w:t>9. Mensajes y estados de pantalla</w:t>
+          <w:color w:val="2E5496"/>
+          <w:sz w:val="23"/>
+          <w:szCs w:val="23"/>
+        </w:rPr>
+        <w:t>8.7 Mi suscripción</w:t>
       </w:r>
       <w:bookmarkEnd w:id="32"/>
     </w:p>
@@ -9909,7 +10311,29 @@
         <w:jc w:val="both"/>
       </w:pPr>
       <w:r>
-        <w:t>Además de los componentes descritos en la sección 6, la interfaz define cómo se comporta una pantalla cuando no hay información que mostrar, cuando los datos aún se están cargando o cuando una operación falla. El objetivo es que el usuario siempre sepa qué ocurre y qué puede hacer a continuación.</w:t>
+        <w:t>Reúne en una sola pantalla lo que el negocio necesita saber de su contratación: el plan vigente con su estado, la fecha hasta la que vale y los días que faltan. Cuando la suscripción ha vencido y corre el plazo de gracia, el segundo indicador cambia de sentido y pasa a contar los días que quedan antes de la suspensión, porque esa es la cifra que obliga a actuar.</w:t>
+      </w:r>
+    </w:p>
+    <w:p>
+      <w:pPr>
+        <w:spacing w:after="110" w:line="262" w:lineRule="auto"/>
+        <w:jc w:val="both"/>
+      </w:pPr>
+      <w:r>
+        <w:t xml:space="preserve">Debajo se listan los planes disponibles con lo que incluye cada uno, tomado del propio plan y no de un texto fijo, de modo que un plan nuevo aparece sin tocar la pantalla. El plan contratado se señala y no ofrece acción. Solo se ofrece el botón de los planes más económicos: bajar de plan no implica cobro y lo </w:t>
+      </w:r>
+      <w:r>
+        <w:lastRenderedPageBreak/>
+        <w:t>ejecuta el propio negocio, mientras que subir se contrata con INVENTRA, que lo activa al confirmar el pago. La pantalla lo dice con esas palabras en lugar de ocultar el plan superior, porque el negocio necesita saber cómo se contrata.</w:t>
+      </w:r>
+    </w:p>
+    <w:p>
+      <w:pPr>
+        <w:spacing w:after="110" w:line="262" w:lineRule="auto"/>
+        <w:jc w:val="both"/>
+      </w:pPr>
+      <w:r>
+        <w:t>Antes de bajar de plan se pide confirmación, con el detalle de lo que se pierde. Si la licorera tiene más usuarios o más sedes de los que admite el plan de destino, el sistema rechaza el cambio y dice cuántos sobran, sin inactivar nada por su cuenta: esa decisión es del negocio.</w:t>
       </w:r>
     </w:p>
     <w:p>
@@ -9922,10 +10346,10 @@
           <w:noProof/>
         </w:rPr>
         <w:drawing>
-          <wp:inline distT="0" distB="0" distL="0" distR="0" wp14:anchorId="22E8D717" wp14:editId="5990524A">
-            <wp:extent cx="6096000" cy="2324100"/>
+          <wp:inline distT="0" distB="0" distL="0" distR="0" wp14:anchorId="1B653B7C" wp14:editId="15A7CA7B">
+            <wp:extent cx="6096000" cy="3067050"/>
             <wp:effectExtent l="0" t="0" r="0" b="0"/>
-            <wp:docPr id="1195684467" name="Imagen 1195684467"/>
+            <wp:docPr id="1623259274" name="Imagen 1623259274"/>
             <wp:cNvGraphicFramePr>
               <a:graphicFrameLocks xmlns:a="http://schemas.openxmlformats.org/drawingml/2006/main" noChangeAspect="1"/>
             </wp:cNvGraphicFramePr>
@@ -9948,6 +10372,100 @@
                   <pic:spPr bwMode="auto">
                     <a:xfrm>
                       <a:off x="0" y="0"/>
+                      <a:ext cx="6096000" cy="3067050"/>
+                    </a:xfrm>
+                    <a:prstGeom prst="rect">
+                      <a:avLst/>
+                    </a:prstGeom>
+                  </pic:spPr>
+                </pic:pic>
+              </a:graphicData>
+            </a:graphic>
+          </wp:inline>
+        </w:drawing>
+      </w:r>
+    </w:p>
+    <w:p>
+      <w:pPr>
+        <w:spacing w:before="6" w:after="150"/>
+        <w:jc w:val="center"/>
+      </w:pPr>
+      <w:r>
+        <w:rPr>
+          <w:i/>
+          <w:iCs/>
+          <w:color w:val="5B6678"/>
+          <w:sz w:val="18"/>
+          <w:szCs w:val="18"/>
+        </w:rPr>
+        <w:t>Figura 16. Mi suscripción. Fuente: del autor.</w:t>
+      </w:r>
+    </w:p>
+    <w:p>
+      <w:pPr>
+        <w:pStyle w:val="Ttulo1"/>
+        <w:pageBreakBefore/>
+        <w:spacing w:before="220" w:after="110"/>
+      </w:pPr>
+      <w:bookmarkStart w:id="33" w:name="bm34"/>
+      <w:r>
+        <w:rPr>
+          <w:b/>
+          <w:bCs/>
+          <w:color w:val="1F3864"/>
+          <w:sz w:val="27"/>
+          <w:szCs w:val="27"/>
+        </w:rPr>
+        <w:lastRenderedPageBreak/>
+        <w:t>9. Mensajes y estados de pantalla</w:t>
+      </w:r>
+      <w:bookmarkEnd w:id="33"/>
+    </w:p>
+    <w:p>
+      <w:pPr>
+        <w:spacing w:after="110" w:line="262" w:lineRule="auto"/>
+        <w:jc w:val="both"/>
+      </w:pPr>
+      <w:r>
+        <w:t>Además de los componentes descritos en la sección 6, la interfaz define cómo se comporta una pantalla cuando no hay información que mostrar, cuando los datos aún se están cargando o cuando una operación falla. El objetivo es que el usuario siempre sepa qué ocurre y qué puede hacer a continuación.</w:t>
+      </w:r>
+    </w:p>
+    <w:p>
+      <w:pPr>
+        <w:spacing w:before="60" w:after="20"/>
+        <w:jc w:val="center"/>
+      </w:pPr>
+      <w:r>
+        <w:rPr>
+          <w:noProof/>
+        </w:rPr>
+        <w:drawing>
+          <wp:inline distT="0" distB="0" distL="0" distR="0" wp14:anchorId="610FA0A1" wp14:editId="2F92396D">
+            <wp:extent cx="6096000" cy="2324100"/>
+            <wp:effectExtent l="0" t="0" r="0" b="0"/>
+            <wp:docPr id="1741880689" name="Imagen 1741880689"/>
+            <wp:cNvGraphicFramePr>
+              <a:graphicFrameLocks xmlns:a="http://schemas.openxmlformats.org/drawingml/2006/main" noChangeAspect="1"/>
+            </wp:cNvGraphicFramePr>
+            <a:graphic xmlns:a="http://schemas.openxmlformats.org/drawingml/2006/main">
+              <a:graphicData uri="http://schemas.openxmlformats.org/drawingml/2006/picture">
+                <pic:pic xmlns:pic="http://schemas.openxmlformats.org/drawingml/2006/picture">
+                  <pic:nvPicPr>
+                    <pic:cNvPr id="0" name=""/>
+                    <pic:cNvPicPr>
+                      <a:picLocks noChangeAspect="1" noChangeArrowheads="1"/>
+                    </pic:cNvPicPr>
+                  </pic:nvPicPr>
+                  <pic:blipFill>
+                    <a:blip r:embed="rId23"/>
+                    <a:srcRect/>
+                    <a:stretch>
+                      <a:fillRect/>
+                    </a:stretch>
+                  </pic:blipFill>
+                  <pic:spPr bwMode="auto">
+                    <a:xfrm>
+                      <a:off x="0" y="0"/>
                       <a:ext cx="6096000" cy="2324100"/>
                     </a:xfrm>
                     <a:prstGeom prst="rect">
@@ -9974,7 +10492,7 @@
           <w:sz w:val="18"/>
           <w:szCs w:val="18"/>
         </w:rPr>
-        <w:t>Figura 16. Mensajes del sistema y estado vacío. Fuente: del autor.</w:t>
+        <w:t>Figura 17. Mensajes del sistema y estado vacío. Fuente: del autor.</w:t>
       </w:r>
     </w:p>
     <w:p>
@@ -9982,7 +10500,7 @@
         <w:pStyle w:val="Ttulo2"/>
         <w:spacing w:before="150" w:after="80"/>
       </w:pPr>
-      <w:bookmarkStart w:id="33" w:name="bm34"/>
+      <w:bookmarkStart w:id="34" w:name="bm35"/>
       <w:r>
         <w:rPr>
           <w:b/>
@@ -9993,7 +10511,7 @@
         </w:rPr>
         <w:t>9.1 Estados de una pantalla</w:t>
       </w:r>
-      <w:bookmarkEnd w:id="33"/>
+      <w:bookmarkEnd w:id="34"/>
     </w:p>
     <w:tbl>
       <w:tblPr>
@@ -10019,6 +10537,12 @@
         <w:gridCol w:w="4460"/>
       </w:tblGrid>
       <w:tr>
+        <w:tblPrEx>
+          <w:tblCellMar>
+            <w:top w:w="0" w:type="dxa"/>
+            <w:bottom w:w="0" w:type="dxa"/>
+          </w:tblCellMar>
+        </w:tblPrEx>
         <w:trPr>
           <w:tblHeader/>
         </w:trPr>
@@ -10105,6 +10629,12 @@
         </w:tc>
       </w:tr>
       <w:tr>
+        <w:tblPrEx>
+          <w:tblCellMar>
+            <w:top w:w="0" w:type="dxa"/>
+            <w:bottom w:w="0" w:type="dxa"/>
+          </w:tblCellMar>
+        </w:tblPrEx>
         <w:tc>
           <w:tcPr>
             <w:tcW w:w="1700" w:type="dxa"/>
@@ -10179,6 +10709,12 @@
         </w:tc>
       </w:tr>
       <w:tr>
+        <w:tblPrEx>
+          <w:tblCellMar>
+            <w:top w:w="0" w:type="dxa"/>
+            <w:bottom w:w="0" w:type="dxa"/>
+          </w:tblCellMar>
+        </w:tblPrEx>
         <w:tc>
           <w:tcPr>
             <w:tcW w:w="1700" w:type="dxa"/>
@@ -10253,6 +10789,12 @@
         </w:tc>
       </w:tr>
       <w:tr>
+        <w:tblPrEx>
+          <w:tblCellMar>
+            <w:top w:w="0" w:type="dxa"/>
+            <w:bottom w:w="0" w:type="dxa"/>
+          </w:tblCellMar>
+        </w:tblPrEx>
         <w:tc>
           <w:tcPr>
             <w:tcW w:w="1700" w:type="dxa"/>
@@ -10327,6 +10869,12 @@
         </w:tc>
       </w:tr>
       <w:tr>
+        <w:tblPrEx>
+          <w:tblCellMar>
+            <w:top w:w="0" w:type="dxa"/>
+            <w:bottom w:w="0" w:type="dxa"/>
+          </w:tblCellMar>
+        </w:tblPrEx>
         <w:tc>
           <w:tcPr>
             <w:tcW w:w="1700" w:type="dxa"/>
@@ -10401,6 +10949,12 @@
         </w:tc>
       </w:tr>
       <w:tr>
+        <w:tblPrEx>
+          <w:tblCellMar>
+            <w:top w:w="0" w:type="dxa"/>
+            <w:bottom w:w="0" w:type="dxa"/>
+          </w:tblCellMar>
+        </w:tblPrEx>
         <w:tc>
           <w:tcPr>
             <w:tcW w:w="1700" w:type="dxa"/>
@@ -10475,6 +11029,12 @@
         </w:tc>
       </w:tr>
       <w:tr>
+        <w:tblPrEx>
+          <w:tblCellMar>
+            <w:top w:w="0" w:type="dxa"/>
+            <w:bottom w:w="0" w:type="dxa"/>
+          </w:tblCellMar>
+        </w:tblPrEx>
         <w:tc>
           <w:tcPr>
             <w:tcW w:w="1700" w:type="dxa"/>
@@ -10554,7 +11114,7 @@
         <w:pStyle w:val="Ttulo2"/>
         <w:spacing w:before="150" w:after="80"/>
       </w:pPr>
-      <w:bookmarkStart w:id="34" w:name="bm35"/>
+      <w:bookmarkStart w:id="35" w:name="bm36"/>
       <w:r>
         <w:rPr>
           <w:b/>
@@ -10565,7 +11125,7 @@
         </w:rPr>
         <w:t>9.2 Redacción de los mensajes</w:t>
       </w:r>
-      <w:bookmarkEnd w:id="34"/>
+      <w:bookmarkEnd w:id="35"/>
     </w:p>
     <w:p>
       <w:pPr>
@@ -10647,7 +11207,7 @@
         <w:pageBreakBefore/>
         <w:spacing w:before="220" w:after="110"/>
       </w:pPr>
-      <w:bookmarkStart w:id="35" w:name="bm36"/>
+      <w:bookmarkStart w:id="36" w:name="bm37"/>
       <w:r>
         <w:rPr>
           <w:b/>
@@ -10659,7 +11219,7 @@
         <w:lastRenderedPageBreak/>
         <w:t>10. Comportamiento responsivo y modo oscuro</w:t>
       </w:r>
-      <w:bookmarkEnd w:id="35"/>
+      <w:bookmarkEnd w:id="36"/>
     </w:p>
     <w:p>
       <w:pPr>
@@ -10675,7 +11235,7 @@
         <w:pStyle w:val="Ttulo2"/>
         <w:spacing w:before="150" w:after="80"/>
       </w:pPr>
-      <w:bookmarkStart w:id="36" w:name="bm37"/>
+      <w:bookmarkStart w:id="37" w:name="bm38"/>
       <w:r>
         <w:rPr>
           <w:b/>
@@ -10686,7 +11246,7 @@
         </w:rPr>
         <w:t>10.1 Versión móvil</w:t>
       </w:r>
-      <w:bookmarkEnd w:id="36"/>
+      <w:bookmarkEnd w:id="37"/>
     </w:p>
     <w:p>
       <w:pPr>
@@ -10746,130 +11306,10 @@
           <w:noProof/>
         </w:rPr>
         <w:drawing>
-          <wp:inline distT="0" distB="0" distL="0" distR="0" wp14:anchorId="10B1BEEC" wp14:editId="0DF615A4">
+          <wp:inline distT="0" distB="0" distL="0" distR="0" wp14:anchorId="17B1C485" wp14:editId="19CCE574">
             <wp:extent cx="6096000" cy="3295650"/>
             <wp:effectExtent l="0" t="0" r="0" b="0"/>
-            <wp:docPr id="636021871" name="Imagen 636021871"/>
-            <wp:cNvGraphicFramePr>
-              <a:graphicFrameLocks xmlns:a="http://schemas.openxmlformats.org/drawingml/2006/main" noChangeAspect="1"/>
-            </wp:cNvGraphicFramePr>
-            <a:graphic xmlns:a="http://schemas.openxmlformats.org/drawingml/2006/main">
-              <a:graphicData uri="http://schemas.openxmlformats.org/drawingml/2006/picture">
-                <pic:pic xmlns:pic="http://schemas.openxmlformats.org/drawingml/2006/picture">
-                  <pic:nvPicPr>
-                    <pic:cNvPr id="0" name=""/>
-                    <pic:cNvPicPr>
-                      <a:picLocks noChangeAspect="1" noChangeArrowheads="1"/>
-                    </pic:cNvPicPr>
-                  </pic:nvPicPr>
-                  <pic:blipFill>
-                    <a:blip r:embed="rId23"/>
-                    <a:srcRect/>
-                    <a:stretch>
-                      <a:fillRect/>
-                    </a:stretch>
-                  </pic:blipFill>
-                  <pic:spPr bwMode="auto">
-                    <a:xfrm>
-                      <a:off x="0" y="0"/>
-                      <a:ext cx="6096000" cy="3295650"/>
-                    </a:xfrm>
-                    <a:prstGeom prst="rect">
-                      <a:avLst/>
-                    </a:prstGeom>
-                  </pic:spPr>
-                </pic:pic>
-              </a:graphicData>
-            </a:graphic>
-          </wp:inline>
-        </w:drawing>
-      </w:r>
-    </w:p>
-    <w:p>
-      <w:pPr>
-        <w:spacing w:before="6" w:after="150"/>
-        <w:jc w:val="center"/>
-      </w:pPr>
-      <w:r>
-        <w:rPr>
-          <w:i/>
-          <w:iCs/>
-          <w:color w:val="5B6678"/>
-          <w:sz w:val="18"/>
-          <w:szCs w:val="18"/>
-        </w:rPr>
-        <w:t>Figura 17. Versión móvil: inicio de sesión, panel y punto de venta. Fuente: del autor.</w:t>
-      </w:r>
-    </w:p>
-    <w:p>
-      <w:pPr>
-        <w:pStyle w:val="Ttulo2"/>
-        <w:spacing w:before="150" w:after="80"/>
-      </w:pPr>
-      <w:bookmarkStart w:id="37" w:name="bm38"/>
-      <w:r>
-        <w:rPr>
-          <w:b/>
-          <w:bCs/>
-          <w:color w:val="2E5496"/>
-          <w:sz w:val="23"/>
-          <w:szCs w:val="23"/>
-        </w:rPr>
-        <w:t>10.2 Tablet y escritorio</w:t>
-      </w:r>
-      <w:bookmarkEnd w:id="37"/>
-    </w:p>
-    <w:p>
-      <w:pPr>
-        <w:spacing w:after="110" w:line="262" w:lineRule="auto"/>
-        <w:jc w:val="both"/>
-      </w:pPr>
-      <w:r>
-        <w:t>En tablet el contenido se organiza en dos columnas y la navegación lateral puede contraerse para dejar más espacio al contenido. En escritorio se emplea la rejilla completa, con la navegación lateral fija y los paneles de apoyo a la derecha del contenido principal, como ocurre en el punto de venta.</w:t>
-      </w:r>
-    </w:p>
-    <w:p>
-      <w:pPr>
-        <w:pStyle w:val="Ttulo2"/>
-        <w:spacing w:before="150" w:after="80"/>
-      </w:pPr>
-      <w:bookmarkStart w:id="38" w:name="bm39"/>
-      <w:r>
-        <w:rPr>
-          <w:b/>
-          <w:bCs/>
-          <w:color w:val="2E5496"/>
-          <w:sz w:val="23"/>
-          <w:szCs w:val="23"/>
-        </w:rPr>
-        <w:t>10.3 Modo oscuro</w:t>
-      </w:r>
-      <w:bookmarkEnd w:id="38"/>
-    </w:p>
-    <w:p>
-      <w:pPr>
-        <w:spacing w:after="110" w:line="262" w:lineRule="auto"/>
-        <w:jc w:val="both"/>
-      </w:pPr>
-      <w:r>
-        <w:t>El modo oscuro utiliza la variante de paleta definida en la sección 4.2 y conserva la misma estructura, la misma jerarquía y los mismos componentes del modo claro. Cambian únicamente los colores de fondo, superficie, borde y texto, y se ajustan los tonos de las etiquetas de estado para mantener el contraste. La elección del modo es del usuario y se conserva entre sesiones. El cambio se hace desde la parte inferior del menú lateral y, en las pantallas de acceso, desde el panel de marca, de modo que también pueda elegirlo quien todavía no ha entrado. Mientras el usuario no elija, se aplica la preferencia del sistema operativo.</w:t>
-      </w:r>
-    </w:p>
-    <w:p>
-      <w:pPr>
-        <w:spacing w:before="60" w:after="20"/>
-        <w:jc w:val="center"/>
-      </w:pPr>
-      <w:r>
-        <w:rPr>
-          <w:noProof/>
-        </w:rPr>
-        <w:lastRenderedPageBreak/>
-        <w:drawing>
-          <wp:inline distT="0" distB="0" distL="0" distR="0" wp14:anchorId="34A8E702" wp14:editId="4EB2F491">
-            <wp:extent cx="6096000" cy="3067050"/>
-            <wp:effectExtent l="0" t="0" r="0" b="0"/>
-            <wp:docPr id="724953491" name="Imagen 724953491"/>
+            <wp:docPr id="1388362268" name="Imagen 1388362268"/>
             <wp:cNvGraphicFramePr>
               <a:graphicFrameLocks xmlns:a="http://schemas.openxmlformats.org/drawingml/2006/main" noChangeAspect="1"/>
             </wp:cNvGraphicFramePr>
@@ -10892,6 +11332,126 @@
                   <pic:spPr bwMode="auto">
                     <a:xfrm>
                       <a:off x="0" y="0"/>
+                      <a:ext cx="6096000" cy="3295650"/>
+                    </a:xfrm>
+                    <a:prstGeom prst="rect">
+                      <a:avLst/>
+                    </a:prstGeom>
+                  </pic:spPr>
+                </pic:pic>
+              </a:graphicData>
+            </a:graphic>
+          </wp:inline>
+        </w:drawing>
+      </w:r>
+    </w:p>
+    <w:p>
+      <w:pPr>
+        <w:spacing w:before="6" w:after="150"/>
+        <w:jc w:val="center"/>
+      </w:pPr>
+      <w:r>
+        <w:rPr>
+          <w:i/>
+          <w:iCs/>
+          <w:color w:val="5B6678"/>
+          <w:sz w:val="18"/>
+          <w:szCs w:val="18"/>
+        </w:rPr>
+        <w:t>Figura 18. Versión móvil: inicio de sesión, panel y punto de venta. Fuente: del autor.</w:t>
+      </w:r>
+    </w:p>
+    <w:p>
+      <w:pPr>
+        <w:pStyle w:val="Ttulo2"/>
+        <w:spacing w:before="150" w:after="80"/>
+      </w:pPr>
+      <w:bookmarkStart w:id="38" w:name="bm39"/>
+      <w:r>
+        <w:rPr>
+          <w:b/>
+          <w:bCs/>
+          <w:color w:val="2E5496"/>
+          <w:sz w:val="23"/>
+          <w:szCs w:val="23"/>
+        </w:rPr>
+        <w:t>10.2 Tablet y escritorio</w:t>
+      </w:r>
+      <w:bookmarkEnd w:id="38"/>
+    </w:p>
+    <w:p>
+      <w:pPr>
+        <w:spacing w:after="110" w:line="262" w:lineRule="auto"/>
+        <w:jc w:val="both"/>
+      </w:pPr>
+      <w:r>
+        <w:t>En tablet el contenido se organiza en dos columnas y la navegación lateral puede contraerse para dejar más espacio al contenido. En escritorio se emplea la rejilla completa, con la navegación lateral fija y los paneles de apoyo a la derecha del contenido principal, como ocurre en el punto de venta.</w:t>
+      </w:r>
+    </w:p>
+    <w:p>
+      <w:pPr>
+        <w:pStyle w:val="Ttulo2"/>
+        <w:spacing w:before="150" w:after="80"/>
+      </w:pPr>
+      <w:bookmarkStart w:id="39" w:name="bm40"/>
+      <w:r>
+        <w:rPr>
+          <w:b/>
+          <w:bCs/>
+          <w:color w:val="2E5496"/>
+          <w:sz w:val="23"/>
+          <w:szCs w:val="23"/>
+        </w:rPr>
+        <w:t>10.3 Modo oscuro</w:t>
+      </w:r>
+      <w:bookmarkEnd w:id="39"/>
+    </w:p>
+    <w:p>
+      <w:pPr>
+        <w:spacing w:after="110" w:line="262" w:lineRule="auto"/>
+        <w:jc w:val="both"/>
+      </w:pPr>
+      <w:r>
+        <w:t>El modo oscuro utiliza la variante de paleta definida en la sección 4.2 y conserva la misma estructura, la misma jerarquía y los mismos componentes del modo claro. Cambian únicamente los colores de fondo, superficie, borde y texto, y se ajustan los tonos de las etiquetas de estado para mantener el contraste. La elección del modo es del usuario y se conserva entre sesiones. El cambio se hace desde la parte inferior del menú lateral y, en las pantallas de acceso, desde el panel de marca, de modo que también pueda elegirlo quien todavía no ha entrado. Mientras el usuario no elija, se aplica la preferencia del sistema operativo.</w:t>
+      </w:r>
+    </w:p>
+    <w:p>
+      <w:pPr>
+        <w:spacing w:before="60" w:after="20"/>
+        <w:jc w:val="center"/>
+      </w:pPr>
+      <w:r>
+        <w:rPr>
+          <w:noProof/>
+        </w:rPr>
+        <w:lastRenderedPageBreak/>
+        <w:drawing>
+          <wp:inline distT="0" distB="0" distL="0" distR="0" wp14:anchorId="648B6363" wp14:editId="5270BB69">
+            <wp:extent cx="6096000" cy="3067050"/>
+            <wp:effectExtent l="0" t="0" r="0" b="0"/>
+            <wp:docPr id="253484830" name="Imagen 253484830"/>
+            <wp:cNvGraphicFramePr>
+              <a:graphicFrameLocks xmlns:a="http://schemas.openxmlformats.org/drawingml/2006/main" noChangeAspect="1"/>
+            </wp:cNvGraphicFramePr>
+            <a:graphic xmlns:a="http://schemas.openxmlformats.org/drawingml/2006/main">
+              <a:graphicData uri="http://schemas.openxmlformats.org/drawingml/2006/picture">
+                <pic:pic xmlns:pic="http://schemas.openxmlformats.org/drawingml/2006/picture">
+                  <pic:nvPicPr>
+                    <pic:cNvPr id="0" name=""/>
+                    <pic:cNvPicPr>
+                      <a:picLocks noChangeAspect="1" noChangeArrowheads="1"/>
+                    </pic:cNvPicPr>
+                  </pic:nvPicPr>
+                  <pic:blipFill>
+                    <a:blip r:embed="rId25"/>
+                    <a:srcRect/>
+                    <a:stretch>
+                      <a:fillRect/>
+                    </a:stretch>
+                  </pic:blipFill>
+                  <pic:spPr bwMode="auto">
+                    <a:xfrm>
+                      <a:off x="0" y="0"/>
                       <a:ext cx="6096000" cy="3067050"/>
                     </a:xfrm>
                     <a:prstGeom prst="rect">
@@ -10918,7 +11478,7 @@
           <w:sz w:val="18"/>
           <w:szCs w:val="18"/>
         </w:rPr>
-        <w:t>Figura 18. Panel principal en modo oscuro. Fuente: del autor.</w:t>
+        <w:t>Figura 19. Panel principal en modo oscuro. Fuente: del autor.</w:t>
       </w:r>
     </w:p>
     <w:p>
@@ -10927,7 +11487,7 @@
         <w:pageBreakBefore/>
         <w:spacing w:before="220" w:after="110"/>
       </w:pPr>
-      <w:bookmarkStart w:id="39" w:name="bm40"/>
+      <w:bookmarkStart w:id="40" w:name="bm41"/>
       <w:r>
         <w:rPr>
           <w:b/>
@@ -10939,7 +11499,7 @@
         <w:lastRenderedPageBreak/>
         <w:t>11. Conclusión</w:t>
       </w:r>
-      <w:bookmarkEnd w:id="39"/>
+      <w:bookmarkEnd w:id="40"/>
     </w:p>
     <w:p>
       <w:pPr>
@@ -10965,7 +11525,7 @@
         <w:pageBreakBefore/>
         <w:spacing w:before="220" w:after="110"/>
       </w:pPr>
-      <w:bookmarkStart w:id="40" w:name="bm41"/>
+      <w:bookmarkStart w:id="41" w:name="bm42"/>
       <w:r>
         <w:rPr>
           <w:b/>
@@ -10977,7 +11537,7 @@
         <w:lastRenderedPageBreak/>
         <w:t>12. Glosario</w:t>
       </w:r>
-      <w:bookmarkEnd w:id="40"/>
+      <w:bookmarkEnd w:id="41"/>
     </w:p>
     <w:tbl>
       <w:tblPr>
@@ -11002,6 +11562,12 @@
         <w:gridCol w:w="7260"/>
       </w:tblGrid>
       <w:tr>
+        <w:tblPrEx>
+          <w:tblCellMar>
+            <w:top w:w="0" w:type="dxa"/>
+            <w:bottom w:w="0" w:type="dxa"/>
+          </w:tblCellMar>
+        </w:tblPrEx>
         <w:trPr>
           <w:tblHeader/>
         </w:trPr>
@@ -11061,6 +11627,12 @@
         </w:tc>
       </w:tr>
       <w:tr>
+        <w:tblPrEx>
+          <w:tblCellMar>
+            <w:top w:w="0" w:type="dxa"/>
+            <w:bottom w:w="0" w:type="dxa"/>
+          </w:tblCellMar>
+        </w:tblPrEx>
         <w:tc>
           <w:tcPr>
             <w:tcW w:w="2100" w:type="dxa"/>
@@ -11111,6 +11683,12 @@
         </w:tc>
       </w:tr>
       <w:tr>
+        <w:tblPrEx>
+          <w:tblCellMar>
+            <w:top w:w="0" w:type="dxa"/>
+            <w:bottom w:w="0" w:type="dxa"/>
+          </w:tblCellMar>
+        </w:tblPrEx>
         <w:tc>
           <w:tcPr>
             <w:tcW w:w="2100" w:type="dxa"/>
@@ -11161,6 +11739,12 @@
         </w:tc>
       </w:tr>
       <w:tr>
+        <w:tblPrEx>
+          <w:tblCellMar>
+            <w:top w:w="0" w:type="dxa"/>
+            <w:bottom w:w="0" w:type="dxa"/>
+          </w:tblCellMar>
+        </w:tblPrEx>
         <w:tc>
           <w:tcPr>
             <w:tcW w:w="2100" w:type="dxa"/>
@@ -11211,6 +11795,12 @@
         </w:tc>
       </w:tr>
       <w:tr>
+        <w:tblPrEx>
+          <w:tblCellMar>
+            <w:top w:w="0" w:type="dxa"/>
+            <w:bottom w:w="0" w:type="dxa"/>
+          </w:tblCellMar>
+        </w:tblPrEx>
         <w:tc>
           <w:tcPr>
             <w:tcW w:w="2100" w:type="dxa"/>
@@ -11261,6 +11851,12 @@
         </w:tc>
       </w:tr>
       <w:tr>
+        <w:tblPrEx>
+          <w:tblCellMar>
+            <w:top w:w="0" w:type="dxa"/>
+            <w:bottom w:w="0" w:type="dxa"/>
+          </w:tblCellMar>
+        </w:tblPrEx>
         <w:tc>
           <w:tcPr>
             <w:tcW w:w="2100" w:type="dxa"/>
@@ -11311,6 +11907,12 @@
         </w:tc>
       </w:tr>
       <w:tr>
+        <w:tblPrEx>
+          <w:tblCellMar>
+            <w:top w:w="0" w:type="dxa"/>
+            <w:bottom w:w="0" w:type="dxa"/>
+          </w:tblCellMar>
+        </w:tblPrEx>
         <w:tc>
           <w:tcPr>
             <w:tcW w:w="2100" w:type="dxa"/>
@@ -11361,6 +11963,12 @@
         </w:tc>
       </w:tr>
       <w:tr>
+        <w:tblPrEx>
+          <w:tblCellMar>
+            <w:top w:w="0" w:type="dxa"/>
+            <w:bottom w:w="0" w:type="dxa"/>
+          </w:tblCellMar>
+        </w:tblPrEx>
         <w:tc>
           <w:tcPr>
             <w:tcW w:w="2100" w:type="dxa"/>
@@ -11411,6 +12019,12 @@
         </w:tc>
       </w:tr>
       <w:tr>
+        <w:tblPrEx>
+          <w:tblCellMar>
+            <w:top w:w="0" w:type="dxa"/>
+            <w:bottom w:w="0" w:type="dxa"/>
+          </w:tblCellMar>
+        </w:tblPrEx>
         <w:tc>
           <w:tcPr>
             <w:tcW w:w="2100" w:type="dxa"/>
@@ -11461,6 +12075,12 @@
         </w:tc>
       </w:tr>
       <w:tr>
+        <w:tblPrEx>
+          <w:tblCellMar>
+            <w:top w:w="0" w:type="dxa"/>
+            <w:bottom w:w="0" w:type="dxa"/>
+          </w:tblCellMar>
+        </w:tblPrEx>
         <w:tc>
           <w:tcPr>
             <w:tcW w:w="2100" w:type="dxa"/>
@@ -11511,6 +12131,12 @@
         </w:tc>
       </w:tr>
       <w:tr>
+        <w:tblPrEx>
+          <w:tblCellMar>
+            <w:top w:w="0" w:type="dxa"/>
+            <w:bottom w:w="0" w:type="dxa"/>
+          </w:tblCellMar>
+        </w:tblPrEx>
         <w:tc>
           <w:tcPr>
             <w:tcW w:w="2100" w:type="dxa"/>
@@ -11561,6 +12187,12 @@
         </w:tc>
       </w:tr>
       <w:tr>
+        <w:tblPrEx>
+          <w:tblCellMar>
+            <w:top w:w="0" w:type="dxa"/>
+            <w:bottom w:w="0" w:type="dxa"/>
+          </w:tblCellMar>
+        </w:tblPrEx>
         <w:tc>
           <w:tcPr>
             <w:tcW w:w="2100" w:type="dxa"/>
@@ -11611,6 +12243,12 @@
         </w:tc>
       </w:tr>
       <w:tr>
+        <w:tblPrEx>
+          <w:tblCellMar>
+            <w:top w:w="0" w:type="dxa"/>
+            <w:bottom w:w="0" w:type="dxa"/>
+          </w:tblCellMar>
+        </w:tblPrEx>
         <w:tc>
           <w:tcPr>
             <w:tcW w:w="2100" w:type="dxa"/>
@@ -11661,6 +12299,12 @@
         </w:tc>
       </w:tr>
       <w:tr>
+        <w:tblPrEx>
+          <w:tblCellMar>
+            <w:top w:w="0" w:type="dxa"/>
+            <w:bottom w:w="0" w:type="dxa"/>
+          </w:tblCellMar>
+        </w:tblPrEx>
         <w:tc>
           <w:tcPr>
             <w:tcW w:w="2100" w:type="dxa"/>
@@ -11717,7 +12361,7 @@
         <w:pageBreakBefore/>
         <w:spacing w:before="220" w:after="110"/>
       </w:pPr>
-      <w:bookmarkStart w:id="41" w:name="bm42"/>
+      <w:bookmarkStart w:id="42" w:name="bm43"/>
       <w:r>
         <w:rPr>
           <w:b/>
@@ -11729,7 +12373,7 @@
         <w:lastRenderedPageBreak/>
         <w:t>13. Referencias</w:t>
       </w:r>
-      <w:bookmarkEnd w:id="41"/>
+      <w:bookmarkEnd w:id="42"/>
     </w:p>
     <w:p>
       <w:pPr>
@@ -11811,13 +12455,7 @@
         <w:spacing w:after="60" w:line="258" w:lineRule="auto"/>
       </w:pPr>
       <w:r>
-        <w:rPr>
-          <w:lang w:val="en-US"/>
-        </w:rPr>
-        <w:t xml:space="preserve">World Wide Web Consortium. Web Content Accessibility Guidelines (WCAG) 2.1. </w:t>
-      </w:r>
-      <w:r>
-        <w:t>W3C, 2018.</w:t>
+        <w:t>World Wide Web Consortium. Web Content Accessibility Guidelines (WCAG) 2.1. W3C, 2018.</w:t>
       </w:r>
     </w:p>
     <w:p>
@@ -11860,7 +12498,7 @@
       </w:r>
     </w:p>
     <w:sectPr>
-      <w:footerReference w:type="default" r:id="rId25"/>
+      <w:footerReference w:type="default" r:id="rId26"/>
       <w:pgSz w:w="12240" w:h="15840"/>
       <w:pgMar w:top="1080" w:right="1000" w:bottom="1080" w:left="1000" w:header="708" w:footer="708" w:gutter="0"/>
       <w:cols w:space="720"/>
@@ -11957,10 +12595,10 @@
 <file path=word/numbering.xml><?xml version="1.0" encoding="utf-8"?>
 <w:numbering xmlns:wpc="http://schemas.microsoft.com/office/word/2010/wordprocessingCanvas" xmlns:cx="http://schemas.microsoft.com/office/drawing/2014/chartex" xmlns:cx1="http://schemas.microsoft.com/office/drawing/2015/9/8/chartex" xmlns:cx2="http://schemas.microsoft.com/office/drawing/2015/10/21/chartex" xmlns:cx3="http://schemas.microsoft.com/office/drawing/2016/5/9/chartex" xmlns:cx4="http://schemas.microsoft.com/office/drawing/2016/5/10/chartex" xmlns:cx5="http://schemas.microsoft.com/office/drawing/2016/5/11/chartex" xmlns:cx6="http://schemas.microsoft.com/office/drawing/2016/5/12/chartex" xmlns:cx7="http://schemas.microsoft.com/office/drawing/2016/5/13/chartex" xmlns:cx8="http://schemas.microsoft.com/office/drawing/2016/5/14/chartex" xmlns:mc="http://schemas.openxmlformats.org/markup-compatibility/2006" xmlns:aink="http://schemas.microsoft.com/office/drawing/2016/ink" xmlns:am3d="http://schemas.microsoft.com/office/drawing/2017/model3d" xmlns:o="urn:schemas-microsoft-com:office:office" xmlns:oel="http://schemas.microsoft.com/office/2019/extlst" xmlns:r="http://schemas.openxmlformats.org/officeDocument/2006/relationships" xmlns:m="http://schemas.openxmlformats.org/officeDocument/2006/math" xmlns:v="urn:schemas-microsoft-com:vml" xmlns:wp14="http://schemas.microsoft.com/office/word/2010/wordprocessingDrawing" xmlns:wp="http://schemas.openxmlformats.org/drawingml/2006/wordprocessingDrawing" xmlns:w10="urn:schemas-microsoft-com:office:word" xmlns:w="http://schemas.openxmlformats.org/wordprocessingml/2006/main" xmlns:w14="http://schemas.microsoft.com/office/word/2010/wordml" xmlns:w15="http://schemas.microsoft.com/office/word/2012/wordml" xmlns:w16cex="http://schemas.microsoft.com/office/word/2018/wordml/cex" xmlns:w16cid="http://schemas.microsoft.com/office/word/2016/wordml/cid" xmlns:w16="http://schemas.microsoft.com/office/word/2018/wordml" xmlns:w16du="http://schemas.microsoft.com/office/word/2023/wordml/word16du" xmlns:w16sdtdh="http://schemas.microsoft.com/office/word/2020/wordml/sdtdatahash" xmlns:w16sdtfl="http://schemas.microsoft.com/office/word/2024/wordml/sdtformatlock" xmlns:w16se="http://schemas.microsoft.com/office/word/2015/wordml/symex" xmlns:wpg="http://schemas.microsoft.com/office/word/2010/wordprocessingGroup" xmlns:wpi="http://schemas.microsoft.com/office/word/2010/wordprocessingInk" xmlns:wne="http://schemas.microsoft.com/office/word/2006/wordml" xmlns:wps="http://schemas.microsoft.com/office/word/2010/wordprocessingShape" mc:Ignorable="w14 w15 w16se w16cid w16 w16cex w16sdtdh w16sdtfl w16du wp14">
   <w:abstractNum w:abstractNumId="0" w15:restartNumberingAfterBreak="0">
-    <w:nsid w:val="64D62F92"/>
+    <w:nsid w:val="6036307A"/>
     <w:multiLevelType w:val="hybridMultilevel"/>
-    <w:tmpl w:val="BD307480"/>
-    <w:lvl w:ilvl="0" w:tplc="D910B93C">
+    <w:tmpl w:val="17A697F0"/>
+    <w:lvl w:ilvl="0" w:tplc="765C2C60">
       <w:start w:val="1"/>
       <w:numFmt w:val="bullet"/>
       <w:lvlText w:val="●"/>
@@ -11969,7 +12607,7 @@
         <w:ind w:left="720" w:hanging="360"/>
       </w:pPr>
     </w:lvl>
-    <w:lvl w:ilvl="1" w:tplc="A8F698C4">
+    <w:lvl w:ilvl="1" w:tplc="B4E2F8A4">
       <w:start w:val="1"/>
       <w:numFmt w:val="bullet"/>
       <w:lvlText w:val="○"/>
@@ -11978,7 +12616,7 @@
         <w:ind w:left="1440" w:hanging="360"/>
       </w:pPr>
     </w:lvl>
-    <w:lvl w:ilvl="2" w:tplc="2432DD00">
+    <w:lvl w:ilvl="2" w:tplc="5F0226DA">
       <w:start w:val="1"/>
       <w:numFmt w:val="bullet"/>
       <w:lvlText w:val="■"/>
@@ -11987,7 +12625,7 @@
         <w:ind w:left="2160" w:hanging="360"/>
       </w:pPr>
     </w:lvl>
-    <w:lvl w:ilvl="3" w:tplc="C256EE26">
+    <w:lvl w:ilvl="3" w:tplc="020CE072">
       <w:start w:val="1"/>
       <w:numFmt w:val="bullet"/>
       <w:lvlText w:val="●"/>
@@ -11996,7 +12634,7 @@
         <w:ind w:left="2880" w:hanging="360"/>
       </w:pPr>
     </w:lvl>
-    <w:lvl w:ilvl="4" w:tplc="DCD8CE56">
+    <w:lvl w:ilvl="4" w:tplc="067E8986">
       <w:start w:val="1"/>
       <w:numFmt w:val="bullet"/>
       <w:lvlText w:val="○"/>
@@ -12005,7 +12643,7 @@
         <w:ind w:left="3600" w:hanging="360"/>
       </w:pPr>
     </w:lvl>
-    <w:lvl w:ilvl="5" w:tplc="3D60D904">
+    <w:lvl w:ilvl="5" w:tplc="4CD27822">
       <w:start w:val="1"/>
       <w:numFmt w:val="bullet"/>
       <w:lvlText w:val="■"/>
@@ -12014,7 +12652,7 @@
         <w:ind w:left="4320" w:hanging="360"/>
       </w:pPr>
     </w:lvl>
-    <w:lvl w:ilvl="6" w:tplc="0C6016E6">
+    <w:lvl w:ilvl="6" w:tplc="2774EF32">
       <w:start w:val="1"/>
       <w:numFmt w:val="bullet"/>
       <w:lvlText w:val="●"/>
@@ -12023,7 +12661,7 @@
         <w:ind w:left="5040" w:hanging="360"/>
       </w:pPr>
     </w:lvl>
-    <w:lvl w:ilvl="7" w:tplc="C65EAC92">
+    <w:lvl w:ilvl="7" w:tplc="017AF196">
       <w:start w:val="1"/>
       <w:numFmt w:val="bullet"/>
       <w:lvlText w:val="●"/>
@@ -12032,7 +12670,7 @@
         <w:ind w:left="5760" w:hanging="360"/>
       </w:pPr>
     </w:lvl>
-    <w:lvl w:ilvl="8" w:tplc="F21E1110">
+    <w:lvl w:ilvl="8" w:tplc="A6AC9EFE">
       <w:start w:val="1"/>
       <w:numFmt w:val="bullet"/>
       <w:lvlText w:val="●"/>
@@ -12042,7 +12680,7 @@
       </w:pPr>
     </w:lvl>
   </w:abstractNum>
-  <w:num w:numId="1" w16cid:durableId="715928869">
+  <w:num w:numId="1" w16cid:durableId="2062753550">
     <w:abstractNumId w:val="0"/>
     <w:lvlOverride w:ilvl="0">
       <w:startOverride w:val="1"/>

</xml_diff>

<commit_message>
Llevo la pantalla de plataforma al prototipo y al documento de diseno
</commit_message>
<xml_diff>
--- a/docs/diseno/INVENTRA_Documento_Tecnico_Diseno.docx
+++ b/docs/diseno/INVENTRA_Documento_Tecnico_Diseno.docx
@@ -154,12 +154,6 @@
         <w:gridCol w:w="3260"/>
       </w:tblGrid>
       <w:tr>
-        <w:tblPrEx>
-          <w:tblCellMar>
-            <w:top w:w="0" w:type="dxa"/>
-            <w:bottom w:w="0" w:type="dxa"/>
-          </w:tblCellMar>
-        </w:tblPrEx>
         <w:trPr>
           <w:tblHeader/>
         </w:trPr>
@@ -273,12 +267,6 @@
         </w:tc>
       </w:tr>
       <w:tr>
-        <w:tblPrEx>
-          <w:tblCellMar>
-            <w:top w:w="0" w:type="dxa"/>
-            <w:bottom w:w="0" w:type="dxa"/>
-          </w:tblCellMar>
-        </w:tblPrEx>
         <w:tc>
           <w:tcPr>
             <w:tcW w:w="1500" w:type="dxa"/>
@@ -1860,8 +1848,52 @@
           <w:tab w:val="right" w:leader="dot" w:pos="9200"/>
         </w:tabs>
         <w:spacing w:after="40" w:line="252" w:lineRule="auto"/>
+        <w:ind w:left="360"/>
       </w:pPr>
       <w:hyperlink w:anchor="bm34" w:history="1">
+        <w:r>
+          <w:rPr>
+            <w:color w:val="1F3864"/>
+            <w:sz w:val="20"/>
+            <w:szCs w:val="20"/>
+          </w:rPr>
+          <w:t>8.8 Plataforma</w:t>
+        </w:r>
+      </w:hyperlink>
+      <w:r>
+        <w:rPr>
+          <w:sz w:val="20"/>
+          <w:szCs w:val="20"/>
+        </w:rPr>
+        <w:tab/>
+      </w:r>
+      <w:r>
+        <w:fldChar w:fldCharType="begin"/>
+      </w:r>
+      <w:r>
+        <w:instrText>PAGEREF bm34</w:instrText>
+      </w:r>
+      <w:r>
+        <w:fldChar w:fldCharType="separate"/>
+      </w:r>
+      <w:r>
+        <w:rPr>
+          <w:noProof/>
+        </w:rPr>
+        <w:t>1</w:t>
+      </w:r>
+      <w:r>
+        <w:fldChar w:fldCharType="end"/>
+      </w:r>
+    </w:p>
+    <w:p>
+      <w:pPr>
+        <w:tabs>
+          <w:tab w:val="right" w:leader="dot" w:pos="9200"/>
+        </w:tabs>
+        <w:spacing w:after="40" w:line="252" w:lineRule="auto"/>
+      </w:pPr>
+      <w:hyperlink w:anchor="bm35" w:history="1">
         <w:r>
           <w:rPr>
             <w:b/>
@@ -1884,7 +1916,7 @@
         <w:fldChar w:fldCharType="begin"/>
       </w:r>
       <w:r>
-        <w:instrText>PAGEREF bm34</w:instrText>
+        <w:instrText>PAGEREF bm35</w:instrText>
       </w:r>
       <w:r>
         <w:fldChar w:fldCharType="separate"/>
@@ -1907,7 +1939,7 @@
         <w:spacing w:after="40" w:line="252" w:lineRule="auto"/>
         <w:ind w:left="360"/>
       </w:pPr>
-      <w:hyperlink w:anchor="bm35" w:history="1">
+      <w:hyperlink w:anchor="bm36" w:history="1">
         <w:r>
           <w:rPr>
             <w:color w:val="1F3864"/>
@@ -1928,7 +1960,7 @@
         <w:fldChar w:fldCharType="begin"/>
       </w:r>
       <w:r>
-        <w:instrText>PAGEREF bm35</w:instrText>
+        <w:instrText>PAGEREF bm36</w:instrText>
       </w:r>
       <w:r>
         <w:fldChar w:fldCharType="separate"/>
@@ -1951,7 +1983,7 @@
         <w:spacing w:after="40" w:line="252" w:lineRule="auto"/>
         <w:ind w:left="360"/>
       </w:pPr>
-      <w:hyperlink w:anchor="bm36" w:history="1">
+      <w:hyperlink w:anchor="bm37" w:history="1">
         <w:r>
           <w:rPr>
             <w:color w:val="1F3864"/>
@@ -1972,7 +2004,7 @@
         <w:fldChar w:fldCharType="begin"/>
       </w:r>
       <w:r>
-        <w:instrText>PAGEREF bm36</w:instrText>
+        <w:instrText>PAGEREF bm37</w:instrText>
       </w:r>
       <w:r>
         <w:fldChar w:fldCharType="separate"/>
@@ -1994,7 +2026,7 @@
         </w:tabs>
         <w:spacing w:after="40" w:line="252" w:lineRule="auto"/>
       </w:pPr>
-      <w:hyperlink w:anchor="bm37" w:history="1">
+      <w:hyperlink w:anchor="bm38" w:history="1">
         <w:r>
           <w:rPr>
             <w:b/>
@@ -2017,7 +2049,7 @@
         <w:fldChar w:fldCharType="begin"/>
       </w:r>
       <w:r>
-        <w:instrText>PAGEREF bm37</w:instrText>
+        <w:instrText>PAGEREF bm38</w:instrText>
       </w:r>
       <w:r>
         <w:fldChar w:fldCharType="separate"/>
@@ -2040,7 +2072,7 @@
         <w:spacing w:after="40" w:line="252" w:lineRule="auto"/>
         <w:ind w:left="360"/>
       </w:pPr>
-      <w:hyperlink w:anchor="bm38" w:history="1">
+      <w:hyperlink w:anchor="bm39" w:history="1">
         <w:r>
           <w:rPr>
             <w:color w:val="1F3864"/>
@@ -2061,7 +2093,7 @@
         <w:fldChar w:fldCharType="begin"/>
       </w:r>
       <w:r>
-        <w:instrText>PAGEREF bm38</w:instrText>
+        <w:instrText>PAGEREF bm39</w:instrText>
       </w:r>
       <w:r>
         <w:fldChar w:fldCharType="separate"/>
@@ -2084,7 +2116,7 @@
         <w:spacing w:after="40" w:line="252" w:lineRule="auto"/>
         <w:ind w:left="360"/>
       </w:pPr>
-      <w:hyperlink w:anchor="bm39" w:history="1">
+      <w:hyperlink w:anchor="bm40" w:history="1">
         <w:r>
           <w:rPr>
             <w:color w:val="1F3864"/>
@@ -2105,7 +2137,7 @@
         <w:fldChar w:fldCharType="begin"/>
       </w:r>
       <w:r>
-        <w:instrText>PAGEREF bm39</w:instrText>
+        <w:instrText>PAGEREF bm40</w:instrText>
       </w:r>
       <w:r>
         <w:fldChar w:fldCharType="separate"/>
@@ -2128,7 +2160,7 @@
         <w:spacing w:after="40" w:line="252" w:lineRule="auto"/>
         <w:ind w:left="360"/>
       </w:pPr>
-      <w:hyperlink w:anchor="bm40" w:history="1">
+      <w:hyperlink w:anchor="bm41" w:history="1">
         <w:r>
           <w:rPr>
             <w:color w:val="1F3864"/>
@@ -2149,7 +2181,7 @@
         <w:fldChar w:fldCharType="begin"/>
       </w:r>
       <w:r>
-        <w:instrText>PAGEREF bm40</w:instrText>
+        <w:instrText>PAGEREF bm41</w:instrText>
       </w:r>
       <w:r>
         <w:fldChar w:fldCharType="separate"/>
@@ -2171,7 +2203,7 @@
         </w:tabs>
         <w:spacing w:after="40" w:line="252" w:lineRule="auto"/>
       </w:pPr>
-      <w:hyperlink w:anchor="bm41" w:history="1">
+      <w:hyperlink w:anchor="bm42" w:history="1">
         <w:r>
           <w:rPr>
             <w:b/>
@@ -2194,7 +2226,7 @@
         <w:fldChar w:fldCharType="begin"/>
       </w:r>
       <w:r>
-        <w:instrText>PAGEREF bm41</w:instrText>
+        <w:instrText>PAGEREF bm42</w:instrText>
       </w:r>
       <w:r>
         <w:fldChar w:fldCharType="separate"/>
@@ -2216,7 +2248,7 @@
         </w:tabs>
         <w:spacing w:after="40" w:line="252" w:lineRule="auto"/>
       </w:pPr>
-      <w:hyperlink w:anchor="bm42" w:history="1">
+      <w:hyperlink w:anchor="bm43" w:history="1">
         <w:r>
           <w:rPr>
             <w:b/>
@@ -2239,7 +2271,7 @@
         <w:fldChar w:fldCharType="begin"/>
       </w:r>
       <w:r>
-        <w:instrText>PAGEREF bm42</w:instrText>
+        <w:instrText>PAGEREF bm43</w:instrText>
       </w:r>
       <w:r>
         <w:fldChar w:fldCharType="separate"/>
@@ -2261,7 +2293,7 @@
         </w:tabs>
         <w:spacing w:after="40" w:line="252" w:lineRule="auto"/>
       </w:pPr>
-      <w:hyperlink w:anchor="bm43" w:history="1">
+      <w:hyperlink w:anchor="bm44" w:history="1">
         <w:r>
           <w:rPr>
             <w:b/>
@@ -2284,7 +2316,7 @@
         <w:fldChar w:fldCharType="begin"/>
       </w:r>
       <w:r>
-        <w:instrText>PAGEREF bm43</w:instrText>
+        <w:instrText>PAGEREF bm44</w:instrText>
       </w:r>
       <w:r>
         <w:fldChar w:fldCharType="separate"/>
@@ -2313,7 +2345,6 @@
           <w:sz w:val="27"/>
           <w:szCs w:val="27"/>
         </w:rPr>
-        <w:lastRenderedPageBreak/>
         <w:t>1. Introducción, objetivo y alcance</w:t>
       </w:r>
       <w:bookmarkEnd w:id="0"/>
@@ -2340,7 +2371,10 @@
         <w:t xml:space="preserve">Objetivo. </w:t>
       </w:r>
       <w:r>
-        <w:t>Establecer los lineamientos visuales y de interacción que orientan el desarrollo de la interfaz, de modo que las pantallas mantengan una apariencia y un comportamiento uniformes.</w:t>
+        <w:t>Establecer los lineamientos visuales y de interacción que orientan el desarrollo de la interfaz, de modo que las pantallas mantengan una apariencia y un comportamiento uniformes</w:t>
+      </w:r>
+      <w:r>
+        <w:t>.</w:t>
       </w:r>
     </w:p>
     <w:p>
@@ -2717,7 +2751,7 @@
           <w:noProof/>
         </w:rPr>
         <w:drawing>
-          <wp:inline distT="0" distB="0" distL="0" distR="0" wp14:anchorId="2EDAA709" wp14:editId="1546C456">
+          <wp:inline distT="0" distB="0" distL="0" distR="0" wp14:anchorId="44F40DD5" wp14:editId="61C38243">
             <wp:extent cx="5905500" cy="2324100"/>
             <wp:effectExtent l="0" t="0" r="0" b="0"/>
             <wp:docPr id="1" name="Imagen 1"/>
@@ -2800,10 +2834,10 @@
           <w:noProof/>
         </w:rPr>
         <w:drawing>
-          <wp:inline distT="0" distB="0" distL="0" distR="0" wp14:anchorId="56E6D655" wp14:editId="70B95278">
+          <wp:inline distT="0" distB="0" distL="0" distR="0" wp14:anchorId="24693509" wp14:editId="732454F0">
             <wp:extent cx="5334000" cy="2371725"/>
             <wp:effectExtent l="0" t="0" r="0" b="0"/>
-            <wp:docPr id="1161191268" name="Imagen 1161191268"/>
+            <wp:docPr id="589253631" name="Imagen 589253631"/>
             <wp:cNvGraphicFramePr>
               <a:graphicFrameLocks xmlns:a="http://schemas.openxmlformats.org/drawingml/2006/main" noChangeAspect="1"/>
             </wp:cNvGraphicFramePr>
@@ -2907,12 +2941,6 @@
         <w:gridCol w:w="4510"/>
       </w:tblGrid>
       <w:tr>
-        <w:tblPrEx>
-          <w:tblCellMar>
-            <w:top w:w="0" w:type="dxa"/>
-            <w:bottom w:w="0" w:type="dxa"/>
-          </w:tblCellMar>
-        </w:tblPrEx>
         <w:trPr>
           <w:tblHeader/>
         </w:trPr>
@@ -3026,12 +3054,6 @@
         </w:tc>
       </w:tr>
       <w:tr>
-        <w:tblPrEx>
-          <w:tblCellMar>
-            <w:top w:w="0" w:type="dxa"/>
-            <w:bottom w:w="0" w:type="dxa"/>
-          </w:tblCellMar>
-        </w:tblPrEx>
         <w:tc>
           <w:tcPr>
             <w:tcW w:w="1850" w:type="dxa"/>
@@ -3130,12 +3152,6 @@
         </w:tc>
       </w:tr>
       <w:tr>
-        <w:tblPrEx>
-          <w:tblCellMar>
-            <w:top w:w="0" w:type="dxa"/>
-            <w:bottom w:w="0" w:type="dxa"/>
-          </w:tblCellMar>
-        </w:tblPrEx>
         <w:tc>
           <w:tcPr>
             <w:tcW w:w="1850" w:type="dxa"/>
@@ -3235,12 +3251,6 @@
         </w:tc>
       </w:tr>
       <w:tr>
-        <w:tblPrEx>
-          <w:tblCellMar>
-            <w:top w:w="0" w:type="dxa"/>
-            <w:bottom w:w="0" w:type="dxa"/>
-          </w:tblCellMar>
-        </w:tblPrEx>
         <w:tc>
           <w:tcPr>
             <w:tcW w:w="1850" w:type="dxa"/>
@@ -3339,12 +3349,6 @@
         </w:tc>
       </w:tr>
       <w:tr>
-        <w:tblPrEx>
-          <w:tblCellMar>
-            <w:top w:w="0" w:type="dxa"/>
-            <w:bottom w:w="0" w:type="dxa"/>
-          </w:tblCellMar>
-        </w:tblPrEx>
         <w:tc>
           <w:tcPr>
             <w:tcW w:w="1850" w:type="dxa"/>
@@ -3443,12 +3447,6 @@
         </w:tc>
       </w:tr>
       <w:tr>
-        <w:tblPrEx>
-          <w:tblCellMar>
-            <w:top w:w="0" w:type="dxa"/>
-            <w:bottom w:w="0" w:type="dxa"/>
-          </w:tblCellMar>
-        </w:tblPrEx>
         <w:tc>
           <w:tcPr>
             <w:tcW w:w="1850" w:type="dxa"/>
@@ -3547,12 +3545,6 @@
         </w:tc>
       </w:tr>
       <w:tr>
-        <w:tblPrEx>
-          <w:tblCellMar>
-            <w:top w:w="0" w:type="dxa"/>
-            <w:bottom w:w="0" w:type="dxa"/>
-          </w:tblCellMar>
-        </w:tblPrEx>
         <w:tc>
           <w:tcPr>
             <w:tcW w:w="1850" w:type="dxa"/>
@@ -3651,12 +3643,6 @@
         </w:tc>
       </w:tr>
       <w:tr>
-        <w:tblPrEx>
-          <w:tblCellMar>
-            <w:top w:w="0" w:type="dxa"/>
-            <w:bottom w:w="0" w:type="dxa"/>
-          </w:tblCellMar>
-        </w:tblPrEx>
         <w:tc>
           <w:tcPr>
             <w:tcW w:w="1850" w:type="dxa"/>
@@ -3755,12 +3741,6 @@
         </w:tc>
       </w:tr>
       <w:tr>
-        <w:tblPrEx>
-          <w:tblCellMar>
-            <w:top w:w="0" w:type="dxa"/>
-            <w:bottom w:w="0" w:type="dxa"/>
-          </w:tblCellMar>
-        </w:tblPrEx>
         <w:tc>
           <w:tcPr>
             <w:tcW w:w="1850" w:type="dxa"/>
@@ -3859,12 +3839,6 @@
         </w:tc>
       </w:tr>
       <w:tr>
-        <w:tblPrEx>
-          <w:tblCellMar>
-            <w:top w:w="0" w:type="dxa"/>
-            <w:bottom w:w="0" w:type="dxa"/>
-          </w:tblCellMar>
-        </w:tblPrEx>
         <w:tc>
           <w:tcPr>
             <w:tcW w:w="1850" w:type="dxa"/>
@@ -3963,12 +3937,6 @@
         </w:tc>
       </w:tr>
       <w:tr>
-        <w:tblPrEx>
-          <w:tblCellMar>
-            <w:top w:w="0" w:type="dxa"/>
-            <w:bottom w:w="0" w:type="dxa"/>
-          </w:tblCellMar>
-        </w:tblPrEx>
         <w:tc>
           <w:tcPr>
             <w:tcW w:w="1850" w:type="dxa"/>
@@ -4067,12 +4035,6 @@
         </w:tc>
       </w:tr>
       <w:tr>
-        <w:tblPrEx>
-          <w:tblCellMar>
-            <w:top w:w="0" w:type="dxa"/>
-            <w:bottom w:w="0" w:type="dxa"/>
-          </w:tblCellMar>
-        </w:tblPrEx>
         <w:tc>
           <w:tcPr>
             <w:tcW w:w="1850" w:type="dxa"/>
@@ -4171,12 +4133,6 @@
         </w:tc>
       </w:tr>
       <w:tr>
-        <w:tblPrEx>
-          <w:tblCellMar>
-            <w:top w:w="0" w:type="dxa"/>
-            <w:bottom w:w="0" w:type="dxa"/>
-          </w:tblCellMar>
-        </w:tblPrEx>
         <w:tc>
           <w:tcPr>
             <w:tcW w:w="1850" w:type="dxa"/>
@@ -4275,12 +4231,6 @@
         </w:tc>
       </w:tr>
       <w:tr>
-        <w:tblPrEx>
-          <w:tblCellMar>
-            <w:top w:w="0" w:type="dxa"/>
-            <w:bottom w:w="0" w:type="dxa"/>
-          </w:tblCellMar>
-        </w:tblPrEx>
         <w:tc>
           <w:tcPr>
             <w:tcW w:w="1850" w:type="dxa"/>
@@ -4379,12 +4329,6 @@
         </w:tc>
       </w:tr>
       <w:tr>
-        <w:tblPrEx>
-          <w:tblCellMar>
-            <w:top w:w="0" w:type="dxa"/>
-            <w:bottom w:w="0" w:type="dxa"/>
-          </w:tblCellMar>
-        </w:tblPrEx>
         <w:tc>
           <w:tcPr>
             <w:tcW w:w="1850" w:type="dxa"/>
@@ -4483,12 +4427,6 @@
         </w:tc>
       </w:tr>
       <w:tr>
-        <w:tblPrEx>
-          <w:tblCellMar>
-            <w:top w:w="0" w:type="dxa"/>
-            <w:bottom w:w="0" w:type="dxa"/>
-          </w:tblCellMar>
-        </w:tblPrEx>
         <w:tc>
           <w:tcPr>
             <w:tcW w:w="1850" w:type="dxa"/>
@@ -4587,12 +4525,6 @@
         </w:tc>
       </w:tr>
       <w:tr>
-        <w:tblPrEx>
-          <w:tblCellMar>
-            <w:top w:w="0" w:type="dxa"/>
-            <w:bottom w:w="0" w:type="dxa"/>
-          </w:tblCellMar>
-        </w:tblPrEx>
         <w:tc>
           <w:tcPr>
             <w:tcW w:w="1850" w:type="dxa"/>
@@ -4691,12 +4623,6 @@
         </w:tc>
       </w:tr>
       <w:tr>
-        <w:tblPrEx>
-          <w:tblCellMar>
-            <w:top w:w="0" w:type="dxa"/>
-            <w:bottom w:w="0" w:type="dxa"/>
-          </w:tblCellMar>
-        </w:tblPrEx>
         <w:tc>
           <w:tcPr>
             <w:tcW w:w="1850" w:type="dxa"/>
@@ -4847,12 +4773,6 @@
         <w:gridCol w:w="3760"/>
       </w:tblGrid>
       <w:tr>
-        <w:tblPrEx>
-          <w:tblCellMar>
-            <w:top w:w="0" w:type="dxa"/>
-            <w:bottom w:w="0" w:type="dxa"/>
-          </w:tblCellMar>
-        </w:tblPrEx>
         <w:trPr>
           <w:tblHeader/>
         </w:trPr>
@@ -4966,12 +4886,6 @@
         </w:tc>
       </w:tr>
       <w:tr>
-        <w:tblPrEx>
-          <w:tblCellMar>
-            <w:top w:w="0" w:type="dxa"/>
-            <w:bottom w:w="0" w:type="dxa"/>
-          </w:tblCellMar>
-        </w:tblPrEx>
         <w:tc>
           <w:tcPr>
             <w:tcW w:w="2400" w:type="dxa"/>
@@ -5070,12 +4984,6 @@
         </w:tc>
       </w:tr>
       <w:tr>
-        <w:tblPrEx>
-          <w:tblCellMar>
-            <w:top w:w="0" w:type="dxa"/>
-            <w:bottom w:w="0" w:type="dxa"/>
-          </w:tblCellMar>
-        </w:tblPrEx>
         <w:tc>
           <w:tcPr>
             <w:tcW w:w="2400" w:type="dxa"/>
@@ -5174,12 +5082,6 @@
         </w:tc>
       </w:tr>
       <w:tr>
-        <w:tblPrEx>
-          <w:tblCellMar>
-            <w:top w:w="0" w:type="dxa"/>
-            <w:bottom w:w="0" w:type="dxa"/>
-          </w:tblCellMar>
-        </w:tblPrEx>
         <w:tc>
           <w:tcPr>
             <w:tcW w:w="2400" w:type="dxa"/>
@@ -5278,12 +5180,6 @@
         </w:tc>
       </w:tr>
       <w:tr>
-        <w:tblPrEx>
-          <w:tblCellMar>
-            <w:top w:w="0" w:type="dxa"/>
-            <w:bottom w:w="0" w:type="dxa"/>
-          </w:tblCellMar>
-        </w:tblPrEx>
         <w:tc>
           <w:tcPr>
             <w:tcW w:w="2400" w:type="dxa"/>
@@ -5382,12 +5278,6 @@
         </w:tc>
       </w:tr>
       <w:tr>
-        <w:tblPrEx>
-          <w:tblCellMar>
-            <w:top w:w="0" w:type="dxa"/>
-            <w:bottom w:w="0" w:type="dxa"/>
-          </w:tblCellMar>
-        </w:tblPrEx>
         <w:tc>
           <w:tcPr>
             <w:tcW w:w="2400" w:type="dxa"/>
@@ -5486,12 +5376,6 @@
         </w:tc>
       </w:tr>
       <w:tr>
-        <w:tblPrEx>
-          <w:tblCellMar>
-            <w:top w:w="0" w:type="dxa"/>
-            <w:bottom w:w="0" w:type="dxa"/>
-          </w:tblCellMar>
-        </w:tblPrEx>
         <w:tc>
           <w:tcPr>
             <w:tcW w:w="2400" w:type="dxa"/>
@@ -5696,12 +5580,6 @@
         <w:gridCol w:w="7160"/>
       </w:tblGrid>
       <w:tr>
-        <w:tblPrEx>
-          <w:tblCellMar>
-            <w:top w:w="0" w:type="dxa"/>
-            <w:bottom w:w="0" w:type="dxa"/>
-          </w:tblCellMar>
-        </w:tblPrEx>
         <w:trPr>
           <w:tblHeader/>
         </w:trPr>
@@ -5761,12 +5639,6 @@
         </w:tc>
       </w:tr>
       <w:tr>
-        <w:tblPrEx>
-          <w:tblCellMar>
-            <w:top w:w="0" w:type="dxa"/>
-            <w:bottom w:w="0" w:type="dxa"/>
-          </w:tblCellMar>
-        </w:tblPrEx>
         <w:tc>
           <w:tcPr>
             <w:tcW w:w="2200" w:type="dxa"/>
@@ -5817,12 +5689,6 @@
         </w:tc>
       </w:tr>
       <w:tr>
-        <w:tblPrEx>
-          <w:tblCellMar>
-            <w:top w:w="0" w:type="dxa"/>
-            <w:bottom w:w="0" w:type="dxa"/>
-          </w:tblCellMar>
-        </w:tblPrEx>
         <w:tc>
           <w:tcPr>
             <w:tcW w:w="2200" w:type="dxa"/>
@@ -5873,12 +5739,6 @@
         </w:tc>
       </w:tr>
       <w:tr>
-        <w:tblPrEx>
-          <w:tblCellMar>
-            <w:top w:w="0" w:type="dxa"/>
-            <w:bottom w:w="0" w:type="dxa"/>
-          </w:tblCellMar>
-        </w:tblPrEx>
         <w:tc>
           <w:tcPr>
             <w:tcW w:w="2200" w:type="dxa"/>
@@ -5929,12 +5789,6 @@
         </w:tc>
       </w:tr>
       <w:tr>
-        <w:tblPrEx>
-          <w:tblCellMar>
-            <w:top w:w="0" w:type="dxa"/>
-            <w:bottom w:w="0" w:type="dxa"/>
-          </w:tblCellMar>
-        </w:tblPrEx>
         <w:tc>
           <w:tcPr>
             <w:tcW w:w="2200" w:type="dxa"/>
@@ -6063,12 +5917,6 @@
         <w:gridCol w:w="4960"/>
       </w:tblGrid>
       <w:tr>
-        <w:tblPrEx>
-          <w:tblCellMar>
-            <w:top w:w="0" w:type="dxa"/>
-            <w:bottom w:w="0" w:type="dxa"/>
-          </w:tblCellMar>
-        </w:tblPrEx>
         <w:trPr>
           <w:tblHeader/>
         </w:trPr>
@@ -6155,12 +6003,6 @@
         </w:tc>
       </w:tr>
       <w:tr>
-        <w:tblPrEx>
-          <w:tblCellMar>
-            <w:top w:w="0" w:type="dxa"/>
-            <w:bottom w:w="0" w:type="dxa"/>
-          </w:tblCellMar>
-        </w:tblPrEx>
         <w:tc>
           <w:tcPr>
             <w:tcW w:w="2200" w:type="dxa"/>
@@ -6235,12 +6077,6 @@
         </w:tc>
       </w:tr>
       <w:tr>
-        <w:tblPrEx>
-          <w:tblCellMar>
-            <w:top w:w="0" w:type="dxa"/>
-            <w:bottom w:w="0" w:type="dxa"/>
-          </w:tblCellMar>
-        </w:tblPrEx>
         <w:tc>
           <w:tcPr>
             <w:tcW w:w="2200" w:type="dxa"/>
@@ -6315,12 +6151,6 @@
         </w:tc>
       </w:tr>
       <w:tr>
-        <w:tblPrEx>
-          <w:tblCellMar>
-            <w:top w:w="0" w:type="dxa"/>
-            <w:bottom w:w="0" w:type="dxa"/>
-          </w:tblCellMar>
-        </w:tblPrEx>
         <w:tc>
           <w:tcPr>
             <w:tcW w:w="2200" w:type="dxa"/>
@@ -6475,12 +6305,6 @@
         <w:gridCol w:w="3660"/>
       </w:tblGrid>
       <w:tr>
-        <w:tblPrEx>
-          <w:tblCellMar>
-            <w:top w:w="0" w:type="dxa"/>
-            <w:bottom w:w="0" w:type="dxa"/>
-          </w:tblCellMar>
-        </w:tblPrEx>
         <w:trPr>
           <w:tblHeader/>
         </w:trPr>
@@ -6567,12 +6391,6 @@
         </w:tc>
       </w:tr>
       <w:tr>
-        <w:tblPrEx>
-          <w:tblCellMar>
-            <w:top w:w="0" w:type="dxa"/>
-            <w:bottom w:w="0" w:type="dxa"/>
-          </w:tblCellMar>
-        </w:tblPrEx>
         <w:tc>
           <w:tcPr>
             <w:tcW w:w="1700" w:type="dxa"/>
@@ -6647,12 +6465,6 @@
         </w:tc>
       </w:tr>
       <w:tr>
-        <w:tblPrEx>
-          <w:tblCellMar>
-            <w:top w:w="0" w:type="dxa"/>
-            <w:bottom w:w="0" w:type="dxa"/>
-          </w:tblCellMar>
-        </w:tblPrEx>
         <w:tc>
           <w:tcPr>
             <w:tcW w:w="1700" w:type="dxa"/>
@@ -6727,12 +6539,6 @@
         </w:tc>
       </w:tr>
       <w:tr>
-        <w:tblPrEx>
-          <w:tblCellMar>
-            <w:top w:w="0" w:type="dxa"/>
-            <w:bottom w:w="0" w:type="dxa"/>
-          </w:tblCellMar>
-        </w:tblPrEx>
         <w:tc>
           <w:tcPr>
             <w:tcW w:w="1700" w:type="dxa"/>
@@ -6807,12 +6613,6 @@
         </w:tc>
       </w:tr>
       <w:tr>
-        <w:tblPrEx>
-          <w:tblCellMar>
-            <w:top w:w="0" w:type="dxa"/>
-            <w:bottom w:w="0" w:type="dxa"/>
-          </w:tblCellMar>
-        </w:tblPrEx>
         <w:tc>
           <w:tcPr>
             <w:tcW w:w="1700" w:type="dxa"/>
@@ -6887,12 +6687,6 @@
         </w:tc>
       </w:tr>
       <w:tr>
-        <w:tblPrEx>
-          <w:tblCellMar>
-            <w:top w:w="0" w:type="dxa"/>
-            <w:bottom w:w="0" w:type="dxa"/>
-          </w:tblCellMar>
-        </w:tblPrEx>
         <w:tc>
           <w:tcPr>
             <w:tcW w:w="1700" w:type="dxa"/>
@@ -6967,12 +6761,6 @@
         </w:tc>
       </w:tr>
       <w:tr>
-        <w:tblPrEx>
-          <w:tblCellMar>
-            <w:top w:w="0" w:type="dxa"/>
-            <w:bottom w:w="0" w:type="dxa"/>
-          </w:tblCellMar>
-        </w:tblPrEx>
         <w:tc>
           <w:tcPr>
             <w:tcW w:w="1700" w:type="dxa"/>
@@ -7047,12 +6835,6 @@
         </w:tc>
       </w:tr>
       <w:tr>
-        <w:tblPrEx>
-          <w:tblCellMar>
-            <w:top w:w="0" w:type="dxa"/>
-            <w:bottom w:w="0" w:type="dxa"/>
-          </w:tblCellMar>
-        </w:tblPrEx>
         <w:tc>
           <w:tcPr>
             <w:tcW w:w="1700" w:type="dxa"/>
@@ -7178,12 +6960,6 @@
         <w:gridCol w:w="3060"/>
       </w:tblGrid>
       <w:tr>
-        <w:tblPrEx>
-          <w:tblCellMar>
-            <w:top w:w="0" w:type="dxa"/>
-            <w:bottom w:w="0" w:type="dxa"/>
-          </w:tblCellMar>
-        </w:tblPrEx>
         <w:trPr>
           <w:tblHeader/>
         </w:trPr>
@@ -7270,12 +7046,6 @@
         </w:tc>
       </w:tr>
       <w:tr>
-        <w:tblPrEx>
-          <w:tblCellMar>
-            <w:top w:w="0" w:type="dxa"/>
-            <w:bottom w:w="0" w:type="dxa"/>
-          </w:tblCellMar>
-        </w:tblPrEx>
         <w:tc>
           <w:tcPr>
             <w:tcW w:w="1700" w:type="dxa"/>
@@ -7350,12 +7120,6 @@
         </w:tc>
       </w:tr>
       <w:tr>
-        <w:tblPrEx>
-          <w:tblCellMar>
-            <w:top w:w="0" w:type="dxa"/>
-            <w:bottom w:w="0" w:type="dxa"/>
-          </w:tblCellMar>
-        </w:tblPrEx>
         <w:tc>
           <w:tcPr>
             <w:tcW w:w="1700" w:type="dxa"/>
@@ -7430,12 +7194,6 @@
         </w:tc>
       </w:tr>
       <w:tr>
-        <w:tblPrEx>
-          <w:tblCellMar>
-            <w:top w:w="0" w:type="dxa"/>
-            <w:bottom w:w="0" w:type="dxa"/>
-          </w:tblCellMar>
-        </w:tblPrEx>
         <w:tc>
           <w:tcPr>
             <w:tcW w:w="1700" w:type="dxa"/>
@@ -7510,12 +7268,6 @@
         </w:tc>
       </w:tr>
       <w:tr>
-        <w:tblPrEx>
-          <w:tblCellMar>
-            <w:top w:w="0" w:type="dxa"/>
-            <w:bottom w:w="0" w:type="dxa"/>
-          </w:tblCellMar>
-        </w:tblPrEx>
         <w:tc>
           <w:tcPr>
             <w:tcW w:w="1700" w:type="dxa"/>
@@ -7610,10 +7362,10 @@
         </w:rPr>
         <w:lastRenderedPageBreak/>
         <w:drawing>
-          <wp:inline distT="0" distB="0" distL="0" distR="0" wp14:anchorId="109DAC66" wp14:editId="0BEB80A0">
+          <wp:inline distT="0" distB="0" distL="0" distR="0" wp14:anchorId="53DB5DA4" wp14:editId="21A4507F">
             <wp:extent cx="5905500" cy="2419350"/>
             <wp:effectExtent l="0" t="0" r="0" b="0"/>
-            <wp:docPr id="1497086497" name="Imagen 1497086497"/>
+            <wp:docPr id="1891884226" name="Imagen 1891884226"/>
             <wp:cNvGraphicFramePr>
               <a:graphicFrameLocks xmlns:a="http://schemas.openxmlformats.org/drawingml/2006/main" noChangeAspect="1"/>
             </wp:cNvGraphicFramePr>
@@ -7763,10 +7515,10 @@
           <w:noProof/>
         </w:rPr>
         <w:drawing>
-          <wp:inline distT="0" distB="0" distL="0" distR="0" wp14:anchorId="64B23D1C" wp14:editId="24DF43D9">
+          <wp:inline distT="0" distB="0" distL="0" distR="0" wp14:anchorId="37B0CB8A" wp14:editId="147D37D7">
             <wp:extent cx="5905500" cy="2257425"/>
             <wp:effectExtent l="0" t="0" r="0" b="0"/>
-            <wp:docPr id="349414791" name="Imagen 349414791"/>
+            <wp:docPr id="1155096988" name="Imagen 1155096988"/>
             <wp:cNvGraphicFramePr>
               <a:graphicFrameLocks xmlns:a="http://schemas.openxmlformats.org/drawingml/2006/main" noChangeAspect="1"/>
             </wp:cNvGraphicFramePr>
@@ -7959,12 +7711,6 @@
         <w:gridCol w:w="5360"/>
       </w:tblGrid>
       <w:tr>
-        <w:tblPrEx>
-          <w:tblCellMar>
-            <w:top w:w="0" w:type="dxa"/>
-            <w:bottom w:w="0" w:type="dxa"/>
-          </w:tblCellMar>
-        </w:tblPrEx>
         <w:trPr>
           <w:tblHeader/>
         </w:trPr>
@@ -8051,12 +7797,6 @@
         </w:tc>
       </w:tr>
       <w:tr>
-        <w:tblPrEx>
-          <w:tblCellMar>
-            <w:top w:w="0" w:type="dxa"/>
-            <w:bottom w:w="0" w:type="dxa"/>
-          </w:tblCellMar>
-        </w:tblPrEx>
         <w:tc>
           <w:tcPr>
             <w:tcW w:w="1700" w:type="dxa"/>
@@ -8131,12 +7871,6 @@
         </w:tc>
       </w:tr>
       <w:tr>
-        <w:tblPrEx>
-          <w:tblCellMar>
-            <w:top w:w="0" w:type="dxa"/>
-            <w:bottom w:w="0" w:type="dxa"/>
-          </w:tblCellMar>
-        </w:tblPrEx>
         <w:tc>
           <w:tcPr>
             <w:tcW w:w="1700" w:type="dxa"/>
@@ -8211,12 +7945,6 @@
         </w:tc>
       </w:tr>
       <w:tr>
-        <w:tblPrEx>
-          <w:tblCellMar>
-            <w:top w:w="0" w:type="dxa"/>
-            <w:bottom w:w="0" w:type="dxa"/>
-          </w:tblCellMar>
-        </w:tblPrEx>
         <w:tc>
           <w:tcPr>
             <w:tcW w:w="1700" w:type="dxa"/>
@@ -8291,12 +8019,6 @@
         </w:tc>
       </w:tr>
       <w:tr>
-        <w:tblPrEx>
-          <w:tblCellMar>
-            <w:top w:w="0" w:type="dxa"/>
-            <w:bottom w:w="0" w:type="dxa"/>
-          </w:tblCellMar>
-        </w:tblPrEx>
         <w:tc>
           <w:tcPr>
             <w:tcW w:w="1700" w:type="dxa"/>
@@ -8390,10 +8112,10 @@
           <w:noProof/>
         </w:rPr>
         <w:drawing>
-          <wp:inline distT="0" distB="0" distL="0" distR="0" wp14:anchorId="243AAC28" wp14:editId="79EB4994">
+          <wp:inline distT="0" distB="0" distL="0" distR="0" wp14:anchorId="22D3EA41" wp14:editId="36CE8D77">
             <wp:extent cx="5334000" cy="3381375"/>
             <wp:effectExtent l="0" t="0" r="0" b="0"/>
-            <wp:docPr id="1910381599" name="Imagen 1910381599"/>
+            <wp:docPr id="620766192" name="Imagen 620766192"/>
             <wp:cNvGraphicFramePr>
               <a:graphicFrameLocks xmlns:a="http://schemas.openxmlformats.org/drawingml/2006/main" noChangeAspect="1"/>
             </wp:cNvGraphicFramePr>
@@ -8543,10 +8265,10 @@
           <w:noProof/>
         </w:rPr>
         <w:drawing>
-          <wp:inline distT="0" distB="0" distL="0" distR="0" wp14:anchorId="5272A4CE" wp14:editId="13295E5C">
+          <wp:inline distT="0" distB="0" distL="0" distR="0" wp14:anchorId="2D15DD82" wp14:editId="3ADF7E72">
             <wp:extent cx="6096000" cy="1676400"/>
             <wp:effectExtent l="0" t="0" r="0" b="0"/>
-            <wp:docPr id="657125968" name="Imagen 657125968"/>
+            <wp:docPr id="243441305" name="Imagen 243441305"/>
             <wp:cNvGraphicFramePr>
               <a:graphicFrameLocks xmlns:a="http://schemas.openxmlformats.org/drawingml/2006/main" noChangeAspect="1"/>
             </wp:cNvGraphicFramePr>
@@ -8635,10 +8357,10 @@
           <w:noProof/>
         </w:rPr>
         <w:drawing>
-          <wp:inline distT="0" distB="0" distL="0" distR="0" wp14:anchorId="3515BC00" wp14:editId="1DDA17E8">
+          <wp:inline distT="0" distB="0" distL="0" distR="0" wp14:anchorId="2B02BA6D" wp14:editId="22B6A75D">
             <wp:extent cx="4762500" cy="2447925"/>
             <wp:effectExtent l="0" t="0" r="0" b="0"/>
-            <wp:docPr id="33631168" name="Imagen 33631168"/>
+            <wp:docPr id="1577479188" name="Imagen 1577479188"/>
             <wp:cNvGraphicFramePr>
               <a:graphicFrameLocks xmlns:a="http://schemas.openxmlformats.org/drawingml/2006/main" noChangeAspect="1"/>
             </wp:cNvGraphicFramePr>
@@ -8765,10 +8487,10 @@
           <w:noProof/>
         </w:rPr>
         <w:drawing>
-          <wp:inline distT="0" distB="0" distL="0" distR="0" wp14:anchorId="52D3D2D5" wp14:editId="234C0E05">
+          <wp:inline distT="0" distB="0" distL="0" distR="0" wp14:anchorId="543F645D" wp14:editId="1EFA2BDD">
             <wp:extent cx="6096000" cy="3048000"/>
             <wp:effectExtent l="0" t="0" r="0" b="0"/>
-            <wp:docPr id="1156282116" name="Imagen 1156282116"/>
+            <wp:docPr id="430750763" name="Imagen 430750763"/>
             <wp:cNvGraphicFramePr>
               <a:graphicFrameLocks xmlns:a="http://schemas.openxmlformats.org/drawingml/2006/main" noChangeAspect="1"/>
             </wp:cNvGraphicFramePr>
@@ -8910,10 +8632,10 @@
         </w:rPr>
         <w:lastRenderedPageBreak/>
         <w:drawing>
-          <wp:inline distT="0" distB="0" distL="0" distR="0" wp14:anchorId="37C2AB16" wp14:editId="422A3998">
+          <wp:inline distT="0" distB="0" distL="0" distR="0" wp14:anchorId="7E717C39" wp14:editId="62B786B9">
             <wp:extent cx="6096000" cy="3848100"/>
             <wp:effectExtent l="0" t="0" r="0" b="0"/>
-            <wp:docPr id="650565111" name="Imagen 650565111"/>
+            <wp:docPr id="599296008" name="Imagen 599296008"/>
             <wp:cNvGraphicFramePr>
               <a:graphicFrameLocks xmlns:a="http://schemas.openxmlformats.org/drawingml/2006/main" noChangeAspect="1"/>
             </wp:cNvGraphicFramePr>
@@ -9082,12 +8804,6 @@
         <w:gridCol w:w="4160"/>
       </w:tblGrid>
       <w:tr>
-        <w:tblPrEx>
-          <w:tblCellMar>
-            <w:top w:w="0" w:type="dxa"/>
-            <w:bottom w:w="0" w:type="dxa"/>
-          </w:tblCellMar>
-        </w:tblPrEx>
         <w:trPr>
           <w:tblHeader/>
         </w:trPr>
@@ -9174,12 +8890,6 @@
         </w:tc>
       </w:tr>
       <w:tr>
-        <w:tblPrEx>
-          <w:tblCellMar>
-            <w:top w:w="0" w:type="dxa"/>
-            <w:bottom w:w="0" w:type="dxa"/>
-          </w:tblCellMar>
-        </w:tblPrEx>
         <w:tc>
           <w:tcPr>
             <w:tcW w:w="2100" w:type="dxa"/>
@@ -9254,12 +8964,6 @@
         </w:tc>
       </w:tr>
       <w:tr>
-        <w:tblPrEx>
-          <w:tblCellMar>
-            <w:top w:w="0" w:type="dxa"/>
-            <w:bottom w:w="0" w:type="dxa"/>
-          </w:tblCellMar>
-        </w:tblPrEx>
         <w:tc>
           <w:tcPr>
             <w:tcW w:w="2100" w:type="dxa"/>
@@ -9334,12 +9038,6 @@
         </w:tc>
       </w:tr>
       <w:tr>
-        <w:tblPrEx>
-          <w:tblCellMar>
-            <w:top w:w="0" w:type="dxa"/>
-            <w:bottom w:w="0" w:type="dxa"/>
-          </w:tblCellMar>
-        </w:tblPrEx>
         <w:tc>
           <w:tcPr>
             <w:tcW w:w="2100" w:type="dxa"/>
@@ -9414,12 +9112,6 @@
         </w:tc>
       </w:tr>
       <w:tr>
-        <w:tblPrEx>
-          <w:tblCellMar>
-            <w:top w:w="0" w:type="dxa"/>
-            <w:bottom w:w="0" w:type="dxa"/>
-          </w:tblCellMar>
-        </w:tblPrEx>
         <w:tc>
           <w:tcPr>
             <w:tcW w:w="2100" w:type="dxa"/>
@@ -9494,12 +9186,6 @@
         </w:tc>
       </w:tr>
       <w:tr>
-        <w:tblPrEx>
-          <w:tblCellMar>
-            <w:top w:w="0" w:type="dxa"/>
-            <w:bottom w:w="0" w:type="dxa"/>
-          </w:tblCellMar>
-        </w:tblPrEx>
         <w:tc>
           <w:tcPr>
             <w:tcW w:w="2100" w:type="dxa"/>
@@ -9574,12 +9260,6 @@
         </w:tc>
       </w:tr>
       <w:tr>
-        <w:tblPrEx>
-          <w:tblCellMar>
-            <w:top w:w="0" w:type="dxa"/>
-            <w:bottom w:w="0" w:type="dxa"/>
-          </w:tblCellMar>
-        </w:tblPrEx>
         <w:tc>
           <w:tcPr>
             <w:tcW w:w="2100" w:type="dxa"/>
@@ -9721,10 +9401,10 @@
           <w:noProof/>
         </w:rPr>
         <w:drawing>
-          <wp:inline distT="0" distB="0" distL="0" distR="0" wp14:anchorId="68F04473" wp14:editId="647ECD83">
+          <wp:inline distT="0" distB="0" distL="0" distR="0" wp14:anchorId="35B85654" wp14:editId="7BD4964D">
             <wp:extent cx="6096000" cy="3000375"/>
             <wp:effectExtent l="0" t="0" r="0" b="0"/>
-            <wp:docPr id="2052150752" name="Imagen 2052150752"/>
+            <wp:docPr id="190562509" name="Imagen 190562509"/>
             <wp:cNvGraphicFramePr>
               <a:graphicFrameLocks xmlns:a="http://schemas.openxmlformats.org/drawingml/2006/main" noChangeAspect="1"/>
             </wp:cNvGraphicFramePr>
@@ -9853,10 +9533,10 @@
         </w:rPr>
         <w:lastRenderedPageBreak/>
         <w:drawing>
-          <wp:inline distT="0" distB="0" distL="0" distR="0" wp14:anchorId="6F9EFD58" wp14:editId="416A023E">
+          <wp:inline distT="0" distB="0" distL="0" distR="0" wp14:anchorId="2596F43F" wp14:editId="2B24DA7F">
             <wp:extent cx="6096000" cy="2857500"/>
             <wp:effectExtent l="0" t="0" r="0" b="0"/>
-            <wp:docPr id="950796651" name="Imagen 950796651"/>
+            <wp:docPr id="1623499181" name="Imagen 1623499181"/>
             <wp:cNvGraphicFramePr>
               <a:graphicFrameLocks xmlns:a="http://schemas.openxmlformats.org/drawingml/2006/main" noChangeAspect="1"/>
             </wp:cNvGraphicFramePr>
@@ -9945,10 +9625,10 @@
           <w:noProof/>
         </w:rPr>
         <w:drawing>
-          <wp:inline distT="0" distB="0" distL="0" distR="0" wp14:anchorId="1AE4E64F" wp14:editId="5A6419BF">
+          <wp:inline distT="0" distB="0" distL="0" distR="0" wp14:anchorId="3FDF0A29" wp14:editId="6A95A06E">
             <wp:extent cx="6096000" cy="2857500"/>
             <wp:effectExtent l="0" t="0" r="0" b="0"/>
-            <wp:docPr id="1189987927" name="Imagen 1189987927"/>
+            <wp:docPr id="681532347" name="Imagen 681532347"/>
             <wp:cNvGraphicFramePr>
               <a:graphicFrameLocks xmlns:a="http://schemas.openxmlformats.org/drawingml/2006/main" noChangeAspect="1"/>
             </wp:cNvGraphicFramePr>
@@ -10038,10 +9718,10 @@
         </w:rPr>
         <w:lastRenderedPageBreak/>
         <w:drawing>
-          <wp:inline distT="0" distB="0" distL="0" distR="0" wp14:anchorId="4D3CA54E" wp14:editId="2A9E70E9">
+          <wp:inline distT="0" distB="0" distL="0" distR="0" wp14:anchorId="09389E7D" wp14:editId="5C24E4EB">
             <wp:extent cx="4953000" cy="4572000"/>
             <wp:effectExtent l="0" t="0" r="0" b="0"/>
-            <wp:docPr id="1581986011" name="Imagen 1581986011"/>
+            <wp:docPr id="2005508579" name="Imagen 2005508579"/>
             <wp:cNvGraphicFramePr>
               <a:graphicFrameLocks xmlns:a="http://schemas.openxmlformats.org/drawingml/2006/main" noChangeAspect="1"/>
             </wp:cNvGraphicFramePr>
@@ -10140,10 +9820,10 @@
         </w:rPr>
         <w:lastRenderedPageBreak/>
         <w:drawing>
-          <wp:inline distT="0" distB="0" distL="0" distR="0" wp14:anchorId="1B5E70BD" wp14:editId="1117D130">
+          <wp:inline distT="0" distB="0" distL="0" distR="0" wp14:anchorId="0E6EFE77" wp14:editId="5324CEB5">
             <wp:extent cx="6096000" cy="2562225"/>
             <wp:effectExtent l="0" t="0" r="0" b="0"/>
-            <wp:docPr id="1112097117" name="Imagen 1112097117"/>
+            <wp:docPr id="1548391722" name="Imagen 1548391722"/>
             <wp:cNvGraphicFramePr>
               <a:graphicFrameLocks xmlns:a="http://schemas.openxmlformats.org/drawingml/2006/main" noChangeAspect="1"/>
             </wp:cNvGraphicFramePr>
@@ -10232,10 +9912,10 @@
           <w:noProof/>
         </w:rPr>
         <w:drawing>
-          <wp:inline distT="0" distB="0" distL="0" distR="0" wp14:anchorId="59C0DFB3" wp14:editId="5752B7E2">
+          <wp:inline distT="0" distB="0" distL="0" distR="0" wp14:anchorId="461AC76D" wp14:editId="0C6179FE">
             <wp:extent cx="6096000" cy="2857500"/>
             <wp:effectExtent l="0" t="0" r="0" b="0"/>
-            <wp:docPr id="1234444453" name="Imagen 1234444453"/>
+            <wp:docPr id="1251416475" name="Imagen 1251416475"/>
             <wp:cNvGraphicFramePr>
               <a:graphicFrameLocks xmlns:a="http://schemas.openxmlformats.org/drawingml/2006/main" noChangeAspect="1"/>
             </wp:cNvGraphicFramePr>
@@ -10346,10 +10026,10 @@
           <w:noProof/>
         </w:rPr>
         <w:drawing>
-          <wp:inline distT="0" distB="0" distL="0" distR="0" wp14:anchorId="1B653B7C" wp14:editId="15A7CA7B">
+          <wp:inline distT="0" distB="0" distL="0" distR="0" wp14:anchorId="1291AD23" wp14:editId="79ABE377">
             <wp:extent cx="6096000" cy="3067050"/>
             <wp:effectExtent l="0" t="0" r="0" b="0"/>
-            <wp:docPr id="1623259274" name="Imagen 1623259274"/>
+            <wp:docPr id="282408876" name="Imagen 282408876"/>
             <wp:cNvGraphicFramePr>
               <a:graphicFrameLocks xmlns:a="http://schemas.openxmlformats.org/drawingml/2006/main" noChangeAspect="1"/>
             </wp:cNvGraphicFramePr>
@@ -10403,21 +10083,19 @@
     </w:p>
     <w:p>
       <w:pPr>
-        <w:pStyle w:val="Ttulo1"/>
-        <w:pageBreakBefore/>
-        <w:spacing w:before="220" w:after="110"/>
+        <w:pStyle w:val="Ttulo2"/>
+        <w:spacing w:before="150" w:after="80"/>
       </w:pPr>
       <w:bookmarkStart w:id="33" w:name="bm34"/>
       <w:r>
         <w:rPr>
           <w:b/>
           <w:bCs/>
-          <w:color w:val="1F3864"/>
-          <w:sz w:val="27"/>
-          <w:szCs w:val="27"/>
-        </w:rPr>
-        <w:lastRenderedPageBreak/>
-        <w:t>9. Mensajes y estados de pantalla</w:t>
+          <w:color w:val="2E5496"/>
+          <w:sz w:val="23"/>
+          <w:szCs w:val="23"/>
+        </w:rPr>
+        <w:t>8.8 Plataforma</w:t>
       </w:r>
       <w:bookmarkEnd w:id="33"/>
     </w:p>
@@ -10427,7 +10105,34 @@
         <w:jc w:val="both"/>
       </w:pPr>
       <w:r>
-        <w:t>Además de los componentes descritos en la sección 6, la interfaz define cómo se comporta una pantalla cuando no hay información que mostrar, cuando los datos aún se están cargando o cuando una operación falla. El objetivo es que el usuario siempre sepa qué ocurre y qué puede hacer a continuación.</w:t>
+        <w:t>Es la pantalla del administrador de INVENTRA, no la de un negocio, y es la única que no pertenece a ninguna licorera. Reúne las tres cifras globales del servicio —licoreras registradas, cuentas con suscripción vigente e ingreso mensual contratado— y, debajo, el listado de las licoreras con su contacto, el plan, el estado de la suscripción, la fecha hasta la que vale y el número de cuentas que tiene abiertas.</w:t>
+      </w:r>
+    </w:p>
+    <w:p>
+      <w:pPr>
+        <w:spacing w:after="110" w:line="262" w:lineRule="auto"/>
+        <w:jc w:val="both"/>
+      </w:pPr>
+      <w:r>
+        <w:t>El listado no muestra ningún dato comercial de los negocios: ni sus productos, ni sus ventas, ni sus importes. La restricción es del requisito y está resuelta en el servidor, que sencillamente no devuelve esa información; la pantalla no tiene nada que ocultar porque nunca la recibe.</w:t>
+      </w:r>
+    </w:p>
+    <w:p>
+      <w:pPr>
+        <w:spacing w:after="110" w:line="262" w:lineRule="auto"/>
+        <w:jc w:val="both"/>
+      </w:pPr>
+      <w:r>
+        <w:t>Desde aquí se ejecutan las tres operaciones que le corresponden a quien cobra el servicio: dar de alta una licorera, que crea el negocio y la cuenta de su administrador y le envía el enlace para que defina su propia contraseña; abrir un período, que es la misma operación para renovar y para subir de plan, porque en los dos casos se cierra la suscripción anterior y se inicia otra con su fecha de vencimiento; y corregir la fecha de una suscripción vigente, prevista para enmendar una fecha mal escrita y no para renovar. Bajar de plan no aparece en esta pantalla: esa operación la ejecuta el propio negocio desde la suya, según se explica en el apartado anterior.</w:t>
+      </w:r>
+    </w:p>
+    <w:p>
+      <w:pPr>
+        <w:spacing w:after="110" w:line="262" w:lineRule="auto"/>
+        <w:jc w:val="both"/>
+      </w:pPr>
+      <w:r>
+        <w:t>La navegación lateral de este rol es distinta: no se le presentan los módulos de inventario, ventas o sedes, porque no administra un negocio sino el servicio.</w:t>
       </w:r>
     </w:p>
     <w:p>
@@ -10439,11 +10144,12 @@
         <w:rPr>
           <w:noProof/>
         </w:rPr>
+        <w:lastRenderedPageBreak/>
         <w:drawing>
-          <wp:inline distT="0" distB="0" distL="0" distR="0" wp14:anchorId="610FA0A1" wp14:editId="2F92396D">
-            <wp:extent cx="6096000" cy="2324100"/>
+          <wp:inline distT="0" distB="0" distL="0" distR="0" wp14:anchorId="52423E92" wp14:editId="52674812">
+            <wp:extent cx="6096000" cy="4114800"/>
             <wp:effectExtent l="0" t="0" r="0" b="0"/>
-            <wp:docPr id="1741880689" name="Imagen 1741880689"/>
+            <wp:docPr id="2091782917" name="Imagen 2091782917"/>
             <wp:cNvGraphicFramePr>
               <a:graphicFrameLocks xmlns:a="http://schemas.openxmlformats.org/drawingml/2006/main" noChangeAspect="1"/>
             </wp:cNvGraphicFramePr>
@@ -10466,6 +10172,100 @@
                   <pic:spPr bwMode="auto">
                     <a:xfrm>
                       <a:off x="0" y="0"/>
+                      <a:ext cx="6096000" cy="4114800"/>
+                    </a:xfrm>
+                    <a:prstGeom prst="rect">
+                      <a:avLst/>
+                    </a:prstGeom>
+                  </pic:spPr>
+                </pic:pic>
+              </a:graphicData>
+            </a:graphic>
+          </wp:inline>
+        </w:drawing>
+      </w:r>
+    </w:p>
+    <w:p>
+      <w:pPr>
+        <w:spacing w:before="6" w:after="150"/>
+        <w:jc w:val="center"/>
+      </w:pPr>
+      <w:r>
+        <w:rPr>
+          <w:i/>
+          <w:iCs/>
+          <w:color w:val="5B6678"/>
+          <w:sz w:val="18"/>
+          <w:szCs w:val="18"/>
+        </w:rPr>
+        <w:t>Figura 17. Plataforma: licoreras registradas y sus suscripciones. Fuente: del autor.</w:t>
+      </w:r>
+    </w:p>
+    <w:p>
+      <w:pPr>
+        <w:pStyle w:val="Ttulo1"/>
+        <w:pageBreakBefore/>
+        <w:spacing w:before="220" w:after="110"/>
+      </w:pPr>
+      <w:bookmarkStart w:id="34" w:name="bm35"/>
+      <w:r>
+        <w:rPr>
+          <w:b/>
+          <w:bCs/>
+          <w:color w:val="1F3864"/>
+          <w:sz w:val="27"/>
+          <w:szCs w:val="27"/>
+        </w:rPr>
+        <w:lastRenderedPageBreak/>
+        <w:t>9. Mensajes y estados de pantalla</w:t>
+      </w:r>
+      <w:bookmarkEnd w:id="34"/>
+    </w:p>
+    <w:p>
+      <w:pPr>
+        <w:spacing w:after="110" w:line="262" w:lineRule="auto"/>
+        <w:jc w:val="both"/>
+      </w:pPr>
+      <w:r>
+        <w:t>Además de los componentes descritos en la sección 6, la interfaz define cómo se comporta una pantalla cuando no hay información que mostrar, cuando los datos aún se están cargando o cuando una operación falla. El objetivo es que el usuario siempre sepa qué ocurre y qué puede hacer a continuación.</w:t>
+      </w:r>
+    </w:p>
+    <w:p>
+      <w:pPr>
+        <w:spacing w:before="60" w:after="20"/>
+        <w:jc w:val="center"/>
+      </w:pPr>
+      <w:r>
+        <w:rPr>
+          <w:noProof/>
+        </w:rPr>
+        <w:drawing>
+          <wp:inline distT="0" distB="0" distL="0" distR="0" wp14:anchorId="5F44BCFE" wp14:editId="6B135009">
+            <wp:extent cx="6096000" cy="2324100"/>
+            <wp:effectExtent l="0" t="0" r="0" b="0"/>
+            <wp:docPr id="826446153" name="Imagen 826446153"/>
+            <wp:cNvGraphicFramePr>
+              <a:graphicFrameLocks xmlns:a="http://schemas.openxmlformats.org/drawingml/2006/main" noChangeAspect="1"/>
+            </wp:cNvGraphicFramePr>
+            <a:graphic xmlns:a="http://schemas.openxmlformats.org/drawingml/2006/main">
+              <a:graphicData uri="http://schemas.openxmlformats.org/drawingml/2006/picture">
+                <pic:pic xmlns:pic="http://schemas.openxmlformats.org/drawingml/2006/picture">
+                  <pic:nvPicPr>
+                    <pic:cNvPr id="0" name=""/>
+                    <pic:cNvPicPr>
+                      <a:picLocks noChangeAspect="1" noChangeArrowheads="1"/>
+                    </pic:cNvPicPr>
+                  </pic:nvPicPr>
+                  <pic:blipFill>
+                    <a:blip r:embed="rId24"/>
+                    <a:srcRect/>
+                    <a:stretch>
+                      <a:fillRect/>
+                    </a:stretch>
+                  </pic:blipFill>
+                  <pic:spPr bwMode="auto">
+                    <a:xfrm>
+                      <a:off x="0" y="0"/>
                       <a:ext cx="6096000" cy="2324100"/>
                     </a:xfrm>
                     <a:prstGeom prst="rect">
@@ -10492,7 +10292,7 @@
           <w:sz w:val="18"/>
           <w:szCs w:val="18"/>
         </w:rPr>
-        <w:t>Figura 17. Mensajes del sistema y estado vacío. Fuente: del autor.</w:t>
+        <w:t>Figura 18. Mensajes del sistema y estado vacío. Fuente: del autor.</w:t>
       </w:r>
     </w:p>
     <w:p>
@@ -10500,7 +10300,7 @@
         <w:pStyle w:val="Ttulo2"/>
         <w:spacing w:before="150" w:after="80"/>
       </w:pPr>
-      <w:bookmarkStart w:id="34" w:name="bm35"/>
+      <w:bookmarkStart w:id="35" w:name="bm36"/>
       <w:r>
         <w:rPr>
           <w:b/>
@@ -10511,7 +10311,7 @@
         </w:rPr>
         <w:t>9.1 Estados de una pantalla</w:t>
       </w:r>
-      <w:bookmarkEnd w:id="34"/>
+      <w:bookmarkEnd w:id="35"/>
     </w:p>
     <w:tbl>
       <w:tblPr>
@@ -10537,12 +10337,6 @@
         <w:gridCol w:w="4460"/>
       </w:tblGrid>
       <w:tr>
-        <w:tblPrEx>
-          <w:tblCellMar>
-            <w:top w:w="0" w:type="dxa"/>
-            <w:bottom w:w="0" w:type="dxa"/>
-          </w:tblCellMar>
-        </w:tblPrEx>
         <w:trPr>
           <w:tblHeader/>
         </w:trPr>
@@ -10629,12 +10423,6 @@
         </w:tc>
       </w:tr>
       <w:tr>
-        <w:tblPrEx>
-          <w:tblCellMar>
-            <w:top w:w="0" w:type="dxa"/>
-            <w:bottom w:w="0" w:type="dxa"/>
-          </w:tblCellMar>
-        </w:tblPrEx>
         <w:tc>
           <w:tcPr>
             <w:tcW w:w="1700" w:type="dxa"/>
@@ -10709,12 +10497,6 @@
         </w:tc>
       </w:tr>
       <w:tr>
-        <w:tblPrEx>
-          <w:tblCellMar>
-            <w:top w:w="0" w:type="dxa"/>
-            <w:bottom w:w="0" w:type="dxa"/>
-          </w:tblCellMar>
-        </w:tblPrEx>
         <w:tc>
           <w:tcPr>
             <w:tcW w:w="1700" w:type="dxa"/>
@@ -10789,12 +10571,6 @@
         </w:tc>
       </w:tr>
       <w:tr>
-        <w:tblPrEx>
-          <w:tblCellMar>
-            <w:top w:w="0" w:type="dxa"/>
-            <w:bottom w:w="0" w:type="dxa"/>
-          </w:tblCellMar>
-        </w:tblPrEx>
         <w:tc>
           <w:tcPr>
             <w:tcW w:w="1700" w:type="dxa"/>
@@ -10869,12 +10645,6 @@
         </w:tc>
       </w:tr>
       <w:tr>
-        <w:tblPrEx>
-          <w:tblCellMar>
-            <w:top w:w="0" w:type="dxa"/>
-            <w:bottom w:w="0" w:type="dxa"/>
-          </w:tblCellMar>
-        </w:tblPrEx>
         <w:tc>
           <w:tcPr>
             <w:tcW w:w="1700" w:type="dxa"/>
@@ -10949,12 +10719,6 @@
         </w:tc>
       </w:tr>
       <w:tr>
-        <w:tblPrEx>
-          <w:tblCellMar>
-            <w:top w:w="0" w:type="dxa"/>
-            <w:bottom w:w="0" w:type="dxa"/>
-          </w:tblCellMar>
-        </w:tblPrEx>
         <w:tc>
           <w:tcPr>
             <w:tcW w:w="1700" w:type="dxa"/>
@@ -11029,12 +10793,6 @@
         </w:tc>
       </w:tr>
       <w:tr>
-        <w:tblPrEx>
-          <w:tblCellMar>
-            <w:top w:w="0" w:type="dxa"/>
-            <w:bottom w:w="0" w:type="dxa"/>
-          </w:tblCellMar>
-        </w:tblPrEx>
         <w:tc>
           <w:tcPr>
             <w:tcW w:w="1700" w:type="dxa"/>
@@ -11114,7 +10872,7 @@
         <w:pStyle w:val="Ttulo2"/>
         <w:spacing w:before="150" w:after="80"/>
       </w:pPr>
-      <w:bookmarkStart w:id="35" w:name="bm36"/>
+      <w:bookmarkStart w:id="36" w:name="bm37"/>
       <w:r>
         <w:rPr>
           <w:b/>
@@ -11125,7 +10883,7 @@
         </w:rPr>
         <w:t>9.2 Redacción de los mensajes</w:t>
       </w:r>
-      <w:bookmarkEnd w:id="35"/>
+      <w:bookmarkEnd w:id="36"/>
     </w:p>
     <w:p>
       <w:pPr>
@@ -11207,7 +10965,7 @@
         <w:pageBreakBefore/>
         <w:spacing w:before="220" w:after="110"/>
       </w:pPr>
-      <w:bookmarkStart w:id="36" w:name="bm37"/>
+      <w:bookmarkStart w:id="37" w:name="bm38"/>
       <w:r>
         <w:rPr>
           <w:b/>
@@ -11219,7 +10977,7 @@
         <w:lastRenderedPageBreak/>
         <w:t>10. Comportamiento responsivo y modo oscuro</w:t>
       </w:r>
-      <w:bookmarkEnd w:id="36"/>
+      <w:bookmarkEnd w:id="37"/>
     </w:p>
     <w:p>
       <w:pPr>
@@ -11235,7 +10993,7 @@
         <w:pStyle w:val="Ttulo2"/>
         <w:spacing w:before="150" w:after="80"/>
       </w:pPr>
-      <w:bookmarkStart w:id="37" w:name="bm38"/>
+      <w:bookmarkStart w:id="38" w:name="bm39"/>
       <w:r>
         <w:rPr>
           <w:b/>
@@ -11246,7 +11004,7 @@
         </w:rPr>
         <w:t>10.1 Versión móvil</w:t>
       </w:r>
-      <w:bookmarkEnd w:id="37"/>
+      <w:bookmarkEnd w:id="38"/>
     </w:p>
     <w:p>
       <w:pPr>
@@ -11306,130 +11064,10 @@
           <w:noProof/>
         </w:rPr>
         <w:drawing>
-          <wp:inline distT="0" distB="0" distL="0" distR="0" wp14:anchorId="17B1C485" wp14:editId="19CCE574">
+          <wp:inline distT="0" distB="0" distL="0" distR="0" wp14:anchorId="5EF25B75" wp14:editId="12AB90D1">
             <wp:extent cx="6096000" cy="3295650"/>
             <wp:effectExtent l="0" t="0" r="0" b="0"/>
-            <wp:docPr id="1388362268" name="Imagen 1388362268"/>
-            <wp:cNvGraphicFramePr>
-              <a:graphicFrameLocks xmlns:a="http://schemas.openxmlformats.org/drawingml/2006/main" noChangeAspect="1"/>
-            </wp:cNvGraphicFramePr>
-            <a:graphic xmlns:a="http://schemas.openxmlformats.org/drawingml/2006/main">
-              <a:graphicData uri="http://schemas.openxmlformats.org/drawingml/2006/picture">
-                <pic:pic xmlns:pic="http://schemas.openxmlformats.org/drawingml/2006/picture">
-                  <pic:nvPicPr>
-                    <pic:cNvPr id="0" name=""/>
-                    <pic:cNvPicPr>
-                      <a:picLocks noChangeAspect="1" noChangeArrowheads="1"/>
-                    </pic:cNvPicPr>
-                  </pic:nvPicPr>
-                  <pic:blipFill>
-                    <a:blip r:embed="rId24"/>
-                    <a:srcRect/>
-                    <a:stretch>
-                      <a:fillRect/>
-                    </a:stretch>
-                  </pic:blipFill>
-                  <pic:spPr bwMode="auto">
-                    <a:xfrm>
-                      <a:off x="0" y="0"/>
-                      <a:ext cx="6096000" cy="3295650"/>
-                    </a:xfrm>
-                    <a:prstGeom prst="rect">
-                      <a:avLst/>
-                    </a:prstGeom>
-                  </pic:spPr>
-                </pic:pic>
-              </a:graphicData>
-            </a:graphic>
-          </wp:inline>
-        </w:drawing>
-      </w:r>
-    </w:p>
-    <w:p>
-      <w:pPr>
-        <w:spacing w:before="6" w:after="150"/>
-        <w:jc w:val="center"/>
-      </w:pPr>
-      <w:r>
-        <w:rPr>
-          <w:i/>
-          <w:iCs/>
-          <w:color w:val="5B6678"/>
-          <w:sz w:val="18"/>
-          <w:szCs w:val="18"/>
-        </w:rPr>
-        <w:t>Figura 18. Versión móvil: inicio de sesión, panel y punto de venta. Fuente: del autor.</w:t>
-      </w:r>
-    </w:p>
-    <w:p>
-      <w:pPr>
-        <w:pStyle w:val="Ttulo2"/>
-        <w:spacing w:before="150" w:after="80"/>
-      </w:pPr>
-      <w:bookmarkStart w:id="38" w:name="bm39"/>
-      <w:r>
-        <w:rPr>
-          <w:b/>
-          <w:bCs/>
-          <w:color w:val="2E5496"/>
-          <w:sz w:val="23"/>
-          <w:szCs w:val="23"/>
-        </w:rPr>
-        <w:t>10.2 Tablet y escritorio</w:t>
-      </w:r>
-      <w:bookmarkEnd w:id="38"/>
-    </w:p>
-    <w:p>
-      <w:pPr>
-        <w:spacing w:after="110" w:line="262" w:lineRule="auto"/>
-        <w:jc w:val="both"/>
-      </w:pPr>
-      <w:r>
-        <w:t>En tablet el contenido se organiza en dos columnas y la navegación lateral puede contraerse para dejar más espacio al contenido. En escritorio se emplea la rejilla completa, con la navegación lateral fija y los paneles de apoyo a la derecha del contenido principal, como ocurre en el punto de venta.</w:t>
-      </w:r>
-    </w:p>
-    <w:p>
-      <w:pPr>
-        <w:pStyle w:val="Ttulo2"/>
-        <w:spacing w:before="150" w:after="80"/>
-      </w:pPr>
-      <w:bookmarkStart w:id="39" w:name="bm40"/>
-      <w:r>
-        <w:rPr>
-          <w:b/>
-          <w:bCs/>
-          <w:color w:val="2E5496"/>
-          <w:sz w:val="23"/>
-          <w:szCs w:val="23"/>
-        </w:rPr>
-        <w:t>10.3 Modo oscuro</w:t>
-      </w:r>
-      <w:bookmarkEnd w:id="39"/>
-    </w:p>
-    <w:p>
-      <w:pPr>
-        <w:spacing w:after="110" w:line="262" w:lineRule="auto"/>
-        <w:jc w:val="both"/>
-      </w:pPr>
-      <w:r>
-        <w:t>El modo oscuro utiliza la variante de paleta definida en la sección 4.2 y conserva la misma estructura, la misma jerarquía y los mismos componentes del modo claro. Cambian únicamente los colores de fondo, superficie, borde y texto, y se ajustan los tonos de las etiquetas de estado para mantener el contraste. La elección del modo es del usuario y se conserva entre sesiones. El cambio se hace desde la parte inferior del menú lateral y, en las pantallas de acceso, desde el panel de marca, de modo que también pueda elegirlo quien todavía no ha entrado. Mientras el usuario no elija, se aplica la preferencia del sistema operativo.</w:t>
-      </w:r>
-    </w:p>
-    <w:p>
-      <w:pPr>
-        <w:spacing w:before="60" w:after="20"/>
-        <w:jc w:val="center"/>
-      </w:pPr>
-      <w:r>
-        <w:rPr>
-          <w:noProof/>
-        </w:rPr>
-        <w:lastRenderedPageBreak/>
-        <w:drawing>
-          <wp:inline distT="0" distB="0" distL="0" distR="0" wp14:anchorId="648B6363" wp14:editId="5270BB69">
-            <wp:extent cx="6096000" cy="3067050"/>
-            <wp:effectExtent l="0" t="0" r="0" b="0"/>
-            <wp:docPr id="253484830" name="Imagen 253484830"/>
+            <wp:docPr id="2083509568" name="Imagen 2083509568"/>
             <wp:cNvGraphicFramePr>
               <a:graphicFrameLocks xmlns:a="http://schemas.openxmlformats.org/drawingml/2006/main" noChangeAspect="1"/>
             </wp:cNvGraphicFramePr>
@@ -11452,6 +11090,126 @@
                   <pic:spPr bwMode="auto">
                     <a:xfrm>
                       <a:off x="0" y="0"/>
+                      <a:ext cx="6096000" cy="3295650"/>
+                    </a:xfrm>
+                    <a:prstGeom prst="rect">
+                      <a:avLst/>
+                    </a:prstGeom>
+                  </pic:spPr>
+                </pic:pic>
+              </a:graphicData>
+            </a:graphic>
+          </wp:inline>
+        </w:drawing>
+      </w:r>
+    </w:p>
+    <w:p>
+      <w:pPr>
+        <w:spacing w:before="6" w:after="150"/>
+        <w:jc w:val="center"/>
+      </w:pPr>
+      <w:r>
+        <w:rPr>
+          <w:i/>
+          <w:iCs/>
+          <w:color w:val="5B6678"/>
+          <w:sz w:val="18"/>
+          <w:szCs w:val="18"/>
+        </w:rPr>
+        <w:t>Figura 19. Versión móvil: inicio de sesión, panel y punto de venta. Fuente: del autor.</w:t>
+      </w:r>
+    </w:p>
+    <w:p>
+      <w:pPr>
+        <w:pStyle w:val="Ttulo2"/>
+        <w:spacing w:before="150" w:after="80"/>
+      </w:pPr>
+      <w:bookmarkStart w:id="39" w:name="bm40"/>
+      <w:r>
+        <w:rPr>
+          <w:b/>
+          <w:bCs/>
+          <w:color w:val="2E5496"/>
+          <w:sz w:val="23"/>
+          <w:szCs w:val="23"/>
+        </w:rPr>
+        <w:t>10.2 Tablet y escritorio</w:t>
+      </w:r>
+      <w:bookmarkEnd w:id="39"/>
+    </w:p>
+    <w:p>
+      <w:pPr>
+        <w:spacing w:after="110" w:line="262" w:lineRule="auto"/>
+        <w:jc w:val="both"/>
+      </w:pPr>
+      <w:r>
+        <w:t>En tablet el contenido se organiza en dos columnas y la navegación lateral puede contraerse para dejar más espacio al contenido. En escritorio se emplea la rejilla completa, con la navegación lateral fija y los paneles de apoyo a la derecha del contenido principal, como ocurre en el punto de venta.</w:t>
+      </w:r>
+    </w:p>
+    <w:p>
+      <w:pPr>
+        <w:pStyle w:val="Ttulo2"/>
+        <w:spacing w:before="150" w:after="80"/>
+      </w:pPr>
+      <w:bookmarkStart w:id="40" w:name="bm41"/>
+      <w:r>
+        <w:rPr>
+          <w:b/>
+          <w:bCs/>
+          <w:color w:val="2E5496"/>
+          <w:sz w:val="23"/>
+          <w:szCs w:val="23"/>
+        </w:rPr>
+        <w:t>10.3 Modo oscuro</w:t>
+      </w:r>
+      <w:bookmarkEnd w:id="40"/>
+    </w:p>
+    <w:p>
+      <w:pPr>
+        <w:spacing w:after="110" w:line="262" w:lineRule="auto"/>
+        <w:jc w:val="both"/>
+      </w:pPr>
+      <w:r>
+        <w:t>El modo oscuro utiliza la variante de paleta definida en la sección 4.2 y conserva la misma estructura, la misma jerarquía y los mismos componentes del modo claro. Cambian únicamente los colores de fondo, superficie, borde y texto, y se ajustan los tonos de las etiquetas de estado para mantener el contraste. La elección del modo es del usuario y se conserva entre sesiones. El cambio se hace desde la parte inferior del menú lateral y, en las pantallas de acceso, desde el panel de marca, de modo que también pueda elegirlo quien todavía no ha entrado. Mientras el usuario no elija, se aplica la preferencia del sistema operativo.</w:t>
+      </w:r>
+    </w:p>
+    <w:p>
+      <w:pPr>
+        <w:spacing w:before="60" w:after="20"/>
+        <w:jc w:val="center"/>
+      </w:pPr>
+      <w:r>
+        <w:rPr>
+          <w:noProof/>
+        </w:rPr>
+        <w:lastRenderedPageBreak/>
+        <w:drawing>
+          <wp:inline distT="0" distB="0" distL="0" distR="0" wp14:anchorId="5ADF5853" wp14:editId="454C3D0C">
+            <wp:extent cx="6096000" cy="3067050"/>
+            <wp:effectExtent l="0" t="0" r="0" b="0"/>
+            <wp:docPr id="670398065" name="Imagen 670398065"/>
+            <wp:cNvGraphicFramePr>
+              <a:graphicFrameLocks xmlns:a="http://schemas.openxmlformats.org/drawingml/2006/main" noChangeAspect="1"/>
+            </wp:cNvGraphicFramePr>
+            <a:graphic xmlns:a="http://schemas.openxmlformats.org/drawingml/2006/main">
+              <a:graphicData uri="http://schemas.openxmlformats.org/drawingml/2006/picture">
+                <pic:pic xmlns:pic="http://schemas.openxmlformats.org/drawingml/2006/picture">
+                  <pic:nvPicPr>
+                    <pic:cNvPr id="0" name=""/>
+                    <pic:cNvPicPr>
+                      <a:picLocks noChangeAspect="1" noChangeArrowheads="1"/>
+                    </pic:cNvPicPr>
+                  </pic:nvPicPr>
+                  <pic:blipFill>
+                    <a:blip r:embed="rId26"/>
+                    <a:srcRect/>
+                    <a:stretch>
+                      <a:fillRect/>
+                    </a:stretch>
+                  </pic:blipFill>
+                  <pic:spPr bwMode="auto">
+                    <a:xfrm>
+                      <a:off x="0" y="0"/>
                       <a:ext cx="6096000" cy="3067050"/>
                     </a:xfrm>
                     <a:prstGeom prst="rect">
@@ -11478,7 +11236,7 @@
           <w:sz w:val="18"/>
           <w:szCs w:val="18"/>
         </w:rPr>
-        <w:t>Figura 19. Panel principal en modo oscuro. Fuente: del autor.</w:t>
+        <w:t>Figura 20. Panel principal en modo oscuro. Fuente: del autor.</w:t>
       </w:r>
     </w:p>
     <w:p>
@@ -11487,7 +11245,7 @@
         <w:pageBreakBefore/>
         <w:spacing w:before="220" w:after="110"/>
       </w:pPr>
-      <w:bookmarkStart w:id="40" w:name="bm41"/>
+      <w:bookmarkStart w:id="41" w:name="bm42"/>
       <w:r>
         <w:rPr>
           <w:b/>
@@ -11499,7 +11257,7 @@
         <w:lastRenderedPageBreak/>
         <w:t>11. Conclusión</w:t>
       </w:r>
-      <w:bookmarkEnd w:id="40"/>
+      <w:bookmarkEnd w:id="41"/>
     </w:p>
     <w:p>
       <w:pPr>
@@ -11525,7 +11283,7 @@
         <w:pageBreakBefore/>
         <w:spacing w:before="220" w:after="110"/>
       </w:pPr>
-      <w:bookmarkStart w:id="41" w:name="bm42"/>
+      <w:bookmarkStart w:id="42" w:name="bm43"/>
       <w:r>
         <w:rPr>
           <w:b/>
@@ -11537,7 +11295,7 @@
         <w:lastRenderedPageBreak/>
         <w:t>12. Glosario</w:t>
       </w:r>
-      <w:bookmarkEnd w:id="41"/>
+      <w:bookmarkEnd w:id="42"/>
     </w:p>
     <w:tbl>
       <w:tblPr>
@@ -11562,12 +11320,6 @@
         <w:gridCol w:w="7260"/>
       </w:tblGrid>
       <w:tr>
-        <w:tblPrEx>
-          <w:tblCellMar>
-            <w:top w:w="0" w:type="dxa"/>
-            <w:bottom w:w="0" w:type="dxa"/>
-          </w:tblCellMar>
-        </w:tblPrEx>
         <w:trPr>
           <w:tblHeader/>
         </w:trPr>
@@ -11627,12 +11379,6 @@
         </w:tc>
       </w:tr>
       <w:tr>
-        <w:tblPrEx>
-          <w:tblCellMar>
-            <w:top w:w="0" w:type="dxa"/>
-            <w:bottom w:w="0" w:type="dxa"/>
-          </w:tblCellMar>
-        </w:tblPrEx>
         <w:tc>
           <w:tcPr>
             <w:tcW w:w="2100" w:type="dxa"/>
@@ -11683,12 +11429,6 @@
         </w:tc>
       </w:tr>
       <w:tr>
-        <w:tblPrEx>
-          <w:tblCellMar>
-            <w:top w:w="0" w:type="dxa"/>
-            <w:bottom w:w="0" w:type="dxa"/>
-          </w:tblCellMar>
-        </w:tblPrEx>
         <w:tc>
           <w:tcPr>
             <w:tcW w:w="2100" w:type="dxa"/>
@@ -11739,12 +11479,6 @@
         </w:tc>
       </w:tr>
       <w:tr>
-        <w:tblPrEx>
-          <w:tblCellMar>
-            <w:top w:w="0" w:type="dxa"/>
-            <w:bottom w:w="0" w:type="dxa"/>
-          </w:tblCellMar>
-        </w:tblPrEx>
         <w:tc>
           <w:tcPr>
             <w:tcW w:w="2100" w:type="dxa"/>
@@ -11795,12 +11529,6 @@
         </w:tc>
       </w:tr>
       <w:tr>
-        <w:tblPrEx>
-          <w:tblCellMar>
-            <w:top w:w="0" w:type="dxa"/>
-            <w:bottom w:w="0" w:type="dxa"/>
-          </w:tblCellMar>
-        </w:tblPrEx>
         <w:tc>
           <w:tcPr>
             <w:tcW w:w="2100" w:type="dxa"/>
@@ -11851,12 +11579,6 @@
         </w:tc>
       </w:tr>
       <w:tr>
-        <w:tblPrEx>
-          <w:tblCellMar>
-            <w:top w:w="0" w:type="dxa"/>
-            <w:bottom w:w="0" w:type="dxa"/>
-          </w:tblCellMar>
-        </w:tblPrEx>
         <w:tc>
           <w:tcPr>
             <w:tcW w:w="2100" w:type="dxa"/>
@@ -11907,12 +11629,6 @@
         </w:tc>
       </w:tr>
       <w:tr>
-        <w:tblPrEx>
-          <w:tblCellMar>
-            <w:top w:w="0" w:type="dxa"/>
-            <w:bottom w:w="0" w:type="dxa"/>
-          </w:tblCellMar>
-        </w:tblPrEx>
         <w:tc>
           <w:tcPr>
             <w:tcW w:w="2100" w:type="dxa"/>
@@ -11963,12 +11679,6 @@
         </w:tc>
       </w:tr>
       <w:tr>
-        <w:tblPrEx>
-          <w:tblCellMar>
-            <w:top w:w="0" w:type="dxa"/>
-            <w:bottom w:w="0" w:type="dxa"/>
-          </w:tblCellMar>
-        </w:tblPrEx>
         <w:tc>
           <w:tcPr>
             <w:tcW w:w="2100" w:type="dxa"/>
@@ -12019,12 +11729,6 @@
         </w:tc>
       </w:tr>
       <w:tr>
-        <w:tblPrEx>
-          <w:tblCellMar>
-            <w:top w:w="0" w:type="dxa"/>
-            <w:bottom w:w="0" w:type="dxa"/>
-          </w:tblCellMar>
-        </w:tblPrEx>
         <w:tc>
           <w:tcPr>
             <w:tcW w:w="2100" w:type="dxa"/>
@@ -12075,12 +11779,6 @@
         </w:tc>
       </w:tr>
       <w:tr>
-        <w:tblPrEx>
-          <w:tblCellMar>
-            <w:top w:w="0" w:type="dxa"/>
-            <w:bottom w:w="0" w:type="dxa"/>
-          </w:tblCellMar>
-        </w:tblPrEx>
         <w:tc>
           <w:tcPr>
             <w:tcW w:w="2100" w:type="dxa"/>
@@ -12131,12 +11829,6 @@
         </w:tc>
       </w:tr>
       <w:tr>
-        <w:tblPrEx>
-          <w:tblCellMar>
-            <w:top w:w="0" w:type="dxa"/>
-            <w:bottom w:w="0" w:type="dxa"/>
-          </w:tblCellMar>
-        </w:tblPrEx>
         <w:tc>
           <w:tcPr>
             <w:tcW w:w="2100" w:type="dxa"/>
@@ -12187,12 +11879,6 @@
         </w:tc>
       </w:tr>
       <w:tr>
-        <w:tblPrEx>
-          <w:tblCellMar>
-            <w:top w:w="0" w:type="dxa"/>
-            <w:bottom w:w="0" w:type="dxa"/>
-          </w:tblCellMar>
-        </w:tblPrEx>
         <w:tc>
           <w:tcPr>
             <w:tcW w:w="2100" w:type="dxa"/>
@@ -12243,12 +11929,6 @@
         </w:tc>
       </w:tr>
       <w:tr>
-        <w:tblPrEx>
-          <w:tblCellMar>
-            <w:top w:w="0" w:type="dxa"/>
-            <w:bottom w:w="0" w:type="dxa"/>
-          </w:tblCellMar>
-        </w:tblPrEx>
         <w:tc>
           <w:tcPr>
             <w:tcW w:w="2100" w:type="dxa"/>
@@ -12299,12 +11979,6 @@
         </w:tc>
       </w:tr>
       <w:tr>
-        <w:tblPrEx>
-          <w:tblCellMar>
-            <w:top w:w="0" w:type="dxa"/>
-            <w:bottom w:w="0" w:type="dxa"/>
-          </w:tblCellMar>
-        </w:tblPrEx>
         <w:tc>
           <w:tcPr>
             <w:tcW w:w="2100" w:type="dxa"/>
@@ -12361,7 +12035,7 @@
         <w:pageBreakBefore/>
         <w:spacing w:before="220" w:after="110"/>
       </w:pPr>
-      <w:bookmarkStart w:id="42" w:name="bm43"/>
+      <w:bookmarkStart w:id="43" w:name="bm44"/>
       <w:r>
         <w:rPr>
           <w:b/>
@@ -12373,7 +12047,7 @@
         <w:lastRenderedPageBreak/>
         <w:t>13. Referencias</w:t>
       </w:r>
-      <w:bookmarkEnd w:id="42"/>
+      <w:bookmarkEnd w:id="43"/>
     </w:p>
     <w:p>
       <w:pPr>
@@ -12455,7 +12129,13 @@
         <w:spacing w:after="60" w:line="258" w:lineRule="auto"/>
       </w:pPr>
       <w:r>
-        <w:t>World Wide Web Consortium. Web Content Accessibility Guidelines (WCAG) 2.1. W3C, 2018.</w:t>
+        <w:rPr>
+          <w:lang w:val="en-US"/>
+        </w:rPr>
+        <w:t xml:space="preserve">World Wide Web Consortium. Web Content Accessibility Guidelines (WCAG) 2.1. </w:t>
+      </w:r>
+      <w:r>
+        <w:t>W3C, 2018.</w:t>
       </w:r>
     </w:p>
     <w:p>
@@ -12498,7 +12178,7 @@
       </w:r>
     </w:p>
     <w:sectPr>
-      <w:footerReference w:type="default" r:id="rId26"/>
+      <w:footerReference w:type="default" r:id="rId27"/>
       <w:pgSz w:w="12240" w:h="15840"/>
       <w:pgMar w:top="1080" w:right="1000" w:bottom="1080" w:left="1000" w:header="708" w:footer="708" w:gutter="0"/>
       <w:cols w:space="720"/>
@@ -12595,10 +12275,10 @@
 <file path=word/numbering.xml><?xml version="1.0" encoding="utf-8"?>
 <w:numbering xmlns:wpc="http://schemas.microsoft.com/office/word/2010/wordprocessingCanvas" xmlns:cx="http://schemas.microsoft.com/office/drawing/2014/chartex" xmlns:cx1="http://schemas.microsoft.com/office/drawing/2015/9/8/chartex" xmlns:cx2="http://schemas.microsoft.com/office/drawing/2015/10/21/chartex" xmlns:cx3="http://schemas.microsoft.com/office/drawing/2016/5/9/chartex" xmlns:cx4="http://schemas.microsoft.com/office/drawing/2016/5/10/chartex" xmlns:cx5="http://schemas.microsoft.com/office/drawing/2016/5/11/chartex" xmlns:cx6="http://schemas.microsoft.com/office/drawing/2016/5/12/chartex" xmlns:cx7="http://schemas.microsoft.com/office/drawing/2016/5/13/chartex" xmlns:cx8="http://schemas.microsoft.com/office/drawing/2016/5/14/chartex" xmlns:mc="http://schemas.openxmlformats.org/markup-compatibility/2006" xmlns:aink="http://schemas.microsoft.com/office/drawing/2016/ink" xmlns:am3d="http://schemas.microsoft.com/office/drawing/2017/model3d" xmlns:o="urn:schemas-microsoft-com:office:office" xmlns:oel="http://schemas.microsoft.com/office/2019/extlst" xmlns:r="http://schemas.openxmlformats.org/officeDocument/2006/relationships" xmlns:m="http://schemas.openxmlformats.org/officeDocument/2006/math" xmlns:v="urn:schemas-microsoft-com:vml" xmlns:wp14="http://schemas.microsoft.com/office/word/2010/wordprocessingDrawing" xmlns:wp="http://schemas.openxmlformats.org/drawingml/2006/wordprocessingDrawing" xmlns:w10="urn:schemas-microsoft-com:office:word" xmlns:w="http://schemas.openxmlformats.org/wordprocessingml/2006/main" xmlns:w14="http://schemas.microsoft.com/office/word/2010/wordml" xmlns:w15="http://schemas.microsoft.com/office/word/2012/wordml" xmlns:w16cex="http://schemas.microsoft.com/office/word/2018/wordml/cex" xmlns:w16cid="http://schemas.microsoft.com/office/word/2016/wordml/cid" xmlns:w16="http://schemas.microsoft.com/office/word/2018/wordml" xmlns:w16du="http://schemas.microsoft.com/office/word/2023/wordml/word16du" xmlns:w16sdtdh="http://schemas.microsoft.com/office/word/2020/wordml/sdtdatahash" xmlns:w16sdtfl="http://schemas.microsoft.com/office/word/2024/wordml/sdtformatlock" xmlns:w16se="http://schemas.microsoft.com/office/word/2015/wordml/symex" xmlns:wpg="http://schemas.microsoft.com/office/word/2010/wordprocessingGroup" xmlns:wpi="http://schemas.microsoft.com/office/word/2010/wordprocessingInk" xmlns:wne="http://schemas.microsoft.com/office/word/2006/wordml" xmlns:wps="http://schemas.microsoft.com/office/word/2010/wordprocessingShape" mc:Ignorable="w14 w15 w16se w16cid w16 w16cex w16sdtdh w16sdtfl w16du wp14">
   <w:abstractNum w:abstractNumId="0" w15:restartNumberingAfterBreak="0">
-    <w:nsid w:val="6036307A"/>
+    <w:nsid w:val="40320A26"/>
     <w:multiLevelType w:val="hybridMultilevel"/>
-    <w:tmpl w:val="17A697F0"/>
-    <w:lvl w:ilvl="0" w:tplc="765C2C60">
+    <w:tmpl w:val="64BC0146"/>
+    <w:lvl w:ilvl="0" w:tplc="54301D8A">
       <w:start w:val="1"/>
       <w:numFmt w:val="bullet"/>
       <w:lvlText w:val="●"/>
@@ -12607,7 +12287,7 @@
         <w:ind w:left="720" w:hanging="360"/>
       </w:pPr>
     </w:lvl>
-    <w:lvl w:ilvl="1" w:tplc="B4E2F8A4">
+    <w:lvl w:ilvl="1" w:tplc="931AB72A">
       <w:start w:val="1"/>
       <w:numFmt w:val="bullet"/>
       <w:lvlText w:val="○"/>
@@ -12616,7 +12296,7 @@
         <w:ind w:left="1440" w:hanging="360"/>
       </w:pPr>
     </w:lvl>
-    <w:lvl w:ilvl="2" w:tplc="5F0226DA">
+    <w:lvl w:ilvl="2" w:tplc="3364FB54">
       <w:start w:val="1"/>
       <w:numFmt w:val="bullet"/>
       <w:lvlText w:val="■"/>
@@ -12625,7 +12305,7 @@
         <w:ind w:left="2160" w:hanging="360"/>
       </w:pPr>
     </w:lvl>
-    <w:lvl w:ilvl="3" w:tplc="020CE072">
+    <w:lvl w:ilvl="3" w:tplc="4F92134E">
       <w:start w:val="1"/>
       <w:numFmt w:val="bullet"/>
       <w:lvlText w:val="●"/>
@@ -12634,7 +12314,7 @@
         <w:ind w:left="2880" w:hanging="360"/>
       </w:pPr>
     </w:lvl>
-    <w:lvl w:ilvl="4" w:tplc="067E8986">
+    <w:lvl w:ilvl="4" w:tplc="1DC0A078">
       <w:start w:val="1"/>
       <w:numFmt w:val="bullet"/>
       <w:lvlText w:val="○"/>
@@ -12643,7 +12323,7 @@
         <w:ind w:left="3600" w:hanging="360"/>
       </w:pPr>
     </w:lvl>
-    <w:lvl w:ilvl="5" w:tplc="4CD27822">
+    <w:lvl w:ilvl="5" w:tplc="959033BA">
       <w:start w:val="1"/>
       <w:numFmt w:val="bullet"/>
       <w:lvlText w:val="■"/>
@@ -12652,7 +12332,7 @@
         <w:ind w:left="4320" w:hanging="360"/>
       </w:pPr>
     </w:lvl>
-    <w:lvl w:ilvl="6" w:tplc="2774EF32">
+    <w:lvl w:ilvl="6" w:tplc="F41A4C32">
       <w:start w:val="1"/>
       <w:numFmt w:val="bullet"/>
       <w:lvlText w:val="●"/>
@@ -12661,7 +12341,7 @@
         <w:ind w:left="5040" w:hanging="360"/>
       </w:pPr>
     </w:lvl>
-    <w:lvl w:ilvl="7" w:tplc="017AF196">
+    <w:lvl w:ilvl="7" w:tplc="73944F50">
       <w:start w:val="1"/>
       <w:numFmt w:val="bullet"/>
       <w:lvlText w:val="●"/>
@@ -12670,7 +12350,7 @@
         <w:ind w:left="5760" w:hanging="360"/>
       </w:pPr>
     </w:lvl>
-    <w:lvl w:ilvl="8" w:tplc="A6AC9EFE">
+    <w:lvl w:ilvl="8" w:tplc="0FE8A944">
       <w:start w:val="1"/>
       <w:numFmt w:val="bullet"/>
       <w:lvlText w:val="●"/>
@@ -12680,7 +12360,7 @@
       </w:pPr>
     </w:lvl>
   </w:abstractNum>
-  <w:num w:numId="1" w16cid:durableId="2062753550">
+  <w:num w:numId="1" w16cid:durableId="374618932">
     <w:abstractNumId w:val="0"/>
     <w:lvlOverride w:ilvl="0">
       <w:startOverride w:val="1"/>

</xml_diff>

<commit_message>
Construyo el boton secundario como lo define el documento y marco la accion principal de Mi suscripcion
</commit_message>
<xml_diff>
--- a/docs/diseno/INVENTRA_Documento_Tecnico_Diseno.docx
+++ b/docs/diseno/INVENTRA_Documento_Tecnico_Diseno.docx
@@ -154,6 +154,12 @@
         <w:gridCol w:w="3260"/>
       </w:tblGrid>
       <w:tr>
+        <w:tblPrEx>
+          <w:tblCellMar>
+            <w:top w:w="0" w:type="dxa"/>
+            <w:bottom w:w="0" w:type="dxa"/>
+          </w:tblCellMar>
+        </w:tblPrEx>
         <w:trPr>
           <w:tblHeader/>
         </w:trPr>
@@ -267,6 +273,12 @@
         </w:tc>
       </w:tr>
       <w:tr>
+        <w:tblPrEx>
+          <w:tblCellMar>
+            <w:top w:w="0" w:type="dxa"/>
+            <w:bottom w:w="0" w:type="dxa"/>
+          </w:tblCellMar>
+        </w:tblPrEx>
         <w:tc>
           <w:tcPr>
             <w:tcW w:w="1500" w:type="dxa"/>
@@ -2355,7 +2367,10 @@
         <w:jc w:val="both"/>
       </w:pPr>
       <w:r>
-        <w:t>Este documento define el sistema de diseño de la interfaz de INVENTRA para las plataformas web y móvil. Reúne la identidad visual, los componentes reutilizables, las pautas de accesibilidad y de experiencia de usuario, y las pantallas principales de la aplicación. Su propósito es servir de guía para la etapa de construcción y garantizar una interfaz coherente en todo el producto.</w:t>
+        <w:t>Este documento define el sistema de diseño de la interfaz de INVENTRA para las plataformas web y móvil. Reúne la identidad visual, los componentes reutilizables, las pautas de accesibilidad y de experiencia de usuario, y las pantallas principales de la aplicación. Su propósito es servir de guía para la etapa de construcción y garantizar una interfaz coherente en todo el producto</w:t>
+      </w:r>
+      <w:r>
+        <w:t>.</w:t>
       </w:r>
     </w:p>
     <w:p>
@@ -2371,10 +2386,7 @@
         <w:t xml:space="preserve">Objetivo. </w:t>
       </w:r>
       <w:r>
-        <w:t>Establecer los lineamientos visuales y de interacción que orientan el desarrollo de la interfaz, de modo que las pantallas mantengan una apariencia y un comportamiento uniformes</w:t>
-      </w:r>
-      <w:r>
-        <w:t>.</w:t>
+        <w:t>Establecer los lineamientos visuales y de interacción que orientan el desarrollo de la interfaz, de modo que las pantallas mantengan una apariencia y un comportamiento uniformes.</w:t>
       </w:r>
     </w:p>
     <w:p>
@@ -2390,10 +2402,7 @@
         <w:t xml:space="preserve">Alcance. </w:t>
       </w:r>
       <w:r>
-        <w:t>Cubre la aplicación web y su versión móvil. Se apoya en la especificación de requisitos (IEEE 830), en el modelo de datos (MER y diccionario) y en el prototipo de INVENTRA. No incluye la implementación del código, que corresponde a la etapa de construcción</w:t>
-      </w:r>
-      <w:r>
-        <w:t>.</w:t>
+        <w:t>Cubre la aplicación web y su versión móvil. Se apoya en la especificación de requisitos (IEEE 830), en el modelo de datos (MER y diccionario) y en el prototipo de INVENTRA. No incluye la implementación del código, que corresponde a la etapa de construcción.</w:t>
       </w:r>
     </w:p>
     <w:p>
@@ -2751,7 +2760,7 @@
           <w:noProof/>
         </w:rPr>
         <w:drawing>
-          <wp:inline distT="0" distB="0" distL="0" distR="0" wp14:anchorId="44F40DD5" wp14:editId="61C38243">
+          <wp:inline distT="0" distB="0" distL="0" distR="0" wp14:anchorId="6881F2A2" wp14:editId="5C460D76">
             <wp:extent cx="5905500" cy="2324100"/>
             <wp:effectExtent l="0" t="0" r="0" b="0"/>
             <wp:docPr id="1" name="Imagen 1"/>
@@ -2834,10 +2843,10 @@
           <w:noProof/>
         </w:rPr>
         <w:drawing>
-          <wp:inline distT="0" distB="0" distL="0" distR="0" wp14:anchorId="24693509" wp14:editId="732454F0">
+          <wp:inline distT="0" distB="0" distL="0" distR="0" wp14:anchorId="067F5531" wp14:editId="5DF3ECCD">
             <wp:extent cx="5334000" cy="2371725"/>
             <wp:effectExtent l="0" t="0" r="0" b="0"/>
-            <wp:docPr id="589253631" name="Imagen 589253631"/>
+            <wp:docPr id="1624456519" name="Imagen 1624456519"/>
             <wp:cNvGraphicFramePr>
               <a:graphicFrameLocks xmlns:a="http://schemas.openxmlformats.org/drawingml/2006/main" noChangeAspect="1"/>
             </wp:cNvGraphicFramePr>
@@ -2941,6 +2950,12 @@
         <w:gridCol w:w="4510"/>
       </w:tblGrid>
       <w:tr>
+        <w:tblPrEx>
+          <w:tblCellMar>
+            <w:top w:w="0" w:type="dxa"/>
+            <w:bottom w:w="0" w:type="dxa"/>
+          </w:tblCellMar>
+        </w:tblPrEx>
         <w:trPr>
           <w:tblHeader/>
         </w:trPr>
@@ -3054,6 +3069,12 @@
         </w:tc>
       </w:tr>
       <w:tr>
+        <w:tblPrEx>
+          <w:tblCellMar>
+            <w:top w:w="0" w:type="dxa"/>
+            <w:bottom w:w="0" w:type="dxa"/>
+          </w:tblCellMar>
+        </w:tblPrEx>
         <w:tc>
           <w:tcPr>
             <w:tcW w:w="1850" w:type="dxa"/>
@@ -3152,6 +3173,12 @@
         </w:tc>
       </w:tr>
       <w:tr>
+        <w:tblPrEx>
+          <w:tblCellMar>
+            <w:top w:w="0" w:type="dxa"/>
+            <w:bottom w:w="0" w:type="dxa"/>
+          </w:tblCellMar>
+        </w:tblPrEx>
         <w:tc>
           <w:tcPr>
             <w:tcW w:w="1850" w:type="dxa"/>
@@ -3251,6 +3278,12 @@
         </w:tc>
       </w:tr>
       <w:tr>
+        <w:tblPrEx>
+          <w:tblCellMar>
+            <w:top w:w="0" w:type="dxa"/>
+            <w:bottom w:w="0" w:type="dxa"/>
+          </w:tblCellMar>
+        </w:tblPrEx>
         <w:tc>
           <w:tcPr>
             <w:tcW w:w="1850" w:type="dxa"/>
@@ -3349,6 +3382,12 @@
         </w:tc>
       </w:tr>
       <w:tr>
+        <w:tblPrEx>
+          <w:tblCellMar>
+            <w:top w:w="0" w:type="dxa"/>
+            <w:bottom w:w="0" w:type="dxa"/>
+          </w:tblCellMar>
+        </w:tblPrEx>
         <w:tc>
           <w:tcPr>
             <w:tcW w:w="1850" w:type="dxa"/>
@@ -3447,6 +3486,12 @@
         </w:tc>
       </w:tr>
       <w:tr>
+        <w:tblPrEx>
+          <w:tblCellMar>
+            <w:top w:w="0" w:type="dxa"/>
+            <w:bottom w:w="0" w:type="dxa"/>
+          </w:tblCellMar>
+        </w:tblPrEx>
         <w:tc>
           <w:tcPr>
             <w:tcW w:w="1850" w:type="dxa"/>
@@ -3545,6 +3590,12 @@
         </w:tc>
       </w:tr>
       <w:tr>
+        <w:tblPrEx>
+          <w:tblCellMar>
+            <w:top w:w="0" w:type="dxa"/>
+            <w:bottom w:w="0" w:type="dxa"/>
+          </w:tblCellMar>
+        </w:tblPrEx>
         <w:tc>
           <w:tcPr>
             <w:tcW w:w="1850" w:type="dxa"/>
@@ -3643,6 +3694,12 @@
         </w:tc>
       </w:tr>
       <w:tr>
+        <w:tblPrEx>
+          <w:tblCellMar>
+            <w:top w:w="0" w:type="dxa"/>
+            <w:bottom w:w="0" w:type="dxa"/>
+          </w:tblCellMar>
+        </w:tblPrEx>
         <w:tc>
           <w:tcPr>
             <w:tcW w:w="1850" w:type="dxa"/>
@@ -3741,6 +3798,12 @@
         </w:tc>
       </w:tr>
       <w:tr>
+        <w:tblPrEx>
+          <w:tblCellMar>
+            <w:top w:w="0" w:type="dxa"/>
+            <w:bottom w:w="0" w:type="dxa"/>
+          </w:tblCellMar>
+        </w:tblPrEx>
         <w:tc>
           <w:tcPr>
             <w:tcW w:w="1850" w:type="dxa"/>
@@ -3839,6 +3902,12 @@
         </w:tc>
       </w:tr>
       <w:tr>
+        <w:tblPrEx>
+          <w:tblCellMar>
+            <w:top w:w="0" w:type="dxa"/>
+            <w:bottom w:w="0" w:type="dxa"/>
+          </w:tblCellMar>
+        </w:tblPrEx>
         <w:tc>
           <w:tcPr>
             <w:tcW w:w="1850" w:type="dxa"/>
@@ -3937,6 +4006,12 @@
         </w:tc>
       </w:tr>
       <w:tr>
+        <w:tblPrEx>
+          <w:tblCellMar>
+            <w:top w:w="0" w:type="dxa"/>
+            <w:bottom w:w="0" w:type="dxa"/>
+          </w:tblCellMar>
+        </w:tblPrEx>
         <w:tc>
           <w:tcPr>
             <w:tcW w:w="1850" w:type="dxa"/>
@@ -4035,6 +4110,12 @@
         </w:tc>
       </w:tr>
       <w:tr>
+        <w:tblPrEx>
+          <w:tblCellMar>
+            <w:top w:w="0" w:type="dxa"/>
+            <w:bottom w:w="0" w:type="dxa"/>
+          </w:tblCellMar>
+        </w:tblPrEx>
         <w:tc>
           <w:tcPr>
             <w:tcW w:w="1850" w:type="dxa"/>
@@ -4133,6 +4214,12 @@
         </w:tc>
       </w:tr>
       <w:tr>
+        <w:tblPrEx>
+          <w:tblCellMar>
+            <w:top w:w="0" w:type="dxa"/>
+            <w:bottom w:w="0" w:type="dxa"/>
+          </w:tblCellMar>
+        </w:tblPrEx>
         <w:tc>
           <w:tcPr>
             <w:tcW w:w="1850" w:type="dxa"/>
@@ -4231,6 +4318,12 @@
         </w:tc>
       </w:tr>
       <w:tr>
+        <w:tblPrEx>
+          <w:tblCellMar>
+            <w:top w:w="0" w:type="dxa"/>
+            <w:bottom w:w="0" w:type="dxa"/>
+          </w:tblCellMar>
+        </w:tblPrEx>
         <w:tc>
           <w:tcPr>
             <w:tcW w:w="1850" w:type="dxa"/>
@@ -4329,6 +4422,12 @@
         </w:tc>
       </w:tr>
       <w:tr>
+        <w:tblPrEx>
+          <w:tblCellMar>
+            <w:top w:w="0" w:type="dxa"/>
+            <w:bottom w:w="0" w:type="dxa"/>
+          </w:tblCellMar>
+        </w:tblPrEx>
         <w:tc>
           <w:tcPr>
             <w:tcW w:w="1850" w:type="dxa"/>
@@ -4427,6 +4526,12 @@
         </w:tc>
       </w:tr>
       <w:tr>
+        <w:tblPrEx>
+          <w:tblCellMar>
+            <w:top w:w="0" w:type="dxa"/>
+            <w:bottom w:w="0" w:type="dxa"/>
+          </w:tblCellMar>
+        </w:tblPrEx>
         <w:tc>
           <w:tcPr>
             <w:tcW w:w="1850" w:type="dxa"/>
@@ -4525,6 +4630,12 @@
         </w:tc>
       </w:tr>
       <w:tr>
+        <w:tblPrEx>
+          <w:tblCellMar>
+            <w:top w:w="0" w:type="dxa"/>
+            <w:bottom w:w="0" w:type="dxa"/>
+          </w:tblCellMar>
+        </w:tblPrEx>
         <w:tc>
           <w:tcPr>
             <w:tcW w:w="1850" w:type="dxa"/>
@@ -4623,6 +4734,12 @@
         </w:tc>
       </w:tr>
       <w:tr>
+        <w:tblPrEx>
+          <w:tblCellMar>
+            <w:top w:w="0" w:type="dxa"/>
+            <w:bottom w:w="0" w:type="dxa"/>
+          </w:tblCellMar>
+        </w:tblPrEx>
         <w:tc>
           <w:tcPr>
             <w:tcW w:w="1850" w:type="dxa"/>
@@ -4773,6 +4890,12 @@
         <w:gridCol w:w="3760"/>
       </w:tblGrid>
       <w:tr>
+        <w:tblPrEx>
+          <w:tblCellMar>
+            <w:top w:w="0" w:type="dxa"/>
+            <w:bottom w:w="0" w:type="dxa"/>
+          </w:tblCellMar>
+        </w:tblPrEx>
         <w:trPr>
           <w:tblHeader/>
         </w:trPr>
@@ -4886,6 +5009,12 @@
         </w:tc>
       </w:tr>
       <w:tr>
+        <w:tblPrEx>
+          <w:tblCellMar>
+            <w:top w:w="0" w:type="dxa"/>
+            <w:bottom w:w="0" w:type="dxa"/>
+          </w:tblCellMar>
+        </w:tblPrEx>
         <w:tc>
           <w:tcPr>
             <w:tcW w:w="2400" w:type="dxa"/>
@@ -4984,6 +5113,12 @@
         </w:tc>
       </w:tr>
       <w:tr>
+        <w:tblPrEx>
+          <w:tblCellMar>
+            <w:top w:w="0" w:type="dxa"/>
+            <w:bottom w:w="0" w:type="dxa"/>
+          </w:tblCellMar>
+        </w:tblPrEx>
         <w:tc>
           <w:tcPr>
             <w:tcW w:w="2400" w:type="dxa"/>
@@ -5082,6 +5217,12 @@
         </w:tc>
       </w:tr>
       <w:tr>
+        <w:tblPrEx>
+          <w:tblCellMar>
+            <w:top w:w="0" w:type="dxa"/>
+            <w:bottom w:w="0" w:type="dxa"/>
+          </w:tblCellMar>
+        </w:tblPrEx>
         <w:tc>
           <w:tcPr>
             <w:tcW w:w="2400" w:type="dxa"/>
@@ -5180,6 +5321,12 @@
         </w:tc>
       </w:tr>
       <w:tr>
+        <w:tblPrEx>
+          <w:tblCellMar>
+            <w:top w:w="0" w:type="dxa"/>
+            <w:bottom w:w="0" w:type="dxa"/>
+          </w:tblCellMar>
+        </w:tblPrEx>
         <w:tc>
           <w:tcPr>
             <w:tcW w:w="2400" w:type="dxa"/>
@@ -5278,6 +5425,12 @@
         </w:tc>
       </w:tr>
       <w:tr>
+        <w:tblPrEx>
+          <w:tblCellMar>
+            <w:top w:w="0" w:type="dxa"/>
+            <w:bottom w:w="0" w:type="dxa"/>
+          </w:tblCellMar>
+        </w:tblPrEx>
         <w:tc>
           <w:tcPr>
             <w:tcW w:w="2400" w:type="dxa"/>
@@ -5376,6 +5529,12 @@
         </w:tc>
       </w:tr>
       <w:tr>
+        <w:tblPrEx>
+          <w:tblCellMar>
+            <w:top w:w="0" w:type="dxa"/>
+            <w:bottom w:w="0" w:type="dxa"/>
+          </w:tblCellMar>
+        </w:tblPrEx>
         <w:tc>
           <w:tcPr>
             <w:tcW w:w="2400" w:type="dxa"/>
@@ -5580,6 +5739,12 @@
         <w:gridCol w:w="7160"/>
       </w:tblGrid>
       <w:tr>
+        <w:tblPrEx>
+          <w:tblCellMar>
+            <w:top w:w="0" w:type="dxa"/>
+            <w:bottom w:w="0" w:type="dxa"/>
+          </w:tblCellMar>
+        </w:tblPrEx>
         <w:trPr>
           <w:tblHeader/>
         </w:trPr>
@@ -5639,6 +5804,12 @@
         </w:tc>
       </w:tr>
       <w:tr>
+        <w:tblPrEx>
+          <w:tblCellMar>
+            <w:top w:w="0" w:type="dxa"/>
+            <w:bottom w:w="0" w:type="dxa"/>
+          </w:tblCellMar>
+        </w:tblPrEx>
         <w:tc>
           <w:tcPr>
             <w:tcW w:w="2200" w:type="dxa"/>
@@ -5689,6 +5860,12 @@
         </w:tc>
       </w:tr>
       <w:tr>
+        <w:tblPrEx>
+          <w:tblCellMar>
+            <w:top w:w="0" w:type="dxa"/>
+            <w:bottom w:w="0" w:type="dxa"/>
+          </w:tblCellMar>
+        </w:tblPrEx>
         <w:tc>
           <w:tcPr>
             <w:tcW w:w="2200" w:type="dxa"/>
@@ -5739,6 +5916,12 @@
         </w:tc>
       </w:tr>
       <w:tr>
+        <w:tblPrEx>
+          <w:tblCellMar>
+            <w:top w:w="0" w:type="dxa"/>
+            <w:bottom w:w="0" w:type="dxa"/>
+          </w:tblCellMar>
+        </w:tblPrEx>
         <w:tc>
           <w:tcPr>
             <w:tcW w:w="2200" w:type="dxa"/>
@@ -5789,6 +5972,12 @@
         </w:tc>
       </w:tr>
       <w:tr>
+        <w:tblPrEx>
+          <w:tblCellMar>
+            <w:top w:w="0" w:type="dxa"/>
+            <w:bottom w:w="0" w:type="dxa"/>
+          </w:tblCellMar>
+        </w:tblPrEx>
         <w:tc>
           <w:tcPr>
             <w:tcW w:w="2200" w:type="dxa"/>
@@ -5917,6 +6106,12 @@
         <w:gridCol w:w="4960"/>
       </w:tblGrid>
       <w:tr>
+        <w:tblPrEx>
+          <w:tblCellMar>
+            <w:top w:w="0" w:type="dxa"/>
+            <w:bottom w:w="0" w:type="dxa"/>
+          </w:tblCellMar>
+        </w:tblPrEx>
         <w:trPr>
           <w:tblHeader/>
         </w:trPr>
@@ -6003,6 +6198,12 @@
         </w:tc>
       </w:tr>
       <w:tr>
+        <w:tblPrEx>
+          <w:tblCellMar>
+            <w:top w:w="0" w:type="dxa"/>
+            <w:bottom w:w="0" w:type="dxa"/>
+          </w:tblCellMar>
+        </w:tblPrEx>
         <w:tc>
           <w:tcPr>
             <w:tcW w:w="2200" w:type="dxa"/>
@@ -6077,6 +6278,12 @@
         </w:tc>
       </w:tr>
       <w:tr>
+        <w:tblPrEx>
+          <w:tblCellMar>
+            <w:top w:w="0" w:type="dxa"/>
+            <w:bottom w:w="0" w:type="dxa"/>
+          </w:tblCellMar>
+        </w:tblPrEx>
         <w:tc>
           <w:tcPr>
             <w:tcW w:w="2200" w:type="dxa"/>
@@ -6151,6 +6358,12 @@
         </w:tc>
       </w:tr>
       <w:tr>
+        <w:tblPrEx>
+          <w:tblCellMar>
+            <w:top w:w="0" w:type="dxa"/>
+            <w:bottom w:w="0" w:type="dxa"/>
+          </w:tblCellMar>
+        </w:tblPrEx>
         <w:tc>
           <w:tcPr>
             <w:tcW w:w="2200" w:type="dxa"/>
@@ -6305,6 +6518,12 @@
         <w:gridCol w:w="3660"/>
       </w:tblGrid>
       <w:tr>
+        <w:tblPrEx>
+          <w:tblCellMar>
+            <w:top w:w="0" w:type="dxa"/>
+            <w:bottom w:w="0" w:type="dxa"/>
+          </w:tblCellMar>
+        </w:tblPrEx>
         <w:trPr>
           <w:tblHeader/>
         </w:trPr>
@@ -6391,6 +6610,12 @@
         </w:tc>
       </w:tr>
       <w:tr>
+        <w:tblPrEx>
+          <w:tblCellMar>
+            <w:top w:w="0" w:type="dxa"/>
+            <w:bottom w:w="0" w:type="dxa"/>
+          </w:tblCellMar>
+        </w:tblPrEx>
         <w:tc>
           <w:tcPr>
             <w:tcW w:w="1700" w:type="dxa"/>
@@ -6465,6 +6690,12 @@
         </w:tc>
       </w:tr>
       <w:tr>
+        <w:tblPrEx>
+          <w:tblCellMar>
+            <w:top w:w="0" w:type="dxa"/>
+            <w:bottom w:w="0" w:type="dxa"/>
+          </w:tblCellMar>
+        </w:tblPrEx>
         <w:tc>
           <w:tcPr>
             <w:tcW w:w="1700" w:type="dxa"/>
@@ -6539,6 +6770,12 @@
         </w:tc>
       </w:tr>
       <w:tr>
+        <w:tblPrEx>
+          <w:tblCellMar>
+            <w:top w:w="0" w:type="dxa"/>
+            <w:bottom w:w="0" w:type="dxa"/>
+          </w:tblCellMar>
+        </w:tblPrEx>
         <w:tc>
           <w:tcPr>
             <w:tcW w:w="1700" w:type="dxa"/>
@@ -6613,6 +6850,12 @@
         </w:tc>
       </w:tr>
       <w:tr>
+        <w:tblPrEx>
+          <w:tblCellMar>
+            <w:top w:w="0" w:type="dxa"/>
+            <w:bottom w:w="0" w:type="dxa"/>
+          </w:tblCellMar>
+        </w:tblPrEx>
         <w:tc>
           <w:tcPr>
             <w:tcW w:w="1700" w:type="dxa"/>
@@ -6687,6 +6930,12 @@
         </w:tc>
       </w:tr>
       <w:tr>
+        <w:tblPrEx>
+          <w:tblCellMar>
+            <w:top w:w="0" w:type="dxa"/>
+            <w:bottom w:w="0" w:type="dxa"/>
+          </w:tblCellMar>
+        </w:tblPrEx>
         <w:tc>
           <w:tcPr>
             <w:tcW w:w="1700" w:type="dxa"/>
@@ -6761,6 +7010,12 @@
         </w:tc>
       </w:tr>
       <w:tr>
+        <w:tblPrEx>
+          <w:tblCellMar>
+            <w:top w:w="0" w:type="dxa"/>
+            <w:bottom w:w="0" w:type="dxa"/>
+          </w:tblCellMar>
+        </w:tblPrEx>
         <w:tc>
           <w:tcPr>
             <w:tcW w:w="1700" w:type="dxa"/>
@@ -6835,6 +7090,12 @@
         </w:tc>
       </w:tr>
       <w:tr>
+        <w:tblPrEx>
+          <w:tblCellMar>
+            <w:top w:w="0" w:type="dxa"/>
+            <w:bottom w:w="0" w:type="dxa"/>
+          </w:tblCellMar>
+        </w:tblPrEx>
         <w:tc>
           <w:tcPr>
             <w:tcW w:w="1700" w:type="dxa"/>
@@ -6960,6 +7221,12 @@
         <w:gridCol w:w="3060"/>
       </w:tblGrid>
       <w:tr>
+        <w:tblPrEx>
+          <w:tblCellMar>
+            <w:top w:w="0" w:type="dxa"/>
+            <w:bottom w:w="0" w:type="dxa"/>
+          </w:tblCellMar>
+        </w:tblPrEx>
         <w:trPr>
           <w:tblHeader/>
         </w:trPr>
@@ -7046,6 +7313,12 @@
         </w:tc>
       </w:tr>
       <w:tr>
+        <w:tblPrEx>
+          <w:tblCellMar>
+            <w:top w:w="0" w:type="dxa"/>
+            <w:bottom w:w="0" w:type="dxa"/>
+          </w:tblCellMar>
+        </w:tblPrEx>
         <w:tc>
           <w:tcPr>
             <w:tcW w:w="1700" w:type="dxa"/>
@@ -7120,6 +7393,12 @@
         </w:tc>
       </w:tr>
       <w:tr>
+        <w:tblPrEx>
+          <w:tblCellMar>
+            <w:top w:w="0" w:type="dxa"/>
+            <w:bottom w:w="0" w:type="dxa"/>
+          </w:tblCellMar>
+        </w:tblPrEx>
         <w:tc>
           <w:tcPr>
             <w:tcW w:w="1700" w:type="dxa"/>
@@ -7194,6 +7473,12 @@
         </w:tc>
       </w:tr>
       <w:tr>
+        <w:tblPrEx>
+          <w:tblCellMar>
+            <w:top w:w="0" w:type="dxa"/>
+            <w:bottom w:w="0" w:type="dxa"/>
+          </w:tblCellMar>
+        </w:tblPrEx>
         <w:tc>
           <w:tcPr>
             <w:tcW w:w="1700" w:type="dxa"/>
@@ -7268,6 +7553,12 @@
         </w:tc>
       </w:tr>
       <w:tr>
+        <w:tblPrEx>
+          <w:tblCellMar>
+            <w:top w:w="0" w:type="dxa"/>
+            <w:bottom w:w="0" w:type="dxa"/>
+          </w:tblCellMar>
+        </w:tblPrEx>
         <w:tc>
           <w:tcPr>
             <w:tcW w:w="1700" w:type="dxa"/>
@@ -7362,10 +7653,10 @@
         </w:rPr>
         <w:lastRenderedPageBreak/>
         <w:drawing>
-          <wp:inline distT="0" distB="0" distL="0" distR="0" wp14:anchorId="53DB5DA4" wp14:editId="21A4507F">
+          <wp:inline distT="0" distB="0" distL="0" distR="0" wp14:anchorId="71D0508F" wp14:editId="5FAF60DA">
             <wp:extent cx="5905500" cy="2419350"/>
             <wp:effectExtent l="0" t="0" r="0" b="0"/>
-            <wp:docPr id="1891884226" name="Imagen 1891884226"/>
+            <wp:docPr id="1511305647" name="Imagen 1511305647"/>
             <wp:cNvGraphicFramePr>
               <a:graphicFrameLocks xmlns:a="http://schemas.openxmlformats.org/drawingml/2006/main" noChangeAspect="1"/>
             </wp:cNvGraphicFramePr>
@@ -7515,10 +7806,10 @@
           <w:noProof/>
         </w:rPr>
         <w:drawing>
-          <wp:inline distT="0" distB="0" distL="0" distR="0" wp14:anchorId="37B0CB8A" wp14:editId="147D37D7">
+          <wp:inline distT="0" distB="0" distL="0" distR="0" wp14:anchorId="66238267" wp14:editId="7B4EA93E">
             <wp:extent cx="5905500" cy="2257425"/>
             <wp:effectExtent l="0" t="0" r="0" b="0"/>
-            <wp:docPr id="1155096988" name="Imagen 1155096988"/>
+            <wp:docPr id="1009640275" name="Imagen 1009640275"/>
             <wp:cNvGraphicFramePr>
               <a:graphicFrameLocks xmlns:a="http://schemas.openxmlformats.org/drawingml/2006/main" noChangeAspect="1"/>
             </wp:cNvGraphicFramePr>
@@ -7711,6 +8002,12 @@
         <w:gridCol w:w="5360"/>
       </w:tblGrid>
       <w:tr>
+        <w:tblPrEx>
+          <w:tblCellMar>
+            <w:top w:w="0" w:type="dxa"/>
+            <w:bottom w:w="0" w:type="dxa"/>
+          </w:tblCellMar>
+        </w:tblPrEx>
         <w:trPr>
           <w:tblHeader/>
         </w:trPr>
@@ -7797,6 +8094,12 @@
         </w:tc>
       </w:tr>
       <w:tr>
+        <w:tblPrEx>
+          <w:tblCellMar>
+            <w:top w:w="0" w:type="dxa"/>
+            <w:bottom w:w="0" w:type="dxa"/>
+          </w:tblCellMar>
+        </w:tblPrEx>
         <w:tc>
           <w:tcPr>
             <w:tcW w:w="1700" w:type="dxa"/>
@@ -7871,6 +8174,12 @@
         </w:tc>
       </w:tr>
       <w:tr>
+        <w:tblPrEx>
+          <w:tblCellMar>
+            <w:top w:w="0" w:type="dxa"/>
+            <w:bottom w:w="0" w:type="dxa"/>
+          </w:tblCellMar>
+        </w:tblPrEx>
         <w:tc>
           <w:tcPr>
             <w:tcW w:w="1700" w:type="dxa"/>
@@ -7945,6 +8254,12 @@
         </w:tc>
       </w:tr>
       <w:tr>
+        <w:tblPrEx>
+          <w:tblCellMar>
+            <w:top w:w="0" w:type="dxa"/>
+            <w:bottom w:w="0" w:type="dxa"/>
+          </w:tblCellMar>
+        </w:tblPrEx>
         <w:tc>
           <w:tcPr>
             <w:tcW w:w="1700" w:type="dxa"/>
@@ -8019,6 +8334,12 @@
         </w:tc>
       </w:tr>
       <w:tr>
+        <w:tblPrEx>
+          <w:tblCellMar>
+            <w:top w:w="0" w:type="dxa"/>
+            <w:bottom w:w="0" w:type="dxa"/>
+          </w:tblCellMar>
+        </w:tblPrEx>
         <w:tc>
           <w:tcPr>
             <w:tcW w:w="1700" w:type="dxa"/>
@@ -8112,10 +8433,10 @@
           <w:noProof/>
         </w:rPr>
         <w:drawing>
-          <wp:inline distT="0" distB="0" distL="0" distR="0" wp14:anchorId="22D3EA41" wp14:editId="36CE8D77">
+          <wp:inline distT="0" distB="0" distL="0" distR="0" wp14:anchorId="13BFAB15" wp14:editId="3B130C56">
             <wp:extent cx="5334000" cy="3381375"/>
             <wp:effectExtent l="0" t="0" r="0" b="0"/>
-            <wp:docPr id="620766192" name="Imagen 620766192"/>
+            <wp:docPr id="1983630756" name="Imagen 1983630756"/>
             <wp:cNvGraphicFramePr>
               <a:graphicFrameLocks xmlns:a="http://schemas.openxmlformats.org/drawingml/2006/main" noChangeAspect="1"/>
             </wp:cNvGraphicFramePr>
@@ -8265,10 +8586,10 @@
           <w:noProof/>
         </w:rPr>
         <w:drawing>
-          <wp:inline distT="0" distB="0" distL="0" distR="0" wp14:anchorId="2D15DD82" wp14:editId="3ADF7E72">
+          <wp:inline distT="0" distB="0" distL="0" distR="0" wp14:anchorId="64CD128F" wp14:editId="2A4DF78E">
             <wp:extent cx="6096000" cy="1676400"/>
             <wp:effectExtent l="0" t="0" r="0" b="0"/>
-            <wp:docPr id="243441305" name="Imagen 243441305"/>
+            <wp:docPr id="76150762" name="Imagen 76150762"/>
             <wp:cNvGraphicFramePr>
               <a:graphicFrameLocks xmlns:a="http://schemas.openxmlformats.org/drawingml/2006/main" noChangeAspect="1"/>
             </wp:cNvGraphicFramePr>
@@ -8357,10 +8678,10 @@
           <w:noProof/>
         </w:rPr>
         <w:drawing>
-          <wp:inline distT="0" distB="0" distL="0" distR="0" wp14:anchorId="2B02BA6D" wp14:editId="22B6A75D">
+          <wp:inline distT="0" distB="0" distL="0" distR="0" wp14:anchorId="0C1EC2E1" wp14:editId="1326DF5F">
             <wp:extent cx="4762500" cy="2447925"/>
             <wp:effectExtent l="0" t="0" r="0" b="0"/>
-            <wp:docPr id="1577479188" name="Imagen 1577479188"/>
+            <wp:docPr id="700759784" name="Imagen 700759784"/>
             <wp:cNvGraphicFramePr>
               <a:graphicFrameLocks xmlns:a="http://schemas.openxmlformats.org/drawingml/2006/main" noChangeAspect="1"/>
             </wp:cNvGraphicFramePr>
@@ -8487,10 +8808,10 @@
           <w:noProof/>
         </w:rPr>
         <w:drawing>
-          <wp:inline distT="0" distB="0" distL="0" distR="0" wp14:anchorId="543F645D" wp14:editId="1EFA2BDD">
+          <wp:inline distT="0" distB="0" distL="0" distR="0" wp14:anchorId="55540ABD" wp14:editId="142CDC97">
             <wp:extent cx="6096000" cy="3048000"/>
             <wp:effectExtent l="0" t="0" r="0" b="0"/>
-            <wp:docPr id="430750763" name="Imagen 430750763"/>
+            <wp:docPr id="781470344" name="Imagen 781470344"/>
             <wp:cNvGraphicFramePr>
               <a:graphicFrameLocks xmlns:a="http://schemas.openxmlformats.org/drawingml/2006/main" noChangeAspect="1"/>
             </wp:cNvGraphicFramePr>
@@ -8632,10 +8953,10 @@
         </w:rPr>
         <w:lastRenderedPageBreak/>
         <w:drawing>
-          <wp:inline distT="0" distB="0" distL="0" distR="0" wp14:anchorId="7E717C39" wp14:editId="62B786B9">
+          <wp:inline distT="0" distB="0" distL="0" distR="0" wp14:anchorId="18173DDD" wp14:editId="4EACF2D1">
             <wp:extent cx="6096000" cy="3848100"/>
             <wp:effectExtent l="0" t="0" r="0" b="0"/>
-            <wp:docPr id="599296008" name="Imagen 599296008"/>
+            <wp:docPr id="2119902877" name="Imagen 2119902877"/>
             <wp:cNvGraphicFramePr>
               <a:graphicFrameLocks xmlns:a="http://schemas.openxmlformats.org/drawingml/2006/main" noChangeAspect="1"/>
             </wp:cNvGraphicFramePr>
@@ -8804,6 +9125,12 @@
         <w:gridCol w:w="4160"/>
       </w:tblGrid>
       <w:tr>
+        <w:tblPrEx>
+          <w:tblCellMar>
+            <w:top w:w="0" w:type="dxa"/>
+            <w:bottom w:w="0" w:type="dxa"/>
+          </w:tblCellMar>
+        </w:tblPrEx>
         <w:trPr>
           <w:tblHeader/>
         </w:trPr>
@@ -8890,6 +9217,12 @@
         </w:tc>
       </w:tr>
       <w:tr>
+        <w:tblPrEx>
+          <w:tblCellMar>
+            <w:top w:w="0" w:type="dxa"/>
+            <w:bottom w:w="0" w:type="dxa"/>
+          </w:tblCellMar>
+        </w:tblPrEx>
         <w:tc>
           <w:tcPr>
             <w:tcW w:w="2100" w:type="dxa"/>
@@ -8964,6 +9297,12 @@
         </w:tc>
       </w:tr>
       <w:tr>
+        <w:tblPrEx>
+          <w:tblCellMar>
+            <w:top w:w="0" w:type="dxa"/>
+            <w:bottom w:w="0" w:type="dxa"/>
+          </w:tblCellMar>
+        </w:tblPrEx>
         <w:tc>
           <w:tcPr>
             <w:tcW w:w="2100" w:type="dxa"/>
@@ -9038,6 +9377,12 @@
         </w:tc>
       </w:tr>
       <w:tr>
+        <w:tblPrEx>
+          <w:tblCellMar>
+            <w:top w:w="0" w:type="dxa"/>
+            <w:bottom w:w="0" w:type="dxa"/>
+          </w:tblCellMar>
+        </w:tblPrEx>
         <w:tc>
           <w:tcPr>
             <w:tcW w:w="2100" w:type="dxa"/>
@@ -9112,6 +9457,12 @@
         </w:tc>
       </w:tr>
       <w:tr>
+        <w:tblPrEx>
+          <w:tblCellMar>
+            <w:top w:w="0" w:type="dxa"/>
+            <w:bottom w:w="0" w:type="dxa"/>
+          </w:tblCellMar>
+        </w:tblPrEx>
         <w:tc>
           <w:tcPr>
             <w:tcW w:w="2100" w:type="dxa"/>
@@ -9186,6 +9537,12 @@
         </w:tc>
       </w:tr>
       <w:tr>
+        <w:tblPrEx>
+          <w:tblCellMar>
+            <w:top w:w="0" w:type="dxa"/>
+            <w:bottom w:w="0" w:type="dxa"/>
+          </w:tblCellMar>
+        </w:tblPrEx>
         <w:tc>
           <w:tcPr>
             <w:tcW w:w="2100" w:type="dxa"/>
@@ -9260,6 +9617,12 @@
         </w:tc>
       </w:tr>
       <w:tr>
+        <w:tblPrEx>
+          <w:tblCellMar>
+            <w:top w:w="0" w:type="dxa"/>
+            <w:bottom w:w="0" w:type="dxa"/>
+          </w:tblCellMar>
+        </w:tblPrEx>
         <w:tc>
           <w:tcPr>
             <w:tcW w:w="2100" w:type="dxa"/>
@@ -9401,10 +9764,10 @@
           <w:noProof/>
         </w:rPr>
         <w:drawing>
-          <wp:inline distT="0" distB="0" distL="0" distR="0" wp14:anchorId="35B85654" wp14:editId="7BD4964D">
+          <wp:inline distT="0" distB="0" distL="0" distR="0" wp14:anchorId="5BEC2A38" wp14:editId="0E1C8E93">
             <wp:extent cx="6096000" cy="3000375"/>
             <wp:effectExtent l="0" t="0" r="0" b="0"/>
-            <wp:docPr id="190562509" name="Imagen 190562509"/>
+            <wp:docPr id="1159407317" name="Imagen 1159407317"/>
             <wp:cNvGraphicFramePr>
               <a:graphicFrameLocks xmlns:a="http://schemas.openxmlformats.org/drawingml/2006/main" noChangeAspect="1"/>
             </wp:cNvGraphicFramePr>
@@ -9533,10 +9896,10 @@
         </w:rPr>
         <w:lastRenderedPageBreak/>
         <w:drawing>
-          <wp:inline distT="0" distB="0" distL="0" distR="0" wp14:anchorId="2596F43F" wp14:editId="2B24DA7F">
+          <wp:inline distT="0" distB="0" distL="0" distR="0" wp14:anchorId="789643EA" wp14:editId="37B84FC9">
             <wp:extent cx="6096000" cy="2857500"/>
             <wp:effectExtent l="0" t="0" r="0" b="0"/>
-            <wp:docPr id="1623499181" name="Imagen 1623499181"/>
+            <wp:docPr id="1507591142" name="Imagen 1507591142"/>
             <wp:cNvGraphicFramePr>
               <a:graphicFrameLocks xmlns:a="http://schemas.openxmlformats.org/drawingml/2006/main" noChangeAspect="1"/>
             </wp:cNvGraphicFramePr>
@@ -9625,10 +9988,10 @@
           <w:noProof/>
         </w:rPr>
         <w:drawing>
-          <wp:inline distT="0" distB="0" distL="0" distR="0" wp14:anchorId="3FDF0A29" wp14:editId="6A95A06E">
+          <wp:inline distT="0" distB="0" distL="0" distR="0" wp14:anchorId="34D99B86" wp14:editId="1B3044CA">
             <wp:extent cx="6096000" cy="2857500"/>
             <wp:effectExtent l="0" t="0" r="0" b="0"/>
-            <wp:docPr id="681532347" name="Imagen 681532347"/>
+            <wp:docPr id="1961469924" name="Imagen 1961469924"/>
             <wp:cNvGraphicFramePr>
               <a:graphicFrameLocks xmlns:a="http://schemas.openxmlformats.org/drawingml/2006/main" noChangeAspect="1"/>
             </wp:cNvGraphicFramePr>
@@ -9718,10 +10081,10 @@
         </w:rPr>
         <w:lastRenderedPageBreak/>
         <w:drawing>
-          <wp:inline distT="0" distB="0" distL="0" distR="0" wp14:anchorId="09389E7D" wp14:editId="5C24E4EB">
+          <wp:inline distT="0" distB="0" distL="0" distR="0" wp14:anchorId="25CBBC72" wp14:editId="14092AB2">
             <wp:extent cx="4953000" cy="4572000"/>
             <wp:effectExtent l="0" t="0" r="0" b="0"/>
-            <wp:docPr id="2005508579" name="Imagen 2005508579"/>
+            <wp:docPr id="2004898931" name="Imagen 2004898931"/>
             <wp:cNvGraphicFramePr>
               <a:graphicFrameLocks xmlns:a="http://schemas.openxmlformats.org/drawingml/2006/main" noChangeAspect="1"/>
             </wp:cNvGraphicFramePr>
@@ -9820,10 +10183,10 @@
         </w:rPr>
         <w:lastRenderedPageBreak/>
         <w:drawing>
-          <wp:inline distT="0" distB="0" distL="0" distR="0" wp14:anchorId="0E6EFE77" wp14:editId="5324CEB5">
+          <wp:inline distT="0" distB="0" distL="0" distR="0" wp14:anchorId="3EB7BADE" wp14:editId="2988A613">
             <wp:extent cx="6096000" cy="2562225"/>
             <wp:effectExtent l="0" t="0" r="0" b="0"/>
-            <wp:docPr id="1548391722" name="Imagen 1548391722"/>
+            <wp:docPr id="270675194" name="Imagen 270675194"/>
             <wp:cNvGraphicFramePr>
               <a:graphicFrameLocks xmlns:a="http://schemas.openxmlformats.org/drawingml/2006/main" noChangeAspect="1"/>
             </wp:cNvGraphicFramePr>
@@ -9912,10 +10275,10 @@
           <w:noProof/>
         </w:rPr>
         <w:drawing>
-          <wp:inline distT="0" distB="0" distL="0" distR="0" wp14:anchorId="461AC76D" wp14:editId="0C6179FE">
+          <wp:inline distT="0" distB="0" distL="0" distR="0" wp14:anchorId="7A57EF0E" wp14:editId="1A7AE938">
             <wp:extent cx="6096000" cy="2857500"/>
             <wp:effectExtent l="0" t="0" r="0" b="0"/>
-            <wp:docPr id="1251416475" name="Imagen 1251416475"/>
+            <wp:docPr id="951416628" name="Imagen 951416628"/>
             <wp:cNvGraphicFramePr>
               <a:graphicFrameLocks xmlns:a="http://schemas.openxmlformats.org/drawingml/2006/main" noChangeAspect="1"/>
             </wp:cNvGraphicFramePr>
@@ -10026,10 +10389,10 @@
           <w:noProof/>
         </w:rPr>
         <w:drawing>
-          <wp:inline distT="0" distB="0" distL="0" distR="0" wp14:anchorId="1291AD23" wp14:editId="79ABE377">
+          <wp:inline distT="0" distB="0" distL="0" distR="0" wp14:anchorId="7851CA01" wp14:editId="74BF7F32">
             <wp:extent cx="6096000" cy="3067050"/>
             <wp:effectExtent l="0" t="0" r="0" b="0"/>
-            <wp:docPr id="282408876" name="Imagen 282408876"/>
+            <wp:docPr id="952520927" name="Imagen 952520927"/>
             <wp:cNvGraphicFramePr>
               <a:graphicFrameLocks xmlns:a="http://schemas.openxmlformats.org/drawingml/2006/main" noChangeAspect="1"/>
             </wp:cNvGraphicFramePr>
@@ -10146,10 +10509,10 @@
         </w:rPr>
         <w:lastRenderedPageBreak/>
         <w:drawing>
-          <wp:inline distT="0" distB="0" distL="0" distR="0" wp14:anchorId="52423E92" wp14:editId="52674812">
+          <wp:inline distT="0" distB="0" distL="0" distR="0" wp14:anchorId="717FA4A9" wp14:editId="48DCDF34">
             <wp:extent cx="6096000" cy="4114800"/>
             <wp:effectExtent l="0" t="0" r="0" b="0"/>
-            <wp:docPr id="2091782917" name="Imagen 2091782917"/>
+            <wp:docPr id="1722648204" name="Imagen 1722648204"/>
             <wp:cNvGraphicFramePr>
               <a:graphicFrameLocks xmlns:a="http://schemas.openxmlformats.org/drawingml/2006/main" noChangeAspect="1"/>
             </wp:cNvGraphicFramePr>
@@ -10240,10 +10603,10 @@
           <w:noProof/>
         </w:rPr>
         <w:drawing>
-          <wp:inline distT="0" distB="0" distL="0" distR="0" wp14:anchorId="5F44BCFE" wp14:editId="6B135009">
-            <wp:extent cx="6096000" cy="2324100"/>
+          <wp:inline distT="0" distB="0" distL="0" distR="0" wp14:anchorId="5C6BB8D0" wp14:editId="2B9DE51F">
+            <wp:extent cx="6096000" cy="2314575"/>
             <wp:effectExtent l="0" t="0" r="0" b="0"/>
-            <wp:docPr id="826446153" name="Imagen 826446153"/>
+            <wp:docPr id="1658223459" name="Imagen 1658223459"/>
             <wp:cNvGraphicFramePr>
               <a:graphicFrameLocks xmlns:a="http://schemas.openxmlformats.org/drawingml/2006/main" noChangeAspect="1"/>
             </wp:cNvGraphicFramePr>
@@ -10266,7 +10629,7 @@
                   <pic:spPr bwMode="auto">
                     <a:xfrm>
                       <a:off x="0" y="0"/>
-                      <a:ext cx="6096000" cy="2324100"/>
+                      <a:ext cx="6096000" cy="2314575"/>
                     </a:xfrm>
                     <a:prstGeom prst="rect">
                       <a:avLst/>
@@ -10337,6 +10700,12 @@
         <w:gridCol w:w="4460"/>
       </w:tblGrid>
       <w:tr>
+        <w:tblPrEx>
+          <w:tblCellMar>
+            <w:top w:w="0" w:type="dxa"/>
+            <w:bottom w:w="0" w:type="dxa"/>
+          </w:tblCellMar>
+        </w:tblPrEx>
         <w:trPr>
           <w:tblHeader/>
         </w:trPr>
@@ -10423,6 +10792,12 @@
         </w:tc>
       </w:tr>
       <w:tr>
+        <w:tblPrEx>
+          <w:tblCellMar>
+            <w:top w:w="0" w:type="dxa"/>
+            <w:bottom w:w="0" w:type="dxa"/>
+          </w:tblCellMar>
+        </w:tblPrEx>
         <w:tc>
           <w:tcPr>
             <w:tcW w:w="1700" w:type="dxa"/>
@@ -10497,6 +10872,12 @@
         </w:tc>
       </w:tr>
       <w:tr>
+        <w:tblPrEx>
+          <w:tblCellMar>
+            <w:top w:w="0" w:type="dxa"/>
+            <w:bottom w:w="0" w:type="dxa"/>
+          </w:tblCellMar>
+        </w:tblPrEx>
         <w:tc>
           <w:tcPr>
             <w:tcW w:w="1700" w:type="dxa"/>
@@ -10571,6 +10952,12 @@
         </w:tc>
       </w:tr>
       <w:tr>
+        <w:tblPrEx>
+          <w:tblCellMar>
+            <w:top w:w="0" w:type="dxa"/>
+            <w:bottom w:w="0" w:type="dxa"/>
+          </w:tblCellMar>
+        </w:tblPrEx>
         <w:tc>
           <w:tcPr>
             <w:tcW w:w="1700" w:type="dxa"/>
@@ -10645,6 +11032,12 @@
         </w:tc>
       </w:tr>
       <w:tr>
+        <w:tblPrEx>
+          <w:tblCellMar>
+            <w:top w:w="0" w:type="dxa"/>
+            <w:bottom w:w="0" w:type="dxa"/>
+          </w:tblCellMar>
+        </w:tblPrEx>
         <w:tc>
           <w:tcPr>
             <w:tcW w:w="1700" w:type="dxa"/>
@@ -10719,6 +11112,12 @@
         </w:tc>
       </w:tr>
       <w:tr>
+        <w:tblPrEx>
+          <w:tblCellMar>
+            <w:top w:w="0" w:type="dxa"/>
+            <w:bottom w:w="0" w:type="dxa"/>
+          </w:tblCellMar>
+        </w:tblPrEx>
         <w:tc>
           <w:tcPr>
             <w:tcW w:w="1700" w:type="dxa"/>
@@ -10793,6 +11192,12 @@
         </w:tc>
       </w:tr>
       <w:tr>
+        <w:tblPrEx>
+          <w:tblCellMar>
+            <w:top w:w="0" w:type="dxa"/>
+            <w:bottom w:w="0" w:type="dxa"/>
+          </w:tblCellMar>
+        </w:tblPrEx>
         <w:tc>
           <w:tcPr>
             <w:tcW w:w="1700" w:type="dxa"/>
@@ -11064,10 +11469,10 @@
           <w:noProof/>
         </w:rPr>
         <w:drawing>
-          <wp:inline distT="0" distB="0" distL="0" distR="0" wp14:anchorId="5EF25B75" wp14:editId="12AB90D1">
-            <wp:extent cx="6096000" cy="3295650"/>
+          <wp:inline distT="0" distB="0" distL="0" distR="0" wp14:anchorId="636B9CC4" wp14:editId="326A087C">
+            <wp:extent cx="6096000" cy="2819400"/>
             <wp:effectExtent l="0" t="0" r="0" b="0"/>
-            <wp:docPr id="2083509568" name="Imagen 2083509568"/>
+            <wp:docPr id="519212223" name="Imagen 519212223"/>
             <wp:cNvGraphicFramePr>
               <a:graphicFrameLocks xmlns:a="http://schemas.openxmlformats.org/drawingml/2006/main" noChangeAspect="1"/>
             </wp:cNvGraphicFramePr>
@@ -11090,7 +11495,7 @@
                   <pic:spPr bwMode="auto">
                     <a:xfrm>
                       <a:off x="0" y="0"/>
-                      <a:ext cx="6096000" cy="3295650"/>
+                      <a:ext cx="6096000" cy="2819400"/>
                     </a:xfrm>
                     <a:prstGeom prst="rect">
                       <a:avLst/>
@@ -11184,10 +11589,10 @@
         </w:rPr>
         <w:lastRenderedPageBreak/>
         <w:drawing>
-          <wp:inline distT="0" distB="0" distL="0" distR="0" wp14:anchorId="5ADF5853" wp14:editId="454C3D0C">
-            <wp:extent cx="6096000" cy="3067050"/>
+          <wp:inline distT="0" distB="0" distL="0" distR="0" wp14:anchorId="28D44B80" wp14:editId="736127CB">
+            <wp:extent cx="6096000" cy="3057525"/>
             <wp:effectExtent l="0" t="0" r="0" b="0"/>
-            <wp:docPr id="670398065" name="Imagen 670398065"/>
+            <wp:docPr id="397979527" name="Imagen 397979527"/>
             <wp:cNvGraphicFramePr>
               <a:graphicFrameLocks xmlns:a="http://schemas.openxmlformats.org/drawingml/2006/main" noChangeAspect="1"/>
             </wp:cNvGraphicFramePr>
@@ -11210,7 +11615,7 @@
                   <pic:spPr bwMode="auto">
                     <a:xfrm>
                       <a:off x="0" y="0"/>
-                      <a:ext cx="6096000" cy="3067050"/>
+                      <a:ext cx="6096000" cy="3057525"/>
                     </a:xfrm>
                     <a:prstGeom prst="rect">
                       <a:avLst/>
@@ -11320,6 +11725,12 @@
         <w:gridCol w:w="7260"/>
       </w:tblGrid>
       <w:tr>
+        <w:tblPrEx>
+          <w:tblCellMar>
+            <w:top w:w="0" w:type="dxa"/>
+            <w:bottom w:w="0" w:type="dxa"/>
+          </w:tblCellMar>
+        </w:tblPrEx>
         <w:trPr>
           <w:tblHeader/>
         </w:trPr>
@@ -11379,6 +11790,12 @@
         </w:tc>
       </w:tr>
       <w:tr>
+        <w:tblPrEx>
+          <w:tblCellMar>
+            <w:top w:w="0" w:type="dxa"/>
+            <w:bottom w:w="0" w:type="dxa"/>
+          </w:tblCellMar>
+        </w:tblPrEx>
         <w:tc>
           <w:tcPr>
             <w:tcW w:w="2100" w:type="dxa"/>
@@ -11429,6 +11846,12 @@
         </w:tc>
       </w:tr>
       <w:tr>
+        <w:tblPrEx>
+          <w:tblCellMar>
+            <w:top w:w="0" w:type="dxa"/>
+            <w:bottom w:w="0" w:type="dxa"/>
+          </w:tblCellMar>
+        </w:tblPrEx>
         <w:tc>
           <w:tcPr>
             <w:tcW w:w="2100" w:type="dxa"/>
@@ -11479,6 +11902,12 @@
         </w:tc>
       </w:tr>
       <w:tr>
+        <w:tblPrEx>
+          <w:tblCellMar>
+            <w:top w:w="0" w:type="dxa"/>
+            <w:bottom w:w="0" w:type="dxa"/>
+          </w:tblCellMar>
+        </w:tblPrEx>
         <w:tc>
           <w:tcPr>
             <w:tcW w:w="2100" w:type="dxa"/>
@@ -11529,6 +11958,12 @@
         </w:tc>
       </w:tr>
       <w:tr>
+        <w:tblPrEx>
+          <w:tblCellMar>
+            <w:top w:w="0" w:type="dxa"/>
+            <w:bottom w:w="0" w:type="dxa"/>
+          </w:tblCellMar>
+        </w:tblPrEx>
         <w:tc>
           <w:tcPr>
             <w:tcW w:w="2100" w:type="dxa"/>
@@ -11579,6 +12014,12 @@
         </w:tc>
       </w:tr>
       <w:tr>
+        <w:tblPrEx>
+          <w:tblCellMar>
+            <w:top w:w="0" w:type="dxa"/>
+            <w:bottom w:w="0" w:type="dxa"/>
+          </w:tblCellMar>
+        </w:tblPrEx>
         <w:tc>
           <w:tcPr>
             <w:tcW w:w="2100" w:type="dxa"/>
@@ -11629,6 +12070,12 @@
         </w:tc>
       </w:tr>
       <w:tr>
+        <w:tblPrEx>
+          <w:tblCellMar>
+            <w:top w:w="0" w:type="dxa"/>
+            <w:bottom w:w="0" w:type="dxa"/>
+          </w:tblCellMar>
+        </w:tblPrEx>
         <w:tc>
           <w:tcPr>
             <w:tcW w:w="2100" w:type="dxa"/>
@@ -11679,6 +12126,12 @@
         </w:tc>
       </w:tr>
       <w:tr>
+        <w:tblPrEx>
+          <w:tblCellMar>
+            <w:top w:w="0" w:type="dxa"/>
+            <w:bottom w:w="0" w:type="dxa"/>
+          </w:tblCellMar>
+        </w:tblPrEx>
         <w:tc>
           <w:tcPr>
             <w:tcW w:w="2100" w:type="dxa"/>
@@ -11729,6 +12182,12 @@
         </w:tc>
       </w:tr>
       <w:tr>
+        <w:tblPrEx>
+          <w:tblCellMar>
+            <w:top w:w="0" w:type="dxa"/>
+            <w:bottom w:w="0" w:type="dxa"/>
+          </w:tblCellMar>
+        </w:tblPrEx>
         <w:tc>
           <w:tcPr>
             <w:tcW w:w="2100" w:type="dxa"/>
@@ -11779,6 +12238,12 @@
         </w:tc>
       </w:tr>
       <w:tr>
+        <w:tblPrEx>
+          <w:tblCellMar>
+            <w:top w:w="0" w:type="dxa"/>
+            <w:bottom w:w="0" w:type="dxa"/>
+          </w:tblCellMar>
+        </w:tblPrEx>
         <w:tc>
           <w:tcPr>
             <w:tcW w:w="2100" w:type="dxa"/>
@@ -11829,6 +12294,12 @@
         </w:tc>
       </w:tr>
       <w:tr>
+        <w:tblPrEx>
+          <w:tblCellMar>
+            <w:top w:w="0" w:type="dxa"/>
+            <w:bottom w:w="0" w:type="dxa"/>
+          </w:tblCellMar>
+        </w:tblPrEx>
         <w:tc>
           <w:tcPr>
             <w:tcW w:w="2100" w:type="dxa"/>
@@ -11879,6 +12350,12 @@
         </w:tc>
       </w:tr>
       <w:tr>
+        <w:tblPrEx>
+          <w:tblCellMar>
+            <w:top w:w="0" w:type="dxa"/>
+            <w:bottom w:w="0" w:type="dxa"/>
+          </w:tblCellMar>
+        </w:tblPrEx>
         <w:tc>
           <w:tcPr>
             <w:tcW w:w="2100" w:type="dxa"/>
@@ -11929,6 +12406,12 @@
         </w:tc>
       </w:tr>
       <w:tr>
+        <w:tblPrEx>
+          <w:tblCellMar>
+            <w:top w:w="0" w:type="dxa"/>
+            <w:bottom w:w="0" w:type="dxa"/>
+          </w:tblCellMar>
+        </w:tblPrEx>
         <w:tc>
           <w:tcPr>
             <w:tcW w:w="2100" w:type="dxa"/>
@@ -11979,6 +12462,12 @@
         </w:tc>
       </w:tr>
       <w:tr>
+        <w:tblPrEx>
+          <w:tblCellMar>
+            <w:top w:w="0" w:type="dxa"/>
+            <w:bottom w:w="0" w:type="dxa"/>
+          </w:tblCellMar>
+        </w:tblPrEx>
         <w:tc>
           <w:tcPr>
             <w:tcW w:w="2100" w:type="dxa"/>
@@ -12129,13 +12618,7 @@
         <w:spacing w:after="60" w:line="258" w:lineRule="auto"/>
       </w:pPr>
       <w:r>
-        <w:rPr>
-          <w:lang w:val="en-US"/>
-        </w:rPr>
-        <w:t xml:space="preserve">World Wide Web Consortium. Web Content Accessibility Guidelines (WCAG) 2.1. </w:t>
-      </w:r>
-      <w:r>
-        <w:t>W3C, 2018.</w:t>
+        <w:t>World Wide Web Consortium. Web Content Accessibility Guidelines (WCAG) 2.1. W3C, 2018.</w:t>
       </w:r>
     </w:p>
     <w:p>
@@ -12275,10 +12758,10 @@
 <file path=word/numbering.xml><?xml version="1.0" encoding="utf-8"?>
 <w:numbering xmlns:wpc="http://schemas.microsoft.com/office/word/2010/wordprocessingCanvas" xmlns:cx="http://schemas.microsoft.com/office/drawing/2014/chartex" xmlns:cx1="http://schemas.microsoft.com/office/drawing/2015/9/8/chartex" xmlns:cx2="http://schemas.microsoft.com/office/drawing/2015/10/21/chartex" xmlns:cx3="http://schemas.microsoft.com/office/drawing/2016/5/9/chartex" xmlns:cx4="http://schemas.microsoft.com/office/drawing/2016/5/10/chartex" xmlns:cx5="http://schemas.microsoft.com/office/drawing/2016/5/11/chartex" xmlns:cx6="http://schemas.microsoft.com/office/drawing/2016/5/12/chartex" xmlns:cx7="http://schemas.microsoft.com/office/drawing/2016/5/13/chartex" xmlns:cx8="http://schemas.microsoft.com/office/drawing/2016/5/14/chartex" xmlns:mc="http://schemas.openxmlformats.org/markup-compatibility/2006" xmlns:aink="http://schemas.microsoft.com/office/drawing/2016/ink" xmlns:am3d="http://schemas.microsoft.com/office/drawing/2017/model3d" xmlns:o="urn:schemas-microsoft-com:office:office" xmlns:oel="http://schemas.microsoft.com/office/2019/extlst" xmlns:r="http://schemas.openxmlformats.org/officeDocument/2006/relationships" xmlns:m="http://schemas.openxmlformats.org/officeDocument/2006/math" xmlns:v="urn:schemas-microsoft-com:vml" xmlns:wp14="http://schemas.microsoft.com/office/word/2010/wordprocessingDrawing" xmlns:wp="http://schemas.openxmlformats.org/drawingml/2006/wordprocessingDrawing" xmlns:w10="urn:schemas-microsoft-com:office:word" xmlns:w="http://schemas.openxmlformats.org/wordprocessingml/2006/main" xmlns:w14="http://schemas.microsoft.com/office/word/2010/wordml" xmlns:w15="http://schemas.microsoft.com/office/word/2012/wordml" xmlns:w16cex="http://schemas.microsoft.com/office/word/2018/wordml/cex" xmlns:w16cid="http://schemas.microsoft.com/office/word/2016/wordml/cid" xmlns:w16="http://schemas.microsoft.com/office/word/2018/wordml" xmlns:w16du="http://schemas.microsoft.com/office/word/2023/wordml/word16du" xmlns:w16sdtdh="http://schemas.microsoft.com/office/word/2020/wordml/sdtdatahash" xmlns:w16sdtfl="http://schemas.microsoft.com/office/word/2024/wordml/sdtformatlock" xmlns:w16se="http://schemas.microsoft.com/office/word/2015/wordml/symex" xmlns:wpg="http://schemas.microsoft.com/office/word/2010/wordprocessingGroup" xmlns:wpi="http://schemas.microsoft.com/office/word/2010/wordprocessingInk" xmlns:wne="http://schemas.microsoft.com/office/word/2006/wordml" xmlns:wps="http://schemas.microsoft.com/office/word/2010/wordprocessingShape" mc:Ignorable="w14 w15 w16se w16cid w16 w16cex w16sdtdh w16sdtfl w16du wp14">
   <w:abstractNum w:abstractNumId="0" w15:restartNumberingAfterBreak="0">
-    <w:nsid w:val="40320A26"/>
+    <w:nsid w:val="6FD62F9A"/>
     <w:multiLevelType w:val="hybridMultilevel"/>
-    <w:tmpl w:val="64BC0146"/>
-    <w:lvl w:ilvl="0" w:tplc="54301D8A">
+    <w:tmpl w:val="8C6C77CA"/>
+    <w:lvl w:ilvl="0" w:tplc="EF345288">
       <w:start w:val="1"/>
       <w:numFmt w:val="bullet"/>
       <w:lvlText w:val="●"/>
@@ -12287,7 +12770,7 @@
         <w:ind w:left="720" w:hanging="360"/>
       </w:pPr>
     </w:lvl>
-    <w:lvl w:ilvl="1" w:tplc="931AB72A">
+    <w:lvl w:ilvl="1" w:tplc="BAE6852A">
       <w:start w:val="1"/>
       <w:numFmt w:val="bullet"/>
       <w:lvlText w:val="○"/>
@@ -12296,7 +12779,7 @@
         <w:ind w:left="1440" w:hanging="360"/>
       </w:pPr>
     </w:lvl>
-    <w:lvl w:ilvl="2" w:tplc="3364FB54">
+    <w:lvl w:ilvl="2" w:tplc="1C122018">
       <w:start w:val="1"/>
       <w:numFmt w:val="bullet"/>
       <w:lvlText w:val="■"/>
@@ -12305,7 +12788,7 @@
         <w:ind w:left="2160" w:hanging="360"/>
       </w:pPr>
     </w:lvl>
-    <w:lvl w:ilvl="3" w:tplc="4F92134E">
+    <w:lvl w:ilvl="3" w:tplc="C262D686">
       <w:start w:val="1"/>
       <w:numFmt w:val="bullet"/>
       <w:lvlText w:val="●"/>
@@ -12314,7 +12797,7 @@
         <w:ind w:left="2880" w:hanging="360"/>
       </w:pPr>
     </w:lvl>
-    <w:lvl w:ilvl="4" w:tplc="1DC0A078">
+    <w:lvl w:ilvl="4" w:tplc="51327D04">
       <w:start w:val="1"/>
       <w:numFmt w:val="bullet"/>
       <w:lvlText w:val="○"/>
@@ -12323,7 +12806,7 @@
         <w:ind w:left="3600" w:hanging="360"/>
       </w:pPr>
     </w:lvl>
-    <w:lvl w:ilvl="5" w:tplc="959033BA">
+    <w:lvl w:ilvl="5" w:tplc="9C2CB624">
       <w:start w:val="1"/>
       <w:numFmt w:val="bullet"/>
       <w:lvlText w:val="■"/>
@@ -12332,7 +12815,7 @@
         <w:ind w:left="4320" w:hanging="360"/>
       </w:pPr>
     </w:lvl>
-    <w:lvl w:ilvl="6" w:tplc="F41A4C32">
+    <w:lvl w:ilvl="6" w:tplc="16D0AEB6">
       <w:start w:val="1"/>
       <w:numFmt w:val="bullet"/>
       <w:lvlText w:val="●"/>
@@ -12341,7 +12824,7 @@
         <w:ind w:left="5040" w:hanging="360"/>
       </w:pPr>
     </w:lvl>
-    <w:lvl w:ilvl="7" w:tplc="73944F50">
+    <w:lvl w:ilvl="7" w:tplc="313C57F6">
       <w:start w:val="1"/>
       <w:numFmt w:val="bullet"/>
       <w:lvlText w:val="●"/>
@@ -12350,7 +12833,7 @@
         <w:ind w:left="5760" w:hanging="360"/>
       </w:pPr>
     </w:lvl>
-    <w:lvl w:ilvl="8" w:tplc="0FE8A944">
+    <w:lvl w:ilvl="8" w:tplc="FED245FA">
       <w:start w:val="1"/>
       <w:numFmt w:val="bullet"/>
       <w:lvlText w:val="●"/>
@@ -12360,7 +12843,7 @@
       </w:pPr>
     </w:lvl>
   </w:abstractNum>
-  <w:num w:numId="1" w16cid:durableId="374618932">
+  <w:num w:numId="1" w16cid:durableId="1726028658">
     <w:abstractNumId w:val="0"/>
     <w:lvlOverride w:ilvl="0">
       <w:startOverride w:val="1"/>

</xml_diff>

<commit_message>
Documento las pantallas de usuarios, perfil y verificacion del correo
</commit_message>
<xml_diff>
--- a/docs/diseno/INVENTRA_Documento_Tecnico_Diseno.docx
+++ b/docs/diseno/INVENTRA_Documento_Tecnico_Diseno.docx
@@ -1257,7 +1257,7 @@
             <w:sz w:val="20"/>
             <w:szCs w:val="20"/>
           </w:rPr>
-          <w:t xml:space="preserve">7.4 Validaciones y mensajes</w:t>
+          <w:t xml:space="preserve">7.5 Verificación del correo</w:t>
         </w:r>
       </w:hyperlink>
       <w:r>
@@ -1280,8 +1280,43 @@
           <w:tab w:val="right" w:pos="9200" w:leader="dot"/>
         </w:tabs>
         <w:spacing w:after="40" w:line="252"/>
+        <w:ind w:left="360"/>
       </w:pPr>
       <w:hyperlink w:history="1" w:anchor="bm26">
+        <w:r>
+          <w:rPr>
+            <w:rFonts w:ascii="Arial" w:cs="Arial" w:eastAsia="Arial" w:hAnsi="Arial"/>
+            <w:b w:val="false"/>
+            <w:bCs w:val="false"/>
+            <w:color w:val="1F3864"/>
+            <w:sz w:val="20"/>
+            <w:szCs w:val="20"/>
+          </w:rPr>
+          <w:t xml:space="preserve">7.6 Validaciones y mensajes</w:t>
+        </w:r>
+      </w:hyperlink>
+      <w:r>
+        <w:rPr>
+          <w:rFonts w:ascii="Arial" w:cs="Arial" w:eastAsia="Arial" w:hAnsi="Arial"/>
+          <w:sz w:val="20"/>
+          <w:szCs w:val="20"/>
+        </w:rPr>
+        <w:t xml:space="preserve">	</w:t>
+      </w:r>
+      <w:r>
+        <w:fldChar w:fldCharType="begin" w:dirty="true"/>
+        <w:instrText xml:space="preserve">PAGEREF bm26</w:instrText>
+        <w:fldChar w:fldCharType="end"/>
+      </w:r>
+    </w:p>
+    <w:p>
+      <w:pPr>
+        <w:tabs>
+          <w:tab w:val="right" w:pos="9200" w:leader="dot"/>
+        </w:tabs>
+        <w:spacing w:after="40" w:line="252"/>
+      </w:pPr>
+      <w:hyperlink w:history="1" w:anchor="bm27">
         <w:r>
           <w:rPr>
             <w:rFonts w:ascii="Arial" w:cs="Arial" w:eastAsia="Arial" w:hAnsi="Arial"/>
@@ -1304,7 +1339,7 @@
       </w:r>
       <w:r>
         <w:fldChar w:fldCharType="begin" w:dirty="true"/>
-        <w:instrText xml:space="preserve">PAGEREF bm26</w:instrText>
+        <w:instrText xml:space="preserve">PAGEREF bm27</w:instrText>
         <w:fldChar w:fldCharType="end"/>
       </w:r>
     </w:p>
@@ -1316,7 +1351,7 @@
         <w:spacing w:after="40" w:line="252"/>
         <w:ind w:left="360"/>
       </w:pPr>
-      <w:hyperlink w:history="1" w:anchor="bm27">
+      <w:hyperlink w:history="1" w:anchor="bm28">
         <w:r>
           <w:rPr>
             <w:rFonts w:ascii="Arial" w:cs="Arial" w:eastAsia="Arial" w:hAnsi="Arial"/>
@@ -1339,7 +1374,7 @@
       </w:r>
       <w:r>
         <w:fldChar w:fldCharType="begin" w:dirty="true"/>
-        <w:instrText xml:space="preserve">PAGEREF bm27</w:instrText>
+        <w:instrText xml:space="preserve">PAGEREF bm28</w:instrText>
         <w:fldChar w:fldCharType="end"/>
       </w:r>
     </w:p>
@@ -1351,7 +1386,7 @@
         <w:spacing w:after="40" w:line="252"/>
         <w:ind w:left="360"/>
       </w:pPr>
-      <w:hyperlink w:history="1" w:anchor="bm28">
+      <w:hyperlink w:history="1" w:anchor="bm29">
         <w:r>
           <w:rPr>
             <w:rFonts w:ascii="Arial" w:cs="Arial" w:eastAsia="Arial" w:hAnsi="Arial"/>
@@ -1374,7 +1409,7 @@
       </w:r>
       <w:r>
         <w:fldChar w:fldCharType="begin" w:dirty="true"/>
-        <w:instrText xml:space="preserve">PAGEREF bm28</w:instrText>
+        <w:instrText xml:space="preserve">PAGEREF bm29</w:instrText>
         <w:fldChar w:fldCharType="end"/>
       </w:r>
     </w:p>
@@ -1386,7 +1421,7 @@
         <w:spacing w:after="40" w:line="252"/>
         <w:ind w:left="360"/>
       </w:pPr>
-      <w:hyperlink w:history="1" w:anchor="bm29">
+      <w:hyperlink w:history="1" w:anchor="bm30">
         <w:r>
           <w:rPr>
             <w:rFonts w:ascii="Arial" w:cs="Arial" w:eastAsia="Arial" w:hAnsi="Arial"/>
@@ -1409,7 +1444,7 @@
       </w:r>
       <w:r>
         <w:fldChar w:fldCharType="begin" w:dirty="true"/>
-        <w:instrText xml:space="preserve">PAGEREF bm29</w:instrText>
+        <w:instrText xml:space="preserve">PAGEREF bm30</w:instrText>
         <w:fldChar w:fldCharType="end"/>
       </w:r>
     </w:p>
@@ -1421,7 +1456,7 @@
         <w:spacing w:after="40" w:line="252"/>
         <w:ind w:left="360"/>
       </w:pPr>
-      <w:hyperlink w:history="1" w:anchor="bm30">
+      <w:hyperlink w:history="1" w:anchor="bm31">
         <w:r>
           <w:rPr>
             <w:rFonts w:ascii="Arial" w:cs="Arial" w:eastAsia="Arial" w:hAnsi="Arial"/>
@@ -1444,7 +1479,7 @@
       </w:r>
       <w:r>
         <w:fldChar w:fldCharType="begin" w:dirty="true"/>
-        <w:instrText xml:space="preserve">PAGEREF bm30</w:instrText>
+        <w:instrText xml:space="preserve">PAGEREF bm31</w:instrText>
         <w:fldChar w:fldCharType="end"/>
       </w:r>
     </w:p>
@@ -1456,7 +1491,7 @@
         <w:spacing w:after="40" w:line="252"/>
         <w:ind w:left="360"/>
       </w:pPr>
-      <w:hyperlink w:history="1" w:anchor="bm31">
+      <w:hyperlink w:history="1" w:anchor="bm32">
         <w:r>
           <w:rPr>
             <w:rFonts w:ascii="Arial" w:cs="Arial" w:eastAsia="Arial" w:hAnsi="Arial"/>
@@ -1479,7 +1514,7 @@
       </w:r>
       <w:r>
         <w:fldChar w:fldCharType="begin" w:dirty="true"/>
-        <w:instrText xml:space="preserve">PAGEREF bm31</w:instrText>
+        <w:instrText xml:space="preserve">PAGEREF bm32</w:instrText>
         <w:fldChar w:fldCharType="end"/>
       </w:r>
     </w:p>
@@ -1491,7 +1526,7 @@
         <w:spacing w:after="40" w:line="252"/>
         <w:ind w:left="360"/>
       </w:pPr>
-      <w:hyperlink w:history="1" w:anchor="bm32">
+      <w:hyperlink w:history="1" w:anchor="bm33">
         <w:r>
           <w:rPr>
             <w:rFonts w:ascii="Arial" w:cs="Arial" w:eastAsia="Arial" w:hAnsi="Arial"/>
@@ -1514,41 +1549,6 @@
       </w:r>
       <w:r>
         <w:fldChar w:fldCharType="begin" w:dirty="true"/>
-        <w:instrText xml:space="preserve">PAGEREF bm32</w:instrText>
-        <w:fldChar w:fldCharType="end"/>
-      </w:r>
-    </w:p>
-    <w:p>
-      <w:pPr>
-        <w:tabs>
-          <w:tab w:val="right" w:pos="9200" w:leader="dot"/>
-        </w:tabs>
-        <w:spacing w:after="40" w:line="252"/>
-        <w:ind w:left="360"/>
-      </w:pPr>
-      <w:hyperlink w:history="1" w:anchor="bm33">
-        <w:r>
-          <w:rPr>
-            <w:rFonts w:ascii="Arial" w:cs="Arial" w:eastAsia="Arial" w:hAnsi="Arial"/>
-            <w:b w:val="false"/>
-            <w:bCs w:val="false"/>
-            <w:color w:val="1F3864"/>
-            <w:sz w:val="20"/>
-            <w:szCs w:val="20"/>
-          </w:rPr>
-          <w:t xml:space="preserve">8.7 Mi suscripción</w:t>
-        </w:r>
-      </w:hyperlink>
-      <w:r>
-        <w:rPr>
-          <w:rFonts w:ascii="Arial" w:cs="Arial" w:eastAsia="Arial" w:hAnsi="Arial"/>
-          <w:sz w:val="20"/>
-          <w:szCs w:val="20"/>
-        </w:rPr>
-        <w:t xml:space="preserve">	</w:t>
-      </w:r>
-      <w:r>
-        <w:fldChar w:fldCharType="begin" w:dirty="true"/>
         <w:instrText xml:space="preserve">PAGEREF bm33</w:instrText>
         <w:fldChar w:fldCharType="end"/>
       </w:r>
@@ -1571,7 +1571,7 @@
             <w:sz w:val="20"/>
             <w:szCs w:val="20"/>
           </w:rPr>
-          <w:t xml:space="preserve">8.8 Plataforma</w:t>
+          <w:t xml:space="preserve">8.7 Usuarios de la licorera</w:t>
         </w:r>
       </w:hyperlink>
       <w:r>
@@ -1594,8 +1594,113 @@
           <w:tab w:val="right" w:pos="9200" w:leader="dot"/>
         </w:tabs>
         <w:spacing w:after="40" w:line="252"/>
+        <w:ind w:left="360"/>
       </w:pPr>
       <w:hyperlink w:history="1" w:anchor="bm35">
+        <w:r>
+          <w:rPr>
+            <w:rFonts w:ascii="Arial" w:cs="Arial" w:eastAsia="Arial" w:hAnsi="Arial"/>
+            <w:b w:val="false"/>
+            <w:bCs w:val="false"/>
+            <w:color w:val="1F3864"/>
+            <w:sz w:val="20"/>
+            <w:szCs w:val="20"/>
+          </w:rPr>
+          <w:t xml:space="preserve">8.8 Mi perfil</w:t>
+        </w:r>
+      </w:hyperlink>
+      <w:r>
+        <w:rPr>
+          <w:rFonts w:ascii="Arial" w:cs="Arial" w:eastAsia="Arial" w:hAnsi="Arial"/>
+          <w:sz w:val="20"/>
+          <w:szCs w:val="20"/>
+        </w:rPr>
+        <w:t xml:space="preserve">	</w:t>
+      </w:r>
+      <w:r>
+        <w:fldChar w:fldCharType="begin" w:dirty="true"/>
+        <w:instrText xml:space="preserve">PAGEREF bm35</w:instrText>
+        <w:fldChar w:fldCharType="end"/>
+      </w:r>
+    </w:p>
+    <w:p>
+      <w:pPr>
+        <w:tabs>
+          <w:tab w:val="right" w:pos="9200" w:leader="dot"/>
+        </w:tabs>
+        <w:spacing w:after="40" w:line="252"/>
+        <w:ind w:left="360"/>
+      </w:pPr>
+      <w:hyperlink w:history="1" w:anchor="bm36">
+        <w:r>
+          <w:rPr>
+            <w:rFonts w:ascii="Arial" w:cs="Arial" w:eastAsia="Arial" w:hAnsi="Arial"/>
+            <w:b w:val="false"/>
+            <w:bCs w:val="false"/>
+            <w:color w:val="1F3864"/>
+            <w:sz w:val="20"/>
+            <w:szCs w:val="20"/>
+          </w:rPr>
+          <w:t xml:space="preserve">8.9 Mi suscripción</w:t>
+        </w:r>
+      </w:hyperlink>
+      <w:r>
+        <w:rPr>
+          <w:rFonts w:ascii="Arial" w:cs="Arial" w:eastAsia="Arial" w:hAnsi="Arial"/>
+          <w:sz w:val="20"/>
+          <w:szCs w:val="20"/>
+        </w:rPr>
+        <w:t xml:space="preserve">	</w:t>
+      </w:r>
+      <w:r>
+        <w:fldChar w:fldCharType="begin" w:dirty="true"/>
+        <w:instrText xml:space="preserve">PAGEREF bm36</w:instrText>
+        <w:fldChar w:fldCharType="end"/>
+      </w:r>
+    </w:p>
+    <w:p>
+      <w:pPr>
+        <w:tabs>
+          <w:tab w:val="right" w:pos="9200" w:leader="dot"/>
+        </w:tabs>
+        <w:spacing w:after="40" w:line="252"/>
+        <w:ind w:left="360"/>
+      </w:pPr>
+      <w:hyperlink w:history="1" w:anchor="bm37">
+        <w:r>
+          <w:rPr>
+            <w:rFonts w:ascii="Arial" w:cs="Arial" w:eastAsia="Arial" w:hAnsi="Arial"/>
+            <w:b w:val="false"/>
+            <w:bCs w:val="false"/>
+            <w:color w:val="1F3864"/>
+            <w:sz w:val="20"/>
+            <w:szCs w:val="20"/>
+          </w:rPr>
+          <w:t xml:space="preserve">8.10 Plataforma</w:t>
+        </w:r>
+      </w:hyperlink>
+      <w:r>
+        <w:rPr>
+          <w:rFonts w:ascii="Arial" w:cs="Arial" w:eastAsia="Arial" w:hAnsi="Arial"/>
+          <w:sz w:val="20"/>
+          <w:szCs w:val="20"/>
+        </w:rPr>
+        <w:t xml:space="preserve">	</w:t>
+      </w:r>
+      <w:r>
+        <w:fldChar w:fldCharType="begin" w:dirty="true"/>
+        <w:instrText xml:space="preserve">PAGEREF bm37</w:instrText>
+        <w:fldChar w:fldCharType="end"/>
+      </w:r>
+    </w:p>
+    <w:p>
+      <w:pPr>
+        <w:tabs>
+          <w:tab w:val="right" w:pos="9200" w:leader="dot"/>
+        </w:tabs>
+        <w:spacing w:after="40" w:line="252"/>
+      </w:pPr>
+      <w:hyperlink w:history="1" w:anchor="bm38">
         <w:r>
           <w:rPr>
             <w:rFonts w:ascii="Arial" w:cs="Arial" w:eastAsia="Arial" w:hAnsi="Arial"/>
@@ -1618,7 +1723,7 @@
       </w:r>
       <w:r>
         <w:fldChar w:fldCharType="begin" w:dirty="true"/>
-        <w:instrText xml:space="preserve">PAGEREF bm35</w:instrText>
+        <w:instrText xml:space="preserve">PAGEREF bm38</w:instrText>
         <w:fldChar w:fldCharType="end"/>
       </w:r>
     </w:p>
@@ -1630,7 +1735,7 @@
         <w:spacing w:after="40" w:line="252"/>
         <w:ind w:left="360"/>
       </w:pPr>
-      <w:hyperlink w:history="1" w:anchor="bm36">
+      <w:hyperlink w:history="1" w:anchor="bm39">
         <w:r>
           <w:rPr>
             <w:rFonts w:ascii="Arial" w:cs="Arial" w:eastAsia="Arial" w:hAnsi="Arial"/>
@@ -1653,7 +1758,7 @@
       </w:r>
       <w:r>
         <w:fldChar w:fldCharType="begin" w:dirty="true"/>
-        <w:instrText xml:space="preserve">PAGEREF bm36</w:instrText>
+        <w:instrText xml:space="preserve">PAGEREF bm39</w:instrText>
         <w:fldChar w:fldCharType="end"/>
       </w:r>
     </w:p>
@@ -1665,7 +1770,7 @@
         <w:spacing w:after="40" w:line="252"/>
         <w:ind w:left="360"/>
       </w:pPr>
-      <w:hyperlink w:history="1" w:anchor="bm37">
+      <w:hyperlink w:history="1" w:anchor="bm40">
         <w:r>
           <w:rPr>
             <w:rFonts w:ascii="Arial" w:cs="Arial" w:eastAsia="Arial" w:hAnsi="Arial"/>
@@ -1688,7 +1793,7 @@
       </w:r>
       <w:r>
         <w:fldChar w:fldCharType="begin" w:dirty="true"/>
-        <w:instrText xml:space="preserve">PAGEREF bm37</w:instrText>
+        <w:instrText xml:space="preserve">PAGEREF bm40</w:instrText>
         <w:fldChar w:fldCharType="end"/>
       </w:r>
     </w:p>
@@ -1699,7 +1804,7 @@
         </w:tabs>
         <w:spacing w:after="40" w:line="252"/>
       </w:pPr>
-      <w:hyperlink w:history="1" w:anchor="bm38">
+      <w:hyperlink w:history="1" w:anchor="bm41">
         <w:r>
           <w:rPr>
             <w:rFonts w:ascii="Arial" w:cs="Arial" w:eastAsia="Arial" w:hAnsi="Arial"/>
@@ -1722,7 +1827,7 @@
       </w:r>
       <w:r>
         <w:fldChar w:fldCharType="begin" w:dirty="true"/>
-        <w:instrText xml:space="preserve">PAGEREF bm38</w:instrText>
+        <w:instrText xml:space="preserve">PAGEREF bm41</w:instrText>
         <w:fldChar w:fldCharType="end"/>
       </w:r>
     </w:p>
@@ -1734,7 +1839,7 @@
         <w:spacing w:after="40" w:line="252"/>
         <w:ind w:left="360"/>
       </w:pPr>
-      <w:hyperlink w:history="1" w:anchor="bm39">
+      <w:hyperlink w:history="1" w:anchor="bm42">
         <w:r>
           <w:rPr>
             <w:rFonts w:ascii="Arial" w:cs="Arial" w:eastAsia="Arial" w:hAnsi="Arial"/>
@@ -1757,7 +1862,7 @@
       </w:r>
       <w:r>
         <w:fldChar w:fldCharType="begin" w:dirty="true"/>
-        <w:instrText xml:space="preserve">PAGEREF bm39</w:instrText>
+        <w:instrText xml:space="preserve">PAGEREF bm42</w:instrText>
         <w:fldChar w:fldCharType="end"/>
       </w:r>
     </w:p>
@@ -1769,7 +1874,7 @@
         <w:spacing w:after="40" w:line="252"/>
         <w:ind w:left="360"/>
       </w:pPr>
-      <w:hyperlink w:history="1" w:anchor="bm40">
+      <w:hyperlink w:history="1" w:anchor="bm43">
         <w:r>
           <w:rPr>
             <w:rFonts w:ascii="Arial" w:cs="Arial" w:eastAsia="Arial" w:hAnsi="Arial"/>
@@ -1792,7 +1897,7 @@
       </w:r>
       <w:r>
         <w:fldChar w:fldCharType="begin" w:dirty="true"/>
-        <w:instrText xml:space="preserve">PAGEREF bm40</w:instrText>
+        <w:instrText xml:space="preserve">PAGEREF bm43</w:instrText>
         <w:fldChar w:fldCharType="end"/>
       </w:r>
     </w:p>
@@ -1804,7 +1909,7 @@
         <w:spacing w:after="40" w:line="252"/>
         <w:ind w:left="360"/>
       </w:pPr>
-      <w:hyperlink w:history="1" w:anchor="bm41">
+      <w:hyperlink w:history="1" w:anchor="bm44">
         <w:r>
           <w:rPr>
             <w:rFonts w:ascii="Arial" w:cs="Arial" w:eastAsia="Arial" w:hAnsi="Arial"/>
@@ -1827,7 +1932,7 @@
       </w:r>
       <w:r>
         <w:fldChar w:fldCharType="begin" w:dirty="true"/>
-        <w:instrText xml:space="preserve">PAGEREF bm41</w:instrText>
+        <w:instrText xml:space="preserve">PAGEREF bm44</w:instrText>
         <w:fldChar w:fldCharType="end"/>
       </w:r>
     </w:p>
@@ -1838,7 +1943,7 @@
         </w:tabs>
         <w:spacing w:after="40" w:line="252"/>
       </w:pPr>
-      <w:hyperlink w:history="1" w:anchor="bm42">
+      <w:hyperlink w:history="1" w:anchor="bm45">
         <w:r>
           <w:rPr>
             <w:rFonts w:ascii="Arial" w:cs="Arial" w:eastAsia="Arial" w:hAnsi="Arial"/>
@@ -1861,7 +1966,7 @@
       </w:r>
       <w:r>
         <w:fldChar w:fldCharType="begin" w:dirty="true"/>
-        <w:instrText xml:space="preserve">PAGEREF bm42</w:instrText>
+        <w:instrText xml:space="preserve">PAGEREF bm45</w:instrText>
         <w:fldChar w:fldCharType="end"/>
       </w:r>
     </w:p>
@@ -1872,7 +1977,7 @@
         </w:tabs>
         <w:spacing w:after="40" w:line="252"/>
       </w:pPr>
-      <w:hyperlink w:history="1" w:anchor="bm43">
+      <w:hyperlink w:history="1" w:anchor="bm46">
         <w:r>
           <w:rPr>
             <w:rFonts w:ascii="Arial" w:cs="Arial" w:eastAsia="Arial" w:hAnsi="Arial"/>
@@ -1895,7 +2000,7 @@
       </w:r>
       <w:r>
         <w:fldChar w:fldCharType="begin" w:dirty="true"/>
-        <w:instrText xml:space="preserve">PAGEREF bm43</w:instrText>
+        <w:instrText xml:space="preserve">PAGEREF bm46</w:instrText>
         <w:fldChar w:fldCharType="end"/>
       </w:r>
     </w:p>
@@ -1906,7 +2011,7 @@
         </w:tabs>
         <w:spacing w:after="40" w:line="252"/>
       </w:pPr>
-      <w:hyperlink w:history="1" w:anchor="bm44">
+      <w:hyperlink w:history="1" w:anchor="bm47">
         <w:r>
           <w:rPr>
             <w:rFonts w:ascii="Arial" w:cs="Arial" w:eastAsia="Arial" w:hAnsi="Arial"/>
@@ -1929,7 +2034,7 @@
       </w:r>
       <w:r>
         <w:fldChar w:fldCharType="begin" w:dirty="true"/>
-        <w:instrText xml:space="preserve">PAGEREF bm44</w:instrText>
+        <w:instrText xml:space="preserve">PAGEREF bm47</w:instrText>
         <w:fldChar w:fldCharType="end"/>
       </w:r>
     </w:p>
@@ -9414,7 +9519,72 @@
           <w:sz w:val="23"/>
           <w:szCs w:val="23"/>
         </w:rPr>
-        <w:t xml:space="preserve">7.4 Validaciones y mensajes</w:t>
+        <w:t xml:space="preserve">7.5 Verificación del correo</w:t>
+      </w:r>
+      <w:bookmarkEnd w:id="1"/>
+    </w:p>
+    <w:p>
+      <w:pPr>
+        <w:spacing w:after="110" w:line="262"/>
+        <w:jc w:val="both"/>
+      </w:pPr>
+      <w:r>
+        <w:rPr>
+          <w:rFonts w:ascii="Arial" w:cs="Arial" w:eastAsia="Arial" w:hAnsi="Arial"/>
+          <w:sz w:val="22"/>
+          <w:szCs w:val="22"/>
+        </w:rPr>
+        <w:t xml:space="preserve">Al registrarse, el sistema envía al correo indicado un enlace de vigencia limitada para confirmarlo. La cuenta </w:t>
+      </w:r>
+      <w:r>
+        <w:rPr>
+          <w:rFonts w:ascii="Arial" w:cs="Arial" w:eastAsia="Arial" w:hAnsi="Arial"/>
+          <w:b/>
+          <w:bCs/>
+          <w:sz w:val="22"/>
+          <w:szCs w:val="22"/>
+        </w:rPr>
+        <w:t xml:space="preserve">entra sin esperar la confirmación</w:t>
+      </w:r>
+      <w:r>
+        <w:rPr>
+          <w:rFonts w:ascii="Arial" w:cs="Arial" w:eastAsia="Arial" w:hAnsi="Arial"/>
+          <w:sz w:val="22"/>
+          <w:szCs w:val="22"/>
+        </w:rPr>
+        <w:t xml:space="preserve"> y opera con normalidad; lo único que cambia es una franja de aviso, visible en todas las pantallas internas, que recuerda el paso pendiente y ofrece reenviar el enlace. Se decidió así porque bloquear el acceso hasta confirmar deja fuera a quien se equivocó al escribir su dirección, que es justo quien más necesita entrar para corregirla.</w:t>
+      </w:r>
+    </w:p>
+    <w:p>
+      <w:pPr>
+        <w:spacing w:after="110" w:line="262"/>
+        <w:jc w:val="both"/>
+      </w:pPr>
+      <w:r>
+        <w:rPr>
+          <w:rFonts w:ascii="Arial" w:cs="Arial" w:eastAsia="Arial" w:hAnsi="Arial"/>
+          <w:sz w:val="22"/>
+          <w:szCs w:val="22"/>
+        </w:rPr>
+        <w:t xml:space="preserve">Al abrir el enlace se muestra una pantalla de confirmación con el resultado y el acceso al inicio de sesión. Abrirlo dos veces responde lo mismo: confirmar lo ya confirmado no cambia nada. Si el plazo venció, el mensaje lo dice y ofrece pedir otro enlace. El plazo y el reenvío se describen en el requisito RF-SUS-01.</w:t>
+      </w:r>
+    </w:p>
+    <w:p>
+      <w:pPr>
+        <w:pStyle w:val="Heading2"/>
+        <w:spacing w:after="80" w:before="150"/>
+      </w:pPr>
+      <w:bookmarkStart w:name="bm26" w:id="1"/>
+      <w:r>
+        <w:rPr>
+          <w:rFonts w:ascii="Arial" w:cs="Arial" w:eastAsia="Arial" w:hAnsi="Arial"/>
+          <w:b/>
+          <w:bCs/>
+          <w:color w:val="2E5496"/>
+          <w:sz w:val="23"/>
+          <w:szCs w:val="23"/>
+        </w:rPr>
+        <w:t xml:space="preserve">7.6 Validaciones y mensajes</w:t>
       </w:r>
       <w:bookmarkEnd w:id="1"/>
     </w:p>
@@ -10062,7 +10232,7 @@
         <w:pageBreakBefore/>
         <w:spacing w:after="110" w:before="220"/>
       </w:pPr>
-      <w:bookmarkStart w:name="bm26" w:id="1"/>
+      <w:bookmarkStart w:name="bm27" w:id="1"/>
       <w:r>
         <w:rPr>
           <w:rFonts w:ascii="Arial" w:cs="Arial" w:eastAsia="Arial" w:hAnsi="Arial"/>
@@ -10095,7 +10265,7 @@
         <w:pStyle w:val="Heading2"/>
         <w:spacing w:after="80" w:before="150"/>
       </w:pPr>
-      <w:bookmarkStart w:name="bm27" w:id="1"/>
+      <w:bookmarkStart w:name="bm28" w:id="1"/>
       <w:r>
         <w:rPr>
           <w:rFonts w:ascii="Arial" w:cs="Arial" w:eastAsia="Arial" w:hAnsi="Arial"/>
@@ -10191,7 +10361,7 @@
         <w:pStyle w:val="Heading2"/>
         <w:spacing w:after="80" w:before="150"/>
       </w:pPr>
-      <w:bookmarkStart w:name="bm28" w:id="1"/>
+      <w:bookmarkStart w:name="bm29" w:id="1"/>
       <w:r>
         <w:rPr>
           <w:rFonts w:ascii="Arial" w:cs="Arial" w:eastAsia="Arial" w:hAnsi="Arial"/>
@@ -10284,7 +10454,7 @@
           <w:sz w:val="22"/>
           <w:szCs w:val="22"/>
         </w:rPr>
-        <w:t xml:space="preserve">Sobre los indicadores puede aparecer una franja con el estado de la suscripción, que solo se muestra cuando hay algo que decir y por eso no figura en la imagen (RF-SUS-03). Son cuatro situaciones, y el color de cada una corresponde al tipo de mensaje definido en el apartado 6.4: durante el período de prueba se informa cuántos días faltan para que termine; en los tres días previos al vencimiento del plan contratado, y durante los cuatro días posteriores en que el negocio sigue operando con normalidad, el mensaje es de advertencia; y cuando la suscripción deja de estar vigente pasa a ser de error, porque desde ese momento la información se puede consultar pero no registrar. Mientras la fecha de vencimiento está lejos, la franja no aparece. Los tres colores se ilustran en la figura 18.</w:t>
+        <w:t xml:space="preserve">Sobre los indicadores puede aparecer una franja con el estado de la suscripción, que solo se muestra cuando hay algo que decir y por eso no figura en la imagen (RF-SUS-03). Son cuatro situaciones, y el color de cada una corresponde al tipo de mensaje definido en el apartado 6.4: durante el período de prueba se informa cuántos días faltan para que termine; en los tres días previos al vencimiento del plan contratado, y durante los cuatro días posteriores en que el negocio sigue operando con normalidad, el mensaje es de advertencia; y cuando la suscripción deja de estar vigente pasa a ser de error, porque desde ese momento la información se puede consultar pero no registrar. Mientras la fecha de vencimiento está lejos, la franja no aparece. Los tres colores se ilustran en la figura 20.</w:t>
       </w:r>
     </w:p>
     <w:p>
@@ -10355,7 +10525,7 @@
         <w:pStyle w:val="Heading2"/>
         <w:spacing w:after="80" w:before="150"/>
       </w:pPr>
-      <w:bookmarkStart w:name="bm29" w:id="1"/>
+      <w:bookmarkStart w:name="bm30" w:id="1"/>
       <w:r>
         <w:rPr>
           <w:rFonts w:ascii="Arial" w:cs="Arial" w:eastAsia="Arial" w:hAnsi="Arial"/>
@@ -10451,7 +10621,7 @@
         <w:pStyle w:val="Heading2"/>
         <w:spacing w:after="80" w:before="150"/>
       </w:pPr>
-      <w:bookmarkStart w:name="bm30" w:id="1"/>
+      <w:bookmarkStart w:name="bm31" w:id="1"/>
       <w:r>
         <w:rPr>
           <w:rFonts w:ascii="Arial" w:cs="Arial" w:eastAsia="Arial" w:hAnsi="Arial"/>
@@ -10547,7 +10717,7 @@
         <w:pStyle w:val="Heading2"/>
         <w:spacing w:after="80" w:before="150"/>
       </w:pPr>
-      <w:bookmarkStart w:name="bm31" w:id="1"/>
+      <w:bookmarkStart w:name="bm32" w:id="1"/>
       <w:r>
         <w:rPr>
           <w:rFonts w:ascii="Arial" w:cs="Arial" w:eastAsia="Arial" w:hAnsi="Arial"/>
@@ -10657,7 +10827,7 @@
         <w:pStyle w:val="Heading2"/>
         <w:spacing w:after="80" w:before="150"/>
       </w:pPr>
-      <w:bookmarkStart w:name="bm32" w:id="1"/>
+      <w:bookmarkStart w:name="bm33" w:id="1"/>
       <w:r>
         <w:rPr>
           <w:rFonts w:ascii="Arial" w:cs="Arial" w:eastAsia="Arial" w:hAnsi="Arial"/>
@@ -10753,7 +10923,7 @@
         <w:pStyle w:val="Heading2"/>
         <w:spacing w:after="80" w:before="150"/>
       </w:pPr>
-      <w:bookmarkStart w:name="bm33" w:id="1"/>
+      <w:bookmarkStart w:name="bm34" w:id="1"/>
       <w:r>
         <w:rPr>
           <w:rFonts w:ascii="Arial" w:cs="Arial" w:eastAsia="Arial" w:hAnsi="Arial"/>
@@ -10763,7 +10933,7 @@
           <w:sz w:val="23"/>
           <w:szCs w:val="23"/>
         </w:rPr>
-        <w:t xml:space="preserve">8.7 Mi suscripción</w:t>
+        <w:t xml:space="preserve">8.7 Usuarios de la licorera</w:t>
       </w:r>
       <w:bookmarkEnd w:id="1"/>
     </w:p>
@@ -10778,7 +10948,7 @@
           <w:sz w:val="22"/>
           <w:szCs w:val="22"/>
         </w:rPr>
-        <w:t xml:space="preserve">Reúne en una sola pantalla lo que el negocio necesita saber de su contratación: el plan vigente con su estado, la fecha hasta la que vale y los días que faltan. Cuando la suscripción ha vencido y corre el plazo de gracia, el segundo indicador cambia de sentido y pasa a contar los días que quedan antes de la suspensión, porque esa es la cifra que obliga a actuar.</w:t>
+        <w:t xml:space="preserve">Es la pantalla con la que el administrador decide quién entra a su negocio. Bajo el título se indica cuántas cuentas están activas de las registradas, porque es esa cifra —y no el total— la que el plan contratado limita. La acción principal, en la esquina superior, registra una cuenta nueva.</w:t>
       </w:r>
     </w:p>
     <w:p>
@@ -10792,7 +10962,7 @@
           <w:sz w:val="22"/>
           <w:szCs w:val="22"/>
         </w:rPr>
-        <w:t xml:space="preserve">Debajo se listan los planes disponibles con lo que incluye cada uno, tomado del propio plan y no de un texto fijo, de modo que un plan nuevo aparece sin tocar la pantalla. El plan contratado se señala y no ofrece acción. Solo se ofrece el botón de los planes más económicos: bajar de plan no implica cobro y lo ejecuta el propio negocio, mientras que subir se contrata con INVENTRA, que lo activa al confirmar el pago. La pantalla lo dice con esas palabras en lugar de ocultar el plan superior, porque el negocio necesita saber cómo se contrata.</w:t>
+        <w:t xml:space="preserve">La tabla presenta el nombre, el correo, el rol y el estado de cada cuenta, con la fila propia señalada. Las acciones de cada fila son editar y, según el estado, inactivar o reactivar. No hay acción de borrado: una cuenta que ha registrado operaciones no se elimina, se inactiva, de modo que el histórico conserva quién hizo qué. Tampoco aparece la acción de inactivarse a uno mismo.</w:t>
       </w:r>
     </w:p>
     <w:p>
@@ -10806,7 +10976,7 @@
           <w:sz w:val="22"/>
           <w:szCs w:val="22"/>
         </w:rPr>
-        <w:t xml:space="preserve">Antes de bajar de plan se pide confirmación, con el detalle de lo que se pierde. Si la licorera tiene más usuarios o más sedes de los que admite el plan de destino, el sistema rechaza el cambio y dice cuántos sobran, sin inactivar nada por su cuenta: esa decisión es del negocio.</w:t>
+        <w:t xml:space="preserve">Cuando el plan contratado no admite más cuentas activas, el sistema rechaza el alta y lo dice con la cifra concreta; y cuando la suscripción no está vigente, las acciones de registrar y modificar desaparecen y en su lugar se explica el motivo con el acceso a «Mi suscripción». Ambos textos los redacta el servidor, que es quien conoce la razón del rechazo.</w:t>
       </w:r>
     </w:p>
     <w:p>
@@ -10817,7 +10987,7 @@
       <w:r>
         <w:drawing>
           <wp:inline distT="0" distB="0" distL="0" distR="0">
-            <wp:extent cx="6096000" cy="3067050"/>
+            <wp:extent cx="6096000" cy="2857500"/>
             <wp:effectExtent t="0" r="0" b="0" l="0"/>
             <wp:docPr id="1" name="" descr="" title=""/>
             <wp:cNvGraphicFramePr>
@@ -10842,7 +11012,7 @@
                   <pic:spPr bwMode="auto">
                     <a:xfrm>
                       <a:off x="0" y="0"/>
-                      <a:ext cx="6096000" cy="3067050"/>
+                      <a:ext cx="6096000" cy="2857500"/>
                     </a:xfrm>
                     <a:prstGeom prst="rect">
                       <a:avLst/>
@@ -10869,7 +11039,7 @@
           <w:sz w:val="18"/>
           <w:szCs w:val="18"/>
         </w:rPr>
-        <w:t xml:space="preserve">Figura 16. Mi suscripción. Fuente: del autor.</w:t>
+        <w:t xml:space="preserve">Figura 16. Usuarios de la licorera. Fuente: del autor.</w:t>
       </w:r>
     </w:p>
     <w:p>
@@ -10877,7 +11047,7 @@
         <w:pStyle w:val="Heading2"/>
         <w:spacing w:after="80" w:before="150"/>
       </w:pPr>
-      <w:bookmarkStart w:name="bm34" w:id="1"/>
+      <w:bookmarkStart w:name="bm35" w:id="1"/>
       <w:r>
         <w:rPr>
           <w:rFonts w:ascii="Arial" w:cs="Arial" w:eastAsia="Arial" w:hAnsi="Arial"/>
@@ -10887,7 +11057,7 @@
           <w:sz w:val="23"/>
           <w:szCs w:val="23"/>
         </w:rPr>
-        <w:t xml:space="preserve">8.8 Plataforma</w:t>
+        <w:t xml:space="preserve">8.8 Mi perfil</w:t>
       </w:r>
       <w:bookmarkEnd w:id="1"/>
     </w:p>
@@ -10902,7 +11072,7 @@
           <w:sz w:val="22"/>
           <w:szCs w:val="22"/>
         </w:rPr>
-        <w:t xml:space="preserve">Es la pantalla del administrador de INVENTRA, no la de un negocio, y es la única que no pertenece a ninguna licorera. Reúne las tres cifras globales del servicio —licoreras registradas, cuentas con suscripción vigente e ingreso mensual contratado— y, debajo, el listado de las licoreras con su contacto, el plan, el estado de la suscripción, la fecha hasta la que vale y el número de cuentas que tiene abiertas.</w:t>
+        <w:t xml:space="preserve">Reúne lo que cada persona puede consultar y cambiar de su propia cuenta, sin importar su rol. Se divide en tres bloques: los datos que administra INVENTRA y no se editan desde aquí —correo, rol y licorera—, los datos personales que sí se editan —nombre y teléfono—, y el cambio de contraseña.</w:t>
       </w:r>
     </w:p>
     <w:p>
@@ -10916,35 +11086,7 @@
           <w:sz w:val="22"/>
           <w:szCs w:val="22"/>
         </w:rPr>
-        <w:t xml:space="preserve">El listado no muestra ningún dato comercial de los negocios: ni sus productos, ni sus ventas, ni sus importes. La restricción es del requisito y está resuelta en el servidor, que sencillamente no devuelve esa información; la pantalla no tiene nada que ocultar porque nunca la recibe.</w:t>
-      </w:r>
-    </w:p>
-    <w:p>
-      <w:pPr>
-        <w:spacing w:after="110" w:line="262"/>
-        <w:jc w:val="both"/>
-      </w:pPr>
-      <w:r>
-        <w:rPr>
-          <w:rFonts w:ascii="Arial" w:cs="Arial" w:eastAsia="Arial" w:hAnsi="Arial"/>
-          <w:sz w:val="22"/>
-          <w:szCs w:val="22"/>
-        </w:rPr>
-        <w:t xml:space="preserve">Desde aquí se ejecutan las tres operaciones que le corresponden a quien cobra el servicio: dar de alta una licorera, que crea el negocio y la cuenta de su administrador y le envía el enlace para que defina su propia contraseña; abrir un período, que es la misma operación para renovar y para subir de plan, porque en los dos casos se cierra la suscripción anterior y se inicia otra con su fecha de vencimiento; y corregir la fecha de una suscripción vigente, prevista para enmendar una fecha mal escrita y no para renovar. Bajar de plan no aparece en esta pantalla: esa operación la ejecuta el propio negocio desde la suya, según se explica en el apartado anterior.</w:t>
-      </w:r>
-    </w:p>
-    <w:p>
-      <w:pPr>
-        <w:spacing w:after="110" w:line="262"/>
-        <w:jc w:val="both"/>
-      </w:pPr>
-      <w:r>
-        <w:rPr>
-          <w:rFonts w:ascii="Arial" w:cs="Arial" w:eastAsia="Arial" w:hAnsi="Arial"/>
-          <w:sz w:val="22"/>
-          <w:szCs w:val="22"/>
-        </w:rPr>
-        <w:t xml:space="preserve">La navegación lateral de este rol es distinta: no se le presentan los módulos de inventario, ventas o sedes, porque no administra un negocio sino el servicio.</w:t>
+        <w:t xml:space="preserve">El correo no se edita porque identifica la cuenta en toda la plataforma y cambiarlo equivaldría a cambiar de cuenta; el rol y la licorera los asigna quien administra, no su titular. Al cambiar la contraseña se cierran las demás sesiones abiertas, de modo que una contraseña comprometida deja de servir en cuanto su dueño reacciona.</w:t>
       </w:r>
     </w:p>
     <w:p>
@@ -10955,7 +11097,7 @@
       <w:r>
         <w:drawing>
           <wp:inline distT="0" distB="0" distL="0" distR="0">
-            <wp:extent cx="6096000" cy="4114800"/>
+            <wp:extent cx="6096000" cy="3562350"/>
             <wp:effectExtent t="0" r="0" b="0" l="0"/>
             <wp:docPr id="1" name="" descr="" title=""/>
             <wp:cNvGraphicFramePr>
@@ -10980,7 +11122,7 @@
                   <pic:spPr bwMode="auto">
                     <a:xfrm>
                       <a:off x="0" y="0"/>
-                      <a:ext cx="6096000" cy="4114800"/>
+                      <a:ext cx="6096000" cy="3562350"/>
                     </a:xfrm>
                     <a:prstGeom prst="rect">
                       <a:avLst/>
@@ -11007,26 +11149,25 @@
           <w:sz w:val="18"/>
           <w:szCs w:val="18"/>
         </w:rPr>
-        <w:t xml:space="preserve">Figura 17. Plataforma: licoreras registradas y sus suscripciones. Fuente: del autor.</w:t>
-      </w:r>
-    </w:p>
-    <w:p>
-      <w:pPr>
-        <w:pStyle w:val="Heading1"/>
-        <w:pageBreakBefore/>
-        <w:spacing w:after="110" w:before="220"/>
-      </w:pPr>
-      <w:bookmarkStart w:name="bm35" w:id="1"/>
+        <w:t xml:space="preserve">Figura 17. Mi perfil. Fuente: del autor.</w:t>
+      </w:r>
+    </w:p>
+    <w:p>
+      <w:pPr>
+        <w:pStyle w:val="Heading2"/>
+        <w:spacing w:after="80" w:before="150"/>
+      </w:pPr>
+      <w:bookmarkStart w:name="bm36" w:id="1"/>
       <w:r>
         <w:rPr>
           <w:rFonts w:ascii="Arial" w:cs="Arial" w:eastAsia="Arial" w:hAnsi="Arial"/>
           <w:b/>
           <w:bCs/>
-          <w:color w:val="1F3864"/>
-          <w:sz w:val="27"/>
-          <w:szCs w:val="27"/>
-        </w:rPr>
-        <w:t xml:space="preserve">9. Mensajes y estados de pantalla</w:t>
+          <w:color w:val="2E5496"/>
+          <w:sz w:val="23"/>
+          <w:szCs w:val="23"/>
+        </w:rPr>
+        <w:t xml:space="preserve">8.9 Mi suscripción</w:t>
       </w:r>
       <w:bookmarkEnd w:id="1"/>
     </w:p>
@@ -11041,7 +11182,35 @@
           <w:sz w:val="22"/>
           <w:szCs w:val="22"/>
         </w:rPr>
-        <w:t xml:space="preserve">Además de los componentes descritos en la sección 6, la interfaz define cómo se comporta una pantalla cuando no hay información que mostrar, cuando los datos aún se están cargando o cuando una operación falla. El objetivo es que el usuario siempre sepa qué ocurre y qué puede hacer a continuación.</w:t>
+        <w:t xml:space="preserve">Reúne en una sola pantalla lo que el negocio necesita saber de su contratación: el plan vigente con su estado, la fecha hasta la que vale y los días que faltan. Cuando la suscripción ha vencido y corre el plazo de gracia, el segundo indicador cambia de sentido y pasa a contar los días que quedan antes de la suspensión, porque esa es la cifra que obliga a actuar.</w:t>
+      </w:r>
+    </w:p>
+    <w:p>
+      <w:pPr>
+        <w:spacing w:after="110" w:line="262"/>
+        <w:jc w:val="both"/>
+      </w:pPr>
+      <w:r>
+        <w:rPr>
+          <w:rFonts w:ascii="Arial" w:cs="Arial" w:eastAsia="Arial" w:hAnsi="Arial"/>
+          <w:sz w:val="22"/>
+          <w:szCs w:val="22"/>
+        </w:rPr>
+        <w:t xml:space="preserve">Debajo se listan los planes disponibles con lo que incluye cada uno, tomado del propio plan y no de un texto fijo, de modo que un plan nuevo aparece sin tocar la pantalla. El plan contratado se señala y no ofrece acción. Solo se ofrece el botón de los planes más económicos: bajar de plan no implica cobro y lo ejecuta el propio negocio, mientras que subir se contrata con INVENTRA, que lo activa al confirmar el pago. La pantalla lo dice con esas palabras en lugar de ocultar el plan superior, porque el negocio necesita saber cómo se contrata.</w:t>
+      </w:r>
+    </w:p>
+    <w:p>
+      <w:pPr>
+        <w:spacing w:after="110" w:line="262"/>
+        <w:jc w:val="both"/>
+      </w:pPr>
+      <w:r>
+        <w:rPr>
+          <w:rFonts w:ascii="Arial" w:cs="Arial" w:eastAsia="Arial" w:hAnsi="Arial"/>
+          <w:sz w:val="22"/>
+          <w:szCs w:val="22"/>
+        </w:rPr>
+        <w:t xml:space="preserve">Antes de bajar de plan se pide confirmación, con el detalle de lo que se pierde. Si la licorera tiene más usuarios o más sedes de los que admite el plan de destino, el sistema rechaza el cambio y dice cuántos sobran, sin inactivar nada por su cuenta: esa decisión es del negocio.</w:t>
       </w:r>
     </w:p>
     <w:p>
@@ -11052,7 +11221,7 @@
       <w:r>
         <w:drawing>
           <wp:inline distT="0" distB="0" distL="0" distR="0">
-            <wp:extent cx="6096000" cy="2733675"/>
+            <wp:extent cx="6096000" cy="3067050"/>
             <wp:effectExtent t="0" r="0" b="0" l="0"/>
             <wp:docPr id="1" name="" descr="" title=""/>
             <wp:cNvGraphicFramePr>
@@ -11077,7 +11246,7 @@
                   <pic:spPr bwMode="auto">
                     <a:xfrm>
                       <a:off x="0" y="0"/>
-                      <a:ext cx="6096000" cy="2733675"/>
+                      <a:ext cx="6096000" cy="3067050"/>
                     </a:xfrm>
                     <a:prstGeom prst="rect">
                       <a:avLst/>
@@ -11104,7 +11273,7 @@
           <w:sz w:val="18"/>
           <w:szCs w:val="18"/>
         </w:rPr>
-        <w:t xml:space="preserve">Figura 18. Mensajes del sistema y estado vacío. Fuente: del autor.</w:t>
+        <w:t xml:space="preserve">Figura 18. Mi suscripción. Fuente: del autor.</w:t>
       </w:r>
     </w:p>
     <w:p>
@@ -11112,7 +11281,7 @@
         <w:pStyle w:val="Heading2"/>
         <w:spacing w:after="80" w:before="150"/>
       </w:pPr>
-      <w:bookmarkStart w:name="bm36" w:id="1"/>
+      <w:bookmarkStart w:name="bm37" w:id="1"/>
       <w:r>
         <w:rPr>
           <w:rFonts w:ascii="Arial" w:cs="Arial" w:eastAsia="Arial" w:hAnsi="Arial"/>
@@ -11122,650 +11291,7 @@
           <w:sz w:val="23"/>
           <w:szCs w:val="23"/>
         </w:rPr>
-        <w:t xml:space="preserve">9.1 Estados de una pantalla</w:t>
-      </w:r>
-      <w:bookmarkEnd w:id="1"/>
-    </w:p>
-    <w:tbl>
-      <w:tblPr>
-        <w:tblW w:type="dxa" w:w="9360"/>
-        <w:tblBorders>
-          <w:top w:val="single" w:color="9CA3AF" w:sz="6"/>
-          <w:left w:val="single" w:color="9CA3AF" w:sz="6"/>
-          <w:bottom w:val="single" w:color="9CA3AF" w:sz="6"/>
-          <w:right w:val="single" w:color="9CA3AF" w:sz="6"/>
-          <w:insideH w:val="single" w:color="9CA3AF" w:sz="6"/>
-          <w:insideV w:val="single" w:color="9CA3AF" w:sz="6"/>
-        </w:tblBorders>
-        <w:tblLayout w:type="fixed"/>
-      </w:tblPr>
-      <w:tblGrid>
-        <w:gridCol w:w="1700"/>
-        <w:gridCol w:w="3200"/>
-        <w:gridCol w:w="4460"/>
-      </w:tblGrid>
-      <w:tr>
-        <w:trPr>
-          <w:tblHeader/>
-        </w:trPr>
-        <w:tc>
-          <w:tcPr>
-            <w:tcW w:type="dxa" w:w="1700"/>
-            <w:shd w:fill="1F3864" w:val="clear"/>
-            <w:tcMar>
-              <w:top w:type="dxa" w:w="40"/>
-              <w:left w:type="dxa" w:w="70"/>
-              <w:bottom w:type="dxa" w:w="40"/>
-              <w:right w:type="dxa" w:w="70"/>
-            </w:tcMar>
-          </w:tcPr>
-          <w:p>
-            <w:pPr>
-              <w:spacing w:after="0" w:line="236"/>
-            </w:pPr>
-            <w:r>
-              <w:rPr>
-                <w:rFonts w:ascii="Arial" w:cs="Arial" w:eastAsia="Arial" w:hAnsi="Arial"/>
-                <w:b/>
-                <w:bCs/>
-                <w:color w:val="FFFFFF"/>
-                <w:sz w:val="19"/>
-                <w:szCs w:val="19"/>
-              </w:rPr>
-              <w:t xml:space="preserve">Estado</w:t>
-            </w:r>
-          </w:p>
-        </w:tc>
-        <w:tc>
-          <w:tcPr>
-            <w:tcW w:type="dxa" w:w="3200"/>
-            <w:shd w:fill="1F3864" w:val="clear"/>
-            <w:tcMar>
-              <w:top w:type="dxa" w:w="40"/>
-              <w:left w:type="dxa" w:w="70"/>
-              <w:bottom w:type="dxa" w:w="40"/>
-              <w:right w:type="dxa" w:w="70"/>
-            </w:tcMar>
-          </w:tcPr>
-          <w:p>
-            <w:pPr>
-              <w:spacing w:after="0" w:line="236"/>
-            </w:pPr>
-            <w:r>
-              <w:rPr>
-                <w:rFonts w:ascii="Arial" w:cs="Arial" w:eastAsia="Arial" w:hAnsi="Arial"/>
-                <w:b/>
-                <w:bCs/>
-                <w:color w:val="FFFFFF"/>
-                <w:sz w:val="19"/>
-                <w:szCs w:val="19"/>
-              </w:rPr>
-              <w:t xml:space="preserve">Cuándo se presenta</w:t>
-            </w:r>
-          </w:p>
-        </w:tc>
-        <w:tc>
-          <w:tcPr>
-            <w:tcW w:type="dxa" w:w="4460"/>
-            <w:shd w:fill="1F3864" w:val="clear"/>
-            <w:tcMar>
-              <w:top w:type="dxa" w:w="40"/>
-              <w:left w:type="dxa" w:w="70"/>
-              <w:bottom w:type="dxa" w:w="40"/>
-              <w:right w:type="dxa" w:w="70"/>
-            </w:tcMar>
-          </w:tcPr>
-          <w:p>
-            <w:pPr>
-              <w:spacing w:after="0" w:line="236"/>
-            </w:pPr>
-            <w:r>
-              <w:rPr>
-                <w:rFonts w:ascii="Arial" w:cs="Arial" w:eastAsia="Arial" w:hAnsi="Arial"/>
-                <w:b/>
-                <w:bCs/>
-                <w:color w:val="FFFFFF"/>
-                <w:sz w:val="19"/>
-                <w:szCs w:val="19"/>
-              </w:rPr>
-              <w:t xml:space="preserve">Qué muestra la pantalla</w:t>
-            </w:r>
-          </w:p>
-        </w:tc>
-      </w:tr>
-      <w:tr>
-        <w:trPr>
-          <w:tblHeader w:val="false"/>
-        </w:trPr>
-        <w:tc>
-          <w:tcPr>
-            <w:tcW w:type="dxa" w:w="1700"/>
-            <w:shd w:fill="FFFFFF" w:val="clear"/>
-            <w:tcMar>
-              <w:top w:type="dxa" w:w="40"/>
-              <w:left w:type="dxa" w:w="70"/>
-              <w:bottom w:type="dxa" w:w="40"/>
-              <w:right w:type="dxa" w:w="70"/>
-            </w:tcMar>
-          </w:tcPr>
-          <w:p>
-            <w:pPr>
-              <w:spacing w:after="0" w:line="236"/>
-            </w:pPr>
-            <w:r>
-              <w:rPr>
-                <w:rFonts w:ascii="Arial" w:cs="Arial" w:eastAsia="Arial" w:hAnsi="Arial"/>
-                <w:b w:val="false"/>
-                <w:bCs w:val="false"/>
-                <w:sz w:val="19"/>
-                <w:szCs w:val="19"/>
-              </w:rPr>
-              <w:t xml:space="preserve">Con datos</w:t>
-            </w:r>
-          </w:p>
-        </w:tc>
-        <w:tc>
-          <w:tcPr>
-            <w:tcW w:type="dxa" w:w="3200"/>
-            <w:shd w:fill="FFFFFF" w:val="clear"/>
-            <w:tcMar>
-              <w:top w:type="dxa" w:w="40"/>
-              <w:left w:type="dxa" w:w="70"/>
-              <w:bottom w:type="dxa" w:w="40"/>
-              <w:right w:type="dxa" w:w="70"/>
-            </w:tcMar>
-          </w:tcPr>
-          <w:p>
-            <w:pPr>
-              <w:spacing w:after="0" w:line="236"/>
-            </w:pPr>
-            <w:r>
-              <w:rPr>
-                <w:rFonts w:ascii="Arial" w:cs="Arial" w:eastAsia="Arial" w:hAnsi="Arial"/>
-                <w:b w:val="false"/>
-                <w:bCs w:val="false"/>
-                <w:sz w:val="19"/>
-                <w:szCs w:val="19"/>
-              </w:rPr>
-              <w:t xml:space="preserve">Funcionamiento normal.</w:t>
-            </w:r>
-          </w:p>
-        </w:tc>
-        <w:tc>
-          <w:tcPr>
-            <w:tcW w:type="dxa" w:w="4460"/>
-            <w:shd w:fill="FFFFFF" w:val="clear"/>
-            <w:tcMar>
-              <w:top w:type="dxa" w:w="40"/>
-              <w:left w:type="dxa" w:w="70"/>
-              <w:bottom w:type="dxa" w:w="40"/>
-              <w:right w:type="dxa" w:w="70"/>
-            </w:tcMar>
-          </w:tcPr>
-          <w:p>
-            <w:pPr>
-              <w:spacing w:after="0" w:line="236"/>
-            </w:pPr>
-            <w:r>
-              <w:rPr>
-                <w:rFonts w:ascii="Arial" w:cs="Arial" w:eastAsia="Arial" w:hAnsi="Arial"/>
-                <w:b w:val="false"/>
-                <w:bCs w:val="false"/>
-                <w:sz w:val="19"/>
-                <w:szCs w:val="19"/>
-              </w:rPr>
-              <w:t xml:space="preserve">El contenido propio de la pantalla.</w:t>
-            </w:r>
-          </w:p>
-        </w:tc>
-      </w:tr>
-      <w:tr>
-        <w:trPr>
-          <w:tblHeader w:val="false"/>
-        </w:trPr>
-        <w:tc>
-          <w:tcPr>
-            <w:tcW w:type="dxa" w:w="1700"/>
-            <w:shd w:fill="F2F2F2" w:val="clear"/>
-            <w:tcMar>
-              <w:top w:type="dxa" w:w="40"/>
-              <w:left w:type="dxa" w:w="70"/>
-              <w:bottom w:type="dxa" w:w="40"/>
-              <w:right w:type="dxa" w:w="70"/>
-            </w:tcMar>
-          </w:tcPr>
-          <w:p>
-            <w:pPr>
-              <w:spacing w:after="0" w:line="236"/>
-            </w:pPr>
-            <w:r>
-              <w:rPr>
-                <w:rFonts w:ascii="Arial" w:cs="Arial" w:eastAsia="Arial" w:hAnsi="Arial"/>
-                <w:b w:val="false"/>
-                <w:bCs w:val="false"/>
-                <w:sz w:val="19"/>
-                <w:szCs w:val="19"/>
-              </w:rPr>
-              <w:t xml:space="preserve">Cargando</w:t>
-            </w:r>
-          </w:p>
-        </w:tc>
-        <w:tc>
-          <w:tcPr>
-            <w:tcW w:type="dxa" w:w="3200"/>
-            <w:shd w:fill="F2F2F2" w:val="clear"/>
-            <w:tcMar>
-              <w:top w:type="dxa" w:w="40"/>
-              <w:left w:type="dxa" w:w="70"/>
-              <w:bottom w:type="dxa" w:w="40"/>
-              <w:right w:type="dxa" w:w="70"/>
-            </w:tcMar>
-          </w:tcPr>
-          <w:p>
-            <w:pPr>
-              <w:spacing w:after="0" w:line="236"/>
-            </w:pPr>
-            <w:r>
-              <w:rPr>
-                <w:rFonts w:ascii="Arial" w:cs="Arial" w:eastAsia="Arial" w:hAnsi="Arial"/>
-                <w:b w:val="false"/>
-                <w:bCs w:val="false"/>
-                <w:sz w:val="19"/>
-                <w:szCs w:val="19"/>
-              </w:rPr>
-              <w:t xml:space="preserve">Mientras se consulta la información.</w:t>
-            </w:r>
-          </w:p>
-        </w:tc>
-        <w:tc>
-          <w:tcPr>
-            <w:tcW w:type="dxa" w:w="4460"/>
-            <w:shd w:fill="F2F2F2" w:val="clear"/>
-            <w:tcMar>
-              <w:top w:type="dxa" w:w="40"/>
-              <w:left w:type="dxa" w:w="70"/>
-              <w:bottom w:type="dxa" w:w="40"/>
-              <w:right w:type="dxa" w:w="70"/>
-            </w:tcMar>
-          </w:tcPr>
-          <w:p>
-            <w:pPr>
-              <w:spacing w:after="0" w:line="236"/>
-            </w:pPr>
-            <w:r>
-              <w:rPr>
-                <w:rFonts w:ascii="Arial" w:cs="Arial" w:eastAsia="Arial" w:hAnsi="Arial"/>
-                <w:b w:val="false"/>
-                <w:bCs w:val="false"/>
-                <w:sz w:val="19"/>
-                <w:szCs w:val="19"/>
-              </w:rPr>
-              <w:t xml:space="preserve">Marcadores de carga en el lugar del contenido, conservando la estructura.</w:t>
-            </w:r>
-          </w:p>
-        </w:tc>
-      </w:tr>
-      <w:tr>
-        <w:trPr>
-          <w:tblHeader w:val="false"/>
-        </w:trPr>
-        <w:tc>
-          <w:tcPr>
-            <w:tcW w:type="dxa" w:w="1700"/>
-            <w:shd w:fill="FFFFFF" w:val="clear"/>
-            <w:tcMar>
-              <w:top w:type="dxa" w:w="40"/>
-              <w:left w:type="dxa" w:w="70"/>
-              <w:bottom w:type="dxa" w:w="40"/>
-              <w:right w:type="dxa" w:w="70"/>
-            </w:tcMar>
-          </w:tcPr>
-          <w:p>
-            <w:pPr>
-              <w:spacing w:after="0" w:line="236"/>
-            </w:pPr>
-            <w:r>
-              <w:rPr>
-                <w:rFonts w:ascii="Arial" w:cs="Arial" w:eastAsia="Arial" w:hAnsi="Arial"/>
-                <w:b w:val="false"/>
-                <w:bCs w:val="false"/>
-                <w:sz w:val="19"/>
-                <w:szCs w:val="19"/>
-              </w:rPr>
-              <w:t xml:space="preserve">Vacío inicial</w:t>
-            </w:r>
-          </w:p>
-        </w:tc>
-        <w:tc>
-          <w:tcPr>
-            <w:tcW w:type="dxa" w:w="3200"/>
-            <w:shd w:fill="FFFFFF" w:val="clear"/>
-            <w:tcMar>
-              <w:top w:type="dxa" w:w="40"/>
-              <w:left w:type="dxa" w:w="70"/>
-              <w:bottom w:type="dxa" w:w="40"/>
-              <w:right w:type="dxa" w:w="70"/>
-            </w:tcMar>
-          </w:tcPr>
-          <w:p>
-            <w:pPr>
-              <w:spacing w:after="0" w:line="236"/>
-            </w:pPr>
-            <w:r>
-              <w:rPr>
-                <w:rFonts w:ascii="Arial" w:cs="Arial" w:eastAsia="Arial" w:hAnsi="Arial"/>
-                <w:b w:val="false"/>
-                <w:bCs w:val="false"/>
-                <w:sz w:val="19"/>
-                <w:szCs w:val="19"/>
-              </w:rPr>
-              <w:t xml:space="preserve">El usuario aún no ha registrado datos.</w:t>
-            </w:r>
-          </w:p>
-        </w:tc>
-        <w:tc>
-          <w:tcPr>
-            <w:tcW w:type="dxa" w:w="4460"/>
-            <w:shd w:fill="FFFFFF" w:val="clear"/>
-            <w:tcMar>
-              <w:top w:type="dxa" w:w="40"/>
-              <w:left w:type="dxa" w:w="70"/>
-              <w:bottom w:type="dxa" w:w="40"/>
-              <w:right w:type="dxa" w:w="70"/>
-            </w:tcMar>
-          </w:tcPr>
-          <w:p>
-            <w:pPr>
-              <w:spacing w:after="0" w:line="236"/>
-            </w:pPr>
-            <w:r>
-              <w:rPr>
-                <w:rFonts w:ascii="Arial" w:cs="Arial" w:eastAsia="Arial" w:hAnsi="Arial"/>
-                <w:b w:val="false"/>
-                <w:bCs w:val="false"/>
-                <w:sz w:val="19"/>
-                <w:szCs w:val="19"/>
-              </w:rPr>
-              <w:t xml:space="preserve">Mensaje breve, explicación de un renglón y la acción para crear el primer registro.</w:t>
-            </w:r>
-          </w:p>
-        </w:tc>
-      </w:tr>
-      <w:tr>
-        <w:trPr>
-          <w:tblHeader w:val="false"/>
-        </w:trPr>
-        <w:tc>
-          <w:tcPr>
-            <w:tcW w:type="dxa" w:w="1700"/>
-            <w:shd w:fill="F2F2F2" w:val="clear"/>
-            <w:tcMar>
-              <w:top w:type="dxa" w:w="40"/>
-              <w:left w:type="dxa" w:w="70"/>
-              <w:bottom w:type="dxa" w:w="40"/>
-              <w:right w:type="dxa" w:w="70"/>
-            </w:tcMar>
-          </w:tcPr>
-          <w:p>
-            <w:pPr>
-              <w:spacing w:after="0" w:line="236"/>
-            </w:pPr>
-            <w:r>
-              <w:rPr>
-                <w:rFonts w:ascii="Arial" w:cs="Arial" w:eastAsia="Arial" w:hAnsi="Arial"/>
-                <w:b w:val="false"/>
-                <w:bCs w:val="false"/>
-                <w:sz w:val="19"/>
-                <w:szCs w:val="19"/>
-              </w:rPr>
-              <w:t xml:space="preserve">Sin resultados</w:t>
-            </w:r>
-          </w:p>
-        </w:tc>
-        <w:tc>
-          <w:tcPr>
-            <w:tcW w:type="dxa" w:w="3200"/>
-            <w:shd w:fill="F2F2F2" w:val="clear"/>
-            <w:tcMar>
-              <w:top w:type="dxa" w:w="40"/>
-              <w:left w:type="dxa" w:w="70"/>
-              <w:bottom w:type="dxa" w:w="40"/>
-              <w:right w:type="dxa" w:w="70"/>
-            </w:tcMar>
-          </w:tcPr>
-          <w:p>
-            <w:pPr>
-              <w:spacing w:after="0" w:line="236"/>
-            </w:pPr>
-            <w:r>
-              <w:rPr>
-                <w:rFonts w:ascii="Arial" w:cs="Arial" w:eastAsia="Arial" w:hAnsi="Arial"/>
-                <w:b w:val="false"/>
-                <w:bCs w:val="false"/>
-                <w:sz w:val="19"/>
-                <w:szCs w:val="19"/>
-              </w:rPr>
-              <w:t xml:space="preserve">La búsqueda o el filtro no arroja coincidencias.</w:t>
-            </w:r>
-          </w:p>
-        </w:tc>
-        <w:tc>
-          <w:tcPr>
-            <w:tcW w:type="dxa" w:w="4460"/>
-            <w:shd w:fill="F2F2F2" w:val="clear"/>
-            <w:tcMar>
-              <w:top w:type="dxa" w:w="40"/>
-              <w:left w:type="dxa" w:w="70"/>
-              <w:bottom w:type="dxa" w:w="40"/>
-              <w:right w:type="dxa" w:w="70"/>
-            </w:tcMar>
-          </w:tcPr>
-          <w:p>
-            <w:pPr>
-              <w:spacing w:after="0" w:line="236"/>
-            </w:pPr>
-            <w:r>
-              <w:rPr>
-                <w:rFonts w:ascii="Arial" w:cs="Arial" w:eastAsia="Arial" w:hAnsi="Arial"/>
-                <w:b w:val="false"/>
-                <w:bCs w:val="false"/>
-                <w:sz w:val="19"/>
-                <w:szCs w:val="19"/>
-              </w:rPr>
-              <w:t xml:space="preserve">Aviso de que no se encontraron resultados y sugerencia de modificar la búsqueda.</w:t>
-            </w:r>
-          </w:p>
-        </w:tc>
-      </w:tr>
-      <w:tr>
-        <w:trPr>
-          <w:tblHeader w:val="false"/>
-        </w:trPr>
-        <w:tc>
-          <w:tcPr>
-            <w:tcW w:type="dxa" w:w="1700"/>
-            <w:shd w:fill="FFFFFF" w:val="clear"/>
-            <w:tcMar>
-              <w:top w:type="dxa" w:w="40"/>
-              <w:left w:type="dxa" w:w="70"/>
-              <w:bottom w:type="dxa" w:w="40"/>
-              <w:right w:type="dxa" w:w="70"/>
-            </w:tcMar>
-          </w:tcPr>
-          <w:p>
-            <w:pPr>
-              <w:spacing w:after="0" w:line="236"/>
-            </w:pPr>
-            <w:r>
-              <w:rPr>
-                <w:rFonts w:ascii="Arial" w:cs="Arial" w:eastAsia="Arial" w:hAnsi="Arial"/>
-                <w:b w:val="false"/>
-                <w:bCs w:val="false"/>
-                <w:sz w:val="19"/>
-                <w:szCs w:val="19"/>
-              </w:rPr>
-              <w:t xml:space="preserve">Error</w:t>
-            </w:r>
-          </w:p>
-        </w:tc>
-        <w:tc>
-          <w:tcPr>
-            <w:tcW w:type="dxa" w:w="3200"/>
-            <w:shd w:fill="FFFFFF" w:val="clear"/>
-            <w:tcMar>
-              <w:top w:type="dxa" w:w="40"/>
-              <w:left w:type="dxa" w:w="70"/>
-              <w:bottom w:type="dxa" w:w="40"/>
-              <w:right w:type="dxa" w:w="70"/>
-            </w:tcMar>
-          </w:tcPr>
-          <w:p>
-            <w:pPr>
-              <w:spacing w:after="0" w:line="236"/>
-            </w:pPr>
-            <w:r>
-              <w:rPr>
-                <w:rFonts w:ascii="Arial" w:cs="Arial" w:eastAsia="Arial" w:hAnsi="Arial"/>
-                <w:b w:val="false"/>
-                <w:bCs w:val="false"/>
-                <w:sz w:val="19"/>
-                <w:szCs w:val="19"/>
-              </w:rPr>
-              <w:t xml:space="preserve">Falla la operación o la conexión.</w:t>
-            </w:r>
-          </w:p>
-        </w:tc>
-        <w:tc>
-          <w:tcPr>
-            <w:tcW w:type="dxa" w:w="4460"/>
-            <w:shd w:fill="FFFFFF" w:val="clear"/>
-            <w:tcMar>
-              <w:top w:type="dxa" w:w="40"/>
-              <w:left w:type="dxa" w:w="70"/>
-              <w:bottom w:type="dxa" w:w="40"/>
-              <w:right w:type="dxa" w:w="70"/>
-            </w:tcMar>
-          </w:tcPr>
-          <w:p>
-            <w:pPr>
-              <w:spacing w:after="0" w:line="236"/>
-            </w:pPr>
-            <w:r>
-              <w:rPr>
-                <w:rFonts w:ascii="Arial" w:cs="Arial" w:eastAsia="Arial" w:hAnsi="Arial"/>
-                <w:b w:val="false"/>
-                <w:bCs w:val="false"/>
-                <w:sz w:val="19"/>
-                <w:szCs w:val="19"/>
-              </w:rPr>
-              <w:t xml:space="preserve">Mensaje en color de peligro con la causa y la opción de reintentar.</w:t>
-            </w:r>
-          </w:p>
-        </w:tc>
-      </w:tr>
-      <w:tr>
-        <w:trPr>
-          <w:tblHeader w:val="false"/>
-        </w:trPr>
-        <w:tc>
-          <w:tcPr>
-            <w:tcW w:type="dxa" w:w="1700"/>
-            <w:shd w:fill="F2F2F2" w:val="clear"/>
-            <w:tcMar>
-              <w:top w:type="dxa" w:w="40"/>
-              <w:left w:type="dxa" w:w="70"/>
-              <w:bottom w:type="dxa" w:w="40"/>
-              <w:right w:type="dxa" w:w="70"/>
-            </w:tcMar>
-          </w:tcPr>
-          <w:p>
-            <w:pPr>
-              <w:spacing w:after="0" w:line="236"/>
-            </w:pPr>
-            <w:r>
-              <w:rPr>
-                <w:rFonts w:ascii="Arial" w:cs="Arial" w:eastAsia="Arial" w:hAnsi="Arial"/>
-                <w:b w:val="false"/>
-                <w:bCs w:val="false"/>
-                <w:sz w:val="19"/>
-                <w:szCs w:val="19"/>
-              </w:rPr>
-              <w:t xml:space="preserve">Sin permiso</w:t>
-            </w:r>
-          </w:p>
-        </w:tc>
-        <w:tc>
-          <w:tcPr>
-            <w:tcW w:type="dxa" w:w="3200"/>
-            <w:shd w:fill="F2F2F2" w:val="clear"/>
-            <w:tcMar>
-              <w:top w:type="dxa" w:w="40"/>
-              <w:left w:type="dxa" w:w="70"/>
-              <w:bottom w:type="dxa" w:w="40"/>
-              <w:right w:type="dxa" w:w="70"/>
-            </w:tcMar>
-          </w:tcPr>
-          <w:p>
-            <w:pPr>
-              <w:spacing w:after="0" w:line="236"/>
-            </w:pPr>
-            <w:r>
-              <w:rPr>
-                <w:rFonts w:ascii="Arial" w:cs="Arial" w:eastAsia="Arial" w:hAnsi="Arial"/>
-                <w:b w:val="false"/>
-                <w:bCs w:val="false"/>
-                <w:sz w:val="19"/>
-                <w:szCs w:val="19"/>
-              </w:rPr>
-              <w:t xml:space="preserve">El rol o el plan no habilitan la función.</w:t>
-            </w:r>
-          </w:p>
-        </w:tc>
-        <w:tc>
-          <w:tcPr>
-            <w:tcW w:type="dxa" w:w="4460"/>
-            <w:shd w:fill="F2F2F2" w:val="clear"/>
-            <w:tcMar>
-              <w:top w:type="dxa" w:w="40"/>
-              <w:left w:type="dxa" w:w="70"/>
-              <w:bottom w:type="dxa" w:w="40"/>
-              <w:right w:type="dxa" w:w="70"/>
-            </w:tcMar>
-          </w:tcPr>
-          <w:p>
-            <w:pPr>
-              <w:spacing w:after="0" w:line="236"/>
-            </w:pPr>
-            <w:r>
-              <w:rPr>
-                <w:rFonts w:ascii="Arial" w:cs="Arial" w:eastAsia="Arial" w:hAnsi="Arial"/>
-                <w:b w:val="false"/>
-                <w:bCs w:val="false"/>
-                <w:sz w:val="19"/>
-                <w:szCs w:val="19"/>
-              </w:rPr>
-              <w:t xml:space="preserve">Explicación del motivo y, cuando corresponde, la vía para cambiar de plan.</w:t>
-            </w:r>
-          </w:p>
-        </w:tc>
-      </w:tr>
-    </w:tbl>
-    <w:p>
-      <w:pPr>
-        <w:pStyle w:val="Heading2"/>
-        <w:spacing w:after="80" w:before="150"/>
-      </w:pPr>
-      <w:bookmarkStart w:name="bm37" w:id="1"/>
-      <w:r>
-        <w:rPr>
-          <w:rFonts w:ascii="Arial" w:cs="Arial" w:eastAsia="Arial" w:hAnsi="Arial"/>
-          <w:b/>
-          <w:bCs/>
-          <w:color w:val="2E5496"/>
-          <w:sz w:val="23"/>
-          <w:szCs w:val="23"/>
-        </w:rPr>
-        <w:t xml:space="preserve">9.2 Redacción de los mensajes</w:t>
+        <w:t xml:space="preserve">8.10 Plataforma</w:t>
       </w:r>
       <w:bookmarkEnd w:id="1"/>
     </w:p>
@@ -11780,17 +11306,13 @@
           <w:sz w:val="22"/>
           <w:szCs w:val="22"/>
         </w:rPr>
-        <w:t xml:space="preserve">Los textos siguen las mismas reglas en toda la aplicación:</w:t>
-      </w:r>
-    </w:p>
-    <w:p>
-      <w:pPr>
-        <w:pStyle w:val="ListParagraph"/>
-        <w:numPr>
-          <w:ilvl w:val="0"/>
-          <w:numId w:val="1"/>
-        </w:numPr>
-        <w:spacing w:after="60" w:line="258"/>
+        <w:t xml:space="preserve">Es la pantalla del administrador de INVENTRA, no la de un negocio, y es la única que no pertenece a ninguna licorera. Reúne las tres cifras globales del servicio —licoreras registradas, cuentas con suscripción vigente e ingreso mensual contratado— y, debajo, el listado de las licoreras con su contacto, el plan, el estado de la suscripción, la fecha hasta la que vale y el número de cuentas que tiene abiertas.</w:t>
+      </w:r>
+    </w:p>
+    <w:p>
+      <w:pPr>
+        <w:spacing w:after="110" w:line="262"/>
+        <w:jc w:val="both"/>
       </w:pPr>
       <w:r>
         <w:rPr>
@@ -11798,17 +11320,13 @@
           <w:sz w:val="22"/>
           <w:szCs w:val="22"/>
         </w:rPr>
-        <w:t xml:space="preserve">Lenguaje sencillo y directo, sin términos técnicos ni códigos de error visibles para el usuario.</w:t>
-      </w:r>
-    </w:p>
-    <w:p>
-      <w:pPr>
-        <w:pStyle w:val="ListParagraph"/>
-        <w:numPr>
-          <w:ilvl w:val="0"/>
-          <w:numId w:val="1"/>
-        </w:numPr>
-        <w:spacing w:after="60" w:line="258"/>
+        <w:t xml:space="preserve">El listado no muestra ningún dato comercial de los negocios: ni sus productos, ni sus ventas, ni sus importes. La restricción es del requisito y está resuelta en el servidor, que sencillamente no devuelve esa información; la pantalla no tiene nada que ocultar porque nunca la recibe.</w:t>
+      </w:r>
+    </w:p>
+    <w:p>
+      <w:pPr>
+        <w:spacing w:after="110" w:line="262"/>
+        <w:jc w:val="both"/>
       </w:pPr>
       <w:r>
         <w:rPr>
@@ -11816,17 +11334,13 @@
           <w:sz w:val="22"/>
           <w:szCs w:val="22"/>
         </w:rPr>
-        <w:t xml:space="preserve">El mensaje describe qué ocurrió y qué hacer a continuación, en una sola frase cuando es posible.</w:t>
-      </w:r>
-    </w:p>
-    <w:p>
-      <w:pPr>
-        <w:pStyle w:val="ListParagraph"/>
-        <w:numPr>
-          <w:ilvl w:val="0"/>
-          <w:numId w:val="1"/>
-        </w:numPr>
-        <w:spacing w:after="60" w:line="258"/>
+        <w:t xml:space="preserve">Desde aquí se ejecutan las tres operaciones que le corresponden a quien cobra el servicio: dar de alta una licorera, que crea el negocio y la cuenta de su administrador y le envía el enlace para que defina su propia contraseña; abrir un período, que es la misma operación para renovar y para subir de plan, porque en los dos casos se cierra la suscripción anterior y se inicia otra con su fecha de vencimiento; y corregir la fecha de una suscripción vigente, prevista para enmendar una fecha mal escrita y no para renovar. Bajar de plan no aparece en esta pantalla: esa operación la ejecuta el propio negocio desde la suya, según se explica en el apartado anterior.</w:t>
+      </w:r>
+    </w:p>
+    <w:p>
+      <w:pPr>
+        <w:spacing w:after="110" w:line="262"/>
+        <w:jc w:val="both"/>
       </w:pPr>
       <w:r>
         <w:rPr>
@@ -11834,164 +11348,7 @@
           <w:sz w:val="22"/>
           <w:szCs w:val="22"/>
         </w:rPr>
-        <w:t xml:space="preserve">Los mensajes de validación se ubican junto al campo que los origina; los de operación, en la parte superior del contenido o como aviso emergente.</w:t>
-      </w:r>
-    </w:p>
-    <w:p>
-      <w:pPr>
-        <w:pStyle w:val="ListParagraph"/>
-        <w:numPr>
-          <w:ilvl w:val="0"/>
-          <w:numId w:val="1"/>
-        </w:numPr>
-        <w:spacing w:after="60" w:line="258"/>
-      </w:pPr>
-      <w:r>
-        <w:rPr>
-          <w:rFonts w:ascii="Arial" w:cs="Arial" w:eastAsia="Arial" w:hAnsi="Arial"/>
-          <w:sz w:val="22"/>
-          <w:szCs w:val="22"/>
-        </w:rPr>
-        <w:t xml:space="preserve">Las confirmaciones de una acción rápida desaparecen solas; los errores permanecen hasta que el usuario los atiende.</w:t>
-      </w:r>
-    </w:p>
-    <w:p>
-      <w:pPr>
-        <w:pStyle w:val="ListParagraph"/>
-        <w:numPr>
-          <w:ilvl w:val="0"/>
-          <w:numId w:val="1"/>
-        </w:numPr>
-        <w:spacing w:after="60" w:line="258"/>
-      </w:pPr>
-      <w:r>
-        <w:rPr>
-          <w:rFonts w:ascii="Arial" w:cs="Arial" w:eastAsia="Arial" w:hAnsi="Arial"/>
-          <w:sz w:val="22"/>
-          <w:szCs w:val="22"/>
-        </w:rPr>
-        <w:t xml:space="preserve">No se responsabiliza al usuario del error ni se emplean expresiones de alarma.</w:t>
-      </w:r>
-    </w:p>
-    <w:p>
-      <w:pPr>
-        <w:pStyle w:val="Heading1"/>
-        <w:pageBreakBefore/>
-        <w:spacing w:after="110" w:before="220"/>
-      </w:pPr>
-      <w:bookmarkStart w:name="bm38" w:id="1"/>
-      <w:r>
-        <w:rPr>
-          <w:rFonts w:ascii="Arial" w:cs="Arial" w:eastAsia="Arial" w:hAnsi="Arial"/>
-          <w:b/>
-          <w:bCs/>
-          <w:color w:val="1F3864"/>
-          <w:sz w:val="27"/>
-          <w:szCs w:val="27"/>
-        </w:rPr>
-        <w:t xml:space="preserve">10. Comportamiento responsivo y modo oscuro</w:t>
-      </w:r>
-      <w:bookmarkEnd w:id="1"/>
-    </w:p>
-    <w:p>
-      <w:pPr>
-        <w:spacing w:after="110" w:line="262"/>
-        <w:jc w:val="both"/>
-      </w:pPr>
-      <w:r>
-        <w:rPr>
-          <w:rFonts w:ascii="Arial" w:cs="Arial" w:eastAsia="Arial" w:hAnsi="Arial"/>
-          <w:sz w:val="22"/>
-          <w:szCs w:val="22"/>
-        </w:rPr>
-        <w:t xml:space="preserve">La interfaz se adapta a los tamaños definidos en la sección 5.3. La adaptación no consiste en reducir la pantalla de escritorio, sino en reorganizar el contenido para conservar la facilidad de uso en cada dispositivo.</w:t>
-      </w:r>
-    </w:p>
-    <w:p>
-      <w:pPr>
-        <w:pStyle w:val="Heading2"/>
-        <w:spacing w:after="80" w:before="150"/>
-      </w:pPr>
-      <w:bookmarkStart w:name="bm39" w:id="1"/>
-      <w:r>
-        <w:rPr>
-          <w:rFonts w:ascii="Arial" w:cs="Arial" w:eastAsia="Arial" w:hAnsi="Arial"/>
-          <w:b/>
-          <w:bCs/>
-          <w:color w:val="2E5496"/>
-          <w:sz w:val="23"/>
-          <w:szCs w:val="23"/>
-        </w:rPr>
-        <w:t xml:space="preserve">10.1 Versión móvil</w:t>
-      </w:r>
-      <w:bookmarkEnd w:id="1"/>
-    </w:p>
-    <w:p>
-      <w:pPr>
-        <w:spacing w:after="110" w:line="262"/>
-        <w:jc w:val="both"/>
-      </w:pPr>
-      <w:r>
-        <w:rPr>
-          <w:rFonts w:ascii="Arial" w:cs="Arial" w:eastAsia="Arial" w:hAnsi="Arial"/>
-          <w:sz w:val="22"/>
-          <w:szCs w:val="22"/>
-        </w:rPr>
-        <w:t xml:space="preserve">En el teléfono el contenido se presenta en una sola columna y la barra lateral se traslada a la parte superior, donde se desplaza en horizontal y conserva el acceso a todos los módulos. Los controles aumentan su área de toque y las tablas se convierten en listas, de modo que cada registro ocupe un renglón legible.</w:t>
-      </w:r>
-    </w:p>
-    <w:p>
-      <w:pPr>
-        <w:pStyle w:val="ListParagraph"/>
-        <w:numPr>
-          <w:ilvl w:val="0"/>
-          <w:numId w:val="1"/>
-        </w:numPr>
-        <w:spacing w:after="60" w:line="258"/>
-      </w:pPr>
-      <w:r>
-        <w:rPr>
-          <w:rFonts w:ascii="Arial" w:cs="Arial" w:eastAsia="Arial" w:hAnsi="Arial"/>
-          <w:sz w:val="22"/>
-          <w:szCs w:val="22"/>
-        </w:rPr>
-        <w:t xml:space="preserve">Inicio de sesión: formulario centrado, con los campos y el botón a todo el ancho.</w:t>
-      </w:r>
-    </w:p>
-    <w:p>
-      <w:pPr>
-        <w:pStyle w:val="ListParagraph"/>
-        <w:numPr>
-          <w:ilvl w:val="0"/>
-          <w:numId w:val="1"/>
-        </w:numPr>
-        <w:spacing w:after="60" w:line="258"/>
-      </w:pPr>
-      <w:r>
-        <w:rPr>
-          <w:rFonts w:ascii="Arial" w:cs="Arial" w:eastAsia="Arial" w:hAnsi="Arial"/>
-          <w:sz w:val="22"/>
-          <w:szCs w:val="22"/>
-        </w:rPr>
-        <w:t xml:space="preserve">Panel: los indicadores se agrupan de a dos por fila y las alertas de existencias quedan inmediatamente debajo.</w:t>
-      </w:r>
-    </w:p>
-    <w:p>
-      <w:pPr>
-        <w:pStyle w:val="ListParagraph"/>
-        <w:numPr>
-          <w:ilvl w:val="0"/>
-          <w:numId w:val="1"/>
-        </w:numPr>
-        <w:spacing w:after="60" w:line="258"/>
-      </w:pPr>
-      <w:r>
-        <w:rPr>
-          <w:rFonts w:ascii="Arial" w:cs="Arial" w:eastAsia="Arial" w:hAnsi="Arial"/>
-          <w:sz w:val="22"/>
-          <w:szCs w:val="22"/>
-        </w:rPr>
-        <w:t xml:space="preserve">Punto de venta: buscador, lista de la venta en curso, total y medios de pago en una sola columna, con la acción de cobro fija en la parte inferior.</w:t>
+        <w:t xml:space="preserve">La navegación lateral de este rol es distinta: no se le presentan los módulos de inventario, ventas o sedes, porque no administra un negocio sino el servicio.</w:t>
       </w:r>
     </w:p>
     <w:p>
@@ -12002,7 +11359,7 @@
       <w:r>
         <w:drawing>
           <wp:inline distT="0" distB="0" distL="0" distR="0">
-            <wp:extent cx="6096000" cy="3295650"/>
+            <wp:extent cx="6096000" cy="4114800"/>
             <wp:effectExtent t="0" r="0" b="0" l="0"/>
             <wp:docPr id="1" name="" descr="" title=""/>
             <wp:cNvGraphicFramePr>
@@ -12027,7 +11384,7 @@
                   <pic:spPr bwMode="auto">
                     <a:xfrm>
                       <a:off x="0" y="0"/>
-                      <a:ext cx="6096000" cy="3295650"/>
+                      <a:ext cx="6096000" cy="4114800"/>
                     </a:xfrm>
                     <a:prstGeom prst="rect">
                       <a:avLst/>
@@ -12054,25 +11411,26 @@
           <w:sz w:val="18"/>
           <w:szCs w:val="18"/>
         </w:rPr>
-        <w:t xml:space="preserve">Figura 19. Versión móvil: inicio de sesión, panel y punto de venta. Fuente: del autor.</w:t>
-      </w:r>
-    </w:p>
-    <w:p>
-      <w:pPr>
-        <w:pStyle w:val="Heading2"/>
-        <w:spacing w:after="80" w:before="150"/>
-      </w:pPr>
-      <w:bookmarkStart w:name="bm40" w:id="1"/>
+        <w:t xml:space="preserve">Figura 19. Plataforma: licoreras registradas y sus suscripciones. Fuente: del autor.</w:t>
+      </w:r>
+    </w:p>
+    <w:p>
+      <w:pPr>
+        <w:pStyle w:val="Heading1"/>
+        <w:pageBreakBefore/>
+        <w:spacing w:after="110" w:before="220"/>
+      </w:pPr>
+      <w:bookmarkStart w:name="bm38" w:id="1"/>
       <w:r>
         <w:rPr>
           <w:rFonts w:ascii="Arial" w:cs="Arial" w:eastAsia="Arial" w:hAnsi="Arial"/>
           <w:b/>
           <w:bCs/>
-          <w:color w:val="2E5496"/>
-          <w:sz w:val="23"/>
-          <w:szCs w:val="23"/>
-        </w:rPr>
-        <w:t xml:space="preserve">10.2 Tablet y escritorio</w:t>
+          <w:color w:val="1F3864"/>
+          <w:sz w:val="27"/>
+          <w:szCs w:val="27"/>
+        </w:rPr>
+        <w:t xml:space="preserve">9. Mensajes y estados de pantalla</w:t>
       </w:r>
       <w:bookmarkEnd w:id="1"/>
     </w:p>
@@ -12087,40 +11445,7 @@
           <w:sz w:val="22"/>
           <w:szCs w:val="22"/>
         </w:rPr>
-        <w:t xml:space="preserve">En tablet el contenido se organiza en dos columnas y la navegación lateral puede contraerse para dejar más espacio al contenido. En escritorio se emplea la rejilla completa, con la navegación lateral fija y los paneles de apoyo a la derecha del contenido principal, como ocurre en el punto de venta.</w:t>
-      </w:r>
-    </w:p>
-    <w:p>
-      <w:pPr>
-        <w:pStyle w:val="Heading2"/>
-        <w:spacing w:after="80" w:before="150"/>
-      </w:pPr>
-      <w:bookmarkStart w:name="bm41" w:id="1"/>
-      <w:r>
-        <w:rPr>
-          <w:rFonts w:ascii="Arial" w:cs="Arial" w:eastAsia="Arial" w:hAnsi="Arial"/>
-          <w:b/>
-          <w:bCs/>
-          <w:color w:val="2E5496"/>
-          <w:sz w:val="23"/>
-          <w:szCs w:val="23"/>
-        </w:rPr>
-        <w:t xml:space="preserve">10.3 Modo oscuro</w:t>
-      </w:r>
-      <w:bookmarkEnd w:id="1"/>
-    </w:p>
-    <w:p>
-      <w:pPr>
-        <w:spacing w:after="110" w:line="262"/>
-        <w:jc w:val="both"/>
-      </w:pPr>
-      <w:r>
-        <w:rPr>
-          <w:rFonts w:ascii="Arial" w:cs="Arial" w:eastAsia="Arial" w:hAnsi="Arial"/>
-          <w:sz w:val="22"/>
-          <w:szCs w:val="22"/>
-        </w:rPr>
-        <w:t xml:space="preserve">El modo oscuro utiliza la variante de paleta definida en la sección 4.2 y conserva la misma estructura, la misma jerarquía y los mismos componentes del modo claro. Cambian únicamente los colores de fondo, superficie, borde y texto, y se ajustan los tonos de las etiquetas de estado para mantener el contraste. La elección del modo es del usuario y se conserva entre sesiones. El cambio se hace desde la parte inferior del menú lateral y, en las pantallas de acceso, desde el panel de marca, de modo que también pueda elegirlo quien todavía no ha entrado. Mientras el usuario no elija, se aplica la preferencia del sistema operativo.</w:t>
+        <w:t xml:space="preserve">Además de los componentes descritos en la sección 6, la interfaz define cómo se comporta una pantalla cuando no hay información que mostrar, cuando los datos aún se están cargando o cuando una operación falla. El objetivo es que el usuario siempre sepa qué ocurre y qué puede hacer a continuación.</w:t>
       </w:r>
     </w:p>
     <w:p>
@@ -12131,7 +11456,7 @@
       <w:r>
         <w:drawing>
           <wp:inline distT="0" distB="0" distL="0" distR="0">
-            <wp:extent cx="6096000" cy="3067050"/>
+            <wp:extent cx="6096000" cy="2733675"/>
             <wp:effectExtent t="0" r="0" b="0" l="0"/>
             <wp:docPr id="1" name="" descr="" title=""/>
             <wp:cNvGraphicFramePr>
@@ -12156,6 +11481,1085 @@
                   <pic:spPr bwMode="auto">
                     <a:xfrm>
                       <a:off x="0" y="0"/>
+                      <a:ext cx="6096000" cy="2733675"/>
+                    </a:xfrm>
+                    <a:prstGeom prst="rect">
+                      <a:avLst/>
+                    </a:prstGeom>
+                  </pic:spPr>
+                </pic:pic>
+              </a:graphicData>
+            </a:graphic>
+          </wp:inline>
+        </w:drawing>
+      </w:r>
+    </w:p>
+    <w:p>
+      <w:pPr>
+        <w:spacing w:after="150" w:before="6"/>
+        <w:jc w:val="center"/>
+      </w:pPr>
+      <w:r>
+        <w:rPr>
+          <w:rFonts w:ascii="Arial" w:cs="Arial" w:eastAsia="Arial" w:hAnsi="Arial"/>
+          <w:i/>
+          <w:iCs/>
+          <w:color w:val="5B6678"/>
+          <w:sz w:val="18"/>
+          <w:szCs w:val="18"/>
+        </w:rPr>
+        <w:t xml:space="preserve">Figura 20. Mensajes del sistema y estado vacío. Fuente: del autor.</w:t>
+      </w:r>
+    </w:p>
+    <w:p>
+      <w:pPr>
+        <w:pStyle w:val="Heading2"/>
+        <w:spacing w:after="80" w:before="150"/>
+      </w:pPr>
+      <w:bookmarkStart w:name="bm39" w:id="1"/>
+      <w:r>
+        <w:rPr>
+          <w:rFonts w:ascii="Arial" w:cs="Arial" w:eastAsia="Arial" w:hAnsi="Arial"/>
+          <w:b/>
+          <w:bCs/>
+          <w:color w:val="2E5496"/>
+          <w:sz w:val="23"/>
+          <w:szCs w:val="23"/>
+        </w:rPr>
+        <w:t xml:space="preserve">9.1 Estados de una pantalla</w:t>
+      </w:r>
+      <w:bookmarkEnd w:id="1"/>
+    </w:p>
+    <w:tbl>
+      <w:tblPr>
+        <w:tblW w:type="dxa" w:w="9360"/>
+        <w:tblBorders>
+          <w:top w:val="single" w:color="9CA3AF" w:sz="6"/>
+          <w:left w:val="single" w:color="9CA3AF" w:sz="6"/>
+          <w:bottom w:val="single" w:color="9CA3AF" w:sz="6"/>
+          <w:right w:val="single" w:color="9CA3AF" w:sz="6"/>
+          <w:insideH w:val="single" w:color="9CA3AF" w:sz="6"/>
+          <w:insideV w:val="single" w:color="9CA3AF" w:sz="6"/>
+        </w:tblBorders>
+        <w:tblLayout w:type="fixed"/>
+      </w:tblPr>
+      <w:tblGrid>
+        <w:gridCol w:w="1700"/>
+        <w:gridCol w:w="3200"/>
+        <w:gridCol w:w="4460"/>
+      </w:tblGrid>
+      <w:tr>
+        <w:trPr>
+          <w:tblHeader/>
+        </w:trPr>
+        <w:tc>
+          <w:tcPr>
+            <w:tcW w:type="dxa" w:w="1700"/>
+            <w:shd w:fill="1F3864" w:val="clear"/>
+            <w:tcMar>
+              <w:top w:type="dxa" w:w="40"/>
+              <w:left w:type="dxa" w:w="70"/>
+              <w:bottom w:type="dxa" w:w="40"/>
+              <w:right w:type="dxa" w:w="70"/>
+            </w:tcMar>
+          </w:tcPr>
+          <w:p>
+            <w:pPr>
+              <w:spacing w:after="0" w:line="236"/>
+            </w:pPr>
+            <w:r>
+              <w:rPr>
+                <w:rFonts w:ascii="Arial" w:cs="Arial" w:eastAsia="Arial" w:hAnsi="Arial"/>
+                <w:b/>
+                <w:bCs/>
+                <w:color w:val="FFFFFF"/>
+                <w:sz w:val="19"/>
+                <w:szCs w:val="19"/>
+              </w:rPr>
+              <w:t xml:space="preserve">Estado</w:t>
+            </w:r>
+          </w:p>
+        </w:tc>
+        <w:tc>
+          <w:tcPr>
+            <w:tcW w:type="dxa" w:w="3200"/>
+            <w:shd w:fill="1F3864" w:val="clear"/>
+            <w:tcMar>
+              <w:top w:type="dxa" w:w="40"/>
+              <w:left w:type="dxa" w:w="70"/>
+              <w:bottom w:type="dxa" w:w="40"/>
+              <w:right w:type="dxa" w:w="70"/>
+            </w:tcMar>
+          </w:tcPr>
+          <w:p>
+            <w:pPr>
+              <w:spacing w:after="0" w:line="236"/>
+            </w:pPr>
+            <w:r>
+              <w:rPr>
+                <w:rFonts w:ascii="Arial" w:cs="Arial" w:eastAsia="Arial" w:hAnsi="Arial"/>
+                <w:b/>
+                <w:bCs/>
+                <w:color w:val="FFFFFF"/>
+                <w:sz w:val="19"/>
+                <w:szCs w:val="19"/>
+              </w:rPr>
+              <w:t xml:space="preserve">Cuándo se presenta</w:t>
+            </w:r>
+          </w:p>
+        </w:tc>
+        <w:tc>
+          <w:tcPr>
+            <w:tcW w:type="dxa" w:w="4460"/>
+            <w:shd w:fill="1F3864" w:val="clear"/>
+            <w:tcMar>
+              <w:top w:type="dxa" w:w="40"/>
+              <w:left w:type="dxa" w:w="70"/>
+              <w:bottom w:type="dxa" w:w="40"/>
+              <w:right w:type="dxa" w:w="70"/>
+            </w:tcMar>
+          </w:tcPr>
+          <w:p>
+            <w:pPr>
+              <w:spacing w:after="0" w:line="236"/>
+            </w:pPr>
+            <w:r>
+              <w:rPr>
+                <w:rFonts w:ascii="Arial" w:cs="Arial" w:eastAsia="Arial" w:hAnsi="Arial"/>
+                <w:b/>
+                <w:bCs/>
+                <w:color w:val="FFFFFF"/>
+                <w:sz w:val="19"/>
+                <w:szCs w:val="19"/>
+              </w:rPr>
+              <w:t xml:space="preserve">Qué muestra la pantalla</w:t>
+            </w:r>
+          </w:p>
+        </w:tc>
+      </w:tr>
+      <w:tr>
+        <w:trPr>
+          <w:tblHeader w:val="false"/>
+        </w:trPr>
+        <w:tc>
+          <w:tcPr>
+            <w:tcW w:type="dxa" w:w="1700"/>
+            <w:shd w:fill="FFFFFF" w:val="clear"/>
+            <w:tcMar>
+              <w:top w:type="dxa" w:w="40"/>
+              <w:left w:type="dxa" w:w="70"/>
+              <w:bottom w:type="dxa" w:w="40"/>
+              <w:right w:type="dxa" w:w="70"/>
+            </w:tcMar>
+          </w:tcPr>
+          <w:p>
+            <w:pPr>
+              <w:spacing w:after="0" w:line="236"/>
+            </w:pPr>
+            <w:r>
+              <w:rPr>
+                <w:rFonts w:ascii="Arial" w:cs="Arial" w:eastAsia="Arial" w:hAnsi="Arial"/>
+                <w:b w:val="false"/>
+                <w:bCs w:val="false"/>
+                <w:sz w:val="19"/>
+                <w:szCs w:val="19"/>
+              </w:rPr>
+              <w:t xml:space="preserve">Con datos</w:t>
+            </w:r>
+          </w:p>
+        </w:tc>
+        <w:tc>
+          <w:tcPr>
+            <w:tcW w:type="dxa" w:w="3200"/>
+            <w:shd w:fill="FFFFFF" w:val="clear"/>
+            <w:tcMar>
+              <w:top w:type="dxa" w:w="40"/>
+              <w:left w:type="dxa" w:w="70"/>
+              <w:bottom w:type="dxa" w:w="40"/>
+              <w:right w:type="dxa" w:w="70"/>
+            </w:tcMar>
+          </w:tcPr>
+          <w:p>
+            <w:pPr>
+              <w:spacing w:after="0" w:line="236"/>
+            </w:pPr>
+            <w:r>
+              <w:rPr>
+                <w:rFonts w:ascii="Arial" w:cs="Arial" w:eastAsia="Arial" w:hAnsi="Arial"/>
+                <w:b w:val="false"/>
+                <w:bCs w:val="false"/>
+                <w:sz w:val="19"/>
+                <w:szCs w:val="19"/>
+              </w:rPr>
+              <w:t xml:space="preserve">Funcionamiento normal.</w:t>
+            </w:r>
+          </w:p>
+        </w:tc>
+        <w:tc>
+          <w:tcPr>
+            <w:tcW w:type="dxa" w:w="4460"/>
+            <w:shd w:fill="FFFFFF" w:val="clear"/>
+            <w:tcMar>
+              <w:top w:type="dxa" w:w="40"/>
+              <w:left w:type="dxa" w:w="70"/>
+              <w:bottom w:type="dxa" w:w="40"/>
+              <w:right w:type="dxa" w:w="70"/>
+            </w:tcMar>
+          </w:tcPr>
+          <w:p>
+            <w:pPr>
+              <w:spacing w:after="0" w:line="236"/>
+            </w:pPr>
+            <w:r>
+              <w:rPr>
+                <w:rFonts w:ascii="Arial" w:cs="Arial" w:eastAsia="Arial" w:hAnsi="Arial"/>
+                <w:b w:val="false"/>
+                <w:bCs w:val="false"/>
+                <w:sz w:val="19"/>
+                <w:szCs w:val="19"/>
+              </w:rPr>
+              <w:t xml:space="preserve">El contenido propio de la pantalla.</w:t>
+            </w:r>
+          </w:p>
+        </w:tc>
+      </w:tr>
+      <w:tr>
+        <w:trPr>
+          <w:tblHeader w:val="false"/>
+        </w:trPr>
+        <w:tc>
+          <w:tcPr>
+            <w:tcW w:type="dxa" w:w="1700"/>
+            <w:shd w:fill="F2F2F2" w:val="clear"/>
+            <w:tcMar>
+              <w:top w:type="dxa" w:w="40"/>
+              <w:left w:type="dxa" w:w="70"/>
+              <w:bottom w:type="dxa" w:w="40"/>
+              <w:right w:type="dxa" w:w="70"/>
+            </w:tcMar>
+          </w:tcPr>
+          <w:p>
+            <w:pPr>
+              <w:spacing w:after="0" w:line="236"/>
+            </w:pPr>
+            <w:r>
+              <w:rPr>
+                <w:rFonts w:ascii="Arial" w:cs="Arial" w:eastAsia="Arial" w:hAnsi="Arial"/>
+                <w:b w:val="false"/>
+                <w:bCs w:val="false"/>
+                <w:sz w:val="19"/>
+                <w:szCs w:val="19"/>
+              </w:rPr>
+              <w:t xml:space="preserve">Cargando</w:t>
+            </w:r>
+          </w:p>
+        </w:tc>
+        <w:tc>
+          <w:tcPr>
+            <w:tcW w:type="dxa" w:w="3200"/>
+            <w:shd w:fill="F2F2F2" w:val="clear"/>
+            <w:tcMar>
+              <w:top w:type="dxa" w:w="40"/>
+              <w:left w:type="dxa" w:w="70"/>
+              <w:bottom w:type="dxa" w:w="40"/>
+              <w:right w:type="dxa" w:w="70"/>
+            </w:tcMar>
+          </w:tcPr>
+          <w:p>
+            <w:pPr>
+              <w:spacing w:after="0" w:line="236"/>
+            </w:pPr>
+            <w:r>
+              <w:rPr>
+                <w:rFonts w:ascii="Arial" w:cs="Arial" w:eastAsia="Arial" w:hAnsi="Arial"/>
+                <w:b w:val="false"/>
+                <w:bCs w:val="false"/>
+                <w:sz w:val="19"/>
+                <w:szCs w:val="19"/>
+              </w:rPr>
+              <w:t xml:space="preserve">Mientras se consulta la información.</w:t>
+            </w:r>
+          </w:p>
+        </w:tc>
+        <w:tc>
+          <w:tcPr>
+            <w:tcW w:type="dxa" w:w="4460"/>
+            <w:shd w:fill="F2F2F2" w:val="clear"/>
+            <w:tcMar>
+              <w:top w:type="dxa" w:w="40"/>
+              <w:left w:type="dxa" w:w="70"/>
+              <w:bottom w:type="dxa" w:w="40"/>
+              <w:right w:type="dxa" w:w="70"/>
+            </w:tcMar>
+          </w:tcPr>
+          <w:p>
+            <w:pPr>
+              <w:spacing w:after="0" w:line="236"/>
+            </w:pPr>
+            <w:r>
+              <w:rPr>
+                <w:rFonts w:ascii="Arial" w:cs="Arial" w:eastAsia="Arial" w:hAnsi="Arial"/>
+                <w:b w:val="false"/>
+                <w:bCs w:val="false"/>
+                <w:sz w:val="19"/>
+                <w:szCs w:val="19"/>
+              </w:rPr>
+              <w:t xml:space="preserve">Marcadores de carga en el lugar del contenido, conservando la estructura.</w:t>
+            </w:r>
+          </w:p>
+        </w:tc>
+      </w:tr>
+      <w:tr>
+        <w:trPr>
+          <w:tblHeader w:val="false"/>
+        </w:trPr>
+        <w:tc>
+          <w:tcPr>
+            <w:tcW w:type="dxa" w:w="1700"/>
+            <w:shd w:fill="FFFFFF" w:val="clear"/>
+            <w:tcMar>
+              <w:top w:type="dxa" w:w="40"/>
+              <w:left w:type="dxa" w:w="70"/>
+              <w:bottom w:type="dxa" w:w="40"/>
+              <w:right w:type="dxa" w:w="70"/>
+            </w:tcMar>
+          </w:tcPr>
+          <w:p>
+            <w:pPr>
+              <w:spacing w:after="0" w:line="236"/>
+            </w:pPr>
+            <w:r>
+              <w:rPr>
+                <w:rFonts w:ascii="Arial" w:cs="Arial" w:eastAsia="Arial" w:hAnsi="Arial"/>
+                <w:b w:val="false"/>
+                <w:bCs w:val="false"/>
+                <w:sz w:val="19"/>
+                <w:szCs w:val="19"/>
+              </w:rPr>
+              <w:t xml:space="preserve">Vacío inicial</w:t>
+            </w:r>
+          </w:p>
+        </w:tc>
+        <w:tc>
+          <w:tcPr>
+            <w:tcW w:type="dxa" w:w="3200"/>
+            <w:shd w:fill="FFFFFF" w:val="clear"/>
+            <w:tcMar>
+              <w:top w:type="dxa" w:w="40"/>
+              <w:left w:type="dxa" w:w="70"/>
+              <w:bottom w:type="dxa" w:w="40"/>
+              <w:right w:type="dxa" w:w="70"/>
+            </w:tcMar>
+          </w:tcPr>
+          <w:p>
+            <w:pPr>
+              <w:spacing w:after="0" w:line="236"/>
+            </w:pPr>
+            <w:r>
+              <w:rPr>
+                <w:rFonts w:ascii="Arial" w:cs="Arial" w:eastAsia="Arial" w:hAnsi="Arial"/>
+                <w:b w:val="false"/>
+                <w:bCs w:val="false"/>
+                <w:sz w:val="19"/>
+                <w:szCs w:val="19"/>
+              </w:rPr>
+              <w:t xml:space="preserve">El usuario aún no ha registrado datos.</w:t>
+            </w:r>
+          </w:p>
+        </w:tc>
+        <w:tc>
+          <w:tcPr>
+            <w:tcW w:type="dxa" w:w="4460"/>
+            <w:shd w:fill="FFFFFF" w:val="clear"/>
+            <w:tcMar>
+              <w:top w:type="dxa" w:w="40"/>
+              <w:left w:type="dxa" w:w="70"/>
+              <w:bottom w:type="dxa" w:w="40"/>
+              <w:right w:type="dxa" w:w="70"/>
+            </w:tcMar>
+          </w:tcPr>
+          <w:p>
+            <w:pPr>
+              <w:spacing w:after="0" w:line="236"/>
+            </w:pPr>
+            <w:r>
+              <w:rPr>
+                <w:rFonts w:ascii="Arial" w:cs="Arial" w:eastAsia="Arial" w:hAnsi="Arial"/>
+                <w:b w:val="false"/>
+                <w:bCs w:val="false"/>
+                <w:sz w:val="19"/>
+                <w:szCs w:val="19"/>
+              </w:rPr>
+              <w:t xml:space="preserve">Mensaje breve, explicación de un renglón y la acción para crear el primer registro.</w:t>
+            </w:r>
+          </w:p>
+        </w:tc>
+      </w:tr>
+      <w:tr>
+        <w:trPr>
+          <w:tblHeader w:val="false"/>
+        </w:trPr>
+        <w:tc>
+          <w:tcPr>
+            <w:tcW w:type="dxa" w:w="1700"/>
+            <w:shd w:fill="F2F2F2" w:val="clear"/>
+            <w:tcMar>
+              <w:top w:type="dxa" w:w="40"/>
+              <w:left w:type="dxa" w:w="70"/>
+              <w:bottom w:type="dxa" w:w="40"/>
+              <w:right w:type="dxa" w:w="70"/>
+            </w:tcMar>
+          </w:tcPr>
+          <w:p>
+            <w:pPr>
+              <w:spacing w:after="0" w:line="236"/>
+            </w:pPr>
+            <w:r>
+              <w:rPr>
+                <w:rFonts w:ascii="Arial" w:cs="Arial" w:eastAsia="Arial" w:hAnsi="Arial"/>
+                <w:b w:val="false"/>
+                <w:bCs w:val="false"/>
+                <w:sz w:val="19"/>
+                <w:szCs w:val="19"/>
+              </w:rPr>
+              <w:t xml:space="preserve">Sin resultados</w:t>
+            </w:r>
+          </w:p>
+        </w:tc>
+        <w:tc>
+          <w:tcPr>
+            <w:tcW w:type="dxa" w:w="3200"/>
+            <w:shd w:fill="F2F2F2" w:val="clear"/>
+            <w:tcMar>
+              <w:top w:type="dxa" w:w="40"/>
+              <w:left w:type="dxa" w:w="70"/>
+              <w:bottom w:type="dxa" w:w="40"/>
+              <w:right w:type="dxa" w:w="70"/>
+            </w:tcMar>
+          </w:tcPr>
+          <w:p>
+            <w:pPr>
+              <w:spacing w:after="0" w:line="236"/>
+            </w:pPr>
+            <w:r>
+              <w:rPr>
+                <w:rFonts w:ascii="Arial" w:cs="Arial" w:eastAsia="Arial" w:hAnsi="Arial"/>
+                <w:b w:val="false"/>
+                <w:bCs w:val="false"/>
+                <w:sz w:val="19"/>
+                <w:szCs w:val="19"/>
+              </w:rPr>
+              <w:t xml:space="preserve">La búsqueda o el filtro no arroja coincidencias.</w:t>
+            </w:r>
+          </w:p>
+        </w:tc>
+        <w:tc>
+          <w:tcPr>
+            <w:tcW w:type="dxa" w:w="4460"/>
+            <w:shd w:fill="F2F2F2" w:val="clear"/>
+            <w:tcMar>
+              <w:top w:type="dxa" w:w="40"/>
+              <w:left w:type="dxa" w:w="70"/>
+              <w:bottom w:type="dxa" w:w="40"/>
+              <w:right w:type="dxa" w:w="70"/>
+            </w:tcMar>
+          </w:tcPr>
+          <w:p>
+            <w:pPr>
+              <w:spacing w:after="0" w:line="236"/>
+            </w:pPr>
+            <w:r>
+              <w:rPr>
+                <w:rFonts w:ascii="Arial" w:cs="Arial" w:eastAsia="Arial" w:hAnsi="Arial"/>
+                <w:b w:val="false"/>
+                <w:bCs w:val="false"/>
+                <w:sz w:val="19"/>
+                <w:szCs w:val="19"/>
+              </w:rPr>
+              <w:t xml:space="preserve">Aviso de que no se encontraron resultados y sugerencia de modificar la búsqueda.</w:t>
+            </w:r>
+          </w:p>
+        </w:tc>
+      </w:tr>
+      <w:tr>
+        <w:trPr>
+          <w:tblHeader w:val="false"/>
+        </w:trPr>
+        <w:tc>
+          <w:tcPr>
+            <w:tcW w:type="dxa" w:w="1700"/>
+            <w:shd w:fill="FFFFFF" w:val="clear"/>
+            <w:tcMar>
+              <w:top w:type="dxa" w:w="40"/>
+              <w:left w:type="dxa" w:w="70"/>
+              <w:bottom w:type="dxa" w:w="40"/>
+              <w:right w:type="dxa" w:w="70"/>
+            </w:tcMar>
+          </w:tcPr>
+          <w:p>
+            <w:pPr>
+              <w:spacing w:after="0" w:line="236"/>
+            </w:pPr>
+            <w:r>
+              <w:rPr>
+                <w:rFonts w:ascii="Arial" w:cs="Arial" w:eastAsia="Arial" w:hAnsi="Arial"/>
+                <w:b w:val="false"/>
+                <w:bCs w:val="false"/>
+                <w:sz w:val="19"/>
+                <w:szCs w:val="19"/>
+              </w:rPr>
+              <w:t xml:space="preserve">Error</w:t>
+            </w:r>
+          </w:p>
+        </w:tc>
+        <w:tc>
+          <w:tcPr>
+            <w:tcW w:type="dxa" w:w="3200"/>
+            <w:shd w:fill="FFFFFF" w:val="clear"/>
+            <w:tcMar>
+              <w:top w:type="dxa" w:w="40"/>
+              <w:left w:type="dxa" w:w="70"/>
+              <w:bottom w:type="dxa" w:w="40"/>
+              <w:right w:type="dxa" w:w="70"/>
+            </w:tcMar>
+          </w:tcPr>
+          <w:p>
+            <w:pPr>
+              <w:spacing w:after="0" w:line="236"/>
+            </w:pPr>
+            <w:r>
+              <w:rPr>
+                <w:rFonts w:ascii="Arial" w:cs="Arial" w:eastAsia="Arial" w:hAnsi="Arial"/>
+                <w:b w:val="false"/>
+                <w:bCs w:val="false"/>
+                <w:sz w:val="19"/>
+                <w:szCs w:val="19"/>
+              </w:rPr>
+              <w:t xml:space="preserve">Falla la operación o la conexión.</w:t>
+            </w:r>
+          </w:p>
+        </w:tc>
+        <w:tc>
+          <w:tcPr>
+            <w:tcW w:type="dxa" w:w="4460"/>
+            <w:shd w:fill="FFFFFF" w:val="clear"/>
+            <w:tcMar>
+              <w:top w:type="dxa" w:w="40"/>
+              <w:left w:type="dxa" w:w="70"/>
+              <w:bottom w:type="dxa" w:w="40"/>
+              <w:right w:type="dxa" w:w="70"/>
+            </w:tcMar>
+          </w:tcPr>
+          <w:p>
+            <w:pPr>
+              <w:spacing w:after="0" w:line="236"/>
+            </w:pPr>
+            <w:r>
+              <w:rPr>
+                <w:rFonts w:ascii="Arial" w:cs="Arial" w:eastAsia="Arial" w:hAnsi="Arial"/>
+                <w:b w:val="false"/>
+                <w:bCs w:val="false"/>
+                <w:sz w:val="19"/>
+                <w:szCs w:val="19"/>
+              </w:rPr>
+              <w:t xml:space="preserve">Mensaje en color de peligro con la causa y la opción de reintentar.</w:t>
+            </w:r>
+          </w:p>
+        </w:tc>
+      </w:tr>
+      <w:tr>
+        <w:trPr>
+          <w:tblHeader w:val="false"/>
+        </w:trPr>
+        <w:tc>
+          <w:tcPr>
+            <w:tcW w:type="dxa" w:w="1700"/>
+            <w:shd w:fill="F2F2F2" w:val="clear"/>
+            <w:tcMar>
+              <w:top w:type="dxa" w:w="40"/>
+              <w:left w:type="dxa" w:w="70"/>
+              <w:bottom w:type="dxa" w:w="40"/>
+              <w:right w:type="dxa" w:w="70"/>
+            </w:tcMar>
+          </w:tcPr>
+          <w:p>
+            <w:pPr>
+              <w:spacing w:after="0" w:line="236"/>
+            </w:pPr>
+            <w:r>
+              <w:rPr>
+                <w:rFonts w:ascii="Arial" w:cs="Arial" w:eastAsia="Arial" w:hAnsi="Arial"/>
+                <w:b w:val="false"/>
+                <w:bCs w:val="false"/>
+                <w:sz w:val="19"/>
+                <w:szCs w:val="19"/>
+              </w:rPr>
+              <w:t xml:space="preserve">Sin permiso</w:t>
+            </w:r>
+          </w:p>
+        </w:tc>
+        <w:tc>
+          <w:tcPr>
+            <w:tcW w:type="dxa" w:w="3200"/>
+            <w:shd w:fill="F2F2F2" w:val="clear"/>
+            <w:tcMar>
+              <w:top w:type="dxa" w:w="40"/>
+              <w:left w:type="dxa" w:w="70"/>
+              <w:bottom w:type="dxa" w:w="40"/>
+              <w:right w:type="dxa" w:w="70"/>
+            </w:tcMar>
+          </w:tcPr>
+          <w:p>
+            <w:pPr>
+              <w:spacing w:after="0" w:line="236"/>
+            </w:pPr>
+            <w:r>
+              <w:rPr>
+                <w:rFonts w:ascii="Arial" w:cs="Arial" w:eastAsia="Arial" w:hAnsi="Arial"/>
+                <w:b w:val="false"/>
+                <w:bCs w:val="false"/>
+                <w:sz w:val="19"/>
+                <w:szCs w:val="19"/>
+              </w:rPr>
+              <w:t xml:space="preserve">El rol o el plan no habilitan la función.</w:t>
+            </w:r>
+          </w:p>
+        </w:tc>
+        <w:tc>
+          <w:tcPr>
+            <w:tcW w:type="dxa" w:w="4460"/>
+            <w:shd w:fill="F2F2F2" w:val="clear"/>
+            <w:tcMar>
+              <w:top w:type="dxa" w:w="40"/>
+              <w:left w:type="dxa" w:w="70"/>
+              <w:bottom w:type="dxa" w:w="40"/>
+              <w:right w:type="dxa" w:w="70"/>
+            </w:tcMar>
+          </w:tcPr>
+          <w:p>
+            <w:pPr>
+              <w:spacing w:after="0" w:line="236"/>
+            </w:pPr>
+            <w:r>
+              <w:rPr>
+                <w:rFonts w:ascii="Arial" w:cs="Arial" w:eastAsia="Arial" w:hAnsi="Arial"/>
+                <w:b w:val="false"/>
+                <w:bCs w:val="false"/>
+                <w:sz w:val="19"/>
+                <w:szCs w:val="19"/>
+              </w:rPr>
+              <w:t xml:space="preserve">Explicación del motivo y, cuando corresponde, la vía para cambiar de plan.</w:t>
+            </w:r>
+          </w:p>
+        </w:tc>
+      </w:tr>
+    </w:tbl>
+    <w:p>
+      <w:pPr>
+        <w:pStyle w:val="Heading2"/>
+        <w:spacing w:after="80" w:before="150"/>
+      </w:pPr>
+      <w:bookmarkStart w:name="bm40" w:id="1"/>
+      <w:r>
+        <w:rPr>
+          <w:rFonts w:ascii="Arial" w:cs="Arial" w:eastAsia="Arial" w:hAnsi="Arial"/>
+          <w:b/>
+          <w:bCs/>
+          <w:color w:val="2E5496"/>
+          <w:sz w:val="23"/>
+          <w:szCs w:val="23"/>
+        </w:rPr>
+        <w:t xml:space="preserve">9.2 Redacción de los mensajes</w:t>
+      </w:r>
+      <w:bookmarkEnd w:id="1"/>
+    </w:p>
+    <w:p>
+      <w:pPr>
+        <w:spacing w:after="110" w:line="262"/>
+        <w:jc w:val="both"/>
+      </w:pPr>
+      <w:r>
+        <w:rPr>
+          <w:rFonts w:ascii="Arial" w:cs="Arial" w:eastAsia="Arial" w:hAnsi="Arial"/>
+          <w:sz w:val="22"/>
+          <w:szCs w:val="22"/>
+        </w:rPr>
+        <w:t xml:space="preserve">Los textos siguen las mismas reglas en toda la aplicación:</w:t>
+      </w:r>
+    </w:p>
+    <w:p>
+      <w:pPr>
+        <w:pStyle w:val="ListParagraph"/>
+        <w:numPr>
+          <w:ilvl w:val="0"/>
+          <w:numId w:val="1"/>
+        </w:numPr>
+        <w:spacing w:after="60" w:line="258"/>
+      </w:pPr>
+      <w:r>
+        <w:rPr>
+          <w:rFonts w:ascii="Arial" w:cs="Arial" w:eastAsia="Arial" w:hAnsi="Arial"/>
+          <w:sz w:val="22"/>
+          <w:szCs w:val="22"/>
+        </w:rPr>
+        <w:t xml:space="preserve">Lenguaje sencillo y directo, sin términos técnicos ni códigos de error visibles para el usuario.</w:t>
+      </w:r>
+    </w:p>
+    <w:p>
+      <w:pPr>
+        <w:pStyle w:val="ListParagraph"/>
+        <w:numPr>
+          <w:ilvl w:val="0"/>
+          <w:numId w:val="1"/>
+        </w:numPr>
+        <w:spacing w:after="60" w:line="258"/>
+      </w:pPr>
+      <w:r>
+        <w:rPr>
+          <w:rFonts w:ascii="Arial" w:cs="Arial" w:eastAsia="Arial" w:hAnsi="Arial"/>
+          <w:sz w:val="22"/>
+          <w:szCs w:val="22"/>
+        </w:rPr>
+        <w:t xml:space="preserve">El mensaje describe qué ocurrió y qué hacer a continuación, en una sola frase cuando es posible.</w:t>
+      </w:r>
+    </w:p>
+    <w:p>
+      <w:pPr>
+        <w:pStyle w:val="ListParagraph"/>
+        <w:numPr>
+          <w:ilvl w:val="0"/>
+          <w:numId w:val="1"/>
+        </w:numPr>
+        <w:spacing w:after="60" w:line="258"/>
+      </w:pPr>
+      <w:r>
+        <w:rPr>
+          <w:rFonts w:ascii="Arial" w:cs="Arial" w:eastAsia="Arial" w:hAnsi="Arial"/>
+          <w:sz w:val="22"/>
+          <w:szCs w:val="22"/>
+        </w:rPr>
+        <w:t xml:space="preserve">Los mensajes de validación se ubican junto al campo que los origina; los de operación, en la parte superior del contenido o como aviso emergente.</w:t>
+      </w:r>
+    </w:p>
+    <w:p>
+      <w:pPr>
+        <w:pStyle w:val="ListParagraph"/>
+        <w:numPr>
+          <w:ilvl w:val="0"/>
+          <w:numId w:val="1"/>
+        </w:numPr>
+        <w:spacing w:after="60" w:line="258"/>
+      </w:pPr>
+      <w:r>
+        <w:rPr>
+          <w:rFonts w:ascii="Arial" w:cs="Arial" w:eastAsia="Arial" w:hAnsi="Arial"/>
+          <w:sz w:val="22"/>
+          <w:szCs w:val="22"/>
+        </w:rPr>
+        <w:t xml:space="preserve">Las confirmaciones de una acción rápida desaparecen solas; los errores permanecen hasta que el usuario los atiende.</w:t>
+      </w:r>
+    </w:p>
+    <w:p>
+      <w:pPr>
+        <w:pStyle w:val="ListParagraph"/>
+        <w:numPr>
+          <w:ilvl w:val="0"/>
+          <w:numId w:val="1"/>
+        </w:numPr>
+        <w:spacing w:after="60" w:line="258"/>
+      </w:pPr>
+      <w:r>
+        <w:rPr>
+          <w:rFonts w:ascii="Arial" w:cs="Arial" w:eastAsia="Arial" w:hAnsi="Arial"/>
+          <w:sz w:val="22"/>
+          <w:szCs w:val="22"/>
+        </w:rPr>
+        <w:t xml:space="preserve">No se responsabiliza al usuario del error ni se emplean expresiones de alarma.</w:t>
+      </w:r>
+    </w:p>
+    <w:p>
+      <w:pPr>
+        <w:pStyle w:val="Heading1"/>
+        <w:pageBreakBefore/>
+        <w:spacing w:after="110" w:before="220"/>
+      </w:pPr>
+      <w:bookmarkStart w:name="bm41" w:id="1"/>
+      <w:r>
+        <w:rPr>
+          <w:rFonts w:ascii="Arial" w:cs="Arial" w:eastAsia="Arial" w:hAnsi="Arial"/>
+          <w:b/>
+          <w:bCs/>
+          <w:color w:val="1F3864"/>
+          <w:sz w:val="27"/>
+          <w:szCs w:val="27"/>
+        </w:rPr>
+        <w:t xml:space="preserve">10. Comportamiento responsivo y modo oscuro</w:t>
+      </w:r>
+      <w:bookmarkEnd w:id="1"/>
+    </w:p>
+    <w:p>
+      <w:pPr>
+        <w:spacing w:after="110" w:line="262"/>
+        <w:jc w:val="both"/>
+      </w:pPr>
+      <w:r>
+        <w:rPr>
+          <w:rFonts w:ascii="Arial" w:cs="Arial" w:eastAsia="Arial" w:hAnsi="Arial"/>
+          <w:sz w:val="22"/>
+          <w:szCs w:val="22"/>
+        </w:rPr>
+        <w:t xml:space="preserve">La interfaz se adapta a los tamaños definidos en la sección 5.3. La adaptación no consiste en reducir la pantalla de escritorio, sino en reorganizar el contenido para conservar la facilidad de uso en cada dispositivo.</w:t>
+      </w:r>
+    </w:p>
+    <w:p>
+      <w:pPr>
+        <w:pStyle w:val="Heading2"/>
+        <w:spacing w:after="80" w:before="150"/>
+      </w:pPr>
+      <w:bookmarkStart w:name="bm42" w:id="1"/>
+      <w:r>
+        <w:rPr>
+          <w:rFonts w:ascii="Arial" w:cs="Arial" w:eastAsia="Arial" w:hAnsi="Arial"/>
+          <w:b/>
+          <w:bCs/>
+          <w:color w:val="2E5496"/>
+          <w:sz w:val="23"/>
+          <w:szCs w:val="23"/>
+        </w:rPr>
+        <w:t xml:space="preserve">10.1 Versión móvil</w:t>
+      </w:r>
+      <w:bookmarkEnd w:id="1"/>
+    </w:p>
+    <w:p>
+      <w:pPr>
+        <w:spacing w:after="110" w:line="262"/>
+        <w:jc w:val="both"/>
+      </w:pPr>
+      <w:r>
+        <w:rPr>
+          <w:rFonts w:ascii="Arial" w:cs="Arial" w:eastAsia="Arial" w:hAnsi="Arial"/>
+          <w:sz w:val="22"/>
+          <w:szCs w:val="22"/>
+        </w:rPr>
+        <w:t xml:space="preserve">En el teléfono el contenido se presenta en una sola columna y la barra lateral se traslada a la parte superior, donde se desplaza en horizontal y conserva el acceso a todos los módulos. Los controles aumentan su área de toque y las tablas se convierten en listas, de modo que cada registro ocupe un renglón legible.</w:t>
+      </w:r>
+    </w:p>
+    <w:p>
+      <w:pPr>
+        <w:pStyle w:val="ListParagraph"/>
+        <w:numPr>
+          <w:ilvl w:val="0"/>
+          <w:numId w:val="1"/>
+        </w:numPr>
+        <w:spacing w:after="60" w:line="258"/>
+      </w:pPr>
+      <w:r>
+        <w:rPr>
+          <w:rFonts w:ascii="Arial" w:cs="Arial" w:eastAsia="Arial" w:hAnsi="Arial"/>
+          <w:sz w:val="22"/>
+          <w:szCs w:val="22"/>
+        </w:rPr>
+        <w:t xml:space="preserve">Inicio de sesión: formulario centrado, con los campos y el botón a todo el ancho.</w:t>
+      </w:r>
+    </w:p>
+    <w:p>
+      <w:pPr>
+        <w:pStyle w:val="ListParagraph"/>
+        <w:numPr>
+          <w:ilvl w:val="0"/>
+          <w:numId w:val="1"/>
+        </w:numPr>
+        <w:spacing w:after="60" w:line="258"/>
+      </w:pPr>
+      <w:r>
+        <w:rPr>
+          <w:rFonts w:ascii="Arial" w:cs="Arial" w:eastAsia="Arial" w:hAnsi="Arial"/>
+          <w:sz w:val="22"/>
+          <w:szCs w:val="22"/>
+        </w:rPr>
+        <w:t xml:space="preserve">Panel: los indicadores se agrupan de a dos por fila y las alertas de existencias quedan inmediatamente debajo.</w:t>
+      </w:r>
+    </w:p>
+    <w:p>
+      <w:pPr>
+        <w:pStyle w:val="ListParagraph"/>
+        <w:numPr>
+          <w:ilvl w:val="0"/>
+          <w:numId w:val="1"/>
+        </w:numPr>
+        <w:spacing w:after="60" w:line="258"/>
+      </w:pPr>
+      <w:r>
+        <w:rPr>
+          <w:rFonts w:ascii="Arial" w:cs="Arial" w:eastAsia="Arial" w:hAnsi="Arial"/>
+          <w:sz w:val="22"/>
+          <w:szCs w:val="22"/>
+        </w:rPr>
+        <w:t xml:space="preserve">Punto de venta: buscador, lista de la venta en curso, total y medios de pago en una sola columna, con la acción de cobro fija en la parte inferior.</w:t>
+      </w:r>
+    </w:p>
+    <w:p>
+      <w:pPr>
+        <w:spacing w:after="20" w:before="60"/>
+        <w:jc w:val="center"/>
+      </w:pPr>
+      <w:r>
+        <w:drawing>
+          <wp:inline distT="0" distB="0" distL="0" distR="0">
+            <wp:extent cx="6096000" cy="3295650"/>
+            <wp:effectExtent t="0" r="0" b="0" l="0"/>
+            <wp:docPr id="1" name="" descr="" title=""/>
+            <wp:cNvGraphicFramePr>
+              <a:graphicFrameLocks xmlns:a="http://schemas.openxmlformats.org/drawingml/2006/main" noChangeAspect="1"/>
+            </wp:cNvGraphicFramePr>
+            <a:graphic xmlns:a="http://schemas.openxmlformats.org/drawingml/2006/main">
+              <a:graphicData uri="http://schemas.openxmlformats.org/drawingml/2006/picture">
+                <pic:pic xmlns:pic="http://schemas.openxmlformats.org/drawingml/2006/picture">
+                  <pic:nvPicPr>
+                    <pic:cNvPr id="0" name="" descr=""/>
+                    <pic:cNvPicPr>
+                      <a:picLocks noChangeAspect="1" noChangeArrowheads="1"/>
+                    </pic:cNvPicPr>
+                  </pic:nvPicPr>
+                  <pic:blipFill>
+                    <a:blip r:embed="rId28" cstate="none"/>
+                    <a:srcRect/>
+                    <a:stretch>
+                      <a:fillRect/>
+                    </a:stretch>
+                  </pic:blipFill>
+                  <pic:spPr bwMode="auto">
+                    <a:xfrm>
+                      <a:off x="0" y="0"/>
+                      <a:ext cx="6096000" cy="3295650"/>
+                    </a:xfrm>
+                    <a:prstGeom prst="rect">
+                      <a:avLst/>
+                    </a:prstGeom>
+                  </pic:spPr>
+                </pic:pic>
+              </a:graphicData>
+            </a:graphic>
+          </wp:inline>
+        </w:drawing>
+      </w:r>
+    </w:p>
+    <w:p>
+      <w:pPr>
+        <w:spacing w:after="150" w:before="6"/>
+        <w:jc w:val="center"/>
+      </w:pPr>
+      <w:r>
+        <w:rPr>
+          <w:rFonts w:ascii="Arial" w:cs="Arial" w:eastAsia="Arial" w:hAnsi="Arial"/>
+          <w:i/>
+          <w:iCs/>
+          <w:color w:val="5B6678"/>
+          <w:sz w:val="18"/>
+          <w:szCs w:val="18"/>
+        </w:rPr>
+        <w:t xml:space="preserve">Figura 21. Versión móvil: inicio de sesión, panel y punto de venta. Fuente: del autor.</w:t>
+      </w:r>
+    </w:p>
+    <w:p>
+      <w:pPr>
+        <w:pStyle w:val="Heading2"/>
+        <w:spacing w:after="80" w:before="150"/>
+      </w:pPr>
+      <w:bookmarkStart w:name="bm43" w:id="1"/>
+      <w:r>
+        <w:rPr>
+          <w:rFonts w:ascii="Arial" w:cs="Arial" w:eastAsia="Arial" w:hAnsi="Arial"/>
+          <w:b/>
+          <w:bCs/>
+          <w:color w:val="2E5496"/>
+          <w:sz w:val="23"/>
+          <w:szCs w:val="23"/>
+        </w:rPr>
+        <w:t xml:space="preserve">10.2 Tablet y escritorio</w:t>
+      </w:r>
+      <w:bookmarkEnd w:id="1"/>
+    </w:p>
+    <w:p>
+      <w:pPr>
+        <w:spacing w:after="110" w:line="262"/>
+        <w:jc w:val="both"/>
+      </w:pPr>
+      <w:r>
+        <w:rPr>
+          <w:rFonts w:ascii="Arial" w:cs="Arial" w:eastAsia="Arial" w:hAnsi="Arial"/>
+          <w:sz w:val="22"/>
+          <w:szCs w:val="22"/>
+        </w:rPr>
+        <w:t xml:space="preserve">En tablet el contenido se organiza en dos columnas y la navegación lateral puede contraerse para dejar más espacio al contenido. En escritorio se emplea la rejilla completa, con la navegación lateral fija y los paneles de apoyo a la derecha del contenido principal, como ocurre en el punto de venta.</w:t>
+      </w:r>
+    </w:p>
+    <w:p>
+      <w:pPr>
+        <w:pStyle w:val="Heading2"/>
+        <w:spacing w:after="80" w:before="150"/>
+      </w:pPr>
+      <w:bookmarkStart w:name="bm44" w:id="1"/>
+      <w:r>
+        <w:rPr>
+          <w:rFonts w:ascii="Arial" w:cs="Arial" w:eastAsia="Arial" w:hAnsi="Arial"/>
+          <w:b/>
+          <w:bCs/>
+          <w:color w:val="2E5496"/>
+          <w:sz w:val="23"/>
+          <w:szCs w:val="23"/>
+        </w:rPr>
+        <w:t xml:space="preserve">10.3 Modo oscuro</w:t>
+      </w:r>
+      <w:bookmarkEnd w:id="1"/>
+    </w:p>
+    <w:p>
+      <w:pPr>
+        <w:spacing w:after="110" w:line="262"/>
+        <w:jc w:val="both"/>
+      </w:pPr>
+      <w:r>
+        <w:rPr>
+          <w:rFonts w:ascii="Arial" w:cs="Arial" w:eastAsia="Arial" w:hAnsi="Arial"/>
+          <w:sz w:val="22"/>
+          <w:szCs w:val="22"/>
+        </w:rPr>
+        <w:t xml:space="preserve">El modo oscuro utiliza la variante de paleta definida en la sección 4.2 y conserva la misma estructura, la misma jerarquía y los mismos componentes del modo claro. Cambian únicamente los colores de fondo, superficie, borde y texto, y se ajustan los tonos de las etiquetas de estado para mantener el contraste. La elección del modo es del usuario y se conserva entre sesiones. El cambio se hace desde la parte inferior del menú lateral y, en las pantallas de acceso, desde el panel de marca, de modo que también pueda elegirlo quien todavía no ha entrado. Mientras el usuario no elija, se aplica la preferencia del sistema operativo.</w:t>
+      </w:r>
+    </w:p>
+    <w:p>
+      <w:pPr>
+        <w:spacing w:after="20" w:before="60"/>
+        <w:jc w:val="center"/>
+      </w:pPr>
+      <w:r>
+        <w:drawing>
+          <wp:inline distT="0" distB="0" distL="0" distR="0">
+            <wp:extent cx="6096000" cy="3067050"/>
+            <wp:effectExtent t="0" r="0" b="0" l="0"/>
+            <wp:docPr id="1" name="" descr="" title=""/>
+            <wp:cNvGraphicFramePr>
+              <a:graphicFrameLocks xmlns:a="http://schemas.openxmlformats.org/drawingml/2006/main" noChangeAspect="1"/>
+            </wp:cNvGraphicFramePr>
+            <a:graphic xmlns:a="http://schemas.openxmlformats.org/drawingml/2006/main">
+              <a:graphicData uri="http://schemas.openxmlformats.org/drawingml/2006/picture">
+                <pic:pic xmlns:pic="http://schemas.openxmlformats.org/drawingml/2006/picture">
+                  <pic:nvPicPr>
+                    <pic:cNvPr id="0" name="" descr=""/>
+                    <pic:cNvPicPr>
+                      <a:picLocks noChangeAspect="1" noChangeArrowheads="1"/>
+                    </pic:cNvPicPr>
+                  </pic:nvPicPr>
+                  <pic:blipFill>
+                    <a:blip r:embed="rId29" cstate="none"/>
+                    <a:srcRect/>
+                    <a:stretch>
+                      <a:fillRect/>
+                    </a:stretch>
+                  </pic:blipFill>
+                  <pic:spPr bwMode="auto">
+                    <a:xfrm>
+                      <a:off x="0" y="0"/>
                       <a:ext cx="6096000" cy="3067050"/>
                     </a:xfrm>
                     <a:prstGeom prst="rect">
@@ -12183,7 +12587,7 @@
           <w:sz w:val="18"/>
           <w:szCs w:val="18"/>
         </w:rPr>
-        <w:t xml:space="preserve">Figura 20. Panel principal en modo oscuro. Fuente: del autor.</w:t>
+        <w:t xml:space="preserve">Figura 22. Panel principal en modo oscuro. Fuente: del autor.</w:t>
       </w:r>
     </w:p>
     <w:p>
@@ -12192,7 +12596,7 @@
         <w:pageBreakBefore/>
         <w:spacing w:after="110" w:before="220"/>
       </w:pPr>
-      <w:bookmarkStart w:name="bm42" w:id="1"/>
+      <w:bookmarkStart w:name="bm45" w:id="1"/>
       <w:r>
         <w:rPr>
           <w:rFonts w:ascii="Arial" w:cs="Arial" w:eastAsia="Arial" w:hAnsi="Arial"/>
@@ -12240,7 +12644,7 @@
         <w:pageBreakBefore/>
         <w:spacing w:after="110" w:before="220"/>
       </w:pPr>
-      <w:bookmarkStart w:name="bm43" w:id="1"/>
+      <w:bookmarkStart w:name="bm46" w:id="1"/>
       <w:r>
         <w:rPr>
           <w:rFonts w:ascii="Arial" w:cs="Arial" w:eastAsia="Arial" w:hAnsi="Arial"/>
@@ -13106,7 +13510,7 @@
         <w:pageBreakBefore/>
         <w:spacing w:after="110" w:before="220"/>
       </w:pPr>
-      <w:bookmarkStart w:name="bm44" w:id="1"/>
+      <w:bookmarkStart w:name="bm47" w:id="1"/>
       <w:r>
         <w:rPr>
           <w:rFonts w:ascii="Arial" w:cs="Arial" w:eastAsia="Arial" w:hAnsi="Arial"/>

</xml_diff>

<commit_message>
Abro el modulo de inventario con el catalogo de productos
Creo la tabla de sedes, que el modelo de datos exige como llave obligatoria en cinco tablas de inventario y ventas, y hago que toda licorera nazca con su sede y sus seis categorias desde una sola funcion. Catalogo de productos con su busqueda, sus filtros, la edicion y la baja logica. El producto no guarda costo ni existencias: el costo entra con cada lote y la existencia se deriva de ellos. Corrijo ademas el formulario del prototipo, que pedia precio de compra y existencias iniciales, y dejo las categorias en singular como las enumera la especificacion.
</commit_message>
<xml_diff>
--- a/docs/diseno/INVENTRA_Documento_Tecnico_Diseno.docx
+++ b/docs/diseno/INVENTRA_Documento_Tecnico_Diseno.docx
@@ -2499,7 +2499,10 @@
         <w:jc w:val="both"/>
       </w:pPr>
       <w:r>
-        <w:t>Este documento define el sistema de diseño de la interfaz de INVENTRA para las plataformas web y móvil. Reúne la identidad visual, los componentes reutilizables, las pautas de accesibilidad y de experiencia de usuario, y las pantallas principales de la aplicación. Su propósito es servir de guía para la etapa de construcción y garantizar una interfaz coherente en todo el producto.</w:t>
+        <w:t>Este documento define el sistema de diseño de la interfaz de INVENTRA para las plataformas web y móvil. Reúne la identidad visual, los componentes reutilizables, las pautas de accesibilidad y de experiencia de usuario, y las pantallas principales de la aplicación. Su propósito es servir de guía para la etapa de construcción y garantizar una interfaz coherente en todo el producto</w:t>
+      </w:r>
+      <w:r>
+        <w:t>.</w:t>
       </w:r>
     </w:p>
     <w:p>
@@ -2680,10 +2683,7 @@
         <w:t xml:space="preserve">Retroalimentación. </w:t>
       </w:r>
       <w:r>
-        <w:t>El sistema informa siempre el resultado de cada acción (éxito, error o proceso en curso)</w:t>
-      </w:r>
-      <w:r>
-        <w:t>.</w:t>
+        <w:t>El sistema informa siempre el resultado de cada acción (éxito, error o proceso en curso).</w:t>
       </w:r>
     </w:p>
     <w:p>
@@ -2892,7 +2892,7 @@
           <w:noProof/>
         </w:rPr>
         <w:drawing>
-          <wp:inline distT="0" distB="0" distL="0" distR="0" wp14:anchorId="23EF8F27" wp14:editId="385395A6">
+          <wp:inline distT="0" distB="0" distL="0" distR="0" wp14:anchorId="03D1B426" wp14:editId="1EF8D160">
             <wp:extent cx="5905500" cy="2324100"/>
             <wp:effectExtent l="0" t="0" r="0" b="0"/>
             <wp:docPr id="1" name="Imagen 1"/>
@@ -2975,10 +2975,10 @@
           <w:noProof/>
         </w:rPr>
         <w:drawing>
-          <wp:inline distT="0" distB="0" distL="0" distR="0" wp14:anchorId="79A0C9E8" wp14:editId="286EC9DC">
+          <wp:inline distT="0" distB="0" distL="0" distR="0" wp14:anchorId="4A8512DC" wp14:editId="6E316A98">
             <wp:extent cx="5334000" cy="2371725"/>
             <wp:effectExtent l="0" t="0" r="0" b="0"/>
-            <wp:docPr id="1588971322" name="Imagen 1588971322"/>
+            <wp:docPr id="1035720411" name="Imagen 1035720411"/>
             <wp:cNvGraphicFramePr>
               <a:graphicFrameLocks xmlns:a="http://schemas.openxmlformats.org/drawingml/2006/main" noChangeAspect="1"/>
             </wp:cNvGraphicFramePr>
@@ -5295,17 +5295,8 @@
                 <w:sz w:val="19"/>
                 <w:szCs w:val="19"/>
               </w:rPr>
-              <w:t xml:space="preserve">28 </w:t>
-            </w:r>
-            <w:proofErr w:type="spellStart"/>
-            <w:r>
-              <w:rPr>
-                <w:sz w:val="19"/>
-                <w:szCs w:val="19"/>
-              </w:rPr>
-              <w:t>px</w:t>
-            </w:r>
-            <w:proofErr w:type="spellEnd"/>
+              <w:t>28 px</w:t>
+            </w:r>
           </w:p>
         </w:tc>
         <w:tc>
@@ -5408,17 +5399,8 @@
                 <w:sz w:val="19"/>
                 <w:szCs w:val="19"/>
               </w:rPr>
-              <w:t xml:space="preserve">22 </w:t>
-            </w:r>
-            <w:proofErr w:type="spellStart"/>
-            <w:r>
-              <w:rPr>
-                <w:sz w:val="19"/>
-                <w:szCs w:val="19"/>
-              </w:rPr>
-              <w:t>px</w:t>
-            </w:r>
-            <w:proofErr w:type="spellEnd"/>
+              <w:t>22 px</w:t>
+            </w:r>
           </w:p>
         </w:tc>
         <w:tc>
@@ -5521,17 +5503,8 @@
                 <w:sz w:val="19"/>
                 <w:szCs w:val="19"/>
               </w:rPr>
-              <w:t xml:space="preserve">18 </w:t>
-            </w:r>
-            <w:proofErr w:type="spellStart"/>
-            <w:r>
-              <w:rPr>
-                <w:sz w:val="19"/>
-                <w:szCs w:val="19"/>
-              </w:rPr>
-              <w:t>px</w:t>
-            </w:r>
-            <w:proofErr w:type="spellEnd"/>
+              <w:t>18 px</w:t>
+            </w:r>
           </w:p>
         </w:tc>
         <w:tc>
@@ -5549,7 +5522,6 @@
             <w:pPr>
               <w:spacing w:line="236" w:lineRule="auto"/>
             </w:pPr>
-            <w:proofErr w:type="spellStart"/>
             <w:r>
               <w:rPr>
                 <w:sz w:val="19"/>
@@ -5557,7 +5529,6 @@
               </w:rPr>
               <w:t>Seminegrita</w:t>
             </w:r>
-            <w:proofErr w:type="spellEnd"/>
           </w:p>
         </w:tc>
         <w:tc>
@@ -5636,17 +5607,8 @@
                 <w:sz w:val="19"/>
                 <w:szCs w:val="19"/>
               </w:rPr>
-              <w:t xml:space="preserve">15 </w:t>
-            </w:r>
-            <w:proofErr w:type="spellStart"/>
-            <w:r>
-              <w:rPr>
-                <w:sz w:val="19"/>
-                <w:szCs w:val="19"/>
-              </w:rPr>
-              <w:t>px</w:t>
-            </w:r>
-            <w:proofErr w:type="spellEnd"/>
+              <w:t>15 px</w:t>
+            </w:r>
           </w:p>
         </w:tc>
         <w:tc>
@@ -5749,17 +5711,8 @@
                 <w:sz w:val="19"/>
                 <w:szCs w:val="19"/>
               </w:rPr>
-              <w:t xml:space="preserve">13 </w:t>
-            </w:r>
-            <w:proofErr w:type="spellStart"/>
-            <w:r>
-              <w:rPr>
-                <w:sz w:val="19"/>
-                <w:szCs w:val="19"/>
-              </w:rPr>
-              <w:t>px</w:t>
-            </w:r>
-            <w:proofErr w:type="spellEnd"/>
+              <w:t>13 px</w:t>
+            </w:r>
           </w:p>
         </w:tc>
         <w:tc>
@@ -5862,17 +5815,8 @@
                 <w:sz w:val="19"/>
                 <w:szCs w:val="19"/>
               </w:rPr>
-              <w:t xml:space="preserve">12 </w:t>
-            </w:r>
-            <w:proofErr w:type="spellStart"/>
-            <w:r>
-              <w:rPr>
-                <w:sz w:val="19"/>
-                <w:szCs w:val="19"/>
-              </w:rPr>
-              <w:t>px</w:t>
-            </w:r>
-            <w:proofErr w:type="spellEnd"/>
+              <w:t>12 px</w:t>
+            </w:r>
           </w:p>
         </w:tc>
         <w:tc>
@@ -5919,23 +5863,7 @@
                 <w:sz w:val="19"/>
                 <w:szCs w:val="19"/>
               </w:rPr>
-              <w:t xml:space="preserve">Etiquetas de campos y </w:t>
-            </w:r>
-            <w:proofErr w:type="spellStart"/>
-            <w:r>
-              <w:rPr>
-                <w:sz w:val="19"/>
-                <w:szCs w:val="19"/>
-              </w:rPr>
-              <w:t>badges</w:t>
-            </w:r>
-            <w:proofErr w:type="spellEnd"/>
-            <w:r>
-              <w:rPr>
-                <w:sz w:val="19"/>
-                <w:szCs w:val="19"/>
-              </w:rPr>
-              <w:t>.</w:t>
+              <w:t>Etiquetas de campos y badges.</w:t>
             </w:r>
           </w:p>
         </w:tc>
@@ -6138,33 +6066,8 @@
                 <w:sz w:val="19"/>
                 <w:szCs w:val="19"/>
               </w:rPr>
-              <w:t xml:space="preserve">4 </w:t>
-            </w:r>
-            <w:proofErr w:type="spellStart"/>
-            <w:r>
-              <w:rPr>
-                <w:sz w:val="19"/>
-                <w:szCs w:val="19"/>
-              </w:rPr>
-              <w:t>px</w:t>
-            </w:r>
-            <w:proofErr w:type="spellEnd"/>
-            <w:r>
-              <w:rPr>
-                <w:sz w:val="19"/>
-                <w:szCs w:val="19"/>
-              </w:rPr>
-              <w:t xml:space="preserve"> / 8 </w:t>
-            </w:r>
-            <w:proofErr w:type="spellStart"/>
-            <w:r>
-              <w:rPr>
-                <w:sz w:val="19"/>
-                <w:szCs w:val="19"/>
-              </w:rPr>
-              <w:t>px</w:t>
-            </w:r>
-            <w:proofErr w:type="spellEnd"/>
+              <w:t>4 px / 8 px</w:t>
+            </w:r>
           </w:p>
         </w:tc>
         <w:tc>
@@ -6219,33 +6122,8 @@
                 <w:sz w:val="19"/>
                 <w:szCs w:val="19"/>
               </w:rPr>
-              <w:t xml:space="preserve">12 </w:t>
-            </w:r>
-            <w:proofErr w:type="spellStart"/>
-            <w:r>
-              <w:rPr>
-                <w:sz w:val="19"/>
-                <w:szCs w:val="19"/>
-              </w:rPr>
-              <w:t>px</w:t>
-            </w:r>
-            <w:proofErr w:type="spellEnd"/>
-            <w:r>
-              <w:rPr>
-                <w:sz w:val="19"/>
-                <w:szCs w:val="19"/>
-              </w:rPr>
-              <w:t xml:space="preserve"> / 16 </w:t>
-            </w:r>
-            <w:proofErr w:type="spellStart"/>
-            <w:r>
-              <w:rPr>
-                <w:sz w:val="19"/>
-                <w:szCs w:val="19"/>
-              </w:rPr>
-              <w:t>px</w:t>
-            </w:r>
-            <w:proofErr w:type="spellEnd"/>
+              <w:t>12 px / 16 px</w:t>
+            </w:r>
           </w:p>
         </w:tc>
         <w:tc>
@@ -6300,33 +6178,8 @@
                 <w:sz w:val="19"/>
                 <w:szCs w:val="19"/>
               </w:rPr>
-              <w:t xml:space="preserve">24 </w:t>
-            </w:r>
-            <w:proofErr w:type="spellStart"/>
-            <w:r>
-              <w:rPr>
-                <w:sz w:val="19"/>
-                <w:szCs w:val="19"/>
-              </w:rPr>
-              <w:t>px</w:t>
-            </w:r>
-            <w:proofErr w:type="spellEnd"/>
-            <w:r>
-              <w:rPr>
-                <w:sz w:val="19"/>
-                <w:szCs w:val="19"/>
-              </w:rPr>
-              <w:t xml:space="preserve"> / 32 </w:t>
-            </w:r>
-            <w:proofErr w:type="spellStart"/>
-            <w:r>
-              <w:rPr>
-                <w:sz w:val="19"/>
-                <w:szCs w:val="19"/>
-              </w:rPr>
-              <w:t>px</w:t>
-            </w:r>
-            <w:proofErr w:type="spellEnd"/>
+              <w:t>24 px / 32 px</w:t>
+            </w:r>
           </w:p>
         </w:tc>
         <w:tc>
@@ -6381,17 +6234,8 @@
                 <w:sz w:val="19"/>
                 <w:szCs w:val="19"/>
               </w:rPr>
-              <w:t xml:space="preserve">48 </w:t>
-            </w:r>
-            <w:proofErr w:type="spellStart"/>
-            <w:r>
-              <w:rPr>
-                <w:sz w:val="19"/>
-                <w:szCs w:val="19"/>
-              </w:rPr>
-              <w:t>px</w:t>
-            </w:r>
-            <w:proofErr w:type="spellEnd"/>
+              <w:t>48 px</w:t>
+            </w:r>
           </w:p>
         </w:tc>
         <w:tc>
@@ -6640,17 +6484,8 @@
                 <w:sz w:val="19"/>
                 <w:szCs w:val="19"/>
               </w:rPr>
-              <w:t xml:space="preserve">Hasta 480 </w:t>
-            </w:r>
-            <w:proofErr w:type="spellStart"/>
-            <w:r>
-              <w:rPr>
-                <w:sz w:val="19"/>
-                <w:szCs w:val="19"/>
-              </w:rPr>
-              <w:t>px</w:t>
-            </w:r>
-            <w:proofErr w:type="spellEnd"/>
+              <w:t>Hasta 480 px</w:t>
+            </w:r>
           </w:p>
         </w:tc>
         <w:tc>
@@ -6729,17 +6564,8 @@
                 <w:sz w:val="19"/>
                 <w:szCs w:val="19"/>
               </w:rPr>
-              <w:t xml:space="preserve">481 a 1024 </w:t>
-            </w:r>
-            <w:proofErr w:type="spellStart"/>
-            <w:r>
-              <w:rPr>
-                <w:sz w:val="19"/>
-                <w:szCs w:val="19"/>
-              </w:rPr>
-              <w:t>px</w:t>
-            </w:r>
-            <w:proofErr w:type="spellEnd"/>
+              <w:t>481 a 1024 px</w:t>
+            </w:r>
           </w:p>
         </w:tc>
         <w:tc>
@@ -6818,23 +6644,7 @@
                 <w:sz w:val="19"/>
                 <w:szCs w:val="19"/>
               </w:rPr>
-              <w:t xml:space="preserve">1025 </w:t>
-            </w:r>
-            <w:proofErr w:type="spellStart"/>
-            <w:r>
-              <w:rPr>
-                <w:sz w:val="19"/>
-                <w:szCs w:val="19"/>
-              </w:rPr>
-              <w:t>px</w:t>
-            </w:r>
-            <w:proofErr w:type="spellEnd"/>
-            <w:r>
-              <w:rPr>
-                <w:sz w:val="19"/>
-                <w:szCs w:val="19"/>
-              </w:rPr>
-              <w:t xml:space="preserve"> en adelante</w:t>
+              <w:t>1025 px en adelante</w:t>
             </w:r>
           </w:p>
         </w:tc>
@@ -8079,10 +7889,10 @@
         </w:rPr>
         <w:lastRenderedPageBreak/>
         <w:drawing>
-          <wp:inline distT="0" distB="0" distL="0" distR="0" wp14:anchorId="3D42CB13" wp14:editId="46755CB0">
+          <wp:inline distT="0" distB="0" distL="0" distR="0" wp14:anchorId="78D33FE7" wp14:editId="5B477654">
             <wp:extent cx="5905500" cy="2419350"/>
             <wp:effectExtent l="0" t="0" r="0" b="0"/>
-            <wp:docPr id="101390742" name="Imagen 101390742"/>
+            <wp:docPr id="1527615235" name="Imagen 1527615235"/>
             <wp:cNvGraphicFramePr>
               <a:graphicFrameLocks xmlns:a="http://schemas.openxmlformats.org/drawingml/2006/main" noChangeAspect="1"/>
             </wp:cNvGraphicFramePr>
@@ -8232,10 +8042,10 @@
           <w:noProof/>
         </w:rPr>
         <w:drawing>
-          <wp:inline distT="0" distB="0" distL="0" distR="0" wp14:anchorId="1F719C0A" wp14:editId="647BE5C6">
+          <wp:inline distT="0" distB="0" distL="0" distR="0" wp14:anchorId="5F9366A1" wp14:editId="34D520D4">
             <wp:extent cx="5905500" cy="2257425"/>
             <wp:effectExtent l="0" t="0" r="0" b="0"/>
-            <wp:docPr id="269876222" name="Imagen 269876222"/>
+            <wp:docPr id="1792408593" name="Imagen 1792408593"/>
             <wp:cNvGraphicFramePr>
               <a:graphicFrameLocks xmlns:a="http://schemas.openxmlformats.org/drawingml/2006/main" noChangeAspect="1"/>
             </wp:cNvGraphicFramePr>
@@ -8859,10 +8669,10 @@
           <w:noProof/>
         </w:rPr>
         <w:drawing>
-          <wp:inline distT="0" distB="0" distL="0" distR="0" wp14:anchorId="002ADB57" wp14:editId="072D3622">
+          <wp:inline distT="0" distB="0" distL="0" distR="0" wp14:anchorId="6F5945E5" wp14:editId="4EDB5D13">
             <wp:extent cx="5334000" cy="3381375"/>
             <wp:effectExtent l="0" t="0" r="0" b="0"/>
-            <wp:docPr id="1218004321" name="Imagen 1218004321"/>
+            <wp:docPr id="765064514" name="Imagen 765064514"/>
             <wp:cNvGraphicFramePr>
               <a:graphicFrameLocks xmlns:a="http://schemas.openxmlformats.org/drawingml/2006/main" noChangeAspect="1"/>
             </wp:cNvGraphicFramePr>
@@ -9012,10 +8822,10 @@
           <w:noProof/>
         </w:rPr>
         <w:drawing>
-          <wp:inline distT="0" distB="0" distL="0" distR="0" wp14:anchorId="6C825931" wp14:editId="5FA4A6C6">
+          <wp:inline distT="0" distB="0" distL="0" distR="0" wp14:anchorId="508E778B" wp14:editId="048D00F1">
             <wp:extent cx="6096000" cy="1676400"/>
             <wp:effectExtent l="0" t="0" r="0" b="0"/>
-            <wp:docPr id="1666809501" name="Imagen 1666809501"/>
+            <wp:docPr id="954095992" name="Imagen 954095992"/>
             <wp:cNvGraphicFramePr>
               <a:graphicFrameLocks xmlns:a="http://schemas.openxmlformats.org/drawingml/2006/main" noChangeAspect="1"/>
             </wp:cNvGraphicFramePr>
@@ -9104,10 +8914,10 @@
           <w:noProof/>
         </w:rPr>
         <w:drawing>
-          <wp:inline distT="0" distB="0" distL="0" distR="0" wp14:anchorId="4A9EDFE8" wp14:editId="4C00A949">
+          <wp:inline distT="0" distB="0" distL="0" distR="0" wp14:anchorId="3069D12D" wp14:editId="668A8AF4">
             <wp:extent cx="4762500" cy="2447925"/>
             <wp:effectExtent l="0" t="0" r="0" b="0"/>
-            <wp:docPr id="653633343" name="Imagen 653633343"/>
+            <wp:docPr id="1448061055" name="Imagen 1448061055"/>
             <wp:cNvGraphicFramePr>
               <a:graphicFrameLocks xmlns:a="http://schemas.openxmlformats.org/drawingml/2006/main" noChangeAspect="1"/>
             </wp:cNvGraphicFramePr>
@@ -9234,10 +9044,10 @@
           <w:noProof/>
         </w:rPr>
         <w:drawing>
-          <wp:inline distT="0" distB="0" distL="0" distR="0" wp14:anchorId="506B45D6" wp14:editId="3E63074C">
+          <wp:inline distT="0" distB="0" distL="0" distR="0" wp14:anchorId="6C01AA26" wp14:editId="16E96925">
             <wp:extent cx="6096000" cy="3048000"/>
             <wp:effectExtent l="0" t="0" r="0" b="0"/>
-            <wp:docPr id="703834692" name="Imagen 703834692"/>
+            <wp:docPr id="968950310" name="Imagen 968950310"/>
             <wp:cNvGraphicFramePr>
               <a:graphicFrameLocks xmlns:a="http://schemas.openxmlformats.org/drawingml/2006/main" noChangeAspect="1"/>
             </wp:cNvGraphicFramePr>
@@ -9379,10 +9189,10 @@
         </w:rPr>
         <w:lastRenderedPageBreak/>
         <w:drawing>
-          <wp:inline distT="0" distB="0" distL="0" distR="0" wp14:anchorId="781BBF4E" wp14:editId="5B87053A">
+          <wp:inline distT="0" distB="0" distL="0" distR="0" wp14:anchorId="1373754E" wp14:editId="4F67E20A">
             <wp:extent cx="6096000" cy="3848100"/>
             <wp:effectExtent l="0" t="0" r="0" b="0"/>
-            <wp:docPr id="1737651717" name="Imagen 1737651717"/>
+            <wp:docPr id="107137195" name="Imagen 107137195"/>
             <wp:cNvGraphicFramePr>
               <a:graphicFrameLocks xmlns:a="http://schemas.openxmlformats.org/drawingml/2006/main" noChangeAspect="1"/>
             </wp:cNvGraphicFramePr>
@@ -10264,10 +10074,10 @@
           <w:noProof/>
         </w:rPr>
         <w:drawing>
-          <wp:inline distT="0" distB="0" distL="0" distR="0" wp14:anchorId="65E05F81" wp14:editId="6BBCC51B">
+          <wp:inline distT="0" distB="0" distL="0" distR="0" wp14:anchorId="5F577605" wp14:editId="3957763C">
             <wp:extent cx="6096000" cy="3000375"/>
             <wp:effectExtent l="0" t="0" r="0" b="0"/>
-            <wp:docPr id="2036334253" name="Imagen 2036334253"/>
+            <wp:docPr id="1707881766" name="Imagen 1707881766"/>
             <wp:cNvGraphicFramePr>
               <a:graphicFrameLocks xmlns:a="http://schemas.openxmlformats.org/drawingml/2006/main" noChangeAspect="1"/>
             </wp:cNvGraphicFramePr>
@@ -10405,10 +10215,10 @@
         </w:rPr>
         <w:lastRenderedPageBreak/>
         <w:drawing>
-          <wp:inline distT="0" distB="0" distL="0" distR="0" wp14:anchorId="43E29691" wp14:editId="66B718F5">
+          <wp:inline distT="0" distB="0" distL="0" distR="0" wp14:anchorId="6B5F9C28" wp14:editId="4DF6ABDB">
             <wp:extent cx="6096000" cy="2857500"/>
             <wp:effectExtent l="0" t="0" r="0" b="0"/>
-            <wp:docPr id="1539927087" name="Imagen 1539927087"/>
+            <wp:docPr id="1709037394" name="Imagen 1709037394"/>
             <wp:cNvGraphicFramePr>
               <a:graphicFrameLocks xmlns:a="http://schemas.openxmlformats.org/drawingml/2006/main" noChangeAspect="1"/>
             </wp:cNvGraphicFramePr>
@@ -10497,10 +10307,10 @@
           <w:noProof/>
         </w:rPr>
         <w:drawing>
-          <wp:inline distT="0" distB="0" distL="0" distR="0" wp14:anchorId="19455881" wp14:editId="14611D1D">
+          <wp:inline distT="0" distB="0" distL="0" distR="0" wp14:anchorId="0B2BDE2F" wp14:editId="2CF75A96">
             <wp:extent cx="6096000" cy="2857500"/>
             <wp:effectExtent l="0" t="0" r="0" b="0"/>
-            <wp:docPr id="1731439187" name="Imagen 1731439187"/>
+            <wp:docPr id="618424164" name="Imagen 618424164"/>
             <wp:cNvGraphicFramePr>
               <a:graphicFrameLocks xmlns:a="http://schemas.openxmlformats.org/drawingml/2006/main" noChangeAspect="1"/>
             </wp:cNvGraphicFramePr>
@@ -10576,7 +10386,11 @@
         <w:jc w:val="both"/>
       </w:pPr>
       <w:r>
-        <w:t>El mismo formulario se emplea para crear y para editar. Agrupa los datos de identificación del producto (nombre, categoría, presentación y código de barras) y los datos comerciales (precio de venta y mínimo de existencias para la alerta); las existencias no se capturan aquí, sino que ingresan como lote con su costo unitario. El precio de venta se registra de forma independiente del costo: el sistema puede sugerirlo a partir del margen, pero nunca lo modifica de manera automática.</w:t>
+        <w:t xml:space="preserve">El mismo formulario se emplea para crear y para editar. Agrupa los datos de identificación del producto (nombre, categoría, presentación y código de barras) y los datos comerciales (precio de venta y mínimo de existencias para la alerta); las existencias no se capturan aquí, sino que ingresan como lote con su costo unitario, y el formulario lo advierte bajo los campos comerciales para que su ausencia no se lea como un olvido. La categoría y la presentación se eligen de listas cerradas, definidas en el modelo de datos, y no se escriben a mano: de ello depende que el catálogo se pueda filtrar y agrupar. El precio de </w:t>
+      </w:r>
+      <w:r>
+        <w:lastRenderedPageBreak/>
+        <w:t>venta se registra de forma independiente del costo: el sistema puede sugerirlo a partir del margen, pero nunca lo modifica de manera automática.</w:t>
       </w:r>
     </w:p>
     <w:p>
@@ -10588,12 +10402,11 @@
         <w:rPr>
           <w:noProof/>
         </w:rPr>
-        <w:lastRenderedPageBreak/>
         <w:drawing>
-          <wp:inline distT="0" distB="0" distL="0" distR="0" wp14:anchorId="6CA6A99D" wp14:editId="50C5E232">
-            <wp:extent cx="4953000" cy="4572000"/>
+          <wp:inline distT="0" distB="0" distL="0" distR="0" wp14:anchorId="285AF819" wp14:editId="44EC951F">
+            <wp:extent cx="4953000" cy="4067175"/>
             <wp:effectExtent l="0" t="0" r="0" b="0"/>
-            <wp:docPr id="90451392" name="Imagen 90451392"/>
+            <wp:docPr id="1464188655" name="Imagen 1464188655"/>
             <wp:cNvGraphicFramePr>
               <a:graphicFrameLocks xmlns:a="http://schemas.openxmlformats.org/drawingml/2006/main" noChangeAspect="1"/>
             </wp:cNvGraphicFramePr>
@@ -10616,7 +10429,7 @@
                   <pic:spPr bwMode="auto">
                     <a:xfrm>
                       <a:off x="0" y="0"/>
-                      <a:ext cx="4953000" cy="4572000"/>
+                      <a:ext cx="4953000" cy="4067175"/>
                     </a:xfrm>
                     <a:prstGeom prst="rect">
                       <a:avLst/>
@@ -10692,10 +10505,10 @@
         </w:rPr>
         <w:lastRenderedPageBreak/>
         <w:drawing>
-          <wp:inline distT="0" distB="0" distL="0" distR="0" wp14:anchorId="5283833C" wp14:editId="1A4E844B">
+          <wp:inline distT="0" distB="0" distL="0" distR="0" wp14:anchorId="4321AF63" wp14:editId="7E523CBB">
             <wp:extent cx="6096000" cy="2562225"/>
             <wp:effectExtent l="0" t="0" r="0" b="0"/>
-            <wp:docPr id="179431276" name="Imagen 179431276"/>
+            <wp:docPr id="1012973154" name="Imagen 1012973154"/>
             <wp:cNvGraphicFramePr>
               <a:graphicFrameLocks xmlns:a="http://schemas.openxmlformats.org/drawingml/2006/main" noChangeAspect="1"/>
             </wp:cNvGraphicFramePr>
@@ -10784,10 +10597,10 @@
           <w:noProof/>
         </w:rPr>
         <w:drawing>
-          <wp:inline distT="0" distB="0" distL="0" distR="0" wp14:anchorId="5135EF83" wp14:editId="1D324C42">
+          <wp:inline distT="0" distB="0" distL="0" distR="0" wp14:anchorId="33F0D4FC" wp14:editId="3927958C">
             <wp:extent cx="6096000" cy="2857500"/>
             <wp:effectExtent l="0" t="0" r="0" b="0"/>
-            <wp:docPr id="688296717" name="Imagen 688296717"/>
+            <wp:docPr id="1044518178" name="Imagen 1044518178"/>
             <wp:cNvGraphicFramePr>
               <a:graphicFrameLocks xmlns:a="http://schemas.openxmlformats.org/drawingml/2006/main" noChangeAspect="1"/>
             </wp:cNvGraphicFramePr>
@@ -10895,10 +10708,10 @@
           <w:noProof/>
         </w:rPr>
         <w:drawing>
-          <wp:inline distT="0" distB="0" distL="0" distR="0" wp14:anchorId="2DA44762" wp14:editId="1253586A">
+          <wp:inline distT="0" distB="0" distL="0" distR="0" wp14:anchorId="3EA0F912" wp14:editId="407FFFE1">
             <wp:extent cx="6096000" cy="2857500"/>
             <wp:effectExtent l="0" t="0" r="0" b="0"/>
-            <wp:docPr id="499404782" name="Imagen 499404782"/>
+            <wp:docPr id="531357636" name="Imagen 531357636"/>
             <wp:cNvGraphicFramePr>
               <a:graphicFrameLocks xmlns:a="http://schemas.openxmlformats.org/drawingml/2006/main" noChangeAspect="1"/>
             </wp:cNvGraphicFramePr>
@@ -11006,10 +10819,10 @@
         </w:rPr>
         <w:lastRenderedPageBreak/>
         <w:drawing>
-          <wp:inline distT="0" distB="0" distL="0" distR="0" wp14:anchorId="22739DDF" wp14:editId="487C32CD">
+          <wp:inline distT="0" distB="0" distL="0" distR="0" wp14:anchorId="09883A80" wp14:editId="4A38F938">
             <wp:extent cx="6096000" cy="3562350"/>
             <wp:effectExtent l="0" t="0" r="0" b="0"/>
-            <wp:docPr id="1777658622" name="Imagen 1777658622"/>
+            <wp:docPr id="614402199" name="Imagen 614402199"/>
             <wp:cNvGraphicFramePr>
               <a:graphicFrameLocks xmlns:a="http://schemas.openxmlformats.org/drawingml/2006/main" noChangeAspect="1"/>
             </wp:cNvGraphicFramePr>
@@ -11117,10 +10930,10 @@
         </w:rPr>
         <w:lastRenderedPageBreak/>
         <w:drawing>
-          <wp:inline distT="0" distB="0" distL="0" distR="0" wp14:anchorId="5FB5C48D" wp14:editId="5B424C82">
+          <wp:inline distT="0" distB="0" distL="0" distR="0" wp14:anchorId="06BDC671" wp14:editId="3972A283">
             <wp:extent cx="6096000" cy="3067050"/>
             <wp:effectExtent l="0" t="0" r="0" b="0"/>
-            <wp:docPr id="886741569" name="Imagen 886741569"/>
+            <wp:docPr id="1609467002" name="Imagen 1609467002"/>
             <wp:cNvGraphicFramePr>
               <a:graphicFrameLocks xmlns:a="http://schemas.openxmlformats.org/drawingml/2006/main" noChangeAspect="1"/>
             </wp:cNvGraphicFramePr>
@@ -11237,10 +11050,10 @@
         </w:rPr>
         <w:lastRenderedPageBreak/>
         <w:drawing>
-          <wp:inline distT="0" distB="0" distL="0" distR="0" wp14:anchorId="197DF7A9" wp14:editId="1092DF78">
+          <wp:inline distT="0" distB="0" distL="0" distR="0" wp14:anchorId="7DD13DAC" wp14:editId="5F37F7A1">
             <wp:extent cx="6096000" cy="4114800"/>
             <wp:effectExtent l="0" t="0" r="0" b="0"/>
-            <wp:docPr id="2080047305" name="Imagen 2080047305"/>
+            <wp:docPr id="775029016" name="Imagen 775029016"/>
             <wp:cNvGraphicFramePr>
               <a:graphicFrameLocks xmlns:a="http://schemas.openxmlformats.org/drawingml/2006/main" noChangeAspect="1"/>
             </wp:cNvGraphicFramePr>
@@ -11331,10 +11144,10 @@
           <w:noProof/>
         </w:rPr>
         <w:drawing>
-          <wp:inline distT="0" distB="0" distL="0" distR="0" wp14:anchorId="6D93C699" wp14:editId="5936CAC6">
+          <wp:inline distT="0" distB="0" distL="0" distR="0" wp14:anchorId="0123B6FB" wp14:editId="522F6657">
             <wp:extent cx="6096000" cy="2733675"/>
             <wp:effectExtent l="0" t="0" r="0" b="0"/>
-            <wp:docPr id="1792585019" name="Imagen 1792585019"/>
+            <wp:docPr id="532387118" name="Imagen 532387118"/>
             <wp:cNvGraphicFramePr>
               <a:graphicFrameLocks xmlns:a="http://schemas.openxmlformats.org/drawingml/2006/main" noChangeAspect="1"/>
             </wp:cNvGraphicFramePr>
@@ -12197,10 +12010,10 @@
           <w:noProof/>
         </w:rPr>
         <w:drawing>
-          <wp:inline distT="0" distB="0" distL="0" distR="0" wp14:anchorId="260DFD0D" wp14:editId="01B19D84">
+          <wp:inline distT="0" distB="0" distL="0" distR="0" wp14:anchorId="7F76096B" wp14:editId="6E54562A">
             <wp:extent cx="6096000" cy="3295650"/>
             <wp:effectExtent l="0" t="0" r="0" b="0"/>
-            <wp:docPr id="1379702249" name="Imagen 1379702249"/>
+            <wp:docPr id="2124781037" name="Imagen 2124781037"/>
             <wp:cNvGraphicFramePr>
               <a:graphicFrameLocks xmlns:a="http://schemas.openxmlformats.org/drawingml/2006/main" noChangeAspect="1"/>
             </wp:cNvGraphicFramePr>
@@ -12276,15 +12089,7 @@
         <w:jc w:val="both"/>
       </w:pPr>
       <w:r>
-        <w:t xml:space="preserve">En </w:t>
-      </w:r>
-      <w:proofErr w:type="spellStart"/>
-      <w:r>
-        <w:t>tablet</w:t>
-      </w:r>
-      <w:proofErr w:type="spellEnd"/>
-      <w:r>
-        <w:t xml:space="preserve"> el contenido se organiza en dos columnas y la navegación lateral puede contraerse para dejar más espacio al contenido. En escritorio se emplea la rejilla completa, con la navegación lateral fija y los paneles de apoyo a la derecha del contenido principal, como ocurre en el punto de venta.</w:t>
+        <w:t>En tablet el contenido se organiza en dos columnas y la navegación lateral puede contraerse para dejar más espacio al contenido. En escritorio se emplea la rejilla completa, con la navegación lateral fija y los paneles de apoyo a la derecha del contenido principal, como ocurre en el punto de venta.</w:t>
       </w:r>
     </w:p>
     <w:p>
@@ -12325,10 +12130,10 @@
         </w:rPr>
         <w:lastRenderedPageBreak/>
         <w:drawing>
-          <wp:inline distT="0" distB="0" distL="0" distR="0" wp14:anchorId="15F47080" wp14:editId="5D8CA409">
+          <wp:inline distT="0" distB="0" distL="0" distR="0" wp14:anchorId="347A72AF" wp14:editId="588E6CEE">
             <wp:extent cx="6096000" cy="3067050"/>
             <wp:effectExtent l="0" t="0" r="0" b="0"/>
-            <wp:docPr id="1608178081" name="Imagen 1608178081"/>
+            <wp:docPr id="1918366596" name="Imagen 1918366596"/>
             <wp:cNvGraphicFramePr>
               <a:graphicFrameLocks xmlns:a="http://schemas.openxmlformats.org/drawingml/2006/main" noChangeAspect="1"/>
             </wp:cNvGraphicFramePr>
@@ -12688,55 +12493,7 @@
                 <w:sz w:val="19"/>
                 <w:szCs w:val="19"/>
               </w:rPr>
-              <w:t>Color y botón reservados para la acción principal de una pantalla, del inglés «</w:t>
-            </w:r>
-            <w:proofErr w:type="spellStart"/>
-            <w:r>
-              <w:rPr>
-                <w:sz w:val="19"/>
-                <w:szCs w:val="19"/>
-              </w:rPr>
-              <w:t>call</w:t>
-            </w:r>
-            <w:proofErr w:type="spellEnd"/>
-            <w:r>
-              <w:rPr>
-                <w:sz w:val="19"/>
-                <w:szCs w:val="19"/>
-              </w:rPr>
-              <w:t xml:space="preserve"> </w:t>
-            </w:r>
-            <w:proofErr w:type="spellStart"/>
-            <w:r>
-              <w:rPr>
-                <w:sz w:val="19"/>
-                <w:szCs w:val="19"/>
-              </w:rPr>
-              <w:t>to</w:t>
-            </w:r>
-            <w:proofErr w:type="spellEnd"/>
-            <w:r>
-              <w:rPr>
-                <w:sz w:val="19"/>
-                <w:szCs w:val="19"/>
-              </w:rPr>
-              <w:t xml:space="preserve"> </w:t>
-            </w:r>
-            <w:proofErr w:type="spellStart"/>
-            <w:r>
-              <w:rPr>
-                <w:sz w:val="19"/>
-                <w:szCs w:val="19"/>
-              </w:rPr>
-              <w:t>action</w:t>
-            </w:r>
-            <w:proofErr w:type="spellEnd"/>
-            <w:r>
-              <w:rPr>
-                <w:sz w:val="19"/>
-                <w:szCs w:val="19"/>
-              </w:rPr>
-              <w:t>» o llamado a la acción.</w:t>
+              <w:t>Color y botón reservados para la acción principal de una pantalla, del inglés «call to action» o llamado a la acción.</w:t>
             </w:r>
           </w:p>
         </w:tc>
@@ -13402,13 +13159,7 @@
         <w:spacing w:after="60" w:line="258" w:lineRule="auto"/>
       </w:pPr>
       <w:r>
-        <w:rPr>
-          <w:lang w:val="en-US"/>
-        </w:rPr>
-        <w:t xml:space="preserve">World Wide Web Consortium. Web Content Accessibility Guidelines (WCAG) 2.1. </w:t>
-      </w:r>
-      <w:r>
-        <w:t>W3C, 2018.</w:t>
+        <w:t>World Wide Web Consortium. Web Content Accessibility Guidelines (WCAG) 2.1. W3C, 2018.</w:t>
       </w:r>
     </w:p>
     <w:p>
@@ -13447,15 +13198,7 @@
         <w:spacing w:after="60" w:line="258" w:lineRule="auto"/>
       </w:pPr>
       <w:r>
-        <w:t xml:space="preserve">Familia tipográfica Inter, de distribución libre bajo licencia SIL Open Font </w:t>
-      </w:r>
-      <w:proofErr w:type="spellStart"/>
-      <w:r>
-        <w:t>License</w:t>
-      </w:r>
-      <w:proofErr w:type="spellEnd"/>
-      <w:r>
-        <w:t>.</w:t>
+        <w:t>Familia tipográfica Inter, de distribución libre bajo licencia SIL Open Font License.</w:t>
       </w:r>
     </w:p>
     <w:sectPr>
@@ -13556,10 +13299,10 @@
 <file path=word/numbering.xml><?xml version="1.0" encoding="utf-8"?>
 <w:numbering xmlns:wpc="http://schemas.microsoft.com/office/word/2010/wordprocessingCanvas" xmlns:cx="http://schemas.microsoft.com/office/drawing/2014/chartex" xmlns:cx1="http://schemas.microsoft.com/office/drawing/2015/9/8/chartex" xmlns:cx2="http://schemas.microsoft.com/office/drawing/2015/10/21/chartex" xmlns:cx3="http://schemas.microsoft.com/office/drawing/2016/5/9/chartex" xmlns:cx4="http://schemas.microsoft.com/office/drawing/2016/5/10/chartex" xmlns:cx5="http://schemas.microsoft.com/office/drawing/2016/5/11/chartex" xmlns:cx6="http://schemas.microsoft.com/office/drawing/2016/5/12/chartex" xmlns:cx7="http://schemas.microsoft.com/office/drawing/2016/5/13/chartex" xmlns:cx8="http://schemas.microsoft.com/office/drawing/2016/5/14/chartex" xmlns:mc="http://schemas.openxmlformats.org/markup-compatibility/2006" xmlns:aink="http://schemas.microsoft.com/office/drawing/2016/ink" xmlns:am3d="http://schemas.microsoft.com/office/drawing/2017/model3d" xmlns:o="urn:schemas-microsoft-com:office:office" xmlns:oel="http://schemas.microsoft.com/office/2019/extlst" xmlns:r="http://schemas.openxmlformats.org/officeDocument/2006/relationships" xmlns:m="http://schemas.openxmlformats.org/officeDocument/2006/math" xmlns:v="urn:schemas-microsoft-com:vml" xmlns:wp14="http://schemas.microsoft.com/office/word/2010/wordprocessingDrawing" xmlns:wp="http://schemas.openxmlformats.org/drawingml/2006/wordprocessingDrawing" xmlns:w10="urn:schemas-microsoft-com:office:word" xmlns:w="http://schemas.openxmlformats.org/wordprocessingml/2006/main" xmlns:w14="http://schemas.microsoft.com/office/word/2010/wordml" xmlns:w15="http://schemas.microsoft.com/office/word/2012/wordml" xmlns:w16cex="http://schemas.microsoft.com/office/word/2018/wordml/cex" xmlns:w16cid="http://schemas.microsoft.com/office/word/2016/wordml/cid" xmlns:w16="http://schemas.microsoft.com/office/word/2018/wordml" xmlns:w16du="http://schemas.microsoft.com/office/word/2023/wordml/word16du" xmlns:w16sdtdh="http://schemas.microsoft.com/office/word/2020/wordml/sdtdatahash" xmlns:w16sdtfl="http://schemas.microsoft.com/office/word/2024/wordml/sdtformatlock" xmlns:w16se="http://schemas.microsoft.com/office/word/2015/wordml/symex" xmlns:wpg="http://schemas.microsoft.com/office/word/2010/wordprocessingGroup" xmlns:wpi="http://schemas.microsoft.com/office/word/2010/wordprocessingInk" xmlns:wne="http://schemas.microsoft.com/office/word/2006/wordml" xmlns:wps="http://schemas.microsoft.com/office/word/2010/wordprocessingShape" mc:Ignorable="w14 w15 w16se w16cid w16 w16cex w16sdtdh w16sdtfl w16du wp14">
   <w:abstractNum w:abstractNumId="0" w15:restartNumberingAfterBreak="0">
-    <w:nsid w:val="43F37C9E"/>
+    <w:nsid w:val="434B6707"/>
     <w:multiLevelType w:val="hybridMultilevel"/>
-    <w:tmpl w:val="228E145E"/>
-    <w:lvl w:ilvl="0" w:tplc="C5A49C5A">
+    <w:tmpl w:val="85F2F9DE"/>
+    <w:lvl w:ilvl="0" w:tplc="51C2D182">
       <w:start w:val="1"/>
       <w:numFmt w:val="bullet"/>
       <w:lvlText w:val="●"/>
@@ -13568,7 +13311,7 @@
         <w:ind w:left="720" w:hanging="360"/>
       </w:pPr>
     </w:lvl>
-    <w:lvl w:ilvl="1" w:tplc="D65ACD5E">
+    <w:lvl w:ilvl="1" w:tplc="24729256">
       <w:start w:val="1"/>
       <w:numFmt w:val="bullet"/>
       <w:lvlText w:val="○"/>
@@ -13577,7 +13320,7 @@
         <w:ind w:left="1440" w:hanging="360"/>
       </w:pPr>
     </w:lvl>
-    <w:lvl w:ilvl="2" w:tplc="25129DD8">
+    <w:lvl w:ilvl="2" w:tplc="91469D2A">
       <w:start w:val="1"/>
       <w:numFmt w:val="bullet"/>
       <w:lvlText w:val="■"/>
@@ -13586,7 +13329,7 @@
         <w:ind w:left="2160" w:hanging="360"/>
       </w:pPr>
     </w:lvl>
-    <w:lvl w:ilvl="3" w:tplc="E9F89196">
+    <w:lvl w:ilvl="3" w:tplc="BBBEEED8">
       <w:start w:val="1"/>
       <w:numFmt w:val="bullet"/>
       <w:lvlText w:val="●"/>
@@ -13595,7 +13338,7 @@
         <w:ind w:left="2880" w:hanging="360"/>
       </w:pPr>
     </w:lvl>
-    <w:lvl w:ilvl="4" w:tplc="A63272FC">
+    <w:lvl w:ilvl="4" w:tplc="7666A64E">
       <w:start w:val="1"/>
       <w:numFmt w:val="bullet"/>
       <w:lvlText w:val="○"/>
@@ -13604,7 +13347,7 @@
         <w:ind w:left="3600" w:hanging="360"/>
       </w:pPr>
     </w:lvl>
-    <w:lvl w:ilvl="5" w:tplc="A8E4DD82">
+    <w:lvl w:ilvl="5" w:tplc="8D0A1EBA">
       <w:start w:val="1"/>
       <w:numFmt w:val="bullet"/>
       <w:lvlText w:val="■"/>
@@ -13613,7 +13356,7 @@
         <w:ind w:left="4320" w:hanging="360"/>
       </w:pPr>
     </w:lvl>
-    <w:lvl w:ilvl="6" w:tplc="801AF5CA">
+    <w:lvl w:ilvl="6" w:tplc="06D21B82">
       <w:start w:val="1"/>
       <w:numFmt w:val="bullet"/>
       <w:lvlText w:val="●"/>
@@ -13622,7 +13365,7 @@
         <w:ind w:left="5040" w:hanging="360"/>
       </w:pPr>
     </w:lvl>
-    <w:lvl w:ilvl="7" w:tplc="E53607A8">
+    <w:lvl w:ilvl="7" w:tplc="D29C4FAE">
       <w:start w:val="1"/>
       <w:numFmt w:val="bullet"/>
       <w:lvlText w:val="●"/>
@@ -13631,7 +13374,7 @@
         <w:ind w:left="5760" w:hanging="360"/>
       </w:pPr>
     </w:lvl>
-    <w:lvl w:ilvl="8" w:tplc="2320C628">
+    <w:lvl w:ilvl="8" w:tplc="274CD178">
       <w:start w:val="1"/>
       <w:numFmt w:val="bullet"/>
       <w:lvlText w:val="●"/>
@@ -13641,7 +13384,7 @@
       </w:pPr>
     </w:lvl>
   </w:abstractNum>
-  <w:num w:numId="1" w16cid:durableId="333845109">
+  <w:num w:numId="1" w16cid:durableId="1531722526">
     <w:abstractNumId w:val="0"/>
     <w:lvlOverride w:ilvl="0">
       <w:startOverride w:val="1"/>

</xml_diff>

<commit_message>
Abro la pantalla de inventario y dejo listas las licoreras existentes. Las categorias y la sede principal solo nacian al crear la licorera, de modo que ninguna de las anteriores podia registrar productos.
</commit_message>
<xml_diff>
--- a/docs/diseno/INVENTRA_Documento_Tecnico_Diseno.docx
+++ b/docs/diseno/INVENTRA_Documento_Tecnico_Diseno.docx
@@ -2499,10 +2499,7 @@
         <w:jc w:val="both"/>
       </w:pPr>
       <w:r>
-        <w:t>Este documento define el sistema de diseño de la interfaz de INVENTRA para las plataformas web y móvil. Reúne la identidad visual, los componentes reutilizables, las pautas de accesibilidad y de experiencia de usuario, y las pantallas principales de la aplicación. Su propósito es servir de guía para la etapa de construcción y garantizar una interfaz coherente en todo el producto</w:t>
-      </w:r>
-      <w:r>
-        <w:t>.</w:t>
+        <w:t>Este documento define el sistema de diseño de la interfaz de INVENTRA para las plataformas web y móvil. Reúne la identidad visual, los componentes reutilizables, las pautas de accesibilidad y de experiencia de usuario, y las pantallas principales de la aplicación. Su propósito es servir de guía para la etapa de construcción y garantizar una interfaz coherente en todo el producto.</w:t>
       </w:r>
     </w:p>
     <w:p>
@@ -2683,7 +2680,10 @@
         <w:t xml:space="preserve">Retroalimentación. </w:t>
       </w:r>
       <w:r>
-        <w:t>El sistema informa siempre el resultado de cada acción (éxito, error o proceso en curso).</w:t>
+        <w:t>El sistema informa siempre el resultado de cada acción (éxito, error o proceso en curso)</w:t>
+      </w:r>
+      <w:r>
+        <w:t>.</w:t>
       </w:r>
     </w:p>
     <w:p>
@@ -2892,7 +2892,7 @@
           <w:noProof/>
         </w:rPr>
         <w:drawing>
-          <wp:inline distT="0" distB="0" distL="0" distR="0" wp14:anchorId="03D1B426" wp14:editId="1EF8D160">
+          <wp:inline distT="0" distB="0" distL="0" distR="0" wp14:anchorId="43D8CBC7" wp14:editId="6F0E674F">
             <wp:extent cx="5905500" cy="2324100"/>
             <wp:effectExtent l="0" t="0" r="0" b="0"/>
             <wp:docPr id="1" name="Imagen 1"/>
@@ -2975,10 +2975,10 @@
           <w:noProof/>
         </w:rPr>
         <w:drawing>
-          <wp:inline distT="0" distB="0" distL="0" distR="0" wp14:anchorId="4A8512DC" wp14:editId="6E316A98">
+          <wp:inline distT="0" distB="0" distL="0" distR="0" wp14:anchorId="169E2F9F" wp14:editId="4D95AC38">
             <wp:extent cx="5334000" cy="2371725"/>
             <wp:effectExtent l="0" t="0" r="0" b="0"/>
-            <wp:docPr id="1035720411" name="Imagen 1035720411"/>
+            <wp:docPr id="1762889563" name="Imagen 1762889563"/>
             <wp:cNvGraphicFramePr>
               <a:graphicFrameLocks xmlns:a="http://schemas.openxmlformats.org/drawingml/2006/main" noChangeAspect="1"/>
             </wp:cNvGraphicFramePr>
@@ -7889,10 +7889,10 @@
         </w:rPr>
         <w:lastRenderedPageBreak/>
         <w:drawing>
-          <wp:inline distT="0" distB="0" distL="0" distR="0" wp14:anchorId="78D33FE7" wp14:editId="5B477654">
+          <wp:inline distT="0" distB="0" distL="0" distR="0" wp14:anchorId="01FCC8CC" wp14:editId="59AFF587">
             <wp:extent cx="5905500" cy="2419350"/>
             <wp:effectExtent l="0" t="0" r="0" b="0"/>
-            <wp:docPr id="1527615235" name="Imagen 1527615235"/>
+            <wp:docPr id="1282264956" name="Imagen 1282264956"/>
             <wp:cNvGraphicFramePr>
               <a:graphicFrameLocks xmlns:a="http://schemas.openxmlformats.org/drawingml/2006/main" noChangeAspect="1"/>
             </wp:cNvGraphicFramePr>
@@ -8042,10 +8042,10 @@
           <w:noProof/>
         </w:rPr>
         <w:drawing>
-          <wp:inline distT="0" distB="0" distL="0" distR="0" wp14:anchorId="5F9366A1" wp14:editId="34D520D4">
+          <wp:inline distT="0" distB="0" distL="0" distR="0" wp14:anchorId="4E6B1775" wp14:editId="7D6FC50F">
             <wp:extent cx="5905500" cy="2257425"/>
             <wp:effectExtent l="0" t="0" r="0" b="0"/>
-            <wp:docPr id="1792408593" name="Imagen 1792408593"/>
+            <wp:docPr id="1874559027" name="Imagen 1874559027"/>
             <wp:cNvGraphicFramePr>
               <a:graphicFrameLocks xmlns:a="http://schemas.openxmlformats.org/drawingml/2006/main" noChangeAspect="1"/>
             </wp:cNvGraphicFramePr>
@@ -8669,10 +8669,10 @@
           <w:noProof/>
         </w:rPr>
         <w:drawing>
-          <wp:inline distT="0" distB="0" distL="0" distR="0" wp14:anchorId="6F5945E5" wp14:editId="4EDB5D13">
+          <wp:inline distT="0" distB="0" distL="0" distR="0" wp14:anchorId="43E7BD52" wp14:editId="2C56C9C8">
             <wp:extent cx="5334000" cy="3381375"/>
             <wp:effectExtent l="0" t="0" r="0" b="0"/>
-            <wp:docPr id="765064514" name="Imagen 765064514"/>
+            <wp:docPr id="211133366" name="Imagen 211133366"/>
             <wp:cNvGraphicFramePr>
               <a:graphicFrameLocks xmlns:a="http://schemas.openxmlformats.org/drawingml/2006/main" noChangeAspect="1"/>
             </wp:cNvGraphicFramePr>
@@ -8822,10 +8822,10 @@
           <w:noProof/>
         </w:rPr>
         <w:drawing>
-          <wp:inline distT="0" distB="0" distL="0" distR="0" wp14:anchorId="508E778B" wp14:editId="048D00F1">
+          <wp:inline distT="0" distB="0" distL="0" distR="0" wp14:anchorId="1887D314" wp14:editId="2DB95C71">
             <wp:extent cx="6096000" cy="1676400"/>
             <wp:effectExtent l="0" t="0" r="0" b="0"/>
-            <wp:docPr id="954095992" name="Imagen 954095992"/>
+            <wp:docPr id="1700865459" name="Imagen 1700865459"/>
             <wp:cNvGraphicFramePr>
               <a:graphicFrameLocks xmlns:a="http://schemas.openxmlformats.org/drawingml/2006/main" noChangeAspect="1"/>
             </wp:cNvGraphicFramePr>
@@ -8914,10 +8914,10 @@
           <w:noProof/>
         </w:rPr>
         <w:drawing>
-          <wp:inline distT="0" distB="0" distL="0" distR="0" wp14:anchorId="3069D12D" wp14:editId="668A8AF4">
+          <wp:inline distT="0" distB="0" distL="0" distR="0" wp14:anchorId="3B1C1B0A" wp14:editId="40462D1E">
             <wp:extent cx="4762500" cy="2447925"/>
             <wp:effectExtent l="0" t="0" r="0" b="0"/>
-            <wp:docPr id="1448061055" name="Imagen 1448061055"/>
+            <wp:docPr id="1248129059" name="Imagen 1248129059"/>
             <wp:cNvGraphicFramePr>
               <a:graphicFrameLocks xmlns:a="http://schemas.openxmlformats.org/drawingml/2006/main" noChangeAspect="1"/>
             </wp:cNvGraphicFramePr>
@@ -9044,10 +9044,10 @@
           <w:noProof/>
         </w:rPr>
         <w:drawing>
-          <wp:inline distT="0" distB="0" distL="0" distR="0" wp14:anchorId="6C01AA26" wp14:editId="16E96925">
+          <wp:inline distT="0" distB="0" distL="0" distR="0" wp14:anchorId="5F3DB39C" wp14:editId="5D204E19">
             <wp:extent cx="6096000" cy="3048000"/>
             <wp:effectExtent l="0" t="0" r="0" b="0"/>
-            <wp:docPr id="968950310" name="Imagen 968950310"/>
+            <wp:docPr id="1428025531" name="Imagen 1428025531"/>
             <wp:cNvGraphicFramePr>
               <a:graphicFrameLocks xmlns:a="http://schemas.openxmlformats.org/drawingml/2006/main" noChangeAspect="1"/>
             </wp:cNvGraphicFramePr>
@@ -9189,10 +9189,10 @@
         </w:rPr>
         <w:lastRenderedPageBreak/>
         <w:drawing>
-          <wp:inline distT="0" distB="0" distL="0" distR="0" wp14:anchorId="1373754E" wp14:editId="4F67E20A">
+          <wp:inline distT="0" distB="0" distL="0" distR="0" wp14:anchorId="3B60FA89" wp14:editId="1278315D">
             <wp:extent cx="6096000" cy="3848100"/>
             <wp:effectExtent l="0" t="0" r="0" b="0"/>
-            <wp:docPr id="107137195" name="Imagen 107137195"/>
+            <wp:docPr id="1789255475" name="Imagen 1789255475"/>
             <wp:cNvGraphicFramePr>
               <a:graphicFrameLocks xmlns:a="http://schemas.openxmlformats.org/drawingml/2006/main" noChangeAspect="1"/>
             </wp:cNvGraphicFramePr>
@@ -10074,10 +10074,10 @@
           <w:noProof/>
         </w:rPr>
         <w:drawing>
-          <wp:inline distT="0" distB="0" distL="0" distR="0" wp14:anchorId="5F577605" wp14:editId="3957763C">
+          <wp:inline distT="0" distB="0" distL="0" distR="0" wp14:anchorId="280A7D3A" wp14:editId="3572D5A4">
             <wp:extent cx="6096000" cy="3000375"/>
             <wp:effectExtent l="0" t="0" r="0" b="0"/>
-            <wp:docPr id="1707881766" name="Imagen 1707881766"/>
+            <wp:docPr id="1650193089" name="Imagen 1650193089"/>
             <wp:cNvGraphicFramePr>
               <a:graphicFrameLocks xmlns:a="http://schemas.openxmlformats.org/drawingml/2006/main" noChangeAspect="1"/>
             </wp:cNvGraphicFramePr>
@@ -10215,10 +10215,10 @@
         </w:rPr>
         <w:lastRenderedPageBreak/>
         <w:drawing>
-          <wp:inline distT="0" distB="0" distL="0" distR="0" wp14:anchorId="6B5F9C28" wp14:editId="4DF6ABDB">
+          <wp:inline distT="0" distB="0" distL="0" distR="0" wp14:anchorId="117AB791" wp14:editId="2BE0F7FD">
             <wp:extent cx="6096000" cy="2857500"/>
             <wp:effectExtent l="0" t="0" r="0" b="0"/>
-            <wp:docPr id="1709037394" name="Imagen 1709037394"/>
+            <wp:docPr id="846024311" name="Imagen 846024311"/>
             <wp:cNvGraphicFramePr>
               <a:graphicFrameLocks xmlns:a="http://schemas.openxmlformats.org/drawingml/2006/main" noChangeAspect="1"/>
             </wp:cNvGraphicFramePr>
@@ -10294,7 +10294,16 @@
         <w:jc w:val="both"/>
       </w:pPr>
       <w:r>
-        <w:t>Concentra la consulta del catálogo. Sobre la tabla se ubican el buscador por nombre o código y los filtros rápidos por situación de existencias. La tabla presenta el producto, su categoría, el precio de venta, las existencias, la etiqueta de estado y la acción de edición. La acción principal de la pantalla, situada en la barra superior, es el registro de un producto nuevo.</w:t>
+        <w:t>Concentra la consulta del catálogo. Sobre la tabla se ubican el buscador —que localiza por nombre, por categoría o por código de barras— y los filtros rápidos por situación de existencias: todos, existencias bajas y agotados. Junto a ellos, un selector permite acotar por estado del producto, con el catálogo activo como opción inicial, porque las referencias descontinuadas se consultan de manera ocasional. La tabla presenta el producto, su categoría, el precio de venta, las existencias, la etiqueta de estado y las acciones de edición y descontinuación. La acción principal de la pantalla, situada en la barra superior, es el registro de un producto nuevo.</w:t>
+      </w:r>
+    </w:p>
+    <w:p>
+      <w:pPr>
+        <w:spacing w:after="110" w:line="262" w:lineRule="auto"/>
+        <w:jc w:val="both"/>
+      </w:pPr>
+      <w:r>
+        <w:t>La etiqueta de estado resume en una palabra la situación de la referencia, con los colores que fija el punto 6.4: existencias bajas en el tono de advertencia, porque todavía se puede vender y lo que falta es reponer, y agotado en el de error, porque ya no se puede vender. Una referencia descontinuada muestra esa condición en lugar de su nivel de existencias: anunciar que le quedan pocas unidades sería pedir que se repongan.</w:t>
       </w:r>
     </w:p>
     <w:p>
@@ -10307,10 +10316,10 @@
           <w:noProof/>
         </w:rPr>
         <w:drawing>
-          <wp:inline distT="0" distB="0" distL="0" distR="0" wp14:anchorId="0B2BDE2F" wp14:editId="2CF75A96">
+          <wp:inline distT="0" distB="0" distL="0" distR="0" wp14:anchorId="7096753B" wp14:editId="571C4DD8">
             <wp:extent cx="6096000" cy="2857500"/>
             <wp:effectExtent l="0" t="0" r="0" b="0"/>
-            <wp:docPr id="618424164" name="Imagen 618424164"/>
+            <wp:docPr id="1175762813" name="Imagen 1175762813"/>
             <wp:cNvGraphicFramePr>
               <a:graphicFrameLocks xmlns:a="http://schemas.openxmlformats.org/drawingml/2006/main" noChangeAspect="1"/>
             </wp:cNvGraphicFramePr>
@@ -10376,6 +10385,7 @@
           <w:sz w:val="23"/>
           <w:szCs w:val="23"/>
         </w:rPr>
+        <w:lastRenderedPageBreak/>
         <w:t>8.4 Inventario: registro y edición de producto</w:t>
       </w:r>
       <w:bookmarkEnd w:id="30"/>
@@ -10386,11 +10396,7 @@
         <w:jc w:val="both"/>
       </w:pPr>
       <w:r>
-        <w:t xml:space="preserve">El mismo formulario se emplea para crear y para editar. Agrupa los datos de identificación del producto (nombre, categoría, presentación y código de barras) y los datos comerciales (precio de venta y mínimo de existencias para la alerta); las existencias no se capturan aquí, sino que ingresan como lote con su costo unitario, y el formulario lo advierte bajo los campos comerciales para que su ausencia no se lea como un olvido. La categoría y la presentación se eligen de listas cerradas, definidas en el modelo de datos, y no se escriben a mano: de ello depende que el catálogo se pueda filtrar y agrupar. El precio de </w:t>
-      </w:r>
-      <w:r>
-        <w:lastRenderedPageBreak/>
-        <w:t>venta se registra de forma independiente del costo: el sistema puede sugerirlo a partir del margen, pero nunca lo modifica de manera automática.</w:t>
+        <w:t>El mismo formulario se emplea para crear y para editar. Agrupa los datos de identificación del producto (nombre, categoría, presentación y código de barras) y los datos comerciales (precio de venta y mínimo de existencias para la alerta); las existencias no se capturan aquí, sino que ingresan como lote con su costo unitario, y el formulario lo advierte bajo los campos comerciales para que su ausencia no se lea como un olvido. La categoría y la presentación se eligen de listas cerradas, definidas en el modelo de datos, y no se escriben a mano: de ello depende que el catálogo se pueda filtrar y agrupar. El precio de venta se registra de forma independiente del costo: el sistema puede sugerirlo a partir del margen, pero nunca lo modifica de manera automática.</w:t>
       </w:r>
     </w:p>
     <w:p>
@@ -10403,10 +10409,10 @@
           <w:noProof/>
         </w:rPr>
         <w:drawing>
-          <wp:inline distT="0" distB="0" distL="0" distR="0" wp14:anchorId="285AF819" wp14:editId="44EC951F">
+          <wp:inline distT="0" distB="0" distL="0" distR="0" wp14:anchorId="73E34995" wp14:editId="718ACB77">
             <wp:extent cx="4953000" cy="4067175"/>
             <wp:effectExtent l="0" t="0" r="0" b="0"/>
-            <wp:docPr id="1464188655" name="Imagen 1464188655"/>
+            <wp:docPr id="672950529" name="Imagen 672950529"/>
             <wp:cNvGraphicFramePr>
               <a:graphicFrameLocks xmlns:a="http://schemas.openxmlformats.org/drawingml/2006/main" noChangeAspect="1"/>
             </wp:cNvGraphicFramePr>
@@ -10505,10 +10511,10 @@
         </w:rPr>
         <w:lastRenderedPageBreak/>
         <w:drawing>
-          <wp:inline distT="0" distB="0" distL="0" distR="0" wp14:anchorId="4321AF63" wp14:editId="7E523CBB">
+          <wp:inline distT="0" distB="0" distL="0" distR="0" wp14:anchorId="74AC9B9F" wp14:editId="1CDB2BA8">
             <wp:extent cx="6096000" cy="2562225"/>
             <wp:effectExtent l="0" t="0" r="0" b="0"/>
-            <wp:docPr id="1012973154" name="Imagen 1012973154"/>
+            <wp:docPr id="779798616" name="Imagen 779798616"/>
             <wp:cNvGraphicFramePr>
               <a:graphicFrameLocks xmlns:a="http://schemas.openxmlformats.org/drawingml/2006/main" noChangeAspect="1"/>
             </wp:cNvGraphicFramePr>
@@ -10597,10 +10603,10 @@
           <w:noProof/>
         </w:rPr>
         <w:drawing>
-          <wp:inline distT="0" distB="0" distL="0" distR="0" wp14:anchorId="33F0D4FC" wp14:editId="3927958C">
+          <wp:inline distT="0" distB="0" distL="0" distR="0" wp14:anchorId="1F26A07A" wp14:editId="27E736FF">
             <wp:extent cx="6096000" cy="2857500"/>
             <wp:effectExtent l="0" t="0" r="0" b="0"/>
-            <wp:docPr id="1044518178" name="Imagen 1044518178"/>
+            <wp:docPr id="253974864" name="Imagen 253974864"/>
             <wp:cNvGraphicFramePr>
               <a:graphicFrameLocks xmlns:a="http://schemas.openxmlformats.org/drawingml/2006/main" noChangeAspect="1"/>
             </wp:cNvGraphicFramePr>
@@ -10708,10 +10714,10 @@
           <w:noProof/>
         </w:rPr>
         <w:drawing>
-          <wp:inline distT="0" distB="0" distL="0" distR="0" wp14:anchorId="3EA0F912" wp14:editId="407FFFE1">
+          <wp:inline distT="0" distB="0" distL="0" distR="0" wp14:anchorId="6C35A3D5" wp14:editId="60DB225B">
             <wp:extent cx="6096000" cy="2857500"/>
             <wp:effectExtent l="0" t="0" r="0" b="0"/>
-            <wp:docPr id="531357636" name="Imagen 531357636"/>
+            <wp:docPr id="2008429913" name="Imagen 2008429913"/>
             <wp:cNvGraphicFramePr>
               <a:graphicFrameLocks xmlns:a="http://schemas.openxmlformats.org/drawingml/2006/main" noChangeAspect="1"/>
             </wp:cNvGraphicFramePr>
@@ -10796,7 +10802,7 @@
         <w:jc w:val="both"/>
       </w:pPr>
       <w:r>
-        <w:t>El correo no se edita porque identifica la cuenta en toda la plataforma y cambiarlo equivaldría a cambiar de cuenta; el rol y la licorera los asigna quien administra, no su titular. Al cambiar la contraseña se cierran las demás sesiones abiertas, de modo que una contraseña comprometida deja de servir en cuanto su dueño reacciona.</w:t>
+        <w:t>El correo no se edita porque identifica la cuenta en toda la plataforma y cambiarlo equivaldría a cambiar de cuenta; el rol y la licorera se fijan al crear la cuenta y no los modifica su titular. La pantalla distingue a quién corresponde el cambio: al administrador de la licorera, cuando el titular es un vendedor, y al soporte de INVENTRA cuando el titular es el propio administrador, que dentro del negocio no tiene a nadie por encima. Al cambiar la contraseña se cierran las demás sesiones abiertas, de modo que una contraseña comprometida deja de servir en cuanto su dueño reacciona.</w:t>
       </w:r>
     </w:p>
     <w:p>
@@ -10819,10 +10825,10 @@
         </w:rPr>
         <w:lastRenderedPageBreak/>
         <w:drawing>
-          <wp:inline distT="0" distB="0" distL="0" distR="0" wp14:anchorId="09883A80" wp14:editId="4A38F938">
+          <wp:inline distT="0" distB="0" distL="0" distR="0" wp14:anchorId="51C1E030" wp14:editId="15C27731">
             <wp:extent cx="6096000" cy="3562350"/>
             <wp:effectExtent l="0" t="0" r="0" b="0"/>
-            <wp:docPr id="614402199" name="Imagen 614402199"/>
+            <wp:docPr id="397112857" name="Imagen 397112857"/>
             <wp:cNvGraphicFramePr>
               <a:graphicFrameLocks xmlns:a="http://schemas.openxmlformats.org/drawingml/2006/main" noChangeAspect="1"/>
             </wp:cNvGraphicFramePr>
@@ -10930,10 +10936,10 @@
         </w:rPr>
         <w:lastRenderedPageBreak/>
         <w:drawing>
-          <wp:inline distT="0" distB="0" distL="0" distR="0" wp14:anchorId="06BDC671" wp14:editId="3972A283">
+          <wp:inline distT="0" distB="0" distL="0" distR="0" wp14:anchorId="60635FE6" wp14:editId="5F62F73C">
             <wp:extent cx="6096000" cy="3067050"/>
             <wp:effectExtent l="0" t="0" r="0" b="0"/>
-            <wp:docPr id="1609467002" name="Imagen 1609467002"/>
+            <wp:docPr id="2070000954" name="Imagen 2070000954"/>
             <wp:cNvGraphicFramePr>
               <a:graphicFrameLocks xmlns:a="http://schemas.openxmlformats.org/drawingml/2006/main" noChangeAspect="1"/>
             </wp:cNvGraphicFramePr>
@@ -11050,10 +11056,10 @@
         </w:rPr>
         <w:lastRenderedPageBreak/>
         <w:drawing>
-          <wp:inline distT="0" distB="0" distL="0" distR="0" wp14:anchorId="7DD13DAC" wp14:editId="5F37F7A1">
+          <wp:inline distT="0" distB="0" distL="0" distR="0" wp14:anchorId="72B39C39" wp14:editId="6F7D3855">
             <wp:extent cx="6096000" cy="4114800"/>
             <wp:effectExtent l="0" t="0" r="0" b="0"/>
-            <wp:docPr id="775029016" name="Imagen 775029016"/>
+            <wp:docPr id="902347867" name="Imagen 902347867"/>
             <wp:cNvGraphicFramePr>
               <a:graphicFrameLocks xmlns:a="http://schemas.openxmlformats.org/drawingml/2006/main" noChangeAspect="1"/>
             </wp:cNvGraphicFramePr>
@@ -11144,10 +11150,10 @@
           <w:noProof/>
         </w:rPr>
         <w:drawing>
-          <wp:inline distT="0" distB="0" distL="0" distR="0" wp14:anchorId="0123B6FB" wp14:editId="522F6657">
+          <wp:inline distT="0" distB="0" distL="0" distR="0" wp14:anchorId="31E6F803" wp14:editId="04C54A8F">
             <wp:extent cx="6096000" cy="2733675"/>
             <wp:effectExtent l="0" t="0" r="0" b="0"/>
-            <wp:docPr id="532387118" name="Imagen 532387118"/>
+            <wp:docPr id="516045500" name="Imagen 516045500"/>
             <wp:cNvGraphicFramePr>
               <a:graphicFrameLocks xmlns:a="http://schemas.openxmlformats.org/drawingml/2006/main" noChangeAspect="1"/>
             </wp:cNvGraphicFramePr>
@@ -12010,10 +12016,10 @@
           <w:noProof/>
         </w:rPr>
         <w:drawing>
-          <wp:inline distT="0" distB="0" distL="0" distR="0" wp14:anchorId="7F76096B" wp14:editId="6E54562A">
+          <wp:inline distT="0" distB="0" distL="0" distR="0" wp14:anchorId="1FC9FDA8" wp14:editId="2314E83B">
             <wp:extent cx="6096000" cy="3295650"/>
             <wp:effectExtent l="0" t="0" r="0" b="0"/>
-            <wp:docPr id="2124781037" name="Imagen 2124781037"/>
+            <wp:docPr id="1007538449" name="Imagen 1007538449"/>
             <wp:cNvGraphicFramePr>
               <a:graphicFrameLocks xmlns:a="http://schemas.openxmlformats.org/drawingml/2006/main" noChangeAspect="1"/>
             </wp:cNvGraphicFramePr>
@@ -12130,10 +12136,10 @@
         </w:rPr>
         <w:lastRenderedPageBreak/>
         <w:drawing>
-          <wp:inline distT="0" distB="0" distL="0" distR="0" wp14:anchorId="347A72AF" wp14:editId="588E6CEE">
+          <wp:inline distT="0" distB="0" distL="0" distR="0" wp14:anchorId="741DDCDF" wp14:editId="38AF551E">
             <wp:extent cx="6096000" cy="3067050"/>
             <wp:effectExtent l="0" t="0" r="0" b="0"/>
-            <wp:docPr id="1918366596" name="Imagen 1918366596"/>
+            <wp:docPr id="982208206" name="Imagen 982208206"/>
             <wp:cNvGraphicFramePr>
               <a:graphicFrameLocks xmlns:a="http://schemas.openxmlformats.org/drawingml/2006/main" noChangeAspect="1"/>
             </wp:cNvGraphicFramePr>
@@ -13299,10 +13305,10 @@
 <file path=word/numbering.xml><?xml version="1.0" encoding="utf-8"?>
 <w:numbering xmlns:wpc="http://schemas.microsoft.com/office/word/2010/wordprocessingCanvas" xmlns:cx="http://schemas.microsoft.com/office/drawing/2014/chartex" xmlns:cx1="http://schemas.microsoft.com/office/drawing/2015/9/8/chartex" xmlns:cx2="http://schemas.microsoft.com/office/drawing/2015/10/21/chartex" xmlns:cx3="http://schemas.microsoft.com/office/drawing/2016/5/9/chartex" xmlns:cx4="http://schemas.microsoft.com/office/drawing/2016/5/10/chartex" xmlns:cx5="http://schemas.microsoft.com/office/drawing/2016/5/11/chartex" xmlns:cx6="http://schemas.microsoft.com/office/drawing/2016/5/12/chartex" xmlns:cx7="http://schemas.microsoft.com/office/drawing/2016/5/13/chartex" xmlns:cx8="http://schemas.microsoft.com/office/drawing/2016/5/14/chartex" xmlns:mc="http://schemas.openxmlformats.org/markup-compatibility/2006" xmlns:aink="http://schemas.microsoft.com/office/drawing/2016/ink" xmlns:am3d="http://schemas.microsoft.com/office/drawing/2017/model3d" xmlns:o="urn:schemas-microsoft-com:office:office" xmlns:oel="http://schemas.microsoft.com/office/2019/extlst" xmlns:r="http://schemas.openxmlformats.org/officeDocument/2006/relationships" xmlns:m="http://schemas.openxmlformats.org/officeDocument/2006/math" xmlns:v="urn:schemas-microsoft-com:vml" xmlns:wp14="http://schemas.microsoft.com/office/word/2010/wordprocessingDrawing" xmlns:wp="http://schemas.openxmlformats.org/drawingml/2006/wordprocessingDrawing" xmlns:w10="urn:schemas-microsoft-com:office:word" xmlns:w="http://schemas.openxmlformats.org/wordprocessingml/2006/main" xmlns:w14="http://schemas.microsoft.com/office/word/2010/wordml" xmlns:w15="http://schemas.microsoft.com/office/word/2012/wordml" xmlns:w16cex="http://schemas.microsoft.com/office/word/2018/wordml/cex" xmlns:w16cid="http://schemas.microsoft.com/office/word/2016/wordml/cid" xmlns:w16="http://schemas.microsoft.com/office/word/2018/wordml" xmlns:w16du="http://schemas.microsoft.com/office/word/2023/wordml/word16du" xmlns:w16sdtdh="http://schemas.microsoft.com/office/word/2020/wordml/sdtdatahash" xmlns:w16sdtfl="http://schemas.microsoft.com/office/word/2024/wordml/sdtformatlock" xmlns:w16se="http://schemas.microsoft.com/office/word/2015/wordml/symex" xmlns:wpg="http://schemas.microsoft.com/office/word/2010/wordprocessingGroup" xmlns:wpi="http://schemas.microsoft.com/office/word/2010/wordprocessingInk" xmlns:wne="http://schemas.microsoft.com/office/word/2006/wordml" xmlns:wps="http://schemas.microsoft.com/office/word/2010/wordprocessingShape" mc:Ignorable="w14 w15 w16se w16cid w16 w16cex w16sdtdh w16sdtfl w16du wp14">
   <w:abstractNum w:abstractNumId="0" w15:restartNumberingAfterBreak="0">
-    <w:nsid w:val="434B6707"/>
+    <w:nsid w:val="7E857986"/>
     <w:multiLevelType w:val="hybridMultilevel"/>
-    <w:tmpl w:val="85F2F9DE"/>
-    <w:lvl w:ilvl="0" w:tplc="51C2D182">
+    <w:tmpl w:val="21DC43C6"/>
+    <w:lvl w:ilvl="0" w:tplc="6D0E0DBA">
       <w:start w:val="1"/>
       <w:numFmt w:val="bullet"/>
       <w:lvlText w:val="●"/>
@@ -13311,7 +13317,7 @@
         <w:ind w:left="720" w:hanging="360"/>
       </w:pPr>
     </w:lvl>
-    <w:lvl w:ilvl="1" w:tplc="24729256">
+    <w:lvl w:ilvl="1" w:tplc="1AAA34B8">
       <w:start w:val="1"/>
       <w:numFmt w:val="bullet"/>
       <w:lvlText w:val="○"/>
@@ -13320,7 +13326,7 @@
         <w:ind w:left="1440" w:hanging="360"/>
       </w:pPr>
     </w:lvl>
-    <w:lvl w:ilvl="2" w:tplc="91469D2A">
+    <w:lvl w:ilvl="2" w:tplc="EADC8992">
       <w:start w:val="1"/>
       <w:numFmt w:val="bullet"/>
       <w:lvlText w:val="■"/>
@@ -13329,7 +13335,7 @@
         <w:ind w:left="2160" w:hanging="360"/>
       </w:pPr>
     </w:lvl>
-    <w:lvl w:ilvl="3" w:tplc="BBBEEED8">
+    <w:lvl w:ilvl="3" w:tplc="390257B8">
       <w:start w:val="1"/>
       <w:numFmt w:val="bullet"/>
       <w:lvlText w:val="●"/>
@@ -13338,7 +13344,7 @@
         <w:ind w:left="2880" w:hanging="360"/>
       </w:pPr>
     </w:lvl>
-    <w:lvl w:ilvl="4" w:tplc="7666A64E">
+    <w:lvl w:ilvl="4" w:tplc="9CA4D1B2">
       <w:start w:val="1"/>
       <w:numFmt w:val="bullet"/>
       <w:lvlText w:val="○"/>
@@ -13347,7 +13353,7 @@
         <w:ind w:left="3600" w:hanging="360"/>
       </w:pPr>
     </w:lvl>
-    <w:lvl w:ilvl="5" w:tplc="8D0A1EBA">
+    <w:lvl w:ilvl="5" w:tplc="42726310">
       <w:start w:val="1"/>
       <w:numFmt w:val="bullet"/>
       <w:lvlText w:val="■"/>
@@ -13356,7 +13362,7 @@
         <w:ind w:left="4320" w:hanging="360"/>
       </w:pPr>
     </w:lvl>
-    <w:lvl w:ilvl="6" w:tplc="06D21B82">
+    <w:lvl w:ilvl="6" w:tplc="F7A05EE8">
       <w:start w:val="1"/>
       <w:numFmt w:val="bullet"/>
       <w:lvlText w:val="●"/>
@@ -13365,7 +13371,7 @@
         <w:ind w:left="5040" w:hanging="360"/>
       </w:pPr>
     </w:lvl>
-    <w:lvl w:ilvl="7" w:tplc="D29C4FAE">
+    <w:lvl w:ilvl="7" w:tplc="7CD0D4F4">
       <w:start w:val="1"/>
       <w:numFmt w:val="bullet"/>
       <w:lvlText w:val="●"/>
@@ -13374,7 +13380,7 @@
         <w:ind w:left="5760" w:hanging="360"/>
       </w:pPr>
     </w:lvl>
-    <w:lvl w:ilvl="8" w:tplc="274CD178">
+    <w:lvl w:ilvl="8" w:tplc="40C8A454">
       <w:start w:val="1"/>
       <w:numFmt w:val="bullet"/>
       <w:lvlText w:val="●"/>
@@ -13384,7 +13390,7 @@
       </w:pPr>
     </w:lvl>
   </w:abstractNum>
-  <w:num w:numId="1" w16cid:durableId="1531722526">
+  <w:num w:numId="1" w16cid:durableId="1006008871">
     <w:abstractNumId w:val="0"/>
     <w:lvlOverride w:ilvl="0">
       <w:startOverride w:val="1"/>

</xml_diff>

<commit_message>
Abro la entrada de mercancia y el kardex con el ajuste de existencias. El ajuste vive sobre el kardex porque una diferencia se explica en los movimientos y no en una cifra suelta.
</commit_message>
<xml_diff>
--- a/docs/diseno/INVENTRA_Documento_Tecnico_Diseno.docx
+++ b/docs/diseno/INVENTRA_Documento_Tecnico_Diseno.docx
@@ -1781,7 +1781,7 @@
             <w:sz w:val="20"/>
             <w:szCs w:val="20"/>
           </w:rPr>
-          <w:t>8.5 Punto de venta</w:t>
+          <w:t>8.5 Inventario: entrada de mercancía</w:t>
         </w:r>
       </w:hyperlink>
       <w:r>
@@ -1825,7 +1825,7 @@
             <w:sz w:val="20"/>
             <w:szCs w:val="20"/>
           </w:rPr>
-          <w:t>8.6 Reportes</w:t>
+          <w:t>8.6 Inventario: kardex y ajuste de existencias</w:t>
         </w:r>
       </w:hyperlink>
       <w:r>
@@ -1869,7 +1869,7 @@
             <w:sz w:val="20"/>
             <w:szCs w:val="20"/>
           </w:rPr>
-          <w:t>8.7 Usuarios de la licorera</w:t>
+          <w:t>8.7 Punto de venta</w:t>
         </w:r>
       </w:hyperlink>
       <w:r>
@@ -1913,7 +1913,7 @@
             <w:sz w:val="20"/>
             <w:szCs w:val="20"/>
           </w:rPr>
-          <w:t>8.8 Mi perfil</w:t>
+          <w:t>8.8 Reportes</w:t>
         </w:r>
       </w:hyperlink>
       <w:r>
@@ -1957,7 +1957,7 @@
             <w:sz w:val="20"/>
             <w:szCs w:val="20"/>
           </w:rPr>
-          <w:t>8.9 Mi suscripción</w:t>
+          <w:t>8.9 Usuarios de la licorera</w:t>
         </w:r>
       </w:hyperlink>
       <w:r>
@@ -2001,7 +2001,7 @@
             <w:sz w:val="20"/>
             <w:szCs w:val="20"/>
           </w:rPr>
-          <w:t>8.10 Plataforma</w:t>
+          <w:t>8.10 Mi perfil</w:t>
         </w:r>
       </w:hyperlink>
       <w:r>
@@ -2036,8 +2036,96 @@
           <w:tab w:val="right" w:leader="dot" w:pos="9200"/>
         </w:tabs>
         <w:spacing w:after="40" w:line="252" w:lineRule="auto"/>
+        <w:ind w:left="360"/>
       </w:pPr>
       <w:hyperlink w:anchor="bm38" w:history="1">
+        <w:r>
+          <w:rPr>
+            <w:color w:val="1F3864"/>
+            <w:sz w:val="20"/>
+            <w:szCs w:val="20"/>
+          </w:rPr>
+          <w:t>8.11 Mi suscripción</w:t>
+        </w:r>
+      </w:hyperlink>
+      <w:r>
+        <w:rPr>
+          <w:sz w:val="20"/>
+          <w:szCs w:val="20"/>
+        </w:rPr>
+        <w:tab/>
+      </w:r>
+      <w:r>
+        <w:fldChar w:fldCharType="begin"/>
+      </w:r>
+      <w:r>
+        <w:instrText>PAGEREF bm38</w:instrText>
+      </w:r>
+      <w:r>
+        <w:fldChar w:fldCharType="separate"/>
+      </w:r>
+      <w:r>
+        <w:rPr>
+          <w:noProof/>
+        </w:rPr>
+        <w:t>1</w:t>
+      </w:r>
+      <w:r>
+        <w:fldChar w:fldCharType="end"/>
+      </w:r>
+    </w:p>
+    <w:p>
+      <w:pPr>
+        <w:tabs>
+          <w:tab w:val="right" w:leader="dot" w:pos="9200"/>
+        </w:tabs>
+        <w:spacing w:after="40" w:line="252" w:lineRule="auto"/>
+        <w:ind w:left="360"/>
+      </w:pPr>
+      <w:hyperlink w:anchor="bm39" w:history="1">
+        <w:r>
+          <w:rPr>
+            <w:color w:val="1F3864"/>
+            <w:sz w:val="20"/>
+            <w:szCs w:val="20"/>
+          </w:rPr>
+          <w:t>8.12 Plataforma</w:t>
+        </w:r>
+      </w:hyperlink>
+      <w:r>
+        <w:rPr>
+          <w:sz w:val="20"/>
+          <w:szCs w:val="20"/>
+        </w:rPr>
+        <w:tab/>
+      </w:r>
+      <w:r>
+        <w:fldChar w:fldCharType="begin"/>
+      </w:r>
+      <w:r>
+        <w:instrText>PAGEREF bm39</w:instrText>
+      </w:r>
+      <w:r>
+        <w:fldChar w:fldCharType="separate"/>
+      </w:r>
+      <w:r>
+        <w:rPr>
+          <w:noProof/>
+        </w:rPr>
+        <w:t>1</w:t>
+      </w:r>
+      <w:r>
+        <w:fldChar w:fldCharType="end"/>
+      </w:r>
+    </w:p>
+    <w:p>
+      <w:pPr>
+        <w:tabs>
+          <w:tab w:val="right" w:leader="dot" w:pos="9200"/>
+        </w:tabs>
+        <w:spacing w:after="40" w:line="252" w:lineRule="auto"/>
+      </w:pPr>
+      <w:hyperlink w:anchor="bm40" w:history="1">
         <w:r>
           <w:rPr>
             <w:b/>
@@ -2060,7 +2148,7 @@
         <w:fldChar w:fldCharType="begin"/>
       </w:r>
       <w:r>
-        <w:instrText>PAGEREF bm38</w:instrText>
+        <w:instrText>PAGEREF bm40</w:instrText>
       </w:r>
       <w:r>
         <w:fldChar w:fldCharType="separate"/>
@@ -2083,7 +2171,7 @@
         <w:spacing w:after="40" w:line="252" w:lineRule="auto"/>
         <w:ind w:left="360"/>
       </w:pPr>
-      <w:hyperlink w:anchor="bm39" w:history="1">
+      <w:hyperlink w:anchor="bm41" w:history="1">
         <w:r>
           <w:rPr>
             <w:color w:val="1F3864"/>
@@ -2104,7 +2192,7 @@
         <w:fldChar w:fldCharType="begin"/>
       </w:r>
       <w:r>
-        <w:instrText>PAGEREF bm39</w:instrText>
+        <w:instrText>PAGEREF bm41</w:instrText>
       </w:r>
       <w:r>
         <w:fldChar w:fldCharType="separate"/>
@@ -2127,7 +2215,7 @@
         <w:spacing w:after="40" w:line="252" w:lineRule="auto"/>
         <w:ind w:left="360"/>
       </w:pPr>
-      <w:hyperlink w:anchor="bm40" w:history="1">
+      <w:hyperlink w:anchor="bm42" w:history="1">
         <w:r>
           <w:rPr>
             <w:color w:val="1F3864"/>
@@ -2148,7 +2236,7 @@
         <w:fldChar w:fldCharType="begin"/>
       </w:r>
       <w:r>
-        <w:instrText>PAGEREF bm40</w:instrText>
+        <w:instrText>PAGEREF bm42</w:instrText>
       </w:r>
       <w:r>
         <w:fldChar w:fldCharType="separate"/>
@@ -2170,7 +2258,7 @@
         </w:tabs>
         <w:spacing w:after="40" w:line="252" w:lineRule="auto"/>
       </w:pPr>
-      <w:hyperlink w:anchor="bm41" w:history="1">
+      <w:hyperlink w:anchor="bm43" w:history="1">
         <w:r>
           <w:rPr>
             <w:b/>
@@ -2193,7 +2281,7 @@
         <w:fldChar w:fldCharType="begin"/>
       </w:r>
       <w:r>
-        <w:instrText>PAGEREF bm41</w:instrText>
+        <w:instrText>PAGEREF bm43</w:instrText>
       </w:r>
       <w:r>
         <w:fldChar w:fldCharType="separate"/>
@@ -2216,7 +2304,7 @@
         <w:spacing w:after="40" w:line="252" w:lineRule="auto"/>
         <w:ind w:left="360"/>
       </w:pPr>
-      <w:hyperlink w:anchor="bm42" w:history="1">
+      <w:hyperlink w:anchor="bm44" w:history="1">
         <w:r>
           <w:rPr>
             <w:color w:val="1F3864"/>
@@ -2237,7 +2325,7 @@
         <w:fldChar w:fldCharType="begin"/>
       </w:r>
       <w:r>
-        <w:instrText>PAGEREF bm42</w:instrText>
+        <w:instrText>PAGEREF bm44</w:instrText>
       </w:r>
       <w:r>
         <w:fldChar w:fldCharType="separate"/>
@@ -2260,7 +2348,7 @@
         <w:spacing w:after="40" w:line="252" w:lineRule="auto"/>
         <w:ind w:left="360"/>
       </w:pPr>
-      <w:hyperlink w:anchor="bm43" w:history="1">
+      <w:hyperlink w:anchor="bm45" w:history="1">
         <w:r>
           <w:rPr>
             <w:color w:val="1F3864"/>
@@ -2281,7 +2369,7 @@
         <w:fldChar w:fldCharType="begin"/>
       </w:r>
       <w:r>
-        <w:instrText>PAGEREF bm43</w:instrText>
+        <w:instrText>PAGEREF bm45</w:instrText>
       </w:r>
       <w:r>
         <w:fldChar w:fldCharType="separate"/>
@@ -2304,7 +2392,7 @@
         <w:spacing w:after="40" w:line="252" w:lineRule="auto"/>
         <w:ind w:left="360"/>
       </w:pPr>
-      <w:hyperlink w:anchor="bm44" w:history="1">
+      <w:hyperlink w:anchor="bm46" w:history="1">
         <w:r>
           <w:rPr>
             <w:color w:val="1F3864"/>
@@ -2325,7 +2413,7 @@
         <w:fldChar w:fldCharType="begin"/>
       </w:r>
       <w:r>
-        <w:instrText>PAGEREF bm44</w:instrText>
+        <w:instrText>PAGEREF bm46</w:instrText>
       </w:r>
       <w:r>
         <w:fldChar w:fldCharType="separate"/>
@@ -2347,7 +2435,7 @@
         </w:tabs>
         <w:spacing w:after="40" w:line="252" w:lineRule="auto"/>
       </w:pPr>
-      <w:hyperlink w:anchor="bm45" w:history="1">
+      <w:hyperlink w:anchor="bm47" w:history="1">
         <w:r>
           <w:rPr>
             <w:b/>
@@ -2370,7 +2458,7 @@
         <w:fldChar w:fldCharType="begin"/>
       </w:r>
       <w:r>
-        <w:instrText>PAGEREF bm45</w:instrText>
+        <w:instrText>PAGEREF bm47</w:instrText>
       </w:r>
       <w:r>
         <w:fldChar w:fldCharType="separate"/>
@@ -2392,7 +2480,7 @@
         </w:tabs>
         <w:spacing w:after="40" w:line="252" w:lineRule="auto"/>
       </w:pPr>
-      <w:hyperlink w:anchor="bm46" w:history="1">
+      <w:hyperlink w:anchor="bm48" w:history="1">
         <w:r>
           <w:rPr>
             <w:b/>
@@ -2415,7 +2503,7 @@
         <w:fldChar w:fldCharType="begin"/>
       </w:r>
       <w:r>
-        <w:instrText>PAGEREF bm46</w:instrText>
+        <w:instrText>PAGEREF bm48</w:instrText>
       </w:r>
       <w:r>
         <w:fldChar w:fldCharType="separate"/>
@@ -2437,7 +2525,7 @@
         </w:tabs>
         <w:spacing w:after="40" w:line="252" w:lineRule="auto"/>
       </w:pPr>
-      <w:hyperlink w:anchor="bm47" w:history="1">
+      <w:hyperlink w:anchor="bm49" w:history="1">
         <w:r>
           <w:rPr>
             <w:b/>
@@ -2460,7 +2548,7 @@
         <w:fldChar w:fldCharType="begin"/>
       </w:r>
       <w:r>
-        <w:instrText>PAGEREF bm47</w:instrText>
+        <w:instrText>PAGEREF bm49</w:instrText>
       </w:r>
       <w:r>
         <w:fldChar w:fldCharType="separate"/>
@@ -2892,7 +2980,7 @@
           <w:noProof/>
         </w:rPr>
         <w:drawing>
-          <wp:inline distT="0" distB="0" distL="0" distR="0" wp14:anchorId="43D8CBC7" wp14:editId="6F0E674F">
+          <wp:inline distT="0" distB="0" distL="0" distR="0" wp14:anchorId="3174713B" wp14:editId="5B28AD1D">
             <wp:extent cx="5905500" cy="2324100"/>
             <wp:effectExtent l="0" t="0" r="0" b="0"/>
             <wp:docPr id="1" name="Imagen 1"/>
@@ -2975,10 +3063,10 @@
           <w:noProof/>
         </w:rPr>
         <w:drawing>
-          <wp:inline distT="0" distB="0" distL="0" distR="0" wp14:anchorId="169E2F9F" wp14:editId="4D95AC38">
+          <wp:inline distT="0" distB="0" distL="0" distR="0" wp14:anchorId="428612B8" wp14:editId="2C88E6E0">
             <wp:extent cx="5334000" cy="2371725"/>
             <wp:effectExtent l="0" t="0" r="0" b="0"/>
-            <wp:docPr id="1762889563" name="Imagen 1762889563"/>
+            <wp:docPr id="1958213157" name="Imagen 1958213157"/>
             <wp:cNvGraphicFramePr>
               <a:graphicFrameLocks xmlns:a="http://schemas.openxmlformats.org/drawingml/2006/main" noChangeAspect="1"/>
             </wp:cNvGraphicFramePr>
@@ -7889,10 +7977,10 @@
         </w:rPr>
         <w:lastRenderedPageBreak/>
         <w:drawing>
-          <wp:inline distT="0" distB="0" distL="0" distR="0" wp14:anchorId="01FCC8CC" wp14:editId="59AFF587">
+          <wp:inline distT="0" distB="0" distL="0" distR="0" wp14:anchorId="1B0DE489" wp14:editId="7F052858">
             <wp:extent cx="5905500" cy="2419350"/>
             <wp:effectExtent l="0" t="0" r="0" b="0"/>
-            <wp:docPr id="1282264956" name="Imagen 1282264956"/>
+            <wp:docPr id="954330597" name="Imagen 954330597"/>
             <wp:cNvGraphicFramePr>
               <a:graphicFrameLocks xmlns:a="http://schemas.openxmlformats.org/drawingml/2006/main" noChangeAspect="1"/>
             </wp:cNvGraphicFramePr>
@@ -8042,10 +8130,10 @@
           <w:noProof/>
         </w:rPr>
         <w:drawing>
-          <wp:inline distT="0" distB="0" distL="0" distR="0" wp14:anchorId="4E6B1775" wp14:editId="7D6FC50F">
+          <wp:inline distT="0" distB="0" distL="0" distR="0" wp14:anchorId="03E9AA3D" wp14:editId="363499C9">
             <wp:extent cx="5905500" cy="2257425"/>
             <wp:effectExtent l="0" t="0" r="0" b="0"/>
-            <wp:docPr id="1874559027" name="Imagen 1874559027"/>
+            <wp:docPr id="1196260665" name="Imagen 1196260665"/>
             <wp:cNvGraphicFramePr>
               <a:graphicFrameLocks xmlns:a="http://schemas.openxmlformats.org/drawingml/2006/main" noChangeAspect="1"/>
             </wp:cNvGraphicFramePr>
@@ -8669,10 +8757,10 @@
           <w:noProof/>
         </w:rPr>
         <w:drawing>
-          <wp:inline distT="0" distB="0" distL="0" distR="0" wp14:anchorId="43E7BD52" wp14:editId="2C56C9C8">
+          <wp:inline distT="0" distB="0" distL="0" distR="0" wp14:anchorId="1AFC93A1" wp14:editId="66B858A2">
             <wp:extent cx="5334000" cy="3381375"/>
             <wp:effectExtent l="0" t="0" r="0" b="0"/>
-            <wp:docPr id="211133366" name="Imagen 211133366"/>
+            <wp:docPr id="606399100" name="Imagen 606399100"/>
             <wp:cNvGraphicFramePr>
               <a:graphicFrameLocks xmlns:a="http://schemas.openxmlformats.org/drawingml/2006/main" noChangeAspect="1"/>
             </wp:cNvGraphicFramePr>
@@ -8822,10 +8910,10 @@
           <w:noProof/>
         </w:rPr>
         <w:drawing>
-          <wp:inline distT="0" distB="0" distL="0" distR="0" wp14:anchorId="1887D314" wp14:editId="2DB95C71">
+          <wp:inline distT="0" distB="0" distL="0" distR="0" wp14:anchorId="492D3430" wp14:editId="66380082">
             <wp:extent cx="6096000" cy="1676400"/>
             <wp:effectExtent l="0" t="0" r="0" b="0"/>
-            <wp:docPr id="1700865459" name="Imagen 1700865459"/>
+            <wp:docPr id="1855307052" name="Imagen 1855307052"/>
             <wp:cNvGraphicFramePr>
               <a:graphicFrameLocks xmlns:a="http://schemas.openxmlformats.org/drawingml/2006/main" noChangeAspect="1"/>
             </wp:cNvGraphicFramePr>
@@ -8914,10 +9002,10 @@
           <w:noProof/>
         </w:rPr>
         <w:drawing>
-          <wp:inline distT="0" distB="0" distL="0" distR="0" wp14:anchorId="3B1C1B0A" wp14:editId="40462D1E">
+          <wp:inline distT="0" distB="0" distL="0" distR="0" wp14:anchorId="0D786AB9" wp14:editId="5FA2F979">
             <wp:extent cx="4762500" cy="2447925"/>
             <wp:effectExtent l="0" t="0" r="0" b="0"/>
-            <wp:docPr id="1248129059" name="Imagen 1248129059"/>
+            <wp:docPr id="445793801" name="Imagen 445793801"/>
             <wp:cNvGraphicFramePr>
               <a:graphicFrameLocks xmlns:a="http://schemas.openxmlformats.org/drawingml/2006/main" noChangeAspect="1"/>
             </wp:cNvGraphicFramePr>
@@ -9044,10 +9132,10 @@
           <w:noProof/>
         </w:rPr>
         <w:drawing>
-          <wp:inline distT="0" distB="0" distL="0" distR="0" wp14:anchorId="5F3DB39C" wp14:editId="5D204E19">
+          <wp:inline distT="0" distB="0" distL="0" distR="0" wp14:anchorId="0A496EA0" wp14:editId="3E25B788">
             <wp:extent cx="6096000" cy="3048000"/>
             <wp:effectExtent l="0" t="0" r="0" b="0"/>
-            <wp:docPr id="1428025531" name="Imagen 1428025531"/>
+            <wp:docPr id="297506673" name="Imagen 297506673"/>
             <wp:cNvGraphicFramePr>
               <a:graphicFrameLocks xmlns:a="http://schemas.openxmlformats.org/drawingml/2006/main" noChangeAspect="1"/>
             </wp:cNvGraphicFramePr>
@@ -9189,10 +9277,10 @@
         </w:rPr>
         <w:lastRenderedPageBreak/>
         <w:drawing>
-          <wp:inline distT="0" distB="0" distL="0" distR="0" wp14:anchorId="3B60FA89" wp14:editId="1278315D">
+          <wp:inline distT="0" distB="0" distL="0" distR="0" wp14:anchorId="47FEBA37" wp14:editId="123AB9B5">
             <wp:extent cx="6096000" cy="3848100"/>
             <wp:effectExtent l="0" t="0" r="0" b="0"/>
-            <wp:docPr id="1789255475" name="Imagen 1789255475"/>
+            <wp:docPr id="217293475" name="Imagen 217293475"/>
             <wp:cNvGraphicFramePr>
               <a:graphicFrameLocks xmlns:a="http://schemas.openxmlformats.org/drawingml/2006/main" noChangeAspect="1"/>
             </wp:cNvGraphicFramePr>
@@ -10074,10 +10162,10 @@
           <w:noProof/>
         </w:rPr>
         <w:drawing>
-          <wp:inline distT="0" distB="0" distL="0" distR="0" wp14:anchorId="280A7D3A" wp14:editId="3572D5A4">
+          <wp:inline distT="0" distB="0" distL="0" distR="0" wp14:anchorId="71F3138B" wp14:editId="15419D95">
             <wp:extent cx="6096000" cy="3000375"/>
             <wp:effectExtent l="0" t="0" r="0" b="0"/>
-            <wp:docPr id="1650193089" name="Imagen 1650193089"/>
+            <wp:docPr id="1360959545" name="Imagen 1360959545"/>
             <wp:cNvGraphicFramePr>
               <a:graphicFrameLocks xmlns:a="http://schemas.openxmlformats.org/drawingml/2006/main" noChangeAspect="1"/>
             </wp:cNvGraphicFramePr>
@@ -10201,7 +10289,7 @@
         <w:jc w:val="both"/>
       </w:pPr>
       <w:r>
-        <w:t>Sobre los indicadores puede aparecer una franja con el estado de la suscripción, que solo se muestra cuando hay algo que decir y por eso no figura en la imagen (RF-SUS-03). Son cuatro situaciones, y el color de cada una corresponde al tipo de mensaje definido en el apartado 6.4: durante el período de prueba se informa cuántos días faltan para que termine; en los tres días previos al vencimiento del plan contratado, y durante los cuatro días posteriores en que el negocio sigue operando con normalidad, el mensaje es de advertencia; y cuando la suscripción deja de estar vigente pasa a ser de error, porque desde ese momento la información se puede consultar pero no registrar. Mientras la fecha de vencimiento está lejos, la franja no aparece. Los tres colores se ilustran en la figura 20.</w:t>
+        <w:t>Sobre los indicadores puede aparecer una franja con el estado de la suscripción, que solo se muestra cuando hay algo que decir y por eso no figura en la imagen (RF-SUS-03). Son cuatro situaciones, y el color de cada una corresponde al tipo de mensaje definido en el apartado 6.4: durante el período de prueba se informa cuántos días faltan para que termine; en los tres días previos al vencimiento del plan contratado, y durante los cuatro días posteriores en que el negocio sigue operando con normalidad, el mensaje es de advertencia; y cuando la suscripción deja de estar vigente pasa a ser de error, porque desde ese momento la información se puede consultar pero no registrar. Mientras la fecha de vencimiento está lejos, la franja no aparece. Los tres colores se ilustran en la figura 22.</w:t>
       </w:r>
     </w:p>
     <w:p>
@@ -10215,10 +10303,10 @@
         </w:rPr>
         <w:lastRenderedPageBreak/>
         <w:drawing>
-          <wp:inline distT="0" distB="0" distL="0" distR="0" wp14:anchorId="117AB791" wp14:editId="2BE0F7FD">
+          <wp:inline distT="0" distB="0" distL="0" distR="0" wp14:anchorId="114707C4" wp14:editId="6D01AB3D">
             <wp:extent cx="6096000" cy="2857500"/>
             <wp:effectExtent l="0" t="0" r="0" b="0"/>
-            <wp:docPr id="846024311" name="Imagen 846024311"/>
+            <wp:docPr id="1441598176" name="Imagen 1441598176"/>
             <wp:cNvGraphicFramePr>
               <a:graphicFrameLocks xmlns:a="http://schemas.openxmlformats.org/drawingml/2006/main" noChangeAspect="1"/>
             </wp:cNvGraphicFramePr>
@@ -10294,7 +10382,7 @@
         <w:jc w:val="both"/>
       </w:pPr>
       <w:r>
-        <w:t>Concentra la consulta del catálogo. Sobre la tabla se ubican el buscador —que localiza por nombre, por categoría o por código de barras— y los filtros rápidos por situación de existencias: todos, existencias bajas y agotados. Junto a ellos, un selector permite acotar por estado del producto, con el catálogo activo como opción inicial, porque las referencias descontinuadas se consultan de manera ocasional. La tabla presenta el producto, su categoría, el precio de venta, las existencias, la etiqueta de estado y las acciones de edición y descontinuación. La acción principal de la pantalla, situada en la barra superior, es el registro de un producto nuevo.</w:t>
+        <w:t>Concentra la consulta del catálogo. Sobre la tabla se ubican el buscador —que localiza por nombre, por categoría o por código de barras— y los dos filtros que pide el requisito, que preguntan cosas distintas y se combinan entre sí: la situación de las existencias, en filtros rápidos de un clic —todos, existencias bajas y agotados—, y el estado de la referencia, en un selector con el catálogo activo como opción inicial, porque las descontinuadas se consultan de manera ocasional. Cada control nombra la dimensión que filtra: de lo contrario, al ofrecer ambos la opción de no filtrar, se leerían como un mismo control repetido.</w:t>
       </w:r>
     </w:p>
     <w:p>
@@ -10303,6 +10391,33 @@
         <w:jc w:val="both"/>
       </w:pPr>
       <w:r>
+        <w:t>La tabla presenta el producto, su categoría, el precio de venta, las existencias y la etiqueta de estado. Las acciones de cada fila son consultar sus movimientos, editar y, según el estado, descontinuar o reactivar. La acción principal de la pantalla, situada en la barra superior, es el registro de un producto nuevo, junto al acceso a la entrada de mercancía.</w:t>
+      </w:r>
+    </w:p>
+    <w:p>
+      <w:pPr>
+        <w:spacing w:after="110" w:line="262" w:lineRule="auto"/>
+        <w:jc w:val="both"/>
+      </w:pPr>
+      <w:r>
+        <w:t>La pantalla es de los dos roles del negocio, y no muestra lo mismo a cada uno. El vendedor consulta el catálogo, lo busca y lo filtra, y entra al historial de una referencia, porque su rol registra ventas y consulta existencias; no se le ofrecen el registro, la edición, la descontinuación ni el ajuste, y esas acciones sencillamente no aparecen, sin aviso que las explique: no es un trámite pendiente que pueda resolver, es el reparto del trabajo. La regla que decide esto vive en el servidor, que rechaza esas operaciones a quien no administra la licorera; la interfaz solo evita ofrecer un botón que se va a rechazar.</w:t>
+      </w:r>
+    </w:p>
+    <w:p>
+      <w:pPr>
+        <w:spacing w:after="110" w:line="262" w:lineRule="auto"/>
+        <w:jc w:val="both"/>
+      </w:pPr>
+      <w:r>
+        <w:t>Descontinuar pide confirmación, con la consecuencia escrita: la referencia deja de ofrecerse en el punto de venta y conserva sus existencias y su historial. Tiene vuelta atrás, porque se dispara con un clic en una fila y descontinuar la equivocada obligaría, sin ella, a registrar el producto de nuevo con otro código de barras y a partir su historial en dos. Reactivar no pide confirmación: devuelve la referencia al catálogo sin alterar nada más.</w:t>
+      </w:r>
+    </w:p>
+    <w:p>
+      <w:pPr>
+        <w:spacing w:after="110" w:line="262" w:lineRule="auto"/>
+        <w:jc w:val="both"/>
+      </w:pPr>
+      <w:r>
         <w:t>La etiqueta de estado resume en una palabra la situación de la referencia, con los colores que fija el punto 6.4: existencias bajas en el tono de advertencia, porque todavía se puede vender y lo que falta es reponer, y agotado en el de error, porque ya no se puede vender. Una referencia descontinuada muestra esa condición en lugar de su nivel de existencias: anunciar que le quedan pocas unidades sería pedir que se repongan.</w:t>
       </w:r>
     </w:p>
@@ -10315,11 +10430,12 @@
         <w:rPr>
           <w:noProof/>
         </w:rPr>
+        <w:lastRenderedPageBreak/>
         <w:drawing>
-          <wp:inline distT="0" distB="0" distL="0" distR="0" wp14:anchorId="7096753B" wp14:editId="571C4DD8">
+          <wp:inline distT="0" distB="0" distL="0" distR="0" wp14:anchorId="74133679" wp14:editId="201DAEC7">
             <wp:extent cx="6096000" cy="2857500"/>
             <wp:effectExtent l="0" t="0" r="0" b="0"/>
-            <wp:docPr id="1175762813" name="Imagen 1175762813"/>
+            <wp:docPr id="2063194622" name="Imagen 2063194622"/>
             <wp:cNvGraphicFramePr>
               <a:graphicFrameLocks xmlns:a="http://schemas.openxmlformats.org/drawingml/2006/main" noChangeAspect="1"/>
             </wp:cNvGraphicFramePr>
@@ -10385,7 +10501,6 @@
           <w:sz w:val="23"/>
           <w:szCs w:val="23"/>
         </w:rPr>
-        <w:lastRenderedPageBreak/>
         <w:t>8.4 Inventario: registro y edición de producto</w:t>
       </w:r>
       <w:bookmarkEnd w:id="30"/>
@@ -10408,11 +10523,12 @@
         <w:rPr>
           <w:noProof/>
         </w:rPr>
+        <w:lastRenderedPageBreak/>
         <w:drawing>
-          <wp:inline distT="0" distB="0" distL="0" distR="0" wp14:anchorId="73E34995" wp14:editId="718ACB77">
+          <wp:inline distT="0" distB="0" distL="0" distR="0" wp14:anchorId="2DC6D4A5" wp14:editId="3FD89B4D">
             <wp:extent cx="4953000" cy="4067175"/>
             <wp:effectExtent l="0" t="0" r="0" b="0"/>
-            <wp:docPr id="672950529" name="Imagen 672950529"/>
+            <wp:docPr id="768996606" name="Imagen 768996606"/>
             <wp:cNvGraphicFramePr>
               <a:graphicFrameLocks xmlns:a="http://schemas.openxmlformats.org/drawingml/2006/main" noChangeAspect="1"/>
             </wp:cNvGraphicFramePr>
@@ -10478,7 +10594,7 @@
           <w:sz w:val="23"/>
           <w:szCs w:val="23"/>
         </w:rPr>
-        <w:t>8.5 Punto de venta</w:t>
+        <w:t>8.5 Inventario: entrada de mercancía</w:t>
       </w:r>
       <w:bookmarkEnd w:id="31"/>
     </w:p>
@@ -10488,7 +10604,7 @@
         <w:jc w:val="both"/>
       </w:pPr>
       <w:r>
-        <w:t>Es la pantalla de uso más frecuente y la que exige mayor rapidez. Se divide en dos zonas: a la izquierda, el buscador con lectura de código de barras, los filtros por categoría y la cuadrícula de productos con precio y existencia disponible; a la derecha, la venta en curso con sus líneas, el total, los medios de pago y la acción de cobro, que muestra el valor a cobrar en la propia etiqueta del botón.</w:t>
+        <w:t>Registra la llegada de mercancía al negocio y es el único formulario del sistema con varias líneas, porque una compra llega con lo que diga la factura del proveedor: tres referencias o catorce. En la parte alta se capturan los datos comunes a toda la entrada —el proveedor y una observación, ambos opcionales— y debajo se agregan tantas líneas como productos se hayan recibido, cada una con su referencia, la cantidad y el costo unitario al que se compró. El producto no se elige de una lista desplegable sino que se busca por nombre o por código de barras, porque un catálogo de varios cientos de referencias no se recorre con la vista.</w:t>
       </w:r>
     </w:p>
     <w:p>
@@ -10497,7 +10613,16 @@
         <w:jc w:val="both"/>
       </w:pPr>
       <w:r>
-        <w:t>Al confirmar el cobro, el sistema descuenta las existencias consumiendo los lotes más antiguos, registra el costo real despachado y genera el comprobante de la venta.</w:t>
+        <w:t>El costo se captura aquí y no en el formulario del producto, y esa es la decisión que explica la pantalla: el mismo ron no cuesta lo mismo en marzo que en junio, de modo que el costo no pertenece a la referencia sino a cada lote que ingresa. Cada línea de la entrada se convierte en un lote con su costo congelado, que es lo que permite valorar después las salidas por el método PEPS. Mientras se escriben las líneas, la pantalla muestra el subtotal de cada una y el total de la compra, para cotejarlos con la factura antes de registrar.</w:t>
+      </w:r>
+    </w:p>
+    <w:p>
+      <w:pPr>
+        <w:spacing w:after="110" w:line="262" w:lineRule="auto"/>
+        <w:jc w:val="both"/>
+      </w:pPr>
+      <w:r>
+        <w:t>Debajo se listan las entradas ya registradas con su fecha, su proveedor, los productos que trajo cada una y su costo total. Ninguna ofrece acción de edición ni de borrado: una entrada registrada movió existencias y quedó anotada en el kardex, de modo que modificarla haría que los saldos posteriores dejaran de cuadrar. Lo que corrige una entrada equivocada es un ajuste de existencias con su motivo, descrito en el apartado siguiente.</w:t>
       </w:r>
     </w:p>
     <w:p>
@@ -10511,10 +10636,10 @@
         </w:rPr>
         <w:lastRenderedPageBreak/>
         <w:drawing>
-          <wp:inline distT="0" distB="0" distL="0" distR="0" wp14:anchorId="74AC9B9F" wp14:editId="1CDB2BA8">
-            <wp:extent cx="6096000" cy="2562225"/>
+          <wp:inline distT="0" distB="0" distL="0" distR="0" wp14:anchorId="73CABF3F" wp14:editId="4417D1C4">
+            <wp:extent cx="6096000" cy="4124325"/>
             <wp:effectExtent l="0" t="0" r="0" b="0"/>
-            <wp:docPr id="779798616" name="Imagen 779798616"/>
+            <wp:docPr id="1497323834" name="Imagen 1497323834"/>
             <wp:cNvGraphicFramePr>
               <a:graphicFrameLocks xmlns:a="http://schemas.openxmlformats.org/drawingml/2006/main" noChangeAspect="1"/>
             </wp:cNvGraphicFramePr>
@@ -10537,7 +10662,7 @@
                   <pic:spPr bwMode="auto">
                     <a:xfrm>
                       <a:off x="0" y="0"/>
-                      <a:ext cx="6096000" cy="2562225"/>
+                      <a:ext cx="6096000" cy="4124325"/>
                     </a:xfrm>
                     <a:prstGeom prst="rect">
                       <a:avLst/>
@@ -10563,7 +10688,7 @@
           <w:sz w:val="18"/>
           <w:szCs w:val="18"/>
         </w:rPr>
-        <w:t>Figura 14. Punto de venta. Fuente: del autor.</w:t>
+        <w:t>Figura 14. Inventario: entrada de mercancía. Fuente: del autor.</w:t>
       </w:r>
     </w:p>
     <w:p>
@@ -10580,7 +10705,7 @@
           <w:sz w:val="23"/>
           <w:szCs w:val="23"/>
         </w:rPr>
-        <w:t>8.6 Reportes</w:t>
+        <w:t>8.6 Inventario: kardex y ajuste de existencias</w:t>
       </w:r>
       <w:bookmarkEnd w:id="32"/>
     </w:p>
@@ -10590,7 +10715,25 @@
         <w:jc w:val="both"/>
       </w:pPr>
       <w:r>
-        <w:t>Presenta los resultados del periodo seleccionado, que se indica en la barra superior junto a la acción de exportación. En la parte alta se ubican los indicadores del mes —ventas y utilidad— y debajo, el comportamiento de las ventas por día y el listado de productos más vendidos con las unidades despachadas. La utilidad se calcula con el costo histórico de los lotes consumidos, no con el costo actual del producto.</w:t>
+        <w:t>Reúne el historial de movimientos de una referencia y la corrección de sus existencias, y se abre desde la acción «Movimientos» de la lista de productos. En la cabecera aparecen el nombre del producto y sus existencias actuales; debajo, el formulario de ajuste; y al final, la tabla de movimientos ordenada del más reciente al más antiguo, con la fecha y la hora, el tipo de movimiento, la cantidad con su signo, el costo unitario con el que se registró, el saldo que quedó y quién lo hizo.</w:t>
+      </w:r>
+    </w:p>
+    <w:p>
+      <w:pPr>
+        <w:spacing w:after="110" w:line="262" w:lineRule="auto"/>
+        <w:jc w:val="both"/>
+      </w:pPr>
+      <w:r>
+        <w:t>El ajuste se sitúa sobre el historial y no en la lista de productos porque un ajuste es la respuesta a una diferencia, y la diferencia se explica en los movimientos: faltan unidades que nadie vendió, o aparecen unidades que nadie registró. Se pide la diferencia y no la cantidad final —un número positivo si en el conteo sobraron unidades y uno negativo si faltaron— junto con el motivo, que es obligatorio: una existencia que cambió sin explicación es justo lo que un inventario sirve para evitar. Al guardarlo, el movimiento aparece en la primera fila de la tabla.</w:t>
+      </w:r>
+    </w:p>
+    <w:p>
+      <w:pPr>
+        <w:spacing w:after="110" w:line="262" w:lineRule="auto"/>
+        <w:jc w:val="both"/>
+      </w:pPr>
+      <w:r>
+        <w:t>El kardex es de solo lectura para todos los roles, incluido el administrador de la licorera. Ninguna línea se edita ni se borra: un historial que se puede reescribir no sirve para rendir cuentas, y una cifra equivocada se corrige con otro movimiento que diga por qué. Cuando el ajuste reduce las existencias, el sistema consume los lotes más antiguos y registra el costo real de lo que se perdió; cuando las aumenta, el lote que nace toma el costo de la compra más reciente, porque unas unidades que aparecen en un conteo son mercancía que ya se compró.</w:t>
       </w:r>
     </w:p>
     <w:p>
@@ -10602,11 +10745,12 @@
         <w:rPr>
           <w:noProof/>
         </w:rPr>
+        <w:lastRenderedPageBreak/>
         <w:drawing>
-          <wp:inline distT="0" distB="0" distL="0" distR="0" wp14:anchorId="1F26A07A" wp14:editId="27E736FF">
-            <wp:extent cx="6096000" cy="2857500"/>
+          <wp:inline distT="0" distB="0" distL="0" distR="0" wp14:anchorId="60D72C09" wp14:editId="39C13B53">
+            <wp:extent cx="6096000" cy="4162425"/>
             <wp:effectExtent l="0" t="0" r="0" b="0"/>
-            <wp:docPr id="253974864" name="Imagen 253974864"/>
+            <wp:docPr id="1048123329" name="Imagen 1048123329"/>
             <wp:cNvGraphicFramePr>
               <a:graphicFrameLocks xmlns:a="http://schemas.openxmlformats.org/drawingml/2006/main" noChangeAspect="1"/>
             </wp:cNvGraphicFramePr>
@@ -10629,7 +10773,7 @@
                   <pic:spPr bwMode="auto">
                     <a:xfrm>
                       <a:off x="0" y="0"/>
-                      <a:ext cx="6096000" cy="2857500"/>
+                      <a:ext cx="6096000" cy="4162425"/>
                     </a:xfrm>
                     <a:prstGeom prst="rect">
                       <a:avLst/>
@@ -10655,7 +10799,7 @@
           <w:sz w:val="18"/>
           <w:szCs w:val="18"/>
         </w:rPr>
-        <w:t>Figura 15. Reportes. Fuente: del autor.</w:t>
+        <w:t>Figura 15. Inventario: kardex y ajuste de existencias. Fuente: del autor.</w:t>
       </w:r>
     </w:p>
     <w:p>
@@ -10672,7 +10816,7 @@
           <w:sz w:val="23"/>
           <w:szCs w:val="23"/>
         </w:rPr>
-        <w:t>8.7 Usuarios de la licorera</w:t>
+        <w:t>8.7 Punto de venta</w:t>
       </w:r>
       <w:bookmarkEnd w:id="33"/>
     </w:p>
@@ -10682,7 +10826,7 @@
         <w:jc w:val="both"/>
       </w:pPr>
       <w:r>
-        <w:t>Es la pantalla con la que el administrador decide quién entra a su negocio. Bajo el título se indica cuántas cuentas están activas de las registradas, porque es esa cifra —y no el total— la que el plan contratado limita. La acción principal, en la esquina superior, registra una cuenta nueva.</w:t>
+        <w:t>Es la pantalla de uso más frecuente y la que exige mayor rapidez. Se divide en dos zonas: a la izquierda, el buscador con lectura de código de barras, los filtros por categoría y la cuadrícula de productos con precio y existencia disponible; a la derecha, la venta en curso con sus líneas, el total, los medios de pago y la acción de cobro, que muestra el valor a cobrar en la propia etiqueta del botón.</w:t>
       </w:r>
     </w:p>
     <w:p>
@@ -10691,17 +10835,7 @@
         <w:jc w:val="both"/>
       </w:pPr>
       <w:r>
-        <w:t>La tabla presenta el nombre, el correo, el rol y el estado de cada cuenta, con la fila propia señalada. Las acciones de cada fila son editar y, según el estado, inactivar o reactivar. No hay acción de borrado: una cuenta que ha registrado operaciones no se elimina, se inactiva, de modo que el histórico conserva quién hizo qué. Tampoco aparece la acción de inactivarse a uno mismo.</w:t>
-      </w:r>
-    </w:p>
-    <w:p>
-      <w:pPr>
-        <w:spacing w:after="110" w:line="262" w:lineRule="auto"/>
-        <w:jc w:val="both"/>
-      </w:pPr>
-      <w:r>
-        <w:lastRenderedPageBreak/>
-        <w:t>Cuando el plan contratado no admite más cuentas activas, el sistema rechaza el alta y lo dice con la cifra concreta; y cuando la suscripción no está vigente, las acciones de registrar y modificar desaparecen y en su lugar se explica el motivo con el acceso a «Mi suscripción». Ambos textos los redacta el servidor, que es quien conoce la razón del rechazo.</w:t>
+        <w:t>Al confirmar el cobro, el sistema descuenta las existencias consumiendo los lotes más antiguos, registra el costo real despachado y genera el comprobante de la venta.</w:t>
       </w:r>
     </w:p>
     <w:p>
@@ -10714,10 +10848,10 @@
           <w:noProof/>
         </w:rPr>
         <w:drawing>
-          <wp:inline distT="0" distB="0" distL="0" distR="0" wp14:anchorId="6C35A3D5" wp14:editId="60DB225B">
-            <wp:extent cx="6096000" cy="2857500"/>
+          <wp:inline distT="0" distB="0" distL="0" distR="0" wp14:anchorId="450DA1C3" wp14:editId="3703A20A">
+            <wp:extent cx="6096000" cy="2562225"/>
             <wp:effectExtent l="0" t="0" r="0" b="0"/>
-            <wp:docPr id="2008429913" name="Imagen 2008429913"/>
+            <wp:docPr id="1353208267" name="Imagen 1353208267"/>
             <wp:cNvGraphicFramePr>
               <a:graphicFrameLocks xmlns:a="http://schemas.openxmlformats.org/drawingml/2006/main" noChangeAspect="1"/>
             </wp:cNvGraphicFramePr>
@@ -10740,7 +10874,7 @@
                   <pic:spPr bwMode="auto">
                     <a:xfrm>
                       <a:off x="0" y="0"/>
-                      <a:ext cx="6096000" cy="2857500"/>
+                      <a:ext cx="6096000" cy="2562225"/>
                     </a:xfrm>
                     <a:prstGeom prst="rect">
                       <a:avLst/>
@@ -10766,7 +10900,7 @@
           <w:sz w:val="18"/>
           <w:szCs w:val="18"/>
         </w:rPr>
-        <w:t>Figura 16. Usuarios de la licorera. Fuente: del autor.</w:t>
+        <w:t>Figura 16. Punto de venta. Fuente: del autor.</w:t>
       </w:r>
     </w:p>
     <w:p>
@@ -10783,7 +10917,8 @@
           <w:sz w:val="23"/>
           <w:szCs w:val="23"/>
         </w:rPr>
-        <w:t>8.8 Mi perfil</w:t>
+        <w:lastRenderedPageBreak/>
+        <w:t>8.8 Reportes</w:t>
       </w:r>
       <w:bookmarkEnd w:id="34"/>
     </w:p>
@@ -10793,25 +10928,7 @@
         <w:jc w:val="both"/>
       </w:pPr>
       <w:r>
-        <w:t>Reúne lo que cada persona puede consultar y cambiar de su propia cuenta, sin importar su rol. Se divide en tres bloques: los datos que administra INVENTRA y no se editan desde aquí —correo, rol y licorera—, los datos personales que sí se editan —nombre y teléfono—, y el cambio de contraseña.</w:t>
-      </w:r>
-    </w:p>
-    <w:p>
-      <w:pPr>
-        <w:spacing w:after="110" w:line="262" w:lineRule="auto"/>
-        <w:jc w:val="both"/>
-      </w:pPr>
-      <w:r>
-        <w:t>El correo no se edita porque identifica la cuenta en toda la plataforma y cambiarlo equivaldría a cambiar de cuenta; el rol y la licorera se fijan al crear la cuenta y no los modifica su titular. La pantalla distingue a quién corresponde el cambio: al administrador de la licorera, cuando el titular es un vendedor, y al soporte de INVENTRA cuando el titular es el propio administrador, que dentro del negocio no tiene a nadie por encima. Al cambiar la contraseña se cierran las demás sesiones abiertas, de modo que una contraseña comprometida deja de servir en cuanto su dueño reacciona.</w:t>
-      </w:r>
-    </w:p>
-    <w:p>
-      <w:pPr>
-        <w:spacing w:after="110" w:line="262" w:lineRule="auto"/>
-        <w:jc w:val="both"/>
-      </w:pPr>
-      <w:r>
-        <w:t>La única excepción es el correo todavía sin confirmar. Mientras la cuenta siga pendiente, su titular puede corregir la dirección desde esta misma pantalla y el sistema envía el enlace nuevo a la dirección corregida; en cuanto el correo queda confirmado, la corrección deja de ofrecerse. La excepción es necesaria porque quien se registra por autoservicio es el único administrador de su licorera: si escribió mal su dirección no hay nadie por encima que pueda corregirla, y la cuenta quedaría sin poder confirmar y, por tanto, sin poder registrar. Por el mismo motivo, cuando un administrador cambia el correo de una de las cuentas de su licorera, esa cuenta vuelve a quedar pendiente de confirmación. La corrección no figura en la imagen porque solo se ofrece mientras el correo esté sin confirmar.</w:t>
+        <w:t>Presenta los resultados del periodo seleccionado, que se indica en la barra superior junto a la acción de exportación. En la parte alta se ubican los indicadores del mes —ventas y utilidad— y debajo, el comportamiento de las ventas por día y el listado de productos más vendidos con las unidades despachadas. La utilidad se calcula con el costo histórico de los lotes consumidos, no con el costo actual del producto.</w:t>
       </w:r>
     </w:p>
     <w:p>
@@ -10823,12 +10940,11 @@
         <w:rPr>
           <w:noProof/>
         </w:rPr>
-        <w:lastRenderedPageBreak/>
         <w:drawing>
-          <wp:inline distT="0" distB="0" distL="0" distR="0" wp14:anchorId="51C1E030" wp14:editId="15C27731">
-            <wp:extent cx="6096000" cy="3562350"/>
+          <wp:inline distT="0" distB="0" distL="0" distR="0" wp14:anchorId="216C1833" wp14:editId="4AE929B4">
+            <wp:extent cx="6096000" cy="2857500"/>
             <wp:effectExtent l="0" t="0" r="0" b="0"/>
-            <wp:docPr id="397112857" name="Imagen 397112857"/>
+            <wp:docPr id="750768330" name="Imagen 750768330"/>
             <wp:cNvGraphicFramePr>
               <a:graphicFrameLocks xmlns:a="http://schemas.openxmlformats.org/drawingml/2006/main" noChangeAspect="1"/>
             </wp:cNvGraphicFramePr>
@@ -10851,7 +10967,7 @@
                   <pic:spPr bwMode="auto">
                     <a:xfrm>
                       <a:off x="0" y="0"/>
-                      <a:ext cx="6096000" cy="3562350"/>
+                      <a:ext cx="6096000" cy="2857500"/>
                     </a:xfrm>
                     <a:prstGeom prst="rect">
                       <a:avLst/>
@@ -10877,7 +10993,7 @@
           <w:sz w:val="18"/>
           <w:szCs w:val="18"/>
         </w:rPr>
-        <w:t>Figura 17. Mi perfil. Fuente: del autor.</w:t>
+        <w:t>Figura 17. Reportes. Fuente: del autor.</w:t>
       </w:r>
     </w:p>
     <w:p>
@@ -10894,7 +11010,7 @@
           <w:sz w:val="23"/>
           <w:szCs w:val="23"/>
         </w:rPr>
-        <w:t>8.9 Mi suscripción</w:t>
+        <w:t>8.9 Usuarios de la licorera</w:t>
       </w:r>
       <w:bookmarkEnd w:id="35"/>
     </w:p>
@@ -10904,7 +11020,7 @@
         <w:jc w:val="both"/>
       </w:pPr>
       <w:r>
-        <w:t>Reúne en una sola pantalla lo que el negocio necesita saber de su contratación: el plan vigente con su estado, la fecha hasta la que vale y los días que faltan. Cuando la suscripción ha vencido y corre el plazo de gracia, el segundo indicador cambia de sentido y pasa a contar los días que quedan antes de la suspensión, porque esa es la cifra que obliga a actuar.</w:t>
+        <w:t>Es la pantalla con la que el administrador decide quién entra a su negocio. Bajo el título se indica cuántas cuentas están activas de las registradas, porque es esa cifra —y no el total— la que el plan contratado limita. La acción principal, en la esquina superior, registra una cuenta nueva.</w:t>
       </w:r>
     </w:p>
     <w:p>
@@ -10913,7 +11029,7 @@
         <w:jc w:val="both"/>
       </w:pPr>
       <w:r>
-        <w:t>Debajo se listan los planes disponibles con lo que incluye cada uno, tomado del propio plan y no de un texto fijo, de modo que un plan nuevo aparece sin tocar la pantalla. El plan contratado se señala y no ofrece acción. Solo se ofrece el botón de los planes más económicos: bajar de plan no implica cobro y lo ejecuta el propio negocio, mientras que subir se contrata con INVENTRA, que lo activa al confirmar el pago. La pantalla lo dice con esas palabras en lugar de ocultar el plan superior, porque el negocio necesita saber cómo se contrata.</w:t>
+        <w:t>La tabla presenta el nombre, el correo, el rol y el estado de cada cuenta, con la fila propia señalada. Las acciones de cada fila son editar y, según el estado, inactivar o reactivar. No hay acción de borrado: una cuenta que ha registrado operaciones no se elimina, se inactiva, de modo que el histórico conserva quién hizo qué. Tampoco aparece la acción de inactivarse a uno mismo.</w:t>
       </w:r>
     </w:p>
     <w:p>
@@ -10922,7 +11038,16 @@
         <w:jc w:val="both"/>
       </w:pPr>
       <w:r>
-        <w:t>Antes de bajar de plan se pide confirmación, con el detalle de lo que se pierde. Si la licorera tiene más usuarios o más sedes de los que admite el plan de destino, el sistema rechaza el cambio y dice cuántos sobran, sin inactivar nada por su cuenta: esa decisión es del negocio.</w:t>
+        <w:t>Una licorera no puede quedarse sin ningún administrador activo, y el sistema lo impide por los dos caminos que llevarían a ello: cambiarle el rol a la última cuenta de administrador y desmarcarla como activa. En ambos casos el rechazo explica qué hacer antes —nombrar a otro administrador—, porque una licorera sin ninguno no puede registrar usuarios ni productos ni gestionar su suscripción, y no habría forma de repararlo desde la propia aplicación.</w:t>
+      </w:r>
+    </w:p>
+    <w:p>
+      <w:pPr>
+        <w:spacing w:after="110" w:line="262" w:lineRule="auto"/>
+        <w:jc w:val="both"/>
+      </w:pPr>
+      <w:r>
+        <w:t>Cuando el plan contratado no admite más cuentas activas, el sistema rechaza el alta y lo dice con la cifra concreta; y cuando la suscripción no está vigente, las acciones de registrar y modificar desaparecen y en su lugar se explica el motivo con el acceso a «Mi suscripción». Ambos textos los redacta el servidor, que es quien conoce la razón del rechazo.</w:t>
       </w:r>
     </w:p>
     <w:p>
@@ -10936,10 +11061,10 @@
         </w:rPr>
         <w:lastRenderedPageBreak/>
         <w:drawing>
-          <wp:inline distT="0" distB="0" distL="0" distR="0" wp14:anchorId="60635FE6" wp14:editId="5F62F73C">
-            <wp:extent cx="6096000" cy="3067050"/>
+          <wp:inline distT="0" distB="0" distL="0" distR="0" wp14:anchorId="6DF1BBAD" wp14:editId="6DB9BB27">
+            <wp:extent cx="6096000" cy="2857500"/>
             <wp:effectExtent l="0" t="0" r="0" b="0"/>
-            <wp:docPr id="2070000954" name="Imagen 2070000954"/>
+            <wp:docPr id="936383055" name="Imagen 936383055"/>
             <wp:cNvGraphicFramePr>
               <a:graphicFrameLocks xmlns:a="http://schemas.openxmlformats.org/drawingml/2006/main" noChangeAspect="1"/>
             </wp:cNvGraphicFramePr>
@@ -10962,7 +11087,7 @@
                   <pic:spPr bwMode="auto">
                     <a:xfrm>
                       <a:off x="0" y="0"/>
-                      <a:ext cx="6096000" cy="3067050"/>
+                      <a:ext cx="6096000" cy="2857500"/>
                     </a:xfrm>
                     <a:prstGeom prst="rect">
                       <a:avLst/>
@@ -10988,7 +11113,7 @@
           <w:sz w:val="18"/>
           <w:szCs w:val="18"/>
         </w:rPr>
-        <w:t>Figura 18. Mi suscripción. Fuente: del autor.</w:t>
+        <w:t>Figura 18. Usuarios de la licorera. Fuente: del autor.</w:t>
       </w:r>
     </w:p>
     <w:p>
@@ -11005,7 +11130,7 @@
           <w:sz w:val="23"/>
           <w:szCs w:val="23"/>
         </w:rPr>
-        <w:t>8.10 Plataforma</w:t>
+        <w:t>8.10 Mi perfil</w:t>
       </w:r>
       <w:bookmarkEnd w:id="36"/>
     </w:p>
@@ -11015,7 +11140,7 @@
         <w:jc w:val="both"/>
       </w:pPr>
       <w:r>
-        <w:t>Es la pantalla del administrador de INVENTRA, no la de un negocio, y es la única que no pertenece a ninguna licorera. Reúne las tres cifras globales del servicio —licoreras registradas, cuentas con suscripción vigente e ingreso mensual contratado— y, debajo, el listado de las licoreras con su contacto, el plan, el estado de la suscripción, la fecha hasta la que vale y el número de cuentas que tiene abiertas.</w:t>
+        <w:t>Reúne lo que cada persona puede consultar y cambiar de su propia cuenta, sin importar su rol. Se divide en tres bloques: los datos que administra INVENTRA y no se editan desde aquí —correo, rol y licorera—, los datos personales que sí se editan —nombre y teléfono—, y el cambio de contraseña.</w:t>
       </w:r>
     </w:p>
     <w:p>
@@ -11024,7 +11149,7 @@
         <w:jc w:val="both"/>
       </w:pPr>
       <w:r>
-        <w:t>El listado no muestra ningún dato comercial de los negocios: ni sus productos, ni sus ventas, ni sus importes. La restricción es del requisito y está resuelta en el servidor, que sencillamente no devuelve esa información; la pantalla no tiene nada que ocultar porque nunca la recibe.</w:t>
+        <w:t>El correo no se edita porque identifica la cuenta en toda la plataforma y cambiarlo equivaldría a cambiar de cuenta; el rol y la licorera se fijan al crear la cuenta y no los modifica su titular. La pantalla distingue a quién corresponde el cambio: al administrador de la licorera, cuando el titular es un vendedor, y al soporte de INVENTRA cuando el titular es el propio administrador, que dentro del negocio no tiene a nadie por encima. Al cambiar la contraseña se cierran las demás sesiones abiertas, de modo que una contraseña comprometida deja de servir en cuanto su dueño reacciona.</w:t>
       </w:r>
     </w:p>
     <w:p>
@@ -11033,16 +11158,7 @@
         <w:jc w:val="both"/>
       </w:pPr>
       <w:r>
-        <w:t>Desde aquí se ejecutan las tres operaciones que le corresponden a quien cobra el servicio: dar de alta una licorera, que crea el negocio y la cuenta de su administrador y le envía el enlace para que defina su propia contraseña; abrir un período, que es la misma operación para renovar y para subir de plan, porque en los dos casos se cierra la suscripción anterior y se inicia otra con su fecha de vencimiento; y corregir la fecha de una suscripción vigente, prevista para enmendar una fecha mal escrita y no para renovar. Bajar de plan no aparece en esta pantalla: esa operación la ejecuta el propio negocio desde la suya, según se explica en el apartado anterior.</w:t>
-      </w:r>
-    </w:p>
-    <w:p>
-      <w:pPr>
-        <w:spacing w:after="110" w:line="262" w:lineRule="auto"/>
-        <w:jc w:val="both"/>
-      </w:pPr>
-      <w:r>
-        <w:t>La navegación lateral de este rol es distinta: no se le presentan los módulos de inventario, ventas o sedes, porque no administra un negocio sino el servicio.</w:t>
+        <w:t>La única excepción es el correo todavía sin confirmar. Mientras la cuenta siga pendiente, su titular puede corregir la dirección desde esta misma pantalla y el sistema envía el enlace nuevo a la dirección corregida; en cuanto el correo queda confirmado, la corrección deja de ofrecerse. La excepción es necesaria porque quien se registra por autoservicio es el único administrador de su licorera: si escribió mal su dirección no hay nadie por encima que pueda corregirla, y la cuenta quedaría sin poder confirmar y, por tanto, sin poder registrar. Por el mismo motivo, cuando un administrador cambia el correo de una de las cuentas de su licorera, esa cuenta vuelve a quedar pendiente de confirmación. La corrección no figura en la imagen porque solo se ofrece mientras el correo esté sin confirmar.</w:t>
       </w:r>
     </w:p>
     <w:p>
@@ -11056,10 +11172,10 @@
         </w:rPr>
         <w:lastRenderedPageBreak/>
         <w:drawing>
-          <wp:inline distT="0" distB="0" distL="0" distR="0" wp14:anchorId="72B39C39" wp14:editId="6F7D3855">
-            <wp:extent cx="6096000" cy="4114800"/>
+          <wp:inline distT="0" distB="0" distL="0" distR="0" wp14:anchorId="094DC92C" wp14:editId="082B5629">
+            <wp:extent cx="6096000" cy="3562350"/>
             <wp:effectExtent l="0" t="0" r="0" b="0"/>
-            <wp:docPr id="902347867" name="Imagen 902347867"/>
+            <wp:docPr id="357298746" name="Imagen 357298746"/>
             <wp:cNvGraphicFramePr>
               <a:graphicFrameLocks xmlns:a="http://schemas.openxmlformats.org/drawingml/2006/main" noChangeAspect="1"/>
             </wp:cNvGraphicFramePr>
@@ -11082,7 +11198,7 @@
                   <pic:spPr bwMode="auto">
                     <a:xfrm>
                       <a:off x="0" y="0"/>
-                      <a:ext cx="6096000" cy="4114800"/>
+                      <a:ext cx="6096000" cy="3562350"/>
                     </a:xfrm>
                     <a:prstGeom prst="rect">
                       <a:avLst/>
@@ -11108,26 +11224,24 @@
           <w:sz w:val="18"/>
           <w:szCs w:val="18"/>
         </w:rPr>
-        <w:t>Figura 19. Plataforma: licoreras registradas y sus suscripciones. Fuente: del autor.</w:t>
-      </w:r>
-    </w:p>
-    <w:p>
-      <w:pPr>
-        <w:pStyle w:val="Ttulo1"/>
-        <w:pageBreakBefore/>
-        <w:spacing w:before="220" w:after="110"/>
+        <w:t>Figura 19. Mi perfil. Fuente: del autor.</w:t>
+      </w:r>
+    </w:p>
+    <w:p>
+      <w:pPr>
+        <w:pStyle w:val="Ttulo2"/>
+        <w:spacing w:before="150" w:after="80"/>
       </w:pPr>
       <w:bookmarkStart w:id="37" w:name="bm38"/>
       <w:r>
         <w:rPr>
           <w:b/>
           <w:bCs/>
-          <w:color w:val="1F3864"/>
-          <w:sz w:val="27"/>
-          <w:szCs w:val="27"/>
-        </w:rPr>
-        <w:lastRenderedPageBreak/>
-        <w:t>9. Mensajes y estados de pantalla</w:t>
+          <w:color w:val="2E5496"/>
+          <w:sz w:val="23"/>
+          <w:szCs w:val="23"/>
+        </w:rPr>
+        <w:t>8.11 Mi suscripción</w:t>
       </w:r>
       <w:bookmarkEnd w:id="37"/>
     </w:p>
@@ -11137,7 +11251,25 @@
         <w:jc w:val="both"/>
       </w:pPr>
       <w:r>
-        <w:t>Además de los componentes descritos en la sección 6, la interfaz define cómo se comporta una pantalla cuando no hay información que mostrar, cuando los datos aún se están cargando o cuando una operación falla. El objetivo es que el usuario siempre sepa qué ocurre y qué puede hacer a continuación.</w:t>
+        <w:t>Reúne en una sola pantalla lo que el negocio necesita saber de su contratación: el plan vigente con su estado, la fecha hasta la que vale y los días que faltan. Cuando la suscripción ha vencido y corre el plazo de gracia, el segundo indicador cambia de sentido y pasa a contar los días que quedan antes de la suspensión, porque esa es la cifra que obliga a actuar.</w:t>
+      </w:r>
+    </w:p>
+    <w:p>
+      <w:pPr>
+        <w:spacing w:after="110" w:line="262" w:lineRule="auto"/>
+        <w:jc w:val="both"/>
+      </w:pPr>
+      <w:r>
+        <w:t>Debajo se listan los planes disponibles con lo que incluye cada uno, tomado del propio plan y no de un texto fijo, de modo que un plan nuevo aparece sin tocar la pantalla. El plan contratado se señala y no ofrece acción. Solo se ofrece el botón de los planes más económicos: bajar de plan no implica cobro y lo ejecuta el propio negocio, mientras que subir se contrata con INVENTRA, que lo activa al confirmar el pago. La pantalla lo dice con esas palabras en lugar de ocultar el plan superior, porque el negocio necesita saber cómo se contrata.</w:t>
+      </w:r>
+    </w:p>
+    <w:p>
+      <w:pPr>
+        <w:spacing w:after="110" w:line="262" w:lineRule="auto"/>
+        <w:jc w:val="both"/>
+      </w:pPr>
+      <w:r>
+        <w:t>Antes de bajar de plan se pide confirmación, con el detalle de lo que se pierde. Si la licorera tiene más usuarios o más sedes de los que admite el plan de destino, el sistema rechaza el cambio y dice cuántos sobran, sin inactivar nada por su cuenta: esa decisión es del negocio.</w:t>
       </w:r>
     </w:p>
     <w:p>
@@ -11149,11 +11281,12 @@
         <w:rPr>
           <w:noProof/>
         </w:rPr>
+        <w:lastRenderedPageBreak/>
         <w:drawing>
-          <wp:inline distT="0" distB="0" distL="0" distR="0" wp14:anchorId="31E6F803" wp14:editId="04C54A8F">
-            <wp:extent cx="6096000" cy="2733675"/>
+          <wp:inline distT="0" distB="0" distL="0" distR="0" wp14:anchorId="019506B7" wp14:editId="4D2F4736">
+            <wp:extent cx="6096000" cy="3067050"/>
             <wp:effectExtent l="0" t="0" r="0" b="0"/>
-            <wp:docPr id="516045500" name="Imagen 516045500"/>
+            <wp:docPr id="839689717" name="Imagen 839689717"/>
             <wp:cNvGraphicFramePr>
               <a:graphicFrameLocks xmlns:a="http://schemas.openxmlformats.org/drawingml/2006/main" noChangeAspect="1"/>
             </wp:cNvGraphicFramePr>
@@ -11176,6 +11309,220 @@
                   <pic:spPr bwMode="auto">
                     <a:xfrm>
                       <a:off x="0" y="0"/>
+                      <a:ext cx="6096000" cy="3067050"/>
+                    </a:xfrm>
+                    <a:prstGeom prst="rect">
+                      <a:avLst/>
+                    </a:prstGeom>
+                  </pic:spPr>
+                </pic:pic>
+              </a:graphicData>
+            </a:graphic>
+          </wp:inline>
+        </w:drawing>
+      </w:r>
+    </w:p>
+    <w:p>
+      <w:pPr>
+        <w:spacing w:before="6" w:after="150"/>
+        <w:jc w:val="center"/>
+      </w:pPr>
+      <w:r>
+        <w:rPr>
+          <w:i/>
+          <w:iCs/>
+          <w:color w:val="5B6678"/>
+          <w:sz w:val="18"/>
+          <w:szCs w:val="18"/>
+        </w:rPr>
+        <w:t>Figura 20. Mi suscripción. Fuente: del autor.</w:t>
+      </w:r>
+    </w:p>
+    <w:p>
+      <w:pPr>
+        <w:pStyle w:val="Ttulo2"/>
+        <w:spacing w:before="150" w:after="80"/>
+      </w:pPr>
+      <w:bookmarkStart w:id="38" w:name="bm39"/>
+      <w:r>
+        <w:rPr>
+          <w:b/>
+          <w:bCs/>
+          <w:color w:val="2E5496"/>
+          <w:sz w:val="23"/>
+          <w:szCs w:val="23"/>
+        </w:rPr>
+        <w:t>8.12 Plataforma</w:t>
+      </w:r>
+      <w:bookmarkEnd w:id="38"/>
+    </w:p>
+    <w:p>
+      <w:pPr>
+        <w:spacing w:after="110" w:line="262" w:lineRule="auto"/>
+        <w:jc w:val="both"/>
+      </w:pPr>
+      <w:r>
+        <w:t>Es la pantalla del administrador de INVENTRA, no la de un negocio, y es la única que no pertenece a ninguna licorera. Reúne las tres cifras globales del servicio —licoreras registradas, cuentas con suscripción vigente e ingreso mensual contratado— y, debajo, el listado de las licoreras con su contacto, el plan, el estado de la suscripción, la fecha hasta la que vale y el número de cuentas que tiene abiertas.</w:t>
+      </w:r>
+    </w:p>
+    <w:p>
+      <w:pPr>
+        <w:spacing w:after="110" w:line="262" w:lineRule="auto"/>
+        <w:jc w:val="both"/>
+      </w:pPr>
+      <w:r>
+        <w:t>El listado no muestra ningún dato comercial de los negocios: ni sus productos, ni sus ventas, ni sus importes. La restricción es del requisito y está resuelta en el servidor, que sencillamente no devuelve esa información; la pantalla no tiene nada que ocultar porque nunca la recibe.</w:t>
+      </w:r>
+    </w:p>
+    <w:p>
+      <w:pPr>
+        <w:spacing w:after="110" w:line="262" w:lineRule="auto"/>
+        <w:jc w:val="both"/>
+      </w:pPr>
+      <w:r>
+        <w:t>Desde aquí se ejecutan las tres operaciones que le corresponden a quien cobra el servicio: dar de alta una licorera, que crea el negocio y la cuenta de su administrador y le envía el enlace para que defina su propia contraseña; abrir un período, que es la misma operación para renovar y para subir de plan, porque en los dos casos se cierra la suscripción anterior y se inicia otra con su fecha de vencimiento; y corregir la fecha de una suscripción vigente, prevista para enmendar una fecha mal escrita y no para renovar. Bajar de plan no aparece en esta pantalla: esa operación la ejecuta el propio negocio desde la suya, según se explica en el apartado anterior.</w:t>
+      </w:r>
+    </w:p>
+    <w:p>
+      <w:pPr>
+        <w:spacing w:after="110" w:line="262" w:lineRule="auto"/>
+        <w:jc w:val="both"/>
+      </w:pPr>
+      <w:r>
+        <w:t>La navegación lateral de este rol es distinta: no se le presentan los módulos de inventario, ventas o sedes, porque no administra un negocio sino el servicio.</w:t>
+      </w:r>
+    </w:p>
+    <w:p>
+      <w:pPr>
+        <w:spacing w:before="60" w:after="20"/>
+        <w:jc w:val="center"/>
+      </w:pPr>
+      <w:r>
+        <w:rPr>
+          <w:noProof/>
+        </w:rPr>
+        <w:lastRenderedPageBreak/>
+        <w:drawing>
+          <wp:inline distT="0" distB="0" distL="0" distR="0" wp14:anchorId="29CBCD51" wp14:editId="0A90748C">
+            <wp:extent cx="6096000" cy="4114800"/>
+            <wp:effectExtent l="0" t="0" r="0" b="0"/>
+            <wp:docPr id="554330017" name="Imagen 554330017"/>
+            <wp:cNvGraphicFramePr>
+              <a:graphicFrameLocks xmlns:a="http://schemas.openxmlformats.org/drawingml/2006/main" noChangeAspect="1"/>
+            </wp:cNvGraphicFramePr>
+            <a:graphic xmlns:a="http://schemas.openxmlformats.org/drawingml/2006/main">
+              <a:graphicData uri="http://schemas.openxmlformats.org/drawingml/2006/picture">
+                <pic:pic xmlns:pic="http://schemas.openxmlformats.org/drawingml/2006/picture">
+                  <pic:nvPicPr>
+                    <pic:cNvPr id="0" name=""/>
+                    <pic:cNvPicPr>
+                      <a:picLocks noChangeAspect="1" noChangeArrowheads="1"/>
+                    </pic:cNvPicPr>
+                  </pic:nvPicPr>
+                  <pic:blipFill>
+                    <a:blip r:embed="rId27"/>
+                    <a:srcRect/>
+                    <a:stretch>
+                      <a:fillRect/>
+                    </a:stretch>
+                  </pic:blipFill>
+                  <pic:spPr bwMode="auto">
+                    <a:xfrm>
+                      <a:off x="0" y="0"/>
+                      <a:ext cx="6096000" cy="4114800"/>
+                    </a:xfrm>
+                    <a:prstGeom prst="rect">
+                      <a:avLst/>
+                    </a:prstGeom>
+                  </pic:spPr>
+                </pic:pic>
+              </a:graphicData>
+            </a:graphic>
+          </wp:inline>
+        </w:drawing>
+      </w:r>
+    </w:p>
+    <w:p>
+      <w:pPr>
+        <w:spacing w:before="6" w:after="150"/>
+        <w:jc w:val="center"/>
+      </w:pPr>
+      <w:r>
+        <w:rPr>
+          <w:i/>
+          <w:iCs/>
+          <w:color w:val="5B6678"/>
+          <w:sz w:val="18"/>
+          <w:szCs w:val="18"/>
+        </w:rPr>
+        <w:t>Figura 21. Plataforma: licoreras registradas y sus suscripciones. Fuente: del autor.</w:t>
+      </w:r>
+    </w:p>
+    <w:p>
+      <w:pPr>
+        <w:pStyle w:val="Ttulo1"/>
+        <w:pageBreakBefore/>
+        <w:spacing w:before="220" w:after="110"/>
+      </w:pPr>
+      <w:bookmarkStart w:id="39" w:name="bm40"/>
+      <w:r>
+        <w:rPr>
+          <w:b/>
+          <w:bCs/>
+          <w:color w:val="1F3864"/>
+          <w:sz w:val="27"/>
+          <w:szCs w:val="27"/>
+        </w:rPr>
+        <w:lastRenderedPageBreak/>
+        <w:t>9. Mensajes y estados de pantalla</w:t>
+      </w:r>
+      <w:bookmarkEnd w:id="39"/>
+    </w:p>
+    <w:p>
+      <w:pPr>
+        <w:spacing w:after="110" w:line="262" w:lineRule="auto"/>
+        <w:jc w:val="both"/>
+      </w:pPr>
+      <w:r>
+        <w:t>Además de los componentes descritos en la sección 6, la interfaz define cómo se comporta una pantalla cuando no hay información que mostrar, cuando los datos aún se están cargando o cuando una operación falla. El objetivo es que el usuario siempre sepa qué ocurre y qué puede hacer a continuación.</w:t>
+      </w:r>
+    </w:p>
+    <w:p>
+      <w:pPr>
+        <w:spacing w:before="60" w:after="20"/>
+        <w:jc w:val="center"/>
+      </w:pPr>
+      <w:r>
+        <w:rPr>
+          <w:noProof/>
+        </w:rPr>
+        <w:drawing>
+          <wp:inline distT="0" distB="0" distL="0" distR="0" wp14:anchorId="62D3C359" wp14:editId="70FA18C7">
+            <wp:extent cx="6096000" cy="2733675"/>
+            <wp:effectExtent l="0" t="0" r="0" b="0"/>
+            <wp:docPr id="1500067853" name="Imagen 1500067853"/>
+            <wp:cNvGraphicFramePr>
+              <a:graphicFrameLocks xmlns:a="http://schemas.openxmlformats.org/drawingml/2006/main" noChangeAspect="1"/>
+            </wp:cNvGraphicFramePr>
+            <a:graphic xmlns:a="http://schemas.openxmlformats.org/drawingml/2006/main">
+              <a:graphicData uri="http://schemas.openxmlformats.org/drawingml/2006/picture">
+                <pic:pic xmlns:pic="http://schemas.openxmlformats.org/drawingml/2006/picture">
+                  <pic:nvPicPr>
+                    <pic:cNvPr id="0" name=""/>
+                    <pic:cNvPicPr>
+                      <a:picLocks noChangeAspect="1" noChangeArrowheads="1"/>
+                    </pic:cNvPicPr>
+                  </pic:nvPicPr>
+                  <pic:blipFill>
+                    <a:blip r:embed="rId28"/>
+                    <a:srcRect/>
+                    <a:stretch>
+                      <a:fillRect/>
+                    </a:stretch>
+                  </pic:blipFill>
+                  <pic:spPr bwMode="auto">
+                    <a:xfrm>
+                      <a:off x="0" y="0"/>
                       <a:ext cx="6096000" cy="2733675"/>
                     </a:xfrm>
                     <a:prstGeom prst="rect">
@@ -11202,7 +11549,7 @@
           <w:sz w:val="18"/>
           <w:szCs w:val="18"/>
         </w:rPr>
-        <w:t>Figura 20. Mensajes del sistema y estado vacío. Fuente: del autor.</w:t>
+        <w:t>Figura 22. Mensajes del sistema y estado vacío. Fuente: del autor.</w:t>
       </w:r>
     </w:p>
     <w:p>
@@ -11210,7 +11557,7 @@
         <w:pStyle w:val="Ttulo2"/>
         <w:spacing w:before="150" w:after="80"/>
       </w:pPr>
-      <w:bookmarkStart w:id="38" w:name="bm39"/>
+      <w:bookmarkStart w:id="40" w:name="bm41"/>
       <w:r>
         <w:rPr>
           <w:b/>
@@ -11221,7 +11568,7 @@
         </w:rPr>
         <w:t>9.1 Estados de una pantalla</w:t>
       </w:r>
-      <w:bookmarkEnd w:id="38"/>
+      <w:bookmarkEnd w:id="40"/>
     </w:p>
     <w:tbl>
       <w:tblPr>
@@ -11824,7 +12171,7 @@
         <w:pStyle w:val="Ttulo2"/>
         <w:spacing w:before="150" w:after="80"/>
       </w:pPr>
-      <w:bookmarkStart w:id="39" w:name="bm40"/>
+      <w:bookmarkStart w:id="41" w:name="bm42"/>
       <w:r>
         <w:rPr>
           <w:b/>
@@ -11835,7 +12182,7 @@
         </w:rPr>
         <w:t>9.2 Redacción de los mensajes</w:t>
       </w:r>
-      <w:bookmarkEnd w:id="39"/>
+      <w:bookmarkEnd w:id="41"/>
     </w:p>
     <w:p>
       <w:pPr>
@@ -11917,7 +12264,7 @@
         <w:pageBreakBefore/>
         <w:spacing w:before="220" w:after="110"/>
       </w:pPr>
-      <w:bookmarkStart w:id="40" w:name="bm41"/>
+      <w:bookmarkStart w:id="42" w:name="bm43"/>
       <w:r>
         <w:rPr>
           <w:b/>
@@ -11929,7 +12276,7 @@
         <w:lastRenderedPageBreak/>
         <w:t>10. Comportamiento responsivo y modo oscuro</w:t>
       </w:r>
-      <w:bookmarkEnd w:id="40"/>
+      <w:bookmarkEnd w:id="42"/>
     </w:p>
     <w:p>
       <w:pPr>
@@ -11945,7 +12292,7 @@
         <w:pStyle w:val="Ttulo2"/>
         <w:spacing w:before="150" w:after="80"/>
       </w:pPr>
-      <w:bookmarkStart w:id="41" w:name="bm42"/>
+      <w:bookmarkStart w:id="43" w:name="bm44"/>
       <w:r>
         <w:rPr>
           <w:b/>
@@ -11956,7 +12303,7 @@
         </w:rPr>
         <w:t>10.1 Versión móvil</w:t>
       </w:r>
-      <w:bookmarkEnd w:id="41"/>
+      <w:bookmarkEnd w:id="43"/>
     </w:p>
     <w:p>
       <w:pPr>
@@ -12016,10 +12363,10 @@
           <w:noProof/>
         </w:rPr>
         <w:drawing>
-          <wp:inline distT="0" distB="0" distL="0" distR="0" wp14:anchorId="1FC9FDA8" wp14:editId="2314E83B">
+          <wp:inline distT="0" distB="0" distL="0" distR="0" wp14:anchorId="45957644" wp14:editId="11E6DECE">
             <wp:extent cx="6096000" cy="3295650"/>
             <wp:effectExtent l="0" t="0" r="0" b="0"/>
-            <wp:docPr id="1007538449" name="Imagen 1007538449"/>
+            <wp:docPr id="563585081" name="Imagen 563585081"/>
             <wp:cNvGraphicFramePr>
               <a:graphicFrameLocks xmlns:a="http://schemas.openxmlformats.org/drawingml/2006/main" noChangeAspect="1"/>
             </wp:cNvGraphicFramePr>
@@ -12033,7 +12380,7 @@
                     </pic:cNvPicPr>
                   </pic:nvPicPr>
                   <pic:blipFill>
-                    <a:blip r:embed="rId27"/>
+                    <a:blip r:embed="rId29"/>
                     <a:srcRect/>
                     <a:stretch>
                       <a:fillRect/>
@@ -12068,7 +12415,7 @@
           <w:sz w:val="18"/>
           <w:szCs w:val="18"/>
         </w:rPr>
-        <w:t>Figura 21. Versión móvil: inicio de sesión, panel y punto de venta. Fuente: del autor.</w:t>
+        <w:t>Figura 23. Versión móvil: inicio de sesión, panel y punto de venta. Fuente: del autor.</w:t>
       </w:r>
     </w:p>
     <w:p>
@@ -12076,7 +12423,7 @@
         <w:pStyle w:val="Ttulo2"/>
         <w:spacing w:before="150" w:after="80"/>
       </w:pPr>
-      <w:bookmarkStart w:id="42" w:name="bm43"/>
+      <w:bookmarkStart w:id="44" w:name="bm45"/>
       <w:r>
         <w:rPr>
           <w:b/>
@@ -12087,7 +12434,7 @@
         </w:rPr>
         <w:t>10.2 Tablet y escritorio</w:t>
       </w:r>
-      <w:bookmarkEnd w:id="42"/>
+      <w:bookmarkEnd w:id="44"/>
     </w:p>
     <w:p>
       <w:pPr>
@@ -12103,7 +12450,7 @@
         <w:pStyle w:val="Ttulo2"/>
         <w:spacing w:before="150" w:after="80"/>
       </w:pPr>
-      <w:bookmarkStart w:id="43" w:name="bm44"/>
+      <w:bookmarkStart w:id="45" w:name="bm46"/>
       <w:r>
         <w:rPr>
           <w:b/>
@@ -12114,7 +12461,7 @@
         </w:rPr>
         <w:t>10.3 Modo oscuro</w:t>
       </w:r>
-      <w:bookmarkEnd w:id="43"/>
+      <w:bookmarkEnd w:id="45"/>
     </w:p>
     <w:p>
       <w:pPr>
@@ -12136,10 +12483,10 @@
         </w:rPr>
         <w:lastRenderedPageBreak/>
         <w:drawing>
-          <wp:inline distT="0" distB="0" distL="0" distR="0" wp14:anchorId="741DDCDF" wp14:editId="38AF551E">
+          <wp:inline distT="0" distB="0" distL="0" distR="0" wp14:anchorId="60FE3EFB" wp14:editId="14C2FB3A">
             <wp:extent cx="6096000" cy="3067050"/>
             <wp:effectExtent l="0" t="0" r="0" b="0"/>
-            <wp:docPr id="982208206" name="Imagen 982208206"/>
+            <wp:docPr id="1049693819" name="Imagen 1049693819"/>
             <wp:cNvGraphicFramePr>
               <a:graphicFrameLocks xmlns:a="http://schemas.openxmlformats.org/drawingml/2006/main" noChangeAspect="1"/>
             </wp:cNvGraphicFramePr>
@@ -12153,7 +12500,7 @@
                     </pic:cNvPicPr>
                   </pic:nvPicPr>
                   <pic:blipFill>
-                    <a:blip r:embed="rId28"/>
+                    <a:blip r:embed="rId30"/>
                     <a:srcRect/>
                     <a:stretch>
                       <a:fillRect/>
@@ -12188,7 +12535,7 @@
           <w:sz w:val="18"/>
           <w:szCs w:val="18"/>
         </w:rPr>
-        <w:t>Figura 22. Panel principal en modo oscuro. Fuente: del autor.</w:t>
+        <w:t>Figura 24. Panel principal en modo oscuro. Fuente: del autor.</w:t>
       </w:r>
     </w:p>
     <w:p>
@@ -12197,7 +12544,7 @@
         <w:pageBreakBefore/>
         <w:spacing w:before="220" w:after="110"/>
       </w:pPr>
-      <w:bookmarkStart w:id="44" w:name="bm45"/>
+      <w:bookmarkStart w:id="46" w:name="bm47"/>
       <w:r>
         <w:rPr>
           <w:b/>
@@ -12209,7 +12556,7 @@
         <w:lastRenderedPageBreak/>
         <w:t>11. Conclusión</w:t>
       </w:r>
-      <w:bookmarkEnd w:id="44"/>
+      <w:bookmarkEnd w:id="46"/>
     </w:p>
     <w:p>
       <w:pPr>
@@ -12235,7 +12582,7 @@
         <w:pageBreakBefore/>
         <w:spacing w:before="220" w:after="110"/>
       </w:pPr>
-      <w:bookmarkStart w:id="45" w:name="bm46"/>
+      <w:bookmarkStart w:id="47" w:name="bm48"/>
       <w:r>
         <w:rPr>
           <w:b/>
@@ -12247,7 +12594,7 @@
         <w:lastRenderedPageBreak/>
         <w:t>12. Glosario</w:t>
       </w:r>
-      <w:bookmarkEnd w:id="45"/>
+      <w:bookmarkEnd w:id="47"/>
     </w:p>
     <w:tbl>
       <w:tblPr>
@@ -13071,7 +13418,7 @@
         <w:pageBreakBefore/>
         <w:spacing w:before="220" w:after="110"/>
       </w:pPr>
-      <w:bookmarkStart w:id="46" w:name="bm47"/>
+      <w:bookmarkStart w:id="48" w:name="bm49"/>
       <w:r>
         <w:rPr>
           <w:b/>
@@ -13083,7 +13430,7 @@
         <w:lastRenderedPageBreak/>
         <w:t>13. Referencias</w:t>
       </w:r>
-      <w:bookmarkEnd w:id="46"/>
+      <w:bookmarkEnd w:id="48"/>
     </w:p>
     <w:p>
       <w:pPr>
@@ -13165,7 +13512,13 @@
         <w:spacing w:after="60" w:line="258" w:lineRule="auto"/>
       </w:pPr>
       <w:r>
-        <w:t>World Wide Web Consortium. Web Content Accessibility Guidelines (WCAG) 2.1. W3C, 2018.</w:t>
+        <w:rPr>
+          <w:lang w:val="en-US"/>
+        </w:rPr>
+        <w:t xml:space="preserve">World Wide Web Consortium. Web Content Accessibility Guidelines (WCAG) 2.1. </w:t>
+      </w:r>
+      <w:r>
+        <w:t>W3C, 2018.</w:t>
       </w:r>
     </w:p>
     <w:p>
@@ -13208,7 +13561,7 @@
       </w:r>
     </w:p>
     <w:sectPr>
-      <w:footerReference w:type="default" r:id="rId29"/>
+      <w:footerReference w:type="default" r:id="rId31"/>
       <w:pgSz w:w="12240" w:h="15840"/>
       <w:pgMar w:top="1080" w:right="1000" w:bottom="1080" w:left="1000" w:header="708" w:footer="708" w:gutter="0"/>
       <w:cols w:space="720"/>
@@ -13305,10 +13658,10 @@
 <file path=word/numbering.xml><?xml version="1.0" encoding="utf-8"?>
 <w:numbering xmlns:wpc="http://schemas.microsoft.com/office/word/2010/wordprocessingCanvas" xmlns:cx="http://schemas.microsoft.com/office/drawing/2014/chartex" xmlns:cx1="http://schemas.microsoft.com/office/drawing/2015/9/8/chartex" xmlns:cx2="http://schemas.microsoft.com/office/drawing/2015/10/21/chartex" xmlns:cx3="http://schemas.microsoft.com/office/drawing/2016/5/9/chartex" xmlns:cx4="http://schemas.microsoft.com/office/drawing/2016/5/10/chartex" xmlns:cx5="http://schemas.microsoft.com/office/drawing/2016/5/11/chartex" xmlns:cx6="http://schemas.microsoft.com/office/drawing/2016/5/12/chartex" xmlns:cx7="http://schemas.microsoft.com/office/drawing/2016/5/13/chartex" xmlns:cx8="http://schemas.microsoft.com/office/drawing/2016/5/14/chartex" xmlns:mc="http://schemas.openxmlformats.org/markup-compatibility/2006" xmlns:aink="http://schemas.microsoft.com/office/drawing/2016/ink" xmlns:am3d="http://schemas.microsoft.com/office/drawing/2017/model3d" xmlns:o="urn:schemas-microsoft-com:office:office" xmlns:oel="http://schemas.microsoft.com/office/2019/extlst" xmlns:r="http://schemas.openxmlformats.org/officeDocument/2006/relationships" xmlns:m="http://schemas.openxmlformats.org/officeDocument/2006/math" xmlns:v="urn:schemas-microsoft-com:vml" xmlns:wp14="http://schemas.microsoft.com/office/word/2010/wordprocessingDrawing" xmlns:wp="http://schemas.openxmlformats.org/drawingml/2006/wordprocessingDrawing" xmlns:w10="urn:schemas-microsoft-com:office:word" xmlns:w="http://schemas.openxmlformats.org/wordprocessingml/2006/main" xmlns:w14="http://schemas.microsoft.com/office/word/2010/wordml" xmlns:w15="http://schemas.microsoft.com/office/word/2012/wordml" xmlns:w16cex="http://schemas.microsoft.com/office/word/2018/wordml/cex" xmlns:w16cid="http://schemas.microsoft.com/office/word/2016/wordml/cid" xmlns:w16="http://schemas.microsoft.com/office/word/2018/wordml" xmlns:w16du="http://schemas.microsoft.com/office/word/2023/wordml/word16du" xmlns:w16sdtdh="http://schemas.microsoft.com/office/word/2020/wordml/sdtdatahash" xmlns:w16sdtfl="http://schemas.microsoft.com/office/word/2024/wordml/sdtformatlock" xmlns:w16se="http://schemas.microsoft.com/office/word/2015/wordml/symex" xmlns:wpg="http://schemas.microsoft.com/office/word/2010/wordprocessingGroup" xmlns:wpi="http://schemas.microsoft.com/office/word/2010/wordprocessingInk" xmlns:wne="http://schemas.microsoft.com/office/word/2006/wordml" xmlns:wps="http://schemas.microsoft.com/office/word/2010/wordprocessingShape" mc:Ignorable="w14 w15 w16se w16cid w16 w16cex w16sdtdh w16sdtfl w16du wp14">
   <w:abstractNum w:abstractNumId="0" w15:restartNumberingAfterBreak="0">
-    <w:nsid w:val="7E857986"/>
+    <w:nsid w:val="25A32964"/>
     <w:multiLevelType w:val="hybridMultilevel"/>
-    <w:tmpl w:val="21DC43C6"/>
-    <w:lvl w:ilvl="0" w:tplc="6D0E0DBA">
+    <w:tmpl w:val="7730F28A"/>
+    <w:lvl w:ilvl="0" w:tplc="6302B90A">
       <w:start w:val="1"/>
       <w:numFmt w:val="bullet"/>
       <w:lvlText w:val="●"/>
@@ -13317,7 +13670,7 @@
         <w:ind w:left="720" w:hanging="360"/>
       </w:pPr>
     </w:lvl>
-    <w:lvl w:ilvl="1" w:tplc="1AAA34B8">
+    <w:lvl w:ilvl="1" w:tplc="58FAD350">
       <w:start w:val="1"/>
       <w:numFmt w:val="bullet"/>
       <w:lvlText w:val="○"/>
@@ -13326,7 +13679,7 @@
         <w:ind w:left="1440" w:hanging="360"/>
       </w:pPr>
     </w:lvl>
-    <w:lvl w:ilvl="2" w:tplc="EADC8992">
+    <w:lvl w:ilvl="2" w:tplc="3440F48E">
       <w:start w:val="1"/>
       <w:numFmt w:val="bullet"/>
       <w:lvlText w:val="■"/>
@@ -13335,7 +13688,7 @@
         <w:ind w:left="2160" w:hanging="360"/>
       </w:pPr>
     </w:lvl>
-    <w:lvl w:ilvl="3" w:tplc="390257B8">
+    <w:lvl w:ilvl="3" w:tplc="969A128A">
       <w:start w:val="1"/>
       <w:numFmt w:val="bullet"/>
       <w:lvlText w:val="●"/>
@@ -13344,7 +13697,7 @@
         <w:ind w:left="2880" w:hanging="360"/>
       </w:pPr>
     </w:lvl>
-    <w:lvl w:ilvl="4" w:tplc="9CA4D1B2">
+    <w:lvl w:ilvl="4" w:tplc="BE3A35E6">
       <w:start w:val="1"/>
       <w:numFmt w:val="bullet"/>
       <w:lvlText w:val="○"/>
@@ -13353,7 +13706,7 @@
         <w:ind w:left="3600" w:hanging="360"/>
       </w:pPr>
     </w:lvl>
-    <w:lvl w:ilvl="5" w:tplc="42726310">
+    <w:lvl w:ilvl="5" w:tplc="1F6E1986">
       <w:start w:val="1"/>
       <w:numFmt w:val="bullet"/>
       <w:lvlText w:val="■"/>
@@ -13362,7 +13715,7 @@
         <w:ind w:left="4320" w:hanging="360"/>
       </w:pPr>
     </w:lvl>
-    <w:lvl w:ilvl="6" w:tplc="F7A05EE8">
+    <w:lvl w:ilvl="6" w:tplc="752C9502">
       <w:start w:val="1"/>
       <w:numFmt w:val="bullet"/>
       <w:lvlText w:val="●"/>
@@ -13371,7 +13724,7 @@
         <w:ind w:left="5040" w:hanging="360"/>
       </w:pPr>
     </w:lvl>
-    <w:lvl w:ilvl="7" w:tplc="7CD0D4F4">
+    <w:lvl w:ilvl="7" w:tplc="E814D712">
       <w:start w:val="1"/>
       <w:numFmt w:val="bullet"/>
       <w:lvlText w:val="●"/>
@@ -13380,7 +13733,7 @@
         <w:ind w:left="5760" w:hanging="360"/>
       </w:pPr>
     </w:lvl>
-    <w:lvl w:ilvl="8" w:tplc="40C8A454">
+    <w:lvl w:ilvl="8" w:tplc="841E102A">
       <w:start w:val="1"/>
       <w:numFmt w:val="bullet"/>
       <w:lvlText w:val="●"/>
@@ -13390,7 +13743,7 @@
       </w:pPr>
     </w:lvl>
   </w:abstractNum>
-  <w:num w:numId="1" w16cid:durableId="1006008871">
+  <w:num w:numId="1" w16cid:durableId="1259752526">
     <w:abstractNumId w:val="0"/>
     <w:lvlOverride w:ilvl="0">
       <w:startOverride w:val="1"/>

</xml_diff>

<commit_message>
Sugiero el precio de venta a partir del margen de la categoria. El costo que se usa es el promedio de las existencias y no el de la ultima compra: un lote de oferta de pocas unidades no representa lo que costo el inventario.
</commit_message>
<xml_diff>
--- a/docs/diseno/INVENTRA_Documento_Tecnico_Diseno.docx
+++ b/docs/diseno/INVENTRA_Documento_Tecnico_Diseno.docx
@@ -2980,7 +2980,7 @@
           <w:noProof/>
         </w:rPr>
         <w:drawing>
-          <wp:inline distT="0" distB="0" distL="0" distR="0" wp14:anchorId="3174713B" wp14:editId="5B28AD1D">
+          <wp:inline distT="0" distB="0" distL="0" distR="0" wp14:anchorId="15BF4F90" wp14:editId="675C1336">
             <wp:extent cx="5905500" cy="2324100"/>
             <wp:effectExtent l="0" t="0" r="0" b="0"/>
             <wp:docPr id="1" name="Imagen 1"/>
@@ -3063,10 +3063,10 @@
           <w:noProof/>
         </w:rPr>
         <w:drawing>
-          <wp:inline distT="0" distB="0" distL="0" distR="0" wp14:anchorId="428612B8" wp14:editId="2C88E6E0">
+          <wp:inline distT="0" distB="0" distL="0" distR="0" wp14:anchorId="5259FEE5" wp14:editId="61946FD4">
             <wp:extent cx="5334000" cy="2371725"/>
             <wp:effectExtent l="0" t="0" r="0" b="0"/>
-            <wp:docPr id="1958213157" name="Imagen 1958213157"/>
+            <wp:docPr id="265376083" name="Imagen 265376083"/>
             <wp:cNvGraphicFramePr>
               <a:graphicFrameLocks xmlns:a="http://schemas.openxmlformats.org/drawingml/2006/main" noChangeAspect="1"/>
             </wp:cNvGraphicFramePr>
@@ -7977,10 +7977,10 @@
         </w:rPr>
         <w:lastRenderedPageBreak/>
         <w:drawing>
-          <wp:inline distT="0" distB="0" distL="0" distR="0" wp14:anchorId="1B0DE489" wp14:editId="7F052858">
+          <wp:inline distT="0" distB="0" distL="0" distR="0" wp14:anchorId="169313A6" wp14:editId="236595E8">
             <wp:extent cx="5905500" cy="2419350"/>
             <wp:effectExtent l="0" t="0" r="0" b="0"/>
-            <wp:docPr id="954330597" name="Imagen 954330597"/>
+            <wp:docPr id="486162528" name="Imagen 486162528"/>
             <wp:cNvGraphicFramePr>
               <a:graphicFrameLocks xmlns:a="http://schemas.openxmlformats.org/drawingml/2006/main" noChangeAspect="1"/>
             </wp:cNvGraphicFramePr>
@@ -8130,10 +8130,10 @@
           <w:noProof/>
         </w:rPr>
         <w:drawing>
-          <wp:inline distT="0" distB="0" distL="0" distR="0" wp14:anchorId="03E9AA3D" wp14:editId="363499C9">
+          <wp:inline distT="0" distB="0" distL="0" distR="0" wp14:anchorId="0B34AD84" wp14:editId="7EF15852">
             <wp:extent cx="5905500" cy="2257425"/>
             <wp:effectExtent l="0" t="0" r="0" b="0"/>
-            <wp:docPr id="1196260665" name="Imagen 1196260665"/>
+            <wp:docPr id="89108825" name="Imagen 89108825"/>
             <wp:cNvGraphicFramePr>
               <a:graphicFrameLocks xmlns:a="http://schemas.openxmlformats.org/drawingml/2006/main" noChangeAspect="1"/>
             </wp:cNvGraphicFramePr>
@@ -8757,10 +8757,10 @@
           <w:noProof/>
         </w:rPr>
         <w:drawing>
-          <wp:inline distT="0" distB="0" distL="0" distR="0" wp14:anchorId="1AFC93A1" wp14:editId="66B858A2">
+          <wp:inline distT="0" distB="0" distL="0" distR="0" wp14:anchorId="0BD64AE9" wp14:editId="37048FB5">
             <wp:extent cx="5334000" cy="3381375"/>
             <wp:effectExtent l="0" t="0" r="0" b="0"/>
-            <wp:docPr id="606399100" name="Imagen 606399100"/>
+            <wp:docPr id="1061041052" name="Imagen 1061041052"/>
             <wp:cNvGraphicFramePr>
               <a:graphicFrameLocks xmlns:a="http://schemas.openxmlformats.org/drawingml/2006/main" noChangeAspect="1"/>
             </wp:cNvGraphicFramePr>
@@ -8910,10 +8910,10 @@
           <w:noProof/>
         </w:rPr>
         <w:drawing>
-          <wp:inline distT="0" distB="0" distL="0" distR="0" wp14:anchorId="492D3430" wp14:editId="66380082">
+          <wp:inline distT="0" distB="0" distL="0" distR="0" wp14:anchorId="4509DC09" wp14:editId="264B1179">
             <wp:extent cx="6096000" cy="1676400"/>
             <wp:effectExtent l="0" t="0" r="0" b="0"/>
-            <wp:docPr id="1855307052" name="Imagen 1855307052"/>
+            <wp:docPr id="201037628" name="Imagen 201037628"/>
             <wp:cNvGraphicFramePr>
               <a:graphicFrameLocks xmlns:a="http://schemas.openxmlformats.org/drawingml/2006/main" noChangeAspect="1"/>
             </wp:cNvGraphicFramePr>
@@ -9002,10 +9002,10 @@
           <w:noProof/>
         </w:rPr>
         <w:drawing>
-          <wp:inline distT="0" distB="0" distL="0" distR="0" wp14:anchorId="0D786AB9" wp14:editId="5FA2F979">
+          <wp:inline distT="0" distB="0" distL="0" distR="0" wp14:anchorId="28EA1E62" wp14:editId="389C5DC2">
             <wp:extent cx="4762500" cy="2447925"/>
             <wp:effectExtent l="0" t="0" r="0" b="0"/>
-            <wp:docPr id="445793801" name="Imagen 445793801"/>
+            <wp:docPr id="1043696357" name="Imagen 1043696357"/>
             <wp:cNvGraphicFramePr>
               <a:graphicFrameLocks xmlns:a="http://schemas.openxmlformats.org/drawingml/2006/main" noChangeAspect="1"/>
             </wp:cNvGraphicFramePr>
@@ -9132,10 +9132,10 @@
           <w:noProof/>
         </w:rPr>
         <w:drawing>
-          <wp:inline distT="0" distB="0" distL="0" distR="0" wp14:anchorId="0A496EA0" wp14:editId="3E25B788">
+          <wp:inline distT="0" distB="0" distL="0" distR="0" wp14:anchorId="61C5B23E" wp14:editId="7853DB66">
             <wp:extent cx="6096000" cy="3048000"/>
             <wp:effectExtent l="0" t="0" r="0" b="0"/>
-            <wp:docPr id="297506673" name="Imagen 297506673"/>
+            <wp:docPr id="1531779728" name="Imagen 1531779728"/>
             <wp:cNvGraphicFramePr>
               <a:graphicFrameLocks xmlns:a="http://schemas.openxmlformats.org/drawingml/2006/main" noChangeAspect="1"/>
             </wp:cNvGraphicFramePr>
@@ -9277,10 +9277,10 @@
         </w:rPr>
         <w:lastRenderedPageBreak/>
         <w:drawing>
-          <wp:inline distT="0" distB="0" distL="0" distR="0" wp14:anchorId="47FEBA37" wp14:editId="123AB9B5">
+          <wp:inline distT="0" distB="0" distL="0" distR="0" wp14:anchorId="4414C0F4" wp14:editId="6B3B35DE">
             <wp:extent cx="6096000" cy="3848100"/>
             <wp:effectExtent l="0" t="0" r="0" b="0"/>
-            <wp:docPr id="217293475" name="Imagen 217293475"/>
+            <wp:docPr id="1039382667" name="Imagen 1039382667"/>
             <wp:cNvGraphicFramePr>
               <a:graphicFrameLocks xmlns:a="http://schemas.openxmlformats.org/drawingml/2006/main" noChangeAspect="1"/>
             </wp:cNvGraphicFramePr>
@@ -10162,10 +10162,10 @@
           <w:noProof/>
         </w:rPr>
         <w:drawing>
-          <wp:inline distT="0" distB="0" distL="0" distR="0" wp14:anchorId="71F3138B" wp14:editId="15419D95">
+          <wp:inline distT="0" distB="0" distL="0" distR="0" wp14:anchorId="598E6EB2" wp14:editId="483995FB">
             <wp:extent cx="6096000" cy="3000375"/>
             <wp:effectExtent l="0" t="0" r="0" b="0"/>
-            <wp:docPr id="1360959545" name="Imagen 1360959545"/>
+            <wp:docPr id="223904153" name="Imagen 223904153"/>
             <wp:cNvGraphicFramePr>
               <a:graphicFrameLocks xmlns:a="http://schemas.openxmlformats.org/drawingml/2006/main" noChangeAspect="1"/>
             </wp:cNvGraphicFramePr>
@@ -10303,10 +10303,10 @@
         </w:rPr>
         <w:lastRenderedPageBreak/>
         <w:drawing>
-          <wp:inline distT="0" distB="0" distL="0" distR="0" wp14:anchorId="114707C4" wp14:editId="6D01AB3D">
+          <wp:inline distT="0" distB="0" distL="0" distR="0" wp14:anchorId="643B8690" wp14:editId="5AA62DFC">
             <wp:extent cx="6096000" cy="2857500"/>
             <wp:effectExtent l="0" t="0" r="0" b="0"/>
-            <wp:docPr id="1441598176" name="Imagen 1441598176"/>
+            <wp:docPr id="206353330" name="Imagen 206353330"/>
             <wp:cNvGraphicFramePr>
               <a:graphicFrameLocks xmlns:a="http://schemas.openxmlformats.org/drawingml/2006/main" noChangeAspect="1"/>
             </wp:cNvGraphicFramePr>
@@ -10391,7 +10391,7 @@
         <w:jc w:val="both"/>
       </w:pPr>
       <w:r>
-        <w:t>La tabla presenta el producto, su categoría, el precio de venta, las existencias y la etiqueta de estado. Las acciones de cada fila son consultar sus movimientos, editar y, según el estado, descontinuar o reactivar. La acción principal de la pantalla, situada en la barra superior, es el registro de un producto nuevo, junto al acceso a la entrada de mercancía.</w:t>
+        <w:t>La tabla presenta el producto, su categoría, el precio de venta, las existencias y la etiqueta de estado. Las acciones de cada fila son consultar sus movimientos, editar y, según el estado, descontinuar o reactivar. La acción principal de la pantalla, situada en la barra superior, es el registro de un producto nuevo, junto al acceso a la entrada de mercancía y a los márgenes de las categorías.</w:t>
       </w:r>
     </w:p>
     <w:p>
@@ -10432,10 +10432,10 @@
         </w:rPr>
         <w:lastRenderedPageBreak/>
         <w:drawing>
-          <wp:inline distT="0" distB="0" distL="0" distR="0" wp14:anchorId="74133679" wp14:editId="201DAEC7">
+          <wp:inline distT="0" distB="0" distL="0" distR="0" wp14:anchorId="343EF710" wp14:editId="6E98E478">
             <wp:extent cx="6096000" cy="2857500"/>
             <wp:effectExtent l="0" t="0" r="0" b="0"/>
-            <wp:docPr id="2063194622" name="Imagen 2063194622"/>
+            <wp:docPr id="1733680609" name="Imagen 1733680609"/>
             <wp:cNvGraphicFramePr>
               <a:graphicFrameLocks xmlns:a="http://schemas.openxmlformats.org/drawingml/2006/main" noChangeAspect="1"/>
             </wp:cNvGraphicFramePr>
@@ -10511,7 +10511,47 @@
         <w:jc w:val="both"/>
       </w:pPr>
       <w:r>
-        <w:t>El mismo formulario se emplea para crear y para editar. Agrupa los datos de identificación del producto (nombre, categoría, presentación y código de barras) y los datos comerciales (precio de venta y mínimo de existencias para la alerta); las existencias no se capturan aquí, sino que ingresan como lote con su costo unitario, y el formulario lo advierte bajo los campos comerciales para que su ausencia no se lea como un olvido. La categoría y la presentación se eligen de listas cerradas, definidas en el modelo de datos, y no se escriben a mano: de ello depende que el catálogo se pueda filtrar y agrupar. El precio de venta se registra de forma independiente del costo: el sistema puede sugerirlo a partir del margen, pero nunca lo modifica de manera automática.</w:t>
+        <w:t>El mismo formulario se emplea para crear y para editar. Agrupa los datos de identificación del producto (nombre, categoría, presentación y código de barras) y los datos comerciales (precio de venta y mínimo de existencias para la alerta); las existencias no se capturan aquí, sino que ingresan como lote con su costo unitario, y el formulario lo advierte bajo los campos comerciales para que su ausencia no se lea como un olvido. La categoría y la presentación se eligen de listas cerradas, definidas en el modelo de datos, y no se escriben a mano: de ello depende que el catálogo se pueda filtrar y agrupar. El precio de venta se registra de forma independiente del costo.</w:t>
+      </w:r>
+    </w:p>
+    <w:p>
+      <w:pPr>
+        <w:spacing w:after="110" w:line="262" w:lineRule="auto"/>
+        <w:jc w:val="both"/>
+      </w:pPr>
+      <w:r>
+        <w:t>Sobre el precio, el formulario muestra la propuesta del sistema: cuántas unidades hay en existencia y lo que costó cada una en promedio, el margen de la categoría y el precio que resulta de aplicarlo, con una acción para tomarlo. El costo que se usa es el promedio ponderado de los lotes que siguen en bodega, no el de la última compra: una compra de oferta por unas pocas unidades no representa lo que costó el inventario, y proponer sobre ella llevaría a vender por debajo de costo todo lo comprado antes. El promedio es además la única base con la que un precio único deja el margen pedido sobre el conjunto de las existencias. Cuando no quedan unidades se propone sobre la última compra, que es lo único que se sabe, y la pantalla lo dice.</w:t>
+      </w:r>
+    </w:p>
+    <w:p>
+      <w:pPr>
+        <w:spacing w:after="110" w:line="262" w:lineRule="auto"/>
+        <w:jc w:val="both"/>
+      </w:pPr>
+      <w:r>
+        <w:t>Un promedio reparte, y esa parte no puede quedar escondida. Si los lotes no costaron lo mismo, la propuesta muestra también el más barato y el más caro, y el formulario advierte cuando el precio escrito no cubre el costo de alguno de ellos, diciendo cuántas unidades quedan por encima: el margen se cumple sobre el conjunto, pero solo si se venden todas. La propuesta se calcula en el servidor y se redondea a la centena superior, porque un precio con unidades sueltas no se cobra; se sube y no se baja, ya que redondear hacia abajo recortaría el margen que se acaba de pedir. Una referencia sin ninguna compra registrada no tiene propuesta: sin costo no hay nada sobre lo que aplicar un porcentaje.</w:t>
+      </w:r>
+    </w:p>
+    <w:p>
+      <w:pPr>
+        <w:spacing w:after="110" w:line="262" w:lineRule="auto"/>
+        <w:jc w:val="both"/>
+      </w:pPr>
+      <w:r>
+        <w:t>El sistema propone y no aplica, y esa es la regla del requisito (RF-INV-11). Una compra más cara no mueve el precio de venta de la referencia: repreciar solo rompería sin avisar una promoción, un precio acordado con el proveedor o un artículo que se vende casi a costo para atraer clientes. Lo que sí hace el formulario es advertir cuando el precio escrito queda por debajo de lo que costó la mercancía, sin impedir que se guarde, porque una liquidación es una decisión del negocio.</w:t>
+      </w:r>
+    </w:p>
+    <w:p>
+      <w:pPr>
+        <w:spacing w:after="110" w:line="262" w:lineRule="auto"/>
+        <w:jc w:val="both"/>
+      </w:pPr>
+      <w:r>
+        <w:t xml:space="preserve">Los márgenes se definen por categoría y no producto a producto, que es como trabaja el comercio: una regla por familia y excepciones donde la regla no vale. Aquí la excepción es escribir el precio a mano. Se </w:t>
+      </w:r>
+      <w:r>
+        <w:lastRenderedPageBreak/>
+        <w:t>editan los seis juntos en una ventana que se abre desde la barra superior del catálogo, reservada a quien administra la licorera, y todas las categorías nacen con el mismo valor inicial, que el negocio ajusta.</w:t>
       </w:r>
     </w:p>
     <w:p>
@@ -10523,12 +10563,11 @@
         <w:rPr>
           <w:noProof/>
         </w:rPr>
-        <w:lastRenderedPageBreak/>
         <w:drawing>
-          <wp:inline distT="0" distB="0" distL="0" distR="0" wp14:anchorId="2DC6D4A5" wp14:editId="3FD89B4D">
+          <wp:inline distT="0" distB="0" distL="0" distR="0" wp14:anchorId="7A81D09E" wp14:editId="612D3582">
             <wp:extent cx="4953000" cy="4067175"/>
             <wp:effectExtent l="0" t="0" r="0" b="0"/>
-            <wp:docPr id="768996606" name="Imagen 768996606"/>
+            <wp:docPr id="880982533" name="Imagen 880982533"/>
             <wp:cNvGraphicFramePr>
               <a:graphicFrameLocks xmlns:a="http://schemas.openxmlformats.org/drawingml/2006/main" noChangeAspect="1"/>
             </wp:cNvGraphicFramePr>
@@ -10636,10 +10675,10 @@
         </w:rPr>
         <w:lastRenderedPageBreak/>
         <w:drawing>
-          <wp:inline distT="0" distB="0" distL="0" distR="0" wp14:anchorId="73CABF3F" wp14:editId="4417D1C4">
+          <wp:inline distT="0" distB="0" distL="0" distR="0" wp14:anchorId="1E6A9CA9" wp14:editId="7B08D077">
             <wp:extent cx="6096000" cy="4124325"/>
             <wp:effectExtent l="0" t="0" r="0" b="0"/>
-            <wp:docPr id="1497323834" name="Imagen 1497323834"/>
+            <wp:docPr id="895165765" name="Imagen 895165765"/>
             <wp:cNvGraphicFramePr>
               <a:graphicFrameLocks xmlns:a="http://schemas.openxmlformats.org/drawingml/2006/main" noChangeAspect="1"/>
             </wp:cNvGraphicFramePr>
@@ -10747,10 +10786,10 @@
         </w:rPr>
         <w:lastRenderedPageBreak/>
         <w:drawing>
-          <wp:inline distT="0" distB="0" distL="0" distR="0" wp14:anchorId="60D72C09" wp14:editId="39C13B53">
+          <wp:inline distT="0" distB="0" distL="0" distR="0" wp14:anchorId="1C32539A" wp14:editId="51BE03DA">
             <wp:extent cx="6096000" cy="4162425"/>
             <wp:effectExtent l="0" t="0" r="0" b="0"/>
-            <wp:docPr id="1048123329" name="Imagen 1048123329"/>
+            <wp:docPr id="506311028" name="Imagen 506311028"/>
             <wp:cNvGraphicFramePr>
               <a:graphicFrameLocks xmlns:a="http://schemas.openxmlformats.org/drawingml/2006/main" noChangeAspect="1"/>
             </wp:cNvGraphicFramePr>
@@ -10848,10 +10887,10 @@
           <w:noProof/>
         </w:rPr>
         <w:drawing>
-          <wp:inline distT="0" distB="0" distL="0" distR="0" wp14:anchorId="450DA1C3" wp14:editId="3703A20A">
+          <wp:inline distT="0" distB="0" distL="0" distR="0" wp14:anchorId="01A691EC" wp14:editId="6E38C866">
             <wp:extent cx="6096000" cy="2562225"/>
             <wp:effectExtent l="0" t="0" r="0" b="0"/>
-            <wp:docPr id="1353208267" name="Imagen 1353208267"/>
+            <wp:docPr id="1797674212" name="Imagen 1797674212"/>
             <wp:cNvGraphicFramePr>
               <a:graphicFrameLocks xmlns:a="http://schemas.openxmlformats.org/drawingml/2006/main" noChangeAspect="1"/>
             </wp:cNvGraphicFramePr>
@@ -10941,10 +10980,10 @@
           <w:noProof/>
         </w:rPr>
         <w:drawing>
-          <wp:inline distT="0" distB="0" distL="0" distR="0" wp14:anchorId="216C1833" wp14:editId="4AE929B4">
+          <wp:inline distT="0" distB="0" distL="0" distR="0" wp14:anchorId="136CDDB4" wp14:editId="52820FF1">
             <wp:extent cx="6096000" cy="2857500"/>
             <wp:effectExtent l="0" t="0" r="0" b="0"/>
-            <wp:docPr id="750768330" name="Imagen 750768330"/>
+            <wp:docPr id="704969167" name="Imagen 704969167"/>
             <wp:cNvGraphicFramePr>
               <a:graphicFrameLocks xmlns:a="http://schemas.openxmlformats.org/drawingml/2006/main" noChangeAspect="1"/>
             </wp:cNvGraphicFramePr>
@@ -11061,10 +11100,10 @@
         </w:rPr>
         <w:lastRenderedPageBreak/>
         <w:drawing>
-          <wp:inline distT="0" distB="0" distL="0" distR="0" wp14:anchorId="6DF1BBAD" wp14:editId="6DB9BB27">
+          <wp:inline distT="0" distB="0" distL="0" distR="0" wp14:anchorId="62AA6A50" wp14:editId="3EBD7021">
             <wp:extent cx="6096000" cy="2857500"/>
             <wp:effectExtent l="0" t="0" r="0" b="0"/>
-            <wp:docPr id="936383055" name="Imagen 936383055"/>
+            <wp:docPr id="1540477850" name="Imagen 1540477850"/>
             <wp:cNvGraphicFramePr>
               <a:graphicFrameLocks xmlns:a="http://schemas.openxmlformats.org/drawingml/2006/main" noChangeAspect="1"/>
             </wp:cNvGraphicFramePr>
@@ -11172,10 +11211,10 @@
         </w:rPr>
         <w:lastRenderedPageBreak/>
         <w:drawing>
-          <wp:inline distT="0" distB="0" distL="0" distR="0" wp14:anchorId="094DC92C" wp14:editId="082B5629">
+          <wp:inline distT="0" distB="0" distL="0" distR="0" wp14:anchorId="04837F81" wp14:editId="43BF1F5A">
             <wp:extent cx="6096000" cy="3562350"/>
             <wp:effectExtent l="0" t="0" r="0" b="0"/>
-            <wp:docPr id="357298746" name="Imagen 357298746"/>
+            <wp:docPr id="158425372" name="Imagen 158425372"/>
             <wp:cNvGraphicFramePr>
               <a:graphicFrameLocks xmlns:a="http://schemas.openxmlformats.org/drawingml/2006/main" noChangeAspect="1"/>
             </wp:cNvGraphicFramePr>
@@ -11283,10 +11322,10 @@
         </w:rPr>
         <w:lastRenderedPageBreak/>
         <w:drawing>
-          <wp:inline distT="0" distB="0" distL="0" distR="0" wp14:anchorId="019506B7" wp14:editId="4D2F4736">
+          <wp:inline distT="0" distB="0" distL="0" distR="0" wp14:anchorId="16228EF9" wp14:editId="46D3A0AD">
             <wp:extent cx="6096000" cy="3067050"/>
             <wp:effectExtent l="0" t="0" r="0" b="0"/>
-            <wp:docPr id="839689717" name="Imagen 839689717"/>
+            <wp:docPr id="1696405793" name="Imagen 1696405793"/>
             <wp:cNvGraphicFramePr>
               <a:graphicFrameLocks xmlns:a="http://schemas.openxmlformats.org/drawingml/2006/main" noChangeAspect="1"/>
             </wp:cNvGraphicFramePr>
@@ -11403,10 +11442,10 @@
         </w:rPr>
         <w:lastRenderedPageBreak/>
         <w:drawing>
-          <wp:inline distT="0" distB="0" distL="0" distR="0" wp14:anchorId="29CBCD51" wp14:editId="0A90748C">
+          <wp:inline distT="0" distB="0" distL="0" distR="0" wp14:anchorId="3FC7EBDB" wp14:editId="73B016AF">
             <wp:extent cx="6096000" cy="4114800"/>
             <wp:effectExtent l="0" t="0" r="0" b="0"/>
-            <wp:docPr id="554330017" name="Imagen 554330017"/>
+            <wp:docPr id="553963601" name="Imagen 553963601"/>
             <wp:cNvGraphicFramePr>
               <a:graphicFrameLocks xmlns:a="http://schemas.openxmlformats.org/drawingml/2006/main" noChangeAspect="1"/>
             </wp:cNvGraphicFramePr>
@@ -11497,10 +11536,10 @@
           <w:noProof/>
         </w:rPr>
         <w:drawing>
-          <wp:inline distT="0" distB="0" distL="0" distR="0" wp14:anchorId="62D3C359" wp14:editId="70FA18C7">
+          <wp:inline distT="0" distB="0" distL="0" distR="0" wp14:anchorId="45632784" wp14:editId="07EFDB2F">
             <wp:extent cx="6096000" cy="2733675"/>
             <wp:effectExtent l="0" t="0" r="0" b="0"/>
-            <wp:docPr id="1500067853" name="Imagen 1500067853"/>
+            <wp:docPr id="1666201648" name="Imagen 1666201648"/>
             <wp:cNvGraphicFramePr>
               <a:graphicFrameLocks xmlns:a="http://schemas.openxmlformats.org/drawingml/2006/main" noChangeAspect="1"/>
             </wp:cNvGraphicFramePr>
@@ -12363,10 +12402,10 @@
           <w:noProof/>
         </w:rPr>
         <w:drawing>
-          <wp:inline distT="0" distB="0" distL="0" distR="0" wp14:anchorId="45957644" wp14:editId="11E6DECE">
+          <wp:inline distT="0" distB="0" distL="0" distR="0" wp14:anchorId="17B84097" wp14:editId="1292A245">
             <wp:extent cx="6096000" cy="3295650"/>
             <wp:effectExtent l="0" t="0" r="0" b="0"/>
-            <wp:docPr id="563585081" name="Imagen 563585081"/>
+            <wp:docPr id="1971369181" name="Imagen 1971369181"/>
             <wp:cNvGraphicFramePr>
               <a:graphicFrameLocks xmlns:a="http://schemas.openxmlformats.org/drawingml/2006/main" noChangeAspect="1"/>
             </wp:cNvGraphicFramePr>
@@ -12483,10 +12522,10 @@
         </w:rPr>
         <w:lastRenderedPageBreak/>
         <w:drawing>
-          <wp:inline distT="0" distB="0" distL="0" distR="0" wp14:anchorId="60FE3EFB" wp14:editId="14C2FB3A">
+          <wp:inline distT="0" distB="0" distL="0" distR="0" wp14:anchorId="1E67FA80" wp14:editId="1601B447">
             <wp:extent cx="6096000" cy="3067050"/>
             <wp:effectExtent l="0" t="0" r="0" b="0"/>
-            <wp:docPr id="1049693819" name="Imagen 1049693819"/>
+            <wp:docPr id="838987930" name="Imagen 838987930"/>
             <wp:cNvGraphicFramePr>
               <a:graphicFrameLocks xmlns:a="http://schemas.openxmlformats.org/drawingml/2006/main" noChangeAspect="1"/>
             </wp:cNvGraphicFramePr>
@@ -13512,13 +13551,7 @@
         <w:spacing w:after="60" w:line="258" w:lineRule="auto"/>
       </w:pPr>
       <w:r>
-        <w:rPr>
-          <w:lang w:val="en-US"/>
-        </w:rPr>
-        <w:t xml:space="preserve">World Wide Web Consortium. Web Content Accessibility Guidelines (WCAG) 2.1. </w:t>
-      </w:r>
-      <w:r>
-        <w:t>W3C, 2018.</w:t>
+        <w:t>World Wide Web Consortium. Web Content Accessibility Guidelines (WCAG) 2.1. W3C, 2018.</w:t>
       </w:r>
     </w:p>
     <w:p>
@@ -13658,10 +13691,10 @@
 <file path=word/numbering.xml><?xml version="1.0" encoding="utf-8"?>
 <w:numbering xmlns:wpc="http://schemas.microsoft.com/office/word/2010/wordprocessingCanvas" xmlns:cx="http://schemas.microsoft.com/office/drawing/2014/chartex" xmlns:cx1="http://schemas.microsoft.com/office/drawing/2015/9/8/chartex" xmlns:cx2="http://schemas.microsoft.com/office/drawing/2015/10/21/chartex" xmlns:cx3="http://schemas.microsoft.com/office/drawing/2016/5/9/chartex" xmlns:cx4="http://schemas.microsoft.com/office/drawing/2016/5/10/chartex" xmlns:cx5="http://schemas.microsoft.com/office/drawing/2016/5/11/chartex" xmlns:cx6="http://schemas.microsoft.com/office/drawing/2016/5/12/chartex" xmlns:cx7="http://schemas.microsoft.com/office/drawing/2016/5/13/chartex" xmlns:cx8="http://schemas.microsoft.com/office/drawing/2016/5/14/chartex" xmlns:mc="http://schemas.openxmlformats.org/markup-compatibility/2006" xmlns:aink="http://schemas.microsoft.com/office/drawing/2016/ink" xmlns:am3d="http://schemas.microsoft.com/office/drawing/2017/model3d" xmlns:o="urn:schemas-microsoft-com:office:office" xmlns:oel="http://schemas.microsoft.com/office/2019/extlst" xmlns:r="http://schemas.openxmlformats.org/officeDocument/2006/relationships" xmlns:m="http://schemas.openxmlformats.org/officeDocument/2006/math" xmlns:v="urn:schemas-microsoft-com:vml" xmlns:wp14="http://schemas.microsoft.com/office/word/2010/wordprocessingDrawing" xmlns:wp="http://schemas.openxmlformats.org/drawingml/2006/wordprocessingDrawing" xmlns:w10="urn:schemas-microsoft-com:office:word" xmlns:w="http://schemas.openxmlformats.org/wordprocessingml/2006/main" xmlns:w14="http://schemas.microsoft.com/office/word/2010/wordml" xmlns:w15="http://schemas.microsoft.com/office/word/2012/wordml" xmlns:w16cex="http://schemas.microsoft.com/office/word/2018/wordml/cex" xmlns:w16cid="http://schemas.microsoft.com/office/word/2016/wordml/cid" xmlns:w16="http://schemas.microsoft.com/office/word/2018/wordml" xmlns:w16du="http://schemas.microsoft.com/office/word/2023/wordml/word16du" xmlns:w16sdtdh="http://schemas.microsoft.com/office/word/2020/wordml/sdtdatahash" xmlns:w16sdtfl="http://schemas.microsoft.com/office/word/2024/wordml/sdtformatlock" xmlns:w16se="http://schemas.microsoft.com/office/word/2015/wordml/symex" xmlns:wpg="http://schemas.microsoft.com/office/word/2010/wordprocessingGroup" xmlns:wpi="http://schemas.microsoft.com/office/word/2010/wordprocessingInk" xmlns:wne="http://schemas.microsoft.com/office/word/2006/wordml" xmlns:wps="http://schemas.microsoft.com/office/word/2010/wordprocessingShape" mc:Ignorable="w14 w15 w16se w16cid w16 w16cex w16sdtdh w16sdtfl w16du wp14">
   <w:abstractNum w:abstractNumId="0" w15:restartNumberingAfterBreak="0">
-    <w:nsid w:val="25A32964"/>
+    <w:nsid w:val="68BF3C8A"/>
     <w:multiLevelType w:val="hybridMultilevel"/>
-    <w:tmpl w:val="7730F28A"/>
-    <w:lvl w:ilvl="0" w:tplc="6302B90A">
+    <w:tmpl w:val="E924AB20"/>
+    <w:lvl w:ilvl="0" w:tplc="54465870">
       <w:start w:val="1"/>
       <w:numFmt w:val="bullet"/>
       <w:lvlText w:val="●"/>
@@ -13670,7 +13703,7 @@
         <w:ind w:left="720" w:hanging="360"/>
       </w:pPr>
     </w:lvl>
-    <w:lvl w:ilvl="1" w:tplc="58FAD350">
+    <w:lvl w:ilvl="1" w:tplc="30BE6F0C">
       <w:start w:val="1"/>
       <w:numFmt w:val="bullet"/>
       <w:lvlText w:val="○"/>
@@ -13679,7 +13712,7 @@
         <w:ind w:left="1440" w:hanging="360"/>
       </w:pPr>
     </w:lvl>
-    <w:lvl w:ilvl="2" w:tplc="3440F48E">
+    <w:lvl w:ilvl="2" w:tplc="AC468422">
       <w:start w:val="1"/>
       <w:numFmt w:val="bullet"/>
       <w:lvlText w:val="■"/>
@@ -13688,7 +13721,7 @@
         <w:ind w:left="2160" w:hanging="360"/>
       </w:pPr>
     </w:lvl>
-    <w:lvl w:ilvl="3" w:tplc="969A128A">
+    <w:lvl w:ilvl="3" w:tplc="8B4EC8D4">
       <w:start w:val="1"/>
       <w:numFmt w:val="bullet"/>
       <w:lvlText w:val="●"/>
@@ -13697,7 +13730,7 @@
         <w:ind w:left="2880" w:hanging="360"/>
       </w:pPr>
     </w:lvl>
-    <w:lvl w:ilvl="4" w:tplc="BE3A35E6">
+    <w:lvl w:ilvl="4" w:tplc="271EFF24">
       <w:start w:val="1"/>
       <w:numFmt w:val="bullet"/>
       <w:lvlText w:val="○"/>
@@ -13706,7 +13739,7 @@
         <w:ind w:left="3600" w:hanging="360"/>
       </w:pPr>
     </w:lvl>
-    <w:lvl w:ilvl="5" w:tplc="1F6E1986">
+    <w:lvl w:ilvl="5" w:tplc="B0E6DE14">
       <w:start w:val="1"/>
       <w:numFmt w:val="bullet"/>
       <w:lvlText w:val="■"/>
@@ -13715,7 +13748,7 @@
         <w:ind w:left="4320" w:hanging="360"/>
       </w:pPr>
     </w:lvl>
-    <w:lvl w:ilvl="6" w:tplc="752C9502">
+    <w:lvl w:ilvl="6" w:tplc="46AA6244">
       <w:start w:val="1"/>
       <w:numFmt w:val="bullet"/>
       <w:lvlText w:val="●"/>
@@ -13724,7 +13757,7 @@
         <w:ind w:left="5040" w:hanging="360"/>
       </w:pPr>
     </w:lvl>
-    <w:lvl w:ilvl="7" w:tplc="E814D712">
+    <w:lvl w:ilvl="7" w:tplc="5770DAEA">
       <w:start w:val="1"/>
       <w:numFmt w:val="bullet"/>
       <w:lvlText w:val="●"/>
@@ -13733,7 +13766,7 @@
         <w:ind w:left="5760" w:hanging="360"/>
       </w:pPr>
     </w:lvl>
-    <w:lvl w:ilvl="8" w:tplc="841E102A">
+    <w:lvl w:ilvl="8" w:tplc="D5FCC440">
       <w:start w:val="1"/>
       <w:numFmt w:val="bullet"/>
       <w:lvlText w:val="●"/>
@@ -13743,7 +13776,7 @@
       </w:pPr>
     </w:lvl>
   </w:abstractNum>
-  <w:num w:numId="1" w16cid:durableId="1259752526">
+  <w:num w:numId="1" w16cid:durableId="2040428953">
     <w:abstractNumId w:val="0"/>
     <w:lvlOverride w:ilvl="0">
       <w:startOverride w:val="1"/>

</xml_diff>

<commit_message>
Dejo que el panel deshaga una renovacion que nunca se pago
Si el pago no entro, la licorera tiene que volver a suspendida y dejar de sumar en los ingresos; hasta ahora la fecha solo podia avanzar.
</commit_message>
<xml_diff>
--- a/docs/diseno/INVENTRA_Documento_Tecnico_Diseno.docx
+++ b/docs/diseno/INVENTRA_Documento_Tecnico_Diseno.docx
@@ -145,7 +145,7 @@
           <w:left w:w="10" w:type="dxa"/>
           <w:right w:w="10" w:type="dxa"/>
         </w:tblCellMar>
-        <w:tblLook w:val="04A0" w:firstRow="1" w:lastRow="0" w:firstColumn="1" w:lastColumn="0" w:noHBand="0" w:noVBand="1"/>
+        <w:tblLook w:val="0000" w:firstRow="0" w:lastRow="0" w:firstColumn="0" w:lastColumn="0" w:noHBand="0" w:noVBand="0"/>
       </w:tblPr>
       <w:tblGrid>
         <w:gridCol w:w="1500"/>
@@ -2668,7 +2668,10 @@
         <w:t xml:space="preserve">Claridad. </w:t>
       </w:r>
       <w:r>
-        <w:t>Interfaces simples y directas, sin elementos innecesarios.</w:t>
+        <w:t>Interfaces simples y directas, sin elementos innecesarios</w:t>
+      </w:r>
+      <w:r>
+        <w:t>.</w:t>
       </w:r>
     </w:p>
     <w:p>
@@ -2768,10 +2771,7 @@
         <w:t xml:space="preserve">Retroalimentación. </w:t>
       </w:r>
       <w:r>
-        <w:t>El sistema informa siempre el resultado de cada acción (éxito, error o proceso en curso)</w:t>
-      </w:r>
-      <w:r>
-        <w:t>.</w:t>
+        <w:t>El sistema informa siempre el resultado de cada acción (éxito, error o proceso en curso).</w:t>
       </w:r>
     </w:p>
     <w:p>
@@ -2980,7 +2980,7 @@
           <w:noProof/>
         </w:rPr>
         <w:drawing>
-          <wp:inline distT="0" distB="0" distL="0" distR="0" wp14:anchorId="15BF4F90" wp14:editId="675C1336">
+          <wp:inline distT="0" distB="0" distL="0" distR="0" wp14:anchorId="157F050D" wp14:editId="44F18390">
             <wp:extent cx="5905500" cy="2324100"/>
             <wp:effectExtent l="0" t="0" r="0" b="0"/>
             <wp:docPr id="1" name="Imagen 1"/>
@@ -3063,10 +3063,10 @@
           <w:noProof/>
         </w:rPr>
         <w:drawing>
-          <wp:inline distT="0" distB="0" distL="0" distR="0" wp14:anchorId="5259FEE5" wp14:editId="61946FD4">
+          <wp:inline distT="0" distB="0" distL="0" distR="0" wp14:anchorId="0050FBDD" wp14:editId="3DDB0AE0">
             <wp:extent cx="5334000" cy="2371725"/>
             <wp:effectExtent l="0" t="0" r="0" b="0"/>
-            <wp:docPr id="265376083" name="Imagen 265376083"/>
+            <wp:docPr id="1596319230" name="Imagen 1596319230"/>
             <wp:cNvGraphicFramePr>
               <a:graphicFrameLocks xmlns:a="http://schemas.openxmlformats.org/drawingml/2006/main" noChangeAspect="1"/>
             </wp:cNvGraphicFramePr>
@@ -3161,7 +3161,7 @@
           <w:left w:w="10" w:type="dxa"/>
           <w:right w:w="10" w:type="dxa"/>
         </w:tblCellMar>
-        <w:tblLook w:val="04A0" w:firstRow="1" w:lastRow="0" w:firstColumn="1" w:lastColumn="0" w:noHBand="0" w:noVBand="1"/>
+        <w:tblLook w:val="0000" w:firstRow="0" w:lastRow="0" w:firstColumn="0" w:lastColumn="0" w:noHBand="0" w:noVBand="0"/>
       </w:tblPr>
       <w:tblGrid>
         <w:gridCol w:w="1850"/>
@@ -5205,7 +5205,7 @@
           <w:left w:w="10" w:type="dxa"/>
           <w:right w:w="10" w:type="dxa"/>
         </w:tblCellMar>
-        <w:tblLook w:val="04A0" w:firstRow="1" w:lastRow="0" w:firstColumn="1" w:lastColumn="0" w:noHBand="0" w:noVBand="1"/>
+        <w:tblLook w:val="0000" w:firstRow="0" w:lastRow="0" w:firstColumn="0" w:lastColumn="0" w:noHBand="0" w:noVBand="0"/>
       </w:tblPr>
       <w:tblGrid>
         <w:gridCol w:w="2400"/>
@@ -6056,7 +6056,7 @@
           <w:left w:w="10" w:type="dxa"/>
           <w:right w:w="10" w:type="dxa"/>
         </w:tblCellMar>
-        <w:tblLook w:val="04A0" w:firstRow="1" w:lastRow="0" w:firstColumn="1" w:lastColumn="0" w:noHBand="0" w:noVBand="1"/>
+        <w:tblLook w:val="0000" w:firstRow="0" w:lastRow="0" w:firstColumn="0" w:lastColumn="0" w:noHBand="0" w:noVBand="0"/>
       </w:tblPr>
       <w:tblGrid>
         <w:gridCol w:w="2200"/>
@@ -6422,7 +6422,7 @@
           <w:left w:w="10" w:type="dxa"/>
           <w:right w:w="10" w:type="dxa"/>
         </w:tblCellMar>
-        <w:tblLook w:val="04A0" w:firstRow="1" w:lastRow="0" w:firstColumn="1" w:lastColumn="0" w:noHBand="0" w:noVBand="1"/>
+        <w:tblLook w:val="0000" w:firstRow="0" w:lastRow="0" w:firstColumn="0" w:lastColumn="0" w:noHBand="0" w:noVBand="0"/>
       </w:tblPr>
       <w:tblGrid>
         <w:gridCol w:w="2200"/>
@@ -6834,7 +6834,7 @@
           <w:left w:w="10" w:type="dxa"/>
           <w:right w:w="10" w:type="dxa"/>
         </w:tblCellMar>
-        <w:tblLook w:val="04A0" w:firstRow="1" w:lastRow="0" w:firstColumn="1" w:lastColumn="0" w:noHBand="0" w:noVBand="1"/>
+        <w:tblLook w:val="0000" w:firstRow="0" w:lastRow="0" w:firstColumn="0" w:lastColumn="0" w:noHBand="0" w:noVBand="0"/>
       </w:tblPr>
       <w:tblGrid>
         <w:gridCol w:w="1700"/>
@@ -7537,7 +7537,7 @@
           <w:left w:w="10" w:type="dxa"/>
           <w:right w:w="10" w:type="dxa"/>
         </w:tblCellMar>
-        <w:tblLook w:val="04A0" w:firstRow="1" w:lastRow="0" w:firstColumn="1" w:lastColumn="0" w:noHBand="0" w:noVBand="1"/>
+        <w:tblLook w:val="0000" w:firstRow="0" w:lastRow="0" w:firstColumn="0" w:lastColumn="0" w:noHBand="0" w:noVBand="0"/>
       </w:tblPr>
       <w:tblGrid>
         <w:gridCol w:w="1700"/>
@@ -7977,10 +7977,10 @@
         </w:rPr>
         <w:lastRenderedPageBreak/>
         <w:drawing>
-          <wp:inline distT="0" distB="0" distL="0" distR="0" wp14:anchorId="169313A6" wp14:editId="236595E8">
+          <wp:inline distT="0" distB="0" distL="0" distR="0" wp14:anchorId="173D190F" wp14:editId="1DF7029C">
             <wp:extent cx="5905500" cy="2419350"/>
             <wp:effectExtent l="0" t="0" r="0" b="0"/>
-            <wp:docPr id="486162528" name="Imagen 486162528"/>
+            <wp:docPr id="1526078898" name="Imagen 1526078898"/>
             <wp:cNvGraphicFramePr>
               <a:graphicFrameLocks xmlns:a="http://schemas.openxmlformats.org/drawingml/2006/main" noChangeAspect="1"/>
             </wp:cNvGraphicFramePr>
@@ -8130,10 +8130,10 @@
           <w:noProof/>
         </w:rPr>
         <w:drawing>
-          <wp:inline distT="0" distB="0" distL="0" distR="0" wp14:anchorId="0B34AD84" wp14:editId="7EF15852">
+          <wp:inline distT="0" distB="0" distL="0" distR="0" wp14:anchorId="282BC9F4" wp14:editId="32EF60B8">
             <wp:extent cx="5905500" cy="2257425"/>
             <wp:effectExtent l="0" t="0" r="0" b="0"/>
-            <wp:docPr id="89108825" name="Imagen 89108825"/>
+            <wp:docPr id="133918481" name="Imagen 133918481"/>
             <wp:cNvGraphicFramePr>
               <a:graphicFrameLocks xmlns:a="http://schemas.openxmlformats.org/drawingml/2006/main" noChangeAspect="1"/>
             </wp:cNvGraphicFramePr>
@@ -8318,7 +8318,7 @@
           <w:left w:w="10" w:type="dxa"/>
           <w:right w:w="10" w:type="dxa"/>
         </w:tblCellMar>
-        <w:tblLook w:val="04A0" w:firstRow="1" w:lastRow="0" w:firstColumn="1" w:lastColumn="0" w:noHBand="0" w:noVBand="1"/>
+        <w:tblLook w:val="0000" w:firstRow="0" w:lastRow="0" w:firstColumn="0" w:lastColumn="0" w:noHBand="0" w:noVBand="0"/>
       </w:tblPr>
       <w:tblGrid>
         <w:gridCol w:w="1700"/>
@@ -8757,10 +8757,10 @@
           <w:noProof/>
         </w:rPr>
         <w:drawing>
-          <wp:inline distT="0" distB="0" distL="0" distR="0" wp14:anchorId="0BD64AE9" wp14:editId="37048FB5">
+          <wp:inline distT="0" distB="0" distL="0" distR="0" wp14:anchorId="245E4CD6" wp14:editId="50B666FD">
             <wp:extent cx="5334000" cy="3381375"/>
             <wp:effectExtent l="0" t="0" r="0" b="0"/>
-            <wp:docPr id="1061041052" name="Imagen 1061041052"/>
+            <wp:docPr id="495285357" name="Imagen 495285357"/>
             <wp:cNvGraphicFramePr>
               <a:graphicFrameLocks xmlns:a="http://schemas.openxmlformats.org/drawingml/2006/main" noChangeAspect="1"/>
             </wp:cNvGraphicFramePr>
@@ -8910,10 +8910,10 @@
           <w:noProof/>
         </w:rPr>
         <w:drawing>
-          <wp:inline distT="0" distB="0" distL="0" distR="0" wp14:anchorId="4509DC09" wp14:editId="264B1179">
+          <wp:inline distT="0" distB="0" distL="0" distR="0" wp14:anchorId="0099C910" wp14:editId="26C3136D">
             <wp:extent cx="6096000" cy="1676400"/>
             <wp:effectExtent l="0" t="0" r="0" b="0"/>
-            <wp:docPr id="201037628" name="Imagen 201037628"/>
+            <wp:docPr id="527784681" name="Imagen 527784681"/>
             <wp:cNvGraphicFramePr>
               <a:graphicFrameLocks xmlns:a="http://schemas.openxmlformats.org/drawingml/2006/main" noChangeAspect="1"/>
             </wp:cNvGraphicFramePr>
@@ -9002,10 +9002,10 @@
           <w:noProof/>
         </w:rPr>
         <w:drawing>
-          <wp:inline distT="0" distB="0" distL="0" distR="0" wp14:anchorId="28EA1E62" wp14:editId="389C5DC2">
+          <wp:inline distT="0" distB="0" distL="0" distR="0" wp14:anchorId="24CD014F" wp14:editId="67B80854">
             <wp:extent cx="4762500" cy="2447925"/>
             <wp:effectExtent l="0" t="0" r="0" b="0"/>
-            <wp:docPr id="1043696357" name="Imagen 1043696357"/>
+            <wp:docPr id="1308701235" name="Imagen 1308701235"/>
             <wp:cNvGraphicFramePr>
               <a:graphicFrameLocks xmlns:a="http://schemas.openxmlformats.org/drawingml/2006/main" noChangeAspect="1"/>
             </wp:cNvGraphicFramePr>
@@ -9132,10 +9132,10 @@
           <w:noProof/>
         </w:rPr>
         <w:drawing>
-          <wp:inline distT="0" distB="0" distL="0" distR="0" wp14:anchorId="61C5B23E" wp14:editId="7853DB66">
+          <wp:inline distT="0" distB="0" distL="0" distR="0" wp14:anchorId="1A2471CC" wp14:editId="032E50DE">
             <wp:extent cx="6096000" cy="3048000"/>
             <wp:effectExtent l="0" t="0" r="0" b="0"/>
-            <wp:docPr id="1531779728" name="Imagen 1531779728"/>
+            <wp:docPr id="1165873749" name="Imagen 1165873749"/>
             <wp:cNvGraphicFramePr>
               <a:graphicFrameLocks xmlns:a="http://schemas.openxmlformats.org/drawingml/2006/main" noChangeAspect="1"/>
             </wp:cNvGraphicFramePr>
@@ -9277,10 +9277,10 @@
         </w:rPr>
         <w:lastRenderedPageBreak/>
         <w:drawing>
-          <wp:inline distT="0" distB="0" distL="0" distR="0" wp14:anchorId="4414C0F4" wp14:editId="6B3B35DE">
+          <wp:inline distT="0" distB="0" distL="0" distR="0" wp14:anchorId="22E0F924" wp14:editId="2BC29F2A">
             <wp:extent cx="6096000" cy="3848100"/>
             <wp:effectExtent l="0" t="0" r="0" b="0"/>
-            <wp:docPr id="1039382667" name="Imagen 1039382667"/>
+            <wp:docPr id="1786318854" name="Imagen 1786318854"/>
             <wp:cNvGraphicFramePr>
               <a:graphicFrameLocks xmlns:a="http://schemas.openxmlformats.org/drawingml/2006/main" noChangeAspect="1"/>
             </wp:cNvGraphicFramePr>
@@ -9441,7 +9441,7 @@
           <w:left w:w="10" w:type="dxa"/>
           <w:right w:w="10" w:type="dxa"/>
         </w:tblCellMar>
-        <w:tblLook w:val="04A0" w:firstRow="1" w:lastRow="0" w:firstColumn="1" w:lastColumn="0" w:noHBand="0" w:noVBand="1"/>
+        <w:tblLook w:val="0000" w:firstRow="0" w:lastRow="0" w:firstColumn="0" w:lastColumn="0" w:noHBand="0" w:noVBand="0"/>
       </w:tblPr>
       <w:tblGrid>
         <w:gridCol w:w="2100"/>
@@ -10162,10 +10162,10 @@
           <w:noProof/>
         </w:rPr>
         <w:drawing>
-          <wp:inline distT="0" distB="0" distL="0" distR="0" wp14:anchorId="598E6EB2" wp14:editId="483995FB">
+          <wp:inline distT="0" distB="0" distL="0" distR="0" wp14:anchorId="6460EADE" wp14:editId="751F33F7">
             <wp:extent cx="6096000" cy="3000375"/>
             <wp:effectExtent l="0" t="0" r="0" b="0"/>
-            <wp:docPr id="223904153" name="Imagen 223904153"/>
+            <wp:docPr id="1792079688" name="Imagen 1792079688"/>
             <wp:cNvGraphicFramePr>
               <a:graphicFrameLocks xmlns:a="http://schemas.openxmlformats.org/drawingml/2006/main" noChangeAspect="1"/>
             </wp:cNvGraphicFramePr>
@@ -10303,10 +10303,10 @@
         </w:rPr>
         <w:lastRenderedPageBreak/>
         <w:drawing>
-          <wp:inline distT="0" distB="0" distL="0" distR="0" wp14:anchorId="643B8690" wp14:editId="5AA62DFC">
+          <wp:inline distT="0" distB="0" distL="0" distR="0" wp14:anchorId="49198B75" wp14:editId="7407E3BD">
             <wp:extent cx="6096000" cy="2857500"/>
             <wp:effectExtent l="0" t="0" r="0" b="0"/>
-            <wp:docPr id="206353330" name="Imagen 206353330"/>
+            <wp:docPr id="603648078" name="Imagen 603648078"/>
             <wp:cNvGraphicFramePr>
               <a:graphicFrameLocks xmlns:a="http://schemas.openxmlformats.org/drawingml/2006/main" noChangeAspect="1"/>
             </wp:cNvGraphicFramePr>
@@ -10432,10 +10432,10 @@
         </w:rPr>
         <w:lastRenderedPageBreak/>
         <w:drawing>
-          <wp:inline distT="0" distB="0" distL="0" distR="0" wp14:anchorId="343EF710" wp14:editId="6E98E478">
+          <wp:inline distT="0" distB="0" distL="0" distR="0" wp14:anchorId="6DB8BA80" wp14:editId="62D7AF9E">
             <wp:extent cx="6096000" cy="2857500"/>
             <wp:effectExtent l="0" t="0" r="0" b="0"/>
-            <wp:docPr id="1733680609" name="Imagen 1733680609"/>
+            <wp:docPr id="797497186" name="Imagen 797497186"/>
             <wp:cNvGraphicFramePr>
               <a:graphicFrameLocks xmlns:a="http://schemas.openxmlformats.org/drawingml/2006/main" noChangeAspect="1"/>
             </wp:cNvGraphicFramePr>
@@ -10564,10 +10564,10 @@
           <w:noProof/>
         </w:rPr>
         <w:drawing>
-          <wp:inline distT="0" distB="0" distL="0" distR="0" wp14:anchorId="7A81D09E" wp14:editId="612D3582">
+          <wp:inline distT="0" distB="0" distL="0" distR="0" wp14:anchorId="077928A1" wp14:editId="4E184F00">
             <wp:extent cx="4953000" cy="4067175"/>
             <wp:effectExtent l="0" t="0" r="0" b="0"/>
-            <wp:docPr id="880982533" name="Imagen 880982533"/>
+            <wp:docPr id="1110371434" name="Imagen 1110371434"/>
             <wp:cNvGraphicFramePr>
               <a:graphicFrameLocks xmlns:a="http://schemas.openxmlformats.org/drawingml/2006/main" noChangeAspect="1"/>
             </wp:cNvGraphicFramePr>
@@ -10675,10 +10675,10 @@
         </w:rPr>
         <w:lastRenderedPageBreak/>
         <w:drawing>
-          <wp:inline distT="0" distB="0" distL="0" distR="0" wp14:anchorId="1E6A9CA9" wp14:editId="7B08D077">
+          <wp:inline distT="0" distB="0" distL="0" distR="0" wp14:anchorId="159B9AC7" wp14:editId="0D8D8DBA">
             <wp:extent cx="6096000" cy="4124325"/>
             <wp:effectExtent l="0" t="0" r="0" b="0"/>
-            <wp:docPr id="895165765" name="Imagen 895165765"/>
+            <wp:docPr id="2070896056" name="Imagen 2070896056"/>
             <wp:cNvGraphicFramePr>
               <a:graphicFrameLocks xmlns:a="http://schemas.openxmlformats.org/drawingml/2006/main" noChangeAspect="1"/>
             </wp:cNvGraphicFramePr>
@@ -10786,10 +10786,10 @@
         </w:rPr>
         <w:lastRenderedPageBreak/>
         <w:drawing>
-          <wp:inline distT="0" distB="0" distL="0" distR="0" wp14:anchorId="1C32539A" wp14:editId="51BE03DA">
+          <wp:inline distT="0" distB="0" distL="0" distR="0" wp14:anchorId="0A82CC59" wp14:editId="56E63983">
             <wp:extent cx="6096000" cy="4162425"/>
             <wp:effectExtent l="0" t="0" r="0" b="0"/>
-            <wp:docPr id="506311028" name="Imagen 506311028"/>
+            <wp:docPr id="1954378961" name="Imagen 1954378961"/>
             <wp:cNvGraphicFramePr>
               <a:graphicFrameLocks xmlns:a="http://schemas.openxmlformats.org/drawingml/2006/main" noChangeAspect="1"/>
             </wp:cNvGraphicFramePr>
@@ -10887,10 +10887,10 @@
           <w:noProof/>
         </w:rPr>
         <w:drawing>
-          <wp:inline distT="0" distB="0" distL="0" distR="0" wp14:anchorId="01A691EC" wp14:editId="6E38C866">
+          <wp:inline distT="0" distB="0" distL="0" distR="0" wp14:anchorId="593945DB" wp14:editId="0539D8A6">
             <wp:extent cx="6096000" cy="2562225"/>
             <wp:effectExtent l="0" t="0" r="0" b="0"/>
-            <wp:docPr id="1797674212" name="Imagen 1797674212"/>
+            <wp:docPr id="1616278903" name="Imagen 1616278903"/>
             <wp:cNvGraphicFramePr>
               <a:graphicFrameLocks xmlns:a="http://schemas.openxmlformats.org/drawingml/2006/main" noChangeAspect="1"/>
             </wp:cNvGraphicFramePr>
@@ -10980,10 +10980,10 @@
           <w:noProof/>
         </w:rPr>
         <w:drawing>
-          <wp:inline distT="0" distB="0" distL="0" distR="0" wp14:anchorId="136CDDB4" wp14:editId="52820FF1">
+          <wp:inline distT="0" distB="0" distL="0" distR="0" wp14:anchorId="173915F9" wp14:editId="040CB7BE">
             <wp:extent cx="6096000" cy="2857500"/>
             <wp:effectExtent l="0" t="0" r="0" b="0"/>
-            <wp:docPr id="704969167" name="Imagen 704969167"/>
+            <wp:docPr id="501368526" name="Imagen 501368526"/>
             <wp:cNvGraphicFramePr>
               <a:graphicFrameLocks xmlns:a="http://schemas.openxmlformats.org/drawingml/2006/main" noChangeAspect="1"/>
             </wp:cNvGraphicFramePr>
@@ -11100,10 +11100,10 @@
         </w:rPr>
         <w:lastRenderedPageBreak/>
         <w:drawing>
-          <wp:inline distT="0" distB="0" distL="0" distR="0" wp14:anchorId="62AA6A50" wp14:editId="3EBD7021">
+          <wp:inline distT="0" distB="0" distL="0" distR="0" wp14:anchorId="76F1B608" wp14:editId="31E15215">
             <wp:extent cx="6096000" cy="2857500"/>
             <wp:effectExtent l="0" t="0" r="0" b="0"/>
-            <wp:docPr id="1540477850" name="Imagen 1540477850"/>
+            <wp:docPr id="407542715" name="Imagen 407542715"/>
             <wp:cNvGraphicFramePr>
               <a:graphicFrameLocks xmlns:a="http://schemas.openxmlformats.org/drawingml/2006/main" noChangeAspect="1"/>
             </wp:cNvGraphicFramePr>
@@ -11211,10 +11211,10 @@
         </w:rPr>
         <w:lastRenderedPageBreak/>
         <w:drawing>
-          <wp:inline distT="0" distB="0" distL="0" distR="0" wp14:anchorId="04837F81" wp14:editId="43BF1F5A">
+          <wp:inline distT="0" distB="0" distL="0" distR="0" wp14:anchorId="2C16CF2A" wp14:editId="02164871">
             <wp:extent cx="6096000" cy="3562350"/>
             <wp:effectExtent l="0" t="0" r="0" b="0"/>
-            <wp:docPr id="158425372" name="Imagen 158425372"/>
+            <wp:docPr id="648902476" name="Imagen 648902476"/>
             <wp:cNvGraphicFramePr>
               <a:graphicFrameLocks xmlns:a="http://schemas.openxmlformats.org/drawingml/2006/main" noChangeAspect="1"/>
             </wp:cNvGraphicFramePr>
@@ -11322,10 +11322,10 @@
         </w:rPr>
         <w:lastRenderedPageBreak/>
         <w:drawing>
-          <wp:inline distT="0" distB="0" distL="0" distR="0" wp14:anchorId="16228EF9" wp14:editId="46D3A0AD">
+          <wp:inline distT="0" distB="0" distL="0" distR="0" wp14:anchorId="2BE5C3C9" wp14:editId="2894BA5C">
             <wp:extent cx="6096000" cy="3067050"/>
             <wp:effectExtent l="0" t="0" r="0" b="0"/>
-            <wp:docPr id="1696405793" name="Imagen 1696405793"/>
+            <wp:docPr id="443020521" name="Imagen 443020521"/>
             <wp:cNvGraphicFramePr>
               <a:graphicFrameLocks xmlns:a="http://schemas.openxmlformats.org/drawingml/2006/main" noChangeAspect="1"/>
             </wp:cNvGraphicFramePr>
@@ -11419,7 +11419,7 @@
         <w:jc w:val="both"/>
       </w:pPr>
       <w:r>
-        <w:t>Desde aquí se ejecutan las tres operaciones que le corresponden a quien cobra el servicio: dar de alta una licorera, que crea el negocio y la cuenta de su administrador y le envía el enlace para que defina su propia contraseña; abrir un período, que es la misma operación para renovar y para subir de plan, porque en los dos casos se cierra la suscripción anterior y se inicia otra con su fecha de vencimiento; y corregir la fecha de una suscripción vigente, prevista para enmendar una fecha mal escrita y no para renovar. Bajar de plan no aparece en esta pantalla: esa operación la ejecuta el propio negocio desde la suya, según se explica en el apartado anterior.</w:t>
+        <w:t>Desde aquí se ejecutan las tres operaciones que le corresponden a quien cobra el servicio: dar de alta una licorera, que crea el negocio y la cuenta de su administrador y le envía el enlace para que defina su propia contraseña; abrir un período, que es la misma operación para renovar y para subir de plan, porque en los dos casos se cierra la suscripción anterior y se inicia otra con su fecha de vencimiento; y corregir la fecha de una suscripción vigente. La corrección mueve esa fecha en los dos sentidos y cada uno tiene su caso: hacia adelante enmienda un dato mal escrito que dejó a un negocio suspendido por error, y hacia atrás deshace un período que se abrió por un pago que finalmente no entró, con lo que la licorera vuelve al estado que le corresponde y su plan deja de contar en los ingresos del servicio. No exige recordar nada: la pantalla ofrece la fecha en que terminó el período anterior. Un período que se abre, en cambio, nunca puede nacer vencido. Bajar de plan no aparece en esta pantalla: esa operación la ejecuta el propio negocio desde la suya, según se explica en el apartado anterior.</w:t>
       </w:r>
     </w:p>
     <w:p>
@@ -11442,10 +11442,10 @@
         </w:rPr>
         <w:lastRenderedPageBreak/>
         <w:drawing>
-          <wp:inline distT="0" distB="0" distL="0" distR="0" wp14:anchorId="3FC7EBDB" wp14:editId="73B016AF">
+          <wp:inline distT="0" distB="0" distL="0" distR="0" wp14:anchorId="6CBE18B6" wp14:editId="53C6EE49">
             <wp:extent cx="6096000" cy="4114800"/>
             <wp:effectExtent l="0" t="0" r="0" b="0"/>
-            <wp:docPr id="553963601" name="Imagen 553963601"/>
+            <wp:docPr id="401995199" name="Imagen 401995199"/>
             <wp:cNvGraphicFramePr>
               <a:graphicFrameLocks xmlns:a="http://schemas.openxmlformats.org/drawingml/2006/main" noChangeAspect="1"/>
             </wp:cNvGraphicFramePr>
@@ -11536,10 +11536,10 @@
           <w:noProof/>
         </w:rPr>
         <w:drawing>
-          <wp:inline distT="0" distB="0" distL="0" distR="0" wp14:anchorId="45632784" wp14:editId="07EFDB2F">
+          <wp:inline distT="0" distB="0" distL="0" distR="0" wp14:anchorId="11B03D37" wp14:editId="31292087">
             <wp:extent cx="6096000" cy="2733675"/>
             <wp:effectExtent l="0" t="0" r="0" b="0"/>
-            <wp:docPr id="1666201648" name="Imagen 1666201648"/>
+            <wp:docPr id="1577410697" name="Imagen 1577410697"/>
             <wp:cNvGraphicFramePr>
               <a:graphicFrameLocks xmlns:a="http://schemas.openxmlformats.org/drawingml/2006/main" noChangeAspect="1"/>
             </wp:cNvGraphicFramePr>
@@ -11625,7 +11625,7 @@
           <w:left w:w="10" w:type="dxa"/>
           <w:right w:w="10" w:type="dxa"/>
         </w:tblCellMar>
-        <w:tblLook w:val="04A0" w:firstRow="1" w:lastRow="0" w:firstColumn="1" w:lastColumn="0" w:noHBand="0" w:noVBand="1"/>
+        <w:tblLook w:val="0000" w:firstRow="0" w:lastRow="0" w:firstColumn="0" w:lastColumn="0" w:noHBand="0" w:noVBand="0"/>
       </w:tblPr>
       <w:tblGrid>
         <w:gridCol w:w="1700"/>
@@ -12207,6 +12207,15 @@
     </w:tbl>
     <w:p>
       <w:pPr>
+        <w:spacing w:after="110" w:line="262" w:lineRule="auto"/>
+        <w:jc w:val="both"/>
+      </w:pPr>
+      <w:r>
+        <w:t>Los avisos que confirman una operación no son permanentes: se muestran y se retiran solos a los pocos segundos. Quien los lee ya vio el resultado en la propia pantalla, y un mensaje que sobrevive a la acción siguiente deja de describir lo que acaba de pasar. Los de error, en cambio, permanecen hasta que se intenta otra cosa: llevan la causa y casi siempre algo que corregir, y uno que se desvanece mientras se lee es peor que no tenerlo. La regla vale para todas las pantallas y está escrita en un solo sitio.</w:t>
+      </w:r>
+    </w:p>
+    <w:p>
+      <w:pPr>
         <w:pStyle w:val="Ttulo2"/>
         <w:spacing w:before="150" w:after="80"/>
       </w:pPr>
@@ -12281,6 +12290,7 @@
         <w:spacing w:after="60" w:line="258" w:lineRule="auto"/>
       </w:pPr>
       <w:r>
+        <w:lastRenderedPageBreak/>
         <w:t>Las confirmaciones de una acción rápida desaparecen solas; los errores permanecen hasta que el usuario los atiende.</w:t>
       </w:r>
     </w:p>
@@ -12402,10 +12412,10 @@
           <w:noProof/>
         </w:rPr>
         <w:drawing>
-          <wp:inline distT="0" distB="0" distL="0" distR="0" wp14:anchorId="17B84097" wp14:editId="1292A245">
+          <wp:inline distT="0" distB="0" distL="0" distR="0" wp14:anchorId="11D1A1B4" wp14:editId="323534E2">
             <wp:extent cx="6096000" cy="3295650"/>
             <wp:effectExtent l="0" t="0" r="0" b="0"/>
-            <wp:docPr id="1971369181" name="Imagen 1971369181"/>
+            <wp:docPr id="804573650" name="Imagen 804573650"/>
             <wp:cNvGraphicFramePr>
               <a:graphicFrameLocks xmlns:a="http://schemas.openxmlformats.org/drawingml/2006/main" noChangeAspect="1"/>
             </wp:cNvGraphicFramePr>
@@ -12522,10 +12532,10 @@
         </w:rPr>
         <w:lastRenderedPageBreak/>
         <w:drawing>
-          <wp:inline distT="0" distB="0" distL="0" distR="0" wp14:anchorId="1E67FA80" wp14:editId="1601B447">
+          <wp:inline distT="0" distB="0" distL="0" distR="0" wp14:anchorId="3E3A884F" wp14:editId="668C201B">
             <wp:extent cx="6096000" cy="3067050"/>
             <wp:effectExtent l="0" t="0" r="0" b="0"/>
-            <wp:docPr id="838987930" name="Imagen 838987930"/>
+            <wp:docPr id="1494839543" name="Imagen 1494839543"/>
             <wp:cNvGraphicFramePr>
               <a:graphicFrameLocks xmlns:a="http://schemas.openxmlformats.org/drawingml/2006/main" noChangeAspect="1"/>
             </wp:cNvGraphicFramePr>
@@ -12651,7 +12661,7 @@
           <w:left w:w="10" w:type="dxa"/>
           <w:right w:w="10" w:type="dxa"/>
         </w:tblCellMar>
-        <w:tblLook w:val="04A0" w:firstRow="1" w:lastRow="0" w:firstColumn="1" w:lastColumn="0" w:noHBand="0" w:noVBand="1"/>
+        <w:tblLook w:val="0000" w:firstRow="0" w:lastRow="0" w:firstColumn="0" w:lastColumn="0" w:noHBand="0" w:noVBand="0"/>
       </w:tblPr>
       <w:tblGrid>
         <w:gridCol w:w="2100"/>
@@ -13551,7 +13561,13 @@
         <w:spacing w:after="60" w:line="258" w:lineRule="auto"/>
       </w:pPr>
       <w:r>
-        <w:t>World Wide Web Consortium. Web Content Accessibility Guidelines (WCAG) 2.1. W3C, 2018.</w:t>
+        <w:rPr>
+          <w:lang w:val="en-US"/>
+        </w:rPr>
+        <w:t xml:space="preserve">World Wide Web Consortium. Web Content Accessibility Guidelines (WCAG) 2.1. </w:t>
+      </w:r>
+      <w:r>
+        <w:t>W3C, 2018.</w:t>
       </w:r>
     </w:p>
     <w:p>
@@ -13691,10 +13707,10 @@
 <file path=word/numbering.xml><?xml version="1.0" encoding="utf-8"?>
 <w:numbering xmlns:wpc="http://schemas.microsoft.com/office/word/2010/wordprocessingCanvas" xmlns:cx="http://schemas.microsoft.com/office/drawing/2014/chartex" xmlns:cx1="http://schemas.microsoft.com/office/drawing/2015/9/8/chartex" xmlns:cx2="http://schemas.microsoft.com/office/drawing/2015/10/21/chartex" xmlns:cx3="http://schemas.microsoft.com/office/drawing/2016/5/9/chartex" xmlns:cx4="http://schemas.microsoft.com/office/drawing/2016/5/10/chartex" xmlns:cx5="http://schemas.microsoft.com/office/drawing/2016/5/11/chartex" xmlns:cx6="http://schemas.microsoft.com/office/drawing/2016/5/12/chartex" xmlns:cx7="http://schemas.microsoft.com/office/drawing/2016/5/13/chartex" xmlns:cx8="http://schemas.microsoft.com/office/drawing/2016/5/14/chartex" xmlns:mc="http://schemas.openxmlformats.org/markup-compatibility/2006" xmlns:aink="http://schemas.microsoft.com/office/drawing/2016/ink" xmlns:am3d="http://schemas.microsoft.com/office/drawing/2017/model3d" xmlns:o="urn:schemas-microsoft-com:office:office" xmlns:oel="http://schemas.microsoft.com/office/2019/extlst" xmlns:r="http://schemas.openxmlformats.org/officeDocument/2006/relationships" xmlns:m="http://schemas.openxmlformats.org/officeDocument/2006/math" xmlns:v="urn:schemas-microsoft-com:vml" xmlns:wp14="http://schemas.microsoft.com/office/word/2010/wordprocessingDrawing" xmlns:wp="http://schemas.openxmlformats.org/drawingml/2006/wordprocessingDrawing" xmlns:w10="urn:schemas-microsoft-com:office:word" xmlns:w="http://schemas.openxmlformats.org/wordprocessingml/2006/main" xmlns:w14="http://schemas.microsoft.com/office/word/2010/wordml" xmlns:w15="http://schemas.microsoft.com/office/word/2012/wordml" xmlns:w16cex="http://schemas.microsoft.com/office/word/2018/wordml/cex" xmlns:w16cid="http://schemas.microsoft.com/office/word/2016/wordml/cid" xmlns:w16="http://schemas.microsoft.com/office/word/2018/wordml" xmlns:w16du="http://schemas.microsoft.com/office/word/2023/wordml/word16du" xmlns:w16sdtdh="http://schemas.microsoft.com/office/word/2020/wordml/sdtdatahash" xmlns:w16sdtfl="http://schemas.microsoft.com/office/word/2024/wordml/sdtformatlock" xmlns:w16se="http://schemas.microsoft.com/office/word/2015/wordml/symex" xmlns:wpg="http://schemas.microsoft.com/office/word/2010/wordprocessingGroup" xmlns:wpi="http://schemas.microsoft.com/office/word/2010/wordprocessingInk" xmlns:wne="http://schemas.microsoft.com/office/word/2006/wordml" xmlns:wps="http://schemas.microsoft.com/office/word/2010/wordprocessingShape" mc:Ignorable="w14 w15 w16se w16cid w16 w16cex w16sdtdh w16sdtfl w16du wp14">
   <w:abstractNum w:abstractNumId="0" w15:restartNumberingAfterBreak="0">
-    <w:nsid w:val="68BF3C8A"/>
+    <w:nsid w:val="59303DDF"/>
     <w:multiLevelType w:val="hybridMultilevel"/>
-    <w:tmpl w:val="E924AB20"/>
-    <w:lvl w:ilvl="0" w:tplc="54465870">
+    <w:tmpl w:val="EF68FA02"/>
+    <w:lvl w:ilvl="0" w:tplc="ACB2D1F8">
       <w:start w:val="1"/>
       <w:numFmt w:val="bullet"/>
       <w:lvlText w:val="●"/>
@@ -13703,7 +13719,7 @@
         <w:ind w:left="720" w:hanging="360"/>
       </w:pPr>
     </w:lvl>
-    <w:lvl w:ilvl="1" w:tplc="30BE6F0C">
+    <w:lvl w:ilvl="1" w:tplc="D39CB59C">
       <w:start w:val="1"/>
       <w:numFmt w:val="bullet"/>
       <w:lvlText w:val="○"/>
@@ -13712,7 +13728,7 @@
         <w:ind w:left="1440" w:hanging="360"/>
       </w:pPr>
     </w:lvl>
-    <w:lvl w:ilvl="2" w:tplc="AC468422">
+    <w:lvl w:ilvl="2" w:tplc="BAEEEC8A">
       <w:start w:val="1"/>
       <w:numFmt w:val="bullet"/>
       <w:lvlText w:val="■"/>
@@ -13721,7 +13737,7 @@
         <w:ind w:left="2160" w:hanging="360"/>
       </w:pPr>
     </w:lvl>
-    <w:lvl w:ilvl="3" w:tplc="8B4EC8D4">
+    <w:lvl w:ilvl="3" w:tplc="0C821D9E">
       <w:start w:val="1"/>
       <w:numFmt w:val="bullet"/>
       <w:lvlText w:val="●"/>
@@ -13730,7 +13746,7 @@
         <w:ind w:left="2880" w:hanging="360"/>
       </w:pPr>
     </w:lvl>
-    <w:lvl w:ilvl="4" w:tplc="271EFF24">
+    <w:lvl w:ilvl="4" w:tplc="83BC3DAA">
       <w:start w:val="1"/>
       <w:numFmt w:val="bullet"/>
       <w:lvlText w:val="○"/>
@@ -13739,7 +13755,7 @@
         <w:ind w:left="3600" w:hanging="360"/>
       </w:pPr>
     </w:lvl>
-    <w:lvl w:ilvl="5" w:tplc="B0E6DE14">
+    <w:lvl w:ilvl="5" w:tplc="2CA4D766">
       <w:start w:val="1"/>
       <w:numFmt w:val="bullet"/>
       <w:lvlText w:val="■"/>
@@ -13748,7 +13764,7 @@
         <w:ind w:left="4320" w:hanging="360"/>
       </w:pPr>
     </w:lvl>
-    <w:lvl w:ilvl="6" w:tplc="46AA6244">
+    <w:lvl w:ilvl="6" w:tplc="0E6A5060">
       <w:start w:val="1"/>
       <w:numFmt w:val="bullet"/>
       <w:lvlText w:val="●"/>
@@ -13757,7 +13773,7 @@
         <w:ind w:left="5040" w:hanging="360"/>
       </w:pPr>
     </w:lvl>
-    <w:lvl w:ilvl="7" w:tplc="5770DAEA">
+    <w:lvl w:ilvl="7" w:tplc="F146C59A">
       <w:start w:val="1"/>
       <w:numFmt w:val="bullet"/>
       <w:lvlText w:val="●"/>
@@ -13766,7 +13782,7 @@
         <w:ind w:left="5760" w:hanging="360"/>
       </w:pPr>
     </w:lvl>
-    <w:lvl w:ilvl="8" w:tplc="D5FCC440">
+    <w:lvl w:ilvl="8" w:tplc="4532F310">
       <w:start w:val="1"/>
       <w:numFmt w:val="bullet"/>
       <w:lvlText w:val="●"/>
@@ -13776,7 +13792,7 @@
       </w:pPr>
     </w:lvl>
   </w:abstractNum>
-  <w:num w:numId="1" w16cid:durableId="2040428953">
+  <w:num w:numId="1" w16cid:durableId="1499075634">
     <w:abstractNumId w:val="0"/>
     <w:lvlOverride w:ilvl="0">
       <w:startOverride w:val="1"/>

</xml_diff>

<commit_message>
Llevo la alerta de existencias bajas al panel principal
El requisito la pide ahi y estaba construida solo en el servidor: el dato existia y el sitio donde se tenia que leer estaba vacio.
</commit_message>
<xml_diff>
--- a/docs/diseno/INVENTRA_Documento_Tecnico_Diseno.docx
+++ b/docs/diseno/INVENTRA_Documento_Tecnico_Diseno.docx
@@ -2587,7 +2587,10 @@
         <w:jc w:val="both"/>
       </w:pPr>
       <w:r>
-        <w:t>Este documento define el sistema de diseño de la interfaz de INVENTRA para las plataformas web y móvil. Reúne la identidad visual, los componentes reutilizables, las pautas de accesibilidad y de experiencia de usuario, y las pantallas principales de la aplicación. Su propósito es servir de guía para la etapa de construcción y garantizar una interfaz coherente en todo el producto.</w:t>
+        <w:t>Este documento define el sistema de diseño de la interfaz de INVENTRA para las plataformas web y móvil. Reúne la identidad visual, los componentes reutilizables, las pautas de accesibilidad y de experiencia de usuario, y las pantallas principales de la aplicación. Su propósito es servir de guía para la etapa de construcción y garantizar una interfaz coherente en todo el producto</w:t>
+      </w:r>
+      <w:r>
+        <w:t>.</w:t>
       </w:r>
     </w:p>
     <w:p>
@@ -2668,10 +2671,7 @@
         <w:t xml:space="preserve">Claridad. </w:t>
       </w:r>
       <w:r>
-        <w:t>Interfaces simples y directas, sin elementos innecesarios</w:t>
-      </w:r>
-      <w:r>
-        <w:t>.</w:t>
+        <w:t>Interfaces simples y directas, sin elementos innecesarios.</w:t>
       </w:r>
     </w:p>
     <w:p>
@@ -2980,7 +2980,7 @@
           <w:noProof/>
         </w:rPr>
         <w:drawing>
-          <wp:inline distT="0" distB="0" distL="0" distR="0" wp14:anchorId="157F050D" wp14:editId="44F18390">
+          <wp:inline distT="0" distB="0" distL="0" distR="0" wp14:anchorId="2C7A162B" wp14:editId="62B14CC1">
             <wp:extent cx="5905500" cy="2324100"/>
             <wp:effectExtent l="0" t="0" r="0" b="0"/>
             <wp:docPr id="1" name="Imagen 1"/>
@@ -3063,10 +3063,10 @@
           <w:noProof/>
         </w:rPr>
         <w:drawing>
-          <wp:inline distT="0" distB="0" distL="0" distR="0" wp14:anchorId="0050FBDD" wp14:editId="3DDB0AE0">
+          <wp:inline distT="0" distB="0" distL="0" distR="0" wp14:anchorId="46DA7FD9" wp14:editId="47678BB6">
             <wp:extent cx="5334000" cy="2371725"/>
             <wp:effectExtent l="0" t="0" r="0" b="0"/>
-            <wp:docPr id="1596319230" name="Imagen 1596319230"/>
+            <wp:docPr id="743026117" name="Imagen 743026117"/>
             <wp:cNvGraphicFramePr>
               <a:graphicFrameLocks xmlns:a="http://schemas.openxmlformats.org/drawingml/2006/main" noChangeAspect="1"/>
             </wp:cNvGraphicFramePr>
@@ -7977,10 +7977,10 @@
         </w:rPr>
         <w:lastRenderedPageBreak/>
         <w:drawing>
-          <wp:inline distT="0" distB="0" distL="0" distR="0" wp14:anchorId="173D190F" wp14:editId="1DF7029C">
+          <wp:inline distT="0" distB="0" distL="0" distR="0" wp14:anchorId="6A67A3D3" wp14:editId="2504C646">
             <wp:extent cx="5905500" cy="2419350"/>
             <wp:effectExtent l="0" t="0" r="0" b="0"/>
-            <wp:docPr id="1526078898" name="Imagen 1526078898"/>
+            <wp:docPr id="1291741542" name="Imagen 1291741542"/>
             <wp:cNvGraphicFramePr>
               <a:graphicFrameLocks xmlns:a="http://schemas.openxmlformats.org/drawingml/2006/main" noChangeAspect="1"/>
             </wp:cNvGraphicFramePr>
@@ -8130,10 +8130,10 @@
           <w:noProof/>
         </w:rPr>
         <w:drawing>
-          <wp:inline distT="0" distB="0" distL="0" distR="0" wp14:anchorId="282BC9F4" wp14:editId="32EF60B8">
+          <wp:inline distT="0" distB="0" distL="0" distR="0" wp14:anchorId="43371F21" wp14:editId="34B21B91">
             <wp:extent cx="5905500" cy="2257425"/>
             <wp:effectExtent l="0" t="0" r="0" b="0"/>
-            <wp:docPr id="133918481" name="Imagen 133918481"/>
+            <wp:docPr id="1206838948" name="Imagen 1206838948"/>
             <wp:cNvGraphicFramePr>
               <a:graphicFrameLocks xmlns:a="http://schemas.openxmlformats.org/drawingml/2006/main" noChangeAspect="1"/>
             </wp:cNvGraphicFramePr>
@@ -8757,10 +8757,10 @@
           <w:noProof/>
         </w:rPr>
         <w:drawing>
-          <wp:inline distT="0" distB="0" distL="0" distR="0" wp14:anchorId="245E4CD6" wp14:editId="50B666FD">
+          <wp:inline distT="0" distB="0" distL="0" distR="0" wp14:anchorId="2FD856B4" wp14:editId="198306BE">
             <wp:extent cx="5334000" cy="3381375"/>
             <wp:effectExtent l="0" t="0" r="0" b="0"/>
-            <wp:docPr id="495285357" name="Imagen 495285357"/>
+            <wp:docPr id="1854364633" name="Imagen 1854364633"/>
             <wp:cNvGraphicFramePr>
               <a:graphicFrameLocks xmlns:a="http://schemas.openxmlformats.org/drawingml/2006/main" noChangeAspect="1"/>
             </wp:cNvGraphicFramePr>
@@ -8910,10 +8910,10 @@
           <w:noProof/>
         </w:rPr>
         <w:drawing>
-          <wp:inline distT="0" distB="0" distL="0" distR="0" wp14:anchorId="0099C910" wp14:editId="26C3136D">
+          <wp:inline distT="0" distB="0" distL="0" distR="0" wp14:anchorId="52A66836" wp14:editId="54F8BA81">
             <wp:extent cx="6096000" cy="1676400"/>
             <wp:effectExtent l="0" t="0" r="0" b="0"/>
-            <wp:docPr id="527784681" name="Imagen 527784681"/>
+            <wp:docPr id="25427096" name="Imagen 25427096"/>
             <wp:cNvGraphicFramePr>
               <a:graphicFrameLocks xmlns:a="http://schemas.openxmlformats.org/drawingml/2006/main" noChangeAspect="1"/>
             </wp:cNvGraphicFramePr>
@@ -9002,10 +9002,10 @@
           <w:noProof/>
         </w:rPr>
         <w:drawing>
-          <wp:inline distT="0" distB="0" distL="0" distR="0" wp14:anchorId="24CD014F" wp14:editId="67B80854">
+          <wp:inline distT="0" distB="0" distL="0" distR="0" wp14:anchorId="6517CD5D" wp14:editId="5D2E5534">
             <wp:extent cx="4762500" cy="2447925"/>
             <wp:effectExtent l="0" t="0" r="0" b="0"/>
-            <wp:docPr id="1308701235" name="Imagen 1308701235"/>
+            <wp:docPr id="714269403" name="Imagen 714269403"/>
             <wp:cNvGraphicFramePr>
               <a:graphicFrameLocks xmlns:a="http://schemas.openxmlformats.org/drawingml/2006/main" noChangeAspect="1"/>
             </wp:cNvGraphicFramePr>
@@ -9132,10 +9132,10 @@
           <w:noProof/>
         </w:rPr>
         <w:drawing>
-          <wp:inline distT="0" distB="0" distL="0" distR="0" wp14:anchorId="1A2471CC" wp14:editId="032E50DE">
+          <wp:inline distT="0" distB="0" distL="0" distR="0" wp14:anchorId="5587A5B9" wp14:editId="4FED9162">
             <wp:extent cx="6096000" cy="3048000"/>
             <wp:effectExtent l="0" t="0" r="0" b="0"/>
-            <wp:docPr id="1165873749" name="Imagen 1165873749"/>
+            <wp:docPr id="862104771" name="Imagen 862104771"/>
             <wp:cNvGraphicFramePr>
               <a:graphicFrameLocks xmlns:a="http://schemas.openxmlformats.org/drawingml/2006/main" noChangeAspect="1"/>
             </wp:cNvGraphicFramePr>
@@ -9277,10 +9277,10 @@
         </w:rPr>
         <w:lastRenderedPageBreak/>
         <w:drawing>
-          <wp:inline distT="0" distB="0" distL="0" distR="0" wp14:anchorId="22E0F924" wp14:editId="2BC29F2A">
+          <wp:inline distT="0" distB="0" distL="0" distR="0" wp14:anchorId="67EF3B02" wp14:editId="5FB7B6D5">
             <wp:extent cx="6096000" cy="3848100"/>
             <wp:effectExtent l="0" t="0" r="0" b="0"/>
-            <wp:docPr id="1786318854" name="Imagen 1786318854"/>
+            <wp:docPr id="722853583" name="Imagen 722853583"/>
             <wp:cNvGraphicFramePr>
               <a:graphicFrameLocks xmlns:a="http://schemas.openxmlformats.org/drawingml/2006/main" noChangeAspect="1"/>
             </wp:cNvGraphicFramePr>
@@ -10162,10 +10162,10 @@
           <w:noProof/>
         </w:rPr>
         <w:drawing>
-          <wp:inline distT="0" distB="0" distL="0" distR="0" wp14:anchorId="6460EADE" wp14:editId="751F33F7">
+          <wp:inline distT="0" distB="0" distL="0" distR="0" wp14:anchorId="25EDF3EE" wp14:editId="34B3B02D">
             <wp:extent cx="6096000" cy="3000375"/>
             <wp:effectExtent l="0" t="0" r="0" b="0"/>
-            <wp:docPr id="1792079688" name="Imagen 1792079688"/>
+            <wp:docPr id="5987165" name="Imagen 5987165"/>
             <wp:cNvGraphicFramePr>
               <a:graphicFrameLocks xmlns:a="http://schemas.openxmlformats.org/drawingml/2006/main" noChangeAspect="1"/>
             </wp:cNvGraphicFramePr>
@@ -10294,6 +10294,16 @@
     </w:p>
     <w:p>
       <w:pPr>
+        <w:spacing w:after="110" w:line="262" w:lineRule="auto"/>
+        <w:jc w:val="both"/>
+      </w:pPr>
+      <w:r>
+        <w:lastRenderedPageBreak/>
+        <w:t>La imagen corresponde al diseño completo. De los cuatro indicadores, los que dependen de las ventas —ventas del día y utilidad del mes— se anuncian como pendientes mientras su módulo no esté construido, en lugar de mostrarse con cifras de ejemplo: un indicador con un número inventado se lee igual que uno real y no hay forma de distinguirlos. Los otros dos se calculan con datos del negocio: las referencias activas del catálogo y las que están en existencias bajas. Estas últimas son además donde vive la alerta que pide RF-INV-07, y por eso debajo de los indicadores se nombran las referencias por reponer, de la más urgente a la menos, con su cantidad restante, su mínimo y el acceso al catálogo ya filtrado; un contador suelto obligaría a ir a buscar de qué referencias se trata. La lista la ven los dos roles del negocio, porque quien está en el mostrador es el primero que nota que algo se acabó.</w:t>
+      </w:r>
+    </w:p>
+    <w:p>
+      <w:pPr>
         <w:spacing w:before="60" w:after="20"/>
         <w:jc w:val="center"/>
       </w:pPr>
@@ -10301,12 +10311,11 @@
         <w:rPr>
           <w:noProof/>
         </w:rPr>
-        <w:lastRenderedPageBreak/>
         <w:drawing>
-          <wp:inline distT="0" distB="0" distL="0" distR="0" wp14:anchorId="49198B75" wp14:editId="7407E3BD">
+          <wp:inline distT="0" distB="0" distL="0" distR="0" wp14:anchorId="6C7A8975" wp14:editId="33F848E9">
             <wp:extent cx="6096000" cy="2857500"/>
             <wp:effectExtent l="0" t="0" r="0" b="0"/>
-            <wp:docPr id="603648078" name="Imagen 603648078"/>
+            <wp:docPr id="528337215" name="Imagen 528337215"/>
             <wp:cNvGraphicFramePr>
               <a:graphicFrameLocks xmlns:a="http://schemas.openxmlformats.org/drawingml/2006/main" noChangeAspect="1"/>
             </wp:cNvGraphicFramePr>
@@ -10409,7 +10418,11 @@
         <w:jc w:val="both"/>
       </w:pPr>
       <w:r>
-        <w:t>Descontinuar pide confirmación, con la consecuencia escrita: la referencia deja de ofrecerse en el punto de venta y conserva sus existencias y su historial. Tiene vuelta atrás, porque se dispara con un clic en una fila y descontinuar la equivocada obligaría, sin ella, a registrar el producto de nuevo con otro código de barras y a partir su historial en dos. Reactivar no pide confirmación: devuelve la referencia al catálogo sin alterar nada más.</w:t>
+        <w:t xml:space="preserve">Descontinuar pide confirmación, con la consecuencia escrita: la referencia deja de ofrecerse en el punto de venta y conserva sus existencias y su historial. Tiene vuelta atrás, porque se dispara con un clic en una fila y descontinuar la equivocada obligaría, sin ella, a registrar el producto de nuevo con otro código </w:t>
+      </w:r>
+      <w:r>
+        <w:lastRenderedPageBreak/>
+        <w:t>de barras y a partir su historial en dos. Reactivar no pide confirmación: devuelve la referencia al catálogo sin alterar nada más.</w:t>
       </w:r>
     </w:p>
     <w:p>
@@ -10430,12 +10443,11 @@
         <w:rPr>
           <w:noProof/>
         </w:rPr>
-        <w:lastRenderedPageBreak/>
         <w:drawing>
-          <wp:inline distT="0" distB="0" distL="0" distR="0" wp14:anchorId="6DB8BA80" wp14:editId="62D7AF9E">
+          <wp:inline distT="0" distB="0" distL="0" distR="0" wp14:anchorId="5711F2C7" wp14:editId="669B97DA">
             <wp:extent cx="6096000" cy="2857500"/>
             <wp:effectExtent l="0" t="0" r="0" b="0"/>
-            <wp:docPr id="797497186" name="Imagen 797497186"/>
+            <wp:docPr id="1064005256" name="Imagen 1064005256"/>
             <wp:cNvGraphicFramePr>
               <a:graphicFrameLocks xmlns:a="http://schemas.openxmlformats.org/drawingml/2006/main" noChangeAspect="1"/>
             </wp:cNvGraphicFramePr>
@@ -10538,6 +10550,7 @@
         <w:jc w:val="both"/>
       </w:pPr>
       <w:r>
+        <w:lastRenderedPageBreak/>
         <w:t>El sistema propone y no aplica, y esa es la regla del requisito (RF-INV-11). Una compra más cara no mueve el precio de venta de la referencia: repreciar solo rompería sin avisar una promoción, un precio acordado con el proveedor o un artículo que se vende casi a costo para atraer clientes. Lo que sí hace el formulario es advertir cuando el precio escrito queda por debajo de lo que costó la mercancía, sin impedir que se guarde, porque una liquidación es una decisión del negocio.</w:t>
       </w:r>
     </w:p>
@@ -10547,11 +10560,7 @@
         <w:jc w:val="both"/>
       </w:pPr>
       <w:r>
-        <w:t xml:space="preserve">Los márgenes se definen por categoría y no producto a producto, que es como trabaja el comercio: una regla por familia y excepciones donde la regla no vale. Aquí la excepción es escribir el precio a mano. Se </w:t>
-      </w:r>
-      <w:r>
-        <w:lastRenderedPageBreak/>
-        <w:t>editan los seis juntos en una ventana que se abre desde la barra superior del catálogo, reservada a quien administra la licorera, y todas las categorías nacen con el mismo valor inicial, que el negocio ajusta.</w:t>
+        <w:t>Los márgenes se definen por categoría y no producto a producto, que es como trabaja el comercio: una regla por familia y excepciones donde la regla no vale. Aquí la excepción es escribir el precio a mano. Se editan los seis juntos en una ventana que se abre desde la barra superior del catálogo, reservada a quien administra la licorera, y todas las categorías nacen con el mismo valor inicial, que el negocio ajusta.</w:t>
       </w:r>
     </w:p>
     <w:p>
@@ -10564,10 +10573,10 @@
           <w:noProof/>
         </w:rPr>
         <w:drawing>
-          <wp:inline distT="0" distB="0" distL="0" distR="0" wp14:anchorId="077928A1" wp14:editId="4E184F00">
+          <wp:inline distT="0" distB="0" distL="0" distR="0" wp14:anchorId="7A1D850C" wp14:editId="59860B0E">
             <wp:extent cx="4953000" cy="4067175"/>
             <wp:effectExtent l="0" t="0" r="0" b="0"/>
-            <wp:docPr id="1110371434" name="Imagen 1110371434"/>
+            <wp:docPr id="1525860663" name="Imagen 1525860663"/>
             <wp:cNvGraphicFramePr>
               <a:graphicFrameLocks xmlns:a="http://schemas.openxmlformats.org/drawingml/2006/main" noChangeAspect="1"/>
             </wp:cNvGraphicFramePr>
@@ -10661,6 +10670,7 @@
         <w:jc w:val="both"/>
       </w:pPr>
       <w:r>
+        <w:lastRenderedPageBreak/>
         <w:t>Debajo se listan las entradas ya registradas con su fecha, su proveedor, los productos que trajo cada una y su costo total. Ninguna ofrece acción de edición ni de borrado: una entrada registrada movió existencias y quedó anotada en el kardex, de modo que modificarla haría que los saldos posteriores dejaran de cuadrar. Lo que corrige una entrada equivocada es un ajuste de existencias con su motivo, descrito en el apartado siguiente.</w:t>
       </w:r>
     </w:p>
@@ -10673,12 +10683,11 @@
         <w:rPr>
           <w:noProof/>
         </w:rPr>
-        <w:lastRenderedPageBreak/>
         <w:drawing>
-          <wp:inline distT="0" distB="0" distL="0" distR="0" wp14:anchorId="159B9AC7" wp14:editId="0D8D8DBA">
+          <wp:inline distT="0" distB="0" distL="0" distR="0" wp14:anchorId="0662EEEF" wp14:editId="1C74E7F2">
             <wp:extent cx="6096000" cy="4124325"/>
             <wp:effectExtent l="0" t="0" r="0" b="0"/>
-            <wp:docPr id="2070896056" name="Imagen 2070896056"/>
+            <wp:docPr id="334874936" name="Imagen 334874936"/>
             <wp:cNvGraphicFramePr>
               <a:graphicFrameLocks xmlns:a="http://schemas.openxmlformats.org/drawingml/2006/main" noChangeAspect="1"/>
             </wp:cNvGraphicFramePr>
@@ -10786,10 +10795,10 @@
         </w:rPr>
         <w:lastRenderedPageBreak/>
         <w:drawing>
-          <wp:inline distT="0" distB="0" distL="0" distR="0" wp14:anchorId="0A82CC59" wp14:editId="56E63983">
+          <wp:inline distT="0" distB="0" distL="0" distR="0" wp14:anchorId="4BF2ED54" wp14:editId="4187951E">
             <wp:extent cx="6096000" cy="4162425"/>
             <wp:effectExtent l="0" t="0" r="0" b="0"/>
-            <wp:docPr id="1954378961" name="Imagen 1954378961"/>
+            <wp:docPr id="892471978" name="Imagen 892471978"/>
             <wp:cNvGraphicFramePr>
               <a:graphicFrameLocks xmlns:a="http://schemas.openxmlformats.org/drawingml/2006/main" noChangeAspect="1"/>
             </wp:cNvGraphicFramePr>
@@ -10887,10 +10896,10 @@
           <w:noProof/>
         </w:rPr>
         <w:drawing>
-          <wp:inline distT="0" distB="0" distL="0" distR="0" wp14:anchorId="593945DB" wp14:editId="0539D8A6">
+          <wp:inline distT="0" distB="0" distL="0" distR="0" wp14:anchorId="0970856E" wp14:editId="3CBB8528">
             <wp:extent cx="6096000" cy="2562225"/>
             <wp:effectExtent l="0" t="0" r="0" b="0"/>
-            <wp:docPr id="1616278903" name="Imagen 1616278903"/>
+            <wp:docPr id="556486425" name="Imagen 556486425"/>
             <wp:cNvGraphicFramePr>
               <a:graphicFrameLocks xmlns:a="http://schemas.openxmlformats.org/drawingml/2006/main" noChangeAspect="1"/>
             </wp:cNvGraphicFramePr>
@@ -10980,10 +10989,10 @@
           <w:noProof/>
         </w:rPr>
         <w:drawing>
-          <wp:inline distT="0" distB="0" distL="0" distR="0" wp14:anchorId="173915F9" wp14:editId="040CB7BE">
+          <wp:inline distT="0" distB="0" distL="0" distR="0" wp14:anchorId="00F03237" wp14:editId="19C323ED">
             <wp:extent cx="6096000" cy="2857500"/>
             <wp:effectExtent l="0" t="0" r="0" b="0"/>
-            <wp:docPr id="501368526" name="Imagen 501368526"/>
+            <wp:docPr id="124470600" name="Imagen 124470600"/>
             <wp:cNvGraphicFramePr>
               <a:graphicFrameLocks xmlns:a="http://schemas.openxmlformats.org/drawingml/2006/main" noChangeAspect="1"/>
             </wp:cNvGraphicFramePr>
@@ -11100,10 +11109,10 @@
         </w:rPr>
         <w:lastRenderedPageBreak/>
         <w:drawing>
-          <wp:inline distT="0" distB="0" distL="0" distR="0" wp14:anchorId="76F1B608" wp14:editId="31E15215">
+          <wp:inline distT="0" distB="0" distL="0" distR="0" wp14:anchorId="6E45FA90" wp14:editId="0DAA45E3">
             <wp:extent cx="6096000" cy="2857500"/>
             <wp:effectExtent l="0" t="0" r="0" b="0"/>
-            <wp:docPr id="407542715" name="Imagen 407542715"/>
+            <wp:docPr id="1676644751" name="Imagen 1676644751"/>
             <wp:cNvGraphicFramePr>
               <a:graphicFrameLocks xmlns:a="http://schemas.openxmlformats.org/drawingml/2006/main" noChangeAspect="1"/>
             </wp:cNvGraphicFramePr>
@@ -11211,10 +11220,10 @@
         </w:rPr>
         <w:lastRenderedPageBreak/>
         <w:drawing>
-          <wp:inline distT="0" distB="0" distL="0" distR="0" wp14:anchorId="2C16CF2A" wp14:editId="02164871">
+          <wp:inline distT="0" distB="0" distL="0" distR="0" wp14:anchorId="5847CFFC" wp14:editId="5602CB11">
             <wp:extent cx="6096000" cy="3562350"/>
             <wp:effectExtent l="0" t="0" r="0" b="0"/>
-            <wp:docPr id="648902476" name="Imagen 648902476"/>
+            <wp:docPr id="2067985475" name="Imagen 2067985475"/>
             <wp:cNvGraphicFramePr>
               <a:graphicFrameLocks xmlns:a="http://schemas.openxmlformats.org/drawingml/2006/main" noChangeAspect="1"/>
             </wp:cNvGraphicFramePr>
@@ -11322,10 +11331,10 @@
         </w:rPr>
         <w:lastRenderedPageBreak/>
         <w:drawing>
-          <wp:inline distT="0" distB="0" distL="0" distR="0" wp14:anchorId="2BE5C3C9" wp14:editId="2894BA5C">
+          <wp:inline distT="0" distB="0" distL="0" distR="0" wp14:anchorId="443520D2" wp14:editId="4538E35E">
             <wp:extent cx="6096000" cy="3067050"/>
             <wp:effectExtent l="0" t="0" r="0" b="0"/>
-            <wp:docPr id="443020521" name="Imagen 443020521"/>
+            <wp:docPr id="309173736" name="Imagen 309173736"/>
             <wp:cNvGraphicFramePr>
               <a:graphicFrameLocks xmlns:a="http://schemas.openxmlformats.org/drawingml/2006/main" noChangeAspect="1"/>
             </wp:cNvGraphicFramePr>
@@ -11442,10 +11451,10 @@
         </w:rPr>
         <w:lastRenderedPageBreak/>
         <w:drawing>
-          <wp:inline distT="0" distB="0" distL="0" distR="0" wp14:anchorId="6CBE18B6" wp14:editId="53C6EE49">
+          <wp:inline distT="0" distB="0" distL="0" distR="0" wp14:anchorId="32776723" wp14:editId="29BC8953">
             <wp:extent cx="6096000" cy="4114800"/>
             <wp:effectExtent l="0" t="0" r="0" b="0"/>
-            <wp:docPr id="401995199" name="Imagen 401995199"/>
+            <wp:docPr id="809669241" name="Imagen 809669241"/>
             <wp:cNvGraphicFramePr>
               <a:graphicFrameLocks xmlns:a="http://schemas.openxmlformats.org/drawingml/2006/main" noChangeAspect="1"/>
             </wp:cNvGraphicFramePr>
@@ -11536,10 +11545,10 @@
           <w:noProof/>
         </w:rPr>
         <w:drawing>
-          <wp:inline distT="0" distB="0" distL="0" distR="0" wp14:anchorId="11B03D37" wp14:editId="31292087">
+          <wp:inline distT="0" distB="0" distL="0" distR="0" wp14:anchorId="40ED064D" wp14:editId="601786F2">
             <wp:extent cx="6096000" cy="2733675"/>
             <wp:effectExtent l="0" t="0" r="0" b="0"/>
-            <wp:docPr id="1577410697" name="Imagen 1577410697"/>
+            <wp:docPr id="470267597" name="Imagen 470267597"/>
             <wp:cNvGraphicFramePr>
               <a:graphicFrameLocks xmlns:a="http://schemas.openxmlformats.org/drawingml/2006/main" noChangeAspect="1"/>
             </wp:cNvGraphicFramePr>
@@ -12412,10 +12421,10 @@
           <w:noProof/>
         </w:rPr>
         <w:drawing>
-          <wp:inline distT="0" distB="0" distL="0" distR="0" wp14:anchorId="11D1A1B4" wp14:editId="323534E2">
+          <wp:inline distT="0" distB="0" distL="0" distR="0" wp14:anchorId="01A0DCFE" wp14:editId="134A9F0B">
             <wp:extent cx="6096000" cy="3295650"/>
             <wp:effectExtent l="0" t="0" r="0" b="0"/>
-            <wp:docPr id="804573650" name="Imagen 804573650"/>
+            <wp:docPr id="1345291109" name="Imagen 1345291109"/>
             <wp:cNvGraphicFramePr>
               <a:graphicFrameLocks xmlns:a="http://schemas.openxmlformats.org/drawingml/2006/main" noChangeAspect="1"/>
             </wp:cNvGraphicFramePr>
@@ -12532,10 +12541,10 @@
         </w:rPr>
         <w:lastRenderedPageBreak/>
         <w:drawing>
-          <wp:inline distT="0" distB="0" distL="0" distR="0" wp14:anchorId="3E3A884F" wp14:editId="668C201B">
+          <wp:inline distT="0" distB="0" distL="0" distR="0" wp14:anchorId="30C42744" wp14:editId="70231881">
             <wp:extent cx="6096000" cy="3067050"/>
             <wp:effectExtent l="0" t="0" r="0" b="0"/>
-            <wp:docPr id="1494839543" name="Imagen 1494839543"/>
+            <wp:docPr id="1694399042" name="Imagen 1694399042"/>
             <wp:cNvGraphicFramePr>
               <a:graphicFrameLocks xmlns:a="http://schemas.openxmlformats.org/drawingml/2006/main" noChangeAspect="1"/>
             </wp:cNvGraphicFramePr>
@@ -13561,13 +13570,7 @@
         <w:spacing w:after="60" w:line="258" w:lineRule="auto"/>
       </w:pPr>
       <w:r>
-        <w:rPr>
-          <w:lang w:val="en-US"/>
-        </w:rPr>
-        <w:t xml:space="preserve">World Wide Web Consortium. Web Content Accessibility Guidelines (WCAG) 2.1. </w:t>
-      </w:r>
-      <w:r>
-        <w:t>W3C, 2018.</w:t>
+        <w:t>World Wide Web Consortium. Web Content Accessibility Guidelines (WCAG) 2.1. W3C, 2018.</w:t>
       </w:r>
     </w:p>
     <w:p>
@@ -13707,10 +13710,10 @@
 <file path=word/numbering.xml><?xml version="1.0" encoding="utf-8"?>
 <w:numbering xmlns:wpc="http://schemas.microsoft.com/office/word/2010/wordprocessingCanvas" xmlns:cx="http://schemas.microsoft.com/office/drawing/2014/chartex" xmlns:cx1="http://schemas.microsoft.com/office/drawing/2015/9/8/chartex" xmlns:cx2="http://schemas.microsoft.com/office/drawing/2015/10/21/chartex" xmlns:cx3="http://schemas.microsoft.com/office/drawing/2016/5/9/chartex" xmlns:cx4="http://schemas.microsoft.com/office/drawing/2016/5/10/chartex" xmlns:cx5="http://schemas.microsoft.com/office/drawing/2016/5/11/chartex" xmlns:cx6="http://schemas.microsoft.com/office/drawing/2016/5/12/chartex" xmlns:cx7="http://schemas.microsoft.com/office/drawing/2016/5/13/chartex" xmlns:cx8="http://schemas.microsoft.com/office/drawing/2016/5/14/chartex" xmlns:mc="http://schemas.openxmlformats.org/markup-compatibility/2006" xmlns:aink="http://schemas.microsoft.com/office/drawing/2016/ink" xmlns:am3d="http://schemas.microsoft.com/office/drawing/2017/model3d" xmlns:o="urn:schemas-microsoft-com:office:office" xmlns:oel="http://schemas.microsoft.com/office/2019/extlst" xmlns:r="http://schemas.openxmlformats.org/officeDocument/2006/relationships" xmlns:m="http://schemas.openxmlformats.org/officeDocument/2006/math" xmlns:v="urn:schemas-microsoft-com:vml" xmlns:wp14="http://schemas.microsoft.com/office/word/2010/wordprocessingDrawing" xmlns:wp="http://schemas.openxmlformats.org/drawingml/2006/wordprocessingDrawing" xmlns:w10="urn:schemas-microsoft-com:office:word" xmlns:w="http://schemas.openxmlformats.org/wordprocessingml/2006/main" xmlns:w14="http://schemas.microsoft.com/office/word/2010/wordml" xmlns:w15="http://schemas.microsoft.com/office/word/2012/wordml" xmlns:w16cex="http://schemas.microsoft.com/office/word/2018/wordml/cex" xmlns:w16cid="http://schemas.microsoft.com/office/word/2016/wordml/cid" xmlns:w16="http://schemas.microsoft.com/office/word/2018/wordml" xmlns:w16du="http://schemas.microsoft.com/office/word/2023/wordml/word16du" xmlns:w16sdtdh="http://schemas.microsoft.com/office/word/2020/wordml/sdtdatahash" xmlns:w16sdtfl="http://schemas.microsoft.com/office/word/2024/wordml/sdtformatlock" xmlns:w16se="http://schemas.microsoft.com/office/word/2015/wordml/symex" xmlns:wpg="http://schemas.microsoft.com/office/word/2010/wordprocessingGroup" xmlns:wpi="http://schemas.microsoft.com/office/word/2010/wordprocessingInk" xmlns:wne="http://schemas.microsoft.com/office/word/2006/wordml" xmlns:wps="http://schemas.microsoft.com/office/word/2010/wordprocessingShape" mc:Ignorable="w14 w15 w16se w16cid w16 w16cex w16sdtdh w16sdtfl w16du wp14">
   <w:abstractNum w:abstractNumId="0" w15:restartNumberingAfterBreak="0">
-    <w:nsid w:val="59303DDF"/>
+    <w:nsid w:val="4E1E0922"/>
     <w:multiLevelType w:val="hybridMultilevel"/>
-    <w:tmpl w:val="EF68FA02"/>
-    <w:lvl w:ilvl="0" w:tplc="ACB2D1F8">
+    <w:tmpl w:val="C8A89390"/>
+    <w:lvl w:ilvl="0" w:tplc="74EE542E">
       <w:start w:val="1"/>
       <w:numFmt w:val="bullet"/>
       <w:lvlText w:val="●"/>
@@ -13719,7 +13722,7 @@
         <w:ind w:left="720" w:hanging="360"/>
       </w:pPr>
     </w:lvl>
-    <w:lvl w:ilvl="1" w:tplc="D39CB59C">
+    <w:lvl w:ilvl="1" w:tplc="BD2248F6">
       <w:start w:val="1"/>
       <w:numFmt w:val="bullet"/>
       <w:lvlText w:val="○"/>
@@ -13728,7 +13731,7 @@
         <w:ind w:left="1440" w:hanging="360"/>
       </w:pPr>
     </w:lvl>
-    <w:lvl w:ilvl="2" w:tplc="BAEEEC8A">
+    <w:lvl w:ilvl="2" w:tplc="66ECE136">
       <w:start w:val="1"/>
       <w:numFmt w:val="bullet"/>
       <w:lvlText w:val="■"/>
@@ -13737,7 +13740,7 @@
         <w:ind w:left="2160" w:hanging="360"/>
       </w:pPr>
     </w:lvl>
-    <w:lvl w:ilvl="3" w:tplc="0C821D9E">
+    <w:lvl w:ilvl="3" w:tplc="7074ABFC">
       <w:start w:val="1"/>
       <w:numFmt w:val="bullet"/>
       <w:lvlText w:val="●"/>
@@ -13746,7 +13749,7 @@
         <w:ind w:left="2880" w:hanging="360"/>
       </w:pPr>
     </w:lvl>
-    <w:lvl w:ilvl="4" w:tplc="83BC3DAA">
+    <w:lvl w:ilvl="4" w:tplc="7EEA35C6">
       <w:start w:val="1"/>
       <w:numFmt w:val="bullet"/>
       <w:lvlText w:val="○"/>
@@ -13755,7 +13758,7 @@
         <w:ind w:left="3600" w:hanging="360"/>
       </w:pPr>
     </w:lvl>
-    <w:lvl w:ilvl="5" w:tplc="2CA4D766">
+    <w:lvl w:ilvl="5" w:tplc="7326E8D0">
       <w:start w:val="1"/>
       <w:numFmt w:val="bullet"/>
       <w:lvlText w:val="■"/>
@@ -13764,7 +13767,7 @@
         <w:ind w:left="4320" w:hanging="360"/>
       </w:pPr>
     </w:lvl>
-    <w:lvl w:ilvl="6" w:tplc="0E6A5060">
+    <w:lvl w:ilvl="6" w:tplc="24A88BC0">
       <w:start w:val="1"/>
       <w:numFmt w:val="bullet"/>
       <w:lvlText w:val="●"/>
@@ -13773,7 +13776,7 @@
         <w:ind w:left="5040" w:hanging="360"/>
       </w:pPr>
     </w:lvl>
-    <w:lvl w:ilvl="7" w:tplc="F146C59A">
+    <w:lvl w:ilvl="7" w:tplc="C2386944">
       <w:start w:val="1"/>
       <w:numFmt w:val="bullet"/>
       <w:lvlText w:val="●"/>
@@ -13782,7 +13785,7 @@
         <w:ind w:left="5760" w:hanging="360"/>
       </w:pPr>
     </w:lvl>
-    <w:lvl w:ilvl="8" w:tplc="4532F310">
+    <w:lvl w:ilvl="8" w:tplc="F452B426">
       <w:start w:val="1"/>
       <w:numFmt w:val="bullet"/>
       <w:lvlText w:val="●"/>
@@ -13792,7 +13795,7 @@
       </w:pPr>
     </w:lvl>
   </w:abstractNum>
-  <w:num w:numId="1" w16cid:durableId="1499075634">
+  <w:num w:numId="1" w16cid:durableId="2054647136">
     <w:abstractNumId w:val="0"/>
     <w:lvlOverride w:ilvl="0">
       <w:startOverride w:val="1"/>

</xml_diff>

<commit_message>
Dibujo y documento las cuatro pantallas que faltaban de ventas
De los seis requisitos del modulo, el papel solo describia uno: sin comprobante, historial, anulacion ni cierre no hay contra que construir.
</commit_message>
<xml_diff>
--- a/docs/diseno/INVENTRA_Documento_Tecnico_Diseno.docx
+++ b/docs/diseno/INVENTRA_Documento_Tecnico_Diseno.docx
@@ -145,7 +145,7 @@
           <w:left w:w="10" w:type="dxa"/>
           <w:right w:w="10" w:type="dxa"/>
         </w:tblCellMar>
-        <w:tblLook w:val="0000" w:firstRow="0" w:lastRow="0" w:firstColumn="0" w:lastColumn="0" w:noHBand="0" w:noVBand="0"/>
+        <w:tblLook w:val="04A0" w:firstRow="1" w:lastRow="0" w:firstColumn="1" w:lastColumn="0" w:noHBand="0" w:noVBand="1"/>
       </w:tblPr>
       <w:tblGrid>
         <w:gridCol w:w="1500"/>
@@ -1913,7 +1913,7 @@
             <w:sz w:val="20"/>
             <w:szCs w:val="20"/>
           </w:rPr>
-          <w:t>8.8 Reportes</w:t>
+          <w:t>8.8 Ventas: historial y anulación</w:t>
         </w:r>
       </w:hyperlink>
       <w:r>
@@ -1957,7 +1957,7 @@
             <w:sz w:val="20"/>
             <w:szCs w:val="20"/>
           </w:rPr>
-          <w:t>8.9 Usuarios de la licorera</w:t>
+          <w:t>8.9 Cierre de caja</w:t>
         </w:r>
       </w:hyperlink>
       <w:r>
@@ -2001,7 +2001,7 @@
             <w:sz w:val="20"/>
             <w:szCs w:val="20"/>
           </w:rPr>
-          <w:t>8.10 Mi perfil</w:t>
+          <w:t>8.10 Reportes</w:t>
         </w:r>
       </w:hyperlink>
       <w:r>
@@ -2045,7 +2045,7 @@
             <w:sz w:val="20"/>
             <w:szCs w:val="20"/>
           </w:rPr>
-          <w:t>8.11 Mi suscripción</w:t>
+          <w:t>8.11 Usuarios de la licorera</w:t>
         </w:r>
       </w:hyperlink>
       <w:r>
@@ -2089,7 +2089,7 @@
             <w:sz w:val="20"/>
             <w:szCs w:val="20"/>
           </w:rPr>
-          <w:t>8.12 Plataforma</w:t>
+          <w:t>8.12 Mi perfil</w:t>
         </w:r>
       </w:hyperlink>
       <w:r>
@@ -2124,8 +2124,96 @@
           <w:tab w:val="right" w:leader="dot" w:pos="9200"/>
         </w:tabs>
         <w:spacing w:after="40" w:line="252" w:lineRule="auto"/>
+        <w:ind w:left="360"/>
       </w:pPr>
       <w:hyperlink w:anchor="bm40" w:history="1">
+        <w:r>
+          <w:rPr>
+            <w:color w:val="1F3864"/>
+            <w:sz w:val="20"/>
+            <w:szCs w:val="20"/>
+          </w:rPr>
+          <w:t>8.13 Mi suscripción</w:t>
+        </w:r>
+      </w:hyperlink>
+      <w:r>
+        <w:rPr>
+          <w:sz w:val="20"/>
+          <w:szCs w:val="20"/>
+        </w:rPr>
+        <w:tab/>
+      </w:r>
+      <w:r>
+        <w:fldChar w:fldCharType="begin"/>
+      </w:r>
+      <w:r>
+        <w:instrText>PAGEREF bm40</w:instrText>
+      </w:r>
+      <w:r>
+        <w:fldChar w:fldCharType="separate"/>
+      </w:r>
+      <w:r>
+        <w:rPr>
+          <w:noProof/>
+        </w:rPr>
+        <w:t>1</w:t>
+      </w:r>
+      <w:r>
+        <w:fldChar w:fldCharType="end"/>
+      </w:r>
+    </w:p>
+    <w:p>
+      <w:pPr>
+        <w:tabs>
+          <w:tab w:val="right" w:leader="dot" w:pos="9200"/>
+        </w:tabs>
+        <w:spacing w:after="40" w:line="252" w:lineRule="auto"/>
+        <w:ind w:left="360"/>
+      </w:pPr>
+      <w:hyperlink w:anchor="bm41" w:history="1">
+        <w:r>
+          <w:rPr>
+            <w:color w:val="1F3864"/>
+            <w:sz w:val="20"/>
+            <w:szCs w:val="20"/>
+          </w:rPr>
+          <w:t>8.14 Plataforma</w:t>
+        </w:r>
+      </w:hyperlink>
+      <w:r>
+        <w:rPr>
+          <w:sz w:val="20"/>
+          <w:szCs w:val="20"/>
+        </w:rPr>
+        <w:tab/>
+      </w:r>
+      <w:r>
+        <w:fldChar w:fldCharType="begin"/>
+      </w:r>
+      <w:r>
+        <w:instrText>PAGEREF bm41</w:instrText>
+      </w:r>
+      <w:r>
+        <w:fldChar w:fldCharType="separate"/>
+      </w:r>
+      <w:r>
+        <w:rPr>
+          <w:noProof/>
+        </w:rPr>
+        <w:t>1</w:t>
+      </w:r>
+      <w:r>
+        <w:fldChar w:fldCharType="end"/>
+      </w:r>
+    </w:p>
+    <w:p>
+      <w:pPr>
+        <w:tabs>
+          <w:tab w:val="right" w:leader="dot" w:pos="9200"/>
+        </w:tabs>
+        <w:spacing w:after="40" w:line="252" w:lineRule="auto"/>
+      </w:pPr>
+      <w:hyperlink w:anchor="bm42" w:history="1">
         <w:r>
           <w:rPr>
             <w:b/>
@@ -2148,7 +2236,7 @@
         <w:fldChar w:fldCharType="begin"/>
       </w:r>
       <w:r>
-        <w:instrText>PAGEREF bm40</w:instrText>
+        <w:instrText>PAGEREF bm42</w:instrText>
       </w:r>
       <w:r>
         <w:fldChar w:fldCharType="separate"/>
@@ -2171,7 +2259,7 @@
         <w:spacing w:after="40" w:line="252" w:lineRule="auto"/>
         <w:ind w:left="360"/>
       </w:pPr>
-      <w:hyperlink w:anchor="bm41" w:history="1">
+      <w:hyperlink w:anchor="bm43" w:history="1">
         <w:r>
           <w:rPr>
             <w:color w:val="1F3864"/>
@@ -2192,7 +2280,7 @@
         <w:fldChar w:fldCharType="begin"/>
       </w:r>
       <w:r>
-        <w:instrText>PAGEREF bm41</w:instrText>
+        <w:instrText>PAGEREF bm43</w:instrText>
       </w:r>
       <w:r>
         <w:fldChar w:fldCharType="separate"/>
@@ -2215,7 +2303,7 @@
         <w:spacing w:after="40" w:line="252" w:lineRule="auto"/>
         <w:ind w:left="360"/>
       </w:pPr>
-      <w:hyperlink w:anchor="bm42" w:history="1">
+      <w:hyperlink w:anchor="bm44" w:history="1">
         <w:r>
           <w:rPr>
             <w:color w:val="1F3864"/>
@@ -2236,7 +2324,7 @@
         <w:fldChar w:fldCharType="begin"/>
       </w:r>
       <w:r>
-        <w:instrText>PAGEREF bm42</w:instrText>
+        <w:instrText>PAGEREF bm44</w:instrText>
       </w:r>
       <w:r>
         <w:fldChar w:fldCharType="separate"/>
@@ -2258,7 +2346,7 @@
         </w:tabs>
         <w:spacing w:after="40" w:line="252" w:lineRule="auto"/>
       </w:pPr>
-      <w:hyperlink w:anchor="bm43" w:history="1">
+      <w:hyperlink w:anchor="bm45" w:history="1">
         <w:r>
           <w:rPr>
             <w:b/>
@@ -2281,7 +2369,7 @@
         <w:fldChar w:fldCharType="begin"/>
       </w:r>
       <w:r>
-        <w:instrText>PAGEREF bm43</w:instrText>
+        <w:instrText>PAGEREF bm45</w:instrText>
       </w:r>
       <w:r>
         <w:fldChar w:fldCharType="separate"/>
@@ -2304,7 +2392,7 @@
         <w:spacing w:after="40" w:line="252" w:lineRule="auto"/>
         <w:ind w:left="360"/>
       </w:pPr>
-      <w:hyperlink w:anchor="bm44" w:history="1">
+      <w:hyperlink w:anchor="bm46" w:history="1">
         <w:r>
           <w:rPr>
             <w:color w:val="1F3864"/>
@@ -2325,7 +2413,7 @@
         <w:fldChar w:fldCharType="begin"/>
       </w:r>
       <w:r>
-        <w:instrText>PAGEREF bm44</w:instrText>
+        <w:instrText>PAGEREF bm46</w:instrText>
       </w:r>
       <w:r>
         <w:fldChar w:fldCharType="separate"/>
@@ -2348,7 +2436,7 @@
         <w:spacing w:after="40" w:line="252" w:lineRule="auto"/>
         <w:ind w:left="360"/>
       </w:pPr>
-      <w:hyperlink w:anchor="bm45" w:history="1">
+      <w:hyperlink w:anchor="bm47" w:history="1">
         <w:r>
           <w:rPr>
             <w:color w:val="1F3864"/>
@@ -2369,7 +2457,7 @@
         <w:fldChar w:fldCharType="begin"/>
       </w:r>
       <w:r>
-        <w:instrText>PAGEREF bm45</w:instrText>
+        <w:instrText>PAGEREF bm47</w:instrText>
       </w:r>
       <w:r>
         <w:fldChar w:fldCharType="separate"/>
@@ -2392,7 +2480,7 @@
         <w:spacing w:after="40" w:line="252" w:lineRule="auto"/>
         <w:ind w:left="360"/>
       </w:pPr>
-      <w:hyperlink w:anchor="bm46" w:history="1">
+      <w:hyperlink w:anchor="bm48" w:history="1">
         <w:r>
           <w:rPr>
             <w:color w:val="1F3864"/>
@@ -2413,7 +2501,7 @@
         <w:fldChar w:fldCharType="begin"/>
       </w:r>
       <w:r>
-        <w:instrText>PAGEREF bm46</w:instrText>
+        <w:instrText>PAGEREF bm48</w:instrText>
       </w:r>
       <w:r>
         <w:fldChar w:fldCharType="separate"/>
@@ -2435,7 +2523,7 @@
         </w:tabs>
         <w:spacing w:after="40" w:line="252" w:lineRule="auto"/>
       </w:pPr>
-      <w:hyperlink w:anchor="bm47" w:history="1">
+      <w:hyperlink w:anchor="bm49" w:history="1">
         <w:r>
           <w:rPr>
             <w:b/>
@@ -2458,7 +2546,7 @@
         <w:fldChar w:fldCharType="begin"/>
       </w:r>
       <w:r>
-        <w:instrText>PAGEREF bm47</w:instrText>
+        <w:instrText>PAGEREF bm49</w:instrText>
       </w:r>
       <w:r>
         <w:fldChar w:fldCharType="separate"/>
@@ -2480,7 +2568,7 @@
         </w:tabs>
         <w:spacing w:after="40" w:line="252" w:lineRule="auto"/>
       </w:pPr>
-      <w:hyperlink w:anchor="bm48" w:history="1">
+      <w:hyperlink w:anchor="bm50" w:history="1">
         <w:r>
           <w:rPr>
             <w:b/>
@@ -2503,7 +2591,7 @@
         <w:fldChar w:fldCharType="begin"/>
       </w:r>
       <w:r>
-        <w:instrText>PAGEREF bm48</w:instrText>
+        <w:instrText>PAGEREF bm50</w:instrText>
       </w:r>
       <w:r>
         <w:fldChar w:fldCharType="separate"/>
@@ -2525,7 +2613,7 @@
         </w:tabs>
         <w:spacing w:after="40" w:line="252" w:lineRule="auto"/>
       </w:pPr>
-      <w:hyperlink w:anchor="bm49" w:history="1">
+      <w:hyperlink w:anchor="bm51" w:history="1">
         <w:r>
           <w:rPr>
             <w:b/>
@@ -2548,7 +2636,7 @@
         <w:fldChar w:fldCharType="begin"/>
       </w:r>
       <w:r>
-        <w:instrText>PAGEREF bm49</w:instrText>
+        <w:instrText>PAGEREF bm51</w:instrText>
       </w:r>
       <w:r>
         <w:fldChar w:fldCharType="separate"/>
@@ -2980,7 +3068,7 @@
           <w:noProof/>
         </w:rPr>
         <w:drawing>
-          <wp:inline distT="0" distB="0" distL="0" distR="0" wp14:anchorId="2C7A162B" wp14:editId="62B14CC1">
+          <wp:inline distT="0" distB="0" distL="0" distR="0" wp14:anchorId="6492A5E3" wp14:editId="68F2F285">
             <wp:extent cx="5905500" cy="2324100"/>
             <wp:effectExtent l="0" t="0" r="0" b="0"/>
             <wp:docPr id="1" name="Imagen 1"/>
@@ -3063,10 +3151,10 @@
           <w:noProof/>
         </w:rPr>
         <w:drawing>
-          <wp:inline distT="0" distB="0" distL="0" distR="0" wp14:anchorId="46DA7FD9" wp14:editId="47678BB6">
+          <wp:inline distT="0" distB="0" distL="0" distR="0" wp14:anchorId="4B4EB839" wp14:editId="25FE4FBB">
             <wp:extent cx="5334000" cy="2371725"/>
             <wp:effectExtent l="0" t="0" r="0" b="0"/>
-            <wp:docPr id="743026117" name="Imagen 743026117"/>
+            <wp:docPr id="1330692320" name="Imagen 1330692320"/>
             <wp:cNvGraphicFramePr>
               <a:graphicFrameLocks xmlns:a="http://schemas.openxmlformats.org/drawingml/2006/main" noChangeAspect="1"/>
             </wp:cNvGraphicFramePr>
@@ -3161,7 +3249,7 @@
           <w:left w:w="10" w:type="dxa"/>
           <w:right w:w="10" w:type="dxa"/>
         </w:tblCellMar>
-        <w:tblLook w:val="0000" w:firstRow="0" w:lastRow="0" w:firstColumn="0" w:lastColumn="0" w:noHBand="0" w:noVBand="0"/>
+        <w:tblLook w:val="04A0" w:firstRow="1" w:lastRow="0" w:firstColumn="1" w:lastColumn="0" w:noHBand="0" w:noVBand="1"/>
       </w:tblPr>
       <w:tblGrid>
         <w:gridCol w:w="1850"/>
@@ -5205,7 +5293,7 @@
           <w:left w:w="10" w:type="dxa"/>
           <w:right w:w="10" w:type="dxa"/>
         </w:tblCellMar>
-        <w:tblLook w:val="0000" w:firstRow="0" w:lastRow="0" w:firstColumn="0" w:lastColumn="0" w:noHBand="0" w:noVBand="0"/>
+        <w:tblLook w:val="04A0" w:firstRow="1" w:lastRow="0" w:firstColumn="1" w:lastColumn="0" w:noHBand="0" w:noVBand="1"/>
       </w:tblPr>
       <w:tblGrid>
         <w:gridCol w:w="2400"/>
@@ -6056,7 +6144,7 @@
           <w:left w:w="10" w:type="dxa"/>
           <w:right w:w="10" w:type="dxa"/>
         </w:tblCellMar>
-        <w:tblLook w:val="0000" w:firstRow="0" w:lastRow="0" w:firstColumn="0" w:lastColumn="0" w:noHBand="0" w:noVBand="0"/>
+        <w:tblLook w:val="04A0" w:firstRow="1" w:lastRow="0" w:firstColumn="1" w:lastColumn="0" w:noHBand="0" w:noVBand="1"/>
       </w:tblPr>
       <w:tblGrid>
         <w:gridCol w:w="2200"/>
@@ -6422,7 +6510,7 @@
           <w:left w:w="10" w:type="dxa"/>
           <w:right w:w="10" w:type="dxa"/>
         </w:tblCellMar>
-        <w:tblLook w:val="0000" w:firstRow="0" w:lastRow="0" w:firstColumn="0" w:lastColumn="0" w:noHBand="0" w:noVBand="0"/>
+        <w:tblLook w:val="04A0" w:firstRow="1" w:lastRow="0" w:firstColumn="1" w:lastColumn="0" w:noHBand="0" w:noVBand="1"/>
       </w:tblPr>
       <w:tblGrid>
         <w:gridCol w:w="2200"/>
@@ -6834,7 +6922,7 @@
           <w:left w:w="10" w:type="dxa"/>
           <w:right w:w="10" w:type="dxa"/>
         </w:tblCellMar>
-        <w:tblLook w:val="0000" w:firstRow="0" w:lastRow="0" w:firstColumn="0" w:lastColumn="0" w:noHBand="0" w:noVBand="0"/>
+        <w:tblLook w:val="04A0" w:firstRow="1" w:lastRow="0" w:firstColumn="1" w:lastColumn="0" w:noHBand="0" w:noVBand="1"/>
       </w:tblPr>
       <w:tblGrid>
         <w:gridCol w:w="1700"/>
@@ -7537,7 +7625,7 @@
           <w:left w:w="10" w:type="dxa"/>
           <w:right w:w="10" w:type="dxa"/>
         </w:tblCellMar>
-        <w:tblLook w:val="0000" w:firstRow="0" w:lastRow="0" w:firstColumn="0" w:lastColumn="0" w:noHBand="0" w:noVBand="0"/>
+        <w:tblLook w:val="04A0" w:firstRow="1" w:lastRow="0" w:firstColumn="1" w:lastColumn="0" w:noHBand="0" w:noVBand="1"/>
       </w:tblPr>
       <w:tblGrid>
         <w:gridCol w:w="1700"/>
@@ -7977,10 +8065,10 @@
         </w:rPr>
         <w:lastRenderedPageBreak/>
         <w:drawing>
-          <wp:inline distT="0" distB="0" distL="0" distR="0" wp14:anchorId="6A67A3D3" wp14:editId="2504C646">
+          <wp:inline distT="0" distB="0" distL="0" distR="0" wp14:anchorId="2845776D" wp14:editId="0C0356CF">
             <wp:extent cx="5905500" cy="2419350"/>
             <wp:effectExtent l="0" t="0" r="0" b="0"/>
-            <wp:docPr id="1291741542" name="Imagen 1291741542"/>
+            <wp:docPr id="369004807" name="Imagen 369004807"/>
             <wp:cNvGraphicFramePr>
               <a:graphicFrameLocks xmlns:a="http://schemas.openxmlformats.org/drawingml/2006/main" noChangeAspect="1"/>
             </wp:cNvGraphicFramePr>
@@ -8130,10 +8218,10 @@
           <w:noProof/>
         </w:rPr>
         <w:drawing>
-          <wp:inline distT="0" distB="0" distL="0" distR="0" wp14:anchorId="43371F21" wp14:editId="34B21B91">
+          <wp:inline distT="0" distB="0" distL="0" distR="0" wp14:anchorId="7725FE3D" wp14:editId="07976F76">
             <wp:extent cx="5905500" cy="2257425"/>
             <wp:effectExtent l="0" t="0" r="0" b="0"/>
-            <wp:docPr id="1206838948" name="Imagen 1206838948"/>
+            <wp:docPr id="478177078" name="Imagen 478177078"/>
             <wp:cNvGraphicFramePr>
               <a:graphicFrameLocks xmlns:a="http://schemas.openxmlformats.org/drawingml/2006/main" noChangeAspect="1"/>
             </wp:cNvGraphicFramePr>
@@ -8318,7 +8406,7 @@
           <w:left w:w="10" w:type="dxa"/>
           <w:right w:w="10" w:type="dxa"/>
         </w:tblCellMar>
-        <w:tblLook w:val="0000" w:firstRow="0" w:lastRow="0" w:firstColumn="0" w:lastColumn="0" w:noHBand="0" w:noVBand="0"/>
+        <w:tblLook w:val="04A0" w:firstRow="1" w:lastRow="0" w:firstColumn="1" w:lastColumn="0" w:noHBand="0" w:noVBand="1"/>
       </w:tblPr>
       <w:tblGrid>
         <w:gridCol w:w="1700"/>
@@ -8757,10 +8845,10 @@
           <w:noProof/>
         </w:rPr>
         <w:drawing>
-          <wp:inline distT="0" distB="0" distL="0" distR="0" wp14:anchorId="2FD856B4" wp14:editId="198306BE">
+          <wp:inline distT="0" distB="0" distL="0" distR="0" wp14:anchorId="579BBABD" wp14:editId="0C57B955">
             <wp:extent cx="5334000" cy="3381375"/>
             <wp:effectExtent l="0" t="0" r="0" b="0"/>
-            <wp:docPr id="1854364633" name="Imagen 1854364633"/>
+            <wp:docPr id="41856308" name="Imagen 41856308"/>
             <wp:cNvGraphicFramePr>
               <a:graphicFrameLocks xmlns:a="http://schemas.openxmlformats.org/drawingml/2006/main" noChangeAspect="1"/>
             </wp:cNvGraphicFramePr>
@@ -8910,10 +8998,10 @@
           <w:noProof/>
         </w:rPr>
         <w:drawing>
-          <wp:inline distT="0" distB="0" distL="0" distR="0" wp14:anchorId="52A66836" wp14:editId="54F8BA81">
+          <wp:inline distT="0" distB="0" distL="0" distR="0" wp14:anchorId="1C6DAF19" wp14:editId="36E314EB">
             <wp:extent cx="6096000" cy="1676400"/>
             <wp:effectExtent l="0" t="0" r="0" b="0"/>
-            <wp:docPr id="25427096" name="Imagen 25427096"/>
+            <wp:docPr id="1495209749" name="Imagen 1495209749"/>
             <wp:cNvGraphicFramePr>
               <a:graphicFrameLocks xmlns:a="http://schemas.openxmlformats.org/drawingml/2006/main" noChangeAspect="1"/>
             </wp:cNvGraphicFramePr>
@@ -9002,10 +9090,10 @@
           <w:noProof/>
         </w:rPr>
         <w:drawing>
-          <wp:inline distT="0" distB="0" distL="0" distR="0" wp14:anchorId="6517CD5D" wp14:editId="5D2E5534">
+          <wp:inline distT="0" distB="0" distL="0" distR="0" wp14:anchorId="40A6561C" wp14:editId="484248BD">
             <wp:extent cx="4762500" cy="2447925"/>
             <wp:effectExtent l="0" t="0" r="0" b="0"/>
-            <wp:docPr id="714269403" name="Imagen 714269403"/>
+            <wp:docPr id="1332648685" name="Imagen 1332648685"/>
             <wp:cNvGraphicFramePr>
               <a:graphicFrameLocks xmlns:a="http://schemas.openxmlformats.org/drawingml/2006/main" noChangeAspect="1"/>
             </wp:cNvGraphicFramePr>
@@ -9132,10 +9220,10 @@
           <w:noProof/>
         </w:rPr>
         <w:drawing>
-          <wp:inline distT="0" distB="0" distL="0" distR="0" wp14:anchorId="5587A5B9" wp14:editId="4FED9162">
+          <wp:inline distT="0" distB="0" distL="0" distR="0" wp14:anchorId="31ED48F6" wp14:editId="7714D816">
             <wp:extent cx="6096000" cy="3048000"/>
             <wp:effectExtent l="0" t="0" r="0" b="0"/>
-            <wp:docPr id="862104771" name="Imagen 862104771"/>
+            <wp:docPr id="894432202" name="Imagen 894432202"/>
             <wp:cNvGraphicFramePr>
               <a:graphicFrameLocks xmlns:a="http://schemas.openxmlformats.org/drawingml/2006/main" noChangeAspect="1"/>
             </wp:cNvGraphicFramePr>
@@ -9277,10 +9365,10 @@
         </w:rPr>
         <w:lastRenderedPageBreak/>
         <w:drawing>
-          <wp:inline distT="0" distB="0" distL="0" distR="0" wp14:anchorId="67EF3B02" wp14:editId="5FB7B6D5">
+          <wp:inline distT="0" distB="0" distL="0" distR="0" wp14:anchorId="75B2B235" wp14:editId="636BA2F2">
             <wp:extent cx="6096000" cy="3848100"/>
             <wp:effectExtent l="0" t="0" r="0" b="0"/>
-            <wp:docPr id="722853583" name="Imagen 722853583"/>
+            <wp:docPr id="975717446" name="Imagen 975717446"/>
             <wp:cNvGraphicFramePr>
               <a:graphicFrameLocks xmlns:a="http://schemas.openxmlformats.org/drawingml/2006/main" noChangeAspect="1"/>
             </wp:cNvGraphicFramePr>
@@ -9441,7 +9529,7 @@
           <w:left w:w="10" w:type="dxa"/>
           <w:right w:w="10" w:type="dxa"/>
         </w:tblCellMar>
-        <w:tblLook w:val="0000" w:firstRow="0" w:lastRow="0" w:firstColumn="0" w:lastColumn="0" w:noHBand="0" w:noVBand="0"/>
+        <w:tblLook w:val="04A0" w:firstRow="1" w:lastRow="0" w:firstColumn="1" w:lastColumn="0" w:noHBand="0" w:noVBand="1"/>
       </w:tblPr>
       <w:tblGrid>
         <w:gridCol w:w="2100"/>
@@ -10162,10 +10250,10 @@
           <w:noProof/>
         </w:rPr>
         <w:drawing>
-          <wp:inline distT="0" distB="0" distL="0" distR="0" wp14:anchorId="25EDF3EE" wp14:editId="34B3B02D">
+          <wp:inline distT="0" distB="0" distL="0" distR="0" wp14:anchorId="33571C52" wp14:editId="2FE639AD">
             <wp:extent cx="6096000" cy="3000375"/>
             <wp:effectExtent l="0" t="0" r="0" b="0"/>
-            <wp:docPr id="5987165" name="Imagen 5987165"/>
+            <wp:docPr id="939594014" name="Imagen 939594014"/>
             <wp:cNvGraphicFramePr>
               <a:graphicFrameLocks xmlns:a="http://schemas.openxmlformats.org/drawingml/2006/main" noChangeAspect="1"/>
             </wp:cNvGraphicFramePr>
@@ -10289,7 +10377,7 @@
         <w:jc w:val="both"/>
       </w:pPr>
       <w:r>
-        <w:t>Sobre los indicadores puede aparecer una franja con el estado de la suscripción, que solo se muestra cuando hay algo que decir y por eso no figura en la imagen (RF-SUS-03). Son cuatro situaciones, y el color de cada una corresponde al tipo de mensaje definido en el apartado 6.4: durante el período de prueba se informa cuántos días faltan para que termine; en los tres días previos al vencimiento del plan contratado, y durante los cuatro días posteriores en que el negocio sigue operando con normalidad, el mensaje es de advertencia; y cuando la suscripción deja de estar vigente pasa a ser de error, porque desde ese momento la información se puede consultar pero no registrar. Mientras la fecha de vencimiento está lejos, la franja no aparece. Los tres colores se ilustran en la figura 22.</w:t>
+        <w:t>Sobre los indicadores puede aparecer una franja con el estado de la suscripción, que solo se muestra cuando hay algo que decir y por eso no figura en la imagen (RF-SUS-03). Son cuatro situaciones, y el color de cada una corresponde al tipo de mensaje definido en el apartado 6.4: durante el período de prueba se informa cuántos días faltan para que termine; en los tres días previos al vencimiento del plan contratado, y durante los cuatro días posteriores en que el negocio sigue operando con normalidad, el mensaje es de advertencia; y cuando la suscripción deja de estar vigente pasa a ser de error, porque desde ese momento la información se puede consultar pero no registrar. Mientras la fecha de vencimiento está lejos, la franja no aparece. Los tres colores se ilustran en la figura 25.</w:t>
       </w:r>
     </w:p>
     <w:p>
@@ -10312,10 +10400,10 @@
           <w:noProof/>
         </w:rPr>
         <w:drawing>
-          <wp:inline distT="0" distB="0" distL="0" distR="0" wp14:anchorId="6C7A8975" wp14:editId="33F848E9">
+          <wp:inline distT="0" distB="0" distL="0" distR="0" wp14:anchorId="2E3F6B0E" wp14:editId="51FABD52">
             <wp:extent cx="6096000" cy="2857500"/>
             <wp:effectExtent l="0" t="0" r="0" b="0"/>
-            <wp:docPr id="528337215" name="Imagen 528337215"/>
+            <wp:docPr id="2008301415" name="Imagen 2008301415"/>
             <wp:cNvGraphicFramePr>
               <a:graphicFrameLocks xmlns:a="http://schemas.openxmlformats.org/drawingml/2006/main" noChangeAspect="1"/>
             </wp:cNvGraphicFramePr>
@@ -10444,10 +10532,10 @@
           <w:noProof/>
         </w:rPr>
         <w:drawing>
-          <wp:inline distT="0" distB="0" distL="0" distR="0" wp14:anchorId="5711F2C7" wp14:editId="669B97DA">
+          <wp:inline distT="0" distB="0" distL="0" distR="0" wp14:anchorId="1B3DC656" wp14:editId="2BEE9906">
             <wp:extent cx="6096000" cy="2857500"/>
             <wp:effectExtent l="0" t="0" r="0" b="0"/>
-            <wp:docPr id="1064005256" name="Imagen 1064005256"/>
+            <wp:docPr id="2118523498" name="Imagen 2118523498"/>
             <wp:cNvGraphicFramePr>
               <a:graphicFrameLocks xmlns:a="http://schemas.openxmlformats.org/drawingml/2006/main" noChangeAspect="1"/>
             </wp:cNvGraphicFramePr>
@@ -10573,10 +10661,10 @@
           <w:noProof/>
         </w:rPr>
         <w:drawing>
-          <wp:inline distT="0" distB="0" distL="0" distR="0" wp14:anchorId="7A1D850C" wp14:editId="59860B0E">
+          <wp:inline distT="0" distB="0" distL="0" distR="0" wp14:anchorId="7B715577" wp14:editId="45E8B1B6">
             <wp:extent cx="4953000" cy="4067175"/>
             <wp:effectExtent l="0" t="0" r="0" b="0"/>
-            <wp:docPr id="1525860663" name="Imagen 1525860663"/>
+            <wp:docPr id="517742431" name="Imagen 517742431"/>
             <wp:cNvGraphicFramePr>
               <a:graphicFrameLocks xmlns:a="http://schemas.openxmlformats.org/drawingml/2006/main" noChangeAspect="1"/>
             </wp:cNvGraphicFramePr>
@@ -10684,10 +10772,10 @@
           <w:noProof/>
         </w:rPr>
         <w:drawing>
-          <wp:inline distT="0" distB="0" distL="0" distR="0" wp14:anchorId="0662EEEF" wp14:editId="1C74E7F2">
+          <wp:inline distT="0" distB="0" distL="0" distR="0" wp14:anchorId="0AF67A26" wp14:editId="2CB8ADEA">
             <wp:extent cx="6096000" cy="4124325"/>
             <wp:effectExtent l="0" t="0" r="0" b="0"/>
-            <wp:docPr id="334874936" name="Imagen 334874936"/>
+            <wp:docPr id="674816654" name="Imagen 674816654"/>
             <wp:cNvGraphicFramePr>
               <a:graphicFrameLocks xmlns:a="http://schemas.openxmlformats.org/drawingml/2006/main" noChangeAspect="1"/>
             </wp:cNvGraphicFramePr>
@@ -10795,10 +10883,10 @@
         </w:rPr>
         <w:lastRenderedPageBreak/>
         <w:drawing>
-          <wp:inline distT="0" distB="0" distL="0" distR="0" wp14:anchorId="4BF2ED54" wp14:editId="4187951E">
+          <wp:inline distT="0" distB="0" distL="0" distR="0" wp14:anchorId="43F4C6FE" wp14:editId="2082E813">
             <wp:extent cx="6096000" cy="4162425"/>
             <wp:effectExtent l="0" t="0" r="0" b="0"/>
-            <wp:docPr id="892471978" name="Imagen 892471978"/>
+            <wp:docPr id="2101925285" name="Imagen 2101925285"/>
             <wp:cNvGraphicFramePr>
               <a:graphicFrameLocks xmlns:a="http://schemas.openxmlformats.org/drawingml/2006/main" noChangeAspect="1"/>
             </wp:cNvGraphicFramePr>
@@ -10874,7 +10962,7 @@
         <w:jc w:val="both"/>
       </w:pPr>
       <w:r>
-        <w:t>Es la pantalla de uso más frecuente y la que exige mayor rapidez. Se divide en dos zonas: a la izquierda, el buscador con lectura de código de barras, los filtros por categoría y la cuadrícula de productos con precio y existencia disponible; a la derecha, la venta en curso con sus líneas, el total, los medios de pago y la acción de cobro, que muestra el valor a cobrar en la propia etiqueta del botón.</w:t>
+        <w:t>Es la pantalla de uso más frecuente y la única que se juzga por su rapidez. Se divide en dos zonas: a la izquierda, el buscador con lectura de código de barras, los filtros por categoría y la cuadrícula de productos con su precio y su existencia disponible; a la derecha, la venta en curso con sus líneas, el total, los medios de pago y la acción de cobro, que muestra el valor a cobrar en la propia etiqueta del botón.</w:t>
       </w:r>
     </w:p>
     <w:p>
@@ -10883,7 +10971,25 @@
         <w:jc w:val="both"/>
       </w:pPr>
       <w:r>
-        <w:t>Al confirmar el cobro, el sistema descuenta las existencias consumiendo los lotes más antiguos, registra el costo real despachado y genera el comprobante de la venta.</w:t>
+        <w:t>La cuadrícula presenta el resultado de la búsqueda, y no el catálogo completo: una licorera con cientos de referencias no se recorre con el ratón mientras un cliente espera. Sin texto escrito muestra las referencias de mayor rotación, que son las que se venden sin buscarlas. Cada línea agregada permite corregir su cantidad o retirarse, porque equivocarse de cantidad es lo más frecuente que ocurre en un mostrador.</w:t>
+      </w:r>
+    </w:p>
+    <w:p>
+      <w:pPr>
+        <w:spacing w:after="110" w:line="262" w:lineRule="auto"/>
+        <w:jc w:val="both"/>
+      </w:pPr>
+      <w:r>
+        <w:t>El medio de pago se elige antes de cobrar. Cuando es efectivo, la pantalla pide el monto recibido y calcula el cambio, que es la operación que el sistema debe ahorrarle a quien atiende; en los otros dos medios ese campo no aparece, porque no hay cambio que devolver. El número consecutivo de la venta se muestra en la barra superior: es el dato por el que el cliente la nombra si vuelve a reclamar.</w:t>
+      </w:r>
+    </w:p>
+    <w:p>
+      <w:pPr>
+        <w:spacing w:after="110" w:line="262" w:lineRule="auto"/>
+        <w:jc w:val="both"/>
+      </w:pPr>
+      <w:r>
+        <w:t>Al confirmar el cobro, el sistema descuenta las existencias consumiendo los lotes más antiguos, registra el costo real de lo despachado y genera el comprobante. Si lo pedido supera lo disponible, la venta se rechaza entera y no se registra nada: una existencia en negativo no significa nada, y en cuanto aparece una deja de poder confiarse en el resto del inventario.</w:t>
       </w:r>
     </w:p>
     <w:p>
@@ -10895,11 +11001,12 @@
         <w:rPr>
           <w:noProof/>
         </w:rPr>
+        <w:lastRenderedPageBreak/>
         <w:drawing>
-          <wp:inline distT="0" distB="0" distL="0" distR="0" wp14:anchorId="0970856E" wp14:editId="3CBB8528">
-            <wp:extent cx="6096000" cy="2562225"/>
+          <wp:inline distT="0" distB="0" distL="0" distR="0" wp14:anchorId="590DE6A9" wp14:editId="0556BF5C">
+            <wp:extent cx="6096000" cy="3438525"/>
             <wp:effectExtent l="0" t="0" r="0" b="0"/>
-            <wp:docPr id="556486425" name="Imagen 556486425"/>
+            <wp:docPr id="1215740446" name="Imagen 1215740446"/>
             <wp:cNvGraphicFramePr>
               <a:graphicFrameLocks xmlns:a="http://schemas.openxmlformats.org/drawingml/2006/main" noChangeAspect="1"/>
             </wp:cNvGraphicFramePr>
@@ -10922,7 +11029,7 @@
                   <pic:spPr bwMode="auto">
                     <a:xfrm>
                       <a:off x="0" y="0"/>
-                      <a:ext cx="6096000" cy="2562225"/>
+                      <a:ext cx="6096000" cy="3438525"/>
                     </a:xfrm>
                     <a:prstGeom prst="rect">
                       <a:avLst/>
@@ -10953,30 +11060,11 @@
     </w:p>
     <w:p>
       <w:pPr>
-        <w:pStyle w:val="Ttulo2"/>
-        <w:spacing w:before="150" w:after="80"/>
-      </w:pPr>
-      <w:bookmarkStart w:id="34" w:name="bm35"/>
-      <w:r>
-        <w:rPr>
-          <w:b/>
-          <w:bCs/>
-          <w:color w:val="2E5496"/>
-          <w:sz w:val="23"/>
-          <w:szCs w:val="23"/>
-        </w:rPr>
-        <w:lastRenderedPageBreak/>
-        <w:t>8.8 Reportes</w:t>
-      </w:r>
-      <w:bookmarkEnd w:id="34"/>
-    </w:p>
-    <w:p>
-      <w:pPr>
         <w:spacing w:after="110" w:line="262" w:lineRule="auto"/>
         <w:jc w:val="both"/>
       </w:pPr>
       <w:r>
-        <w:t>Presenta los resultados del periodo seleccionado, que se indica en la barra superior junto a la acción de exportación. En la parte alta se ubican los indicadores del mes —ventas y utilidad— y debajo, el comportamiento de las ventas por día y el listado de productos más vendidos con las unidades despachadas. La utilidad se calcula con el costo histórico de los lotes consumidos, no con el costo actual del producto.</w:t>
+        <w:t>El comprobante aparece sobre la misma pantalla al confirmar el cobro, y se puede imprimir o descargar. Su ancho es el de una impresora térmica, de modo que lo que se ve es lo que sale en papel. No es una factura electrónica —eso corresponde al módulo FAC—: es el documento con el que el negocio entrega la compra y con el que el cliente reclama.</w:t>
       </w:r>
     </w:p>
     <w:p>
@@ -10989,10 +11077,10 @@
           <w:noProof/>
         </w:rPr>
         <w:drawing>
-          <wp:inline distT="0" distB="0" distL="0" distR="0" wp14:anchorId="00F03237" wp14:editId="19C323ED">
-            <wp:extent cx="6096000" cy="2857500"/>
+          <wp:inline distT="0" distB="0" distL="0" distR="0" wp14:anchorId="6BF7D75A" wp14:editId="1E0D9AF9">
+            <wp:extent cx="4000500" cy="1362075"/>
             <wp:effectExtent l="0" t="0" r="0" b="0"/>
-            <wp:docPr id="124470600" name="Imagen 124470600"/>
+            <wp:docPr id="1618201082" name="Imagen 1618201082"/>
             <wp:cNvGraphicFramePr>
               <a:graphicFrameLocks xmlns:a="http://schemas.openxmlformats.org/drawingml/2006/main" noChangeAspect="1"/>
             </wp:cNvGraphicFramePr>
@@ -11015,7 +11103,7 @@
                   <pic:spPr bwMode="auto">
                     <a:xfrm>
                       <a:off x="0" y="0"/>
-                      <a:ext cx="6096000" cy="2857500"/>
+                      <a:ext cx="4000500" cy="1362075"/>
                     </a:xfrm>
                     <a:prstGeom prst="rect">
                       <a:avLst/>
@@ -11041,7 +11129,7 @@
           <w:sz w:val="18"/>
           <w:szCs w:val="18"/>
         </w:rPr>
-        <w:t>Figura 17. Reportes. Fuente: del autor.</w:t>
+        <w:t>Figura 17. Comprobante de venta. Fuente: del autor.</w:t>
       </w:r>
     </w:p>
     <w:p>
@@ -11049,7 +11137,7 @@
         <w:pStyle w:val="Ttulo2"/>
         <w:spacing w:before="150" w:after="80"/>
       </w:pPr>
-      <w:bookmarkStart w:id="35" w:name="bm36"/>
+      <w:bookmarkStart w:id="34" w:name="bm35"/>
       <w:r>
         <w:rPr>
           <w:b/>
@@ -11058,9 +11146,9 @@
           <w:sz w:val="23"/>
           <w:szCs w:val="23"/>
         </w:rPr>
-        <w:t>8.9 Usuarios de la licorera</w:t>
-      </w:r>
-      <w:bookmarkEnd w:id="35"/>
+        <w:t>8.8 Ventas: historial y anulación</w:t>
+      </w:r>
+      <w:bookmarkEnd w:id="34"/>
     </w:p>
     <w:p>
       <w:pPr>
@@ -11068,7 +11156,7 @@
         <w:jc w:val="both"/>
       </w:pPr>
       <w:r>
-        <w:t>Es la pantalla con la que el administrador decide quién entra a su negocio. Bajo el título se indica cuántas cuentas están activas de las registradas, porque es esa cifra —y no el total— la que el plan contratado limita. La acción principal, en la esquina superior, registra una cuenta nueva.</w:t>
+        <w:t>Reúne la consulta de lo vendido y la única corrección que el sistema admite sobre una venta. Sobre la tabla se ubican el buscador por número de venta o producto, los filtros por vendedor y por medio de pago, y el rango de fechas; encima, tres indicadores del período: lo vendido, lo anulado y el valor promedio de cada transacción.</w:t>
       </w:r>
     </w:p>
     <w:p>
@@ -11077,7 +11165,7 @@
         <w:jc w:val="both"/>
       </w:pPr>
       <w:r>
-        <w:t>La tabla presenta el nombre, el correo, el rol y el estado de cada cuenta, con la fila propia señalada. Las acciones de cada fila son editar y, según el estado, inactivar o reactivar. No hay acción de borrado: una cuenta que ha registrado operaciones no se elimina, se inactiva, de modo que el histórico conserva quién hizo qué. Tampoco aparece la acción de inactivarse a uno mismo.</w:t>
+        <w:t>La tabla presenta el consecutivo, la fecha, quién vendió, el medio de pago, el total y el estado. Las ventas anuladas no desaparecen: se muestran marcadas y con el motivo a la vista, porque una venta que se borra deja un hueco en la numeración que nadie puede explicar después.</w:t>
       </w:r>
     </w:p>
     <w:p>
@@ -11086,16 +11174,7 @@
         <w:jc w:val="both"/>
       </w:pPr>
       <w:r>
-        <w:t>Una licorera no puede quedarse sin ningún administrador activo, y el sistema lo impide por los dos caminos que llevarían a ello: cambiarle el rol a la última cuenta de administrador y desmarcarla como activa. En ambos casos el rechazo explica qué hacer antes —nombrar a otro administrador—, porque una licorera sin ninguno no puede registrar usuarios ni productos ni gestionar su suscripción, y no habría forma de repararlo desde la propia aplicación.</w:t>
-      </w:r>
-    </w:p>
-    <w:p>
-      <w:pPr>
-        <w:spacing w:after="110" w:line="262" w:lineRule="auto"/>
-        <w:jc w:val="both"/>
-      </w:pPr>
-      <w:r>
-        <w:t>Cuando el plan contratado no admite más cuentas activas, el sistema rechaza el alta y lo dice con la cifra concreta; y cuando la suscripción no está vigente, las acciones de registrar y modificar desaparecen y en su lugar se explica el motivo con el acceso a «Mi suscripción». Ambos textos los redacta el servidor, que es quien conoce la razón del rechazo.</w:t>
+        <w:t>La acción de anular se ofrece únicamente sobre las ventas del día y únicamente a quien administra la licorera. Lo primero, porque una venta de días anteriores ya entró en un cierre de caja cuadrado y deshacerla descuadraría un día cerrado; lo segundo, porque quien cobra no debería poder deshacer su propio cobro. Se pide el motivo, y al confirmarla cada unidad vuelve al lote del que salió, con lo que el inventario y su valoración quedan como estaban antes de la venta.</w:t>
       </w:r>
     </w:p>
     <w:p>
@@ -11109,10 +11188,10 @@
         </w:rPr>
         <w:lastRenderedPageBreak/>
         <w:drawing>
-          <wp:inline distT="0" distB="0" distL="0" distR="0" wp14:anchorId="6E45FA90" wp14:editId="0DAA45E3">
-            <wp:extent cx="6096000" cy="2857500"/>
+          <wp:inline distT="0" distB="0" distL="0" distR="0" wp14:anchorId="0AFEFEED" wp14:editId="738693F9">
+            <wp:extent cx="6096000" cy="5314950"/>
             <wp:effectExtent l="0" t="0" r="0" b="0"/>
-            <wp:docPr id="1676644751" name="Imagen 1676644751"/>
+            <wp:docPr id="783671835" name="Imagen 783671835"/>
             <wp:cNvGraphicFramePr>
               <a:graphicFrameLocks xmlns:a="http://schemas.openxmlformats.org/drawingml/2006/main" noChangeAspect="1"/>
             </wp:cNvGraphicFramePr>
@@ -11135,7 +11214,7 @@
                   <pic:spPr bwMode="auto">
                     <a:xfrm>
                       <a:off x="0" y="0"/>
-                      <a:ext cx="6096000" cy="2857500"/>
+                      <a:ext cx="6096000" cy="5314950"/>
                     </a:xfrm>
                     <a:prstGeom prst="rect">
                       <a:avLst/>
@@ -11161,7 +11240,7 @@
           <w:sz w:val="18"/>
           <w:szCs w:val="18"/>
         </w:rPr>
-        <w:t>Figura 18. Usuarios de la licorera. Fuente: del autor.</w:t>
+        <w:t>Figura 18. Ventas: historial y anulación. Fuente: del autor.</w:t>
       </w:r>
     </w:p>
     <w:p>
@@ -11169,7 +11248,7 @@
         <w:pStyle w:val="Ttulo2"/>
         <w:spacing w:before="150" w:after="80"/>
       </w:pPr>
-      <w:bookmarkStart w:id="36" w:name="bm37"/>
+      <w:bookmarkStart w:id="35" w:name="bm36"/>
       <w:r>
         <w:rPr>
           <w:b/>
@@ -11178,9 +11257,9 @@
           <w:sz w:val="23"/>
           <w:szCs w:val="23"/>
         </w:rPr>
-        <w:t>8.10 Mi perfil</w:t>
-      </w:r>
-      <w:bookmarkEnd w:id="36"/>
+        <w:t>8.9 Cierre de caja</w:t>
+      </w:r>
+      <w:bookmarkEnd w:id="35"/>
     </w:p>
     <w:p>
       <w:pPr>
@@ -11188,7 +11267,7 @@
         <w:jc w:val="both"/>
       </w:pPr>
       <w:r>
-        <w:t>Reúne lo que cada persona puede consultar y cambiar de su propia cuenta, sin importar su rol. Se divide en tres bloques: los datos que administra INVENTRA y no se editan desde aquí —correo, rol y licorera—, los datos personales que sí se editan —nombre y teléfono—, y el cambio de contraseña.</w:t>
+        <w:t>Cierra la jornada de una sede comparando lo que dice el sistema con lo que hay en el cajón. A la izquierda, el total vendido repartido por medio de pago y el número de transacciones; a la derecha, el campo donde se escribe el efectivo contado y la diferencia que resulta, con su explicación.</w:t>
       </w:r>
     </w:p>
     <w:p>
@@ -11197,7 +11276,7 @@
         <w:jc w:val="both"/>
       </w:pPr>
       <w:r>
-        <w:t>El correo no se edita porque identifica la cuenta en toda la plataforma y cambiarlo equivaldría a cambiar de cuenta; el rol y la licorera se fijan al crear la cuenta y no los modifica su titular. La pantalla distingue a quién corresponde el cambio: al administrador de la licorera, cuando el titular es un vendedor, y al soporte de INVENTRA cuando el titular es el propio administrador, que dentro del negocio no tiene a nadie por encima. Al cambiar la contraseña se cierran las demás sesiones abiertas, de modo que una contraseña comprometida deja de servir en cuanto su dueño reacciona.</w:t>
+        <w:t>La jornada no es el día del calendario: empieza a las seis de la mañana y termina a las seis de la mañana siguiente, y la pantalla lo dice en su cabecera. Una licorera vende de noche, de modo que un corte a medianoche partiría en dos una sola noche de trabajo. El problema no sería dónde cae cada venta, sino que el cajón no se vacía a las doce: el efectivo contado a las dos de la madrugada corresponde a las dos horas recién pasadas y a toda la noche anterior, y repartirlo entre dos cierres produciría un descuadre que nadie cometió. Con la jornada, lo vendido de madrugada se cierra junto con la noche en la que se vendió.</w:t>
       </w:r>
     </w:p>
     <w:p>
@@ -11206,7 +11285,38 @@
         <w:jc w:val="both"/>
       </w:pPr>
       <w:r>
-        <w:t>La única excepción es el correo todavía sin confirmar. Mientras la cuenta siga pendiente, su titular puede corregir la dirección desde esta misma pantalla y el sistema envía el enlace nuevo a la dirección corregida; en cuanto el correo queda confirmado, la corrección deja de ofrecerse. La excepción es necesaria porque quien se registra por autoservicio es el único administrador de su licorera: si escribió mal su dirección no hay nadie por encima que pueda corregirla, y la cuenta quedaría sin poder confirmar y, por tanto, sin poder registrar. Por el mismo motivo, cuando un administrador cambia el correo de una de las cuentas de su licorera, esa cuenta vuelve a quedar pendiente de confirmación. La corrección no figura en la imagen porque solo se ofrece mientras el correo esté sin confirmar.</w:t>
+        <w:t>Solo se compara el efectivo. La transferencia y la tarjeta no pasan por el cajón, de modo que contarlas no diría nada: su control está en el extracto, no en la caja.</w:t>
+      </w:r>
+    </w:p>
+    <w:p>
+      <w:pPr>
+        <w:spacing w:after="110" w:line="262" w:lineRule="auto"/>
+        <w:jc w:val="both"/>
+      </w:pPr>
+      <w:r>
+        <w:t xml:space="preserve">Hay un cierre por sede y jornada, y no bloquea ninguna operación: es una fotografía de cómo quedó la caja, con la diferencia escrita y explicada. Un cierre que impidiera seguir vendiendo convertiría un descuadre de ocho mil pesos en un negocio parado. Tampoco existe apertura de caja ni saldo que venga del cierre anterior: cada cierre se calcula con todas las ventas de su jornada, desde la primera. Si alguien </w:t>
+      </w:r>
+      <w:r>
+        <w:lastRenderedPageBreak/>
+        <w:t>cierra antes de tiempo, el cierre se rehace mientras la jornada siga abierta —se actualiza el mismo registro, no se crea otro— y los totales se recalculan enteros.</w:t>
+      </w:r>
+    </w:p>
+    <w:p>
+      <w:pPr>
+        <w:spacing w:after="110" w:line="262" w:lineRule="auto"/>
+        <w:jc w:val="both"/>
+      </w:pPr>
+      <w:r>
+        <w:t>Una diferencia no se queda esperando a que alguien la consulte. Al cerrar con faltante o con sobrante, el sistema avisa por correo a quienes administran la licorera, con el monto y con la explicación que se escribió, de modo que puedan juzgarla sin entrar; y el panel principal mantiene a la vista las jornadas que cerraron con diferencia y sin explicar, hasta que alguien escriba el porqué. Hacen falta los dos: quien cierra suele ser quien vende, y si el único aviso fuera el del panel, bastaría escribir cualquier cosa para que el dueño no se enterara nunca.</w:t>
+      </w:r>
+    </w:p>
+    <w:p>
+      <w:pPr>
+        <w:spacing w:after="110" w:line="262" w:lineRule="auto"/>
+        <w:jc w:val="both"/>
+      </w:pPr>
+      <w:r>
+        <w:t>La explicación se puede escribir en el momento del cierre o más tarde desde el historial, porque es una nota y no una cifra: editarla no mueve ningún total ni ninguna diferencia.</w:t>
       </w:r>
     </w:p>
     <w:p>
@@ -11218,12 +11328,11 @@
         <w:rPr>
           <w:noProof/>
         </w:rPr>
-        <w:lastRenderedPageBreak/>
         <w:drawing>
-          <wp:inline distT="0" distB="0" distL="0" distR="0" wp14:anchorId="5847CFFC" wp14:editId="5602CB11">
-            <wp:extent cx="6096000" cy="3562350"/>
+          <wp:inline distT="0" distB="0" distL="0" distR="0" wp14:anchorId="0CE7BB69" wp14:editId="310D59AD">
+            <wp:extent cx="6096000" cy="3343275"/>
             <wp:effectExtent l="0" t="0" r="0" b="0"/>
-            <wp:docPr id="2067985475" name="Imagen 2067985475"/>
+            <wp:docPr id="929779519" name="Imagen 929779519"/>
             <wp:cNvGraphicFramePr>
               <a:graphicFrameLocks xmlns:a="http://schemas.openxmlformats.org/drawingml/2006/main" noChangeAspect="1"/>
             </wp:cNvGraphicFramePr>
@@ -11246,7 +11355,7 @@
                   <pic:spPr bwMode="auto">
                     <a:xfrm>
                       <a:off x="0" y="0"/>
-                      <a:ext cx="6096000" cy="3562350"/>
+                      <a:ext cx="6096000" cy="3343275"/>
                     </a:xfrm>
                     <a:prstGeom prst="rect">
                       <a:avLst/>
@@ -11272,7 +11381,7 @@
           <w:sz w:val="18"/>
           <w:szCs w:val="18"/>
         </w:rPr>
-        <w:t>Figura 19. Mi perfil. Fuente: del autor.</w:t>
+        <w:t>Figura 19. Cierre de caja. Fuente: del autor.</w:t>
       </w:r>
     </w:p>
     <w:p>
@@ -11280,7 +11389,7 @@
         <w:pStyle w:val="Ttulo2"/>
         <w:spacing w:before="150" w:after="80"/>
       </w:pPr>
-      <w:bookmarkStart w:id="37" w:name="bm38"/>
+      <w:bookmarkStart w:id="36" w:name="bm37"/>
       <w:r>
         <w:rPr>
           <w:b/>
@@ -11289,9 +11398,9 @@
           <w:sz w:val="23"/>
           <w:szCs w:val="23"/>
         </w:rPr>
-        <w:t>8.11 Mi suscripción</w:t>
-      </w:r>
-      <w:bookmarkEnd w:id="37"/>
+        <w:t>8.10 Reportes</w:t>
+      </w:r>
+      <w:bookmarkEnd w:id="36"/>
     </w:p>
     <w:p>
       <w:pPr>
@@ -11299,25 +11408,7 @@
         <w:jc w:val="both"/>
       </w:pPr>
       <w:r>
-        <w:t>Reúne en una sola pantalla lo que el negocio necesita saber de su contratación: el plan vigente con su estado, la fecha hasta la que vale y los días que faltan. Cuando la suscripción ha vencido y corre el plazo de gracia, el segundo indicador cambia de sentido y pasa a contar los días que quedan antes de la suspensión, porque esa es la cifra que obliga a actuar.</w:t>
-      </w:r>
-    </w:p>
-    <w:p>
-      <w:pPr>
-        <w:spacing w:after="110" w:line="262" w:lineRule="auto"/>
-        <w:jc w:val="both"/>
-      </w:pPr>
-      <w:r>
-        <w:t>Debajo se listan los planes disponibles con lo que incluye cada uno, tomado del propio plan y no de un texto fijo, de modo que un plan nuevo aparece sin tocar la pantalla. El plan contratado se señala y no ofrece acción. Solo se ofrece el botón de los planes más económicos: bajar de plan no implica cobro y lo ejecuta el propio negocio, mientras que subir se contrata con INVENTRA, que lo activa al confirmar el pago. La pantalla lo dice con esas palabras en lugar de ocultar el plan superior, porque el negocio necesita saber cómo se contrata.</w:t>
-      </w:r>
-    </w:p>
-    <w:p>
-      <w:pPr>
-        <w:spacing w:after="110" w:line="262" w:lineRule="auto"/>
-        <w:jc w:val="both"/>
-      </w:pPr>
-      <w:r>
-        <w:t>Antes de bajar de plan se pide confirmación, con el detalle de lo que se pierde. Si la licorera tiene más usuarios o más sedes de los que admite el plan de destino, el sistema rechaza el cambio y dice cuántos sobran, sin inactivar nada por su cuenta: esa decisión es del negocio.</w:t>
+        <w:t>Presenta los resultados del periodo seleccionado, que se indica en la barra superior junto a la acción de exportación. En la parte alta se ubican los indicadores del mes —ventas y utilidad— y debajo, el comportamiento de las ventas por día y el listado de productos más vendidos con las unidades despachadas. La utilidad se calcula con el costo histórico de los lotes consumidos, no con el costo actual del producto.</w:t>
       </w:r>
     </w:p>
     <w:p>
@@ -11331,10 +11422,10 @@
         </w:rPr>
         <w:lastRenderedPageBreak/>
         <w:drawing>
-          <wp:inline distT="0" distB="0" distL="0" distR="0" wp14:anchorId="443520D2" wp14:editId="4538E35E">
-            <wp:extent cx="6096000" cy="3067050"/>
+          <wp:inline distT="0" distB="0" distL="0" distR="0" wp14:anchorId="683613F8" wp14:editId="7DA8EDED">
+            <wp:extent cx="6096000" cy="2857500"/>
             <wp:effectExtent l="0" t="0" r="0" b="0"/>
-            <wp:docPr id="309173736" name="Imagen 309173736"/>
+            <wp:docPr id="1103570974" name="Imagen 1103570974"/>
             <wp:cNvGraphicFramePr>
               <a:graphicFrameLocks xmlns:a="http://schemas.openxmlformats.org/drawingml/2006/main" noChangeAspect="1"/>
             </wp:cNvGraphicFramePr>
@@ -11357,7 +11448,7 @@
                   <pic:spPr bwMode="auto">
                     <a:xfrm>
                       <a:off x="0" y="0"/>
-                      <a:ext cx="6096000" cy="3067050"/>
+                      <a:ext cx="6096000" cy="2857500"/>
                     </a:xfrm>
                     <a:prstGeom prst="rect">
                       <a:avLst/>
@@ -11383,7 +11474,7 @@
           <w:sz w:val="18"/>
           <w:szCs w:val="18"/>
         </w:rPr>
-        <w:t>Figura 20. Mi suscripción. Fuente: del autor.</w:t>
+        <w:t>Figura 20. Reportes. Fuente: del autor.</w:t>
       </w:r>
     </w:p>
     <w:p>
@@ -11391,7 +11482,7 @@
         <w:pStyle w:val="Ttulo2"/>
         <w:spacing w:before="150" w:after="80"/>
       </w:pPr>
-      <w:bookmarkStart w:id="38" w:name="bm39"/>
+      <w:bookmarkStart w:id="37" w:name="bm38"/>
       <w:r>
         <w:rPr>
           <w:b/>
@@ -11400,9 +11491,9 @@
           <w:sz w:val="23"/>
           <w:szCs w:val="23"/>
         </w:rPr>
-        <w:t>8.12 Plataforma</w:t>
-      </w:r>
-      <w:bookmarkEnd w:id="38"/>
+        <w:t>8.11 Usuarios de la licorera</w:t>
+      </w:r>
+      <w:bookmarkEnd w:id="37"/>
     </w:p>
     <w:p>
       <w:pPr>
@@ -11410,7 +11501,7 @@
         <w:jc w:val="both"/>
       </w:pPr>
       <w:r>
-        <w:t>Es la pantalla del administrador de INVENTRA, no la de un negocio, y es la única que no pertenece a ninguna licorera. Reúne las tres cifras globales del servicio —licoreras registradas, cuentas con suscripción vigente e ingreso mensual contratado— y, debajo, el listado de las licoreras con su contacto, el plan, el estado de la suscripción, la fecha hasta la que vale y el número de cuentas que tiene abiertas.</w:t>
+        <w:t>Es la pantalla con la que el administrador decide quién entra a su negocio. Bajo el título se indica cuántas cuentas están activas de las registradas, porque es esa cifra —y no el total— la que el plan contratado limita. La acción principal, en la esquina superior, registra una cuenta nueva.</w:t>
       </w:r>
     </w:p>
     <w:p>
@@ -11419,7 +11510,7 @@
         <w:jc w:val="both"/>
       </w:pPr>
       <w:r>
-        <w:t>El listado no muestra ningún dato comercial de los negocios: ni sus productos, ni sus ventas, ni sus importes. La restricción es del requisito y está resuelta en el servidor, que sencillamente no devuelve esa información; la pantalla no tiene nada que ocultar porque nunca la recibe.</w:t>
+        <w:t>La tabla presenta el nombre, el correo, el rol y el estado de cada cuenta, con la fila propia señalada. Las acciones de cada fila son editar y, según el estado, inactivar o reactivar. No hay acción de borrado: una cuenta que ha registrado operaciones no se elimina, se inactiva, de modo que el histórico conserva quién hizo qué. Tampoco aparece la acción de inactivarse a uno mismo.</w:t>
       </w:r>
     </w:p>
     <w:p>
@@ -11428,7 +11519,7 @@
         <w:jc w:val="both"/>
       </w:pPr>
       <w:r>
-        <w:t>Desde aquí se ejecutan las tres operaciones que le corresponden a quien cobra el servicio: dar de alta una licorera, que crea el negocio y la cuenta de su administrador y le envía el enlace para que defina su propia contraseña; abrir un período, que es la misma operación para renovar y para subir de plan, porque en los dos casos se cierra la suscripción anterior y se inicia otra con su fecha de vencimiento; y corregir la fecha de una suscripción vigente. La corrección mueve esa fecha en los dos sentidos y cada uno tiene su caso: hacia adelante enmienda un dato mal escrito que dejó a un negocio suspendido por error, y hacia atrás deshace un período que se abrió por un pago que finalmente no entró, con lo que la licorera vuelve al estado que le corresponde y su plan deja de contar en los ingresos del servicio. No exige recordar nada: la pantalla ofrece la fecha en que terminó el período anterior. Un período que se abre, en cambio, nunca puede nacer vencido. Bajar de plan no aparece en esta pantalla: esa operación la ejecuta el propio negocio desde la suya, según se explica en el apartado anterior.</w:t>
+        <w:t>Una licorera no puede quedarse sin ningún administrador activo, y el sistema lo impide por los dos caminos que llevarían a ello: cambiarle el rol a la última cuenta de administrador y desmarcarla como activa. En ambos casos el rechazo explica qué hacer antes —nombrar a otro administrador—, porque una licorera sin ninguno no puede registrar usuarios ni productos ni gestionar su suscripción, y no habría forma de repararlo desde la propia aplicación.</w:t>
       </w:r>
     </w:p>
     <w:p>
@@ -11437,7 +11528,7 @@
         <w:jc w:val="both"/>
       </w:pPr>
       <w:r>
-        <w:t>La navegación lateral de este rol es distinta: no se le presentan los módulos de inventario, ventas o sedes, porque no administra un negocio sino el servicio.</w:t>
+        <w:t>Cuando el plan contratado no admite más cuentas activas, el sistema rechaza el alta y lo dice con la cifra concreta; y cuando la suscripción no está vigente, las acciones de registrar y modificar desaparecen y en su lugar se explica el motivo con el acceso a «Mi suscripción». Ambos textos los redacta el servidor, que es quien conoce la razón del rechazo.</w:t>
       </w:r>
     </w:p>
     <w:p>
@@ -11451,10 +11542,10 @@
         </w:rPr>
         <w:lastRenderedPageBreak/>
         <w:drawing>
-          <wp:inline distT="0" distB="0" distL="0" distR="0" wp14:anchorId="32776723" wp14:editId="29BC8953">
-            <wp:extent cx="6096000" cy="4114800"/>
+          <wp:inline distT="0" distB="0" distL="0" distR="0" wp14:anchorId="54BC9F52" wp14:editId="6339014D">
+            <wp:extent cx="6096000" cy="2857500"/>
             <wp:effectExtent l="0" t="0" r="0" b="0"/>
-            <wp:docPr id="809669241" name="Imagen 809669241"/>
+            <wp:docPr id="1846432289" name="Imagen 1846432289"/>
             <wp:cNvGraphicFramePr>
               <a:graphicFrameLocks xmlns:a="http://schemas.openxmlformats.org/drawingml/2006/main" noChangeAspect="1"/>
             </wp:cNvGraphicFramePr>
@@ -11477,7 +11568,7 @@
                   <pic:spPr bwMode="auto">
                     <a:xfrm>
                       <a:off x="0" y="0"/>
-                      <a:ext cx="6096000" cy="4114800"/>
+                      <a:ext cx="6096000" cy="2857500"/>
                     </a:xfrm>
                     <a:prstGeom prst="rect">
                       <a:avLst/>
@@ -11503,28 +11594,26 @@
           <w:sz w:val="18"/>
           <w:szCs w:val="18"/>
         </w:rPr>
-        <w:t>Figura 21. Plataforma: licoreras registradas y sus suscripciones. Fuente: del autor.</w:t>
-      </w:r>
-    </w:p>
-    <w:p>
-      <w:pPr>
-        <w:pStyle w:val="Ttulo1"/>
-        <w:pageBreakBefore/>
-        <w:spacing w:before="220" w:after="110"/>
-      </w:pPr>
-      <w:bookmarkStart w:id="39" w:name="bm40"/>
+        <w:t>Figura 21. Usuarios de la licorera. Fuente: del autor.</w:t>
+      </w:r>
+    </w:p>
+    <w:p>
+      <w:pPr>
+        <w:pStyle w:val="Ttulo2"/>
+        <w:spacing w:before="150" w:after="80"/>
+      </w:pPr>
+      <w:bookmarkStart w:id="38" w:name="bm39"/>
       <w:r>
         <w:rPr>
           <w:b/>
           <w:bCs/>
-          <w:color w:val="1F3864"/>
-          <w:sz w:val="27"/>
-          <w:szCs w:val="27"/>
-        </w:rPr>
-        <w:lastRenderedPageBreak/>
-        <w:t>9. Mensajes y estados de pantalla</w:t>
-      </w:r>
-      <w:bookmarkEnd w:id="39"/>
+          <w:color w:val="2E5496"/>
+          <w:sz w:val="23"/>
+          <w:szCs w:val="23"/>
+        </w:rPr>
+        <w:t>8.12 Mi perfil</w:t>
+      </w:r>
+      <w:bookmarkEnd w:id="38"/>
     </w:p>
     <w:p>
       <w:pPr>
@@ -11532,7 +11621,25 @@
         <w:jc w:val="both"/>
       </w:pPr>
       <w:r>
-        <w:t>Además de los componentes descritos en la sección 6, la interfaz define cómo se comporta una pantalla cuando no hay información que mostrar, cuando los datos aún se están cargando o cuando una operación falla. El objetivo es que el usuario siempre sepa qué ocurre y qué puede hacer a continuación.</w:t>
+        <w:t>Reúne lo que cada persona puede consultar y cambiar de su propia cuenta, sin importar su rol. Se divide en tres bloques: los datos que administra INVENTRA y no se editan desde aquí —correo, rol y licorera—, los datos personales que sí se editan —nombre y teléfono—, y el cambio de contraseña.</w:t>
+      </w:r>
+    </w:p>
+    <w:p>
+      <w:pPr>
+        <w:spacing w:after="110" w:line="262" w:lineRule="auto"/>
+        <w:jc w:val="both"/>
+      </w:pPr>
+      <w:r>
+        <w:t>El correo no se edita porque identifica la cuenta en toda la plataforma y cambiarlo equivaldría a cambiar de cuenta; el rol y la licorera se fijan al crear la cuenta y no los modifica su titular. La pantalla distingue a quién corresponde el cambio: al administrador de la licorera, cuando el titular es un vendedor, y al soporte de INVENTRA cuando el titular es el propio administrador, que dentro del negocio no tiene a nadie por encima. Al cambiar la contraseña se cierran las demás sesiones abiertas, de modo que una contraseña comprometida deja de servir en cuanto su dueño reacciona.</w:t>
+      </w:r>
+    </w:p>
+    <w:p>
+      <w:pPr>
+        <w:spacing w:after="110" w:line="262" w:lineRule="auto"/>
+        <w:jc w:val="both"/>
+      </w:pPr>
+      <w:r>
+        <w:t>La única excepción es el correo todavía sin confirmar. Mientras la cuenta siga pendiente, su titular puede corregir la dirección desde esta misma pantalla y el sistema envía el enlace nuevo a la dirección corregida; en cuanto el correo queda confirmado, la corrección deja de ofrecerse. La excepción es necesaria porque quien se registra por autoservicio es el único administrador de su licorera: si escribió mal su dirección no hay nadie por encima que pueda corregirla, y la cuenta quedaría sin poder confirmar y, por tanto, sin poder registrar. Por el mismo motivo, cuando un administrador cambia el correo de una de las cuentas de su licorera, esa cuenta vuelve a quedar pendiente de confirmación. La corrección no figura en la imagen porque solo se ofrece mientras el correo esté sin confirmar.</w:t>
       </w:r>
     </w:p>
     <w:p>
@@ -11544,11 +11651,12 @@
         <w:rPr>
           <w:noProof/>
         </w:rPr>
+        <w:lastRenderedPageBreak/>
         <w:drawing>
-          <wp:inline distT="0" distB="0" distL="0" distR="0" wp14:anchorId="40ED064D" wp14:editId="601786F2">
-            <wp:extent cx="6096000" cy="2733675"/>
+          <wp:inline distT="0" distB="0" distL="0" distR="0" wp14:anchorId="1CF3D21F" wp14:editId="50D0BF5C">
+            <wp:extent cx="6096000" cy="3562350"/>
             <wp:effectExtent l="0" t="0" r="0" b="0"/>
-            <wp:docPr id="470267597" name="Imagen 470267597"/>
+            <wp:docPr id="889210243" name="Imagen 889210243"/>
             <wp:cNvGraphicFramePr>
               <a:graphicFrameLocks xmlns:a="http://schemas.openxmlformats.org/drawingml/2006/main" noChangeAspect="1"/>
             </wp:cNvGraphicFramePr>
@@ -11571,7 +11679,7 @@
                   <pic:spPr bwMode="auto">
                     <a:xfrm>
                       <a:off x="0" y="0"/>
-                      <a:ext cx="6096000" cy="2733675"/>
+                      <a:ext cx="6096000" cy="3562350"/>
                     </a:xfrm>
                     <a:prstGeom prst="rect">
                       <a:avLst/>
@@ -11597,7 +11705,7 @@
           <w:sz w:val="18"/>
           <w:szCs w:val="18"/>
         </w:rPr>
-        <w:t>Figura 22. Mensajes del sistema y estado vacío. Fuente: del autor.</w:t>
+        <w:t>Figura 22. Mi perfil. Fuente: del autor.</w:t>
       </w:r>
     </w:p>
     <w:p>
@@ -11605,7 +11713,7 @@
         <w:pStyle w:val="Ttulo2"/>
         <w:spacing w:before="150" w:after="80"/>
       </w:pPr>
-      <w:bookmarkStart w:id="40" w:name="bm41"/>
+      <w:bookmarkStart w:id="39" w:name="bm40"/>
       <w:r>
         <w:rPr>
           <w:b/>
@@ -11614,632 +11722,18 @@
           <w:sz w:val="23"/>
           <w:szCs w:val="23"/>
         </w:rPr>
-        <w:t>9.1 Estados de una pantalla</w:t>
-      </w:r>
-      <w:bookmarkEnd w:id="40"/>
-    </w:p>
-    <w:tbl>
-      <w:tblPr>
-        <w:tblW w:w="9360" w:type="dxa"/>
-        <w:tblBorders>
-          <w:top w:val="single" w:sz="6" w:space="0" w:color="9CA3AF"/>
-          <w:left w:val="single" w:sz="6" w:space="0" w:color="9CA3AF"/>
-          <w:bottom w:val="single" w:sz="6" w:space="0" w:color="9CA3AF"/>
-          <w:right w:val="single" w:sz="6" w:space="0" w:color="9CA3AF"/>
-          <w:insideH w:val="single" w:sz="6" w:space="0" w:color="9CA3AF"/>
-          <w:insideV w:val="single" w:sz="6" w:space="0" w:color="9CA3AF"/>
-        </w:tblBorders>
-        <w:tblLayout w:type="fixed"/>
-        <w:tblCellMar>
-          <w:left w:w="10" w:type="dxa"/>
-          <w:right w:w="10" w:type="dxa"/>
-        </w:tblCellMar>
-        <w:tblLook w:val="0000" w:firstRow="0" w:lastRow="0" w:firstColumn="0" w:lastColumn="0" w:noHBand="0" w:noVBand="0"/>
-      </w:tblPr>
-      <w:tblGrid>
-        <w:gridCol w:w="1700"/>
-        <w:gridCol w:w="3200"/>
-        <w:gridCol w:w="4460"/>
-      </w:tblGrid>
-      <w:tr>
-        <w:tblPrEx>
-          <w:tblCellMar>
-            <w:top w:w="0" w:type="dxa"/>
-            <w:bottom w:w="0" w:type="dxa"/>
-          </w:tblCellMar>
-        </w:tblPrEx>
-        <w:trPr>
-          <w:tblHeader/>
-        </w:trPr>
-        <w:tc>
-          <w:tcPr>
-            <w:tcW w:w="1700" w:type="dxa"/>
-            <w:shd w:val="clear" w:color="auto" w:fill="1F3864"/>
-            <w:tcMar>
-              <w:top w:w="40" w:type="dxa"/>
-              <w:left w:w="70" w:type="dxa"/>
-              <w:bottom w:w="40" w:type="dxa"/>
-              <w:right w:w="70" w:type="dxa"/>
-            </w:tcMar>
-          </w:tcPr>
-          <w:p>
-            <w:pPr>
-              <w:spacing w:line="236" w:lineRule="auto"/>
-            </w:pPr>
-            <w:r>
-              <w:rPr>
-                <w:b/>
-                <w:bCs/>
-                <w:color w:val="FFFFFF"/>
-                <w:sz w:val="19"/>
-                <w:szCs w:val="19"/>
-              </w:rPr>
-              <w:t>Estado</w:t>
-            </w:r>
-          </w:p>
-        </w:tc>
-        <w:tc>
-          <w:tcPr>
-            <w:tcW w:w="3200" w:type="dxa"/>
-            <w:shd w:val="clear" w:color="auto" w:fill="1F3864"/>
-            <w:tcMar>
-              <w:top w:w="40" w:type="dxa"/>
-              <w:left w:w="70" w:type="dxa"/>
-              <w:bottom w:w="40" w:type="dxa"/>
-              <w:right w:w="70" w:type="dxa"/>
-            </w:tcMar>
-          </w:tcPr>
-          <w:p>
-            <w:pPr>
-              <w:spacing w:line="236" w:lineRule="auto"/>
-            </w:pPr>
-            <w:r>
-              <w:rPr>
-                <w:b/>
-                <w:bCs/>
-                <w:color w:val="FFFFFF"/>
-                <w:sz w:val="19"/>
-                <w:szCs w:val="19"/>
-              </w:rPr>
-              <w:t>Cuándo se presenta</w:t>
-            </w:r>
-          </w:p>
-        </w:tc>
-        <w:tc>
-          <w:tcPr>
-            <w:tcW w:w="4460" w:type="dxa"/>
-            <w:shd w:val="clear" w:color="auto" w:fill="1F3864"/>
-            <w:tcMar>
-              <w:top w:w="40" w:type="dxa"/>
-              <w:left w:w="70" w:type="dxa"/>
-              <w:bottom w:w="40" w:type="dxa"/>
-              <w:right w:w="70" w:type="dxa"/>
-            </w:tcMar>
-          </w:tcPr>
-          <w:p>
-            <w:pPr>
-              <w:spacing w:line="236" w:lineRule="auto"/>
-            </w:pPr>
-            <w:r>
-              <w:rPr>
-                <w:b/>
-                <w:bCs/>
-                <w:color w:val="FFFFFF"/>
-                <w:sz w:val="19"/>
-                <w:szCs w:val="19"/>
-              </w:rPr>
-              <w:t>Qué muestra la pantalla</w:t>
-            </w:r>
-          </w:p>
-        </w:tc>
-      </w:tr>
-      <w:tr>
-        <w:tblPrEx>
-          <w:tblCellMar>
-            <w:top w:w="0" w:type="dxa"/>
-            <w:bottom w:w="0" w:type="dxa"/>
-          </w:tblCellMar>
-        </w:tblPrEx>
-        <w:tc>
-          <w:tcPr>
-            <w:tcW w:w="1700" w:type="dxa"/>
-            <w:shd w:val="clear" w:color="auto" w:fill="FFFFFF"/>
-            <w:tcMar>
-              <w:top w:w="40" w:type="dxa"/>
-              <w:left w:w="70" w:type="dxa"/>
-              <w:bottom w:w="40" w:type="dxa"/>
-              <w:right w:w="70" w:type="dxa"/>
-            </w:tcMar>
-          </w:tcPr>
-          <w:p>
-            <w:pPr>
-              <w:spacing w:line="236" w:lineRule="auto"/>
-            </w:pPr>
-            <w:r>
-              <w:rPr>
-                <w:sz w:val="19"/>
-                <w:szCs w:val="19"/>
-              </w:rPr>
-              <w:t>Con datos</w:t>
-            </w:r>
-          </w:p>
-        </w:tc>
-        <w:tc>
-          <w:tcPr>
-            <w:tcW w:w="3200" w:type="dxa"/>
-            <w:shd w:val="clear" w:color="auto" w:fill="FFFFFF"/>
-            <w:tcMar>
-              <w:top w:w="40" w:type="dxa"/>
-              <w:left w:w="70" w:type="dxa"/>
-              <w:bottom w:w="40" w:type="dxa"/>
-              <w:right w:w="70" w:type="dxa"/>
-            </w:tcMar>
-          </w:tcPr>
-          <w:p>
-            <w:pPr>
-              <w:spacing w:line="236" w:lineRule="auto"/>
-            </w:pPr>
-            <w:r>
-              <w:rPr>
-                <w:sz w:val="19"/>
-                <w:szCs w:val="19"/>
-              </w:rPr>
-              <w:t>Funcionamiento normal.</w:t>
-            </w:r>
-          </w:p>
-        </w:tc>
-        <w:tc>
-          <w:tcPr>
-            <w:tcW w:w="4460" w:type="dxa"/>
-            <w:shd w:val="clear" w:color="auto" w:fill="FFFFFF"/>
-            <w:tcMar>
-              <w:top w:w="40" w:type="dxa"/>
-              <w:left w:w="70" w:type="dxa"/>
-              <w:bottom w:w="40" w:type="dxa"/>
-              <w:right w:w="70" w:type="dxa"/>
-            </w:tcMar>
-          </w:tcPr>
-          <w:p>
-            <w:pPr>
-              <w:spacing w:line="236" w:lineRule="auto"/>
-            </w:pPr>
-            <w:r>
-              <w:rPr>
-                <w:sz w:val="19"/>
-                <w:szCs w:val="19"/>
-              </w:rPr>
-              <w:t>El contenido propio de la pantalla.</w:t>
-            </w:r>
-          </w:p>
-        </w:tc>
-      </w:tr>
-      <w:tr>
-        <w:tblPrEx>
-          <w:tblCellMar>
-            <w:top w:w="0" w:type="dxa"/>
-            <w:bottom w:w="0" w:type="dxa"/>
-          </w:tblCellMar>
-        </w:tblPrEx>
-        <w:tc>
-          <w:tcPr>
-            <w:tcW w:w="1700" w:type="dxa"/>
-            <w:shd w:val="clear" w:color="auto" w:fill="F2F2F2"/>
-            <w:tcMar>
-              <w:top w:w="40" w:type="dxa"/>
-              <w:left w:w="70" w:type="dxa"/>
-              <w:bottom w:w="40" w:type="dxa"/>
-              <w:right w:w="70" w:type="dxa"/>
-            </w:tcMar>
-          </w:tcPr>
-          <w:p>
-            <w:pPr>
-              <w:spacing w:line="236" w:lineRule="auto"/>
-            </w:pPr>
-            <w:r>
-              <w:rPr>
-                <w:sz w:val="19"/>
-                <w:szCs w:val="19"/>
-              </w:rPr>
-              <w:t>Cargando</w:t>
-            </w:r>
-          </w:p>
-        </w:tc>
-        <w:tc>
-          <w:tcPr>
-            <w:tcW w:w="3200" w:type="dxa"/>
-            <w:shd w:val="clear" w:color="auto" w:fill="F2F2F2"/>
-            <w:tcMar>
-              <w:top w:w="40" w:type="dxa"/>
-              <w:left w:w="70" w:type="dxa"/>
-              <w:bottom w:w="40" w:type="dxa"/>
-              <w:right w:w="70" w:type="dxa"/>
-            </w:tcMar>
-          </w:tcPr>
-          <w:p>
-            <w:pPr>
-              <w:spacing w:line="236" w:lineRule="auto"/>
-            </w:pPr>
-            <w:r>
-              <w:rPr>
-                <w:sz w:val="19"/>
-                <w:szCs w:val="19"/>
-              </w:rPr>
-              <w:t>Mientras se consulta la información.</w:t>
-            </w:r>
-          </w:p>
-        </w:tc>
-        <w:tc>
-          <w:tcPr>
-            <w:tcW w:w="4460" w:type="dxa"/>
-            <w:shd w:val="clear" w:color="auto" w:fill="F2F2F2"/>
-            <w:tcMar>
-              <w:top w:w="40" w:type="dxa"/>
-              <w:left w:w="70" w:type="dxa"/>
-              <w:bottom w:w="40" w:type="dxa"/>
-              <w:right w:w="70" w:type="dxa"/>
-            </w:tcMar>
-          </w:tcPr>
-          <w:p>
-            <w:pPr>
-              <w:spacing w:line="236" w:lineRule="auto"/>
-            </w:pPr>
-            <w:r>
-              <w:rPr>
-                <w:sz w:val="19"/>
-                <w:szCs w:val="19"/>
-              </w:rPr>
-              <w:t>Marcadores de carga en el lugar del contenido, conservando la estructura.</w:t>
-            </w:r>
-          </w:p>
-        </w:tc>
-      </w:tr>
-      <w:tr>
-        <w:tblPrEx>
-          <w:tblCellMar>
-            <w:top w:w="0" w:type="dxa"/>
-            <w:bottom w:w="0" w:type="dxa"/>
-          </w:tblCellMar>
-        </w:tblPrEx>
-        <w:tc>
-          <w:tcPr>
-            <w:tcW w:w="1700" w:type="dxa"/>
-            <w:shd w:val="clear" w:color="auto" w:fill="FFFFFF"/>
-            <w:tcMar>
-              <w:top w:w="40" w:type="dxa"/>
-              <w:left w:w="70" w:type="dxa"/>
-              <w:bottom w:w="40" w:type="dxa"/>
-              <w:right w:w="70" w:type="dxa"/>
-            </w:tcMar>
-          </w:tcPr>
-          <w:p>
-            <w:pPr>
-              <w:spacing w:line="236" w:lineRule="auto"/>
-            </w:pPr>
-            <w:r>
-              <w:rPr>
-                <w:sz w:val="19"/>
-                <w:szCs w:val="19"/>
-              </w:rPr>
-              <w:t>Vacío inicial</w:t>
-            </w:r>
-          </w:p>
-        </w:tc>
-        <w:tc>
-          <w:tcPr>
-            <w:tcW w:w="3200" w:type="dxa"/>
-            <w:shd w:val="clear" w:color="auto" w:fill="FFFFFF"/>
-            <w:tcMar>
-              <w:top w:w="40" w:type="dxa"/>
-              <w:left w:w="70" w:type="dxa"/>
-              <w:bottom w:w="40" w:type="dxa"/>
-              <w:right w:w="70" w:type="dxa"/>
-            </w:tcMar>
-          </w:tcPr>
-          <w:p>
-            <w:pPr>
-              <w:spacing w:line="236" w:lineRule="auto"/>
-            </w:pPr>
-            <w:r>
-              <w:rPr>
-                <w:sz w:val="19"/>
-                <w:szCs w:val="19"/>
-              </w:rPr>
-              <w:t>El usuario aún no ha registrado datos.</w:t>
-            </w:r>
-          </w:p>
-        </w:tc>
-        <w:tc>
-          <w:tcPr>
-            <w:tcW w:w="4460" w:type="dxa"/>
-            <w:shd w:val="clear" w:color="auto" w:fill="FFFFFF"/>
-            <w:tcMar>
-              <w:top w:w="40" w:type="dxa"/>
-              <w:left w:w="70" w:type="dxa"/>
-              <w:bottom w:w="40" w:type="dxa"/>
-              <w:right w:w="70" w:type="dxa"/>
-            </w:tcMar>
-          </w:tcPr>
-          <w:p>
-            <w:pPr>
-              <w:spacing w:line="236" w:lineRule="auto"/>
-            </w:pPr>
-            <w:r>
-              <w:rPr>
-                <w:sz w:val="19"/>
-                <w:szCs w:val="19"/>
-              </w:rPr>
-              <w:t>Mensaje breve, explicación de un renglón y la acción para crear el primer registro.</w:t>
-            </w:r>
-          </w:p>
-        </w:tc>
-      </w:tr>
-      <w:tr>
-        <w:tblPrEx>
-          <w:tblCellMar>
-            <w:top w:w="0" w:type="dxa"/>
-            <w:bottom w:w="0" w:type="dxa"/>
-          </w:tblCellMar>
-        </w:tblPrEx>
-        <w:tc>
-          <w:tcPr>
-            <w:tcW w:w="1700" w:type="dxa"/>
-            <w:shd w:val="clear" w:color="auto" w:fill="F2F2F2"/>
-            <w:tcMar>
-              <w:top w:w="40" w:type="dxa"/>
-              <w:left w:w="70" w:type="dxa"/>
-              <w:bottom w:w="40" w:type="dxa"/>
-              <w:right w:w="70" w:type="dxa"/>
-            </w:tcMar>
-          </w:tcPr>
-          <w:p>
-            <w:pPr>
-              <w:spacing w:line="236" w:lineRule="auto"/>
-            </w:pPr>
-            <w:r>
-              <w:rPr>
-                <w:sz w:val="19"/>
-                <w:szCs w:val="19"/>
-              </w:rPr>
-              <w:t>Sin resultados</w:t>
-            </w:r>
-          </w:p>
-        </w:tc>
-        <w:tc>
-          <w:tcPr>
-            <w:tcW w:w="3200" w:type="dxa"/>
-            <w:shd w:val="clear" w:color="auto" w:fill="F2F2F2"/>
-            <w:tcMar>
-              <w:top w:w="40" w:type="dxa"/>
-              <w:left w:w="70" w:type="dxa"/>
-              <w:bottom w:w="40" w:type="dxa"/>
-              <w:right w:w="70" w:type="dxa"/>
-            </w:tcMar>
-          </w:tcPr>
-          <w:p>
-            <w:pPr>
-              <w:spacing w:line="236" w:lineRule="auto"/>
-            </w:pPr>
-            <w:r>
-              <w:rPr>
-                <w:sz w:val="19"/>
-                <w:szCs w:val="19"/>
-              </w:rPr>
-              <w:t>La búsqueda o el filtro no arroja coincidencias.</w:t>
-            </w:r>
-          </w:p>
-        </w:tc>
-        <w:tc>
-          <w:tcPr>
-            <w:tcW w:w="4460" w:type="dxa"/>
-            <w:shd w:val="clear" w:color="auto" w:fill="F2F2F2"/>
-            <w:tcMar>
-              <w:top w:w="40" w:type="dxa"/>
-              <w:left w:w="70" w:type="dxa"/>
-              <w:bottom w:w="40" w:type="dxa"/>
-              <w:right w:w="70" w:type="dxa"/>
-            </w:tcMar>
-          </w:tcPr>
-          <w:p>
-            <w:pPr>
-              <w:spacing w:line="236" w:lineRule="auto"/>
-            </w:pPr>
-            <w:r>
-              <w:rPr>
-                <w:sz w:val="19"/>
-                <w:szCs w:val="19"/>
-              </w:rPr>
-              <w:t>Aviso de que no se encontraron resultados y sugerencia de modificar la búsqueda.</w:t>
-            </w:r>
-          </w:p>
-        </w:tc>
-      </w:tr>
-      <w:tr>
-        <w:tblPrEx>
-          <w:tblCellMar>
-            <w:top w:w="0" w:type="dxa"/>
-            <w:bottom w:w="0" w:type="dxa"/>
-          </w:tblCellMar>
-        </w:tblPrEx>
-        <w:tc>
-          <w:tcPr>
-            <w:tcW w:w="1700" w:type="dxa"/>
-            <w:shd w:val="clear" w:color="auto" w:fill="FFFFFF"/>
-            <w:tcMar>
-              <w:top w:w="40" w:type="dxa"/>
-              <w:left w:w="70" w:type="dxa"/>
-              <w:bottom w:w="40" w:type="dxa"/>
-              <w:right w:w="70" w:type="dxa"/>
-            </w:tcMar>
-          </w:tcPr>
-          <w:p>
-            <w:pPr>
-              <w:spacing w:line="236" w:lineRule="auto"/>
-            </w:pPr>
-            <w:r>
-              <w:rPr>
-                <w:sz w:val="19"/>
-                <w:szCs w:val="19"/>
-              </w:rPr>
-              <w:t>Error</w:t>
-            </w:r>
-          </w:p>
-        </w:tc>
-        <w:tc>
-          <w:tcPr>
-            <w:tcW w:w="3200" w:type="dxa"/>
-            <w:shd w:val="clear" w:color="auto" w:fill="FFFFFF"/>
-            <w:tcMar>
-              <w:top w:w="40" w:type="dxa"/>
-              <w:left w:w="70" w:type="dxa"/>
-              <w:bottom w:w="40" w:type="dxa"/>
-              <w:right w:w="70" w:type="dxa"/>
-            </w:tcMar>
-          </w:tcPr>
-          <w:p>
-            <w:pPr>
-              <w:spacing w:line="236" w:lineRule="auto"/>
-            </w:pPr>
-            <w:r>
-              <w:rPr>
-                <w:sz w:val="19"/>
-                <w:szCs w:val="19"/>
-              </w:rPr>
-              <w:t>Falla la operación o la conexión.</w:t>
-            </w:r>
-          </w:p>
-        </w:tc>
-        <w:tc>
-          <w:tcPr>
-            <w:tcW w:w="4460" w:type="dxa"/>
-            <w:shd w:val="clear" w:color="auto" w:fill="FFFFFF"/>
-            <w:tcMar>
-              <w:top w:w="40" w:type="dxa"/>
-              <w:left w:w="70" w:type="dxa"/>
-              <w:bottom w:w="40" w:type="dxa"/>
-              <w:right w:w="70" w:type="dxa"/>
-            </w:tcMar>
-          </w:tcPr>
-          <w:p>
-            <w:pPr>
-              <w:spacing w:line="236" w:lineRule="auto"/>
-            </w:pPr>
-            <w:r>
-              <w:rPr>
-                <w:sz w:val="19"/>
-                <w:szCs w:val="19"/>
-              </w:rPr>
-              <w:t>Mensaje en color de peligro con la causa y la opción de reintentar.</w:t>
-            </w:r>
-          </w:p>
-        </w:tc>
-      </w:tr>
-      <w:tr>
-        <w:tblPrEx>
-          <w:tblCellMar>
-            <w:top w:w="0" w:type="dxa"/>
-            <w:bottom w:w="0" w:type="dxa"/>
-          </w:tblCellMar>
-        </w:tblPrEx>
-        <w:tc>
-          <w:tcPr>
-            <w:tcW w:w="1700" w:type="dxa"/>
-            <w:shd w:val="clear" w:color="auto" w:fill="F2F2F2"/>
-            <w:tcMar>
-              <w:top w:w="40" w:type="dxa"/>
-              <w:left w:w="70" w:type="dxa"/>
-              <w:bottom w:w="40" w:type="dxa"/>
-              <w:right w:w="70" w:type="dxa"/>
-            </w:tcMar>
-          </w:tcPr>
-          <w:p>
-            <w:pPr>
-              <w:spacing w:line="236" w:lineRule="auto"/>
-            </w:pPr>
-            <w:r>
-              <w:rPr>
-                <w:sz w:val="19"/>
-                <w:szCs w:val="19"/>
-              </w:rPr>
-              <w:t>Sin permiso</w:t>
-            </w:r>
-          </w:p>
-        </w:tc>
-        <w:tc>
-          <w:tcPr>
-            <w:tcW w:w="3200" w:type="dxa"/>
-            <w:shd w:val="clear" w:color="auto" w:fill="F2F2F2"/>
-            <w:tcMar>
-              <w:top w:w="40" w:type="dxa"/>
-              <w:left w:w="70" w:type="dxa"/>
-              <w:bottom w:w="40" w:type="dxa"/>
-              <w:right w:w="70" w:type="dxa"/>
-            </w:tcMar>
-          </w:tcPr>
-          <w:p>
-            <w:pPr>
-              <w:spacing w:line="236" w:lineRule="auto"/>
-            </w:pPr>
-            <w:r>
-              <w:rPr>
-                <w:sz w:val="19"/>
-                <w:szCs w:val="19"/>
-              </w:rPr>
-              <w:t>El rol o el plan no habilitan la función.</w:t>
-            </w:r>
-          </w:p>
-        </w:tc>
-        <w:tc>
-          <w:tcPr>
-            <w:tcW w:w="4460" w:type="dxa"/>
-            <w:shd w:val="clear" w:color="auto" w:fill="F2F2F2"/>
-            <w:tcMar>
-              <w:top w:w="40" w:type="dxa"/>
-              <w:left w:w="70" w:type="dxa"/>
-              <w:bottom w:w="40" w:type="dxa"/>
-              <w:right w:w="70" w:type="dxa"/>
-            </w:tcMar>
-          </w:tcPr>
-          <w:p>
-            <w:pPr>
-              <w:spacing w:line="236" w:lineRule="auto"/>
-            </w:pPr>
-            <w:r>
-              <w:rPr>
-                <w:sz w:val="19"/>
-                <w:szCs w:val="19"/>
-              </w:rPr>
-              <w:t>Explicación del motivo y, cuando corresponde, la vía para cambiar de plan.</w:t>
-            </w:r>
-          </w:p>
-        </w:tc>
-      </w:tr>
-    </w:tbl>
+        <w:t>8.13 Mi suscripción</w:t>
+      </w:r>
+      <w:bookmarkEnd w:id="39"/>
+    </w:p>
     <w:p>
       <w:pPr>
         <w:spacing w:after="110" w:line="262" w:lineRule="auto"/>
         <w:jc w:val="both"/>
       </w:pPr>
       <w:r>
-        <w:t>Los avisos que confirman una operación no son permanentes: se muestran y se retiran solos a los pocos segundos. Quien los lee ya vio el resultado en la propia pantalla, y un mensaje que sobrevive a la acción siguiente deja de describir lo que acaba de pasar. Los de error, en cambio, permanecen hasta que se intenta otra cosa: llevan la causa y casi siempre algo que corregir, y uno que se desvanece mientras se lee es peor que no tenerlo. La regla vale para todas las pantallas y está escrita en un solo sitio.</w:t>
-      </w:r>
-    </w:p>
-    <w:p>
-      <w:pPr>
-        <w:pStyle w:val="Ttulo2"/>
-        <w:spacing w:before="150" w:after="80"/>
-      </w:pPr>
-      <w:bookmarkStart w:id="41" w:name="bm42"/>
-      <w:r>
-        <w:rPr>
-          <w:b/>
-          <w:bCs/>
-          <w:color w:val="2E5496"/>
-          <w:sz w:val="23"/>
-          <w:szCs w:val="23"/>
-        </w:rPr>
-        <w:t>9.2 Redacción de los mensajes</w:t>
-      </w:r>
-      <w:bookmarkEnd w:id="41"/>
+        <w:t>Reúne en una sola pantalla lo que el negocio necesita saber de su contratación: el plan vigente con su estado, la fecha hasta la que vale y los días que faltan. Cuando la suscripción ha vencido y corre el plazo de gracia, el segundo indicador cambia de sentido y pasa a contar los días que quedan antes de la suspensión, porque esa es la cifra que obliga a actuar.</w:t>
+      </w:r>
     </w:p>
     <w:p>
       <w:pPr>
@@ -12247,94 +11741,8 @@
         <w:jc w:val="both"/>
       </w:pPr>
       <w:r>
-        <w:t>Los textos siguen las mismas reglas en toda la aplicación:</w:t>
-      </w:r>
-    </w:p>
-    <w:p>
-      <w:pPr>
-        <w:pStyle w:val="Prrafodelista"/>
-        <w:numPr>
-          <w:ilvl w:val="0"/>
-          <w:numId w:val="1"/>
-        </w:numPr>
-        <w:spacing w:after="60" w:line="258" w:lineRule="auto"/>
-      </w:pPr>
-      <w:r>
-        <w:t>Lenguaje sencillo y directo, sin términos técnicos ni códigos de error visibles para el usuario.</w:t>
-      </w:r>
-    </w:p>
-    <w:p>
-      <w:pPr>
-        <w:pStyle w:val="Prrafodelista"/>
-        <w:numPr>
-          <w:ilvl w:val="0"/>
-          <w:numId w:val="1"/>
-        </w:numPr>
-        <w:spacing w:after="60" w:line="258" w:lineRule="auto"/>
-      </w:pPr>
-      <w:r>
-        <w:t>El mensaje describe qué ocurrió y qué hacer a continuación, en una sola frase cuando es posible.</w:t>
-      </w:r>
-    </w:p>
-    <w:p>
-      <w:pPr>
-        <w:pStyle w:val="Prrafodelista"/>
-        <w:numPr>
-          <w:ilvl w:val="0"/>
-          <w:numId w:val="1"/>
-        </w:numPr>
-        <w:spacing w:after="60" w:line="258" w:lineRule="auto"/>
-      </w:pPr>
-      <w:r>
-        <w:t>Los mensajes de validación se ubican junto al campo que los origina; los de operación, en la parte superior del contenido o como aviso emergente.</w:t>
-      </w:r>
-    </w:p>
-    <w:p>
-      <w:pPr>
-        <w:pStyle w:val="Prrafodelista"/>
-        <w:numPr>
-          <w:ilvl w:val="0"/>
-          <w:numId w:val="1"/>
-        </w:numPr>
-        <w:spacing w:after="60" w:line="258" w:lineRule="auto"/>
-      </w:pPr>
-      <w:r>
-        <w:lastRenderedPageBreak/>
-        <w:t>Las confirmaciones de una acción rápida desaparecen solas; los errores permanecen hasta que el usuario los atiende.</w:t>
-      </w:r>
-    </w:p>
-    <w:p>
-      <w:pPr>
-        <w:pStyle w:val="Prrafodelista"/>
-        <w:numPr>
-          <w:ilvl w:val="0"/>
-          <w:numId w:val="1"/>
-        </w:numPr>
-        <w:spacing w:after="60" w:line="258" w:lineRule="auto"/>
-      </w:pPr>
-      <w:r>
-        <w:t>No se responsabiliza al usuario del error ni se emplean expresiones de alarma.</w:t>
-      </w:r>
-    </w:p>
-    <w:p>
-      <w:pPr>
-        <w:pStyle w:val="Ttulo1"/>
-        <w:pageBreakBefore/>
-        <w:spacing w:before="220" w:after="110"/>
-      </w:pPr>
-      <w:bookmarkStart w:id="42" w:name="bm43"/>
-      <w:r>
-        <w:rPr>
-          <w:b/>
-          <w:bCs/>
-          <w:color w:val="1F3864"/>
-          <w:sz w:val="27"/>
-          <w:szCs w:val="27"/>
-        </w:rPr>
-        <w:lastRenderedPageBreak/>
-        <w:t>10. Comportamiento responsivo y modo oscuro</w:t>
-      </w:r>
-      <w:bookmarkEnd w:id="42"/>
+        <w:t>Debajo se listan los planes disponibles con lo que incluye cada uno, tomado del propio plan y no de un texto fijo, de modo que un plan nuevo aparece sin tocar la pantalla. El plan contratado se señala y no ofrece acción. Solo se ofrece el botón de los planes más económicos: bajar de plan no implica cobro y lo ejecuta el propio negocio, mientras que subir se contrata con INVENTRA, que lo activa al confirmar el pago. La pantalla lo dice con esas palabras en lugar de ocultar el plan superior, porque el negocio necesita saber cómo se contrata.</w:t>
+      </w:r>
     </w:p>
     <w:p>
       <w:pPr>
@@ -12342,73 +11750,7 @@
         <w:jc w:val="both"/>
       </w:pPr>
       <w:r>
-        <w:t>La interfaz se adapta a los tamaños definidos en la sección 5.3. La adaptación no consiste en reducir la pantalla de escritorio, sino en reorganizar el contenido para conservar la facilidad de uso en cada dispositivo.</w:t>
-      </w:r>
-    </w:p>
-    <w:p>
-      <w:pPr>
-        <w:pStyle w:val="Ttulo2"/>
-        <w:spacing w:before="150" w:after="80"/>
-      </w:pPr>
-      <w:bookmarkStart w:id="43" w:name="bm44"/>
-      <w:r>
-        <w:rPr>
-          <w:b/>
-          <w:bCs/>
-          <w:color w:val="2E5496"/>
-          <w:sz w:val="23"/>
-          <w:szCs w:val="23"/>
-        </w:rPr>
-        <w:t>10.1 Versión móvil</w:t>
-      </w:r>
-      <w:bookmarkEnd w:id="43"/>
-    </w:p>
-    <w:p>
-      <w:pPr>
-        <w:spacing w:after="110" w:line="262" w:lineRule="auto"/>
-        <w:jc w:val="both"/>
-      </w:pPr>
-      <w:r>
-        <w:t>En el teléfono el contenido se presenta en una sola columna y la barra lateral se traslada a la parte superior, donde se desplaza en horizontal y conserva el acceso a todos los módulos. Los controles aumentan su área de toque y las tablas se convierten en listas, de modo que cada registro ocupe un renglón legible.</w:t>
-      </w:r>
-    </w:p>
-    <w:p>
-      <w:pPr>
-        <w:pStyle w:val="Prrafodelista"/>
-        <w:numPr>
-          <w:ilvl w:val="0"/>
-          <w:numId w:val="1"/>
-        </w:numPr>
-        <w:spacing w:after="60" w:line="258" w:lineRule="auto"/>
-      </w:pPr>
-      <w:r>
-        <w:t>Inicio de sesión: formulario centrado, con los campos y el botón a todo el ancho.</w:t>
-      </w:r>
-    </w:p>
-    <w:p>
-      <w:pPr>
-        <w:pStyle w:val="Prrafodelista"/>
-        <w:numPr>
-          <w:ilvl w:val="0"/>
-          <w:numId w:val="1"/>
-        </w:numPr>
-        <w:spacing w:after="60" w:line="258" w:lineRule="auto"/>
-      </w:pPr>
-      <w:r>
-        <w:t>Panel: los indicadores se agrupan de a dos por fila y las alertas de existencias quedan inmediatamente debajo.</w:t>
-      </w:r>
-    </w:p>
-    <w:p>
-      <w:pPr>
-        <w:pStyle w:val="Prrafodelista"/>
-        <w:numPr>
-          <w:ilvl w:val="0"/>
-          <w:numId w:val="1"/>
-        </w:numPr>
-        <w:spacing w:after="60" w:line="258" w:lineRule="auto"/>
-      </w:pPr>
-      <w:r>
-        <w:t>Punto de venta: buscador, lista de la venta en curso, total y medios de pago en una sola columna, con la acción de cobro fija en la parte inferior.</w:t>
+        <w:t>Antes de bajar de plan se pide confirmación, con el detalle de lo que se pierde. Si la licorera tiene más usuarios o más sedes de los que admite el plan de destino, el sistema rechaza el cambio y dice cuántos sobran, sin inactivar nada por su cuenta: esa decisión es del negocio.</w:t>
       </w:r>
     </w:p>
     <w:p>
@@ -12420,11 +11762,12 @@
         <w:rPr>
           <w:noProof/>
         </w:rPr>
+        <w:lastRenderedPageBreak/>
         <w:drawing>
-          <wp:inline distT="0" distB="0" distL="0" distR="0" wp14:anchorId="01A0DCFE" wp14:editId="134A9F0B">
-            <wp:extent cx="6096000" cy="3295650"/>
+          <wp:inline distT="0" distB="0" distL="0" distR="0" wp14:anchorId="734A0CED" wp14:editId="7ADEDE80">
+            <wp:extent cx="6096000" cy="3067050"/>
             <wp:effectExtent l="0" t="0" r="0" b="0"/>
-            <wp:docPr id="1345291109" name="Imagen 1345291109"/>
+            <wp:docPr id="774411253" name="Imagen 774411253"/>
             <wp:cNvGraphicFramePr>
               <a:graphicFrameLocks xmlns:a="http://schemas.openxmlformats.org/drawingml/2006/main" noChangeAspect="1"/>
             </wp:cNvGraphicFramePr>
@@ -12447,7 +11790,7 @@
                   <pic:spPr bwMode="auto">
                     <a:xfrm>
                       <a:off x="0" y="0"/>
-                      <a:ext cx="6096000" cy="3295650"/>
+                      <a:ext cx="6096000" cy="3067050"/>
                     </a:xfrm>
                     <a:prstGeom prst="rect">
                       <a:avLst/>
@@ -12473,7 +11816,7 @@
           <w:sz w:val="18"/>
           <w:szCs w:val="18"/>
         </w:rPr>
-        <w:t>Figura 23. Versión móvil: inicio de sesión, panel y punto de venta. Fuente: del autor.</w:t>
+        <w:t>Figura 23. Mi suscripción. Fuente: del autor.</w:t>
       </w:r>
     </w:p>
     <w:p>
@@ -12481,7 +11824,7 @@
         <w:pStyle w:val="Ttulo2"/>
         <w:spacing w:before="150" w:after="80"/>
       </w:pPr>
-      <w:bookmarkStart w:id="44" w:name="bm45"/>
+      <w:bookmarkStart w:id="40" w:name="bm41"/>
       <w:r>
         <w:rPr>
           <w:b/>
@@ -12490,9 +11833,9 @@
           <w:sz w:val="23"/>
           <w:szCs w:val="23"/>
         </w:rPr>
-        <w:t>10.2 Tablet y escritorio</w:t>
-      </w:r>
-      <w:bookmarkEnd w:id="44"/>
+        <w:t>8.14 Plataforma</w:t>
+      </w:r>
+      <w:bookmarkEnd w:id="40"/>
     </w:p>
     <w:p>
       <w:pPr>
@@ -12500,26 +11843,8 @@
         <w:jc w:val="both"/>
       </w:pPr>
       <w:r>
-        <w:t>En tablet el contenido se organiza en dos columnas y la navegación lateral puede contraerse para dejar más espacio al contenido. En escritorio se emplea la rejilla completa, con la navegación lateral fija y los paneles de apoyo a la derecha del contenido principal, como ocurre en el punto de venta.</w:t>
-      </w:r>
-    </w:p>
-    <w:p>
-      <w:pPr>
-        <w:pStyle w:val="Ttulo2"/>
-        <w:spacing w:before="150" w:after="80"/>
-      </w:pPr>
-      <w:bookmarkStart w:id="45" w:name="bm46"/>
-      <w:r>
-        <w:rPr>
-          <w:b/>
-          <w:bCs/>
-          <w:color w:val="2E5496"/>
-          <w:sz w:val="23"/>
-          <w:szCs w:val="23"/>
-        </w:rPr>
-        <w:t>10.3 Modo oscuro</w:t>
-      </w:r>
-      <w:bookmarkEnd w:id="45"/>
+        <w:t>Es la pantalla del administrador de INVENTRA, no la de un negocio, y es la única que no pertenece a ninguna licorera. Reúne las tres cifras globales del servicio —licoreras registradas, cuentas con suscripción vigente e ingreso mensual contratado— y, debajo, el listado de las licoreras con su contacto, el plan, el estado de la suscripción, la fecha hasta la que vale y el número de cuentas que tiene abiertas.</w:t>
+      </w:r>
     </w:p>
     <w:p>
       <w:pPr>
@@ -12527,7 +11852,25 @@
         <w:jc w:val="both"/>
       </w:pPr>
       <w:r>
-        <w:t>El modo oscuro utiliza la variante de paleta definida en la sección 4.2 y conserva la misma estructura, la misma jerarquía y los mismos componentes del modo claro. Cambian únicamente los colores de fondo, superficie, borde y texto, y se ajustan los tonos de las etiquetas de estado para mantener el contraste. La elección del modo es del usuario y se conserva entre sesiones. El cambio se hace desde la parte inferior del menú lateral y, en las pantallas de acceso, desde el panel de marca, de modo que también pueda elegirlo quien todavía no ha entrado. Mientras el usuario no elija, se aplica la preferencia del sistema operativo.</w:t>
+        <w:t>El listado no muestra ningún dato comercial de los negocios: ni sus productos, ni sus ventas, ni sus importes. La restricción es del requisito y está resuelta en el servidor, que sencillamente no devuelve esa información; la pantalla no tiene nada que ocultar porque nunca la recibe.</w:t>
+      </w:r>
+    </w:p>
+    <w:p>
+      <w:pPr>
+        <w:spacing w:after="110" w:line="262" w:lineRule="auto"/>
+        <w:jc w:val="both"/>
+      </w:pPr>
+      <w:r>
+        <w:t>Desde aquí se ejecutan las tres operaciones que le corresponden a quien cobra el servicio: dar de alta una licorera, que crea el negocio y la cuenta de su administrador y le envía el enlace para que defina su propia contraseña; abrir un período, que es la misma operación para renovar y para subir de plan, porque en los dos casos se cierra la suscripción anterior y se inicia otra con su fecha de vencimiento; y corregir la fecha de una suscripción vigente. La corrección mueve esa fecha en los dos sentidos y cada uno tiene su caso: hacia adelante enmienda un dato mal escrito que dejó a un negocio suspendido por error, y hacia atrás deshace un período que se abrió por un pago que finalmente no entró, con lo que la licorera vuelve al estado que le corresponde y su plan deja de contar en los ingresos del servicio. No exige recordar nada: la pantalla ofrece la fecha en que terminó el período anterior. Un período que se abre, en cambio, nunca puede nacer vencido. Bajar de plan no aparece en esta pantalla: esa operación la ejecuta el propio negocio desde la suya, según se explica en el apartado anterior.</w:t>
+      </w:r>
+    </w:p>
+    <w:p>
+      <w:pPr>
+        <w:spacing w:after="110" w:line="262" w:lineRule="auto"/>
+        <w:jc w:val="both"/>
+      </w:pPr>
+      <w:r>
+        <w:t>La navegación lateral de este rol es distinta: no se le presentan los módulos de inventario, ventas o sedes, porque no administra un negocio sino el servicio.</w:t>
       </w:r>
     </w:p>
     <w:p>
@@ -12541,10 +11884,10 @@
         </w:rPr>
         <w:lastRenderedPageBreak/>
         <w:drawing>
-          <wp:inline distT="0" distB="0" distL="0" distR="0" wp14:anchorId="30C42744" wp14:editId="70231881">
-            <wp:extent cx="6096000" cy="3067050"/>
+          <wp:inline distT="0" distB="0" distL="0" distR="0" wp14:anchorId="530ABED3" wp14:editId="5E4774E6">
+            <wp:extent cx="6096000" cy="4114800"/>
             <wp:effectExtent l="0" t="0" r="0" b="0"/>
-            <wp:docPr id="1694399042" name="Imagen 1694399042"/>
+            <wp:docPr id="594606175" name="Imagen 594606175"/>
             <wp:cNvGraphicFramePr>
               <a:graphicFrameLocks xmlns:a="http://schemas.openxmlformats.org/drawingml/2006/main" noChangeAspect="1"/>
             </wp:cNvGraphicFramePr>
@@ -12567,7 +11910,7 @@
                   <pic:spPr bwMode="auto">
                     <a:xfrm>
                       <a:off x="0" y="0"/>
-                      <a:ext cx="6096000" cy="3067050"/>
+                      <a:ext cx="6096000" cy="4114800"/>
                     </a:xfrm>
                     <a:prstGeom prst="rect">
                       <a:avLst/>
@@ -12593,7 +11936,7 @@
           <w:sz w:val="18"/>
           <w:szCs w:val="18"/>
         </w:rPr>
-        <w:t>Figura 24. Panel principal en modo oscuro. Fuente: del autor.</w:t>
+        <w:t>Figura 24. Plataforma: licoreras registradas y sus suscripciones. Fuente: del autor.</w:t>
       </w:r>
     </w:p>
     <w:p>
@@ -12602,7 +11945,7 @@
         <w:pageBreakBefore/>
         <w:spacing w:before="220" w:after="110"/>
       </w:pPr>
-      <w:bookmarkStart w:id="46" w:name="bm47"/>
+      <w:bookmarkStart w:id="41" w:name="bm42"/>
       <w:r>
         <w:rPr>
           <w:b/>
@@ -12612,9 +11955,9 @@
           <w:szCs w:val="27"/>
         </w:rPr>
         <w:lastRenderedPageBreak/>
-        <w:t>11. Conclusión</w:t>
-      </w:r>
-      <w:bookmarkEnd w:id="46"/>
+        <w:t>9. Mensajes y estados de pantalla</w:t>
+      </w:r>
+      <w:bookmarkEnd w:id="41"/>
     </w:p>
     <w:p>
       <w:pPr>
@@ -12622,37 +11965,91 @@
         <w:jc w:val="both"/>
       </w:pPr>
       <w:r>
-        <w:t>Este documento reúne los lineamientos visuales y de interacción de INVENTRA: la identidad visual con sus dos paletas, la tipografía y la iconografía; la rejilla, el espaciado y los puntos de quiebre; los componentes comunes con sus estados; los formularios de acceso y registro; las pantallas principales de la aplicación; el tratamiento de los mensajes y de los estados de pantalla; y el comportamiento en distintos dispositivos.</w:t>
-      </w:r>
-    </w:p>
-    <w:p>
-      <w:pPr>
-        <w:spacing w:after="110" w:line="262" w:lineRule="auto"/>
-        <w:jc w:val="both"/>
-      </w:pPr>
-      <w:r>
-        <w:t>Con ello, la etapa de construcción cuenta con un referente único para implementar la interfaz: cada pantalla nueva puede armarse a partir de los componentes ya definidos, sin decisiones visuales aisladas. Los criterios aquí establecidos son coherentes con la especificación de requisitos, con el modelo de datos y con el análisis y diseño en UML del proyecto, y se complementan con el manual de marca, que desarrolla el uso del logotipo y de los elementos gráficos de identidad.</w:t>
-      </w:r>
-    </w:p>
-    <w:p>
-      <w:pPr>
-        <w:pStyle w:val="Ttulo1"/>
-        <w:pageBreakBefore/>
-        <w:spacing w:before="220" w:after="110"/>
-      </w:pPr>
-      <w:bookmarkStart w:id="47" w:name="bm48"/>
+        <w:t>Además de los componentes descritos en la sección 6, la interfaz define cómo se comporta una pantalla cuando no hay información que mostrar, cuando los datos aún se están cargando o cuando una operación falla. El objetivo es que el usuario siempre sepa qué ocurre y qué puede hacer a continuación.</w:t>
+      </w:r>
+    </w:p>
+    <w:p>
+      <w:pPr>
+        <w:spacing w:before="60" w:after="20"/>
+        <w:jc w:val="center"/>
+      </w:pPr>
+      <w:r>
+        <w:rPr>
+          <w:noProof/>
+        </w:rPr>
+        <w:drawing>
+          <wp:inline distT="0" distB="0" distL="0" distR="0" wp14:anchorId="765C89FF" wp14:editId="5726F1CC">
+            <wp:extent cx="6096000" cy="2733675"/>
+            <wp:effectExtent l="0" t="0" r="0" b="0"/>
+            <wp:docPr id="539503658" name="Imagen 539503658"/>
+            <wp:cNvGraphicFramePr>
+              <a:graphicFrameLocks xmlns:a="http://schemas.openxmlformats.org/drawingml/2006/main" noChangeAspect="1"/>
+            </wp:cNvGraphicFramePr>
+            <a:graphic xmlns:a="http://schemas.openxmlformats.org/drawingml/2006/main">
+              <a:graphicData uri="http://schemas.openxmlformats.org/drawingml/2006/picture">
+                <pic:pic xmlns:pic="http://schemas.openxmlformats.org/drawingml/2006/picture">
+                  <pic:nvPicPr>
+                    <pic:cNvPr id="0" name=""/>
+                    <pic:cNvPicPr>
+                      <a:picLocks noChangeAspect="1" noChangeArrowheads="1"/>
+                    </pic:cNvPicPr>
+                  </pic:nvPicPr>
+                  <pic:blipFill>
+                    <a:blip r:embed="rId31"/>
+                    <a:srcRect/>
+                    <a:stretch>
+                      <a:fillRect/>
+                    </a:stretch>
+                  </pic:blipFill>
+                  <pic:spPr bwMode="auto">
+                    <a:xfrm>
+                      <a:off x="0" y="0"/>
+                      <a:ext cx="6096000" cy="2733675"/>
+                    </a:xfrm>
+                    <a:prstGeom prst="rect">
+                      <a:avLst/>
+                    </a:prstGeom>
+                  </pic:spPr>
+                </pic:pic>
+              </a:graphicData>
+            </a:graphic>
+          </wp:inline>
+        </w:drawing>
+      </w:r>
+    </w:p>
+    <w:p>
+      <w:pPr>
+        <w:spacing w:before="6" w:after="150"/>
+        <w:jc w:val="center"/>
+      </w:pPr>
+      <w:r>
+        <w:rPr>
+          <w:i/>
+          <w:iCs/>
+          <w:color w:val="5B6678"/>
+          <w:sz w:val="18"/>
+          <w:szCs w:val="18"/>
+        </w:rPr>
+        <w:t>Figura 25. Mensajes del sistema y estado vacío. Fuente: del autor.</w:t>
+      </w:r>
+    </w:p>
+    <w:p>
+      <w:pPr>
+        <w:pStyle w:val="Ttulo2"/>
+        <w:spacing w:before="150" w:after="80"/>
+      </w:pPr>
+      <w:bookmarkStart w:id="42" w:name="bm43"/>
       <w:r>
         <w:rPr>
           <w:b/>
           <w:bCs/>
-          <w:color w:val="1F3864"/>
-          <w:sz w:val="27"/>
-          <w:szCs w:val="27"/>
-        </w:rPr>
-        <w:lastRenderedPageBreak/>
-        <w:t>12. Glosario</w:t>
-      </w:r>
-      <w:bookmarkEnd w:id="47"/>
+          <w:color w:val="2E5496"/>
+          <w:sz w:val="23"/>
+          <w:szCs w:val="23"/>
+        </w:rPr>
+        <w:t>9.1 Estados de una pantalla</w:t>
+      </w:r>
+      <w:bookmarkEnd w:id="42"/>
     </w:p>
     <w:tbl>
       <w:tblPr>
@@ -12670,7 +12067,1046 @@
           <w:left w:w="10" w:type="dxa"/>
           <w:right w:w="10" w:type="dxa"/>
         </w:tblCellMar>
-        <w:tblLook w:val="0000" w:firstRow="0" w:lastRow="0" w:firstColumn="0" w:lastColumn="0" w:noHBand="0" w:noVBand="0"/>
+        <w:tblLook w:val="04A0" w:firstRow="1" w:lastRow="0" w:firstColumn="1" w:lastColumn="0" w:noHBand="0" w:noVBand="1"/>
+      </w:tblPr>
+      <w:tblGrid>
+        <w:gridCol w:w="1700"/>
+        <w:gridCol w:w="3200"/>
+        <w:gridCol w:w="4460"/>
+      </w:tblGrid>
+      <w:tr>
+        <w:tblPrEx>
+          <w:tblCellMar>
+            <w:top w:w="0" w:type="dxa"/>
+            <w:bottom w:w="0" w:type="dxa"/>
+          </w:tblCellMar>
+        </w:tblPrEx>
+        <w:trPr>
+          <w:tblHeader/>
+        </w:trPr>
+        <w:tc>
+          <w:tcPr>
+            <w:tcW w:w="1700" w:type="dxa"/>
+            <w:shd w:val="clear" w:color="auto" w:fill="1F3864"/>
+            <w:tcMar>
+              <w:top w:w="40" w:type="dxa"/>
+              <w:left w:w="70" w:type="dxa"/>
+              <w:bottom w:w="40" w:type="dxa"/>
+              <w:right w:w="70" w:type="dxa"/>
+            </w:tcMar>
+          </w:tcPr>
+          <w:p>
+            <w:pPr>
+              <w:spacing w:line="236" w:lineRule="auto"/>
+            </w:pPr>
+            <w:r>
+              <w:rPr>
+                <w:b/>
+                <w:bCs/>
+                <w:color w:val="FFFFFF"/>
+                <w:sz w:val="19"/>
+                <w:szCs w:val="19"/>
+              </w:rPr>
+              <w:t>Estado</w:t>
+            </w:r>
+          </w:p>
+        </w:tc>
+        <w:tc>
+          <w:tcPr>
+            <w:tcW w:w="3200" w:type="dxa"/>
+            <w:shd w:val="clear" w:color="auto" w:fill="1F3864"/>
+            <w:tcMar>
+              <w:top w:w="40" w:type="dxa"/>
+              <w:left w:w="70" w:type="dxa"/>
+              <w:bottom w:w="40" w:type="dxa"/>
+              <w:right w:w="70" w:type="dxa"/>
+            </w:tcMar>
+          </w:tcPr>
+          <w:p>
+            <w:pPr>
+              <w:spacing w:line="236" w:lineRule="auto"/>
+            </w:pPr>
+            <w:r>
+              <w:rPr>
+                <w:b/>
+                <w:bCs/>
+                <w:color w:val="FFFFFF"/>
+                <w:sz w:val="19"/>
+                <w:szCs w:val="19"/>
+              </w:rPr>
+              <w:t>Cuándo se presenta</w:t>
+            </w:r>
+          </w:p>
+        </w:tc>
+        <w:tc>
+          <w:tcPr>
+            <w:tcW w:w="4460" w:type="dxa"/>
+            <w:shd w:val="clear" w:color="auto" w:fill="1F3864"/>
+            <w:tcMar>
+              <w:top w:w="40" w:type="dxa"/>
+              <w:left w:w="70" w:type="dxa"/>
+              <w:bottom w:w="40" w:type="dxa"/>
+              <w:right w:w="70" w:type="dxa"/>
+            </w:tcMar>
+          </w:tcPr>
+          <w:p>
+            <w:pPr>
+              <w:spacing w:line="236" w:lineRule="auto"/>
+            </w:pPr>
+            <w:r>
+              <w:rPr>
+                <w:b/>
+                <w:bCs/>
+                <w:color w:val="FFFFFF"/>
+                <w:sz w:val="19"/>
+                <w:szCs w:val="19"/>
+              </w:rPr>
+              <w:t>Qué muestra la pantalla</w:t>
+            </w:r>
+          </w:p>
+        </w:tc>
+      </w:tr>
+      <w:tr>
+        <w:tblPrEx>
+          <w:tblCellMar>
+            <w:top w:w="0" w:type="dxa"/>
+            <w:bottom w:w="0" w:type="dxa"/>
+          </w:tblCellMar>
+        </w:tblPrEx>
+        <w:tc>
+          <w:tcPr>
+            <w:tcW w:w="1700" w:type="dxa"/>
+            <w:shd w:val="clear" w:color="auto" w:fill="FFFFFF"/>
+            <w:tcMar>
+              <w:top w:w="40" w:type="dxa"/>
+              <w:left w:w="70" w:type="dxa"/>
+              <w:bottom w:w="40" w:type="dxa"/>
+              <w:right w:w="70" w:type="dxa"/>
+            </w:tcMar>
+          </w:tcPr>
+          <w:p>
+            <w:pPr>
+              <w:spacing w:line="236" w:lineRule="auto"/>
+            </w:pPr>
+            <w:r>
+              <w:rPr>
+                <w:sz w:val="19"/>
+                <w:szCs w:val="19"/>
+              </w:rPr>
+              <w:t>Con datos</w:t>
+            </w:r>
+          </w:p>
+        </w:tc>
+        <w:tc>
+          <w:tcPr>
+            <w:tcW w:w="3200" w:type="dxa"/>
+            <w:shd w:val="clear" w:color="auto" w:fill="FFFFFF"/>
+            <w:tcMar>
+              <w:top w:w="40" w:type="dxa"/>
+              <w:left w:w="70" w:type="dxa"/>
+              <w:bottom w:w="40" w:type="dxa"/>
+              <w:right w:w="70" w:type="dxa"/>
+            </w:tcMar>
+          </w:tcPr>
+          <w:p>
+            <w:pPr>
+              <w:spacing w:line="236" w:lineRule="auto"/>
+            </w:pPr>
+            <w:r>
+              <w:rPr>
+                <w:sz w:val="19"/>
+                <w:szCs w:val="19"/>
+              </w:rPr>
+              <w:t>Funcionamiento normal.</w:t>
+            </w:r>
+          </w:p>
+        </w:tc>
+        <w:tc>
+          <w:tcPr>
+            <w:tcW w:w="4460" w:type="dxa"/>
+            <w:shd w:val="clear" w:color="auto" w:fill="FFFFFF"/>
+            <w:tcMar>
+              <w:top w:w="40" w:type="dxa"/>
+              <w:left w:w="70" w:type="dxa"/>
+              <w:bottom w:w="40" w:type="dxa"/>
+              <w:right w:w="70" w:type="dxa"/>
+            </w:tcMar>
+          </w:tcPr>
+          <w:p>
+            <w:pPr>
+              <w:spacing w:line="236" w:lineRule="auto"/>
+            </w:pPr>
+            <w:r>
+              <w:rPr>
+                <w:sz w:val="19"/>
+                <w:szCs w:val="19"/>
+              </w:rPr>
+              <w:t>El contenido propio de la pantalla.</w:t>
+            </w:r>
+          </w:p>
+        </w:tc>
+      </w:tr>
+      <w:tr>
+        <w:tblPrEx>
+          <w:tblCellMar>
+            <w:top w:w="0" w:type="dxa"/>
+            <w:bottom w:w="0" w:type="dxa"/>
+          </w:tblCellMar>
+        </w:tblPrEx>
+        <w:tc>
+          <w:tcPr>
+            <w:tcW w:w="1700" w:type="dxa"/>
+            <w:shd w:val="clear" w:color="auto" w:fill="F2F2F2"/>
+            <w:tcMar>
+              <w:top w:w="40" w:type="dxa"/>
+              <w:left w:w="70" w:type="dxa"/>
+              <w:bottom w:w="40" w:type="dxa"/>
+              <w:right w:w="70" w:type="dxa"/>
+            </w:tcMar>
+          </w:tcPr>
+          <w:p>
+            <w:pPr>
+              <w:spacing w:line="236" w:lineRule="auto"/>
+            </w:pPr>
+            <w:r>
+              <w:rPr>
+                <w:sz w:val="19"/>
+                <w:szCs w:val="19"/>
+              </w:rPr>
+              <w:t>Cargando</w:t>
+            </w:r>
+          </w:p>
+        </w:tc>
+        <w:tc>
+          <w:tcPr>
+            <w:tcW w:w="3200" w:type="dxa"/>
+            <w:shd w:val="clear" w:color="auto" w:fill="F2F2F2"/>
+            <w:tcMar>
+              <w:top w:w="40" w:type="dxa"/>
+              <w:left w:w="70" w:type="dxa"/>
+              <w:bottom w:w="40" w:type="dxa"/>
+              <w:right w:w="70" w:type="dxa"/>
+            </w:tcMar>
+          </w:tcPr>
+          <w:p>
+            <w:pPr>
+              <w:spacing w:line="236" w:lineRule="auto"/>
+            </w:pPr>
+            <w:r>
+              <w:rPr>
+                <w:sz w:val="19"/>
+                <w:szCs w:val="19"/>
+              </w:rPr>
+              <w:t>Mientras se consulta la información.</w:t>
+            </w:r>
+          </w:p>
+        </w:tc>
+        <w:tc>
+          <w:tcPr>
+            <w:tcW w:w="4460" w:type="dxa"/>
+            <w:shd w:val="clear" w:color="auto" w:fill="F2F2F2"/>
+            <w:tcMar>
+              <w:top w:w="40" w:type="dxa"/>
+              <w:left w:w="70" w:type="dxa"/>
+              <w:bottom w:w="40" w:type="dxa"/>
+              <w:right w:w="70" w:type="dxa"/>
+            </w:tcMar>
+          </w:tcPr>
+          <w:p>
+            <w:pPr>
+              <w:spacing w:line="236" w:lineRule="auto"/>
+            </w:pPr>
+            <w:r>
+              <w:rPr>
+                <w:sz w:val="19"/>
+                <w:szCs w:val="19"/>
+              </w:rPr>
+              <w:t>Marcadores de carga en el lugar del contenido, conservando la estructura.</w:t>
+            </w:r>
+          </w:p>
+        </w:tc>
+      </w:tr>
+      <w:tr>
+        <w:tblPrEx>
+          <w:tblCellMar>
+            <w:top w:w="0" w:type="dxa"/>
+            <w:bottom w:w="0" w:type="dxa"/>
+          </w:tblCellMar>
+        </w:tblPrEx>
+        <w:tc>
+          <w:tcPr>
+            <w:tcW w:w="1700" w:type="dxa"/>
+            <w:shd w:val="clear" w:color="auto" w:fill="FFFFFF"/>
+            <w:tcMar>
+              <w:top w:w="40" w:type="dxa"/>
+              <w:left w:w="70" w:type="dxa"/>
+              <w:bottom w:w="40" w:type="dxa"/>
+              <w:right w:w="70" w:type="dxa"/>
+            </w:tcMar>
+          </w:tcPr>
+          <w:p>
+            <w:pPr>
+              <w:spacing w:line="236" w:lineRule="auto"/>
+            </w:pPr>
+            <w:r>
+              <w:rPr>
+                <w:sz w:val="19"/>
+                <w:szCs w:val="19"/>
+              </w:rPr>
+              <w:t>Vacío inicial</w:t>
+            </w:r>
+          </w:p>
+        </w:tc>
+        <w:tc>
+          <w:tcPr>
+            <w:tcW w:w="3200" w:type="dxa"/>
+            <w:shd w:val="clear" w:color="auto" w:fill="FFFFFF"/>
+            <w:tcMar>
+              <w:top w:w="40" w:type="dxa"/>
+              <w:left w:w="70" w:type="dxa"/>
+              <w:bottom w:w="40" w:type="dxa"/>
+              <w:right w:w="70" w:type="dxa"/>
+            </w:tcMar>
+          </w:tcPr>
+          <w:p>
+            <w:pPr>
+              <w:spacing w:line="236" w:lineRule="auto"/>
+            </w:pPr>
+            <w:r>
+              <w:rPr>
+                <w:sz w:val="19"/>
+                <w:szCs w:val="19"/>
+              </w:rPr>
+              <w:t>El usuario aún no ha registrado datos.</w:t>
+            </w:r>
+          </w:p>
+        </w:tc>
+        <w:tc>
+          <w:tcPr>
+            <w:tcW w:w="4460" w:type="dxa"/>
+            <w:shd w:val="clear" w:color="auto" w:fill="FFFFFF"/>
+            <w:tcMar>
+              <w:top w:w="40" w:type="dxa"/>
+              <w:left w:w="70" w:type="dxa"/>
+              <w:bottom w:w="40" w:type="dxa"/>
+              <w:right w:w="70" w:type="dxa"/>
+            </w:tcMar>
+          </w:tcPr>
+          <w:p>
+            <w:pPr>
+              <w:spacing w:line="236" w:lineRule="auto"/>
+            </w:pPr>
+            <w:r>
+              <w:rPr>
+                <w:sz w:val="19"/>
+                <w:szCs w:val="19"/>
+              </w:rPr>
+              <w:t>Mensaje breve, explicación de un renglón y la acción para crear el primer registro.</w:t>
+            </w:r>
+          </w:p>
+        </w:tc>
+      </w:tr>
+      <w:tr>
+        <w:tblPrEx>
+          <w:tblCellMar>
+            <w:top w:w="0" w:type="dxa"/>
+            <w:bottom w:w="0" w:type="dxa"/>
+          </w:tblCellMar>
+        </w:tblPrEx>
+        <w:tc>
+          <w:tcPr>
+            <w:tcW w:w="1700" w:type="dxa"/>
+            <w:shd w:val="clear" w:color="auto" w:fill="F2F2F2"/>
+            <w:tcMar>
+              <w:top w:w="40" w:type="dxa"/>
+              <w:left w:w="70" w:type="dxa"/>
+              <w:bottom w:w="40" w:type="dxa"/>
+              <w:right w:w="70" w:type="dxa"/>
+            </w:tcMar>
+          </w:tcPr>
+          <w:p>
+            <w:pPr>
+              <w:spacing w:line="236" w:lineRule="auto"/>
+            </w:pPr>
+            <w:r>
+              <w:rPr>
+                <w:sz w:val="19"/>
+                <w:szCs w:val="19"/>
+              </w:rPr>
+              <w:t>Sin resultados</w:t>
+            </w:r>
+          </w:p>
+        </w:tc>
+        <w:tc>
+          <w:tcPr>
+            <w:tcW w:w="3200" w:type="dxa"/>
+            <w:shd w:val="clear" w:color="auto" w:fill="F2F2F2"/>
+            <w:tcMar>
+              <w:top w:w="40" w:type="dxa"/>
+              <w:left w:w="70" w:type="dxa"/>
+              <w:bottom w:w="40" w:type="dxa"/>
+              <w:right w:w="70" w:type="dxa"/>
+            </w:tcMar>
+          </w:tcPr>
+          <w:p>
+            <w:pPr>
+              <w:spacing w:line="236" w:lineRule="auto"/>
+            </w:pPr>
+            <w:r>
+              <w:rPr>
+                <w:sz w:val="19"/>
+                <w:szCs w:val="19"/>
+              </w:rPr>
+              <w:t>La búsqueda o el filtro no arroja coincidencias.</w:t>
+            </w:r>
+          </w:p>
+        </w:tc>
+        <w:tc>
+          <w:tcPr>
+            <w:tcW w:w="4460" w:type="dxa"/>
+            <w:shd w:val="clear" w:color="auto" w:fill="F2F2F2"/>
+            <w:tcMar>
+              <w:top w:w="40" w:type="dxa"/>
+              <w:left w:w="70" w:type="dxa"/>
+              <w:bottom w:w="40" w:type="dxa"/>
+              <w:right w:w="70" w:type="dxa"/>
+            </w:tcMar>
+          </w:tcPr>
+          <w:p>
+            <w:pPr>
+              <w:spacing w:line="236" w:lineRule="auto"/>
+            </w:pPr>
+            <w:r>
+              <w:rPr>
+                <w:sz w:val="19"/>
+                <w:szCs w:val="19"/>
+              </w:rPr>
+              <w:t>Aviso de que no se encontraron resultados y sugerencia de modificar la búsqueda.</w:t>
+            </w:r>
+          </w:p>
+        </w:tc>
+      </w:tr>
+      <w:tr>
+        <w:tblPrEx>
+          <w:tblCellMar>
+            <w:top w:w="0" w:type="dxa"/>
+            <w:bottom w:w="0" w:type="dxa"/>
+          </w:tblCellMar>
+        </w:tblPrEx>
+        <w:tc>
+          <w:tcPr>
+            <w:tcW w:w="1700" w:type="dxa"/>
+            <w:shd w:val="clear" w:color="auto" w:fill="FFFFFF"/>
+            <w:tcMar>
+              <w:top w:w="40" w:type="dxa"/>
+              <w:left w:w="70" w:type="dxa"/>
+              <w:bottom w:w="40" w:type="dxa"/>
+              <w:right w:w="70" w:type="dxa"/>
+            </w:tcMar>
+          </w:tcPr>
+          <w:p>
+            <w:pPr>
+              <w:spacing w:line="236" w:lineRule="auto"/>
+            </w:pPr>
+            <w:r>
+              <w:rPr>
+                <w:sz w:val="19"/>
+                <w:szCs w:val="19"/>
+              </w:rPr>
+              <w:t>Error</w:t>
+            </w:r>
+          </w:p>
+        </w:tc>
+        <w:tc>
+          <w:tcPr>
+            <w:tcW w:w="3200" w:type="dxa"/>
+            <w:shd w:val="clear" w:color="auto" w:fill="FFFFFF"/>
+            <w:tcMar>
+              <w:top w:w="40" w:type="dxa"/>
+              <w:left w:w="70" w:type="dxa"/>
+              <w:bottom w:w="40" w:type="dxa"/>
+              <w:right w:w="70" w:type="dxa"/>
+            </w:tcMar>
+          </w:tcPr>
+          <w:p>
+            <w:pPr>
+              <w:spacing w:line="236" w:lineRule="auto"/>
+            </w:pPr>
+            <w:r>
+              <w:rPr>
+                <w:sz w:val="19"/>
+                <w:szCs w:val="19"/>
+              </w:rPr>
+              <w:t>Falla la operación o la conexión.</w:t>
+            </w:r>
+          </w:p>
+        </w:tc>
+        <w:tc>
+          <w:tcPr>
+            <w:tcW w:w="4460" w:type="dxa"/>
+            <w:shd w:val="clear" w:color="auto" w:fill="FFFFFF"/>
+            <w:tcMar>
+              <w:top w:w="40" w:type="dxa"/>
+              <w:left w:w="70" w:type="dxa"/>
+              <w:bottom w:w="40" w:type="dxa"/>
+              <w:right w:w="70" w:type="dxa"/>
+            </w:tcMar>
+          </w:tcPr>
+          <w:p>
+            <w:pPr>
+              <w:spacing w:line="236" w:lineRule="auto"/>
+            </w:pPr>
+            <w:r>
+              <w:rPr>
+                <w:sz w:val="19"/>
+                <w:szCs w:val="19"/>
+              </w:rPr>
+              <w:t>Mensaje en color de peligro con la causa y la opción de reintentar.</w:t>
+            </w:r>
+          </w:p>
+        </w:tc>
+      </w:tr>
+      <w:tr>
+        <w:tblPrEx>
+          <w:tblCellMar>
+            <w:top w:w="0" w:type="dxa"/>
+            <w:bottom w:w="0" w:type="dxa"/>
+          </w:tblCellMar>
+        </w:tblPrEx>
+        <w:tc>
+          <w:tcPr>
+            <w:tcW w:w="1700" w:type="dxa"/>
+            <w:shd w:val="clear" w:color="auto" w:fill="F2F2F2"/>
+            <w:tcMar>
+              <w:top w:w="40" w:type="dxa"/>
+              <w:left w:w="70" w:type="dxa"/>
+              <w:bottom w:w="40" w:type="dxa"/>
+              <w:right w:w="70" w:type="dxa"/>
+            </w:tcMar>
+          </w:tcPr>
+          <w:p>
+            <w:pPr>
+              <w:spacing w:line="236" w:lineRule="auto"/>
+            </w:pPr>
+            <w:r>
+              <w:rPr>
+                <w:sz w:val="19"/>
+                <w:szCs w:val="19"/>
+              </w:rPr>
+              <w:t>Sin permiso</w:t>
+            </w:r>
+          </w:p>
+        </w:tc>
+        <w:tc>
+          <w:tcPr>
+            <w:tcW w:w="3200" w:type="dxa"/>
+            <w:shd w:val="clear" w:color="auto" w:fill="F2F2F2"/>
+            <w:tcMar>
+              <w:top w:w="40" w:type="dxa"/>
+              <w:left w:w="70" w:type="dxa"/>
+              <w:bottom w:w="40" w:type="dxa"/>
+              <w:right w:w="70" w:type="dxa"/>
+            </w:tcMar>
+          </w:tcPr>
+          <w:p>
+            <w:pPr>
+              <w:spacing w:line="236" w:lineRule="auto"/>
+            </w:pPr>
+            <w:r>
+              <w:rPr>
+                <w:sz w:val="19"/>
+                <w:szCs w:val="19"/>
+              </w:rPr>
+              <w:t>El rol o el plan no habilitan la función.</w:t>
+            </w:r>
+          </w:p>
+        </w:tc>
+        <w:tc>
+          <w:tcPr>
+            <w:tcW w:w="4460" w:type="dxa"/>
+            <w:shd w:val="clear" w:color="auto" w:fill="F2F2F2"/>
+            <w:tcMar>
+              <w:top w:w="40" w:type="dxa"/>
+              <w:left w:w="70" w:type="dxa"/>
+              <w:bottom w:w="40" w:type="dxa"/>
+              <w:right w:w="70" w:type="dxa"/>
+            </w:tcMar>
+          </w:tcPr>
+          <w:p>
+            <w:pPr>
+              <w:spacing w:line="236" w:lineRule="auto"/>
+            </w:pPr>
+            <w:r>
+              <w:rPr>
+                <w:sz w:val="19"/>
+                <w:szCs w:val="19"/>
+              </w:rPr>
+              <w:t>Explicación del motivo y, cuando corresponde, la vía para cambiar de plan.</w:t>
+            </w:r>
+          </w:p>
+        </w:tc>
+      </w:tr>
+    </w:tbl>
+    <w:p>
+      <w:pPr>
+        <w:spacing w:after="110" w:line="262" w:lineRule="auto"/>
+        <w:jc w:val="both"/>
+      </w:pPr>
+      <w:r>
+        <w:t>Los avisos que confirman una operación no son permanentes: se muestran y se retiran solos a los pocos segundos. Quien los lee ya vio el resultado en la propia pantalla, y un mensaje que sobrevive a la acción siguiente deja de describir lo que acaba de pasar. Los de error, en cambio, permanecen hasta que se intenta otra cosa: llevan la causa y casi siempre algo que corregir, y uno que se desvanece mientras se lee es peor que no tenerlo. La regla vale para todas las pantallas y está escrita en un solo sitio.</w:t>
+      </w:r>
+    </w:p>
+    <w:p>
+      <w:pPr>
+        <w:pStyle w:val="Ttulo2"/>
+        <w:spacing w:before="150" w:after="80"/>
+      </w:pPr>
+      <w:bookmarkStart w:id="43" w:name="bm44"/>
+      <w:r>
+        <w:rPr>
+          <w:b/>
+          <w:bCs/>
+          <w:color w:val="2E5496"/>
+          <w:sz w:val="23"/>
+          <w:szCs w:val="23"/>
+        </w:rPr>
+        <w:t>9.2 Redacción de los mensajes</w:t>
+      </w:r>
+      <w:bookmarkEnd w:id="43"/>
+    </w:p>
+    <w:p>
+      <w:pPr>
+        <w:spacing w:after="110" w:line="262" w:lineRule="auto"/>
+        <w:jc w:val="both"/>
+      </w:pPr>
+      <w:r>
+        <w:t>Los textos siguen las mismas reglas en toda la aplicación:</w:t>
+      </w:r>
+    </w:p>
+    <w:p>
+      <w:pPr>
+        <w:pStyle w:val="Prrafodelista"/>
+        <w:numPr>
+          <w:ilvl w:val="0"/>
+          <w:numId w:val="1"/>
+        </w:numPr>
+        <w:spacing w:after="60" w:line="258" w:lineRule="auto"/>
+      </w:pPr>
+      <w:r>
+        <w:t>Lenguaje sencillo y directo, sin términos técnicos ni códigos de error visibles para el usuario.</w:t>
+      </w:r>
+    </w:p>
+    <w:p>
+      <w:pPr>
+        <w:pStyle w:val="Prrafodelista"/>
+        <w:numPr>
+          <w:ilvl w:val="0"/>
+          <w:numId w:val="1"/>
+        </w:numPr>
+        <w:spacing w:after="60" w:line="258" w:lineRule="auto"/>
+      </w:pPr>
+      <w:r>
+        <w:t>El mensaje describe qué ocurrió y qué hacer a continuación, en una sola frase cuando es posible.</w:t>
+      </w:r>
+    </w:p>
+    <w:p>
+      <w:pPr>
+        <w:pStyle w:val="Prrafodelista"/>
+        <w:numPr>
+          <w:ilvl w:val="0"/>
+          <w:numId w:val="1"/>
+        </w:numPr>
+        <w:spacing w:after="60" w:line="258" w:lineRule="auto"/>
+      </w:pPr>
+      <w:r>
+        <w:t>Los mensajes de validación se ubican junto al campo que los origina; los de operación, en la parte superior del contenido o como aviso emergente.</w:t>
+      </w:r>
+    </w:p>
+    <w:p>
+      <w:pPr>
+        <w:pStyle w:val="Prrafodelista"/>
+        <w:numPr>
+          <w:ilvl w:val="0"/>
+          <w:numId w:val="1"/>
+        </w:numPr>
+        <w:spacing w:after="60" w:line="258" w:lineRule="auto"/>
+      </w:pPr>
+      <w:r>
+        <w:lastRenderedPageBreak/>
+        <w:t>Las confirmaciones de una acción rápida desaparecen solas; los errores permanecen hasta que el usuario los atiende.</w:t>
+      </w:r>
+    </w:p>
+    <w:p>
+      <w:pPr>
+        <w:pStyle w:val="Prrafodelista"/>
+        <w:numPr>
+          <w:ilvl w:val="0"/>
+          <w:numId w:val="1"/>
+        </w:numPr>
+        <w:spacing w:after="60" w:line="258" w:lineRule="auto"/>
+      </w:pPr>
+      <w:r>
+        <w:t>No se responsabiliza al usuario del error ni se emplean expresiones de alarma.</w:t>
+      </w:r>
+    </w:p>
+    <w:p>
+      <w:pPr>
+        <w:pStyle w:val="Ttulo1"/>
+        <w:pageBreakBefore/>
+        <w:spacing w:before="220" w:after="110"/>
+      </w:pPr>
+      <w:bookmarkStart w:id="44" w:name="bm45"/>
+      <w:r>
+        <w:rPr>
+          <w:b/>
+          <w:bCs/>
+          <w:color w:val="1F3864"/>
+          <w:sz w:val="27"/>
+          <w:szCs w:val="27"/>
+        </w:rPr>
+        <w:lastRenderedPageBreak/>
+        <w:t>10. Comportamiento responsivo y modo oscuro</w:t>
+      </w:r>
+      <w:bookmarkEnd w:id="44"/>
+    </w:p>
+    <w:p>
+      <w:pPr>
+        <w:spacing w:after="110" w:line="262" w:lineRule="auto"/>
+        <w:jc w:val="both"/>
+      </w:pPr>
+      <w:r>
+        <w:t>La interfaz se adapta a los tamaños definidos en la sección 5.3. La adaptación no consiste en reducir la pantalla de escritorio, sino en reorganizar el contenido para conservar la facilidad de uso en cada dispositivo.</w:t>
+      </w:r>
+    </w:p>
+    <w:p>
+      <w:pPr>
+        <w:pStyle w:val="Ttulo2"/>
+        <w:spacing w:before="150" w:after="80"/>
+      </w:pPr>
+      <w:bookmarkStart w:id="45" w:name="bm46"/>
+      <w:r>
+        <w:rPr>
+          <w:b/>
+          <w:bCs/>
+          <w:color w:val="2E5496"/>
+          <w:sz w:val="23"/>
+          <w:szCs w:val="23"/>
+        </w:rPr>
+        <w:t>10.1 Versión móvil</w:t>
+      </w:r>
+      <w:bookmarkEnd w:id="45"/>
+    </w:p>
+    <w:p>
+      <w:pPr>
+        <w:spacing w:after="110" w:line="262" w:lineRule="auto"/>
+        <w:jc w:val="both"/>
+      </w:pPr>
+      <w:r>
+        <w:t>En el teléfono el contenido se presenta en una sola columna y la barra lateral se traslada a la parte superior, donde se desplaza en horizontal y conserva el acceso a todos los módulos. Los controles aumentan su área de toque y las tablas se convierten en listas, de modo que cada registro ocupe un renglón legible.</w:t>
+      </w:r>
+    </w:p>
+    <w:p>
+      <w:pPr>
+        <w:pStyle w:val="Prrafodelista"/>
+        <w:numPr>
+          <w:ilvl w:val="0"/>
+          <w:numId w:val="1"/>
+        </w:numPr>
+        <w:spacing w:after="60" w:line="258" w:lineRule="auto"/>
+      </w:pPr>
+      <w:r>
+        <w:t>Inicio de sesión: formulario centrado, con los campos y el botón a todo el ancho.</w:t>
+      </w:r>
+    </w:p>
+    <w:p>
+      <w:pPr>
+        <w:pStyle w:val="Prrafodelista"/>
+        <w:numPr>
+          <w:ilvl w:val="0"/>
+          <w:numId w:val="1"/>
+        </w:numPr>
+        <w:spacing w:after="60" w:line="258" w:lineRule="auto"/>
+      </w:pPr>
+      <w:r>
+        <w:t>Panel: los indicadores se agrupan de a dos por fila y las alertas de existencias quedan inmediatamente debajo.</w:t>
+      </w:r>
+    </w:p>
+    <w:p>
+      <w:pPr>
+        <w:pStyle w:val="Prrafodelista"/>
+        <w:numPr>
+          <w:ilvl w:val="0"/>
+          <w:numId w:val="1"/>
+        </w:numPr>
+        <w:spacing w:after="60" w:line="258" w:lineRule="auto"/>
+      </w:pPr>
+      <w:r>
+        <w:t>Punto de venta: buscador, lista de la venta en curso, total y medios de pago en una sola columna, con la acción de cobro fija en la parte inferior.</w:t>
+      </w:r>
+    </w:p>
+    <w:p>
+      <w:pPr>
+        <w:spacing w:before="60" w:after="20"/>
+        <w:jc w:val="center"/>
+      </w:pPr>
+      <w:r>
+        <w:rPr>
+          <w:noProof/>
+        </w:rPr>
+        <w:drawing>
+          <wp:inline distT="0" distB="0" distL="0" distR="0" wp14:anchorId="0C170A2F" wp14:editId="6AEE7634">
+            <wp:extent cx="6096000" cy="3295650"/>
+            <wp:effectExtent l="0" t="0" r="0" b="0"/>
+            <wp:docPr id="1481642797" name="Imagen 1481642797"/>
+            <wp:cNvGraphicFramePr>
+              <a:graphicFrameLocks xmlns:a="http://schemas.openxmlformats.org/drawingml/2006/main" noChangeAspect="1"/>
+            </wp:cNvGraphicFramePr>
+            <a:graphic xmlns:a="http://schemas.openxmlformats.org/drawingml/2006/main">
+              <a:graphicData uri="http://schemas.openxmlformats.org/drawingml/2006/picture">
+                <pic:pic xmlns:pic="http://schemas.openxmlformats.org/drawingml/2006/picture">
+                  <pic:nvPicPr>
+                    <pic:cNvPr id="0" name=""/>
+                    <pic:cNvPicPr>
+                      <a:picLocks noChangeAspect="1" noChangeArrowheads="1"/>
+                    </pic:cNvPicPr>
+                  </pic:nvPicPr>
+                  <pic:blipFill>
+                    <a:blip r:embed="rId32"/>
+                    <a:srcRect/>
+                    <a:stretch>
+                      <a:fillRect/>
+                    </a:stretch>
+                  </pic:blipFill>
+                  <pic:spPr bwMode="auto">
+                    <a:xfrm>
+                      <a:off x="0" y="0"/>
+                      <a:ext cx="6096000" cy="3295650"/>
+                    </a:xfrm>
+                    <a:prstGeom prst="rect">
+                      <a:avLst/>
+                    </a:prstGeom>
+                  </pic:spPr>
+                </pic:pic>
+              </a:graphicData>
+            </a:graphic>
+          </wp:inline>
+        </w:drawing>
+      </w:r>
+    </w:p>
+    <w:p>
+      <w:pPr>
+        <w:spacing w:before="6" w:after="150"/>
+        <w:jc w:val="center"/>
+      </w:pPr>
+      <w:r>
+        <w:rPr>
+          <w:i/>
+          <w:iCs/>
+          <w:color w:val="5B6678"/>
+          <w:sz w:val="18"/>
+          <w:szCs w:val="18"/>
+        </w:rPr>
+        <w:t>Figura 26. Versión móvil: inicio de sesión, panel y punto de venta. Fuente: del autor.</w:t>
+      </w:r>
+    </w:p>
+    <w:p>
+      <w:pPr>
+        <w:pStyle w:val="Ttulo2"/>
+        <w:spacing w:before="150" w:after="80"/>
+      </w:pPr>
+      <w:bookmarkStart w:id="46" w:name="bm47"/>
+      <w:r>
+        <w:rPr>
+          <w:b/>
+          <w:bCs/>
+          <w:color w:val="2E5496"/>
+          <w:sz w:val="23"/>
+          <w:szCs w:val="23"/>
+        </w:rPr>
+        <w:t>10.2 Tablet y escritorio</w:t>
+      </w:r>
+      <w:bookmarkEnd w:id="46"/>
+    </w:p>
+    <w:p>
+      <w:pPr>
+        <w:spacing w:after="110" w:line="262" w:lineRule="auto"/>
+        <w:jc w:val="both"/>
+      </w:pPr>
+      <w:r>
+        <w:t>En tablet el contenido se organiza en dos columnas. En escritorio se emplea la rejilla completa, con los paneles de apoyo a la derecha del contenido principal, como ocurre en el punto de venta. En ambos tamaños la navegación lateral se muestra desplegada y puede contraerse hasta dejar solo los iconos, para ganar ancho cuando el contenido lo pide; la elección se conserva entre sesiones, igual que la del modo oscuro, porque es una preferencia de quien trabaja en ese equipo. El punto de venta no es una excepción: es la pantalla que más agradece el ancho, y por eso la contracción se ofrece en todas y no solo en ella.</w:t>
+      </w:r>
+    </w:p>
+    <w:p>
+      <w:pPr>
+        <w:pStyle w:val="Ttulo2"/>
+        <w:spacing w:before="150" w:after="80"/>
+      </w:pPr>
+      <w:bookmarkStart w:id="47" w:name="bm48"/>
+      <w:r>
+        <w:rPr>
+          <w:b/>
+          <w:bCs/>
+          <w:color w:val="2E5496"/>
+          <w:sz w:val="23"/>
+          <w:szCs w:val="23"/>
+        </w:rPr>
+        <w:t>10.3 Modo oscuro</w:t>
+      </w:r>
+      <w:bookmarkEnd w:id="47"/>
+    </w:p>
+    <w:p>
+      <w:pPr>
+        <w:spacing w:after="110" w:line="262" w:lineRule="auto"/>
+        <w:jc w:val="both"/>
+      </w:pPr>
+      <w:r>
+        <w:t xml:space="preserve">El modo oscuro utiliza la variante de paleta definida en la sección 4.2 y conserva la misma estructura, la misma jerarquía y los mismos componentes del modo claro. Cambian únicamente los colores de fondo, superficie, borde y texto, y se ajustan los tonos de las etiquetas de estado para mantener el contraste. La </w:t>
+      </w:r>
+      <w:r>
+        <w:lastRenderedPageBreak/>
+        <w:t>elección del modo es del usuario y se conserva entre sesiones. El cambio se hace desde la parte inferior del menú lateral y, en las pantallas de acceso, desde el panel de marca, de modo que también pueda elegirlo quien todavía no ha entrado. Mientras el usuario no elija, se aplica la preferencia del sistema operativo.</w:t>
+      </w:r>
+    </w:p>
+    <w:p>
+      <w:pPr>
+        <w:spacing w:before="60" w:after="20"/>
+        <w:jc w:val="center"/>
+      </w:pPr>
+      <w:r>
+        <w:rPr>
+          <w:noProof/>
+        </w:rPr>
+        <w:drawing>
+          <wp:inline distT="0" distB="0" distL="0" distR="0" wp14:anchorId="59398D85" wp14:editId="0FF6FF10">
+            <wp:extent cx="6096000" cy="3067050"/>
+            <wp:effectExtent l="0" t="0" r="0" b="0"/>
+            <wp:docPr id="154515524" name="Imagen 154515524"/>
+            <wp:cNvGraphicFramePr>
+              <a:graphicFrameLocks xmlns:a="http://schemas.openxmlformats.org/drawingml/2006/main" noChangeAspect="1"/>
+            </wp:cNvGraphicFramePr>
+            <a:graphic xmlns:a="http://schemas.openxmlformats.org/drawingml/2006/main">
+              <a:graphicData uri="http://schemas.openxmlformats.org/drawingml/2006/picture">
+                <pic:pic xmlns:pic="http://schemas.openxmlformats.org/drawingml/2006/picture">
+                  <pic:nvPicPr>
+                    <pic:cNvPr id="0" name=""/>
+                    <pic:cNvPicPr>
+                      <a:picLocks noChangeAspect="1" noChangeArrowheads="1"/>
+                    </pic:cNvPicPr>
+                  </pic:nvPicPr>
+                  <pic:blipFill>
+                    <a:blip r:embed="rId33"/>
+                    <a:srcRect/>
+                    <a:stretch>
+                      <a:fillRect/>
+                    </a:stretch>
+                  </pic:blipFill>
+                  <pic:spPr bwMode="auto">
+                    <a:xfrm>
+                      <a:off x="0" y="0"/>
+                      <a:ext cx="6096000" cy="3067050"/>
+                    </a:xfrm>
+                    <a:prstGeom prst="rect">
+                      <a:avLst/>
+                    </a:prstGeom>
+                  </pic:spPr>
+                </pic:pic>
+              </a:graphicData>
+            </a:graphic>
+          </wp:inline>
+        </w:drawing>
+      </w:r>
+    </w:p>
+    <w:p>
+      <w:pPr>
+        <w:spacing w:before="6" w:after="150"/>
+        <w:jc w:val="center"/>
+      </w:pPr>
+      <w:r>
+        <w:rPr>
+          <w:i/>
+          <w:iCs/>
+          <w:color w:val="5B6678"/>
+          <w:sz w:val="18"/>
+          <w:szCs w:val="18"/>
+        </w:rPr>
+        <w:t>Figura 27. Panel principal en modo oscuro. Fuente: del autor.</w:t>
+      </w:r>
+    </w:p>
+    <w:p>
+      <w:pPr>
+        <w:pStyle w:val="Ttulo1"/>
+        <w:pageBreakBefore/>
+        <w:spacing w:before="220" w:after="110"/>
+      </w:pPr>
+      <w:bookmarkStart w:id="48" w:name="bm49"/>
+      <w:r>
+        <w:rPr>
+          <w:b/>
+          <w:bCs/>
+          <w:color w:val="1F3864"/>
+          <w:sz w:val="27"/>
+          <w:szCs w:val="27"/>
+        </w:rPr>
+        <w:lastRenderedPageBreak/>
+        <w:t>11. Conclusión</w:t>
+      </w:r>
+      <w:bookmarkEnd w:id="48"/>
+    </w:p>
+    <w:p>
+      <w:pPr>
+        <w:spacing w:after="110" w:line="262" w:lineRule="auto"/>
+        <w:jc w:val="both"/>
+      </w:pPr>
+      <w:r>
+        <w:t>Este documento reúne los lineamientos visuales y de interacción de INVENTRA: la identidad visual con sus dos paletas, la tipografía y la iconografía; la rejilla, el espaciado y los puntos de quiebre; los componentes comunes con sus estados; los formularios de acceso y registro; las pantallas principales de la aplicación; el tratamiento de los mensajes y de los estados de pantalla; y el comportamiento en distintos dispositivos.</w:t>
+      </w:r>
+    </w:p>
+    <w:p>
+      <w:pPr>
+        <w:spacing w:after="110" w:line="262" w:lineRule="auto"/>
+        <w:jc w:val="both"/>
+      </w:pPr>
+      <w:r>
+        <w:t>Con ello, la etapa de construcción cuenta con un referente único para implementar la interfaz: cada pantalla nueva puede armarse a partir de los componentes ya definidos, sin decisiones visuales aisladas. Los criterios aquí establecidos son coherentes con la especificación de requisitos, con el modelo de datos y con el análisis y diseño en UML del proyecto, y se complementan con el manual de marca, que desarrolla el uso del logotipo y de los elementos gráficos de identidad.</w:t>
+      </w:r>
+    </w:p>
+    <w:p>
+      <w:pPr>
+        <w:pStyle w:val="Ttulo1"/>
+        <w:pageBreakBefore/>
+        <w:spacing w:before="220" w:after="110"/>
+      </w:pPr>
+      <w:bookmarkStart w:id="49" w:name="bm50"/>
+      <w:r>
+        <w:rPr>
+          <w:b/>
+          <w:bCs/>
+          <w:color w:val="1F3864"/>
+          <w:sz w:val="27"/>
+          <w:szCs w:val="27"/>
+        </w:rPr>
+        <w:lastRenderedPageBreak/>
+        <w:t>12. Glosario</w:t>
+      </w:r>
+      <w:bookmarkEnd w:id="49"/>
+    </w:p>
+    <w:tbl>
+      <w:tblPr>
+        <w:tblW w:w="9360" w:type="dxa"/>
+        <w:tblBorders>
+          <w:top w:val="single" w:sz="6" w:space="0" w:color="9CA3AF"/>
+          <w:left w:val="single" w:sz="6" w:space="0" w:color="9CA3AF"/>
+          <w:bottom w:val="single" w:sz="6" w:space="0" w:color="9CA3AF"/>
+          <w:right w:val="single" w:sz="6" w:space="0" w:color="9CA3AF"/>
+          <w:insideH w:val="single" w:sz="6" w:space="0" w:color="9CA3AF"/>
+          <w:insideV w:val="single" w:sz="6" w:space="0" w:color="9CA3AF"/>
+        </w:tblBorders>
+        <w:tblLayout w:type="fixed"/>
+        <w:tblCellMar>
+          <w:left w:w="10" w:type="dxa"/>
+          <w:right w:w="10" w:type="dxa"/>
+        </w:tblCellMar>
+        <w:tblLook w:val="04A0" w:firstRow="1" w:lastRow="0" w:firstColumn="1" w:lastColumn="0" w:noHBand="0" w:noVBand="1"/>
       </w:tblPr>
       <w:tblGrid>
         <w:gridCol w:w="2100"/>
@@ -13476,7 +13912,7 @@
         <w:pageBreakBefore/>
         <w:spacing w:before="220" w:after="110"/>
       </w:pPr>
-      <w:bookmarkStart w:id="48" w:name="bm49"/>
+      <w:bookmarkStart w:id="50" w:name="bm51"/>
       <w:r>
         <w:rPr>
           <w:b/>
@@ -13488,7 +13924,7 @@
         <w:lastRenderedPageBreak/>
         <w:t>13. Referencias</w:t>
       </w:r>
-      <w:bookmarkEnd w:id="48"/>
+      <w:bookmarkEnd w:id="50"/>
     </w:p>
     <w:p>
       <w:pPr>
@@ -13613,7 +14049,7 @@
       </w:r>
     </w:p>
     <w:sectPr>
-      <w:footerReference w:type="default" r:id="rId31"/>
+      <w:footerReference w:type="default" r:id="rId34"/>
       <w:pgSz w:w="12240" w:h="15840"/>
       <w:pgMar w:top="1080" w:right="1000" w:bottom="1080" w:left="1000" w:header="708" w:footer="708" w:gutter="0"/>
       <w:cols w:space="720"/>
@@ -13710,10 +14146,10 @@
 <file path=word/numbering.xml><?xml version="1.0" encoding="utf-8"?>
 <w:numbering xmlns:wpc="http://schemas.microsoft.com/office/word/2010/wordprocessingCanvas" xmlns:cx="http://schemas.microsoft.com/office/drawing/2014/chartex" xmlns:cx1="http://schemas.microsoft.com/office/drawing/2015/9/8/chartex" xmlns:cx2="http://schemas.microsoft.com/office/drawing/2015/10/21/chartex" xmlns:cx3="http://schemas.microsoft.com/office/drawing/2016/5/9/chartex" xmlns:cx4="http://schemas.microsoft.com/office/drawing/2016/5/10/chartex" xmlns:cx5="http://schemas.microsoft.com/office/drawing/2016/5/11/chartex" xmlns:cx6="http://schemas.microsoft.com/office/drawing/2016/5/12/chartex" xmlns:cx7="http://schemas.microsoft.com/office/drawing/2016/5/13/chartex" xmlns:cx8="http://schemas.microsoft.com/office/drawing/2016/5/14/chartex" xmlns:mc="http://schemas.openxmlformats.org/markup-compatibility/2006" xmlns:aink="http://schemas.microsoft.com/office/drawing/2016/ink" xmlns:am3d="http://schemas.microsoft.com/office/drawing/2017/model3d" xmlns:o="urn:schemas-microsoft-com:office:office" xmlns:oel="http://schemas.microsoft.com/office/2019/extlst" xmlns:r="http://schemas.openxmlformats.org/officeDocument/2006/relationships" xmlns:m="http://schemas.openxmlformats.org/officeDocument/2006/math" xmlns:v="urn:schemas-microsoft-com:vml" xmlns:wp14="http://schemas.microsoft.com/office/word/2010/wordprocessingDrawing" xmlns:wp="http://schemas.openxmlformats.org/drawingml/2006/wordprocessingDrawing" xmlns:w10="urn:schemas-microsoft-com:office:word" xmlns:w="http://schemas.openxmlformats.org/wordprocessingml/2006/main" xmlns:w14="http://schemas.microsoft.com/office/word/2010/wordml" xmlns:w15="http://schemas.microsoft.com/office/word/2012/wordml" xmlns:w16cex="http://schemas.microsoft.com/office/word/2018/wordml/cex" xmlns:w16cid="http://schemas.microsoft.com/office/word/2016/wordml/cid" xmlns:w16="http://schemas.microsoft.com/office/word/2018/wordml" xmlns:w16du="http://schemas.microsoft.com/office/word/2023/wordml/word16du" xmlns:w16sdtdh="http://schemas.microsoft.com/office/word/2020/wordml/sdtdatahash" xmlns:w16sdtfl="http://schemas.microsoft.com/office/word/2024/wordml/sdtformatlock" xmlns:w16se="http://schemas.microsoft.com/office/word/2015/wordml/symex" xmlns:wpg="http://schemas.microsoft.com/office/word/2010/wordprocessingGroup" xmlns:wpi="http://schemas.microsoft.com/office/word/2010/wordprocessingInk" xmlns:wne="http://schemas.microsoft.com/office/word/2006/wordml" xmlns:wps="http://schemas.microsoft.com/office/word/2010/wordprocessingShape" mc:Ignorable="w14 w15 w16se w16cid w16 w16cex w16sdtdh w16sdtfl w16du wp14">
   <w:abstractNum w:abstractNumId="0" w15:restartNumberingAfterBreak="0">
-    <w:nsid w:val="4E1E0922"/>
+    <w:nsid w:val="142F1481"/>
     <w:multiLevelType w:val="hybridMultilevel"/>
-    <w:tmpl w:val="C8A89390"/>
-    <w:lvl w:ilvl="0" w:tplc="74EE542E">
+    <w:tmpl w:val="2BB402CC"/>
+    <w:lvl w:ilvl="0" w:tplc="B1B4F000">
       <w:start w:val="1"/>
       <w:numFmt w:val="bullet"/>
       <w:lvlText w:val="●"/>
@@ -13722,7 +14158,7 @@
         <w:ind w:left="720" w:hanging="360"/>
       </w:pPr>
     </w:lvl>
-    <w:lvl w:ilvl="1" w:tplc="BD2248F6">
+    <w:lvl w:ilvl="1" w:tplc="F13EA234">
       <w:start w:val="1"/>
       <w:numFmt w:val="bullet"/>
       <w:lvlText w:val="○"/>
@@ -13731,7 +14167,7 @@
         <w:ind w:left="1440" w:hanging="360"/>
       </w:pPr>
     </w:lvl>
-    <w:lvl w:ilvl="2" w:tplc="66ECE136">
+    <w:lvl w:ilvl="2" w:tplc="2B18C0D8">
       <w:start w:val="1"/>
       <w:numFmt w:val="bullet"/>
       <w:lvlText w:val="■"/>
@@ -13740,7 +14176,7 @@
         <w:ind w:left="2160" w:hanging="360"/>
       </w:pPr>
     </w:lvl>
-    <w:lvl w:ilvl="3" w:tplc="7074ABFC">
+    <w:lvl w:ilvl="3" w:tplc="96F0124A">
       <w:start w:val="1"/>
       <w:numFmt w:val="bullet"/>
       <w:lvlText w:val="●"/>
@@ -13749,7 +14185,7 @@
         <w:ind w:left="2880" w:hanging="360"/>
       </w:pPr>
     </w:lvl>
-    <w:lvl w:ilvl="4" w:tplc="7EEA35C6">
+    <w:lvl w:ilvl="4" w:tplc="FAB2211A">
       <w:start w:val="1"/>
       <w:numFmt w:val="bullet"/>
       <w:lvlText w:val="○"/>
@@ -13758,7 +14194,7 @@
         <w:ind w:left="3600" w:hanging="360"/>
       </w:pPr>
     </w:lvl>
-    <w:lvl w:ilvl="5" w:tplc="7326E8D0">
+    <w:lvl w:ilvl="5" w:tplc="5DAE3CF0">
       <w:start w:val="1"/>
       <w:numFmt w:val="bullet"/>
       <w:lvlText w:val="■"/>
@@ -13767,7 +14203,7 @@
         <w:ind w:left="4320" w:hanging="360"/>
       </w:pPr>
     </w:lvl>
-    <w:lvl w:ilvl="6" w:tplc="24A88BC0">
+    <w:lvl w:ilvl="6" w:tplc="11F2D916">
       <w:start w:val="1"/>
       <w:numFmt w:val="bullet"/>
       <w:lvlText w:val="●"/>
@@ -13776,7 +14212,7 @@
         <w:ind w:left="5040" w:hanging="360"/>
       </w:pPr>
     </w:lvl>
-    <w:lvl w:ilvl="7" w:tplc="C2386944">
+    <w:lvl w:ilvl="7" w:tplc="A3709E9C">
       <w:start w:val="1"/>
       <w:numFmt w:val="bullet"/>
       <w:lvlText w:val="●"/>
@@ -13785,7 +14221,7 @@
         <w:ind w:left="5760" w:hanging="360"/>
       </w:pPr>
     </w:lvl>
-    <w:lvl w:ilvl="8" w:tplc="F452B426">
+    <w:lvl w:ilvl="8" w:tplc="62B89412">
       <w:start w:val="1"/>
       <w:numFmt w:val="bullet"/>
       <w:lvlText w:val="●"/>
@@ -13795,7 +14231,7 @@
       </w:pPr>
     </w:lvl>
   </w:abstractNum>
-  <w:num w:numId="1" w16cid:durableId="2054647136">
+  <w:num w:numId="1" w16cid:durableId="1934123202">
     <w:abstractNumId w:val="0"/>
     <w:lvlOverride w:ilvl="0">
       <w:startOverride w:val="1"/>

</xml_diff>

<commit_message>
Construyo el punto de venta con su comprobante
Es la pantalla que se juzga por su rapidez, de modo que se vende sin soltar el teclado y lo que se arma no se pierde al salir de ella.
</commit_message>
<xml_diff>
--- a/docs/diseno/INVENTRA_Documento_Tecnico_Diseno.docx
+++ b/docs/diseno/INVENTRA_Documento_Tecnico_Diseno.docx
@@ -154,12 +154,6 @@
         <w:gridCol w:w="3260"/>
       </w:tblGrid>
       <w:tr>
-        <w:tblPrEx>
-          <w:tblCellMar>
-            <w:top w:w="0" w:type="dxa"/>
-            <w:bottom w:w="0" w:type="dxa"/>
-          </w:tblCellMar>
-        </w:tblPrEx>
         <w:trPr>
           <w:tblHeader/>
         </w:trPr>
@@ -273,12 +267,6 @@
         </w:tc>
       </w:tr>
       <w:tr>
-        <w:tblPrEx>
-          <w:tblCellMar>
-            <w:top w:w="0" w:type="dxa"/>
-            <w:bottom w:w="0" w:type="dxa"/>
-          </w:tblCellMar>
-        </w:tblPrEx>
         <w:tc>
           <w:tcPr>
             <w:tcW w:w="1500" w:type="dxa"/>
@@ -2675,10 +2663,7 @@
         <w:jc w:val="both"/>
       </w:pPr>
       <w:r>
-        <w:t>Este documento define el sistema de diseño de la interfaz de INVENTRA para las plataformas web y móvil. Reúne la identidad visual, los componentes reutilizables, las pautas de accesibilidad y de experiencia de usuario, y las pantallas principales de la aplicación. Su propósito es servir de guía para la etapa de construcción y garantizar una interfaz coherente en todo el producto</w:t>
-      </w:r>
-      <w:r>
-        <w:t>.</w:t>
+        <w:t>Este documento define el sistema de diseño de la interfaz de INVENTRA para las plataformas web y móvil. Reúne la identidad visual, los componentes reutilizables, las pautas de accesibilidad y de experiencia de usuario, y las pantallas principales de la aplicación. Su propósito es servir de guía para la etapa de construcción y garantizar una interfaz coherente en todo el producto.</w:t>
       </w:r>
     </w:p>
     <w:p>
@@ -2710,7 +2695,10 @@
         <w:t xml:space="preserve">Alcance. </w:t>
       </w:r>
       <w:r>
-        <w:t>Cubre la aplicación web y su versión móvil. Se apoya en la especificación de requisitos (IEEE 830), en el modelo de datos (MER y diccionario) y en el prototipo de INVENTRA. No incluye la implementación del código, que corresponde a la etapa de construcción.</w:t>
+        <w:t>Cubre la aplicación web y su versión móvil. Se apoya en la especificación de requisitos (IEEE 830), en el modelo de datos (MER y diccionario) y en el prototipo de INVENTRA. No incluye la implementación del código, que corresponde a la etapa de construcción</w:t>
+      </w:r>
+      <w:r>
+        <w:t>.</w:t>
       </w:r>
     </w:p>
     <w:p>
@@ -3008,7 +2996,10 @@
         <w:t xml:space="preserve">Mensajes comprensibles. </w:t>
       </w:r>
       <w:r>
-        <w:t>Los errores se explican en lenguaje sencillo e indican cómo corregirlos.</w:t>
+        <w:t>Los errores se explican en lenguaje sencillo e indican cómo corregirlos</w:t>
+      </w:r>
+      <w:r>
+        <w:t>.</w:t>
       </w:r>
     </w:p>
     <w:p>
@@ -3068,7 +3059,7 @@
           <w:noProof/>
         </w:rPr>
         <w:drawing>
-          <wp:inline distT="0" distB="0" distL="0" distR="0" wp14:anchorId="6492A5E3" wp14:editId="68F2F285">
+          <wp:inline distT="0" distB="0" distL="0" distR="0" wp14:anchorId="23018FEE" wp14:editId="0DFB5F8D">
             <wp:extent cx="5905500" cy="2324100"/>
             <wp:effectExtent l="0" t="0" r="0" b="0"/>
             <wp:docPr id="1" name="Imagen 1"/>
@@ -3151,10 +3142,10 @@
           <w:noProof/>
         </w:rPr>
         <w:drawing>
-          <wp:inline distT="0" distB="0" distL="0" distR="0" wp14:anchorId="4B4EB839" wp14:editId="25FE4FBB">
+          <wp:inline distT="0" distB="0" distL="0" distR="0" wp14:anchorId="7F8D5FA3" wp14:editId="6D9AF1FD">
             <wp:extent cx="5334000" cy="2371725"/>
             <wp:effectExtent l="0" t="0" r="0" b="0"/>
-            <wp:docPr id="1330692320" name="Imagen 1330692320"/>
+            <wp:docPr id="1305898800" name="Imagen 1305898800"/>
             <wp:cNvGraphicFramePr>
               <a:graphicFrameLocks xmlns:a="http://schemas.openxmlformats.org/drawingml/2006/main" noChangeAspect="1"/>
             </wp:cNvGraphicFramePr>
@@ -3258,12 +3249,6 @@
         <w:gridCol w:w="4510"/>
       </w:tblGrid>
       <w:tr>
-        <w:tblPrEx>
-          <w:tblCellMar>
-            <w:top w:w="0" w:type="dxa"/>
-            <w:bottom w:w="0" w:type="dxa"/>
-          </w:tblCellMar>
-        </w:tblPrEx>
         <w:trPr>
           <w:tblHeader/>
         </w:trPr>
@@ -3377,12 +3362,6 @@
         </w:tc>
       </w:tr>
       <w:tr>
-        <w:tblPrEx>
-          <w:tblCellMar>
-            <w:top w:w="0" w:type="dxa"/>
-            <w:bottom w:w="0" w:type="dxa"/>
-          </w:tblCellMar>
-        </w:tblPrEx>
         <w:tc>
           <w:tcPr>
             <w:tcW w:w="1850" w:type="dxa"/>
@@ -3481,12 +3460,6 @@
         </w:tc>
       </w:tr>
       <w:tr>
-        <w:tblPrEx>
-          <w:tblCellMar>
-            <w:top w:w="0" w:type="dxa"/>
-            <w:bottom w:w="0" w:type="dxa"/>
-          </w:tblCellMar>
-        </w:tblPrEx>
         <w:tc>
           <w:tcPr>
             <w:tcW w:w="1850" w:type="dxa"/>
@@ -3586,12 +3559,6 @@
         </w:tc>
       </w:tr>
       <w:tr>
-        <w:tblPrEx>
-          <w:tblCellMar>
-            <w:top w:w="0" w:type="dxa"/>
-            <w:bottom w:w="0" w:type="dxa"/>
-          </w:tblCellMar>
-        </w:tblPrEx>
         <w:tc>
           <w:tcPr>
             <w:tcW w:w="1850" w:type="dxa"/>
@@ -3690,12 +3657,6 @@
         </w:tc>
       </w:tr>
       <w:tr>
-        <w:tblPrEx>
-          <w:tblCellMar>
-            <w:top w:w="0" w:type="dxa"/>
-            <w:bottom w:w="0" w:type="dxa"/>
-          </w:tblCellMar>
-        </w:tblPrEx>
         <w:tc>
           <w:tcPr>
             <w:tcW w:w="1850" w:type="dxa"/>
@@ -3794,12 +3755,6 @@
         </w:tc>
       </w:tr>
       <w:tr>
-        <w:tblPrEx>
-          <w:tblCellMar>
-            <w:top w:w="0" w:type="dxa"/>
-            <w:bottom w:w="0" w:type="dxa"/>
-          </w:tblCellMar>
-        </w:tblPrEx>
         <w:tc>
           <w:tcPr>
             <w:tcW w:w="1850" w:type="dxa"/>
@@ -3898,12 +3853,6 @@
         </w:tc>
       </w:tr>
       <w:tr>
-        <w:tblPrEx>
-          <w:tblCellMar>
-            <w:top w:w="0" w:type="dxa"/>
-            <w:bottom w:w="0" w:type="dxa"/>
-          </w:tblCellMar>
-        </w:tblPrEx>
         <w:tc>
           <w:tcPr>
             <w:tcW w:w="1850" w:type="dxa"/>
@@ -4002,12 +3951,6 @@
         </w:tc>
       </w:tr>
       <w:tr>
-        <w:tblPrEx>
-          <w:tblCellMar>
-            <w:top w:w="0" w:type="dxa"/>
-            <w:bottom w:w="0" w:type="dxa"/>
-          </w:tblCellMar>
-        </w:tblPrEx>
         <w:tc>
           <w:tcPr>
             <w:tcW w:w="1850" w:type="dxa"/>
@@ -4106,12 +4049,6 @@
         </w:tc>
       </w:tr>
       <w:tr>
-        <w:tblPrEx>
-          <w:tblCellMar>
-            <w:top w:w="0" w:type="dxa"/>
-            <w:bottom w:w="0" w:type="dxa"/>
-          </w:tblCellMar>
-        </w:tblPrEx>
         <w:tc>
           <w:tcPr>
             <w:tcW w:w="1850" w:type="dxa"/>
@@ -4210,12 +4147,6 @@
         </w:tc>
       </w:tr>
       <w:tr>
-        <w:tblPrEx>
-          <w:tblCellMar>
-            <w:top w:w="0" w:type="dxa"/>
-            <w:bottom w:w="0" w:type="dxa"/>
-          </w:tblCellMar>
-        </w:tblPrEx>
         <w:tc>
           <w:tcPr>
             <w:tcW w:w="1850" w:type="dxa"/>
@@ -4314,12 +4245,6 @@
         </w:tc>
       </w:tr>
       <w:tr>
-        <w:tblPrEx>
-          <w:tblCellMar>
-            <w:top w:w="0" w:type="dxa"/>
-            <w:bottom w:w="0" w:type="dxa"/>
-          </w:tblCellMar>
-        </w:tblPrEx>
         <w:tc>
           <w:tcPr>
             <w:tcW w:w="1850" w:type="dxa"/>
@@ -4418,12 +4343,6 @@
         </w:tc>
       </w:tr>
       <w:tr>
-        <w:tblPrEx>
-          <w:tblCellMar>
-            <w:top w:w="0" w:type="dxa"/>
-            <w:bottom w:w="0" w:type="dxa"/>
-          </w:tblCellMar>
-        </w:tblPrEx>
         <w:tc>
           <w:tcPr>
             <w:tcW w:w="1850" w:type="dxa"/>
@@ -4522,12 +4441,6 @@
         </w:tc>
       </w:tr>
       <w:tr>
-        <w:tblPrEx>
-          <w:tblCellMar>
-            <w:top w:w="0" w:type="dxa"/>
-            <w:bottom w:w="0" w:type="dxa"/>
-          </w:tblCellMar>
-        </w:tblPrEx>
         <w:tc>
           <w:tcPr>
             <w:tcW w:w="1850" w:type="dxa"/>
@@ -4626,12 +4539,6 @@
         </w:tc>
       </w:tr>
       <w:tr>
-        <w:tblPrEx>
-          <w:tblCellMar>
-            <w:top w:w="0" w:type="dxa"/>
-            <w:bottom w:w="0" w:type="dxa"/>
-          </w:tblCellMar>
-        </w:tblPrEx>
         <w:tc>
           <w:tcPr>
             <w:tcW w:w="1850" w:type="dxa"/>
@@ -4730,12 +4637,6 @@
         </w:tc>
       </w:tr>
       <w:tr>
-        <w:tblPrEx>
-          <w:tblCellMar>
-            <w:top w:w="0" w:type="dxa"/>
-            <w:bottom w:w="0" w:type="dxa"/>
-          </w:tblCellMar>
-        </w:tblPrEx>
         <w:tc>
           <w:tcPr>
             <w:tcW w:w="1850" w:type="dxa"/>
@@ -4834,12 +4735,6 @@
         </w:tc>
       </w:tr>
       <w:tr>
-        <w:tblPrEx>
-          <w:tblCellMar>
-            <w:top w:w="0" w:type="dxa"/>
-            <w:bottom w:w="0" w:type="dxa"/>
-          </w:tblCellMar>
-        </w:tblPrEx>
         <w:tc>
           <w:tcPr>
             <w:tcW w:w="1850" w:type="dxa"/>
@@ -4938,12 +4833,6 @@
         </w:tc>
       </w:tr>
       <w:tr>
-        <w:tblPrEx>
-          <w:tblCellMar>
-            <w:top w:w="0" w:type="dxa"/>
-            <w:bottom w:w="0" w:type="dxa"/>
-          </w:tblCellMar>
-        </w:tblPrEx>
         <w:tc>
           <w:tcPr>
             <w:tcW w:w="1850" w:type="dxa"/>
@@ -5042,12 +4931,6 @@
         </w:tc>
       </w:tr>
       <w:tr>
-        <w:tblPrEx>
-          <w:tblCellMar>
-            <w:top w:w="0" w:type="dxa"/>
-            <w:bottom w:w="0" w:type="dxa"/>
-          </w:tblCellMar>
-        </w:tblPrEx>
         <w:tc>
           <w:tcPr>
             <w:tcW w:w="1850" w:type="dxa"/>
@@ -5146,12 +5029,6 @@
         </w:tc>
       </w:tr>
       <w:tr>
-        <w:tblPrEx>
-          <w:tblCellMar>
-            <w:top w:w="0" w:type="dxa"/>
-            <w:bottom w:w="0" w:type="dxa"/>
-          </w:tblCellMar>
-        </w:tblPrEx>
         <w:tc>
           <w:tcPr>
             <w:tcW w:w="1850" w:type="dxa"/>
@@ -5302,12 +5179,6 @@
         <w:gridCol w:w="3760"/>
       </w:tblGrid>
       <w:tr>
-        <w:tblPrEx>
-          <w:tblCellMar>
-            <w:top w:w="0" w:type="dxa"/>
-            <w:bottom w:w="0" w:type="dxa"/>
-          </w:tblCellMar>
-        </w:tblPrEx>
         <w:trPr>
           <w:tblHeader/>
         </w:trPr>
@@ -5421,12 +5292,6 @@
         </w:tc>
       </w:tr>
       <w:tr>
-        <w:tblPrEx>
-          <w:tblCellMar>
-            <w:top w:w="0" w:type="dxa"/>
-            <w:bottom w:w="0" w:type="dxa"/>
-          </w:tblCellMar>
-        </w:tblPrEx>
         <w:tc>
           <w:tcPr>
             <w:tcW w:w="2400" w:type="dxa"/>
@@ -5525,12 +5390,6 @@
         </w:tc>
       </w:tr>
       <w:tr>
-        <w:tblPrEx>
-          <w:tblCellMar>
-            <w:top w:w="0" w:type="dxa"/>
-            <w:bottom w:w="0" w:type="dxa"/>
-          </w:tblCellMar>
-        </w:tblPrEx>
         <w:tc>
           <w:tcPr>
             <w:tcW w:w="2400" w:type="dxa"/>
@@ -5629,12 +5488,6 @@
         </w:tc>
       </w:tr>
       <w:tr>
-        <w:tblPrEx>
-          <w:tblCellMar>
-            <w:top w:w="0" w:type="dxa"/>
-            <w:bottom w:w="0" w:type="dxa"/>
-          </w:tblCellMar>
-        </w:tblPrEx>
         <w:tc>
           <w:tcPr>
             <w:tcW w:w="2400" w:type="dxa"/>
@@ -5733,12 +5586,6 @@
         </w:tc>
       </w:tr>
       <w:tr>
-        <w:tblPrEx>
-          <w:tblCellMar>
-            <w:top w:w="0" w:type="dxa"/>
-            <w:bottom w:w="0" w:type="dxa"/>
-          </w:tblCellMar>
-        </w:tblPrEx>
         <w:tc>
           <w:tcPr>
             <w:tcW w:w="2400" w:type="dxa"/>
@@ -5837,12 +5684,6 @@
         </w:tc>
       </w:tr>
       <w:tr>
-        <w:tblPrEx>
-          <w:tblCellMar>
-            <w:top w:w="0" w:type="dxa"/>
-            <w:bottom w:w="0" w:type="dxa"/>
-          </w:tblCellMar>
-        </w:tblPrEx>
         <w:tc>
           <w:tcPr>
             <w:tcW w:w="2400" w:type="dxa"/>
@@ -5941,12 +5782,6 @@
         </w:tc>
       </w:tr>
       <w:tr>
-        <w:tblPrEx>
-          <w:tblCellMar>
-            <w:top w:w="0" w:type="dxa"/>
-            <w:bottom w:w="0" w:type="dxa"/>
-          </w:tblCellMar>
-        </w:tblPrEx>
         <w:tc>
           <w:tcPr>
             <w:tcW w:w="2400" w:type="dxa"/>
@@ -6151,12 +5986,6 @@
         <w:gridCol w:w="7160"/>
       </w:tblGrid>
       <w:tr>
-        <w:tblPrEx>
-          <w:tblCellMar>
-            <w:top w:w="0" w:type="dxa"/>
-            <w:bottom w:w="0" w:type="dxa"/>
-          </w:tblCellMar>
-        </w:tblPrEx>
         <w:trPr>
           <w:tblHeader/>
         </w:trPr>
@@ -6216,12 +6045,6 @@
         </w:tc>
       </w:tr>
       <w:tr>
-        <w:tblPrEx>
-          <w:tblCellMar>
-            <w:top w:w="0" w:type="dxa"/>
-            <w:bottom w:w="0" w:type="dxa"/>
-          </w:tblCellMar>
-        </w:tblPrEx>
         <w:tc>
           <w:tcPr>
             <w:tcW w:w="2200" w:type="dxa"/>
@@ -6272,12 +6095,6 @@
         </w:tc>
       </w:tr>
       <w:tr>
-        <w:tblPrEx>
-          <w:tblCellMar>
-            <w:top w:w="0" w:type="dxa"/>
-            <w:bottom w:w="0" w:type="dxa"/>
-          </w:tblCellMar>
-        </w:tblPrEx>
         <w:tc>
           <w:tcPr>
             <w:tcW w:w="2200" w:type="dxa"/>
@@ -6328,12 +6145,6 @@
         </w:tc>
       </w:tr>
       <w:tr>
-        <w:tblPrEx>
-          <w:tblCellMar>
-            <w:top w:w="0" w:type="dxa"/>
-            <w:bottom w:w="0" w:type="dxa"/>
-          </w:tblCellMar>
-        </w:tblPrEx>
         <w:tc>
           <w:tcPr>
             <w:tcW w:w="2200" w:type="dxa"/>
@@ -6384,12 +6195,6 @@
         </w:tc>
       </w:tr>
       <w:tr>
-        <w:tblPrEx>
-          <w:tblCellMar>
-            <w:top w:w="0" w:type="dxa"/>
-            <w:bottom w:w="0" w:type="dxa"/>
-          </w:tblCellMar>
-        </w:tblPrEx>
         <w:tc>
           <w:tcPr>
             <w:tcW w:w="2200" w:type="dxa"/>
@@ -6518,12 +6323,6 @@
         <w:gridCol w:w="4960"/>
       </w:tblGrid>
       <w:tr>
-        <w:tblPrEx>
-          <w:tblCellMar>
-            <w:top w:w="0" w:type="dxa"/>
-            <w:bottom w:w="0" w:type="dxa"/>
-          </w:tblCellMar>
-        </w:tblPrEx>
         <w:trPr>
           <w:tblHeader/>
         </w:trPr>
@@ -6610,12 +6409,6 @@
         </w:tc>
       </w:tr>
       <w:tr>
-        <w:tblPrEx>
-          <w:tblCellMar>
-            <w:top w:w="0" w:type="dxa"/>
-            <w:bottom w:w="0" w:type="dxa"/>
-          </w:tblCellMar>
-        </w:tblPrEx>
         <w:tc>
           <w:tcPr>
             <w:tcW w:w="2200" w:type="dxa"/>
@@ -6690,12 +6483,6 @@
         </w:tc>
       </w:tr>
       <w:tr>
-        <w:tblPrEx>
-          <w:tblCellMar>
-            <w:top w:w="0" w:type="dxa"/>
-            <w:bottom w:w="0" w:type="dxa"/>
-          </w:tblCellMar>
-        </w:tblPrEx>
         <w:tc>
           <w:tcPr>
             <w:tcW w:w="2200" w:type="dxa"/>
@@ -6770,12 +6557,6 @@
         </w:tc>
       </w:tr>
       <w:tr>
-        <w:tblPrEx>
-          <w:tblCellMar>
-            <w:top w:w="0" w:type="dxa"/>
-            <w:bottom w:w="0" w:type="dxa"/>
-          </w:tblCellMar>
-        </w:tblPrEx>
         <w:tc>
           <w:tcPr>
             <w:tcW w:w="2200" w:type="dxa"/>
@@ -6930,12 +6711,6 @@
         <w:gridCol w:w="3660"/>
       </w:tblGrid>
       <w:tr>
-        <w:tblPrEx>
-          <w:tblCellMar>
-            <w:top w:w="0" w:type="dxa"/>
-            <w:bottom w:w="0" w:type="dxa"/>
-          </w:tblCellMar>
-        </w:tblPrEx>
         <w:trPr>
           <w:tblHeader/>
         </w:trPr>
@@ -7022,12 +6797,6 @@
         </w:tc>
       </w:tr>
       <w:tr>
-        <w:tblPrEx>
-          <w:tblCellMar>
-            <w:top w:w="0" w:type="dxa"/>
-            <w:bottom w:w="0" w:type="dxa"/>
-          </w:tblCellMar>
-        </w:tblPrEx>
         <w:tc>
           <w:tcPr>
             <w:tcW w:w="1700" w:type="dxa"/>
@@ -7102,12 +6871,6 @@
         </w:tc>
       </w:tr>
       <w:tr>
-        <w:tblPrEx>
-          <w:tblCellMar>
-            <w:top w:w="0" w:type="dxa"/>
-            <w:bottom w:w="0" w:type="dxa"/>
-          </w:tblCellMar>
-        </w:tblPrEx>
         <w:tc>
           <w:tcPr>
             <w:tcW w:w="1700" w:type="dxa"/>
@@ -7182,12 +6945,6 @@
         </w:tc>
       </w:tr>
       <w:tr>
-        <w:tblPrEx>
-          <w:tblCellMar>
-            <w:top w:w="0" w:type="dxa"/>
-            <w:bottom w:w="0" w:type="dxa"/>
-          </w:tblCellMar>
-        </w:tblPrEx>
         <w:tc>
           <w:tcPr>
             <w:tcW w:w="1700" w:type="dxa"/>
@@ -7262,12 +7019,6 @@
         </w:tc>
       </w:tr>
       <w:tr>
-        <w:tblPrEx>
-          <w:tblCellMar>
-            <w:top w:w="0" w:type="dxa"/>
-            <w:bottom w:w="0" w:type="dxa"/>
-          </w:tblCellMar>
-        </w:tblPrEx>
         <w:tc>
           <w:tcPr>
             <w:tcW w:w="1700" w:type="dxa"/>
@@ -7342,12 +7093,6 @@
         </w:tc>
       </w:tr>
       <w:tr>
-        <w:tblPrEx>
-          <w:tblCellMar>
-            <w:top w:w="0" w:type="dxa"/>
-            <w:bottom w:w="0" w:type="dxa"/>
-          </w:tblCellMar>
-        </w:tblPrEx>
         <w:tc>
           <w:tcPr>
             <w:tcW w:w="1700" w:type="dxa"/>
@@ -7422,12 +7167,6 @@
         </w:tc>
       </w:tr>
       <w:tr>
-        <w:tblPrEx>
-          <w:tblCellMar>
-            <w:top w:w="0" w:type="dxa"/>
-            <w:bottom w:w="0" w:type="dxa"/>
-          </w:tblCellMar>
-        </w:tblPrEx>
         <w:tc>
           <w:tcPr>
             <w:tcW w:w="1700" w:type="dxa"/>
@@ -7502,12 +7241,6 @@
         </w:tc>
       </w:tr>
       <w:tr>
-        <w:tblPrEx>
-          <w:tblCellMar>
-            <w:top w:w="0" w:type="dxa"/>
-            <w:bottom w:w="0" w:type="dxa"/>
-          </w:tblCellMar>
-        </w:tblPrEx>
         <w:tc>
           <w:tcPr>
             <w:tcW w:w="1700" w:type="dxa"/>
@@ -7633,12 +7366,6 @@
         <w:gridCol w:w="3060"/>
       </w:tblGrid>
       <w:tr>
-        <w:tblPrEx>
-          <w:tblCellMar>
-            <w:top w:w="0" w:type="dxa"/>
-            <w:bottom w:w="0" w:type="dxa"/>
-          </w:tblCellMar>
-        </w:tblPrEx>
         <w:trPr>
           <w:tblHeader/>
         </w:trPr>
@@ -7725,12 +7452,6 @@
         </w:tc>
       </w:tr>
       <w:tr>
-        <w:tblPrEx>
-          <w:tblCellMar>
-            <w:top w:w="0" w:type="dxa"/>
-            <w:bottom w:w="0" w:type="dxa"/>
-          </w:tblCellMar>
-        </w:tblPrEx>
         <w:tc>
           <w:tcPr>
             <w:tcW w:w="1700" w:type="dxa"/>
@@ -7805,12 +7526,6 @@
         </w:tc>
       </w:tr>
       <w:tr>
-        <w:tblPrEx>
-          <w:tblCellMar>
-            <w:top w:w="0" w:type="dxa"/>
-            <w:bottom w:w="0" w:type="dxa"/>
-          </w:tblCellMar>
-        </w:tblPrEx>
         <w:tc>
           <w:tcPr>
             <w:tcW w:w="1700" w:type="dxa"/>
@@ -7885,12 +7600,6 @@
         </w:tc>
       </w:tr>
       <w:tr>
-        <w:tblPrEx>
-          <w:tblCellMar>
-            <w:top w:w="0" w:type="dxa"/>
-            <w:bottom w:w="0" w:type="dxa"/>
-          </w:tblCellMar>
-        </w:tblPrEx>
         <w:tc>
           <w:tcPr>
             <w:tcW w:w="1700" w:type="dxa"/>
@@ -7965,12 +7674,6 @@
         </w:tc>
       </w:tr>
       <w:tr>
-        <w:tblPrEx>
-          <w:tblCellMar>
-            <w:top w:w="0" w:type="dxa"/>
-            <w:bottom w:w="0" w:type="dxa"/>
-          </w:tblCellMar>
-        </w:tblPrEx>
         <w:tc>
           <w:tcPr>
             <w:tcW w:w="1700" w:type="dxa"/>
@@ -8065,10 +7768,10 @@
         </w:rPr>
         <w:lastRenderedPageBreak/>
         <w:drawing>
-          <wp:inline distT="0" distB="0" distL="0" distR="0" wp14:anchorId="2845776D" wp14:editId="0C0356CF">
+          <wp:inline distT="0" distB="0" distL="0" distR="0" wp14:anchorId="6C4267D3" wp14:editId="4A95FFAA">
             <wp:extent cx="5905500" cy="2419350"/>
             <wp:effectExtent l="0" t="0" r="0" b="0"/>
-            <wp:docPr id="369004807" name="Imagen 369004807"/>
+            <wp:docPr id="240012898" name="Imagen 240012898"/>
             <wp:cNvGraphicFramePr>
               <a:graphicFrameLocks xmlns:a="http://schemas.openxmlformats.org/drawingml/2006/main" noChangeAspect="1"/>
             </wp:cNvGraphicFramePr>
@@ -8218,10 +7921,10 @@
           <w:noProof/>
         </w:rPr>
         <w:drawing>
-          <wp:inline distT="0" distB="0" distL="0" distR="0" wp14:anchorId="7725FE3D" wp14:editId="07976F76">
+          <wp:inline distT="0" distB="0" distL="0" distR="0" wp14:anchorId="777DF9E4" wp14:editId="36E89790">
             <wp:extent cx="5905500" cy="2257425"/>
             <wp:effectExtent l="0" t="0" r="0" b="0"/>
-            <wp:docPr id="478177078" name="Imagen 478177078"/>
+            <wp:docPr id="1618190245" name="Imagen 1618190245"/>
             <wp:cNvGraphicFramePr>
               <a:graphicFrameLocks xmlns:a="http://schemas.openxmlformats.org/drawingml/2006/main" noChangeAspect="1"/>
             </wp:cNvGraphicFramePr>
@@ -8414,12 +8117,6 @@
         <w:gridCol w:w="5360"/>
       </w:tblGrid>
       <w:tr>
-        <w:tblPrEx>
-          <w:tblCellMar>
-            <w:top w:w="0" w:type="dxa"/>
-            <w:bottom w:w="0" w:type="dxa"/>
-          </w:tblCellMar>
-        </w:tblPrEx>
         <w:trPr>
           <w:tblHeader/>
         </w:trPr>
@@ -8506,12 +8203,6 @@
         </w:tc>
       </w:tr>
       <w:tr>
-        <w:tblPrEx>
-          <w:tblCellMar>
-            <w:top w:w="0" w:type="dxa"/>
-            <w:bottom w:w="0" w:type="dxa"/>
-          </w:tblCellMar>
-        </w:tblPrEx>
         <w:tc>
           <w:tcPr>
             <w:tcW w:w="1700" w:type="dxa"/>
@@ -8586,12 +8277,6 @@
         </w:tc>
       </w:tr>
       <w:tr>
-        <w:tblPrEx>
-          <w:tblCellMar>
-            <w:top w:w="0" w:type="dxa"/>
-            <w:bottom w:w="0" w:type="dxa"/>
-          </w:tblCellMar>
-        </w:tblPrEx>
         <w:tc>
           <w:tcPr>
             <w:tcW w:w="1700" w:type="dxa"/>
@@ -8666,12 +8351,6 @@
         </w:tc>
       </w:tr>
       <w:tr>
-        <w:tblPrEx>
-          <w:tblCellMar>
-            <w:top w:w="0" w:type="dxa"/>
-            <w:bottom w:w="0" w:type="dxa"/>
-          </w:tblCellMar>
-        </w:tblPrEx>
         <w:tc>
           <w:tcPr>
             <w:tcW w:w="1700" w:type="dxa"/>
@@ -8746,12 +8425,6 @@
         </w:tc>
       </w:tr>
       <w:tr>
-        <w:tblPrEx>
-          <w:tblCellMar>
-            <w:top w:w="0" w:type="dxa"/>
-            <w:bottom w:w="0" w:type="dxa"/>
-          </w:tblCellMar>
-        </w:tblPrEx>
         <w:tc>
           <w:tcPr>
             <w:tcW w:w="1700" w:type="dxa"/>
@@ -8845,10 +8518,10 @@
           <w:noProof/>
         </w:rPr>
         <w:drawing>
-          <wp:inline distT="0" distB="0" distL="0" distR="0" wp14:anchorId="579BBABD" wp14:editId="0C57B955">
+          <wp:inline distT="0" distB="0" distL="0" distR="0" wp14:anchorId="140B5358" wp14:editId="11891D41">
             <wp:extent cx="5334000" cy="3381375"/>
             <wp:effectExtent l="0" t="0" r="0" b="0"/>
-            <wp:docPr id="41856308" name="Imagen 41856308"/>
+            <wp:docPr id="1440665335" name="Imagen 1440665335"/>
             <wp:cNvGraphicFramePr>
               <a:graphicFrameLocks xmlns:a="http://schemas.openxmlformats.org/drawingml/2006/main" noChangeAspect="1"/>
             </wp:cNvGraphicFramePr>
@@ -8998,10 +8671,10 @@
           <w:noProof/>
         </w:rPr>
         <w:drawing>
-          <wp:inline distT="0" distB="0" distL="0" distR="0" wp14:anchorId="1C6DAF19" wp14:editId="36E314EB">
+          <wp:inline distT="0" distB="0" distL="0" distR="0" wp14:anchorId="543408A0" wp14:editId="6B3BBCF0">
             <wp:extent cx="6096000" cy="1676400"/>
             <wp:effectExtent l="0" t="0" r="0" b="0"/>
-            <wp:docPr id="1495209749" name="Imagen 1495209749"/>
+            <wp:docPr id="1414651780" name="Imagen 1414651780"/>
             <wp:cNvGraphicFramePr>
               <a:graphicFrameLocks xmlns:a="http://schemas.openxmlformats.org/drawingml/2006/main" noChangeAspect="1"/>
             </wp:cNvGraphicFramePr>
@@ -9090,10 +8763,10 @@
           <w:noProof/>
         </w:rPr>
         <w:drawing>
-          <wp:inline distT="0" distB="0" distL="0" distR="0" wp14:anchorId="40A6561C" wp14:editId="484248BD">
+          <wp:inline distT="0" distB="0" distL="0" distR="0" wp14:anchorId="6DCC22B8" wp14:editId="4B5CDD76">
             <wp:extent cx="4762500" cy="2447925"/>
             <wp:effectExtent l="0" t="0" r="0" b="0"/>
-            <wp:docPr id="1332648685" name="Imagen 1332648685"/>
+            <wp:docPr id="1963707189" name="Imagen 1963707189"/>
             <wp:cNvGraphicFramePr>
               <a:graphicFrameLocks xmlns:a="http://schemas.openxmlformats.org/drawingml/2006/main" noChangeAspect="1"/>
             </wp:cNvGraphicFramePr>
@@ -9220,10 +8893,10 @@
           <w:noProof/>
         </w:rPr>
         <w:drawing>
-          <wp:inline distT="0" distB="0" distL="0" distR="0" wp14:anchorId="31ED48F6" wp14:editId="7714D816">
+          <wp:inline distT="0" distB="0" distL="0" distR="0" wp14:anchorId="44A8D202" wp14:editId="1B8D5DE9">
             <wp:extent cx="6096000" cy="3048000"/>
             <wp:effectExtent l="0" t="0" r="0" b="0"/>
-            <wp:docPr id="894432202" name="Imagen 894432202"/>
+            <wp:docPr id="1878665285" name="Imagen 1878665285"/>
             <wp:cNvGraphicFramePr>
               <a:graphicFrameLocks xmlns:a="http://schemas.openxmlformats.org/drawingml/2006/main" noChangeAspect="1"/>
             </wp:cNvGraphicFramePr>
@@ -9365,10 +9038,10 @@
         </w:rPr>
         <w:lastRenderedPageBreak/>
         <w:drawing>
-          <wp:inline distT="0" distB="0" distL="0" distR="0" wp14:anchorId="75B2B235" wp14:editId="636BA2F2">
+          <wp:inline distT="0" distB="0" distL="0" distR="0" wp14:anchorId="19587C8D" wp14:editId="72AEFCF2">
             <wp:extent cx="6096000" cy="3848100"/>
             <wp:effectExtent l="0" t="0" r="0" b="0"/>
-            <wp:docPr id="975717446" name="Imagen 975717446"/>
+            <wp:docPr id="249685786" name="Imagen 249685786"/>
             <wp:cNvGraphicFramePr>
               <a:graphicFrameLocks xmlns:a="http://schemas.openxmlformats.org/drawingml/2006/main" noChangeAspect="1"/>
             </wp:cNvGraphicFramePr>
@@ -9537,12 +9210,6 @@
         <w:gridCol w:w="4160"/>
       </w:tblGrid>
       <w:tr>
-        <w:tblPrEx>
-          <w:tblCellMar>
-            <w:top w:w="0" w:type="dxa"/>
-            <w:bottom w:w="0" w:type="dxa"/>
-          </w:tblCellMar>
-        </w:tblPrEx>
         <w:trPr>
           <w:tblHeader/>
         </w:trPr>
@@ -9629,12 +9296,6 @@
         </w:tc>
       </w:tr>
       <w:tr>
-        <w:tblPrEx>
-          <w:tblCellMar>
-            <w:top w:w="0" w:type="dxa"/>
-            <w:bottom w:w="0" w:type="dxa"/>
-          </w:tblCellMar>
-        </w:tblPrEx>
         <w:tc>
           <w:tcPr>
             <w:tcW w:w="2100" w:type="dxa"/>
@@ -9709,12 +9370,6 @@
         </w:tc>
       </w:tr>
       <w:tr>
-        <w:tblPrEx>
-          <w:tblCellMar>
-            <w:top w:w="0" w:type="dxa"/>
-            <w:bottom w:w="0" w:type="dxa"/>
-          </w:tblCellMar>
-        </w:tblPrEx>
         <w:tc>
           <w:tcPr>
             <w:tcW w:w="2100" w:type="dxa"/>
@@ -9789,12 +9444,6 @@
         </w:tc>
       </w:tr>
       <w:tr>
-        <w:tblPrEx>
-          <w:tblCellMar>
-            <w:top w:w="0" w:type="dxa"/>
-            <w:bottom w:w="0" w:type="dxa"/>
-          </w:tblCellMar>
-        </w:tblPrEx>
         <w:tc>
           <w:tcPr>
             <w:tcW w:w="2100" w:type="dxa"/>
@@ -9869,12 +9518,6 @@
         </w:tc>
       </w:tr>
       <w:tr>
-        <w:tblPrEx>
-          <w:tblCellMar>
-            <w:top w:w="0" w:type="dxa"/>
-            <w:bottom w:w="0" w:type="dxa"/>
-          </w:tblCellMar>
-        </w:tblPrEx>
         <w:tc>
           <w:tcPr>
             <w:tcW w:w="2100" w:type="dxa"/>
@@ -9949,12 +9592,6 @@
         </w:tc>
       </w:tr>
       <w:tr>
-        <w:tblPrEx>
-          <w:tblCellMar>
-            <w:top w:w="0" w:type="dxa"/>
-            <w:bottom w:w="0" w:type="dxa"/>
-          </w:tblCellMar>
-        </w:tblPrEx>
         <w:tc>
           <w:tcPr>
             <w:tcW w:w="2100" w:type="dxa"/>
@@ -10030,12 +9667,6 @@
         </w:tc>
       </w:tr>
       <w:tr>
-        <w:tblPrEx>
-          <w:tblCellMar>
-            <w:top w:w="0" w:type="dxa"/>
-            <w:bottom w:w="0" w:type="dxa"/>
-          </w:tblCellMar>
-        </w:tblPrEx>
         <w:tc>
           <w:tcPr>
             <w:tcW w:w="2100" w:type="dxa"/>
@@ -10250,10 +9881,10 @@
           <w:noProof/>
         </w:rPr>
         <w:drawing>
-          <wp:inline distT="0" distB="0" distL="0" distR="0" wp14:anchorId="33571C52" wp14:editId="2FE639AD">
+          <wp:inline distT="0" distB="0" distL="0" distR="0" wp14:anchorId="3E2AB3F2" wp14:editId="07461147">
             <wp:extent cx="6096000" cy="3000375"/>
             <wp:effectExtent l="0" t="0" r="0" b="0"/>
-            <wp:docPr id="939594014" name="Imagen 939594014"/>
+            <wp:docPr id="1877701181" name="Imagen 1877701181"/>
             <wp:cNvGraphicFramePr>
               <a:graphicFrameLocks xmlns:a="http://schemas.openxmlformats.org/drawingml/2006/main" noChangeAspect="1"/>
             </wp:cNvGraphicFramePr>
@@ -10400,10 +10031,10 @@
           <w:noProof/>
         </w:rPr>
         <w:drawing>
-          <wp:inline distT="0" distB="0" distL="0" distR="0" wp14:anchorId="2E3F6B0E" wp14:editId="51FABD52">
+          <wp:inline distT="0" distB="0" distL="0" distR="0" wp14:anchorId="26117369" wp14:editId="068559D7">
             <wp:extent cx="6096000" cy="2857500"/>
             <wp:effectExtent l="0" t="0" r="0" b="0"/>
-            <wp:docPr id="2008301415" name="Imagen 2008301415"/>
+            <wp:docPr id="922454826" name="Imagen 922454826"/>
             <wp:cNvGraphicFramePr>
               <a:graphicFrameLocks xmlns:a="http://schemas.openxmlformats.org/drawingml/2006/main" noChangeAspect="1"/>
             </wp:cNvGraphicFramePr>
@@ -10532,10 +10163,10 @@
           <w:noProof/>
         </w:rPr>
         <w:drawing>
-          <wp:inline distT="0" distB="0" distL="0" distR="0" wp14:anchorId="1B3DC656" wp14:editId="2BEE9906">
+          <wp:inline distT="0" distB="0" distL="0" distR="0" wp14:anchorId="44D446A7" wp14:editId="1EA73B54">
             <wp:extent cx="6096000" cy="2857500"/>
             <wp:effectExtent l="0" t="0" r="0" b="0"/>
-            <wp:docPr id="2118523498" name="Imagen 2118523498"/>
+            <wp:docPr id="1156767938" name="Imagen 1156767938"/>
             <wp:cNvGraphicFramePr>
               <a:graphicFrameLocks xmlns:a="http://schemas.openxmlformats.org/drawingml/2006/main" noChangeAspect="1"/>
             </wp:cNvGraphicFramePr>
@@ -10661,10 +10292,10 @@
           <w:noProof/>
         </w:rPr>
         <w:drawing>
-          <wp:inline distT="0" distB="0" distL="0" distR="0" wp14:anchorId="7B715577" wp14:editId="45E8B1B6">
+          <wp:inline distT="0" distB="0" distL="0" distR="0" wp14:anchorId="109BC402" wp14:editId="42BB46EF">
             <wp:extent cx="4953000" cy="4067175"/>
             <wp:effectExtent l="0" t="0" r="0" b="0"/>
-            <wp:docPr id="517742431" name="Imagen 517742431"/>
+            <wp:docPr id="1459923674" name="Imagen 1459923674"/>
             <wp:cNvGraphicFramePr>
               <a:graphicFrameLocks xmlns:a="http://schemas.openxmlformats.org/drawingml/2006/main" noChangeAspect="1"/>
             </wp:cNvGraphicFramePr>
@@ -10772,10 +10403,10 @@
           <w:noProof/>
         </w:rPr>
         <w:drawing>
-          <wp:inline distT="0" distB="0" distL="0" distR="0" wp14:anchorId="0AF67A26" wp14:editId="2CB8ADEA">
+          <wp:inline distT="0" distB="0" distL="0" distR="0" wp14:anchorId="259D203C" wp14:editId="17EA565F">
             <wp:extent cx="6096000" cy="4124325"/>
             <wp:effectExtent l="0" t="0" r="0" b="0"/>
-            <wp:docPr id="674816654" name="Imagen 674816654"/>
+            <wp:docPr id="1317925268" name="Imagen 1317925268"/>
             <wp:cNvGraphicFramePr>
               <a:graphicFrameLocks xmlns:a="http://schemas.openxmlformats.org/drawingml/2006/main" noChangeAspect="1"/>
             </wp:cNvGraphicFramePr>
@@ -10883,10 +10514,10 @@
         </w:rPr>
         <w:lastRenderedPageBreak/>
         <w:drawing>
-          <wp:inline distT="0" distB="0" distL="0" distR="0" wp14:anchorId="43F4C6FE" wp14:editId="2082E813">
+          <wp:inline distT="0" distB="0" distL="0" distR="0" wp14:anchorId="1400334F" wp14:editId="66BD2B66">
             <wp:extent cx="6096000" cy="4162425"/>
             <wp:effectExtent l="0" t="0" r="0" b="0"/>
-            <wp:docPr id="2101925285" name="Imagen 2101925285"/>
+            <wp:docPr id="1036222764" name="Imagen 1036222764"/>
             <wp:cNvGraphicFramePr>
               <a:graphicFrameLocks xmlns:a="http://schemas.openxmlformats.org/drawingml/2006/main" noChangeAspect="1"/>
             </wp:cNvGraphicFramePr>
@@ -10971,7 +10602,7 @@
         <w:jc w:val="both"/>
       </w:pPr>
       <w:r>
-        <w:t>La cuadrícula presenta el resultado de la búsqueda, y no el catálogo completo: una licorera con cientos de referencias no se recorre con el ratón mientras un cliente espera. Sin texto escrito muestra las referencias de mayor rotación, que son las que se venden sin buscarlas. Cada línea agregada permite corregir su cantidad o retirarse, porque equivocarse de cantidad es lo más frecuente que ocurre en un mostrador.</w:t>
+        <w:t>La cuadrícula presenta el resultado de la búsqueda, y no el catálogo completo: una licorera con cientos de referencias no se recorre con el ratón mientras un cliente espera. Sin texto escrito muestra las referencias de mayor rotación, que son las que se venden sin buscarlas. Elegir un producto es agregarlo: el cursor regresa al buscador con el texto ya borrado, de modo que la referencia siguiente se escribe sin tocar el ratón, y volver a elegir el mismo producto suma una unidad en lugar de abrir un segundo renglón.</w:t>
       </w:r>
     </w:p>
     <w:p>
@@ -10980,7 +10611,7 @@
         <w:jc w:val="both"/>
       </w:pPr>
       <w:r>
-        <w:t>El medio de pago se elige antes de cobrar. Cuando es efectivo, la pantalla pide el monto recibido y calcula el cambio, que es la operación que el sistema debe ahorrarle a quien atiende; en los otros dos medios ese campo no aparece, porque no hay cambio que devolver. El número consecutivo de la venta se muestra en la barra superior: es el dato por el que el cliente la nombra si vuelve a reclamar.</w:t>
+        <w:t>Cada línea permite corregir su cantidad o retirarse, porque equivocarse de cantidad es lo más frecuente que ocurre en un mostrador. La cantidad se escribe además de ajustarse con los botones: cien unidades de un mismo producto son cien pulsaciones en un botón y tres teclas en un campo. Ninguna línea admite más unidades de las que hay en existencia, y al llegar al tope la propia línea dice cuántas quedan; la comprobación definitiva la hace el servidor, porque otra caja puede haber vendido mientras tanto, pero avisar aquí evita armar una venta larga para descubrir al cobrar que de la tercera referencia no había suficiente.</w:t>
       </w:r>
     </w:p>
     <w:p>
@@ -10989,6 +10620,25 @@
         <w:jc w:val="both"/>
       </w:pPr>
       <w:r>
+        <w:t>La venta a medio armar no se pierde al salir de la pantalla. Quien atiende puede necesitar consultar el inventario con el cliente delante, o pulsar otra opción del menú sin querer, y al volver encuentra las mismas líneas; lo contrario obligaría a pedirle al cliente que repitiera su compra. Se conserva en el propio navegador y por cuenta de usuario, de modo que dos personas que se turnan la misma caja no heredan la una el carro de la otra, y se descarta al cobrar.</w:t>
+      </w:r>
+    </w:p>
+    <w:p>
+      <w:pPr>
+        <w:spacing w:after="110" w:line="262" w:lineRule="auto"/>
+        <w:jc w:val="both"/>
+      </w:pPr>
+      <w:r>
+        <w:lastRenderedPageBreak/>
+        <w:t>El medio de pago se elige antes de cobrar. Cuando es efectivo, la pantalla pide el monto recibido y calcula el cambio, que es la operación que el sistema debe ahorrarle a quien atiende; en los otros dos medios ese campo no aparece, porque no hay cambio que devolver. El cobro en efectivo no se habilita hasta que ese monto está escrito y alcanza el total, y para el pago exacto hay un botón que lo rellena: dejar el botón activo con el campo vacío haría inútil apagarlo cuando el dinero no alcanza, porque bastaría no escribir nada. El número consecutivo de la venta se muestra en la barra superior: es el dato por el que el cliente la nombra si vuelve a reclamar.</w:t>
+      </w:r>
+    </w:p>
+    <w:p>
+      <w:pPr>
+        <w:spacing w:after="110" w:line="262" w:lineRule="auto"/>
+        <w:jc w:val="both"/>
+      </w:pPr>
+      <w:r>
         <w:t>Al confirmar el cobro, el sistema descuenta las existencias consumiendo los lotes más antiguos, registra el costo real de lo despachado y genera el comprobante. Si lo pedido supera lo disponible, la venta se rechaza entera y no se registra nada: una existencia en negativo no significa nada, y en cuanto aparece una deja de poder confiarse en el resto del inventario.</w:t>
       </w:r>
     </w:p>
@@ -11001,12 +10651,11 @@
         <w:rPr>
           <w:noProof/>
         </w:rPr>
-        <w:lastRenderedPageBreak/>
         <w:drawing>
-          <wp:inline distT="0" distB="0" distL="0" distR="0" wp14:anchorId="590DE6A9" wp14:editId="0556BF5C">
-            <wp:extent cx="6096000" cy="3438525"/>
+          <wp:inline distT="0" distB="0" distL="0" distR="0" wp14:anchorId="0236CFC2" wp14:editId="0BCD07F1">
+            <wp:extent cx="6096000" cy="3476625"/>
             <wp:effectExtent l="0" t="0" r="0" b="0"/>
-            <wp:docPr id="1215740446" name="Imagen 1215740446"/>
+            <wp:docPr id="553530896" name="Imagen 553530896"/>
             <wp:cNvGraphicFramePr>
               <a:graphicFrameLocks xmlns:a="http://schemas.openxmlformats.org/drawingml/2006/main" noChangeAspect="1"/>
             </wp:cNvGraphicFramePr>
@@ -11029,7 +10678,7 @@
                   <pic:spPr bwMode="auto">
                     <a:xfrm>
                       <a:off x="0" y="0"/>
-                      <a:ext cx="6096000" cy="3438525"/>
+                      <a:ext cx="6096000" cy="3476625"/>
                     </a:xfrm>
                     <a:prstGeom prst="rect">
                       <a:avLst/>
@@ -11064,7 +10713,7 @@
         <w:jc w:val="both"/>
       </w:pPr>
       <w:r>
-        <w:t>El comprobante aparece sobre la misma pantalla al confirmar el cobro, y se puede imprimir o descargar. Su ancho es el de una impresora térmica, de modo que lo que se ve es lo que sale en papel. No es una factura electrónica —eso corresponde al módulo FAC—: es el documento con el que el negocio entrega la compra y con el que el cliente reclama.</w:t>
+        <w:t>El comprobante aparece sobre la misma pantalla al confirmar el cobro y se puede imprimir. Su ancho es el de una impresora térmica y al imprimir se envía solo él, sin el menú ni el resto de la pantalla, de modo que lo que se ve es lo que sale en papel. No es una factura electrónica —eso corresponde al módulo FAC—: es el documento con el que el negocio entrega la compra y con el que el cliente reclama. Junto a la impresión está la acción de empezar una venta nueva, que retira el comprobante y deja la caja lista; sin ella la pantalla se queda con el papel delante y parece que no hubiera por dónde seguir vendiendo. Retirarlo no lo pierde: la misma venta se vuelve a abrir desde el historial, que es de donde sale el papel cuando el cliente lo rechaza y lo pide un minuto después.</w:t>
       </w:r>
     </w:p>
     <w:p>
@@ -11077,10 +10726,10 @@
           <w:noProof/>
         </w:rPr>
         <w:drawing>
-          <wp:inline distT="0" distB="0" distL="0" distR="0" wp14:anchorId="6BF7D75A" wp14:editId="1E0D9AF9">
+          <wp:inline distT="0" distB="0" distL="0" distR="0" wp14:anchorId="53B66073" wp14:editId="169EF995">
             <wp:extent cx="4000500" cy="1362075"/>
             <wp:effectExtent l="0" t="0" r="0" b="0"/>
-            <wp:docPr id="1618201082" name="Imagen 1618201082"/>
+            <wp:docPr id="1663361862" name="Imagen 1663361862"/>
             <wp:cNvGraphicFramePr>
               <a:graphicFrameLocks xmlns:a="http://schemas.openxmlformats.org/drawingml/2006/main" noChangeAspect="1"/>
             </wp:cNvGraphicFramePr>
@@ -11129,6 +10778,7 @@
           <w:sz w:val="18"/>
           <w:szCs w:val="18"/>
         </w:rPr>
+        <w:lastRenderedPageBreak/>
         <w:t>Figura 17. Comprobante de venta. Fuente: del autor.</w:t>
       </w:r>
     </w:p>
@@ -11174,6 +10824,15 @@
         <w:jc w:val="both"/>
       </w:pPr>
       <w:r>
+        <w:t>Cada fila abre la venta y permite volver a imprimir su comprobante. Es el mismo documento que salió en la caja y no una copia rehecha aparte, porque dos papeles distintos para una misma venta son dos versiones que alguien tendrá que comparar algún día.</w:t>
+      </w:r>
+    </w:p>
+    <w:p>
+      <w:pPr>
+        <w:spacing w:after="110" w:line="262" w:lineRule="auto"/>
+        <w:jc w:val="both"/>
+      </w:pPr>
+      <w:r>
         <w:t>La acción de anular se ofrece únicamente sobre las ventas del día y únicamente a quien administra la licorera. Lo primero, porque una venta de días anteriores ya entró en un cierre de caja cuadrado y deshacerla descuadraría un día cerrado; lo segundo, porque quien cobra no debería poder deshacer su propio cobro. Se pide el motivo, y al confirmarla cada unidad vuelve al lote del que salió, con lo que el inventario y su valoración quedan como estaban antes de la venta.</w:t>
       </w:r>
     </w:p>
@@ -11186,12 +10845,11 @@
         <w:rPr>
           <w:noProof/>
         </w:rPr>
-        <w:lastRenderedPageBreak/>
         <w:drawing>
-          <wp:inline distT="0" distB="0" distL="0" distR="0" wp14:anchorId="0AFEFEED" wp14:editId="738693F9">
+          <wp:inline distT="0" distB="0" distL="0" distR="0" wp14:anchorId="6BD97D34" wp14:editId="11A516F3">
             <wp:extent cx="6096000" cy="5314950"/>
             <wp:effectExtent l="0" t="0" r="0" b="0"/>
-            <wp:docPr id="783671835" name="Imagen 783671835"/>
+            <wp:docPr id="950320343" name="Imagen 950320343"/>
             <wp:cNvGraphicFramePr>
               <a:graphicFrameLocks xmlns:a="http://schemas.openxmlformats.org/drawingml/2006/main" noChangeAspect="1"/>
             </wp:cNvGraphicFramePr>
@@ -11240,6 +10898,7 @@
           <w:sz w:val="18"/>
           <w:szCs w:val="18"/>
         </w:rPr>
+        <w:lastRenderedPageBreak/>
         <w:t>Figura 18. Ventas: historial y anulación. Fuente: del autor.</w:t>
       </w:r>
     </w:p>
@@ -11294,11 +10953,7 @@
         <w:jc w:val="both"/>
       </w:pPr>
       <w:r>
-        <w:t xml:space="preserve">Hay un cierre por sede y jornada, y no bloquea ninguna operación: es una fotografía de cómo quedó la caja, con la diferencia escrita y explicada. Un cierre que impidiera seguir vendiendo convertiría un descuadre de ocho mil pesos en un negocio parado. Tampoco existe apertura de caja ni saldo que venga del cierre anterior: cada cierre se calcula con todas las ventas de su jornada, desde la primera. Si alguien </w:t>
-      </w:r>
-      <w:r>
-        <w:lastRenderedPageBreak/>
-        <w:t>cierra antes de tiempo, el cierre se rehace mientras la jornada siga abierta —se actualiza el mismo registro, no se crea otro— y los totales se recalculan enteros.</w:t>
+        <w:t>Hay un cierre por sede y jornada, y no bloquea ninguna operación: es una fotografía de cómo quedó la caja, con la diferencia escrita y explicada. Un cierre que impidiera seguir vendiendo convertiría un descuadre de ocho mil pesos en un negocio parado. Tampoco existe apertura de caja ni saldo que venga del cierre anterior: cada cierre se calcula con todas las ventas de su jornada, desde la primera. Si alguien cierra antes de tiempo, el cierre se rehace mientras la jornada siga abierta —se actualiza el mismo registro, no se crea otro— y los totales se recalculan enteros.</w:t>
       </w:r>
     </w:p>
     <w:p>
@@ -11329,10 +10984,10 @@
           <w:noProof/>
         </w:rPr>
         <w:drawing>
-          <wp:inline distT="0" distB="0" distL="0" distR="0" wp14:anchorId="0CE7BB69" wp14:editId="310D59AD">
+          <wp:inline distT="0" distB="0" distL="0" distR="0" wp14:anchorId="056E20DA" wp14:editId="6CEF03FD">
             <wp:extent cx="6096000" cy="3343275"/>
             <wp:effectExtent l="0" t="0" r="0" b="0"/>
-            <wp:docPr id="929779519" name="Imagen 929779519"/>
+            <wp:docPr id="1967523915" name="Imagen 1967523915"/>
             <wp:cNvGraphicFramePr>
               <a:graphicFrameLocks xmlns:a="http://schemas.openxmlformats.org/drawingml/2006/main" noChangeAspect="1"/>
             </wp:cNvGraphicFramePr>
@@ -11381,6 +11036,7 @@
           <w:sz w:val="18"/>
           <w:szCs w:val="18"/>
         </w:rPr>
+        <w:lastRenderedPageBreak/>
         <w:t>Figura 19. Cierre de caja. Fuente: del autor.</w:t>
       </w:r>
     </w:p>
@@ -11420,12 +11076,11 @@
         <w:rPr>
           <w:noProof/>
         </w:rPr>
-        <w:lastRenderedPageBreak/>
         <w:drawing>
-          <wp:inline distT="0" distB="0" distL="0" distR="0" wp14:anchorId="683613F8" wp14:editId="7DA8EDED">
+          <wp:inline distT="0" distB="0" distL="0" distR="0" wp14:anchorId="2878F4FA" wp14:editId="435ADC3C">
             <wp:extent cx="6096000" cy="2857500"/>
             <wp:effectExtent l="0" t="0" r="0" b="0"/>
-            <wp:docPr id="1103570974" name="Imagen 1103570974"/>
+            <wp:docPr id="388138197" name="Imagen 388138197"/>
             <wp:cNvGraphicFramePr>
               <a:graphicFrameLocks xmlns:a="http://schemas.openxmlformats.org/drawingml/2006/main" noChangeAspect="1"/>
             </wp:cNvGraphicFramePr>
@@ -11542,10 +11197,10 @@
         </w:rPr>
         <w:lastRenderedPageBreak/>
         <w:drawing>
-          <wp:inline distT="0" distB="0" distL="0" distR="0" wp14:anchorId="54BC9F52" wp14:editId="6339014D">
+          <wp:inline distT="0" distB="0" distL="0" distR="0" wp14:anchorId="0FBFB33B" wp14:editId="484B9235">
             <wp:extent cx="6096000" cy="2857500"/>
             <wp:effectExtent l="0" t="0" r="0" b="0"/>
-            <wp:docPr id="1846432289" name="Imagen 1846432289"/>
+            <wp:docPr id="344638626" name="Imagen 344638626"/>
             <wp:cNvGraphicFramePr>
               <a:graphicFrameLocks xmlns:a="http://schemas.openxmlformats.org/drawingml/2006/main" noChangeAspect="1"/>
             </wp:cNvGraphicFramePr>
@@ -11653,10 +11308,10 @@
         </w:rPr>
         <w:lastRenderedPageBreak/>
         <w:drawing>
-          <wp:inline distT="0" distB="0" distL="0" distR="0" wp14:anchorId="1CF3D21F" wp14:editId="50D0BF5C">
+          <wp:inline distT="0" distB="0" distL="0" distR="0" wp14:anchorId="1634E8CD" wp14:editId="06D3C962">
             <wp:extent cx="6096000" cy="3562350"/>
             <wp:effectExtent l="0" t="0" r="0" b="0"/>
-            <wp:docPr id="889210243" name="Imagen 889210243"/>
+            <wp:docPr id="1895840258" name="Imagen 1895840258"/>
             <wp:cNvGraphicFramePr>
               <a:graphicFrameLocks xmlns:a="http://schemas.openxmlformats.org/drawingml/2006/main" noChangeAspect="1"/>
             </wp:cNvGraphicFramePr>
@@ -11764,10 +11419,10 @@
         </w:rPr>
         <w:lastRenderedPageBreak/>
         <w:drawing>
-          <wp:inline distT="0" distB="0" distL="0" distR="0" wp14:anchorId="734A0CED" wp14:editId="7ADEDE80">
+          <wp:inline distT="0" distB="0" distL="0" distR="0" wp14:anchorId="05E15DF7" wp14:editId="31DE8A66">
             <wp:extent cx="6096000" cy="3067050"/>
             <wp:effectExtent l="0" t="0" r="0" b="0"/>
-            <wp:docPr id="774411253" name="Imagen 774411253"/>
+            <wp:docPr id="1804840021" name="Imagen 1804840021"/>
             <wp:cNvGraphicFramePr>
               <a:graphicFrameLocks xmlns:a="http://schemas.openxmlformats.org/drawingml/2006/main" noChangeAspect="1"/>
             </wp:cNvGraphicFramePr>
@@ -11884,10 +11539,10 @@
         </w:rPr>
         <w:lastRenderedPageBreak/>
         <w:drawing>
-          <wp:inline distT="0" distB="0" distL="0" distR="0" wp14:anchorId="530ABED3" wp14:editId="5E4774E6">
+          <wp:inline distT="0" distB="0" distL="0" distR="0" wp14:anchorId="41703156" wp14:editId="0821989F">
             <wp:extent cx="6096000" cy="4114800"/>
             <wp:effectExtent l="0" t="0" r="0" b="0"/>
-            <wp:docPr id="594606175" name="Imagen 594606175"/>
+            <wp:docPr id="1539645140" name="Imagen 1539645140"/>
             <wp:cNvGraphicFramePr>
               <a:graphicFrameLocks xmlns:a="http://schemas.openxmlformats.org/drawingml/2006/main" noChangeAspect="1"/>
             </wp:cNvGraphicFramePr>
@@ -11978,10 +11633,10 @@
           <w:noProof/>
         </w:rPr>
         <w:drawing>
-          <wp:inline distT="0" distB="0" distL="0" distR="0" wp14:anchorId="765C89FF" wp14:editId="5726F1CC">
+          <wp:inline distT="0" distB="0" distL="0" distR="0" wp14:anchorId="0BE8C037" wp14:editId="7B22B726">
             <wp:extent cx="6096000" cy="2733675"/>
             <wp:effectExtent l="0" t="0" r="0" b="0"/>
-            <wp:docPr id="539503658" name="Imagen 539503658"/>
+            <wp:docPr id="266935628" name="Imagen 266935628"/>
             <wp:cNvGraphicFramePr>
               <a:graphicFrameLocks xmlns:a="http://schemas.openxmlformats.org/drawingml/2006/main" noChangeAspect="1"/>
             </wp:cNvGraphicFramePr>
@@ -12075,12 +11730,6 @@
         <w:gridCol w:w="4460"/>
       </w:tblGrid>
       <w:tr>
-        <w:tblPrEx>
-          <w:tblCellMar>
-            <w:top w:w="0" w:type="dxa"/>
-            <w:bottom w:w="0" w:type="dxa"/>
-          </w:tblCellMar>
-        </w:tblPrEx>
         <w:trPr>
           <w:tblHeader/>
         </w:trPr>
@@ -12167,12 +11816,6 @@
         </w:tc>
       </w:tr>
       <w:tr>
-        <w:tblPrEx>
-          <w:tblCellMar>
-            <w:top w:w="0" w:type="dxa"/>
-            <w:bottom w:w="0" w:type="dxa"/>
-          </w:tblCellMar>
-        </w:tblPrEx>
         <w:tc>
           <w:tcPr>
             <w:tcW w:w="1700" w:type="dxa"/>
@@ -12247,12 +11890,6 @@
         </w:tc>
       </w:tr>
       <w:tr>
-        <w:tblPrEx>
-          <w:tblCellMar>
-            <w:top w:w="0" w:type="dxa"/>
-            <w:bottom w:w="0" w:type="dxa"/>
-          </w:tblCellMar>
-        </w:tblPrEx>
         <w:tc>
           <w:tcPr>
             <w:tcW w:w="1700" w:type="dxa"/>
@@ -12327,12 +11964,6 @@
         </w:tc>
       </w:tr>
       <w:tr>
-        <w:tblPrEx>
-          <w:tblCellMar>
-            <w:top w:w="0" w:type="dxa"/>
-            <w:bottom w:w="0" w:type="dxa"/>
-          </w:tblCellMar>
-        </w:tblPrEx>
         <w:tc>
           <w:tcPr>
             <w:tcW w:w="1700" w:type="dxa"/>
@@ -12407,12 +12038,6 @@
         </w:tc>
       </w:tr>
       <w:tr>
-        <w:tblPrEx>
-          <w:tblCellMar>
-            <w:top w:w="0" w:type="dxa"/>
-            <w:bottom w:w="0" w:type="dxa"/>
-          </w:tblCellMar>
-        </w:tblPrEx>
         <w:tc>
           <w:tcPr>
             <w:tcW w:w="1700" w:type="dxa"/>
@@ -12487,12 +12112,6 @@
         </w:tc>
       </w:tr>
       <w:tr>
-        <w:tblPrEx>
-          <w:tblCellMar>
-            <w:top w:w="0" w:type="dxa"/>
-            <w:bottom w:w="0" w:type="dxa"/>
-          </w:tblCellMar>
-        </w:tblPrEx>
         <w:tc>
           <w:tcPr>
             <w:tcW w:w="1700" w:type="dxa"/>
@@ -12567,12 +12186,6 @@
         </w:tc>
       </w:tr>
       <w:tr>
-        <w:tblPrEx>
-          <w:tblCellMar>
-            <w:top w:w="0" w:type="dxa"/>
-            <w:bottom w:w="0" w:type="dxa"/>
-          </w:tblCellMar>
-        </w:tblPrEx>
         <w:tc>
           <w:tcPr>
             <w:tcW w:w="1700" w:type="dxa"/>
@@ -12854,10 +12467,10 @@
           <w:noProof/>
         </w:rPr>
         <w:drawing>
-          <wp:inline distT="0" distB="0" distL="0" distR="0" wp14:anchorId="0C170A2F" wp14:editId="6AEE7634">
+          <wp:inline distT="0" distB="0" distL="0" distR="0" wp14:anchorId="7DD91D58" wp14:editId="0D47B295">
             <wp:extent cx="6096000" cy="3295650"/>
             <wp:effectExtent l="0" t="0" r="0" b="0"/>
-            <wp:docPr id="1481642797" name="Imagen 1481642797"/>
+            <wp:docPr id="1505843068" name="Imagen 1505843068"/>
             <wp:cNvGraphicFramePr>
               <a:graphicFrameLocks xmlns:a="http://schemas.openxmlformats.org/drawingml/2006/main" noChangeAspect="1"/>
             </wp:cNvGraphicFramePr>
@@ -12977,10 +12590,10 @@
           <w:noProof/>
         </w:rPr>
         <w:drawing>
-          <wp:inline distT="0" distB="0" distL="0" distR="0" wp14:anchorId="59398D85" wp14:editId="0FF6FF10">
+          <wp:inline distT="0" distB="0" distL="0" distR="0" wp14:anchorId="129AAA1D" wp14:editId="527CE5EA">
             <wp:extent cx="6096000" cy="3067050"/>
             <wp:effectExtent l="0" t="0" r="0" b="0"/>
-            <wp:docPr id="154515524" name="Imagen 154515524"/>
+            <wp:docPr id="719771840" name="Imagen 719771840"/>
             <wp:cNvGraphicFramePr>
               <a:graphicFrameLocks xmlns:a="http://schemas.openxmlformats.org/drawingml/2006/main" noChangeAspect="1"/>
             </wp:cNvGraphicFramePr>
@@ -13113,12 +12726,6 @@
         <w:gridCol w:w="7260"/>
       </w:tblGrid>
       <w:tr>
-        <w:tblPrEx>
-          <w:tblCellMar>
-            <w:top w:w="0" w:type="dxa"/>
-            <w:bottom w:w="0" w:type="dxa"/>
-          </w:tblCellMar>
-        </w:tblPrEx>
         <w:trPr>
           <w:tblHeader/>
         </w:trPr>
@@ -13178,12 +12785,6 @@
         </w:tc>
       </w:tr>
       <w:tr>
-        <w:tblPrEx>
-          <w:tblCellMar>
-            <w:top w:w="0" w:type="dxa"/>
-            <w:bottom w:w="0" w:type="dxa"/>
-          </w:tblCellMar>
-        </w:tblPrEx>
         <w:tc>
           <w:tcPr>
             <w:tcW w:w="2100" w:type="dxa"/>
@@ -13234,12 +12835,6 @@
         </w:tc>
       </w:tr>
       <w:tr>
-        <w:tblPrEx>
-          <w:tblCellMar>
-            <w:top w:w="0" w:type="dxa"/>
-            <w:bottom w:w="0" w:type="dxa"/>
-          </w:tblCellMar>
-        </w:tblPrEx>
         <w:tc>
           <w:tcPr>
             <w:tcW w:w="2100" w:type="dxa"/>
@@ -13290,12 +12885,6 @@
         </w:tc>
       </w:tr>
       <w:tr>
-        <w:tblPrEx>
-          <w:tblCellMar>
-            <w:top w:w="0" w:type="dxa"/>
-            <w:bottom w:w="0" w:type="dxa"/>
-          </w:tblCellMar>
-        </w:tblPrEx>
         <w:tc>
           <w:tcPr>
             <w:tcW w:w="2100" w:type="dxa"/>
@@ -13346,12 +12935,6 @@
         </w:tc>
       </w:tr>
       <w:tr>
-        <w:tblPrEx>
-          <w:tblCellMar>
-            <w:top w:w="0" w:type="dxa"/>
-            <w:bottom w:w="0" w:type="dxa"/>
-          </w:tblCellMar>
-        </w:tblPrEx>
         <w:tc>
           <w:tcPr>
             <w:tcW w:w="2100" w:type="dxa"/>
@@ -13402,12 +12985,6 @@
         </w:tc>
       </w:tr>
       <w:tr>
-        <w:tblPrEx>
-          <w:tblCellMar>
-            <w:top w:w="0" w:type="dxa"/>
-            <w:bottom w:w="0" w:type="dxa"/>
-          </w:tblCellMar>
-        </w:tblPrEx>
         <w:tc>
           <w:tcPr>
             <w:tcW w:w="2100" w:type="dxa"/>
@@ -13458,12 +13035,6 @@
         </w:tc>
       </w:tr>
       <w:tr>
-        <w:tblPrEx>
-          <w:tblCellMar>
-            <w:top w:w="0" w:type="dxa"/>
-            <w:bottom w:w="0" w:type="dxa"/>
-          </w:tblCellMar>
-        </w:tblPrEx>
         <w:tc>
           <w:tcPr>
             <w:tcW w:w="2100" w:type="dxa"/>
@@ -13514,12 +13085,6 @@
         </w:tc>
       </w:tr>
       <w:tr>
-        <w:tblPrEx>
-          <w:tblCellMar>
-            <w:top w:w="0" w:type="dxa"/>
-            <w:bottom w:w="0" w:type="dxa"/>
-          </w:tblCellMar>
-        </w:tblPrEx>
         <w:tc>
           <w:tcPr>
             <w:tcW w:w="2100" w:type="dxa"/>
@@ -13570,12 +13135,6 @@
         </w:tc>
       </w:tr>
       <w:tr>
-        <w:tblPrEx>
-          <w:tblCellMar>
-            <w:top w:w="0" w:type="dxa"/>
-            <w:bottom w:w="0" w:type="dxa"/>
-          </w:tblCellMar>
-        </w:tblPrEx>
         <w:tc>
           <w:tcPr>
             <w:tcW w:w="2100" w:type="dxa"/>
@@ -13626,12 +13185,6 @@
         </w:tc>
       </w:tr>
       <w:tr>
-        <w:tblPrEx>
-          <w:tblCellMar>
-            <w:top w:w="0" w:type="dxa"/>
-            <w:bottom w:w="0" w:type="dxa"/>
-          </w:tblCellMar>
-        </w:tblPrEx>
         <w:tc>
           <w:tcPr>
             <w:tcW w:w="2100" w:type="dxa"/>
@@ -13682,12 +13235,6 @@
         </w:tc>
       </w:tr>
       <w:tr>
-        <w:tblPrEx>
-          <w:tblCellMar>
-            <w:top w:w="0" w:type="dxa"/>
-            <w:bottom w:w="0" w:type="dxa"/>
-          </w:tblCellMar>
-        </w:tblPrEx>
         <w:tc>
           <w:tcPr>
             <w:tcW w:w="2100" w:type="dxa"/>
@@ -13738,12 +13285,6 @@
         </w:tc>
       </w:tr>
       <w:tr>
-        <w:tblPrEx>
-          <w:tblCellMar>
-            <w:top w:w="0" w:type="dxa"/>
-            <w:bottom w:w="0" w:type="dxa"/>
-          </w:tblCellMar>
-        </w:tblPrEx>
         <w:tc>
           <w:tcPr>
             <w:tcW w:w="2100" w:type="dxa"/>
@@ -13794,12 +13335,6 @@
         </w:tc>
       </w:tr>
       <w:tr>
-        <w:tblPrEx>
-          <w:tblCellMar>
-            <w:top w:w="0" w:type="dxa"/>
-            <w:bottom w:w="0" w:type="dxa"/>
-          </w:tblCellMar>
-        </w:tblPrEx>
         <w:tc>
           <w:tcPr>
             <w:tcW w:w="2100" w:type="dxa"/>
@@ -13850,12 +13385,6 @@
         </w:tc>
       </w:tr>
       <w:tr>
-        <w:tblPrEx>
-          <w:tblCellMar>
-            <w:top w:w="0" w:type="dxa"/>
-            <w:bottom w:w="0" w:type="dxa"/>
-          </w:tblCellMar>
-        </w:tblPrEx>
         <w:tc>
           <w:tcPr>
             <w:tcW w:w="2100" w:type="dxa"/>
@@ -14006,7 +13535,13 @@
         <w:spacing w:after="60" w:line="258" w:lineRule="auto"/>
       </w:pPr>
       <w:r>
-        <w:t>World Wide Web Consortium. Web Content Accessibility Guidelines (WCAG) 2.1. W3C, 2018.</w:t>
+        <w:rPr>
+          <w:lang w:val="en-US"/>
+        </w:rPr>
+        <w:t xml:space="preserve">World Wide Web Consortium. Web Content Accessibility Guidelines (WCAG) 2.1. </w:t>
+      </w:r>
+      <w:r>
+        <w:t>W3C, 2018.</w:t>
       </w:r>
     </w:p>
     <w:p>
@@ -14146,10 +13681,10 @@
 <file path=word/numbering.xml><?xml version="1.0" encoding="utf-8"?>
 <w:numbering xmlns:wpc="http://schemas.microsoft.com/office/word/2010/wordprocessingCanvas" xmlns:cx="http://schemas.microsoft.com/office/drawing/2014/chartex" xmlns:cx1="http://schemas.microsoft.com/office/drawing/2015/9/8/chartex" xmlns:cx2="http://schemas.microsoft.com/office/drawing/2015/10/21/chartex" xmlns:cx3="http://schemas.microsoft.com/office/drawing/2016/5/9/chartex" xmlns:cx4="http://schemas.microsoft.com/office/drawing/2016/5/10/chartex" xmlns:cx5="http://schemas.microsoft.com/office/drawing/2016/5/11/chartex" xmlns:cx6="http://schemas.microsoft.com/office/drawing/2016/5/12/chartex" xmlns:cx7="http://schemas.microsoft.com/office/drawing/2016/5/13/chartex" xmlns:cx8="http://schemas.microsoft.com/office/drawing/2016/5/14/chartex" xmlns:mc="http://schemas.openxmlformats.org/markup-compatibility/2006" xmlns:aink="http://schemas.microsoft.com/office/drawing/2016/ink" xmlns:am3d="http://schemas.microsoft.com/office/drawing/2017/model3d" xmlns:o="urn:schemas-microsoft-com:office:office" xmlns:oel="http://schemas.microsoft.com/office/2019/extlst" xmlns:r="http://schemas.openxmlformats.org/officeDocument/2006/relationships" xmlns:m="http://schemas.openxmlformats.org/officeDocument/2006/math" xmlns:v="urn:schemas-microsoft-com:vml" xmlns:wp14="http://schemas.microsoft.com/office/word/2010/wordprocessingDrawing" xmlns:wp="http://schemas.openxmlformats.org/drawingml/2006/wordprocessingDrawing" xmlns:w10="urn:schemas-microsoft-com:office:word" xmlns:w="http://schemas.openxmlformats.org/wordprocessingml/2006/main" xmlns:w14="http://schemas.microsoft.com/office/word/2010/wordml" xmlns:w15="http://schemas.microsoft.com/office/word/2012/wordml" xmlns:w16cex="http://schemas.microsoft.com/office/word/2018/wordml/cex" xmlns:w16cid="http://schemas.microsoft.com/office/word/2016/wordml/cid" xmlns:w16="http://schemas.microsoft.com/office/word/2018/wordml" xmlns:w16du="http://schemas.microsoft.com/office/word/2023/wordml/word16du" xmlns:w16sdtdh="http://schemas.microsoft.com/office/word/2020/wordml/sdtdatahash" xmlns:w16sdtfl="http://schemas.microsoft.com/office/word/2024/wordml/sdtformatlock" xmlns:w16se="http://schemas.microsoft.com/office/word/2015/wordml/symex" xmlns:wpg="http://schemas.microsoft.com/office/word/2010/wordprocessingGroup" xmlns:wpi="http://schemas.microsoft.com/office/word/2010/wordprocessingInk" xmlns:wne="http://schemas.microsoft.com/office/word/2006/wordml" xmlns:wps="http://schemas.microsoft.com/office/word/2010/wordprocessingShape" mc:Ignorable="w14 w15 w16se w16cid w16 w16cex w16sdtdh w16sdtfl w16du wp14">
   <w:abstractNum w:abstractNumId="0" w15:restartNumberingAfterBreak="0">
-    <w:nsid w:val="142F1481"/>
+    <w:nsid w:val="43944D3B"/>
     <w:multiLevelType w:val="hybridMultilevel"/>
-    <w:tmpl w:val="2BB402CC"/>
-    <w:lvl w:ilvl="0" w:tplc="B1B4F000">
+    <w:tmpl w:val="C8B4500C"/>
+    <w:lvl w:ilvl="0" w:tplc="362EDD4A">
       <w:start w:val="1"/>
       <w:numFmt w:val="bullet"/>
       <w:lvlText w:val="●"/>
@@ -14158,7 +13693,7 @@
         <w:ind w:left="720" w:hanging="360"/>
       </w:pPr>
     </w:lvl>
-    <w:lvl w:ilvl="1" w:tplc="F13EA234">
+    <w:lvl w:ilvl="1" w:tplc="15D84DB2">
       <w:start w:val="1"/>
       <w:numFmt w:val="bullet"/>
       <w:lvlText w:val="○"/>
@@ -14167,7 +13702,7 @@
         <w:ind w:left="1440" w:hanging="360"/>
       </w:pPr>
     </w:lvl>
-    <w:lvl w:ilvl="2" w:tplc="2B18C0D8">
+    <w:lvl w:ilvl="2" w:tplc="F3383E66">
       <w:start w:val="1"/>
       <w:numFmt w:val="bullet"/>
       <w:lvlText w:val="■"/>
@@ -14176,7 +13711,7 @@
         <w:ind w:left="2160" w:hanging="360"/>
       </w:pPr>
     </w:lvl>
-    <w:lvl w:ilvl="3" w:tplc="96F0124A">
+    <w:lvl w:ilvl="3" w:tplc="3B8A6638">
       <w:start w:val="1"/>
       <w:numFmt w:val="bullet"/>
       <w:lvlText w:val="●"/>
@@ -14185,7 +13720,7 @@
         <w:ind w:left="2880" w:hanging="360"/>
       </w:pPr>
     </w:lvl>
-    <w:lvl w:ilvl="4" w:tplc="FAB2211A">
+    <w:lvl w:ilvl="4" w:tplc="E4760350">
       <w:start w:val="1"/>
       <w:numFmt w:val="bullet"/>
       <w:lvlText w:val="○"/>
@@ -14194,7 +13729,7 @@
         <w:ind w:left="3600" w:hanging="360"/>
       </w:pPr>
     </w:lvl>
-    <w:lvl w:ilvl="5" w:tplc="5DAE3CF0">
+    <w:lvl w:ilvl="5" w:tplc="8AF0AC1A">
       <w:start w:val="1"/>
       <w:numFmt w:val="bullet"/>
       <w:lvlText w:val="■"/>
@@ -14203,7 +13738,7 @@
         <w:ind w:left="4320" w:hanging="360"/>
       </w:pPr>
     </w:lvl>
-    <w:lvl w:ilvl="6" w:tplc="11F2D916">
+    <w:lvl w:ilvl="6" w:tplc="D4BE2C76">
       <w:start w:val="1"/>
       <w:numFmt w:val="bullet"/>
       <w:lvlText w:val="●"/>
@@ -14212,7 +13747,7 @@
         <w:ind w:left="5040" w:hanging="360"/>
       </w:pPr>
     </w:lvl>
-    <w:lvl w:ilvl="7" w:tplc="A3709E9C">
+    <w:lvl w:ilvl="7" w:tplc="F6FA9F52">
       <w:start w:val="1"/>
       <w:numFmt w:val="bullet"/>
       <w:lvlText w:val="●"/>
@@ -14221,7 +13756,7 @@
         <w:ind w:left="5760" w:hanging="360"/>
       </w:pPr>
     </w:lvl>
-    <w:lvl w:ilvl="8" w:tplc="62B89412">
+    <w:lvl w:ilvl="8" w:tplc="91328D08">
       <w:start w:val="1"/>
       <w:numFmt w:val="bullet"/>
       <w:lvlText w:val="●"/>
@@ -14231,7 +13766,7 @@
       </w:pPr>
     </w:lvl>
   </w:abstractNum>
-  <w:num w:numId="1" w16cid:durableId="1934123202">
+  <w:num w:numId="1" w16cid:durableId="919946407">
     <w:abstractNumId w:val="0"/>
     <w:lvlOverride w:ilvl="0">
       <w:startOverride w:val="1"/>

</xml_diff>

<commit_message>
Anoto la mesa en la venta y cierro el rastro de las anulaciones
El negocio tambien sirve mesas, de modo que una venta necesita poder reconocerse despues; y una anulacion no dejaba constancia de quien la hizo ni aviso a nadie, aunque el cajon cuadre igual se haya devuelto el dinero o no.
</commit_message>
<xml_diff>
--- a/docs/diseno/INVENTRA_Documento_Tecnico_Diseno.docx
+++ b/docs/diseno/INVENTRA_Documento_Tecnico_Diseno.docx
@@ -145,7 +145,7 @@
           <w:left w:w="10" w:type="dxa"/>
           <w:right w:w="10" w:type="dxa"/>
         </w:tblCellMar>
-        <w:tblLook w:val="04A0" w:firstRow="1" w:lastRow="0" w:firstColumn="1" w:lastColumn="0" w:noHBand="0" w:noVBand="1"/>
+        <w:tblLook w:val="0000" w:firstRow="0" w:lastRow="0" w:firstColumn="0" w:lastColumn="0" w:noHBand="0" w:noVBand="0"/>
       </w:tblPr>
       <w:tblGrid>
         <w:gridCol w:w="1500"/>
@@ -154,6 +154,12 @@
         <w:gridCol w:w="3260"/>
       </w:tblGrid>
       <w:tr>
+        <w:tblPrEx>
+          <w:tblCellMar>
+            <w:top w:w="0" w:type="dxa"/>
+            <w:bottom w:w="0" w:type="dxa"/>
+          </w:tblCellMar>
+        </w:tblPrEx>
         <w:trPr>
           <w:tblHeader/>
         </w:trPr>
@@ -267,6 +273,12 @@
         </w:tc>
       </w:tr>
       <w:tr>
+        <w:tblPrEx>
+          <w:tblCellMar>
+            <w:top w:w="0" w:type="dxa"/>
+            <w:bottom w:w="0" w:type="dxa"/>
+          </w:tblCellMar>
+        </w:tblPrEx>
         <w:tc>
           <w:tcPr>
             <w:tcW w:w="1500" w:type="dxa"/>
@@ -2996,10 +3008,7 @@
         <w:t xml:space="preserve">Mensajes comprensibles. </w:t>
       </w:r>
       <w:r>
-        <w:t>Los errores se explican en lenguaje sencillo e indican cómo corregirlos</w:t>
-      </w:r>
-      <w:r>
-        <w:t>.</w:t>
+        <w:t>Los errores se explican en lenguaje sencillo e indican cómo corregirlos.</w:t>
       </w:r>
     </w:p>
     <w:p>
@@ -3059,7 +3068,7 @@
           <w:noProof/>
         </w:rPr>
         <w:drawing>
-          <wp:inline distT="0" distB="0" distL="0" distR="0" wp14:anchorId="23018FEE" wp14:editId="0DFB5F8D">
+          <wp:inline distT="0" distB="0" distL="0" distR="0" wp14:anchorId="6D3E5924" wp14:editId="0BEEBA22">
             <wp:extent cx="5905500" cy="2324100"/>
             <wp:effectExtent l="0" t="0" r="0" b="0"/>
             <wp:docPr id="1" name="Imagen 1"/>
@@ -3142,10 +3151,10 @@
           <w:noProof/>
         </w:rPr>
         <w:drawing>
-          <wp:inline distT="0" distB="0" distL="0" distR="0" wp14:anchorId="7F8D5FA3" wp14:editId="6D9AF1FD">
+          <wp:inline distT="0" distB="0" distL="0" distR="0" wp14:anchorId="60676E29" wp14:editId="7AFA037E">
             <wp:extent cx="5334000" cy="2371725"/>
             <wp:effectExtent l="0" t="0" r="0" b="0"/>
-            <wp:docPr id="1305898800" name="Imagen 1305898800"/>
+            <wp:docPr id="894435221" name="Imagen 894435221"/>
             <wp:cNvGraphicFramePr>
               <a:graphicFrameLocks xmlns:a="http://schemas.openxmlformats.org/drawingml/2006/main" noChangeAspect="1"/>
             </wp:cNvGraphicFramePr>
@@ -3240,7 +3249,7 @@
           <w:left w:w="10" w:type="dxa"/>
           <w:right w:w="10" w:type="dxa"/>
         </w:tblCellMar>
-        <w:tblLook w:val="04A0" w:firstRow="1" w:lastRow="0" w:firstColumn="1" w:lastColumn="0" w:noHBand="0" w:noVBand="1"/>
+        <w:tblLook w:val="0000" w:firstRow="0" w:lastRow="0" w:firstColumn="0" w:lastColumn="0" w:noHBand="0" w:noVBand="0"/>
       </w:tblPr>
       <w:tblGrid>
         <w:gridCol w:w="1850"/>
@@ -3249,6 +3258,12 @@
         <w:gridCol w:w="4510"/>
       </w:tblGrid>
       <w:tr>
+        <w:tblPrEx>
+          <w:tblCellMar>
+            <w:top w:w="0" w:type="dxa"/>
+            <w:bottom w:w="0" w:type="dxa"/>
+          </w:tblCellMar>
+        </w:tblPrEx>
         <w:trPr>
           <w:tblHeader/>
         </w:trPr>
@@ -3362,6 +3377,12 @@
         </w:tc>
       </w:tr>
       <w:tr>
+        <w:tblPrEx>
+          <w:tblCellMar>
+            <w:top w:w="0" w:type="dxa"/>
+            <w:bottom w:w="0" w:type="dxa"/>
+          </w:tblCellMar>
+        </w:tblPrEx>
         <w:tc>
           <w:tcPr>
             <w:tcW w:w="1850" w:type="dxa"/>
@@ -3460,6 +3481,12 @@
         </w:tc>
       </w:tr>
       <w:tr>
+        <w:tblPrEx>
+          <w:tblCellMar>
+            <w:top w:w="0" w:type="dxa"/>
+            <w:bottom w:w="0" w:type="dxa"/>
+          </w:tblCellMar>
+        </w:tblPrEx>
         <w:tc>
           <w:tcPr>
             <w:tcW w:w="1850" w:type="dxa"/>
@@ -3559,6 +3586,12 @@
         </w:tc>
       </w:tr>
       <w:tr>
+        <w:tblPrEx>
+          <w:tblCellMar>
+            <w:top w:w="0" w:type="dxa"/>
+            <w:bottom w:w="0" w:type="dxa"/>
+          </w:tblCellMar>
+        </w:tblPrEx>
         <w:tc>
           <w:tcPr>
             <w:tcW w:w="1850" w:type="dxa"/>
@@ -3657,6 +3690,12 @@
         </w:tc>
       </w:tr>
       <w:tr>
+        <w:tblPrEx>
+          <w:tblCellMar>
+            <w:top w:w="0" w:type="dxa"/>
+            <w:bottom w:w="0" w:type="dxa"/>
+          </w:tblCellMar>
+        </w:tblPrEx>
         <w:tc>
           <w:tcPr>
             <w:tcW w:w="1850" w:type="dxa"/>
@@ -3755,6 +3794,12 @@
         </w:tc>
       </w:tr>
       <w:tr>
+        <w:tblPrEx>
+          <w:tblCellMar>
+            <w:top w:w="0" w:type="dxa"/>
+            <w:bottom w:w="0" w:type="dxa"/>
+          </w:tblCellMar>
+        </w:tblPrEx>
         <w:tc>
           <w:tcPr>
             <w:tcW w:w="1850" w:type="dxa"/>
@@ -3853,6 +3898,12 @@
         </w:tc>
       </w:tr>
       <w:tr>
+        <w:tblPrEx>
+          <w:tblCellMar>
+            <w:top w:w="0" w:type="dxa"/>
+            <w:bottom w:w="0" w:type="dxa"/>
+          </w:tblCellMar>
+        </w:tblPrEx>
         <w:tc>
           <w:tcPr>
             <w:tcW w:w="1850" w:type="dxa"/>
@@ -3951,6 +4002,12 @@
         </w:tc>
       </w:tr>
       <w:tr>
+        <w:tblPrEx>
+          <w:tblCellMar>
+            <w:top w:w="0" w:type="dxa"/>
+            <w:bottom w:w="0" w:type="dxa"/>
+          </w:tblCellMar>
+        </w:tblPrEx>
         <w:tc>
           <w:tcPr>
             <w:tcW w:w="1850" w:type="dxa"/>
@@ -4049,6 +4106,12 @@
         </w:tc>
       </w:tr>
       <w:tr>
+        <w:tblPrEx>
+          <w:tblCellMar>
+            <w:top w:w="0" w:type="dxa"/>
+            <w:bottom w:w="0" w:type="dxa"/>
+          </w:tblCellMar>
+        </w:tblPrEx>
         <w:tc>
           <w:tcPr>
             <w:tcW w:w="1850" w:type="dxa"/>
@@ -4147,6 +4210,12 @@
         </w:tc>
       </w:tr>
       <w:tr>
+        <w:tblPrEx>
+          <w:tblCellMar>
+            <w:top w:w="0" w:type="dxa"/>
+            <w:bottom w:w="0" w:type="dxa"/>
+          </w:tblCellMar>
+        </w:tblPrEx>
         <w:tc>
           <w:tcPr>
             <w:tcW w:w="1850" w:type="dxa"/>
@@ -4245,6 +4314,12 @@
         </w:tc>
       </w:tr>
       <w:tr>
+        <w:tblPrEx>
+          <w:tblCellMar>
+            <w:top w:w="0" w:type="dxa"/>
+            <w:bottom w:w="0" w:type="dxa"/>
+          </w:tblCellMar>
+        </w:tblPrEx>
         <w:tc>
           <w:tcPr>
             <w:tcW w:w="1850" w:type="dxa"/>
@@ -4343,6 +4418,12 @@
         </w:tc>
       </w:tr>
       <w:tr>
+        <w:tblPrEx>
+          <w:tblCellMar>
+            <w:top w:w="0" w:type="dxa"/>
+            <w:bottom w:w="0" w:type="dxa"/>
+          </w:tblCellMar>
+        </w:tblPrEx>
         <w:tc>
           <w:tcPr>
             <w:tcW w:w="1850" w:type="dxa"/>
@@ -4441,6 +4522,12 @@
         </w:tc>
       </w:tr>
       <w:tr>
+        <w:tblPrEx>
+          <w:tblCellMar>
+            <w:top w:w="0" w:type="dxa"/>
+            <w:bottom w:w="0" w:type="dxa"/>
+          </w:tblCellMar>
+        </w:tblPrEx>
         <w:tc>
           <w:tcPr>
             <w:tcW w:w="1850" w:type="dxa"/>
@@ -4539,6 +4626,12 @@
         </w:tc>
       </w:tr>
       <w:tr>
+        <w:tblPrEx>
+          <w:tblCellMar>
+            <w:top w:w="0" w:type="dxa"/>
+            <w:bottom w:w="0" w:type="dxa"/>
+          </w:tblCellMar>
+        </w:tblPrEx>
         <w:tc>
           <w:tcPr>
             <w:tcW w:w="1850" w:type="dxa"/>
@@ -4637,6 +4730,12 @@
         </w:tc>
       </w:tr>
       <w:tr>
+        <w:tblPrEx>
+          <w:tblCellMar>
+            <w:top w:w="0" w:type="dxa"/>
+            <w:bottom w:w="0" w:type="dxa"/>
+          </w:tblCellMar>
+        </w:tblPrEx>
         <w:tc>
           <w:tcPr>
             <w:tcW w:w="1850" w:type="dxa"/>
@@ -4735,6 +4834,12 @@
         </w:tc>
       </w:tr>
       <w:tr>
+        <w:tblPrEx>
+          <w:tblCellMar>
+            <w:top w:w="0" w:type="dxa"/>
+            <w:bottom w:w="0" w:type="dxa"/>
+          </w:tblCellMar>
+        </w:tblPrEx>
         <w:tc>
           <w:tcPr>
             <w:tcW w:w="1850" w:type="dxa"/>
@@ -4833,6 +4938,12 @@
         </w:tc>
       </w:tr>
       <w:tr>
+        <w:tblPrEx>
+          <w:tblCellMar>
+            <w:top w:w="0" w:type="dxa"/>
+            <w:bottom w:w="0" w:type="dxa"/>
+          </w:tblCellMar>
+        </w:tblPrEx>
         <w:tc>
           <w:tcPr>
             <w:tcW w:w="1850" w:type="dxa"/>
@@ -4931,6 +5042,12 @@
         </w:tc>
       </w:tr>
       <w:tr>
+        <w:tblPrEx>
+          <w:tblCellMar>
+            <w:top w:w="0" w:type="dxa"/>
+            <w:bottom w:w="0" w:type="dxa"/>
+          </w:tblCellMar>
+        </w:tblPrEx>
         <w:tc>
           <w:tcPr>
             <w:tcW w:w="1850" w:type="dxa"/>
@@ -5029,6 +5146,12 @@
         </w:tc>
       </w:tr>
       <w:tr>
+        <w:tblPrEx>
+          <w:tblCellMar>
+            <w:top w:w="0" w:type="dxa"/>
+            <w:bottom w:w="0" w:type="dxa"/>
+          </w:tblCellMar>
+        </w:tblPrEx>
         <w:tc>
           <w:tcPr>
             <w:tcW w:w="1850" w:type="dxa"/>
@@ -5170,7 +5293,7 @@
           <w:left w:w="10" w:type="dxa"/>
           <w:right w:w="10" w:type="dxa"/>
         </w:tblCellMar>
-        <w:tblLook w:val="04A0" w:firstRow="1" w:lastRow="0" w:firstColumn="1" w:lastColumn="0" w:noHBand="0" w:noVBand="1"/>
+        <w:tblLook w:val="0000" w:firstRow="0" w:lastRow="0" w:firstColumn="0" w:lastColumn="0" w:noHBand="0" w:noVBand="0"/>
       </w:tblPr>
       <w:tblGrid>
         <w:gridCol w:w="2400"/>
@@ -5179,6 +5302,12 @@
         <w:gridCol w:w="3760"/>
       </w:tblGrid>
       <w:tr>
+        <w:tblPrEx>
+          <w:tblCellMar>
+            <w:top w:w="0" w:type="dxa"/>
+            <w:bottom w:w="0" w:type="dxa"/>
+          </w:tblCellMar>
+        </w:tblPrEx>
         <w:trPr>
           <w:tblHeader/>
         </w:trPr>
@@ -5292,6 +5421,12 @@
         </w:tc>
       </w:tr>
       <w:tr>
+        <w:tblPrEx>
+          <w:tblCellMar>
+            <w:top w:w="0" w:type="dxa"/>
+            <w:bottom w:w="0" w:type="dxa"/>
+          </w:tblCellMar>
+        </w:tblPrEx>
         <w:tc>
           <w:tcPr>
             <w:tcW w:w="2400" w:type="dxa"/>
@@ -5390,6 +5525,12 @@
         </w:tc>
       </w:tr>
       <w:tr>
+        <w:tblPrEx>
+          <w:tblCellMar>
+            <w:top w:w="0" w:type="dxa"/>
+            <w:bottom w:w="0" w:type="dxa"/>
+          </w:tblCellMar>
+        </w:tblPrEx>
         <w:tc>
           <w:tcPr>
             <w:tcW w:w="2400" w:type="dxa"/>
@@ -5488,6 +5629,12 @@
         </w:tc>
       </w:tr>
       <w:tr>
+        <w:tblPrEx>
+          <w:tblCellMar>
+            <w:top w:w="0" w:type="dxa"/>
+            <w:bottom w:w="0" w:type="dxa"/>
+          </w:tblCellMar>
+        </w:tblPrEx>
         <w:tc>
           <w:tcPr>
             <w:tcW w:w="2400" w:type="dxa"/>
@@ -5586,6 +5733,12 @@
         </w:tc>
       </w:tr>
       <w:tr>
+        <w:tblPrEx>
+          <w:tblCellMar>
+            <w:top w:w="0" w:type="dxa"/>
+            <w:bottom w:w="0" w:type="dxa"/>
+          </w:tblCellMar>
+        </w:tblPrEx>
         <w:tc>
           <w:tcPr>
             <w:tcW w:w="2400" w:type="dxa"/>
@@ -5684,6 +5837,12 @@
         </w:tc>
       </w:tr>
       <w:tr>
+        <w:tblPrEx>
+          <w:tblCellMar>
+            <w:top w:w="0" w:type="dxa"/>
+            <w:bottom w:w="0" w:type="dxa"/>
+          </w:tblCellMar>
+        </w:tblPrEx>
         <w:tc>
           <w:tcPr>
             <w:tcW w:w="2400" w:type="dxa"/>
@@ -5782,6 +5941,12 @@
         </w:tc>
       </w:tr>
       <w:tr>
+        <w:tblPrEx>
+          <w:tblCellMar>
+            <w:top w:w="0" w:type="dxa"/>
+            <w:bottom w:w="0" w:type="dxa"/>
+          </w:tblCellMar>
+        </w:tblPrEx>
         <w:tc>
           <w:tcPr>
             <w:tcW w:w="2400" w:type="dxa"/>
@@ -5979,13 +6144,19 @@
           <w:left w:w="10" w:type="dxa"/>
           <w:right w:w="10" w:type="dxa"/>
         </w:tblCellMar>
-        <w:tblLook w:val="04A0" w:firstRow="1" w:lastRow="0" w:firstColumn="1" w:lastColumn="0" w:noHBand="0" w:noVBand="1"/>
+        <w:tblLook w:val="0000" w:firstRow="0" w:lastRow="0" w:firstColumn="0" w:lastColumn="0" w:noHBand="0" w:noVBand="0"/>
       </w:tblPr>
       <w:tblGrid>
         <w:gridCol w:w="2200"/>
         <w:gridCol w:w="7160"/>
       </w:tblGrid>
       <w:tr>
+        <w:tblPrEx>
+          <w:tblCellMar>
+            <w:top w:w="0" w:type="dxa"/>
+            <w:bottom w:w="0" w:type="dxa"/>
+          </w:tblCellMar>
+        </w:tblPrEx>
         <w:trPr>
           <w:tblHeader/>
         </w:trPr>
@@ -6045,6 +6216,12 @@
         </w:tc>
       </w:tr>
       <w:tr>
+        <w:tblPrEx>
+          <w:tblCellMar>
+            <w:top w:w="0" w:type="dxa"/>
+            <w:bottom w:w="0" w:type="dxa"/>
+          </w:tblCellMar>
+        </w:tblPrEx>
         <w:tc>
           <w:tcPr>
             <w:tcW w:w="2200" w:type="dxa"/>
@@ -6095,6 +6272,12 @@
         </w:tc>
       </w:tr>
       <w:tr>
+        <w:tblPrEx>
+          <w:tblCellMar>
+            <w:top w:w="0" w:type="dxa"/>
+            <w:bottom w:w="0" w:type="dxa"/>
+          </w:tblCellMar>
+        </w:tblPrEx>
         <w:tc>
           <w:tcPr>
             <w:tcW w:w="2200" w:type="dxa"/>
@@ -6145,6 +6328,12 @@
         </w:tc>
       </w:tr>
       <w:tr>
+        <w:tblPrEx>
+          <w:tblCellMar>
+            <w:top w:w="0" w:type="dxa"/>
+            <w:bottom w:w="0" w:type="dxa"/>
+          </w:tblCellMar>
+        </w:tblPrEx>
         <w:tc>
           <w:tcPr>
             <w:tcW w:w="2200" w:type="dxa"/>
@@ -6195,6 +6384,12 @@
         </w:tc>
       </w:tr>
       <w:tr>
+        <w:tblPrEx>
+          <w:tblCellMar>
+            <w:top w:w="0" w:type="dxa"/>
+            <w:bottom w:w="0" w:type="dxa"/>
+          </w:tblCellMar>
+        </w:tblPrEx>
         <w:tc>
           <w:tcPr>
             <w:tcW w:w="2200" w:type="dxa"/>
@@ -6315,7 +6510,7 @@
           <w:left w:w="10" w:type="dxa"/>
           <w:right w:w="10" w:type="dxa"/>
         </w:tblCellMar>
-        <w:tblLook w:val="04A0" w:firstRow="1" w:lastRow="0" w:firstColumn="1" w:lastColumn="0" w:noHBand="0" w:noVBand="1"/>
+        <w:tblLook w:val="0000" w:firstRow="0" w:lastRow="0" w:firstColumn="0" w:lastColumn="0" w:noHBand="0" w:noVBand="0"/>
       </w:tblPr>
       <w:tblGrid>
         <w:gridCol w:w="2200"/>
@@ -6323,6 +6518,12 @@
         <w:gridCol w:w="4960"/>
       </w:tblGrid>
       <w:tr>
+        <w:tblPrEx>
+          <w:tblCellMar>
+            <w:top w:w="0" w:type="dxa"/>
+            <w:bottom w:w="0" w:type="dxa"/>
+          </w:tblCellMar>
+        </w:tblPrEx>
         <w:trPr>
           <w:tblHeader/>
         </w:trPr>
@@ -6409,6 +6610,12 @@
         </w:tc>
       </w:tr>
       <w:tr>
+        <w:tblPrEx>
+          <w:tblCellMar>
+            <w:top w:w="0" w:type="dxa"/>
+            <w:bottom w:w="0" w:type="dxa"/>
+          </w:tblCellMar>
+        </w:tblPrEx>
         <w:tc>
           <w:tcPr>
             <w:tcW w:w="2200" w:type="dxa"/>
@@ -6483,6 +6690,12 @@
         </w:tc>
       </w:tr>
       <w:tr>
+        <w:tblPrEx>
+          <w:tblCellMar>
+            <w:top w:w="0" w:type="dxa"/>
+            <w:bottom w:w="0" w:type="dxa"/>
+          </w:tblCellMar>
+        </w:tblPrEx>
         <w:tc>
           <w:tcPr>
             <w:tcW w:w="2200" w:type="dxa"/>
@@ -6557,6 +6770,12 @@
         </w:tc>
       </w:tr>
       <w:tr>
+        <w:tblPrEx>
+          <w:tblCellMar>
+            <w:top w:w="0" w:type="dxa"/>
+            <w:bottom w:w="0" w:type="dxa"/>
+          </w:tblCellMar>
+        </w:tblPrEx>
         <w:tc>
           <w:tcPr>
             <w:tcW w:w="2200" w:type="dxa"/>
@@ -6703,7 +6922,7 @@
           <w:left w:w="10" w:type="dxa"/>
           <w:right w:w="10" w:type="dxa"/>
         </w:tblCellMar>
-        <w:tblLook w:val="04A0" w:firstRow="1" w:lastRow="0" w:firstColumn="1" w:lastColumn="0" w:noHBand="0" w:noVBand="1"/>
+        <w:tblLook w:val="0000" w:firstRow="0" w:lastRow="0" w:firstColumn="0" w:lastColumn="0" w:noHBand="0" w:noVBand="0"/>
       </w:tblPr>
       <w:tblGrid>
         <w:gridCol w:w="1700"/>
@@ -6711,6 +6930,12 @@
         <w:gridCol w:w="3660"/>
       </w:tblGrid>
       <w:tr>
+        <w:tblPrEx>
+          <w:tblCellMar>
+            <w:top w:w="0" w:type="dxa"/>
+            <w:bottom w:w="0" w:type="dxa"/>
+          </w:tblCellMar>
+        </w:tblPrEx>
         <w:trPr>
           <w:tblHeader/>
         </w:trPr>
@@ -6797,6 +7022,12 @@
         </w:tc>
       </w:tr>
       <w:tr>
+        <w:tblPrEx>
+          <w:tblCellMar>
+            <w:top w:w="0" w:type="dxa"/>
+            <w:bottom w:w="0" w:type="dxa"/>
+          </w:tblCellMar>
+        </w:tblPrEx>
         <w:tc>
           <w:tcPr>
             <w:tcW w:w="1700" w:type="dxa"/>
@@ -6871,6 +7102,12 @@
         </w:tc>
       </w:tr>
       <w:tr>
+        <w:tblPrEx>
+          <w:tblCellMar>
+            <w:top w:w="0" w:type="dxa"/>
+            <w:bottom w:w="0" w:type="dxa"/>
+          </w:tblCellMar>
+        </w:tblPrEx>
         <w:tc>
           <w:tcPr>
             <w:tcW w:w="1700" w:type="dxa"/>
@@ -6945,6 +7182,12 @@
         </w:tc>
       </w:tr>
       <w:tr>
+        <w:tblPrEx>
+          <w:tblCellMar>
+            <w:top w:w="0" w:type="dxa"/>
+            <w:bottom w:w="0" w:type="dxa"/>
+          </w:tblCellMar>
+        </w:tblPrEx>
         <w:tc>
           <w:tcPr>
             <w:tcW w:w="1700" w:type="dxa"/>
@@ -7019,6 +7262,12 @@
         </w:tc>
       </w:tr>
       <w:tr>
+        <w:tblPrEx>
+          <w:tblCellMar>
+            <w:top w:w="0" w:type="dxa"/>
+            <w:bottom w:w="0" w:type="dxa"/>
+          </w:tblCellMar>
+        </w:tblPrEx>
         <w:tc>
           <w:tcPr>
             <w:tcW w:w="1700" w:type="dxa"/>
@@ -7093,6 +7342,12 @@
         </w:tc>
       </w:tr>
       <w:tr>
+        <w:tblPrEx>
+          <w:tblCellMar>
+            <w:top w:w="0" w:type="dxa"/>
+            <w:bottom w:w="0" w:type="dxa"/>
+          </w:tblCellMar>
+        </w:tblPrEx>
         <w:tc>
           <w:tcPr>
             <w:tcW w:w="1700" w:type="dxa"/>
@@ -7167,6 +7422,12 @@
         </w:tc>
       </w:tr>
       <w:tr>
+        <w:tblPrEx>
+          <w:tblCellMar>
+            <w:top w:w="0" w:type="dxa"/>
+            <w:bottom w:w="0" w:type="dxa"/>
+          </w:tblCellMar>
+        </w:tblPrEx>
         <w:tc>
           <w:tcPr>
             <w:tcW w:w="1700" w:type="dxa"/>
@@ -7241,6 +7502,12 @@
         </w:tc>
       </w:tr>
       <w:tr>
+        <w:tblPrEx>
+          <w:tblCellMar>
+            <w:top w:w="0" w:type="dxa"/>
+            <w:bottom w:w="0" w:type="dxa"/>
+          </w:tblCellMar>
+        </w:tblPrEx>
         <w:tc>
           <w:tcPr>
             <w:tcW w:w="1700" w:type="dxa"/>
@@ -7358,7 +7625,7 @@
           <w:left w:w="10" w:type="dxa"/>
           <w:right w:w="10" w:type="dxa"/>
         </w:tblCellMar>
-        <w:tblLook w:val="04A0" w:firstRow="1" w:lastRow="0" w:firstColumn="1" w:lastColumn="0" w:noHBand="0" w:noVBand="1"/>
+        <w:tblLook w:val="0000" w:firstRow="0" w:lastRow="0" w:firstColumn="0" w:lastColumn="0" w:noHBand="0" w:noVBand="0"/>
       </w:tblPr>
       <w:tblGrid>
         <w:gridCol w:w="1700"/>
@@ -7366,6 +7633,12 @@
         <w:gridCol w:w="3060"/>
       </w:tblGrid>
       <w:tr>
+        <w:tblPrEx>
+          <w:tblCellMar>
+            <w:top w:w="0" w:type="dxa"/>
+            <w:bottom w:w="0" w:type="dxa"/>
+          </w:tblCellMar>
+        </w:tblPrEx>
         <w:trPr>
           <w:tblHeader/>
         </w:trPr>
@@ -7452,6 +7725,12 @@
         </w:tc>
       </w:tr>
       <w:tr>
+        <w:tblPrEx>
+          <w:tblCellMar>
+            <w:top w:w="0" w:type="dxa"/>
+            <w:bottom w:w="0" w:type="dxa"/>
+          </w:tblCellMar>
+        </w:tblPrEx>
         <w:tc>
           <w:tcPr>
             <w:tcW w:w="1700" w:type="dxa"/>
@@ -7526,6 +7805,12 @@
         </w:tc>
       </w:tr>
       <w:tr>
+        <w:tblPrEx>
+          <w:tblCellMar>
+            <w:top w:w="0" w:type="dxa"/>
+            <w:bottom w:w="0" w:type="dxa"/>
+          </w:tblCellMar>
+        </w:tblPrEx>
         <w:tc>
           <w:tcPr>
             <w:tcW w:w="1700" w:type="dxa"/>
@@ -7600,6 +7885,12 @@
         </w:tc>
       </w:tr>
       <w:tr>
+        <w:tblPrEx>
+          <w:tblCellMar>
+            <w:top w:w="0" w:type="dxa"/>
+            <w:bottom w:w="0" w:type="dxa"/>
+          </w:tblCellMar>
+        </w:tblPrEx>
         <w:tc>
           <w:tcPr>
             <w:tcW w:w="1700" w:type="dxa"/>
@@ -7674,6 +7965,12 @@
         </w:tc>
       </w:tr>
       <w:tr>
+        <w:tblPrEx>
+          <w:tblCellMar>
+            <w:top w:w="0" w:type="dxa"/>
+            <w:bottom w:w="0" w:type="dxa"/>
+          </w:tblCellMar>
+        </w:tblPrEx>
         <w:tc>
           <w:tcPr>
             <w:tcW w:w="1700" w:type="dxa"/>
@@ -7768,10 +8065,10 @@
         </w:rPr>
         <w:lastRenderedPageBreak/>
         <w:drawing>
-          <wp:inline distT="0" distB="0" distL="0" distR="0" wp14:anchorId="6C4267D3" wp14:editId="4A95FFAA">
+          <wp:inline distT="0" distB="0" distL="0" distR="0" wp14:anchorId="6464E87D" wp14:editId="0E37FD06">
             <wp:extent cx="5905500" cy="2419350"/>
             <wp:effectExtent l="0" t="0" r="0" b="0"/>
-            <wp:docPr id="240012898" name="Imagen 240012898"/>
+            <wp:docPr id="1936050056" name="Imagen 1936050056"/>
             <wp:cNvGraphicFramePr>
               <a:graphicFrameLocks xmlns:a="http://schemas.openxmlformats.org/drawingml/2006/main" noChangeAspect="1"/>
             </wp:cNvGraphicFramePr>
@@ -7921,10 +8218,10 @@
           <w:noProof/>
         </w:rPr>
         <w:drawing>
-          <wp:inline distT="0" distB="0" distL="0" distR="0" wp14:anchorId="777DF9E4" wp14:editId="36E89790">
+          <wp:inline distT="0" distB="0" distL="0" distR="0" wp14:anchorId="14F27B17" wp14:editId="3568E5C4">
             <wp:extent cx="5905500" cy="2257425"/>
             <wp:effectExtent l="0" t="0" r="0" b="0"/>
-            <wp:docPr id="1618190245" name="Imagen 1618190245"/>
+            <wp:docPr id="323493269" name="Imagen 323493269"/>
             <wp:cNvGraphicFramePr>
               <a:graphicFrameLocks xmlns:a="http://schemas.openxmlformats.org/drawingml/2006/main" noChangeAspect="1"/>
             </wp:cNvGraphicFramePr>
@@ -8109,7 +8406,7 @@
           <w:left w:w="10" w:type="dxa"/>
           <w:right w:w="10" w:type="dxa"/>
         </w:tblCellMar>
-        <w:tblLook w:val="04A0" w:firstRow="1" w:lastRow="0" w:firstColumn="1" w:lastColumn="0" w:noHBand="0" w:noVBand="1"/>
+        <w:tblLook w:val="0000" w:firstRow="0" w:lastRow="0" w:firstColumn="0" w:lastColumn="0" w:noHBand="0" w:noVBand="0"/>
       </w:tblPr>
       <w:tblGrid>
         <w:gridCol w:w="1700"/>
@@ -8117,6 +8414,12 @@
         <w:gridCol w:w="5360"/>
       </w:tblGrid>
       <w:tr>
+        <w:tblPrEx>
+          <w:tblCellMar>
+            <w:top w:w="0" w:type="dxa"/>
+            <w:bottom w:w="0" w:type="dxa"/>
+          </w:tblCellMar>
+        </w:tblPrEx>
         <w:trPr>
           <w:tblHeader/>
         </w:trPr>
@@ -8203,6 +8506,12 @@
         </w:tc>
       </w:tr>
       <w:tr>
+        <w:tblPrEx>
+          <w:tblCellMar>
+            <w:top w:w="0" w:type="dxa"/>
+            <w:bottom w:w="0" w:type="dxa"/>
+          </w:tblCellMar>
+        </w:tblPrEx>
         <w:tc>
           <w:tcPr>
             <w:tcW w:w="1700" w:type="dxa"/>
@@ -8277,6 +8586,12 @@
         </w:tc>
       </w:tr>
       <w:tr>
+        <w:tblPrEx>
+          <w:tblCellMar>
+            <w:top w:w="0" w:type="dxa"/>
+            <w:bottom w:w="0" w:type="dxa"/>
+          </w:tblCellMar>
+        </w:tblPrEx>
         <w:tc>
           <w:tcPr>
             <w:tcW w:w="1700" w:type="dxa"/>
@@ -8351,6 +8666,12 @@
         </w:tc>
       </w:tr>
       <w:tr>
+        <w:tblPrEx>
+          <w:tblCellMar>
+            <w:top w:w="0" w:type="dxa"/>
+            <w:bottom w:w="0" w:type="dxa"/>
+          </w:tblCellMar>
+        </w:tblPrEx>
         <w:tc>
           <w:tcPr>
             <w:tcW w:w="1700" w:type="dxa"/>
@@ -8425,6 +8746,12 @@
         </w:tc>
       </w:tr>
       <w:tr>
+        <w:tblPrEx>
+          <w:tblCellMar>
+            <w:top w:w="0" w:type="dxa"/>
+            <w:bottom w:w="0" w:type="dxa"/>
+          </w:tblCellMar>
+        </w:tblPrEx>
         <w:tc>
           <w:tcPr>
             <w:tcW w:w="1700" w:type="dxa"/>
@@ -8518,10 +8845,10 @@
           <w:noProof/>
         </w:rPr>
         <w:drawing>
-          <wp:inline distT="0" distB="0" distL="0" distR="0" wp14:anchorId="140B5358" wp14:editId="11891D41">
+          <wp:inline distT="0" distB="0" distL="0" distR="0" wp14:anchorId="144363D3" wp14:editId="78596466">
             <wp:extent cx="5334000" cy="3381375"/>
             <wp:effectExtent l="0" t="0" r="0" b="0"/>
-            <wp:docPr id="1440665335" name="Imagen 1440665335"/>
+            <wp:docPr id="2068897345" name="Imagen 2068897345"/>
             <wp:cNvGraphicFramePr>
               <a:graphicFrameLocks xmlns:a="http://schemas.openxmlformats.org/drawingml/2006/main" noChangeAspect="1"/>
             </wp:cNvGraphicFramePr>
@@ -8658,7 +8985,7 @@
         <w:t xml:space="preserve">Tablas. </w:t>
       </w:r>
       <w:r>
-        <w:t>Muestran los listados de productos, ventas y movimientos. Incluyen encabezado fijo, buscador, filtros rápidos, etiquetas de estado en la última columna y paginación cuando el volumen lo requiere.</w:t>
+        <w:t>Muestran los listados de productos, ventas y movimientos. Incluyen encabezado fijo, buscador, filtros rápidos, etiquetas de estado en la última columna y paginación cuando el volumen lo requiere. El control de páginas es el mismo en todas y solo aparece cuando hay más de una: dice en qué tramo del total se está —«26 a 50 de 142»— y no solo el número de página, porque quien recorre un listado largo pregunta a la vez dónde está y cuánto le falta. Se repite sobre la tabla y bajo ella: con una página entera de filas, el de abajo queda fuera de la pantalla y cambiar de página obligaría a bajar primero.</w:t>
       </w:r>
     </w:p>
     <w:p>
@@ -8671,10 +8998,10 @@
           <w:noProof/>
         </w:rPr>
         <w:drawing>
-          <wp:inline distT="0" distB="0" distL="0" distR="0" wp14:anchorId="543408A0" wp14:editId="6B3BBCF0">
+          <wp:inline distT="0" distB="0" distL="0" distR="0" wp14:anchorId="186D9997" wp14:editId="3FA9E523">
             <wp:extent cx="6096000" cy="1676400"/>
             <wp:effectExtent l="0" t="0" r="0" b="0"/>
-            <wp:docPr id="1414651780" name="Imagen 1414651780"/>
+            <wp:docPr id="1190250012" name="Imagen 1190250012"/>
             <wp:cNvGraphicFramePr>
               <a:graphicFrameLocks xmlns:a="http://schemas.openxmlformats.org/drawingml/2006/main" noChangeAspect="1"/>
             </wp:cNvGraphicFramePr>
@@ -8763,10 +9090,10 @@
           <w:noProof/>
         </w:rPr>
         <w:drawing>
-          <wp:inline distT="0" distB="0" distL="0" distR="0" wp14:anchorId="6DCC22B8" wp14:editId="4B5CDD76">
+          <wp:inline distT="0" distB="0" distL="0" distR="0" wp14:anchorId="73C83ACA" wp14:editId="638457BC">
             <wp:extent cx="4762500" cy="2447925"/>
             <wp:effectExtent l="0" t="0" r="0" b="0"/>
-            <wp:docPr id="1963707189" name="Imagen 1963707189"/>
+            <wp:docPr id="1356257924" name="Imagen 1356257924"/>
             <wp:cNvGraphicFramePr>
               <a:graphicFrameLocks xmlns:a="http://schemas.openxmlformats.org/drawingml/2006/main" noChangeAspect="1"/>
             </wp:cNvGraphicFramePr>
@@ -8893,10 +9220,10 @@
           <w:noProof/>
         </w:rPr>
         <w:drawing>
-          <wp:inline distT="0" distB="0" distL="0" distR="0" wp14:anchorId="44A8D202" wp14:editId="1B8D5DE9">
+          <wp:inline distT="0" distB="0" distL="0" distR="0" wp14:anchorId="6726A6FA" wp14:editId="50E0C34C">
             <wp:extent cx="6096000" cy="3048000"/>
             <wp:effectExtent l="0" t="0" r="0" b="0"/>
-            <wp:docPr id="1878665285" name="Imagen 1878665285"/>
+            <wp:docPr id="76944698" name="Imagen 76944698"/>
             <wp:cNvGraphicFramePr>
               <a:graphicFrameLocks xmlns:a="http://schemas.openxmlformats.org/drawingml/2006/main" noChangeAspect="1"/>
             </wp:cNvGraphicFramePr>
@@ -9038,10 +9365,10 @@
         </w:rPr>
         <w:lastRenderedPageBreak/>
         <w:drawing>
-          <wp:inline distT="0" distB="0" distL="0" distR="0" wp14:anchorId="19587C8D" wp14:editId="72AEFCF2">
+          <wp:inline distT="0" distB="0" distL="0" distR="0" wp14:anchorId="59B12BD3" wp14:editId="7CEB2919">
             <wp:extent cx="6096000" cy="3848100"/>
             <wp:effectExtent l="0" t="0" r="0" b="0"/>
-            <wp:docPr id="249685786" name="Imagen 249685786"/>
+            <wp:docPr id="2100996362" name="Imagen 2100996362"/>
             <wp:cNvGraphicFramePr>
               <a:graphicFrameLocks xmlns:a="http://schemas.openxmlformats.org/drawingml/2006/main" noChangeAspect="1"/>
             </wp:cNvGraphicFramePr>
@@ -9202,7 +9529,7 @@
           <w:left w:w="10" w:type="dxa"/>
           <w:right w:w="10" w:type="dxa"/>
         </w:tblCellMar>
-        <w:tblLook w:val="04A0" w:firstRow="1" w:lastRow="0" w:firstColumn="1" w:lastColumn="0" w:noHBand="0" w:noVBand="1"/>
+        <w:tblLook w:val="0000" w:firstRow="0" w:lastRow="0" w:firstColumn="0" w:lastColumn="0" w:noHBand="0" w:noVBand="0"/>
       </w:tblPr>
       <w:tblGrid>
         <w:gridCol w:w="2100"/>
@@ -9210,6 +9537,12 @@
         <w:gridCol w:w="4160"/>
       </w:tblGrid>
       <w:tr>
+        <w:tblPrEx>
+          <w:tblCellMar>
+            <w:top w:w="0" w:type="dxa"/>
+            <w:bottom w:w="0" w:type="dxa"/>
+          </w:tblCellMar>
+        </w:tblPrEx>
         <w:trPr>
           <w:tblHeader/>
         </w:trPr>
@@ -9296,6 +9629,12 @@
         </w:tc>
       </w:tr>
       <w:tr>
+        <w:tblPrEx>
+          <w:tblCellMar>
+            <w:top w:w="0" w:type="dxa"/>
+            <w:bottom w:w="0" w:type="dxa"/>
+          </w:tblCellMar>
+        </w:tblPrEx>
         <w:tc>
           <w:tcPr>
             <w:tcW w:w="2100" w:type="dxa"/>
@@ -9370,6 +9709,12 @@
         </w:tc>
       </w:tr>
       <w:tr>
+        <w:tblPrEx>
+          <w:tblCellMar>
+            <w:top w:w="0" w:type="dxa"/>
+            <w:bottom w:w="0" w:type="dxa"/>
+          </w:tblCellMar>
+        </w:tblPrEx>
         <w:tc>
           <w:tcPr>
             <w:tcW w:w="2100" w:type="dxa"/>
@@ -9444,6 +9789,12 @@
         </w:tc>
       </w:tr>
       <w:tr>
+        <w:tblPrEx>
+          <w:tblCellMar>
+            <w:top w:w="0" w:type="dxa"/>
+            <w:bottom w:w="0" w:type="dxa"/>
+          </w:tblCellMar>
+        </w:tblPrEx>
         <w:tc>
           <w:tcPr>
             <w:tcW w:w="2100" w:type="dxa"/>
@@ -9518,6 +9869,12 @@
         </w:tc>
       </w:tr>
       <w:tr>
+        <w:tblPrEx>
+          <w:tblCellMar>
+            <w:top w:w="0" w:type="dxa"/>
+            <w:bottom w:w="0" w:type="dxa"/>
+          </w:tblCellMar>
+        </w:tblPrEx>
         <w:tc>
           <w:tcPr>
             <w:tcW w:w="2100" w:type="dxa"/>
@@ -9592,6 +9949,12 @@
         </w:tc>
       </w:tr>
       <w:tr>
+        <w:tblPrEx>
+          <w:tblCellMar>
+            <w:top w:w="0" w:type="dxa"/>
+            <w:bottom w:w="0" w:type="dxa"/>
+          </w:tblCellMar>
+        </w:tblPrEx>
         <w:tc>
           <w:tcPr>
             <w:tcW w:w="2100" w:type="dxa"/>
@@ -9667,6 +10030,12 @@
         </w:tc>
       </w:tr>
       <w:tr>
+        <w:tblPrEx>
+          <w:tblCellMar>
+            <w:top w:w="0" w:type="dxa"/>
+            <w:bottom w:w="0" w:type="dxa"/>
+          </w:tblCellMar>
+        </w:tblPrEx>
         <w:tc>
           <w:tcPr>
             <w:tcW w:w="2100" w:type="dxa"/>
@@ -9881,10 +10250,10 @@
           <w:noProof/>
         </w:rPr>
         <w:drawing>
-          <wp:inline distT="0" distB="0" distL="0" distR="0" wp14:anchorId="3E2AB3F2" wp14:editId="07461147">
+          <wp:inline distT="0" distB="0" distL="0" distR="0" wp14:anchorId="6494900D" wp14:editId="3267392F">
             <wp:extent cx="6096000" cy="3000375"/>
             <wp:effectExtent l="0" t="0" r="0" b="0"/>
-            <wp:docPr id="1877701181" name="Imagen 1877701181"/>
+            <wp:docPr id="719848660" name="Imagen 719848660"/>
             <wp:cNvGraphicFramePr>
               <a:graphicFrameLocks xmlns:a="http://schemas.openxmlformats.org/drawingml/2006/main" noChangeAspect="1"/>
             </wp:cNvGraphicFramePr>
@@ -10031,10 +10400,10 @@
           <w:noProof/>
         </w:rPr>
         <w:drawing>
-          <wp:inline distT="0" distB="0" distL="0" distR="0" wp14:anchorId="26117369" wp14:editId="068559D7">
+          <wp:inline distT="0" distB="0" distL="0" distR="0" wp14:anchorId="3D09A095" wp14:editId="35624C2C">
             <wp:extent cx="6096000" cy="2857500"/>
             <wp:effectExtent l="0" t="0" r="0" b="0"/>
-            <wp:docPr id="922454826" name="Imagen 922454826"/>
+            <wp:docPr id="91273034" name="Imagen 91273034"/>
             <wp:cNvGraphicFramePr>
               <a:graphicFrameLocks xmlns:a="http://schemas.openxmlformats.org/drawingml/2006/main" noChangeAspect="1"/>
             </wp:cNvGraphicFramePr>
@@ -10163,10 +10532,10 @@
           <w:noProof/>
         </w:rPr>
         <w:drawing>
-          <wp:inline distT="0" distB="0" distL="0" distR="0" wp14:anchorId="44D446A7" wp14:editId="1EA73B54">
-            <wp:extent cx="6096000" cy="2857500"/>
+          <wp:inline distT="0" distB="0" distL="0" distR="0" wp14:anchorId="1710F7DF" wp14:editId="0101EF39">
+            <wp:extent cx="6096000" cy="3286125"/>
             <wp:effectExtent l="0" t="0" r="0" b="0"/>
-            <wp:docPr id="1156767938" name="Imagen 1156767938"/>
+            <wp:docPr id="1685885302" name="Imagen 1685885302"/>
             <wp:cNvGraphicFramePr>
               <a:graphicFrameLocks xmlns:a="http://schemas.openxmlformats.org/drawingml/2006/main" noChangeAspect="1"/>
             </wp:cNvGraphicFramePr>
@@ -10189,7 +10558,7 @@
                   <pic:spPr bwMode="auto">
                     <a:xfrm>
                       <a:off x="0" y="0"/>
-                      <a:ext cx="6096000" cy="2857500"/>
+                      <a:ext cx="6096000" cy="3286125"/>
                     </a:xfrm>
                     <a:prstGeom prst="rect">
                       <a:avLst/>
@@ -10260,7 +10629,11 @@
         <w:jc w:val="both"/>
       </w:pPr>
       <w:r>
-        <w:t>Un promedio reparte, y esa parte no puede quedar escondida. Si los lotes no costaron lo mismo, la propuesta muestra también el más barato y el más caro, y el formulario advierte cuando el precio escrito no cubre el costo de alguno de ellos, diciendo cuántas unidades quedan por encima: el margen se cumple sobre el conjunto, pero solo si se venden todas. La propuesta se calcula en el servidor y se redondea a la centena superior, porque un precio con unidades sueltas no se cobra; se sube y no se baja, ya que redondear hacia abajo recortaría el margen que se acaba de pedir. Una referencia sin ninguna compra registrada no tiene propuesta: sin costo no hay nada sobre lo que aplicar un porcentaje.</w:t>
+        <w:t xml:space="preserve">Un promedio reparte, y esa parte no puede quedar escondida. Si los lotes no costaron lo mismo, la propuesta muestra también el más barato y el más caro, y el formulario advierte cuando el precio escrito no cubre el costo de alguno de ellos, diciendo cuántas unidades quedan por encima: el margen se cumple sobre el conjunto, pero solo si se venden todas. La propuesta se calcula en el servidor y se redondea a la </w:t>
+      </w:r>
+      <w:r>
+        <w:lastRenderedPageBreak/>
+        <w:t>centena superior, porque un precio con unidades sueltas no se cobra; se sube y no se baja, ya que redondear hacia abajo recortaría el margen que se acaba de pedir. Una referencia sin ninguna compra registrada no tiene propuesta: sin costo no hay nada sobre lo que aplicar un porcentaje.</w:t>
       </w:r>
     </w:p>
     <w:p>
@@ -10269,7 +10642,6 @@
         <w:jc w:val="both"/>
       </w:pPr>
       <w:r>
-        <w:lastRenderedPageBreak/>
         <w:t>El sistema propone y no aplica, y esa es la regla del requisito (RF-INV-11). Una compra más cara no mueve el precio de venta de la referencia: repreciar solo rompería sin avisar una promoción, un precio acordado con el proveedor o un artículo que se vende casi a costo para atraer clientes. Lo que sí hace el formulario es advertir cuando el precio escrito queda por debajo de lo que costó la mercancía, sin impedir que se guarde, porque una liquidación es una decisión del negocio.</w:t>
       </w:r>
     </w:p>
@@ -10292,10 +10664,10 @@
           <w:noProof/>
         </w:rPr>
         <w:drawing>
-          <wp:inline distT="0" distB="0" distL="0" distR="0" wp14:anchorId="109BC402" wp14:editId="42BB46EF">
+          <wp:inline distT="0" distB="0" distL="0" distR="0" wp14:anchorId="4242FC94" wp14:editId="1EE08D50">
             <wp:extent cx="4953000" cy="4067175"/>
             <wp:effectExtent l="0" t="0" r="0" b="0"/>
-            <wp:docPr id="1459923674" name="Imagen 1459923674"/>
+            <wp:docPr id="597610021" name="Imagen 597610021"/>
             <wp:cNvGraphicFramePr>
               <a:graphicFrameLocks xmlns:a="http://schemas.openxmlformats.org/drawingml/2006/main" noChangeAspect="1"/>
             </wp:cNvGraphicFramePr>
@@ -10380,7 +10752,11 @@
         <w:jc w:val="both"/>
       </w:pPr>
       <w:r>
-        <w:t>El costo se captura aquí y no en el formulario del producto, y esa es la decisión que explica la pantalla: el mismo ron no cuesta lo mismo en marzo que en junio, de modo que el costo no pertenece a la referencia sino a cada lote que ingresa. Cada línea de la entrada se convierte en un lote con su costo congelado, que es lo que permite valorar después las salidas por el método PEPS. Mientras se escriben las líneas, la pantalla muestra el subtotal de cada una y el total de la compra, para cotejarlos con la factura antes de registrar.</w:t>
+        <w:t xml:space="preserve">El costo se captura aquí y no en el formulario del producto, y esa es la decisión que explica la pantalla: el mismo ron no cuesta lo mismo en marzo que en junio, de modo que el costo no pertenece a la referencia sino a cada lote que ingresa. Cada línea de la entrada se convierte en un lote con su costo congelado, </w:t>
+      </w:r>
+      <w:r>
+        <w:lastRenderedPageBreak/>
+        <w:t>que es lo que permite valorar después las salidas por el método PEPS. Mientras se escriben las líneas, la pantalla muestra el subtotal de cada una y el total de la compra, para cotejarlos con la factura antes de registrar.</w:t>
       </w:r>
     </w:p>
     <w:p>
@@ -10389,7 +10765,6 @@
         <w:jc w:val="both"/>
       </w:pPr>
       <w:r>
-        <w:lastRenderedPageBreak/>
         <w:t>Debajo se listan las entradas ya registradas con su fecha, su proveedor, los productos que trajo cada una y su costo total. Ninguna ofrece acción de edición ni de borrado: una entrada registrada movió existencias y quedó anotada en el kardex, de modo que modificarla haría que los saldos posteriores dejaran de cuadrar. Lo que corrige una entrada equivocada es un ajuste de existencias con su motivo, descrito en el apartado siguiente.</w:t>
       </w:r>
     </w:p>
@@ -10403,10 +10778,10 @@
           <w:noProof/>
         </w:rPr>
         <w:drawing>
-          <wp:inline distT="0" distB="0" distL="0" distR="0" wp14:anchorId="259D203C" wp14:editId="17EA565F">
+          <wp:inline distT="0" distB="0" distL="0" distR="0" wp14:anchorId="279A094F" wp14:editId="5B63EDF8">
             <wp:extent cx="6096000" cy="4124325"/>
             <wp:effectExtent l="0" t="0" r="0" b="0"/>
-            <wp:docPr id="1317925268" name="Imagen 1317925268"/>
+            <wp:docPr id="966598762" name="Imagen 966598762"/>
             <wp:cNvGraphicFramePr>
               <a:graphicFrameLocks xmlns:a="http://schemas.openxmlformats.org/drawingml/2006/main" noChangeAspect="1"/>
             </wp:cNvGraphicFramePr>
@@ -10500,7 +10875,11 @@
         <w:jc w:val="both"/>
       </w:pPr>
       <w:r>
-        <w:t>El kardex es de solo lectura para todos los roles, incluido el administrador de la licorera. Ninguna línea se edita ni se borra: un historial que se puede reescribir no sirve para rendir cuentas, y una cifra equivocada se corrige con otro movimiento que diga por qué. Cuando el ajuste reduce las existencias, el sistema consume los lotes más antiguos y registra el costo real de lo que se perdió; cuando las aumenta, el lote que nace toma el costo de la compra más reciente, porque unas unidades que aparecen en un conteo son mercancía que ya se compró.</w:t>
+        <w:t xml:space="preserve">El kardex es de solo lectura para todos los roles, incluido el administrador de la licorera. Ninguna línea se edita ni se borra: un historial que se puede reescribir no sirve para rendir cuentas, y una cifra equivocada </w:t>
+      </w:r>
+      <w:r>
+        <w:lastRenderedPageBreak/>
+        <w:t>se corrige con otro movimiento que diga por qué. Cuando el ajuste reduce las existencias, el sistema consume los lotes más antiguos y registra el costo real de lo que se perdió; cuando las aumenta, el lote que nace toma el costo de la compra más reciente, porque unas unidades que aparecen en un conteo son mercancía que ya se compró.</w:t>
       </w:r>
     </w:p>
     <w:p>
@@ -10512,12 +10891,11 @@
         <w:rPr>
           <w:noProof/>
         </w:rPr>
-        <w:lastRenderedPageBreak/>
         <w:drawing>
-          <wp:inline distT="0" distB="0" distL="0" distR="0" wp14:anchorId="1400334F" wp14:editId="66BD2B66">
+          <wp:inline distT="0" distB="0" distL="0" distR="0" wp14:anchorId="23AD2DDE" wp14:editId="45C57145">
             <wp:extent cx="6096000" cy="4162425"/>
             <wp:effectExtent l="0" t="0" r="0" b="0"/>
-            <wp:docPr id="1036222764" name="Imagen 1036222764"/>
+            <wp:docPr id="1905327973" name="Imagen 1905327973"/>
             <wp:cNvGraphicFramePr>
               <a:graphicFrameLocks xmlns:a="http://schemas.openxmlformats.org/drawingml/2006/main" noChangeAspect="1"/>
             </wp:cNvGraphicFramePr>
@@ -10593,7 +10971,7 @@
         <w:jc w:val="both"/>
       </w:pPr>
       <w:r>
-        <w:t>Es la pantalla de uso más frecuente y la única que se juzga por su rapidez. Se divide en dos zonas: a la izquierda, el buscador con lectura de código de barras, los filtros por categoría y la cuadrícula de productos con su precio y su existencia disponible; a la derecha, la venta en curso con sus líneas, el total, los medios de pago y la acción de cobro, que muestra el valor a cobrar en la propia etiqueta del botón.</w:t>
+        <w:t>Ventas es el primer módulo con tres pantallas del mismo rango —cobrar, consultar lo vendido y cerrar la caja—, y la navegación lateral lleva una entrada por módulo. Las tres se alcanzan desde un grupo de apartados situado sobre el contenido, igual en las tres, que señala en cuál se está. No se sigue el camino del inventario, donde las pantallas que cuelgan del catálogo se abren desde lo que se está mirando —la entrada desde la lista, los movimientos desde la referencia—, porque aquí ninguna de las tres nace de otra.</w:t>
       </w:r>
     </w:p>
     <w:p>
@@ -10602,7 +10980,7 @@
         <w:jc w:val="both"/>
       </w:pPr>
       <w:r>
-        <w:t>La cuadrícula presenta el resultado de la búsqueda, y no el catálogo completo: una licorera con cientos de referencias no se recorre con el ratón mientras un cliente espera. Sin texto escrito muestra las referencias de mayor rotación, que son las que se venden sin buscarlas. Elegir un producto es agregarlo: el cursor regresa al buscador con el texto ya borrado, de modo que la referencia siguiente se escribe sin tocar el ratón, y volver a elegir el mismo producto suma una unidad en lugar de abrir un segundo renglón.</w:t>
+        <w:t>Es la pantalla de uso más frecuente y la única que se juzga por su rapidez. Se divide en dos zonas: a la izquierda, el buscador con lectura de código de barras, los filtros por categoría y la cuadrícula de productos con su precio y su existencia disponible; a la derecha, la venta en curso con sus líneas, el total, los medios de pago y la acción de cobro, que muestra el valor a cobrar en la propia etiqueta del botón.</w:t>
       </w:r>
     </w:p>
     <w:p>
@@ -10611,7 +10989,7 @@
         <w:jc w:val="both"/>
       </w:pPr>
       <w:r>
-        <w:t>Cada línea permite corregir su cantidad o retirarse, porque equivocarse de cantidad es lo más frecuente que ocurre en un mostrador. La cantidad se escribe además de ajustarse con los botones: cien unidades de un mismo producto son cien pulsaciones en un botón y tres teclas en un campo. Ninguna línea admite más unidades de las que hay en existencia, y al llegar al tope la propia línea dice cuántas quedan; la comprobación definitiva la hace el servidor, porque otra caja puede haber vendido mientras tanto, pero avisar aquí evita armar una venta larga para descubrir al cobrar que de la tercera referencia no había suficiente.</w:t>
+        <w:t>La cuadrícula presenta el resultado de la búsqueda, y no el catálogo completo: una licorera con cientos de referencias no se recorre con el ratón mientras un cliente espera. Sin texto escrito muestra las referencias de mayor rotación, que son las que se venden sin buscarlas. Elegir un producto es agregarlo: el cursor regresa al buscador con el texto ya borrado, de modo que la referencia siguiente se escribe sin tocar el ratón, y volver a elegir el mismo producto suma una unidad en lugar de abrir un segundo renglón.</w:t>
       </w:r>
     </w:p>
     <w:p>
@@ -10620,7 +10998,11 @@
         <w:jc w:val="both"/>
       </w:pPr>
       <w:r>
-        <w:t>La venta a medio armar no se pierde al salir de la pantalla. Quien atiende puede necesitar consultar el inventario con el cliente delante, o pulsar otra opción del menú sin querer, y al volver encuentra las mismas líneas; lo contrario obligaría a pedirle al cliente que repitiera su compra. Se conserva en el propio navegador y por cuenta de usuario, de modo que dos personas que se turnan la misma caja no heredan la una el carro de la otra, y se descarta al cobrar.</w:t>
+        <w:t xml:space="preserve">Cada línea permite corregir su cantidad o retirarse, porque equivocarse de cantidad es lo más frecuente que ocurre en un mostrador. La cantidad se escribe además de ajustarse con los botones: cien unidades </w:t>
+      </w:r>
+      <w:r>
+        <w:lastRenderedPageBreak/>
+        <w:t>de un mismo producto son cien pulsaciones en un botón y tres teclas en un campo. Ninguna línea admite más unidades de las que hay en existencia, y al llegar al tope la propia línea dice cuántas quedan; la comprobación definitiva la hace el servidor, porque otra caja puede haber vendido mientras tanto, pero avisar aquí evita armar una venta larga para descubrir al cobrar que de la tercera referencia no había suficiente.</w:t>
       </w:r>
     </w:p>
     <w:p>
@@ -10629,8 +11011,7 @@
         <w:jc w:val="both"/>
       </w:pPr>
       <w:r>
-        <w:lastRenderedPageBreak/>
-        <w:t>El medio de pago se elige antes de cobrar. Cuando es efectivo, la pantalla pide el monto recibido y calcula el cambio, que es la operación que el sistema debe ahorrarle a quien atiende; en los otros dos medios ese campo no aparece, porque no hay cambio que devolver. El cobro en efectivo no se habilita hasta que ese monto está escrito y alcanza el total, y para el pago exacto hay un botón que lo rellena: dejar el botón activo con el campo vacío haría inútil apagarlo cuando el dinero no alcanza, porque bastaría no escribir nada. El número consecutivo de la venta se muestra en la barra superior: es el dato por el que el cliente la nombra si vuelve a reclamar.</w:t>
+        <w:t>La venta a medio armar no se pierde al salir de la pantalla. Quien atiende puede necesitar consultar el inventario con el cliente delante, o pulsar otra opción del menú sin querer, y al volver encuentra las mismas líneas; lo contrario obligaría a pedirle al cliente que repitiera su compra. Se conserva en el propio navegador y por cuenta de usuario, de modo que dos personas que se turnan la misma caja no heredan la una el carro de la otra, y se descarta al cobrar.</w:t>
       </w:r>
     </w:p>
     <w:p>
@@ -10639,6 +11020,24 @@
         <w:jc w:val="both"/>
       </w:pPr>
       <w:r>
+        <w:t>Antes del cobro, la venta admite una nota corta y opcional —«mesa 1, pedido 3»—, porque el negocio no es solo de mostrador y una parte de lo que vende se consume en mesa. Sale en el comprobante y el buscador del historial la encuentra, que es para lo que existe: sirve para reconocer después una venta que el cliente no se llevó en la mano. Es una etiqueta y no un campo de notas, de ahí que sea corta; en una caja que se juzga por su rapidez nadie va a redactar. El modelo entregado no declara esa columna y por eso queda escrita como decisión.</w:t>
+      </w:r>
+    </w:p>
+    <w:p>
+      <w:pPr>
+        <w:spacing w:after="110" w:line="262" w:lineRule="auto"/>
+        <w:jc w:val="both"/>
+      </w:pPr>
+      <w:r>
+        <w:t>El medio de pago se elige antes de cobrar. Cuando es efectivo, la pantalla pide el monto recibido y calcula el cambio, que es la operación que el sistema debe ahorrarle a quien atiende; en los otros dos medios ese campo no aparece, porque no hay cambio que devolver. El cobro en efectivo no se habilita hasta que ese monto está escrito y alcanza el total, y para el pago exacto hay un botón que lo rellena: dejar el botón activo con el campo vacío haría inútil apagarlo cuando el dinero no alcanza, porque bastaría no escribir nada. El número consecutivo de la venta se muestra en la barra superior: es el dato por el que el cliente la nombra si vuelve a reclamar.</w:t>
+      </w:r>
+    </w:p>
+    <w:p>
+      <w:pPr>
+        <w:spacing w:after="110" w:line="262" w:lineRule="auto"/>
+        <w:jc w:val="both"/>
+      </w:pPr>
+      <w:r>
         <w:t>Al confirmar el cobro, el sistema descuenta las existencias consumiendo los lotes más antiguos, registra el costo real de lo despachado y genera el comprobante. Si lo pedido supera lo disponible, la venta se rechaza entera y no se registra nada: una existencia en negativo no significa nada, y en cuanto aparece una deja de poder confiarse en el resto del inventario.</w:t>
       </w:r>
     </w:p>
@@ -10651,11 +11050,12 @@
         <w:rPr>
           <w:noProof/>
         </w:rPr>
+        <w:lastRenderedPageBreak/>
         <w:drawing>
-          <wp:inline distT="0" distB="0" distL="0" distR="0" wp14:anchorId="0236CFC2" wp14:editId="0BCD07F1">
-            <wp:extent cx="6096000" cy="3476625"/>
+          <wp:inline distT="0" distB="0" distL="0" distR="0" wp14:anchorId="429732D1" wp14:editId="3D855218">
+            <wp:extent cx="6096000" cy="4514850"/>
             <wp:effectExtent l="0" t="0" r="0" b="0"/>
-            <wp:docPr id="553530896" name="Imagen 553530896"/>
+            <wp:docPr id="1567734146" name="Imagen 1567734146"/>
             <wp:cNvGraphicFramePr>
               <a:graphicFrameLocks xmlns:a="http://schemas.openxmlformats.org/drawingml/2006/main" noChangeAspect="1"/>
             </wp:cNvGraphicFramePr>
@@ -10678,7 +11078,7 @@
                   <pic:spPr bwMode="auto">
                     <a:xfrm>
                       <a:off x="0" y="0"/>
-                      <a:ext cx="6096000" cy="3476625"/>
+                      <a:ext cx="6096000" cy="4514850"/>
                     </a:xfrm>
                     <a:prstGeom prst="rect">
                       <a:avLst/>
@@ -10713,7 +11113,7 @@
         <w:jc w:val="both"/>
       </w:pPr>
       <w:r>
-        <w:t>El comprobante aparece sobre la misma pantalla al confirmar el cobro y se puede imprimir. Su ancho es el de una impresora térmica y al imprimir se envía solo él, sin el menú ni el resto de la pantalla, de modo que lo que se ve es lo que sale en papel. No es una factura electrónica —eso corresponde al módulo FAC—: es el documento con el que el negocio entrega la compra y con el que el cliente reclama. Junto a la impresión está la acción de empezar una venta nueva, que retira el comprobante y deja la caja lista; sin ella la pantalla se queda con el papel delante y parece que no hubiera por dónde seguir vendiendo. Retirarlo no lo pierde: la misma venta se vuelve a abrir desde el historial, que es de donde sale el papel cuando el cliente lo rechaza y lo pide un minuto después.</w:t>
+        <w:t>El comprobante aparece sobre la misma pantalla al confirmar el cobro y se puede imprimir. Su ancho es el de una impresora térmica y al imprimir se envía solo él, sin el menú ni el resto de la pantalla, de modo que lo que se ve es lo que sale en papel. No es una factura electrónica —eso corresponde al módulo FAC—: es el documento con el que el negocio entrega la compra y con el que el cliente reclama. Junto a la impresión está la acción de empezar una venta nueva, que retira el comprobante y deja la caja lista; sin ella la pantalla se queda con el papel delante y parece que no hubiera por dónde seguir vendiendo. Retirarlo no lo pierde: la misma venta se vuelve a abrir desde el historial —allí en una ventana, porque a una venta entre muchas se llega buscándola y dejar el papel al pie de la tabla obligaría a desplazarse para encontrarlo y otra vez para seguir—, y de ahí sale el comprobante cuando el cliente lo rechaza y lo pide un minuto después.</w:t>
       </w:r>
     </w:p>
     <w:p>
@@ -10726,10 +11126,10 @@
           <w:noProof/>
         </w:rPr>
         <w:drawing>
-          <wp:inline distT="0" distB="0" distL="0" distR="0" wp14:anchorId="53B66073" wp14:editId="169EF995">
-            <wp:extent cx="4000500" cy="1362075"/>
+          <wp:inline distT="0" distB="0" distL="0" distR="0" wp14:anchorId="3EAB3836" wp14:editId="4998531F">
+            <wp:extent cx="4000500" cy="1438275"/>
             <wp:effectExtent l="0" t="0" r="0" b="0"/>
-            <wp:docPr id="1663361862" name="Imagen 1663361862"/>
+            <wp:docPr id="366070994" name="Imagen 366070994"/>
             <wp:cNvGraphicFramePr>
               <a:graphicFrameLocks xmlns:a="http://schemas.openxmlformats.org/drawingml/2006/main" noChangeAspect="1"/>
             </wp:cNvGraphicFramePr>
@@ -10752,7 +11152,7 @@
                   <pic:spPr bwMode="auto">
                     <a:xfrm>
                       <a:off x="0" y="0"/>
-                      <a:ext cx="4000500" cy="1362075"/>
+                      <a:ext cx="4000500" cy="1438275"/>
                     </a:xfrm>
                     <a:prstGeom prst="rect">
                       <a:avLst/>
@@ -10778,7 +11178,6 @@
           <w:sz w:val="18"/>
           <w:szCs w:val="18"/>
         </w:rPr>
-        <w:lastRenderedPageBreak/>
         <w:t>Figura 17. Comprobante de venta. Fuente: del autor.</w:t>
       </w:r>
     </w:p>
@@ -10806,7 +11205,8 @@
         <w:jc w:val="both"/>
       </w:pPr>
       <w:r>
-        <w:t>Reúne la consulta de lo vendido y la única corrección que el sistema admite sobre una venta. Sobre la tabla se ubican el buscador por número de venta o producto, los filtros por vendedor y por medio de pago, y el rango de fechas; encima, tres indicadores del período: lo vendido, lo anulado y el valor promedio de cada transacción.</w:t>
+        <w:lastRenderedPageBreak/>
+        <w:t>Reúne la consulta de lo vendido y la única corrección que el sistema admite sobre una venta. Sobre la tabla se ubican el buscador por número de venta o producto, los filtros por vendedor y por medio de pago, y el rango de fechas; encima, tres indicadores del período: lo vendido, lo anulado y el valor promedio de cada transacción. Las tres cifras hablan del período filtrado y no de la página que se está viendo, y llegan en la misma respuesta que las filas: calcularlas aparte admitiría que la tabla y los indicadores vinieran de dos momentos distintos y no concordaran.</w:t>
       </w:r>
     </w:p>
     <w:p>
@@ -10815,7 +11215,7 @@
         <w:jc w:val="both"/>
       </w:pPr>
       <w:r>
-        <w:t>La tabla presenta el consecutivo, la fecha, quién vendió, el medio de pago, el total y el estado. Las ventas anuladas no desaparecen: se muestran marcadas y con el motivo a la vista, porque una venta que se borra deja un hueco en la numeración que nadie puede explicar después.</w:t>
+        <w:t>La tabla presenta el consecutivo —con la nota de la venta debajo, si la lleva—, la fecha, quién vendió, el medio de pago, el total y el estado. Las ventas anuladas no desaparecen: se muestran marcadas, con el motivo y con quién las anuló a la vista, porque una venta que se borra deja un hueco en la numeración que nadie puede explicar después. Quién la anuló y cuándo se guardan en la propia venta y no se deducen de quién la cobró: anular es del administrador y cobrar es del vendedor, de modo que son dos personas y dos momentos.</w:t>
       </w:r>
     </w:p>
     <w:p>
@@ -10833,7 +11233,16 @@
         <w:jc w:val="both"/>
       </w:pPr>
       <w:r>
-        <w:t>La acción de anular se ofrece únicamente sobre las ventas del día y únicamente a quien administra la licorera. Lo primero, porque una venta de días anteriores ya entró en un cierre de caja cuadrado y deshacerla descuadraría un día cerrado; lo segundo, porque quien cobra no debería poder deshacer su propio cobro. Se pide el motivo, y al confirmarla cada unidad vuelve al lote del que salió, con lo que el inventario y su valoración quedan como estaban antes de la venta.</w:t>
+        <w:t>La pantalla es de los dos roles del negocio. Quien vende necesita alcanzar una venta para volver a imprimir su comprobante, que es lo que ocurre cuando el cliente rechaza el papel y lo pide un minuto después; lo único que no se le ofrece es el filtro por vendedor, porque la lista de cuentas de la licorera es del administrador. Si una venta admite anulación lo responde el servidor en cada fila, y no lo calcula la pantalla: la jornada empieza a las seis de la mañana, y escribir esa hora también aquí la dejaría en dos sitios que pueden dejar de coincidir.</w:t>
+      </w:r>
+    </w:p>
+    <w:p>
+      <w:pPr>
+        <w:spacing w:after="110" w:line="262" w:lineRule="auto"/>
+        <w:jc w:val="both"/>
+      </w:pPr>
+      <w:r>
+        <w:t>La acción de anular se ofrece únicamente sobre las ventas del día y únicamente a quien administra la licorera. Lo primero, porque una venta de días anteriores ya entró en un cierre de caja cuadrado y deshacerla descuadraría un día cerrado; lo segundo, porque quien cobra no debería poder deshacer su propio cobro. Se pide el motivo, y al confirmarla cada unidad vuelve al lote del que salió, con lo que el inventario y su valoración quedan como estaban antes de la venta. Al confirmarla también sale un correo a quienes administran la licorera, con el número, el monto, el motivo y quién la hizo. Hace falta porque una anulación **no deja rastro en el cierre de caja**: lo anulado no cuenta como dinero, de modo que si el efectivo se devolvió al cliente el cajón cuadra igual —y también cuadra, al céntimo, si quien anuló se quedó con él—. El cierre no puede detectarla y el historial solo la enseña a quien va a buscarla; el correo es el único sitio donde una anulación sale a buscar a quien debe juzgarla.</w:t>
       </w:r>
     </w:p>
     <w:p>
@@ -10845,11 +11254,12 @@
         <w:rPr>
           <w:noProof/>
         </w:rPr>
+        <w:lastRenderedPageBreak/>
         <w:drawing>
-          <wp:inline distT="0" distB="0" distL="0" distR="0" wp14:anchorId="6BD97D34" wp14:editId="11A516F3">
-            <wp:extent cx="6096000" cy="5314950"/>
+          <wp:inline distT="0" distB="0" distL="0" distR="0" wp14:anchorId="73B9AE7D" wp14:editId="3567F6A2">
+            <wp:extent cx="6096000" cy="7010400"/>
             <wp:effectExtent l="0" t="0" r="0" b="0"/>
-            <wp:docPr id="950320343" name="Imagen 950320343"/>
+            <wp:docPr id="731971444" name="Imagen 731971444"/>
             <wp:cNvGraphicFramePr>
               <a:graphicFrameLocks xmlns:a="http://schemas.openxmlformats.org/drawingml/2006/main" noChangeAspect="1"/>
             </wp:cNvGraphicFramePr>
@@ -10872,7 +11282,7 @@
                   <pic:spPr bwMode="auto">
                     <a:xfrm>
                       <a:off x="0" y="0"/>
-                      <a:ext cx="6096000" cy="5314950"/>
+                      <a:ext cx="6096000" cy="7010400"/>
                     </a:xfrm>
                     <a:prstGeom prst="rect">
                       <a:avLst/>
@@ -10898,7 +11308,6 @@
           <w:sz w:val="18"/>
           <w:szCs w:val="18"/>
         </w:rPr>
-        <w:lastRenderedPageBreak/>
         <w:t>Figura 18. Ventas: historial y anulación. Fuente: del autor.</w:t>
       </w:r>
     </w:p>
@@ -10935,7 +11344,11 @@
         <w:jc w:val="both"/>
       </w:pPr>
       <w:r>
-        <w:t>La jornada no es el día del calendario: empieza a las seis de la mañana y termina a las seis de la mañana siguiente, y la pantalla lo dice en su cabecera. Una licorera vende de noche, de modo que un corte a medianoche partiría en dos una sola noche de trabajo. El problema no sería dónde cae cada venta, sino que el cajón no se vacía a las doce: el efectivo contado a las dos de la madrugada corresponde a las dos horas recién pasadas y a toda la noche anterior, y repartirlo entre dos cierres produciría un descuadre que nadie cometió. Con la jornada, lo vendido de madrugada se cierra junto con la noche en la que se vendió.</w:t>
+        <w:t xml:space="preserve">La jornada no es el día del calendario: empieza a las seis de la mañana y termina a las seis de la mañana siguiente, y la pantalla lo dice en su cabecera. Una licorera vende de noche, de modo que un corte a medianoche partiría en dos una sola noche de trabajo. El problema no sería dónde cae cada venta, sino </w:t>
+      </w:r>
+      <w:r>
+        <w:lastRenderedPageBreak/>
+        <w:t>que el cajón no se vacía a las doce: el efectivo contado a las dos de la madrugada corresponde a las dos horas recién pasadas y a toda la noche anterior, y repartirlo entre dos cierres produciría un descuadre que nadie cometió. Con la jornada, lo vendido de madrugada se cierra junto con la noche en la que se vendió.</w:t>
       </w:r>
     </w:p>
     <w:p>
@@ -10971,7 +11384,7 @@
         <w:jc w:val="both"/>
       </w:pPr>
       <w:r>
-        <w:t>La explicación se puede escribir en el momento del cierre o más tarde desde el historial, porque es una nota y no una cifra: editarla no mueve ningún total ni ninguna diferencia.</w:t>
+        <w:t>La explicación se puede escribir en el momento del cierre o más tarde, desde el aviso que el panel mantiene a la vista, porque es una nota y no una cifra: editarla no mueve ningún total ni ninguna diferencia. Escribirla después queda reservado a quien administra la licorera, por lo mismo que la anulación: quien cierra suele ser quien vende, y el aviso que señala su propio faltante no debería poder apagarlo él.</w:t>
       </w:r>
     </w:p>
     <w:p>
@@ -10984,10 +11397,10 @@
           <w:noProof/>
         </w:rPr>
         <w:drawing>
-          <wp:inline distT="0" distB="0" distL="0" distR="0" wp14:anchorId="056E20DA" wp14:editId="6CEF03FD">
-            <wp:extent cx="6096000" cy="3343275"/>
+          <wp:inline distT="0" distB="0" distL="0" distR="0" wp14:anchorId="706D7D30" wp14:editId="3368A08F">
+            <wp:extent cx="6096000" cy="3724275"/>
             <wp:effectExtent l="0" t="0" r="0" b="0"/>
-            <wp:docPr id="1967523915" name="Imagen 1967523915"/>
+            <wp:docPr id="1459794242" name="Imagen 1459794242"/>
             <wp:cNvGraphicFramePr>
               <a:graphicFrameLocks xmlns:a="http://schemas.openxmlformats.org/drawingml/2006/main" noChangeAspect="1"/>
             </wp:cNvGraphicFramePr>
@@ -11010,7 +11423,7 @@
                   <pic:spPr bwMode="auto">
                     <a:xfrm>
                       <a:off x="0" y="0"/>
-                      <a:ext cx="6096000" cy="3343275"/>
+                      <a:ext cx="6096000" cy="3724275"/>
                     </a:xfrm>
                     <a:prstGeom prst="rect">
                       <a:avLst/>
@@ -11036,7 +11449,6 @@
           <w:sz w:val="18"/>
           <w:szCs w:val="18"/>
         </w:rPr>
-        <w:lastRenderedPageBreak/>
         <w:t>Figura 19. Cierre de caja. Fuente: del autor.</w:t>
       </w:r>
     </w:p>
@@ -11064,7 +11476,11 @@
         <w:jc w:val="both"/>
       </w:pPr>
       <w:r>
-        <w:t>Presenta los resultados del periodo seleccionado, que se indica en la barra superior junto a la acción de exportación. En la parte alta se ubican los indicadores del mes —ventas y utilidad— y debajo, el comportamiento de las ventas por día y el listado de productos más vendidos con las unidades despachadas. La utilidad se calcula con el costo histórico de los lotes consumidos, no con el costo actual del producto.</w:t>
+        <w:t xml:space="preserve">Presenta los resultados del periodo seleccionado, que se indica en la barra superior junto a la acción de exportación. En la parte alta se ubican los indicadores del mes —ventas y utilidad— y debajo, el </w:t>
+      </w:r>
+      <w:r>
+        <w:lastRenderedPageBreak/>
+        <w:t>comportamiento de las ventas por día y el listado de productos más vendidos con las unidades despachadas. La utilidad se calcula con el costo histórico de los lotes consumidos, no con el costo actual del producto.</w:t>
       </w:r>
     </w:p>
     <w:p>
@@ -11077,10 +11493,10 @@
           <w:noProof/>
         </w:rPr>
         <w:drawing>
-          <wp:inline distT="0" distB="0" distL="0" distR="0" wp14:anchorId="2878F4FA" wp14:editId="435ADC3C">
+          <wp:inline distT="0" distB="0" distL="0" distR="0" wp14:anchorId="4FE46D2F" wp14:editId="093D78BF">
             <wp:extent cx="6096000" cy="2857500"/>
             <wp:effectExtent l="0" t="0" r="0" b="0"/>
-            <wp:docPr id="388138197" name="Imagen 388138197"/>
+            <wp:docPr id="2146509367" name="Imagen 2146509367"/>
             <wp:cNvGraphicFramePr>
               <a:graphicFrameLocks xmlns:a="http://schemas.openxmlformats.org/drawingml/2006/main" noChangeAspect="1"/>
             </wp:cNvGraphicFramePr>
@@ -11197,10 +11613,10 @@
         </w:rPr>
         <w:lastRenderedPageBreak/>
         <w:drawing>
-          <wp:inline distT="0" distB="0" distL="0" distR="0" wp14:anchorId="0FBFB33B" wp14:editId="484B9235">
+          <wp:inline distT="0" distB="0" distL="0" distR="0" wp14:anchorId="164DF49B" wp14:editId="47ADA125">
             <wp:extent cx="6096000" cy="2857500"/>
             <wp:effectExtent l="0" t="0" r="0" b="0"/>
-            <wp:docPr id="344638626" name="Imagen 344638626"/>
+            <wp:docPr id="1966653712" name="Imagen 1966653712"/>
             <wp:cNvGraphicFramePr>
               <a:graphicFrameLocks xmlns:a="http://schemas.openxmlformats.org/drawingml/2006/main" noChangeAspect="1"/>
             </wp:cNvGraphicFramePr>
@@ -11308,10 +11724,10 @@
         </w:rPr>
         <w:lastRenderedPageBreak/>
         <w:drawing>
-          <wp:inline distT="0" distB="0" distL="0" distR="0" wp14:anchorId="1634E8CD" wp14:editId="06D3C962">
+          <wp:inline distT="0" distB="0" distL="0" distR="0" wp14:anchorId="6B0BE32D" wp14:editId="42173447">
             <wp:extent cx="6096000" cy="3562350"/>
             <wp:effectExtent l="0" t="0" r="0" b="0"/>
-            <wp:docPr id="1895840258" name="Imagen 1895840258"/>
+            <wp:docPr id="1498058167" name="Imagen 1498058167"/>
             <wp:cNvGraphicFramePr>
               <a:graphicFrameLocks xmlns:a="http://schemas.openxmlformats.org/drawingml/2006/main" noChangeAspect="1"/>
             </wp:cNvGraphicFramePr>
@@ -11419,10 +11835,10 @@
         </w:rPr>
         <w:lastRenderedPageBreak/>
         <w:drawing>
-          <wp:inline distT="0" distB="0" distL="0" distR="0" wp14:anchorId="05E15DF7" wp14:editId="31DE8A66">
+          <wp:inline distT="0" distB="0" distL="0" distR="0" wp14:anchorId="0F3D563F" wp14:editId="3F22692E">
             <wp:extent cx="6096000" cy="3067050"/>
             <wp:effectExtent l="0" t="0" r="0" b="0"/>
-            <wp:docPr id="1804840021" name="Imagen 1804840021"/>
+            <wp:docPr id="250480836" name="Imagen 250480836"/>
             <wp:cNvGraphicFramePr>
               <a:graphicFrameLocks xmlns:a="http://schemas.openxmlformats.org/drawingml/2006/main" noChangeAspect="1"/>
             </wp:cNvGraphicFramePr>
@@ -11539,10 +11955,10 @@
         </w:rPr>
         <w:lastRenderedPageBreak/>
         <w:drawing>
-          <wp:inline distT="0" distB="0" distL="0" distR="0" wp14:anchorId="41703156" wp14:editId="0821989F">
+          <wp:inline distT="0" distB="0" distL="0" distR="0" wp14:anchorId="2629EFB1" wp14:editId="31DD14F2">
             <wp:extent cx="6096000" cy="4114800"/>
             <wp:effectExtent l="0" t="0" r="0" b="0"/>
-            <wp:docPr id="1539645140" name="Imagen 1539645140"/>
+            <wp:docPr id="328952219" name="Imagen 328952219"/>
             <wp:cNvGraphicFramePr>
               <a:graphicFrameLocks xmlns:a="http://schemas.openxmlformats.org/drawingml/2006/main" noChangeAspect="1"/>
             </wp:cNvGraphicFramePr>
@@ -11633,10 +12049,10 @@
           <w:noProof/>
         </w:rPr>
         <w:drawing>
-          <wp:inline distT="0" distB="0" distL="0" distR="0" wp14:anchorId="0BE8C037" wp14:editId="7B22B726">
+          <wp:inline distT="0" distB="0" distL="0" distR="0" wp14:anchorId="097951DF" wp14:editId="0E469635">
             <wp:extent cx="6096000" cy="2733675"/>
             <wp:effectExtent l="0" t="0" r="0" b="0"/>
-            <wp:docPr id="266935628" name="Imagen 266935628"/>
+            <wp:docPr id="169264922" name="Imagen 169264922"/>
             <wp:cNvGraphicFramePr>
               <a:graphicFrameLocks xmlns:a="http://schemas.openxmlformats.org/drawingml/2006/main" noChangeAspect="1"/>
             </wp:cNvGraphicFramePr>
@@ -11722,7 +12138,7 @@
           <w:left w:w="10" w:type="dxa"/>
           <w:right w:w="10" w:type="dxa"/>
         </w:tblCellMar>
-        <w:tblLook w:val="04A0" w:firstRow="1" w:lastRow="0" w:firstColumn="1" w:lastColumn="0" w:noHBand="0" w:noVBand="1"/>
+        <w:tblLook w:val="0000" w:firstRow="0" w:lastRow="0" w:firstColumn="0" w:lastColumn="0" w:noHBand="0" w:noVBand="0"/>
       </w:tblPr>
       <w:tblGrid>
         <w:gridCol w:w="1700"/>
@@ -11730,6 +12146,12 @@
         <w:gridCol w:w="4460"/>
       </w:tblGrid>
       <w:tr>
+        <w:tblPrEx>
+          <w:tblCellMar>
+            <w:top w:w="0" w:type="dxa"/>
+            <w:bottom w:w="0" w:type="dxa"/>
+          </w:tblCellMar>
+        </w:tblPrEx>
         <w:trPr>
           <w:tblHeader/>
         </w:trPr>
@@ -11816,6 +12238,12 @@
         </w:tc>
       </w:tr>
       <w:tr>
+        <w:tblPrEx>
+          <w:tblCellMar>
+            <w:top w:w="0" w:type="dxa"/>
+            <w:bottom w:w="0" w:type="dxa"/>
+          </w:tblCellMar>
+        </w:tblPrEx>
         <w:tc>
           <w:tcPr>
             <w:tcW w:w="1700" w:type="dxa"/>
@@ -11890,6 +12318,12 @@
         </w:tc>
       </w:tr>
       <w:tr>
+        <w:tblPrEx>
+          <w:tblCellMar>
+            <w:top w:w="0" w:type="dxa"/>
+            <w:bottom w:w="0" w:type="dxa"/>
+          </w:tblCellMar>
+        </w:tblPrEx>
         <w:tc>
           <w:tcPr>
             <w:tcW w:w="1700" w:type="dxa"/>
@@ -11964,6 +12398,12 @@
         </w:tc>
       </w:tr>
       <w:tr>
+        <w:tblPrEx>
+          <w:tblCellMar>
+            <w:top w:w="0" w:type="dxa"/>
+            <w:bottom w:w="0" w:type="dxa"/>
+          </w:tblCellMar>
+        </w:tblPrEx>
         <w:tc>
           <w:tcPr>
             <w:tcW w:w="1700" w:type="dxa"/>
@@ -12038,6 +12478,12 @@
         </w:tc>
       </w:tr>
       <w:tr>
+        <w:tblPrEx>
+          <w:tblCellMar>
+            <w:top w:w="0" w:type="dxa"/>
+            <w:bottom w:w="0" w:type="dxa"/>
+          </w:tblCellMar>
+        </w:tblPrEx>
         <w:tc>
           <w:tcPr>
             <w:tcW w:w="1700" w:type="dxa"/>
@@ -12112,6 +12558,12 @@
         </w:tc>
       </w:tr>
       <w:tr>
+        <w:tblPrEx>
+          <w:tblCellMar>
+            <w:top w:w="0" w:type="dxa"/>
+            <w:bottom w:w="0" w:type="dxa"/>
+          </w:tblCellMar>
+        </w:tblPrEx>
         <w:tc>
           <w:tcPr>
             <w:tcW w:w="1700" w:type="dxa"/>
@@ -12186,6 +12638,12 @@
         </w:tc>
       </w:tr>
       <w:tr>
+        <w:tblPrEx>
+          <w:tblCellMar>
+            <w:top w:w="0" w:type="dxa"/>
+            <w:bottom w:w="0" w:type="dxa"/>
+          </w:tblCellMar>
+        </w:tblPrEx>
         <w:tc>
           <w:tcPr>
             <w:tcW w:w="1700" w:type="dxa"/>
@@ -12467,10 +12925,10 @@
           <w:noProof/>
         </w:rPr>
         <w:drawing>
-          <wp:inline distT="0" distB="0" distL="0" distR="0" wp14:anchorId="7DD91D58" wp14:editId="0D47B295">
+          <wp:inline distT="0" distB="0" distL="0" distR="0" wp14:anchorId="44FD1997" wp14:editId="3CCB8162">
             <wp:extent cx="6096000" cy="3295650"/>
             <wp:effectExtent l="0" t="0" r="0" b="0"/>
-            <wp:docPr id="1505843068" name="Imagen 1505843068"/>
+            <wp:docPr id="34769661" name="Imagen 34769661"/>
             <wp:cNvGraphicFramePr>
               <a:graphicFrameLocks xmlns:a="http://schemas.openxmlformats.org/drawingml/2006/main" noChangeAspect="1"/>
             </wp:cNvGraphicFramePr>
@@ -12590,10 +13048,10 @@
           <w:noProof/>
         </w:rPr>
         <w:drawing>
-          <wp:inline distT="0" distB="0" distL="0" distR="0" wp14:anchorId="129AAA1D" wp14:editId="527CE5EA">
+          <wp:inline distT="0" distB="0" distL="0" distR="0" wp14:anchorId="662F6A09" wp14:editId="4403C884">
             <wp:extent cx="6096000" cy="3067050"/>
             <wp:effectExtent l="0" t="0" r="0" b="0"/>
-            <wp:docPr id="719771840" name="Imagen 719771840"/>
+            <wp:docPr id="1452175404" name="Imagen 1452175404"/>
             <wp:cNvGraphicFramePr>
               <a:graphicFrameLocks xmlns:a="http://schemas.openxmlformats.org/drawingml/2006/main" noChangeAspect="1"/>
             </wp:cNvGraphicFramePr>
@@ -12719,13 +13177,19 @@
           <w:left w:w="10" w:type="dxa"/>
           <w:right w:w="10" w:type="dxa"/>
         </w:tblCellMar>
-        <w:tblLook w:val="04A0" w:firstRow="1" w:lastRow="0" w:firstColumn="1" w:lastColumn="0" w:noHBand="0" w:noVBand="1"/>
+        <w:tblLook w:val="0000" w:firstRow="0" w:lastRow="0" w:firstColumn="0" w:lastColumn="0" w:noHBand="0" w:noVBand="0"/>
       </w:tblPr>
       <w:tblGrid>
         <w:gridCol w:w="2100"/>
         <w:gridCol w:w="7260"/>
       </w:tblGrid>
       <w:tr>
+        <w:tblPrEx>
+          <w:tblCellMar>
+            <w:top w:w="0" w:type="dxa"/>
+            <w:bottom w:w="0" w:type="dxa"/>
+          </w:tblCellMar>
+        </w:tblPrEx>
         <w:trPr>
           <w:tblHeader/>
         </w:trPr>
@@ -12785,6 +13249,12 @@
         </w:tc>
       </w:tr>
       <w:tr>
+        <w:tblPrEx>
+          <w:tblCellMar>
+            <w:top w:w="0" w:type="dxa"/>
+            <w:bottom w:w="0" w:type="dxa"/>
+          </w:tblCellMar>
+        </w:tblPrEx>
         <w:tc>
           <w:tcPr>
             <w:tcW w:w="2100" w:type="dxa"/>
@@ -12835,6 +13305,12 @@
         </w:tc>
       </w:tr>
       <w:tr>
+        <w:tblPrEx>
+          <w:tblCellMar>
+            <w:top w:w="0" w:type="dxa"/>
+            <w:bottom w:w="0" w:type="dxa"/>
+          </w:tblCellMar>
+        </w:tblPrEx>
         <w:tc>
           <w:tcPr>
             <w:tcW w:w="2100" w:type="dxa"/>
@@ -12885,6 +13361,12 @@
         </w:tc>
       </w:tr>
       <w:tr>
+        <w:tblPrEx>
+          <w:tblCellMar>
+            <w:top w:w="0" w:type="dxa"/>
+            <w:bottom w:w="0" w:type="dxa"/>
+          </w:tblCellMar>
+        </w:tblPrEx>
         <w:tc>
           <w:tcPr>
             <w:tcW w:w="2100" w:type="dxa"/>
@@ -12935,6 +13417,12 @@
         </w:tc>
       </w:tr>
       <w:tr>
+        <w:tblPrEx>
+          <w:tblCellMar>
+            <w:top w:w="0" w:type="dxa"/>
+            <w:bottom w:w="0" w:type="dxa"/>
+          </w:tblCellMar>
+        </w:tblPrEx>
         <w:tc>
           <w:tcPr>
             <w:tcW w:w="2100" w:type="dxa"/>
@@ -12985,6 +13473,12 @@
         </w:tc>
       </w:tr>
       <w:tr>
+        <w:tblPrEx>
+          <w:tblCellMar>
+            <w:top w:w="0" w:type="dxa"/>
+            <w:bottom w:w="0" w:type="dxa"/>
+          </w:tblCellMar>
+        </w:tblPrEx>
         <w:tc>
           <w:tcPr>
             <w:tcW w:w="2100" w:type="dxa"/>
@@ -13035,6 +13529,12 @@
         </w:tc>
       </w:tr>
       <w:tr>
+        <w:tblPrEx>
+          <w:tblCellMar>
+            <w:top w:w="0" w:type="dxa"/>
+            <w:bottom w:w="0" w:type="dxa"/>
+          </w:tblCellMar>
+        </w:tblPrEx>
         <w:tc>
           <w:tcPr>
             <w:tcW w:w="2100" w:type="dxa"/>
@@ -13085,6 +13585,12 @@
         </w:tc>
       </w:tr>
       <w:tr>
+        <w:tblPrEx>
+          <w:tblCellMar>
+            <w:top w:w="0" w:type="dxa"/>
+            <w:bottom w:w="0" w:type="dxa"/>
+          </w:tblCellMar>
+        </w:tblPrEx>
         <w:tc>
           <w:tcPr>
             <w:tcW w:w="2100" w:type="dxa"/>
@@ -13135,6 +13641,12 @@
         </w:tc>
       </w:tr>
       <w:tr>
+        <w:tblPrEx>
+          <w:tblCellMar>
+            <w:top w:w="0" w:type="dxa"/>
+            <w:bottom w:w="0" w:type="dxa"/>
+          </w:tblCellMar>
+        </w:tblPrEx>
         <w:tc>
           <w:tcPr>
             <w:tcW w:w="2100" w:type="dxa"/>
@@ -13185,6 +13697,12 @@
         </w:tc>
       </w:tr>
       <w:tr>
+        <w:tblPrEx>
+          <w:tblCellMar>
+            <w:top w:w="0" w:type="dxa"/>
+            <w:bottom w:w="0" w:type="dxa"/>
+          </w:tblCellMar>
+        </w:tblPrEx>
         <w:tc>
           <w:tcPr>
             <w:tcW w:w="2100" w:type="dxa"/>
@@ -13235,6 +13753,12 @@
         </w:tc>
       </w:tr>
       <w:tr>
+        <w:tblPrEx>
+          <w:tblCellMar>
+            <w:top w:w="0" w:type="dxa"/>
+            <w:bottom w:w="0" w:type="dxa"/>
+          </w:tblCellMar>
+        </w:tblPrEx>
         <w:tc>
           <w:tcPr>
             <w:tcW w:w="2100" w:type="dxa"/>
@@ -13285,6 +13809,12 @@
         </w:tc>
       </w:tr>
       <w:tr>
+        <w:tblPrEx>
+          <w:tblCellMar>
+            <w:top w:w="0" w:type="dxa"/>
+            <w:bottom w:w="0" w:type="dxa"/>
+          </w:tblCellMar>
+        </w:tblPrEx>
         <w:tc>
           <w:tcPr>
             <w:tcW w:w="2100" w:type="dxa"/>
@@ -13335,6 +13865,12 @@
         </w:tc>
       </w:tr>
       <w:tr>
+        <w:tblPrEx>
+          <w:tblCellMar>
+            <w:top w:w="0" w:type="dxa"/>
+            <w:bottom w:w="0" w:type="dxa"/>
+          </w:tblCellMar>
+        </w:tblPrEx>
         <w:tc>
           <w:tcPr>
             <w:tcW w:w="2100" w:type="dxa"/>
@@ -13385,6 +13921,12 @@
         </w:tc>
       </w:tr>
       <w:tr>
+        <w:tblPrEx>
+          <w:tblCellMar>
+            <w:top w:w="0" w:type="dxa"/>
+            <w:bottom w:w="0" w:type="dxa"/>
+          </w:tblCellMar>
+        </w:tblPrEx>
         <w:tc>
           <w:tcPr>
             <w:tcW w:w="2100" w:type="dxa"/>
@@ -13535,13 +14077,7 @@
         <w:spacing w:after="60" w:line="258" w:lineRule="auto"/>
       </w:pPr>
       <w:r>
-        <w:rPr>
-          <w:lang w:val="en-US"/>
-        </w:rPr>
-        <w:t xml:space="preserve">World Wide Web Consortium. Web Content Accessibility Guidelines (WCAG) 2.1. </w:t>
-      </w:r>
-      <w:r>
-        <w:t>W3C, 2018.</w:t>
+        <w:t>World Wide Web Consortium. Web Content Accessibility Guidelines (WCAG) 2.1. W3C, 2018.</w:t>
       </w:r>
     </w:p>
     <w:p>
@@ -13681,10 +14217,10 @@
 <file path=word/numbering.xml><?xml version="1.0" encoding="utf-8"?>
 <w:numbering xmlns:wpc="http://schemas.microsoft.com/office/word/2010/wordprocessingCanvas" xmlns:cx="http://schemas.microsoft.com/office/drawing/2014/chartex" xmlns:cx1="http://schemas.microsoft.com/office/drawing/2015/9/8/chartex" xmlns:cx2="http://schemas.microsoft.com/office/drawing/2015/10/21/chartex" xmlns:cx3="http://schemas.microsoft.com/office/drawing/2016/5/9/chartex" xmlns:cx4="http://schemas.microsoft.com/office/drawing/2016/5/10/chartex" xmlns:cx5="http://schemas.microsoft.com/office/drawing/2016/5/11/chartex" xmlns:cx6="http://schemas.microsoft.com/office/drawing/2016/5/12/chartex" xmlns:cx7="http://schemas.microsoft.com/office/drawing/2016/5/13/chartex" xmlns:cx8="http://schemas.microsoft.com/office/drawing/2016/5/14/chartex" xmlns:mc="http://schemas.openxmlformats.org/markup-compatibility/2006" xmlns:aink="http://schemas.microsoft.com/office/drawing/2016/ink" xmlns:am3d="http://schemas.microsoft.com/office/drawing/2017/model3d" xmlns:o="urn:schemas-microsoft-com:office:office" xmlns:oel="http://schemas.microsoft.com/office/2019/extlst" xmlns:r="http://schemas.openxmlformats.org/officeDocument/2006/relationships" xmlns:m="http://schemas.openxmlformats.org/officeDocument/2006/math" xmlns:v="urn:schemas-microsoft-com:vml" xmlns:wp14="http://schemas.microsoft.com/office/word/2010/wordprocessingDrawing" xmlns:wp="http://schemas.openxmlformats.org/drawingml/2006/wordprocessingDrawing" xmlns:w10="urn:schemas-microsoft-com:office:word" xmlns:w="http://schemas.openxmlformats.org/wordprocessingml/2006/main" xmlns:w14="http://schemas.microsoft.com/office/word/2010/wordml" xmlns:w15="http://schemas.microsoft.com/office/word/2012/wordml" xmlns:w16cex="http://schemas.microsoft.com/office/word/2018/wordml/cex" xmlns:w16cid="http://schemas.microsoft.com/office/word/2016/wordml/cid" xmlns:w16="http://schemas.microsoft.com/office/word/2018/wordml" xmlns:w16du="http://schemas.microsoft.com/office/word/2023/wordml/word16du" xmlns:w16sdtdh="http://schemas.microsoft.com/office/word/2020/wordml/sdtdatahash" xmlns:w16sdtfl="http://schemas.microsoft.com/office/word/2024/wordml/sdtformatlock" xmlns:w16se="http://schemas.microsoft.com/office/word/2015/wordml/symex" xmlns:wpg="http://schemas.microsoft.com/office/word/2010/wordprocessingGroup" xmlns:wpi="http://schemas.microsoft.com/office/word/2010/wordprocessingInk" xmlns:wne="http://schemas.microsoft.com/office/word/2006/wordml" xmlns:wps="http://schemas.microsoft.com/office/word/2010/wordprocessingShape" mc:Ignorable="w14 w15 w16se w16cid w16 w16cex w16sdtdh w16sdtfl w16du wp14">
   <w:abstractNum w:abstractNumId="0" w15:restartNumberingAfterBreak="0">
-    <w:nsid w:val="43944D3B"/>
+    <w:nsid w:val="0748083A"/>
     <w:multiLevelType w:val="hybridMultilevel"/>
-    <w:tmpl w:val="C8B4500C"/>
-    <w:lvl w:ilvl="0" w:tplc="362EDD4A">
+    <w:tmpl w:val="C2B89234"/>
+    <w:lvl w:ilvl="0" w:tplc="71D8CDCE">
       <w:start w:val="1"/>
       <w:numFmt w:val="bullet"/>
       <w:lvlText w:val="●"/>
@@ -13693,7 +14229,7 @@
         <w:ind w:left="720" w:hanging="360"/>
       </w:pPr>
     </w:lvl>
-    <w:lvl w:ilvl="1" w:tplc="15D84DB2">
+    <w:lvl w:ilvl="1" w:tplc="DBC0FFFA">
       <w:start w:val="1"/>
       <w:numFmt w:val="bullet"/>
       <w:lvlText w:val="○"/>
@@ -13702,7 +14238,7 @@
         <w:ind w:left="1440" w:hanging="360"/>
       </w:pPr>
     </w:lvl>
-    <w:lvl w:ilvl="2" w:tplc="F3383E66">
+    <w:lvl w:ilvl="2" w:tplc="E4B8F4B4">
       <w:start w:val="1"/>
       <w:numFmt w:val="bullet"/>
       <w:lvlText w:val="■"/>
@@ -13711,7 +14247,7 @@
         <w:ind w:left="2160" w:hanging="360"/>
       </w:pPr>
     </w:lvl>
-    <w:lvl w:ilvl="3" w:tplc="3B8A6638">
+    <w:lvl w:ilvl="3" w:tplc="600AFCFE">
       <w:start w:val="1"/>
       <w:numFmt w:val="bullet"/>
       <w:lvlText w:val="●"/>
@@ -13720,7 +14256,7 @@
         <w:ind w:left="2880" w:hanging="360"/>
       </w:pPr>
     </w:lvl>
-    <w:lvl w:ilvl="4" w:tplc="E4760350">
+    <w:lvl w:ilvl="4" w:tplc="296A0B04">
       <w:start w:val="1"/>
       <w:numFmt w:val="bullet"/>
       <w:lvlText w:val="○"/>
@@ -13729,7 +14265,7 @@
         <w:ind w:left="3600" w:hanging="360"/>
       </w:pPr>
     </w:lvl>
-    <w:lvl w:ilvl="5" w:tplc="8AF0AC1A">
+    <w:lvl w:ilvl="5" w:tplc="FE580A6A">
       <w:start w:val="1"/>
       <w:numFmt w:val="bullet"/>
       <w:lvlText w:val="■"/>
@@ -13738,7 +14274,7 @@
         <w:ind w:left="4320" w:hanging="360"/>
       </w:pPr>
     </w:lvl>
-    <w:lvl w:ilvl="6" w:tplc="D4BE2C76">
+    <w:lvl w:ilvl="6" w:tplc="F078D738">
       <w:start w:val="1"/>
       <w:numFmt w:val="bullet"/>
       <w:lvlText w:val="●"/>
@@ -13747,7 +14283,7 @@
         <w:ind w:left="5040" w:hanging="360"/>
       </w:pPr>
     </w:lvl>
-    <w:lvl w:ilvl="7" w:tplc="F6FA9F52">
+    <w:lvl w:ilvl="7" w:tplc="386C01EA">
       <w:start w:val="1"/>
       <w:numFmt w:val="bullet"/>
       <w:lvlText w:val="●"/>
@@ -13756,7 +14292,7 @@
         <w:ind w:left="5760" w:hanging="360"/>
       </w:pPr>
     </w:lvl>
-    <w:lvl w:ilvl="8" w:tplc="91328D08">
+    <w:lvl w:ilvl="8" w:tplc="B7F84500">
       <w:start w:val="1"/>
       <w:numFmt w:val="bullet"/>
       <w:lvlText w:val="●"/>
@@ -13766,7 +14302,7 @@
       </w:pPr>
     </w:lvl>
   </w:abstractNum>
-  <w:num w:numId="1" w16cid:durableId="919946407">
+  <w:num w:numId="1" w16cid:durableId="1376079097">
     <w:abstractNumId w:val="0"/>
     <w:lvlOverride w:ilvl="0">
       <w:startOverride w:val="1"/>

</xml_diff>

<commit_message>
Completo el panel y aviso de las referencias estancadas
El panel llevaba un mes anunciando dos indicadores como pendientes y la alerta de baja rotacion esperaba a que existieran las ventas que mide.
</commit_message>
<xml_diff>
--- a/docs/diseno/INVENTRA_Documento_Tecnico_Diseno.docx
+++ b/docs/diseno/INVENTRA_Documento_Tecnico_Diseno.docx
@@ -2691,7 +2691,10 @@
         <w:t xml:space="preserve">Objetivo. </w:t>
       </w:r>
       <w:r>
-        <w:t>Establecer los lineamientos visuales y de interacción que orientan el desarrollo de la interfaz, de modo que las pantallas mantengan una apariencia y un comportamiento uniformes.</w:t>
+        <w:t>Establecer los lineamientos visuales y de interacción que orientan el desarrollo de la interfaz, de modo que las pantallas mantengan una apariencia y un comportamiento uniformes</w:t>
+      </w:r>
+      <w:r>
+        <w:t>.</w:t>
       </w:r>
     </w:p>
     <w:p>
@@ -2707,10 +2710,7 @@
         <w:t xml:space="preserve">Alcance. </w:t>
       </w:r>
       <w:r>
-        <w:t>Cubre la aplicación web y su versión móvil. Se apoya en la especificación de requisitos (IEEE 830), en el modelo de datos (MER y diccionario) y en el prototipo de INVENTRA. No incluye la implementación del código, que corresponde a la etapa de construcción</w:t>
-      </w:r>
-      <w:r>
-        <w:t>.</w:t>
+        <w:t>Cubre la aplicación web y su versión móvil. Se apoya en la especificación de requisitos (IEEE 830), en el modelo de datos (MER y diccionario) y en el prototipo de INVENTRA. No incluye la implementación del código, que corresponde a la etapa de construcción.</w:t>
       </w:r>
     </w:p>
     <w:p>
@@ -3068,7 +3068,7 @@
           <w:noProof/>
         </w:rPr>
         <w:drawing>
-          <wp:inline distT="0" distB="0" distL="0" distR="0" wp14:anchorId="6D3E5924" wp14:editId="0BEEBA22">
+          <wp:inline distT="0" distB="0" distL="0" distR="0" wp14:anchorId="2E9331DA" wp14:editId="5FEC406D">
             <wp:extent cx="5905500" cy="2324100"/>
             <wp:effectExtent l="0" t="0" r="0" b="0"/>
             <wp:docPr id="1" name="Imagen 1"/>
@@ -3151,10 +3151,10 @@
           <w:noProof/>
         </w:rPr>
         <w:drawing>
-          <wp:inline distT="0" distB="0" distL="0" distR="0" wp14:anchorId="60676E29" wp14:editId="7AFA037E">
+          <wp:inline distT="0" distB="0" distL="0" distR="0" wp14:anchorId="05707356" wp14:editId="460566A2">
             <wp:extent cx="5334000" cy="2371725"/>
             <wp:effectExtent l="0" t="0" r="0" b="0"/>
-            <wp:docPr id="894435221" name="Imagen 894435221"/>
+            <wp:docPr id="254086214" name="Imagen 254086214"/>
             <wp:cNvGraphicFramePr>
               <a:graphicFrameLocks xmlns:a="http://schemas.openxmlformats.org/drawingml/2006/main" noChangeAspect="1"/>
             </wp:cNvGraphicFramePr>
@@ -8065,10 +8065,10 @@
         </w:rPr>
         <w:lastRenderedPageBreak/>
         <w:drawing>
-          <wp:inline distT="0" distB="0" distL="0" distR="0" wp14:anchorId="6464E87D" wp14:editId="0E37FD06">
+          <wp:inline distT="0" distB="0" distL="0" distR="0" wp14:anchorId="583F3E20" wp14:editId="0D3F3356">
             <wp:extent cx="5905500" cy="2419350"/>
             <wp:effectExtent l="0" t="0" r="0" b="0"/>
-            <wp:docPr id="1936050056" name="Imagen 1936050056"/>
+            <wp:docPr id="453589456" name="Imagen 453589456"/>
             <wp:cNvGraphicFramePr>
               <a:graphicFrameLocks xmlns:a="http://schemas.openxmlformats.org/drawingml/2006/main" noChangeAspect="1"/>
             </wp:cNvGraphicFramePr>
@@ -8218,10 +8218,10 @@
           <w:noProof/>
         </w:rPr>
         <w:drawing>
-          <wp:inline distT="0" distB="0" distL="0" distR="0" wp14:anchorId="14F27B17" wp14:editId="3568E5C4">
+          <wp:inline distT="0" distB="0" distL="0" distR="0" wp14:anchorId="4CA11853" wp14:editId="5B2EF6D3">
             <wp:extent cx="5905500" cy="2257425"/>
             <wp:effectExtent l="0" t="0" r="0" b="0"/>
-            <wp:docPr id="323493269" name="Imagen 323493269"/>
+            <wp:docPr id="2002812431" name="Imagen 2002812431"/>
             <wp:cNvGraphicFramePr>
               <a:graphicFrameLocks xmlns:a="http://schemas.openxmlformats.org/drawingml/2006/main" noChangeAspect="1"/>
             </wp:cNvGraphicFramePr>
@@ -8845,10 +8845,10 @@
           <w:noProof/>
         </w:rPr>
         <w:drawing>
-          <wp:inline distT="0" distB="0" distL="0" distR="0" wp14:anchorId="144363D3" wp14:editId="78596466">
+          <wp:inline distT="0" distB="0" distL="0" distR="0" wp14:anchorId="33BFF237" wp14:editId="65BC0198">
             <wp:extent cx="5334000" cy="3381375"/>
             <wp:effectExtent l="0" t="0" r="0" b="0"/>
-            <wp:docPr id="2068897345" name="Imagen 2068897345"/>
+            <wp:docPr id="1895229342" name="Imagen 1895229342"/>
             <wp:cNvGraphicFramePr>
               <a:graphicFrameLocks xmlns:a="http://schemas.openxmlformats.org/drawingml/2006/main" noChangeAspect="1"/>
             </wp:cNvGraphicFramePr>
@@ -8998,10 +8998,10 @@
           <w:noProof/>
         </w:rPr>
         <w:drawing>
-          <wp:inline distT="0" distB="0" distL="0" distR="0" wp14:anchorId="186D9997" wp14:editId="3FA9E523">
+          <wp:inline distT="0" distB="0" distL="0" distR="0" wp14:anchorId="78960759" wp14:editId="2EA4C716">
             <wp:extent cx="6096000" cy="1676400"/>
             <wp:effectExtent l="0" t="0" r="0" b="0"/>
-            <wp:docPr id="1190250012" name="Imagen 1190250012"/>
+            <wp:docPr id="774842356" name="Imagen 774842356"/>
             <wp:cNvGraphicFramePr>
               <a:graphicFrameLocks xmlns:a="http://schemas.openxmlformats.org/drawingml/2006/main" noChangeAspect="1"/>
             </wp:cNvGraphicFramePr>
@@ -9090,10 +9090,10 @@
           <w:noProof/>
         </w:rPr>
         <w:drawing>
-          <wp:inline distT="0" distB="0" distL="0" distR="0" wp14:anchorId="73C83ACA" wp14:editId="638457BC">
+          <wp:inline distT="0" distB="0" distL="0" distR="0" wp14:anchorId="0276643F" wp14:editId="12F082C8">
             <wp:extent cx="4762500" cy="2447925"/>
             <wp:effectExtent l="0" t="0" r="0" b="0"/>
-            <wp:docPr id="1356257924" name="Imagen 1356257924"/>
+            <wp:docPr id="128603505" name="Imagen 128603505"/>
             <wp:cNvGraphicFramePr>
               <a:graphicFrameLocks xmlns:a="http://schemas.openxmlformats.org/drawingml/2006/main" noChangeAspect="1"/>
             </wp:cNvGraphicFramePr>
@@ -9220,10 +9220,10 @@
           <w:noProof/>
         </w:rPr>
         <w:drawing>
-          <wp:inline distT="0" distB="0" distL="0" distR="0" wp14:anchorId="6726A6FA" wp14:editId="50E0C34C">
+          <wp:inline distT="0" distB="0" distL="0" distR="0" wp14:anchorId="2FD5E77C" wp14:editId="3C1E4CB3">
             <wp:extent cx="6096000" cy="3048000"/>
             <wp:effectExtent l="0" t="0" r="0" b="0"/>
-            <wp:docPr id="76944698" name="Imagen 76944698"/>
+            <wp:docPr id="2060462624" name="Imagen 2060462624"/>
             <wp:cNvGraphicFramePr>
               <a:graphicFrameLocks xmlns:a="http://schemas.openxmlformats.org/drawingml/2006/main" noChangeAspect="1"/>
             </wp:cNvGraphicFramePr>
@@ -9365,10 +9365,10 @@
         </w:rPr>
         <w:lastRenderedPageBreak/>
         <w:drawing>
-          <wp:inline distT="0" distB="0" distL="0" distR="0" wp14:anchorId="59B12BD3" wp14:editId="7CEB2919">
+          <wp:inline distT="0" distB="0" distL="0" distR="0" wp14:anchorId="717141E5" wp14:editId="20F9EA5A">
             <wp:extent cx="6096000" cy="3848100"/>
             <wp:effectExtent l="0" t="0" r="0" b="0"/>
-            <wp:docPr id="2100996362" name="Imagen 2100996362"/>
+            <wp:docPr id="1455273920" name="Imagen 1455273920"/>
             <wp:cNvGraphicFramePr>
               <a:graphicFrameLocks xmlns:a="http://schemas.openxmlformats.org/drawingml/2006/main" noChangeAspect="1"/>
             </wp:cNvGraphicFramePr>
@@ -10250,10 +10250,10 @@
           <w:noProof/>
         </w:rPr>
         <w:drawing>
-          <wp:inline distT="0" distB="0" distL="0" distR="0" wp14:anchorId="6494900D" wp14:editId="3267392F">
+          <wp:inline distT="0" distB="0" distL="0" distR="0" wp14:anchorId="2EA0316C" wp14:editId="5294D4F3">
             <wp:extent cx="6096000" cy="3000375"/>
             <wp:effectExtent l="0" t="0" r="0" b="0"/>
-            <wp:docPr id="719848660" name="Imagen 719848660"/>
+            <wp:docPr id="788058391" name="Imagen 788058391"/>
             <wp:cNvGraphicFramePr>
               <a:graphicFrameLocks xmlns:a="http://schemas.openxmlformats.org/drawingml/2006/main" noChangeAspect="1"/>
             </wp:cNvGraphicFramePr>
@@ -10342,7 +10342,7 @@
         <w:spacing w:after="60" w:line="258" w:lineRule="auto"/>
       </w:pPr>
       <w:r>
-        <w:t>Cuatro tarjetas de indicador: ventas del día, productos activos en el catálogo, productos con existencias bajas y utilidad del mes, cada una con su variación frente al periodo anterior.</w:t>
+        <w:t>Tarjetas de indicador: ventas de la jornada, productos activos en el catálogo, productos con existencias bajas, referencias sin rotación y utilidad del mes.</w:t>
       </w:r>
     </w:p>
     <w:p>
@@ -10387,7 +10387,25 @@
       </w:pPr>
       <w:r>
         <w:lastRenderedPageBreak/>
-        <w:t>La imagen corresponde al diseño completo. De los cuatro indicadores, los que dependen de las ventas —ventas del día y utilidad del mes— se anuncian como pendientes mientras su módulo no esté construido, en lugar de mostrarse con cifras de ejemplo: un indicador con un número inventado se lee igual que uno real y no hay forma de distinguirlos. Los otros dos se calculan con datos del negocio: las referencias activas del catálogo y las que están en existencias bajas. Estas últimas son además donde vive la alerta que pide RF-INV-07, y por eso debajo de los indicadores se nombran las referencias por reponer, de la más urgente a la menos, con su cantidad restante, su mínimo y el acceso al catálogo ya filtrado; un contador suelto obligaría a ir a buscar de qué referencias se trata. La lista la ven los dos roles del negocio, porque quien está en el mostrador es el primero que nota que algo se acabó.</w:t>
+        <w:t>Los cuatro indicadores se calculan con datos del negocio. Los dos que dependen de las ventas —lo vendido y la utilidad— estuvieron anunciados como pendientes mientras su módulo no existió, en lugar de mostrarse con cifras de ejemplo: un indicador con un número inventado se lee igual que uno real y no hay forma de distinguirlos. Lo vendido se cuenta por jornada y no por día del calendario, con la misma definición que usa el cierre de caja: a la una de la madrugada, lo de «hoy» es la noche que sigue abierta, y si el panel dijera una cifra y el cierre otra, las dos serían correctas y distintas, que es peor que una equivocada. La utilidad del mes se calcula con el costo real de los lotes consumidos, que es el que quedó anotado en cada salida del kardex, y no con el costo de hoy del producto.</w:t>
+      </w:r>
+    </w:p>
+    <w:p>
+      <w:pPr>
+        <w:spacing w:after="110" w:line="262" w:lineRule="auto"/>
+        <w:jc w:val="both"/>
+      </w:pPr>
+      <w:r>
+        <w:t>Debajo de los indicadores aparecen los avisos, y cada uno ocupa el sitio que pide su urgencia. Las referencias por reponer se nombran una a una, de la más urgente a la menos, con su cantidad restante, su mínimo y el acceso al catálogo ya filtrado: es donde vive la alerta que pide RF-INV-07, y un contador suelto obligaría a ir a buscar de qué referencias se trata. La baja rotación que pide RF-INV-08 se cuenta y se enlaza en lugar de listarse, porque es el único requisito de prioridad baja del inventario y darle el mismo sitio que a lo urgente empujaría hacia abajo lo que hay que mirar a diario; el detalle está a un clic, en el catálogo con el filtro puesto, que es donde se actúa sobre una referencia. El plazo que define «sin rotación» no se guarda en ninguna parte: se elige al consultar entre treinta, sesenta y noventa días, y el panel usa sesenta porque enseña la cifra sin preguntar. Así se cumple que sea configurable sin añadir al modelo una columna que nadie ha pedido dejar fijada.</w:t>
+      </w:r>
+    </w:p>
+    <w:p>
+      <w:pPr>
+        <w:spacing w:after="110" w:line="262" w:lineRule="auto"/>
+        <w:jc w:val="both"/>
+      </w:pPr>
+      <w:r>
+        <w:t>El tercer aviso es el de las cajas que cerraron con diferencia y sin explicar, y solo lo ve quien administra la licorera: un vendedor no puede escribir esa explicación, de modo que enseñárselo sería ponerle delante algo que no puede resolver. Cada jornada aparece con su fecha, su sede, el monto que faltó o sobró y el acceso a esa jornada para escribirlo. No se retira al leerlo, sino cuando alguien escribe el porqué. La lista de lo que hay que reponer y la cifra de baja rotación las ven los dos roles del negocio, porque quien está en el mostrador es el primero que nota que algo se acabó o que algo lleva meses parado.</w:t>
       </w:r>
     </w:p>
     <w:p>
@@ -10399,11 +10417,12 @@
         <w:rPr>
           <w:noProof/>
         </w:rPr>
+        <w:lastRenderedPageBreak/>
         <w:drawing>
-          <wp:inline distT="0" distB="0" distL="0" distR="0" wp14:anchorId="3D09A095" wp14:editId="35624C2C">
-            <wp:extent cx="6096000" cy="2857500"/>
+          <wp:inline distT="0" distB="0" distL="0" distR="0" wp14:anchorId="32BA4A84" wp14:editId="2FC9746F">
+            <wp:extent cx="6096000" cy="4333875"/>
             <wp:effectExtent l="0" t="0" r="0" b="0"/>
-            <wp:docPr id="91273034" name="Imagen 91273034"/>
+            <wp:docPr id="1967242470" name="Imagen 1967242470"/>
             <wp:cNvGraphicFramePr>
               <a:graphicFrameLocks xmlns:a="http://schemas.openxmlformats.org/drawingml/2006/main" noChangeAspect="1"/>
             </wp:cNvGraphicFramePr>
@@ -10426,7 +10445,7 @@
                   <pic:spPr bwMode="auto">
                     <a:xfrm>
                       <a:off x="0" y="0"/>
-                      <a:ext cx="6096000" cy="2857500"/>
+                      <a:ext cx="6096000" cy="4333875"/>
                     </a:xfrm>
                     <a:prstGeom prst="rect">
                       <a:avLst/>
@@ -10488,7 +10507,7 @@
         <w:jc w:val="both"/>
       </w:pPr>
       <w:r>
-        <w:t>La tabla presenta el producto, su categoría, el precio de venta, las existencias y la etiqueta de estado. Las acciones de cada fila son consultar sus movimientos, editar y, según el estado, descontinuar o reactivar. La acción principal de la pantalla, situada en la barra superior, es el registro de un producto nuevo, junto al acceso a la entrada de mercancía y a los márgenes de las categorías.</w:t>
+        <w:t>A esos dos se suma un tercero, el de la rotación que pide RF-INV-08: cuánto hace que la referencia no se vende, con tres plazos —treinta, sesenta y noventa días—. Es una pregunta distinta de las otras dos y por eso tiene control propio: una referencia puede estar activa y bien surtida y llevar tres meses parada, que es justo el caso que interesa encontrar. El plazo forma parte del filtro y no se guarda, que es como el sistema entiende «configurable» para un dato que nadie ha pedido dejar fijado; una venta anulada no cuenta como venta, porque una referencia que solo aparece en ventas deshechas no se ha vendido. El filtro llega puesto desde el panel.</w:t>
       </w:r>
     </w:p>
     <w:p>
@@ -10497,7 +10516,7 @@
         <w:jc w:val="both"/>
       </w:pPr>
       <w:r>
-        <w:t>La pantalla es de los dos roles del negocio, y no muestra lo mismo a cada uno. El vendedor consulta el catálogo, lo busca y lo filtra, y entra al historial de una referencia, porque su rol registra ventas y consulta existencias; no se le ofrecen el registro, la edición, la descontinuación ni el ajuste, y esas acciones sencillamente no aparecen, sin aviso que las explique: no es un trámite pendiente que pueda resolver, es el reparto del trabajo. La regla que decide esto vive en el servidor, que rechaza esas operaciones a quien no administra la licorera; la interfaz solo evita ofrecer un botón que se va a rechazar.</w:t>
+        <w:t>La tabla presenta el producto, su categoría, el precio de venta, las existencias y la etiqueta de estado. Las acciones de cada fila son consultar sus movimientos, editar y, según el estado, descontinuar o reactivar. La acción principal de la pantalla, situada en la barra superior, es el registro de un producto nuevo, junto al acceso a la entrada de mercancía y a los márgenes de las categorías.</w:t>
       </w:r>
     </w:p>
     <w:p>
@@ -10506,11 +10525,11 @@
         <w:jc w:val="both"/>
       </w:pPr>
       <w:r>
-        <w:t xml:space="preserve">Descontinuar pide confirmación, con la consecuencia escrita: la referencia deja de ofrecerse en el punto de venta y conserva sus existencias y su historial. Tiene vuelta atrás, porque se dispara con un clic en una fila y descontinuar la equivocada obligaría, sin ella, a registrar el producto de nuevo con otro código </w:t>
+        <w:t xml:space="preserve">La pantalla es de los dos roles del negocio, y no muestra lo mismo a cada uno. El vendedor consulta el catálogo, lo busca y lo filtra, y entra al historial de una referencia, porque su rol registra ventas y consulta existencias; no se le ofrecen el registro, la edición, la descontinuación ni el ajuste, y esas acciones sencillamente no aparecen, sin aviso que las explique: no es un trámite pendiente que pueda resolver, es </w:t>
       </w:r>
       <w:r>
         <w:lastRenderedPageBreak/>
-        <w:t>de barras y a partir su historial en dos. Reactivar no pide confirmación: devuelve la referencia al catálogo sin alterar nada más.</w:t>
+        <w:t>el reparto del trabajo. La regla que decide esto vive en el servidor, que rechaza esas operaciones a quien no administra la licorera; la interfaz solo evita ofrecer un botón que se va a rechazar.</w:t>
       </w:r>
     </w:p>
     <w:p>
@@ -10519,6 +10538,15 @@
         <w:jc w:val="both"/>
       </w:pPr>
       <w:r>
+        <w:t>Descontinuar pide confirmación, con la consecuencia escrita: la referencia deja de ofrecerse en el punto de venta y conserva sus existencias y su historial. Tiene vuelta atrás, porque se dispara con un clic en una fila y descontinuar la equivocada obligaría, sin ella, a registrar el producto de nuevo con otro código de barras y a partir su historial en dos. Reactivar no pide confirmación: devuelve la referencia al catálogo sin alterar nada más.</w:t>
+      </w:r>
+    </w:p>
+    <w:p>
+      <w:pPr>
+        <w:spacing w:after="110" w:line="262" w:lineRule="auto"/>
+        <w:jc w:val="both"/>
+      </w:pPr>
+      <w:r>
         <w:t>La etiqueta de estado resume en una palabra la situación de la referencia, con los colores que fija el punto 6.4: existencias bajas en el tono de advertencia, porque todavía se puede vender y lo que falta es reponer, y agotado en el de error, porque ya no se puede vender. Una referencia descontinuada muestra esa condición en lugar de su nivel de existencias: anunciar que le quedan pocas unidades sería pedir que se repongan.</w:t>
       </w:r>
     </w:p>
@@ -10532,10 +10560,10 @@
           <w:noProof/>
         </w:rPr>
         <w:drawing>
-          <wp:inline distT="0" distB="0" distL="0" distR="0" wp14:anchorId="1710F7DF" wp14:editId="0101EF39">
+          <wp:inline distT="0" distB="0" distL="0" distR="0" wp14:anchorId="5E848EEE" wp14:editId="1E6C1AAD">
             <wp:extent cx="6096000" cy="3286125"/>
             <wp:effectExtent l="0" t="0" r="0" b="0"/>
-            <wp:docPr id="1685885302" name="Imagen 1685885302"/>
+            <wp:docPr id="788107257" name="Imagen 788107257"/>
             <wp:cNvGraphicFramePr>
               <a:graphicFrameLocks xmlns:a="http://schemas.openxmlformats.org/drawingml/2006/main" noChangeAspect="1"/>
             </wp:cNvGraphicFramePr>
@@ -10620,7 +10648,11 @@
         <w:jc w:val="both"/>
       </w:pPr>
       <w:r>
-        <w:t>Sobre el precio, el formulario muestra la propuesta del sistema: cuántas unidades hay en existencia y lo que costó cada una en promedio, el margen de la categoría y el precio que resulta de aplicarlo, con una acción para tomarlo. El costo que se usa es el promedio ponderado de los lotes que siguen en bodega, no el de la última compra: una compra de oferta por unas pocas unidades no representa lo que costó el inventario, y proponer sobre ella llevaría a vender por debajo de costo todo lo comprado antes. El promedio es además la única base con la que un precio único deja el margen pedido sobre el conjunto de las existencias. Cuando no quedan unidades se propone sobre la última compra, que es lo único que se sabe, y la pantalla lo dice.</w:t>
+        <w:t xml:space="preserve">Sobre el precio, el formulario muestra la propuesta del sistema: cuántas unidades hay en existencia y lo que costó cada una en promedio, el margen de la categoría y el precio que resulta de aplicarlo, con una acción para tomarlo. El costo que se usa es el promedio ponderado de los lotes que siguen en bodega, no el de la última compra: una compra de oferta por unas pocas unidades no representa lo que costó el inventario, y proponer sobre ella llevaría a vender por debajo de costo todo lo comprado antes. El promedio es además la única base con la que un precio único deja el margen pedido sobre el conjunto de las </w:t>
+      </w:r>
+      <w:r>
+        <w:lastRenderedPageBreak/>
+        <w:t>existencias. Cuando no quedan unidades se propone sobre la última compra, que es lo único que se sabe, y la pantalla lo dice.</w:t>
       </w:r>
     </w:p>
     <w:p>
@@ -10629,11 +10661,7 @@
         <w:jc w:val="both"/>
       </w:pPr>
       <w:r>
-        <w:t xml:space="preserve">Un promedio reparte, y esa parte no puede quedar escondida. Si los lotes no costaron lo mismo, la propuesta muestra también el más barato y el más caro, y el formulario advierte cuando el precio escrito no cubre el costo de alguno de ellos, diciendo cuántas unidades quedan por encima: el margen se cumple sobre el conjunto, pero solo si se venden todas. La propuesta se calcula en el servidor y se redondea a la </w:t>
-      </w:r>
-      <w:r>
-        <w:lastRenderedPageBreak/>
-        <w:t>centena superior, porque un precio con unidades sueltas no se cobra; se sube y no se baja, ya que redondear hacia abajo recortaría el margen que se acaba de pedir. Una referencia sin ninguna compra registrada no tiene propuesta: sin costo no hay nada sobre lo que aplicar un porcentaje.</w:t>
+        <w:t>Un promedio reparte, y esa parte no puede quedar escondida. Si los lotes no costaron lo mismo, la propuesta muestra también el más barato y el más caro, y el formulario advierte cuando el precio escrito no cubre el costo de alguno de ellos, diciendo cuántas unidades quedan por encima: el margen se cumple sobre el conjunto, pero solo si se venden todas. La propuesta se calcula en el servidor y se redondea a la centena superior, porque un precio con unidades sueltas no se cobra; se sube y no se baja, ya que redondear hacia abajo recortaría el margen que se acaba de pedir. Una referencia sin ninguna compra registrada no tiene propuesta: sin costo no hay nada sobre lo que aplicar un porcentaje.</w:t>
       </w:r>
     </w:p>
     <w:p>
@@ -10664,10 +10692,10 @@
           <w:noProof/>
         </w:rPr>
         <w:drawing>
-          <wp:inline distT="0" distB="0" distL="0" distR="0" wp14:anchorId="4242FC94" wp14:editId="1EE08D50">
+          <wp:inline distT="0" distB="0" distL="0" distR="0" wp14:anchorId="34482D00" wp14:editId="4FF31DC9">
             <wp:extent cx="4953000" cy="4067175"/>
             <wp:effectExtent l="0" t="0" r="0" b="0"/>
-            <wp:docPr id="597610021" name="Imagen 597610021"/>
+            <wp:docPr id="1391113357" name="Imagen 1391113357"/>
             <wp:cNvGraphicFramePr>
               <a:graphicFrameLocks xmlns:a="http://schemas.openxmlformats.org/drawingml/2006/main" noChangeAspect="1"/>
             </wp:cNvGraphicFramePr>
@@ -10743,7 +10771,11 @@
         <w:jc w:val="both"/>
       </w:pPr>
       <w:r>
-        <w:t>Registra la llegada de mercancía al negocio y es el único formulario del sistema con varias líneas, porque una compra llega con lo que diga la factura del proveedor: tres referencias o catorce. En la parte alta se capturan los datos comunes a toda la entrada —el proveedor y una observación, ambos opcionales— y debajo se agregan tantas líneas como productos se hayan recibido, cada una con su referencia, la cantidad y el costo unitario al que se compró. El producto no se elige de una lista desplegable sino que se busca por nombre o por código de barras, porque un catálogo de varios cientos de referencias no se recorre con la vista.</w:t>
+        <w:t xml:space="preserve">Registra la llegada de mercancía al negocio y es el único formulario del sistema con varias líneas, porque una compra llega con lo que diga la factura del proveedor: tres referencias o catorce. En la parte alta se capturan los datos comunes a toda la entrada —el proveedor y una observación, ambos opcionales— y debajo se agregan tantas líneas como productos se hayan recibido, cada una con su referencia, la </w:t>
+      </w:r>
+      <w:r>
+        <w:lastRenderedPageBreak/>
+        <w:t>cantidad y el costo unitario al que se compró. El producto no se elige de una lista desplegable sino que se busca por nombre o por código de barras, porque un catálogo de varios cientos de referencias no se recorre con la vista.</w:t>
       </w:r>
     </w:p>
     <w:p>
@@ -10752,11 +10784,7 @@
         <w:jc w:val="both"/>
       </w:pPr>
       <w:r>
-        <w:t xml:space="preserve">El costo se captura aquí y no en el formulario del producto, y esa es la decisión que explica la pantalla: el mismo ron no cuesta lo mismo en marzo que en junio, de modo que el costo no pertenece a la referencia sino a cada lote que ingresa. Cada línea de la entrada se convierte en un lote con su costo congelado, </w:t>
-      </w:r>
-      <w:r>
-        <w:lastRenderedPageBreak/>
-        <w:t>que es lo que permite valorar después las salidas por el método PEPS. Mientras se escriben las líneas, la pantalla muestra el subtotal de cada una y el total de la compra, para cotejarlos con la factura antes de registrar.</w:t>
+        <w:t>El costo se captura aquí y no en el formulario del producto, y esa es la decisión que explica la pantalla: el mismo ron no cuesta lo mismo en marzo que en junio, de modo que el costo no pertenece a la referencia sino a cada lote que ingresa. Cada línea de la entrada se convierte en un lote con su costo congelado, que es lo que permite valorar después las salidas por el método PEPS. Mientras se escriben las líneas, la pantalla muestra el subtotal de cada una y el total de la compra, para cotejarlos con la factura antes de registrar.</w:t>
       </w:r>
     </w:p>
     <w:p>
@@ -10778,10 +10806,10 @@
           <w:noProof/>
         </w:rPr>
         <w:drawing>
-          <wp:inline distT="0" distB="0" distL="0" distR="0" wp14:anchorId="279A094F" wp14:editId="5B63EDF8">
+          <wp:inline distT="0" distB="0" distL="0" distR="0" wp14:anchorId="3CCA781E" wp14:editId="3E6EF768">
             <wp:extent cx="6096000" cy="4124325"/>
             <wp:effectExtent l="0" t="0" r="0" b="0"/>
-            <wp:docPr id="966598762" name="Imagen 966598762"/>
+            <wp:docPr id="1535086446" name="Imagen 1535086446"/>
             <wp:cNvGraphicFramePr>
               <a:graphicFrameLocks xmlns:a="http://schemas.openxmlformats.org/drawingml/2006/main" noChangeAspect="1"/>
             </wp:cNvGraphicFramePr>
@@ -10866,7 +10894,11 @@
         <w:jc w:val="both"/>
       </w:pPr>
       <w:r>
-        <w:t>El ajuste se sitúa sobre el historial y no en la lista de productos porque un ajuste es la respuesta a una diferencia, y la diferencia se explica en los movimientos: faltan unidades que nadie vendió, o aparecen unidades que nadie registró. Se pide la diferencia y no la cantidad final —un número positivo si en el conteo sobraron unidades y uno negativo si faltaron— junto con el motivo, que es obligatorio: una existencia que cambió sin explicación es justo lo que un inventario sirve para evitar. Al guardarlo, el movimiento aparece en la primera fila de la tabla.</w:t>
+        <w:t xml:space="preserve">El ajuste se sitúa sobre el historial y no en la lista de productos porque un ajuste es la respuesta a una diferencia, y la diferencia se explica en los movimientos: faltan unidades que nadie vendió, o aparecen </w:t>
+      </w:r>
+      <w:r>
+        <w:lastRenderedPageBreak/>
+        <w:t>unidades que nadie registró. Se pide la diferencia y no la cantidad final —un número positivo si en el conteo sobraron unidades y uno negativo si faltaron— junto con el motivo, que es obligatorio: una existencia que cambió sin explicación es justo lo que un inventario sirve para evitar. Al guardarlo, el movimiento aparece en la primera fila de la tabla.</w:t>
       </w:r>
     </w:p>
     <w:p>
@@ -10875,11 +10907,7 @@
         <w:jc w:val="both"/>
       </w:pPr>
       <w:r>
-        <w:t xml:space="preserve">El kardex es de solo lectura para todos los roles, incluido el administrador de la licorera. Ninguna línea se edita ni se borra: un historial que se puede reescribir no sirve para rendir cuentas, y una cifra equivocada </w:t>
-      </w:r>
-      <w:r>
-        <w:lastRenderedPageBreak/>
-        <w:t>se corrige con otro movimiento que diga por qué. Cuando el ajuste reduce las existencias, el sistema consume los lotes más antiguos y registra el costo real de lo que se perdió; cuando las aumenta, el lote que nace toma el costo de la compra más reciente, porque unas unidades que aparecen en un conteo son mercancía que ya se compró.</w:t>
+        <w:t>El kardex es de solo lectura para todos los roles, incluido el administrador de la licorera. Ninguna línea se edita ni se borra: un historial que se puede reescribir no sirve para rendir cuentas, y una cifra equivocada se corrige con otro movimiento que diga por qué. Cuando el ajuste reduce las existencias, el sistema consume los lotes más antiguos y registra el costo real de lo que se perdió; cuando las aumenta, el lote que nace toma el costo de la compra más reciente, porque unas unidades que aparecen en un conteo son mercancía que ya se compró.</w:t>
       </w:r>
     </w:p>
     <w:p>
@@ -10892,10 +10920,10 @@
           <w:noProof/>
         </w:rPr>
         <w:drawing>
-          <wp:inline distT="0" distB="0" distL="0" distR="0" wp14:anchorId="23AD2DDE" wp14:editId="45C57145">
+          <wp:inline distT="0" distB="0" distL="0" distR="0" wp14:anchorId="421628D2" wp14:editId="6728EA89">
             <wp:extent cx="6096000" cy="4162425"/>
             <wp:effectExtent l="0" t="0" r="0" b="0"/>
-            <wp:docPr id="1905327973" name="Imagen 1905327973"/>
+            <wp:docPr id="1510048027" name="Imagen 1510048027"/>
             <wp:cNvGraphicFramePr>
               <a:graphicFrameLocks xmlns:a="http://schemas.openxmlformats.org/drawingml/2006/main" noChangeAspect="1"/>
             </wp:cNvGraphicFramePr>
@@ -10989,6 +11017,7 @@
         <w:jc w:val="both"/>
       </w:pPr>
       <w:r>
+        <w:lastRenderedPageBreak/>
         <w:t>La cuadrícula presenta el resultado de la búsqueda, y no el catálogo completo: una licorera con cientos de referencias no se recorre con el ratón mientras un cliente espera. Sin texto escrito muestra las referencias de mayor rotación, que son las que se venden sin buscarlas. Elegir un producto es agregarlo: el cursor regresa al buscador con el texto ya borrado, de modo que la referencia siguiente se escribe sin tocar el ratón, y volver a elegir el mismo producto suma una unidad en lugar de abrir un segundo renglón.</w:t>
       </w:r>
     </w:p>
@@ -10998,11 +11027,7 @@
         <w:jc w:val="both"/>
       </w:pPr>
       <w:r>
-        <w:t xml:space="preserve">Cada línea permite corregir su cantidad o retirarse, porque equivocarse de cantidad es lo más frecuente que ocurre en un mostrador. La cantidad se escribe además de ajustarse con los botones: cien unidades </w:t>
-      </w:r>
-      <w:r>
-        <w:lastRenderedPageBreak/>
-        <w:t>de un mismo producto son cien pulsaciones en un botón y tres teclas en un campo. Ninguna línea admite más unidades de las que hay en existencia, y al llegar al tope la propia línea dice cuántas quedan; la comprobación definitiva la hace el servidor, porque otra caja puede haber vendido mientras tanto, pero avisar aquí evita armar una venta larga para descubrir al cobrar que de la tercera referencia no había suficiente.</w:t>
+        <w:t>Cada línea permite corregir su cantidad o retirarse, porque equivocarse de cantidad es lo más frecuente que ocurre en un mostrador. La cantidad se escribe además de ajustarse con los botones: cien unidades de un mismo producto son cien pulsaciones en un botón y tres teclas en un campo. Ninguna línea admite más unidades de las que hay en existencia, y al llegar al tope la propia línea dice cuántas quedan; la comprobación definitiva la hace el servidor, porque otra caja puede haber vendido mientras tanto, pero avisar aquí evita armar una venta larga para descubrir al cobrar que de la tercera referencia no había suficiente.</w:t>
       </w:r>
     </w:p>
     <w:p>
@@ -11052,10 +11077,10 @@
         </w:rPr>
         <w:lastRenderedPageBreak/>
         <w:drawing>
-          <wp:inline distT="0" distB="0" distL="0" distR="0" wp14:anchorId="429732D1" wp14:editId="3D855218">
+          <wp:inline distT="0" distB="0" distL="0" distR="0" wp14:anchorId="27BA7957" wp14:editId="37CDC3D7">
             <wp:extent cx="6096000" cy="4514850"/>
             <wp:effectExtent l="0" t="0" r="0" b="0"/>
-            <wp:docPr id="1567734146" name="Imagen 1567734146"/>
+            <wp:docPr id="1892110892" name="Imagen 1892110892"/>
             <wp:cNvGraphicFramePr>
               <a:graphicFrameLocks xmlns:a="http://schemas.openxmlformats.org/drawingml/2006/main" noChangeAspect="1"/>
             </wp:cNvGraphicFramePr>
@@ -11126,10 +11151,10 @@
           <w:noProof/>
         </w:rPr>
         <w:drawing>
-          <wp:inline distT="0" distB="0" distL="0" distR="0" wp14:anchorId="3EAB3836" wp14:editId="4998531F">
+          <wp:inline distT="0" distB="0" distL="0" distR="0" wp14:anchorId="6BDEE2A6" wp14:editId="60A9E873">
             <wp:extent cx="4000500" cy="1438275"/>
             <wp:effectExtent l="0" t="0" r="0" b="0"/>
-            <wp:docPr id="366070994" name="Imagen 366070994"/>
+            <wp:docPr id="1942550513" name="Imagen 1942550513"/>
             <wp:cNvGraphicFramePr>
               <a:graphicFrameLocks xmlns:a="http://schemas.openxmlformats.org/drawingml/2006/main" noChangeAspect="1"/>
             </wp:cNvGraphicFramePr>
@@ -11256,10 +11281,10 @@
         </w:rPr>
         <w:lastRenderedPageBreak/>
         <w:drawing>
-          <wp:inline distT="0" distB="0" distL="0" distR="0" wp14:anchorId="73B9AE7D" wp14:editId="3567F6A2">
+          <wp:inline distT="0" distB="0" distL="0" distR="0" wp14:anchorId="71475E37" wp14:editId="59F64709">
             <wp:extent cx="6096000" cy="7010400"/>
             <wp:effectExtent l="0" t="0" r="0" b="0"/>
-            <wp:docPr id="731971444" name="Imagen 731971444"/>
+            <wp:docPr id="2087876919" name="Imagen 2087876919"/>
             <wp:cNvGraphicFramePr>
               <a:graphicFrameLocks xmlns:a="http://schemas.openxmlformats.org/drawingml/2006/main" noChangeAspect="1"/>
             </wp:cNvGraphicFramePr>
@@ -11384,6 +11409,15 @@
         <w:jc w:val="both"/>
       </w:pPr>
       <w:r>
+        <w:t>La pantalla abre la jornada en curso, y también una anterior cuando se llega a ella desde el aviso del panel. En una jornada que ya terminó no hay nada que contar —el cajón se vació—, de modo que el efectivo contado se muestra y no se escribe, y la acción de cerrar no aparece en vez de aparecer apagada.</w:t>
+      </w:r>
+    </w:p>
+    <w:p>
+      <w:pPr>
+        <w:spacing w:after="110" w:line="262" w:lineRule="auto"/>
+        <w:jc w:val="both"/>
+      </w:pPr>
+      <w:r>
         <w:t>La explicación se puede escribir en el momento del cierre o más tarde, desde el aviso que el panel mantiene a la vista, porque es una nota y no una cifra: editarla no mueve ningún total ni ninguna diferencia. Escribirla después queda reservado a quien administra la licorera, por lo mismo que la anulación: quien cierra suele ser quien vende, y el aviso que señala su propio faltante no debería poder apagarlo él.</w:t>
       </w:r>
     </w:p>
@@ -11397,10 +11431,10 @@
           <w:noProof/>
         </w:rPr>
         <w:drawing>
-          <wp:inline distT="0" distB="0" distL="0" distR="0" wp14:anchorId="706D7D30" wp14:editId="3368A08F">
+          <wp:inline distT="0" distB="0" distL="0" distR="0" wp14:anchorId="58100334" wp14:editId="7957C10C">
             <wp:extent cx="6096000" cy="3724275"/>
             <wp:effectExtent l="0" t="0" r="0" b="0"/>
-            <wp:docPr id="1459794242" name="Imagen 1459794242"/>
+            <wp:docPr id="1840704145" name="Imagen 1840704145"/>
             <wp:cNvGraphicFramePr>
               <a:graphicFrameLocks xmlns:a="http://schemas.openxmlformats.org/drawingml/2006/main" noChangeAspect="1"/>
             </wp:cNvGraphicFramePr>
@@ -11466,6 +11500,7 @@
           <w:sz w:val="23"/>
           <w:szCs w:val="23"/>
         </w:rPr>
+        <w:lastRenderedPageBreak/>
         <w:t>8.10 Reportes</w:t>
       </w:r>
       <w:bookmarkEnd w:id="36"/>
@@ -11476,11 +11511,7 @@
         <w:jc w:val="both"/>
       </w:pPr>
       <w:r>
-        <w:t xml:space="preserve">Presenta los resultados del periodo seleccionado, que se indica en la barra superior junto a la acción de exportación. En la parte alta se ubican los indicadores del mes —ventas y utilidad— y debajo, el </w:t>
-      </w:r>
-      <w:r>
-        <w:lastRenderedPageBreak/>
-        <w:t>comportamiento de las ventas por día y el listado de productos más vendidos con las unidades despachadas. La utilidad se calcula con el costo histórico de los lotes consumidos, no con el costo actual del producto.</w:t>
+        <w:t>Presenta los resultados del periodo seleccionado, que se indica en la barra superior junto a la acción de exportación. En la parte alta se ubican los indicadores del mes —ventas y utilidad— y debajo, el comportamiento de las ventas por día y el listado de productos más vendidos con las unidades despachadas. La utilidad se calcula con el costo histórico de los lotes consumidos, no con el costo actual del producto.</w:t>
       </w:r>
     </w:p>
     <w:p>
@@ -11493,10 +11524,10 @@
           <w:noProof/>
         </w:rPr>
         <w:drawing>
-          <wp:inline distT="0" distB="0" distL="0" distR="0" wp14:anchorId="4FE46D2F" wp14:editId="093D78BF">
+          <wp:inline distT="0" distB="0" distL="0" distR="0" wp14:anchorId="3695DD6D" wp14:editId="2E5C6003">
             <wp:extent cx="6096000" cy="2857500"/>
             <wp:effectExtent l="0" t="0" r="0" b="0"/>
-            <wp:docPr id="2146509367" name="Imagen 2146509367"/>
+            <wp:docPr id="785120993" name="Imagen 785120993"/>
             <wp:cNvGraphicFramePr>
               <a:graphicFrameLocks xmlns:a="http://schemas.openxmlformats.org/drawingml/2006/main" noChangeAspect="1"/>
             </wp:cNvGraphicFramePr>
@@ -11613,10 +11644,10 @@
         </w:rPr>
         <w:lastRenderedPageBreak/>
         <w:drawing>
-          <wp:inline distT="0" distB="0" distL="0" distR="0" wp14:anchorId="164DF49B" wp14:editId="47ADA125">
+          <wp:inline distT="0" distB="0" distL="0" distR="0" wp14:anchorId="28DC1C85" wp14:editId="1F3EF475">
             <wp:extent cx="6096000" cy="2857500"/>
             <wp:effectExtent l="0" t="0" r="0" b="0"/>
-            <wp:docPr id="1966653712" name="Imagen 1966653712"/>
+            <wp:docPr id="1384330234" name="Imagen 1384330234"/>
             <wp:cNvGraphicFramePr>
               <a:graphicFrameLocks xmlns:a="http://schemas.openxmlformats.org/drawingml/2006/main" noChangeAspect="1"/>
             </wp:cNvGraphicFramePr>
@@ -11724,10 +11755,10 @@
         </w:rPr>
         <w:lastRenderedPageBreak/>
         <w:drawing>
-          <wp:inline distT="0" distB="0" distL="0" distR="0" wp14:anchorId="6B0BE32D" wp14:editId="42173447">
+          <wp:inline distT="0" distB="0" distL="0" distR="0" wp14:anchorId="4D34F3AF" wp14:editId="03756FD9">
             <wp:extent cx="6096000" cy="3562350"/>
             <wp:effectExtent l="0" t="0" r="0" b="0"/>
-            <wp:docPr id="1498058167" name="Imagen 1498058167"/>
+            <wp:docPr id="2068243361" name="Imagen 2068243361"/>
             <wp:cNvGraphicFramePr>
               <a:graphicFrameLocks xmlns:a="http://schemas.openxmlformats.org/drawingml/2006/main" noChangeAspect="1"/>
             </wp:cNvGraphicFramePr>
@@ -11835,10 +11866,10 @@
         </w:rPr>
         <w:lastRenderedPageBreak/>
         <w:drawing>
-          <wp:inline distT="0" distB="0" distL="0" distR="0" wp14:anchorId="0F3D563F" wp14:editId="3F22692E">
+          <wp:inline distT="0" distB="0" distL="0" distR="0" wp14:anchorId="4B508131" wp14:editId="6A7918D4">
             <wp:extent cx="6096000" cy="3067050"/>
             <wp:effectExtent l="0" t="0" r="0" b="0"/>
-            <wp:docPr id="250480836" name="Imagen 250480836"/>
+            <wp:docPr id="962042407" name="Imagen 962042407"/>
             <wp:cNvGraphicFramePr>
               <a:graphicFrameLocks xmlns:a="http://schemas.openxmlformats.org/drawingml/2006/main" noChangeAspect="1"/>
             </wp:cNvGraphicFramePr>
@@ -11955,10 +11986,10 @@
         </w:rPr>
         <w:lastRenderedPageBreak/>
         <w:drawing>
-          <wp:inline distT="0" distB="0" distL="0" distR="0" wp14:anchorId="2629EFB1" wp14:editId="31DD14F2">
+          <wp:inline distT="0" distB="0" distL="0" distR="0" wp14:anchorId="42BA69A9" wp14:editId="047460C6">
             <wp:extent cx="6096000" cy="4114800"/>
             <wp:effectExtent l="0" t="0" r="0" b="0"/>
-            <wp:docPr id="328952219" name="Imagen 328952219"/>
+            <wp:docPr id="1600078232" name="Imagen 1600078232"/>
             <wp:cNvGraphicFramePr>
               <a:graphicFrameLocks xmlns:a="http://schemas.openxmlformats.org/drawingml/2006/main" noChangeAspect="1"/>
             </wp:cNvGraphicFramePr>
@@ -12049,10 +12080,10 @@
           <w:noProof/>
         </w:rPr>
         <w:drawing>
-          <wp:inline distT="0" distB="0" distL="0" distR="0" wp14:anchorId="097951DF" wp14:editId="0E469635">
+          <wp:inline distT="0" distB="0" distL="0" distR="0" wp14:anchorId="7FB14060" wp14:editId="4DFFA8C5">
             <wp:extent cx="6096000" cy="2733675"/>
             <wp:effectExtent l="0" t="0" r="0" b="0"/>
-            <wp:docPr id="169264922" name="Imagen 169264922"/>
+            <wp:docPr id="2141904253" name="Imagen 2141904253"/>
             <wp:cNvGraphicFramePr>
               <a:graphicFrameLocks xmlns:a="http://schemas.openxmlformats.org/drawingml/2006/main" noChangeAspect="1"/>
             </wp:cNvGraphicFramePr>
@@ -12925,10 +12956,10 @@
           <w:noProof/>
         </w:rPr>
         <w:drawing>
-          <wp:inline distT="0" distB="0" distL="0" distR="0" wp14:anchorId="44FD1997" wp14:editId="3CCB8162">
+          <wp:inline distT="0" distB="0" distL="0" distR="0" wp14:anchorId="63FA7E2F" wp14:editId="1BC7AB24">
             <wp:extent cx="6096000" cy="3295650"/>
             <wp:effectExtent l="0" t="0" r="0" b="0"/>
-            <wp:docPr id="34769661" name="Imagen 34769661"/>
+            <wp:docPr id="117207438" name="Imagen 117207438"/>
             <wp:cNvGraphicFramePr>
               <a:graphicFrameLocks xmlns:a="http://schemas.openxmlformats.org/drawingml/2006/main" noChangeAspect="1"/>
             </wp:cNvGraphicFramePr>
@@ -13048,10 +13079,10 @@
           <w:noProof/>
         </w:rPr>
         <w:drawing>
-          <wp:inline distT="0" distB="0" distL="0" distR="0" wp14:anchorId="662F6A09" wp14:editId="4403C884">
+          <wp:inline distT="0" distB="0" distL="0" distR="0" wp14:anchorId="55FD444A" wp14:editId="7031BE45">
             <wp:extent cx="6096000" cy="3067050"/>
             <wp:effectExtent l="0" t="0" r="0" b="0"/>
-            <wp:docPr id="1452175404" name="Imagen 1452175404"/>
+            <wp:docPr id="1042141808" name="Imagen 1042141808"/>
             <wp:cNvGraphicFramePr>
               <a:graphicFrameLocks xmlns:a="http://schemas.openxmlformats.org/drawingml/2006/main" noChangeAspect="1"/>
             </wp:cNvGraphicFramePr>
@@ -14077,7 +14108,13 @@
         <w:spacing w:after="60" w:line="258" w:lineRule="auto"/>
       </w:pPr>
       <w:r>
-        <w:t>World Wide Web Consortium. Web Content Accessibility Guidelines (WCAG) 2.1. W3C, 2018.</w:t>
+        <w:rPr>
+          <w:lang w:val="en-US"/>
+        </w:rPr>
+        <w:t xml:space="preserve">World Wide Web Consortium. Web Content Accessibility Guidelines (WCAG) 2.1. </w:t>
+      </w:r>
+      <w:r>
+        <w:t>W3C, 2018.</w:t>
       </w:r>
     </w:p>
     <w:p>
@@ -14217,10 +14254,10 @@
 <file path=word/numbering.xml><?xml version="1.0" encoding="utf-8"?>
 <w:numbering xmlns:wpc="http://schemas.microsoft.com/office/word/2010/wordprocessingCanvas" xmlns:cx="http://schemas.microsoft.com/office/drawing/2014/chartex" xmlns:cx1="http://schemas.microsoft.com/office/drawing/2015/9/8/chartex" xmlns:cx2="http://schemas.microsoft.com/office/drawing/2015/10/21/chartex" xmlns:cx3="http://schemas.microsoft.com/office/drawing/2016/5/9/chartex" xmlns:cx4="http://schemas.microsoft.com/office/drawing/2016/5/10/chartex" xmlns:cx5="http://schemas.microsoft.com/office/drawing/2016/5/11/chartex" xmlns:cx6="http://schemas.microsoft.com/office/drawing/2016/5/12/chartex" xmlns:cx7="http://schemas.microsoft.com/office/drawing/2016/5/13/chartex" xmlns:cx8="http://schemas.microsoft.com/office/drawing/2016/5/14/chartex" xmlns:mc="http://schemas.openxmlformats.org/markup-compatibility/2006" xmlns:aink="http://schemas.microsoft.com/office/drawing/2016/ink" xmlns:am3d="http://schemas.microsoft.com/office/drawing/2017/model3d" xmlns:o="urn:schemas-microsoft-com:office:office" xmlns:oel="http://schemas.microsoft.com/office/2019/extlst" xmlns:r="http://schemas.openxmlformats.org/officeDocument/2006/relationships" xmlns:m="http://schemas.openxmlformats.org/officeDocument/2006/math" xmlns:v="urn:schemas-microsoft-com:vml" xmlns:wp14="http://schemas.microsoft.com/office/word/2010/wordprocessingDrawing" xmlns:wp="http://schemas.openxmlformats.org/drawingml/2006/wordprocessingDrawing" xmlns:w10="urn:schemas-microsoft-com:office:word" xmlns:w="http://schemas.openxmlformats.org/wordprocessingml/2006/main" xmlns:w14="http://schemas.microsoft.com/office/word/2010/wordml" xmlns:w15="http://schemas.microsoft.com/office/word/2012/wordml" xmlns:w16cex="http://schemas.microsoft.com/office/word/2018/wordml/cex" xmlns:w16cid="http://schemas.microsoft.com/office/word/2016/wordml/cid" xmlns:w16="http://schemas.microsoft.com/office/word/2018/wordml" xmlns:w16du="http://schemas.microsoft.com/office/word/2023/wordml/word16du" xmlns:w16sdtdh="http://schemas.microsoft.com/office/word/2020/wordml/sdtdatahash" xmlns:w16sdtfl="http://schemas.microsoft.com/office/word/2024/wordml/sdtformatlock" xmlns:w16se="http://schemas.microsoft.com/office/word/2015/wordml/symex" xmlns:wpg="http://schemas.microsoft.com/office/word/2010/wordprocessingGroup" xmlns:wpi="http://schemas.microsoft.com/office/word/2010/wordprocessingInk" xmlns:wne="http://schemas.microsoft.com/office/word/2006/wordml" xmlns:wps="http://schemas.microsoft.com/office/word/2010/wordprocessingShape" mc:Ignorable="w14 w15 w16se w16cid w16 w16cex w16sdtdh w16sdtfl w16du wp14">
   <w:abstractNum w:abstractNumId="0" w15:restartNumberingAfterBreak="0">
-    <w:nsid w:val="0748083A"/>
+    <w:nsid w:val="233B48F9"/>
     <w:multiLevelType w:val="hybridMultilevel"/>
-    <w:tmpl w:val="C2B89234"/>
-    <w:lvl w:ilvl="0" w:tplc="71D8CDCE">
+    <w:tmpl w:val="9BD00C8E"/>
+    <w:lvl w:ilvl="0" w:tplc="FFA89430">
       <w:start w:val="1"/>
       <w:numFmt w:val="bullet"/>
       <w:lvlText w:val="●"/>
@@ -14229,7 +14266,7 @@
         <w:ind w:left="720" w:hanging="360"/>
       </w:pPr>
     </w:lvl>
-    <w:lvl w:ilvl="1" w:tplc="DBC0FFFA">
+    <w:lvl w:ilvl="1" w:tplc="74CC47AE">
       <w:start w:val="1"/>
       <w:numFmt w:val="bullet"/>
       <w:lvlText w:val="○"/>
@@ -14238,7 +14275,7 @@
         <w:ind w:left="1440" w:hanging="360"/>
       </w:pPr>
     </w:lvl>
-    <w:lvl w:ilvl="2" w:tplc="E4B8F4B4">
+    <w:lvl w:ilvl="2" w:tplc="32C6605E">
       <w:start w:val="1"/>
       <w:numFmt w:val="bullet"/>
       <w:lvlText w:val="■"/>
@@ -14247,7 +14284,7 @@
         <w:ind w:left="2160" w:hanging="360"/>
       </w:pPr>
     </w:lvl>
-    <w:lvl w:ilvl="3" w:tplc="600AFCFE">
+    <w:lvl w:ilvl="3" w:tplc="90BC0764">
       <w:start w:val="1"/>
       <w:numFmt w:val="bullet"/>
       <w:lvlText w:val="●"/>
@@ -14256,7 +14293,7 @@
         <w:ind w:left="2880" w:hanging="360"/>
       </w:pPr>
     </w:lvl>
-    <w:lvl w:ilvl="4" w:tplc="296A0B04">
+    <w:lvl w:ilvl="4" w:tplc="063ED4BC">
       <w:start w:val="1"/>
       <w:numFmt w:val="bullet"/>
       <w:lvlText w:val="○"/>
@@ -14265,7 +14302,7 @@
         <w:ind w:left="3600" w:hanging="360"/>
       </w:pPr>
     </w:lvl>
-    <w:lvl w:ilvl="5" w:tplc="FE580A6A">
+    <w:lvl w:ilvl="5" w:tplc="C4B03A2A">
       <w:start w:val="1"/>
       <w:numFmt w:val="bullet"/>
       <w:lvlText w:val="■"/>
@@ -14274,7 +14311,7 @@
         <w:ind w:left="4320" w:hanging="360"/>
       </w:pPr>
     </w:lvl>
-    <w:lvl w:ilvl="6" w:tplc="F078D738">
+    <w:lvl w:ilvl="6" w:tplc="C4AEB844">
       <w:start w:val="1"/>
       <w:numFmt w:val="bullet"/>
       <w:lvlText w:val="●"/>
@@ -14283,7 +14320,7 @@
         <w:ind w:left="5040" w:hanging="360"/>
       </w:pPr>
     </w:lvl>
-    <w:lvl w:ilvl="7" w:tplc="386C01EA">
+    <w:lvl w:ilvl="7" w:tplc="AE4895B8">
       <w:start w:val="1"/>
       <w:numFmt w:val="bullet"/>
       <w:lvlText w:val="●"/>
@@ -14292,7 +14329,7 @@
         <w:ind w:left="5760" w:hanging="360"/>
       </w:pPr>
     </w:lvl>
-    <w:lvl w:ilvl="8" w:tplc="B7F84500">
+    <w:lvl w:ilvl="8" w:tplc="528640C8">
       <w:start w:val="1"/>
       <w:numFmt w:val="bullet"/>
       <w:lvlText w:val="●"/>
@@ -14302,7 +14339,7 @@
       </w:pPr>
     </w:lvl>
   </w:abstractNum>
-  <w:num w:numId="1" w16cid:durableId="1376079097">
+  <w:num w:numId="1" w16cid:durableId="1334379663">
     <w:abstractNumId w:val="0"/>
     <w:lvlOverride w:ilvl="0">
       <w:startOverride w:val="1"/>

</xml_diff>

<commit_message>
Fijo el precio de venta al recibir la mercancia
Al crear la ficha nadie conoce el costo, de modo que el precio que se pedia alli era una suposicion, y de ahi salian las referencias vendidas por debajo de lo que costaron. La entrada lo exige y lo propone con el margen de la categoria. Actualizo el documento tecnico de diseno
</commit_message>
<xml_diff>
--- a/docs/diseno/INVENTRA_Documento_Tecnico_Diseno.docx
+++ b/docs/diseno/INVENTRA_Documento_Tecnico_Diseno.docx
@@ -2691,10 +2691,7 @@
         <w:t xml:space="preserve">Objetivo. </w:t>
       </w:r>
       <w:r>
-        <w:t>Establecer los lineamientos visuales y de interacción que orientan el desarrollo de la interfaz, de modo que las pantallas mantengan una apariencia y un comportamiento uniformes</w:t>
-      </w:r>
-      <w:r>
-        <w:t>.</w:t>
+        <w:t>Establecer los lineamientos visuales y de interacción que orientan el desarrollo de la interfaz, de modo que las pantallas mantengan una apariencia y un comportamiento uniformes.</w:t>
       </w:r>
     </w:p>
     <w:p>
@@ -3068,7 +3065,7 @@
           <w:noProof/>
         </w:rPr>
         <w:drawing>
-          <wp:inline distT="0" distB="0" distL="0" distR="0" wp14:anchorId="2E9331DA" wp14:editId="5FEC406D">
+          <wp:inline distT="0" distB="0" distL="0" distR="0" wp14:anchorId="5F7469F8" wp14:editId="10123D77">
             <wp:extent cx="5905500" cy="2324100"/>
             <wp:effectExtent l="0" t="0" r="0" b="0"/>
             <wp:docPr id="1" name="Imagen 1"/>
@@ -3151,10 +3148,10 @@
           <w:noProof/>
         </w:rPr>
         <w:drawing>
-          <wp:inline distT="0" distB="0" distL="0" distR="0" wp14:anchorId="05707356" wp14:editId="460566A2">
+          <wp:inline distT="0" distB="0" distL="0" distR="0" wp14:anchorId="26CCC710" wp14:editId="18FD7992">
             <wp:extent cx="5334000" cy="2371725"/>
             <wp:effectExtent l="0" t="0" r="0" b="0"/>
-            <wp:docPr id="254086214" name="Imagen 254086214"/>
+            <wp:docPr id="842983843" name="Imagen 842983843"/>
             <wp:cNvGraphicFramePr>
               <a:graphicFrameLocks xmlns:a="http://schemas.openxmlformats.org/drawingml/2006/main" noChangeAspect="1"/>
             </wp:cNvGraphicFramePr>
@@ -8065,10 +8062,10 @@
         </w:rPr>
         <w:lastRenderedPageBreak/>
         <w:drawing>
-          <wp:inline distT="0" distB="0" distL="0" distR="0" wp14:anchorId="583F3E20" wp14:editId="0D3F3356">
+          <wp:inline distT="0" distB="0" distL="0" distR="0" wp14:anchorId="4F2D97D3" wp14:editId="232665ED">
             <wp:extent cx="5905500" cy="2419350"/>
             <wp:effectExtent l="0" t="0" r="0" b="0"/>
-            <wp:docPr id="453589456" name="Imagen 453589456"/>
+            <wp:docPr id="1571203590" name="Imagen 1571203590"/>
             <wp:cNvGraphicFramePr>
               <a:graphicFrameLocks xmlns:a="http://schemas.openxmlformats.org/drawingml/2006/main" noChangeAspect="1"/>
             </wp:cNvGraphicFramePr>
@@ -8218,10 +8215,10 @@
           <w:noProof/>
         </w:rPr>
         <w:drawing>
-          <wp:inline distT="0" distB="0" distL="0" distR="0" wp14:anchorId="4CA11853" wp14:editId="5B2EF6D3">
+          <wp:inline distT="0" distB="0" distL="0" distR="0" wp14:anchorId="1320FAA2" wp14:editId="733BE1E7">
             <wp:extent cx="5905500" cy="2257425"/>
             <wp:effectExtent l="0" t="0" r="0" b="0"/>
-            <wp:docPr id="2002812431" name="Imagen 2002812431"/>
+            <wp:docPr id="1213934521" name="Imagen 1213934521"/>
             <wp:cNvGraphicFramePr>
               <a:graphicFrameLocks xmlns:a="http://schemas.openxmlformats.org/drawingml/2006/main" noChangeAspect="1"/>
             </wp:cNvGraphicFramePr>
@@ -8845,10 +8842,10 @@
           <w:noProof/>
         </w:rPr>
         <w:drawing>
-          <wp:inline distT="0" distB="0" distL="0" distR="0" wp14:anchorId="33BFF237" wp14:editId="65BC0198">
+          <wp:inline distT="0" distB="0" distL="0" distR="0" wp14:anchorId="5B565EF1" wp14:editId="1B851F7E">
             <wp:extent cx="5334000" cy="3381375"/>
             <wp:effectExtent l="0" t="0" r="0" b="0"/>
-            <wp:docPr id="1895229342" name="Imagen 1895229342"/>
+            <wp:docPr id="747060332" name="Imagen 747060332"/>
             <wp:cNvGraphicFramePr>
               <a:graphicFrameLocks xmlns:a="http://schemas.openxmlformats.org/drawingml/2006/main" noChangeAspect="1"/>
             </wp:cNvGraphicFramePr>
@@ -8998,10 +8995,10 @@
           <w:noProof/>
         </w:rPr>
         <w:drawing>
-          <wp:inline distT="0" distB="0" distL="0" distR="0" wp14:anchorId="78960759" wp14:editId="2EA4C716">
+          <wp:inline distT="0" distB="0" distL="0" distR="0" wp14:anchorId="5D15D361" wp14:editId="295B0954">
             <wp:extent cx="6096000" cy="1676400"/>
             <wp:effectExtent l="0" t="0" r="0" b="0"/>
-            <wp:docPr id="774842356" name="Imagen 774842356"/>
+            <wp:docPr id="788057497" name="Imagen 788057497"/>
             <wp:cNvGraphicFramePr>
               <a:graphicFrameLocks xmlns:a="http://schemas.openxmlformats.org/drawingml/2006/main" noChangeAspect="1"/>
             </wp:cNvGraphicFramePr>
@@ -9090,10 +9087,10 @@
           <w:noProof/>
         </w:rPr>
         <w:drawing>
-          <wp:inline distT="0" distB="0" distL="0" distR="0" wp14:anchorId="0276643F" wp14:editId="12F082C8">
+          <wp:inline distT="0" distB="0" distL="0" distR="0" wp14:anchorId="2481B43C" wp14:editId="1EEC17AC">
             <wp:extent cx="4762500" cy="2447925"/>
             <wp:effectExtent l="0" t="0" r="0" b="0"/>
-            <wp:docPr id="128603505" name="Imagen 128603505"/>
+            <wp:docPr id="1448933402" name="Imagen 1448933402"/>
             <wp:cNvGraphicFramePr>
               <a:graphicFrameLocks xmlns:a="http://schemas.openxmlformats.org/drawingml/2006/main" noChangeAspect="1"/>
             </wp:cNvGraphicFramePr>
@@ -9220,10 +9217,10 @@
           <w:noProof/>
         </w:rPr>
         <w:drawing>
-          <wp:inline distT="0" distB="0" distL="0" distR="0" wp14:anchorId="2FD5E77C" wp14:editId="3C1E4CB3">
+          <wp:inline distT="0" distB="0" distL="0" distR="0" wp14:anchorId="6254EBF6" wp14:editId="6EED2B55">
             <wp:extent cx="6096000" cy="3048000"/>
             <wp:effectExtent l="0" t="0" r="0" b="0"/>
-            <wp:docPr id="2060462624" name="Imagen 2060462624"/>
+            <wp:docPr id="828716913" name="Imagen 828716913"/>
             <wp:cNvGraphicFramePr>
               <a:graphicFrameLocks xmlns:a="http://schemas.openxmlformats.org/drawingml/2006/main" noChangeAspect="1"/>
             </wp:cNvGraphicFramePr>
@@ -9365,10 +9362,10 @@
         </w:rPr>
         <w:lastRenderedPageBreak/>
         <w:drawing>
-          <wp:inline distT="0" distB="0" distL="0" distR="0" wp14:anchorId="717141E5" wp14:editId="20F9EA5A">
+          <wp:inline distT="0" distB="0" distL="0" distR="0" wp14:anchorId="1BA45C75" wp14:editId="0B7BC2A8">
             <wp:extent cx="6096000" cy="3848100"/>
             <wp:effectExtent l="0" t="0" r="0" b="0"/>
-            <wp:docPr id="1455273920" name="Imagen 1455273920"/>
+            <wp:docPr id="1420590424" name="Imagen 1420590424"/>
             <wp:cNvGraphicFramePr>
               <a:graphicFrameLocks xmlns:a="http://schemas.openxmlformats.org/drawingml/2006/main" noChangeAspect="1"/>
             </wp:cNvGraphicFramePr>
@@ -10250,10 +10247,10 @@
           <w:noProof/>
         </w:rPr>
         <w:drawing>
-          <wp:inline distT="0" distB="0" distL="0" distR="0" wp14:anchorId="2EA0316C" wp14:editId="5294D4F3">
+          <wp:inline distT="0" distB="0" distL="0" distR="0" wp14:anchorId="25E76BD1" wp14:editId="3A200106">
             <wp:extent cx="6096000" cy="3000375"/>
             <wp:effectExtent l="0" t="0" r="0" b="0"/>
-            <wp:docPr id="788058391" name="Imagen 788058391"/>
+            <wp:docPr id="148769097" name="Imagen 148769097"/>
             <wp:cNvGraphicFramePr>
               <a:graphicFrameLocks xmlns:a="http://schemas.openxmlformats.org/drawingml/2006/main" noChangeAspect="1"/>
             </wp:cNvGraphicFramePr>
@@ -10419,10 +10416,10 @@
         </w:rPr>
         <w:lastRenderedPageBreak/>
         <w:drawing>
-          <wp:inline distT="0" distB="0" distL="0" distR="0" wp14:anchorId="32BA4A84" wp14:editId="2FC9746F">
+          <wp:inline distT="0" distB="0" distL="0" distR="0" wp14:anchorId="78D423AF" wp14:editId="7D69EEFA">
             <wp:extent cx="6096000" cy="4333875"/>
             <wp:effectExtent l="0" t="0" r="0" b="0"/>
-            <wp:docPr id="1967242470" name="Imagen 1967242470"/>
+            <wp:docPr id="1366187470" name="Imagen 1366187470"/>
             <wp:cNvGraphicFramePr>
               <a:graphicFrameLocks xmlns:a="http://schemas.openxmlformats.org/drawingml/2006/main" noChangeAspect="1"/>
             </wp:cNvGraphicFramePr>
@@ -10516,7 +10513,7 @@
         <w:jc w:val="both"/>
       </w:pPr>
       <w:r>
-        <w:t>La tabla presenta el producto, su categoría, el precio de venta, las existencias y la etiqueta de estado. Las acciones de cada fila son consultar sus movimientos, editar y, según el estado, descontinuar o reactivar. La acción principal de la pantalla, situada en la barra superior, es el registro de un producto nuevo, junto al acceso a la entrada de mercancía y a los márgenes de las categorías.</w:t>
+        <w:t>La tabla presenta el producto, su categoría, el precio de venta, las existencias y la etiqueta de estado. En la columna del precio, una referencia que todavía no lo tiene se marca como tal en lugar de mostrar un cero, que se leería como un precio decidido; el precio se fija al recibir la primera mercancía, según se explica en el apartado 8.5. Las acciones de cada fila son consultar sus movimientos, editar y, según el estado, descontinuar o reactivar. La acción principal de la pantalla, situada en la barra superior, es el registro de un producto nuevo, junto al acceso a la entrada de mercancía y a los márgenes de las categorías.</w:t>
       </w:r>
     </w:p>
     <w:p>
@@ -10525,11 +10522,8 @@
         <w:jc w:val="both"/>
       </w:pPr>
       <w:r>
-        <w:t xml:space="preserve">La pantalla es de los dos roles del negocio, y no muestra lo mismo a cada uno. El vendedor consulta el catálogo, lo busca y lo filtra, y entra al historial de una referencia, porque su rol registra ventas y consulta existencias; no se le ofrecen el registro, la edición, la descontinuación ni el ajuste, y esas acciones sencillamente no aparecen, sin aviso que las explique: no es un trámite pendiente que pueda resolver, es </w:t>
-      </w:r>
-      <w:r>
         <w:lastRenderedPageBreak/>
-        <w:t>el reparto del trabajo. La regla que decide esto vive en el servidor, que rechaza esas operaciones a quien no administra la licorera; la interfaz solo evita ofrecer un botón que se va a rechazar.</w:t>
+        <w:t>La pantalla es de los dos roles del negocio, y no muestra lo mismo a cada uno. El vendedor consulta el catálogo, lo busca y lo filtra, y entra al historial de una referencia, porque su rol registra ventas y consulta existencias; no se le ofrecen el registro, la edición, la descontinuación ni el ajuste, y esas acciones sencillamente no aparecen, sin aviso que las explique: no es un trámite pendiente que pueda resolver, es el reparto del trabajo. La regla que decide esto vive en el servidor, que rechaza esas operaciones a quien no administra la licorera; la interfaz solo evita ofrecer un botón que se va a rechazar.</w:t>
       </w:r>
     </w:p>
     <w:p>
@@ -10560,10 +10554,10 @@
           <w:noProof/>
         </w:rPr>
         <w:drawing>
-          <wp:inline distT="0" distB="0" distL="0" distR="0" wp14:anchorId="5E848EEE" wp14:editId="1E6C1AAD">
+          <wp:inline distT="0" distB="0" distL="0" distR="0" wp14:anchorId="6401D724" wp14:editId="35A776B1">
             <wp:extent cx="6096000" cy="3286125"/>
             <wp:effectExtent l="0" t="0" r="0" b="0"/>
-            <wp:docPr id="788107257" name="Imagen 788107257"/>
+            <wp:docPr id="1892150554" name="Imagen 1892150554"/>
             <wp:cNvGraphicFramePr>
               <a:graphicFrameLocks xmlns:a="http://schemas.openxmlformats.org/drawingml/2006/main" noChangeAspect="1"/>
             </wp:cNvGraphicFramePr>
@@ -10639,7 +10633,7 @@
         <w:jc w:val="both"/>
       </w:pPr>
       <w:r>
-        <w:t>El mismo formulario se emplea para crear y para editar. Agrupa los datos de identificación del producto (nombre, categoría, presentación y código de barras) y los datos comerciales (precio de venta y mínimo de existencias para la alerta); las existencias no se capturan aquí, sino que ingresan como lote con su costo unitario, y el formulario lo advierte bajo los campos comerciales para que su ausencia no se lea como un olvido. La categoría y la presentación se eligen de listas cerradas, definidas en el modelo de datos, y no se escriben a mano: de ello depende que el catálogo se pueda filtrar y agrupar. El precio de venta se registra de forma independiente del costo.</w:t>
+        <w:t>El mismo formulario se emplea para crear y para editar, pero no pide lo mismo en los dos casos. Agrupa los datos de identificación del producto (nombre, categoría, presentación y código de barras) y el mínimo de existencias para la alerta; las existencias no se capturan aquí, sino que ingresan como lote con su costo unitario, y el formulario lo advierte bajo los campos para que su ausencia no se lea como un olvido. La categoría y la presentación se eligen de listas cerradas, definidas en el modelo de datos, y no se escriben a mano: de ello depende que el catálogo se pueda filtrar y agrupar.</w:t>
       </w:r>
     </w:p>
     <w:p>
@@ -10648,11 +10642,11 @@
         <w:jc w:val="both"/>
       </w:pPr>
       <w:r>
-        <w:t xml:space="preserve">Sobre el precio, el formulario muestra la propuesta del sistema: cuántas unidades hay en existencia y lo que costó cada una en promedio, el margen de la categoría y el precio que resulta de aplicarlo, con una acción para tomarlo. El costo que se usa es el promedio ponderado de los lotes que siguen en bodega, no el de la última compra: una compra de oferta por unas pocas unidades no representa lo que costó el inventario, y proponer sobre ella llevaría a vender por debajo de costo todo lo comprado antes. El promedio es además la única base con la que un precio único deja el margen pedido sobre el conjunto de las </w:t>
+        <w:t xml:space="preserve">Al registrar una referencia nueva tampoco se pide el precio de venta, y por la misma razón por la que no se piden las existencias: en ese momento no se conoce el costo que ese precio tiene que cubrir, de modo que cualquier cifra sería una suposición. El precio se fija al recibir la primera mercancía (apartado 8.5), y hasta entonces la referencia queda marcada en el catálogo y el punto de venta no la ofrece. El campo sí </w:t>
       </w:r>
       <w:r>
         <w:lastRenderedPageBreak/>
-        <w:t>existencias. Cuando no quedan unidades se propone sobre la última compra, que es lo único que se sabe, y la pantalla lo dice.</w:t>
+        <w:t>aparece al editar, porque corregir el precio de una referencia que ya se vende corresponde a quien administra la licorera (RF-INV-03), y el precio sigue registrándose de forma independiente del costo.</w:t>
       </w:r>
     </w:p>
     <w:p>
@@ -10661,7 +10655,10 @@
         <w:jc w:val="both"/>
       </w:pPr>
       <w:r>
-        <w:t>Un promedio reparte, y esa parte no puede quedar escondida. Si los lotes no costaron lo mismo, la propuesta muestra también el más barato y el más caro, y el formulario advierte cuando el precio escrito no cubre el costo de alguno de ellos, diciendo cuántas unidades quedan por encima: el margen se cumple sobre el conjunto, pero solo si se venden todas. La propuesta se calcula en el servidor y se redondea a la centena superior, porque un precio con unidades sueltas no se cobra; se sube y no se baja, ya que redondear hacia abajo recortaría el margen que se acaba de pedir. Una referencia sin ninguna compra registrada no tiene propuesta: sin costo no hay nada sobre lo que aplicar un porcentaje.</w:t>
+        <w:t>Al editar, sobre el precio, el formulario muestra la propuesta del sistema: cuántas unidades hay en existencia y lo que costó cada una en promedio, el margen de la categoría y el precio que resulta de aplicarlo, con una acción para tomarlo. El costo que se usa es el promedio ponderado de los lotes que siguen en bodega, no el de la última compra: una compra de oferta por unas pocas unidades no representa lo que costó el inventario, y proponer sobre ella llevaría a vender por debajo de costo todo lo comprado antes. El promedio es además la única base con la que un precio único deja el margen pedido sobre el conjunto de las existencias. Cuando no quedan unidades se propone sobre la última compra, que es lo único que se sabe, y la pantalla lo dice</w:t>
+      </w:r>
+      <w:r>
+        <w:t>.</w:t>
       </w:r>
     </w:p>
     <w:p>
@@ -10670,7 +10667,7 @@
         <w:jc w:val="both"/>
       </w:pPr>
       <w:r>
-        <w:t>El sistema propone y no aplica, y esa es la regla del requisito (RF-INV-11). Una compra más cara no mueve el precio de venta de la referencia: repreciar solo rompería sin avisar una promoción, un precio acordado con el proveedor o un artículo que se vende casi a costo para atraer clientes. Lo que sí hace el formulario es advertir cuando el precio escrito queda por debajo de lo que costó la mercancía, sin impedir que se guarde, porque una liquidación es una decisión del negocio.</w:t>
+        <w:t>Un promedio reparte, y esa parte no puede quedar escondida. Si los lotes no costaron lo mismo, la propuesta muestra también el más barato y el más caro, y el formulario advierte cuando el precio escrito no cubre el costo de alguno de ellos, diciendo cuántas unidades quedan por encima: el margen se cumple sobre el conjunto, pero solo si se venden todas. La propuesta se calcula en el servidor y se redondea a la centena superior, porque un precio con unidades sueltas no se cobra; se sube y no se baja, ya que redondear hacia abajo recortaría el margen que se acaba de pedir. Una referencia sin ninguna compra registrada no tiene propuesta: sin costo no hay nada sobre lo que aplicar un porcentaje.</w:t>
       </w:r>
     </w:p>
     <w:p>
@@ -10679,6 +10676,15 @@
         <w:jc w:val="both"/>
       </w:pPr>
       <w:r>
+        <w:t>El sistema propone y no aplica, y esa es la regla del requisito (RF-INV-11). Una compra más cara no mueve el precio de venta de la referencia: repreciar solo rompería sin avisar una promoción, un precio acordado con el proveedor o un artículo que se vende casi a costo para atraer clientes. Lo que sí hace el formulario es advertir cuando el precio escrito queda por debajo de lo que costó la mercancía, sin impedir que se guarde, porque una liquidación es una decisión del negocio.</w:t>
+      </w:r>
+    </w:p>
+    <w:p>
+      <w:pPr>
+        <w:spacing w:after="110" w:line="262" w:lineRule="auto"/>
+        <w:jc w:val="both"/>
+      </w:pPr>
+      <w:r>
         <w:t>Los márgenes se definen por categoría y no producto a producto, que es como trabaja el comercio: una regla por familia y excepciones donde la regla no vale. Aquí la excepción es escribir el precio a mano. Se editan los seis juntos en una ventana que se abre desde la barra superior del catálogo, reservada a quien administra la licorera, y todas las categorías nacen con el mismo valor inicial, que el negocio ajusta.</w:t>
       </w:r>
     </w:p>
@@ -10691,11 +10697,12 @@
         <w:rPr>
           <w:noProof/>
         </w:rPr>
+        <w:lastRenderedPageBreak/>
         <w:drawing>
-          <wp:inline distT="0" distB="0" distL="0" distR="0" wp14:anchorId="34482D00" wp14:editId="4FF31DC9">
+          <wp:inline distT="0" distB="0" distL="0" distR="0" wp14:anchorId="74812C61" wp14:editId="1A907B67">
             <wp:extent cx="4953000" cy="4067175"/>
             <wp:effectExtent l="0" t="0" r="0" b="0"/>
-            <wp:docPr id="1391113357" name="Imagen 1391113357"/>
+            <wp:docPr id="946998091" name="Imagen 946998091"/>
             <wp:cNvGraphicFramePr>
               <a:graphicFrameLocks xmlns:a="http://schemas.openxmlformats.org/drawingml/2006/main" noChangeAspect="1"/>
             </wp:cNvGraphicFramePr>
@@ -10771,11 +10778,7 @@
         <w:jc w:val="both"/>
       </w:pPr>
       <w:r>
-        <w:t xml:space="preserve">Registra la llegada de mercancía al negocio y es el único formulario del sistema con varias líneas, porque una compra llega con lo que diga la factura del proveedor: tres referencias o catorce. En la parte alta se capturan los datos comunes a toda la entrada —el proveedor y una observación, ambos opcionales— y debajo se agregan tantas líneas como productos se hayan recibido, cada una con su referencia, la </w:t>
-      </w:r>
-      <w:r>
-        <w:lastRenderedPageBreak/>
-        <w:t>cantidad y el costo unitario al que se compró. El producto no se elige de una lista desplegable sino que se busca por nombre o por código de barras, porque un catálogo de varios cientos de referencias no se recorre con la vista.</w:t>
+        <w:t>Registra la llegada de mercancía al negocio y es el único formulario del sistema con varias líneas, porque una compra llega con lo que diga la factura del proveedor: tres referencias o catorce. En la parte alta se capturan los datos comunes a toda la entrada —el proveedor y una observación, ambos opcionales— y debajo se agregan tantas líneas como productos se hayan recibido, cada una con su referencia, la cantidad y el costo unitario al que se compró. El producto no se elige de una lista desplegable sino que se busca por nombre o por código de barras, porque un catálogo de varios cientos de referencias no se recorre con la vista.</w:t>
       </w:r>
     </w:p>
     <w:p>
@@ -10793,6 +10796,37 @@
         <w:jc w:val="both"/>
       </w:pPr>
       <w:r>
+        <w:t>Porque el costo se conoce aquí, aquí se decide también el precio de venta. La línea de una referencia que todavía no lo tiene lo pide y no deja registrar la entrada sin él: una compra que entra a bodega sin precio es mercancía que el punto de venta no puede ofrecer, y nadie se entera hasta que un cliente la pide. Para no obligar a calcularlo, la propia línea propone el que resulta del costo recién escrito y del margen de la categoría (RF-INV-11), con una acción para tomarlo.</w:t>
+      </w:r>
+    </w:p>
+    <w:p>
+      <w:pPr>
+        <w:spacing w:after="110" w:line="262" w:lineRule="auto"/>
+        <w:jc w:val="both"/>
+      </w:pPr>
+      <w:r>
+        <w:t xml:space="preserve">La línea tampoco se calla cuando la referencia ya tiene precio, y esa es la otra decisión de la pantalla. Una compra más cara sube el costo promedio de las existencias y deja el precio de siempre ganando menos sin que salte ningún aviso, porque sigue cubriendo el costo: no se pierde dinero, se deja de ganar, y la única forma de verlo sería abrir la ficha del producto a editarla, que es justo lo que nadie hace al recibir </w:t>
+      </w:r>
+      <w:r>
+        <w:lastRenderedPageBreak/>
+        <w:t>una compra. Por eso toda línea con cantidad y costo escritos muestra lo que costará la unidad después de ese ingreso, el precio que pediría el margen de su categoría y, cuando el precio vigente se queda corto, en cuánto queda el margen real. El cálculo se hace sobre el promedio que quedará después de la entrada, no sobre el de hoy ni sobre el costo del lote suelto: en cuanto la mercancía entra, lo que cuestan las existencias es otra cosa, y es esa la que el precio tiene que cubrir.</w:t>
+      </w:r>
+    </w:p>
+    <w:p>
+      <w:pPr>
+        <w:spacing w:after="110" w:line="262" w:lineRule="auto"/>
+        <w:jc w:val="both"/>
+      </w:pPr>
+      <w:r>
+        <w:t>El sistema propone y no aplica. El campo del precio llega vacío en una referencia que ya lo tiene, y vacío significa que no se toca: si cada factura cambiara el precio, el mostrador tendría una tarifa distinta cada semana sin que nadie lo hubiera decidido. Los dos avisos de la línea —el precio no cubre el costo, o lo cubre pero ya no deja el porcentaje de la categoría— informan y no impiden registrar: una liquidación y un precio acordado con un proveedor son decisiones del negocio.</w:t>
+      </w:r>
+    </w:p>
+    <w:p>
+      <w:pPr>
+        <w:spacing w:after="110" w:line="262" w:lineRule="auto"/>
+        <w:jc w:val="both"/>
+      </w:pPr>
+      <w:r>
         <w:t>Debajo se listan las entradas ya registradas con su fecha, su proveedor, los productos que trajo cada una y su costo total. Ninguna ofrece acción de edición ni de borrado: una entrada registrada movió existencias y quedó anotada en el kardex, de modo que modificarla haría que los saldos posteriores dejaran de cuadrar. Lo que corrige una entrada equivocada es un ajuste de existencias con su motivo, descrito en el apartado siguiente.</w:t>
       </w:r>
     </w:p>
@@ -10806,10 +10840,10 @@
           <w:noProof/>
         </w:rPr>
         <w:drawing>
-          <wp:inline distT="0" distB="0" distL="0" distR="0" wp14:anchorId="3CCA781E" wp14:editId="3E6EF768">
+          <wp:inline distT="0" distB="0" distL="0" distR="0" wp14:anchorId="33DAE321" wp14:editId="6F48321E">
             <wp:extent cx="6096000" cy="4124325"/>
             <wp:effectExtent l="0" t="0" r="0" b="0"/>
-            <wp:docPr id="1535086446" name="Imagen 1535086446"/>
+            <wp:docPr id="1549323608" name="Imagen 1549323608"/>
             <wp:cNvGraphicFramePr>
               <a:graphicFrameLocks xmlns:a="http://schemas.openxmlformats.org/drawingml/2006/main" noChangeAspect="1"/>
             </wp:cNvGraphicFramePr>
@@ -10894,11 +10928,8 @@
         <w:jc w:val="both"/>
       </w:pPr>
       <w:r>
-        <w:t xml:space="preserve">El ajuste se sitúa sobre el historial y no en la lista de productos porque un ajuste es la respuesta a una diferencia, y la diferencia se explica en los movimientos: faltan unidades que nadie vendió, o aparecen </w:t>
-      </w:r>
-      <w:r>
         <w:lastRenderedPageBreak/>
-        <w:t>unidades que nadie registró. Se pide la diferencia y no la cantidad final —un número positivo si en el conteo sobraron unidades y uno negativo si faltaron— junto con el motivo, que es obligatorio: una existencia que cambió sin explicación es justo lo que un inventario sirve para evitar. Al guardarlo, el movimiento aparece en la primera fila de la tabla.</w:t>
+        <w:t>El ajuste se sitúa sobre el historial y no en la lista de productos porque un ajuste es la respuesta a una diferencia, y la diferencia se explica en los movimientos: faltan unidades que nadie vendió, o aparecen unidades que nadie registró. Se pide la diferencia y no la cantidad final —un número positivo si en el conteo sobraron unidades y uno negativo si faltaron— junto con el motivo, que es obligatorio: una existencia que cambió sin explicación es justo lo que un inventario sirve para evitar. Al guardarlo, el movimiento aparece en la primera fila de la tabla.</w:t>
       </w:r>
     </w:p>
     <w:p>
@@ -10920,10 +10951,10 @@
           <w:noProof/>
         </w:rPr>
         <w:drawing>
-          <wp:inline distT="0" distB="0" distL="0" distR="0" wp14:anchorId="421628D2" wp14:editId="6728EA89">
+          <wp:inline distT="0" distB="0" distL="0" distR="0" wp14:anchorId="3FB78D87" wp14:editId="7FBD4BC8">
             <wp:extent cx="6096000" cy="4162425"/>
             <wp:effectExtent l="0" t="0" r="0" b="0"/>
-            <wp:docPr id="1510048027" name="Imagen 1510048027"/>
+            <wp:docPr id="649093390" name="Imagen 649093390"/>
             <wp:cNvGraphicFramePr>
               <a:graphicFrameLocks xmlns:a="http://schemas.openxmlformats.org/drawingml/2006/main" noChangeAspect="1"/>
             </wp:cNvGraphicFramePr>
@@ -11027,7 +11058,7 @@
         <w:jc w:val="both"/>
       </w:pPr>
       <w:r>
-        <w:t>Cada línea permite corregir su cantidad o retirarse, porque equivocarse de cantidad es lo más frecuente que ocurre en un mostrador. La cantidad se escribe además de ajustarse con los botones: cien unidades de un mismo producto son cien pulsaciones en un botón y tres teclas en un campo. Ninguna línea admite más unidades de las que hay en existencia, y al llegar al tope la propia línea dice cuántas quedan; la comprobación definitiva la hace el servidor, porque otra caja puede haber vendido mientras tanto, pero avisar aquí evita armar una venta larga para descubrir al cobrar que de la tercera referencia no había suficiente.</w:t>
+        <w:t>El buscador ofrece todas las referencias activas, incluidas las que en ese momento no se pueden vender. Ocultar una sería peor que mostrarla: quien la busca la creería no registrada y la registraría por segunda vez, con lo que el catálogo acabaría con dos fichas del mismo producto y las existencias repartidas entre ambas. Hay dos motivos para que una referencia no se pueda vender —no quedan unidades, o todavía no tiene precio— y los dos se responden igual: la referencia se deja elegir, no se agrega a la venta y la pantalla dice cuál de los dos es. Son el mismo caso para quien atiende, y darles dos comportamientos distintos obligaría a aprenderse cuál es cuál.</w:t>
       </w:r>
     </w:p>
     <w:p>
@@ -11036,7 +11067,7 @@
         <w:jc w:val="both"/>
       </w:pPr>
       <w:r>
-        <w:t>La venta a medio armar no se pierde al salir de la pantalla. Quien atiende puede necesitar consultar el inventario con el cliente delante, o pulsar otra opción del menú sin querer, y al volver encuentra las mismas líneas; lo contrario obligaría a pedirle al cliente que repitiera su compra. Se conserva en el propio navegador y por cuenta de usuario, de modo que dos personas que se turnan la misma caja no heredan la una el carro de la otra, y se descarta al cobrar.</w:t>
+        <w:t>Cada línea permite corregir su cantidad o retirarse, porque equivocarse de cantidad es lo más frecuente que ocurre en un mostrador. La cantidad se escribe además de ajustarse con los botones: cien unidades de un mismo producto son cien pulsaciones en un botón y tres teclas en un campo. Ninguna línea admite más unidades de las que hay en existencia, y al llegar al tope la propia línea dice cuántas quedan; la comprobación definitiva la hace el servidor, porque otra caja puede haber vendido mientras tanto, pero avisar aquí evita armar una venta larga para descubrir al cobrar que de la tercera referencia no había suficiente.</w:t>
       </w:r>
     </w:p>
     <w:p>
@@ -11045,7 +11076,7 @@
         <w:jc w:val="both"/>
       </w:pPr>
       <w:r>
-        <w:t>Antes del cobro, la venta admite una nota corta y opcional —«mesa 1, pedido 3»—, porque el negocio no es solo de mostrador y una parte de lo que vende se consume en mesa. Sale en el comprobante y el buscador del historial la encuentra, que es para lo que existe: sirve para reconocer después una venta que el cliente no se llevó en la mano. Es una etiqueta y no un campo de notas, de ahí que sea corta; en una caja que se juzga por su rapidez nadie va a redactar. El modelo entregado no declara esa columna y por eso queda escrita como decisión.</w:t>
+        <w:t>La venta a medio armar no se pierde al salir de la pantalla. Quien atiende puede necesitar consultar el inventario con el cliente delante, o pulsar otra opción del menú sin querer, y al volver encuentra las mismas líneas; lo contrario obligaría a pedirle al cliente que repitiera su compra. Se conserva en el propio navegador y por cuenta de usuario, de modo que dos personas que se turnan la misma caja no heredan la una el carro de la otra, y se descarta al cobrar.</w:t>
       </w:r>
     </w:p>
     <w:p>
@@ -11054,7 +11085,7 @@
         <w:jc w:val="both"/>
       </w:pPr>
       <w:r>
-        <w:t>El medio de pago se elige antes de cobrar. Cuando es efectivo, la pantalla pide el monto recibido y calcula el cambio, que es la operación que el sistema debe ahorrarle a quien atiende; en los otros dos medios ese campo no aparece, porque no hay cambio que devolver. El cobro en efectivo no se habilita hasta que ese monto está escrito y alcanza el total, y para el pago exacto hay un botón que lo rellena: dejar el botón activo con el campo vacío haría inútil apagarlo cuando el dinero no alcanza, porque bastaría no escribir nada. El número consecutivo de la venta se muestra en la barra superior: es el dato por el que el cliente la nombra si vuelve a reclamar.</w:t>
+        <w:t>Antes del cobro, la venta admite una nota corta y opcional —«mesa 1, pedido 3»—, porque el negocio no es solo de mostrador y una parte de lo que vende se consume en mesa. Sale en el comprobante y el buscador del historial la encuentra, que es para lo que existe: sirve para reconocer después una venta que el cliente no se llevó en la mano. Es una etiqueta y no un campo de notas, de ahí que sea corta; en una caja que se juzga por su rapidez nadie va a redactar. El modelo entregado no declara esa columna y por eso queda escrita como decisión.</w:t>
       </w:r>
     </w:p>
     <w:p>
@@ -11063,6 +11094,15 @@
         <w:jc w:val="both"/>
       </w:pPr>
       <w:r>
+        <w:t>El medio de pago se elige antes de cobrar. Cuando es efectivo, la pantalla pide el monto recibido y calcula el cambio, que es la operación que el sistema debe ahorrarle a quien atiende; en los otros dos medios ese campo no aparece, porque no hay cambio que devolver. El cobro en efectivo no se habilita hasta que ese monto está escrito y alcanza el total, y para el pago exacto hay un botón que lo rellena: dejar el botón activo con el campo vacío haría inútil apagarlo cuando el dinero no alcanza, porque bastaría no escribir nada. El número consecutivo de la venta se muestra en la barra superior: es el dato por el que el cliente la nombra si vuelve a reclamar.</w:t>
+      </w:r>
+    </w:p>
+    <w:p>
+      <w:pPr>
+        <w:spacing w:after="110" w:line="262" w:lineRule="auto"/>
+        <w:jc w:val="both"/>
+      </w:pPr>
+      <w:r>
         <w:t>Al confirmar el cobro, el sistema descuenta las existencias consumiendo los lotes más antiguos, registra el costo real de lo despachado y genera el comprobante. Si lo pedido supera lo disponible, la venta se rechaza entera y no se registra nada: una existencia en negativo no significa nada, y en cuanto aparece una deja de poder confiarse en el resto del inventario.</w:t>
       </w:r>
     </w:p>
@@ -11077,10 +11117,10 @@
         </w:rPr>
         <w:lastRenderedPageBreak/>
         <w:drawing>
-          <wp:inline distT="0" distB="0" distL="0" distR="0" wp14:anchorId="27BA7957" wp14:editId="37CDC3D7">
+          <wp:inline distT="0" distB="0" distL="0" distR="0" wp14:anchorId="1C112C66" wp14:editId="59E0F887">
             <wp:extent cx="6096000" cy="4514850"/>
             <wp:effectExtent l="0" t="0" r="0" b="0"/>
-            <wp:docPr id="1892110892" name="Imagen 1892110892"/>
+            <wp:docPr id="1207078224" name="Imagen 1207078224"/>
             <wp:cNvGraphicFramePr>
               <a:graphicFrameLocks xmlns:a="http://schemas.openxmlformats.org/drawingml/2006/main" noChangeAspect="1"/>
             </wp:cNvGraphicFramePr>
@@ -11151,10 +11191,10 @@
           <w:noProof/>
         </w:rPr>
         <w:drawing>
-          <wp:inline distT="0" distB="0" distL="0" distR="0" wp14:anchorId="6BDEE2A6" wp14:editId="60A9E873">
+          <wp:inline distT="0" distB="0" distL="0" distR="0" wp14:anchorId="26AB4B14" wp14:editId="146C17A8">
             <wp:extent cx="4000500" cy="1438275"/>
             <wp:effectExtent l="0" t="0" r="0" b="0"/>
-            <wp:docPr id="1942550513" name="Imagen 1942550513"/>
+            <wp:docPr id="389987871" name="Imagen 389987871"/>
             <wp:cNvGraphicFramePr>
               <a:graphicFrameLocks xmlns:a="http://schemas.openxmlformats.org/drawingml/2006/main" noChangeAspect="1"/>
             </wp:cNvGraphicFramePr>
@@ -11281,10 +11321,10 @@
         </w:rPr>
         <w:lastRenderedPageBreak/>
         <w:drawing>
-          <wp:inline distT="0" distB="0" distL="0" distR="0" wp14:anchorId="71475E37" wp14:editId="59F64709">
+          <wp:inline distT="0" distB="0" distL="0" distR="0" wp14:anchorId="11D45642" wp14:editId="19FDEDBB">
             <wp:extent cx="6096000" cy="7010400"/>
             <wp:effectExtent l="0" t="0" r="0" b="0"/>
-            <wp:docPr id="2087876919" name="Imagen 2087876919"/>
+            <wp:docPr id="1763511670" name="Imagen 1763511670"/>
             <wp:cNvGraphicFramePr>
               <a:graphicFrameLocks xmlns:a="http://schemas.openxmlformats.org/drawingml/2006/main" noChangeAspect="1"/>
             </wp:cNvGraphicFramePr>
@@ -11431,10 +11471,10 @@
           <w:noProof/>
         </w:rPr>
         <w:drawing>
-          <wp:inline distT="0" distB="0" distL="0" distR="0" wp14:anchorId="58100334" wp14:editId="7957C10C">
+          <wp:inline distT="0" distB="0" distL="0" distR="0" wp14:anchorId="3D95EAE9" wp14:editId="3B61CD87">
             <wp:extent cx="6096000" cy="3724275"/>
             <wp:effectExtent l="0" t="0" r="0" b="0"/>
-            <wp:docPr id="1840704145" name="Imagen 1840704145"/>
+            <wp:docPr id="1578967076" name="Imagen 1578967076"/>
             <wp:cNvGraphicFramePr>
               <a:graphicFrameLocks xmlns:a="http://schemas.openxmlformats.org/drawingml/2006/main" noChangeAspect="1"/>
             </wp:cNvGraphicFramePr>
@@ -11524,10 +11564,10 @@
           <w:noProof/>
         </w:rPr>
         <w:drawing>
-          <wp:inline distT="0" distB="0" distL="0" distR="0" wp14:anchorId="3695DD6D" wp14:editId="2E5C6003">
+          <wp:inline distT="0" distB="0" distL="0" distR="0" wp14:anchorId="32168890" wp14:editId="2581D1F5">
             <wp:extent cx="6096000" cy="2857500"/>
             <wp:effectExtent l="0" t="0" r="0" b="0"/>
-            <wp:docPr id="785120993" name="Imagen 785120993"/>
+            <wp:docPr id="2132075501" name="Imagen 2132075501"/>
             <wp:cNvGraphicFramePr>
               <a:graphicFrameLocks xmlns:a="http://schemas.openxmlformats.org/drawingml/2006/main" noChangeAspect="1"/>
             </wp:cNvGraphicFramePr>
@@ -11644,10 +11684,10 @@
         </w:rPr>
         <w:lastRenderedPageBreak/>
         <w:drawing>
-          <wp:inline distT="0" distB="0" distL="0" distR="0" wp14:anchorId="28DC1C85" wp14:editId="1F3EF475">
+          <wp:inline distT="0" distB="0" distL="0" distR="0" wp14:anchorId="00606F16" wp14:editId="0E92529F">
             <wp:extent cx="6096000" cy="2857500"/>
             <wp:effectExtent l="0" t="0" r="0" b="0"/>
-            <wp:docPr id="1384330234" name="Imagen 1384330234"/>
+            <wp:docPr id="183405289" name="Imagen 183405289"/>
             <wp:cNvGraphicFramePr>
               <a:graphicFrameLocks xmlns:a="http://schemas.openxmlformats.org/drawingml/2006/main" noChangeAspect="1"/>
             </wp:cNvGraphicFramePr>
@@ -11755,10 +11795,10 @@
         </w:rPr>
         <w:lastRenderedPageBreak/>
         <w:drawing>
-          <wp:inline distT="0" distB="0" distL="0" distR="0" wp14:anchorId="4D34F3AF" wp14:editId="03756FD9">
+          <wp:inline distT="0" distB="0" distL="0" distR="0" wp14:anchorId="1E785703" wp14:editId="09AEC73F">
             <wp:extent cx="6096000" cy="3562350"/>
             <wp:effectExtent l="0" t="0" r="0" b="0"/>
-            <wp:docPr id="2068243361" name="Imagen 2068243361"/>
+            <wp:docPr id="1214788932" name="Imagen 1214788932"/>
             <wp:cNvGraphicFramePr>
               <a:graphicFrameLocks xmlns:a="http://schemas.openxmlformats.org/drawingml/2006/main" noChangeAspect="1"/>
             </wp:cNvGraphicFramePr>
@@ -11866,10 +11906,10 @@
         </w:rPr>
         <w:lastRenderedPageBreak/>
         <w:drawing>
-          <wp:inline distT="0" distB="0" distL="0" distR="0" wp14:anchorId="4B508131" wp14:editId="6A7918D4">
+          <wp:inline distT="0" distB="0" distL="0" distR="0" wp14:anchorId="111E6793" wp14:editId="567821E8">
             <wp:extent cx="6096000" cy="3067050"/>
             <wp:effectExtent l="0" t="0" r="0" b="0"/>
-            <wp:docPr id="962042407" name="Imagen 962042407"/>
+            <wp:docPr id="1745659329" name="Imagen 1745659329"/>
             <wp:cNvGraphicFramePr>
               <a:graphicFrameLocks xmlns:a="http://schemas.openxmlformats.org/drawingml/2006/main" noChangeAspect="1"/>
             </wp:cNvGraphicFramePr>
@@ -11986,10 +12026,10 @@
         </w:rPr>
         <w:lastRenderedPageBreak/>
         <w:drawing>
-          <wp:inline distT="0" distB="0" distL="0" distR="0" wp14:anchorId="42BA69A9" wp14:editId="047460C6">
+          <wp:inline distT="0" distB="0" distL="0" distR="0" wp14:anchorId="59B9A143" wp14:editId="416C7B54">
             <wp:extent cx="6096000" cy="4114800"/>
             <wp:effectExtent l="0" t="0" r="0" b="0"/>
-            <wp:docPr id="1600078232" name="Imagen 1600078232"/>
+            <wp:docPr id="1541209090" name="Imagen 1541209090"/>
             <wp:cNvGraphicFramePr>
               <a:graphicFrameLocks xmlns:a="http://schemas.openxmlformats.org/drawingml/2006/main" noChangeAspect="1"/>
             </wp:cNvGraphicFramePr>
@@ -12080,10 +12120,10 @@
           <w:noProof/>
         </w:rPr>
         <w:drawing>
-          <wp:inline distT="0" distB="0" distL="0" distR="0" wp14:anchorId="7FB14060" wp14:editId="4DFFA8C5">
+          <wp:inline distT="0" distB="0" distL="0" distR="0" wp14:anchorId="79C4263F" wp14:editId="74FC2BD4">
             <wp:extent cx="6096000" cy="2733675"/>
             <wp:effectExtent l="0" t="0" r="0" b="0"/>
-            <wp:docPr id="2141904253" name="Imagen 2141904253"/>
+            <wp:docPr id="1146416650" name="Imagen 1146416650"/>
             <wp:cNvGraphicFramePr>
               <a:graphicFrameLocks xmlns:a="http://schemas.openxmlformats.org/drawingml/2006/main" noChangeAspect="1"/>
             </wp:cNvGraphicFramePr>
@@ -12956,10 +12996,10 @@
           <w:noProof/>
         </w:rPr>
         <w:drawing>
-          <wp:inline distT="0" distB="0" distL="0" distR="0" wp14:anchorId="63FA7E2F" wp14:editId="1BC7AB24">
+          <wp:inline distT="0" distB="0" distL="0" distR="0" wp14:anchorId="092A686B" wp14:editId="3AF482D9">
             <wp:extent cx="6096000" cy="3295650"/>
             <wp:effectExtent l="0" t="0" r="0" b="0"/>
-            <wp:docPr id="117207438" name="Imagen 117207438"/>
+            <wp:docPr id="1395751284" name="Imagen 1395751284"/>
             <wp:cNvGraphicFramePr>
               <a:graphicFrameLocks xmlns:a="http://schemas.openxmlformats.org/drawingml/2006/main" noChangeAspect="1"/>
             </wp:cNvGraphicFramePr>
@@ -13079,10 +13119,10 @@
           <w:noProof/>
         </w:rPr>
         <w:drawing>
-          <wp:inline distT="0" distB="0" distL="0" distR="0" wp14:anchorId="55FD444A" wp14:editId="7031BE45">
+          <wp:inline distT="0" distB="0" distL="0" distR="0" wp14:anchorId="514C9E97" wp14:editId="036CE5F2">
             <wp:extent cx="6096000" cy="3067050"/>
             <wp:effectExtent l="0" t="0" r="0" b="0"/>
-            <wp:docPr id="1042141808" name="Imagen 1042141808"/>
+            <wp:docPr id="919231997" name="Imagen 919231997"/>
             <wp:cNvGraphicFramePr>
               <a:graphicFrameLocks xmlns:a="http://schemas.openxmlformats.org/drawingml/2006/main" noChangeAspect="1"/>
             </wp:cNvGraphicFramePr>
@@ -14254,10 +14294,10 @@
 <file path=word/numbering.xml><?xml version="1.0" encoding="utf-8"?>
 <w:numbering xmlns:wpc="http://schemas.microsoft.com/office/word/2010/wordprocessingCanvas" xmlns:cx="http://schemas.microsoft.com/office/drawing/2014/chartex" xmlns:cx1="http://schemas.microsoft.com/office/drawing/2015/9/8/chartex" xmlns:cx2="http://schemas.microsoft.com/office/drawing/2015/10/21/chartex" xmlns:cx3="http://schemas.microsoft.com/office/drawing/2016/5/9/chartex" xmlns:cx4="http://schemas.microsoft.com/office/drawing/2016/5/10/chartex" xmlns:cx5="http://schemas.microsoft.com/office/drawing/2016/5/11/chartex" xmlns:cx6="http://schemas.microsoft.com/office/drawing/2016/5/12/chartex" xmlns:cx7="http://schemas.microsoft.com/office/drawing/2016/5/13/chartex" xmlns:cx8="http://schemas.microsoft.com/office/drawing/2016/5/14/chartex" xmlns:mc="http://schemas.openxmlformats.org/markup-compatibility/2006" xmlns:aink="http://schemas.microsoft.com/office/drawing/2016/ink" xmlns:am3d="http://schemas.microsoft.com/office/drawing/2017/model3d" xmlns:o="urn:schemas-microsoft-com:office:office" xmlns:oel="http://schemas.microsoft.com/office/2019/extlst" xmlns:r="http://schemas.openxmlformats.org/officeDocument/2006/relationships" xmlns:m="http://schemas.openxmlformats.org/officeDocument/2006/math" xmlns:v="urn:schemas-microsoft-com:vml" xmlns:wp14="http://schemas.microsoft.com/office/word/2010/wordprocessingDrawing" xmlns:wp="http://schemas.openxmlformats.org/drawingml/2006/wordprocessingDrawing" xmlns:w10="urn:schemas-microsoft-com:office:word" xmlns:w="http://schemas.openxmlformats.org/wordprocessingml/2006/main" xmlns:w14="http://schemas.microsoft.com/office/word/2010/wordml" xmlns:w15="http://schemas.microsoft.com/office/word/2012/wordml" xmlns:w16cex="http://schemas.microsoft.com/office/word/2018/wordml/cex" xmlns:w16cid="http://schemas.microsoft.com/office/word/2016/wordml/cid" xmlns:w16="http://schemas.microsoft.com/office/word/2018/wordml" xmlns:w16du="http://schemas.microsoft.com/office/word/2023/wordml/word16du" xmlns:w16sdtdh="http://schemas.microsoft.com/office/word/2020/wordml/sdtdatahash" xmlns:w16sdtfl="http://schemas.microsoft.com/office/word/2024/wordml/sdtformatlock" xmlns:w16se="http://schemas.microsoft.com/office/word/2015/wordml/symex" xmlns:wpg="http://schemas.microsoft.com/office/word/2010/wordprocessingGroup" xmlns:wpi="http://schemas.microsoft.com/office/word/2010/wordprocessingInk" xmlns:wne="http://schemas.microsoft.com/office/word/2006/wordml" xmlns:wps="http://schemas.microsoft.com/office/word/2010/wordprocessingShape" mc:Ignorable="w14 w15 w16se w16cid w16 w16cex w16sdtdh w16sdtfl w16du wp14">
   <w:abstractNum w:abstractNumId="0" w15:restartNumberingAfterBreak="0">
-    <w:nsid w:val="233B48F9"/>
+    <w:nsid w:val="365A4F4E"/>
     <w:multiLevelType w:val="hybridMultilevel"/>
-    <w:tmpl w:val="9BD00C8E"/>
-    <w:lvl w:ilvl="0" w:tplc="FFA89430">
+    <w:tmpl w:val="6CCE9EA4"/>
+    <w:lvl w:ilvl="0" w:tplc="75640D34">
       <w:start w:val="1"/>
       <w:numFmt w:val="bullet"/>
       <w:lvlText w:val="●"/>
@@ -14266,7 +14306,7 @@
         <w:ind w:left="720" w:hanging="360"/>
       </w:pPr>
     </w:lvl>
-    <w:lvl w:ilvl="1" w:tplc="74CC47AE">
+    <w:lvl w:ilvl="1" w:tplc="E3327036">
       <w:start w:val="1"/>
       <w:numFmt w:val="bullet"/>
       <w:lvlText w:val="○"/>
@@ -14275,7 +14315,7 @@
         <w:ind w:left="1440" w:hanging="360"/>
       </w:pPr>
     </w:lvl>
-    <w:lvl w:ilvl="2" w:tplc="32C6605E">
+    <w:lvl w:ilvl="2" w:tplc="43BA935C">
       <w:start w:val="1"/>
       <w:numFmt w:val="bullet"/>
       <w:lvlText w:val="■"/>
@@ -14284,7 +14324,7 @@
         <w:ind w:left="2160" w:hanging="360"/>
       </w:pPr>
     </w:lvl>
-    <w:lvl w:ilvl="3" w:tplc="90BC0764">
+    <w:lvl w:ilvl="3" w:tplc="946EEEFC">
       <w:start w:val="1"/>
       <w:numFmt w:val="bullet"/>
       <w:lvlText w:val="●"/>
@@ -14293,7 +14333,7 @@
         <w:ind w:left="2880" w:hanging="360"/>
       </w:pPr>
     </w:lvl>
-    <w:lvl w:ilvl="4" w:tplc="063ED4BC">
+    <w:lvl w:ilvl="4" w:tplc="CB40FD3E">
       <w:start w:val="1"/>
       <w:numFmt w:val="bullet"/>
       <w:lvlText w:val="○"/>
@@ -14302,7 +14342,7 @@
         <w:ind w:left="3600" w:hanging="360"/>
       </w:pPr>
     </w:lvl>
-    <w:lvl w:ilvl="5" w:tplc="C4B03A2A">
+    <w:lvl w:ilvl="5" w:tplc="F20EA576">
       <w:start w:val="1"/>
       <w:numFmt w:val="bullet"/>
       <w:lvlText w:val="■"/>
@@ -14311,7 +14351,7 @@
         <w:ind w:left="4320" w:hanging="360"/>
       </w:pPr>
     </w:lvl>
-    <w:lvl w:ilvl="6" w:tplc="C4AEB844">
+    <w:lvl w:ilvl="6" w:tplc="359882D0">
       <w:start w:val="1"/>
       <w:numFmt w:val="bullet"/>
       <w:lvlText w:val="●"/>
@@ -14320,7 +14360,7 @@
         <w:ind w:left="5040" w:hanging="360"/>
       </w:pPr>
     </w:lvl>
-    <w:lvl w:ilvl="7" w:tplc="AE4895B8">
+    <w:lvl w:ilvl="7" w:tplc="064024B8">
       <w:start w:val="1"/>
       <w:numFmt w:val="bullet"/>
       <w:lvlText w:val="●"/>
@@ -14329,7 +14369,7 @@
         <w:ind w:left="5760" w:hanging="360"/>
       </w:pPr>
     </w:lvl>
-    <w:lvl w:ilvl="8" w:tplc="528640C8">
+    <w:lvl w:ilvl="8" w:tplc="EA9CE830">
       <w:start w:val="1"/>
       <w:numFmt w:val="bullet"/>
       <w:lvlText w:val="●"/>
@@ -14339,7 +14379,7 @@
       </w:pPr>
     </w:lvl>
   </w:abstractNum>
-  <w:num w:numId="1" w16cid:durableId="1334379663">
+  <w:num w:numId="1" w16cid:durableId="2024278087">
     <w:abstractNumId w:val="0"/>
     <w:lvlOverride w:ilvl="0">
       <w:startOverride w:val="1"/>

</xml_diff>

<commit_message>
Actualizo el documento de diseno con las marcas del precio y Agrego el capitulo de ventas al manual de usuario
</commit_message>
<xml_diff>
--- a/docs/diseno/INVENTRA_Documento_Tecnico_Diseno.docx
+++ b/docs/diseno/INVENTRA_Documento_Tecnico_Diseno.docx
@@ -154,12 +154,6 @@
         <w:gridCol w:w="3260"/>
       </w:tblGrid>
       <w:tr>
-        <w:tblPrEx>
-          <w:tblCellMar>
-            <w:top w:w="0" w:type="dxa"/>
-            <w:bottom w:w="0" w:type="dxa"/>
-          </w:tblCellMar>
-        </w:tblPrEx>
         <w:trPr>
           <w:tblHeader/>
         </w:trPr>
@@ -273,12 +267,6 @@
         </w:tc>
       </w:tr>
       <w:tr>
-        <w:tblPrEx>
-          <w:tblCellMar>
-            <w:top w:w="0" w:type="dxa"/>
-            <w:bottom w:w="0" w:type="dxa"/>
-          </w:tblCellMar>
-        </w:tblPrEx>
         <w:tc>
           <w:tcPr>
             <w:tcW w:w="1500" w:type="dxa"/>
@@ -2707,7 +2695,10 @@
         <w:t xml:space="preserve">Alcance. </w:t>
       </w:r>
       <w:r>
-        <w:t>Cubre la aplicación web y su versión móvil. Se apoya en la especificación de requisitos (IEEE 830), en el modelo de datos (MER y diccionario) y en el prototipo de INVENTRA. No incluye la implementación del código, que corresponde a la etapa de construcción.</w:t>
+        <w:t>Cubre la aplicación web y su versión móvil. Se apoya en la especificación de requisitos (IEEE 830), en el modelo de datos (MER y diccionario) y en el prototipo de INVENTRA. No incluye la implementación del código, que corresponde a la etapa de construcción</w:t>
+      </w:r>
+      <w:r>
+        <w:t>.</w:t>
       </w:r>
     </w:p>
     <w:p>
@@ -3065,7 +3056,7 @@
           <w:noProof/>
         </w:rPr>
         <w:drawing>
-          <wp:inline distT="0" distB="0" distL="0" distR="0" wp14:anchorId="5F7469F8" wp14:editId="10123D77">
+          <wp:inline distT="0" distB="0" distL="0" distR="0" wp14:anchorId="0C98B890" wp14:editId="59ED15AC">
             <wp:extent cx="5905500" cy="2324100"/>
             <wp:effectExtent l="0" t="0" r="0" b="0"/>
             <wp:docPr id="1" name="Imagen 1"/>
@@ -3148,10 +3139,10 @@
           <w:noProof/>
         </w:rPr>
         <w:drawing>
-          <wp:inline distT="0" distB="0" distL="0" distR="0" wp14:anchorId="26CCC710" wp14:editId="18FD7992">
+          <wp:inline distT="0" distB="0" distL="0" distR="0" wp14:anchorId="77654B83" wp14:editId="040ECD3D">
             <wp:extent cx="5334000" cy="2371725"/>
             <wp:effectExtent l="0" t="0" r="0" b="0"/>
-            <wp:docPr id="842983843" name="Imagen 842983843"/>
+            <wp:docPr id="1542223091" name="Imagen 1542223091"/>
             <wp:cNvGraphicFramePr>
               <a:graphicFrameLocks xmlns:a="http://schemas.openxmlformats.org/drawingml/2006/main" noChangeAspect="1"/>
             </wp:cNvGraphicFramePr>
@@ -3255,12 +3246,6 @@
         <w:gridCol w:w="4510"/>
       </w:tblGrid>
       <w:tr>
-        <w:tblPrEx>
-          <w:tblCellMar>
-            <w:top w:w="0" w:type="dxa"/>
-            <w:bottom w:w="0" w:type="dxa"/>
-          </w:tblCellMar>
-        </w:tblPrEx>
         <w:trPr>
           <w:tblHeader/>
         </w:trPr>
@@ -3374,12 +3359,6 @@
         </w:tc>
       </w:tr>
       <w:tr>
-        <w:tblPrEx>
-          <w:tblCellMar>
-            <w:top w:w="0" w:type="dxa"/>
-            <w:bottom w:w="0" w:type="dxa"/>
-          </w:tblCellMar>
-        </w:tblPrEx>
         <w:tc>
           <w:tcPr>
             <w:tcW w:w="1850" w:type="dxa"/>
@@ -3478,12 +3457,6 @@
         </w:tc>
       </w:tr>
       <w:tr>
-        <w:tblPrEx>
-          <w:tblCellMar>
-            <w:top w:w="0" w:type="dxa"/>
-            <w:bottom w:w="0" w:type="dxa"/>
-          </w:tblCellMar>
-        </w:tblPrEx>
         <w:tc>
           <w:tcPr>
             <w:tcW w:w="1850" w:type="dxa"/>
@@ -3583,12 +3556,6 @@
         </w:tc>
       </w:tr>
       <w:tr>
-        <w:tblPrEx>
-          <w:tblCellMar>
-            <w:top w:w="0" w:type="dxa"/>
-            <w:bottom w:w="0" w:type="dxa"/>
-          </w:tblCellMar>
-        </w:tblPrEx>
         <w:tc>
           <w:tcPr>
             <w:tcW w:w="1850" w:type="dxa"/>
@@ -3687,12 +3654,6 @@
         </w:tc>
       </w:tr>
       <w:tr>
-        <w:tblPrEx>
-          <w:tblCellMar>
-            <w:top w:w="0" w:type="dxa"/>
-            <w:bottom w:w="0" w:type="dxa"/>
-          </w:tblCellMar>
-        </w:tblPrEx>
         <w:tc>
           <w:tcPr>
             <w:tcW w:w="1850" w:type="dxa"/>
@@ -3791,12 +3752,6 @@
         </w:tc>
       </w:tr>
       <w:tr>
-        <w:tblPrEx>
-          <w:tblCellMar>
-            <w:top w:w="0" w:type="dxa"/>
-            <w:bottom w:w="0" w:type="dxa"/>
-          </w:tblCellMar>
-        </w:tblPrEx>
         <w:tc>
           <w:tcPr>
             <w:tcW w:w="1850" w:type="dxa"/>
@@ -3895,12 +3850,6 @@
         </w:tc>
       </w:tr>
       <w:tr>
-        <w:tblPrEx>
-          <w:tblCellMar>
-            <w:top w:w="0" w:type="dxa"/>
-            <w:bottom w:w="0" w:type="dxa"/>
-          </w:tblCellMar>
-        </w:tblPrEx>
         <w:tc>
           <w:tcPr>
             <w:tcW w:w="1850" w:type="dxa"/>
@@ -3999,12 +3948,6 @@
         </w:tc>
       </w:tr>
       <w:tr>
-        <w:tblPrEx>
-          <w:tblCellMar>
-            <w:top w:w="0" w:type="dxa"/>
-            <w:bottom w:w="0" w:type="dxa"/>
-          </w:tblCellMar>
-        </w:tblPrEx>
         <w:tc>
           <w:tcPr>
             <w:tcW w:w="1850" w:type="dxa"/>
@@ -4103,12 +4046,6 @@
         </w:tc>
       </w:tr>
       <w:tr>
-        <w:tblPrEx>
-          <w:tblCellMar>
-            <w:top w:w="0" w:type="dxa"/>
-            <w:bottom w:w="0" w:type="dxa"/>
-          </w:tblCellMar>
-        </w:tblPrEx>
         <w:tc>
           <w:tcPr>
             <w:tcW w:w="1850" w:type="dxa"/>
@@ -4207,12 +4144,6 @@
         </w:tc>
       </w:tr>
       <w:tr>
-        <w:tblPrEx>
-          <w:tblCellMar>
-            <w:top w:w="0" w:type="dxa"/>
-            <w:bottom w:w="0" w:type="dxa"/>
-          </w:tblCellMar>
-        </w:tblPrEx>
         <w:tc>
           <w:tcPr>
             <w:tcW w:w="1850" w:type="dxa"/>
@@ -4311,12 +4242,6 @@
         </w:tc>
       </w:tr>
       <w:tr>
-        <w:tblPrEx>
-          <w:tblCellMar>
-            <w:top w:w="0" w:type="dxa"/>
-            <w:bottom w:w="0" w:type="dxa"/>
-          </w:tblCellMar>
-        </w:tblPrEx>
         <w:tc>
           <w:tcPr>
             <w:tcW w:w="1850" w:type="dxa"/>
@@ -4415,12 +4340,6 @@
         </w:tc>
       </w:tr>
       <w:tr>
-        <w:tblPrEx>
-          <w:tblCellMar>
-            <w:top w:w="0" w:type="dxa"/>
-            <w:bottom w:w="0" w:type="dxa"/>
-          </w:tblCellMar>
-        </w:tblPrEx>
         <w:tc>
           <w:tcPr>
             <w:tcW w:w="1850" w:type="dxa"/>
@@ -4519,12 +4438,6 @@
         </w:tc>
       </w:tr>
       <w:tr>
-        <w:tblPrEx>
-          <w:tblCellMar>
-            <w:top w:w="0" w:type="dxa"/>
-            <w:bottom w:w="0" w:type="dxa"/>
-          </w:tblCellMar>
-        </w:tblPrEx>
         <w:tc>
           <w:tcPr>
             <w:tcW w:w="1850" w:type="dxa"/>
@@ -4623,12 +4536,6 @@
         </w:tc>
       </w:tr>
       <w:tr>
-        <w:tblPrEx>
-          <w:tblCellMar>
-            <w:top w:w="0" w:type="dxa"/>
-            <w:bottom w:w="0" w:type="dxa"/>
-          </w:tblCellMar>
-        </w:tblPrEx>
         <w:tc>
           <w:tcPr>
             <w:tcW w:w="1850" w:type="dxa"/>
@@ -4727,12 +4634,6 @@
         </w:tc>
       </w:tr>
       <w:tr>
-        <w:tblPrEx>
-          <w:tblCellMar>
-            <w:top w:w="0" w:type="dxa"/>
-            <w:bottom w:w="0" w:type="dxa"/>
-          </w:tblCellMar>
-        </w:tblPrEx>
         <w:tc>
           <w:tcPr>
             <w:tcW w:w="1850" w:type="dxa"/>
@@ -4831,12 +4732,6 @@
         </w:tc>
       </w:tr>
       <w:tr>
-        <w:tblPrEx>
-          <w:tblCellMar>
-            <w:top w:w="0" w:type="dxa"/>
-            <w:bottom w:w="0" w:type="dxa"/>
-          </w:tblCellMar>
-        </w:tblPrEx>
         <w:tc>
           <w:tcPr>
             <w:tcW w:w="1850" w:type="dxa"/>
@@ -4935,12 +4830,6 @@
         </w:tc>
       </w:tr>
       <w:tr>
-        <w:tblPrEx>
-          <w:tblCellMar>
-            <w:top w:w="0" w:type="dxa"/>
-            <w:bottom w:w="0" w:type="dxa"/>
-          </w:tblCellMar>
-        </w:tblPrEx>
         <w:tc>
           <w:tcPr>
             <w:tcW w:w="1850" w:type="dxa"/>
@@ -5039,12 +4928,6 @@
         </w:tc>
       </w:tr>
       <w:tr>
-        <w:tblPrEx>
-          <w:tblCellMar>
-            <w:top w:w="0" w:type="dxa"/>
-            <w:bottom w:w="0" w:type="dxa"/>
-          </w:tblCellMar>
-        </w:tblPrEx>
         <w:tc>
           <w:tcPr>
             <w:tcW w:w="1850" w:type="dxa"/>
@@ -5143,12 +5026,6 @@
         </w:tc>
       </w:tr>
       <w:tr>
-        <w:tblPrEx>
-          <w:tblCellMar>
-            <w:top w:w="0" w:type="dxa"/>
-            <w:bottom w:w="0" w:type="dxa"/>
-          </w:tblCellMar>
-        </w:tblPrEx>
         <w:tc>
           <w:tcPr>
             <w:tcW w:w="1850" w:type="dxa"/>
@@ -5299,12 +5176,6 @@
         <w:gridCol w:w="3760"/>
       </w:tblGrid>
       <w:tr>
-        <w:tblPrEx>
-          <w:tblCellMar>
-            <w:top w:w="0" w:type="dxa"/>
-            <w:bottom w:w="0" w:type="dxa"/>
-          </w:tblCellMar>
-        </w:tblPrEx>
         <w:trPr>
           <w:tblHeader/>
         </w:trPr>
@@ -5418,12 +5289,6 @@
         </w:tc>
       </w:tr>
       <w:tr>
-        <w:tblPrEx>
-          <w:tblCellMar>
-            <w:top w:w="0" w:type="dxa"/>
-            <w:bottom w:w="0" w:type="dxa"/>
-          </w:tblCellMar>
-        </w:tblPrEx>
         <w:tc>
           <w:tcPr>
             <w:tcW w:w="2400" w:type="dxa"/>
@@ -5522,12 +5387,6 @@
         </w:tc>
       </w:tr>
       <w:tr>
-        <w:tblPrEx>
-          <w:tblCellMar>
-            <w:top w:w="0" w:type="dxa"/>
-            <w:bottom w:w="0" w:type="dxa"/>
-          </w:tblCellMar>
-        </w:tblPrEx>
         <w:tc>
           <w:tcPr>
             <w:tcW w:w="2400" w:type="dxa"/>
@@ -5626,12 +5485,6 @@
         </w:tc>
       </w:tr>
       <w:tr>
-        <w:tblPrEx>
-          <w:tblCellMar>
-            <w:top w:w="0" w:type="dxa"/>
-            <w:bottom w:w="0" w:type="dxa"/>
-          </w:tblCellMar>
-        </w:tblPrEx>
         <w:tc>
           <w:tcPr>
             <w:tcW w:w="2400" w:type="dxa"/>
@@ -5730,12 +5583,6 @@
         </w:tc>
       </w:tr>
       <w:tr>
-        <w:tblPrEx>
-          <w:tblCellMar>
-            <w:top w:w="0" w:type="dxa"/>
-            <w:bottom w:w="0" w:type="dxa"/>
-          </w:tblCellMar>
-        </w:tblPrEx>
         <w:tc>
           <w:tcPr>
             <w:tcW w:w="2400" w:type="dxa"/>
@@ -5834,12 +5681,6 @@
         </w:tc>
       </w:tr>
       <w:tr>
-        <w:tblPrEx>
-          <w:tblCellMar>
-            <w:top w:w="0" w:type="dxa"/>
-            <w:bottom w:w="0" w:type="dxa"/>
-          </w:tblCellMar>
-        </w:tblPrEx>
         <w:tc>
           <w:tcPr>
             <w:tcW w:w="2400" w:type="dxa"/>
@@ -5938,12 +5779,6 @@
         </w:tc>
       </w:tr>
       <w:tr>
-        <w:tblPrEx>
-          <w:tblCellMar>
-            <w:top w:w="0" w:type="dxa"/>
-            <w:bottom w:w="0" w:type="dxa"/>
-          </w:tblCellMar>
-        </w:tblPrEx>
         <w:tc>
           <w:tcPr>
             <w:tcW w:w="2400" w:type="dxa"/>
@@ -6148,12 +5983,6 @@
         <w:gridCol w:w="7160"/>
       </w:tblGrid>
       <w:tr>
-        <w:tblPrEx>
-          <w:tblCellMar>
-            <w:top w:w="0" w:type="dxa"/>
-            <w:bottom w:w="0" w:type="dxa"/>
-          </w:tblCellMar>
-        </w:tblPrEx>
         <w:trPr>
           <w:tblHeader/>
         </w:trPr>
@@ -6213,12 +6042,6 @@
         </w:tc>
       </w:tr>
       <w:tr>
-        <w:tblPrEx>
-          <w:tblCellMar>
-            <w:top w:w="0" w:type="dxa"/>
-            <w:bottom w:w="0" w:type="dxa"/>
-          </w:tblCellMar>
-        </w:tblPrEx>
         <w:tc>
           <w:tcPr>
             <w:tcW w:w="2200" w:type="dxa"/>
@@ -6269,12 +6092,6 @@
         </w:tc>
       </w:tr>
       <w:tr>
-        <w:tblPrEx>
-          <w:tblCellMar>
-            <w:top w:w="0" w:type="dxa"/>
-            <w:bottom w:w="0" w:type="dxa"/>
-          </w:tblCellMar>
-        </w:tblPrEx>
         <w:tc>
           <w:tcPr>
             <w:tcW w:w="2200" w:type="dxa"/>
@@ -6325,12 +6142,6 @@
         </w:tc>
       </w:tr>
       <w:tr>
-        <w:tblPrEx>
-          <w:tblCellMar>
-            <w:top w:w="0" w:type="dxa"/>
-            <w:bottom w:w="0" w:type="dxa"/>
-          </w:tblCellMar>
-        </w:tblPrEx>
         <w:tc>
           <w:tcPr>
             <w:tcW w:w="2200" w:type="dxa"/>
@@ -6381,12 +6192,6 @@
         </w:tc>
       </w:tr>
       <w:tr>
-        <w:tblPrEx>
-          <w:tblCellMar>
-            <w:top w:w="0" w:type="dxa"/>
-            <w:bottom w:w="0" w:type="dxa"/>
-          </w:tblCellMar>
-        </w:tblPrEx>
         <w:tc>
           <w:tcPr>
             <w:tcW w:w="2200" w:type="dxa"/>
@@ -6515,12 +6320,6 @@
         <w:gridCol w:w="4960"/>
       </w:tblGrid>
       <w:tr>
-        <w:tblPrEx>
-          <w:tblCellMar>
-            <w:top w:w="0" w:type="dxa"/>
-            <w:bottom w:w="0" w:type="dxa"/>
-          </w:tblCellMar>
-        </w:tblPrEx>
         <w:trPr>
           <w:tblHeader/>
         </w:trPr>
@@ -6607,12 +6406,6 @@
         </w:tc>
       </w:tr>
       <w:tr>
-        <w:tblPrEx>
-          <w:tblCellMar>
-            <w:top w:w="0" w:type="dxa"/>
-            <w:bottom w:w="0" w:type="dxa"/>
-          </w:tblCellMar>
-        </w:tblPrEx>
         <w:tc>
           <w:tcPr>
             <w:tcW w:w="2200" w:type="dxa"/>
@@ -6687,12 +6480,6 @@
         </w:tc>
       </w:tr>
       <w:tr>
-        <w:tblPrEx>
-          <w:tblCellMar>
-            <w:top w:w="0" w:type="dxa"/>
-            <w:bottom w:w="0" w:type="dxa"/>
-          </w:tblCellMar>
-        </w:tblPrEx>
         <w:tc>
           <w:tcPr>
             <w:tcW w:w="2200" w:type="dxa"/>
@@ -6767,12 +6554,6 @@
         </w:tc>
       </w:tr>
       <w:tr>
-        <w:tblPrEx>
-          <w:tblCellMar>
-            <w:top w:w="0" w:type="dxa"/>
-            <w:bottom w:w="0" w:type="dxa"/>
-          </w:tblCellMar>
-        </w:tblPrEx>
         <w:tc>
           <w:tcPr>
             <w:tcW w:w="2200" w:type="dxa"/>
@@ -6927,12 +6708,6 @@
         <w:gridCol w:w="3660"/>
       </w:tblGrid>
       <w:tr>
-        <w:tblPrEx>
-          <w:tblCellMar>
-            <w:top w:w="0" w:type="dxa"/>
-            <w:bottom w:w="0" w:type="dxa"/>
-          </w:tblCellMar>
-        </w:tblPrEx>
         <w:trPr>
           <w:tblHeader/>
         </w:trPr>
@@ -7019,12 +6794,6 @@
         </w:tc>
       </w:tr>
       <w:tr>
-        <w:tblPrEx>
-          <w:tblCellMar>
-            <w:top w:w="0" w:type="dxa"/>
-            <w:bottom w:w="0" w:type="dxa"/>
-          </w:tblCellMar>
-        </w:tblPrEx>
         <w:tc>
           <w:tcPr>
             <w:tcW w:w="1700" w:type="dxa"/>
@@ -7099,12 +6868,6 @@
         </w:tc>
       </w:tr>
       <w:tr>
-        <w:tblPrEx>
-          <w:tblCellMar>
-            <w:top w:w="0" w:type="dxa"/>
-            <w:bottom w:w="0" w:type="dxa"/>
-          </w:tblCellMar>
-        </w:tblPrEx>
         <w:tc>
           <w:tcPr>
             <w:tcW w:w="1700" w:type="dxa"/>
@@ -7179,12 +6942,6 @@
         </w:tc>
       </w:tr>
       <w:tr>
-        <w:tblPrEx>
-          <w:tblCellMar>
-            <w:top w:w="0" w:type="dxa"/>
-            <w:bottom w:w="0" w:type="dxa"/>
-          </w:tblCellMar>
-        </w:tblPrEx>
         <w:tc>
           <w:tcPr>
             <w:tcW w:w="1700" w:type="dxa"/>
@@ -7259,12 +7016,6 @@
         </w:tc>
       </w:tr>
       <w:tr>
-        <w:tblPrEx>
-          <w:tblCellMar>
-            <w:top w:w="0" w:type="dxa"/>
-            <w:bottom w:w="0" w:type="dxa"/>
-          </w:tblCellMar>
-        </w:tblPrEx>
         <w:tc>
           <w:tcPr>
             <w:tcW w:w="1700" w:type="dxa"/>
@@ -7339,12 +7090,6 @@
         </w:tc>
       </w:tr>
       <w:tr>
-        <w:tblPrEx>
-          <w:tblCellMar>
-            <w:top w:w="0" w:type="dxa"/>
-            <w:bottom w:w="0" w:type="dxa"/>
-          </w:tblCellMar>
-        </w:tblPrEx>
         <w:tc>
           <w:tcPr>
             <w:tcW w:w="1700" w:type="dxa"/>
@@ -7419,12 +7164,6 @@
         </w:tc>
       </w:tr>
       <w:tr>
-        <w:tblPrEx>
-          <w:tblCellMar>
-            <w:top w:w="0" w:type="dxa"/>
-            <w:bottom w:w="0" w:type="dxa"/>
-          </w:tblCellMar>
-        </w:tblPrEx>
         <w:tc>
           <w:tcPr>
             <w:tcW w:w="1700" w:type="dxa"/>
@@ -7499,12 +7238,6 @@
         </w:tc>
       </w:tr>
       <w:tr>
-        <w:tblPrEx>
-          <w:tblCellMar>
-            <w:top w:w="0" w:type="dxa"/>
-            <w:bottom w:w="0" w:type="dxa"/>
-          </w:tblCellMar>
-        </w:tblPrEx>
         <w:tc>
           <w:tcPr>
             <w:tcW w:w="1700" w:type="dxa"/>
@@ -7630,12 +7363,6 @@
         <w:gridCol w:w="3060"/>
       </w:tblGrid>
       <w:tr>
-        <w:tblPrEx>
-          <w:tblCellMar>
-            <w:top w:w="0" w:type="dxa"/>
-            <w:bottom w:w="0" w:type="dxa"/>
-          </w:tblCellMar>
-        </w:tblPrEx>
         <w:trPr>
           <w:tblHeader/>
         </w:trPr>
@@ -7722,12 +7449,6 @@
         </w:tc>
       </w:tr>
       <w:tr>
-        <w:tblPrEx>
-          <w:tblCellMar>
-            <w:top w:w="0" w:type="dxa"/>
-            <w:bottom w:w="0" w:type="dxa"/>
-          </w:tblCellMar>
-        </w:tblPrEx>
         <w:tc>
           <w:tcPr>
             <w:tcW w:w="1700" w:type="dxa"/>
@@ -7802,12 +7523,6 @@
         </w:tc>
       </w:tr>
       <w:tr>
-        <w:tblPrEx>
-          <w:tblCellMar>
-            <w:top w:w="0" w:type="dxa"/>
-            <w:bottom w:w="0" w:type="dxa"/>
-          </w:tblCellMar>
-        </w:tblPrEx>
         <w:tc>
           <w:tcPr>
             <w:tcW w:w="1700" w:type="dxa"/>
@@ -7882,12 +7597,6 @@
         </w:tc>
       </w:tr>
       <w:tr>
-        <w:tblPrEx>
-          <w:tblCellMar>
-            <w:top w:w="0" w:type="dxa"/>
-            <w:bottom w:w="0" w:type="dxa"/>
-          </w:tblCellMar>
-        </w:tblPrEx>
         <w:tc>
           <w:tcPr>
             <w:tcW w:w="1700" w:type="dxa"/>
@@ -7962,12 +7671,6 @@
         </w:tc>
       </w:tr>
       <w:tr>
-        <w:tblPrEx>
-          <w:tblCellMar>
-            <w:top w:w="0" w:type="dxa"/>
-            <w:bottom w:w="0" w:type="dxa"/>
-          </w:tblCellMar>
-        </w:tblPrEx>
         <w:tc>
           <w:tcPr>
             <w:tcW w:w="1700" w:type="dxa"/>
@@ -8062,10 +7765,10 @@
         </w:rPr>
         <w:lastRenderedPageBreak/>
         <w:drawing>
-          <wp:inline distT="0" distB="0" distL="0" distR="0" wp14:anchorId="4F2D97D3" wp14:editId="232665ED">
+          <wp:inline distT="0" distB="0" distL="0" distR="0" wp14:anchorId="46E45F52" wp14:editId="4229B58A">
             <wp:extent cx="5905500" cy="2419350"/>
             <wp:effectExtent l="0" t="0" r="0" b="0"/>
-            <wp:docPr id="1571203590" name="Imagen 1571203590"/>
+            <wp:docPr id="965463165" name="Imagen 965463165"/>
             <wp:cNvGraphicFramePr>
               <a:graphicFrameLocks xmlns:a="http://schemas.openxmlformats.org/drawingml/2006/main" noChangeAspect="1"/>
             </wp:cNvGraphicFramePr>
@@ -8215,10 +7918,10 @@
           <w:noProof/>
         </w:rPr>
         <w:drawing>
-          <wp:inline distT="0" distB="0" distL="0" distR="0" wp14:anchorId="1320FAA2" wp14:editId="733BE1E7">
+          <wp:inline distT="0" distB="0" distL="0" distR="0" wp14:anchorId="5526466C" wp14:editId="38688E87">
             <wp:extent cx="5905500" cy="2257425"/>
             <wp:effectExtent l="0" t="0" r="0" b="0"/>
-            <wp:docPr id="1213934521" name="Imagen 1213934521"/>
+            <wp:docPr id="206282018" name="Imagen 206282018"/>
             <wp:cNvGraphicFramePr>
               <a:graphicFrameLocks xmlns:a="http://schemas.openxmlformats.org/drawingml/2006/main" noChangeAspect="1"/>
             </wp:cNvGraphicFramePr>
@@ -8411,12 +8114,6 @@
         <w:gridCol w:w="5360"/>
       </w:tblGrid>
       <w:tr>
-        <w:tblPrEx>
-          <w:tblCellMar>
-            <w:top w:w="0" w:type="dxa"/>
-            <w:bottom w:w="0" w:type="dxa"/>
-          </w:tblCellMar>
-        </w:tblPrEx>
         <w:trPr>
           <w:tblHeader/>
         </w:trPr>
@@ -8503,12 +8200,6 @@
         </w:tc>
       </w:tr>
       <w:tr>
-        <w:tblPrEx>
-          <w:tblCellMar>
-            <w:top w:w="0" w:type="dxa"/>
-            <w:bottom w:w="0" w:type="dxa"/>
-          </w:tblCellMar>
-        </w:tblPrEx>
         <w:tc>
           <w:tcPr>
             <w:tcW w:w="1700" w:type="dxa"/>
@@ -8583,12 +8274,6 @@
         </w:tc>
       </w:tr>
       <w:tr>
-        <w:tblPrEx>
-          <w:tblCellMar>
-            <w:top w:w="0" w:type="dxa"/>
-            <w:bottom w:w="0" w:type="dxa"/>
-          </w:tblCellMar>
-        </w:tblPrEx>
         <w:tc>
           <w:tcPr>
             <w:tcW w:w="1700" w:type="dxa"/>
@@ -8663,12 +8348,6 @@
         </w:tc>
       </w:tr>
       <w:tr>
-        <w:tblPrEx>
-          <w:tblCellMar>
-            <w:top w:w="0" w:type="dxa"/>
-            <w:bottom w:w="0" w:type="dxa"/>
-          </w:tblCellMar>
-        </w:tblPrEx>
         <w:tc>
           <w:tcPr>
             <w:tcW w:w="1700" w:type="dxa"/>
@@ -8743,12 +8422,6 @@
         </w:tc>
       </w:tr>
       <w:tr>
-        <w:tblPrEx>
-          <w:tblCellMar>
-            <w:top w:w="0" w:type="dxa"/>
-            <w:bottom w:w="0" w:type="dxa"/>
-          </w:tblCellMar>
-        </w:tblPrEx>
         <w:tc>
           <w:tcPr>
             <w:tcW w:w="1700" w:type="dxa"/>
@@ -8834,6 +8507,15 @@
     </w:p>
     <w:p>
       <w:pPr>
+        <w:spacing w:after="110" w:line="262" w:lineRule="auto"/>
+        <w:jc w:val="both"/>
+      </w:pPr>
+      <w:r>
+        <w:t>A esas se suman tres etiquetas que no describen un estado guardado sino el resultado de una comparación, y que el catálogo muestra en la columna del precio. El reparto de los dos colores sigue el criterio de la tabla anterior. En rojo lo que impide vender o cuesta dinero cada vez que ocurre: «sin precio», porque una referencia sin precio no se puede cobrar, igual que una agotada, y «bajo el costo», porque cada unidad vendida deja menos dinero del que costó. En naranja lo que sigue funcionando pero pide atención: «sin margen», que señala un precio que cubre el costo pero ya no deja el porcentaje decidido para su categoría. Un faltante de margen no es una pérdida —es ganar menos de lo previsto—, y pintarlo del mismo rojo que una pérdida real haría que el rojo dejara de distinguir.</w:t>
+      </w:r>
+    </w:p>
+    <w:p>
+      <w:pPr>
         <w:spacing w:before="60" w:after="20"/>
         <w:jc w:val="center"/>
       </w:pPr>
@@ -8842,10 +8524,10 @@
           <w:noProof/>
         </w:rPr>
         <w:drawing>
-          <wp:inline distT="0" distB="0" distL="0" distR="0" wp14:anchorId="5B565EF1" wp14:editId="1B851F7E">
+          <wp:inline distT="0" distB="0" distL="0" distR="0" wp14:anchorId="1E309D19" wp14:editId="4A078992">
             <wp:extent cx="5334000" cy="3381375"/>
             <wp:effectExtent l="0" t="0" r="0" b="0"/>
-            <wp:docPr id="747060332" name="Imagen 747060332"/>
+            <wp:docPr id="146694921" name="Imagen 146694921"/>
             <wp:cNvGraphicFramePr>
               <a:graphicFrameLocks xmlns:a="http://schemas.openxmlformats.org/drawingml/2006/main" noChangeAspect="1"/>
             </wp:cNvGraphicFramePr>
@@ -8911,6 +8593,7 @@
           <w:sz w:val="23"/>
           <w:szCs w:val="23"/>
         </w:rPr>
+        <w:lastRenderedPageBreak/>
         <w:t>6.5 Navegación, tarjetas y tablas</w:t>
       </w:r>
       <w:bookmarkEnd w:id="18"/>
@@ -8978,7 +8661,6 @@
           <w:b/>
           <w:bCs/>
         </w:rPr>
-        <w:lastRenderedPageBreak/>
         <w:t xml:space="preserve">Tablas. </w:t>
       </w:r>
       <w:r>
@@ -8995,10 +8677,10 @@
           <w:noProof/>
         </w:rPr>
         <w:drawing>
-          <wp:inline distT="0" distB="0" distL="0" distR="0" wp14:anchorId="5D15D361" wp14:editId="295B0954">
+          <wp:inline distT="0" distB="0" distL="0" distR="0" wp14:anchorId="1E357671" wp14:editId="040D7CB6">
             <wp:extent cx="6096000" cy="1676400"/>
             <wp:effectExtent l="0" t="0" r="0" b="0"/>
-            <wp:docPr id="788057497" name="Imagen 788057497"/>
+            <wp:docPr id="1002613623" name="Imagen 1002613623"/>
             <wp:cNvGraphicFramePr>
               <a:graphicFrameLocks xmlns:a="http://schemas.openxmlformats.org/drawingml/2006/main" noChangeAspect="1"/>
             </wp:cNvGraphicFramePr>
@@ -9087,10 +8769,10 @@
           <w:noProof/>
         </w:rPr>
         <w:drawing>
-          <wp:inline distT="0" distB="0" distL="0" distR="0" wp14:anchorId="2481B43C" wp14:editId="1EEC17AC">
+          <wp:inline distT="0" distB="0" distL="0" distR="0" wp14:anchorId="1475F350" wp14:editId="0C040973">
             <wp:extent cx="4762500" cy="2447925"/>
             <wp:effectExtent l="0" t="0" r="0" b="0"/>
-            <wp:docPr id="1448933402" name="Imagen 1448933402"/>
+            <wp:docPr id="1356282111" name="Imagen 1356282111"/>
             <wp:cNvGraphicFramePr>
               <a:graphicFrameLocks xmlns:a="http://schemas.openxmlformats.org/drawingml/2006/main" noChangeAspect="1"/>
             </wp:cNvGraphicFramePr>
@@ -9148,6 +8830,7 @@
         <w:jc w:val="both"/>
       </w:pPr>
       <w:r>
+        <w:lastRenderedPageBreak/>
         <w:t>Requieren confirmación, entre otras, la anulación de una venta, la inactivación de un producto o un usuario, el traslado de mercancía entre sedes y la restauración de una copia de seguridad.</w:t>
       </w:r>
     </w:p>
@@ -9217,10 +8900,10 @@
           <w:noProof/>
         </w:rPr>
         <w:drawing>
-          <wp:inline distT="0" distB="0" distL="0" distR="0" wp14:anchorId="6254EBF6" wp14:editId="6EED2B55">
+          <wp:inline distT="0" distB="0" distL="0" distR="0" wp14:anchorId="11EB3BE6" wp14:editId="0865A619">
             <wp:extent cx="6096000" cy="3048000"/>
             <wp:effectExtent l="0" t="0" r="0" b="0"/>
-            <wp:docPr id="828716913" name="Imagen 828716913"/>
+            <wp:docPr id="658922819" name="Imagen 658922819"/>
             <wp:cNvGraphicFramePr>
               <a:graphicFrameLocks xmlns:a="http://schemas.openxmlformats.org/drawingml/2006/main" noChangeAspect="1"/>
             </wp:cNvGraphicFramePr>
@@ -9362,10 +9045,10 @@
         </w:rPr>
         <w:lastRenderedPageBreak/>
         <w:drawing>
-          <wp:inline distT="0" distB="0" distL="0" distR="0" wp14:anchorId="1BA45C75" wp14:editId="0B7BC2A8">
+          <wp:inline distT="0" distB="0" distL="0" distR="0" wp14:anchorId="3EA1C1C2" wp14:editId="5E92FD8D">
             <wp:extent cx="6096000" cy="3848100"/>
             <wp:effectExtent l="0" t="0" r="0" b="0"/>
-            <wp:docPr id="1420590424" name="Imagen 1420590424"/>
+            <wp:docPr id="1990481432" name="Imagen 1990481432"/>
             <wp:cNvGraphicFramePr>
               <a:graphicFrameLocks xmlns:a="http://schemas.openxmlformats.org/drawingml/2006/main" noChangeAspect="1"/>
             </wp:cNvGraphicFramePr>
@@ -9534,12 +9217,6 @@
         <w:gridCol w:w="4160"/>
       </w:tblGrid>
       <w:tr>
-        <w:tblPrEx>
-          <w:tblCellMar>
-            <w:top w:w="0" w:type="dxa"/>
-            <w:bottom w:w="0" w:type="dxa"/>
-          </w:tblCellMar>
-        </w:tblPrEx>
         <w:trPr>
           <w:tblHeader/>
         </w:trPr>
@@ -9626,12 +9303,6 @@
         </w:tc>
       </w:tr>
       <w:tr>
-        <w:tblPrEx>
-          <w:tblCellMar>
-            <w:top w:w="0" w:type="dxa"/>
-            <w:bottom w:w="0" w:type="dxa"/>
-          </w:tblCellMar>
-        </w:tblPrEx>
         <w:tc>
           <w:tcPr>
             <w:tcW w:w="2100" w:type="dxa"/>
@@ -9706,12 +9377,6 @@
         </w:tc>
       </w:tr>
       <w:tr>
-        <w:tblPrEx>
-          <w:tblCellMar>
-            <w:top w:w="0" w:type="dxa"/>
-            <w:bottom w:w="0" w:type="dxa"/>
-          </w:tblCellMar>
-        </w:tblPrEx>
         <w:tc>
           <w:tcPr>
             <w:tcW w:w="2100" w:type="dxa"/>
@@ -9786,12 +9451,6 @@
         </w:tc>
       </w:tr>
       <w:tr>
-        <w:tblPrEx>
-          <w:tblCellMar>
-            <w:top w:w="0" w:type="dxa"/>
-            <w:bottom w:w="0" w:type="dxa"/>
-          </w:tblCellMar>
-        </w:tblPrEx>
         <w:tc>
           <w:tcPr>
             <w:tcW w:w="2100" w:type="dxa"/>
@@ -9866,12 +9525,6 @@
         </w:tc>
       </w:tr>
       <w:tr>
-        <w:tblPrEx>
-          <w:tblCellMar>
-            <w:top w:w="0" w:type="dxa"/>
-            <w:bottom w:w="0" w:type="dxa"/>
-          </w:tblCellMar>
-        </w:tblPrEx>
         <w:tc>
           <w:tcPr>
             <w:tcW w:w="2100" w:type="dxa"/>
@@ -9946,12 +9599,6 @@
         </w:tc>
       </w:tr>
       <w:tr>
-        <w:tblPrEx>
-          <w:tblCellMar>
-            <w:top w:w="0" w:type="dxa"/>
-            <w:bottom w:w="0" w:type="dxa"/>
-          </w:tblCellMar>
-        </w:tblPrEx>
         <w:tc>
           <w:tcPr>
             <w:tcW w:w="2100" w:type="dxa"/>
@@ -10027,12 +9674,6 @@
         </w:tc>
       </w:tr>
       <w:tr>
-        <w:tblPrEx>
-          <w:tblCellMar>
-            <w:top w:w="0" w:type="dxa"/>
-            <w:bottom w:w="0" w:type="dxa"/>
-          </w:tblCellMar>
-        </w:tblPrEx>
         <w:tc>
           <w:tcPr>
             <w:tcW w:w="2100" w:type="dxa"/>
@@ -10247,10 +9888,10 @@
           <w:noProof/>
         </w:rPr>
         <w:drawing>
-          <wp:inline distT="0" distB="0" distL="0" distR="0" wp14:anchorId="25E76BD1" wp14:editId="3A200106">
+          <wp:inline distT="0" distB="0" distL="0" distR="0" wp14:anchorId="4815EE67" wp14:editId="0C67B9A4">
             <wp:extent cx="6096000" cy="3000375"/>
             <wp:effectExtent l="0" t="0" r="0" b="0"/>
-            <wp:docPr id="148769097" name="Imagen 148769097"/>
+            <wp:docPr id="1801263955" name="Imagen 1801263955"/>
             <wp:cNvGraphicFramePr>
               <a:graphicFrameLocks xmlns:a="http://schemas.openxmlformats.org/drawingml/2006/main" noChangeAspect="1"/>
             </wp:cNvGraphicFramePr>
@@ -10416,10 +10057,10 @@
         </w:rPr>
         <w:lastRenderedPageBreak/>
         <w:drawing>
-          <wp:inline distT="0" distB="0" distL="0" distR="0" wp14:anchorId="78D423AF" wp14:editId="7D69EEFA">
+          <wp:inline distT="0" distB="0" distL="0" distR="0" wp14:anchorId="0249825A" wp14:editId="591A6BE5">
             <wp:extent cx="6096000" cy="4333875"/>
             <wp:effectExtent l="0" t="0" r="0" b="0"/>
-            <wp:docPr id="1366187470" name="Imagen 1366187470"/>
+            <wp:docPr id="208275973" name="Imagen 208275973"/>
             <wp:cNvGraphicFramePr>
               <a:graphicFrameLocks xmlns:a="http://schemas.openxmlformats.org/drawingml/2006/main" noChangeAspect="1"/>
             </wp:cNvGraphicFramePr>
@@ -10513,7 +10154,11 @@
         <w:jc w:val="both"/>
       </w:pPr>
       <w:r>
-        <w:t>La tabla presenta el producto, su categoría, el precio de venta, las existencias y la etiqueta de estado. En la columna del precio, una referencia que todavía no lo tiene se marca como tal en lugar de mostrar un cero, que se leería como un precio decidido; el precio se fija al recibir la primera mercancía, según se explica en el apartado 8.5. Las acciones de cada fila son consultar sus movimientos, editar y, según el estado, descontinuar o reactivar. La acción principal de la pantalla, situada en la barra superior, es el registro de un producto nuevo, junto al acceso a la entrada de mercancía y a los márgenes de las categorías.</w:t>
+        <w:t xml:space="preserve">La tabla presenta el producto, su categoría, el precio de venta, las existencias y la etiqueta de estado. La columna del precio lleva además, cuando corresponde, una de tres marcas excluyentes: «sin precio» en una referencia que todavía no lo tiene —en lugar de un cero, que se leería como un precio decidido—, «bajo el costo» cuando el precio no cubre lo que costó la mercancía que hay, y «sin margen» cuando lo cubre pero ya no deja el porcentaje de su categoría. Son excluyentes porque una referencia que pierde dinero tampoco da el margen, y mostrar las dos marcas juntas se leería como dos problemas distintos cuando es uno, el más grave. Se marcan en la lista y no solo al editar la referencia: una decisión de precio que hay que revisar debe poder encontrarse recorriendo el catálogo, sin abrir las referencias una por una. </w:t>
+      </w:r>
+      <w:r>
+        <w:lastRenderedPageBreak/>
+        <w:t>El precio se fija al recibir la primera mercancía, según se explica en el apartado 8.5. Las acciones de cada fila son consultar sus movimientos, editar y, según el estado, descontinuar o reactivar. La acción principal de la pantalla, situada en la barra superior, es el registro de un producto nuevo, junto al acceso a la entrada de mercancía y a los márgenes de las categorías.</w:t>
       </w:r>
     </w:p>
     <w:p>
@@ -10522,7 +10167,6 @@
         <w:jc w:val="both"/>
       </w:pPr>
       <w:r>
-        <w:lastRenderedPageBreak/>
         <w:t>La pantalla es de los dos roles del negocio, y no muestra lo mismo a cada uno. El vendedor consulta el catálogo, lo busca y lo filtra, y entra al historial de una referencia, porque su rol registra ventas y consulta existencias; no se le ofrecen el registro, la edición, la descontinuación ni el ajuste, y esas acciones sencillamente no aparecen, sin aviso que las explique: no es un trámite pendiente que pueda resolver, es el reparto del trabajo. La regla que decide esto vive en el servidor, que rechaza esas operaciones a quien no administra la licorera; la interfaz solo evita ofrecer un botón que se va a rechazar.</w:t>
       </w:r>
     </w:p>
@@ -10554,10 +10198,10 @@
           <w:noProof/>
         </w:rPr>
         <w:drawing>
-          <wp:inline distT="0" distB="0" distL="0" distR="0" wp14:anchorId="6401D724" wp14:editId="35A776B1">
-            <wp:extent cx="6096000" cy="3286125"/>
+          <wp:inline distT="0" distB="0" distL="0" distR="0" wp14:anchorId="65AA08AF" wp14:editId="471BFFE9">
+            <wp:extent cx="6096000" cy="3895725"/>
             <wp:effectExtent l="0" t="0" r="0" b="0"/>
-            <wp:docPr id="1892150554" name="Imagen 1892150554"/>
+            <wp:docPr id="51120370" name="Imagen 51120370"/>
             <wp:cNvGraphicFramePr>
               <a:graphicFrameLocks xmlns:a="http://schemas.openxmlformats.org/drawingml/2006/main" noChangeAspect="1"/>
             </wp:cNvGraphicFramePr>
@@ -10580,7 +10224,7 @@
                   <pic:spPr bwMode="auto">
                     <a:xfrm>
                       <a:off x="0" y="0"/>
-                      <a:ext cx="6096000" cy="3286125"/>
+                      <a:ext cx="6096000" cy="3895725"/>
                     </a:xfrm>
                     <a:prstGeom prst="rect">
                       <a:avLst/>
@@ -10633,7 +10277,11 @@
         <w:jc w:val="both"/>
       </w:pPr>
       <w:r>
-        <w:t>El mismo formulario se emplea para crear y para editar, pero no pide lo mismo en los dos casos. Agrupa los datos de identificación del producto (nombre, categoría, presentación y código de barras) y el mínimo de existencias para la alerta; las existencias no se capturan aquí, sino que ingresan como lote con su costo unitario, y el formulario lo advierte bajo los campos para que su ausencia no se lea como un olvido. La categoría y la presentación se eligen de listas cerradas, definidas en el modelo de datos, y no se escriben a mano: de ello depende que el catálogo se pueda filtrar y agrupar.</w:t>
+        <w:t xml:space="preserve">El mismo formulario se emplea para crear y para editar, pero no pide lo mismo en los dos casos. Agrupa los datos de identificación del producto (nombre, categoría, presentación y código de barras) y el mínimo de existencias para la alerta; las existencias no se capturan aquí, sino que ingresan como lote con su </w:t>
+      </w:r>
+      <w:r>
+        <w:lastRenderedPageBreak/>
+        <w:t>costo unitario, y el formulario lo advierte bajo los campos para que su ausencia no se lea como un olvido. La categoría y la presentación se eligen de listas cerradas, definidas en el modelo de datos, y no se escriben a mano: de ello depende que el catálogo se pueda filtrar y agrupar.</w:t>
       </w:r>
     </w:p>
     <w:p>
@@ -10642,11 +10290,7 @@
         <w:jc w:val="both"/>
       </w:pPr>
       <w:r>
-        <w:t xml:space="preserve">Al registrar una referencia nueva tampoco se pide el precio de venta, y por la misma razón por la que no se piden las existencias: en ese momento no se conoce el costo que ese precio tiene que cubrir, de modo que cualquier cifra sería una suposición. El precio se fija al recibir la primera mercancía (apartado 8.5), y hasta entonces la referencia queda marcada en el catálogo y el punto de venta no la ofrece. El campo sí </w:t>
-      </w:r>
-      <w:r>
-        <w:lastRenderedPageBreak/>
-        <w:t>aparece al editar, porque corregir el precio de una referencia que ya se vende corresponde a quien administra la licorera (RF-INV-03), y el precio sigue registrándose de forma independiente del costo.</w:t>
+        <w:t>Al registrar una referencia nueva tampoco se pide el precio de venta, y por la misma razón por la que no se piden las existencias: en ese momento no se conoce el costo que ese precio tiene que cubrir, de modo que cualquier cifra sería una suposición. El precio se fija al recibir la primera mercancía (apartado 8.5), y hasta entonces la referencia queda marcada en el catálogo y el punto de venta no la ofrece. El campo sí aparece al editar, porque corregir el precio de una referencia que ya se vende corresponde a quien administra la licorera (RF-INV-03), y el precio sigue registrándose de forma independiente del costo.</w:t>
       </w:r>
     </w:p>
     <w:p>
@@ -10655,10 +10299,7 @@
         <w:jc w:val="both"/>
       </w:pPr>
       <w:r>
-        <w:t>Al editar, sobre el precio, el formulario muestra la propuesta del sistema: cuántas unidades hay en existencia y lo que costó cada una en promedio, el margen de la categoría y el precio que resulta de aplicarlo, con una acción para tomarlo. El costo que se usa es el promedio ponderado de los lotes que siguen en bodega, no el de la última compra: una compra de oferta por unas pocas unidades no representa lo que costó el inventario, y proponer sobre ella llevaría a vender por debajo de costo todo lo comprado antes. El promedio es además la única base con la que un precio único deja el margen pedido sobre el conjunto de las existencias. Cuando no quedan unidades se propone sobre la última compra, que es lo único que se sabe, y la pantalla lo dice</w:t>
-      </w:r>
-      <w:r>
-        <w:t>.</w:t>
+        <w:t>Al editar, sobre el precio, el formulario muestra la propuesta del sistema: cuántas unidades hay en existencia y lo que costó cada una en promedio, el margen de la categoría y el precio que resulta de aplicarlo, con una acción para tomarlo. El costo que se usa es el promedio ponderado de los lotes que siguen en bodega, no el de la última compra: una compra de oferta por unas pocas unidades no representa lo que costó el inventario, y proponer sobre ella llevaría a vender por debajo de costo todo lo comprado antes. El promedio es además la única base con la que un precio único deja el margen pedido sobre el conjunto de las existencias. Cuando no quedan unidades se propone sobre la última compra, que es lo único que se sabe, y la pantalla lo dice.</w:t>
       </w:r>
     </w:p>
     <w:p>
@@ -10699,10 +10340,10 @@
         </w:rPr>
         <w:lastRenderedPageBreak/>
         <w:drawing>
-          <wp:inline distT="0" distB="0" distL="0" distR="0" wp14:anchorId="74812C61" wp14:editId="1A907B67">
-            <wp:extent cx="4953000" cy="4067175"/>
+          <wp:inline distT="0" distB="0" distL="0" distR="0" wp14:anchorId="18355B6C" wp14:editId="5201068A">
+            <wp:extent cx="4953000" cy="5343525"/>
             <wp:effectExtent l="0" t="0" r="0" b="0"/>
-            <wp:docPr id="946998091" name="Imagen 946998091"/>
+            <wp:docPr id="1472740858" name="Imagen 1472740858"/>
             <wp:cNvGraphicFramePr>
               <a:graphicFrameLocks xmlns:a="http://schemas.openxmlformats.org/drawingml/2006/main" noChangeAspect="1"/>
             </wp:cNvGraphicFramePr>
@@ -10725,7 +10366,7 @@
                   <pic:spPr bwMode="auto">
                     <a:xfrm>
                       <a:off x="0" y="0"/>
-                      <a:ext cx="4953000" cy="4067175"/>
+                      <a:ext cx="4953000" cy="5343525"/>
                     </a:xfrm>
                     <a:prstGeom prst="rect">
                       <a:avLst/>
@@ -10751,7 +10392,7 @@
           <w:sz w:val="18"/>
           <w:szCs w:val="18"/>
         </w:rPr>
-        <w:t>Figura 13. Formulario de registro y edición de producto. Fuente: del autor.</w:t>
+        <w:t>Figura 13. Formulario de producto, en su forma de edición: el precio y su propuesta solo aparecen aquí. Fuente: del autor.</w:t>
       </w:r>
     </w:p>
     <w:p>
@@ -10796,7 +10437,11 @@
         <w:jc w:val="both"/>
       </w:pPr>
       <w:r>
-        <w:t>Porque el costo se conoce aquí, aquí se decide también el precio de venta. La línea de una referencia que todavía no lo tiene lo pide y no deja registrar la entrada sin él: una compra que entra a bodega sin precio es mercancía que el punto de venta no puede ofrecer, y nadie se entera hasta que un cliente la pide. Para no obligar a calcularlo, la propia línea propone el que resulta del costo recién escrito y del margen de la categoría (RF-INV-11), con una acción para tomarlo.</w:t>
+        <w:t xml:space="preserve">Porque el costo se conoce aquí, aquí se decide también el precio de venta. La línea de una referencia que todavía no lo tiene lo pide y no deja registrar la entrada sin él: una compra que entra a bodega sin precio </w:t>
+      </w:r>
+      <w:r>
+        <w:lastRenderedPageBreak/>
+        <w:t>es mercancía que el punto de venta no puede ofrecer, y nadie se entera hasta que un cliente la pide. Para no obligar a calcularlo, la propia línea propone el que resulta del costo recién escrito y del margen de la categoría (RF-INV-11), con una acción para tomarlo.</w:t>
       </w:r>
     </w:p>
     <w:p>
@@ -10805,11 +10450,7 @@
         <w:jc w:val="both"/>
       </w:pPr>
       <w:r>
-        <w:t xml:space="preserve">La línea tampoco se calla cuando la referencia ya tiene precio, y esa es la otra decisión de la pantalla. Una compra más cara sube el costo promedio de las existencias y deja el precio de siempre ganando menos sin que salte ningún aviso, porque sigue cubriendo el costo: no se pierde dinero, se deja de ganar, y la única forma de verlo sería abrir la ficha del producto a editarla, que es justo lo que nadie hace al recibir </w:t>
-      </w:r>
-      <w:r>
-        <w:lastRenderedPageBreak/>
-        <w:t>una compra. Por eso toda línea con cantidad y costo escritos muestra lo que costará la unidad después de ese ingreso, el precio que pediría el margen de su categoría y, cuando el precio vigente se queda corto, en cuánto queda el margen real. El cálculo se hace sobre el promedio que quedará después de la entrada, no sobre el de hoy ni sobre el costo del lote suelto: en cuanto la mercancía entra, lo que cuestan las existencias es otra cosa, y es esa la que el precio tiene que cubrir.</w:t>
+        <w:t>La línea tampoco se calla cuando la referencia ya tiene precio, y esa es la otra decisión de la pantalla. Una compra más cara sube el costo promedio de las existencias y deja el precio de siempre ganando menos sin que salte ningún aviso, porque sigue cubriendo el costo: no se pierde dinero, se deja de ganar, y la única forma de verlo sería abrir la ficha del producto a editarla, que es justo lo que nadie hace al recibir una compra. Por eso toda línea con cantidad y costo escritos muestra lo que costará la unidad después de ese ingreso, el precio que pediría el margen de su categoría y, cuando el precio vigente se queda corto, en cuánto queda el margen real. El cálculo se hace sobre el promedio que quedará después de la entrada, no sobre el de hoy ni sobre el costo del lote suelto: en cuanto la mercancía entra, lo que cuestan las existencias es otra cosa, y es esa la que el precio tiene que cubrir.</w:t>
       </w:r>
     </w:p>
     <w:p>
@@ -10839,11 +10480,12 @@
         <w:rPr>
           <w:noProof/>
         </w:rPr>
+        <w:lastRenderedPageBreak/>
         <w:drawing>
-          <wp:inline distT="0" distB="0" distL="0" distR="0" wp14:anchorId="33DAE321" wp14:editId="6F48321E">
-            <wp:extent cx="6096000" cy="4124325"/>
+          <wp:inline distT="0" distB="0" distL="0" distR="0" wp14:anchorId="0C64C0D7" wp14:editId="1046B061">
+            <wp:extent cx="6096000" cy="5181600"/>
             <wp:effectExtent l="0" t="0" r="0" b="0"/>
-            <wp:docPr id="1549323608" name="Imagen 1549323608"/>
+            <wp:docPr id="1262537282" name="Imagen 1262537282"/>
             <wp:cNvGraphicFramePr>
               <a:graphicFrameLocks xmlns:a="http://schemas.openxmlformats.org/drawingml/2006/main" noChangeAspect="1"/>
             </wp:cNvGraphicFramePr>
@@ -10866,7 +10508,7 @@
                   <pic:spPr bwMode="auto">
                     <a:xfrm>
                       <a:off x="0" y="0"/>
-                      <a:ext cx="6096000" cy="4124325"/>
+                      <a:ext cx="6096000" cy="5181600"/>
                     </a:xfrm>
                     <a:prstGeom prst="rect">
                       <a:avLst/>
@@ -10892,7 +10534,7 @@
           <w:sz w:val="18"/>
           <w:szCs w:val="18"/>
         </w:rPr>
-        <w:t>Figura 14. Inventario: entrada de mercancía. Fuente: del autor.</w:t>
+        <w:t>Figura 14. Inventario: entrada de mercancía, con el precio que propone el margen y el aviso del margen perdido. Fuente: del autor.</w:t>
       </w:r>
     </w:p>
     <w:p>
@@ -10928,7 +10570,6 @@
         <w:jc w:val="both"/>
       </w:pPr>
       <w:r>
-        <w:lastRenderedPageBreak/>
         <w:t>El ajuste se sitúa sobre el historial y no en la lista de productos porque un ajuste es la respuesta a una diferencia, y la diferencia se explica en los movimientos: faltan unidades que nadie vendió, o aparecen unidades que nadie registró. Se pide la diferencia y no la cantidad final —un número positivo si en el conteo sobraron unidades y uno negativo si faltaron— junto con el motivo, que es obligatorio: una existencia que cambió sin explicación es justo lo que un inventario sirve para evitar. Al guardarlo, el movimiento aparece en la primera fila de la tabla.</w:t>
       </w:r>
     </w:p>
@@ -10938,7 +10579,11 @@
         <w:jc w:val="both"/>
       </w:pPr>
       <w:r>
-        <w:t>El kardex es de solo lectura para todos los roles, incluido el administrador de la licorera. Ninguna línea se edita ni se borra: un historial que se puede reescribir no sirve para rendir cuentas, y una cifra equivocada se corrige con otro movimiento que diga por qué. Cuando el ajuste reduce las existencias, el sistema consume los lotes más antiguos y registra el costo real de lo que se perdió; cuando las aumenta, el lote que nace toma el costo de la compra más reciente, porque unas unidades que aparecen en un conteo son mercancía que ya se compró.</w:t>
+        <w:t xml:space="preserve">El kardex es de solo lectura para todos los roles, incluido el administrador de la licorera. Ninguna línea se edita ni se borra: un historial que se puede reescribir no sirve para rendir cuentas, y una cifra equivocada se corrige con otro movimiento que diga por qué. Cuando el ajuste reduce las existencias, el sistema consume los lotes más antiguos y registra el costo real de lo que se perdió; cuando las aumenta, el lote </w:t>
+      </w:r>
+      <w:r>
+        <w:lastRenderedPageBreak/>
+        <w:t>que nace toma el costo de la compra más reciente, porque unas unidades que aparecen en un conteo son mercancía que ya se compró.</w:t>
       </w:r>
     </w:p>
     <w:p>
@@ -10951,10 +10596,10 @@
           <w:noProof/>
         </w:rPr>
         <w:drawing>
-          <wp:inline distT="0" distB="0" distL="0" distR="0" wp14:anchorId="3FB78D87" wp14:editId="7FBD4BC8">
+          <wp:inline distT="0" distB="0" distL="0" distR="0" wp14:anchorId="02E93C87" wp14:editId="48C3BEDD">
             <wp:extent cx="6096000" cy="4162425"/>
             <wp:effectExtent l="0" t="0" r="0" b="0"/>
-            <wp:docPr id="649093390" name="Imagen 649093390"/>
+            <wp:docPr id="1743732449" name="Imagen 1743732449"/>
             <wp:cNvGraphicFramePr>
               <a:graphicFrameLocks xmlns:a="http://schemas.openxmlformats.org/drawingml/2006/main" noChangeAspect="1"/>
             </wp:cNvGraphicFramePr>
@@ -11048,7 +10693,6 @@
         <w:jc w:val="both"/>
       </w:pPr>
       <w:r>
-        <w:lastRenderedPageBreak/>
         <w:t>La cuadrícula presenta el resultado de la búsqueda, y no el catálogo completo: una licorera con cientos de referencias no se recorre con el ratón mientras un cliente espera. Sin texto escrito muestra las referencias de mayor rotación, que son las que se venden sin buscarlas. Elegir un producto es agregarlo: el cursor regresa al buscador con el texto ya borrado, de modo que la referencia siguiente se escribe sin tocar el ratón, y volver a elegir el mismo producto suma una unidad en lugar de abrir un segundo renglón.</w:t>
       </w:r>
     </w:p>
@@ -11058,7 +10702,11 @@
         <w:jc w:val="both"/>
       </w:pPr>
       <w:r>
-        <w:t>El buscador ofrece todas las referencias activas, incluidas las que en ese momento no se pueden vender. Ocultar una sería peor que mostrarla: quien la busca la creería no registrada y la registraría por segunda vez, con lo que el catálogo acabaría con dos fichas del mismo producto y las existencias repartidas entre ambas. Hay dos motivos para que una referencia no se pueda vender —no quedan unidades, o todavía no tiene precio— y los dos se responden igual: la referencia se deja elegir, no se agrega a la venta y la pantalla dice cuál de los dos es. Son el mismo caso para quien atiende, y darles dos comportamientos distintos obligaría a aprenderse cuál es cuál.</w:t>
+        <w:t xml:space="preserve">El buscador ofrece todas las referencias activas, incluidas las que en ese momento no se pueden vender. Ocultar una sería peor que mostrarla: quien la busca la creería no registrada y la registraría por segunda vez, con lo que el catálogo acabaría con dos fichas del mismo producto y las existencias repartidas entre ambas. Hay dos motivos para que una referencia no se pueda vender —no quedan unidades, o todavía </w:t>
+      </w:r>
+      <w:r>
+        <w:lastRenderedPageBreak/>
+        <w:t>no tiene precio— y los dos se responden igual: la referencia se deja elegir, no se agrega a la venta y la pantalla dice cuál de los dos es. Son el mismo caso para quien atiende, y darles dos comportamientos distintos obligaría a aprenderse cuál es cuál.</w:t>
       </w:r>
     </w:p>
     <w:p>
@@ -11117,10 +10765,10 @@
         </w:rPr>
         <w:lastRenderedPageBreak/>
         <w:drawing>
-          <wp:inline distT="0" distB="0" distL="0" distR="0" wp14:anchorId="1C112C66" wp14:editId="59E0F887">
+          <wp:inline distT="0" distB="0" distL="0" distR="0" wp14:anchorId="187E0A7E" wp14:editId="366544F6">
             <wp:extent cx="6096000" cy="4514850"/>
             <wp:effectExtent l="0" t="0" r="0" b="0"/>
-            <wp:docPr id="1207078224" name="Imagen 1207078224"/>
+            <wp:docPr id="1933030899" name="Imagen 1933030899"/>
             <wp:cNvGraphicFramePr>
               <a:graphicFrameLocks xmlns:a="http://schemas.openxmlformats.org/drawingml/2006/main" noChangeAspect="1"/>
             </wp:cNvGraphicFramePr>
@@ -11191,10 +10839,10 @@
           <w:noProof/>
         </w:rPr>
         <w:drawing>
-          <wp:inline distT="0" distB="0" distL="0" distR="0" wp14:anchorId="26AB4B14" wp14:editId="146C17A8">
+          <wp:inline distT="0" distB="0" distL="0" distR="0" wp14:anchorId="66136C41" wp14:editId="122CE01E">
             <wp:extent cx="4000500" cy="1438275"/>
             <wp:effectExtent l="0" t="0" r="0" b="0"/>
-            <wp:docPr id="389987871" name="Imagen 389987871"/>
+            <wp:docPr id="1066483305" name="Imagen 1066483305"/>
             <wp:cNvGraphicFramePr>
               <a:graphicFrameLocks xmlns:a="http://schemas.openxmlformats.org/drawingml/2006/main" noChangeAspect="1"/>
             </wp:cNvGraphicFramePr>
@@ -11321,10 +10969,10 @@
         </w:rPr>
         <w:lastRenderedPageBreak/>
         <w:drawing>
-          <wp:inline distT="0" distB="0" distL="0" distR="0" wp14:anchorId="11D45642" wp14:editId="19FDEDBB">
+          <wp:inline distT="0" distB="0" distL="0" distR="0" wp14:anchorId="5E9EA4F4" wp14:editId="072B1E7A">
             <wp:extent cx="6096000" cy="7010400"/>
             <wp:effectExtent l="0" t="0" r="0" b="0"/>
-            <wp:docPr id="1763511670" name="Imagen 1763511670"/>
+            <wp:docPr id="1625553455" name="Imagen 1625553455"/>
             <wp:cNvGraphicFramePr>
               <a:graphicFrameLocks xmlns:a="http://schemas.openxmlformats.org/drawingml/2006/main" noChangeAspect="1"/>
             </wp:cNvGraphicFramePr>
@@ -11471,10 +11119,10 @@
           <w:noProof/>
         </w:rPr>
         <w:drawing>
-          <wp:inline distT="0" distB="0" distL="0" distR="0" wp14:anchorId="3D95EAE9" wp14:editId="3B61CD87">
+          <wp:inline distT="0" distB="0" distL="0" distR="0" wp14:anchorId="1C3CEF23" wp14:editId="68AEC9C2">
             <wp:extent cx="6096000" cy="3724275"/>
             <wp:effectExtent l="0" t="0" r="0" b="0"/>
-            <wp:docPr id="1578967076" name="Imagen 1578967076"/>
+            <wp:docPr id="634012542" name="Imagen 634012542"/>
             <wp:cNvGraphicFramePr>
               <a:graphicFrameLocks xmlns:a="http://schemas.openxmlformats.org/drawingml/2006/main" noChangeAspect="1"/>
             </wp:cNvGraphicFramePr>
@@ -11564,10 +11212,10 @@
           <w:noProof/>
         </w:rPr>
         <w:drawing>
-          <wp:inline distT="0" distB="0" distL="0" distR="0" wp14:anchorId="32168890" wp14:editId="2581D1F5">
+          <wp:inline distT="0" distB="0" distL="0" distR="0" wp14:anchorId="147F1296" wp14:editId="69F8C8AD">
             <wp:extent cx="6096000" cy="2857500"/>
             <wp:effectExtent l="0" t="0" r="0" b="0"/>
-            <wp:docPr id="2132075501" name="Imagen 2132075501"/>
+            <wp:docPr id="173970020" name="Imagen 173970020"/>
             <wp:cNvGraphicFramePr>
               <a:graphicFrameLocks xmlns:a="http://schemas.openxmlformats.org/drawingml/2006/main" noChangeAspect="1"/>
             </wp:cNvGraphicFramePr>
@@ -11684,10 +11332,10 @@
         </w:rPr>
         <w:lastRenderedPageBreak/>
         <w:drawing>
-          <wp:inline distT="0" distB="0" distL="0" distR="0" wp14:anchorId="00606F16" wp14:editId="0E92529F">
+          <wp:inline distT="0" distB="0" distL="0" distR="0" wp14:anchorId="083779EE" wp14:editId="534D5436">
             <wp:extent cx="6096000" cy="2857500"/>
             <wp:effectExtent l="0" t="0" r="0" b="0"/>
-            <wp:docPr id="183405289" name="Imagen 183405289"/>
+            <wp:docPr id="1093781198" name="Imagen 1093781198"/>
             <wp:cNvGraphicFramePr>
               <a:graphicFrameLocks xmlns:a="http://schemas.openxmlformats.org/drawingml/2006/main" noChangeAspect="1"/>
             </wp:cNvGraphicFramePr>
@@ -11795,10 +11443,10 @@
         </w:rPr>
         <w:lastRenderedPageBreak/>
         <w:drawing>
-          <wp:inline distT="0" distB="0" distL="0" distR="0" wp14:anchorId="1E785703" wp14:editId="09AEC73F">
+          <wp:inline distT="0" distB="0" distL="0" distR="0" wp14:anchorId="58A470A9" wp14:editId="3782E374">
             <wp:extent cx="6096000" cy="3562350"/>
             <wp:effectExtent l="0" t="0" r="0" b="0"/>
-            <wp:docPr id="1214788932" name="Imagen 1214788932"/>
+            <wp:docPr id="2033937472" name="Imagen 2033937472"/>
             <wp:cNvGraphicFramePr>
               <a:graphicFrameLocks xmlns:a="http://schemas.openxmlformats.org/drawingml/2006/main" noChangeAspect="1"/>
             </wp:cNvGraphicFramePr>
@@ -11906,10 +11554,10 @@
         </w:rPr>
         <w:lastRenderedPageBreak/>
         <w:drawing>
-          <wp:inline distT="0" distB="0" distL="0" distR="0" wp14:anchorId="111E6793" wp14:editId="567821E8">
+          <wp:inline distT="0" distB="0" distL="0" distR="0" wp14:anchorId="335CADBC" wp14:editId="0581E1EA">
             <wp:extent cx="6096000" cy="3067050"/>
             <wp:effectExtent l="0" t="0" r="0" b="0"/>
-            <wp:docPr id="1745659329" name="Imagen 1745659329"/>
+            <wp:docPr id="804882639" name="Imagen 804882639"/>
             <wp:cNvGraphicFramePr>
               <a:graphicFrameLocks xmlns:a="http://schemas.openxmlformats.org/drawingml/2006/main" noChangeAspect="1"/>
             </wp:cNvGraphicFramePr>
@@ -12026,10 +11674,10 @@
         </w:rPr>
         <w:lastRenderedPageBreak/>
         <w:drawing>
-          <wp:inline distT="0" distB="0" distL="0" distR="0" wp14:anchorId="59B9A143" wp14:editId="416C7B54">
+          <wp:inline distT="0" distB="0" distL="0" distR="0" wp14:anchorId="62C46E9A" wp14:editId="24D3E450">
             <wp:extent cx="6096000" cy="4114800"/>
             <wp:effectExtent l="0" t="0" r="0" b="0"/>
-            <wp:docPr id="1541209090" name="Imagen 1541209090"/>
+            <wp:docPr id="1286960415" name="Imagen 1286960415"/>
             <wp:cNvGraphicFramePr>
               <a:graphicFrameLocks xmlns:a="http://schemas.openxmlformats.org/drawingml/2006/main" noChangeAspect="1"/>
             </wp:cNvGraphicFramePr>
@@ -12120,10 +11768,10 @@
           <w:noProof/>
         </w:rPr>
         <w:drawing>
-          <wp:inline distT="0" distB="0" distL="0" distR="0" wp14:anchorId="79C4263F" wp14:editId="74FC2BD4">
+          <wp:inline distT="0" distB="0" distL="0" distR="0" wp14:anchorId="6FEA86C9" wp14:editId="1341AFEE">
             <wp:extent cx="6096000" cy="2733675"/>
             <wp:effectExtent l="0" t="0" r="0" b="0"/>
-            <wp:docPr id="1146416650" name="Imagen 1146416650"/>
+            <wp:docPr id="1701198943" name="Imagen 1701198943"/>
             <wp:cNvGraphicFramePr>
               <a:graphicFrameLocks xmlns:a="http://schemas.openxmlformats.org/drawingml/2006/main" noChangeAspect="1"/>
             </wp:cNvGraphicFramePr>
@@ -12217,12 +11865,6 @@
         <w:gridCol w:w="4460"/>
       </w:tblGrid>
       <w:tr>
-        <w:tblPrEx>
-          <w:tblCellMar>
-            <w:top w:w="0" w:type="dxa"/>
-            <w:bottom w:w="0" w:type="dxa"/>
-          </w:tblCellMar>
-        </w:tblPrEx>
         <w:trPr>
           <w:tblHeader/>
         </w:trPr>
@@ -12309,12 +11951,6 @@
         </w:tc>
       </w:tr>
       <w:tr>
-        <w:tblPrEx>
-          <w:tblCellMar>
-            <w:top w:w="0" w:type="dxa"/>
-            <w:bottom w:w="0" w:type="dxa"/>
-          </w:tblCellMar>
-        </w:tblPrEx>
         <w:tc>
           <w:tcPr>
             <w:tcW w:w="1700" w:type="dxa"/>
@@ -12389,12 +12025,6 @@
         </w:tc>
       </w:tr>
       <w:tr>
-        <w:tblPrEx>
-          <w:tblCellMar>
-            <w:top w:w="0" w:type="dxa"/>
-            <w:bottom w:w="0" w:type="dxa"/>
-          </w:tblCellMar>
-        </w:tblPrEx>
         <w:tc>
           <w:tcPr>
             <w:tcW w:w="1700" w:type="dxa"/>
@@ -12469,12 +12099,6 @@
         </w:tc>
       </w:tr>
       <w:tr>
-        <w:tblPrEx>
-          <w:tblCellMar>
-            <w:top w:w="0" w:type="dxa"/>
-            <w:bottom w:w="0" w:type="dxa"/>
-          </w:tblCellMar>
-        </w:tblPrEx>
         <w:tc>
           <w:tcPr>
             <w:tcW w:w="1700" w:type="dxa"/>
@@ -12549,12 +12173,6 @@
         </w:tc>
       </w:tr>
       <w:tr>
-        <w:tblPrEx>
-          <w:tblCellMar>
-            <w:top w:w="0" w:type="dxa"/>
-            <w:bottom w:w="0" w:type="dxa"/>
-          </w:tblCellMar>
-        </w:tblPrEx>
         <w:tc>
           <w:tcPr>
             <w:tcW w:w="1700" w:type="dxa"/>
@@ -12629,12 +12247,6 @@
         </w:tc>
       </w:tr>
       <w:tr>
-        <w:tblPrEx>
-          <w:tblCellMar>
-            <w:top w:w="0" w:type="dxa"/>
-            <w:bottom w:w="0" w:type="dxa"/>
-          </w:tblCellMar>
-        </w:tblPrEx>
         <w:tc>
           <w:tcPr>
             <w:tcW w:w="1700" w:type="dxa"/>
@@ -12709,12 +12321,6 @@
         </w:tc>
       </w:tr>
       <w:tr>
-        <w:tblPrEx>
-          <w:tblCellMar>
-            <w:top w:w="0" w:type="dxa"/>
-            <w:bottom w:w="0" w:type="dxa"/>
-          </w:tblCellMar>
-        </w:tblPrEx>
         <w:tc>
           <w:tcPr>
             <w:tcW w:w="1700" w:type="dxa"/>
@@ -12996,10 +12602,10 @@
           <w:noProof/>
         </w:rPr>
         <w:drawing>
-          <wp:inline distT="0" distB="0" distL="0" distR="0" wp14:anchorId="092A686B" wp14:editId="3AF482D9">
+          <wp:inline distT="0" distB="0" distL="0" distR="0" wp14:anchorId="5A06E7F2" wp14:editId="55FD0861">
             <wp:extent cx="6096000" cy="3295650"/>
             <wp:effectExtent l="0" t="0" r="0" b="0"/>
-            <wp:docPr id="1395751284" name="Imagen 1395751284"/>
+            <wp:docPr id="386605207" name="Imagen 386605207"/>
             <wp:cNvGraphicFramePr>
               <a:graphicFrameLocks xmlns:a="http://schemas.openxmlformats.org/drawingml/2006/main" noChangeAspect="1"/>
             </wp:cNvGraphicFramePr>
@@ -13119,10 +12725,10 @@
           <w:noProof/>
         </w:rPr>
         <w:drawing>
-          <wp:inline distT="0" distB="0" distL="0" distR="0" wp14:anchorId="514C9E97" wp14:editId="036CE5F2">
+          <wp:inline distT="0" distB="0" distL="0" distR="0" wp14:anchorId="6737466E" wp14:editId="4E95D7F5">
             <wp:extent cx="6096000" cy="3067050"/>
             <wp:effectExtent l="0" t="0" r="0" b="0"/>
-            <wp:docPr id="919231997" name="Imagen 919231997"/>
+            <wp:docPr id="1884481419" name="Imagen 1884481419"/>
             <wp:cNvGraphicFramePr>
               <a:graphicFrameLocks xmlns:a="http://schemas.openxmlformats.org/drawingml/2006/main" noChangeAspect="1"/>
             </wp:cNvGraphicFramePr>
@@ -13255,12 +12861,6 @@
         <w:gridCol w:w="7260"/>
       </w:tblGrid>
       <w:tr>
-        <w:tblPrEx>
-          <w:tblCellMar>
-            <w:top w:w="0" w:type="dxa"/>
-            <w:bottom w:w="0" w:type="dxa"/>
-          </w:tblCellMar>
-        </w:tblPrEx>
         <w:trPr>
           <w:tblHeader/>
         </w:trPr>
@@ -13320,12 +12920,6 @@
         </w:tc>
       </w:tr>
       <w:tr>
-        <w:tblPrEx>
-          <w:tblCellMar>
-            <w:top w:w="0" w:type="dxa"/>
-            <w:bottom w:w="0" w:type="dxa"/>
-          </w:tblCellMar>
-        </w:tblPrEx>
         <w:tc>
           <w:tcPr>
             <w:tcW w:w="2100" w:type="dxa"/>
@@ -13376,12 +12970,6 @@
         </w:tc>
       </w:tr>
       <w:tr>
-        <w:tblPrEx>
-          <w:tblCellMar>
-            <w:top w:w="0" w:type="dxa"/>
-            <w:bottom w:w="0" w:type="dxa"/>
-          </w:tblCellMar>
-        </w:tblPrEx>
         <w:tc>
           <w:tcPr>
             <w:tcW w:w="2100" w:type="dxa"/>
@@ -13432,12 +13020,6 @@
         </w:tc>
       </w:tr>
       <w:tr>
-        <w:tblPrEx>
-          <w:tblCellMar>
-            <w:top w:w="0" w:type="dxa"/>
-            <w:bottom w:w="0" w:type="dxa"/>
-          </w:tblCellMar>
-        </w:tblPrEx>
         <w:tc>
           <w:tcPr>
             <w:tcW w:w="2100" w:type="dxa"/>
@@ -13488,12 +13070,6 @@
         </w:tc>
       </w:tr>
       <w:tr>
-        <w:tblPrEx>
-          <w:tblCellMar>
-            <w:top w:w="0" w:type="dxa"/>
-            <w:bottom w:w="0" w:type="dxa"/>
-          </w:tblCellMar>
-        </w:tblPrEx>
         <w:tc>
           <w:tcPr>
             <w:tcW w:w="2100" w:type="dxa"/>
@@ -13544,12 +13120,6 @@
         </w:tc>
       </w:tr>
       <w:tr>
-        <w:tblPrEx>
-          <w:tblCellMar>
-            <w:top w:w="0" w:type="dxa"/>
-            <w:bottom w:w="0" w:type="dxa"/>
-          </w:tblCellMar>
-        </w:tblPrEx>
         <w:tc>
           <w:tcPr>
             <w:tcW w:w="2100" w:type="dxa"/>
@@ -13600,12 +13170,6 @@
         </w:tc>
       </w:tr>
       <w:tr>
-        <w:tblPrEx>
-          <w:tblCellMar>
-            <w:top w:w="0" w:type="dxa"/>
-            <w:bottom w:w="0" w:type="dxa"/>
-          </w:tblCellMar>
-        </w:tblPrEx>
         <w:tc>
           <w:tcPr>
             <w:tcW w:w="2100" w:type="dxa"/>
@@ -13656,12 +13220,6 @@
         </w:tc>
       </w:tr>
       <w:tr>
-        <w:tblPrEx>
-          <w:tblCellMar>
-            <w:top w:w="0" w:type="dxa"/>
-            <w:bottom w:w="0" w:type="dxa"/>
-          </w:tblCellMar>
-        </w:tblPrEx>
         <w:tc>
           <w:tcPr>
             <w:tcW w:w="2100" w:type="dxa"/>
@@ -13712,12 +13270,6 @@
         </w:tc>
       </w:tr>
       <w:tr>
-        <w:tblPrEx>
-          <w:tblCellMar>
-            <w:top w:w="0" w:type="dxa"/>
-            <w:bottom w:w="0" w:type="dxa"/>
-          </w:tblCellMar>
-        </w:tblPrEx>
         <w:tc>
           <w:tcPr>
             <w:tcW w:w="2100" w:type="dxa"/>
@@ -13768,12 +13320,6 @@
         </w:tc>
       </w:tr>
       <w:tr>
-        <w:tblPrEx>
-          <w:tblCellMar>
-            <w:top w:w="0" w:type="dxa"/>
-            <w:bottom w:w="0" w:type="dxa"/>
-          </w:tblCellMar>
-        </w:tblPrEx>
         <w:tc>
           <w:tcPr>
             <w:tcW w:w="2100" w:type="dxa"/>
@@ -13824,12 +13370,6 @@
         </w:tc>
       </w:tr>
       <w:tr>
-        <w:tblPrEx>
-          <w:tblCellMar>
-            <w:top w:w="0" w:type="dxa"/>
-            <w:bottom w:w="0" w:type="dxa"/>
-          </w:tblCellMar>
-        </w:tblPrEx>
         <w:tc>
           <w:tcPr>
             <w:tcW w:w="2100" w:type="dxa"/>
@@ -13880,12 +13420,6 @@
         </w:tc>
       </w:tr>
       <w:tr>
-        <w:tblPrEx>
-          <w:tblCellMar>
-            <w:top w:w="0" w:type="dxa"/>
-            <w:bottom w:w="0" w:type="dxa"/>
-          </w:tblCellMar>
-        </w:tblPrEx>
         <w:tc>
           <w:tcPr>
             <w:tcW w:w="2100" w:type="dxa"/>
@@ -13936,12 +13470,6 @@
         </w:tc>
       </w:tr>
       <w:tr>
-        <w:tblPrEx>
-          <w:tblCellMar>
-            <w:top w:w="0" w:type="dxa"/>
-            <w:bottom w:w="0" w:type="dxa"/>
-          </w:tblCellMar>
-        </w:tblPrEx>
         <w:tc>
           <w:tcPr>
             <w:tcW w:w="2100" w:type="dxa"/>
@@ -13992,12 +13520,6 @@
         </w:tc>
       </w:tr>
       <w:tr>
-        <w:tblPrEx>
-          <w:tblCellMar>
-            <w:top w:w="0" w:type="dxa"/>
-            <w:bottom w:w="0" w:type="dxa"/>
-          </w:tblCellMar>
-        </w:tblPrEx>
         <w:tc>
           <w:tcPr>
             <w:tcW w:w="2100" w:type="dxa"/>
@@ -14148,13 +13670,7 @@
         <w:spacing w:after="60" w:line="258" w:lineRule="auto"/>
       </w:pPr>
       <w:r>
-        <w:rPr>
-          <w:lang w:val="en-US"/>
-        </w:rPr>
-        <w:t xml:space="preserve">World Wide Web Consortium. Web Content Accessibility Guidelines (WCAG) 2.1. </w:t>
-      </w:r>
-      <w:r>
-        <w:t>W3C, 2018.</w:t>
+        <w:t>World Wide Web Consortium. Web Content Accessibility Guidelines (WCAG) 2.1. W3C, 2018.</w:t>
       </w:r>
     </w:p>
     <w:p>
@@ -14294,10 +13810,10 @@
 <file path=word/numbering.xml><?xml version="1.0" encoding="utf-8"?>
 <w:numbering xmlns:wpc="http://schemas.microsoft.com/office/word/2010/wordprocessingCanvas" xmlns:cx="http://schemas.microsoft.com/office/drawing/2014/chartex" xmlns:cx1="http://schemas.microsoft.com/office/drawing/2015/9/8/chartex" xmlns:cx2="http://schemas.microsoft.com/office/drawing/2015/10/21/chartex" xmlns:cx3="http://schemas.microsoft.com/office/drawing/2016/5/9/chartex" xmlns:cx4="http://schemas.microsoft.com/office/drawing/2016/5/10/chartex" xmlns:cx5="http://schemas.microsoft.com/office/drawing/2016/5/11/chartex" xmlns:cx6="http://schemas.microsoft.com/office/drawing/2016/5/12/chartex" xmlns:cx7="http://schemas.microsoft.com/office/drawing/2016/5/13/chartex" xmlns:cx8="http://schemas.microsoft.com/office/drawing/2016/5/14/chartex" xmlns:mc="http://schemas.openxmlformats.org/markup-compatibility/2006" xmlns:aink="http://schemas.microsoft.com/office/drawing/2016/ink" xmlns:am3d="http://schemas.microsoft.com/office/drawing/2017/model3d" xmlns:o="urn:schemas-microsoft-com:office:office" xmlns:oel="http://schemas.microsoft.com/office/2019/extlst" xmlns:r="http://schemas.openxmlformats.org/officeDocument/2006/relationships" xmlns:m="http://schemas.openxmlformats.org/officeDocument/2006/math" xmlns:v="urn:schemas-microsoft-com:vml" xmlns:wp14="http://schemas.microsoft.com/office/word/2010/wordprocessingDrawing" xmlns:wp="http://schemas.openxmlformats.org/drawingml/2006/wordprocessingDrawing" xmlns:w10="urn:schemas-microsoft-com:office:word" xmlns:w="http://schemas.openxmlformats.org/wordprocessingml/2006/main" xmlns:w14="http://schemas.microsoft.com/office/word/2010/wordml" xmlns:w15="http://schemas.microsoft.com/office/word/2012/wordml" xmlns:w16cex="http://schemas.microsoft.com/office/word/2018/wordml/cex" xmlns:w16cid="http://schemas.microsoft.com/office/word/2016/wordml/cid" xmlns:w16="http://schemas.microsoft.com/office/word/2018/wordml" xmlns:w16du="http://schemas.microsoft.com/office/word/2023/wordml/word16du" xmlns:w16sdtdh="http://schemas.microsoft.com/office/word/2020/wordml/sdtdatahash" xmlns:w16sdtfl="http://schemas.microsoft.com/office/word/2024/wordml/sdtformatlock" xmlns:w16se="http://schemas.microsoft.com/office/word/2015/wordml/symex" xmlns:wpg="http://schemas.microsoft.com/office/word/2010/wordprocessingGroup" xmlns:wpi="http://schemas.microsoft.com/office/word/2010/wordprocessingInk" xmlns:wne="http://schemas.microsoft.com/office/word/2006/wordml" xmlns:wps="http://schemas.microsoft.com/office/word/2010/wordprocessingShape" mc:Ignorable="w14 w15 w16se w16cid w16 w16cex w16sdtdh w16sdtfl w16du wp14">
   <w:abstractNum w:abstractNumId="0" w15:restartNumberingAfterBreak="0">
-    <w:nsid w:val="365A4F4E"/>
+    <w:nsid w:val="3AB03CE1"/>
     <w:multiLevelType w:val="hybridMultilevel"/>
-    <w:tmpl w:val="6CCE9EA4"/>
-    <w:lvl w:ilvl="0" w:tplc="75640D34">
+    <w:tmpl w:val="7AFC8D38"/>
+    <w:lvl w:ilvl="0" w:tplc="176ABAF6">
       <w:start w:val="1"/>
       <w:numFmt w:val="bullet"/>
       <w:lvlText w:val="●"/>
@@ -14306,7 +13822,7 @@
         <w:ind w:left="720" w:hanging="360"/>
       </w:pPr>
     </w:lvl>
-    <w:lvl w:ilvl="1" w:tplc="E3327036">
+    <w:lvl w:ilvl="1" w:tplc="F9BC2A06">
       <w:start w:val="1"/>
       <w:numFmt w:val="bullet"/>
       <w:lvlText w:val="○"/>
@@ -14315,7 +13831,7 @@
         <w:ind w:left="1440" w:hanging="360"/>
       </w:pPr>
     </w:lvl>
-    <w:lvl w:ilvl="2" w:tplc="43BA935C">
+    <w:lvl w:ilvl="2" w:tplc="6B38B86A">
       <w:start w:val="1"/>
       <w:numFmt w:val="bullet"/>
       <w:lvlText w:val="■"/>
@@ -14324,7 +13840,7 @@
         <w:ind w:left="2160" w:hanging="360"/>
       </w:pPr>
     </w:lvl>
-    <w:lvl w:ilvl="3" w:tplc="946EEEFC">
+    <w:lvl w:ilvl="3" w:tplc="5FB29CBE">
       <w:start w:val="1"/>
       <w:numFmt w:val="bullet"/>
       <w:lvlText w:val="●"/>
@@ -14333,7 +13849,7 @@
         <w:ind w:left="2880" w:hanging="360"/>
       </w:pPr>
     </w:lvl>
-    <w:lvl w:ilvl="4" w:tplc="CB40FD3E">
+    <w:lvl w:ilvl="4" w:tplc="90B8886C">
       <w:start w:val="1"/>
       <w:numFmt w:val="bullet"/>
       <w:lvlText w:val="○"/>
@@ -14342,7 +13858,7 @@
         <w:ind w:left="3600" w:hanging="360"/>
       </w:pPr>
     </w:lvl>
-    <w:lvl w:ilvl="5" w:tplc="F20EA576">
+    <w:lvl w:ilvl="5" w:tplc="08F62ED2">
       <w:start w:val="1"/>
       <w:numFmt w:val="bullet"/>
       <w:lvlText w:val="■"/>
@@ -14351,7 +13867,7 @@
         <w:ind w:left="4320" w:hanging="360"/>
       </w:pPr>
     </w:lvl>
-    <w:lvl w:ilvl="6" w:tplc="359882D0">
+    <w:lvl w:ilvl="6" w:tplc="83F27592">
       <w:start w:val="1"/>
       <w:numFmt w:val="bullet"/>
       <w:lvlText w:val="●"/>
@@ -14360,7 +13876,7 @@
         <w:ind w:left="5040" w:hanging="360"/>
       </w:pPr>
     </w:lvl>
-    <w:lvl w:ilvl="7" w:tplc="064024B8">
+    <w:lvl w:ilvl="7" w:tplc="C2C481DA">
       <w:start w:val="1"/>
       <w:numFmt w:val="bullet"/>
       <w:lvlText w:val="●"/>
@@ -14369,7 +13885,7 @@
         <w:ind w:left="5760" w:hanging="360"/>
       </w:pPr>
     </w:lvl>
-    <w:lvl w:ilvl="8" w:tplc="EA9CE830">
+    <w:lvl w:ilvl="8" w:tplc="1E9E052A">
       <w:start w:val="1"/>
       <w:numFmt w:val="bullet"/>
       <w:lvlText w:val="●"/>
@@ -14379,7 +13895,7 @@
       </w:pPr>
     </w:lvl>
   </w:abstractNum>
-  <w:num w:numId="1" w16cid:durableId="2024278087">
+  <w:num w:numId="1" w16cid:durableId="437606285">
     <w:abstractNumId w:val="0"/>
     <w:lvlOverride w:ilvl="0">
       <w:startOverride w:val="1"/>

</xml_diff>